<commit_message>
Initial timeline control implementation
</commit_message>
<xml_diff>
--- a/docs/Development.docx
+++ b/docs/Development.docx
@@ -349,7 +349,6 @@
       <w:r>
         <w:t xml:space="preserve">  </w:t>
       </w:r>
-      <w:proofErr w:type="gramStart"/>
       <w:r>
         <w:t>I</w:t>
       </w:r>
@@ -360,25 +359,13 @@
         <w:t xml:space="preserve"> </w:t>
       </w:r>
       <w:r>
-        <w:t xml:space="preserve"> and</w:t>
-      </w:r>
-      <w:proofErr w:type="gramEnd"/>
+        <w:t xml:space="preserve"> and sample</w:t>
+      </w:r>
       <w:r>
         <w:t xml:space="preserve"> </w:t>
       </w:r>
-      <w:proofErr w:type="gramStart"/>
-      <w:r>
-        <w:t>sample</w:t>
-      </w:r>
-      <w:r>
-        <w:t xml:space="preserve"> </w:t>
-      </w:r>
-      <w:r>
-        <w:t>based</w:t>
-      </w:r>
-      <w:proofErr w:type="gramEnd"/>
-      <w:r>
-        <w:t xml:space="preserve"> </w:t>
+      <w:r>
+        <w:t xml:space="preserve">based </w:t>
       </w:r>
       <w:r>
         <w:t xml:space="preserve">measurements </w:t>
@@ -557,7 +544,6 @@
       <w:r>
         <w:t xml:space="preserve">, </w:t>
       </w:r>
-      <w:proofErr w:type="spellStart"/>
       <w:r>
         <w:rPr>
           <w:b/>
@@ -565,7 +551,6 @@
         </w:rPr>
         <w:t>BeebPerf</w:t>
       </w:r>
-      <w:proofErr w:type="spellEnd"/>
       <w:r>
         <w:t>,</w:t>
       </w:r>
@@ -618,7 +603,6 @@
       <w:r>
         <w:t xml:space="preserve">for </w:t>
       </w:r>
-      <w:proofErr w:type="spellStart"/>
       <w:r>
         <w:rPr>
           <w:b/>
@@ -633,7 +617,6 @@
         </w:rPr>
         <w:t>Perf</w:t>
       </w:r>
-      <w:proofErr w:type="spellEnd"/>
       <w:r>
         <w:t xml:space="preserve"> to analyze and </w:t>
       </w:r>
@@ -695,7 +678,6 @@
       <w:r>
         <w:t xml:space="preserve">to decouple </w:t>
       </w:r>
-      <w:proofErr w:type="spellStart"/>
       <w:r>
         <w:rPr>
           <w:b/>
@@ -703,7 +685,6 @@
         </w:rPr>
         <w:t>BeebPerf</w:t>
       </w:r>
-      <w:proofErr w:type="spellEnd"/>
       <w:r>
         <w:t xml:space="preserve"> from </w:t>
       </w:r>
@@ -738,7 +719,6 @@
       <w:r>
         <w:t xml:space="preserve">performance data which </w:t>
       </w:r>
-      <w:proofErr w:type="spellStart"/>
       <w:r>
         <w:rPr>
           <w:b/>
@@ -746,7 +726,6 @@
         </w:rPr>
         <w:t>BeebPerf</w:t>
       </w:r>
-      <w:proofErr w:type="spellEnd"/>
       <w:r>
         <w:t xml:space="preserve"> </w:t>
       </w:r>
@@ -882,7 +861,6 @@
       <w:r>
         <w:t xml:space="preserve"> is modified to generate a .perf file, which </w:t>
       </w:r>
-      <w:proofErr w:type="spellStart"/>
       <w:r>
         <w:rPr>
           <w:b/>
@@ -890,7 +868,6 @@
         </w:rPr>
         <w:t>BeebPerf</w:t>
       </w:r>
-      <w:proofErr w:type="spellEnd"/>
       <w:r>
         <w:t xml:space="preserve"> </w:t>
       </w:r>
@@ -977,7 +954,6 @@
         </w:rPr>
         <w:t>&lt;</w:t>
       </w:r>
-      <w:proofErr w:type="spellStart"/>
       <w:r>
         <w:rPr>
           <w:b/>
@@ -992,7 +968,6 @@
         </w:rPr>
         <w:t>chunk</w:t>
       </w:r>
-      <w:proofErr w:type="spellEnd"/>
       <w:r>
         <w:rPr>
           <w:b/>
@@ -1010,7 +985,6 @@
         </w:rPr>
         <w:t>&lt;</w:t>
       </w:r>
-      <w:proofErr w:type="spellStart"/>
       <w:r>
         <w:rPr>
           <w:b/>
@@ -1032,7 +1006,6 @@
         </w:rPr>
         <w:t>_chunk</w:t>
       </w:r>
-      <w:proofErr w:type="spellEnd"/>
       <w:r>
         <w:rPr>
           <w:b/>
@@ -1061,44 +1034,33 @@
         </w:rPr>
         <w:t>&lt;</w:t>
       </w:r>
-      <w:proofErr w:type="spellStart"/>
       <w:r>
         <w:rPr>
           <w:b/>
           <w:bCs/>
         </w:rPr>
-        <w:t>snapshot_chunk</w:t>
-      </w:r>
-      <w:proofErr w:type="spellEnd"/>
+        <w:t>snapshot_chunk&gt;</w:t>
+      </w:r>
+      <w:r>
+        <w:t xml:space="preserve"> +</w:t>
+      </w:r>
+      <w:r>
+        <w:t xml:space="preserve"> </w:t>
+      </w:r>
       <w:r>
         <w:rPr>
           <w:b/>
           <w:bCs/>
         </w:rPr>
-        <w:t>&gt;</w:t>
-      </w:r>
-      <w:r>
-        <w:t xml:space="preserve"> +</w:t>
-      </w:r>
-      <w:r>
-        <w:t xml:space="preserve"> </w:t>
+        <w:t>&lt;</w:t>
       </w:r>
       <w:r>
         <w:rPr>
           <w:b/>
           <w:bCs/>
         </w:rPr>
-        <w:t>&lt;</w:t>
-      </w:r>
-      <w:proofErr w:type="spellStart"/>
-      <w:r>
-        <w:rPr>
-          <w:b/>
-          <w:bCs/>
-        </w:rPr>
         <w:t>execution_chunk</w:t>
       </w:r>
-      <w:proofErr w:type="spellEnd"/>
       <w:r>
         <w:rPr>
           <w:b/>
@@ -1128,13 +1090,8 @@
       <w:r>
         <w:t xml:space="preserve"> a common header which </w:t>
       </w:r>
-      <w:proofErr w:type="gramStart"/>
-      <w:r>
-        <w:t>proceeds</w:t>
-      </w:r>
-      <w:proofErr w:type="gramEnd"/>
-      <w:r>
-        <w:t xml:space="preserve"> </w:t>
+      <w:r>
+        <w:t xml:space="preserve">proceeds </w:t>
       </w:r>
       <w:r>
         <w:t>the</w:t>
@@ -1298,7 +1255,6 @@
         </w:rPr>
         <w:t>&lt;</w:t>
       </w:r>
-      <w:proofErr w:type="spellStart"/>
       <w:r>
         <w:rPr>
           <w:b/>
@@ -1311,15 +1267,7 @@
           <w:b/>
           <w:bCs/>
         </w:rPr>
-        <w:t>header</w:t>
-      </w:r>
-      <w:proofErr w:type="spellEnd"/>
-      <w:r>
-        <w:rPr>
-          <w:b/>
-          <w:bCs/>
-        </w:rPr>
-        <w:t>&gt;</w:t>
+        <w:t>header&gt;</w:t>
       </w:r>
       <w:r>
         <w:t xml:space="preserve"> = </w:t>
@@ -1330,24 +1278,11 @@
       <w:r>
         <w:t>&lt;tag&gt; + &lt;compression&gt; + &lt;</w:t>
       </w:r>
-      <w:proofErr w:type="spellStart"/>
       <w:r>
         <w:t>original_</w:t>
       </w:r>
       <w:r>
-        <w:t>size</w:t>
-      </w:r>
-      <w:proofErr w:type="spellEnd"/>
-      <w:r>
-        <w:t>&gt; + &lt;</w:t>
-      </w:r>
-      <w:proofErr w:type="spellStart"/>
-      <w:r>
-        <w:t>compressed_size</w:t>
-      </w:r>
-      <w:proofErr w:type="spellEnd"/>
-      <w:r>
-        <w:t>&gt;</w:t>
+        <w:t>size&gt; + &lt;compressed_size&gt;</w:t>
       </w:r>
     </w:p>
     <w:p>
@@ -1474,23 +1409,7 @@
                 <w:rFonts w:ascii="Aptos" w:hAnsi="Aptos"/>
                 <w:color w:val="000000"/>
               </w:rPr>
-              <w:t>‘</w:t>
-            </w:r>
-            <w:proofErr w:type="spellStart"/>
-            <w:r>
-              <w:rPr>
-                <w:rFonts w:ascii="Aptos" w:hAnsi="Aptos"/>
-                <w:color w:val="000000"/>
-              </w:rPr>
-              <w:t>PFhd</w:t>
-            </w:r>
-            <w:proofErr w:type="spellEnd"/>
-            <w:r>
-              <w:rPr>
-                <w:rFonts w:ascii="Aptos" w:hAnsi="Aptos"/>
-                <w:color w:val="000000"/>
-              </w:rPr>
-              <w:t>’</w:t>
+              <w:t>‘PFhd’</w:t>
             </w:r>
           </w:p>
         </w:tc>
@@ -1510,23 +1429,7 @@
                 <w:rFonts w:ascii="Aptos" w:hAnsi="Aptos"/>
                 <w:color w:val="000000"/>
               </w:rPr>
-              <w:t>&lt;</w:t>
-            </w:r>
-            <w:proofErr w:type="spellStart"/>
-            <w:r>
-              <w:rPr>
-                <w:rFonts w:ascii="Aptos" w:hAnsi="Aptos"/>
-                <w:color w:val="000000"/>
-              </w:rPr>
-              <w:t>header_chunk</w:t>
-            </w:r>
-            <w:proofErr w:type="spellEnd"/>
-            <w:r>
-              <w:rPr>
-                <w:rFonts w:ascii="Aptos" w:hAnsi="Aptos"/>
-                <w:color w:val="000000"/>
-              </w:rPr>
-              <w:t>&gt;</w:t>
+              <w:t>&lt;header_chunk&gt;</w:t>
             </w:r>
           </w:p>
         </w:tc>
@@ -1548,23 +1451,7 @@
                 <w:rFonts w:ascii="Aptos" w:hAnsi="Aptos"/>
                 <w:color w:val="000000"/>
               </w:rPr>
-              <w:t>‘</w:t>
-            </w:r>
-            <w:proofErr w:type="spellStart"/>
-            <w:r>
-              <w:rPr>
-                <w:rFonts w:ascii="Aptos" w:hAnsi="Aptos"/>
-                <w:color w:val="000000"/>
-              </w:rPr>
-              <w:t>PFlb</w:t>
-            </w:r>
-            <w:proofErr w:type="spellEnd"/>
-            <w:r>
-              <w:rPr>
-                <w:rFonts w:ascii="Aptos" w:hAnsi="Aptos"/>
-                <w:color w:val="000000"/>
-              </w:rPr>
-              <w:t>’</w:t>
+              <w:t>‘PFlb’</w:t>
             </w:r>
           </w:p>
         </w:tc>
@@ -1580,15 +1467,7 @@
               </w:rPr>
             </w:pPr>
             <w:r>
-              <w:t>&lt;</w:t>
-            </w:r>
-            <w:proofErr w:type="spellStart"/>
-            <w:r>
-              <w:t>labels_chunk</w:t>
-            </w:r>
-            <w:proofErr w:type="spellEnd"/>
-            <w:r>
-              <w:t>&gt;</w:t>
+              <w:t>&lt;labels_chunk&gt;</w:t>
             </w:r>
           </w:p>
         </w:tc>
@@ -1610,23 +1489,7 @@
                 <w:rFonts w:ascii="Aptos" w:hAnsi="Aptos"/>
                 <w:color w:val="000000"/>
               </w:rPr>
-              <w:t>‘</w:t>
-            </w:r>
-            <w:proofErr w:type="spellStart"/>
-            <w:r>
-              <w:rPr>
-                <w:rFonts w:ascii="Aptos" w:hAnsi="Aptos"/>
-                <w:color w:val="000000"/>
-              </w:rPr>
-              <w:t>PFss</w:t>
-            </w:r>
-            <w:proofErr w:type="spellEnd"/>
-            <w:r>
-              <w:rPr>
-                <w:rFonts w:ascii="Aptos" w:hAnsi="Aptos"/>
-                <w:color w:val="000000"/>
-              </w:rPr>
-              <w:t>’</w:t>
+              <w:t>‘PFss’</w:t>
             </w:r>
           </w:p>
         </w:tc>
@@ -1642,15 +1505,7 @@
               </w:rPr>
             </w:pPr>
             <w:r>
-              <w:t>&lt;</w:t>
-            </w:r>
-            <w:proofErr w:type="spellStart"/>
-            <w:r>
-              <w:t>snapshot_chunk</w:t>
-            </w:r>
-            <w:proofErr w:type="spellEnd"/>
-            <w:r>
-              <w:t>&gt;</w:t>
+              <w:t>&lt;snapshot_chunk&gt;</w:t>
             </w:r>
           </w:p>
         </w:tc>
@@ -1672,23 +1527,7 @@
                 <w:rFonts w:ascii="Aptos" w:hAnsi="Aptos"/>
                 <w:color w:val="000000"/>
               </w:rPr>
-              <w:t>‘</w:t>
-            </w:r>
-            <w:proofErr w:type="spellStart"/>
-            <w:r>
-              <w:rPr>
-                <w:rFonts w:ascii="Aptos" w:hAnsi="Aptos"/>
-                <w:color w:val="000000"/>
-              </w:rPr>
-              <w:t>PFex</w:t>
-            </w:r>
-            <w:proofErr w:type="spellEnd"/>
-            <w:r>
-              <w:rPr>
-                <w:rFonts w:ascii="Aptos" w:hAnsi="Aptos"/>
-                <w:color w:val="000000"/>
-              </w:rPr>
-              <w:t>’</w:t>
+              <w:t>‘PFex’</w:t>
             </w:r>
           </w:p>
         </w:tc>
@@ -1704,15 +1543,7 @@
               </w:rPr>
             </w:pPr>
             <w:r>
-              <w:t>&lt;</w:t>
-            </w:r>
-            <w:proofErr w:type="spellStart"/>
-            <w:r>
-              <w:t>execution_chunk</w:t>
-            </w:r>
-            <w:proofErr w:type="spellEnd"/>
-            <w:r>
-              <w:t>&gt;</w:t>
+              <w:t>&lt;execution_chunk&gt;</w:t>
             </w:r>
           </w:p>
         </w:tc>
@@ -1885,13 +1716,8 @@
             <w:tcW w:w="3240" w:type="dxa"/>
           </w:tcPr>
           <w:p>
-            <w:proofErr w:type="spellStart"/>
             <w:r>
-              <w:t>zlib</w:t>
-            </w:r>
-            <w:proofErr w:type="spellEnd"/>
-            <w:r>
-              <w:t xml:space="preserve"> 1.3.1 (default algorithm)</w:t>
+              <w:t>zlib 1.3.1 (default algorithm)</w:t>
             </w:r>
           </w:p>
         </w:tc>
@@ -1907,7 +1733,6 @@
       <w:r>
         <w:t>&lt;</w:t>
       </w:r>
-      <w:proofErr w:type="spellStart"/>
       <w:r>
         <w:t>original</w:t>
       </w:r>
@@ -1917,7 +1742,6 @@
       <w:r>
         <w:t>size</w:t>
       </w:r>
-      <w:proofErr w:type="spellEnd"/>
       <w:r>
         <w:t>&gt;</w:t>
       </w:r>
@@ -1951,16 +1775,11 @@
         <w:ind w:left="360"/>
       </w:pPr>
       <w:r>
-        <w:t>&lt;</w:t>
-      </w:r>
-      <w:proofErr w:type="spellStart"/>
-      <w:r>
-        <w:t>compressed_</w:t>
+        <w:t>&lt;compressed_</w:t>
       </w:r>
       <w:r>
         <w:t>size</w:t>
       </w:r>
-      <w:proofErr w:type="spellEnd"/>
       <w:r>
         <w:t>&gt;</w:t>
       </w:r>
@@ -1988,16 +1807,11 @@
       <w:r>
         <w:t>matches &lt;</w:t>
       </w:r>
-      <w:proofErr w:type="spellStart"/>
       <w:r>
         <w:t>original</w:t>
       </w:r>
       <w:r>
-        <w:t>_size</w:t>
-      </w:r>
-      <w:proofErr w:type="spellEnd"/>
-      <w:r>
-        <w:t>&gt;</w:t>
+        <w:t>_size&gt;</w:t>
       </w:r>
       <w:r>
         <w:t>.</w:t>
@@ -2019,15 +1833,7 @@
         <w:t xml:space="preserve">The header chunk </w:t>
       </w:r>
       <w:r>
-        <w:t xml:space="preserve">is the first chunk in the </w:t>
-      </w:r>
-      <w:proofErr w:type="gramStart"/>
-      <w:r>
-        <w:t>file</w:t>
-      </w:r>
-      <w:proofErr w:type="gramEnd"/>
-      <w:r>
-        <w:t xml:space="preserve"> and </w:t>
+        <w:t xml:space="preserve">is the first chunk in the file and </w:t>
       </w:r>
       <w:r>
         <w:t xml:space="preserve">it </w:t>
@@ -2086,7 +1892,6 @@
         </w:rPr>
         <w:t>&lt;</w:t>
       </w:r>
-      <w:proofErr w:type="spellStart"/>
       <w:r>
         <w:rPr>
           <w:b/>
@@ -2099,27 +1904,14 @@
           <w:b/>
           <w:bCs/>
         </w:rPr>
-        <w:t>_chunk</w:t>
-      </w:r>
-      <w:proofErr w:type="spellEnd"/>
-      <w:r>
-        <w:rPr>
-          <w:b/>
-          <w:bCs/>
-        </w:rPr>
-        <w:t>&gt;</w:t>
+        <w:t>_chunk&gt;</w:t>
       </w:r>
       <w:r>
         <w:t xml:space="preserve"> = </w:t>
       </w:r>
       <w:r>
-        <w:t>&lt;</w:t>
-      </w:r>
-      <w:proofErr w:type="spellStart"/>
-      <w:r>
-        <w:t>common_header</w:t>
-      </w:r>
-      <w:proofErr w:type="spellEnd"/>
+        <w:t>&lt;common_header</w:t>
+      </w:r>
       <w:r>
         <w:t>(</w:t>
       </w:r>
@@ -2130,7 +1922,6 @@
         </w:rPr>
         <w:t>‘</w:t>
       </w:r>
-      <w:proofErr w:type="spellStart"/>
       <w:r>
         <w:rPr>
           <w:rFonts w:ascii="Aptos" w:hAnsi="Aptos"/>
@@ -2138,17 +1929,7 @@
           <w:bCs/>
           <w:color w:val="000000"/>
         </w:rPr>
-        <w:t>PFhd</w:t>
-      </w:r>
-      <w:proofErr w:type="spellEnd"/>
-      <w:r>
-        <w:rPr>
-          <w:rFonts w:ascii="Aptos" w:hAnsi="Aptos"/>
-          <w:b/>
-          <w:bCs/>
-          <w:color w:val="000000"/>
-        </w:rPr>
-        <w:t>’</w:t>
+        <w:t>PFhd’</w:t>
       </w:r>
       <w:r>
         <w:rPr>
@@ -2164,72 +1945,70 @@
         <w:t xml:space="preserve"> + </w:t>
       </w:r>
       <w:r>
+        <w:t>&lt;header_data&gt;</w:t>
+      </w:r>
+    </w:p>
+    <w:p>
+      <w:pPr>
+        <w:ind w:left="720" w:hanging="360"/>
+      </w:pPr>
+      <w:r>
+        <w:t xml:space="preserve">&lt;header_data&gt; = </w:t>
+      </w:r>
+      <w:r>
+        <w:br/>
+      </w:r>
+      <w:r>
+        <w:t>&lt;major_version&gt; + &lt;minor_version&gt; + &lt;bbc_model&gt; + &lt;</w:t>
+      </w:r>
+      <w:r>
+        <w:t>total_</w:t>
+      </w:r>
+      <w:r>
+        <w:t>execution_count&gt;</w:t>
+      </w:r>
+    </w:p>
+    <w:p>
+      <w:pPr>
+        <w:ind w:left="360"/>
+      </w:pPr>
+      <w:r>
         <w:t>&lt;</w:t>
       </w:r>
-      <w:proofErr w:type="spellStart"/>
-      <w:r>
-        <w:t>header_data</w:t>
-      </w:r>
-      <w:proofErr w:type="spellEnd"/>
-      <w:r>
-        <w:t>&gt;</w:t>
-      </w:r>
-    </w:p>
-    <w:p>
-      <w:pPr>
-        <w:ind w:left="720" w:hanging="360"/>
+      <w:r>
+        <w:t>major_</w:t>
+      </w:r>
+      <w:r>
+        <w:t>version&gt;</w:t>
+      </w:r>
+      <w:r>
+        <w:t xml:space="preserve"> </w:t>
+      </w:r>
+      <w:r>
+        <w:t>(1 byte) Major version number</w:t>
+      </w:r>
+      <w:r>
+        <w:t>.  Value is 1.</w:t>
+      </w:r>
+    </w:p>
+    <w:p>
+      <w:pPr>
+        <w:ind w:left="360"/>
       </w:pPr>
       <w:r>
         <w:t>&lt;</w:t>
       </w:r>
-      <w:proofErr w:type="spellStart"/>
-      <w:r>
-        <w:t>header_data</w:t>
-      </w:r>
-      <w:proofErr w:type="spellEnd"/>
-      <w:r>
-        <w:t xml:space="preserve">&gt; = </w:t>
-      </w:r>
-      <w:r>
-        <w:br/>
-      </w:r>
-      <w:r>
-        <w:t>&lt;</w:t>
-      </w:r>
-      <w:proofErr w:type="spellStart"/>
-      <w:r>
-        <w:t>major_version</w:t>
-      </w:r>
-      <w:proofErr w:type="spellEnd"/>
-      <w:r>
-        <w:t>&gt; + &lt;</w:t>
-      </w:r>
-      <w:proofErr w:type="spellStart"/>
-      <w:r>
-        <w:t>minor_version</w:t>
-      </w:r>
-      <w:proofErr w:type="spellEnd"/>
-      <w:r>
-        <w:t>&gt; + &lt;</w:t>
-      </w:r>
-      <w:proofErr w:type="spellStart"/>
-      <w:r>
-        <w:t>bbc_model</w:t>
-      </w:r>
-      <w:proofErr w:type="spellEnd"/>
-      <w:r>
-        <w:t>&gt; + &lt;</w:t>
-      </w:r>
-      <w:proofErr w:type="spellStart"/>
-      <w:r>
-        <w:t>total_</w:t>
-      </w:r>
-      <w:r>
-        <w:t>execution_count</w:t>
-      </w:r>
-      <w:proofErr w:type="spellEnd"/>
-      <w:r>
-        <w:t>&gt;</w:t>
+      <w:r>
+        <w:t>minor</w:t>
+      </w:r>
+      <w:r>
+        <w:t>_version&gt; (1 byte) Minor version number</w:t>
+      </w:r>
+      <w:r>
+        <w:t>.  Value is 0</w:t>
+      </w:r>
+      <w:r>
+        <w:t>.</w:t>
       </w:r>
     </w:p>
     <w:p>
@@ -2237,68 +2016,7 @@
         <w:ind w:left="360"/>
       </w:pPr>
       <w:r>
-        <w:t>&lt;</w:t>
-      </w:r>
-      <w:proofErr w:type="spellStart"/>
-      <w:r>
-        <w:t>major_</w:t>
-      </w:r>
-      <w:r>
-        <w:t>version</w:t>
-      </w:r>
-      <w:proofErr w:type="spellEnd"/>
-      <w:r>
-        <w:t>&gt;</w:t>
-      </w:r>
-      <w:r>
-        <w:t xml:space="preserve"> </w:t>
-      </w:r>
-      <w:r>
-        <w:t>(1 byte) Major version number</w:t>
-      </w:r>
-      <w:r>
-        <w:t>.  Value is 1.</w:t>
-      </w:r>
-    </w:p>
-    <w:p>
-      <w:pPr>
-        <w:ind w:left="360"/>
-      </w:pPr>
-      <w:r>
-        <w:t>&lt;</w:t>
-      </w:r>
-      <w:proofErr w:type="spellStart"/>
-      <w:r>
-        <w:t>minor</w:t>
-      </w:r>
-      <w:r>
-        <w:t>_version</w:t>
-      </w:r>
-      <w:proofErr w:type="spellEnd"/>
-      <w:r>
-        <w:t>&gt; (1 byte) Minor version number</w:t>
-      </w:r>
-      <w:r>
-        <w:t>.  Value is 0</w:t>
-      </w:r>
-      <w:r>
-        <w:t>.</w:t>
-      </w:r>
-    </w:p>
-    <w:p>
-      <w:pPr>
-        <w:ind w:left="360"/>
-      </w:pPr>
-      <w:r>
-        <w:t>&lt;</w:t>
-      </w:r>
-      <w:proofErr w:type="spellStart"/>
-      <w:r>
-        <w:t>bbc_model</w:t>
-      </w:r>
-      <w:proofErr w:type="spellEnd"/>
-      <w:r>
-        <w:t>&gt; (1 byte) The BBC model</w:t>
+        <w:t>&lt;bbc_model&gt; (1 byte) The BBC model</w:t>
       </w:r>
     </w:p>
     <w:tbl>
@@ -2726,7 +2444,6 @@
       <w:r>
         <w:t>&lt;</w:t>
       </w:r>
-      <w:proofErr w:type="spellStart"/>
       <w:r>
         <w:t>total_</w:t>
       </w:r>
@@ -2737,11 +2454,7 @@
         <w:t>_</w:t>
       </w:r>
       <w:r>
-        <w:t>count</w:t>
-      </w:r>
-      <w:proofErr w:type="spellEnd"/>
-      <w:r>
-        <w:t xml:space="preserve">&gt; (4 bytes) The total number of </w:t>
+        <w:t xml:space="preserve">count&gt; (4 bytes) The total number of </w:t>
       </w:r>
       <w:r>
         <w:t xml:space="preserve">executed </w:t>
@@ -2796,35 +2509,14 @@
           <w:b/>
           <w:bCs/>
         </w:rPr>
-        <w:t>&lt;</w:t>
-      </w:r>
-      <w:proofErr w:type="spellStart"/>
-      <w:r>
-        <w:rPr>
-          <w:b/>
-          <w:bCs/>
-        </w:rPr>
-        <w:t>labels_chunk</w:t>
-      </w:r>
-      <w:proofErr w:type="spellEnd"/>
-      <w:r>
-        <w:rPr>
-          <w:b/>
-          <w:bCs/>
-        </w:rPr>
-        <w:t>&gt;</w:t>
+        <w:t>&lt;labels_chunk&gt;</w:t>
       </w:r>
       <w:r>
         <w:t xml:space="preserve"> = </w:t>
       </w:r>
       <w:r>
-        <w:t>&lt;</w:t>
-      </w:r>
-      <w:proofErr w:type="spellStart"/>
-      <w:r>
-        <w:t>common_heade</w:t>
-      </w:r>
-      <w:proofErr w:type="spellEnd"/>
+        <w:t>&lt;common_heade</w:t>
+      </w:r>
       <w:r>
         <w:t>(</w:t>
       </w:r>
@@ -2835,7 +2527,6 @@
         </w:rPr>
         <w:t>‘</w:t>
       </w:r>
-      <w:proofErr w:type="spellStart"/>
       <w:r>
         <w:rPr>
           <w:rFonts w:ascii="Aptos" w:hAnsi="Aptos"/>
@@ -2845,7 +2536,6 @@
         </w:rPr>
         <w:t>PFlb</w:t>
       </w:r>
-      <w:proofErr w:type="spellEnd"/>
       <w:r>
         <w:t>’</w:t>
       </w:r>
@@ -2856,16 +2546,11 @@
         <w:t xml:space="preserve">&gt; </w:t>
       </w:r>
       <w:r>
-        <w:t>+ &lt;</w:t>
-      </w:r>
-      <w:proofErr w:type="spellStart"/>
-      <w:r>
-        <w:t>label</w:t>
+        <w:t>+ &lt;label</w:t>
       </w:r>
       <w:r>
         <w:t>_data</w:t>
       </w:r>
-      <w:proofErr w:type="spellEnd"/>
       <w:r>
         <w:t>&gt;</w:t>
       </w:r>
@@ -2875,15 +2560,7 @@
         <w:ind w:left="360"/>
       </w:pPr>
       <w:r>
-        <w:t>&lt;</w:t>
-      </w:r>
-      <w:proofErr w:type="spellStart"/>
-      <w:r>
-        <w:t>label_data</w:t>
-      </w:r>
-      <w:proofErr w:type="spellEnd"/>
-      <w:r>
-        <w:t xml:space="preserve">&gt; = </w:t>
+        <w:t xml:space="preserve">&lt;label_data&gt; = </w:t>
       </w:r>
       <w:r>
         <w:t xml:space="preserve">list of </w:t>
@@ -2904,23 +2581,7 @@
       </w:r>
       <w:bookmarkEnd w:id="0"/>
       <w:r>
-        <w:t>&lt;</w:t>
-      </w:r>
-      <w:proofErr w:type="spellStart"/>
-      <w:r>
-        <w:t>label_address</w:t>
-      </w:r>
-      <w:proofErr w:type="spellEnd"/>
-      <w:r>
-        <w:t>&gt; + &lt;</w:t>
-      </w:r>
-      <w:proofErr w:type="spellStart"/>
-      <w:r>
-        <w:t>label_name</w:t>
-      </w:r>
-      <w:proofErr w:type="spellEnd"/>
-      <w:r>
-        <w:t>&gt;</w:t>
+        <w:t>&lt;label_address&gt; + &lt;label_name&gt;</w:t>
       </w:r>
       <w:r>
         <w:t xml:space="preserve"> </w:t>
@@ -2931,15 +2592,7 @@
         <w:ind w:left="810"/>
       </w:pPr>
       <w:r>
-        <w:t>&lt;</w:t>
-      </w:r>
-      <w:proofErr w:type="spellStart"/>
-      <w:r>
-        <w:t>label_address</w:t>
-      </w:r>
-      <w:proofErr w:type="spellEnd"/>
-      <w:r>
-        <w:t xml:space="preserve">&gt; (2 bytes) </w:t>
+        <w:t xml:space="preserve">&lt;label_address&gt; (2 bytes) </w:t>
       </w:r>
       <w:r>
         <w:t xml:space="preserve">A </w:t>
@@ -3035,7 +2688,6 @@
         </w:rPr>
         <w:t>&lt;</w:t>
       </w:r>
-      <w:proofErr w:type="spellStart"/>
       <w:r>
         <w:rPr>
           <w:b/>
@@ -3048,34 +2700,21 @@
           <w:b/>
           <w:bCs/>
         </w:rPr>
-        <w:t>_chunk</w:t>
-      </w:r>
-      <w:proofErr w:type="spellEnd"/>
+        <w:t>_chunk&gt;</w:t>
+      </w:r>
       <w:r>
         <w:rPr>
           <w:b/>
           <w:bCs/>
         </w:rPr>
-        <w:t>&gt;</w:t>
-      </w:r>
-      <w:r>
-        <w:rPr>
-          <w:b/>
-          <w:bCs/>
-        </w:rPr>
         <w:t xml:space="preserve"> </w:t>
       </w:r>
       <w:r>
-        <w:t>= &lt;</w:t>
-      </w:r>
-      <w:proofErr w:type="spellStart"/>
-      <w:r>
-        <w:t>common_</w:t>
+        <w:t>= &lt;common_</w:t>
       </w:r>
       <w:r>
         <w:t>header</w:t>
       </w:r>
-      <w:proofErr w:type="spellEnd"/>
       <w:r>
         <w:t>(</w:t>
       </w:r>
@@ -3086,7 +2725,6 @@
         </w:rPr>
         <w:t>‘</w:t>
       </w:r>
-      <w:proofErr w:type="spellStart"/>
       <w:r>
         <w:rPr>
           <w:rFonts w:ascii="Aptos" w:hAnsi="Aptos"/>
@@ -3094,45 +2732,27 @@
           <w:bCs/>
           <w:color w:val="000000"/>
         </w:rPr>
-        <w:t>PFss</w:t>
-      </w:r>
-      <w:proofErr w:type="spellEnd"/>
+        <w:t>PFss’</w:t>
+      </w:r>
       <w:r>
         <w:rPr>
           <w:rFonts w:ascii="Aptos" w:hAnsi="Aptos"/>
+          <w:color w:val="000000"/>
+        </w:rPr>
+        <w:t>)</w:t>
+      </w:r>
+      <w:r>
+        <w:t>&gt; +</w:t>
+      </w:r>
+      <w:r>
+        <w:rPr>
           <w:b/>
           <w:bCs/>
-          <w:color w:val="000000"/>
-        </w:rPr>
-        <w:t>’</w:t>
-      </w:r>
-      <w:r>
-        <w:rPr>
-          <w:rFonts w:ascii="Aptos" w:hAnsi="Aptos"/>
-          <w:color w:val="000000"/>
-        </w:rPr>
-        <w:t>)</w:t>
-      </w:r>
-      <w:r>
-        <w:t>&gt; +</w:t>
-      </w:r>
-      <w:r>
-        <w:rPr>
-          <w:b/>
-          <w:bCs/>
         </w:rPr>
         <w:t xml:space="preserve"> </w:t>
       </w:r>
       <w:r>
-        <w:t>&lt;</w:t>
-      </w:r>
-      <w:proofErr w:type="spellStart"/>
-      <w:r>
-        <w:t>snapshot_data</w:t>
-      </w:r>
-      <w:proofErr w:type="spellEnd"/>
-      <w:r>
-        <w:t>&gt;</w:t>
+        <w:t>&lt;snapshot_data&gt;</w:t>
       </w:r>
     </w:p>
     <w:p>
@@ -3140,63 +2760,26 @@
         <w:ind w:left="720" w:hanging="360"/>
       </w:pPr>
       <w:r>
-        <w:t>&lt;</w:t>
-      </w:r>
-      <w:proofErr w:type="spellStart"/>
-      <w:r>
-        <w:t>snapshot_data</w:t>
-      </w:r>
-      <w:proofErr w:type="spellEnd"/>
-      <w:r>
-        <w:t>&gt; =</w:t>
+        <w:t>&lt;snapshot_data&gt; =</w:t>
       </w:r>
       <w:r>
         <w:br/>
-        <w:t>&lt;</w:t>
-      </w:r>
-      <w:proofErr w:type="spellStart"/>
-      <w:r>
-        <w:t>stack_</w:t>
+        <w:t>&lt;stack_</w:t>
       </w:r>
       <w:r>
         <w:t>pointer</w:t>
       </w:r>
-      <w:proofErr w:type="spellEnd"/>
       <w:r>
         <w:t xml:space="preserve">&gt; + </w:t>
       </w:r>
       <w:r>
-        <w:t>&lt;</w:t>
-      </w:r>
-      <w:proofErr w:type="spellStart"/>
-      <w:r>
-        <w:t>rom_paging_register</w:t>
-      </w:r>
-      <w:proofErr w:type="spellEnd"/>
-      <w:r>
-        <w:t>&gt; + &lt;</w:t>
-      </w:r>
-      <w:proofErr w:type="spellStart"/>
-      <w:r>
-        <w:t>acccon</w:t>
-      </w:r>
-      <w:proofErr w:type="spellEnd"/>
-      <w:r>
-        <w:t xml:space="preserve">&gt; + </w:t>
-      </w:r>
-      <w:r>
-        <w:t>&lt;</w:t>
-      </w:r>
-      <w:proofErr w:type="spellStart"/>
-      <w:r>
-        <w:t>hidden_ram_</w:t>
-      </w:r>
-      <w:r>
-        <w:t>address</w:t>
-      </w:r>
-      <w:proofErr w:type="spellEnd"/>
-      <w:r>
-        <w:t>&gt;</w:t>
+        <w:t xml:space="preserve">&lt;rom_paging_register&gt; + &lt;acccon&gt; + </w:t>
+      </w:r>
+      <w:r>
+        <w:t>&lt;hidden_ram_</w:t>
+      </w:r>
+      <w:r>
+        <w:t>address&gt;</w:t>
       </w:r>
       <w:r>
         <w:rPr>
@@ -3210,15 +2793,7 @@
         <w:t xml:space="preserve"> + </w:t>
       </w:r>
       <w:r>
-        <w:t>&lt;6845-registers&gt; + &lt;</w:t>
-      </w:r>
-      <w:proofErr w:type="spellStart"/>
-      <w:r>
-        <w:t>ULA_video_control_register</w:t>
-      </w:r>
-      <w:proofErr w:type="spellEnd"/>
-      <w:r>
-        <w:t xml:space="preserve">&gt; + &lt;ULA_palette&gt; + </w:t>
+        <w:t xml:space="preserve">&lt;6845-registers&gt; + &lt;ULA_video_control_register&gt; + &lt;ULA_palette&gt; + </w:t>
       </w:r>
       <w:r>
         <w:t>&lt;memory&gt;</w:t>
@@ -3229,24 +2804,66 @@
         <w:ind w:left="360"/>
       </w:pPr>
       <w:r>
+        <w:t>&lt;stack_</w:t>
+      </w:r>
+      <w:r>
+        <w:t>pointer</w:t>
+      </w:r>
+      <w:r>
+        <w:t xml:space="preserve">&gt; (1 byte).  The value of the stack </w:t>
+      </w:r>
+      <w:r>
+        <w:t>pointer</w:t>
+      </w:r>
+      <w:r>
+        <w:t>, used to interpret the stack.</w:t>
+      </w:r>
+    </w:p>
+    <w:p>
+      <w:pPr>
+        <w:ind w:left="360"/>
+      </w:pPr>
+      <w:r>
         <w:t>&lt;</w:t>
       </w:r>
-      <w:proofErr w:type="spellStart"/>
-      <w:r>
-        <w:t>stack_</w:t>
-      </w:r>
-      <w:r>
-        <w:t>pointer</w:t>
-      </w:r>
-      <w:proofErr w:type="spellEnd"/>
-      <w:r>
-        <w:t xml:space="preserve">&gt; (1 byte).  The value of the stack </w:t>
-      </w:r>
-      <w:r>
-        <w:t>pointer</w:t>
-      </w:r>
-      <w:r>
-        <w:t>, used to interpret the stack.</w:t>
+      <w:r>
+        <w:t>rom_</w:t>
+      </w:r>
+      <w:r>
+        <w:t>pag</w:t>
+      </w:r>
+      <w:r>
+        <w:t>ing</w:t>
+      </w:r>
+      <w:r>
+        <w:t>_register</w:t>
+      </w:r>
+      <w:r>
+        <w:t>&gt; (1 byte).</w:t>
+      </w:r>
+      <w:r>
+        <w:t xml:space="preserve">  The value </w:t>
+      </w:r>
+      <w:r>
+        <w:t>of the ROM paging register</w:t>
+      </w:r>
+      <w:r>
+        <w:t xml:space="preserve"> (</w:t>
+      </w:r>
+      <w:r>
+        <w:t xml:space="preserve">set </w:t>
+      </w:r>
+      <w:r>
+        <w:t xml:space="preserve">via </w:t>
+      </w:r>
+      <w:r>
+        <w:t>SHEILA address &amp;FE30</w:t>
+      </w:r>
+      <w:r>
+        <w:t>)</w:t>
+      </w:r>
+      <w:r>
+        <w:t>.</w:t>
       </w:r>
     </w:p>
     <w:p>
@@ -3256,40 +2873,91 @@
       <w:r>
         <w:t>&lt;</w:t>
       </w:r>
-      <w:proofErr w:type="spellStart"/>
-      <w:r>
-        <w:t>rom_</w:t>
-      </w:r>
-      <w:r>
-        <w:t>pag</w:t>
-      </w:r>
-      <w:r>
-        <w:t>ing</w:t>
-      </w:r>
-      <w:r>
-        <w:t>_register</w:t>
-      </w:r>
-      <w:proofErr w:type="spellEnd"/>
-      <w:r>
-        <w:t>&gt; (1 byte).</w:t>
-      </w:r>
-      <w:r>
-        <w:t xml:space="preserve">  The value </w:t>
-      </w:r>
-      <w:r>
-        <w:t>of the ROM paging register</w:t>
-      </w:r>
-      <w:r>
-        <w:t xml:space="preserve"> (</w:t>
+      <w:r>
+        <w:t>acccon</w:t>
+      </w:r>
+      <w:r>
+        <w:t>&gt;</w:t>
+      </w:r>
+      <w:r>
+        <w:t xml:space="preserve"> (1 byte).</w:t>
+      </w:r>
+      <w:r>
+        <w:t xml:space="preserve">  The value of the access control register</w:t>
+      </w:r>
+      <w:r>
+        <w:t xml:space="preserve"> (set via </w:t>
+      </w:r>
+      <w:r>
+        <w:t xml:space="preserve">SHEILA address </w:t>
+      </w:r>
+      <w:r>
+        <w:t>&amp;FE34</w:t>
+      </w:r>
+      <w:r>
+        <w:t>)</w:t>
+      </w:r>
+      <w:r>
+        <w:t>.</w:t>
+      </w:r>
+    </w:p>
+    <w:p>
+      <w:pPr>
+        <w:ind w:left="360"/>
+      </w:pPr>
+      <w:r>
+        <w:t>&lt;hidden_ram_address&gt; (1 byte)</w:t>
+      </w:r>
+      <w:r>
+        <w:t xml:space="preserve">.  Populated </w:t>
+      </w:r>
+      <w:r>
+        <w:t>for the</w:t>
+      </w:r>
+      <w:r>
+        <w:t xml:space="preserve"> </w:t>
+      </w:r>
+      <w:r>
+        <w:t xml:space="preserve">BBC Model </w:t>
+      </w:r>
+      <w:r>
+        <w:t>B</w:t>
+      </w:r>
+      <w:r>
+        <w:t xml:space="preserve"> </w:t>
+      </w:r>
+      <w:r>
+        <w:t>Integra</w:t>
+      </w:r>
+      <w:r>
+        <w:t xml:space="preserve">.  </w:t>
+      </w:r>
+      <w:r>
+        <w:t xml:space="preserve">The value contains the </w:t>
+      </w:r>
+      <w:r>
+        <w:t xml:space="preserve">hidden memory address </w:t>
+      </w:r>
+      <w:r>
+        <w:t>(</w:t>
       </w:r>
       <w:r>
         <w:t xml:space="preserve">set </w:t>
       </w:r>
       <w:r>
-        <w:t xml:space="preserve">via </w:t>
-      </w:r>
-      <w:r>
-        <w:t>SHEILA address &amp;FE30</w:t>
+        <w:t>vi</w:t>
+      </w:r>
+      <w:r>
+        <w:t>a</w:t>
+      </w:r>
+      <w:r>
+        <w:t xml:space="preserve"> </w:t>
+      </w:r>
+      <w:r>
+        <w:t xml:space="preserve">SHEILA address </w:t>
+      </w:r>
+      <w:r>
+        <w:t>&amp;FE38</w:t>
       </w:r>
       <w:r>
         <w:t>)</w:t>
@@ -3297,161 +2965,43 @@
       <w:r>
         <w:t>.</w:t>
       </w:r>
+      <w:r>
+        <w:t xml:space="preserve">  Read</w:t>
+      </w:r>
+      <w:r>
+        <w:t>s</w:t>
+      </w:r>
+      <w:r>
+        <w:t xml:space="preserve"> and writes to SHEILA address </w:t>
+      </w:r>
+      <w:r>
+        <w:t>&amp;</w:t>
+      </w:r>
+      <w:r>
+        <w:t xml:space="preserve">FE3C </w:t>
+      </w:r>
+      <w:r>
+        <w:t xml:space="preserve">access </w:t>
+      </w:r>
+      <w:r>
+        <w:t xml:space="preserve">this </w:t>
+      </w:r>
+      <w:r>
+        <w:t xml:space="preserve">hidden </w:t>
+      </w:r>
+      <w:r>
+        <w:t>address</w:t>
+      </w:r>
+      <w:r>
+        <w:t>.</w:t>
+      </w:r>
     </w:p>
     <w:p>
       <w:pPr>
         <w:ind w:left="360"/>
       </w:pPr>
       <w:r>
-        <w:t>&lt;</w:t>
-      </w:r>
-      <w:proofErr w:type="spellStart"/>
-      <w:r>
-        <w:t>acccon</w:t>
-      </w:r>
-      <w:proofErr w:type="spellEnd"/>
-      <w:r>
-        <w:t>&gt;</w:t>
-      </w:r>
-      <w:r>
-        <w:t xml:space="preserve"> (1 byte).</w:t>
-      </w:r>
-      <w:r>
-        <w:t xml:space="preserve">  The value of the access control register</w:t>
-      </w:r>
-      <w:r>
-        <w:t xml:space="preserve"> (set via </w:t>
-      </w:r>
-      <w:r>
-        <w:t xml:space="preserve">SHEILA address </w:t>
-      </w:r>
-      <w:r>
-        <w:t>&amp;FE34</w:t>
-      </w:r>
-      <w:r>
-        <w:t>)</w:t>
-      </w:r>
-      <w:r>
-        <w:t>.</w:t>
-      </w:r>
-    </w:p>
-    <w:p>
-      <w:pPr>
-        <w:ind w:left="360"/>
-      </w:pPr>
-      <w:r>
-        <w:t>&lt;</w:t>
-      </w:r>
-      <w:proofErr w:type="spellStart"/>
-      <w:r>
-        <w:t>hidden_ram_address</w:t>
-      </w:r>
-      <w:proofErr w:type="spellEnd"/>
-      <w:r>
-        <w:t>&gt; (1 byte)</w:t>
-      </w:r>
-      <w:r>
-        <w:t xml:space="preserve">.  Populated </w:t>
-      </w:r>
-      <w:r>
-        <w:t>for the</w:t>
-      </w:r>
-      <w:r>
-        <w:t xml:space="preserve"> </w:t>
-      </w:r>
-      <w:r>
-        <w:t xml:space="preserve">BBC Model </w:t>
-      </w:r>
-      <w:r>
-        <w:t>B</w:t>
-      </w:r>
-      <w:r>
-        <w:t xml:space="preserve"> </w:t>
-      </w:r>
-      <w:r>
-        <w:t>Integra</w:t>
-      </w:r>
-      <w:r>
-        <w:t xml:space="preserve">.  </w:t>
-      </w:r>
-      <w:r>
-        <w:t xml:space="preserve">The value contains the </w:t>
-      </w:r>
-      <w:r>
-        <w:t xml:space="preserve">hidden memory address </w:t>
-      </w:r>
-      <w:r>
-        <w:t>(</w:t>
-      </w:r>
-      <w:r>
-        <w:t xml:space="preserve">set </w:t>
-      </w:r>
-      <w:r>
-        <w:t>vi</w:t>
-      </w:r>
-      <w:r>
-        <w:t>a</w:t>
-      </w:r>
-      <w:r>
-        <w:t xml:space="preserve"> </w:t>
-      </w:r>
-      <w:r>
-        <w:t xml:space="preserve">SHEILA address </w:t>
-      </w:r>
-      <w:r>
-        <w:t>&amp;FE38</w:t>
-      </w:r>
-      <w:r>
-        <w:t>)</w:t>
-      </w:r>
-      <w:r>
-        <w:t>.</w:t>
-      </w:r>
-      <w:r>
-        <w:t xml:space="preserve">  Read</w:t>
-      </w:r>
-      <w:r>
-        <w:t>s</w:t>
-      </w:r>
-      <w:r>
-        <w:t xml:space="preserve"> and writes to SHEILA address </w:t>
-      </w:r>
-      <w:r>
-        <w:t>&amp;</w:t>
-      </w:r>
-      <w:r>
-        <w:t xml:space="preserve">FE3C </w:t>
-      </w:r>
-      <w:r>
-        <w:t xml:space="preserve">access </w:t>
-      </w:r>
-      <w:r>
-        <w:t xml:space="preserve">this </w:t>
-      </w:r>
-      <w:r>
-        <w:t xml:space="preserve">hidden </w:t>
-      </w:r>
-      <w:r>
-        <w:t>address</w:t>
-      </w:r>
-      <w:r>
-        <w:t>.</w:t>
-      </w:r>
-    </w:p>
-    <w:p>
-      <w:pPr>
-        <w:ind w:left="360"/>
-      </w:pPr>
-      <w:r>
-        <w:t>&lt;</w:t>
-      </w:r>
-      <w:proofErr w:type="spellStart"/>
-      <w:r>
-        <w:t>ULA_video_control_register</w:t>
-      </w:r>
-      <w:proofErr w:type="spellEnd"/>
-      <w:r>
-        <w:t>&gt; (1 byte).  The value of the ULA video control register.</w:t>
+        <w:t>&lt;ULA_video_control_register&gt; (1 byte).  The value of the ULA video control register.</w:t>
       </w:r>
     </w:p>
     <w:p>
@@ -3517,38 +3067,20 @@
       <w:r>
         <w:t>&lt;</w:t>
       </w:r>
-      <w:proofErr w:type="spellStart"/>
       <w:r>
         <w:t>base_</w:t>
       </w:r>
       <w:r>
+        <w:t>memory&gt; + &lt;paged_</w:t>
+      </w:r>
+      <w:r>
         <w:t>memory</w:t>
       </w:r>
-      <w:proofErr w:type="spellEnd"/>
-      <w:r>
-        <w:t>&gt; + &lt;</w:t>
-      </w:r>
-      <w:proofErr w:type="spellStart"/>
-      <w:r>
-        <w:t>paged_</w:t>
-      </w:r>
-      <w:r>
-        <w:t>memory</w:t>
-      </w:r>
-      <w:proofErr w:type="spellEnd"/>
       <w:r>
         <w:t xml:space="preserve">&gt; </w:t>
       </w:r>
       <w:r>
-        <w:t>+ &lt;</w:t>
-      </w:r>
-      <w:proofErr w:type="spellStart"/>
-      <w:r>
-        <w:t>shadow_ram</w:t>
-      </w:r>
-      <w:proofErr w:type="spellEnd"/>
-      <w:r>
-        <w:t>&gt;</w:t>
+        <w:t>+ &lt;shadow_ram&gt;</w:t>
       </w:r>
       <w:r>
         <w:rPr>
@@ -3562,15 +3094,7 @@
         <w:t xml:space="preserve"> + </w:t>
       </w:r>
       <w:r>
-        <w:t>&lt;</w:t>
-      </w:r>
-      <w:proofErr w:type="spellStart"/>
-      <w:r>
-        <w:t>mos_ram</w:t>
-      </w:r>
-      <w:proofErr w:type="spellEnd"/>
-      <w:r>
-        <w:t>&gt;</w:t>
+        <w:t>&lt;mos_ram&gt;</w:t>
       </w:r>
       <w:r>
         <w:rPr>
@@ -3592,15 +3116,7 @@
         <w:t xml:space="preserve"> + </w:t>
       </w:r>
       <w:r>
-        <w:t>&lt;</w:t>
-      </w:r>
-      <w:proofErr w:type="spellStart"/>
-      <w:r>
-        <w:t>filing_system_ram</w:t>
-      </w:r>
-      <w:proofErr w:type="spellEnd"/>
-      <w:r>
-        <w:t>&gt;</w:t>
+        <w:t>&lt;filing_system_ram&gt;</w:t>
       </w:r>
       <w:r>
         <w:rPr>
@@ -3614,15 +3130,7 @@
         <w:t xml:space="preserve"> +</w:t>
       </w:r>
       <w:r>
-        <w:t xml:space="preserve"> &lt;</w:t>
-      </w:r>
-      <w:proofErr w:type="spellStart"/>
-      <w:r>
-        <w:t>private_ram</w:t>
-      </w:r>
-      <w:proofErr w:type="spellEnd"/>
-      <w:r>
-        <w:t>&gt;</w:t>
+        <w:t xml:space="preserve"> &lt;private_ram&gt;</w:t>
       </w:r>
       <w:r>
         <w:rPr>
@@ -3633,15 +3141,7 @@
         <w:t>opt</w:t>
       </w:r>
       <w:r>
-        <w:t xml:space="preserve"> + &lt;</w:t>
-      </w:r>
-      <w:proofErr w:type="spellStart"/>
-      <w:r>
-        <w:t>hidden_ram</w:t>
-      </w:r>
-      <w:proofErr w:type="spellEnd"/>
-      <w:r>
-        <w:t>&gt;</w:t>
+        <w:t xml:space="preserve"> + &lt;hidden_ram&gt;</w:t>
       </w:r>
       <w:r>
         <w:rPr>
@@ -3823,15 +3323,7 @@
               <w:ind w:left="1440" w:hanging="1440"/>
             </w:pPr>
             <w:r>
-              <w:t>&lt;</w:t>
-            </w:r>
-            <w:proofErr w:type="spellStart"/>
-            <w:r>
-              <w:t>base_memory</w:t>
-            </w:r>
-            <w:proofErr w:type="spellEnd"/>
-            <w:r>
-              <w:t>&gt;</w:t>
+              <w:t>&lt;base_memory&gt;</w:t>
             </w:r>
           </w:p>
         </w:tc>
@@ -3904,13 +3396,8 @@
             <w:r>
               <w:t>&lt;</w:t>
             </w:r>
-            <w:proofErr w:type="spellStart"/>
             <w:r>
-              <w:t>paged_memory</w:t>
-            </w:r>
-            <w:proofErr w:type="spellEnd"/>
-            <w:r>
-              <w:t>&gt;</w:t>
+              <w:t>paged_memory&gt;</w:t>
             </w:r>
           </w:p>
         </w:tc>
@@ -3981,15 +3468,7 @@
           </w:tcPr>
           <w:p>
             <w:r>
-              <w:t>&lt;</w:t>
-            </w:r>
-            <w:proofErr w:type="spellStart"/>
-            <w:r>
-              <w:t>shadow_ram</w:t>
-            </w:r>
-            <w:proofErr w:type="spellEnd"/>
-            <w:r>
-              <w:t>&gt;</w:t>
+              <w:t>&lt;shadow_ram&gt;</w:t>
             </w:r>
           </w:p>
         </w:tc>
@@ -4053,15 +3532,7 @@
           </w:tcPr>
           <w:p>
             <w:r>
-              <w:t>&lt;</w:t>
-            </w:r>
-            <w:proofErr w:type="spellStart"/>
-            <w:r>
-              <w:t>mos_ram</w:t>
-            </w:r>
-            <w:proofErr w:type="spellEnd"/>
-            <w:r>
-              <w:t>&gt;</w:t>
+              <w:t>&lt;mos_ram&gt;</w:t>
             </w:r>
           </w:p>
         </w:tc>
@@ -4116,15 +3587,7 @@
           </w:tcPr>
           <w:p>
             <w:r>
-              <w:t>&lt;</w:t>
-            </w:r>
-            <w:proofErr w:type="spellStart"/>
-            <w:r>
-              <w:t>filing_system_ram</w:t>
-            </w:r>
-            <w:proofErr w:type="spellEnd"/>
-            <w:r>
-              <w:t>&gt;</w:t>
+              <w:t>&lt;filing_system_ram&gt;</w:t>
             </w:r>
           </w:p>
         </w:tc>
@@ -4180,15 +3643,7 @@
           <w:p>
             <w:r>
               <w:lastRenderedPageBreak/>
-              <w:t>&lt;</w:t>
-            </w:r>
-            <w:proofErr w:type="spellStart"/>
-            <w:r>
-              <w:t>private_ram</w:t>
-            </w:r>
-            <w:proofErr w:type="spellEnd"/>
-            <w:r>
-              <w:t>&gt;</w:t>
+              <w:t>&lt;private_ram&gt;</w:t>
             </w:r>
           </w:p>
         </w:tc>
@@ -4246,15 +3701,7 @@
           </w:tcPr>
           <w:p>
             <w:r>
-              <w:t>&lt;</w:t>
-            </w:r>
-            <w:proofErr w:type="spellStart"/>
-            <w:r>
-              <w:t>hidden_ram</w:t>
-            </w:r>
-            <w:proofErr w:type="spellEnd"/>
-            <w:r>
-              <w:t>&gt;</w:t>
+              <w:t>&lt;hidden_ram&gt;</w:t>
             </w:r>
           </w:p>
         </w:tc>
@@ -4313,66 +3760,46 @@
       <w:r>
         <w:t>&lt;</w:t>
       </w:r>
-      <w:proofErr w:type="spellStart"/>
       <w:r>
         <w:t>base_</w:t>
       </w:r>
       <w:r>
+        <w:t>memory&gt; (64K) The default 64K of memory.</w:t>
+      </w:r>
+      <w:r>
+        <w:t xml:space="preserve">  Addresses 0</w:t>
+      </w:r>
+      <w:r>
+        <w:t xml:space="preserve"> to </w:t>
+      </w:r>
+      <w:r>
+        <w:t>&amp;FFFF.</w:t>
+      </w:r>
+    </w:p>
+    <w:p>
+      <w:pPr>
+        <w:ind w:left="720" w:hanging="360"/>
+      </w:pPr>
+      <w:r>
+        <w:t>&lt;</w:t>
+      </w:r>
+      <w:r>
+        <w:t>paged_</w:t>
+      </w:r>
+      <w:r>
         <w:t>memory</w:t>
       </w:r>
-      <w:proofErr w:type="spellEnd"/>
-      <w:r>
-        <w:t>&gt; (64K) The default 64K of memory.</w:t>
-      </w:r>
-      <w:r>
-        <w:t xml:space="preserve">  Addresses 0</w:t>
-      </w:r>
-      <w:r>
-        <w:t xml:space="preserve"> to </w:t>
-      </w:r>
-      <w:r>
-        <w:t>&amp;FFFF.</w:t>
-      </w:r>
-    </w:p>
-    <w:p>
-      <w:pPr>
-        <w:ind w:left="720" w:hanging="360"/>
-      </w:pPr>
-      <w:r>
-        <w:t>&lt;</w:t>
-      </w:r>
-      <w:proofErr w:type="spellStart"/>
-      <w:r>
-        <w:t>paged_</w:t>
-      </w:r>
-      <w:r>
-        <w:t>memory</w:t>
-      </w:r>
-      <w:proofErr w:type="spellEnd"/>
       <w:r>
         <w:t>&gt;</w:t>
       </w:r>
       <w:r>
-        <w:t xml:space="preserve"> = &lt;</w:t>
-      </w:r>
-      <w:proofErr w:type="spellStart"/>
-      <w:r>
-        <w:t>page_count</w:t>
-      </w:r>
-      <w:proofErr w:type="spellEnd"/>
-      <w:r>
-        <w:t>&gt; + &lt;</w:t>
-      </w:r>
-      <w:proofErr w:type="spellStart"/>
+        <w:t xml:space="preserve"> = &lt;page_count&gt; + &lt;</w:t>
+      </w:r>
       <w:r>
         <w:t>page_</w:t>
       </w:r>
       <w:r>
-        <w:t>data</w:t>
-      </w:r>
-      <w:proofErr w:type="spellEnd"/>
-      <w:r>
-        <w:t>&gt;</w:t>
+        <w:t>data&gt;</w:t>
       </w:r>
       <w:r>
         <w:rPr>
@@ -4399,151 +3826,242 @@
         <w:ind w:left="720"/>
       </w:pPr>
       <w:r>
+        <w:t>&lt;page_count&gt; (1 byte) The number of pages.</w:t>
+      </w:r>
+    </w:p>
+    <w:p>
+      <w:pPr>
+        <w:ind w:left="720"/>
+      </w:pPr>
+      <w:r>
+        <w:t>&lt;page_data&gt; = &lt;page_back&gt; + &lt;page_readonly&gt; + &lt;page_memort&gt;</w:t>
+      </w:r>
+    </w:p>
+    <w:p>
+      <w:pPr>
+        <w:ind w:left="1080"/>
+      </w:pPr>
+      <w:r>
+        <w:t>&lt;page_</w:t>
+      </w:r>
+      <w:r>
+        <w:t>bank</w:t>
+      </w:r>
+      <w:r>
+        <w:t xml:space="preserve">&gt; (1 byte) A page </w:t>
+      </w:r>
+      <w:r>
+        <w:t xml:space="preserve">bank </w:t>
+      </w:r>
+      <w:r>
+        <w:t>id</w:t>
+      </w:r>
+      <w:r>
+        <w:t xml:space="preserve"> (0 to 16).</w:t>
+      </w:r>
+    </w:p>
+    <w:p>
+      <w:pPr>
+        <w:ind w:left="1080"/>
+      </w:pPr>
+      <w:r>
+        <w:t>&lt;page_</w:t>
+      </w:r>
+      <w:r>
+        <w:t>readonly</w:t>
+      </w:r>
+      <w:r>
+        <w:t xml:space="preserve">&gt; (1 byte) A page </w:t>
+      </w:r>
+      <w:r>
+        <w:t>read</w:t>
+      </w:r>
+      <w:r>
+        <w:t>-</w:t>
+      </w:r>
+      <w:r>
+        <w:t>only</w:t>
+      </w:r>
+      <w:r>
+        <w:t xml:space="preserve"> flag.</w:t>
+      </w:r>
+      <w:r>
+        <w:t xml:space="preserve"> </w:t>
+      </w:r>
+      <w:r>
+        <w:t xml:space="preserve"> 0 = </w:t>
+      </w:r>
+      <w:r>
+        <w:t>writable, 1 = read</w:t>
+      </w:r>
+      <w:r>
+        <w:t>-</w:t>
+      </w:r>
+      <w:r>
+        <w:t>only</w:t>
+      </w:r>
+    </w:p>
+    <w:p>
+      <w:pPr>
+        <w:ind w:left="1080"/>
+      </w:pPr>
+      <w:r>
         <w:t>&lt;</w:t>
       </w:r>
-      <w:proofErr w:type="spellStart"/>
-      <w:r>
-        <w:t>page_count</w:t>
-      </w:r>
-      <w:proofErr w:type="spellEnd"/>
-      <w:r>
-        <w:t>&gt; (1 byte) The number of pages.</w:t>
-      </w:r>
-    </w:p>
-    <w:p>
-      <w:pPr>
-        <w:ind w:left="720"/>
-      </w:pPr>
-      <w:r>
-        <w:t>&lt;</w:t>
-      </w:r>
-      <w:proofErr w:type="spellStart"/>
-      <w:r>
-        <w:t>page_data</w:t>
-      </w:r>
-      <w:proofErr w:type="spellEnd"/>
-      <w:r>
-        <w:t>&gt; = &lt;</w:t>
-      </w:r>
-      <w:proofErr w:type="spellStart"/>
-      <w:r>
-        <w:t>page_back</w:t>
-      </w:r>
-      <w:proofErr w:type="spellEnd"/>
-      <w:r>
-        <w:t>&gt; + &lt;</w:t>
-      </w:r>
-      <w:proofErr w:type="spellStart"/>
-      <w:r>
-        <w:t>page_readonly</w:t>
-      </w:r>
-      <w:proofErr w:type="spellEnd"/>
-      <w:r>
-        <w:t>&gt; + &lt;</w:t>
-      </w:r>
-      <w:proofErr w:type="spellStart"/>
-      <w:r>
-        <w:t>page_memort</w:t>
-      </w:r>
-      <w:proofErr w:type="spellEnd"/>
-      <w:r>
-        <w:t>&gt;</w:t>
-      </w:r>
-    </w:p>
-    <w:p>
-      <w:pPr>
-        <w:ind w:left="1080"/>
-      </w:pPr>
-      <w:r>
-        <w:t>&lt;</w:t>
-      </w:r>
-      <w:proofErr w:type="spellStart"/>
-      <w:r>
-        <w:t>page_</w:t>
-      </w:r>
-      <w:r>
-        <w:t>bank</w:t>
-      </w:r>
-      <w:proofErr w:type="spellEnd"/>
-      <w:r>
-        <w:t xml:space="preserve">&gt; (1 byte) A page </w:t>
-      </w:r>
-      <w:r>
-        <w:t xml:space="preserve">bank </w:t>
-      </w:r>
-      <w:r>
-        <w:t>id</w:t>
-      </w:r>
-      <w:r>
-        <w:t xml:space="preserve"> (0 to 16).</w:t>
-      </w:r>
-    </w:p>
-    <w:p>
-      <w:pPr>
-        <w:ind w:left="1080"/>
-      </w:pPr>
-      <w:r>
-        <w:t>&lt;</w:t>
-      </w:r>
-      <w:proofErr w:type="spellStart"/>
-      <w:r>
-        <w:t>page_</w:t>
-      </w:r>
-      <w:r>
-        <w:t>readonly</w:t>
-      </w:r>
-      <w:proofErr w:type="spellEnd"/>
-      <w:r>
-        <w:t xml:space="preserve">&gt; (1 byte) A page </w:t>
-      </w:r>
-      <w:r>
-        <w:t>read</w:t>
-      </w:r>
-      <w:r>
-        <w:t>-</w:t>
-      </w:r>
-      <w:r>
-        <w:t>only</w:t>
-      </w:r>
-      <w:r>
-        <w:t xml:space="preserve"> flag.</w:t>
+      <w:r>
+        <w:t>page_memory</w:t>
+      </w:r>
+      <w:r>
+        <w:t xml:space="preserve">&gt; (16K) </w:t>
+      </w:r>
+      <w:r>
+        <w:t>The memory contents of a page</w:t>
+      </w:r>
+      <w:r>
+        <w:t>.  Addresses &amp;8000 to &amp;BFFF.</w:t>
+      </w:r>
+    </w:p>
+    <w:p>
+      <w:pPr>
+        <w:ind w:left="360"/>
+      </w:pPr>
+      <w:r>
+        <w:t xml:space="preserve">&lt;shadow_ram&gt; (20K) </w:t>
+      </w:r>
+      <w:r>
+        <w:t xml:space="preserve">Populated on Model B Plus, BBC Model </w:t>
+      </w:r>
+      <w:r>
+        <w:t xml:space="preserve">B </w:t>
+      </w:r>
+      <w:r>
+        <w:t>Integra, and BBC Mas</w:t>
+      </w:r>
+      <w:r>
+        <w:t>ter</w:t>
+      </w:r>
+      <w:r>
+        <w:t>.  Addresses &amp;</w:t>
+      </w:r>
+      <w:r>
+        <w:t>3</w:t>
+      </w:r>
+      <w:r>
+        <w:t>000 to &amp;</w:t>
+      </w:r>
+      <w:r>
+        <w:t>7</w:t>
+      </w:r>
+      <w:r>
+        <w:t>FFF.</w:t>
+      </w:r>
+    </w:p>
+    <w:p>
+      <w:pPr>
+        <w:ind w:left="360"/>
+      </w:pPr>
+      <w:r>
+        <w:t xml:space="preserve">&lt;mos_ram&gt; (4K) </w:t>
+      </w:r>
+      <w:r>
+        <w:t>Populated on BBC Master</w:t>
+      </w:r>
+      <w:r>
+        <w:t>.  Addresses &amp;8000 to &amp;</w:t>
+      </w:r>
+      <w:r>
+        <w:t>8FFF</w:t>
+      </w:r>
+      <w:r>
+        <w:t>.</w:t>
+      </w:r>
+    </w:p>
+    <w:p>
+      <w:pPr>
+        <w:ind w:left="360"/>
+      </w:pPr>
+      <w:r>
+        <w:t xml:space="preserve">&lt;filing_system_ram&gt; (8K) </w:t>
+      </w:r>
+      <w:r>
+        <w:t>Populated on BBC Master</w:t>
+      </w:r>
+      <w:r>
+        <w:t xml:space="preserve">.  </w:t>
+      </w:r>
+      <w:r>
+        <w:t>Addresses &amp;</w:t>
+      </w:r>
+      <w:r>
+        <w:t>C</w:t>
+      </w:r>
+      <w:r>
+        <w:t>000 to &amp;</w:t>
+      </w:r>
+      <w:r>
+        <w:t>D</w:t>
+      </w:r>
+      <w:r>
+        <w:t>FFF.</w:t>
+      </w:r>
+    </w:p>
+    <w:p>
+      <w:pPr>
+        <w:ind w:left="360"/>
+      </w:pPr>
+      <w:r>
+        <w:t>&lt;private_ram&gt; (</w:t>
+      </w:r>
+      <w:r>
+        <w:t>12</w:t>
+      </w:r>
+      <w:r>
+        <w:t xml:space="preserve">K) </w:t>
+      </w:r>
+      <w:r>
+        <w:t xml:space="preserve">Populated on </w:t>
+      </w:r>
+      <w:r>
+        <w:t xml:space="preserve">BBC </w:t>
+      </w:r>
+      <w:r>
+        <w:t>Model B Plus</w:t>
+      </w:r>
+      <w:r>
+        <w:t xml:space="preserve"> and </w:t>
+      </w:r>
+      <w:r>
+        <w:t>BBC Model B</w:t>
       </w:r>
       <w:r>
         <w:t xml:space="preserve"> </w:t>
       </w:r>
       <w:r>
-        <w:t xml:space="preserve"> 0 = </w:t>
-      </w:r>
-      <w:r>
-        <w:t>writable, 1 = read</w:t>
-      </w:r>
-      <w:r>
-        <w:t>-</w:t>
-      </w:r>
-      <w:r>
-        <w:t>only</w:t>
-      </w:r>
-    </w:p>
-    <w:p>
-      <w:pPr>
-        <w:ind w:left="1080"/>
-      </w:pPr>
-      <w:r>
-        <w:t>&lt;</w:t>
-      </w:r>
-      <w:proofErr w:type="spellStart"/>
-      <w:r>
-        <w:t>page_memory</w:t>
-      </w:r>
-      <w:proofErr w:type="spellEnd"/>
-      <w:r>
-        <w:t xml:space="preserve">&gt; (16K) </w:t>
-      </w:r>
-      <w:r>
-        <w:t>The memory contents of a page</w:t>
-      </w:r>
-      <w:r>
-        <w:t>.  Addresses &amp;8000 to &amp;BFFF.</w:t>
+        <w:t>Integra</w:t>
+      </w:r>
+      <w:r>
+        <w:t>.</w:t>
+      </w:r>
+      <w:r>
+        <w:t xml:space="preserve"> </w:t>
+      </w:r>
+      <w:r>
+        <w:t>Addresses &amp;</w:t>
+      </w:r>
+      <w:r>
+        <w:t>8</w:t>
+      </w:r>
+      <w:r>
+        <w:t>000 to &amp;</w:t>
+      </w:r>
+      <w:r>
+        <w:t>A</w:t>
+      </w:r>
+      <w:r>
+        <w:t>FFF.</w:t>
+      </w:r>
+      <w:r>
+        <w:t xml:space="preserve"> </w:t>
       </w:r>
     </w:p>
     <w:p>
@@ -4551,192 +4069,7 @@
         <w:ind w:left="360"/>
       </w:pPr>
       <w:r>
-        <w:t>&lt;</w:t>
-      </w:r>
-      <w:proofErr w:type="spellStart"/>
-      <w:r>
-        <w:t>shadow_ram</w:t>
-      </w:r>
-      <w:proofErr w:type="spellEnd"/>
-      <w:r>
-        <w:t xml:space="preserve">&gt; (20K) </w:t>
-      </w:r>
-      <w:r>
-        <w:t xml:space="preserve">Populated on Model B Plus, BBC Model </w:t>
-      </w:r>
-      <w:r>
-        <w:t xml:space="preserve">B </w:t>
-      </w:r>
-      <w:r>
-        <w:t>Integra, and BBC Mas</w:t>
-      </w:r>
-      <w:r>
-        <w:t>ter</w:t>
-      </w:r>
-      <w:r>
-        <w:t>.  Addresses &amp;</w:t>
-      </w:r>
-      <w:r>
-        <w:t>3</w:t>
-      </w:r>
-      <w:r>
-        <w:t>000 to &amp;</w:t>
-      </w:r>
-      <w:r>
-        <w:t>7</w:t>
-      </w:r>
-      <w:r>
-        <w:t>FFF.</w:t>
-      </w:r>
-    </w:p>
-    <w:p>
-      <w:pPr>
-        <w:ind w:left="360"/>
-      </w:pPr>
-      <w:r>
-        <w:t>&lt;</w:t>
-      </w:r>
-      <w:proofErr w:type="spellStart"/>
-      <w:r>
-        <w:t>mos_ram</w:t>
-      </w:r>
-      <w:proofErr w:type="spellEnd"/>
-      <w:r>
-        <w:t xml:space="preserve">&gt; (4K) </w:t>
-      </w:r>
-      <w:r>
-        <w:t>Populated on BBC Master</w:t>
-      </w:r>
-      <w:r>
-        <w:t>.  Addresses &amp;8000 to &amp;</w:t>
-      </w:r>
-      <w:r>
-        <w:t>8FFF</w:t>
-      </w:r>
-      <w:r>
-        <w:t>.</w:t>
-      </w:r>
-    </w:p>
-    <w:p>
-      <w:pPr>
-        <w:ind w:left="360"/>
-      </w:pPr>
-      <w:r>
-        <w:t>&lt;</w:t>
-      </w:r>
-      <w:proofErr w:type="spellStart"/>
-      <w:r>
-        <w:t>filing_system_ram</w:t>
-      </w:r>
-      <w:proofErr w:type="spellEnd"/>
-      <w:r>
-        <w:t xml:space="preserve">&gt; (8K) </w:t>
-      </w:r>
-      <w:r>
-        <w:t>Populated on BBC Master</w:t>
-      </w:r>
-      <w:r>
-        <w:t xml:space="preserve">.  </w:t>
-      </w:r>
-      <w:r>
-        <w:t>Addresses &amp;</w:t>
-      </w:r>
-      <w:r>
-        <w:t>C</w:t>
-      </w:r>
-      <w:r>
-        <w:t>000 to &amp;</w:t>
-      </w:r>
-      <w:r>
-        <w:t>D</w:t>
-      </w:r>
-      <w:r>
-        <w:t>FFF.</w:t>
-      </w:r>
-    </w:p>
-    <w:p>
-      <w:pPr>
-        <w:ind w:left="360"/>
-      </w:pPr>
-      <w:r>
-        <w:t>&lt;</w:t>
-      </w:r>
-      <w:proofErr w:type="spellStart"/>
-      <w:r>
-        <w:t>private_ram</w:t>
-      </w:r>
-      <w:proofErr w:type="spellEnd"/>
-      <w:r>
-        <w:t>&gt; (</w:t>
-      </w:r>
-      <w:r>
-        <w:t>12</w:t>
-      </w:r>
-      <w:r>
-        <w:t xml:space="preserve">K) </w:t>
-      </w:r>
-      <w:r>
-        <w:t xml:space="preserve">Populated on </w:t>
-      </w:r>
-      <w:r>
-        <w:t xml:space="preserve">BBC </w:t>
-      </w:r>
-      <w:r>
-        <w:t>Model B Plus</w:t>
-      </w:r>
-      <w:r>
-        <w:t xml:space="preserve"> and </w:t>
-      </w:r>
-      <w:r>
-        <w:t>BBC Model B</w:t>
-      </w:r>
-      <w:r>
-        <w:t xml:space="preserve"> </w:t>
-      </w:r>
-      <w:r>
-        <w:t>Integra</w:t>
-      </w:r>
-      <w:proofErr w:type="gramStart"/>
-      <w:r>
-        <w:t>.</w:t>
-      </w:r>
-      <w:r>
-        <w:t xml:space="preserve"> </w:t>
-      </w:r>
-      <w:proofErr w:type="gramEnd"/>
-      <w:r>
-        <w:t>Addresses &amp;</w:t>
-      </w:r>
-      <w:r>
-        <w:t>8</w:t>
-      </w:r>
-      <w:r>
-        <w:t>000 to &amp;</w:t>
-      </w:r>
-      <w:r>
-        <w:t>A</w:t>
-      </w:r>
-      <w:r>
-        <w:t>FFF.</w:t>
-      </w:r>
-      <w:r>
-        <w:t xml:space="preserve"> </w:t>
-      </w:r>
-    </w:p>
-    <w:p>
-      <w:pPr>
-        <w:ind w:left="360"/>
-      </w:pPr>
-      <w:r>
-        <w:t>&lt;</w:t>
-      </w:r>
-      <w:proofErr w:type="spellStart"/>
-      <w:r>
-        <w:t>hidden_ram</w:t>
-      </w:r>
-      <w:proofErr w:type="spellEnd"/>
-      <w:r>
-        <w:t xml:space="preserve">&gt; (256 bytes) </w:t>
+        <w:t xml:space="preserve">&lt;hidden_ram&gt; (256 bytes) </w:t>
       </w:r>
       <w:r>
         <w:t>Populated on BBC Model Integra B.</w:t>
@@ -4821,32 +4154,11 @@
           <w:b/>
           <w:bCs/>
         </w:rPr>
-        <w:t>&lt;</w:t>
-      </w:r>
-      <w:proofErr w:type="spellStart"/>
-      <w:r>
-        <w:rPr>
-          <w:b/>
-          <w:bCs/>
-        </w:rPr>
-        <w:t>execution_chunk</w:t>
-      </w:r>
-      <w:proofErr w:type="spellEnd"/>
-      <w:r>
-        <w:rPr>
-          <w:b/>
-          <w:bCs/>
-        </w:rPr>
-        <w:t>&gt;</w:t>
-      </w:r>
-      <w:r>
-        <w:t xml:space="preserve"> = &lt;</w:t>
-      </w:r>
-      <w:proofErr w:type="spellStart"/>
-      <w:r>
-        <w:t>common_header</w:t>
-      </w:r>
-      <w:proofErr w:type="spellEnd"/>
+        <w:t>&lt;execution_chunk&gt;</w:t>
+      </w:r>
+      <w:r>
+        <w:t xml:space="preserve"> = &lt;common_header</w:t>
+      </w:r>
       <w:r>
         <w:t>(</w:t>
       </w:r>
@@ -4857,7 +4169,6 @@
         </w:rPr>
         <w:t>‘</w:t>
       </w:r>
-      <w:proofErr w:type="spellStart"/>
       <w:r>
         <w:rPr>
           <w:rFonts w:ascii="Aptos" w:hAnsi="Aptos"/>
@@ -4865,94 +4176,68 @@
           <w:bCs/>
           <w:color w:val="000000"/>
         </w:rPr>
-        <w:t>PFex</w:t>
-      </w:r>
-      <w:proofErr w:type="spellEnd"/>
+        <w:t>PFex’</w:t>
+      </w:r>
       <w:r>
         <w:rPr>
           <w:rFonts w:ascii="Aptos" w:hAnsi="Aptos"/>
+          <w:color w:val="000000"/>
+        </w:rPr>
+        <w:t>)</w:t>
+      </w:r>
+      <w:r>
+        <w:t>&gt; + &lt;execution_data&gt;</w:t>
+      </w:r>
+    </w:p>
+    <w:p>
+      <w:pPr>
+        <w:ind w:left="360"/>
+      </w:pPr>
+      <w:r>
+        <w:t xml:space="preserve">&lt;execution_data&gt; = </w:t>
+      </w:r>
+      <w:r>
+        <w:t xml:space="preserve">list of </w:t>
+      </w:r>
+      <w:r>
+        <w:rPr>
           <w:b/>
           <w:bCs/>
-          <w:color w:val="000000"/>
-        </w:rPr>
-        <w:t>’</w:t>
-      </w:r>
-      <w:r>
-        <w:rPr>
-          <w:rFonts w:ascii="Aptos" w:hAnsi="Aptos"/>
-          <w:color w:val="000000"/>
-        </w:rPr>
-        <w:t>)</w:t>
-      </w:r>
-      <w:r>
-        <w:t>&gt; + &lt;</w:t>
-      </w:r>
-      <w:proofErr w:type="spellStart"/>
-      <w:r>
-        <w:t>execution_data</w:t>
-      </w:r>
-      <w:proofErr w:type="spellEnd"/>
-      <w:r>
-        <w:t>&gt;</w:t>
-      </w:r>
-    </w:p>
-    <w:p>
-      <w:pPr>
-        <w:ind w:left="360"/>
-      </w:pPr>
-      <w:r>
-        <w:t>&lt;</w:t>
-      </w:r>
-      <w:proofErr w:type="spellStart"/>
-      <w:r>
-        <w:t>execution_data</w:t>
-      </w:r>
-      <w:proofErr w:type="spellEnd"/>
-      <w:r>
-        <w:t xml:space="preserve">&gt; = </w:t>
-      </w:r>
-      <w:r>
-        <w:t xml:space="preserve">list of </w:t>
+        </w:rPr>
+        <w:t>&lt;interrupt&gt;</w:t>
+      </w:r>
+      <w:r>
+        <w:t xml:space="preserve"> </w:t>
+      </w:r>
+      <w:r>
+        <w:t>and/or</w:t>
+      </w:r>
+      <w:r>
+        <w:t xml:space="preserve"> </w:t>
       </w:r>
       <w:r>
         <w:rPr>
           <w:b/>
           <w:bCs/>
         </w:rPr>
-        <w:t>&lt;interrupt&gt;</w:t>
-      </w:r>
-      <w:r>
-        <w:t xml:space="preserve"> </w:t>
-      </w:r>
-      <w:r>
-        <w:t>and/or</w:t>
-      </w:r>
-      <w:r>
-        <w:t xml:space="preserve"> </w:t>
-      </w:r>
+        <w:t>&lt;instruction&gt;</w:t>
+      </w:r>
+      <w:r>
+        <w:t>, where</w:t>
+      </w:r>
+      <w:r>
+        <w:t>:</w:t>
+      </w:r>
+    </w:p>
+    <w:p>
+      <w:pPr>
+        <w:ind w:left="720" w:hanging="360"/>
+      </w:pPr>
       <w:r>
         <w:rPr>
           <w:b/>
           <w:bCs/>
         </w:rPr>
-        <w:t>&lt;instruction&gt;</w:t>
-      </w:r>
-      <w:r>
-        <w:t>, where</w:t>
-      </w:r>
-      <w:r>
-        <w:t>:</w:t>
-      </w:r>
-    </w:p>
-    <w:p>
-      <w:pPr>
-        <w:ind w:left="720" w:hanging="360"/>
-      </w:pPr>
-      <w:r>
-        <w:rPr>
-          <w:b/>
-          <w:bCs/>
-        </w:rPr>
         <w:t>&lt;interrupt&gt;</w:t>
       </w:r>
       <w:r>
@@ -4962,20 +4247,11 @@
         <w:br/>
       </w:r>
       <w:r>
+        <w:t xml:space="preserve">&lt;interrupt_marker&gt; + </w:t>
+      </w:r>
+      <w:r>
         <w:t>&lt;</w:t>
       </w:r>
-      <w:proofErr w:type="spellStart"/>
-      <w:r>
-        <w:t>interrupt_marker</w:t>
-      </w:r>
-      <w:proofErr w:type="spellEnd"/>
-      <w:r>
-        <w:t xml:space="preserve">&gt; + </w:t>
-      </w:r>
-      <w:r>
-        <w:t>&lt;</w:t>
-      </w:r>
-      <w:proofErr w:type="spellStart"/>
       <w:r>
         <w:t>address</w:t>
       </w:r>
@@ -4985,13 +4261,8 @@
       <w:r>
         <w:t>service_routine</w:t>
       </w:r>
-      <w:proofErr w:type="spellEnd"/>
-      <w:r>
-        <w:t>&gt; + &lt;</w:t>
-      </w:r>
-      <w:proofErr w:type="spellStart"/>
-      <w:r>
-        <w:t>address</w:t>
+      <w:r>
+        <w:t>&gt; + &lt;address</w:t>
       </w:r>
       <w:r>
         <w:t>_</w:t>
@@ -4999,20 +4270,11 @@
       <w:r>
         <w:t>interrupted</w:t>
       </w:r>
-      <w:proofErr w:type="spellEnd"/>
       <w:r>
         <w:t>&gt; +</w:t>
       </w:r>
       <w:r>
-        <w:t xml:space="preserve"> &lt;</w:t>
-      </w:r>
-      <w:proofErr w:type="spellStart"/>
-      <w:r>
-        <w:t>stack_pointer</w:t>
-      </w:r>
-      <w:proofErr w:type="spellEnd"/>
-      <w:r>
-        <w:t>&gt;</w:t>
+        <w:t xml:space="preserve"> &lt;stack_pointer&gt;</w:t>
       </w:r>
     </w:p>
     <w:p>
@@ -5020,15 +4282,7 @@
         <w:ind w:left="720"/>
       </w:pPr>
       <w:r>
-        <w:t>&lt;</w:t>
-      </w:r>
-      <w:proofErr w:type="spellStart"/>
-      <w:r>
-        <w:t>interrupt_marker</w:t>
-      </w:r>
-      <w:proofErr w:type="spellEnd"/>
-      <w:r>
-        <w:t>&gt; (2 bytes).  A two-byte value that distinguishes a &lt;interrupt&gt; from a &lt;instruction&gt;.</w:t>
+        <w:t>&lt;interrupt_marker&gt; (2 bytes).  A two-byte value that distinguishes a &lt;interrupt&gt; from a &lt;instruction&gt;.</w:t>
       </w:r>
       <w:r>
         <w:t xml:space="preserve"> </w:t>
@@ -5208,15 +4462,7 @@
         <w:ind w:left="720"/>
       </w:pPr>
       <w:r>
-        <w:t>&lt;</w:t>
-      </w:r>
-      <w:proofErr w:type="spellStart"/>
-      <w:r>
-        <w:t>address_service_routine</w:t>
-      </w:r>
-      <w:proofErr w:type="spellEnd"/>
-      <w:r>
-        <w:t>&gt; (2 bytes).  The address of the interrupt service routine.</w:t>
+        <w:t>&lt;address_service_routine&gt; (2 bytes).  The address of the interrupt service routine.</w:t>
       </w:r>
     </w:p>
     <w:p>
@@ -5224,16 +4470,11 @@
         <w:ind w:left="720"/>
       </w:pPr>
       <w:r>
-        <w:t>&lt;</w:t>
-      </w:r>
-      <w:proofErr w:type="spellStart"/>
-      <w:r>
-        <w:t>address_</w:t>
+        <w:t>&lt;address_</w:t>
       </w:r>
       <w:r>
         <w:t>interrupted</w:t>
       </w:r>
-      <w:proofErr w:type="spellEnd"/>
       <w:r>
         <w:t xml:space="preserve"> &gt; (2 bytes).  The address of </w:t>
       </w:r>
@@ -5249,15 +4490,7 @@
         <w:ind w:left="720"/>
       </w:pPr>
       <w:r>
-        <w:t>&lt;</w:t>
-      </w:r>
-      <w:proofErr w:type="spellStart"/>
-      <w:r>
-        <w:t>cycle_count</w:t>
-      </w:r>
-      <w:proofErr w:type="spellEnd"/>
-      <w:r>
-        <w:t xml:space="preserve">&gt; </w:t>
+        <w:t xml:space="preserve">&lt;cycle_count&gt; </w:t>
       </w:r>
       <w:r>
         <w:t>(1 byte) S</w:t>
@@ -5271,15 +4504,7 @@
         <w:ind w:left="720"/>
       </w:pPr>
       <w:r>
-        <w:t>&lt;</w:t>
-      </w:r>
-      <w:proofErr w:type="spellStart"/>
-      <w:r>
-        <w:t>stack_pointer</w:t>
-      </w:r>
-      <w:proofErr w:type="spellEnd"/>
-      <w:r>
-        <w:t xml:space="preserve">&gt; </w:t>
+        <w:t xml:space="preserve">&lt;stack_pointer&gt; </w:t>
       </w:r>
       <w:r>
         <w:t>(1 bytes) S</w:t>
@@ -5313,16 +4538,11 @@
       <w:r>
         <w:t>&lt;</w:t>
       </w:r>
-      <w:proofErr w:type="spellStart"/>
       <w:r>
         <w:t>opcode_</w:t>
       </w:r>
       <w:r>
-        <w:t>address</w:t>
-      </w:r>
-      <w:proofErr w:type="spellEnd"/>
-      <w:r>
-        <w:t>&gt; + &lt;opcode&gt; + &lt;operand&gt;</w:t>
+        <w:t>address&gt; + &lt;opcode&gt; + &lt;operand&gt;</w:t>
       </w:r>
       <w:r>
         <w:rPr>
@@ -5349,13 +4569,8 @@
       <w:r>
         <w:t>&lt;</w:t>
       </w:r>
-      <w:proofErr w:type="spellStart"/>
-      <w:r>
-        <w:t>stack_pointer</w:t>
-      </w:r>
-      <w:proofErr w:type="spellEnd"/>
-      <w:r>
-        <w:t>&gt;</w:t>
+      <w:r>
+        <w:t>stack_pointer&gt;</w:t>
       </w:r>
       <w:r>
         <w:rPr>
@@ -5369,15 +4584,7 @@
         <w:t xml:space="preserve"> + </w:t>
       </w:r>
       <w:r>
-        <w:t>&lt;</w:t>
-      </w:r>
-      <w:proofErr w:type="spellStart"/>
-      <w:r>
-        <w:t>return_address</w:t>
-      </w:r>
-      <w:proofErr w:type="spellEnd"/>
-      <w:r>
-        <w:t>&gt;</w:t>
+        <w:t>&lt;return_address&gt;</w:t>
       </w:r>
       <w:r>
         <w:rPr>
@@ -5402,15 +4609,7 @@
         <w:t xml:space="preserve">+ </w:t>
       </w:r>
       <w:r>
-        <w:t>&lt;</w:t>
-      </w:r>
-      <w:proofErr w:type="spellStart"/>
-      <w:r>
-        <w:t>memory_address</w:t>
-      </w:r>
-      <w:proofErr w:type="spellEnd"/>
-      <w:r>
-        <w:t>&gt;</w:t>
+        <w:t>&lt;memory_address&gt;</w:t>
       </w:r>
       <w:r>
         <w:rPr>
@@ -5431,7 +4630,6 @@
       <w:r>
         <w:t xml:space="preserve"> &lt;</w:t>
       </w:r>
-      <w:proofErr w:type="spellStart"/>
       <w:r>
         <w:t>memory</w:t>
       </w:r>
@@ -5441,7 +4639,6 @@
       <w:r>
         <w:t>_value</w:t>
       </w:r>
-      <w:proofErr w:type="spellEnd"/>
       <w:r>
         <w:t>&gt;</w:t>
       </w:r>
@@ -5464,11 +4661,9 @@
       <w:r>
         <w:t>+ &lt;</w:t>
       </w:r>
-      <w:proofErr w:type="spellStart"/>
       <w:r>
         <w:t>memory_write_value</w:t>
       </w:r>
-      <w:proofErr w:type="spellEnd"/>
       <w:r>
         <w:t>&gt;</w:t>
       </w:r>
@@ -5488,16 +4683,11 @@
       <w:r>
         <w:t>&lt;</w:t>
       </w:r>
-      <w:proofErr w:type="spellStart"/>
       <w:r>
         <w:t>opcode_</w:t>
       </w:r>
       <w:r>
-        <w:t>address</w:t>
-      </w:r>
-      <w:proofErr w:type="spellEnd"/>
-      <w:r>
-        <w:t>&gt;</w:t>
+        <w:t>address&gt;</w:t>
       </w:r>
       <w:r>
         <w:t xml:space="preserve"> </w:t>
@@ -5745,7 +4935,6 @@
             <w:r>
               <w:t>&amp;</w:t>
             </w:r>
-            <w:proofErr w:type="gramStart"/>
             <w:r>
               <w:t>8</w:t>
             </w:r>
@@ -5755,7 +4944,6 @@
             <w:r>
               <w:t>..</w:t>
             </w:r>
-            <w:proofErr w:type="gramEnd"/>
             <w:r>
               <w:t>&amp;</w:t>
             </w:r>
@@ -5836,15 +5024,7 @@
               <w:t xml:space="preserve"> </w:t>
             </w:r>
             <w:r>
-              <w:t>&amp;</w:t>
-            </w:r>
-            <w:proofErr w:type="gramStart"/>
-            <w:r>
-              <w:t>0000..</w:t>
-            </w:r>
-            <w:proofErr w:type="gramEnd"/>
-            <w:r>
-              <w:t>&amp;7F</w:t>
+              <w:t>&amp;0000..&amp;7F</w:t>
             </w:r>
             <w:r>
               <w:t>FF</w:t>
@@ -5859,14 +5039,12 @@
             <w:pPr>
               <w:jc w:val="center"/>
             </w:pPr>
-            <w:proofErr w:type="gramStart"/>
             <w:r>
               <w:t>0..</w:t>
             </w:r>
             <w:r>
               <w:t>&amp;</w:t>
             </w:r>
-            <w:proofErr w:type="gramEnd"/>
             <w:r>
               <w:t>7F</w:t>
             </w:r>
@@ -5880,14 +5058,12 @@
             <w:pPr>
               <w:jc w:val="center"/>
             </w:pPr>
-            <w:proofErr w:type="gramStart"/>
             <w:r>
               <w:t>0..</w:t>
             </w:r>
             <w:r>
               <w:t>&amp;</w:t>
             </w:r>
-            <w:proofErr w:type="gramEnd"/>
             <w:r>
               <w:t>FF</w:t>
             </w:r>
@@ -5931,15 +5107,7 @@
               <w:t>:</w:t>
             </w:r>
             <w:r>
-              <w:t xml:space="preserve"> &amp;</w:t>
-            </w:r>
-            <w:proofErr w:type="gramStart"/>
-            <w:r>
-              <w:t>8000..</w:t>
-            </w:r>
-            <w:proofErr w:type="gramEnd"/>
-            <w:r>
-              <w:t>&amp;FFFF</w:t>
+              <w:t xml:space="preserve"> &amp;8000..&amp;FFFF</w:t>
             </w:r>
           </w:p>
         </w:tc>
@@ -5970,11 +5138,9 @@
             <w:r>
               <w:t>&amp;</w:t>
             </w:r>
-            <w:proofErr w:type="gramStart"/>
             <w:r>
               <w:t>80..</w:t>
             </w:r>
-            <w:proofErr w:type="gramEnd"/>
             <w:r>
               <w:t>&amp;</w:t>
             </w:r>
@@ -5991,14 +5157,12 @@
             <w:pPr>
               <w:jc w:val="center"/>
             </w:pPr>
-            <w:proofErr w:type="gramStart"/>
             <w:r>
               <w:t>0..</w:t>
             </w:r>
             <w:r>
               <w:t>&amp;</w:t>
             </w:r>
-            <w:proofErr w:type="gramEnd"/>
             <w:r>
               <w:t>FF</w:t>
             </w:r>
@@ -6749,15 +5913,7 @@
         </w:rPr>
       </w:pPr>
       <w:r>
-        <w:t>&lt;</w:t>
-      </w:r>
-      <w:proofErr w:type="spellStart"/>
-      <w:r>
-        <w:t>stack_pointer</w:t>
-      </w:r>
-      <w:proofErr w:type="spellEnd"/>
-      <w:r>
-        <w:t xml:space="preserve">&gt; (1 byte) Populated for </w:t>
+        <w:t xml:space="preserve">&lt;stack_pointer&gt; (1 byte) Populated for </w:t>
       </w:r>
       <w:r>
         <w:t xml:space="preserve">opcodes </w:t>
@@ -6819,15 +5975,7 @@
         <w:ind w:left="720"/>
       </w:pPr>
       <w:r>
-        <w:t>&lt;</w:t>
-      </w:r>
-      <w:proofErr w:type="spellStart"/>
-      <w:r>
-        <w:t>return_address</w:t>
-      </w:r>
-      <w:proofErr w:type="spellEnd"/>
-      <w:r>
-        <w:t xml:space="preserve">&gt; (2 bytes) Populated for the </w:t>
+        <w:t xml:space="preserve">&lt;return_address&gt; (2 bytes) Populated for the </w:t>
       </w:r>
       <w:r>
         <w:rPr>
@@ -6867,15 +6015,7 @@
         <w:ind w:left="720"/>
       </w:pPr>
       <w:r>
-        <w:t>&lt;</w:t>
-      </w:r>
-      <w:proofErr w:type="spellStart"/>
-      <w:r>
-        <w:t>memory_address</w:t>
-      </w:r>
-      <w:proofErr w:type="spellEnd"/>
-      <w:r>
-        <w:t>&gt; (2 bytes) Populated for all opcodes that use the following addressing modes:</w:t>
+        <w:t>&lt;memory_address&gt; (2 bytes) Populated for all opcodes that use the following addressing modes:</w:t>
       </w:r>
     </w:p>
     <w:p>
@@ -7086,16 +6226,11 @@
         <w:ind w:left="720"/>
       </w:pPr>
       <w:r>
-        <w:t>&lt;</w:t>
-      </w:r>
-      <w:proofErr w:type="spellStart"/>
-      <w:r>
-        <w:t>memory</w:t>
+        <w:t>&lt;memory</w:t>
       </w:r>
       <w:r>
         <w:t>_read_value</w:t>
       </w:r>
-      <w:proofErr w:type="spellEnd"/>
       <w:r>
         <w:t xml:space="preserve">&gt; (1 byte) Populated for </w:t>
       </w:r>
@@ -7160,26 +6295,10 @@
         <w:ind w:left="720"/>
       </w:pPr>
       <w:r>
-        <w:t>&lt;</w:t>
-      </w:r>
-      <w:proofErr w:type="spellStart"/>
-      <w:r>
-        <w:t>memory_write_value</w:t>
-      </w:r>
-      <w:proofErr w:type="spellEnd"/>
-      <w:r>
-        <w:t xml:space="preserve">&gt; (1 byte) Populated for </w:t>
-      </w:r>
-      <w:proofErr w:type="gramStart"/>
-      <w:r>
-        <w:t xml:space="preserve">opcodes that </w:t>
-      </w:r>
-      <w:r>
-        <w:t>write</w:t>
-      </w:r>
-      <w:proofErr w:type="gramEnd"/>
-      <w:r>
-        <w:t xml:space="preserve"> to </w:t>
+        <w:t xml:space="preserve">&lt;memory_write_value&gt; (1 byte) Populated for opcodes that </w:t>
+      </w:r>
+      <w:r>
+        <w:t xml:space="preserve">write to </w:t>
       </w:r>
       <w:r>
         <w:t>an address</w:t>
@@ -7202,16 +6321,11 @@
       <w:r>
         <w:t>attempted to be written</w:t>
       </w:r>
-      <w:proofErr w:type="gramStart"/>
       <w:r>
         <w:t>.</w:t>
       </w:r>
       <w:r>
-        <w:t xml:space="preserve"> </w:t>
-      </w:r>
-      <w:proofErr w:type="gramEnd"/>
-      <w:r>
-        <w:t xml:space="preserve">This includes </w:t>
+        <w:t xml:space="preserve"> This includes </w:t>
       </w:r>
       <w:r>
         <w:lastRenderedPageBreak/>
@@ -7252,7 +6366,6 @@
       </w:r>
     </w:p>
     <w:p>
-      <w:proofErr w:type="gramStart"/>
       <w:r>
         <w:t xml:space="preserve">A </w:t>
       </w:r>
@@ -7263,7 +6376,6 @@
         </w:rPr>
         <w:t>.perf</w:t>
       </w:r>
-      <w:proofErr w:type="gramEnd"/>
       <w:r>
         <w:t xml:space="preserve"> </w:t>
       </w:r>
@@ -7412,7 +6524,6 @@
       <w:r>
         <w:t xml:space="preserve">a </w:t>
       </w:r>
-      <w:proofErr w:type="spellStart"/>
       <w:r>
         <w:rPr>
           <w:b/>
@@ -7420,7 +6531,6 @@
         </w:rPr>
         <w:t>PerfWriter</w:t>
       </w:r>
-      <w:proofErr w:type="spellEnd"/>
       <w:r>
         <w:t xml:space="preserve"> class</w:t>
       </w:r>
@@ -7772,7 +6882,6 @@
       <w:pPr>
         <w:pStyle w:val="Heading1"/>
       </w:pPr>
-      <w:proofErr w:type="spellStart"/>
       <w:r>
         <w:t>Bee</w:t>
       </w:r>
@@ -7782,19 +6891,10 @@
       <w:r>
         <w:t>Perf</w:t>
       </w:r>
-      <w:proofErr w:type="spellEnd"/>
-    </w:p>
-    <w:p>
-      <w:r>
-        <w:t xml:space="preserve">As outlined above, </w:t>
-      </w:r>
-      <w:proofErr w:type="spellStart"/>
-      <w:r>
-        <w:t>BeebPerf</w:t>
-      </w:r>
-      <w:proofErr w:type="spellEnd"/>
-      <w:r>
-        <w:t xml:space="preserve"> is a standalone </w:t>
+    </w:p>
+    <w:p>
+      <w:r>
+        <w:t xml:space="preserve">As outlined above, BeebPerf is a standalone </w:t>
       </w:r>
       <w:r>
         <w:t xml:space="preserve">Windows </w:t>
@@ -9661,19 +8761,15 @@
       <w:r>
         <w:t xml:space="preserve">Hexadecimal </w:t>
       </w:r>
-      <w:proofErr w:type="gramStart"/>
       <w:r>
         <w:t>symbol: ‘</w:t>
       </w:r>
-      <w:proofErr w:type="gramEnd"/>
       <w:r>
         <w:t>$</w:t>
       </w:r>
-      <w:proofErr w:type="gramStart"/>
       <w:r>
         <w:t>’, ‘</w:t>
       </w:r>
-      <w:proofErr w:type="gramEnd"/>
       <w:r>
         <w:t>&amp;</w:t>
       </w:r>
@@ -9819,21 +8915,13 @@
         <w:t xml:space="preserve"> </w:t>
       </w:r>
       <w:r>
-        <w:t xml:space="preserve">or label.  For example, </w:t>
-      </w:r>
-      <w:proofErr w:type="spellStart"/>
-      <w:r>
-        <w:t>wait</w:t>
+        <w:t>or label.  For example, wait</w:t>
       </w:r>
       <w:r>
         <w:t>On</w:t>
       </w:r>
       <w:r>
-        <w:t>VSync</w:t>
-      </w:r>
-      <w:proofErr w:type="spellEnd"/>
-      <w:r>
-        <w:t xml:space="preserve"> could be configured to show a marker on completion.  Markers can be shown either as a milestone (diamond), or as a vertical line.</w:t>
+        <w:t>VSync could be configured to show a marker on completion.  Markers can be shown either as a milestone (diamond), or as a vertical line.</w:t>
       </w:r>
     </w:p>
     <w:p>
@@ -10396,11 +9484,9 @@
       <w:r>
         <w:t xml:space="preserve">Aggregated CPU Metrics, by </w:t>
       </w:r>
-      <w:proofErr w:type="spellStart"/>
       <w:r>
         <w:t>RoutineStack</w:t>
       </w:r>
-      <w:proofErr w:type="spellEnd"/>
       <w:r>
         <w:t xml:space="preserve"> – </w:t>
       </w:r>
@@ -10466,7 +9552,6 @@
           <w:numId w:val="9"/>
         </w:numPr>
       </w:pPr>
-      <w:proofErr w:type="spellStart"/>
       <w:r>
         <w:rPr>
           <w:b/>
@@ -10474,20 +9559,11 @@
         </w:rPr>
         <w:t>CallStack</w:t>
       </w:r>
-      <w:proofErr w:type="spellEnd"/>
       <w:r>
         <w:t xml:space="preserve"> – represents a</w:t>
       </w:r>
       <w:r>
-        <w:t xml:space="preserve"> call stack within the recorded program</w:t>
-      </w:r>
-      <w:proofErr w:type="gramStart"/>
-      <w:r>
-        <w:t xml:space="preserve">. </w:t>
-      </w:r>
-      <w:proofErr w:type="gramEnd"/>
-      <w:r>
-        <w:t>Contains the following fields:</w:t>
+        <w:t xml:space="preserve"> call stack within the recorded program. Contains the following fields:</w:t>
       </w:r>
     </w:p>
     <w:p>
@@ -10532,15 +9608,7 @@
         </w:numPr>
       </w:pPr>
       <w:r>
-        <w:t xml:space="preserve">Parent </w:t>
-      </w:r>
-      <w:proofErr w:type="spellStart"/>
-      <w:r>
-        <w:t>CallStack</w:t>
-      </w:r>
-      <w:proofErr w:type="spellEnd"/>
-      <w:r>
-        <w:t xml:space="preserve"> reference</w:t>
+        <w:t>Parent CallStack reference</w:t>
       </w:r>
     </w:p>
     <w:p>
@@ -10575,15 +9643,7 @@
         <w:ind w:left="1080"/>
       </w:pPr>
       <w:r>
-        <w:t xml:space="preserve">The identify of a </w:t>
-      </w:r>
-      <w:proofErr w:type="spellStart"/>
-      <w:r>
-        <w:t>CallStack</w:t>
-      </w:r>
-      <w:proofErr w:type="spellEnd"/>
-      <w:r>
-        <w:t xml:space="preserve"> is defined </w:t>
+        <w:t xml:space="preserve">The identify of a CallStack is defined </w:t>
       </w:r>
       <w:r>
         <w:t xml:space="preserve">by the sequence of </w:t>
@@ -10624,7 +9684,6 @@
           <w:numId w:val="9"/>
         </w:numPr>
       </w:pPr>
-      <w:proofErr w:type="spellStart"/>
       <w:r>
         <w:rPr>
           <w:b/>
@@ -10632,7 +9691,6 @@
         </w:rPr>
         <w:t>StackFrame</w:t>
       </w:r>
-      <w:proofErr w:type="spellEnd"/>
       <w:r>
         <w:t xml:space="preserve"> – represents a unique stack-frame within the recorded program.</w:t>
       </w:r>
@@ -12681,11 +11739,7 @@
         </w:numPr>
       </w:pPr>
       <w:r>
-        <w:t xml:space="preserve">Populate </w:t>
-      </w:r>
-      <w:proofErr w:type="spellStart"/>
-      <w:r>
-        <w:t>No</w:t>
+        <w:t>Populate No</w:t>
       </w:r>
       <w:r>
         <w:t>Tr</w:t>
@@ -12696,7 +11750,6 @@
       <w:r>
         <w:t>verse</w:t>
       </w:r>
-      <w:proofErr w:type="spellEnd"/>
       <w:r>
         <w:t xml:space="preserve"> </w:t>
       </w:r>
@@ -12766,16 +11819,11 @@
           <w:numId w:val="19"/>
         </w:numPr>
       </w:pPr>
-      <w:proofErr w:type="spellStart"/>
       <w:r>
         <w:t>Routine</w:t>
       </w:r>
       <w:r>
-        <w:t>aggregated</w:t>
-      </w:r>
-      <w:proofErr w:type="spellEnd"/>
-      <w:r>
-        <w:t xml:space="preserve"> and total aggregated</w:t>
+        <w:t>aggregated and total aggregated</w:t>
       </w:r>
       <w:r>
         <w:t xml:space="preserve"> CPU metrics</w:t>
@@ -13149,18 +12197,10 @@
         <w:t xml:space="preserve"> (this can be calculated) </w:t>
       </w:r>
       <w:r>
-        <w:t xml:space="preserve">on </w:t>
-      </w:r>
-      <w:proofErr w:type="gramStart"/>
-      <w:r>
-        <w:t xml:space="preserve">the </w:t>
-      </w:r>
-      <w:r>
-        <w:t>Video</w:t>
-      </w:r>
-      <w:proofErr w:type="gramEnd"/>
-      <w:r>
-        <w:t xml:space="preserve"> </w:t>
+        <w:t xml:space="preserve">on the </w:t>
+      </w:r>
+      <w:r>
+        <w:t xml:space="preserve">Video </w:t>
       </w:r>
       <w:r>
         <w:t>6845</w:t>
@@ -13195,15 +12235,7 @@
         </w:numPr>
       </w:pPr>
       <w:r>
-        <w:t xml:space="preserve">Detecting </w:t>
-      </w:r>
-      <w:proofErr w:type="spellStart"/>
-      <w:r>
-        <w:t>roms</w:t>
-      </w:r>
-      <w:proofErr w:type="spellEnd"/>
-      <w:r>
-        <w:t xml:space="preserve"> being paged in.  The easiest way to handle this is to record the value written to &amp;</w:t>
+        <w:t>Detecting roms being paged in.  The easiest way to handle this is to record the value written to &amp;</w:t>
       </w:r>
       <w:r>
         <w:t>FE30</w:t>
@@ -13230,15 +12262,7 @@
         </w:numPr>
       </w:pPr>
       <w:r>
-        <w:t>A spin loop is a tight look that doesn’t write anything, it just reads something</w:t>
-      </w:r>
-      <w:proofErr w:type="gramStart"/>
-      <w:r>
-        <w:t xml:space="preserve">. </w:t>
-      </w:r>
-      <w:proofErr w:type="gramEnd"/>
-      <w:r>
-        <w:t>They are shown in light grey (background is white).</w:t>
+        <w:t>A spin loop is a tight look that doesn’t write anything, it just reads something. They are shown in light grey (background is white).</w:t>
       </w:r>
       <w:r>
         <w:t xml:space="preserve">  We are looking for a repeated set of non-instructions in the recording.</w:t>
@@ -13265,22 +12289,8 @@
         </w:numPr>
       </w:pPr>
       <w:r>
-        <w:t xml:space="preserve">Look for </w:t>
-      </w:r>
-      <w:proofErr w:type="gramStart"/>
-      <w:r>
-        <w:t>repeating</w:t>
-      </w:r>
-      <w:proofErr w:type="gramEnd"/>
-      <w:r>
-        <w:t xml:space="preserve"> instructions.</w:t>
-      </w:r>
-    </w:p>
-    <w:p>
-      <w:pPr>
-        <w:pStyle w:val="ListParagraph"/>
-        <w:ind w:left="2880"/>
-      </w:pPr>
+        <w:t>Look for repeating instructions.</w:t>
+      </w:r>
     </w:p>
     <w:p>
       <w:pPr>
@@ -13291,15 +12301,7 @@
         </w:numPr>
       </w:pPr>
       <w:r>
-        <w:t>Detecting when screen memory is being read</w:t>
-      </w:r>
-      <w:proofErr w:type="gramStart"/>
-      <w:r>
-        <w:t xml:space="preserve">. </w:t>
-      </w:r>
-      <w:proofErr w:type="gramEnd"/>
-      <w:r>
-        <w:t>We need to know.</w:t>
+        <w:t>Detecting when screen memory is being read. We need to know.</w:t>
       </w:r>
     </w:p>
     <w:p>
@@ -13311,15 +12313,7 @@
         </w:numPr>
       </w:pPr>
       <w:r>
-        <w:t xml:space="preserve">The screen </w:t>
-      </w:r>
-      <w:proofErr w:type="gramStart"/>
-      <w:r>
-        <w:t>start</w:t>
-      </w:r>
-      <w:proofErr w:type="gramEnd"/>
-      <w:r>
-        <w:t xml:space="preserve"> address.  Write value stored to </w:t>
+        <w:t xml:space="preserve">The screen start address.  Write value stored to </w:t>
       </w:r>
       <w:r>
         <w:t>&amp;FE00</w:t>
@@ -13343,15 +12337,7 @@
         </w:numPr>
       </w:pPr>
       <w:r>
-        <w:t>The screen wrap-size (how many K)</w:t>
-      </w:r>
-      <w:proofErr w:type="gramStart"/>
-      <w:r>
-        <w:t xml:space="preserve">. </w:t>
-      </w:r>
-      <w:proofErr w:type="gramEnd"/>
-      <w:r>
-        <w:t xml:space="preserve">Write value stored to </w:t>
+        <w:t xml:space="preserve">The screen wrap-size (how many K). Write value stored to </w:t>
       </w:r>
       <w:r>
         <w:t>&amp;FE40</w:t>
@@ -13366,23 +12352,7 @@
         </w:numPr>
       </w:pPr>
       <w:r>
-        <w:t xml:space="preserve">The screen format (mode-7 verses </w:t>
-      </w:r>
-      <w:proofErr w:type="gramStart"/>
-      <w:r>
-        <w:t>non mode</w:t>
-      </w:r>
-      <w:proofErr w:type="gramEnd"/>
-      <w:r>
-        <w:t>-7)</w:t>
-      </w:r>
-      <w:proofErr w:type="gramStart"/>
-      <w:r>
-        <w:t xml:space="preserve">. </w:t>
-      </w:r>
-      <w:proofErr w:type="gramEnd"/>
-      <w:r>
-        <w:t xml:space="preserve">Write values stored at </w:t>
+        <w:t xml:space="preserve">The screen format (mode-7 verses non mode-7). Write values stored at </w:t>
       </w:r>
       <w:r>
         <w:t>&amp;FE20</w:t>
@@ -13421,45 +12391,13 @@
         </w:numPr>
       </w:pPr>
       <w:r>
-        <w:t xml:space="preserve">Detecting when the screen read starts.  We need to know when the v-sync </w:t>
-      </w:r>
-      <w:proofErr w:type="gramStart"/>
-      <w:r>
-        <w:t>interrupt</w:t>
-      </w:r>
-      <w:proofErr w:type="gramEnd"/>
-      <w:r>
-        <w:t xml:space="preserve"> occurs.  We can time it from here.  We can determine this by </w:t>
-      </w:r>
-      <w:proofErr w:type="gramStart"/>
-      <w:r>
-        <w:t>looking</w:t>
-      </w:r>
-      <w:proofErr w:type="gramEnd"/>
-      <w:r>
-        <w:t xml:space="preserve"> if the values read from &amp;</w:t>
+        <w:t>Detecting when the screen read starts.  We need to know when the v-sync interrupt occurs.  We can time it from here.  We can determine this by looking if the values read from &amp;</w:t>
       </w:r>
       <w:r>
         <w:t>FE4D</w:t>
       </w:r>
       <w:r>
-        <w:t xml:space="preserve"> </w:t>
-      </w:r>
-      <w:proofErr w:type="gramStart"/>
-      <w:r>
-        <w:t>has</w:t>
-      </w:r>
-      <w:proofErr w:type="gramEnd"/>
-      <w:r>
-        <w:t xml:space="preserve"> bit two </w:t>
-      </w:r>
-      <w:proofErr w:type="gramStart"/>
-      <w:r>
-        <w:t>set</w:t>
-      </w:r>
-      <w:proofErr w:type="gramEnd"/>
-      <w:r>
-        <w:t>.  The rest is math.</w:t>
+        <w:t xml:space="preserve"> has bit two set.  The rest is math.</w:t>
       </w:r>
     </w:p>
     <w:p>
@@ -13471,7 +12409,7 @@
         </w:numPr>
       </w:pPr>
       <w:r>
-        <w:t>Timing synchronization</w:t>
+        <w:t>Detecting the game loop</w:t>
       </w:r>
     </w:p>
     <w:p>
@@ -13483,25 +12421,49 @@
         </w:numPr>
       </w:pPr>
       <w:r>
-        <w:t xml:space="preserve">We can </w:t>
-      </w:r>
-      <w:r>
-        <w:t xml:space="preserve">use v-sync interrupts to identify </w:t>
-      </w:r>
-      <w:r>
-        <w:t>v-sync hardware interrupts</w:t>
-      </w:r>
-      <w:r>
-        <w:t xml:space="preserve">, but this will not work if </w:t>
-      </w:r>
-      <w:r>
-        <w:t>OS code is hijacked.</w:t>
-      </w:r>
-      <w:r>
-        <w:t xml:space="preserve">  From this we should be able to identify </w:t>
-      </w:r>
-      <w:r>
-        <w:t>screen timings, by counting instructions.</w:t>
+        <w:t>We can look for code that spins every 50</w:t>
+      </w:r>
+      <w:r>
+        <w:rPr>
+          <w:vertAlign w:val="superscript"/>
+        </w:rPr>
+        <w:t>th</w:t>
+      </w:r>
+      <w:r>
+        <w:t xml:space="preserve"> of a second.</w:t>
+      </w:r>
+    </w:p>
+    <w:p>
+      <w:pPr>
+        <w:pStyle w:val="ListParagraph"/>
+        <w:numPr>
+          <w:ilvl w:val="1"/>
+          <w:numId w:val="12"/>
+        </w:numPr>
+      </w:pPr>
+      <w:r>
+        <w:t>We can look for a spin loop somehow</w:t>
+      </w:r>
+    </w:p>
+    <w:p>
+      <w:pPr>
+        <w:pStyle w:val="ListParagraph"/>
+        <w:numPr>
+          <w:ilvl w:val="1"/>
+          <w:numId w:val="12"/>
+        </w:numPr>
+      </w:pPr>
+      <w:r>
+        <w:t>We can look for code that executes every 50</w:t>
+      </w:r>
+      <w:r>
+        <w:rPr>
+          <w:vertAlign w:val="superscript"/>
+        </w:rPr>
+        <w:t>th</w:t>
+      </w:r>
+      <w:r>
+        <w:t xml:space="preserve"> second.</w:t>
       </w:r>
     </w:p>
     <w:p>
@@ -13513,13 +12475,7 @@
         </w:numPr>
       </w:pPr>
       <w:r>
-        <w:t>Code that pushes addresses on the stack to change what JMP, JSR, RTS</w:t>
-      </w:r>
-      <w:r>
-        <w:t xml:space="preserve"> do</w:t>
-      </w:r>
-      <w:r>
-        <w:t xml:space="preserve">.  </w:t>
+        <w:t>Timing synchronization</w:t>
       </w:r>
     </w:p>
     <w:p>
@@ -13532,10 +12488,25 @@
       </w:pPr>
       <w:r>
         <w:lastRenderedPageBreak/>
-        <w:t>Need to understand the sta</w:t>
-      </w:r>
-      <w:r>
-        <w:t>ck, and operations on it.</w:t>
+        <w:t xml:space="preserve">We can </w:t>
+      </w:r>
+      <w:r>
+        <w:t xml:space="preserve">use v-sync interrupts to identify </w:t>
+      </w:r>
+      <w:r>
+        <w:t>v-sync hardware interrupts</w:t>
+      </w:r>
+      <w:r>
+        <w:t xml:space="preserve">, but this will not work if </w:t>
+      </w:r>
+      <w:r>
+        <w:t>OS code is hijacked.</w:t>
+      </w:r>
+      <w:r>
+        <w:t xml:space="preserve">  From this we should be able to identify </w:t>
+      </w:r>
+      <w:r>
+        <w:t>screen timings, by counting instructions.</w:t>
       </w:r>
     </w:p>
     <w:p>
@@ -13547,33 +12518,28 @@
         </w:numPr>
       </w:pPr>
       <w:r>
-        <w:t xml:space="preserve">Any code that </w:t>
-      </w:r>
-      <w:r>
-        <w:t xml:space="preserve">results in a function being </w:t>
-      </w:r>
-      <w:proofErr w:type="gramStart"/>
-      <w:r>
-        <w:t>called,</w:t>
-      </w:r>
-      <w:proofErr w:type="gramEnd"/>
-      <w:r>
-        <w:t xml:space="preserve"> is an implicit function all.</w:t>
-      </w:r>
-      <w:r>
-        <w:t xml:space="preserve">  A return that lands on a function is </w:t>
-      </w:r>
-      <w:r>
-        <w:t xml:space="preserve">treated as a </w:t>
-      </w:r>
-      <w:r>
-        <w:t>call.</w:t>
-      </w:r>
-      <w:r>
-        <w:t xml:space="preserve">  Code that returns to a different location that than a </w:t>
-      </w:r>
-      <w:r>
-        <w:t>call point on the stack, defines a new candidate function.</w:t>
+        <w:t>Code that pushes addresses on the stack to change what JMP, JSR, RTS</w:t>
+      </w:r>
+      <w:r>
+        <w:t xml:space="preserve"> do</w:t>
+      </w:r>
+      <w:r>
+        <w:t xml:space="preserve">.  </w:t>
+      </w:r>
+    </w:p>
+    <w:p>
+      <w:pPr>
+        <w:pStyle w:val="ListParagraph"/>
+        <w:numPr>
+          <w:ilvl w:val="1"/>
+          <w:numId w:val="12"/>
+        </w:numPr>
+      </w:pPr>
+      <w:r>
+        <w:t>Need to understand the sta</w:t>
+      </w:r>
+      <w:r>
+        <w:t>ck, and operations on it.</w:t>
       </w:r>
     </w:p>
     <w:p>
@@ -13585,40 +12551,25 @@
         </w:numPr>
       </w:pPr>
       <w:r>
-        <w:t>Interrup</w:t>
-      </w:r>
-      <w:r>
-        <w:t>t</w:t>
-      </w:r>
-      <w:r>
-        <w:t>s</w:t>
-      </w:r>
-      <w:r>
-        <w:t>…</w:t>
-      </w:r>
-      <w:r>
-        <w:t xml:space="preserve">  Code that ends in an RTI</w:t>
-      </w:r>
-      <w:r>
-        <w:t xml:space="preserve">, or </w:t>
-      </w:r>
-      <w:r>
-        <w:t xml:space="preserve">an instruction </w:t>
-      </w:r>
-      <w:r>
-        <w:t xml:space="preserve">whose address </w:t>
-      </w:r>
-      <w:r>
-        <w:t xml:space="preserve">is at </w:t>
-      </w:r>
-      <w:r>
-        <w:t xml:space="preserve">an </w:t>
-      </w:r>
-      <w:r>
-        <w:t>unexpected location</w:t>
-      </w:r>
-      <w:r>
-        <w:t xml:space="preserve"> during execution.</w:t>
+        <w:t xml:space="preserve">Any code that </w:t>
+      </w:r>
+      <w:r>
+        <w:t>results in a function being called, is an implicit function all.</w:t>
+      </w:r>
+      <w:r>
+        <w:t xml:space="preserve">  A return that lands on a function is </w:t>
+      </w:r>
+      <w:r>
+        <w:t xml:space="preserve">treated as a </w:t>
+      </w:r>
+      <w:r>
+        <w:t>call.</w:t>
+      </w:r>
+      <w:r>
+        <w:t xml:space="preserve">  Code that returns to a different location that than a </w:t>
+      </w:r>
+      <w:r>
+        <w:t>call point on the stack, defines a new candidate function.</w:t>
       </w:r>
     </w:p>
     <w:p>
@@ -13630,64 +12581,40 @@
         </w:numPr>
       </w:pPr>
       <w:r>
-        <w:t xml:space="preserve">Labels are associated with 16-bit addresses, and as such, </w:t>
-      </w:r>
-      <w:r>
-        <w:t>any label in the &amp;8000-&amp;BFFF range cannot be attributed to a specific</w:t>
-      </w:r>
-      <w:r>
-        <w:t xml:space="preserve"> paged ROM.  Furthermore, code and data may be </w:t>
-      </w:r>
-      <w:r>
-        <w:t xml:space="preserve">dynamically </w:t>
-      </w:r>
-      <w:r>
-        <w:t>loaded</w:t>
-      </w:r>
-      <w:r>
-        <w:t xml:space="preserve"> </w:t>
-      </w:r>
-      <w:r>
-        <w:t>into memory locations</w:t>
-      </w:r>
-      <w:r>
-        <w:t xml:space="preserve"> </w:t>
-      </w:r>
-      <w:r>
-        <w:t>or overwritte</w:t>
-      </w:r>
-      <w:r>
-        <w:t xml:space="preserve">n.  As such, </w:t>
-      </w:r>
-      <w:r>
-        <w:t>a determination needs to be made as to the validity of labels given a context</w:t>
-      </w:r>
-      <w:r>
-        <w:t xml:space="preserve">.  </w:t>
-      </w:r>
-      <w:r>
-        <w:t xml:space="preserve">This is accomplished by </w:t>
-      </w:r>
-      <w:r>
-        <w:t>looking at all the labels associated with a body of code</w:t>
-      </w:r>
-      <w:r>
-        <w:t>.</w:t>
-      </w:r>
-      <w:r>
-        <w:t xml:space="preserve">  If these all align to instructions locations</w:t>
-      </w:r>
-      <w:r>
-        <w:t>, within the code block</w:t>
-      </w:r>
-      <w:r>
-        <w:t xml:space="preserve">, the labels are assumed to be </w:t>
-      </w:r>
-      <w:r>
-        <w:t>valid</w:t>
-      </w:r>
-      <w:r>
-        <w:t>, otherwise not.</w:t>
+        <w:t>Interrup</w:t>
+      </w:r>
+      <w:r>
+        <w:t>t</w:t>
+      </w:r>
+      <w:r>
+        <w:t>s</w:t>
+      </w:r>
+      <w:r>
+        <w:t>…</w:t>
+      </w:r>
+      <w:r>
+        <w:t xml:space="preserve">  Code that ends in an RTI</w:t>
+      </w:r>
+      <w:r>
+        <w:t xml:space="preserve">, or </w:t>
+      </w:r>
+      <w:r>
+        <w:t xml:space="preserve">an instruction </w:t>
+      </w:r>
+      <w:r>
+        <w:t xml:space="preserve">whose address </w:t>
+      </w:r>
+      <w:r>
+        <w:t xml:space="preserve">is at </w:t>
+      </w:r>
+      <w:r>
+        <w:t xml:space="preserve">an </w:t>
+      </w:r>
+      <w:r>
+        <w:t>unexpected location</w:t>
+      </w:r>
+      <w:r>
+        <w:t xml:space="preserve"> during execution.</w:t>
       </w:r>
     </w:p>
     <w:p>
@@ -13699,6 +12626,75 @@
         </w:numPr>
       </w:pPr>
       <w:r>
+        <w:t xml:space="preserve">Labels are associated with 16-bit addresses, and as such, </w:t>
+      </w:r>
+      <w:r>
+        <w:t>any label in the &amp;8000-&amp;BFFF range cannot be attributed to a specific</w:t>
+      </w:r>
+      <w:r>
+        <w:t xml:space="preserve"> paged ROM.  Furthermore, code and data may be </w:t>
+      </w:r>
+      <w:r>
+        <w:t xml:space="preserve">dynamically </w:t>
+      </w:r>
+      <w:r>
+        <w:t>loaded</w:t>
+      </w:r>
+      <w:r>
+        <w:t xml:space="preserve"> </w:t>
+      </w:r>
+      <w:r>
+        <w:t>into memory locations</w:t>
+      </w:r>
+      <w:r>
+        <w:t xml:space="preserve"> </w:t>
+      </w:r>
+      <w:r>
+        <w:t>or overwritte</w:t>
+      </w:r>
+      <w:r>
+        <w:t xml:space="preserve">n.  As such, </w:t>
+      </w:r>
+      <w:r>
+        <w:t>a determination needs to be made as to the validity of labels given a context</w:t>
+      </w:r>
+      <w:r>
+        <w:t xml:space="preserve">.  </w:t>
+      </w:r>
+      <w:r>
+        <w:t xml:space="preserve">This is accomplished by </w:t>
+      </w:r>
+      <w:r>
+        <w:t>looking at all the labels associated with a body of code</w:t>
+      </w:r>
+      <w:r>
+        <w:t>.</w:t>
+      </w:r>
+      <w:r>
+        <w:t xml:space="preserve">  If these all align to instructions locations</w:t>
+      </w:r>
+      <w:r>
+        <w:t>, within the code block</w:t>
+      </w:r>
+      <w:r>
+        <w:t xml:space="preserve">, the labels are assumed to be </w:t>
+      </w:r>
+      <w:r>
+        <w:t>valid</w:t>
+      </w:r>
+      <w:r>
+        <w:t>, otherwise not.</w:t>
+      </w:r>
+    </w:p>
+    <w:p>
+      <w:pPr>
+        <w:pStyle w:val="ListParagraph"/>
+        <w:numPr>
+          <w:ilvl w:val="0"/>
+          <w:numId w:val="12"/>
+        </w:numPr>
+      </w:pPr>
+      <w:r>
         <w:t>Understanding the stack</w:t>
       </w:r>
     </w:p>
@@ -13714,15 +12710,7 @@
         <w:t xml:space="preserve">Values on the stack can be a combination of return addresses, </w:t>
       </w:r>
       <w:r>
-        <w:t xml:space="preserve">and other data.  We want to understand what </w:t>
-      </w:r>
-      <w:proofErr w:type="gramStart"/>
-      <w:r>
-        <w:t>is a return address</w:t>
-      </w:r>
-      <w:proofErr w:type="gramEnd"/>
-      <w:r>
-        <w:t xml:space="preserve"> verses other data.</w:t>
+        <w:t>and other data.  We want to understand what is a return address verses other data.</w:t>
       </w:r>
     </w:p>
     <w:p>

</xml_diff>

<commit_message>
Added asynchronous operations and spinner control
</commit_message>
<xml_diff>
--- a/docs/Development.docx
+++ b/docs/Development.docx
@@ -349,6 +349,7 @@
       <w:r>
         <w:t xml:space="preserve">  </w:t>
       </w:r>
+      <w:proofErr w:type="gramStart"/>
       <w:r>
         <w:t>I</w:t>
       </w:r>
@@ -359,13 +360,25 @@
         <w:t xml:space="preserve"> </w:t>
       </w:r>
       <w:r>
-        <w:t xml:space="preserve"> and sample</w:t>
-      </w:r>
+        <w:t xml:space="preserve"> and</w:t>
+      </w:r>
+      <w:proofErr w:type="gramEnd"/>
       <w:r>
         <w:t xml:space="preserve"> </w:t>
       </w:r>
-      <w:r>
-        <w:t xml:space="preserve">based </w:t>
+      <w:proofErr w:type="gramStart"/>
+      <w:r>
+        <w:t>sample</w:t>
+      </w:r>
+      <w:r>
+        <w:t xml:space="preserve"> </w:t>
+      </w:r>
+      <w:r>
+        <w:t>based</w:t>
+      </w:r>
+      <w:proofErr w:type="gramEnd"/>
+      <w:r>
+        <w:t xml:space="preserve"> </w:t>
       </w:r>
       <w:r>
         <w:t xml:space="preserve">measurements </w:t>
@@ -544,6 +557,7 @@
       <w:r>
         <w:t xml:space="preserve">, </w:t>
       </w:r>
+      <w:proofErr w:type="spellStart"/>
       <w:r>
         <w:rPr>
           <w:b/>
@@ -551,6 +565,7 @@
         </w:rPr>
         <w:t>BeebPerf</w:t>
       </w:r>
+      <w:proofErr w:type="spellEnd"/>
       <w:r>
         <w:t>,</w:t>
       </w:r>
@@ -603,6 +618,7 @@
       <w:r>
         <w:t xml:space="preserve">for </w:t>
       </w:r>
+      <w:proofErr w:type="spellStart"/>
       <w:r>
         <w:rPr>
           <w:b/>
@@ -617,6 +633,7 @@
         </w:rPr>
         <w:t>Perf</w:t>
       </w:r>
+      <w:proofErr w:type="spellEnd"/>
       <w:r>
         <w:t xml:space="preserve"> to analyze and </w:t>
       </w:r>
@@ -678,6 +695,7 @@
       <w:r>
         <w:t xml:space="preserve">to decouple </w:t>
       </w:r>
+      <w:proofErr w:type="spellStart"/>
       <w:r>
         <w:rPr>
           <w:b/>
@@ -685,6 +703,7 @@
         </w:rPr>
         <w:t>BeebPerf</w:t>
       </w:r>
+      <w:proofErr w:type="spellEnd"/>
       <w:r>
         <w:t xml:space="preserve"> from </w:t>
       </w:r>
@@ -719,6 +738,7 @@
       <w:r>
         <w:t xml:space="preserve">performance data which </w:t>
       </w:r>
+      <w:proofErr w:type="spellStart"/>
       <w:r>
         <w:rPr>
           <w:b/>
@@ -726,6 +746,7 @@
         </w:rPr>
         <w:t>BeebPerf</w:t>
       </w:r>
+      <w:proofErr w:type="spellEnd"/>
       <w:r>
         <w:t xml:space="preserve"> </w:t>
       </w:r>
@@ -861,6 +882,7 @@
       <w:r>
         <w:t xml:space="preserve"> is modified to generate a .perf file, which </w:t>
       </w:r>
+      <w:proofErr w:type="spellStart"/>
       <w:r>
         <w:rPr>
           <w:b/>
@@ -868,6 +890,7 @@
         </w:rPr>
         <w:t>BeebPerf</w:t>
       </w:r>
+      <w:proofErr w:type="spellEnd"/>
       <w:r>
         <w:t xml:space="preserve"> </w:t>
       </w:r>
@@ -954,6 +977,7 @@
         </w:rPr>
         <w:t>&lt;</w:t>
       </w:r>
+      <w:proofErr w:type="spellStart"/>
       <w:r>
         <w:rPr>
           <w:b/>
@@ -968,6 +992,7 @@
         </w:rPr>
         <w:t>chunk</w:t>
       </w:r>
+      <w:proofErr w:type="spellEnd"/>
       <w:r>
         <w:rPr>
           <w:b/>
@@ -985,6 +1010,7 @@
         </w:rPr>
         <w:t>&lt;</w:t>
       </w:r>
+      <w:proofErr w:type="spellStart"/>
       <w:r>
         <w:rPr>
           <w:b/>
@@ -1006,6 +1032,7 @@
         </w:rPr>
         <w:t>_chunk</w:t>
       </w:r>
+      <w:proofErr w:type="spellEnd"/>
       <w:r>
         <w:rPr>
           <w:b/>
@@ -1034,33 +1061,44 @@
         </w:rPr>
         <w:t>&lt;</w:t>
       </w:r>
+      <w:proofErr w:type="spellStart"/>
       <w:r>
         <w:rPr>
           <w:b/>
           <w:bCs/>
         </w:rPr>
-        <w:t>snapshot_chunk&gt;</w:t>
-      </w:r>
-      <w:r>
-        <w:t xml:space="preserve"> +</w:t>
-      </w:r>
-      <w:r>
-        <w:t xml:space="preserve"> </w:t>
-      </w:r>
+        <w:t>snapshot_chunk</w:t>
+      </w:r>
+      <w:proofErr w:type="spellEnd"/>
       <w:r>
         <w:rPr>
           <w:b/>
           <w:bCs/>
         </w:rPr>
-        <w:t>&lt;</w:t>
+        <w:t>&gt;</w:t>
+      </w:r>
+      <w:r>
+        <w:t xml:space="preserve"> +</w:t>
+      </w:r>
+      <w:r>
+        <w:t xml:space="preserve"> </w:t>
       </w:r>
       <w:r>
         <w:rPr>
           <w:b/>
           <w:bCs/>
         </w:rPr>
+        <w:t>&lt;</w:t>
+      </w:r>
+      <w:proofErr w:type="spellStart"/>
+      <w:r>
+        <w:rPr>
+          <w:b/>
+          <w:bCs/>
+        </w:rPr>
         <w:t>execution_chunk</w:t>
       </w:r>
+      <w:proofErr w:type="spellEnd"/>
       <w:r>
         <w:rPr>
           <w:b/>
@@ -1090,8 +1128,13 @@
       <w:r>
         <w:t xml:space="preserve"> a common header which </w:t>
       </w:r>
-      <w:r>
-        <w:t xml:space="preserve">proceeds </w:t>
+      <w:proofErr w:type="gramStart"/>
+      <w:r>
+        <w:t>proceeds</w:t>
+      </w:r>
+      <w:proofErr w:type="gramEnd"/>
+      <w:r>
+        <w:t xml:space="preserve"> </w:t>
       </w:r>
       <w:r>
         <w:t>the</w:t>
@@ -1255,6 +1298,7 @@
         </w:rPr>
         <w:t>&lt;</w:t>
       </w:r>
+      <w:proofErr w:type="spellStart"/>
       <w:r>
         <w:rPr>
           <w:b/>
@@ -1267,7 +1311,15 @@
           <w:b/>
           <w:bCs/>
         </w:rPr>
-        <w:t>header&gt;</w:t>
+        <w:t>header</w:t>
+      </w:r>
+      <w:proofErr w:type="spellEnd"/>
+      <w:r>
+        <w:rPr>
+          <w:b/>
+          <w:bCs/>
+        </w:rPr>
+        <w:t>&gt;</w:t>
       </w:r>
       <w:r>
         <w:t xml:space="preserve"> = </w:t>
@@ -1278,11 +1330,24 @@
       <w:r>
         <w:t>&lt;tag&gt; + &lt;compression&gt; + &lt;</w:t>
       </w:r>
+      <w:proofErr w:type="spellStart"/>
       <w:r>
         <w:t>original_</w:t>
       </w:r>
       <w:r>
-        <w:t>size&gt; + &lt;compressed_size&gt;</w:t>
+        <w:t>size</w:t>
+      </w:r>
+      <w:proofErr w:type="spellEnd"/>
+      <w:r>
+        <w:t>&gt; + &lt;</w:t>
+      </w:r>
+      <w:proofErr w:type="spellStart"/>
+      <w:r>
+        <w:t>compressed_size</w:t>
+      </w:r>
+      <w:proofErr w:type="spellEnd"/>
+      <w:r>
+        <w:t>&gt;</w:t>
       </w:r>
     </w:p>
     <w:p>
@@ -1409,7 +1474,23 @@
                 <w:rFonts w:ascii="Aptos" w:hAnsi="Aptos"/>
                 <w:color w:val="000000"/>
               </w:rPr>
-              <w:t>‘PFhd’</w:t>
+              <w:t>‘</w:t>
+            </w:r>
+            <w:proofErr w:type="spellStart"/>
+            <w:r>
+              <w:rPr>
+                <w:rFonts w:ascii="Aptos" w:hAnsi="Aptos"/>
+                <w:color w:val="000000"/>
+              </w:rPr>
+              <w:t>PFhd</w:t>
+            </w:r>
+            <w:proofErr w:type="spellEnd"/>
+            <w:r>
+              <w:rPr>
+                <w:rFonts w:ascii="Aptos" w:hAnsi="Aptos"/>
+                <w:color w:val="000000"/>
+              </w:rPr>
+              <w:t>’</w:t>
             </w:r>
           </w:p>
         </w:tc>
@@ -1429,7 +1510,23 @@
                 <w:rFonts w:ascii="Aptos" w:hAnsi="Aptos"/>
                 <w:color w:val="000000"/>
               </w:rPr>
-              <w:t>&lt;header_chunk&gt;</w:t>
+              <w:t>&lt;</w:t>
+            </w:r>
+            <w:proofErr w:type="spellStart"/>
+            <w:r>
+              <w:rPr>
+                <w:rFonts w:ascii="Aptos" w:hAnsi="Aptos"/>
+                <w:color w:val="000000"/>
+              </w:rPr>
+              <w:t>header_chunk</w:t>
+            </w:r>
+            <w:proofErr w:type="spellEnd"/>
+            <w:r>
+              <w:rPr>
+                <w:rFonts w:ascii="Aptos" w:hAnsi="Aptos"/>
+                <w:color w:val="000000"/>
+              </w:rPr>
+              <w:t>&gt;</w:t>
             </w:r>
           </w:p>
         </w:tc>
@@ -1451,7 +1548,23 @@
                 <w:rFonts w:ascii="Aptos" w:hAnsi="Aptos"/>
                 <w:color w:val="000000"/>
               </w:rPr>
-              <w:t>‘PFlb’</w:t>
+              <w:t>‘</w:t>
+            </w:r>
+            <w:proofErr w:type="spellStart"/>
+            <w:r>
+              <w:rPr>
+                <w:rFonts w:ascii="Aptos" w:hAnsi="Aptos"/>
+                <w:color w:val="000000"/>
+              </w:rPr>
+              <w:t>PFlb</w:t>
+            </w:r>
+            <w:proofErr w:type="spellEnd"/>
+            <w:r>
+              <w:rPr>
+                <w:rFonts w:ascii="Aptos" w:hAnsi="Aptos"/>
+                <w:color w:val="000000"/>
+              </w:rPr>
+              <w:t>’</w:t>
             </w:r>
           </w:p>
         </w:tc>
@@ -1467,7 +1580,15 @@
               </w:rPr>
             </w:pPr>
             <w:r>
-              <w:t>&lt;labels_chunk&gt;</w:t>
+              <w:t>&lt;</w:t>
+            </w:r>
+            <w:proofErr w:type="spellStart"/>
+            <w:r>
+              <w:t>labels_chunk</w:t>
+            </w:r>
+            <w:proofErr w:type="spellEnd"/>
+            <w:r>
+              <w:t>&gt;</w:t>
             </w:r>
           </w:p>
         </w:tc>
@@ -1489,7 +1610,23 @@
                 <w:rFonts w:ascii="Aptos" w:hAnsi="Aptos"/>
                 <w:color w:val="000000"/>
               </w:rPr>
-              <w:t>‘PFss’</w:t>
+              <w:t>‘</w:t>
+            </w:r>
+            <w:proofErr w:type="spellStart"/>
+            <w:r>
+              <w:rPr>
+                <w:rFonts w:ascii="Aptos" w:hAnsi="Aptos"/>
+                <w:color w:val="000000"/>
+              </w:rPr>
+              <w:t>PFss</w:t>
+            </w:r>
+            <w:proofErr w:type="spellEnd"/>
+            <w:r>
+              <w:rPr>
+                <w:rFonts w:ascii="Aptos" w:hAnsi="Aptos"/>
+                <w:color w:val="000000"/>
+              </w:rPr>
+              <w:t>’</w:t>
             </w:r>
           </w:p>
         </w:tc>
@@ -1505,7 +1642,15 @@
               </w:rPr>
             </w:pPr>
             <w:r>
-              <w:t>&lt;snapshot_chunk&gt;</w:t>
+              <w:t>&lt;</w:t>
+            </w:r>
+            <w:proofErr w:type="spellStart"/>
+            <w:r>
+              <w:t>snapshot_chunk</w:t>
+            </w:r>
+            <w:proofErr w:type="spellEnd"/>
+            <w:r>
+              <w:t>&gt;</w:t>
             </w:r>
           </w:p>
         </w:tc>
@@ -1527,7 +1672,23 @@
                 <w:rFonts w:ascii="Aptos" w:hAnsi="Aptos"/>
                 <w:color w:val="000000"/>
               </w:rPr>
-              <w:t>‘PFex’</w:t>
+              <w:t>‘</w:t>
+            </w:r>
+            <w:proofErr w:type="spellStart"/>
+            <w:r>
+              <w:rPr>
+                <w:rFonts w:ascii="Aptos" w:hAnsi="Aptos"/>
+                <w:color w:val="000000"/>
+              </w:rPr>
+              <w:t>PFex</w:t>
+            </w:r>
+            <w:proofErr w:type="spellEnd"/>
+            <w:r>
+              <w:rPr>
+                <w:rFonts w:ascii="Aptos" w:hAnsi="Aptos"/>
+                <w:color w:val="000000"/>
+              </w:rPr>
+              <w:t>’</w:t>
             </w:r>
           </w:p>
         </w:tc>
@@ -1543,7 +1704,15 @@
               </w:rPr>
             </w:pPr>
             <w:r>
-              <w:t>&lt;execution_chunk&gt;</w:t>
+              <w:t>&lt;</w:t>
+            </w:r>
+            <w:proofErr w:type="spellStart"/>
+            <w:r>
+              <w:t>execution_chunk</w:t>
+            </w:r>
+            <w:proofErr w:type="spellEnd"/>
+            <w:r>
+              <w:t>&gt;</w:t>
             </w:r>
           </w:p>
         </w:tc>
@@ -1716,8 +1885,13 @@
             <w:tcW w:w="3240" w:type="dxa"/>
           </w:tcPr>
           <w:p>
+            <w:proofErr w:type="spellStart"/>
             <w:r>
-              <w:t>zlib 1.3.1 (default algorithm)</w:t>
+              <w:t>zlib</w:t>
+            </w:r>
+            <w:proofErr w:type="spellEnd"/>
+            <w:r>
+              <w:t xml:space="preserve"> 1.3.1 (default algorithm)</w:t>
             </w:r>
           </w:p>
         </w:tc>
@@ -1733,6 +1907,7 @@
       <w:r>
         <w:t>&lt;</w:t>
       </w:r>
+      <w:proofErr w:type="spellStart"/>
       <w:r>
         <w:t>original</w:t>
       </w:r>
@@ -1742,6 +1917,7 @@
       <w:r>
         <w:t>size</w:t>
       </w:r>
+      <w:proofErr w:type="spellEnd"/>
       <w:r>
         <w:t>&gt;</w:t>
       </w:r>
@@ -1775,11 +1951,16 @@
         <w:ind w:left="360"/>
       </w:pPr>
       <w:r>
-        <w:t>&lt;compressed_</w:t>
+        <w:t>&lt;</w:t>
+      </w:r>
+      <w:proofErr w:type="spellStart"/>
+      <w:r>
+        <w:t>compressed_</w:t>
       </w:r>
       <w:r>
         <w:t>size</w:t>
       </w:r>
+      <w:proofErr w:type="spellEnd"/>
       <w:r>
         <w:t>&gt;</w:t>
       </w:r>
@@ -1807,11 +1988,16 @@
       <w:r>
         <w:t>matches &lt;</w:t>
       </w:r>
+      <w:proofErr w:type="spellStart"/>
       <w:r>
         <w:t>original</w:t>
       </w:r>
       <w:r>
-        <w:t>_size&gt;</w:t>
+        <w:t>_size</w:t>
+      </w:r>
+      <w:proofErr w:type="spellEnd"/>
+      <w:r>
+        <w:t>&gt;</w:t>
       </w:r>
       <w:r>
         <w:t>.</w:t>
@@ -1833,7 +2019,15 @@
         <w:t xml:space="preserve">The header chunk </w:t>
       </w:r>
       <w:r>
-        <w:t xml:space="preserve">is the first chunk in the file and </w:t>
+        <w:t xml:space="preserve">is the first chunk in the </w:t>
+      </w:r>
+      <w:proofErr w:type="gramStart"/>
+      <w:r>
+        <w:t>file</w:t>
+      </w:r>
+      <w:proofErr w:type="gramEnd"/>
+      <w:r>
+        <w:t xml:space="preserve"> and </w:t>
       </w:r>
       <w:r>
         <w:t xml:space="preserve">it </w:t>
@@ -1892,6 +2086,7 @@
         </w:rPr>
         <w:t>&lt;</w:t>
       </w:r>
+      <w:proofErr w:type="spellStart"/>
       <w:r>
         <w:rPr>
           <w:b/>
@@ -1904,14 +2099,27 @@
           <w:b/>
           <w:bCs/>
         </w:rPr>
-        <w:t>_chunk&gt;</w:t>
+        <w:t>_chunk</w:t>
+      </w:r>
+      <w:proofErr w:type="spellEnd"/>
+      <w:r>
+        <w:rPr>
+          <w:b/>
+          <w:bCs/>
+        </w:rPr>
+        <w:t>&gt;</w:t>
       </w:r>
       <w:r>
         <w:t xml:space="preserve"> = </w:t>
       </w:r>
       <w:r>
-        <w:t>&lt;common_header</w:t>
-      </w:r>
+        <w:t>&lt;</w:t>
+      </w:r>
+      <w:proofErr w:type="spellStart"/>
+      <w:r>
+        <w:t>common_header</w:t>
+      </w:r>
+      <w:proofErr w:type="spellEnd"/>
       <w:r>
         <w:t>(</w:t>
       </w:r>
@@ -1922,6 +2130,7 @@
         </w:rPr>
         <w:t>‘</w:t>
       </w:r>
+      <w:proofErr w:type="spellStart"/>
       <w:r>
         <w:rPr>
           <w:rFonts w:ascii="Aptos" w:hAnsi="Aptos"/>
@@ -1929,7 +2138,17 @@
           <w:bCs/>
           <w:color w:val="000000"/>
         </w:rPr>
-        <w:t>PFhd’</w:t>
+        <w:t>PFhd</w:t>
+      </w:r>
+      <w:proofErr w:type="spellEnd"/>
+      <w:r>
+        <w:rPr>
+          <w:rFonts w:ascii="Aptos" w:hAnsi="Aptos"/>
+          <w:b/>
+          <w:bCs/>
+          <w:color w:val="000000"/>
+        </w:rPr>
+        <w:t>’</w:t>
       </w:r>
       <w:r>
         <w:rPr>
@@ -1945,7 +2164,15 @@
         <w:t xml:space="preserve"> + </w:t>
       </w:r>
       <w:r>
-        <w:t>&lt;header_data&gt;</w:t>
+        <w:t>&lt;</w:t>
+      </w:r>
+      <w:proofErr w:type="spellStart"/>
+      <w:r>
+        <w:t>header_data</w:t>
+      </w:r>
+      <w:proofErr w:type="spellEnd"/>
+      <w:r>
+        <w:t>&gt;</w:t>
       </w:r>
     </w:p>
     <w:p>
@@ -1953,19 +2180,56 @@
         <w:ind w:left="720" w:hanging="360"/>
       </w:pPr>
       <w:r>
-        <w:t xml:space="preserve">&lt;header_data&gt; = </w:t>
+        <w:t>&lt;</w:t>
+      </w:r>
+      <w:proofErr w:type="spellStart"/>
+      <w:r>
+        <w:t>header_data</w:t>
+      </w:r>
+      <w:proofErr w:type="spellEnd"/>
+      <w:r>
+        <w:t xml:space="preserve">&gt; = </w:t>
       </w:r>
       <w:r>
         <w:br/>
       </w:r>
       <w:r>
-        <w:t>&lt;major_version&gt; + &lt;minor_version&gt; + &lt;bbc_model&gt; + &lt;</w:t>
-      </w:r>
+        <w:t>&lt;</w:t>
+      </w:r>
+      <w:proofErr w:type="spellStart"/>
+      <w:r>
+        <w:t>major_version</w:t>
+      </w:r>
+      <w:proofErr w:type="spellEnd"/>
+      <w:r>
+        <w:t>&gt; + &lt;</w:t>
+      </w:r>
+      <w:proofErr w:type="spellStart"/>
+      <w:r>
+        <w:t>minor_version</w:t>
+      </w:r>
+      <w:proofErr w:type="spellEnd"/>
+      <w:r>
+        <w:t>&gt; + &lt;</w:t>
+      </w:r>
+      <w:proofErr w:type="spellStart"/>
+      <w:r>
+        <w:t>bbc_model</w:t>
+      </w:r>
+      <w:proofErr w:type="spellEnd"/>
+      <w:r>
+        <w:t>&gt; + &lt;</w:t>
+      </w:r>
+      <w:proofErr w:type="spellStart"/>
       <w:r>
         <w:t>total_</w:t>
       </w:r>
       <w:r>
-        <w:t>execution_count&gt;</w:t>
+        <w:t>execution_count</w:t>
+      </w:r>
+      <w:proofErr w:type="spellEnd"/>
+      <w:r>
+        <w:t>&gt;</w:t>
       </w:r>
     </w:p>
     <w:p>
@@ -1975,11 +2239,16 @@
       <w:r>
         <w:t>&lt;</w:t>
       </w:r>
+      <w:proofErr w:type="spellStart"/>
       <w:r>
         <w:t>major_</w:t>
       </w:r>
       <w:r>
-        <w:t>version&gt;</w:t>
+        <w:t>version</w:t>
+      </w:r>
+      <w:proofErr w:type="spellEnd"/>
+      <w:r>
+        <w:t>&gt;</w:t>
       </w:r>
       <w:r>
         <w:t xml:space="preserve"> </w:t>
@@ -1998,11 +2267,16 @@
       <w:r>
         <w:t>&lt;</w:t>
       </w:r>
+      <w:proofErr w:type="spellStart"/>
       <w:r>
         <w:t>minor</w:t>
       </w:r>
       <w:r>
-        <w:t>_version&gt; (1 byte) Minor version number</w:t>
+        <w:t>_version</w:t>
+      </w:r>
+      <w:proofErr w:type="spellEnd"/>
+      <w:r>
+        <w:t>&gt; (1 byte) Minor version number</w:t>
       </w:r>
       <w:r>
         <w:t>.  Value is 0</w:t>
@@ -2016,7 +2290,15 @@
         <w:ind w:left="360"/>
       </w:pPr>
       <w:r>
-        <w:t>&lt;bbc_model&gt; (1 byte) The BBC model</w:t>
+        <w:t>&lt;</w:t>
+      </w:r>
+      <w:proofErr w:type="spellStart"/>
+      <w:r>
+        <w:t>bbc_model</w:t>
+      </w:r>
+      <w:proofErr w:type="spellEnd"/>
+      <w:r>
+        <w:t>&gt; (1 byte) The BBC model</w:t>
       </w:r>
     </w:p>
     <w:tbl>
@@ -2444,6 +2726,7 @@
       <w:r>
         <w:t>&lt;</w:t>
       </w:r>
+      <w:proofErr w:type="spellStart"/>
       <w:r>
         <w:t>total_</w:t>
       </w:r>
@@ -2454,7 +2737,11 @@
         <w:t>_</w:t>
       </w:r>
       <w:r>
-        <w:t xml:space="preserve">count&gt; (4 bytes) The total number of </w:t>
+        <w:t>count</w:t>
+      </w:r>
+      <w:proofErr w:type="spellEnd"/>
+      <w:r>
+        <w:t xml:space="preserve">&gt; (4 bytes) The total number of </w:t>
       </w:r>
       <w:r>
         <w:t xml:space="preserve">executed </w:t>
@@ -2509,14 +2796,35 @@
           <w:b/>
           <w:bCs/>
         </w:rPr>
-        <w:t>&lt;labels_chunk&gt;</w:t>
+        <w:t>&lt;</w:t>
+      </w:r>
+      <w:proofErr w:type="spellStart"/>
+      <w:r>
+        <w:rPr>
+          <w:b/>
+          <w:bCs/>
+        </w:rPr>
+        <w:t>labels_chunk</w:t>
+      </w:r>
+      <w:proofErr w:type="spellEnd"/>
+      <w:r>
+        <w:rPr>
+          <w:b/>
+          <w:bCs/>
+        </w:rPr>
+        <w:t>&gt;</w:t>
       </w:r>
       <w:r>
         <w:t xml:space="preserve"> = </w:t>
       </w:r>
       <w:r>
-        <w:t>&lt;common_heade</w:t>
-      </w:r>
+        <w:t>&lt;</w:t>
+      </w:r>
+      <w:proofErr w:type="spellStart"/>
+      <w:r>
+        <w:t>common_heade</w:t>
+      </w:r>
+      <w:proofErr w:type="spellEnd"/>
       <w:r>
         <w:t>(</w:t>
       </w:r>
@@ -2527,6 +2835,7 @@
         </w:rPr>
         <w:t>‘</w:t>
       </w:r>
+      <w:proofErr w:type="spellStart"/>
       <w:r>
         <w:rPr>
           <w:rFonts w:ascii="Aptos" w:hAnsi="Aptos"/>
@@ -2536,6 +2845,7 @@
         </w:rPr>
         <w:t>PFlb</w:t>
       </w:r>
+      <w:proofErr w:type="spellEnd"/>
       <w:r>
         <w:t>’</w:t>
       </w:r>
@@ -2546,11 +2856,16 @@
         <w:t xml:space="preserve">&gt; </w:t>
       </w:r>
       <w:r>
-        <w:t>+ &lt;label</w:t>
+        <w:t>+ &lt;</w:t>
+      </w:r>
+      <w:proofErr w:type="spellStart"/>
+      <w:r>
+        <w:t>label</w:t>
       </w:r>
       <w:r>
         <w:t>_data</w:t>
       </w:r>
+      <w:proofErr w:type="spellEnd"/>
       <w:r>
         <w:t>&gt;</w:t>
       </w:r>
@@ -2560,7 +2875,15 @@
         <w:ind w:left="360"/>
       </w:pPr>
       <w:r>
-        <w:t xml:space="preserve">&lt;label_data&gt; = </w:t>
+        <w:t>&lt;</w:t>
+      </w:r>
+      <w:proofErr w:type="spellStart"/>
+      <w:r>
+        <w:t>label_data</w:t>
+      </w:r>
+      <w:proofErr w:type="spellEnd"/>
+      <w:r>
+        <w:t xml:space="preserve">&gt; = </w:t>
       </w:r>
       <w:r>
         <w:t xml:space="preserve">list of </w:t>
@@ -2581,7 +2904,23 @@
       </w:r>
       <w:bookmarkEnd w:id="0"/>
       <w:r>
-        <w:t>&lt;label_address&gt; + &lt;label_name&gt;</w:t>
+        <w:t>&lt;</w:t>
+      </w:r>
+      <w:proofErr w:type="spellStart"/>
+      <w:r>
+        <w:t>label_address</w:t>
+      </w:r>
+      <w:proofErr w:type="spellEnd"/>
+      <w:r>
+        <w:t>&gt; + &lt;</w:t>
+      </w:r>
+      <w:proofErr w:type="spellStart"/>
+      <w:r>
+        <w:t>label_name</w:t>
+      </w:r>
+      <w:proofErr w:type="spellEnd"/>
+      <w:r>
+        <w:t>&gt;</w:t>
       </w:r>
       <w:r>
         <w:t xml:space="preserve"> </w:t>
@@ -2592,7 +2931,15 @@
         <w:ind w:left="810"/>
       </w:pPr>
       <w:r>
-        <w:t xml:space="preserve">&lt;label_address&gt; (2 bytes) </w:t>
+        <w:t>&lt;</w:t>
+      </w:r>
+      <w:proofErr w:type="spellStart"/>
+      <w:r>
+        <w:t>label_address</w:t>
+      </w:r>
+      <w:proofErr w:type="spellEnd"/>
+      <w:r>
+        <w:t xml:space="preserve">&gt; (2 bytes) </w:t>
       </w:r>
       <w:r>
         <w:t xml:space="preserve">A </w:t>
@@ -2688,6 +3035,7 @@
         </w:rPr>
         <w:t>&lt;</w:t>
       </w:r>
+      <w:proofErr w:type="spellStart"/>
       <w:r>
         <w:rPr>
           <w:b/>
@@ -2700,21 +3048,34 @@
           <w:b/>
           <w:bCs/>
         </w:rPr>
-        <w:t>_chunk&gt;</w:t>
-      </w:r>
+        <w:t>_chunk</w:t>
+      </w:r>
+      <w:proofErr w:type="spellEnd"/>
       <w:r>
         <w:rPr>
           <w:b/>
           <w:bCs/>
         </w:rPr>
+        <w:t>&gt;</w:t>
+      </w:r>
+      <w:r>
+        <w:rPr>
+          <w:b/>
+          <w:bCs/>
+        </w:rPr>
         <w:t xml:space="preserve"> </w:t>
       </w:r>
       <w:r>
-        <w:t>= &lt;common_</w:t>
+        <w:t>= &lt;</w:t>
+      </w:r>
+      <w:proofErr w:type="spellStart"/>
+      <w:r>
+        <w:t>common_</w:t>
       </w:r>
       <w:r>
         <w:t>header</w:t>
       </w:r>
+      <w:proofErr w:type="spellEnd"/>
       <w:r>
         <w:t>(</w:t>
       </w:r>
@@ -2725,6 +3086,7 @@
         </w:rPr>
         <w:t>‘</w:t>
       </w:r>
+      <w:proofErr w:type="spellStart"/>
       <w:r>
         <w:rPr>
           <w:rFonts w:ascii="Aptos" w:hAnsi="Aptos"/>
@@ -2732,7 +3094,17 @@
           <w:bCs/>
           <w:color w:val="000000"/>
         </w:rPr>
-        <w:t>PFss’</w:t>
+        <w:t>PFss</w:t>
+      </w:r>
+      <w:proofErr w:type="spellEnd"/>
+      <w:r>
+        <w:rPr>
+          <w:rFonts w:ascii="Aptos" w:hAnsi="Aptos"/>
+          <w:b/>
+          <w:bCs/>
+          <w:color w:val="000000"/>
+        </w:rPr>
+        <w:t>’</w:t>
       </w:r>
       <w:r>
         <w:rPr>
@@ -2752,7 +3124,15 @@
         <w:t xml:space="preserve"> </w:t>
       </w:r>
       <w:r>
-        <w:t>&lt;snapshot_data&gt;</w:t>
+        <w:t>&lt;</w:t>
+      </w:r>
+      <w:proofErr w:type="spellStart"/>
+      <w:r>
+        <w:t>snapshot_data</w:t>
+      </w:r>
+      <w:proofErr w:type="spellEnd"/>
+      <w:r>
+        <w:t>&gt;</w:t>
       </w:r>
     </w:p>
     <w:p>
@@ -2760,26 +3140,63 @@
         <w:ind w:left="720" w:hanging="360"/>
       </w:pPr>
       <w:r>
-        <w:t>&lt;snapshot_data&gt; =</w:t>
+        <w:t>&lt;</w:t>
+      </w:r>
+      <w:proofErr w:type="spellStart"/>
+      <w:r>
+        <w:t>snapshot_data</w:t>
+      </w:r>
+      <w:proofErr w:type="spellEnd"/>
+      <w:r>
+        <w:t>&gt; =</w:t>
       </w:r>
       <w:r>
         <w:br/>
-        <w:t>&lt;stack_</w:t>
+        <w:t>&lt;</w:t>
+      </w:r>
+      <w:proofErr w:type="spellStart"/>
+      <w:r>
+        <w:t>stack_</w:t>
       </w:r>
       <w:r>
         <w:t>pointer</w:t>
       </w:r>
+      <w:proofErr w:type="spellEnd"/>
       <w:r>
         <w:t xml:space="preserve">&gt; + </w:t>
       </w:r>
       <w:r>
-        <w:t xml:space="preserve">&lt;rom_paging_register&gt; + &lt;acccon&gt; + </w:t>
-      </w:r>
-      <w:r>
-        <w:t>&lt;hidden_ram_</w:t>
-      </w:r>
-      <w:r>
-        <w:t>address&gt;</w:t>
+        <w:t>&lt;</w:t>
+      </w:r>
+      <w:proofErr w:type="spellStart"/>
+      <w:r>
+        <w:t>rom_paging_register</w:t>
+      </w:r>
+      <w:proofErr w:type="spellEnd"/>
+      <w:r>
+        <w:t>&gt; + &lt;</w:t>
+      </w:r>
+      <w:proofErr w:type="spellStart"/>
+      <w:r>
+        <w:t>acccon</w:t>
+      </w:r>
+      <w:proofErr w:type="spellEnd"/>
+      <w:r>
+        <w:t xml:space="preserve">&gt; + </w:t>
+      </w:r>
+      <w:r>
+        <w:t>&lt;</w:t>
+      </w:r>
+      <w:proofErr w:type="spellStart"/>
+      <w:r>
+        <w:t>hidden_ram_</w:t>
+      </w:r>
+      <w:r>
+        <w:t>address</w:t>
+      </w:r>
+      <w:proofErr w:type="spellEnd"/>
+      <w:r>
+        <w:t>&gt;</w:t>
       </w:r>
       <w:r>
         <w:rPr>
@@ -2793,7 +3210,23 @@
         <w:t xml:space="preserve"> + </w:t>
       </w:r>
       <w:r>
-        <w:t xml:space="preserve">&lt;6845-registers&gt; + &lt;ULA_video_control_register&gt; + &lt;ULA_palette&gt; + </w:t>
+        <w:t>&lt;6845-registers&gt; + &lt;</w:t>
+      </w:r>
+      <w:proofErr w:type="spellStart"/>
+      <w:r>
+        <w:t>ULA_video_control_register</w:t>
+      </w:r>
+      <w:proofErr w:type="spellEnd"/>
+      <w:r>
+        <w:t>&gt; + &lt;</w:t>
+      </w:r>
+      <w:proofErr w:type="spellStart"/>
+      <w:r>
+        <w:t>ULA_palette</w:t>
+      </w:r>
+      <w:proofErr w:type="spellEnd"/>
+      <w:r>
+        <w:t xml:space="preserve">&gt; + </w:t>
       </w:r>
       <w:r>
         <w:t>&lt;memory&gt;</w:t>
@@ -2804,11 +3237,16 @@
         <w:ind w:left="360"/>
       </w:pPr>
       <w:r>
-        <w:t>&lt;stack_</w:t>
+        <w:t>&lt;</w:t>
+      </w:r>
+      <w:proofErr w:type="spellStart"/>
+      <w:r>
+        <w:t>stack_</w:t>
       </w:r>
       <w:r>
         <w:t>pointer</w:t>
       </w:r>
+      <w:proofErr w:type="spellEnd"/>
       <w:r>
         <w:t xml:space="preserve">&gt; (1 byte).  The value of the stack </w:t>
       </w:r>
@@ -2826,6 +3264,7 @@
       <w:r>
         <w:t>&lt;</w:t>
       </w:r>
+      <w:proofErr w:type="spellStart"/>
       <w:r>
         <w:t>rom_</w:t>
       </w:r>
@@ -2838,6 +3277,7 @@
       <w:r>
         <w:t>_register</w:t>
       </w:r>
+      <w:proofErr w:type="spellEnd"/>
       <w:r>
         <w:t>&gt; (1 byte).</w:t>
       </w:r>
@@ -2873,9 +3313,11 @@
       <w:r>
         <w:t>&lt;</w:t>
       </w:r>
+      <w:proofErr w:type="spellStart"/>
       <w:r>
         <w:t>acccon</w:t>
       </w:r>
+      <w:proofErr w:type="spellEnd"/>
       <w:r>
         <w:t>&gt;</w:t>
       </w:r>
@@ -2906,7 +3348,15 @@
         <w:ind w:left="360"/>
       </w:pPr>
       <w:r>
-        <w:t>&lt;hidden_ram_address&gt; (1 byte)</w:t>
+        <w:t>&lt;</w:t>
+      </w:r>
+      <w:proofErr w:type="spellStart"/>
+      <w:r>
+        <w:t>hidden_ram_address</w:t>
+      </w:r>
+      <w:proofErr w:type="spellEnd"/>
+      <w:r>
+        <w:t>&gt; (1 byte)</w:t>
       </w:r>
       <w:r>
         <w:t xml:space="preserve">.  Populated </w:t>
@@ -3001,7 +3451,15 @@
         <w:ind w:left="360"/>
       </w:pPr>
       <w:r>
-        <w:t>&lt;ULA_video_control_register&gt; (1 byte).  The value of the ULA video control register.</w:t>
+        <w:t>&lt;</w:t>
+      </w:r>
+      <w:proofErr w:type="spellStart"/>
+      <w:r>
+        <w:t>ULA_video_control_register</w:t>
+      </w:r>
+      <w:proofErr w:type="spellEnd"/>
+      <w:r>
+        <w:t>&gt; (1 byte).  The value of the ULA video control register.</w:t>
       </w:r>
     </w:p>
     <w:p>
@@ -3009,7 +3467,15 @@
         <w:ind w:left="360"/>
       </w:pPr>
       <w:r>
-        <w:t xml:space="preserve">&lt;ULA_palette&gt; (16 bytes).  The </w:t>
+        <w:t>&lt;</w:t>
+      </w:r>
+      <w:proofErr w:type="spellStart"/>
+      <w:r>
+        <w:t>ULA_palette</w:t>
+      </w:r>
+      <w:proofErr w:type="spellEnd"/>
+      <w:r>
+        <w:t xml:space="preserve">&gt; (16 bytes).  The </w:t>
       </w:r>
       <w:r>
         <w:t xml:space="preserve">ULA’s </w:t>
@@ -3067,20 +3533,38 @@
       <w:r>
         <w:t>&lt;</w:t>
       </w:r>
+      <w:proofErr w:type="spellStart"/>
       <w:r>
         <w:t>base_</w:t>
       </w:r>
       <w:r>
-        <w:t>memory&gt; + &lt;paged_</w:t>
-      </w:r>
-      <w:r>
         <w:t>memory</w:t>
       </w:r>
+      <w:proofErr w:type="spellEnd"/>
+      <w:r>
+        <w:t>&gt; + &lt;</w:t>
+      </w:r>
+      <w:proofErr w:type="spellStart"/>
+      <w:r>
+        <w:t>paged_</w:t>
+      </w:r>
+      <w:r>
+        <w:t>memory</w:t>
+      </w:r>
+      <w:proofErr w:type="spellEnd"/>
       <w:r>
         <w:t xml:space="preserve">&gt; </w:t>
       </w:r>
       <w:r>
-        <w:t>+ &lt;shadow_ram&gt;</w:t>
+        <w:t>+ &lt;</w:t>
+      </w:r>
+      <w:proofErr w:type="spellStart"/>
+      <w:r>
+        <w:t>shadow_ram</w:t>
+      </w:r>
+      <w:proofErr w:type="spellEnd"/>
+      <w:r>
+        <w:t>&gt;</w:t>
       </w:r>
       <w:r>
         <w:rPr>
@@ -3094,7 +3578,15 @@
         <w:t xml:space="preserve"> + </w:t>
       </w:r>
       <w:r>
-        <w:t>&lt;mos_ram&gt;</w:t>
+        <w:t>&lt;</w:t>
+      </w:r>
+      <w:proofErr w:type="spellStart"/>
+      <w:r>
+        <w:t>mos_ram</w:t>
+      </w:r>
+      <w:proofErr w:type="spellEnd"/>
+      <w:r>
+        <w:t>&gt;</w:t>
       </w:r>
       <w:r>
         <w:rPr>
@@ -3116,7 +3608,15 @@
         <w:t xml:space="preserve"> + </w:t>
       </w:r>
       <w:r>
-        <w:t>&lt;filing_system_ram&gt;</w:t>
+        <w:t>&lt;</w:t>
+      </w:r>
+      <w:proofErr w:type="spellStart"/>
+      <w:r>
+        <w:t>filing_system_ram</w:t>
+      </w:r>
+      <w:proofErr w:type="spellEnd"/>
+      <w:r>
+        <w:t>&gt;</w:t>
       </w:r>
       <w:r>
         <w:rPr>
@@ -3130,7 +3630,15 @@
         <w:t xml:space="preserve"> +</w:t>
       </w:r>
       <w:r>
-        <w:t xml:space="preserve"> &lt;private_ram&gt;</w:t>
+        <w:t xml:space="preserve"> &lt;</w:t>
+      </w:r>
+      <w:proofErr w:type="spellStart"/>
+      <w:r>
+        <w:t>private_ram</w:t>
+      </w:r>
+      <w:proofErr w:type="spellEnd"/>
+      <w:r>
+        <w:t>&gt;</w:t>
       </w:r>
       <w:r>
         <w:rPr>
@@ -3141,7 +3649,15 @@
         <w:t>opt</w:t>
       </w:r>
       <w:r>
-        <w:t xml:space="preserve"> + &lt;hidden_ram&gt;</w:t>
+        <w:t xml:space="preserve"> + &lt;</w:t>
+      </w:r>
+      <w:proofErr w:type="spellStart"/>
+      <w:r>
+        <w:t>hidden_ram</w:t>
+      </w:r>
+      <w:proofErr w:type="spellEnd"/>
+      <w:r>
+        <w:t>&gt;</w:t>
       </w:r>
       <w:r>
         <w:rPr>
@@ -3323,7 +3839,15 @@
               <w:ind w:left="1440" w:hanging="1440"/>
             </w:pPr>
             <w:r>
-              <w:t>&lt;base_memory&gt;</w:t>
+              <w:t>&lt;</w:t>
+            </w:r>
+            <w:proofErr w:type="spellStart"/>
+            <w:r>
+              <w:t>base_memory</w:t>
+            </w:r>
+            <w:proofErr w:type="spellEnd"/>
+            <w:r>
+              <w:t>&gt;</w:t>
             </w:r>
           </w:p>
         </w:tc>
@@ -3396,8 +3920,13 @@
             <w:r>
               <w:t>&lt;</w:t>
             </w:r>
+            <w:proofErr w:type="spellStart"/>
             <w:r>
-              <w:t>paged_memory&gt;</w:t>
+              <w:t>paged_memory</w:t>
+            </w:r>
+            <w:proofErr w:type="spellEnd"/>
+            <w:r>
+              <w:t>&gt;</w:t>
             </w:r>
           </w:p>
         </w:tc>
@@ -3468,7 +3997,15 @@
           </w:tcPr>
           <w:p>
             <w:r>
-              <w:t>&lt;shadow_ram&gt;</w:t>
+              <w:t>&lt;</w:t>
+            </w:r>
+            <w:proofErr w:type="spellStart"/>
+            <w:r>
+              <w:t>shadow_ram</w:t>
+            </w:r>
+            <w:proofErr w:type="spellEnd"/>
+            <w:r>
+              <w:t>&gt;</w:t>
             </w:r>
           </w:p>
         </w:tc>
@@ -3532,7 +4069,15 @@
           </w:tcPr>
           <w:p>
             <w:r>
-              <w:t>&lt;mos_ram&gt;</w:t>
+              <w:t>&lt;</w:t>
+            </w:r>
+            <w:proofErr w:type="spellStart"/>
+            <w:r>
+              <w:t>mos_ram</w:t>
+            </w:r>
+            <w:proofErr w:type="spellEnd"/>
+            <w:r>
+              <w:t>&gt;</w:t>
             </w:r>
           </w:p>
         </w:tc>
@@ -3587,7 +4132,15 @@
           </w:tcPr>
           <w:p>
             <w:r>
-              <w:t>&lt;filing_system_ram&gt;</w:t>
+              <w:t>&lt;</w:t>
+            </w:r>
+            <w:proofErr w:type="spellStart"/>
+            <w:r>
+              <w:t>filing_system_ram</w:t>
+            </w:r>
+            <w:proofErr w:type="spellEnd"/>
+            <w:r>
+              <w:t>&gt;</w:t>
             </w:r>
           </w:p>
         </w:tc>
@@ -3643,7 +4196,15 @@
           <w:p>
             <w:r>
               <w:lastRenderedPageBreak/>
-              <w:t>&lt;private_ram&gt;</w:t>
+              <w:t>&lt;</w:t>
+            </w:r>
+            <w:proofErr w:type="spellStart"/>
+            <w:r>
+              <w:t>private_ram</w:t>
+            </w:r>
+            <w:proofErr w:type="spellEnd"/>
+            <w:r>
+              <w:t>&gt;</w:t>
             </w:r>
           </w:p>
         </w:tc>
@@ -3701,7 +4262,15 @@
           </w:tcPr>
           <w:p>
             <w:r>
-              <w:t>&lt;hidden_ram&gt;</w:t>
+              <w:t>&lt;</w:t>
+            </w:r>
+            <w:proofErr w:type="spellStart"/>
+            <w:r>
+              <w:t>hidden_ram</w:t>
+            </w:r>
+            <w:proofErr w:type="spellEnd"/>
+            <w:r>
+              <w:t>&gt;</w:t>
             </w:r>
           </w:p>
         </w:tc>
@@ -3760,11 +4329,16 @@
       <w:r>
         <w:t>&lt;</w:t>
       </w:r>
+      <w:proofErr w:type="spellStart"/>
       <w:r>
         <w:t>base_</w:t>
       </w:r>
       <w:r>
-        <w:t>memory&gt; (64K) The default 64K of memory.</w:t>
+        <w:t>memory</w:t>
+      </w:r>
+      <w:proofErr w:type="spellEnd"/>
+      <w:r>
+        <w:t>&gt; (64K) The default 64K of memory.</w:t>
       </w:r>
       <w:r>
         <w:t xml:space="preserve">  Addresses 0</w:t>
@@ -3783,23 +4357,38 @@
       <w:r>
         <w:t>&lt;</w:t>
       </w:r>
+      <w:proofErr w:type="spellStart"/>
       <w:r>
         <w:t>paged_</w:t>
       </w:r>
       <w:r>
         <w:t>memory</w:t>
       </w:r>
+      <w:proofErr w:type="spellEnd"/>
       <w:r>
         <w:t>&gt;</w:t>
       </w:r>
       <w:r>
-        <w:t xml:space="preserve"> = &lt;page_count&gt; + &lt;</w:t>
-      </w:r>
+        <w:t xml:space="preserve"> = &lt;</w:t>
+      </w:r>
+      <w:proofErr w:type="spellStart"/>
+      <w:r>
+        <w:t>page_count</w:t>
+      </w:r>
+      <w:proofErr w:type="spellEnd"/>
+      <w:r>
+        <w:t>&gt; + &lt;</w:t>
+      </w:r>
+      <w:proofErr w:type="spellStart"/>
       <w:r>
         <w:t>page_</w:t>
       </w:r>
       <w:r>
-        <w:t>data&gt;</w:t>
+        <w:t>data</w:t>
+      </w:r>
+      <w:proofErr w:type="spellEnd"/>
+      <w:r>
+        <w:t>&gt;</w:t>
       </w:r>
       <w:r>
         <w:rPr>
@@ -3826,7 +4415,15 @@
         <w:ind w:left="720"/>
       </w:pPr>
       <w:r>
-        <w:t>&lt;page_count&gt; (1 byte) The number of pages.</w:t>
+        <w:t>&lt;</w:t>
+      </w:r>
+      <w:proofErr w:type="spellStart"/>
+      <w:r>
+        <w:t>page_count</w:t>
+      </w:r>
+      <w:proofErr w:type="spellEnd"/>
+      <w:r>
+        <w:t>&gt; (1 byte) The number of pages.</w:t>
       </w:r>
     </w:p>
     <w:p>
@@ -3834,7 +4431,39 @@
         <w:ind w:left="720"/>
       </w:pPr>
       <w:r>
-        <w:t>&lt;page_data&gt; = &lt;page_back&gt; + &lt;page_readonly&gt; + &lt;page_memort&gt;</w:t>
+        <w:t>&lt;</w:t>
+      </w:r>
+      <w:proofErr w:type="spellStart"/>
+      <w:r>
+        <w:t>page_data</w:t>
+      </w:r>
+      <w:proofErr w:type="spellEnd"/>
+      <w:r>
+        <w:t>&gt; = &lt;</w:t>
+      </w:r>
+      <w:proofErr w:type="spellStart"/>
+      <w:r>
+        <w:t>page_back</w:t>
+      </w:r>
+      <w:proofErr w:type="spellEnd"/>
+      <w:r>
+        <w:t>&gt; + &lt;</w:t>
+      </w:r>
+      <w:proofErr w:type="spellStart"/>
+      <w:r>
+        <w:t>page_readonly</w:t>
+      </w:r>
+      <w:proofErr w:type="spellEnd"/>
+      <w:r>
+        <w:t>&gt; + &lt;</w:t>
+      </w:r>
+      <w:proofErr w:type="spellStart"/>
+      <w:r>
+        <w:t>page_memort</w:t>
+      </w:r>
+      <w:proofErr w:type="spellEnd"/>
+      <w:r>
+        <w:t>&gt;</w:t>
       </w:r>
     </w:p>
     <w:p>
@@ -3842,11 +4471,16 @@
         <w:ind w:left="1080"/>
       </w:pPr>
       <w:r>
-        <w:t>&lt;page_</w:t>
+        <w:t>&lt;</w:t>
+      </w:r>
+      <w:proofErr w:type="spellStart"/>
+      <w:r>
+        <w:t>page_</w:t>
       </w:r>
       <w:r>
         <w:t>bank</w:t>
       </w:r>
+      <w:proofErr w:type="spellEnd"/>
       <w:r>
         <w:t xml:space="preserve">&gt; (1 byte) A page </w:t>
       </w:r>
@@ -3865,11 +4499,16 @@
         <w:ind w:left="1080"/>
       </w:pPr>
       <w:r>
-        <w:t>&lt;page_</w:t>
+        <w:t>&lt;</w:t>
+      </w:r>
+      <w:proofErr w:type="spellStart"/>
+      <w:r>
+        <w:t>page_</w:t>
       </w:r>
       <w:r>
         <w:t>readonly</w:t>
       </w:r>
+      <w:proofErr w:type="spellEnd"/>
       <w:r>
         <w:t xml:space="preserve">&gt; (1 byte) A page </w:t>
       </w:r>
@@ -3908,9 +4547,11 @@
       <w:r>
         <w:t>&lt;</w:t>
       </w:r>
+      <w:proofErr w:type="spellStart"/>
       <w:r>
         <w:t>page_memory</w:t>
       </w:r>
+      <w:proofErr w:type="spellEnd"/>
       <w:r>
         <w:t xml:space="preserve">&gt; (16K) </w:t>
       </w:r>
@@ -3926,7 +4567,15 @@
         <w:ind w:left="360"/>
       </w:pPr>
       <w:r>
-        <w:t xml:space="preserve">&lt;shadow_ram&gt; (20K) </w:t>
+        <w:t>&lt;</w:t>
+      </w:r>
+      <w:proofErr w:type="spellStart"/>
+      <w:r>
+        <w:t>shadow_ram</w:t>
+      </w:r>
+      <w:proofErr w:type="spellEnd"/>
+      <w:r>
+        <w:t xml:space="preserve">&gt; (20K) </w:t>
       </w:r>
       <w:r>
         <w:t xml:space="preserve">Populated on Model B Plus, BBC Model </w:t>
@@ -3961,7 +4610,15 @@
         <w:ind w:left="360"/>
       </w:pPr>
       <w:r>
-        <w:t xml:space="preserve">&lt;mos_ram&gt; (4K) </w:t>
+        <w:t>&lt;</w:t>
+      </w:r>
+      <w:proofErr w:type="spellStart"/>
+      <w:r>
+        <w:t>mos_ram</w:t>
+      </w:r>
+      <w:proofErr w:type="spellEnd"/>
+      <w:r>
+        <w:t xml:space="preserve">&gt; (4K) </w:t>
       </w:r>
       <w:r>
         <w:t>Populated on BBC Master</w:t>
@@ -3981,7 +4638,15 @@
         <w:ind w:left="360"/>
       </w:pPr>
       <w:r>
-        <w:t xml:space="preserve">&lt;filing_system_ram&gt; (8K) </w:t>
+        <w:t>&lt;</w:t>
+      </w:r>
+      <w:proofErr w:type="spellStart"/>
+      <w:r>
+        <w:t>filing_system_ram</w:t>
+      </w:r>
+      <w:proofErr w:type="spellEnd"/>
+      <w:r>
+        <w:t xml:space="preserve">&gt; (8K) </w:t>
       </w:r>
       <w:r>
         <w:t>Populated on BBC Master</w:t>
@@ -4010,7 +4675,15 @@
         <w:ind w:left="360"/>
       </w:pPr>
       <w:r>
-        <w:t>&lt;private_ram&gt; (</w:t>
+        <w:t>&lt;</w:t>
+      </w:r>
+      <w:proofErr w:type="spellStart"/>
+      <w:r>
+        <w:t>private_ram</w:t>
+      </w:r>
+      <w:proofErr w:type="spellEnd"/>
+      <w:r>
+        <w:t>&gt; (</w:t>
       </w:r>
       <w:r>
         <w:t>12</w:t>
@@ -4039,12 +4712,14 @@
       <w:r>
         <w:t>Integra</w:t>
       </w:r>
+      <w:proofErr w:type="gramStart"/>
       <w:r>
         <w:t>.</w:t>
       </w:r>
       <w:r>
         <w:t xml:space="preserve"> </w:t>
       </w:r>
+      <w:proofErr w:type="gramEnd"/>
       <w:r>
         <w:t>Addresses &amp;</w:t>
       </w:r>
@@ -4069,7 +4744,15 @@
         <w:ind w:left="360"/>
       </w:pPr>
       <w:r>
-        <w:t xml:space="preserve">&lt;hidden_ram&gt; (256 bytes) </w:t>
+        <w:t>&lt;</w:t>
+      </w:r>
+      <w:proofErr w:type="spellStart"/>
+      <w:r>
+        <w:t>hidden_ram</w:t>
+      </w:r>
+      <w:proofErr w:type="spellEnd"/>
+      <w:r>
+        <w:t xml:space="preserve">&gt; (256 bytes) </w:t>
       </w:r>
       <w:r>
         <w:t>Populated on BBC Model Integra B.</w:t>
@@ -4154,11 +4837,32 @@
           <w:b/>
           <w:bCs/>
         </w:rPr>
-        <w:t>&lt;execution_chunk&gt;</w:t>
-      </w:r>
-      <w:r>
-        <w:t xml:space="preserve"> = &lt;common_header</w:t>
-      </w:r>
+        <w:t>&lt;</w:t>
+      </w:r>
+      <w:proofErr w:type="spellStart"/>
+      <w:r>
+        <w:rPr>
+          <w:b/>
+          <w:bCs/>
+        </w:rPr>
+        <w:t>execution_chunk</w:t>
+      </w:r>
+      <w:proofErr w:type="spellEnd"/>
+      <w:r>
+        <w:rPr>
+          <w:b/>
+          <w:bCs/>
+        </w:rPr>
+        <w:t>&gt;</w:t>
+      </w:r>
+      <w:r>
+        <w:t xml:space="preserve"> = &lt;</w:t>
+      </w:r>
+      <w:proofErr w:type="spellStart"/>
+      <w:r>
+        <w:t>common_header</w:t>
+      </w:r>
+      <w:proofErr w:type="spellEnd"/>
       <w:r>
         <w:t>(</w:t>
       </w:r>
@@ -4169,6 +4873,7 @@
         </w:rPr>
         <w:t>‘</w:t>
       </w:r>
+      <w:proofErr w:type="spellStart"/>
       <w:r>
         <w:rPr>
           <w:rFonts w:ascii="Aptos" w:hAnsi="Aptos"/>
@@ -4176,7 +4881,17 @@
           <w:bCs/>
           <w:color w:val="000000"/>
         </w:rPr>
-        <w:t>PFex’</w:t>
+        <w:t>PFex</w:t>
+      </w:r>
+      <w:proofErr w:type="spellEnd"/>
+      <w:r>
+        <w:rPr>
+          <w:rFonts w:ascii="Aptos" w:hAnsi="Aptos"/>
+          <w:b/>
+          <w:bCs/>
+          <w:color w:val="000000"/>
+        </w:rPr>
+        <w:t>’</w:t>
       </w:r>
       <w:r>
         <w:rPr>
@@ -4186,7 +4901,15 @@
         <w:t>)</w:t>
       </w:r>
       <w:r>
-        <w:t>&gt; + &lt;execution_data&gt;</w:t>
+        <w:t>&gt; + &lt;</w:t>
+      </w:r>
+      <w:proofErr w:type="spellStart"/>
+      <w:r>
+        <w:t>execution_data</w:t>
+      </w:r>
+      <w:proofErr w:type="spellEnd"/>
+      <w:r>
+        <w:t>&gt;</w:t>
       </w:r>
     </w:p>
     <w:p>
@@ -4194,7 +4917,15 @@
         <w:ind w:left="360"/>
       </w:pPr>
       <w:r>
-        <w:t xml:space="preserve">&lt;execution_data&gt; = </w:t>
+        <w:t>&lt;</w:t>
+      </w:r>
+      <w:proofErr w:type="spellStart"/>
+      <w:r>
+        <w:t>execution_data</w:t>
+      </w:r>
+      <w:proofErr w:type="spellEnd"/>
+      <w:r>
+        <w:t xml:space="preserve">&gt; = </w:t>
       </w:r>
       <w:r>
         <w:t xml:space="preserve">list of </w:t>
@@ -4247,11 +4978,20 @@
         <w:br/>
       </w:r>
       <w:r>
-        <w:t xml:space="preserve">&lt;interrupt_marker&gt; + </w:t>
-      </w:r>
-      <w:r>
         <w:t>&lt;</w:t>
       </w:r>
+      <w:proofErr w:type="spellStart"/>
+      <w:r>
+        <w:t>interrupt_marker</w:t>
+      </w:r>
+      <w:proofErr w:type="spellEnd"/>
+      <w:r>
+        <w:t xml:space="preserve">&gt; + </w:t>
+      </w:r>
+      <w:r>
+        <w:t>&lt;</w:t>
+      </w:r>
+      <w:proofErr w:type="spellStart"/>
       <w:r>
         <w:t>address</w:t>
       </w:r>
@@ -4261,8 +5001,13 @@
       <w:r>
         <w:t>service_routine</w:t>
       </w:r>
-      <w:r>
-        <w:t>&gt; + &lt;address</w:t>
+      <w:proofErr w:type="spellEnd"/>
+      <w:r>
+        <w:t>&gt; + &lt;</w:t>
+      </w:r>
+      <w:proofErr w:type="spellStart"/>
+      <w:r>
+        <w:t>address</w:t>
       </w:r>
       <w:r>
         <w:t>_</w:t>
@@ -4270,11 +5015,20 @@
       <w:r>
         <w:t>interrupted</w:t>
       </w:r>
+      <w:proofErr w:type="spellEnd"/>
       <w:r>
         <w:t>&gt; +</w:t>
       </w:r>
       <w:r>
-        <w:t xml:space="preserve"> &lt;stack_pointer&gt;</w:t>
+        <w:t xml:space="preserve"> &lt;</w:t>
+      </w:r>
+      <w:proofErr w:type="spellStart"/>
+      <w:r>
+        <w:t>stack_pointer</w:t>
+      </w:r>
+      <w:proofErr w:type="spellEnd"/>
+      <w:r>
+        <w:t>&gt;</w:t>
       </w:r>
       <w:r>
         <w:t xml:space="preserve"> </w:t>
@@ -4285,7 +5039,15 @@
         <w:ind w:left="720"/>
       </w:pPr>
       <w:r>
-        <w:t>&lt;interrupt_marker&gt; (2 bytes).  A two-byte value that distinguishes a &lt;interrupt&gt; from a &lt;instruction&gt;.</w:t>
+        <w:t>&lt;</w:t>
+      </w:r>
+      <w:proofErr w:type="spellStart"/>
+      <w:r>
+        <w:t>interrupt_marker</w:t>
+      </w:r>
+      <w:proofErr w:type="spellEnd"/>
+      <w:r>
+        <w:t>&gt; (2 bytes).  A two-byte value that distinguishes a &lt;interrupt&gt; from a &lt;instruction&gt;.</w:t>
       </w:r>
       <w:r>
         <w:t xml:space="preserve"> </w:t>
@@ -4465,7 +5227,15 @@
         <w:ind w:left="720"/>
       </w:pPr>
       <w:r>
-        <w:t>&lt;address_service_routine&gt; (2 bytes).  The address of the interrupt service routine.</w:t>
+        <w:t>&lt;</w:t>
+      </w:r>
+      <w:proofErr w:type="spellStart"/>
+      <w:r>
+        <w:t>address_service_routine</w:t>
+      </w:r>
+      <w:proofErr w:type="spellEnd"/>
+      <w:r>
+        <w:t>&gt; (2 bytes).  The address of the interrupt service routine.</w:t>
       </w:r>
     </w:p>
     <w:p>
@@ -4473,11 +5243,16 @@
         <w:ind w:left="720"/>
       </w:pPr>
       <w:r>
-        <w:t>&lt;address_</w:t>
+        <w:t>&lt;</w:t>
+      </w:r>
+      <w:proofErr w:type="spellStart"/>
+      <w:r>
+        <w:t>address_</w:t>
       </w:r>
       <w:r>
         <w:t>interrupted</w:t>
       </w:r>
+      <w:proofErr w:type="spellEnd"/>
       <w:r>
         <w:t xml:space="preserve"> &gt; (2 bytes).  The address of </w:t>
       </w:r>
@@ -4493,7 +5268,15 @@
         <w:ind w:left="720"/>
       </w:pPr>
       <w:r>
-        <w:t xml:space="preserve">&lt;cycle_count&gt; </w:t>
+        <w:t>&lt;</w:t>
+      </w:r>
+      <w:proofErr w:type="spellStart"/>
+      <w:r>
+        <w:t>cycle_count</w:t>
+      </w:r>
+      <w:proofErr w:type="spellEnd"/>
+      <w:r>
+        <w:t xml:space="preserve">&gt; </w:t>
       </w:r>
       <w:r>
         <w:t>(1 byte) S</w:t>
@@ -4507,7 +5290,15 @@
         <w:ind w:left="720"/>
       </w:pPr>
       <w:r>
-        <w:t xml:space="preserve">&lt;stack_pointer&gt; </w:t>
+        <w:t>&lt;</w:t>
+      </w:r>
+      <w:proofErr w:type="spellStart"/>
+      <w:r>
+        <w:t>stack_pointer</w:t>
+      </w:r>
+      <w:proofErr w:type="spellEnd"/>
+      <w:r>
+        <w:t xml:space="preserve">&gt; </w:t>
       </w:r>
       <w:r>
         <w:t>(1 bytes) S</w:t>
@@ -4541,11 +5332,16 @@
       <w:r>
         <w:t>&lt;</w:t>
       </w:r>
+      <w:proofErr w:type="spellStart"/>
       <w:r>
         <w:t>opcode_</w:t>
       </w:r>
       <w:r>
-        <w:t>address&gt; + &lt;opcode&gt; + &lt;operand&gt;</w:t>
+        <w:t>address</w:t>
+      </w:r>
+      <w:proofErr w:type="spellEnd"/>
+      <w:r>
+        <w:t>&gt; + &lt;opcode&gt; + &lt;operand&gt;</w:t>
       </w:r>
       <w:r>
         <w:rPr>
@@ -4572,8 +5368,13 @@
       <w:r>
         <w:t>&lt;</w:t>
       </w:r>
-      <w:r>
-        <w:t>stack_pointer&gt;</w:t>
+      <w:proofErr w:type="spellStart"/>
+      <w:r>
+        <w:t>stack_pointer</w:t>
+      </w:r>
+      <w:proofErr w:type="spellEnd"/>
+      <w:r>
+        <w:t>&gt;</w:t>
       </w:r>
       <w:r>
         <w:rPr>
@@ -4587,7 +5388,15 @@
         <w:t xml:space="preserve"> + </w:t>
       </w:r>
       <w:r>
-        <w:t>&lt;return_address&gt;</w:t>
+        <w:t>&lt;</w:t>
+      </w:r>
+      <w:proofErr w:type="spellStart"/>
+      <w:r>
+        <w:t>return_address</w:t>
+      </w:r>
+      <w:proofErr w:type="spellEnd"/>
+      <w:r>
+        <w:t>&gt;</w:t>
       </w:r>
       <w:r>
         <w:rPr>
@@ -4612,7 +5421,15 @@
         <w:t xml:space="preserve">+ </w:t>
       </w:r>
       <w:r>
-        <w:t>&lt;memory_address&gt;</w:t>
+        <w:t>&lt;</w:t>
+      </w:r>
+      <w:proofErr w:type="spellStart"/>
+      <w:r>
+        <w:t>memory_address</w:t>
+      </w:r>
+      <w:proofErr w:type="spellEnd"/>
+      <w:r>
+        <w:t>&gt;</w:t>
       </w:r>
       <w:r>
         <w:rPr>
@@ -4633,6 +5450,7 @@
       <w:r>
         <w:t xml:space="preserve"> &lt;</w:t>
       </w:r>
+      <w:proofErr w:type="spellStart"/>
       <w:r>
         <w:t>memory</w:t>
       </w:r>
@@ -4642,6 +5460,7 @@
       <w:r>
         <w:t>_value</w:t>
       </w:r>
+      <w:proofErr w:type="spellEnd"/>
       <w:r>
         <w:t>&gt;</w:t>
       </w:r>
@@ -4664,9 +5483,11 @@
       <w:r>
         <w:t>+ &lt;</w:t>
       </w:r>
+      <w:proofErr w:type="spellStart"/>
       <w:r>
         <w:t>memory_write_value</w:t>
       </w:r>
+      <w:proofErr w:type="spellEnd"/>
       <w:r>
         <w:t>&gt;</w:t>
       </w:r>
@@ -4686,11 +5507,16 @@
       <w:r>
         <w:t>&lt;</w:t>
       </w:r>
+      <w:proofErr w:type="spellStart"/>
       <w:r>
         <w:t>opcode_</w:t>
       </w:r>
       <w:r>
-        <w:t>address&gt;</w:t>
+        <w:t>address</w:t>
+      </w:r>
+      <w:proofErr w:type="spellEnd"/>
+      <w:r>
+        <w:t>&gt;</w:t>
       </w:r>
       <w:r>
         <w:t xml:space="preserve"> </w:t>
@@ -4938,6 +5764,7 @@
             <w:r>
               <w:t>&amp;</w:t>
             </w:r>
+            <w:proofErr w:type="gramStart"/>
             <w:r>
               <w:t>8</w:t>
             </w:r>
@@ -4947,6 +5774,7 @@
             <w:r>
               <w:t>..</w:t>
             </w:r>
+            <w:proofErr w:type="gramEnd"/>
             <w:r>
               <w:t>&amp;</w:t>
             </w:r>
@@ -5027,7 +5855,15 @@
               <w:t xml:space="preserve"> </w:t>
             </w:r>
             <w:r>
-              <w:t>&amp;0000..&amp;7F</w:t>
+              <w:t>&amp;</w:t>
+            </w:r>
+            <w:proofErr w:type="gramStart"/>
+            <w:r>
+              <w:t>0000..</w:t>
+            </w:r>
+            <w:proofErr w:type="gramEnd"/>
+            <w:r>
+              <w:t>&amp;7F</w:t>
             </w:r>
             <w:r>
               <w:t>FF</w:t>
@@ -5042,12 +5878,14 @@
             <w:pPr>
               <w:jc w:val="center"/>
             </w:pPr>
+            <w:proofErr w:type="gramStart"/>
             <w:r>
               <w:t>0..</w:t>
             </w:r>
             <w:r>
               <w:t>&amp;</w:t>
             </w:r>
+            <w:proofErr w:type="gramEnd"/>
             <w:r>
               <w:t>7F</w:t>
             </w:r>
@@ -5061,12 +5899,14 @@
             <w:pPr>
               <w:jc w:val="center"/>
             </w:pPr>
+            <w:proofErr w:type="gramStart"/>
             <w:r>
               <w:t>0..</w:t>
             </w:r>
             <w:r>
               <w:t>&amp;</w:t>
             </w:r>
+            <w:proofErr w:type="gramEnd"/>
             <w:r>
               <w:t>FF</w:t>
             </w:r>
@@ -5110,7 +5950,15 @@
               <w:t>:</w:t>
             </w:r>
             <w:r>
-              <w:t xml:space="preserve"> &amp;8000..&amp;FFFF</w:t>
+              <w:t xml:space="preserve"> &amp;</w:t>
+            </w:r>
+            <w:proofErr w:type="gramStart"/>
+            <w:r>
+              <w:t>8000..</w:t>
+            </w:r>
+            <w:proofErr w:type="gramEnd"/>
+            <w:r>
+              <w:t>&amp;FFFF</w:t>
             </w:r>
           </w:p>
         </w:tc>
@@ -5141,9 +5989,11 @@
             <w:r>
               <w:t>&amp;</w:t>
             </w:r>
+            <w:proofErr w:type="gramStart"/>
             <w:r>
               <w:t>80..</w:t>
             </w:r>
+            <w:proofErr w:type="gramEnd"/>
             <w:r>
               <w:t>&amp;</w:t>
             </w:r>
@@ -5160,12 +6010,14 @@
             <w:pPr>
               <w:jc w:val="center"/>
             </w:pPr>
+            <w:proofErr w:type="gramStart"/>
             <w:r>
               <w:t>0..</w:t>
             </w:r>
             <w:r>
               <w:t>&amp;</w:t>
             </w:r>
+            <w:proofErr w:type="gramEnd"/>
             <w:r>
               <w:t>FF</w:t>
             </w:r>
@@ -5916,7 +6768,15 @@
         </w:rPr>
       </w:pPr>
       <w:r>
-        <w:t xml:space="preserve">&lt;stack_pointer&gt; (1 byte) Populated for </w:t>
+        <w:t>&lt;</w:t>
+      </w:r>
+      <w:proofErr w:type="spellStart"/>
+      <w:r>
+        <w:t>stack_pointer</w:t>
+      </w:r>
+      <w:proofErr w:type="spellEnd"/>
+      <w:r>
+        <w:t xml:space="preserve">&gt; (1 byte) Populated for </w:t>
       </w:r>
       <w:r>
         <w:t xml:space="preserve">opcodes </w:t>
@@ -5978,7 +6838,15 @@
         <w:ind w:left="720"/>
       </w:pPr>
       <w:r>
-        <w:t xml:space="preserve">&lt;return_address&gt; (2 bytes) Populated for the </w:t>
+        <w:t>&lt;</w:t>
+      </w:r>
+      <w:proofErr w:type="spellStart"/>
+      <w:r>
+        <w:t>return_address</w:t>
+      </w:r>
+      <w:proofErr w:type="spellEnd"/>
+      <w:r>
+        <w:t xml:space="preserve">&gt; (2 bytes) Populated for the </w:t>
       </w:r>
       <w:r>
         <w:rPr>
@@ -6018,7 +6886,15 @@
         <w:ind w:left="720"/>
       </w:pPr>
       <w:r>
-        <w:t>&lt;memory_address&gt; (2 bytes) Populated for all opcodes that use the following addressing modes:</w:t>
+        <w:t>&lt;</w:t>
+      </w:r>
+      <w:proofErr w:type="spellStart"/>
+      <w:r>
+        <w:t>memory_address</w:t>
+      </w:r>
+      <w:proofErr w:type="spellEnd"/>
+      <w:r>
+        <w:t>&gt; (2 bytes) Populated for all opcodes that use the following addressing modes:</w:t>
       </w:r>
     </w:p>
     <w:p>
@@ -6229,11 +7105,16 @@
         <w:ind w:left="720"/>
       </w:pPr>
       <w:r>
-        <w:t>&lt;memory</w:t>
+        <w:t>&lt;</w:t>
+      </w:r>
+      <w:proofErr w:type="spellStart"/>
+      <w:r>
+        <w:t>memory</w:t>
       </w:r>
       <w:r>
         <w:t>_read_value</w:t>
       </w:r>
+      <w:proofErr w:type="spellEnd"/>
       <w:r>
         <w:t xml:space="preserve">&gt; (1 byte) Populated for </w:t>
       </w:r>
@@ -6298,10 +7179,26 @@
         <w:ind w:left="720"/>
       </w:pPr>
       <w:r>
-        <w:t xml:space="preserve">&lt;memory_write_value&gt; (1 byte) Populated for opcodes that </w:t>
-      </w:r>
-      <w:r>
-        <w:t xml:space="preserve">write to </w:t>
+        <w:t>&lt;</w:t>
+      </w:r>
+      <w:proofErr w:type="spellStart"/>
+      <w:r>
+        <w:t>memory_write_value</w:t>
+      </w:r>
+      <w:proofErr w:type="spellEnd"/>
+      <w:r>
+        <w:t xml:space="preserve">&gt; (1 byte) Populated for </w:t>
+      </w:r>
+      <w:proofErr w:type="gramStart"/>
+      <w:r>
+        <w:t xml:space="preserve">opcodes that </w:t>
+      </w:r>
+      <w:r>
+        <w:t>write</w:t>
+      </w:r>
+      <w:proofErr w:type="gramEnd"/>
+      <w:r>
+        <w:t xml:space="preserve"> to </w:t>
       </w:r>
       <w:r>
         <w:t>an address</w:t>
@@ -6324,11 +7221,16 @@
       <w:r>
         <w:t>attempted to be written</w:t>
       </w:r>
+      <w:proofErr w:type="gramStart"/>
       <w:r>
         <w:t>.</w:t>
       </w:r>
       <w:r>
-        <w:t xml:space="preserve"> This includes </w:t>
+        <w:t xml:space="preserve"> </w:t>
+      </w:r>
+      <w:proofErr w:type="gramEnd"/>
+      <w:r>
+        <w:t xml:space="preserve">This includes </w:t>
       </w:r>
       <w:r>
         <w:lastRenderedPageBreak/>
@@ -6369,6 +7271,7 @@
       </w:r>
     </w:p>
     <w:p>
+      <w:proofErr w:type="gramStart"/>
       <w:r>
         <w:t xml:space="preserve">A </w:t>
       </w:r>
@@ -6379,6 +7282,7 @@
         </w:rPr>
         <w:t>.perf</w:t>
       </w:r>
+      <w:proofErr w:type="gramEnd"/>
       <w:r>
         <w:t xml:space="preserve"> </w:t>
       </w:r>
@@ -6527,6 +7431,7 @@
       <w:r>
         <w:t xml:space="preserve">a </w:t>
       </w:r>
+      <w:proofErr w:type="spellStart"/>
       <w:r>
         <w:rPr>
           <w:b/>
@@ -6534,6 +7439,7 @@
         </w:rPr>
         <w:t>PerfWriter</w:t>
       </w:r>
+      <w:proofErr w:type="spellEnd"/>
       <w:r>
         <w:t xml:space="preserve"> class</w:t>
       </w:r>
@@ -6885,6 +7791,7 @@
       <w:pPr>
         <w:pStyle w:val="Heading1"/>
       </w:pPr>
+      <w:proofErr w:type="spellStart"/>
       <w:r>
         <w:t>Bee</w:t>
       </w:r>
@@ -6894,10 +7801,19 @@
       <w:r>
         <w:t>Perf</w:t>
       </w:r>
-    </w:p>
-    <w:p>
-      <w:r>
-        <w:t xml:space="preserve">As outlined above, BeebPerf is a standalone </w:t>
+      <w:proofErr w:type="spellEnd"/>
+    </w:p>
+    <w:p>
+      <w:r>
+        <w:t xml:space="preserve">As outlined above, </w:t>
+      </w:r>
+      <w:proofErr w:type="spellStart"/>
+      <w:r>
+        <w:t>BeebPerf</w:t>
+      </w:r>
+      <w:proofErr w:type="spellEnd"/>
+      <w:r>
+        <w:t xml:space="preserve"> is a standalone </w:t>
       </w:r>
       <w:r>
         <w:t xml:space="preserve">Windows </w:t>
@@ -8764,15 +9680,19 @@
       <w:r>
         <w:t xml:space="preserve">Hexadecimal </w:t>
       </w:r>
+      <w:proofErr w:type="gramStart"/>
       <w:r>
         <w:t>symbol: ‘</w:t>
       </w:r>
+      <w:proofErr w:type="gramEnd"/>
       <w:r>
         <w:t>$</w:t>
       </w:r>
+      <w:proofErr w:type="gramStart"/>
       <w:r>
         <w:t>’, ‘</w:t>
       </w:r>
+      <w:proofErr w:type="gramEnd"/>
       <w:r>
         <w:t>&amp;</w:t>
       </w:r>
@@ -8918,13 +9838,21 @@
         <w:t xml:space="preserve"> </w:t>
       </w:r>
       <w:r>
-        <w:t>or label.  For example, wait</w:t>
+        <w:t xml:space="preserve">or label.  For example, </w:t>
+      </w:r>
+      <w:proofErr w:type="spellStart"/>
+      <w:r>
+        <w:t>wait</w:t>
       </w:r>
       <w:r>
         <w:t>On</w:t>
       </w:r>
       <w:r>
-        <w:t>VSync could be configured to show a marker on completion.  Markers can be shown either as a milestone (diamond), or as a vertical line.</w:t>
+        <w:t>VSync</w:t>
+      </w:r>
+      <w:proofErr w:type="spellEnd"/>
+      <w:r>
+        <w:t xml:space="preserve"> could be configured to show a marker on completion.  Markers can be shown either as a milestone (diamond), or as a vertical line.</w:t>
       </w:r>
     </w:p>
     <w:p>
@@ -9487,9 +10415,11 @@
       <w:r>
         <w:t xml:space="preserve">Aggregated CPU Metrics, by </w:t>
       </w:r>
+      <w:proofErr w:type="spellStart"/>
       <w:r>
         <w:t>RoutineStack</w:t>
       </w:r>
+      <w:proofErr w:type="spellEnd"/>
       <w:r>
         <w:t xml:space="preserve"> – </w:t>
       </w:r>
@@ -9555,6 +10485,7 @@
           <w:numId w:val="9"/>
         </w:numPr>
       </w:pPr>
+      <w:proofErr w:type="spellStart"/>
       <w:r>
         <w:rPr>
           <w:b/>
@@ -9562,11 +10493,20 @@
         </w:rPr>
         <w:t>CallStack</w:t>
       </w:r>
+      <w:proofErr w:type="spellEnd"/>
       <w:r>
         <w:t xml:space="preserve"> – represents a</w:t>
       </w:r>
       <w:r>
-        <w:t xml:space="preserve"> call stack within the recorded program. Contains the following fields:</w:t>
+        <w:t xml:space="preserve"> call stack within the recorded program</w:t>
+      </w:r>
+      <w:proofErr w:type="gramStart"/>
+      <w:r>
+        <w:t xml:space="preserve">. </w:t>
+      </w:r>
+      <w:proofErr w:type="gramEnd"/>
+      <w:r>
+        <w:t>Contains the following fields:</w:t>
       </w:r>
     </w:p>
     <w:p>
@@ -9611,7 +10551,15 @@
         </w:numPr>
       </w:pPr>
       <w:r>
-        <w:t>Parent CallStack reference</w:t>
+        <w:t xml:space="preserve">Parent </w:t>
+      </w:r>
+      <w:proofErr w:type="spellStart"/>
+      <w:r>
+        <w:t>CallStack</w:t>
+      </w:r>
+      <w:proofErr w:type="spellEnd"/>
+      <w:r>
+        <w:t xml:space="preserve"> reference</w:t>
       </w:r>
     </w:p>
     <w:p>
@@ -9646,7 +10594,15 @@
         <w:ind w:left="1080"/>
       </w:pPr>
       <w:r>
-        <w:t xml:space="preserve">The identify of a CallStack is defined </w:t>
+        <w:t xml:space="preserve">The identify of a </w:t>
+      </w:r>
+      <w:proofErr w:type="spellStart"/>
+      <w:r>
+        <w:t>CallStack</w:t>
+      </w:r>
+      <w:proofErr w:type="spellEnd"/>
+      <w:r>
+        <w:t xml:space="preserve"> is defined </w:t>
       </w:r>
       <w:r>
         <w:t xml:space="preserve">by the sequence of </w:t>
@@ -9687,6 +10643,7 @@
           <w:numId w:val="9"/>
         </w:numPr>
       </w:pPr>
+      <w:proofErr w:type="spellStart"/>
       <w:r>
         <w:rPr>
           <w:b/>
@@ -9694,6 +10651,7 @@
         </w:rPr>
         <w:t>StackFrame</w:t>
       </w:r>
+      <w:proofErr w:type="spellEnd"/>
       <w:r>
         <w:t xml:space="preserve"> – represents a unique stack-frame within the recorded program.</w:t>
       </w:r>
@@ -11742,7 +12700,11 @@
         </w:numPr>
       </w:pPr>
       <w:r>
-        <w:t>Populate No</w:t>
+        <w:t xml:space="preserve">Populate </w:t>
+      </w:r>
+      <w:proofErr w:type="spellStart"/>
+      <w:r>
+        <w:t>No</w:t>
       </w:r>
       <w:r>
         <w:t>Tr</w:t>
@@ -11753,6 +12715,7 @@
       <w:r>
         <w:t>verse</w:t>
       </w:r>
+      <w:proofErr w:type="spellEnd"/>
       <w:r>
         <w:t xml:space="preserve"> </w:t>
       </w:r>
@@ -11822,11 +12785,16 @@
           <w:numId w:val="19"/>
         </w:numPr>
       </w:pPr>
+      <w:proofErr w:type="spellStart"/>
       <w:r>
         <w:t>Routine</w:t>
       </w:r>
       <w:r>
-        <w:t>aggregated and total aggregated</w:t>
+        <w:t>aggregated</w:t>
+      </w:r>
+      <w:proofErr w:type="spellEnd"/>
+      <w:r>
+        <w:t xml:space="preserve"> and total aggregated</w:t>
       </w:r>
       <w:r>
         <w:t xml:space="preserve"> CPU metrics</w:t>
@@ -12200,10 +13168,18 @@
         <w:t xml:space="preserve"> (this can be calculated) </w:t>
       </w:r>
       <w:r>
-        <w:t xml:space="preserve">on the </w:t>
-      </w:r>
-      <w:r>
-        <w:t xml:space="preserve">Video </w:t>
+        <w:t xml:space="preserve">on </w:t>
+      </w:r>
+      <w:proofErr w:type="gramStart"/>
+      <w:r>
+        <w:t xml:space="preserve">the </w:t>
+      </w:r>
+      <w:r>
+        <w:t>Video</w:t>
+      </w:r>
+      <w:proofErr w:type="gramEnd"/>
+      <w:r>
+        <w:t xml:space="preserve"> </w:t>
       </w:r>
       <w:r>
         <w:t>6845</w:t>
@@ -12238,7 +13214,15 @@
         </w:numPr>
       </w:pPr>
       <w:r>
-        <w:t>Detecting roms being paged in.  The easiest way to handle this is to record the value written to &amp;</w:t>
+        <w:t xml:space="preserve">Detecting </w:t>
+      </w:r>
+      <w:proofErr w:type="spellStart"/>
+      <w:r>
+        <w:t>roms</w:t>
+      </w:r>
+      <w:proofErr w:type="spellEnd"/>
+      <w:r>
+        <w:t xml:space="preserve"> being paged in.  The easiest way to handle this is to record the value written to &amp;</w:t>
       </w:r>
       <w:r>
         <w:t>FE30</w:t>
@@ -12265,7 +13249,15 @@
         </w:numPr>
       </w:pPr>
       <w:r>
-        <w:t>A spin loop is a tight look that doesn’t write anything, it just reads something. They are shown in light grey (background is white).</w:t>
+        <w:t>A spin loop is a tight look that doesn’t write anything, it just reads something</w:t>
+      </w:r>
+      <w:proofErr w:type="gramStart"/>
+      <w:r>
+        <w:t xml:space="preserve">. </w:t>
+      </w:r>
+      <w:proofErr w:type="gramEnd"/>
+      <w:r>
+        <w:t>They are shown in light grey (background is white).</w:t>
       </w:r>
       <w:r>
         <w:t xml:space="preserve">  We are looking for a repeated set of non-instructions in the recording.</w:t>
@@ -12292,7 +13284,15 @@
         </w:numPr>
       </w:pPr>
       <w:r>
-        <w:t>Look for repeating instructions.</w:t>
+        <w:t xml:space="preserve">Look for </w:t>
+      </w:r>
+      <w:proofErr w:type="gramStart"/>
+      <w:r>
+        <w:t>repeating</w:t>
+      </w:r>
+      <w:proofErr w:type="gramEnd"/>
+      <w:r>
+        <w:t xml:space="preserve"> instructions.</w:t>
       </w:r>
     </w:p>
     <w:p>
@@ -12304,7 +13304,15 @@
         </w:numPr>
       </w:pPr>
       <w:r>
-        <w:t>Detecting when screen memory is being read. We need to know.</w:t>
+        <w:t>Detecting when screen memory is being read</w:t>
+      </w:r>
+      <w:proofErr w:type="gramStart"/>
+      <w:r>
+        <w:t xml:space="preserve">. </w:t>
+      </w:r>
+      <w:proofErr w:type="gramEnd"/>
+      <w:r>
+        <w:t>We need to know.</w:t>
       </w:r>
     </w:p>
     <w:p>
@@ -12316,7 +13324,15 @@
         </w:numPr>
       </w:pPr>
       <w:r>
-        <w:t xml:space="preserve">The screen start address.  Write value stored to </w:t>
+        <w:t xml:space="preserve">The screen </w:t>
+      </w:r>
+      <w:proofErr w:type="gramStart"/>
+      <w:r>
+        <w:t>start</w:t>
+      </w:r>
+      <w:proofErr w:type="gramEnd"/>
+      <w:r>
+        <w:t xml:space="preserve"> address.  Write value stored to </w:t>
       </w:r>
       <w:r>
         <w:t>&amp;FE00</w:t>
@@ -12340,7 +13356,15 @@
         </w:numPr>
       </w:pPr>
       <w:r>
-        <w:t xml:space="preserve">The screen wrap-size (how many K). Write value stored to </w:t>
+        <w:t>The screen wrap-size (how many K)</w:t>
+      </w:r>
+      <w:proofErr w:type="gramStart"/>
+      <w:r>
+        <w:t xml:space="preserve">. </w:t>
+      </w:r>
+      <w:proofErr w:type="gramEnd"/>
+      <w:r>
+        <w:t xml:space="preserve">Write value stored to </w:t>
       </w:r>
       <w:r>
         <w:t>&amp;FE40</w:t>
@@ -12355,7 +13379,23 @@
         </w:numPr>
       </w:pPr>
       <w:r>
-        <w:t xml:space="preserve">The screen format (mode-7 verses non mode-7). Write values stored at </w:t>
+        <w:t xml:space="preserve">The screen format (mode-7 verses </w:t>
+      </w:r>
+      <w:proofErr w:type="gramStart"/>
+      <w:r>
+        <w:t>non mode</w:t>
+      </w:r>
+      <w:proofErr w:type="gramEnd"/>
+      <w:r>
+        <w:t>-7)</w:t>
+      </w:r>
+      <w:proofErr w:type="gramStart"/>
+      <w:r>
+        <w:t xml:space="preserve">. </w:t>
+      </w:r>
+      <w:proofErr w:type="gramEnd"/>
+      <w:r>
+        <w:t xml:space="preserve">Write values stored at </w:t>
       </w:r>
       <w:r>
         <w:t>&amp;FE20</w:t>
@@ -12394,13 +13434,45 @@
         </w:numPr>
       </w:pPr>
       <w:r>
-        <w:t>Detecting when the screen read starts.  We need to know when the v-sync interrupt occurs.  We can time it from here.  We can determine this by looking if the values read from &amp;</w:t>
+        <w:t xml:space="preserve">Detecting when the screen read starts.  We need to know when the v-sync </w:t>
+      </w:r>
+      <w:proofErr w:type="gramStart"/>
+      <w:r>
+        <w:t>interrupt</w:t>
+      </w:r>
+      <w:proofErr w:type="gramEnd"/>
+      <w:r>
+        <w:t xml:space="preserve"> occurs.  We can time it from here.  We can determine this by </w:t>
+      </w:r>
+      <w:proofErr w:type="gramStart"/>
+      <w:r>
+        <w:t>looking</w:t>
+      </w:r>
+      <w:proofErr w:type="gramEnd"/>
+      <w:r>
+        <w:t xml:space="preserve"> if the values read from &amp;</w:t>
       </w:r>
       <w:r>
         <w:t>FE4D</w:t>
       </w:r>
       <w:r>
-        <w:t xml:space="preserve"> has bit two set.  The rest is math.</w:t>
+        <w:t xml:space="preserve"> </w:t>
+      </w:r>
+      <w:proofErr w:type="gramStart"/>
+      <w:r>
+        <w:t>has</w:t>
+      </w:r>
+      <w:proofErr w:type="gramEnd"/>
+      <w:r>
+        <w:t xml:space="preserve"> bit two </w:t>
+      </w:r>
+      <w:proofErr w:type="gramStart"/>
+      <w:r>
+        <w:t>set</w:t>
+      </w:r>
+      <w:proofErr w:type="gramEnd"/>
+      <w:r>
+        <w:t>.  The rest is math.</w:t>
       </w:r>
     </w:p>
     <w:p>
@@ -12557,7 +13629,15 @@
         <w:t xml:space="preserve">Any code that </w:t>
       </w:r>
       <w:r>
-        <w:t>results in a function being called, is an implicit function all.</w:t>
+        <w:t xml:space="preserve">results in a function being </w:t>
+      </w:r>
+      <w:proofErr w:type="gramStart"/>
+      <w:r>
+        <w:t>called,</w:t>
+      </w:r>
+      <w:proofErr w:type="gramEnd"/>
+      <w:r>
+        <w:t xml:space="preserve"> is an implicit function all.</w:t>
       </w:r>
       <w:r>
         <w:t xml:space="preserve">  A return that lands on a function is </w:t>
@@ -12713,7 +13793,15 @@
         <w:t xml:space="preserve">Values on the stack can be a combination of return addresses, </w:t>
       </w:r>
       <w:r>
-        <w:t>and other data.  We want to understand what is a return address verses other data.</w:t>
+        <w:t xml:space="preserve">and other data.  We want to understand what </w:t>
+      </w:r>
+      <w:proofErr w:type="gramStart"/>
+      <w:r>
+        <w:t>is a return address verses other data</w:t>
+      </w:r>
+      <w:proofErr w:type="gramEnd"/>
+      <w:r>
+        <w:t>.</w:t>
       </w:r>
     </w:p>
     <w:p>
@@ -12818,7 +13906,7 @@
         </w:numPr>
       </w:pPr>
       <w:r>
-        <w:t>Preserve Window position</w:t>
+        <w:t>Fix selection ambiguity when switching tabs</w:t>
       </w:r>
     </w:p>
     <w:p>
@@ -12830,7 +13918,58 @@
         </w:numPr>
       </w:pPr>
       <w:r>
-        <w:t>Fix selection ambiguity when switching tabs</w:t>
+        <w:t>Code view improvements</w:t>
+      </w:r>
+    </w:p>
+    <w:p>
+      <w:pPr>
+        <w:pStyle w:val="ListParagraph"/>
+        <w:numPr>
+          <w:ilvl w:val="1"/>
+          <w:numId w:val="12"/>
+        </w:numPr>
+      </w:pPr>
+      <w:r>
+        <w:t xml:space="preserve">Make red </w:t>
+      </w:r>
+      <w:r>
+        <w:t xml:space="preserve">bars </w:t>
+      </w:r>
+      <w:r>
+        <w:t>less red</w:t>
+      </w:r>
+    </w:p>
+    <w:p>
+      <w:pPr>
+        <w:pStyle w:val="ListParagraph"/>
+        <w:numPr>
+          <w:ilvl w:val="1"/>
+          <w:numId w:val="12"/>
+        </w:numPr>
+      </w:pPr>
+      <w:r>
+        <w:t xml:space="preserve">Denote </w:t>
+      </w:r>
+      <w:r>
+        <w:t>tail</w:t>
+      </w:r>
+      <w:r>
+        <w:t>-</w:t>
+      </w:r>
+      <w:r>
+        <w:t>calls</w:t>
+      </w:r>
+    </w:p>
+    <w:p>
+      <w:pPr>
+        <w:pStyle w:val="ListParagraph"/>
+        <w:numPr>
+          <w:ilvl w:val="1"/>
+          <w:numId w:val="12"/>
+        </w:numPr>
+      </w:pPr>
+      <w:r>
+        <w:t>Show percentages of routine with bars</w:t>
       </w:r>
     </w:p>
     <w:p>
@@ -12842,58 +13981,7 @@
         </w:numPr>
       </w:pPr>
       <w:r>
-        <w:t>Code view improvements</w:t>
-      </w:r>
-    </w:p>
-    <w:p>
-      <w:pPr>
-        <w:pStyle w:val="ListParagraph"/>
-        <w:numPr>
-          <w:ilvl w:val="1"/>
-          <w:numId w:val="12"/>
-        </w:numPr>
-      </w:pPr>
-      <w:r>
-        <w:t xml:space="preserve">Make red </w:t>
-      </w:r>
-      <w:r>
-        <w:t xml:space="preserve">bars </w:t>
-      </w:r>
-      <w:r>
-        <w:t>less red</w:t>
-      </w:r>
-    </w:p>
-    <w:p>
-      <w:pPr>
-        <w:pStyle w:val="ListParagraph"/>
-        <w:numPr>
-          <w:ilvl w:val="1"/>
-          <w:numId w:val="12"/>
-        </w:numPr>
-      </w:pPr>
-      <w:r>
-        <w:t xml:space="preserve">Denote </w:t>
-      </w:r>
-      <w:r>
-        <w:t>tail</w:t>
-      </w:r>
-      <w:r>
-        <w:t>-</w:t>
-      </w:r>
-      <w:r>
-        <w:t>calls</w:t>
-      </w:r>
-    </w:p>
-    <w:p>
-      <w:pPr>
-        <w:pStyle w:val="ListParagraph"/>
-        <w:numPr>
-          <w:ilvl w:val="1"/>
-          <w:numId w:val="12"/>
-        </w:numPr>
-      </w:pPr>
-      <w:r>
-        <w:t>Show percentages of routine with bars</w:t>
+        <w:t>Settings dialog</w:t>
       </w:r>
     </w:p>
     <w:p>
@@ -12905,7 +13993,18 @@
         </w:numPr>
       </w:pPr>
       <w:r>
-        <w:t>Settings dialog</w:t>
+        <w:t>Help dialog</w:t>
+      </w:r>
+    </w:p>
+    <w:p>
+      <w:r>
+        <w:t>How to do work ‘in the background’</w:t>
+      </w:r>
+    </w:p>
+    <w:p>
+      <w:r>
+        <w:lastRenderedPageBreak/>
+        <w:t>There are some key functions that must not block the UI thread.  These include:</w:t>
       </w:r>
     </w:p>
     <w:p>
@@ -12917,13 +14016,58 @@
         </w:numPr>
       </w:pPr>
       <w:r>
-        <w:t>Help dialog</w:t>
-      </w:r>
-    </w:p>
-    <w:p>
-      <w:pPr>
-        <w:ind w:left="360"/>
-      </w:pPr>
+        <w:t>Loading a file and performing static analysis on it</w:t>
+      </w:r>
+    </w:p>
+    <w:p>
+      <w:pPr>
+        <w:pStyle w:val="ListParagraph"/>
+        <w:numPr>
+          <w:ilvl w:val="0"/>
+          <w:numId w:val="12"/>
+        </w:numPr>
+      </w:pPr>
+      <w:r>
+        <w:t>Changing the analysis window</w:t>
+      </w:r>
+    </w:p>
+    <w:p>
+      <w:r>
+        <w:t>When a file is being opened, the window is resizable, and closeable, the tabs can be selected.  However, the timeline cannot be manipulated.</w:t>
+      </w:r>
+    </w:p>
+    <w:p>
+      <w:r>
+        <w:t>When dynamic analysis is being processed, the selection can be changed, the tab can be change</w:t>
+      </w:r>
+      <w:r>
+        <w:t>d</w:t>
+      </w:r>
+      <w:r>
+        <w:t>, the window can be moved and closed</w:t>
+      </w:r>
+      <w:r>
+        <w:t xml:space="preserve">. </w:t>
+      </w:r>
+    </w:p>
+    <w:p>
+      <w:r>
+        <w:t xml:space="preserve">The simplest way to achieve this is to use an </w:t>
+      </w:r>
+      <w:proofErr w:type="spellStart"/>
+      <w:r>
+        <w:t>AppStateFlags</w:t>
+      </w:r>
+      <w:proofErr w:type="spellEnd"/>
+      <w:r>
+        <w:t xml:space="preserve">, that defines what the current state of the app is.  The state can be tested to restrict </w:t>
+      </w:r>
+      <w:r>
+        <w:t xml:space="preserve">user </w:t>
+      </w:r>
+      <w:r>
+        <w:t>operations, painting, and other features.  The state can also be used to terminate and wait on async functionality to clean up or complete.</w:t>
+      </w:r>
     </w:p>
     <w:sectPr>
       <w:footerReference w:type="default" r:id="rId8"/>

</xml_diff>

<commit_message>
Switch internal units from seconds to cycles, and limit zoom in
</commit_message>
<xml_diff>
--- a/docs/Development.docx
+++ b/docs/Development.docx
@@ -13857,6 +13857,16 @@
       <w:r>
         <w:t>Put calculations on another thread</w:t>
       </w:r>
+      <w:r>
+        <w:t xml:space="preserve"> – </w:t>
+      </w:r>
+      <w:r>
+        <w:rPr>
+          <w:b/>
+          <w:bCs/>
+        </w:rPr>
+        <w:t>in progress</w:t>
+      </w:r>
     </w:p>
     <w:p>
       <w:pPr>
@@ -13867,22 +13877,7 @@
         </w:numPr>
       </w:pPr>
       <w:r>
-        <w:t xml:space="preserve">Limit </w:t>
-      </w:r>
-      <w:r>
-        <w:t xml:space="preserve">timeline </w:t>
-      </w:r>
-      <w:r>
-        <w:t>Z</w:t>
-      </w:r>
-      <w:r>
-        <w:t>oom</w:t>
-      </w:r>
-      <w:r>
-        <w:t>-</w:t>
-      </w:r>
-      <w:r>
-        <w:t>In depth</w:t>
+        <w:t>Undo/Redo</w:t>
       </w:r>
     </w:p>
     <w:p>
@@ -13894,7 +13889,7 @@
         </w:numPr>
       </w:pPr>
       <w:r>
-        <w:t>Undo/Redo</w:t>
+        <w:t>Fix selection ambiguity when switching tabs</w:t>
       </w:r>
     </w:p>
     <w:p>
@@ -13906,7 +13901,58 @@
         </w:numPr>
       </w:pPr>
       <w:r>
-        <w:t>Fix selection ambiguity when switching tabs</w:t>
+        <w:t>Code view improvements</w:t>
+      </w:r>
+    </w:p>
+    <w:p>
+      <w:pPr>
+        <w:pStyle w:val="ListParagraph"/>
+        <w:numPr>
+          <w:ilvl w:val="1"/>
+          <w:numId w:val="12"/>
+        </w:numPr>
+      </w:pPr>
+      <w:r>
+        <w:t xml:space="preserve">Make red </w:t>
+      </w:r>
+      <w:r>
+        <w:t xml:space="preserve">bars </w:t>
+      </w:r>
+      <w:r>
+        <w:t>less red</w:t>
+      </w:r>
+    </w:p>
+    <w:p>
+      <w:pPr>
+        <w:pStyle w:val="ListParagraph"/>
+        <w:numPr>
+          <w:ilvl w:val="1"/>
+          <w:numId w:val="12"/>
+        </w:numPr>
+      </w:pPr>
+      <w:r>
+        <w:t xml:space="preserve">Denote </w:t>
+      </w:r>
+      <w:r>
+        <w:t>tail</w:t>
+      </w:r>
+      <w:r>
+        <w:t>-</w:t>
+      </w:r>
+      <w:r>
+        <w:t>calls</w:t>
+      </w:r>
+    </w:p>
+    <w:p>
+      <w:pPr>
+        <w:pStyle w:val="ListParagraph"/>
+        <w:numPr>
+          <w:ilvl w:val="1"/>
+          <w:numId w:val="12"/>
+        </w:numPr>
+      </w:pPr>
+      <w:r>
+        <w:t>Show percentages of routine with bars</w:t>
       </w:r>
     </w:p>
     <w:p>
@@ -13918,58 +13964,7 @@
         </w:numPr>
       </w:pPr>
       <w:r>
-        <w:t>Code view improvements</w:t>
-      </w:r>
-    </w:p>
-    <w:p>
-      <w:pPr>
-        <w:pStyle w:val="ListParagraph"/>
-        <w:numPr>
-          <w:ilvl w:val="1"/>
-          <w:numId w:val="12"/>
-        </w:numPr>
-      </w:pPr>
-      <w:r>
-        <w:t xml:space="preserve">Make red </w:t>
-      </w:r>
-      <w:r>
-        <w:t xml:space="preserve">bars </w:t>
-      </w:r>
-      <w:r>
-        <w:t>less red</w:t>
-      </w:r>
-    </w:p>
-    <w:p>
-      <w:pPr>
-        <w:pStyle w:val="ListParagraph"/>
-        <w:numPr>
-          <w:ilvl w:val="1"/>
-          <w:numId w:val="12"/>
-        </w:numPr>
-      </w:pPr>
-      <w:r>
-        <w:t xml:space="preserve">Denote </w:t>
-      </w:r>
-      <w:r>
-        <w:t>tail</w:t>
-      </w:r>
-      <w:r>
-        <w:t>-</w:t>
-      </w:r>
-      <w:r>
-        <w:t>calls</w:t>
-      </w:r>
-    </w:p>
-    <w:p>
-      <w:pPr>
-        <w:pStyle w:val="ListParagraph"/>
-        <w:numPr>
-          <w:ilvl w:val="1"/>
-          <w:numId w:val="12"/>
-        </w:numPr>
-      </w:pPr>
-      <w:r>
-        <w:t>Show percentages of routine with bars</w:t>
+        <w:t>Settings dialog</w:t>
       </w:r>
     </w:p>
     <w:p>
@@ -13981,92 +13976,7 @@
         </w:numPr>
       </w:pPr>
       <w:r>
-        <w:t>Settings dialog</w:t>
-      </w:r>
-    </w:p>
-    <w:p>
-      <w:pPr>
-        <w:pStyle w:val="ListParagraph"/>
-        <w:numPr>
-          <w:ilvl w:val="0"/>
-          <w:numId w:val="12"/>
-        </w:numPr>
-      </w:pPr>
-      <w:r>
         <w:t>Help dialog</w:t>
-      </w:r>
-    </w:p>
-    <w:p>
-      <w:r>
-        <w:t>How to do work ‘in the background’</w:t>
-      </w:r>
-    </w:p>
-    <w:p>
-      <w:r>
-        <w:lastRenderedPageBreak/>
-        <w:t>There are some key functions that must not block the UI thread.  These include:</w:t>
-      </w:r>
-    </w:p>
-    <w:p>
-      <w:pPr>
-        <w:pStyle w:val="ListParagraph"/>
-        <w:numPr>
-          <w:ilvl w:val="0"/>
-          <w:numId w:val="12"/>
-        </w:numPr>
-      </w:pPr>
-      <w:r>
-        <w:t>Loading a file and performing static analysis on it</w:t>
-      </w:r>
-    </w:p>
-    <w:p>
-      <w:pPr>
-        <w:pStyle w:val="ListParagraph"/>
-        <w:numPr>
-          <w:ilvl w:val="0"/>
-          <w:numId w:val="12"/>
-        </w:numPr>
-      </w:pPr>
-      <w:r>
-        <w:t>Changing the analysis window</w:t>
-      </w:r>
-    </w:p>
-    <w:p>
-      <w:r>
-        <w:t>When a file is being opened, the window is resizable, and closeable, the tabs can be selected.  However, the timeline cannot be manipulated.</w:t>
-      </w:r>
-    </w:p>
-    <w:p>
-      <w:r>
-        <w:t>When dynamic analysis is being processed, the selection can be changed, the tab can be change</w:t>
-      </w:r>
-      <w:r>
-        <w:t>d</w:t>
-      </w:r>
-      <w:r>
-        <w:t>, the window can be moved and closed</w:t>
-      </w:r>
-      <w:r>
-        <w:t xml:space="preserve">. </w:t>
-      </w:r>
-    </w:p>
-    <w:p>
-      <w:r>
-        <w:t xml:space="preserve">The simplest way to achieve this is to use an </w:t>
-      </w:r>
-      <w:proofErr w:type="spellStart"/>
-      <w:r>
-        <w:t>AppStateFlags</w:t>
-      </w:r>
-      <w:proofErr w:type="spellEnd"/>
-      <w:r>
-        <w:t xml:space="preserve">, that defines what the current state of the app is.  The state can be tested to restrict </w:t>
-      </w:r>
-      <w:r>
-        <w:t xml:space="preserve">user </w:t>
-      </w:r>
-      <w:r>
-        <w:t>operations, painting, and other features.  The state can also be used to terminate and wait on async functionality to clean up or complete.</w:t>
       </w:r>
     </w:p>
     <w:sectPr>

</xml_diff>

<commit_message>
- Constraint bars and percentages to be 0..100% - Fixed bug where first instruction was ignored
</commit_message>
<xml_diff>
--- a/docs/Development.docx
+++ b/docs/Development.docx
@@ -349,7 +349,6 @@
       <w:r>
         <w:t xml:space="preserve">  </w:t>
       </w:r>
-      <w:proofErr w:type="gramStart"/>
       <w:r>
         <w:t>I</w:t>
       </w:r>
@@ -360,25 +359,13 @@
         <w:t xml:space="preserve"> </w:t>
       </w:r>
       <w:r>
-        <w:t xml:space="preserve"> and</w:t>
-      </w:r>
-      <w:proofErr w:type="gramEnd"/>
+        <w:t xml:space="preserve"> and sample</w:t>
+      </w:r>
       <w:r>
         <w:t xml:space="preserve"> </w:t>
       </w:r>
-      <w:proofErr w:type="gramStart"/>
-      <w:r>
-        <w:t>sample</w:t>
-      </w:r>
-      <w:r>
-        <w:t xml:space="preserve"> </w:t>
-      </w:r>
-      <w:r>
-        <w:t>based</w:t>
-      </w:r>
-      <w:proofErr w:type="gramEnd"/>
-      <w:r>
-        <w:t xml:space="preserve"> </w:t>
+      <w:r>
+        <w:t xml:space="preserve">based </w:t>
       </w:r>
       <w:r>
         <w:t xml:space="preserve">measurements </w:t>
@@ -1128,13 +1115,8 @@
       <w:r>
         <w:t xml:space="preserve"> a common header which </w:t>
       </w:r>
-      <w:proofErr w:type="gramStart"/>
-      <w:r>
-        <w:t>proceeds</w:t>
-      </w:r>
-      <w:proofErr w:type="gramEnd"/>
-      <w:r>
-        <w:t xml:space="preserve"> </w:t>
+      <w:r>
+        <w:t xml:space="preserve">proceeds </w:t>
       </w:r>
       <w:r>
         <w:t>the</w:t>
@@ -2019,15 +2001,7 @@
         <w:t xml:space="preserve">The header chunk </w:t>
       </w:r>
       <w:r>
-        <w:t xml:space="preserve">is the first chunk in the </w:t>
-      </w:r>
-      <w:proofErr w:type="gramStart"/>
-      <w:r>
-        <w:t>file</w:t>
-      </w:r>
-      <w:proofErr w:type="gramEnd"/>
-      <w:r>
-        <w:t xml:space="preserve"> and </w:t>
+        <w:t xml:space="preserve">is the first chunk in the file and </w:t>
       </w:r>
       <w:r>
         <w:t xml:space="preserve">it </w:t>
@@ -4712,14 +4686,12 @@
       <w:r>
         <w:t>Integra</w:t>
       </w:r>
-      <w:proofErr w:type="gramStart"/>
       <w:r>
         <w:t>.</w:t>
       </w:r>
       <w:r>
         <w:t xml:space="preserve"> </w:t>
       </w:r>
-      <w:proofErr w:type="gramEnd"/>
       <w:r>
         <w:t>Addresses &amp;</w:t>
       </w:r>
@@ -5764,7 +5736,6 @@
             <w:r>
               <w:t>&amp;</w:t>
             </w:r>
-            <w:proofErr w:type="gramStart"/>
             <w:r>
               <w:t>8</w:t>
             </w:r>
@@ -5774,7 +5745,6 @@
             <w:r>
               <w:t>..</w:t>
             </w:r>
-            <w:proofErr w:type="gramEnd"/>
             <w:r>
               <w:t>&amp;</w:t>
             </w:r>
@@ -5855,15 +5825,7 @@
               <w:t xml:space="preserve"> </w:t>
             </w:r>
             <w:r>
-              <w:t>&amp;</w:t>
-            </w:r>
-            <w:proofErr w:type="gramStart"/>
-            <w:r>
-              <w:t>0000..</w:t>
-            </w:r>
-            <w:proofErr w:type="gramEnd"/>
-            <w:r>
-              <w:t>&amp;7F</w:t>
+              <w:t>&amp;0000..&amp;7F</w:t>
             </w:r>
             <w:r>
               <w:t>FF</w:t>
@@ -5878,14 +5840,12 @@
             <w:pPr>
               <w:jc w:val="center"/>
             </w:pPr>
-            <w:proofErr w:type="gramStart"/>
             <w:r>
               <w:t>0..</w:t>
             </w:r>
             <w:r>
               <w:t>&amp;</w:t>
             </w:r>
-            <w:proofErr w:type="gramEnd"/>
             <w:r>
               <w:t>7F</w:t>
             </w:r>
@@ -5899,14 +5859,12 @@
             <w:pPr>
               <w:jc w:val="center"/>
             </w:pPr>
-            <w:proofErr w:type="gramStart"/>
             <w:r>
               <w:t>0..</w:t>
             </w:r>
             <w:r>
               <w:t>&amp;</w:t>
             </w:r>
-            <w:proofErr w:type="gramEnd"/>
             <w:r>
               <w:t>FF</w:t>
             </w:r>
@@ -5950,15 +5908,7 @@
               <w:t>:</w:t>
             </w:r>
             <w:r>
-              <w:t xml:space="preserve"> &amp;</w:t>
-            </w:r>
-            <w:proofErr w:type="gramStart"/>
-            <w:r>
-              <w:t>8000..</w:t>
-            </w:r>
-            <w:proofErr w:type="gramEnd"/>
-            <w:r>
-              <w:t>&amp;FFFF</w:t>
+              <w:t xml:space="preserve"> &amp;8000..&amp;FFFF</w:t>
             </w:r>
           </w:p>
         </w:tc>
@@ -5989,11 +5939,9 @@
             <w:r>
               <w:t>&amp;</w:t>
             </w:r>
-            <w:proofErr w:type="gramStart"/>
             <w:r>
               <w:t>80..</w:t>
             </w:r>
-            <w:proofErr w:type="gramEnd"/>
             <w:r>
               <w:t>&amp;</w:t>
             </w:r>
@@ -6010,14 +5958,12 @@
             <w:pPr>
               <w:jc w:val="center"/>
             </w:pPr>
-            <w:proofErr w:type="gramStart"/>
             <w:r>
               <w:t>0..</w:t>
             </w:r>
             <w:r>
               <w:t>&amp;</w:t>
             </w:r>
-            <w:proofErr w:type="gramEnd"/>
             <w:r>
               <w:t>FF</w:t>
             </w:r>
@@ -7187,18 +7133,10 @@
       </w:r>
       <w:proofErr w:type="spellEnd"/>
       <w:r>
-        <w:t xml:space="preserve">&gt; (1 byte) Populated for </w:t>
-      </w:r>
-      <w:proofErr w:type="gramStart"/>
-      <w:r>
-        <w:t xml:space="preserve">opcodes that </w:t>
-      </w:r>
-      <w:r>
-        <w:t>write</w:t>
-      </w:r>
-      <w:proofErr w:type="gramEnd"/>
-      <w:r>
-        <w:t xml:space="preserve"> to </w:t>
+        <w:t xml:space="preserve">&gt; (1 byte) Populated for opcodes that </w:t>
+      </w:r>
+      <w:r>
+        <w:t xml:space="preserve">write to </w:t>
       </w:r>
       <w:r>
         <w:t>an address</w:t>
@@ -7221,16 +7159,11 @@
       <w:r>
         <w:t>attempted to be written</w:t>
       </w:r>
-      <w:proofErr w:type="gramStart"/>
       <w:r>
         <w:t>.</w:t>
       </w:r>
       <w:r>
-        <w:t xml:space="preserve"> </w:t>
-      </w:r>
-      <w:proofErr w:type="gramEnd"/>
-      <w:r>
-        <w:t xml:space="preserve">This includes </w:t>
+        <w:t xml:space="preserve"> This includes </w:t>
       </w:r>
       <w:r>
         <w:lastRenderedPageBreak/>
@@ -7271,7 +7204,6 @@
       </w:r>
     </w:p>
     <w:p>
-      <w:proofErr w:type="gramStart"/>
       <w:r>
         <w:t xml:space="preserve">A </w:t>
       </w:r>
@@ -7282,7 +7214,6 @@
         </w:rPr>
         <w:t>.perf</w:t>
       </w:r>
-      <w:proofErr w:type="gramEnd"/>
       <w:r>
         <w:t xml:space="preserve"> </w:t>
       </w:r>
@@ -9680,19 +9611,15 @@
       <w:r>
         <w:t xml:space="preserve">Hexadecimal </w:t>
       </w:r>
-      <w:proofErr w:type="gramStart"/>
       <w:r>
         <w:t>symbol: ‘</w:t>
       </w:r>
-      <w:proofErr w:type="gramEnd"/>
       <w:r>
         <w:t>$</w:t>
       </w:r>
-      <w:proofErr w:type="gramStart"/>
       <w:r>
         <w:t>’, ‘</w:t>
       </w:r>
-      <w:proofErr w:type="gramEnd"/>
       <w:r>
         <w:t>&amp;</w:t>
       </w:r>
@@ -10498,15 +10425,7 @@
         <w:t xml:space="preserve"> – represents a</w:t>
       </w:r>
       <w:r>
-        <w:t xml:space="preserve"> call stack within the recorded program</w:t>
-      </w:r>
-      <w:proofErr w:type="gramStart"/>
-      <w:r>
-        <w:t xml:space="preserve">. </w:t>
-      </w:r>
-      <w:proofErr w:type="gramEnd"/>
-      <w:r>
-        <w:t>Contains the following fields:</w:t>
+        <w:t xml:space="preserve"> call stack within the recorded program. Contains the following fields:</w:t>
       </w:r>
     </w:p>
     <w:p>
@@ -13168,18 +13087,10 @@
         <w:t xml:space="preserve"> (this can be calculated) </w:t>
       </w:r>
       <w:r>
-        <w:t xml:space="preserve">on </w:t>
-      </w:r>
-      <w:proofErr w:type="gramStart"/>
-      <w:r>
-        <w:t xml:space="preserve">the </w:t>
-      </w:r>
-      <w:r>
-        <w:t>Video</w:t>
-      </w:r>
-      <w:proofErr w:type="gramEnd"/>
-      <w:r>
-        <w:t xml:space="preserve"> </w:t>
+        <w:t xml:space="preserve">on the </w:t>
+      </w:r>
+      <w:r>
+        <w:t xml:space="preserve">Video </w:t>
       </w:r>
       <w:r>
         <w:t>6845</w:t>
@@ -13249,15 +13160,7 @@
         </w:numPr>
       </w:pPr>
       <w:r>
-        <w:t>A spin loop is a tight look that doesn’t write anything, it just reads something</w:t>
-      </w:r>
-      <w:proofErr w:type="gramStart"/>
-      <w:r>
-        <w:t xml:space="preserve">. </w:t>
-      </w:r>
-      <w:proofErr w:type="gramEnd"/>
-      <w:r>
-        <w:t>They are shown in light grey (background is white).</w:t>
+        <w:t>A spin loop is a tight look that doesn’t write anything, it just reads something. They are shown in light grey (background is white).</w:t>
       </w:r>
       <w:r>
         <w:t xml:space="preserve">  We are looking for a repeated set of non-instructions in the recording.</w:t>
@@ -13284,15 +13187,7 @@
         </w:numPr>
       </w:pPr>
       <w:r>
-        <w:t xml:space="preserve">Look for </w:t>
-      </w:r>
-      <w:proofErr w:type="gramStart"/>
-      <w:r>
-        <w:t>repeating</w:t>
-      </w:r>
-      <w:proofErr w:type="gramEnd"/>
-      <w:r>
-        <w:t xml:space="preserve"> instructions.</w:t>
+        <w:t>Look for repeating instructions.</w:t>
       </w:r>
     </w:p>
     <w:p>
@@ -13304,15 +13199,7 @@
         </w:numPr>
       </w:pPr>
       <w:r>
-        <w:t>Detecting when screen memory is being read</w:t>
-      </w:r>
-      <w:proofErr w:type="gramStart"/>
-      <w:r>
-        <w:t xml:space="preserve">. </w:t>
-      </w:r>
-      <w:proofErr w:type="gramEnd"/>
-      <w:r>
-        <w:t>We need to know.</w:t>
+        <w:t>Detecting when screen memory is being read. We need to know.</w:t>
       </w:r>
     </w:p>
     <w:p>
@@ -13324,15 +13211,7 @@
         </w:numPr>
       </w:pPr>
       <w:r>
-        <w:t xml:space="preserve">The screen </w:t>
-      </w:r>
-      <w:proofErr w:type="gramStart"/>
-      <w:r>
-        <w:t>start</w:t>
-      </w:r>
-      <w:proofErr w:type="gramEnd"/>
-      <w:r>
-        <w:t xml:space="preserve"> address.  Write value stored to </w:t>
+        <w:t xml:space="preserve">The screen start address.  Write value stored to </w:t>
       </w:r>
       <w:r>
         <w:t>&amp;FE00</w:t>
@@ -13356,15 +13235,7 @@
         </w:numPr>
       </w:pPr>
       <w:r>
-        <w:t>The screen wrap-size (how many K)</w:t>
-      </w:r>
-      <w:proofErr w:type="gramStart"/>
-      <w:r>
-        <w:t xml:space="preserve">. </w:t>
-      </w:r>
-      <w:proofErr w:type="gramEnd"/>
-      <w:r>
-        <w:t xml:space="preserve">Write value stored to </w:t>
+        <w:t xml:space="preserve">The screen wrap-size (how many K). Write value stored to </w:t>
       </w:r>
       <w:r>
         <w:t>&amp;FE40</w:t>
@@ -13379,23 +13250,7 @@
         </w:numPr>
       </w:pPr>
       <w:r>
-        <w:t xml:space="preserve">The screen format (mode-7 verses </w:t>
-      </w:r>
-      <w:proofErr w:type="gramStart"/>
-      <w:r>
-        <w:t>non mode</w:t>
-      </w:r>
-      <w:proofErr w:type="gramEnd"/>
-      <w:r>
-        <w:t>-7)</w:t>
-      </w:r>
-      <w:proofErr w:type="gramStart"/>
-      <w:r>
-        <w:t xml:space="preserve">. </w:t>
-      </w:r>
-      <w:proofErr w:type="gramEnd"/>
-      <w:r>
-        <w:t xml:space="preserve">Write values stored at </w:t>
+        <w:t xml:space="preserve">The screen format (mode-7 verses non mode-7). Write values stored at </w:t>
       </w:r>
       <w:r>
         <w:t>&amp;FE20</w:t>
@@ -13434,45 +13289,13 @@
         </w:numPr>
       </w:pPr>
       <w:r>
-        <w:t xml:space="preserve">Detecting when the screen read starts.  We need to know when the v-sync </w:t>
-      </w:r>
-      <w:proofErr w:type="gramStart"/>
-      <w:r>
-        <w:t>interrupt</w:t>
-      </w:r>
-      <w:proofErr w:type="gramEnd"/>
-      <w:r>
-        <w:t xml:space="preserve"> occurs.  We can time it from here.  We can determine this by </w:t>
-      </w:r>
-      <w:proofErr w:type="gramStart"/>
-      <w:r>
-        <w:t>looking</w:t>
-      </w:r>
-      <w:proofErr w:type="gramEnd"/>
-      <w:r>
-        <w:t xml:space="preserve"> if the values read from &amp;</w:t>
+        <w:t>Detecting when the screen read starts.  We need to know when the v-sync interrupt occurs.  We can time it from here.  We can determine this by looking if the values read from &amp;</w:t>
       </w:r>
       <w:r>
         <w:t>FE4D</w:t>
       </w:r>
       <w:r>
-        <w:t xml:space="preserve"> </w:t>
-      </w:r>
-      <w:proofErr w:type="gramStart"/>
-      <w:r>
-        <w:t>has</w:t>
-      </w:r>
-      <w:proofErr w:type="gramEnd"/>
-      <w:r>
-        <w:t xml:space="preserve"> bit two </w:t>
-      </w:r>
-      <w:proofErr w:type="gramStart"/>
-      <w:r>
-        <w:t>set</w:t>
-      </w:r>
-      <w:proofErr w:type="gramEnd"/>
-      <w:r>
-        <w:t>.  The rest is math.</w:t>
+        <w:t xml:space="preserve"> has bit two set.  The rest is math.</w:t>
       </w:r>
     </w:p>
     <w:p>
@@ -13629,15 +13452,7 @@
         <w:t xml:space="preserve">Any code that </w:t>
       </w:r>
       <w:r>
-        <w:t xml:space="preserve">results in a function being </w:t>
-      </w:r>
-      <w:proofErr w:type="gramStart"/>
-      <w:r>
-        <w:t>called,</w:t>
-      </w:r>
-      <w:proofErr w:type="gramEnd"/>
-      <w:r>
-        <w:t xml:space="preserve"> is an implicit function all.</w:t>
+        <w:t>results in a function being called, is an implicit function all.</w:t>
       </w:r>
       <w:r>
         <w:t xml:space="preserve">  A return that lands on a function is </w:t>
@@ -13793,15 +13608,7 @@
         <w:t xml:space="preserve">Values on the stack can be a combination of return addresses, </w:t>
       </w:r>
       <w:r>
-        <w:t xml:space="preserve">and other data.  We want to understand what </w:t>
-      </w:r>
-      <w:proofErr w:type="gramStart"/>
-      <w:r>
-        <w:t>is a return address verses other data</w:t>
-      </w:r>
-      <w:proofErr w:type="gramEnd"/>
-      <w:r>
-        <w:t>.</w:t>
+        <w:t>and other data.  We want to understand what is a return address verses other data.</w:t>
       </w:r>
     </w:p>
     <w:p>
@@ -13866,6 +13673,18 @@
           <w:bCs/>
         </w:rPr>
         <w:t>in progress</w:t>
+      </w:r>
+    </w:p>
+    <w:p>
+      <w:pPr>
+        <w:pStyle w:val="ListParagraph"/>
+        <w:numPr>
+          <w:ilvl w:val="0"/>
+          <w:numId w:val="12"/>
+        </w:numPr>
+      </w:pPr>
+      <w:r>
+        <w:t>Fix percentages which sometimes &gt; 100%</w:t>
       </w:r>
     </w:p>
     <w:p>

</xml_diff>

<commit_message>
Code view improvements: Added branch count and tail-call columns.  Also added percentage bars.
</commit_message>
<xml_diff>
--- a/docs/Development.docx
+++ b/docs/Development.docx
@@ -544,7 +544,6 @@
       <w:r>
         <w:t xml:space="preserve">, </w:t>
       </w:r>
-      <w:proofErr w:type="spellStart"/>
       <w:r>
         <w:rPr>
           <w:b/>
@@ -552,7 +551,6 @@
         </w:rPr>
         <w:t>BeebPerf</w:t>
       </w:r>
-      <w:proofErr w:type="spellEnd"/>
       <w:r>
         <w:t>,</w:t>
       </w:r>
@@ -605,7 +603,6 @@
       <w:r>
         <w:t xml:space="preserve">for </w:t>
       </w:r>
-      <w:proofErr w:type="spellStart"/>
       <w:r>
         <w:rPr>
           <w:b/>
@@ -620,7 +617,6 @@
         </w:rPr>
         <w:t>Perf</w:t>
       </w:r>
-      <w:proofErr w:type="spellEnd"/>
       <w:r>
         <w:t xml:space="preserve"> to analyze and </w:t>
       </w:r>
@@ -682,7 +678,6 @@
       <w:r>
         <w:t xml:space="preserve">to decouple </w:t>
       </w:r>
-      <w:proofErr w:type="spellStart"/>
       <w:r>
         <w:rPr>
           <w:b/>
@@ -690,7 +685,6 @@
         </w:rPr>
         <w:t>BeebPerf</w:t>
       </w:r>
-      <w:proofErr w:type="spellEnd"/>
       <w:r>
         <w:t xml:space="preserve"> from </w:t>
       </w:r>
@@ -725,7 +719,6 @@
       <w:r>
         <w:t xml:space="preserve">performance data which </w:t>
       </w:r>
-      <w:proofErr w:type="spellStart"/>
       <w:r>
         <w:rPr>
           <w:b/>
@@ -733,7 +726,6 @@
         </w:rPr>
         <w:t>BeebPerf</w:t>
       </w:r>
-      <w:proofErr w:type="spellEnd"/>
       <w:r>
         <w:t xml:space="preserve"> </w:t>
       </w:r>
@@ -869,7 +861,6 @@
       <w:r>
         <w:t xml:space="preserve"> is modified to generate a .perf file, which </w:t>
       </w:r>
-      <w:proofErr w:type="spellStart"/>
       <w:r>
         <w:rPr>
           <w:b/>
@@ -877,7 +868,6 @@
         </w:rPr>
         <w:t>BeebPerf</w:t>
       </w:r>
-      <w:proofErr w:type="spellEnd"/>
       <w:r>
         <w:t xml:space="preserve"> </w:t>
       </w:r>
@@ -964,7 +954,6 @@
         </w:rPr>
         <w:t>&lt;</w:t>
       </w:r>
-      <w:proofErr w:type="spellStart"/>
       <w:r>
         <w:rPr>
           <w:b/>
@@ -979,7 +968,6 @@
         </w:rPr>
         <w:t>chunk</w:t>
       </w:r>
-      <w:proofErr w:type="spellEnd"/>
       <w:r>
         <w:rPr>
           <w:b/>
@@ -997,7 +985,6 @@
         </w:rPr>
         <w:t>&lt;</w:t>
       </w:r>
-      <w:proofErr w:type="spellStart"/>
       <w:r>
         <w:rPr>
           <w:b/>
@@ -1019,7 +1006,6 @@
         </w:rPr>
         <w:t>_chunk</w:t>
       </w:r>
-      <w:proofErr w:type="spellEnd"/>
       <w:r>
         <w:rPr>
           <w:b/>
@@ -1048,44 +1034,33 @@
         </w:rPr>
         <w:t>&lt;</w:t>
       </w:r>
-      <w:proofErr w:type="spellStart"/>
       <w:r>
         <w:rPr>
           <w:b/>
           <w:bCs/>
         </w:rPr>
-        <w:t>snapshot_chunk</w:t>
-      </w:r>
-      <w:proofErr w:type="spellEnd"/>
+        <w:t>snapshot_chunk&gt;</w:t>
+      </w:r>
+      <w:r>
+        <w:t xml:space="preserve"> +</w:t>
+      </w:r>
+      <w:r>
+        <w:t xml:space="preserve"> </w:t>
+      </w:r>
       <w:r>
         <w:rPr>
           <w:b/>
           <w:bCs/>
         </w:rPr>
-        <w:t>&gt;</w:t>
-      </w:r>
-      <w:r>
-        <w:t xml:space="preserve"> +</w:t>
-      </w:r>
-      <w:r>
-        <w:t xml:space="preserve"> </w:t>
+        <w:t>&lt;</w:t>
       </w:r>
       <w:r>
         <w:rPr>
           <w:b/>
           <w:bCs/>
         </w:rPr>
-        <w:t>&lt;</w:t>
-      </w:r>
-      <w:proofErr w:type="spellStart"/>
-      <w:r>
-        <w:rPr>
-          <w:b/>
-          <w:bCs/>
-        </w:rPr>
         <w:t>execution_chunk</w:t>
       </w:r>
-      <w:proofErr w:type="spellEnd"/>
       <w:r>
         <w:rPr>
           <w:b/>
@@ -1280,7 +1255,6 @@
         </w:rPr>
         <w:t>&lt;</w:t>
       </w:r>
-      <w:proofErr w:type="spellStart"/>
       <w:r>
         <w:rPr>
           <w:b/>
@@ -1293,15 +1267,7 @@
           <w:b/>
           <w:bCs/>
         </w:rPr>
-        <w:t>header</w:t>
-      </w:r>
-      <w:proofErr w:type="spellEnd"/>
-      <w:r>
-        <w:rPr>
-          <w:b/>
-          <w:bCs/>
-        </w:rPr>
-        <w:t>&gt;</w:t>
+        <w:t>header&gt;</w:t>
       </w:r>
       <w:r>
         <w:t xml:space="preserve"> = </w:t>
@@ -1312,24 +1278,11 @@
       <w:r>
         <w:t>&lt;tag&gt; + &lt;compression&gt; + &lt;</w:t>
       </w:r>
-      <w:proofErr w:type="spellStart"/>
       <w:r>
         <w:t>original_</w:t>
       </w:r>
       <w:r>
-        <w:t>size</w:t>
-      </w:r>
-      <w:proofErr w:type="spellEnd"/>
-      <w:r>
-        <w:t>&gt; + &lt;</w:t>
-      </w:r>
-      <w:proofErr w:type="spellStart"/>
-      <w:r>
-        <w:t>compressed_size</w:t>
-      </w:r>
-      <w:proofErr w:type="spellEnd"/>
-      <w:r>
-        <w:t>&gt;</w:t>
+        <w:t>size&gt; + &lt;compressed_size&gt;</w:t>
       </w:r>
     </w:p>
     <w:p>
@@ -1456,23 +1409,7 @@
                 <w:rFonts w:ascii="Aptos" w:hAnsi="Aptos"/>
                 <w:color w:val="000000"/>
               </w:rPr>
-              <w:t>‘</w:t>
-            </w:r>
-            <w:proofErr w:type="spellStart"/>
-            <w:r>
-              <w:rPr>
-                <w:rFonts w:ascii="Aptos" w:hAnsi="Aptos"/>
-                <w:color w:val="000000"/>
-              </w:rPr>
-              <w:t>PFhd</w:t>
-            </w:r>
-            <w:proofErr w:type="spellEnd"/>
-            <w:r>
-              <w:rPr>
-                <w:rFonts w:ascii="Aptos" w:hAnsi="Aptos"/>
-                <w:color w:val="000000"/>
-              </w:rPr>
-              <w:t>’</w:t>
+              <w:t>‘PFhd’</w:t>
             </w:r>
           </w:p>
         </w:tc>
@@ -1492,23 +1429,7 @@
                 <w:rFonts w:ascii="Aptos" w:hAnsi="Aptos"/>
                 <w:color w:val="000000"/>
               </w:rPr>
-              <w:t>&lt;</w:t>
-            </w:r>
-            <w:proofErr w:type="spellStart"/>
-            <w:r>
-              <w:rPr>
-                <w:rFonts w:ascii="Aptos" w:hAnsi="Aptos"/>
-                <w:color w:val="000000"/>
-              </w:rPr>
-              <w:t>header_chunk</w:t>
-            </w:r>
-            <w:proofErr w:type="spellEnd"/>
-            <w:r>
-              <w:rPr>
-                <w:rFonts w:ascii="Aptos" w:hAnsi="Aptos"/>
-                <w:color w:val="000000"/>
-              </w:rPr>
-              <w:t>&gt;</w:t>
+              <w:t>&lt;header_chunk&gt;</w:t>
             </w:r>
           </w:p>
         </w:tc>
@@ -1530,23 +1451,7 @@
                 <w:rFonts w:ascii="Aptos" w:hAnsi="Aptos"/>
                 <w:color w:val="000000"/>
               </w:rPr>
-              <w:t>‘</w:t>
-            </w:r>
-            <w:proofErr w:type="spellStart"/>
-            <w:r>
-              <w:rPr>
-                <w:rFonts w:ascii="Aptos" w:hAnsi="Aptos"/>
-                <w:color w:val="000000"/>
-              </w:rPr>
-              <w:t>PFlb</w:t>
-            </w:r>
-            <w:proofErr w:type="spellEnd"/>
-            <w:r>
-              <w:rPr>
-                <w:rFonts w:ascii="Aptos" w:hAnsi="Aptos"/>
-                <w:color w:val="000000"/>
-              </w:rPr>
-              <w:t>’</w:t>
+              <w:t>‘PFlb’</w:t>
             </w:r>
           </w:p>
         </w:tc>
@@ -1562,15 +1467,7 @@
               </w:rPr>
             </w:pPr>
             <w:r>
-              <w:t>&lt;</w:t>
-            </w:r>
-            <w:proofErr w:type="spellStart"/>
-            <w:r>
-              <w:t>labels_chunk</w:t>
-            </w:r>
-            <w:proofErr w:type="spellEnd"/>
-            <w:r>
-              <w:t>&gt;</w:t>
+              <w:t>&lt;labels_chunk&gt;</w:t>
             </w:r>
           </w:p>
         </w:tc>
@@ -1592,23 +1489,7 @@
                 <w:rFonts w:ascii="Aptos" w:hAnsi="Aptos"/>
                 <w:color w:val="000000"/>
               </w:rPr>
-              <w:t>‘</w:t>
-            </w:r>
-            <w:proofErr w:type="spellStart"/>
-            <w:r>
-              <w:rPr>
-                <w:rFonts w:ascii="Aptos" w:hAnsi="Aptos"/>
-                <w:color w:val="000000"/>
-              </w:rPr>
-              <w:t>PFss</w:t>
-            </w:r>
-            <w:proofErr w:type="spellEnd"/>
-            <w:r>
-              <w:rPr>
-                <w:rFonts w:ascii="Aptos" w:hAnsi="Aptos"/>
-                <w:color w:val="000000"/>
-              </w:rPr>
-              <w:t>’</w:t>
+              <w:t>‘PFss’</w:t>
             </w:r>
           </w:p>
         </w:tc>
@@ -1624,15 +1505,7 @@
               </w:rPr>
             </w:pPr>
             <w:r>
-              <w:t>&lt;</w:t>
-            </w:r>
-            <w:proofErr w:type="spellStart"/>
-            <w:r>
-              <w:t>snapshot_chunk</w:t>
-            </w:r>
-            <w:proofErr w:type="spellEnd"/>
-            <w:r>
-              <w:t>&gt;</w:t>
+              <w:t>&lt;snapshot_chunk&gt;</w:t>
             </w:r>
           </w:p>
         </w:tc>
@@ -1654,23 +1527,7 @@
                 <w:rFonts w:ascii="Aptos" w:hAnsi="Aptos"/>
                 <w:color w:val="000000"/>
               </w:rPr>
-              <w:t>‘</w:t>
-            </w:r>
-            <w:proofErr w:type="spellStart"/>
-            <w:r>
-              <w:rPr>
-                <w:rFonts w:ascii="Aptos" w:hAnsi="Aptos"/>
-                <w:color w:val="000000"/>
-              </w:rPr>
-              <w:t>PFex</w:t>
-            </w:r>
-            <w:proofErr w:type="spellEnd"/>
-            <w:r>
-              <w:rPr>
-                <w:rFonts w:ascii="Aptos" w:hAnsi="Aptos"/>
-                <w:color w:val="000000"/>
-              </w:rPr>
-              <w:t>’</w:t>
+              <w:t>‘PFex’</w:t>
             </w:r>
           </w:p>
         </w:tc>
@@ -1686,15 +1543,7 @@
               </w:rPr>
             </w:pPr>
             <w:r>
-              <w:t>&lt;</w:t>
-            </w:r>
-            <w:proofErr w:type="spellStart"/>
-            <w:r>
-              <w:t>execution_chunk</w:t>
-            </w:r>
-            <w:proofErr w:type="spellEnd"/>
-            <w:r>
-              <w:t>&gt;</w:t>
+              <w:t>&lt;execution_chunk&gt;</w:t>
             </w:r>
           </w:p>
         </w:tc>
@@ -1867,13 +1716,8 @@
             <w:tcW w:w="3240" w:type="dxa"/>
           </w:tcPr>
           <w:p>
-            <w:proofErr w:type="spellStart"/>
             <w:r>
-              <w:t>zlib</w:t>
-            </w:r>
-            <w:proofErr w:type="spellEnd"/>
-            <w:r>
-              <w:t xml:space="preserve"> 1.3.1 (default algorithm)</w:t>
+              <w:t>zlib 1.3.1 (default algorithm)</w:t>
             </w:r>
           </w:p>
         </w:tc>
@@ -1889,7 +1733,6 @@
       <w:r>
         <w:t>&lt;</w:t>
       </w:r>
-      <w:proofErr w:type="spellStart"/>
       <w:r>
         <w:t>original</w:t>
       </w:r>
@@ -1899,7 +1742,6 @@
       <w:r>
         <w:t>size</w:t>
       </w:r>
-      <w:proofErr w:type="spellEnd"/>
       <w:r>
         <w:t>&gt;</w:t>
       </w:r>
@@ -1933,16 +1775,11 @@
         <w:ind w:left="360"/>
       </w:pPr>
       <w:r>
-        <w:t>&lt;</w:t>
-      </w:r>
-      <w:proofErr w:type="spellStart"/>
-      <w:r>
-        <w:t>compressed_</w:t>
+        <w:t>&lt;compressed_</w:t>
       </w:r>
       <w:r>
         <w:t>size</w:t>
       </w:r>
-      <w:proofErr w:type="spellEnd"/>
       <w:r>
         <w:t>&gt;</w:t>
       </w:r>
@@ -1970,16 +1807,11 @@
       <w:r>
         <w:t>matches &lt;</w:t>
       </w:r>
-      <w:proofErr w:type="spellStart"/>
       <w:r>
         <w:t>original</w:t>
       </w:r>
       <w:r>
-        <w:t>_size</w:t>
-      </w:r>
-      <w:proofErr w:type="spellEnd"/>
-      <w:r>
-        <w:t>&gt;</w:t>
+        <w:t>_size&gt;</w:t>
       </w:r>
       <w:r>
         <w:t>.</w:t>
@@ -2060,7 +1892,6 @@
         </w:rPr>
         <w:t>&lt;</w:t>
       </w:r>
-      <w:proofErr w:type="spellStart"/>
       <w:r>
         <w:rPr>
           <w:b/>
@@ -2073,27 +1904,14 @@
           <w:b/>
           <w:bCs/>
         </w:rPr>
-        <w:t>_chunk</w:t>
-      </w:r>
-      <w:proofErr w:type="spellEnd"/>
-      <w:r>
-        <w:rPr>
-          <w:b/>
-          <w:bCs/>
-        </w:rPr>
-        <w:t>&gt;</w:t>
+        <w:t>_chunk&gt;</w:t>
       </w:r>
       <w:r>
         <w:t xml:space="preserve"> = </w:t>
       </w:r>
       <w:r>
-        <w:t>&lt;</w:t>
-      </w:r>
-      <w:proofErr w:type="spellStart"/>
-      <w:r>
-        <w:t>common_header</w:t>
-      </w:r>
-      <w:proofErr w:type="spellEnd"/>
+        <w:t>&lt;common_header</w:t>
+      </w:r>
       <w:r>
         <w:t>(</w:t>
       </w:r>
@@ -2104,7 +1922,6 @@
         </w:rPr>
         <w:t>‘</w:t>
       </w:r>
-      <w:proofErr w:type="spellStart"/>
       <w:r>
         <w:rPr>
           <w:rFonts w:ascii="Aptos" w:hAnsi="Aptos"/>
@@ -2112,17 +1929,7 @@
           <w:bCs/>
           <w:color w:val="000000"/>
         </w:rPr>
-        <w:t>PFhd</w:t>
-      </w:r>
-      <w:proofErr w:type="spellEnd"/>
-      <w:r>
-        <w:rPr>
-          <w:rFonts w:ascii="Aptos" w:hAnsi="Aptos"/>
-          <w:b/>
-          <w:bCs/>
-          <w:color w:val="000000"/>
-        </w:rPr>
-        <w:t>’</w:t>
+        <w:t>PFhd’</w:t>
       </w:r>
       <w:r>
         <w:rPr>
@@ -2138,72 +1945,70 @@
         <w:t xml:space="preserve"> + </w:t>
       </w:r>
       <w:r>
+        <w:t>&lt;header_data&gt;</w:t>
+      </w:r>
+    </w:p>
+    <w:p>
+      <w:pPr>
+        <w:ind w:left="720" w:hanging="360"/>
+      </w:pPr>
+      <w:r>
+        <w:t xml:space="preserve">&lt;header_data&gt; = </w:t>
+      </w:r>
+      <w:r>
+        <w:br/>
+      </w:r>
+      <w:r>
+        <w:t>&lt;major_version&gt; + &lt;minor_version&gt; + &lt;bbc_model&gt; + &lt;</w:t>
+      </w:r>
+      <w:r>
+        <w:t>total_</w:t>
+      </w:r>
+      <w:r>
+        <w:t>execution_count&gt;</w:t>
+      </w:r>
+    </w:p>
+    <w:p>
+      <w:pPr>
+        <w:ind w:left="360"/>
+      </w:pPr>
+      <w:r>
         <w:t>&lt;</w:t>
       </w:r>
-      <w:proofErr w:type="spellStart"/>
-      <w:r>
-        <w:t>header_data</w:t>
-      </w:r>
-      <w:proofErr w:type="spellEnd"/>
-      <w:r>
-        <w:t>&gt;</w:t>
-      </w:r>
-    </w:p>
-    <w:p>
-      <w:pPr>
-        <w:ind w:left="720" w:hanging="360"/>
+      <w:r>
+        <w:t>major_</w:t>
+      </w:r>
+      <w:r>
+        <w:t>version&gt;</w:t>
+      </w:r>
+      <w:r>
+        <w:t xml:space="preserve"> </w:t>
+      </w:r>
+      <w:r>
+        <w:t>(1 byte) Major version number</w:t>
+      </w:r>
+      <w:r>
+        <w:t>.  Value is 1.</w:t>
+      </w:r>
+    </w:p>
+    <w:p>
+      <w:pPr>
+        <w:ind w:left="360"/>
       </w:pPr>
       <w:r>
         <w:t>&lt;</w:t>
       </w:r>
-      <w:proofErr w:type="spellStart"/>
-      <w:r>
-        <w:t>header_data</w:t>
-      </w:r>
-      <w:proofErr w:type="spellEnd"/>
-      <w:r>
-        <w:t xml:space="preserve">&gt; = </w:t>
-      </w:r>
-      <w:r>
-        <w:br/>
-      </w:r>
-      <w:r>
-        <w:t>&lt;</w:t>
-      </w:r>
-      <w:proofErr w:type="spellStart"/>
-      <w:r>
-        <w:t>major_version</w:t>
-      </w:r>
-      <w:proofErr w:type="spellEnd"/>
-      <w:r>
-        <w:t>&gt; + &lt;</w:t>
-      </w:r>
-      <w:proofErr w:type="spellStart"/>
-      <w:r>
-        <w:t>minor_version</w:t>
-      </w:r>
-      <w:proofErr w:type="spellEnd"/>
-      <w:r>
-        <w:t>&gt; + &lt;</w:t>
-      </w:r>
-      <w:proofErr w:type="spellStart"/>
-      <w:r>
-        <w:t>bbc_model</w:t>
-      </w:r>
-      <w:proofErr w:type="spellEnd"/>
-      <w:r>
-        <w:t>&gt; + &lt;</w:t>
-      </w:r>
-      <w:proofErr w:type="spellStart"/>
-      <w:r>
-        <w:t>total_</w:t>
-      </w:r>
-      <w:r>
-        <w:t>execution_count</w:t>
-      </w:r>
-      <w:proofErr w:type="spellEnd"/>
-      <w:r>
-        <w:t>&gt;</w:t>
+      <w:r>
+        <w:t>minor</w:t>
+      </w:r>
+      <w:r>
+        <w:t>_version&gt; (1 byte) Minor version number</w:t>
+      </w:r>
+      <w:r>
+        <w:t>.  Value is 0</w:t>
+      </w:r>
+      <w:r>
+        <w:t>.</w:t>
       </w:r>
     </w:p>
     <w:p>
@@ -2211,68 +2016,7 @@
         <w:ind w:left="360"/>
       </w:pPr>
       <w:r>
-        <w:t>&lt;</w:t>
-      </w:r>
-      <w:proofErr w:type="spellStart"/>
-      <w:r>
-        <w:t>major_</w:t>
-      </w:r>
-      <w:r>
-        <w:t>version</w:t>
-      </w:r>
-      <w:proofErr w:type="spellEnd"/>
-      <w:r>
-        <w:t>&gt;</w:t>
-      </w:r>
-      <w:r>
-        <w:t xml:space="preserve"> </w:t>
-      </w:r>
-      <w:r>
-        <w:t>(1 byte) Major version number</w:t>
-      </w:r>
-      <w:r>
-        <w:t>.  Value is 1.</w:t>
-      </w:r>
-    </w:p>
-    <w:p>
-      <w:pPr>
-        <w:ind w:left="360"/>
-      </w:pPr>
-      <w:r>
-        <w:t>&lt;</w:t>
-      </w:r>
-      <w:proofErr w:type="spellStart"/>
-      <w:r>
-        <w:t>minor</w:t>
-      </w:r>
-      <w:r>
-        <w:t>_version</w:t>
-      </w:r>
-      <w:proofErr w:type="spellEnd"/>
-      <w:r>
-        <w:t>&gt; (1 byte) Minor version number</w:t>
-      </w:r>
-      <w:r>
-        <w:t>.  Value is 0</w:t>
-      </w:r>
-      <w:r>
-        <w:t>.</w:t>
-      </w:r>
-    </w:p>
-    <w:p>
-      <w:pPr>
-        <w:ind w:left="360"/>
-      </w:pPr>
-      <w:r>
-        <w:t>&lt;</w:t>
-      </w:r>
-      <w:proofErr w:type="spellStart"/>
-      <w:r>
-        <w:t>bbc_model</w:t>
-      </w:r>
-      <w:proofErr w:type="spellEnd"/>
-      <w:r>
-        <w:t>&gt; (1 byte) The BBC model</w:t>
+        <w:t>&lt;bbc_model&gt; (1 byte) The BBC model</w:t>
       </w:r>
     </w:p>
     <w:tbl>
@@ -2700,7 +2444,6 @@
       <w:r>
         <w:t>&lt;</w:t>
       </w:r>
-      <w:proofErr w:type="spellStart"/>
       <w:r>
         <w:t>total_</w:t>
       </w:r>
@@ -2711,11 +2454,7 @@
         <w:t>_</w:t>
       </w:r>
       <w:r>
-        <w:t>count</w:t>
-      </w:r>
-      <w:proofErr w:type="spellEnd"/>
-      <w:r>
-        <w:t xml:space="preserve">&gt; (4 bytes) The total number of </w:t>
+        <w:t xml:space="preserve">count&gt; (4 bytes) The total number of </w:t>
       </w:r>
       <w:r>
         <w:t xml:space="preserve">executed </w:t>
@@ -2770,35 +2509,14 @@
           <w:b/>
           <w:bCs/>
         </w:rPr>
-        <w:t>&lt;</w:t>
-      </w:r>
-      <w:proofErr w:type="spellStart"/>
-      <w:r>
-        <w:rPr>
-          <w:b/>
-          <w:bCs/>
-        </w:rPr>
-        <w:t>labels_chunk</w:t>
-      </w:r>
-      <w:proofErr w:type="spellEnd"/>
-      <w:r>
-        <w:rPr>
-          <w:b/>
-          <w:bCs/>
-        </w:rPr>
-        <w:t>&gt;</w:t>
+        <w:t>&lt;labels_chunk&gt;</w:t>
       </w:r>
       <w:r>
         <w:t xml:space="preserve"> = </w:t>
       </w:r>
       <w:r>
-        <w:t>&lt;</w:t>
-      </w:r>
-      <w:proofErr w:type="spellStart"/>
-      <w:r>
-        <w:t>common_heade</w:t>
-      </w:r>
-      <w:proofErr w:type="spellEnd"/>
+        <w:t>&lt;common_heade</w:t>
+      </w:r>
       <w:r>
         <w:t>(</w:t>
       </w:r>
@@ -2809,7 +2527,6 @@
         </w:rPr>
         <w:t>‘</w:t>
       </w:r>
-      <w:proofErr w:type="spellStart"/>
       <w:r>
         <w:rPr>
           <w:rFonts w:ascii="Aptos" w:hAnsi="Aptos"/>
@@ -2819,7 +2536,6 @@
         </w:rPr>
         <w:t>PFlb</w:t>
       </w:r>
-      <w:proofErr w:type="spellEnd"/>
       <w:r>
         <w:t>’</w:t>
       </w:r>
@@ -2830,16 +2546,11 @@
         <w:t xml:space="preserve">&gt; </w:t>
       </w:r>
       <w:r>
-        <w:t>+ &lt;</w:t>
-      </w:r>
-      <w:proofErr w:type="spellStart"/>
-      <w:r>
-        <w:t>label</w:t>
+        <w:t>+ &lt;label</w:t>
       </w:r>
       <w:r>
         <w:t>_data</w:t>
       </w:r>
-      <w:proofErr w:type="spellEnd"/>
       <w:r>
         <w:t>&gt;</w:t>
       </w:r>
@@ -2849,15 +2560,7 @@
         <w:ind w:left="360"/>
       </w:pPr>
       <w:r>
-        <w:t>&lt;</w:t>
-      </w:r>
-      <w:proofErr w:type="spellStart"/>
-      <w:r>
-        <w:t>label_data</w:t>
-      </w:r>
-      <w:proofErr w:type="spellEnd"/>
-      <w:r>
-        <w:t xml:space="preserve">&gt; = </w:t>
+        <w:t xml:space="preserve">&lt;label_data&gt; = </w:t>
       </w:r>
       <w:r>
         <w:t xml:space="preserve">list of </w:t>
@@ -2878,23 +2581,7 @@
       </w:r>
       <w:bookmarkEnd w:id="0"/>
       <w:r>
-        <w:t>&lt;</w:t>
-      </w:r>
-      <w:proofErr w:type="spellStart"/>
-      <w:r>
-        <w:t>label_address</w:t>
-      </w:r>
-      <w:proofErr w:type="spellEnd"/>
-      <w:r>
-        <w:t>&gt; + &lt;</w:t>
-      </w:r>
-      <w:proofErr w:type="spellStart"/>
-      <w:r>
-        <w:t>label_name</w:t>
-      </w:r>
-      <w:proofErr w:type="spellEnd"/>
-      <w:r>
-        <w:t>&gt;</w:t>
+        <w:t>&lt;label_address&gt; + &lt;label_name&gt;</w:t>
       </w:r>
       <w:r>
         <w:t xml:space="preserve"> </w:t>
@@ -2905,15 +2592,7 @@
         <w:ind w:left="810"/>
       </w:pPr>
       <w:r>
-        <w:t>&lt;</w:t>
-      </w:r>
-      <w:proofErr w:type="spellStart"/>
-      <w:r>
-        <w:t>label_address</w:t>
-      </w:r>
-      <w:proofErr w:type="spellEnd"/>
-      <w:r>
-        <w:t xml:space="preserve">&gt; (2 bytes) </w:t>
+        <w:t xml:space="preserve">&lt;label_address&gt; (2 bytes) </w:t>
       </w:r>
       <w:r>
         <w:t xml:space="preserve">A </w:t>
@@ -3009,7 +2688,6 @@
         </w:rPr>
         <w:t>&lt;</w:t>
       </w:r>
-      <w:proofErr w:type="spellStart"/>
       <w:r>
         <w:rPr>
           <w:b/>
@@ -3022,34 +2700,21 @@
           <w:b/>
           <w:bCs/>
         </w:rPr>
-        <w:t>_chunk</w:t>
-      </w:r>
-      <w:proofErr w:type="spellEnd"/>
+        <w:t>_chunk&gt;</w:t>
+      </w:r>
       <w:r>
         <w:rPr>
           <w:b/>
           <w:bCs/>
         </w:rPr>
-        <w:t>&gt;</w:t>
-      </w:r>
-      <w:r>
-        <w:rPr>
-          <w:b/>
-          <w:bCs/>
-        </w:rPr>
         <w:t xml:space="preserve"> </w:t>
       </w:r>
       <w:r>
-        <w:t>= &lt;</w:t>
-      </w:r>
-      <w:proofErr w:type="spellStart"/>
-      <w:r>
-        <w:t>common_</w:t>
+        <w:t>= &lt;common_</w:t>
       </w:r>
       <w:r>
         <w:t>header</w:t>
       </w:r>
-      <w:proofErr w:type="spellEnd"/>
       <w:r>
         <w:t>(</w:t>
       </w:r>
@@ -3060,7 +2725,6 @@
         </w:rPr>
         <w:t>‘</w:t>
       </w:r>
-      <w:proofErr w:type="spellStart"/>
       <w:r>
         <w:rPr>
           <w:rFonts w:ascii="Aptos" w:hAnsi="Aptos"/>
@@ -3068,45 +2732,27 @@
           <w:bCs/>
           <w:color w:val="000000"/>
         </w:rPr>
-        <w:t>PFss</w:t>
-      </w:r>
-      <w:proofErr w:type="spellEnd"/>
+        <w:t>PFss’</w:t>
+      </w:r>
       <w:r>
         <w:rPr>
           <w:rFonts w:ascii="Aptos" w:hAnsi="Aptos"/>
+          <w:color w:val="000000"/>
+        </w:rPr>
+        <w:t>)</w:t>
+      </w:r>
+      <w:r>
+        <w:t>&gt; +</w:t>
+      </w:r>
+      <w:r>
+        <w:rPr>
           <w:b/>
           <w:bCs/>
-          <w:color w:val="000000"/>
-        </w:rPr>
-        <w:t>’</w:t>
-      </w:r>
-      <w:r>
-        <w:rPr>
-          <w:rFonts w:ascii="Aptos" w:hAnsi="Aptos"/>
-          <w:color w:val="000000"/>
-        </w:rPr>
-        <w:t>)</w:t>
-      </w:r>
-      <w:r>
-        <w:t>&gt; +</w:t>
-      </w:r>
-      <w:r>
-        <w:rPr>
-          <w:b/>
-          <w:bCs/>
         </w:rPr>
         <w:t xml:space="preserve"> </w:t>
       </w:r>
       <w:r>
-        <w:t>&lt;</w:t>
-      </w:r>
-      <w:proofErr w:type="spellStart"/>
-      <w:r>
-        <w:t>snapshot_data</w:t>
-      </w:r>
-      <w:proofErr w:type="spellEnd"/>
-      <w:r>
-        <w:t>&gt;</w:t>
+        <w:t>&lt;snapshot_data&gt;</w:t>
       </w:r>
     </w:p>
     <w:p>
@@ -3114,63 +2760,26 @@
         <w:ind w:left="720" w:hanging="360"/>
       </w:pPr>
       <w:r>
-        <w:t>&lt;</w:t>
-      </w:r>
-      <w:proofErr w:type="spellStart"/>
-      <w:r>
-        <w:t>snapshot_data</w:t>
-      </w:r>
-      <w:proofErr w:type="spellEnd"/>
-      <w:r>
-        <w:t>&gt; =</w:t>
+        <w:t>&lt;snapshot_data&gt; =</w:t>
       </w:r>
       <w:r>
         <w:br/>
-        <w:t>&lt;</w:t>
-      </w:r>
-      <w:proofErr w:type="spellStart"/>
-      <w:r>
-        <w:t>stack_</w:t>
+        <w:t>&lt;stack_</w:t>
       </w:r>
       <w:r>
         <w:t>pointer</w:t>
       </w:r>
-      <w:proofErr w:type="spellEnd"/>
       <w:r>
         <w:t xml:space="preserve">&gt; + </w:t>
       </w:r>
       <w:r>
-        <w:t>&lt;</w:t>
-      </w:r>
-      <w:proofErr w:type="spellStart"/>
-      <w:r>
-        <w:t>rom_paging_register</w:t>
-      </w:r>
-      <w:proofErr w:type="spellEnd"/>
-      <w:r>
-        <w:t>&gt; + &lt;</w:t>
-      </w:r>
-      <w:proofErr w:type="spellStart"/>
-      <w:r>
-        <w:t>acccon</w:t>
-      </w:r>
-      <w:proofErr w:type="spellEnd"/>
-      <w:r>
-        <w:t xml:space="preserve">&gt; + </w:t>
-      </w:r>
-      <w:r>
-        <w:t>&lt;</w:t>
-      </w:r>
-      <w:proofErr w:type="spellStart"/>
-      <w:r>
-        <w:t>hidden_ram_</w:t>
-      </w:r>
-      <w:r>
-        <w:t>address</w:t>
-      </w:r>
-      <w:proofErr w:type="spellEnd"/>
-      <w:r>
-        <w:t>&gt;</w:t>
+        <w:t xml:space="preserve">&lt;rom_paging_register&gt; + &lt;acccon&gt; + </w:t>
+      </w:r>
+      <w:r>
+        <w:t>&lt;hidden_ram_</w:t>
+      </w:r>
+      <w:r>
+        <w:t>address&gt;</w:t>
       </w:r>
       <w:r>
         <w:rPr>
@@ -3184,23 +2793,7 @@
         <w:t xml:space="preserve"> + </w:t>
       </w:r>
       <w:r>
-        <w:t>&lt;6845-registers&gt; + &lt;</w:t>
-      </w:r>
-      <w:proofErr w:type="spellStart"/>
-      <w:r>
-        <w:t>ULA_video_control_register</w:t>
-      </w:r>
-      <w:proofErr w:type="spellEnd"/>
-      <w:r>
-        <w:t>&gt; + &lt;</w:t>
-      </w:r>
-      <w:proofErr w:type="spellStart"/>
-      <w:r>
-        <w:t>ULA_palette</w:t>
-      </w:r>
-      <w:proofErr w:type="spellEnd"/>
-      <w:r>
-        <w:t xml:space="preserve">&gt; + </w:t>
+        <w:t xml:space="preserve">&lt;6845-registers&gt; + &lt;ULA_video_control_register&gt; + &lt;ULA_palette&gt; + </w:t>
       </w:r>
       <w:r>
         <w:t>&lt;memory&gt;</w:t>
@@ -3211,24 +2804,66 @@
         <w:ind w:left="360"/>
       </w:pPr>
       <w:r>
+        <w:t>&lt;stack_</w:t>
+      </w:r>
+      <w:r>
+        <w:t>pointer</w:t>
+      </w:r>
+      <w:r>
+        <w:t xml:space="preserve">&gt; (1 byte).  The value of the stack </w:t>
+      </w:r>
+      <w:r>
+        <w:t>pointer</w:t>
+      </w:r>
+      <w:r>
+        <w:t>, used to interpret the stack.</w:t>
+      </w:r>
+    </w:p>
+    <w:p>
+      <w:pPr>
+        <w:ind w:left="360"/>
+      </w:pPr>
+      <w:r>
         <w:t>&lt;</w:t>
       </w:r>
-      <w:proofErr w:type="spellStart"/>
-      <w:r>
-        <w:t>stack_</w:t>
-      </w:r>
-      <w:r>
-        <w:t>pointer</w:t>
-      </w:r>
-      <w:proofErr w:type="spellEnd"/>
-      <w:r>
-        <w:t xml:space="preserve">&gt; (1 byte).  The value of the stack </w:t>
-      </w:r>
-      <w:r>
-        <w:t>pointer</w:t>
-      </w:r>
-      <w:r>
-        <w:t>, used to interpret the stack.</w:t>
+      <w:r>
+        <w:t>rom_</w:t>
+      </w:r>
+      <w:r>
+        <w:t>pag</w:t>
+      </w:r>
+      <w:r>
+        <w:t>ing</w:t>
+      </w:r>
+      <w:r>
+        <w:t>_register</w:t>
+      </w:r>
+      <w:r>
+        <w:t>&gt; (1 byte).</w:t>
+      </w:r>
+      <w:r>
+        <w:t xml:space="preserve">  The value </w:t>
+      </w:r>
+      <w:r>
+        <w:t>of the ROM paging register</w:t>
+      </w:r>
+      <w:r>
+        <w:t xml:space="preserve"> (</w:t>
+      </w:r>
+      <w:r>
+        <w:t xml:space="preserve">set </w:t>
+      </w:r>
+      <w:r>
+        <w:t xml:space="preserve">via </w:t>
+      </w:r>
+      <w:r>
+        <w:t>SHEILA address &amp;FE30</w:t>
+      </w:r>
+      <w:r>
+        <w:t>)</w:t>
+      </w:r>
+      <w:r>
+        <w:t>.</w:t>
       </w:r>
     </w:p>
     <w:p>
@@ -3238,40 +2873,91 @@
       <w:r>
         <w:t>&lt;</w:t>
       </w:r>
-      <w:proofErr w:type="spellStart"/>
-      <w:r>
-        <w:t>rom_</w:t>
-      </w:r>
-      <w:r>
-        <w:t>pag</w:t>
-      </w:r>
-      <w:r>
-        <w:t>ing</w:t>
-      </w:r>
-      <w:r>
-        <w:t>_register</w:t>
-      </w:r>
-      <w:proofErr w:type="spellEnd"/>
-      <w:r>
-        <w:t>&gt; (1 byte).</w:t>
-      </w:r>
-      <w:r>
-        <w:t xml:space="preserve">  The value </w:t>
-      </w:r>
-      <w:r>
-        <w:t>of the ROM paging register</w:t>
-      </w:r>
-      <w:r>
-        <w:t xml:space="preserve"> (</w:t>
+      <w:r>
+        <w:t>acccon</w:t>
+      </w:r>
+      <w:r>
+        <w:t>&gt;</w:t>
+      </w:r>
+      <w:r>
+        <w:t xml:space="preserve"> (1 byte).</w:t>
+      </w:r>
+      <w:r>
+        <w:t xml:space="preserve">  The value of the access control register</w:t>
+      </w:r>
+      <w:r>
+        <w:t xml:space="preserve"> (set via </w:t>
+      </w:r>
+      <w:r>
+        <w:t xml:space="preserve">SHEILA address </w:t>
+      </w:r>
+      <w:r>
+        <w:t>&amp;FE34</w:t>
+      </w:r>
+      <w:r>
+        <w:t>)</w:t>
+      </w:r>
+      <w:r>
+        <w:t>.</w:t>
+      </w:r>
+    </w:p>
+    <w:p>
+      <w:pPr>
+        <w:ind w:left="360"/>
+      </w:pPr>
+      <w:r>
+        <w:t>&lt;hidden_ram_address&gt; (1 byte)</w:t>
+      </w:r>
+      <w:r>
+        <w:t xml:space="preserve">.  Populated </w:t>
+      </w:r>
+      <w:r>
+        <w:t>for the</w:t>
+      </w:r>
+      <w:r>
+        <w:t xml:space="preserve"> </w:t>
+      </w:r>
+      <w:r>
+        <w:t xml:space="preserve">BBC Model </w:t>
+      </w:r>
+      <w:r>
+        <w:t>B</w:t>
+      </w:r>
+      <w:r>
+        <w:t xml:space="preserve"> </w:t>
+      </w:r>
+      <w:r>
+        <w:t>Integra</w:t>
+      </w:r>
+      <w:r>
+        <w:t xml:space="preserve">.  </w:t>
+      </w:r>
+      <w:r>
+        <w:t xml:space="preserve">The value contains the </w:t>
+      </w:r>
+      <w:r>
+        <w:t xml:space="preserve">hidden memory address </w:t>
+      </w:r>
+      <w:r>
+        <w:t>(</w:t>
       </w:r>
       <w:r>
         <w:t xml:space="preserve">set </w:t>
       </w:r>
       <w:r>
-        <w:t xml:space="preserve">via </w:t>
-      </w:r>
-      <w:r>
-        <w:t>SHEILA address &amp;FE30</w:t>
+        <w:t>vi</w:t>
+      </w:r>
+      <w:r>
+        <w:t>a</w:t>
+      </w:r>
+      <w:r>
+        <w:t xml:space="preserve"> </w:t>
+      </w:r>
+      <w:r>
+        <w:t xml:space="preserve">SHEILA address </w:t>
+      </w:r>
+      <w:r>
+        <w:t>&amp;FE38</w:t>
       </w:r>
       <w:r>
         <w:t>)</w:t>
@@ -3279,42 +2965,43 @@
       <w:r>
         <w:t>.</w:t>
       </w:r>
+      <w:r>
+        <w:t xml:space="preserve">  Read</w:t>
+      </w:r>
+      <w:r>
+        <w:t>s</w:t>
+      </w:r>
+      <w:r>
+        <w:t xml:space="preserve"> and writes to SHEILA address </w:t>
+      </w:r>
+      <w:r>
+        <w:t>&amp;</w:t>
+      </w:r>
+      <w:r>
+        <w:t xml:space="preserve">FE3C </w:t>
+      </w:r>
+      <w:r>
+        <w:t xml:space="preserve">access </w:t>
+      </w:r>
+      <w:r>
+        <w:t xml:space="preserve">this </w:t>
+      </w:r>
+      <w:r>
+        <w:t xml:space="preserve">hidden </w:t>
+      </w:r>
+      <w:r>
+        <w:t>address</w:t>
+      </w:r>
+      <w:r>
+        <w:t>.</w:t>
+      </w:r>
     </w:p>
     <w:p>
       <w:pPr>
         <w:ind w:left="360"/>
       </w:pPr>
       <w:r>
-        <w:t>&lt;</w:t>
-      </w:r>
-      <w:proofErr w:type="spellStart"/>
-      <w:r>
-        <w:t>acccon</w:t>
-      </w:r>
-      <w:proofErr w:type="spellEnd"/>
-      <w:r>
-        <w:t>&gt;</w:t>
-      </w:r>
-      <w:r>
-        <w:t xml:space="preserve"> (1 byte).</w:t>
-      </w:r>
-      <w:r>
-        <w:t xml:space="preserve">  The value of the access control register</w:t>
-      </w:r>
-      <w:r>
-        <w:t xml:space="preserve"> (set via </w:t>
-      </w:r>
-      <w:r>
-        <w:t xml:space="preserve">SHEILA address </w:t>
-      </w:r>
-      <w:r>
-        <w:t>&amp;FE34</w:t>
-      </w:r>
-      <w:r>
-        <w:t>)</w:t>
-      </w:r>
-      <w:r>
-        <w:t>.</w:t>
+        <w:t>&lt;ULA_video_control_register&gt; (1 byte).  The value of the ULA video control register.</w:t>
       </w:r>
     </w:p>
     <w:p>
@@ -3322,134 +3009,7 @@
         <w:ind w:left="360"/>
       </w:pPr>
       <w:r>
-        <w:t>&lt;</w:t>
-      </w:r>
-      <w:proofErr w:type="spellStart"/>
-      <w:r>
-        <w:t>hidden_ram_address</w:t>
-      </w:r>
-      <w:proofErr w:type="spellEnd"/>
-      <w:r>
-        <w:t>&gt; (1 byte)</w:t>
-      </w:r>
-      <w:r>
-        <w:t xml:space="preserve">.  Populated </w:t>
-      </w:r>
-      <w:r>
-        <w:t>for the</w:t>
-      </w:r>
-      <w:r>
-        <w:t xml:space="preserve"> </w:t>
-      </w:r>
-      <w:r>
-        <w:t xml:space="preserve">BBC Model </w:t>
-      </w:r>
-      <w:r>
-        <w:t>B</w:t>
-      </w:r>
-      <w:r>
-        <w:t xml:space="preserve"> </w:t>
-      </w:r>
-      <w:r>
-        <w:t>Integra</w:t>
-      </w:r>
-      <w:r>
-        <w:t xml:space="preserve">.  </w:t>
-      </w:r>
-      <w:r>
-        <w:t xml:space="preserve">The value contains the </w:t>
-      </w:r>
-      <w:r>
-        <w:t xml:space="preserve">hidden memory address </w:t>
-      </w:r>
-      <w:r>
-        <w:t>(</w:t>
-      </w:r>
-      <w:r>
-        <w:t xml:space="preserve">set </w:t>
-      </w:r>
-      <w:r>
-        <w:t>vi</w:t>
-      </w:r>
-      <w:r>
-        <w:t>a</w:t>
-      </w:r>
-      <w:r>
-        <w:t xml:space="preserve"> </w:t>
-      </w:r>
-      <w:r>
-        <w:t xml:space="preserve">SHEILA address </w:t>
-      </w:r>
-      <w:r>
-        <w:t>&amp;FE38</w:t>
-      </w:r>
-      <w:r>
-        <w:t>)</w:t>
-      </w:r>
-      <w:r>
-        <w:t>.</w:t>
-      </w:r>
-      <w:r>
-        <w:t xml:space="preserve">  Read</w:t>
-      </w:r>
-      <w:r>
-        <w:t>s</w:t>
-      </w:r>
-      <w:r>
-        <w:t xml:space="preserve"> and writes to SHEILA address </w:t>
-      </w:r>
-      <w:r>
-        <w:t>&amp;</w:t>
-      </w:r>
-      <w:r>
-        <w:t xml:space="preserve">FE3C </w:t>
-      </w:r>
-      <w:r>
-        <w:t xml:space="preserve">access </w:t>
-      </w:r>
-      <w:r>
-        <w:t xml:space="preserve">this </w:t>
-      </w:r>
-      <w:r>
-        <w:t xml:space="preserve">hidden </w:t>
-      </w:r>
-      <w:r>
-        <w:t>address</w:t>
-      </w:r>
-      <w:r>
-        <w:t>.</w:t>
-      </w:r>
-    </w:p>
-    <w:p>
-      <w:pPr>
-        <w:ind w:left="360"/>
-      </w:pPr>
-      <w:r>
-        <w:t>&lt;</w:t>
-      </w:r>
-      <w:proofErr w:type="spellStart"/>
-      <w:r>
-        <w:t>ULA_video_control_register</w:t>
-      </w:r>
-      <w:proofErr w:type="spellEnd"/>
-      <w:r>
-        <w:t>&gt; (1 byte).  The value of the ULA video control register.</w:t>
-      </w:r>
-    </w:p>
-    <w:p>
-      <w:pPr>
-        <w:ind w:left="360"/>
-      </w:pPr>
-      <w:r>
-        <w:t>&lt;</w:t>
-      </w:r>
-      <w:proofErr w:type="spellStart"/>
-      <w:r>
-        <w:t>ULA_palette</w:t>
-      </w:r>
-      <w:proofErr w:type="spellEnd"/>
-      <w:r>
-        <w:t xml:space="preserve">&gt; (16 bytes).  The </w:t>
+        <w:t xml:space="preserve">&lt;ULA_palette&gt; (16 bytes).  The </w:t>
       </w:r>
       <w:r>
         <w:t xml:space="preserve">ULA’s </w:t>
@@ -3507,38 +3067,20 @@
       <w:r>
         <w:t>&lt;</w:t>
       </w:r>
-      <w:proofErr w:type="spellStart"/>
       <w:r>
         <w:t>base_</w:t>
       </w:r>
       <w:r>
+        <w:t>memory&gt; + &lt;paged_</w:t>
+      </w:r>
+      <w:r>
         <w:t>memory</w:t>
       </w:r>
-      <w:proofErr w:type="spellEnd"/>
-      <w:r>
-        <w:t>&gt; + &lt;</w:t>
-      </w:r>
-      <w:proofErr w:type="spellStart"/>
-      <w:r>
-        <w:t>paged_</w:t>
-      </w:r>
-      <w:r>
-        <w:t>memory</w:t>
-      </w:r>
-      <w:proofErr w:type="spellEnd"/>
       <w:r>
         <w:t xml:space="preserve">&gt; </w:t>
       </w:r>
       <w:r>
-        <w:t>+ &lt;</w:t>
-      </w:r>
-      <w:proofErr w:type="spellStart"/>
-      <w:r>
-        <w:t>shadow_ram</w:t>
-      </w:r>
-      <w:proofErr w:type="spellEnd"/>
-      <w:r>
-        <w:t>&gt;</w:t>
+        <w:t>+ &lt;shadow_ram&gt;</w:t>
       </w:r>
       <w:r>
         <w:rPr>
@@ -3552,15 +3094,7 @@
         <w:t xml:space="preserve"> + </w:t>
       </w:r>
       <w:r>
-        <w:t>&lt;</w:t>
-      </w:r>
-      <w:proofErr w:type="spellStart"/>
-      <w:r>
-        <w:t>mos_ram</w:t>
-      </w:r>
-      <w:proofErr w:type="spellEnd"/>
-      <w:r>
-        <w:t>&gt;</w:t>
+        <w:t>&lt;mos_ram&gt;</w:t>
       </w:r>
       <w:r>
         <w:rPr>
@@ -3582,15 +3116,7 @@
         <w:t xml:space="preserve"> + </w:t>
       </w:r>
       <w:r>
-        <w:t>&lt;</w:t>
-      </w:r>
-      <w:proofErr w:type="spellStart"/>
-      <w:r>
-        <w:t>filing_system_ram</w:t>
-      </w:r>
-      <w:proofErr w:type="spellEnd"/>
-      <w:r>
-        <w:t>&gt;</w:t>
+        <w:t>&lt;filing_system_ram&gt;</w:t>
       </w:r>
       <w:r>
         <w:rPr>
@@ -3604,15 +3130,7 @@
         <w:t xml:space="preserve"> +</w:t>
       </w:r>
       <w:r>
-        <w:t xml:space="preserve"> &lt;</w:t>
-      </w:r>
-      <w:proofErr w:type="spellStart"/>
-      <w:r>
-        <w:t>private_ram</w:t>
-      </w:r>
-      <w:proofErr w:type="spellEnd"/>
-      <w:r>
-        <w:t>&gt;</w:t>
+        <w:t xml:space="preserve"> &lt;private_ram&gt;</w:t>
       </w:r>
       <w:r>
         <w:rPr>
@@ -3623,15 +3141,7 @@
         <w:t>opt</w:t>
       </w:r>
       <w:r>
-        <w:t xml:space="preserve"> + &lt;</w:t>
-      </w:r>
-      <w:proofErr w:type="spellStart"/>
-      <w:r>
-        <w:t>hidden_ram</w:t>
-      </w:r>
-      <w:proofErr w:type="spellEnd"/>
-      <w:r>
-        <w:t>&gt;</w:t>
+        <w:t xml:space="preserve"> + &lt;hidden_ram&gt;</w:t>
       </w:r>
       <w:r>
         <w:rPr>
@@ -3813,15 +3323,7 @@
               <w:ind w:left="1440" w:hanging="1440"/>
             </w:pPr>
             <w:r>
-              <w:t>&lt;</w:t>
-            </w:r>
-            <w:proofErr w:type="spellStart"/>
-            <w:r>
-              <w:t>base_memory</w:t>
-            </w:r>
-            <w:proofErr w:type="spellEnd"/>
-            <w:r>
-              <w:t>&gt;</w:t>
+              <w:t>&lt;base_memory&gt;</w:t>
             </w:r>
           </w:p>
         </w:tc>
@@ -3894,13 +3396,8 @@
             <w:r>
               <w:t>&lt;</w:t>
             </w:r>
-            <w:proofErr w:type="spellStart"/>
             <w:r>
-              <w:t>paged_memory</w:t>
-            </w:r>
-            <w:proofErr w:type="spellEnd"/>
-            <w:r>
-              <w:t>&gt;</w:t>
+              <w:t>paged_memory&gt;</w:t>
             </w:r>
           </w:p>
         </w:tc>
@@ -3971,15 +3468,7 @@
           </w:tcPr>
           <w:p>
             <w:r>
-              <w:t>&lt;</w:t>
-            </w:r>
-            <w:proofErr w:type="spellStart"/>
-            <w:r>
-              <w:t>shadow_ram</w:t>
-            </w:r>
-            <w:proofErr w:type="spellEnd"/>
-            <w:r>
-              <w:t>&gt;</w:t>
+              <w:t>&lt;shadow_ram&gt;</w:t>
             </w:r>
           </w:p>
         </w:tc>
@@ -4043,15 +3532,7 @@
           </w:tcPr>
           <w:p>
             <w:r>
-              <w:t>&lt;</w:t>
-            </w:r>
-            <w:proofErr w:type="spellStart"/>
-            <w:r>
-              <w:t>mos_ram</w:t>
-            </w:r>
-            <w:proofErr w:type="spellEnd"/>
-            <w:r>
-              <w:t>&gt;</w:t>
+              <w:t>&lt;mos_ram&gt;</w:t>
             </w:r>
           </w:p>
         </w:tc>
@@ -4106,15 +3587,7 @@
           </w:tcPr>
           <w:p>
             <w:r>
-              <w:t>&lt;</w:t>
-            </w:r>
-            <w:proofErr w:type="spellStart"/>
-            <w:r>
-              <w:t>filing_system_ram</w:t>
-            </w:r>
-            <w:proofErr w:type="spellEnd"/>
-            <w:r>
-              <w:t>&gt;</w:t>
+              <w:t>&lt;filing_system_ram&gt;</w:t>
             </w:r>
           </w:p>
         </w:tc>
@@ -4170,15 +3643,7 @@
           <w:p>
             <w:r>
               <w:lastRenderedPageBreak/>
-              <w:t>&lt;</w:t>
-            </w:r>
-            <w:proofErr w:type="spellStart"/>
-            <w:r>
-              <w:t>private_ram</w:t>
-            </w:r>
-            <w:proofErr w:type="spellEnd"/>
-            <w:r>
-              <w:t>&gt;</w:t>
+              <w:t>&lt;private_ram&gt;</w:t>
             </w:r>
           </w:p>
         </w:tc>
@@ -4236,15 +3701,7 @@
           </w:tcPr>
           <w:p>
             <w:r>
-              <w:t>&lt;</w:t>
-            </w:r>
-            <w:proofErr w:type="spellStart"/>
-            <w:r>
-              <w:t>hidden_ram</w:t>
-            </w:r>
-            <w:proofErr w:type="spellEnd"/>
-            <w:r>
-              <w:t>&gt;</w:t>
+              <w:t>&lt;hidden_ram&gt;</w:t>
             </w:r>
           </w:p>
         </w:tc>
@@ -4303,66 +3760,46 @@
       <w:r>
         <w:t>&lt;</w:t>
       </w:r>
-      <w:proofErr w:type="spellStart"/>
       <w:r>
         <w:t>base_</w:t>
       </w:r>
       <w:r>
+        <w:t>memory&gt; (64K) The default 64K of memory.</w:t>
+      </w:r>
+      <w:r>
+        <w:t xml:space="preserve">  Addresses 0</w:t>
+      </w:r>
+      <w:r>
+        <w:t xml:space="preserve"> to </w:t>
+      </w:r>
+      <w:r>
+        <w:t>&amp;FFFF.</w:t>
+      </w:r>
+    </w:p>
+    <w:p>
+      <w:pPr>
+        <w:ind w:left="720" w:hanging="360"/>
+      </w:pPr>
+      <w:r>
+        <w:t>&lt;</w:t>
+      </w:r>
+      <w:r>
+        <w:t>paged_</w:t>
+      </w:r>
+      <w:r>
         <w:t>memory</w:t>
       </w:r>
-      <w:proofErr w:type="spellEnd"/>
-      <w:r>
-        <w:t>&gt; (64K) The default 64K of memory.</w:t>
-      </w:r>
-      <w:r>
-        <w:t xml:space="preserve">  Addresses 0</w:t>
-      </w:r>
-      <w:r>
-        <w:t xml:space="preserve"> to </w:t>
-      </w:r>
-      <w:r>
-        <w:t>&amp;FFFF.</w:t>
-      </w:r>
-    </w:p>
-    <w:p>
-      <w:pPr>
-        <w:ind w:left="720" w:hanging="360"/>
-      </w:pPr>
-      <w:r>
-        <w:t>&lt;</w:t>
-      </w:r>
-      <w:proofErr w:type="spellStart"/>
-      <w:r>
-        <w:t>paged_</w:t>
-      </w:r>
-      <w:r>
-        <w:t>memory</w:t>
-      </w:r>
-      <w:proofErr w:type="spellEnd"/>
       <w:r>
         <w:t>&gt;</w:t>
       </w:r>
       <w:r>
-        <w:t xml:space="preserve"> = &lt;</w:t>
-      </w:r>
-      <w:proofErr w:type="spellStart"/>
-      <w:r>
-        <w:t>page_count</w:t>
-      </w:r>
-      <w:proofErr w:type="spellEnd"/>
-      <w:r>
-        <w:t>&gt; + &lt;</w:t>
-      </w:r>
-      <w:proofErr w:type="spellStart"/>
+        <w:t xml:space="preserve"> = &lt;page_count&gt; + &lt;</w:t>
+      </w:r>
       <w:r>
         <w:t>page_</w:t>
       </w:r>
       <w:r>
-        <w:t>data</w:t>
-      </w:r>
-      <w:proofErr w:type="spellEnd"/>
-      <w:r>
-        <w:t>&gt;</w:t>
+        <w:t>data&gt;</w:t>
       </w:r>
       <w:r>
         <w:rPr>
@@ -4389,151 +3826,242 @@
         <w:ind w:left="720"/>
       </w:pPr>
       <w:r>
+        <w:t>&lt;page_count&gt; (1 byte) The number of pages.</w:t>
+      </w:r>
+    </w:p>
+    <w:p>
+      <w:pPr>
+        <w:ind w:left="720"/>
+      </w:pPr>
+      <w:r>
+        <w:t>&lt;page_data&gt; = &lt;page_back&gt; + &lt;page_readonly&gt; + &lt;page_memort&gt;</w:t>
+      </w:r>
+    </w:p>
+    <w:p>
+      <w:pPr>
+        <w:ind w:left="1080"/>
+      </w:pPr>
+      <w:r>
+        <w:t>&lt;page_</w:t>
+      </w:r>
+      <w:r>
+        <w:t>bank</w:t>
+      </w:r>
+      <w:r>
+        <w:t xml:space="preserve">&gt; (1 byte) A page </w:t>
+      </w:r>
+      <w:r>
+        <w:t xml:space="preserve">bank </w:t>
+      </w:r>
+      <w:r>
+        <w:t>id</w:t>
+      </w:r>
+      <w:r>
+        <w:t xml:space="preserve"> (0 to 16).</w:t>
+      </w:r>
+    </w:p>
+    <w:p>
+      <w:pPr>
+        <w:ind w:left="1080"/>
+      </w:pPr>
+      <w:r>
+        <w:t>&lt;page_</w:t>
+      </w:r>
+      <w:r>
+        <w:t>readonly</w:t>
+      </w:r>
+      <w:r>
+        <w:t xml:space="preserve">&gt; (1 byte) A page </w:t>
+      </w:r>
+      <w:r>
+        <w:t>read</w:t>
+      </w:r>
+      <w:r>
+        <w:t>-</w:t>
+      </w:r>
+      <w:r>
+        <w:t>only</w:t>
+      </w:r>
+      <w:r>
+        <w:t xml:space="preserve"> flag.</w:t>
+      </w:r>
+      <w:r>
+        <w:t xml:space="preserve"> </w:t>
+      </w:r>
+      <w:r>
+        <w:t xml:space="preserve"> 0 = </w:t>
+      </w:r>
+      <w:r>
+        <w:t>writable, 1 = read</w:t>
+      </w:r>
+      <w:r>
+        <w:t>-</w:t>
+      </w:r>
+      <w:r>
+        <w:t>only</w:t>
+      </w:r>
+    </w:p>
+    <w:p>
+      <w:pPr>
+        <w:ind w:left="1080"/>
+      </w:pPr>
+      <w:r>
         <w:t>&lt;</w:t>
       </w:r>
-      <w:proofErr w:type="spellStart"/>
-      <w:r>
-        <w:t>page_count</w:t>
-      </w:r>
-      <w:proofErr w:type="spellEnd"/>
-      <w:r>
-        <w:t>&gt; (1 byte) The number of pages.</w:t>
-      </w:r>
-    </w:p>
-    <w:p>
-      <w:pPr>
-        <w:ind w:left="720"/>
-      </w:pPr>
-      <w:r>
-        <w:t>&lt;</w:t>
-      </w:r>
-      <w:proofErr w:type="spellStart"/>
-      <w:r>
-        <w:t>page_data</w:t>
-      </w:r>
-      <w:proofErr w:type="spellEnd"/>
-      <w:r>
-        <w:t>&gt; = &lt;</w:t>
-      </w:r>
-      <w:proofErr w:type="spellStart"/>
-      <w:r>
-        <w:t>page_back</w:t>
-      </w:r>
-      <w:proofErr w:type="spellEnd"/>
-      <w:r>
-        <w:t>&gt; + &lt;</w:t>
-      </w:r>
-      <w:proofErr w:type="spellStart"/>
-      <w:r>
-        <w:t>page_readonly</w:t>
-      </w:r>
-      <w:proofErr w:type="spellEnd"/>
-      <w:r>
-        <w:t>&gt; + &lt;</w:t>
-      </w:r>
-      <w:proofErr w:type="spellStart"/>
-      <w:r>
-        <w:t>page_memort</w:t>
-      </w:r>
-      <w:proofErr w:type="spellEnd"/>
-      <w:r>
-        <w:t>&gt;</w:t>
-      </w:r>
-    </w:p>
-    <w:p>
-      <w:pPr>
-        <w:ind w:left="1080"/>
-      </w:pPr>
-      <w:r>
-        <w:t>&lt;</w:t>
-      </w:r>
-      <w:proofErr w:type="spellStart"/>
-      <w:r>
-        <w:t>page_</w:t>
-      </w:r>
-      <w:r>
-        <w:t>bank</w:t>
-      </w:r>
-      <w:proofErr w:type="spellEnd"/>
-      <w:r>
-        <w:t xml:space="preserve">&gt; (1 byte) A page </w:t>
-      </w:r>
-      <w:r>
-        <w:t xml:space="preserve">bank </w:t>
-      </w:r>
-      <w:r>
-        <w:t>id</w:t>
-      </w:r>
-      <w:r>
-        <w:t xml:space="preserve"> (0 to 16).</w:t>
-      </w:r>
-    </w:p>
-    <w:p>
-      <w:pPr>
-        <w:ind w:left="1080"/>
-      </w:pPr>
-      <w:r>
-        <w:t>&lt;</w:t>
-      </w:r>
-      <w:proofErr w:type="spellStart"/>
-      <w:r>
-        <w:t>page_</w:t>
-      </w:r>
-      <w:r>
-        <w:t>readonly</w:t>
-      </w:r>
-      <w:proofErr w:type="spellEnd"/>
-      <w:r>
-        <w:t xml:space="preserve">&gt; (1 byte) A page </w:t>
-      </w:r>
-      <w:r>
-        <w:t>read</w:t>
-      </w:r>
-      <w:r>
-        <w:t>-</w:t>
-      </w:r>
-      <w:r>
-        <w:t>only</w:t>
-      </w:r>
-      <w:r>
-        <w:t xml:space="preserve"> flag.</w:t>
+      <w:r>
+        <w:t>page_memory</w:t>
+      </w:r>
+      <w:r>
+        <w:t xml:space="preserve">&gt; (16K) </w:t>
+      </w:r>
+      <w:r>
+        <w:t>The memory contents of a page</w:t>
+      </w:r>
+      <w:r>
+        <w:t>.  Addresses &amp;8000 to &amp;BFFF.</w:t>
+      </w:r>
+    </w:p>
+    <w:p>
+      <w:pPr>
+        <w:ind w:left="360"/>
+      </w:pPr>
+      <w:r>
+        <w:t xml:space="preserve">&lt;shadow_ram&gt; (20K) </w:t>
+      </w:r>
+      <w:r>
+        <w:t xml:space="preserve">Populated on Model B Plus, BBC Model </w:t>
+      </w:r>
+      <w:r>
+        <w:t xml:space="preserve">B </w:t>
+      </w:r>
+      <w:r>
+        <w:t>Integra, and BBC Mas</w:t>
+      </w:r>
+      <w:r>
+        <w:t>ter</w:t>
+      </w:r>
+      <w:r>
+        <w:t>.  Addresses &amp;</w:t>
+      </w:r>
+      <w:r>
+        <w:t>3</w:t>
+      </w:r>
+      <w:r>
+        <w:t>000 to &amp;</w:t>
+      </w:r>
+      <w:r>
+        <w:t>7</w:t>
+      </w:r>
+      <w:r>
+        <w:t>FFF.</w:t>
+      </w:r>
+    </w:p>
+    <w:p>
+      <w:pPr>
+        <w:ind w:left="360"/>
+      </w:pPr>
+      <w:r>
+        <w:t xml:space="preserve">&lt;mos_ram&gt; (4K) </w:t>
+      </w:r>
+      <w:r>
+        <w:t>Populated on BBC Master</w:t>
+      </w:r>
+      <w:r>
+        <w:t>.  Addresses &amp;8000 to &amp;</w:t>
+      </w:r>
+      <w:r>
+        <w:t>8FFF</w:t>
+      </w:r>
+      <w:r>
+        <w:t>.</w:t>
+      </w:r>
+    </w:p>
+    <w:p>
+      <w:pPr>
+        <w:ind w:left="360"/>
+      </w:pPr>
+      <w:r>
+        <w:t xml:space="preserve">&lt;filing_system_ram&gt; (8K) </w:t>
+      </w:r>
+      <w:r>
+        <w:t>Populated on BBC Master</w:t>
+      </w:r>
+      <w:r>
+        <w:t xml:space="preserve">.  </w:t>
+      </w:r>
+      <w:r>
+        <w:t>Addresses &amp;</w:t>
+      </w:r>
+      <w:r>
+        <w:t>C</w:t>
+      </w:r>
+      <w:r>
+        <w:t>000 to &amp;</w:t>
+      </w:r>
+      <w:r>
+        <w:t>D</w:t>
+      </w:r>
+      <w:r>
+        <w:t>FFF.</w:t>
+      </w:r>
+    </w:p>
+    <w:p>
+      <w:pPr>
+        <w:ind w:left="360"/>
+      </w:pPr>
+      <w:r>
+        <w:t>&lt;private_ram&gt; (</w:t>
+      </w:r>
+      <w:r>
+        <w:t>12</w:t>
+      </w:r>
+      <w:r>
+        <w:t xml:space="preserve">K) </w:t>
+      </w:r>
+      <w:r>
+        <w:t xml:space="preserve">Populated on </w:t>
+      </w:r>
+      <w:r>
+        <w:t xml:space="preserve">BBC </w:t>
+      </w:r>
+      <w:r>
+        <w:t>Model B Plus</w:t>
+      </w:r>
+      <w:r>
+        <w:t xml:space="preserve"> and </w:t>
+      </w:r>
+      <w:r>
+        <w:t>BBC Model B</w:t>
       </w:r>
       <w:r>
         <w:t xml:space="preserve"> </w:t>
       </w:r>
       <w:r>
-        <w:t xml:space="preserve"> 0 = </w:t>
-      </w:r>
-      <w:r>
-        <w:t>writable, 1 = read</w:t>
-      </w:r>
-      <w:r>
-        <w:t>-</w:t>
-      </w:r>
-      <w:r>
-        <w:t>only</w:t>
-      </w:r>
-    </w:p>
-    <w:p>
-      <w:pPr>
-        <w:ind w:left="1080"/>
-      </w:pPr>
-      <w:r>
-        <w:t>&lt;</w:t>
-      </w:r>
-      <w:proofErr w:type="spellStart"/>
-      <w:r>
-        <w:t>page_memory</w:t>
-      </w:r>
-      <w:proofErr w:type="spellEnd"/>
-      <w:r>
-        <w:t xml:space="preserve">&gt; (16K) </w:t>
-      </w:r>
-      <w:r>
-        <w:t>The memory contents of a page</w:t>
-      </w:r>
-      <w:r>
-        <w:t>.  Addresses &amp;8000 to &amp;BFFF.</w:t>
+        <w:t>Integra</w:t>
+      </w:r>
+      <w:r>
+        <w:t>.</w:t>
+      </w:r>
+      <w:r>
+        <w:t xml:space="preserve"> </w:t>
+      </w:r>
+      <w:r>
+        <w:t>Addresses &amp;</w:t>
+      </w:r>
+      <w:r>
+        <w:t>8</w:t>
+      </w:r>
+      <w:r>
+        <w:t>000 to &amp;</w:t>
+      </w:r>
+      <w:r>
+        <w:t>A</w:t>
+      </w:r>
+      <w:r>
+        <w:t>FFF.</w:t>
+      </w:r>
+      <w:r>
+        <w:t xml:space="preserve"> </w:t>
       </w:r>
     </w:p>
     <w:p>
@@ -4541,190 +4069,7 @@
         <w:ind w:left="360"/>
       </w:pPr>
       <w:r>
-        <w:t>&lt;</w:t>
-      </w:r>
-      <w:proofErr w:type="spellStart"/>
-      <w:r>
-        <w:t>shadow_ram</w:t>
-      </w:r>
-      <w:proofErr w:type="spellEnd"/>
-      <w:r>
-        <w:t xml:space="preserve">&gt; (20K) </w:t>
-      </w:r>
-      <w:r>
-        <w:t xml:space="preserve">Populated on Model B Plus, BBC Model </w:t>
-      </w:r>
-      <w:r>
-        <w:t xml:space="preserve">B </w:t>
-      </w:r>
-      <w:r>
-        <w:t>Integra, and BBC Mas</w:t>
-      </w:r>
-      <w:r>
-        <w:t>ter</w:t>
-      </w:r>
-      <w:r>
-        <w:t>.  Addresses &amp;</w:t>
-      </w:r>
-      <w:r>
-        <w:t>3</w:t>
-      </w:r>
-      <w:r>
-        <w:t>000 to &amp;</w:t>
-      </w:r>
-      <w:r>
-        <w:t>7</w:t>
-      </w:r>
-      <w:r>
-        <w:t>FFF.</w:t>
-      </w:r>
-    </w:p>
-    <w:p>
-      <w:pPr>
-        <w:ind w:left="360"/>
-      </w:pPr>
-      <w:r>
-        <w:t>&lt;</w:t>
-      </w:r>
-      <w:proofErr w:type="spellStart"/>
-      <w:r>
-        <w:t>mos_ram</w:t>
-      </w:r>
-      <w:proofErr w:type="spellEnd"/>
-      <w:r>
-        <w:t xml:space="preserve">&gt; (4K) </w:t>
-      </w:r>
-      <w:r>
-        <w:t>Populated on BBC Master</w:t>
-      </w:r>
-      <w:r>
-        <w:t>.  Addresses &amp;8000 to &amp;</w:t>
-      </w:r>
-      <w:r>
-        <w:t>8FFF</w:t>
-      </w:r>
-      <w:r>
-        <w:t>.</w:t>
-      </w:r>
-    </w:p>
-    <w:p>
-      <w:pPr>
-        <w:ind w:left="360"/>
-      </w:pPr>
-      <w:r>
-        <w:t>&lt;</w:t>
-      </w:r>
-      <w:proofErr w:type="spellStart"/>
-      <w:r>
-        <w:t>filing_system_ram</w:t>
-      </w:r>
-      <w:proofErr w:type="spellEnd"/>
-      <w:r>
-        <w:t xml:space="preserve">&gt; (8K) </w:t>
-      </w:r>
-      <w:r>
-        <w:t>Populated on BBC Master</w:t>
-      </w:r>
-      <w:r>
-        <w:t xml:space="preserve">.  </w:t>
-      </w:r>
-      <w:r>
-        <w:t>Addresses &amp;</w:t>
-      </w:r>
-      <w:r>
-        <w:t>C</w:t>
-      </w:r>
-      <w:r>
-        <w:t>000 to &amp;</w:t>
-      </w:r>
-      <w:r>
-        <w:t>D</w:t>
-      </w:r>
-      <w:r>
-        <w:t>FFF.</w:t>
-      </w:r>
-    </w:p>
-    <w:p>
-      <w:pPr>
-        <w:ind w:left="360"/>
-      </w:pPr>
-      <w:r>
-        <w:t>&lt;</w:t>
-      </w:r>
-      <w:proofErr w:type="spellStart"/>
-      <w:r>
-        <w:t>private_ram</w:t>
-      </w:r>
-      <w:proofErr w:type="spellEnd"/>
-      <w:r>
-        <w:t>&gt; (</w:t>
-      </w:r>
-      <w:r>
-        <w:t>12</w:t>
-      </w:r>
-      <w:r>
-        <w:t xml:space="preserve">K) </w:t>
-      </w:r>
-      <w:r>
-        <w:t xml:space="preserve">Populated on </w:t>
-      </w:r>
-      <w:r>
-        <w:t xml:space="preserve">BBC </w:t>
-      </w:r>
-      <w:r>
-        <w:t>Model B Plus</w:t>
-      </w:r>
-      <w:r>
-        <w:t xml:space="preserve"> and </w:t>
-      </w:r>
-      <w:r>
-        <w:t>BBC Model B</w:t>
-      </w:r>
-      <w:r>
-        <w:t xml:space="preserve"> </w:t>
-      </w:r>
-      <w:r>
-        <w:t>Integra</w:t>
-      </w:r>
-      <w:r>
-        <w:t>.</w:t>
-      </w:r>
-      <w:r>
-        <w:t xml:space="preserve"> </w:t>
-      </w:r>
-      <w:r>
-        <w:t>Addresses &amp;</w:t>
-      </w:r>
-      <w:r>
-        <w:t>8</w:t>
-      </w:r>
-      <w:r>
-        <w:t>000 to &amp;</w:t>
-      </w:r>
-      <w:r>
-        <w:t>A</w:t>
-      </w:r>
-      <w:r>
-        <w:t>FFF.</w:t>
-      </w:r>
-      <w:r>
-        <w:t xml:space="preserve"> </w:t>
-      </w:r>
-    </w:p>
-    <w:p>
-      <w:pPr>
-        <w:ind w:left="360"/>
-      </w:pPr>
-      <w:r>
-        <w:t>&lt;</w:t>
-      </w:r>
-      <w:proofErr w:type="spellStart"/>
-      <w:r>
-        <w:t>hidden_ram</w:t>
-      </w:r>
-      <w:proofErr w:type="spellEnd"/>
-      <w:r>
-        <w:t xml:space="preserve">&gt; (256 bytes) </w:t>
+        <w:t xml:space="preserve">&lt;hidden_ram&gt; (256 bytes) </w:t>
       </w:r>
       <w:r>
         <w:t>Populated on BBC Model Integra B.</w:t>
@@ -4809,32 +4154,11 @@
           <w:b/>
           <w:bCs/>
         </w:rPr>
-        <w:t>&lt;</w:t>
-      </w:r>
-      <w:proofErr w:type="spellStart"/>
-      <w:r>
-        <w:rPr>
-          <w:b/>
-          <w:bCs/>
-        </w:rPr>
-        <w:t>execution_chunk</w:t>
-      </w:r>
-      <w:proofErr w:type="spellEnd"/>
-      <w:r>
-        <w:rPr>
-          <w:b/>
-          <w:bCs/>
-        </w:rPr>
-        <w:t>&gt;</w:t>
-      </w:r>
-      <w:r>
-        <w:t xml:space="preserve"> = &lt;</w:t>
-      </w:r>
-      <w:proofErr w:type="spellStart"/>
-      <w:r>
-        <w:t>common_header</w:t>
-      </w:r>
-      <w:proofErr w:type="spellEnd"/>
+        <w:t>&lt;execution_chunk&gt;</w:t>
+      </w:r>
+      <w:r>
+        <w:t xml:space="preserve"> = &lt;common_header</w:t>
+      </w:r>
       <w:r>
         <w:t>(</w:t>
       </w:r>
@@ -4845,7 +4169,6 @@
         </w:rPr>
         <w:t>‘</w:t>
       </w:r>
-      <w:proofErr w:type="spellStart"/>
       <w:r>
         <w:rPr>
           <w:rFonts w:ascii="Aptos" w:hAnsi="Aptos"/>
@@ -4853,94 +4176,68 @@
           <w:bCs/>
           <w:color w:val="000000"/>
         </w:rPr>
-        <w:t>PFex</w:t>
-      </w:r>
-      <w:proofErr w:type="spellEnd"/>
+        <w:t>PFex’</w:t>
+      </w:r>
       <w:r>
         <w:rPr>
           <w:rFonts w:ascii="Aptos" w:hAnsi="Aptos"/>
+          <w:color w:val="000000"/>
+        </w:rPr>
+        <w:t>)</w:t>
+      </w:r>
+      <w:r>
+        <w:t>&gt; + &lt;execution_data&gt;</w:t>
+      </w:r>
+    </w:p>
+    <w:p>
+      <w:pPr>
+        <w:ind w:left="360"/>
+      </w:pPr>
+      <w:r>
+        <w:t xml:space="preserve">&lt;execution_data&gt; = </w:t>
+      </w:r>
+      <w:r>
+        <w:t xml:space="preserve">list of </w:t>
+      </w:r>
+      <w:r>
+        <w:rPr>
           <w:b/>
           <w:bCs/>
-          <w:color w:val="000000"/>
-        </w:rPr>
-        <w:t>’</w:t>
-      </w:r>
-      <w:r>
-        <w:rPr>
-          <w:rFonts w:ascii="Aptos" w:hAnsi="Aptos"/>
-          <w:color w:val="000000"/>
-        </w:rPr>
-        <w:t>)</w:t>
-      </w:r>
-      <w:r>
-        <w:t>&gt; + &lt;</w:t>
-      </w:r>
-      <w:proofErr w:type="spellStart"/>
-      <w:r>
-        <w:t>execution_data</w:t>
-      </w:r>
-      <w:proofErr w:type="spellEnd"/>
-      <w:r>
-        <w:t>&gt;</w:t>
-      </w:r>
-    </w:p>
-    <w:p>
-      <w:pPr>
-        <w:ind w:left="360"/>
-      </w:pPr>
-      <w:r>
-        <w:t>&lt;</w:t>
-      </w:r>
-      <w:proofErr w:type="spellStart"/>
-      <w:r>
-        <w:t>execution_data</w:t>
-      </w:r>
-      <w:proofErr w:type="spellEnd"/>
-      <w:r>
-        <w:t xml:space="preserve">&gt; = </w:t>
-      </w:r>
-      <w:r>
-        <w:t xml:space="preserve">list of </w:t>
+        </w:rPr>
+        <w:t>&lt;interrupt&gt;</w:t>
+      </w:r>
+      <w:r>
+        <w:t xml:space="preserve"> </w:t>
+      </w:r>
+      <w:r>
+        <w:t>and/or</w:t>
+      </w:r>
+      <w:r>
+        <w:t xml:space="preserve"> </w:t>
       </w:r>
       <w:r>
         <w:rPr>
           <w:b/>
           <w:bCs/>
         </w:rPr>
-        <w:t>&lt;interrupt&gt;</w:t>
-      </w:r>
-      <w:r>
-        <w:t xml:space="preserve"> </w:t>
-      </w:r>
-      <w:r>
-        <w:t>and/or</w:t>
-      </w:r>
-      <w:r>
-        <w:t xml:space="preserve"> </w:t>
-      </w:r>
+        <w:t>&lt;instruction&gt;</w:t>
+      </w:r>
+      <w:r>
+        <w:t>, where</w:t>
+      </w:r>
+      <w:r>
+        <w:t>:</w:t>
+      </w:r>
+    </w:p>
+    <w:p>
+      <w:pPr>
+        <w:ind w:left="720" w:hanging="360"/>
+      </w:pPr>
       <w:r>
         <w:rPr>
           <w:b/>
           <w:bCs/>
         </w:rPr>
-        <w:t>&lt;instruction&gt;</w:t>
-      </w:r>
-      <w:r>
-        <w:t>, where</w:t>
-      </w:r>
-      <w:r>
-        <w:t>:</w:t>
-      </w:r>
-    </w:p>
-    <w:p>
-      <w:pPr>
-        <w:ind w:left="720" w:hanging="360"/>
-      </w:pPr>
-      <w:r>
-        <w:rPr>
-          <w:b/>
-          <w:bCs/>
-        </w:rPr>
         <w:t>&lt;interrupt&gt;</w:t>
       </w:r>
       <w:r>
@@ -4950,20 +4247,11 @@
         <w:br/>
       </w:r>
       <w:r>
+        <w:t xml:space="preserve">&lt;interrupt_marker&gt; + </w:t>
+      </w:r>
+      <w:r>
         <w:t>&lt;</w:t>
       </w:r>
-      <w:proofErr w:type="spellStart"/>
-      <w:r>
-        <w:t>interrupt_marker</w:t>
-      </w:r>
-      <w:proofErr w:type="spellEnd"/>
-      <w:r>
-        <w:t xml:space="preserve">&gt; + </w:t>
-      </w:r>
-      <w:r>
-        <w:t>&lt;</w:t>
-      </w:r>
-      <w:proofErr w:type="spellStart"/>
       <w:r>
         <w:t>address</w:t>
       </w:r>
@@ -4973,13 +4261,8 @@
       <w:r>
         <w:t>service_routine</w:t>
       </w:r>
-      <w:proofErr w:type="spellEnd"/>
-      <w:r>
-        <w:t>&gt; + &lt;</w:t>
-      </w:r>
-      <w:proofErr w:type="spellStart"/>
-      <w:r>
-        <w:t>address</w:t>
+      <w:r>
+        <w:t>&gt; + &lt;address</w:t>
       </w:r>
       <w:r>
         <w:t>_</w:t>
@@ -4987,20 +4270,11 @@
       <w:r>
         <w:t>interrupted</w:t>
       </w:r>
-      <w:proofErr w:type="spellEnd"/>
       <w:r>
         <w:t>&gt; +</w:t>
       </w:r>
       <w:r>
-        <w:t xml:space="preserve"> &lt;</w:t>
-      </w:r>
-      <w:proofErr w:type="spellStart"/>
-      <w:r>
-        <w:t>stack_pointer</w:t>
-      </w:r>
-      <w:proofErr w:type="spellEnd"/>
-      <w:r>
-        <w:t>&gt;</w:t>
+        <w:t xml:space="preserve"> &lt;stack_pointer&gt;</w:t>
       </w:r>
       <w:r>
         <w:t xml:space="preserve"> </w:t>
@@ -5011,15 +4285,7 @@
         <w:ind w:left="720"/>
       </w:pPr>
       <w:r>
-        <w:t>&lt;</w:t>
-      </w:r>
-      <w:proofErr w:type="spellStart"/>
-      <w:r>
-        <w:t>interrupt_marker</w:t>
-      </w:r>
-      <w:proofErr w:type="spellEnd"/>
-      <w:r>
-        <w:t>&gt; (2 bytes).  A two-byte value that distinguishes a &lt;interrupt&gt; from a &lt;instruction&gt;.</w:t>
+        <w:t>&lt;interrupt_marker&gt; (2 bytes).  A two-byte value that distinguishes a &lt;interrupt&gt; from a &lt;instruction&gt;.</w:t>
       </w:r>
       <w:r>
         <w:t xml:space="preserve"> </w:t>
@@ -5199,15 +4465,7 @@
         <w:ind w:left="720"/>
       </w:pPr>
       <w:r>
-        <w:t>&lt;</w:t>
-      </w:r>
-      <w:proofErr w:type="spellStart"/>
-      <w:r>
-        <w:t>address_service_routine</w:t>
-      </w:r>
-      <w:proofErr w:type="spellEnd"/>
-      <w:r>
-        <w:t>&gt; (2 bytes).  The address of the interrupt service routine.</w:t>
+        <w:t>&lt;address_service_routine&gt; (2 bytes).  The address of the interrupt service routine.</w:t>
       </w:r>
     </w:p>
     <w:p>
@@ -5215,16 +4473,11 @@
         <w:ind w:left="720"/>
       </w:pPr>
       <w:r>
-        <w:t>&lt;</w:t>
-      </w:r>
-      <w:proofErr w:type="spellStart"/>
-      <w:r>
-        <w:t>address_</w:t>
+        <w:t>&lt;address_</w:t>
       </w:r>
       <w:r>
         <w:t>interrupted</w:t>
       </w:r>
-      <w:proofErr w:type="spellEnd"/>
       <w:r>
         <w:t xml:space="preserve"> &gt; (2 bytes).  The address of </w:t>
       </w:r>
@@ -5240,15 +4493,7 @@
         <w:ind w:left="720"/>
       </w:pPr>
       <w:r>
-        <w:t>&lt;</w:t>
-      </w:r>
-      <w:proofErr w:type="spellStart"/>
-      <w:r>
-        <w:t>cycle_count</w:t>
-      </w:r>
-      <w:proofErr w:type="spellEnd"/>
-      <w:r>
-        <w:t xml:space="preserve">&gt; </w:t>
+        <w:t xml:space="preserve">&lt;cycle_count&gt; </w:t>
       </w:r>
       <w:r>
         <w:t>(1 byte) S</w:t>
@@ -5262,15 +4507,7 @@
         <w:ind w:left="720"/>
       </w:pPr>
       <w:r>
-        <w:t>&lt;</w:t>
-      </w:r>
-      <w:proofErr w:type="spellStart"/>
-      <w:r>
-        <w:t>stack_pointer</w:t>
-      </w:r>
-      <w:proofErr w:type="spellEnd"/>
-      <w:r>
-        <w:t xml:space="preserve">&gt; </w:t>
+        <w:t xml:space="preserve">&lt;stack_pointer&gt; </w:t>
       </w:r>
       <w:r>
         <w:t>(1 bytes) S</w:t>
@@ -5304,16 +4541,11 @@
       <w:r>
         <w:t>&lt;</w:t>
       </w:r>
-      <w:proofErr w:type="spellStart"/>
       <w:r>
         <w:t>opcode_</w:t>
       </w:r>
       <w:r>
-        <w:t>address</w:t>
-      </w:r>
-      <w:proofErr w:type="spellEnd"/>
-      <w:r>
-        <w:t>&gt; + &lt;opcode&gt; + &lt;operand&gt;</w:t>
+        <w:t>address&gt; + &lt;opcode&gt; + &lt;operand&gt;</w:t>
       </w:r>
       <w:r>
         <w:rPr>
@@ -5340,13 +4572,8 @@
       <w:r>
         <w:t>&lt;</w:t>
       </w:r>
-      <w:proofErr w:type="spellStart"/>
-      <w:r>
-        <w:t>stack_pointer</w:t>
-      </w:r>
-      <w:proofErr w:type="spellEnd"/>
-      <w:r>
-        <w:t>&gt;</w:t>
+      <w:r>
+        <w:t>stack_pointer&gt;</w:t>
       </w:r>
       <w:r>
         <w:rPr>
@@ -5360,15 +4587,7 @@
         <w:t xml:space="preserve"> + </w:t>
       </w:r>
       <w:r>
-        <w:t>&lt;</w:t>
-      </w:r>
-      <w:proofErr w:type="spellStart"/>
-      <w:r>
-        <w:t>return_address</w:t>
-      </w:r>
-      <w:proofErr w:type="spellEnd"/>
-      <w:r>
-        <w:t>&gt;</w:t>
+        <w:t>&lt;return_address&gt;</w:t>
       </w:r>
       <w:r>
         <w:rPr>
@@ -5393,15 +4612,7 @@
         <w:t xml:space="preserve">+ </w:t>
       </w:r>
       <w:r>
-        <w:t>&lt;</w:t>
-      </w:r>
-      <w:proofErr w:type="spellStart"/>
-      <w:r>
-        <w:t>memory_address</w:t>
-      </w:r>
-      <w:proofErr w:type="spellEnd"/>
-      <w:r>
-        <w:t>&gt;</w:t>
+        <w:t>&lt;memory_address&gt;</w:t>
       </w:r>
       <w:r>
         <w:rPr>
@@ -5422,7 +4633,6 @@
       <w:r>
         <w:t xml:space="preserve"> &lt;</w:t>
       </w:r>
-      <w:proofErr w:type="spellStart"/>
       <w:r>
         <w:t>memory</w:t>
       </w:r>
@@ -5432,7 +4642,6 @@
       <w:r>
         <w:t>_value</w:t>
       </w:r>
-      <w:proofErr w:type="spellEnd"/>
       <w:r>
         <w:t>&gt;</w:t>
       </w:r>
@@ -5455,11 +4664,9 @@
       <w:r>
         <w:t>+ &lt;</w:t>
       </w:r>
-      <w:proofErr w:type="spellStart"/>
       <w:r>
         <w:t>memory_write_value</w:t>
       </w:r>
-      <w:proofErr w:type="spellEnd"/>
       <w:r>
         <w:t>&gt;</w:t>
       </w:r>
@@ -5479,16 +4686,11 @@
       <w:r>
         <w:t>&lt;</w:t>
       </w:r>
-      <w:proofErr w:type="spellStart"/>
       <w:r>
         <w:t>opcode_</w:t>
       </w:r>
       <w:r>
-        <w:t>address</w:t>
-      </w:r>
-      <w:proofErr w:type="spellEnd"/>
-      <w:r>
-        <w:t>&gt;</w:t>
+        <w:t>address&gt;</w:t>
       </w:r>
       <w:r>
         <w:t xml:space="preserve"> </w:t>
@@ -6714,15 +5916,7 @@
         </w:rPr>
       </w:pPr>
       <w:r>
-        <w:t>&lt;</w:t>
-      </w:r>
-      <w:proofErr w:type="spellStart"/>
-      <w:r>
-        <w:t>stack_pointer</w:t>
-      </w:r>
-      <w:proofErr w:type="spellEnd"/>
-      <w:r>
-        <w:t xml:space="preserve">&gt; (1 byte) Populated for </w:t>
+        <w:t xml:space="preserve">&lt;stack_pointer&gt; (1 byte) Populated for </w:t>
       </w:r>
       <w:r>
         <w:t xml:space="preserve">opcodes </w:t>
@@ -6784,15 +5978,7 @@
         <w:ind w:left="720"/>
       </w:pPr>
       <w:r>
-        <w:t>&lt;</w:t>
-      </w:r>
-      <w:proofErr w:type="spellStart"/>
-      <w:r>
-        <w:t>return_address</w:t>
-      </w:r>
-      <w:proofErr w:type="spellEnd"/>
-      <w:r>
-        <w:t xml:space="preserve">&gt; (2 bytes) Populated for the </w:t>
+        <w:t xml:space="preserve">&lt;return_address&gt; (2 bytes) Populated for the </w:t>
       </w:r>
       <w:r>
         <w:rPr>
@@ -6832,15 +6018,7 @@
         <w:ind w:left="720"/>
       </w:pPr>
       <w:r>
-        <w:t>&lt;</w:t>
-      </w:r>
-      <w:proofErr w:type="spellStart"/>
-      <w:r>
-        <w:t>memory_address</w:t>
-      </w:r>
-      <w:proofErr w:type="spellEnd"/>
-      <w:r>
-        <w:t>&gt; (2 bytes) Populated for all opcodes that use the following addressing modes:</w:t>
+        <w:t>&lt;memory_address&gt; (2 bytes) Populated for all opcodes that use the following addressing modes:</w:t>
       </w:r>
     </w:p>
     <w:p>
@@ -7051,16 +6229,11 @@
         <w:ind w:left="720"/>
       </w:pPr>
       <w:r>
-        <w:t>&lt;</w:t>
-      </w:r>
-      <w:proofErr w:type="spellStart"/>
-      <w:r>
-        <w:t>memory</w:t>
+        <w:t>&lt;memory</w:t>
       </w:r>
       <w:r>
         <w:t>_read_value</w:t>
       </w:r>
-      <w:proofErr w:type="spellEnd"/>
       <w:r>
         <w:t xml:space="preserve">&gt; (1 byte) Populated for </w:t>
       </w:r>
@@ -7125,15 +6298,7 @@
         <w:ind w:left="720"/>
       </w:pPr>
       <w:r>
-        <w:t>&lt;</w:t>
-      </w:r>
-      <w:proofErr w:type="spellStart"/>
-      <w:r>
-        <w:t>memory_write_value</w:t>
-      </w:r>
-      <w:proofErr w:type="spellEnd"/>
-      <w:r>
-        <w:t xml:space="preserve">&gt; (1 byte) Populated for opcodes that </w:t>
+        <w:t xml:space="preserve">&lt;memory_write_value&gt; (1 byte) Populated for opcodes that </w:t>
       </w:r>
       <w:r>
         <w:t xml:space="preserve">write to </w:t>
@@ -7362,7 +6527,6 @@
       <w:r>
         <w:t xml:space="preserve">a </w:t>
       </w:r>
-      <w:proofErr w:type="spellStart"/>
       <w:r>
         <w:rPr>
           <w:b/>
@@ -7370,7 +6534,6 @@
         </w:rPr>
         <w:t>PerfWriter</w:t>
       </w:r>
-      <w:proofErr w:type="spellEnd"/>
       <w:r>
         <w:t xml:space="preserve"> class</w:t>
       </w:r>
@@ -7722,7 +6885,6 @@
       <w:pPr>
         <w:pStyle w:val="Heading1"/>
       </w:pPr>
-      <w:proofErr w:type="spellStart"/>
       <w:r>
         <w:t>Bee</w:t>
       </w:r>
@@ -7732,19 +6894,10 @@
       <w:r>
         <w:t>Perf</w:t>
       </w:r>
-      <w:proofErr w:type="spellEnd"/>
-    </w:p>
-    <w:p>
-      <w:r>
-        <w:t xml:space="preserve">As outlined above, </w:t>
-      </w:r>
-      <w:proofErr w:type="spellStart"/>
-      <w:r>
-        <w:t>BeebPerf</w:t>
-      </w:r>
-      <w:proofErr w:type="spellEnd"/>
-      <w:r>
-        <w:t xml:space="preserve"> is a standalone </w:t>
+    </w:p>
+    <w:p>
+      <w:r>
+        <w:t xml:space="preserve">As outlined above, BeebPerf is a standalone </w:t>
       </w:r>
       <w:r>
         <w:t xml:space="preserve">Windows </w:t>
@@ -9765,21 +8918,13 @@
         <w:t xml:space="preserve"> </w:t>
       </w:r>
       <w:r>
-        <w:t xml:space="preserve">or label.  For example, </w:t>
-      </w:r>
-      <w:proofErr w:type="spellStart"/>
-      <w:r>
-        <w:t>wait</w:t>
+        <w:t>or label.  For example, wait</w:t>
       </w:r>
       <w:r>
         <w:t>On</w:t>
       </w:r>
       <w:r>
-        <w:t>VSync</w:t>
-      </w:r>
-      <w:proofErr w:type="spellEnd"/>
-      <w:r>
-        <w:t xml:space="preserve"> could be configured to show a marker on completion.  Markers can be shown either as a milestone (diamond), or as a vertical line.</w:t>
+        <w:t>VSync could be configured to show a marker on completion.  Markers can be shown either as a milestone (diamond), or as a vertical line.</w:t>
       </w:r>
     </w:p>
     <w:p>
@@ -10342,11 +9487,9 @@
       <w:r>
         <w:t xml:space="preserve">Aggregated CPU Metrics, by </w:t>
       </w:r>
-      <w:proofErr w:type="spellStart"/>
       <w:r>
         <w:t>RoutineStack</w:t>
       </w:r>
-      <w:proofErr w:type="spellEnd"/>
       <w:r>
         <w:t xml:space="preserve"> – </w:t>
       </w:r>
@@ -10412,7 +9555,6 @@
           <w:numId w:val="9"/>
         </w:numPr>
       </w:pPr>
-      <w:proofErr w:type="spellStart"/>
       <w:r>
         <w:rPr>
           <w:b/>
@@ -10420,7 +9562,6 @@
         </w:rPr>
         <w:t>CallStack</w:t>
       </w:r>
-      <w:proofErr w:type="spellEnd"/>
       <w:r>
         <w:t xml:space="preserve"> – represents a</w:t>
       </w:r>
@@ -10470,15 +9611,7 @@
         </w:numPr>
       </w:pPr>
       <w:r>
-        <w:t xml:space="preserve">Parent </w:t>
-      </w:r>
-      <w:proofErr w:type="spellStart"/>
-      <w:r>
-        <w:t>CallStack</w:t>
-      </w:r>
-      <w:proofErr w:type="spellEnd"/>
-      <w:r>
-        <w:t xml:space="preserve"> reference</w:t>
+        <w:t>Parent CallStack reference</w:t>
       </w:r>
     </w:p>
     <w:p>
@@ -10513,15 +9646,7 @@
         <w:ind w:left="1080"/>
       </w:pPr>
       <w:r>
-        <w:t xml:space="preserve">The identify of a </w:t>
-      </w:r>
-      <w:proofErr w:type="spellStart"/>
-      <w:r>
-        <w:t>CallStack</w:t>
-      </w:r>
-      <w:proofErr w:type="spellEnd"/>
-      <w:r>
-        <w:t xml:space="preserve"> is defined </w:t>
+        <w:t xml:space="preserve">The identify of a CallStack is defined </w:t>
       </w:r>
       <w:r>
         <w:t xml:space="preserve">by the sequence of </w:t>
@@ -10562,7 +9687,6 @@
           <w:numId w:val="9"/>
         </w:numPr>
       </w:pPr>
-      <w:proofErr w:type="spellStart"/>
       <w:r>
         <w:rPr>
           <w:b/>
@@ -10570,7 +9694,6 @@
         </w:rPr>
         <w:t>StackFrame</w:t>
       </w:r>
-      <w:proofErr w:type="spellEnd"/>
       <w:r>
         <w:t xml:space="preserve"> – represents a unique stack-frame within the recorded program.</w:t>
       </w:r>
@@ -12619,11 +11742,7 @@
         </w:numPr>
       </w:pPr>
       <w:r>
-        <w:t xml:space="preserve">Populate </w:t>
-      </w:r>
-      <w:proofErr w:type="spellStart"/>
-      <w:r>
-        <w:t>No</w:t>
+        <w:t>Populate No</w:t>
       </w:r>
       <w:r>
         <w:t>Tr</w:t>
@@ -12634,7 +11753,6 @@
       <w:r>
         <w:t>verse</w:t>
       </w:r>
-      <w:proofErr w:type="spellEnd"/>
       <w:r>
         <w:t xml:space="preserve"> </w:t>
       </w:r>
@@ -12704,16 +11822,11 @@
           <w:numId w:val="19"/>
         </w:numPr>
       </w:pPr>
-      <w:proofErr w:type="spellStart"/>
       <w:r>
         <w:t>Routine</w:t>
       </w:r>
       <w:r>
-        <w:t>aggregated</w:t>
-      </w:r>
-      <w:proofErr w:type="spellEnd"/>
-      <w:r>
-        <w:t xml:space="preserve"> and total aggregated</w:t>
+        <w:t>aggregated and total aggregated</w:t>
       </w:r>
       <w:r>
         <w:t xml:space="preserve"> CPU metrics</w:t>
@@ -13125,15 +12238,7 @@
         </w:numPr>
       </w:pPr>
       <w:r>
-        <w:t xml:space="preserve">Detecting </w:t>
-      </w:r>
-      <w:proofErr w:type="spellStart"/>
-      <w:r>
-        <w:t>roms</w:t>
-      </w:r>
-      <w:proofErr w:type="spellEnd"/>
-      <w:r>
-        <w:t xml:space="preserve"> being paged in.  The easiest way to handle this is to record the value written to &amp;</w:t>
+        <w:t>Detecting roms being paged in.  The easiest way to handle this is to record the value written to &amp;</w:t>
       </w:r>
       <w:r>
         <w:t>FE30</w:t>
@@ -13684,7 +12789,7 @@
         </w:numPr>
       </w:pPr>
       <w:r>
-        <w:t>Fix percentages which sometimes &gt; 100%</w:t>
+        <w:t>Undo/Redo</w:t>
       </w:r>
     </w:p>
     <w:p>
@@ -13696,82 +12801,7 @@
         </w:numPr>
       </w:pPr>
       <w:r>
-        <w:t>Undo/Redo</w:t>
-      </w:r>
-    </w:p>
-    <w:p>
-      <w:pPr>
-        <w:pStyle w:val="ListParagraph"/>
-        <w:numPr>
-          <w:ilvl w:val="0"/>
-          <w:numId w:val="12"/>
-        </w:numPr>
-      </w:pPr>
-      <w:r>
         <w:t>Fix selection ambiguity when switching tabs</w:t>
-      </w:r>
-    </w:p>
-    <w:p>
-      <w:pPr>
-        <w:pStyle w:val="ListParagraph"/>
-        <w:numPr>
-          <w:ilvl w:val="0"/>
-          <w:numId w:val="12"/>
-        </w:numPr>
-      </w:pPr>
-      <w:r>
-        <w:t>Code view improvements</w:t>
-      </w:r>
-    </w:p>
-    <w:p>
-      <w:pPr>
-        <w:pStyle w:val="ListParagraph"/>
-        <w:numPr>
-          <w:ilvl w:val="1"/>
-          <w:numId w:val="12"/>
-        </w:numPr>
-      </w:pPr>
-      <w:r>
-        <w:t xml:space="preserve">Make red </w:t>
-      </w:r>
-      <w:r>
-        <w:t xml:space="preserve">bars </w:t>
-      </w:r>
-      <w:r>
-        <w:t>less red</w:t>
-      </w:r>
-    </w:p>
-    <w:p>
-      <w:pPr>
-        <w:pStyle w:val="ListParagraph"/>
-        <w:numPr>
-          <w:ilvl w:val="1"/>
-          <w:numId w:val="12"/>
-        </w:numPr>
-      </w:pPr>
-      <w:r>
-        <w:t xml:space="preserve">Denote </w:t>
-      </w:r>
-      <w:r>
-        <w:t>tail</w:t>
-      </w:r>
-      <w:r>
-        <w:t>-</w:t>
-      </w:r>
-      <w:r>
-        <w:t>calls</w:t>
-      </w:r>
-    </w:p>
-    <w:p>
-      <w:pPr>
-        <w:pStyle w:val="ListParagraph"/>
-        <w:numPr>
-          <w:ilvl w:val="1"/>
-          <w:numId w:val="12"/>
-        </w:numPr>
-      </w:pPr>
-      <w:r>
-        <w:t>Show percentages of routine with bars</w:t>
       </w:r>
     </w:p>
     <w:p>

</xml_diff>

<commit_message>
Fixed bugs in marking hot routines and paths
</commit_message>
<xml_diff>
--- a/docs/Development.docx
+++ b/docs/Development.docx
@@ -12808,18 +12808,6 @@
       <w:pPr>
         <w:pStyle w:val="ListParagraph"/>
         <w:numPr>
-          <w:ilvl w:val="1"/>
-          <w:numId w:val="12"/>
-        </w:numPr>
-      </w:pPr>
-      <w:r>
-        <w:t>elevatorFrameCallback has errant fallthrough</w:t>
-      </w:r>
-    </w:p>
-    <w:p>
-      <w:pPr>
-        <w:pStyle w:val="ListParagraph"/>
-        <w:numPr>
           <w:ilvl w:val="0"/>
           <w:numId w:val="12"/>
         </w:numPr>

</xml_diff>

<commit_message>
Added proportional hotness coloring
</commit_message>
<xml_diff>
--- a/docs/Development.docx
+++ b/docs/Development.docx
@@ -349,7 +349,6 @@
       <w:r>
         <w:t xml:space="preserve">  </w:t>
       </w:r>
-      <w:proofErr w:type="gramStart"/>
       <w:r>
         <w:t>I</w:t>
       </w:r>
@@ -360,25 +359,13 @@
         <w:t xml:space="preserve"> </w:t>
       </w:r>
       <w:r>
-        <w:t xml:space="preserve"> and</w:t>
-      </w:r>
-      <w:proofErr w:type="gramEnd"/>
+        <w:t xml:space="preserve"> and sample</w:t>
+      </w:r>
       <w:r>
         <w:t xml:space="preserve"> </w:t>
       </w:r>
-      <w:proofErr w:type="gramStart"/>
-      <w:r>
-        <w:t>sample</w:t>
-      </w:r>
-      <w:r>
-        <w:t xml:space="preserve"> </w:t>
-      </w:r>
-      <w:r>
-        <w:t>based</w:t>
-      </w:r>
-      <w:proofErr w:type="gramEnd"/>
-      <w:r>
-        <w:t xml:space="preserve"> </w:t>
+      <w:r>
+        <w:t xml:space="preserve">based </w:t>
       </w:r>
       <w:r>
         <w:t xml:space="preserve">measurements </w:t>
@@ -1128,13 +1115,8 @@
       <w:r>
         <w:t xml:space="preserve"> a common header which </w:t>
       </w:r>
-      <w:proofErr w:type="gramStart"/>
-      <w:r>
-        <w:t>proceeds</w:t>
-      </w:r>
-      <w:proofErr w:type="gramEnd"/>
-      <w:r>
-        <w:t xml:space="preserve"> </w:t>
+      <w:r>
+        <w:t xml:space="preserve">proceeds </w:t>
       </w:r>
       <w:r>
         <w:t>the</w:t>
@@ -2019,15 +2001,7 @@
         <w:t xml:space="preserve">The header chunk </w:t>
       </w:r>
       <w:r>
-        <w:t xml:space="preserve">is the first chunk in the </w:t>
-      </w:r>
-      <w:proofErr w:type="gramStart"/>
-      <w:r>
-        <w:t>file</w:t>
-      </w:r>
-      <w:proofErr w:type="gramEnd"/>
-      <w:r>
-        <w:t xml:space="preserve"> and </w:t>
+        <w:t xml:space="preserve">is the first chunk in the file and </w:t>
       </w:r>
       <w:r>
         <w:t xml:space="preserve">it </w:t>
@@ -4712,14 +4686,12 @@
       <w:r>
         <w:t>Integra</w:t>
       </w:r>
-      <w:proofErr w:type="gramStart"/>
       <w:r>
         <w:t>.</w:t>
       </w:r>
       <w:r>
         <w:t xml:space="preserve"> </w:t>
       </w:r>
-      <w:proofErr w:type="gramEnd"/>
       <w:r>
         <w:t>Addresses &amp;</w:t>
       </w:r>
@@ -5764,7 +5736,6 @@
             <w:r>
               <w:t>&amp;</w:t>
             </w:r>
-            <w:proofErr w:type="gramStart"/>
             <w:r>
               <w:t>8</w:t>
             </w:r>
@@ -5774,7 +5745,6 @@
             <w:r>
               <w:t>..</w:t>
             </w:r>
-            <w:proofErr w:type="gramEnd"/>
             <w:r>
               <w:t>&amp;</w:t>
             </w:r>
@@ -5855,15 +5825,7 @@
               <w:t xml:space="preserve"> </w:t>
             </w:r>
             <w:r>
-              <w:t>&amp;</w:t>
-            </w:r>
-            <w:proofErr w:type="gramStart"/>
-            <w:r>
-              <w:t>0000..</w:t>
-            </w:r>
-            <w:proofErr w:type="gramEnd"/>
-            <w:r>
-              <w:t>&amp;7F</w:t>
+              <w:t>&amp;0000..&amp;7F</w:t>
             </w:r>
             <w:r>
               <w:t>FF</w:t>
@@ -5878,14 +5840,12 @@
             <w:pPr>
               <w:jc w:val="center"/>
             </w:pPr>
-            <w:proofErr w:type="gramStart"/>
             <w:r>
               <w:t>0..</w:t>
             </w:r>
             <w:r>
               <w:t>&amp;</w:t>
             </w:r>
-            <w:proofErr w:type="gramEnd"/>
             <w:r>
               <w:t>7F</w:t>
             </w:r>
@@ -5899,14 +5859,12 @@
             <w:pPr>
               <w:jc w:val="center"/>
             </w:pPr>
-            <w:proofErr w:type="gramStart"/>
             <w:r>
               <w:t>0..</w:t>
             </w:r>
             <w:r>
               <w:t>&amp;</w:t>
             </w:r>
-            <w:proofErr w:type="gramEnd"/>
             <w:r>
               <w:t>FF</w:t>
             </w:r>
@@ -5950,15 +5908,7 @@
               <w:t>:</w:t>
             </w:r>
             <w:r>
-              <w:t xml:space="preserve"> &amp;</w:t>
-            </w:r>
-            <w:proofErr w:type="gramStart"/>
-            <w:r>
-              <w:t>8000..</w:t>
-            </w:r>
-            <w:proofErr w:type="gramEnd"/>
-            <w:r>
-              <w:t>&amp;FFFF</w:t>
+              <w:t xml:space="preserve"> &amp;8000..&amp;FFFF</w:t>
             </w:r>
           </w:p>
         </w:tc>
@@ -5989,11 +5939,9 @@
             <w:r>
               <w:t>&amp;</w:t>
             </w:r>
-            <w:proofErr w:type="gramStart"/>
             <w:r>
               <w:t>80..</w:t>
             </w:r>
-            <w:proofErr w:type="gramEnd"/>
             <w:r>
               <w:t>&amp;</w:t>
             </w:r>
@@ -6010,14 +5958,12 @@
             <w:pPr>
               <w:jc w:val="center"/>
             </w:pPr>
-            <w:proofErr w:type="gramStart"/>
             <w:r>
               <w:t>0..</w:t>
             </w:r>
             <w:r>
               <w:t>&amp;</w:t>
             </w:r>
-            <w:proofErr w:type="gramEnd"/>
             <w:r>
               <w:t>FF</w:t>
             </w:r>
@@ -7187,18 +7133,10 @@
       </w:r>
       <w:proofErr w:type="spellEnd"/>
       <w:r>
-        <w:t xml:space="preserve">&gt; (1 byte) Populated for </w:t>
-      </w:r>
-      <w:proofErr w:type="gramStart"/>
-      <w:r>
-        <w:t xml:space="preserve">opcodes that </w:t>
-      </w:r>
-      <w:r>
-        <w:t>write</w:t>
-      </w:r>
-      <w:proofErr w:type="gramEnd"/>
-      <w:r>
-        <w:t xml:space="preserve"> to </w:t>
+        <w:t xml:space="preserve">&gt; (1 byte) Populated for opcodes that </w:t>
+      </w:r>
+      <w:r>
+        <w:t xml:space="preserve">write to </w:t>
       </w:r>
       <w:r>
         <w:t>an address</w:t>
@@ -7221,16 +7159,11 @@
       <w:r>
         <w:t>attempted to be written</w:t>
       </w:r>
-      <w:proofErr w:type="gramStart"/>
       <w:r>
         <w:t>.</w:t>
       </w:r>
       <w:r>
-        <w:t xml:space="preserve"> </w:t>
-      </w:r>
-      <w:proofErr w:type="gramEnd"/>
-      <w:r>
-        <w:t xml:space="preserve">This includes </w:t>
+        <w:t xml:space="preserve"> This includes </w:t>
       </w:r>
       <w:r>
         <w:lastRenderedPageBreak/>
@@ -7271,7 +7204,6 @@
       </w:r>
     </w:p>
     <w:p>
-      <w:proofErr w:type="gramStart"/>
       <w:r>
         <w:t xml:space="preserve">A </w:t>
       </w:r>
@@ -7282,7 +7214,6 @@
         </w:rPr>
         <w:t>.perf</w:t>
       </w:r>
-      <w:proofErr w:type="gramEnd"/>
       <w:r>
         <w:t xml:space="preserve"> </w:t>
       </w:r>
@@ -9680,19 +9611,15 @@
       <w:r>
         <w:t xml:space="preserve">Hexadecimal </w:t>
       </w:r>
-      <w:proofErr w:type="gramStart"/>
       <w:r>
         <w:t>symbol: ‘</w:t>
       </w:r>
-      <w:proofErr w:type="gramEnd"/>
       <w:r>
         <w:t>$</w:t>
       </w:r>
-      <w:proofErr w:type="gramStart"/>
       <w:r>
         <w:t>’, ‘</w:t>
       </w:r>
-      <w:proofErr w:type="gramEnd"/>
       <w:r>
         <w:t>&amp;</w:t>
       </w:r>
@@ -10498,15 +10425,7 @@
         <w:t xml:space="preserve"> – represents a</w:t>
       </w:r>
       <w:r>
-        <w:t xml:space="preserve"> call stack within the recorded program</w:t>
-      </w:r>
-      <w:proofErr w:type="gramStart"/>
-      <w:r>
-        <w:t xml:space="preserve">. </w:t>
-      </w:r>
-      <w:proofErr w:type="gramEnd"/>
-      <w:r>
-        <w:t>Contains the following fields:</w:t>
+        <w:t xml:space="preserve"> call stack within the recorded program. Contains the following fields:</w:t>
       </w:r>
     </w:p>
     <w:p>
@@ -13148,18 +13067,10 @@
         <w:t xml:space="preserve"> (this can be calculated) </w:t>
       </w:r>
       <w:r>
-        <w:t xml:space="preserve">on </w:t>
-      </w:r>
-      <w:proofErr w:type="gramStart"/>
-      <w:r>
-        <w:t xml:space="preserve">the </w:t>
-      </w:r>
-      <w:r>
-        <w:t>Video</w:t>
-      </w:r>
-      <w:proofErr w:type="gramEnd"/>
-      <w:r>
-        <w:t xml:space="preserve"> </w:t>
+        <w:t xml:space="preserve">on the </w:t>
+      </w:r>
+      <w:r>
+        <w:t xml:space="preserve">Video </w:t>
       </w:r>
       <w:r>
         <w:t>6845</w:t>
@@ -13229,15 +13140,7 @@
         </w:numPr>
       </w:pPr>
       <w:r>
-        <w:t>A spin loop is a tight look that doesn’t write anything, it just reads something</w:t>
-      </w:r>
-      <w:proofErr w:type="gramStart"/>
-      <w:r>
-        <w:t xml:space="preserve">. </w:t>
-      </w:r>
-      <w:proofErr w:type="gramEnd"/>
-      <w:r>
-        <w:t>They are shown in light grey (background is white).</w:t>
+        <w:t>A spin loop is a tight look that doesn’t write anything, it just reads something. They are shown in light grey (background is white).</w:t>
       </w:r>
       <w:r>
         <w:t xml:space="preserve">  We are looking for a repeated set of non-instructions in the recording.</w:t>
@@ -13264,15 +13167,7 @@
         </w:numPr>
       </w:pPr>
       <w:r>
-        <w:t xml:space="preserve">Look for </w:t>
-      </w:r>
-      <w:proofErr w:type="gramStart"/>
-      <w:r>
-        <w:t>repeating</w:t>
-      </w:r>
-      <w:proofErr w:type="gramEnd"/>
-      <w:r>
-        <w:t xml:space="preserve"> instructions.</w:t>
+        <w:t>Look for repeating instructions.</w:t>
       </w:r>
     </w:p>
     <w:p>
@@ -13284,15 +13179,7 @@
         </w:numPr>
       </w:pPr>
       <w:r>
-        <w:t>Detecting when screen memory is being read</w:t>
-      </w:r>
-      <w:proofErr w:type="gramStart"/>
-      <w:r>
-        <w:t xml:space="preserve">. </w:t>
-      </w:r>
-      <w:proofErr w:type="gramEnd"/>
-      <w:r>
-        <w:t>We need to know.</w:t>
+        <w:t>Detecting when screen memory is being read. We need to know.</w:t>
       </w:r>
     </w:p>
     <w:p>
@@ -13304,15 +13191,7 @@
         </w:numPr>
       </w:pPr>
       <w:r>
-        <w:t xml:space="preserve">The screen </w:t>
-      </w:r>
-      <w:proofErr w:type="gramStart"/>
-      <w:r>
-        <w:t>start</w:t>
-      </w:r>
-      <w:proofErr w:type="gramEnd"/>
-      <w:r>
-        <w:t xml:space="preserve"> address.  Write value stored to </w:t>
+        <w:t xml:space="preserve">The screen start address.  Write value stored to </w:t>
       </w:r>
       <w:r>
         <w:t>&amp;FE00</w:t>
@@ -13336,15 +13215,7 @@
         </w:numPr>
       </w:pPr>
       <w:r>
-        <w:t>The screen wrap-size (how many K)</w:t>
-      </w:r>
-      <w:proofErr w:type="gramStart"/>
-      <w:r>
-        <w:t xml:space="preserve">. </w:t>
-      </w:r>
-      <w:proofErr w:type="gramEnd"/>
-      <w:r>
-        <w:t xml:space="preserve">Write value stored to </w:t>
+        <w:t xml:space="preserve">The screen wrap-size (how many K). Write value stored to </w:t>
       </w:r>
       <w:r>
         <w:t>&amp;FE40</w:t>
@@ -13359,23 +13230,7 @@
         </w:numPr>
       </w:pPr>
       <w:r>
-        <w:t xml:space="preserve">The screen format (mode-7 verses </w:t>
-      </w:r>
-      <w:proofErr w:type="gramStart"/>
-      <w:r>
-        <w:t>non mode</w:t>
-      </w:r>
-      <w:proofErr w:type="gramEnd"/>
-      <w:r>
-        <w:t>-7)</w:t>
-      </w:r>
-      <w:proofErr w:type="gramStart"/>
-      <w:r>
-        <w:t xml:space="preserve">. </w:t>
-      </w:r>
-      <w:proofErr w:type="gramEnd"/>
-      <w:r>
-        <w:t xml:space="preserve">Write values stored at </w:t>
+        <w:t xml:space="preserve">The screen format (mode-7 verses non mode-7). Write values stored at </w:t>
       </w:r>
       <w:r>
         <w:t>&amp;FE20</w:t>
@@ -13414,45 +13269,13 @@
         </w:numPr>
       </w:pPr>
       <w:r>
-        <w:t xml:space="preserve">Detecting when the screen read starts.  We need to know when the v-sync </w:t>
-      </w:r>
-      <w:proofErr w:type="gramStart"/>
-      <w:r>
-        <w:t>interrupt</w:t>
-      </w:r>
-      <w:proofErr w:type="gramEnd"/>
-      <w:r>
-        <w:t xml:space="preserve"> occurs.  We can time it from here.  We can determine this by </w:t>
-      </w:r>
-      <w:proofErr w:type="gramStart"/>
-      <w:r>
-        <w:t>looking</w:t>
-      </w:r>
-      <w:proofErr w:type="gramEnd"/>
-      <w:r>
-        <w:t xml:space="preserve"> if the values read from &amp;</w:t>
+        <w:t>Detecting when the screen read starts.  We need to know when the v-sync interrupt occurs.  We can time it from here.  We can determine this by looking if the values read from &amp;</w:t>
       </w:r>
       <w:r>
         <w:t>FE4D</w:t>
       </w:r>
       <w:r>
-        <w:t xml:space="preserve"> </w:t>
-      </w:r>
-      <w:proofErr w:type="gramStart"/>
-      <w:r>
-        <w:t>has</w:t>
-      </w:r>
-      <w:proofErr w:type="gramEnd"/>
-      <w:r>
-        <w:t xml:space="preserve"> bit two </w:t>
-      </w:r>
-      <w:proofErr w:type="gramStart"/>
-      <w:r>
-        <w:t>set</w:t>
-      </w:r>
-      <w:proofErr w:type="gramEnd"/>
-      <w:r>
-        <w:t>.  The rest is math.</w:t>
+        <w:t xml:space="preserve"> has bit two set.  The rest is math.</w:t>
       </w:r>
     </w:p>
     <w:p>
@@ -13609,15 +13432,7 @@
         <w:t xml:space="preserve">Any code that </w:t>
       </w:r>
       <w:r>
-        <w:t xml:space="preserve">results in a function being </w:t>
-      </w:r>
-      <w:proofErr w:type="gramStart"/>
-      <w:r>
-        <w:t>called,</w:t>
-      </w:r>
-      <w:proofErr w:type="gramEnd"/>
-      <w:r>
-        <w:t xml:space="preserve"> is an implicit function all.</w:t>
+        <w:t>results in a function being called, is an implicit function all.</w:t>
       </w:r>
       <w:r>
         <w:t xml:space="preserve">  A return that lands on a function is </w:t>
@@ -13773,15 +13588,7 @@
         <w:t xml:space="preserve">Values on the stack can be a combination of return addresses, </w:t>
       </w:r>
       <w:r>
-        <w:t xml:space="preserve">and other data.  We want to understand what </w:t>
-      </w:r>
-      <w:proofErr w:type="gramStart"/>
-      <w:r>
-        <w:t>is a return address verses other data</w:t>
-      </w:r>
-      <w:proofErr w:type="gramEnd"/>
-      <w:r>
-        <w:t>.</w:t>
+        <w:t>and other data.  We want to understand what is a return address verses other data.</w:t>
       </w:r>
     </w:p>
     <w:p>
@@ -13846,6 +13653,30 @@
           <w:bCs/>
         </w:rPr>
         <w:t>in progress</w:t>
+      </w:r>
+    </w:p>
+    <w:p>
+      <w:pPr>
+        <w:pStyle w:val="ListParagraph"/>
+        <w:numPr>
+          <w:ilvl w:val="0"/>
+          <w:numId w:val="12"/>
+        </w:numPr>
+      </w:pPr>
+      <w:r>
+        <w:t xml:space="preserve">Make percentages either </w:t>
+      </w:r>
+      <w:r>
+        <w:t xml:space="preserve">1) </w:t>
+      </w:r>
+      <w:r>
+        <w:t xml:space="preserve">relative to total or </w:t>
+      </w:r>
+      <w:r>
+        <w:t xml:space="preserve">2) relative to </w:t>
+      </w:r>
+      <w:r>
+        <w:t>selected routine</w:t>
       </w:r>
     </w:p>
     <w:p>

</xml_diff>

<commit_message>
Improved selection behavior, making it consistent across the views.
</commit_message>
<xml_diff>
--- a/docs/Development.docx
+++ b/docs/Development.docx
@@ -8905,108 +8905,84 @@
           <w:b/>
           <w:bCs/>
         </w:rPr>
-        <w:t xml:space="preserve">Pie chart </w:t>
+        <w:t>R</w:t>
       </w:r>
       <w:r>
         <w:rPr>
           <w:b/>
           <w:bCs/>
         </w:rPr>
-        <w:t>view</w:t>
-      </w:r>
-      <w:r>
-        <w:t xml:space="preserve"> </w:t>
-      </w:r>
-      <w:r>
-        <w:t xml:space="preserve">– Show </w:t>
-      </w:r>
-      <w:r>
-        <w:t xml:space="preserve">metrics as </w:t>
-      </w:r>
-      <w:r>
-        <w:t>percentage</w:t>
-      </w:r>
-      <w:r>
-        <w:t>s</w:t>
-      </w:r>
-      <w:r>
-        <w:t xml:space="preserve"> </w:t>
-      </w:r>
-      <w:r>
-        <w:t>associated with the current selection.</w:t>
-      </w:r>
-    </w:p>
-    <w:p>
+        <w:t xml:space="preserve">outines </w:t>
+      </w:r>
       <w:r>
         <w:rPr>
           <w:b/>
           <w:bCs/>
         </w:rPr>
-        <w:t>Hot</w:t>
+        <w:t>tab</w:t>
       </w:r>
       <w:r>
         <w:rPr>
           <w:b/>
           <w:bCs/>
         </w:rPr>
-        <w:t xml:space="preserve">-routines </w:t>
+        <w:t xml:space="preserve"> </w:t>
+      </w:r>
+      <w:r>
+        <w:t>(default)</w:t>
       </w:r>
       <w:r>
         <w:rPr>
           <w:b/>
           <w:bCs/>
         </w:rPr>
-        <w:t>tab</w:t>
-      </w:r>
+        <w:t xml:space="preserve"> </w:t>
+      </w:r>
+      <w:r>
+        <w:t xml:space="preserve">– </w:t>
+      </w:r>
+      <w:r>
+        <w:t xml:space="preserve">Shows the </w:t>
+      </w:r>
+      <w:r>
+        <w:t xml:space="preserve">routines </w:t>
+      </w:r>
+      <w:r>
+        <w:t>in the program</w:t>
+      </w:r>
+      <w:r>
+        <w:t>, sorted by ‘self’ cycle counts.</w:t>
+      </w:r>
+    </w:p>
+    <w:p>
       <w:r>
         <w:rPr>
           <w:b/>
           <w:bCs/>
         </w:rPr>
-        <w:t xml:space="preserve"> </w:t>
-      </w:r>
-      <w:r>
-        <w:t>(default)</w:t>
+        <w:t xml:space="preserve">Caller \ Callee </w:t>
       </w:r>
       <w:r>
         <w:rPr>
           <w:b/>
           <w:bCs/>
         </w:rPr>
+        <w:t>tab</w:t>
+      </w:r>
+      <w:r>
         <w:t xml:space="preserve"> </w:t>
       </w:r>
       <w:r>
         <w:t xml:space="preserve">– </w:t>
       </w:r>
       <w:r>
-        <w:t xml:space="preserve">Shows the </w:t>
-      </w:r>
-      <w:r>
-        <w:t xml:space="preserve">top </w:t>
-      </w:r>
-      <w:r>
-        <w:t xml:space="preserve">hot </w:t>
-      </w:r>
-      <w:r>
-        <w:t xml:space="preserve">routines </w:t>
-      </w:r>
-      <w:r>
-        <w:t>in the program.  The view lists the routines which have the highest</w:t>
-      </w:r>
-      <w:r>
-        <w:t xml:space="preserve"> sel</w:t>
-      </w:r>
-      <w:r>
-        <w:t>f-</w:t>
-      </w:r>
-      <w:r>
-        <w:t xml:space="preserve">CPU timings in the application, within the </w:t>
-      </w:r>
-      <w:r>
-        <w:t>analysis window</w:t>
-      </w:r>
-      <w:r>
-        <w:t>.</w:t>
+        <w:t xml:space="preserve">Show a </w:t>
+      </w:r>
+      <w:r>
+        <w:t xml:space="preserve">routine’s </w:t>
+      </w:r>
+      <w:r>
+        <w:t>calling and called routines, showing their relative percentages.  Selecting a calling or called routine makes it the currently selected routine.</w:t>
       </w:r>
     </w:p>
     <w:p>
@@ -9037,17 +9013,17 @@
         <w:t>is spending its time.  Each node in the tree represents a routine, with the top-level nodes showing the program entry point</w:t>
       </w:r>
       <w:r>
-        <w:t xml:space="preserve"> and </w:t>
+        <w:t xml:space="preserve"> and interrupt </w:t>
+      </w:r>
+      <w:r>
+        <w:t>routines</w:t>
+      </w:r>
+      <w:r>
+        <w:t xml:space="preserve">.  Each node in the tree shows the self (exclusive), overall (inclusive), and </w:t>
       </w:r>
       <w:r>
         <w:lastRenderedPageBreak/>
-        <w:t xml:space="preserve">interrupt </w:t>
-      </w:r>
-      <w:r>
-        <w:t>routines</w:t>
-      </w:r>
-      <w:r>
-        <w:t>.  Each node in the tree shows the self (exclusive), overall (inclusive), and elapsed times.  The child nodes are ordered by their inclusive CPU times.  In cases where a routine is called from multiple callers, the metrics shown are in the context of the caller.</w:t>
+        <w:t>elapsed times.  The child nodes are ordered by their inclusive CPU times.  In cases where a routine is called from multiple callers, the metrics shown are in the context of the caller.</w:t>
       </w:r>
     </w:p>
     <w:p>
@@ -9056,464 +9032,303 @@
           <w:b/>
           <w:bCs/>
         </w:rPr>
-        <w:t xml:space="preserve">Caller \ Callee </w:t>
+        <w:t xml:space="preserve">Flame </w:t>
       </w:r>
       <w:r>
         <w:rPr>
           <w:b/>
           <w:bCs/>
         </w:rPr>
-        <w:t>tab</w:t>
-      </w:r>
-      <w:r>
-        <w:t xml:space="preserve"> </w:t>
-      </w:r>
-      <w:r>
-        <w:t xml:space="preserve">– </w:t>
-      </w:r>
-      <w:r>
-        <w:t>Show a function’s calling and called routines</w:t>
-      </w:r>
-      <w:r>
-        <w:t>, showing their relative percentages.</w:t>
-      </w:r>
-      <w:r>
-        <w:t xml:space="preserve">  </w:t>
-      </w:r>
-      <w:r>
-        <w:t>Selecting a</w:t>
-      </w:r>
-      <w:r>
-        <w:t xml:space="preserve"> calling or called routine </w:t>
-      </w:r>
-      <w:r>
-        <w:t>makes it the currently selected routine.</w:t>
-      </w:r>
-    </w:p>
-    <w:p>
+        <w:t xml:space="preserve">graph </w:t>
+      </w:r>
       <w:r>
         <w:rPr>
           <w:b/>
           <w:bCs/>
         </w:rPr>
-        <w:t xml:space="preserve">Routines </w:t>
-      </w:r>
+        <w:t>tab</w:t>
+      </w:r>
+      <w:r>
+        <w:t xml:space="preserve"> </w:t>
+      </w:r>
+      <w:r>
+        <w:t xml:space="preserve">– </w:t>
+      </w:r>
+      <w:r>
+        <w:t xml:space="preserve">Provides a percentage breakdown of the </w:t>
+      </w:r>
+      <w:r>
+        <w:t>selected function</w:t>
+      </w:r>
+      <w:r>
+        <w:t>’s call graph.</w:t>
+      </w:r>
+      <w:r>
+        <w:t xml:space="preserve">  The </w:t>
+      </w:r>
+      <w:r>
+        <w:t>view can be flipped</w:t>
+      </w:r>
+      <w:r>
+        <w:t xml:space="preserve"> vertically.</w:t>
+      </w:r>
+    </w:p>
+    <w:p>
       <w:r>
         <w:rPr>
           <w:b/>
           <w:bCs/>
         </w:rPr>
-        <w:t>tab</w:t>
-      </w:r>
-      <w:r>
-        <w:t xml:space="preserve"> </w:t>
-      </w:r>
-      <w:r>
-        <w:t xml:space="preserve">– </w:t>
-      </w:r>
-      <w:r>
-        <w:t xml:space="preserve">List all routines in the program, allowing these to be sorted by self, inclusive, and </w:t>
-      </w:r>
-      <w:r>
-        <w:t>elapsed</w:t>
-      </w:r>
-      <w:r>
-        <w:t xml:space="preserve"> times.</w:t>
-      </w:r>
-    </w:p>
-    <w:p>
+        <w:t xml:space="preserve">Memory </w:t>
+      </w:r>
       <w:r>
         <w:rPr>
           <w:b/>
           <w:bCs/>
         </w:rPr>
-        <w:t xml:space="preserve">Call </w:t>
-      </w:r>
+        <w:t>tab</w:t>
+      </w:r>
+      <w:r>
+        <w:t xml:space="preserve"> – The memory </w:t>
+      </w:r>
+      <w:r>
+        <w:t xml:space="preserve">tab </w:t>
+      </w:r>
+      <w:r>
+        <w:t>lists the highest and lowest used memory in the application</w:t>
+      </w:r>
+      <w:r>
+        <w:t>.</w:t>
+      </w:r>
+      <w:r>
+        <w:t xml:space="preserve">  The memory can be shown </w:t>
+      </w:r>
+      <w:r>
+        <w:t>in a</w:t>
+      </w:r>
+      <w:r>
+        <w:t xml:space="preserve"> split-view </w:t>
+      </w:r>
+      <w:r>
+        <w:t xml:space="preserve">with </w:t>
+      </w:r>
+      <w:r>
+        <w:t>zero-page addresses separate</w:t>
+      </w:r>
+      <w:r>
+        <w:t>d</w:t>
+      </w:r>
+      <w:r>
+        <w:t xml:space="preserve"> from non-zero-page addresses, a zero-page only view, and a non-zero-page only view.</w:t>
+      </w:r>
+    </w:p>
+    <w:p>
+      <w:r>
+        <w:t xml:space="preserve">Selecting an address </w:t>
+      </w:r>
+      <w:r>
+        <w:t xml:space="preserve">displays a panel on the right </w:t>
+      </w:r>
+      <w:r>
+        <w:t>which list</w:t>
+      </w:r>
+      <w:r>
+        <w:t>s</w:t>
+      </w:r>
+      <w:r>
+        <w:t xml:space="preserve"> all the routines which read or write to th</w:t>
+      </w:r>
+      <w:r>
+        <w:t>at</w:t>
+      </w:r>
+      <w:r>
+        <w:t xml:space="preserve"> address, </w:t>
+      </w:r>
+      <w:r>
+        <w:t>with access, read, and write counts.</w:t>
+      </w:r>
+      <w:r>
+        <w:t xml:space="preserve">  Selecting a routine </w:t>
+      </w:r>
+      <w:r>
+        <w:t>selects the routine in the code window, with the instructions that access the address highlighted.</w:t>
+      </w:r>
+    </w:p>
+    <w:p>
+      <w:r>
+        <w:t>Labels are shown next to addresses, where a close correlation has been established.</w:t>
+      </w:r>
+    </w:p>
+    <w:p>
       <w:r>
         <w:rPr>
           <w:b/>
           <w:bCs/>
         </w:rPr>
-        <w:t xml:space="preserve">graph </w:t>
-      </w:r>
-      <w:r>
+        <w:t>Code panel</w:t>
+      </w:r>
+      <w:r>
+        <w:t xml:space="preserve"> – used to view the performance of an individual routine.  </w:t>
+      </w:r>
+    </w:p>
+    <w:p>
+      <w:r>
+        <w:t xml:space="preserve">The left </w:t>
+      </w:r>
+      <w:r>
+        <w:t xml:space="preserve">side </w:t>
+      </w:r>
+      <w:r>
+        <w:t>shows the code blocks executed</w:t>
+      </w:r>
+      <w:r>
+        <w:t xml:space="preserve">, along with their corresponding </w:t>
+      </w:r>
+      <w:r>
+        <w:t>metrics</w:t>
+      </w:r>
+      <w:r>
+        <w:t>.  The metrics can be show</w:t>
+      </w:r>
+      <w:r>
+        <w:t>n</w:t>
+      </w:r>
+      <w:r>
+        <w:t xml:space="preserve"> in absolute or relative terms.</w:t>
+      </w:r>
+      <w:r>
+        <w:t xml:space="preserve">  </w:t>
+      </w:r>
+      <w:r>
+        <w:t xml:space="preserve">A call is treated </w:t>
+      </w:r>
+      <w:r>
+        <w:t>like another code block</w:t>
+      </w:r>
+      <w:r>
+        <w:t>, where the overhead of the call is also shown.</w:t>
+      </w:r>
+    </w:p>
+    <w:p>
+      <w:r>
+        <w:t>Alternative call blocks (where code changes) are</w:t>
+      </w:r>
+      <w:r>
+        <w:t xml:space="preserve"> shown with their numbers </w:t>
+      </w:r>
+      <w:r>
+        <w:t>averaged.</w:t>
+      </w:r>
+    </w:p>
+    <w:p>
+      <w:r>
+        <w:t xml:space="preserve">The context of the results can be filtered </w:t>
+      </w:r>
+      <w:r>
+        <w:t xml:space="preserve">(using a drop-down) to a </w:t>
+      </w:r>
+      <w:r>
+        <w:t>specific call-stack or reflect all caller</w:t>
+      </w:r>
+      <w:r>
+        <w:t xml:space="preserve"> stacks</w:t>
+      </w:r>
+      <w:r>
+        <w:t>.</w:t>
+      </w:r>
+    </w:p>
+    <w:p>
+      <w:pPr>
         <w:rPr>
           <w:b/>
           <w:bCs/>
         </w:rPr>
-        <w:t>tab</w:t>
-      </w:r>
-      <w:r>
-        <w:t xml:space="preserve"> </w:t>
-      </w:r>
-      <w:r>
-        <w:t xml:space="preserve">– </w:t>
-      </w:r>
-      <w:r>
-        <w:t xml:space="preserve">Provides a percentage breakdown of the </w:t>
-      </w:r>
-      <w:r>
-        <w:t>selected function</w:t>
-      </w:r>
-      <w:r>
-        <w:t>’s call graph.</w:t>
-      </w:r>
-      <w:r>
-        <w:t xml:space="preserve">  The </w:t>
-      </w:r>
-      <w:r>
-        <w:t>view can be flipped</w:t>
-      </w:r>
-      <w:r>
-        <w:t xml:space="preserve"> vertically.</w:t>
-      </w:r>
-    </w:p>
-    <w:p>
+      </w:pPr>
       <w:r>
         <w:rPr>
           <w:b/>
           <w:bCs/>
         </w:rPr>
-        <w:t>Interrupts</w:t>
-      </w:r>
-      <w:r>
-        <w:t xml:space="preserve"> </w:t>
+        <w:t xml:space="preserve">Code </w:t>
       </w:r>
       <w:r>
         <w:rPr>
           <w:b/>
           <w:bCs/>
         </w:rPr>
-        <w:t>tab</w:t>
-      </w:r>
-      <w:r>
-        <w:t xml:space="preserve"> </w:t>
-      </w:r>
-      <w:r>
-        <w:t>–</w:t>
-      </w:r>
-      <w:r>
-        <w:t xml:space="preserve"> Lists the program’s interrupt routines</w:t>
-      </w:r>
-      <w:r>
-        <w:t xml:space="preserve"> and the </w:t>
-      </w:r>
-      <w:r>
-        <w:t xml:space="preserve">routines </w:t>
-      </w:r>
-      <w:r>
-        <w:t>that they call</w:t>
-      </w:r>
-      <w:r>
-        <w:t>.</w:t>
-      </w:r>
-      <w:r>
-        <w:t xml:space="preserve">  </w:t>
-      </w:r>
-      <w:r>
-        <w:t>T</w:t>
-      </w:r>
-      <w:r>
-        <w:t xml:space="preserve">he view </w:t>
-      </w:r>
-      <w:r>
-        <w:t xml:space="preserve">also </w:t>
-      </w:r>
-      <w:r>
-        <w:t xml:space="preserve">shows the percentage of time spent </w:t>
-      </w:r>
-      <w:r>
-        <w:t xml:space="preserve">within </w:t>
-      </w:r>
-      <w:r>
-        <w:t xml:space="preserve">interrupt </w:t>
-      </w:r>
-      <w:r>
-        <w:t>code</w:t>
-      </w:r>
-      <w:r>
-        <w:t>.</w:t>
-      </w:r>
-    </w:p>
-    <w:p>
-      <w:r>
+        <w:t>Disassembly</w:t>
+      </w:r>
+    </w:p>
+    <w:p>
+      <w:r>
+        <w:t xml:space="preserve">Shows a disassembly of the </w:t>
+      </w:r>
+      <w:r>
+        <w:t xml:space="preserve">current </w:t>
+      </w:r>
+      <w:r>
+        <w:t>routine’s instructions.  If alternative opcode sequences exist, these can be toggled over.  Specific metrics are shown for each (somehow).</w:t>
+      </w:r>
+      <w:r>
+        <w:t xml:space="preserve">  The </w:t>
+      </w:r>
+      <w:r>
+        <w:t>dissemble extends to the routine above and below.</w:t>
+      </w:r>
+    </w:p>
+    <w:p>
+      <w:r>
+        <w:t>If labels are present in the .perf file, these are included in the disassembly as labels, and destination locations.  They also are used to annotate indexed and absolute addressing modes, where the resolved address falls within a data structure.  A data structure is denoted by a label which does not fall within a code region, where the data structure reaches up to the next defined label.</w:t>
+      </w:r>
+    </w:p>
+    <w:p>
+      <w:pPr>
         <w:rPr>
           <w:b/>
           <w:bCs/>
         </w:rPr>
-        <w:t xml:space="preserve">Memory </w:t>
-      </w:r>
+      </w:pPr>
       <w:r>
         <w:rPr>
           <w:b/>
           <w:bCs/>
         </w:rPr>
-        <w:t>tab</w:t>
-      </w:r>
-      <w:r>
-        <w:t xml:space="preserve"> – The memory </w:t>
-      </w:r>
-      <w:r>
-        <w:t xml:space="preserve">tab </w:t>
-      </w:r>
-      <w:r>
-        <w:t>lists the highest and lowest used memory in the application</w:t>
-      </w:r>
-      <w:r>
-        <w:t>.</w:t>
-      </w:r>
-      <w:r>
-        <w:t xml:space="preserve">  The memory can be shown </w:t>
-      </w:r>
-      <w:r>
-        <w:t>in a</w:t>
-      </w:r>
-      <w:r>
-        <w:t xml:space="preserve"> split-view </w:t>
-      </w:r>
-      <w:r>
-        <w:t xml:space="preserve">with </w:t>
-      </w:r>
-      <w:r>
-        <w:t>zero-page addresses separate</w:t>
-      </w:r>
-      <w:r>
-        <w:t>d</w:t>
-      </w:r>
-      <w:r>
-        <w:t xml:space="preserve"> from non-zero-page addresses, a zero-page only view, and a non-zero-page only view.</w:t>
-      </w:r>
-    </w:p>
-    <w:p>
-      <w:r>
-        <w:t xml:space="preserve">Selecting an address </w:t>
-      </w:r>
-      <w:r>
-        <w:t xml:space="preserve">displays a panel on the right </w:t>
-      </w:r>
-      <w:r>
-        <w:t>which list</w:t>
-      </w:r>
-      <w:r>
-        <w:t>s</w:t>
-      </w:r>
-      <w:r>
-        <w:t xml:space="preserve"> all the routines which read or write to th</w:t>
-      </w:r>
-      <w:r>
-        <w:t>at</w:t>
-      </w:r>
-      <w:r>
-        <w:t xml:space="preserve"> address, </w:t>
-      </w:r>
-      <w:r>
-        <w:t>with access, read, and write counts.</w:t>
-      </w:r>
-      <w:r>
-        <w:t xml:space="preserve">  Selecting a routine </w:t>
-      </w:r>
-      <w:r>
-        <w:t>selects the routine in the code window, with the instructions that access the address highlighted.</w:t>
-      </w:r>
-    </w:p>
-    <w:p>
-      <w:r>
-        <w:t>Labels are shown next to addresses, where a close correlation has been established.</w:t>
-      </w:r>
-    </w:p>
-    <w:p>
-      <w:r>
+        <w:t>Layout panel arrangements</w:t>
+      </w:r>
+    </w:p>
+    <w:p>
+      <w:r>
+        <w:t>The panels can be arranged in different ways to optimize analysis.</w:t>
+      </w:r>
+      <w:r>
+        <w:t xml:space="preserve">  The timeline view can be </w:t>
+      </w:r>
+      <w:r>
+        <w:t xml:space="preserve">optionally </w:t>
+      </w:r>
+      <w:r>
+        <w:t>collapsed,</w:t>
+      </w:r>
+      <w:r>
+        <w:t xml:space="preserve"> and the tabbed and </w:t>
+      </w:r>
+      <w:r>
+        <w:t>code-view panels can be arranged horizontally or vertically.</w:t>
+      </w:r>
+    </w:p>
+    <w:p>
+      <w:pPr>
         <w:rPr>
           <w:b/>
           <w:bCs/>
         </w:rPr>
-        <w:t>Code panel</w:t>
-      </w:r>
-      <w:r>
-        <w:t xml:space="preserve"> – used to view the performance of an individual routine.  </w:t>
-      </w:r>
-    </w:p>
-    <w:p>
-      <w:r>
-        <w:t xml:space="preserve">The left </w:t>
-      </w:r>
-      <w:r>
-        <w:t xml:space="preserve">side </w:t>
-      </w:r>
-      <w:r>
-        <w:t>shows the code blocks executed</w:t>
-      </w:r>
-      <w:r>
-        <w:t xml:space="preserve">, along with their corresponding </w:t>
-      </w:r>
-      <w:r>
-        <w:t>metrics</w:t>
-      </w:r>
-      <w:r>
-        <w:t>.  The metrics can be show</w:t>
-      </w:r>
-      <w:r>
-        <w:t>n</w:t>
-      </w:r>
-      <w:r>
-        <w:t xml:space="preserve"> in absolute or relative terms.</w:t>
-      </w:r>
-      <w:r>
-        <w:t xml:space="preserve">  </w:t>
-      </w:r>
-      <w:r>
-        <w:t xml:space="preserve">A call is treated </w:t>
-      </w:r>
-      <w:r>
-        <w:t>like another code block</w:t>
-      </w:r>
-      <w:r>
-        <w:t>, where the overhead of the call is also shown.</w:t>
-      </w:r>
-    </w:p>
-    <w:p>
-      <w:r>
-        <w:t>Alternative call blocks (where code changes) are</w:t>
-      </w:r>
-      <w:r>
-        <w:t xml:space="preserve"> shown with their numbers </w:t>
-      </w:r>
-      <w:r>
-        <w:t>averaged.</w:t>
-      </w:r>
-    </w:p>
-    <w:p>
-      <w:r>
-        <w:t xml:space="preserve">The context of the results can be filtered </w:t>
-      </w:r>
-      <w:r>
-        <w:t xml:space="preserve">(using a drop-down) to a </w:t>
-      </w:r>
-      <w:r>
-        <w:t>specific call-stack or reflect all caller</w:t>
-      </w:r>
-      <w:r>
-        <w:t xml:space="preserve"> stacks</w:t>
-      </w:r>
-      <w:r>
-        <w:t>.</w:t>
-      </w:r>
-    </w:p>
-    <w:p>
-      <w:pPr>
+      </w:pPr>
+      <w:r>
         <w:rPr>
           <w:b/>
           <w:bCs/>
         </w:rPr>
-      </w:pPr>
-      <w:r>
-        <w:rPr>
-          <w:b/>
-          <w:bCs/>
-        </w:rPr>
-        <w:t xml:space="preserve">Code </w:t>
-      </w:r>
-      <w:r>
-        <w:rPr>
-          <w:b/>
-          <w:bCs/>
-        </w:rPr>
-        <w:t>Disassembly</w:t>
-      </w:r>
-    </w:p>
-    <w:p>
-      <w:r>
-        <w:t xml:space="preserve">Shows a disassembly of the </w:t>
-      </w:r>
-      <w:r>
-        <w:t xml:space="preserve">current </w:t>
-      </w:r>
-      <w:r>
-        <w:t>routine’s instructions.  If alternative opcode sequences exist, these can be toggled over.  Specific metrics are shown for each (somehow).</w:t>
-      </w:r>
-      <w:r>
-        <w:t xml:space="preserve">  The </w:t>
-      </w:r>
-      <w:r>
-        <w:t>dissemble extends to the routine above and below.</w:t>
-      </w:r>
-    </w:p>
-    <w:p>
-      <w:r>
-        <w:t xml:space="preserve">If labels are present in the .perf file, these are included in the disassembly as labels, and destination locations.  They also are used to annotate indexed and absolute addressing </w:t>
-      </w:r>
-      <w:r>
         <w:lastRenderedPageBreak/>
-        <w:t>modes, where the resolved address falls within a data structure.  A data structure is denoted by a label which does not fall within a code region, where the data structure reaches up to the next defined label.</w:t>
-      </w:r>
-    </w:p>
-    <w:p>
-      <w:pPr>
-        <w:rPr>
-          <w:b/>
-          <w:bCs/>
-        </w:rPr>
-      </w:pPr>
-      <w:r>
-        <w:rPr>
-          <w:b/>
-          <w:bCs/>
-        </w:rPr>
-        <w:t>Layout panel arrangements</w:t>
-      </w:r>
-    </w:p>
-    <w:p>
-      <w:r>
-        <w:t>The panels can be arranged in different ways to optimize analysis.</w:t>
-      </w:r>
-      <w:r>
-        <w:t xml:space="preserve">  The timeline view can be </w:t>
-      </w:r>
-      <w:r>
-        <w:t xml:space="preserve">optionally </w:t>
-      </w:r>
-      <w:r>
-        <w:t>collapsed,</w:t>
-      </w:r>
-      <w:r>
-        <w:t xml:space="preserve"> and the tabbed and </w:t>
-      </w:r>
-      <w:r>
-        <w:t>code-view panels can be arranged horizontally or vertically.</w:t>
-      </w:r>
-    </w:p>
-    <w:p>
-      <w:pPr>
-        <w:rPr>
-          <w:b/>
-          <w:bCs/>
-        </w:rPr>
-      </w:pPr>
-      <w:r>
-        <w:rPr>
-          <w:b/>
-          <w:bCs/>
-        </w:rPr>
-        <w:t>Undo/redo</w:t>
-      </w:r>
-    </w:p>
-    <w:p>
-      <w:r>
-        <w:t>All navigation and selection actions are stored in an undo/redo buffer, allowing the user to navigate backwards and forwards using a forward and back-buttons.</w:t>
-      </w:r>
-    </w:p>
-    <w:p>
-      <w:pPr>
-        <w:rPr>
-          <w:b/>
-          <w:bCs/>
-        </w:rPr>
-      </w:pPr>
-      <w:r>
-        <w:rPr>
-          <w:b/>
-          <w:bCs/>
-        </w:rPr>
         <w:t>Tooltips</w:t>
       </w:r>
     </w:p>
@@ -9532,26 +9347,6 @@
       </w:r>
       <w:r>
         <w:t>and other numeric formats.</w:t>
-      </w:r>
-    </w:p>
-    <w:p>
-      <w:pPr>
-        <w:rPr>
-          <w:b/>
-          <w:bCs/>
-        </w:rPr>
-      </w:pPr>
-      <w:r>
-        <w:rPr>
-          <w:b/>
-          <w:bCs/>
-        </w:rPr>
-        <w:t>Hot routines</w:t>
-      </w:r>
-    </w:p>
-    <w:p>
-      <w:r>
-        <w:t>All hot routines are denoted with a flame icon</w:t>
       </w:r>
     </w:p>
     <w:p>
@@ -9784,40 +9579,19 @@
     </w:p>
     <w:p>
       <w:pPr>
-        <w:pStyle w:val="Heading1"/>
-      </w:pPr>
-      <w:r>
-        <w:lastRenderedPageBreak/>
-        <w:t>Analysis</w:t>
-      </w:r>
-    </w:p>
-    <w:p>
-      <w:r>
-        <w:t>The following p</w:t>
-      </w:r>
-      <w:r>
-        <w:t>rimary data structures</w:t>
-      </w:r>
-      <w:r>
-        <w:t xml:space="preserve"> are used to </w:t>
-      </w:r>
-      <w:r>
-        <w:t xml:space="preserve">model </w:t>
-      </w:r>
-      <w:r>
-        <w:t xml:space="preserve">and analyze </w:t>
-      </w:r>
-      <w:r>
-        <w:t xml:space="preserve">recorded </w:t>
-      </w:r>
-      <w:r>
-        <w:t xml:space="preserve">performance </w:t>
-      </w:r>
-      <w:r>
-        <w:t>data</w:t>
-      </w:r>
-      <w:r>
-        <w:t>:</w:t>
+        <w:pStyle w:val="Heading3"/>
+      </w:pPr>
+      <w:r>
+        <w:t xml:space="preserve">Managing the </w:t>
+      </w:r>
+      <w:r>
+        <w:t>‘</w:t>
+      </w:r>
+      <w:r>
+        <w:t>context</w:t>
+      </w:r>
+      <w:r>
+        <w:t>’</w:t>
       </w:r>
     </w:p>
     <w:p>
@@ -9829,6 +9603,344 @@
         </w:numPr>
       </w:pPr>
       <w:r>
+        <w:t>The form owns the currently selected routine</w:t>
+      </w:r>
+      <w:r>
+        <w:t xml:space="preserve"> and </w:t>
+      </w:r>
+      <w:r>
+        <w:t>call-stack</w:t>
+      </w:r>
+      <w:r>
+        <w:t>.</w:t>
+      </w:r>
+      <w:r>
+        <w:t xml:space="preserve"> </w:t>
+      </w:r>
+      <w:r>
+        <w:t xml:space="preserve"> The latter may be null.</w:t>
+      </w:r>
+    </w:p>
+    <w:p>
+      <w:pPr>
+        <w:pStyle w:val="ListParagraph"/>
+        <w:numPr>
+          <w:ilvl w:val="0"/>
+          <w:numId w:val="9"/>
+        </w:numPr>
+      </w:pPr>
+      <w:r>
+        <w:t xml:space="preserve">The selection can be </w:t>
+      </w:r>
+      <w:r>
+        <w:t xml:space="preserve">changed </w:t>
+      </w:r>
+      <w:r>
+        <w:t xml:space="preserve">and/or cleared </w:t>
+      </w:r>
+      <w:r>
+        <w:t xml:space="preserve">from </w:t>
+      </w:r>
+      <w:r>
+        <w:t xml:space="preserve">withing </w:t>
+      </w:r>
+      <w:r>
+        <w:t xml:space="preserve">any </w:t>
+      </w:r>
+      <w:r>
+        <w:t>V</w:t>
+      </w:r>
+      <w:r>
+        <w:t>iew</w:t>
+      </w:r>
+      <w:r>
+        <w:t>.</w:t>
+      </w:r>
+    </w:p>
+    <w:p>
+      <w:pPr>
+        <w:pStyle w:val="ListParagraph"/>
+        <w:numPr>
+          <w:ilvl w:val="0"/>
+          <w:numId w:val="9"/>
+        </w:numPr>
+      </w:pPr>
+      <w:r>
+        <w:t>Each View responds to selection changes, highlighting the most appropriate element</w:t>
+      </w:r>
+      <w:r>
+        <w:t xml:space="preserve"> within.</w:t>
+      </w:r>
+      <w:r>
+        <w:t xml:space="preserve">  For example, the Call Tree will select the most appropriate </w:t>
+      </w:r>
+      <w:r>
+        <w:t>tree node, expanding the tree as needed.</w:t>
+      </w:r>
+    </w:p>
+    <w:p>
+      <w:pPr>
+        <w:pStyle w:val="ListParagraph"/>
+        <w:numPr>
+          <w:ilvl w:val="0"/>
+          <w:numId w:val="9"/>
+        </w:numPr>
+        <w:rPr>
+          <w:rFonts w:ascii="Cascadia Mono" w:hAnsi="Cascadia Mono" w:cs="Cascadia Mono"/>
+          <w:color w:val="008000"/>
+          <w:kern w:val="0"/>
+          <w:sz w:val="19"/>
+          <w:szCs w:val="19"/>
+        </w:rPr>
+      </w:pPr>
+      <w:r>
+        <w:t>Selecting a view does not change the selection</w:t>
+      </w:r>
+      <w:r>
+        <w:t xml:space="preserve">, but it may make the </w:t>
+      </w:r>
+      <w:r>
+        <w:t xml:space="preserve">current selected </w:t>
+      </w:r>
+      <w:r>
+        <w:t>call-stack not applicable</w:t>
+      </w:r>
+      <w:r>
+        <w:t xml:space="preserve">, resulting in the </w:t>
+      </w:r>
+      <w:r>
+        <w:t>Code View panel</w:t>
+      </w:r>
+      <w:r>
+        <w:t xml:space="preserve"> updating.</w:t>
+      </w:r>
+    </w:p>
+    <w:p>
+      <w:pPr>
+        <w:pStyle w:val="Heading3"/>
+      </w:pPr>
+      <w:r>
+        <w:t>Undo-Redo</w:t>
+      </w:r>
+      <w:r>
+        <w:t xml:space="preserve"> History</w:t>
+      </w:r>
+    </w:p>
+    <w:p>
+      <w:r>
+        <w:t xml:space="preserve">The following </w:t>
+      </w:r>
+      <w:r>
+        <w:t>actions</w:t>
+      </w:r>
+      <w:r>
+        <w:t xml:space="preserve"> are stored in the undo/redo </w:t>
+      </w:r>
+      <w:r>
+        <w:t>history</w:t>
+      </w:r>
+      <w:r>
+        <w:t>:</w:t>
+      </w:r>
+    </w:p>
+    <w:p>
+      <w:pPr>
+        <w:pStyle w:val="ListParagraph"/>
+        <w:numPr>
+          <w:ilvl w:val="0"/>
+          <w:numId w:val="9"/>
+        </w:numPr>
+      </w:pPr>
+      <w:r>
+        <w:t>Open file</w:t>
+      </w:r>
+    </w:p>
+    <w:p>
+      <w:pPr>
+        <w:pStyle w:val="ListParagraph"/>
+        <w:numPr>
+          <w:ilvl w:val="0"/>
+          <w:numId w:val="9"/>
+        </w:numPr>
+      </w:pPr>
+      <w:r>
+        <w:t>Change time-line range</w:t>
+      </w:r>
+    </w:p>
+    <w:p>
+      <w:pPr>
+        <w:pStyle w:val="ListParagraph"/>
+        <w:numPr>
+          <w:ilvl w:val="0"/>
+          <w:numId w:val="9"/>
+        </w:numPr>
+      </w:pPr>
+      <w:r>
+        <w:t>Change current routine and call-stack</w:t>
+      </w:r>
+    </w:p>
+    <w:p>
+      <w:pPr>
+        <w:pStyle w:val="ListParagraph"/>
+        <w:numPr>
+          <w:ilvl w:val="0"/>
+          <w:numId w:val="9"/>
+        </w:numPr>
+      </w:pPr>
+      <w:r>
+        <w:t>Change view</w:t>
+      </w:r>
+    </w:p>
+    <w:p>
+      <w:pPr>
+        <w:pStyle w:val="ListParagraph"/>
+        <w:numPr>
+          <w:ilvl w:val="0"/>
+          <w:numId w:val="9"/>
+        </w:numPr>
+      </w:pPr>
+      <w:r>
+        <w:t>Flip view</w:t>
+      </w:r>
+    </w:p>
+    <w:p>
+      <w:r>
+        <w:t xml:space="preserve">The following actions are </w:t>
+      </w:r>
+      <w:r>
+        <w:rPr>
+          <w:u w:val="single"/>
+        </w:rPr>
+        <w:t>not</w:t>
+      </w:r>
+      <w:r>
+        <w:t xml:space="preserve"> stored in the undo/redo history: </w:t>
+      </w:r>
+    </w:p>
+    <w:p>
+      <w:pPr>
+        <w:pStyle w:val="ListParagraph"/>
+        <w:numPr>
+          <w:ilvl w:val="0"/>
+          <w:numId w:val="9"/>
+        </w:numPr>
+      </w:pPr>
+      <w:r>
+        <w:lastRenderedPageBreak/>
+        <w:t>Scroll position changes</w:t>
+      </w:r>
+    </w:p>
+    <w:p>
+      <w:pPr>
+        <w:pStyle w:val="ListParagraph"/>
+        <w:numPr>
+          <w:ilvl w:val="0"/>
+          <w:numId w:val="9"/>
+        </w:numPr>
+      </w:pPr>
+      <w:r>
+        <w:t>Divider position changes</w:t>
+      </w:r>
+    </w:p>
+    <w:p>
+      <w:pPr>
+        <w:pStyle w:val="ListParagraph"/>
+        <w:numPr>
+          <w:ilvl w:val="0"/>
+          <w:numId w:val="9"/>
+        </w:numPr>
+      </w:pPr>
+      <w:r>
+        <w:t>Window resize</w:t>
+      </w:r>
+      <w:r>
+        <w:t>s</w:t>
+      </w:r>
+    </w:p>
+    <w:p>
+      <w:pPr>
+        <w:pStyle w:val="ListParagraph"/>
+        <w:numPr>
+          <w:ilvl w:val="0"/>
+          <w:numId w:val="9"/>
+        </w:numPr>
+      </w:pPr>
+      <w:r>
+        <w:t>Zoom in / zoom out</w:t>
+      </w:r>
+    </w:p>
+    <w:p>
+      <w:pPr>
+        <w:pStyle w:val="ListParagraph"/>
+        <w:numPr>
+          <w:ilvl w:val="0"/>
+          <w:numId w:val="9"/>
+        </w:numPr>
+      </w:pPr>
+      <w:r>
+        <w:t>Settings changes</w:t>
+      </w:r>
+    </w:p>
+    <w:p>
+      <w:r>
+        <w:t>All views are notified after a</w:t>
+      </w:r>
+      <w:r>
+        <w:t>n</w:t>
+      </w:r>
+      <w:r>
+        <w:t xml:space="preserve"> undo or redo operation has been executed.  The views refresh themselves </w:t>
+      </w:r>
+      <w:r>
+        <w:t>appropriately, showing the selected routine etc.</w:t>
+      </w:r>
+    </w:p>
+    <w:p>
+      <w:pPr>
+        <w:pStyle w:val="Heading1"/>
+      </w:pPr>
+      <w:r>
+        <w:t>Analysis</w:t>
+      </w:r>
+    </w:p>
+    <w:p>
+      <w:r>
+        <w:t>The following p</w:t>
+      </w:r>
+      <w:r>
+        <w:t>rimary data structures</w:t>
+      </w:r>
+      <w:r>
+        <w:t xml:space="preserve"> are used to </w:t>
+      </w:r>
+      <w:r>
+        <w:t xml:space="preserve">model </w:t>
+      </w:r>
+      <w:r>
+        <w:t xml:space="preserve">and analyze </w:t>
+      </w:r>
+      <w:r>
+        <w:t xml:space="preserve">recorded </w:t>
+      </w:r>
+      <w:r>
+        <w:t xml:space="preserve">performance </w:t>
+      </w:r>
+      <w:r>
+        <w:t>data</w:t>
+      </w:r>
+      <w:r>
+        <w:t>:</w:t>
+      </w:r>
+    </w:p>
+    <w:p>
+      <w:pPr>
+        <w:pStyle w:val="ListParagraph"/>
+        <w:numPr>
+          <w:ilvl w:val="0"/>
+          <w:numId w:val="9"/>
+        </w:numPr>
+      </w:pPr>
+      <w:r>
         <w:rPr>
           <w:b/>
           <w:bCs/>
@@ -10222,6 +10334,7 @@
         </w:numPr>
       </w:pPr>
       <w:r>
+        <w:lastRenderedPageBreak/>
         <w:t>Memory read</w:t>
       </w:r>
       <w:r>
@@ -10377,7 +10490,6 @@
         </w:numPr>
       </w:pPr>
       <w:r>
-        <w:lastRenderedPageBreak/>
         <w:t xml:space="preserve">Total </w:t>
       </w:r>
       <w:r>
@@ -10816,6 +10928,7 @@
           <w:rFonts w:ascii="Aptos" w:hAnsi="Aptos"/>
           <w:color w:val="000000"/>
         </w:rPr>
+        <w:lastRenderedPageBreak/>
         <w:t>The Program’s Labels come from the Label Chunk, Instructions from the Execution Chunk</w:t>
       </w:r>
       <w:r>
@@ -10986,7 +11099,6 @@
         <w:pStyle w:val="Heading2"/>
       </w:pPr>
       <w:r>
-        <w:lastRenderedPageBreak/>
         <w:t xml:space="preserve">Static </w:t>
       </w:r>
       <w:r>
@@ -11487,6 +11599,7 @@
           <w:rFonts w:ascii="Aptos" w:hAnsi="Aptos"/>
           <w:color w:val="000000"/>
         </w:rPr>
+        <w:lastRenderedPageBreak/>
         <w:t xml:space="preserve">The program's cycle count, which begins at zero, is incremented as instructions are processed. </w:t>
       </w:r>
       <w:r>
@@ -11636,7 +11749,6 @@
         <w:contextualSpacing w:val="0"/>
       </w:pPr>
       <w:r>
-        <w:lastRenderedPageBreak/>
         <w:t xml:space="preserve">Each routine </w:t>
       </w:r>
       <w:r>
@@ -12239,6 +12351,7 @@
         <w:pStyle w:val="Heading2"/>
       </w:pPr>
       <w:r>
+        <w:lastRenderedPageBreak/>
         <w:t xml:space="preserve">Dynamic </w:t>
       </w:r>
       <w:r>
@@ -12312,7 +12425,6 @@
         </w:numPr>
       </w:pPr>
       <w:r>
-        <w:lastRenderedPageBreak/>
         <w:t xml:space="preserve">Use the CPU metrics to generate the </w:t>
       </w:r>
       <w:r>
@@ -12841,6 +12953,7 @@
         </w:numPr>
       </w:pPr>
       <w:r>
+        <w:lastRenderedPageBreak/>
         <w:t xml:space="preserve">We also determine if </w:t>
       </w:r>
       <w:r>
@@ -12930,7 +13043,6 @@
     </w:p>
     <w:p>
       <w:r>
-        <w:lastRenderedPageBreak/>
         <w:t xml:space="preserve">To determine if a screen memory access is </w:t>
       </w:r>
       <w:r>
@@ -13353,6 +13465,7 @@
         </w:numPr>
       </w:pPr>
       <w:r>
+        <w:lastRenderedPageBreak/>
         <w:t>Timing synchronization</w:t>
       </w:r>
     </w:p>
@@ -13428,7 +13541,6 @@
         </w:numPr>
       </w:pPr>
       <w:r>
-        <w:lastRenderedPageBreak/>
         <w:t xml:space="preserve">Any code that </w:t>
       </w:r>
       <w:r>

</xml_diff>

<commit_message>
Added header tool tips
</commit_message>
<xml_diff>
--- a/docs/Development.docx
+++ b/docs/Development.docx
@@ -346,36 +346,6 @@
       <w:r>
         <w:t>.</w:t>
       </w:r>
-      <w:r>
-        <w:t xml:space="preserve">  </w:t>
-      </w:r>
-      <w:r>
-        <w:t>I</w:t>
-      </w:r>
-      <w:r>
-        <w:t>nstrumentation</w:t>
-      </w:r>
-      <w:r>
-        <w:t xml:space="preserve"> </w:t>
-      </w:r>
-      <w:r>
-        <w:t xml:space="preserve"> and sample</w:t>
-      </w:r>
-      <w:r>
-        <w:t xml:space="preserve"> </w:t>
-      </w:r>
-      <w:r>
-        <w:t xml:space="preserve">based </w:t>
-      </w:r>
-      <w:r>
-        <w:t xml:space="preserve">measurements </w:t>
-      </w:r>
-      <w:r>
-        <w:t>are not necessary</w:t>
-      </w:r>
-      <w:r>
-        <w:t>.</w:t>
-      </w:r>
     </w:p>
     <w:p>
       <w:pPr>
@@ -388,7 +358,10 @@
         <w:t xml:space="preserve">To this end, </w:t>
       </w:r>
       <w:r>
-        <w:t>New</w:t>
+        <w:t>I added n</w:t>
+      </w:r>
+      <w:r>
+        <w:t>ew</w:t>
       </w:r>
       <w:r>
         <w:rPr>
@@ -439,7 +412,7 @@
           <w:rFonts w:ascii="Aptos" w:hAnsi="Aptos"/>
           <w:color w:val="000000"/>
         </w:rPr>
-        <w:t xml:space="preserve">will be added to </w:t>
+        <w:t xml:space="preserve">to BeebEm that allow </w:t>
       </w:r>
       <w:r>
         <w:rPr>
@@ -530,7 +503,13 @@
         <w:t xml:space="preserve">… </w:t>
       </w:r>
       <w:r>
-        <w:t>this will be performed</w:t>
+        <w:t xml:space="preserve">this </w:t>
+      </w:r>
+      <w:r>
+        <w:t xml:space="preserve">is </w:t>
+      </w:r>
+      <w:r>
+        <w:t>performed</w:t>
       </w:r>
       <w:r>
         <w:t xml:space="preserve"> in a </w:t>
@@ -566,13 +545,6 @@
         <w:t>in its own git repository</w:t>
       </w:r>
       <w:r>
-        <w:t>, at least initially</w:t>
-      </w:r>
-      <w:r>
-        <w:rPr>
-          <w:b/>
-          <w:bCs/>
-        </w:rPr>
         <w:t>.</w:t>
       </w:r>
     </w:p>
@@ -1115,16 +1087,21 @@
       <w:r>
         <w:t xml:space="preserve"> a common header which </w:t>
       </w:r>
-      <w:r>
-        <w:t xml:space="preserve">proceeds </w:t>
-      </w:r>
-      <w:r>
-        <w:t>the</w:t>
-      </w:r>
+      <w:proofErr w:type="gramStart"/>
+      <w:r>
+        <w:t>proceeds</w:t>
+      </w:r>
+      <w:proofErr w:type="gramEnd"/>
       <w:r>
         <w:t xml:space="preserve"> </w:t>
       </w:r>
       <w:r>
+        <w:t>its</w:t>
+      </w:r>
+      <w:r>
+        <w:t xml:space="preserve"> </w:t>
+      </w:r>
+      <w:r>
         <w:t>data</w:t>
       </w:r>
       <w:r>
@@ -1145,7 +1122,7 @@
         <w:shd w:val="clear" w:color="auto" w:fill="FAFAD6"/>
       </w:pPr>
       <w:r>
-        <w:t>All scalar values are stored in little big-endian format (unless otherwise stated), with low bytes preceding high bytes.</w:t>
+        <w:t>All scalar values are stored in little-endian format (unless otherwise stated), with low bytes preceding high bytes.</w:t>
       </w:r>
     </w:p>
     <w:p>
@@ -2001,7 +1978,15 @@
         <w:t xml:space="preserve">The header chunk </w:t>
       </w:r>
       <w:r>
-        <w:t xml:space="preserve">is the first chunk in the file and </w:t>
+        <w:t xml:space="preserve">is the first chunk in the </w:t>
+      </w:r>
+      <w:proofErr w:type="gramStart"/>
+      <w:r>
+        <w:t>file</w:t>
+      </w:r>
+      <w:proofErr w:type="gramEnd"/>
+      <w:r>
+        <w:t xml:space="preserve"> and </w:t>
       </w:r>
       <w:r>
         <w:t xml:space="preserve">it </w:t>
@@ -2147,6 +2132,12 @@
       <w:proofErr w:type="spellEnd"/>
       <w:r>
         <w:t>&gt;</w:t>
+      </w:r>
+      <w:r>
+        <w:t xml:space="preserve"> wher</w:t>
+      </w:r>
+      <w:r>
+        <w:t>e</w:t>
       </w:r>
     </w:p>
     <w:p>
@@ -2843,6 +2834,9 @@
       <w:r>
         <w:t>&gt;</w:t>
       </w:r>
+      <w:r>
+        <w:t xml:space="preserve"> where</w:t>
+      </w:r>
     </w:p>
     <w:p>
       <w:pPr>
@@ -3107,6 +3101,9 @@
       <w:proofErr w:type="spellEnd"/>
       <w:r>
         <w:t>&gt;</w:t>
+      </w:r>
+      <w:r>
+        <w:t xml:space="preserve"> where</w:t>
       </w:r>
     </w:p>
     <w:p>
@@ -4417,7 +4414,13 @@
       </w:r>
       <w:proofErr w:type="spellStart"/>
       <w:r>
-        <w:t>page_back</w:t>
+        <w:t>page_ba</w:t>
+      </w:r>
+      <w:r>
+        <w:t>n</w:t>
+      </w:r>
+      <w:r>
+        <w:t>k</w:t>
       </w:r>
       <w:proofErr w:type="spellEnd"/>
       <w:r>
@@ -4433,7 +4436,10 @@
       </w:r>
       <w:proofErr w:type="spellStart"/>
       <w:r>
-        <w:t>page_memort</w:t>
+        <w:t>page_memor</w:t>
+      </w:r>
+      <w:r>
+        <w:t>y</w:t>
       </w:r>
       <w:proofErr w:type="spellEnd"/>
       <w:r>
@@ -4686,12 +4692,14 @@
       <w:r>
         <w:t>Integra</w:t>
       </w:r>
+      <w:proofErr w:type="gramStart"/>
       <w:r>
         <w:t>.</w:t>
       </w:r>
       <w:r>
         <w:t xml:space="preserve"> </w:t>
       </w:r>
+      <w:proofErr w:type="gramEnd"/>
       <w:r>
         <w:t>Addresses &amp;</w:t>
       </w:r>
@@ -5276,7 +5284,7 @@
         <w:t>(1 bytes) S</w:t>
       </w:r>
       <w:r>
-        <w:t xml:space="preserve">pecifies the new value of the stack pointer. </w:t>
+        <w:t>pecifies the new value of the stack pointer.</w:t>
       </w:r>
     </w:p>
     <w:p>
@@ -5736,6 +5744,7 @@
             <w:r>
               <w:t>&amp;</w:t>
             </w:r>
+            <w:proofErr w:type="gramStart"/>
             <w:r>
               <w:t>8</w:t>
             </w:r>
@@ -5745,6 +5754,7 @@
             <w:r>
               <w:t>..</w:t>
             </w:r>
+            <w:proofErr w:type="gramEnd"/>
             <w:r>
               <w:t>&amp;</w:t>
             </w:r>
@@ -5825,7 +5835,15 @@
               <w:t xml:space="preserve"> </w:t>
             </w:r>
             <w:r>
-              <w:t>&amp;0000..&amp;7F</w:t>
+              <w:t>&amp;</w:t>
+            </w:r>
+            <w:proofErr w:type="gramStart"/>
+            <w:r>
+              <w:t>0000..</w:t>
+            </w:r>
+            <w:proofErr w:type="gramEnd"/>
+            <w:r>
+              <w:t>&amp;7F</w:t>
             </w:r>
             <w:r>
               <w:t>FF</w:t>
@@ -5840,12 +5858,14 @@
             <w:pPr>
               <w:jc w:val="center"/>
             </w:pPr>
+            <w:proofErr w:type="gramStart"/>
             <w:r>
               <w:t>0..</w:t>
             </w:r>
             <w:r>
               <w:t>&amp;</w:t>
             </w:r>
+            <w:proofErr w:type="gramEnd"/>
             <w:r>
               <w:t>7F</w:t>
             </w:r>
@@ -5859,12 +5879,14 @@
             <w:pPr>
               <w:jc w:val="center"/>
             </w:pPr>
+            <w:proofErr w:type="gramStart"/>
             <w:r>
               <w:t>0..</w:t>
             </w:r>
             <w:r>
               <w:t>&amp;</w:t>
             </w:r>
+            <w:proofErr w:type="gramEnd"/>
             <w:r>
               <w:t>FF</w:t>
             </w:r>
@@ -5908,7 +5930,15 @@
               <w:t>:</w:t>
             </w:r>
             <w:r>
-              <w:t xml:space="preserve"> &amp;8000..&amp;FFFF</w:t>
+              <w:t xml:space="preserve"> &amp;</w:t>
+            </w:r>
+            <w:proofErr w:type="gramStart"/>
+            <w:r>
+              <w:t>8000..</w:t>
+            </w:r>
+            <w:proofErr w:type="gramEnd"/>
+            <w:r>
+              <w:t>&amp;FFFF</w:t>
             </w:r>
           </w:p>
         </w:tc>
@@ -5939,9 +5969,11 @@
             <w:r>
               <w:t>&amp;</w:t>
             </w:r>
+            <w:proofErr w:type="gramStart"/>
             <w:r>
               <w:t>80..</w:t>
             </w:r>
+            <w:proofErr w:type="gramEnd"/>
             <w:r>
               <w:t>&amp;</w:t>
             </w:r>
@@ -5958,12 +5990,14 @@
             <w:pPr>
               <w:jc w:val="center"/>
             </w:pPr>
+            <w:proofErr w:type="gramStart"/>
             <w:r>
               <w:t>0..</w:t>
             </w:r>
             <w:r>
               <w:t>&amp;</w:t>
             </w:r>
+            <w:proofErr w:type="gramEnd"/>
             <w:r>
               <w:t>FF</w:t>
             </w:r>
@@ -7133,10 +7167,18 @@
       </w:r>
       <w:proofErr w:type="spellEnd"/>
       <w:r>
-        <w:t xml:space="preserve">&gt; (1 byte) Populated for opcodes that </w:t>
-      </w:r>
-      <w:r>
-        <w:t xml:space="preserve">write to </w:t>
+        <w:t xml:space="preserve">&gt; (1 byte) Populated for </w:t>
+      </w:r>
+      <w:proofErr w:type="gramStart"/>
+      <w:r>
+        <w:t xml:space="preserve">opcodes that </w:t>
+      </w:r>
+      <w:r>
+        <w:t>write</w:t>
+      </w:r>
+      <w:proofErr w:type="gramEnd"/>
+      <w:r>
+        <w:t xml:space="preserve"> to </w:t>
       </w:r>
       <w:r>
         <w:t>an address</w:t>
@@ -7159,11 +7201,16 @@
       <w:r>
         <w:t>attempted to be written</w:t>
       </w:r>
+      <w:proofErr w:type="gramStart"/>
       <w:r>
         <w:t>.</w:t>
       </w:r>
       <w:r>
-        <w:t xml:space="preserve"> This includes </w:t>
+        <w:t xml:space="preserve"> </w:t>
+      </w:r>
+      <w:proofErr w:type="gramEnd"/>
+      <w:r>
+        <w:t xml:space="preserve">This includes </w:t>
       </w:r>
       <w:r>
         <w:lastRenderedPageBreak/>
@@ -7204,6 +7251,7 @@
       </w:r>
     </w:p>
     <w:p>
+      <w:proofErr w:type="gramStart"/>
       <w:r>
         <w:t xml:space="preserve">A </w:t>
       </w:r>
@@ -7214,6 +7262,7 @@
         </w:rPr>
         <w:t>.perf</w:t>
       </w:r>
+      <w:proofErr w:type="gramEnd"/>
       <w:r>
         <w:t xml:space="preserve"> </w:t>
       </w:r>
@@ -7289,21 +7338,6 @@
       <w:r>
         <w:t>.</w:t>
       </w:r>
-      <w:r>
-        <w:t xml:space="preserve">  Without compression, the file </w:t>
-      </w:r>
-      <w:r>
-        <w:t xml:space="preserve">would </w:t>
-      </w:r>
-      <w:r>
-        <w:t>be</w:t>
-      </w:r>
-      <w:r>
-        <w:t xml:space="preserve"> </w:t>
-      </w:r>
-      <w:r>
-        <w:t>85MB.</w:t>
-      </w:r>
     </w:p>
     <w:p>
       <w:pPr>
@@ -7318,7 +7352,10 @@
     </w:p>
     <w:p>
       <w:r>
-        <w:t xml:space="preserve">As outlined above, BeebEm will be </w:t>
+        <w:t xml:space="preserve">As outlined above, BeebEm </w:t>
+      </w:r>
+      <w:r>
+        <w:t xml:space="preserve">is </w:t>
       </w:r>
       <w:r>
         <w:t xml:space="preserve">modified </w:t>
@@ -7588,10 +7625,10 @@
         <w:t xml:space="preserve">in </w:t>
       </w:r>
       <w:r>
-        <w:t xml:space="preserve">a </w:t>
-      </w:r>
-      <w:r>
-        <w:t xml:space="preserve">separate </w:t>
+        <w:t>a</w:t>
+      </w:r>
+      <w:r>
+        <w:t xml:space="preserve">nother </w:t>
       </w:r>
       <w:r>
         <w:t>thread</w:t>
@@ -7647,13 +7684,7 @@
         <w:t>write</w:t>
       </w:r>
       <w:r>
-        <w:t xml:space="preserve"> buffer is </w:t>
-      </w:r>
-      <w:r>
-        <w:t xml:space="preserve">almost </w:t>
-      </w:r>
-      <w:r>
-        <w:t>full.</w:t>
+        <w:t xml:space="preserve"> buffer is full.</w:t>
       </w:r>
     </w:p>
     <w:p>
@@ -7716,6 +7747,11 @@
       </w:r>
       <w:r>
         <w:t xml:space="preserve">  Only the first error is reported.</w:t>
+      </w:r>
+    </w:p>
+    <w:p>
+      <w:r>
+        <w:t>Changes to BeebEm were kept to a minimum.</w:t>
       </w:r>
     </w:p>
     <w:p>
@@ -7829,24 +7865,18 @@
         <mc:AlternateContent>
           <mc:Choice Requires="wpg">
             <w:drawing>
-              <wp:anchor distT="0" distB="0" distL="114300" distR="114300" simplePos="0" relativeHeight="251658240" behindDoc="0" locked="0" layoutInCell="1" allowOverlap="1" wp14:anchorId="2B389A22" wp14:editId="735D8117">
+              <wp:anchor distT="0" distB="0" distL="114300" distR="114300" simplePos="0" relativeHeight="251658240" behindDoc="0" locked="0" layoutInCell="1" allowOverlap="1" wp14:anchorId="62CE50C5" wp14:editId="07DDA8B0">
                 <wp:simplePos x="0" y="0"/>
-                <wp:positionH relativeFrom="margin">
-                  <wp:align>left</wp:align>
+                <wp:positionH relativeFrom="column">
+                  <wp:posOffset>0</wp:posOffset>
                 </wp:positionH>
                 <wp:positionV relativeFrom="paragraph">
-                  <wp:posOffset>134931</wp:posOffset>
+                  <wp:posOffset>136406</wp:posOffset>
                 </wp:positionV>
-                <wp:extent cx="6061589" cy="3674533"/>
+                <wp:extent cx="6038661" cy="3674533"/>
                 <wp:effectExtent l="0" t="0" r="0" b="21590"/>
                 <wp:wrapNone/>
-                <wp:docPr id="1717012107" name="Group 19">
-                  <a:extLst xmlns:a="http://schemas.openxmlformats.org/drawingml/2006/main">
-                    <a:ext uri="{FF2B5EF4-FFF2-40B4-BE49-F238E27FC236}">
-                      <a16:creationId xmlns:a16="http://schemas.microsoft.com/office/drawing/2014/main" id="{BB482792-09F2-48AF-AB01-5D474DAA640F}"/>
-                    </a:ext>
-                  </a:extLst>
-                </wp:docPr>
+                <wp:docPr id="1841638691" name="Group 21"/>
                 <wp:cNvGraphicFramePr/>
                 <a:graphic xmlns:a="http://schemas.openxmlformats.org/drawingml/2006/main">
                   <a:graphicData uri="http://schemas.microsoft.com/office/word/2010/wordprocessingGroup">
@@ -7855,708 +7885,226 @@
                       <wpg:grpSpPr>
                         <a:xfrm>
                           <a:off x="0" y="0"/>
-                          <a:ext cx="6061589" cy="3674533"/>
+                          <a:ext cx="6038661" cy="3674533"/>
                           <a:chOff x="0" y="0"/>
-                          <a:chExt cx="6061589" cy="3674533"/>
+                          <a:chExt cx="6038661" cy="3674533"/>
                         </a:xfrm>
                       </wpg:grpSpPr>
                       <wpg:grpSp>
-                        <wpg:cNvPr id="1787519297" name="Group 18"/>
+                        <wpg:cNvPr id="1385966813" name="Group 10"/>
                         <wpg:cNvGrpSpPr/>
                         <wpg:grpSpPr>
                           <a:xfrm>
-                            <a:off x="11197" y="0"/>
-                            <a:ext cx="6050392" cy="3674533"/>
+                            <a:off x="27160" y="0"/>
+                            <a:ext cx="5943600" cy="3674533"/>
                             <a:chOff x="0" y="0"/>
-                            <a:chExt cx="6050392" cy="3674533"/>
+                            <a:chExt cx="5943600" cy="3674533"/>
                           </a:xfrm>
                         </wpg:grpSpPr>
                         <wpg:grpSp>
-                          <wpg:cNvPr id="562276132" name="Group 17"/>
+                          <wpg:cNvPr id="1610245730" name="Group 7"/>
                           <wpg:cNvGrpSpPr/>
                           <wpg:grpSpPr>
                             <a:xfrm>
                               <a:off x="0" y="0"/>
-                              <a:ext cx="6050392" cy="3674533"/>
+                              <a:ext cx="5943600" cy="3674533"/>
                               <a:chOff x="0" y="0"/>
-                              <a:chExt cx="6050392" cy="3674533"/>
+                              <a:chExt cx="5943600" cy="3674533"/>
                             </a:xfrm>
                           </wpg:grpSpPr>
-                          <wpg:grpSp>
-                            <wpg:cNvPr id="286921061" name="Group 16"/>
-                            <wpg:cNvGrpSpPr/>
-                            <wpg:grpSpPr>
-                              <a:xfrm>
-                                <a:off x="18661" y="0"/>
-                                <a:ext cx="5944024" cy="3674533"/>
-                                <a:chOff x="0" y="0"/>
-                                <a:chExt cx="5944024" cy="3674533"/>
-                              </a:xfrm>
-                            </wpg:grpSpPr>
-                            <wpg:grpSp>
-                              <wpg:cNvPr id="431519196" name="Group 10"/>
-                              <wpg:cNvGrpSpPr/>
-                              <wpg:grpSpPr>
-                                <a:xfrm>
-                                  <a:off x="0" y="0"/>
-                                  <a:ext cx="5943600" cy="3674533"/>
-                                  <a:chOff x="0" y="0"/>
-                                  <a:chExt cx="5943600" cy="3674533"/>
-                                </a:xfrm>
-                              </wpg:grpSpPr>
-                              <wpg:grpSp>
-                                <wpg:cNvPr id="344137943" name="Group 7"/>
-                                <wpg:cNvGrpSpPr/>
-                                <wpg:grpSpPr>
-                                  <a:xfrm>
-                                    <a:off x="0" y="0"/>
-                                    <a:ext cx="5943600" cy="3674533"/>
-                                    <a:chOff x="0" y="0"/>
-                                    <a:chExt cx="5943600" cy="3674533"/>
-                                  </a:xfrm>
-                                </wpg:grpSpPr>
-                                <wps:wsp>
-                                  <wps:cNvPr id="1232608364" name="Rectangle 1"/>
-                                  <wps:cNvSpPr/>
-                                  <wps:spPr>
-                                    <a:xfrm>
-                                      <a:off x="0" y="0"/>
-                                      <a:ext cx="5943600" cy="3674533"/>
-                                    </a:xfrm>
-                                    <a:prstGeom prst="rect">
-                                      <a:avLst/>
-                                    </a:prstGeom>
-                                    <a:solidFill>
-                                      <a:schemeClr val="tx2">
-                                        <a:lumMod val="10000"/>
-                                        <a:lumOff val="90000"/>
-                                      </a:schemeClr>
-                                    </a:solidFill>
-                                  </wps:spPr>
-                                  <wps:style>
-                                    <a:lnRef idx="2">
-                                      <a:schemeClr val="accent1">
-                                        <a:shade val="15000"/>
-                                      </a:schemeClr>
-                                    </a:lnRef>
-                                    <a:fillRef idx="1">
-                                      <a:schemeClr val="accent1"/>
-                                    </a:fillRef>
-                                    <a:effectRef idx="0">
-                                      <a:schemeClr val="accent1"/>
-                                    </a:effectRef>
-                                    <a:fontRef idx="minor">
-                                      <a:schemeClr val="lt1"/>
-                                    </a:fontRef>
-                                  </wps:style>
-                                  <wps:bodyPr rot="0" spcFirstLastPara="0" vertOverflow="overflow" horzOverflow="overflow" vert="horz" wrap="square" lIns="91440" tIns="45720" rIns="91440" bIns="45720" numCol="1" spcCol="0" rtlCol="0" fromWordArt="0" anchor="ctr" anchorCtr="0" forceAA="0" compatLnSpc="1">
-                                    <a:prstTxWarp prst="textNoShape">
-                                      <a:avLst/>
-                                    </a:prstTxWarp>
-                                    <a:noAutofit/>
-                                  </wps:bodyPr>
-                                </wps:wsp>
-                                <wps:wsp>
-                                  <wps:cNvPr id="1503023811" name="Rectangle 3"/>
-                                  <wps:cNvSpPr/>
-                                  <wps:spPr>
-                                    <a:xfrm>
-                                      <a:off x="0" y="3337"/>
-                                      <a:ext cx="5943600" cy="139700"/>
-                                    </a:xfrm>
-                                    <a:prstGeom prst="rect">
-                                      <a:avLst/>
-                                    </a:prstGeom>
-                                  </wps:spPr>
-                                  <wps:style>
-                                    <a:lnRef idx="2">
-                                      <a:schemeClr val="accent1">
-                                        <a:shade val="15000"/>
-                                      </a:schemeClr>
-                                    </a:lnRef>
-                                    <a:fillRef idx="1">
-                                      <a:schemeClr val="accent1"/>
-                                    </a:fillRef>
-                                    <a:effectRef idx="0">
-                                      <a:schemeClr val="accent1"/>
-                                    </a:effectRef>
-                                    <a:fontRef idx="minor">
-                                      <a:schemeClr val="lt1"/>
-                                    </a:fontRef>
-                                  </wps:style>
-                                  <wps:bodyPr rot="0" spcFirstLastPara="0" vertOverflow="overflow" horzOverflow="overflow" vert="horz" wrap="square" lIns="91440" tIns="45720" rIns="91440" bIns="45720" numCol="1" spcCol="0" rtlCol="0" fromWordArt="0" anchor="ctr" anchorCtr="0" forceAA="0" compatLnSpc="1">
-                                    <a:prstTxWarp prst="textNoShape">
-                                      <a:avLst/>
-                                    </a:prstTxWarp>
-                                    <a:noAutofit/>
-                                  </wps:bodyPr>
-                                </wps:wsp>
-                                <wps:wsp>
-                                  <wps:cNvPr id="969671648" name="Rectangle 3"/>
-                                  <wps:cNvSpPr/>
-                                  <wps:spPr>
-                                    <a:xfrm>
-                                      <a:off x="0" y="143501"/>
-                                      <a:ext cx="5943600" cy="169333"/>
-                                    </a:xfrm>
-                                    <a:prstGeom prst="rect">
-                                      <a:avLst/>
-                                    </a:prstGeom>
-                                    <a:solidFill>
-                                      <a:schemeClr val="tx2">
-                                        <a:lumMod val="25000"/>
-                                        <a:lumOff val="75000"/>
-                                      </a:schemeClr>
-                                    </a:solidFill>
-                                  </wps:spPr>
-                                  <wps:style>
-                                    <a:lnRef idx="2">
-                                      <a:schemeClr val="accent1">
-                                        <a:shade val="15000"/>
-                                      </a:schemeClr>
-                                    </a:lnRef>
-                                    <a:fillRef idx="1">
-                                      <a:schemeClr val="accent1"/>
-                                    </a:fillRef>
-                                    <a:effectRef idx="0">
-                                      <a:schemeClr val="accent1"/>
-                                    </a:effectRef>
-                                    <a:fontRef idx="minor">
-                                      <a:schemeClr val="lt1"/>
-                                    </a:fontRef>
-                                  </wps:style>
-                                  <wps:bodyPr rot="0" spcFirstLastPara="0" vertOverflow="overflow" horzOverflow="overflow" vert="horz" wrap="square" lIns="91440" tIns="45720" rIns="91440" bIns="45720" numCol="1" spcCol="0" rtlCol="0" fromWordArt="0" anchor="ctr" anchorCtr="0" forceAA="0" compatLnSpc="1">
-                                    <a:prstTxWarp prst="textNoShape">
-                                      <a:avLst/>
-                                    </a:prstTxWarp>
-                                    <a:noAutofit/>
-                                  </wps:bodyPr>
-                                </wps:wsp>
-                                <wps:wsp>
-                                  <wps:cNvPr id="2044510839" name="Rectangle 3"/>
-                                  <wps:cNvSpPr/>
-                                  <wps:spPr>
-                                    <a:xfrm>
-                                      <a:off x="0" y="303688"/>
-                                      <a:ext cx="5943600" cy="520700"/>
-                                    </a:xfrm>
-                                    <a:prstGeom prst="rect">
-                                      <a:avLst/>
-                                    </a:prstGeom>
-                                    <a:solidFill>
-                                      <a:schemeClr val="tx2">
-                                        <a:lumMod val="10000"/>
-                                        <a:lumOff val="90000"/>
-                                      </a:schemeClr>
-                                    </a:solidFill>
-                                  </wps:spPr>
-                                  <wps:style>
-                                    <a:lnRef idx="2">
-                                      <a:schemeClr val="accent1">
-                                        <a:shade val="15000"/>
-                                      </a:schemeClr>
-                                    </a:lnRef>
-                                    <a:fillRef idx="1">
-                                      <a:schemeClr val="accent1"/>
-                                    </a:fillRef>
-                                    <a:effectRef idx="0">
-                                      <a:schemeClr val="accent1"/>
-                                    </a:effectRef>
-                                    <a:fontRef idx="minor">
-                                      <a:schemeClr val="lt1"/>
-                                    </a:fontRef>
-                                  </wps:style>
-                                  <wps:bodyPr rot="0" spcFirstLastPara="0" vertOverflow="overflow" horzOverflow="overflow" vert="horz" wrap="square" lIns="91440" tIns="45720" rIns="91440" bIns="45720" numCol="1" spcCol="0" rtlCol="0" fromWordArt="0" anchor="ctr" anchorCtr="0" forceAA="0" compatLnSpc="1">
-                                    <a:prstTxWarp prst="textNoShape">
-                                      <a:avLst/>
-                                    </a:prstTxWarp>
-                                    <a:noAutofit/>
-                                  </wps:bodyPr>
-                                </wps:wsp>
-                                <wps:wsp>
-                                  <wps:cNvPr id="1570243698" name="Rectangle 3"/>
-                                  <wps:cNvSpPr/>
-                                  <wps:spPr>
-                                    <a:xfrm>
-                                      <a:off x="0" y="810946"/>
-                                      <a:ext cx="5943600" cy="1367367"/>
-                                    </a:xfrm>
-                                    <a:prstGeom prst="rect">
-                                      <a:avLst/>
-                                    </a:prstGeom>
-                                    <a:solidFill>
-                                      <a:schemeClr val="tx2">
-                                        <a:lumMod val="10000"/>
-                                        <a:lumOff val="90000"/>
-                                      </a:schemeClr>
-                                    </a:solidFill>
-                                  </wps:spPr>
-                                  <wps:style>
-                                    <a:lnRef idx="2">
-                                      <a:schemeClr val="accent1">
-                                        <a:shade val="15000"/>
-                                      </a:schemeClr>
-                                    </a:lnRef>
-                                    <a:fillRef idx="1">
-                                      <a:schemeClr val="accent1"/>
-                                    </a:fillRef>
-                                    <a:effectRef idx="0">
-                                      <a:schemeClr val="accent1"/>
-                                    </a:effectRef>
-                                    <a:fontRef idx="minor">
-                                      <a:schemeClr val="lt1"/>
-                                    </a:fontRef>
-                                  </wps:style>
-                                  <wps:bodyPr rot="0" spcFirstLastPara="0" vertOverflow="overflow" horzOverflow="overflow" vert="horz" wrap="square" lIns="91440" tIns="45720" rIns="91440" bIns="45720" numCol="1" spcCol="0" rtlCol="0" fromWordArt="0" anchor="ctr" anchorCtr="0" forceAA="0" compatLnSpc="1">
-                                    <a:prstTxWarp prst="textNoShape">
-                                      <a:avLst/>
-                                    </a:prstTxWarp>
-                                    <a:noAutofit/>
-                                  </wps:bodyPr>
-                                </wps:wsp>
-                              </wpg:grpSp>
-                              <wpg:grpSp>
-                                <wpg:cNvPr id="812835487" name="Group 8"/>
-                                <wpg:cNvGrpSpPr/>
-                                <wpg:grpSpPr>
-                                  <a:xfrm>
-                                    <a:off x="1057275" y="806450"/>
-                                    <a:ext cx="4879646" cy="174152"/>
-                                    <a:chOff x="0" y="0"/>
-                                    <a:chExt cx="4879646" cy="174152"/>
-                                  </a:xfrm>
-                                </wpg:grpSpPr>
-                                <wps:wsp>
-                                  <wps:cNvPr id="164393152" name="Straight Connector 4"/>
-                                  <wps:cNvCnPr/>
-                                  <wps:spPr>
-                                    <a:xfrm flipV="1">
-                                      <a:off x="63500" y="168275"/>
-                                      <a:ext cx="4816146" cy="3337"/>
-                                    </a:xfrm>
-                                    <a:prstGeom prst="line">
-                                      <a:avLst/>
-                                    </a:prstGeom>
-                                  </wps:spPr>
-                                  <wps:style>
-                                    <a:lnRef idx="1">
-                                      <a:schemeClr val="accent1"/>
-                                    </a:lnRef>
-                                    <a:fillRef idx="0">
-                                      <a:schemeClr val="accent1"/>
-                                    </a:fillRef>
-                                    <a:effectRef idx="0">
-                                      <a:schemeClr val="accent1"/>
-                                    </a:effectRef>
-                                    <a:fontRef idx="minor">
-                                      <a:schemeClr val="tx1"/>
-                                    </a:fontRef>
-                                  </wps:style>
-                                  <wps:bodyPr/>
-                                </wps:wsp>
-                                <wps:wsp>
-                                  <wps:cNvPr id="969935161" name="Straight Connector 5"/>
-                                  <wps:cNvCnPr/>
-                                  <wps:spPr>
-                                    <a:xfrm flipH="1" flipV="1">
-                                      <a:off x="0" y="9525"/>
-                                      <a:ext cx="67755" cy="164627"/>
-                                    </a:xfrm>
-                                    <a:prstGeom prst="line">
-                                      <a:avLst/>
-                                    </a:prstGeom>
-                                  </wps:spPr>
-                                  <wps:style>
-                                    <a:lnRef idx="1">
-                                      <a:schemeClr val="accent1"/>
-                                    </a:lnRef>
-                                    <a:fillRef idx="0">
-                                      <a:schemeClr val="accent1"/>
-                                    </a:fillRef>
-                                    <a:effectRef idx="0">
-                                      <a:schemeClr val="accent1"/>
-                                    </a:effectRef>
-                                    <a:fontRef idx="minor">
-                                      <a:schemeClr val="tx1"/>
-                                    </a:fontRef>
-                                  </wps:style>
-                                  <wps:bodyPr/>
-                                </wps:wsp>
-                                <wps:wsp>
-                                  <wps:cNvPr id="737885506" name="Straight Connector 5"/>
-                                  <wps:cNvCnPr/>
-                                  <wps:spPr>
-                                    <a:xfrm flipH="1" flipV="1">
-                                      <a:off x="739775" y="0"/>
-                                      <a:ext cx="67755" cy="164627"/>
-                                    </a:xfrm>
-                                    <a:prstGeom prst="line">
-                                      <a:avLst/>
-                                    </a:prstGeom>
-                                  </wps:spPr>
-                                  <wps:style>
-                                    <a:lnRef idx="1">
-                                      <a:schemeClr val="accent1"/>
-                                    </a:lnRef>
-                                    <a:fillRef idx="0">
-                                      <a:schemeClr val="accent1"/>
-                                    </a:fillRef>
-                                    <a:effectRef idx="0">
-                                      <a:schemeClr val="accent1"/>
-                                    </a:effectRef>
-                                    <a:fontRef idx="minor">
-                                      <a:schemeClr val="tx1"/>
-                                    </a:fontRef>
-                                  </wps:style>
-                                  <wps:bodyPr/>
-                                </wps:wsp>
-                                <wps:wsp>
-                                  <wps:cNvPr id="906959704" name="Straight Connector 5"/>
-                                  <wps:cNvCnPr/>
-                                  <wps:spPr>
-                                    <a:xfrm flipH="1" flipV="1">
-                                      <a:off x="1784350" y="0"/>
-                                      <a:ext cx="67755" cy="164627"/>
-                                    </a:xfrm>
-                                    <a:prstGeom prst="line">
-                                      <a:avLst/>
-                                    </a:prstGeom>
-                                  </wps:spPr>
-                                  <wps:style>
-                                    <a:lnRef idx="1">
-                                      <a:schemeClr val="accent1"/>
-                                    </a:lnRef>
-                                    <a:fillRef idx="0">
-                                      <a:schemeClr val="accent1"/>
-                                    </a:fillRef>
-                                    <a:effectRef idx="0">
-                                      <a:schemeClr val="accent1"/>
-                                    </a:effectRef>
-                                    <a:fontRef idx="minor">
-                                      <a:schemeClr val="tx1"/>
-                                    </a:fontRef>
-                                  </wps:style>
-                                  <wps:bodyPr/>
-                                </wps:wsp>
-                                <wps:wsp>
-                                  <wps:cNvPr id="1495207080" name="Straight Connector 5"/>
-                                  <wps:cNvCnPr/>
-                                  <wps:spPr>
-                                    <a:xfrm flipH="1" flipV="1">
-                                      <a:off x="2486025" y="3175"/>
-                                      <a:ext cx="67755" cy="164627"/>
-                                    </a:xfrm>
-                                    <a:prstGeom prst="line">
-                                      <a:avLst/>
-                                    </a:prstGeom>
-                                  </wps:spPr>
-                                  <wps:style>
-                                    <a:lnRef idx="1">
-                                      <a:schemeClr val="accent1"/>
-                                    </a:lnRef>
-                                    <a:fillRef idx="0">
-                                      <a:schemeClr val="accent1"/>
-                                    </a:fillRef>
-                                    <a:effectRef idx="0">
-                                      <a:schemeClr val="accent1"/>
-                                    </a:effectRef>
-                                    <a:fontRef idx="minor">
-                                      <a:schemeClr val="tx1"/>
-                                    </a:fontRef>
-                                  </wps:style>
-                                  <wps:bodyPr/>
-                                </wps:wsp>
-                                <wps:wsp>
-                                  <wps:cNvPr id="567463839" name="Straight Connector 5"/>
-                                  <wps:cNvCnPr/>
-                                  <wps:spPr>
-                                    <a:xfrm flipH="1" flipV="1">
-                                      <a:off x="3317875" y="0"/>
-                                      <a:ext cx="67755" cy="164627"/>
-                                    </a:xfrm>
-                                    <a:prstGeom prst="line">
-                                      <a:avLst/>
-                                    </a:prstGeom>
-                                  </wps:spPr>
-                                  <wps:style>
-                                    <a:lnRef idx="1">
-                                      <a:schemeClr val="accent1"/>
-                                    </a:lnRef>
-                                    <a:fillRef idx="0">
-                                      <a:schemeClr val="accent1"/>
-                                    </a:fillRef>
-                                    <a:effectRef idx="0">
-                                      <a:schemeClr val="accent1"/>
-                                    </a:effectRef>
-                                    <a:fontRef idx="minor">
-                                      <a:schemeClr val="tx1"/>
-                                    </a:fontRef>
-                                  </wps:style>
-                                  <wps:bodyPr/>
-                                </wps:wsp>
-                                <wps:wsp>
-                                  <wps:cNvPr id="1885987036" name="Straight Connector 5"/>
-                                  <wps:cNvCnPr/>
-                                  <wps:spPr>
-                                    <a:xfrm flipH="1" flipV="1">
-                                      <a:off x="4127500" y="0"/>
-                                      <a:ext cx="67755" cy="164627"/>
-                                    </a:xfrm>
-                                    <a:prstGeom prst="line">
-                                      <a:avLst/>
-                                    </a:prstGeom>
-                                  </wps:spPr>
-                                  <wps:style>
-                                    <a:lnRef idx="1">
-                                      <a:schemeClr val="accent1"/>
-                                    </a:lnRef>
-                                    <a:fillRef idx="0">
-                                      <a:schemeClr val="accent1"/>
-                                    </a:fillRef>
-                                    <a:effectRef idx="0">
-                                      <a:schemeClr val="accent1"/>
-                                    </a:effectRef>
-                                    <a:fontRef idx="minor">
-                                      <a:schemeClr val="tx1"/>
-                                    </a:fontRef>
-                                  </wps:style>
-                                  <wps:bodyPr/>
-                                </wps:wsp>
-                                <wps:wsp>
-                                  <wps:cNvPr id="1906851549" name="Straight Connector 5"/>
-                                  <wps:cNvCnPr/>
-                                  <wps:spPr>
-                                    <a:xfrm flipH="1" flipV="1">
-                                      <a:off x="4797425" y="0"/>
-                                      <a:ext cx="67755" cy="164627"/>
-                                    </a:xfrm>
-                                    <a:prstGeom prst="line">
-                                      <a:avLst/>
-                                    </a:prstGeom>
-                                  </wps:spPr>
-                                  <wps:style>
-                                    <a:lnRef idx="1">
-                                      <a:schemeClr val="accent1"/>
-                                    </a:lnRef>
-                                    <a:fillRef idx="0">
-                                      <a:schemeClr val="accent1"/>
-                                    </a:fillRef>
-                                    <a:effectRef idx="0">
-                                      <a:schemeClr val="accent1"/>
-                                    </a:effectRef>
-                                    <a:fontRef idx="minor">
-                                      <a:schemeClr val="tx1"/>
-                                    </a:fontRef>
-                                  </wps:style>
-                                  <wps:bodyPr/>
-                                </wps:wsp>
-                              </wpg:grpSp>
-                            </wpg:grpSp>
-                            <wpg:grpSp>
-                              <wpg:cNvPr id="1482597288" name="Group 14"/>
-                              <wpg:cNvGrpSpPr/>
-                              <wpg:grpSpPr>
-                                <a:xfrm>
-                                  <a:off x="5382556" y="302877"/>
-                                  <a:ext cx="561468" cy="507170"/>
-                                  <a:chOff x="0" y="0"/>
-                                  <a:chExt cx="582162" cy="511175"/>
-                                </a:xfrm>
-                              </wpg:grpSpPr>
-                              <wps:wsp>
-                                <wps:cNvPr id="713989712" name="Rectangle 3"/>
-                                <wps:cNvSpPr/>
-                                <wps:spPr>
-                                  <a:xfrm>
-                                    <a:off x="0" y="0"/>
-                                    <a:ext cx="582162" cy="511175"/>
-                                  </a:xfrm>
-                                  <a:prstGeom prst="rect">
-                                    <a:avLst/>
-                                  </a:prstGeom>
-                                  <a:solidFill>
-                                    <a:schemeClr val="tx2">
-                                      <a:lumMod val="25000"/>
-                                      <a:lumOff val="75000"/>
-                                    </a:schemeClr>
-                                  </a:solidFill>
-                                </wps:spPr>
-                                <wps:style>
-                                  <a:lnRef idx="2">
-                                    <a:schemeClr val="accent1">
-                                      <a:shade val="15000"/>
-                                    </a:schemeClr>
-                                  </a:lnRef>
-                                  <a:fillRef idx="1">
-                                    <a:schemeClr val="accent1"/>
-                                  </a:fillRef>
-                                  <a:effectRef idx="0">
-                                    <a:schemeClr val="accent1"/>
-                                  </a:effectRef>
-                                  <a:fontRef idx="minor">
-                                    <a:schemeClr val="lt1"/>
-                                  </a:fontRef>
-                                </wps:style>
-                                <wps:bodyPr rot="0" spcFirstLastPara="0" vertOverflow="overflow" horzOverflow="overflow" vert="horz" wrap="square" lIns="91440" tIns="45720" rIns="91440" bIns="45720" numCol="1" spcCol="0" rtlCol="0" fromWordArt="0" anchor="ctr" anchorCtr="0" forceAA="0" compatLnSpc="1">
-                                  <a:prstTxWarp prst="textNoShape">
-                                    <a:avLst/>
-                                  </a:prstTxWarp>
-                                  <a:noAutofit/>
-                                </wps:bodyPr>
-                              </wps:wsp>
-                              <wps:wsp>
-                                <wps:cNvPr id="1990610174" name="Partial Circle 13"/>
-                                <wps:cNvSpPr/>
-                                <wps:spPr>
-                                  <a:xfrm rot="16200000">
-                                    <a:off x="71959" y="52077"/>
-                                    <a:ext cx="446405" cy="436245"/>
-                                  </a:xfrm>
-                                  <a:prstGeom prst="pie">
-                                    <a:avLst>
-                                      <a:gd name="adj1" fmla="val 1497"/>
-                                      <a:gd name="adj2" fmla="val 5338087"/>
-                                    </a:avLst>
-                                  </a:prstGeom>
-                                  <a:solidFill>
-                                    <a:schemeClr val="accent2"/>
-                                  </a:solidFill>
-                                  <a:ln w="6350">
-                                    <a:solidFill>
-                                      <a:schemeClr val="tx1"/>
-                                    </a:solidFill>
-                                  </a:ln>
-                                </wps:spPr>
-                                <wps:style>
-                                  <a:lnRef idx="2">
-                                    <a:schemeClr val="accent1">
-                                      <a:shade val="15000"/>
-                                    </a:schemeClr>
-                                  </a:lnRef>
-                                  <a:fillRef idx="1">
-                                    <a:schemeClr val="accent1"/>
-                                  </a:fillRef>
-                                  <a:effectRef idx="0">
-                                    <a:schemeClr val="accent1"/>
-                                  </a:effectRef>
-                                  <a:fontRef idx="minor">
-                                    <a:schemeClr val="lt1"/>
-                                  </a:fontRef>
-                                </wps:style>
-                                <wps:bodyPr rot="0" spcFirstLastPara="0" vertOverflow="overflow" horzOverflow="overflow" vert="horz" wrap="square" lIns="91440" tIns="45720" rIns="91440" bIns="45720" numCol="1" spcCol="0" rtlCol="0" fromWordArt="0" anchor="ctr" anchorCtr="0" forceAA="0" compatLnSpc="1">
-                                  <a:prstTxWarp prst="textNoShape">
-                                    <a:avLst/>
-                                  </a:prstTxWarp>
-                                  <a:noAutofit/>
-                                </wps:bodyPr>
-                              </wps:wsp>
-                              <wps:wsp>
-                                <wps:cNvPr id="1081596827" name="Partial Circle 13"/>
-                                <wps:cNvSpPr/>
-                                <wps:spPr>
-                                  <a:xfrm>
-                                    <a:off x="70972" y="46153"/>
-                                    <a:ext cx="446405" cy="434340"/>
-                                  </a:xfrm>
-                                  <a:prstGeom prst="pie">
-                                    <a:avLst>
-                                      <a:gd name="adj1" fmla="val 20185875"/>
-                                      <a:gd name="adj2" fmla="val 16200000"/>
-                                    </a:avLst>
-                                  </a:prstGeom>
-                                  <a:solidFill>
-                                    <a:schemeClr val="accent3">
-                                      <a:lumMod val="60000"/>
-                                      <a:lumOff val="40000"/>
-                                    </a:schemeClr>
-                                  </a:solidFill>
-                                  <a:ln w="6350">
-                                    <a:solidFill>
-                                      <a:schemeClr val="tx1"/>
-                                    </a:solidFill>
-                                  </a:ln>
-                                </wps:spPr>
-                                <wps:style>
-                                  <a:lnRef idx="2">
-                                    <a:schemeClr val="accent1">
-                                      <a:shade val="15000"/>
-                                    </a:schemeClr>
-                                  </a:lnRef>
-                                  <a:fillRef idx="1">
-                                    <a:schemeClr val="accent1"/>
-                                  </a:fillRef>
-                                  <a:effectRef idx="0">
-                                    <a:schemeClr val="accent1"/>
-                                  </a:effectRef>
-                                  <a:fontRef idx="minor">
-                                    <a:schemeClr val="lt1"/>
-                                  </a:fontRef>
-                                </wps:style>
-                                <wps:bodyPr rot="0" spcFirstLastPara="0" vertOverflow="overflow" horzOverflow="overflow" vert="horz" wrap="square" lIns="91440" tIns="45720" rIns="91440" bIns="45720" numCol="1" spcCol="0" rtlCol="0" fromWordArt="0" anchor="ctr" anchorCtr="0" forceAA="0" compatLnSpc="1">
-                                  <a:prstTxWarp prst="textNoShape">
-                                    <a:avLst/>
-                                  </a:prstTxWarp>
-                                  <a:noAutofit/>
-                                </wps:bodyPr>
-                              </wps:wsp>
-                            </wpg:grpSp>
-                          </wpg:grpSp>
                           <wps:wsp>
-                            <wps:cNvPr id="948758520" name="Text Box 6"/>
-                            <wps:cNvSpPr txBox="1"/>
+                            <wps:cNvPr id="254528433" name="Rectangle 1"/>
+                            <wps:cNvSpPr/>
                             <wps:spPr>
                               <a:xfrm>
-                                <a:off x="0" y="761378"/>
-                                <a:ext cx="6050392" cy="248077"/>
+                                <a:off x="0" y="0"/>
+                                <a:ext cx="5943600" cy="3674533"/>
                               </a:xfrm>
                               <a:prstGeom prst="rect">
                                 <a:avLst/>
                               </a:prstGeom>
-                              <a:noFill/>
-                              <a:ln w="6350">
-                                <a:noFill/>
-                              </a:ln>
+                              <a:solidFill>
+                                <a:schemeClr val="tx2">
+                                  <a:lumMod val="10000"/>
+                                  <a:lumOff val="90000"/>
+                                </a:schemeClr>
+                              </a:solidFill>
                             </wps:spPr>
-                            <wps:txbx>
-                              <w:txbxContent>
-                                <w:p>
-                                  <w:r>
-                                    <w:t>Hot Routines</w:t>
-                                  </w:r>
-                                  <w:r>
-                                    <w:t xml:space="preserve">       Call Tree   </w:t>
-                                  </w:r>
-                                  <w:r>
-                                    <w:t xml:space="preserve">   </w:t>
-                                  </w:r>
-                                  <w:r>
-                                    <w:t xml:space="preserve">Caller </w:t>
-                                  </w:r>
-                                  <w:r>
-                                    <w:t>\</w:t>
-                                  </w:r>
-                                  <w:r>
-                                    <w:t xml:space="preserve"> Callee </w:t>
-                                  </w:r>
-                                  <w:r>
-                                    <w:t xml:space="preserve">  </w:t>
-                                  </w:r>
-                                  <w:r>
-                                    <w:t xml:space="preserve">Routines </w:t>
-                                  </w:r>
-                                  <w:r>
-                                    <w:t xml:space="preserve">   </w:t>
-                                  </w:r>
-                                  <w:r>
-                                    <w:t>Hot Gr</w:t>
-                                  </w:r>
-                                  <w:r>
-                                    <w:t>aph     Interrupts      Memory</w:t>
-                                  </w:r>
-                                </w:p>
-                              </w:txbxContent>
-                            </wps:txbx>
-                            <wps:bodyPr rot="0" spcFirstLastPara="0" vertOverflow="overflow" horzOverflow="overflow" vert="horz" wrap="square" lIns="91440" tIns="45720" rIns="91440" bIns="45720" numCol="1" spcCol="0" rtlCol="0" fromWordArt="0" anchor="t" anchorCtr="0" forceAA="0" compatLnSpc="1">
+                            <wps:style>
+                              <a:lnRef idx="2">
+                                <a:schemeClr val="accent1">
+                                  <a:shade val="15000"/>
+                                </a:schemeClr>
+                              </a:lnRef>
+                              <a:fillRef idx="1">
+                                <a:schemeClr val="accent1"/>
+                              </a:fillRef>
+                              <a:effectRef idx="0">
+                                <a:schemeClr val="accent1"/>
+                              </a:effectRef>
+                              <a:fontRef idx="minor">
+                                <a:schemeClr val="lt1"/>
+                              </a:fontRef>
+                            </wps:style>
+                            <wps:bodyPr rot="0" spcFirstLastPara="0" vertOverflow="overflow" horzOverflow="overflow" vert="horz" wrap="square" lIns="91440" tIns="45720" rIns="91440" bIns="45720" numCol="1" spcCol="0" rtlCol="0" fromWordArt="0" anchor="ctr" anchorCtr="0" forceAA="0" compatLnSpc="1">
+                              <a:prstTxWarp prst="textNoShape">
+                                <a:avLst/>
+                              </a:prstTxWarp>
+                              <a:noAutofit/>
+                            </wps:bodyPr>
+                          </wps:wsp>
+                          <wps:wsp>
+                            <wps:cNvPr id="433327047" name="Rectangle 3"/>
+                            <wps:cNvSpPr/>
+                            <wps:spPr>
+                              <a:xfrm>
+                                <a:off x="0" y="3337"/>
+                                <a:ext cx="5943600" cy="139700"/>
+                              </a:xfrm>
+                              <a:prstGeom prst="rect">
+                                <a:avLst/>
+                              </a:prstGeom>
+                            </wps:spPr>
+                            <wps:style>
+                              <a:lnRef idx="2">
+                                <a:schemeClr val="accent1">
+                                  <a:shade val="15000"/>
+                                </a:schemeClr>
+                              </a:lnRef>
+                              <a:fillRef idx="1">
+                                <a:schemeClr val="accent1"/>
+                              </a:fillRef>
+                              <a:effectRef idx="0">
+                                <a:schemeClr val="accent1"/>
+                              </a:effectRef>
+                              <a:fontRef idx="minor">
+                                <a:schemeClr val="lt1"/>
+                              </a:fontRef>
+                            </wps:style>
+                            <wps:bodyPr rot="0" spcFirstLastPara="0" vertOverflow="overflow" horzOverflow="overflow" vert="horz" wrap="square" lIns="91440" tIns="45720" rIns="91440" bIns="45720" numCol="1" spcCol="0" rtlCol="0" fromWordArt="0" anchor="ctr" anchorCtr="0" forceAA="0" compatLnSpc="1">
+                              <a:prstTxWarp prst="textNoShape">
+                                <a:avLst/>
+                              </a:prstTxWarp>
+                              <a:noAutofit/>
+                            </wps:bodyPr>
+                          </wps:wsp>
+                          <wps:wsp>
+                            <wps:cNvPr id="900533183" name="Rectangle 3"/>
+                            <wps:cNvSpPr/>
+                            <wps:spPr>
+                              <a:xfrm>
+                                <a:off x="0" y="143501"/>
+                                <a:ext cx="5943600" cy="169333"/>
+                              </a:xfrm>
+                              <a:prstGeom prst="rect">
+                                <a:avLst/>
+                              </a:prstGeom>
+                              <a:solidFill>
+                                <a:schemeClr val="tx2">
+                                  <a:lumMod val="25000"/>
+                                  <a:lumOff val="75000"/>
+                                </a:schemeClr>
+                              </a:solidFill>
+                            </wps:spPr>
+                            <wps:style>
+                              <a:lnRef idx="2">
+                                <a:schemeClr val="accent1">
+                                  <a:shade val="15000"/>
+                                </a:schemeClr>
+                              </a:lnRef>
+                              <a:fillRef idx="1">
+                                <a:schemeClr val="accent1"/>
+                              </a:fillRef>
+                              <a:effectRef idx="0">
+                                <a:schemeClr val="accent1"/>
+                              </a:effectRef>
+                              <a:fontRef idx="minor">
+                                <a:schemeClr val="lt1"/>
+                              </a:fontRef>
+                            </wps:style>
+                            <wps:bodyPr rot="0" spcFirstLastPara="0" vertOverflow="overflow" horzOverflow="overflow" vert="horz" wrap="square" lIns="91440" tIns="45720" rIns="91440" bIns="45720" numCol="1" spcCol="0" rtlCol="0" fromWordArt="0" anchor="ctr" anchorCtr="0" forceAA="0" compatLnSpc="1">
+                              <a:prstTxWarp prst="textNoShape">
+                                <a:avLst/>
+                              </a:prstTxWarp>
+                              <a:noAutofit/>
+                            </wps:bodyPr>
+                          </wps:wsp>
+                          <wps:wsp>
+                            <wps:cNvPr id="494354915" name="Rectangle 3"/>
+                            <wps:cNvSpPr/>
+                            <wps:spPr>
+                              <a:xfrm>
+                                <a:off x="0" y="303688"/>
+                                <a:ext cx="5943600" cy="520700"/>
+                              </a:xfrm>
+                              <a:prstGeom prst="rect">
+                                <a:avLst/>
+                              </a:prstGeom>
+                              <a:solidFill>
+                                <a:schemeClr val="tx2">
+                                  <a:lumMod val="10000"/>
+                                  <a:lumOff val="90000"/>
+                                </a:schemeClr>
+                              </a:solidFill>
+                            </wps:spPr>
+                            <wps:style>
+                              <a:lnRef idx="2">
+                                <a:schemeClr val="accent1">
+                                  <a:shade val="15000"/>
+                                </a:schemeClr>
+                              </a:lnRef>
+                              <a:fillRef idx="1">
+                                <a:schemeClr val="accent1"/>
+                              </a:fillRef>
+                              <a:effectRef idx="0">
+                                <a:schemeClr val="accent1"/>
+                              </a:effectRef>
+                              <a:fontRef idx="minor">
+                                <a:schemeClr val="lt1"/>
+                              </a:fontRef>
+                            </wps:style>
+                            <wps:bodyPr rot="0" spcFirstLastPara="0" vertOverflow="overflow" horzOverflow="overflow" vert="horz" wrap="square" lIns="91440" tIns="45720" rIns="91440" bIns="45720" numCol="1" spcCol="0" rtlCol="0" fromWordArt="0" anchor="ctr" anchorCtr="0" forceAA="0" compatLnSpc="1">
+                              <a:prstTxWarp prst="textNoShape">
+                                <a:avLst/>
+                              </a:prstTxWarp>
+                              <a:noAutofit/>
+                            </wps:bodyPr>
+                          </wps:wsp>
+                          <wps:wsp>
+                            <wps:cNvPr id="761887324" name="Rectangle 3"/>
+                            <wps:cNvSpPr/>
+                            <wps:spPr>
+                              <a:xfrm>
+                                <a:off x="0" y="810946"/>
+                                <a:ext cx="5943600" cy="1367367"/>
+                              </a:xfrm>
+                              <a:prstGeom prst="rect">
+                                <a:avLst/>
+                              </a:prstGeom>
+                              <a:solidFill>
+                                <a:schemeClr val="tx2">
+                                  <a:lumMod val="10000"/>
+                                  <a:lumOff val="90000"/>
+                                </a:schemeClr>
+                              </a:solidFill>
+                            </wps:spPr>
+                            <wps:style>
+                              <a:lnRef idx="2">
+                                <a:schemeClr val="accent1">
+                                  <a:shade val="15000"/>
+                                </a:schemeClr>
+                              </a:lnRef>
+                              <a:fillRef idx="1">
+                                <a:schemeClr val="accent1"/>
+                              </a:fillRef>
+                              <a:effectRef idx="0">
+                                <a:schemeClr val="accent1"/>
+                              </a:effectRef>
+                              <a:fontRef idx="minor">
+                                <a:schemeClr val="lt1"/>
+                              </a:fontRef>
+                            </wps:style>
+                            <wps:bodyPr rot="0" spcFirstLastPara="0" vertOverflow="overflow" horzOverflow="overflow" vert="horz" wrap="square" lIns="91440" tIns="45720" rIns="91440" bIns="45720" numCol="1" spcCol="0" rtlCol="0" fromWordArt="0" anchor="ctr" anchorCtr="0" forceAA="0" compatLnSpc="1">
                               <a:prstTxWarp prst="textNoShape">
                                 <a:avLst/>
                               </a:prstTxWarp>
@@ -8564,45 +8112,290 @@
                             </wps:bodyPr>
                           </wps:wsp>
                         </wpg:grpSp>
-                        <wps:wsp>
-                          <wps:cNvPr id="1727550888" name="Text Box 6"/>
-                          <wps:cNvSpPr txBox="1"/>
-                          <wps:spPr>
+                        <wpg:grpSp>
+                          <wpg:cNvPr id="21405722" name="Group 8"/>
+                          <wpg:cNvGrpSpPr/>
+                          <wpg:grpSpPr>
                             <a:xfrm>
-                              <a:off x="0" y="2164702"/>
-                              <a:ext cx="1206500" cy="244495"/>
+                              <a:off x="713244" y="806450"/>
+                              <a:ext cx="5223253" cy="169125"/>
+                              <a:chOff x="-344031" y="0"/>
+                              <a:chExt cx="5223253" cy="169125"/>
                             </a:xfrm>
-                            <a:prstGeom prst="rect">
-                              <a:avLst/>
-                            </a:prstGeom>
-                            <a:noFill/>
-                            <a:ln w="6350">
-                              <a:noFill/>
-                            </a:ln>
-                          </wps:spPr>
-                          <wps:txbx>
-                            <w:txbxContent>
-                              <w:p>
-                                <w:r>
-                                  <w:t>Code view</w:t>
-                                </w:r>
-                              </w:p>
-                            </w:txbxContent>
-                          </wps:txbx>
-                          <wps:bodyPr rot="0" spcFirstLastPara="0" vertOverflow="overflow" horzOverflow="overflow" vert="horz" wrap="square" lIns="91440" tIns="45720" rIns="91440" bIns="45720" numCol="1" spcCol="0" rtlCol="0" fromWordArt="0" anchor="t" anchorCtr="0" forceAA="0" compatLnSpc="1">
-                            <a:prstTxWarp prst="textNoShape">
-                              <a:avLst/>
-                            </a:prstTxWarp>
-                            <a:noAutofit/>
-                          </wps:bodyPr>
-                        </wps:wsp>
+                          </wpg:grpSpPr>
+                          <wps:wsp>
+                            <wps:cNvPr id="1349684385" name="Straight Connector 4"/>
+                            <wps:cNvCnPr/>
+                            <wps:spPr>
+                              <a:xfrm>
+                                <a:off x="-269623" y="168163"/>
+                                <a:ext cx="5148845" cy="0"/>
+                              </a:xfrm>
+                              <a:prstGeom prst="line">
+                                <a:avLst/>
+                              </a:prstGeom>
+                            </wps:spPr>
+                            <wps:style>
+                              <a:lnRef idx="1">
+                                <a:schemeClr val="accent1"/>
+                              </a:lnRef>
+                              <a:fillRef idx="0">
+                                <a:schemeClr val="accent1"/>
+                              </a:fillRef>
+                              <a:effectRef idx="0">
+                                <a:schemeClr val="accent1"/>
+                              </a:effectRef>
+                              <a:fontRef idx="minor">
+                                <a:schemeClr val="tx1"/>
+                              </a:fontRef>
+                            </wps:style>
+                            <wps:bodyPr/>
+                          </wps:wsp>
+                          <wps:wsp>
+                            <wps:cNvPr id="2125262892" name="Straight Connector 5"/>
+                            <wps:cNvCnPr/>
+                            <wps:spPr>
+                              <a:xfrm flipH="1" flipV="1">
+                                <a:off x="-344031" y="4498"/>
+                                <a:ext cx="67755" cy="164627"/>
+                              </a:xfrm>
+                              <a:prstGeom prst="line">
+                                <a:avLst/>
+                              </a:prstGeom>
+                            </wps:spPr>
+                            <wps:style>
+                              <a:lnRef idx="1">
+                                <a:schemeClr val="accent1"/>
+                              </a:lnRef>
+                              <a:fillRef idx="0">
+                                <a:schemeClr val="accent1"/>
+                              </a:fillRef>
+                              <a:effectRef idx="0">
+                                <a:schemeClr val="accent1"/>
+                              </a:effectRef>
+                              <a:fontRef idx="minor">
+                                <a:schemeClr val="tx1"/>
+                              </a:fontRef>
+                            </wps:style>
+                            <wps:bodyPr/>
+                          </wps:wsp>
+                          <wps:wsp>
+                            <wps:cNvPr id="303276826" name="Straight Connector 5"/>
+                            <wps:cNvCnPr/>
+                            <wps:spPr>
+                              <a:xfrm flipH="1" flipV="1">
+                                <a:off x="766936" y="4498"/>
+                                <a:ext cx="67755" cy="164627"/>
+                              </a:xfrm>
+                              <a:prstGeom prst="line">
+                                <a:avLst/>
+                              </a:prstGeom>
+                            </wps:spPr>
+                            <wps:style>
+                              <a:lnRef idx="1">
+                                <a:schemeClr val="accent1"/>
+                              </a:lnRef>
+                              <a:fillRef idx="0">
+                                <a:schemeClr val="accent1"/>
+                              </a:fillRef>
+                              <a:effectRef idx="0">
+                                <a:schemeClr val="accent1"/>
+                              </a:effectRef>
+                              <a:fontRef idx="minor">
+                                <a:schemeClr val="tx1"/>
+                              </a:fontRef>
+                            </wps:style>
+                            <wps:bodyPr/>
+                          </wps:wsp>
+                          <wps:wsp>
+                            <wps:cNvPr id="1555909986" name="Straight Connector 5"/>
+                            <wps:cNvCnPr/>
+                            <wps:spPr>
+                              <a:xfrm flipH="1" flipV="1">
+                                <a:off x="1476532" y="4498"/>
+                                <a:ext cx="67755" cy="164627"/>
+                              </a:xfrm>
+                              <a:prstGeom prst="line">
+                                <a:avLst/>
+                              </a:prstGeom>
+                            </wps:spPr>
+                            <wps:style>
+                              <a:lnRef idx="1">
+                                <a:schemeClr val="accent1"/>
+                              </a:lnRef>
+                              <a:fillRef idx="0">
+                                <a:schemeClr val="accent1"/>
+                              </a:fillRef>
+                              <a:effectRef idx="0">
+                                <a:schemeClr val="accent1"/>
+                              </a:effectRef>
+                              <a:fontRef idx="minor">
+                                <a:schemeClr val="tx1"/>
+                              </a:fontRef>
+                            </wps:style>
+                            <wps:bodyPr/>
+                          </wps:wsp>
+                          <wps:wsp>
+                            <wps:cNvPr id="1314617253" name="Straight Connector 5"/>
+                            <wps:cNvCnPr/>
+                            <wps:spPr>
+                              <a:xfrm flipH="1" flipV="1">
+                                <a:off x="2495225" y="0"/>
+                                <a:ext cx="67755" cy="164627"/>
+                              </a:xfrm>
+                              <a:prstGeom prst="line">
+                                <a:avLst/>
+                              </a:prstGeom>
+                            </wps:spPr>
+                            <wps:style>
+                              <a:lnRef idx="1">
+                                <a:schemeClr val="accent1"/>
+                              </a:lnRef>
+                              <a:fillRef idx="0">
+                                <a:schemeClr val="accent1"/>
+                              </a:fillRef>
+                              <a:effectRef idx="0">
+                                <a:schemeClr val="accent1"/>
+                              </a:effectRef>
+                              <a:fontRef idx="minor">
+                                <a:schemeClr val="tx1"/>
+                              </a:fontRef>
+                            </wps:style>
+                            <wps:bodyPr/>
+                          </wps:wsp>
+                          <wps:wsp>
+                            <wps:cNvPr id="412244795" name="Straight Connector 5"/>
+                            <wps:cNvCnPr/>
+                            <wps:spPr>
+                              <a:xfrm flipH="1" flipV="1">
+                                <a:off x="3259027" y="0"/>
+                                <a:ext cx="67755" cy="164627"/>
+                              </a:xfrm>
+                              <a:prstGeom prst="line">
+                                <a:avLst/>
+                              </a:prstGeom>
+                            </wps:spPr>
+                            <wps:style>
+                              <a:lnRef idx="1">
+                                <a:schemeClr val="accent1"/>
+                              </a:lnRef>
+                              <a:fillRef idx="0">
+                                <a:schemeClr val="accent1"/>
+                              </a:fillRef>
+                              <a:effectRef idx="0">
+                                <a:schemeClr val="accent1"/>
+                              </a:effectRef>
+                              <a:fontRef idx="minor">
+                                <a:schemeClr val="tx1"/>
+                              </a:fontRef>
+                            </wps:style>
+                            <wps:bodyPr/>
+                          </wps:wsp>
+                        </wpg:grpSp>
                       </wpg:grpSp>
                       <wps:wsp>
-                        <wps:cNvPr id="1978524162" name="Text Box 6"/>
+                        <wps:cNvPr id="607154413" name="Text Box 6"/>
                         <wps:cNvSpPr txBox="1"/>
                         <wps:spPr>
                           <a:xfrm>
-                            <a:off x="0" y="276186"/>
+                            <a:off x="0" y="746910"/>
+                            <a:ext cx="6038661" cy="294238"/>
+                          </a:xfrm>
+                          <a:prstGeom prst="rect">
+                            <a:avLst/>
+                          </a:prstGeom>
+                          <a:noFill/>
+                          <a:ln w="6350">
+                            <a:noFill/>
+                          </a:ln>
+                        </wps:spPr>
+                        <wps:txbx>
+                          <w:txbxContent>
+                            <w:p>
+                              <w:r>
+                                <w:t>Routines</w:t>
+                              </w:r>
+                              <w:r>
+                                <w:t xml:space="preserve">     Caller </w:t>
+                              </w:r>
+                              <w:r>
+                                <w:t>\</w:t>
+                              </w:r>
+                              <w:r>
+                                <w:t xml:space="preserve"> Callee </w:t>
+                              </w:r>
+                              <w:r>
+                                <w:t xml:space="preserve"> </w:t>
+                              </w:r>
+                              <w:r>
+                                <w:t xml:space="preserve">  </w:t>
+                              </w:r>
+                              <w:r>
+                                <w:t xml:space="preserve"> </w:t>
+                              </w:r>
+                              <w:r>
+                                <w:t xml:space="preserve"> Call Tree     Flame </w:t>
+                              </w:r>
+                              <w:r>
+                                <w:t>Gr</w:t>
+                              </w:r>
+                              <w:r>
+                                <w:t xml:space="preserve">aph    </w:t>
+                              </w:r>
+                              <w:r>
+                                <w:t xml:space="preserve"> </w:t>
+                              </w:r>
+                              <w:r>
+                                <w:t>Memory</w:t>
+                              </w:r>
+                            </w:p>
+                          </w:txbxContent>
+                        </wps:txbx>
+                        <wps:bodyPr rot="0" spcFirstLastPara="0" vertOverflow="overflow" horzOverflow="overflow" vert="horz" wrap="square" lIns="91440" tIns="45720" rIns="91440" bIns="45720" numCol="1" spcCol="0" rtlCol="0" fromWordArt="0" anchor="t" anchorCtr="0" forceAA="0" compatLnSpc="1">
+                          <a:prstTxWarp prst="textNoShape">
+                            <a:avLst/>
+                          </a:prstTxWarp>
+                          <a:noAutofit/>
+                        </wps:bodyPr>
+                      </wps:wsp>
+                      <wps:wsp>
+                        <wps:cNvPr id="135055616" name="Text Box 6"/>
+                        <wps:cNvSpPr txBox="1"/>
+                        <wps:spPr>
+                          <a:xfrm>
+                            <a:off x="9053" y="2163778"/>
+                            <a:ext cx="1206500" cy="244495"/>
+                          </a:xfrm>
+                          <a:prstGeom prst="rect">
+                            <a:avLst/>
+                          </a:prstGeom>
+                          <a:noFill/>
+                          <a:ln w="6350">
+                            <a:noFill/>
+                          </a:ln>
+                        </wps:spPr>
+                        <wps:txbx>
+                          <w:txbxContent>
+                            <w:p>
+                              <w:r>
+                                <w:t>Code view</w:t>
+                              </w:r>
+                            </w:p>
+                          </w:txbxContent>
+                        </wps:txbx>
+                        <wps:bodyPr rot="0" spcFirstLastPara="0" vertOverflow="overflow" horzOverflow="overflow" vert="horz" wrap="square" lIns="91440" tIns="45720" rIns="91440" bIns="45720" numCol="1" spcCol="0" rtlCol="0" fromWordArt="0" anchor="t" anchorCtr="0" forceAA="0" compatLnSpc="1">
+                          <a:prstTxWarp prst="textNoShape">
+                            <a:avLst/>
+                          </a:prstTxWarp>
+                          <a:noAutofit/>
+                        </wps:bodyPr>
+                      </wps:wsp>
+                      <wps:wsp>
+                        <wps:cNvPr id="1354423132" name="Text Box 6"/>
+                        <wps:cNvSpPr txBox="1"/>
+                        <wps:spPr>
+                          <a:xfrm>
+                            <a:off x="0" y="276130"/>
                             <a:ext cx="1206500" cy="248077"/>
                           </a:xfrm>
                           <a:prstGeom prst="rect">
@@ -8640,116 +8433,96 @@
           </mc:Choice>
           <mc:Fallback>
             <w:pict>
-              <v:group w14:anchorId="2B389A22" id="Group 19" o:spid="_x0000_s1026" style="position:absolute;margin-left:0;margin-top:10.6pt;width:477.3pt;height:289.35pt;z-index:251658240;mso-position-horizontal:left;mso-position-horizontal-relative:margin" coordsize="60615,36745" o:gfxdata="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">
-                <v:group id="Group 18" o:spid="_x0000_s1027" style="position:absolute;left:111;width:60504;height:36745" coordsize="60503,36745" o:gfxdata="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">
-                  <v:group id="Group 17" o:spid="_x0000_s1028" style="position:absolute;width:60503;height:36745" coordsize="60503,36745" o:gfxdata="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">
-                    <v:group id="Group 16" o:spid="_x0000_s1029" style="position:absolute;left:186;width:59440;height:36745" coordsize="59440,36745" o:gfxdata="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">
-                      <v:group id="Group 10" o:spid="_x0000_s1030" style="position:absolute;width:59436;height:36745" coordsize="59436,36745" o:gfxdata="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">
-                        <v:group id="Group 7" o:spid="_x0000_s1031" style="position:absolute;width:59436;height:36745" coordsize="59436,36745" o:gfxdata="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">
-                          <v:rect id="Rectangle 1" o:spid="_x0000_s1032" style="position:absolute;width:59436;height:36745;visibility:visible;mso-wrap-style:square;v-text-anchor:middle" o:gfxdata="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" fillcolor="#dceaf7 [351]" strokecolor="#030e13 [484]" strokeweight="1pt"/>
-                          <v:rect id="Rectangle 3" o:spid="_x0000_s1033" style="position:absolute;top:33;width:59436;height:1397;visibility:visible;mso-wrap-style:square;v-text-anchor:middle" o:gfxdata="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" fillcolor="#156082 [3204]" strokecolor="#030e13 [484]" strokeweight="1pt"/>
-                          <v:rect id="Rectangle 3" o:spid="_x0000_s1034" style="position:absolute;top:1435;width:59436;height:1693;visibility:visible;mso-wrap-style:square;v-text-anchor:middle" o:gfxdata="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" fillcolor="#a7caec [831]" strokecolor="#030e13 [484]" strokeweight="1pt"/>
-                          <v:rect id="Rectangle 3" o:spid="_x0000_s1035" style="position:absolute;top:3036;width:59436;height:5207;visibility:visible;mso-wrap-style:square;v-text-anchor:middle" o:gfxdata="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" fillcolor="#dceaf7 [351]" strokecolor="#030e13 [484]" strokeweight="1pt"/>
-                          <v:rect id="Rectangle 3" o:spid="_x0000_s1036" style="position:absolute;top:8109;width:59436;height:13674;visibility:visible;mso-wrap-style:square;v-text-anchor:middle" o:gfxdata="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" fillcolor="#dceaf7 [351]" strokecolor="#030e13 [484]" strokeweight="1pt"/>
-                        </v:group>
-                        <v:group id="Group 8" o:spid="_x0000_s1037" style="position:absolute;left:10572;top:8064;width:48797;height:1742" coordsize="48796,1741" o:gfxdata="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">
-                          <v:line id="Straight Connector 4" o:spid="_x0000_s1038" style="position:absolute;flip:y;visibility:visible;mso-wrap-style:square" from="635,1682" to="48796,1716" o:connectortype="straight" o:gfxdata="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" strokecolor="#156082 [3204]" strokeweight=".5pt">
-                            <v:stroke joinstyle="miter"/>
-                          </v:line>
-                          <v:line id="Straight Connector 5" o:spid="_x0000_s1039" style="position:absolute;flip:x y;visibility:visible;mso-wrap-style:square" from="0,95" to="677,1741" o:connectortype="straight" o:gfxdata="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" strokecolor="#156082 [3204]" strokeweight=".5pt">
-                            <v:stroke joinstyle="miter"/>
-                          </v:line>
-                          <v:line id="Straight Connector 5" o:spid="_x0000_s1040" style="position:absolute;flip:x y;visibility:visible;mso-wrap-style:square" from="7397,0" to="8075,1646" o:connectortype="straight" o:gfxdata="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" strokecolor="#156082 [3204]" strokeweight=".5pt">
-                            <v:stroke joinstyle="miter"/>
-                          </v:line>
-                          <v:line id="Straight Connector 5" o:spid="_x0000_s1041" style="position:absolute;flip:x y;visibility:visible;mso-wrap-style:square" from="17843,0" to="18521,1646" o:connectortype="straight" o:gfxdata="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" strokecolor="#156082 [3204]" strokeweight=".5pt">
-                            <v:stroke joinstyle="miter"/>
-                          </v:line>
-                          <v:line id="Straight Connector 5" o:spid="_x0000_s1042" style="position:absolute;flip:x y;visibility:visible;mso-wrap-style:square" from="24860,31" to="25537,1678" o:connectortype="straight" o:gfxdata="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" strokecolor="#156082 [3204]" strokeweight=".5pt">
-                            <v:stroke joinstyle="miter"/>
-                          </v:line>
-                          <v:line id="Straight Connector 5" o:spid="_x0000_s1043" style="position:absolute;flip:x y;visibility:visible;mso-wrap-style:square" from="33178,0" to="33856,1646" o:connectortype="straight" o:gfxdata="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" strokecolor="#156082 [3204]" strokeweight=".5pt">
-                            <v:stroke joinstyle="miter"/>
-                          </v:line>
-                          <v:line id="Straight Connector 5" o:spid="_x0000_s1044" style="position:absolute;flip:x y;visibility:visible;mso-wrap-style:square" from="41275,0" to="41952,1646" o:connectortype="straight" o:gfxdata="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" strokecolor="#156082 [3204]" strokeweight=".5pt">
-                            <v:stroke joinstyle="miter"/>
-                          </v:line>
-                          <v:line id="Straight Connector 5" o:spid="_x0000_s1045" style="position:absolute;flip:x y;visibility:visible;mso-wrap-style:square" from="47974,0" to="48651,1646" o:connectortype="straight" o:gfxdata="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" strokecolor="#156082 [3204]" strokeweight=".5pt">
-                            <v:stroke joinstyle="miter"/>
-                          </v:line>
-                        </v:group>
-                      </v:group>
-                      <v:group id="Group 14" o:spid="_x0000_s1046" style="position:absolute;left:53825;top:3028;width:5615;height:5072" coordsize="5821,5111" o:gfxdata="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">
-                        <v:rect id="Rectangle 3" o:spid="_x0000_s1047" style="position:absolute;width:5821;height:5111;visibility:visible;mso-wrap-style:square;v-text-anchor:middle" o:gfxdata="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" fillcolor="#a7caec [831]" strokecolor="#030e13 [484]" strokeweight="1pt"/>
-                        <v:shape id="Partial Circle 13" o:spid="_x0000_s1048" style="position:absolute;left:718;top:521;width:4465;height:4362;rotation:-90;visibility:visible;mso-wrap-style:square;v-text-anchor:middle" coordsize="446405,436245" o:gfxdata="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" path="m446405,218220v-54,118932,-97592,215899,-219275,217992l223203,218123r223202,97xe" fillcolor="#e97132 [3205]" strokecolor="black [3213]" strokeweight=".5pt">
-                          <v:stroke joinstyle="miter"/>
-                          <v:path arrowok="t" o:connecttype="custom" o:connectlocs="446405,218220;227130,436212;223203,218123;446405,218220" o:connectangles="0,0,0,0"/>
-                        </v:shape>
-                        <v:shape id="Partial Circle 13" o:spid="_x0000_s1049" style="position:absolute;left:709;top:461;width:4464;height:4343;visibility:visible;mso-wrap-style:square;v-text-anchor:middle" coordsize="446405,434340" o:gfxdata="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" path="m426871,128322v41179,89362,15792,194485,-61981,256652c290279,444613,184714,450809,103275,400329,18631,347862,-19613,246881,9801,153521,38545,62289,125129,,223202,v,72390,1,144780,1,217170l426871,128322xe" fillcolor="#47d459 [1942]" strokecolor="black [3213]" strokeweight=".5pt">
-                          <v:stroke joinstyle="miter"/>
-                          <v:path arrowok="t" o:connecttype="custom" o:connectlocs="426871,128322;364890,384974;103275,400329;9801,153521;223202,0;223203,217170;426871,128322" o:connectangles="0,0,0,0,0,0,0"/>
-                        </v:shape>
-                      </v:group>
-                    </v:group>
-                    <v:shapetype id="_x0000_t202" coordsize="21600,21600" o:spt="202" path="m,l,21600r21600,l21600,xe">
+              <v:group w14:anchorId="62CE50C5" id="Group 21" o:spid="_x0000_s1026" style="position:absolute;margin-left:0;margin-top:10.75pt;width:475.5pt;height:289.35pt;z-index:251658240" coordsize="60386,36745" o:gfxdata="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">
+                <v:group id="Group 10" o:spid="_x0000_s1027" style="position:absolute;left:271;width:59436;height:36745" coordsize="59436,36745" o:gfxdata="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">
+                  <v:group id="Group 7" o:spid="_x0000_s1028" style="position:absolute;width:59436;height:36745" coordsize="59436,36745" o:gfxdata="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">
+                    <v:rect id="Rectangle 1" o:spid="_x0000_s1029" style="position:absolute;width:59436;height:36745;visibility:visible;mso-wrap-style:square;v-text-anchor:middle" o:gfxdata="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" fillcolor="#dceaf7 [351]" strokecolor="#030e13 [484]" strokeweight="1pt"/>
+                    <v:rect id="Rectangle 3" o:spid="_x0000_s1030" style="position:absolute;top:33;width:59436;height:1397;visibility:visible;mso-wrap-style:square;v-text-anchor:middle" o:gfxdata="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" fillcolor="#156082 [3204]" strokecolor="#030e13 [484]" strokeweight="1pt"/>
+                    <v:rect id="Rectangle 3" o:spid="_x0000_s1031" style="position:absolute;top:1435;width:59436;height:1693;visibility:visible;mso-wrap-style:square;v-text-anchor:middle" o:gfxdata="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" fillcolor="#a7caec [831]" strokecolor="#030e13 [484]" strokeweight="1pt"/>
+                    <v:rect id="Rectangle 3" o:spid="_x0000_s1032" style="position:absolute;top:3036;width:59436;height:5207;visibility:visible;mso-wrap-style:square;v-text-anchor:middle" o:gfxdata="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" fillcolor="#dceaf7 [351]" strokecolor="#030e13 [484]" strokeweight="1pt"/>
+                    <v:rect id="Rectangle 3" o:spid="_x0000_s1033" style="position:absolute;top:8109;width:59436;height:13674;visibility:visible;mso-wrap-style:square;v-text-anchor:middle" o:gfxdata="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" fillcolor="#dceaf7 [351]" strokecolor="#030e13 [484]" strokeweight="1pt"/>
+                  </v:group>
+                  <v:group id="Group 8" o:spid="_x0000_s1034" style="position:absolute;left:7132;top:8064;width:52232;height:1691" coordorigin="-3440" coordsize="52232,1691" o:gfxdata="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">
+                    <v:line id="Straight Connector 4" o:spid="_x0000_s1035" style="position:absolute;visibility:visible;mso-wrap-style:square" from="-2696,1681" to="48792,1681" o:connectortype="straight" o:gfxdata="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" strokecolor="#156082 [3204]" strokeweight=".5pt">
                       <v:stroke joinstyle="miter"/>
-                      <v:path gradientshapeok="t" o:connecttype="rect"/>
-                    </v:shapetype>
-                    <v:shape id="Text Box 6" o:spid="_x0000_s1050" type="#_x0000_t202" style="position:absolute;top:7613;width:60503;height:2481;visibility:visible;mso-wrap-style:square;v-text-anchor:top" o:gfxdata="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" filled="f" stroked="f" strokeweight=".5pt">
-                      <v:textbox>
-                        <w:txbxContent>
-                          <w:p>
-                            <w:r>
-                              <w:t>Hot Routines</w:t>
-                            </w:r>
-                            <w:r>
-                              <w:t xml:space="preserve">       Call Tree   </w:t>
-                            </w:r>
-                            <w:r>
-                              <w:t xml:space="preserve">   </w:t>
-                            </w:r>
-                            <w:r>
-                              <w:t xml:space="preserve">Caller </w:t>
-                            </w:r>
-                            <w:r>
-                              <w:t>\</w:t>
-                            </w:r>
-                            <w:r>
-                              <w:t xml:space="preserve"> Callee </w:t>
-                            </w:r>
-                            <w:r>
-                              <w:t xml:space="preserve">  </w:t>
-                            </w:r>
-                            <w:r>
-                              <w:t xml:space="preserve">Routines </w:t>
-                            </w:r>
-                            <w:r>
-                              <w:t xml:space="preserve">   </w:t>
-                            </w:r>
-                            <w:r>
-                              <w:t>Hot Gr</w:t>
-                            </w:r>
-                            <w:r>
-                              <w:t>aph     Interrupts      Memory</w:t>
-                            </w:r>
-                          </w:p>
-                        </w:txbxContent>
-                      </v:textbox>
-                    </v:shape>
+                    </v:line>
+                    <v:line id="Straight Connector 5" o:spid="_x0000_s1036" style="position:absolute;flip:x y;visibility:visible;mso-wrap-style:square" from="-3440,44" to="-2762,1691" o:connectortype="straight" o:gfxdata="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" strokecolor="#156082 [3204]" strokeweight=".5pt">
+                      <v:stroke joinstyle="miter"/>
+                    </v:line>
+                    <v:line id="Straight Connector 5" o:spid="_x0000_s1037" style="position:absolute;flip:x y;visibility:visible;mso-wrap-style:square" from="7669,44" to="8346,1691" o:connectortype="straight" o:gfxdata="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" strokecolor="#156082 [3204]" strokeweight=".5pt">
+                      <v:stroke joinstyle="miter"/>
+                    </v:line>
+                    <v:line id="Straight Connector 5" o:spid="_x0000_s1038" style="position:absolute;flip:x y;visibility:visible;mso-wrap-style:square" from="14765,44" to="15442,1691" o:connectortype="straight" o:gfxdata="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" strokecolor="#156082 [3204]" strokeweight=".5pt">
+                      <v:stroke joinstyle="miter"/>
+                    </v:line>
+                    <v:line id="Straight Connector 5" o:spid="_x0000_s1039" style="position:absolute;flip:x y;visibility:visible;mso-wrap-style:square" from="24952,0" to="25629,1646" o:connectortype="straight" o:gfxdata="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" strokecolor="#156082 [3204]" strokeweight=".5pt">
+                      <v:stroke joinstyle="miter"/>
+                    </v:line>
+                    <v:line id="Straight Connector 5" o:spid="_x0000_s1040" style="position:absolute;flip:x y;visibility:visible;mso-wrap-style:square" from="32590,0" to="33267,1646" o:connectortype="straight" o:gfxdata="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" strokecolor="#156082 [3204]" strokeweight=".5pt">
+                      <v:stroke joinstyle="miter"/>
+                    </v:line>
                   </v:group>
-                  <v:shape id="Text Box 6" o:spid="_x0000_s1051" type="#_x0000_t202" style="position:absolute;top:21647;width:12065;height:2444;visibility:visible;mso-wrap-style:square;v-text-anchor:top" o:gfxdata="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" filled="f" stroked="f" strokeweight=".5pt">
-                    <v:textbox>
-                      <w:txbxContent>
-                        <w:p>
-                          <w:r>
-                            <w:t>Code view</w:t>
-                          </w:r>
-                        </w:p>
-                      </w:txbxContent>
-                    </v:textbox>
-                  </v:shape>
                 </v:group>
-                <v:shape id="Text Box 6" o:spid="_x0000_s1052" type="#_x0000_t202" style="position:absolute;top:2761;width:12065;height:2481;visibility:visible;mso-wrap-style:square;v-text-anchor:top" o:gfxdata="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" filled="f" stroked="f" strokeweight=".5pt">
+                <v:shapetype id="_x0000_t202" coordsize="21600,21600" o:spt="202" path="m,l,21600r21600,l21600,xe">
+                  <v:stroke joinstyle="miter"/>
+                  <v:path gradientshapeok="t" o:connecttype="rect"/>
+                </v:shapetype>
+                <v:shape id="Text Box 6" o:spid="_x0000_s1041" type="#_x0000_t202" style="position:absolute;top:7469;width:60386;height:2942;visibility:visible;mso-wrap-style:square;v-text-anchor:top" o:gfxdata="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" filled="f" stroked="f" strokeweight=".5pt">
+                  <v:textbox>
+                    <w:txbxContent>
+                      <w:p>
+                        <w:r>
+                          <w:t>Routines</w:t>
+                        </w:r>
+                        <w:r>
+                          <w:t xml:space="preserve">     Caller </w:t>
+                        </w:r>
+                        <w:r>
+                          <w:t>\</w:t>
+                        </w:r>
+                        <w:r>
+                          <w:t xml:space="preserve"> Callee </w:t>
+                        </w:r>
+                        <w:r>
+                          <w:t xml:space="preserve"> </w:t>
+                        </w:r>
+                        <w:r>
+                          <w:t xml:space="preserve">  </w:t>
+                        </w:r>
+                        <w:r>
+                          <w:t xml:space="preserve"> </w:t>
+                        </w:r>
+                        <w:r>
+                          <w:t xml:space="preserve"> Call Tree     Flame </w:t>
+                        </w:r>
+                        <w:r>
+                          <w:t>Gr</w:t>
+                        </w:r>
+                        <w:r>
+                          <w:t xml:space="preserve">aph    </w:t>
+                        </w:r>
+                        <w:r>
+                          <w:t xml:space="preserve"> </w:t>
+                        </w:r>
+                        <w:r>
+                          <w:t>Memory</w:t>
+                        </w:r>
+                      </w:p>
+                    </w:txbxContent>
+                  </v:textbox>
+                </v:shape>
+                <v:shape id="Text Box 6" o:spid="_x0000_s1042" type="#_x0000_t202" style="position:absolute;left:90;top:21637;width:12065;height:2445;visibility:visible;mso-wrap-style:square;v-text-anchor:top" o:gfxdata="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" filled="f" stroked="f" strokeweight=".5pt">
+                  <v:textbox>
+                    <w:txbxContent>
+                      <w:p>
+                        <w:r>
+                          <w:t>Code view</w:t>
+                        </w:r>
+                      </w:p>
+                    </w:txbxContent>
+                  </v:textbox>
+                </v:shape>
+                <v:shape id="Text Box 6" o:spid="_x0000_s1043" type="#_x0000_t202" style="position:absolute;top:2761;width:12065;height:2481;visibility:visible;mso-wrap-style:square;v-text-anchor:top" o:gfxdata="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" filled="f" stroked="f" strokeweight=".5pt">
                   <v:textbox>
                     <w:txbxContent>
                       <w:p>
@@ -8763,7 +8536,6 @@
                     </w:txbxContent>
                   </v:textbox>
                 </v:shape>
-                <w10:wrap anchorx="margin"/>
               </v:group>
             </w:pict>
           </mc:Fallback>
@@ -8976,13 +8748,7 @@
         <w:t xml:space="preserve">– </w:t>
       </w:r>
       <w:r>
-        <w:t xml:space="preserve">Show a </w:t>
-      </w:r>
-      <w:r>
-        <w:t xml:space="preserve">routine’s </w:t>
-      </w:r>
-      <w:r>
-        <w:t>calling and called routines, showing their relative percentages.  Selecting a calling or called routine makes it the currently selected routine.</w:t>
+        <w:t>Show a routine’s calling and called routines, showing their relative percentages.  Selecting a calling or called routine makes it the currently selected routine.</w:t>
       </w:r>
     </w:p>
     <w:p>
@@ -9406,15 +9172,19 @@
       <w:r>
         <w:t xml:space="preserve">Hexadecimal </w:t>
       </w:r>
+      <w:proofErr w:type="gramStart"/>
       <w:r>
         <w:t>symbol: ‘</w:t>
       </w:r>
+      <w:proofErr w:type="gramEnd"/>
       <w:r>
         <w:t>$</w:t>
       </w:r>
+      <w:proofErr w:type="gramStart"/>
       <w:r>
         <w:t>’, ‘</w:t>
       </w:r>
+      <w:proofErr w:type="gramEnd"/>
       <w:r>
         <w:t>&amp;</w:t>
       </w:r>
@@ -9694,10 +9464,7 @@
         </w:rPr>
       </w:pPr>
       <w:r>
-        <w:t>Selecting a view does not change the selection</w:t>
-      </w:r>
-      <w:r>
-        <w:t xml:space="preserve">, but it may make the </w:t>
+        <w:t xml:space="preserve">Selecting a view does not change the selection, but it may make the </w:t>
       </w:r>
       <w:r>
         <w:t xml:space="preserve">current selected </w:t>
@@ -9737,10 +9504,7 @@
         <w:t xml:space="preserve"> are stored in the undo/redo </w:t>
       </w:r>
       <w:r>
-        <w:t>history</w:t>
-      </w:r>
-      <w:r>
-        <w:t>:</w:t>
+        <w:t>history:</w:t>
       </w:r>
     </w:p>
     <w:p>
@@ -10537,7 +10301,15 @@
         <w:t xml:space="preserve"> – represents a</w:t>
       </w:r>
       <w:r>
-        <w:t xml:space="preserve"> call stack within the recorded program. Contains the following fields:</w:t>
+        <w:t xml:space="preserve"> call stack within the recorded program</w:t>
+      </w:r>
+      <w:proofErr w:type="gramStart"/>
+      <w:r>
+        <w:t xml:space="preserve">. </w:t>
+      </w:r>
+      <w:proofErr w:type="gramEnd"/>
+      <w:r>
+        <w:t>Contains the following fields:</w:t>
       </w:r>
     </w:p>
     <w:p>
@@ -13179,10 +12951,18 @@
         <w:t xml:space="preserve"> (this can be calculated) </w:t>
       </w:r>
       <w:r>
-        <w:t xml:space="preserve">on the </w:t>
-      </w:r>
-      <w:r>
-        <w:t xml:space="preserve">Video </w:t>
+        <w:t xml:space="preserve">on </w:t>
+      </w:r>
+      <w:proofErr w:type="gramStart"/>
+      <w:r>
+        <w:t xml:space="preserve">the </w:t>
+      </w:r>
+      <w:r>
+        <w:t>Video</w:t>
+      </w:r>
+      <w:proofErr w:type="gramEnd"/>
+      <w:r>
+        <w:t xml:space="preserve"> </w:t>
       </w:r>
       <w:r>
         <w:t>6845</w:t>
@@ -13252,7 +13032,15 @@
         </w:numPr>
       </w:pPr>
       <w:r>
-        <w:t>A spin loop is a tight look that doesn’t write anything, it just reads something. They are shown in light grey (background is white).</w:t>
+        <w:t>A spin loop is a tight look that doesn’t write anything, it just reads something</w:t>
+      </w:r>
+      <w:proofErr w:type="gramStart"/>
+      <w:r>
+        <w:t xml:space="preserve">. </w:t>
+      </w:r>
+      <w:proofErr w:type="gramEnd"/>
+      <w:r>
+        <w:t>They are shown in light grey (background is white).</w:t>
       </w:r>
       <w:r>
         <w:t xml:space="preserve">  We are looking for a repeated set of non-instructions in the recording.</w:t>
@@ -13279,7 +13067,15 @@
         </w:numPr>
       </w:pPr>
       <w:r>
-        <w:t>Look for repeating instructions.</w:t>
+        <w:t xml:space="preserve">Look for </w:t>
+      </w:r>
+      <w:proofErr w:type="gramStart"/>
+      <w:r>
+        <w:t>repeating</w:t>
+      </w:r>
+      <w:proofErr w:type="gramEnd"/>
+      <w:r>
+        <w:t xml:space="preserve"> instructions.</w:t>
       </w:r>
     </w:p>
     <w:p>
@@ -13291,7 +13087,15 @@
         </w:numPr>
       </w:pPr>
       <w:r>
-        <w:t>Detecting when screen memory is being read. We need to know.</w:t>
+        <w:t>Detecting when screen memory is being read</w:t>
+      </w:r>
+      <w:proofErr w:type="gramStart"/>
+      <w:r>
+        <w:t xml:space="preserve">. </w:t>
+      </w:r>
+      <w:proofErr w:type="gramEnd"/>
+      <w:r>
+        <w:t>We need to know.</w:t>
       </w:r>
     </w:p>
     <w:p>
@@ -13303,7 +13107,15 @@
         </w:numPr>
       </w:pPr>
       <w:r>
-        <w:t xml:space="preserve">The screen start address.  Write value stored to </w:t>
+        <w:t xml:space="preserve">The screen </w:t>
+      </w:r>
+      <w:proofErr w:type="gramStart"/>
+      <w:r>
+        <w:t>start</w:t>
+      </w:r>
+      <w:proofErr w:type="gramEnd"/>
+      <w:r>
+        <w:t xml:space="preserve"> address.  Write value stored to </w:t>
       </w:r>
       <w:r>
         <w:t>&amp;FE00</w:t>
@@ -13327,7 +13139,15 @@
         </w:numPr>
       </w:pPr>
       <w:r>
-        <w:t xml:space="preserve">The screen wrap-size (how many K). Write value stored to </w:t>
+        <w:t>The screen wrap-size (how many K)</w:t>
+      </w:r>
+      <w:proofErr w:type="gramStart"/>
+      <w:r>
+        <w:t xml:space="preserve">. </w:t>
+      </w:r>
+      <w:proofErr w:type="gramEnd"/>
+      <w:r>
+        <w:t xml:space="preserve">Write value stored to </w:t>
       </w:r>
       <w:r>
         <w:t>&amp;FE40</w:t>
@@ -13342,7 +13162,23 @@
         </w:numPr>
       </w:pPr>
       <w:r>
-        <w:t xml:space="preserve">The screen format (mode-7 verses non mode-7). Write values stored at </w:t>
+        <w:t xml:space="preserve">The screen format (mode-7 verses </w:t>
+      </w:r>
+      <w:proofErr w:type="gramStart"/>
+      <w:r>
+        <w:t>non mode</w:t>
+      </w:r>
+      <w:proofErr w:type="gramEnd"/>
+      <w:r>
+        <w:t>-7)</w:t>
+      </w:r>
+      <w:proofErr w:type="gramStart"/>
+      <w:r>
+        <w:t xml:space="preserve">. </w:t>
+      </w:r>
+      <w:proofErr w:type="gramEnd"/>
+      <w:r>
+        <w:t xml:space="preserve">Write values stored at </w:t>
       </w:r>
       <w:r>
         <w:t>&amp;FE20</w:t>
@@ -13381,13 +13217,45 @@
         </w:numPr>
       </w:pPr>
       <w:r>
-        <w:t>Detecting when the screen read starts.  We need to know when the v-sync interrupt occurs.  We can time it from here.  We can determine this by looking if the values read from &amp;</w:t>
+        <w:t xml:space="preserve">Detecting when the screen read starts.  We need to know when the v-sync </w:t>
+      </w:r>
+      <w:proofErr w:type="gramStart"/>
+      <w:r>
+        <w:t>interrupt</w:t>
+      </w:r>
+      <w:proofErr w:type="gramEnd"/>
+      <w:r>
+        <w:t xml:space="preserve"> occurs.  We can time it from here.  We can determine this by </w:t>
+      </w:r>
+      <w:proofErr w:type="gramStart"/>
+      <w:r>
+        <w:t>looking</w:t>
+      </w:r>
+      <w:proofErr w:type="gramEnd"/>
+      <w:r>
+        <w:t xml:space="preserve"> if the values read from &amp;</w:t>
       </w:r>
       <w:r>
         <w:t>FE4D</w:t>
       </w:r>
       <w:r>
-        <w:t xml:space="preserve"> has bit two set.  The rest is math.</w:t>
+        <w:t xml:space="preserve"> </w:t>
+      </w:r>
+      <w:proofErr w:type="gramStart"/>
+      <w:r>
+        <w:t>has</w:t>
+      </w:r>
+      <w:proofErr w:type="gramEnd"/>
+      <w:r>
+        <w:t xml:space="preserve"> bit two </w:t>
+      </w:r>
+      <w:proofErr w:type="gramStart"/>
+      <w:r>
+        <w:t>set</w:t>
+      </w:r>
+      <w:proofErr w:type="gramEnd"/>
+      <w:r>
+        <w:t>.  The rest is math.</w:t>
       </w:r>
     </w:p>
     <w:p>
@@ -13544,7 +13412,15 @@
         <w:t xml:space="preserve">Any code that </w:t>
       </w:r>
       <w:r>
-        <w:t>results in a function being called, is an implicit function all.</w:t>
+        <w:t xml:space="preserve">results in a function being </w:t>
+      </w:r>
+      <w:proofErr w:type="gramStart"/>
+      <w:r>
+        <w:t>called,</w:t>
+      </w:r>
+      <w:proofErr w:type="gramEnd"/>
+      <w:r>
+        <w:t xml:space="preserve"> is an implicit function all.</w:t>
       </w:r>
       <w:r>
         <w:t xml:space="preserve">  A return that lands on a function is </w:t>
@@ -13700,7 +13576,15 @@
         <w:t xml:space="preserve">Values on the stack can be a combination of return addresses, </w:t>
       </w:r>
       <w:r>
-        <w:t>and other data.  We want to understand what is a return address verses other data.</w:t>
+        <w:t xml:space="preserve">and other data.  We want to understand what </w:t>
+      </w:r>
+      <w:proofErr w:type="gramStart"/>
+      <w:r>
+        <w:t>is a return address verses other data</w:t>
+      </w:r>
+      <w:proofErr w:type="gramEnd"/>
+      <w:r>
+        <w:t>.</w:t>
       </w:r>
     </w:p>
     <w:p>

</xml_diff>

<commit_message>
Rename interrupts tab to memory
</commit_message>
<xml_diff>
--- a/docs/Development.docx
+++ b/docs/Development.docx
@@ -523,7 +523,6 @@
       <w:r>
         <w:t xml:space="preserve">, </w:t>
       </w:r>
-      <w:proofErr w:type="spellStart"/>
       <w:r>
         <w:rPr>
           <w:b/>
@@ -531,7 +530,6 @@
         </w:rPr>
         <w:t>BeebPerf</w:t>
       </w:r>
-      <w:proofErr w:type="spellEnd"/>
       <w:r>
         <w:t>,</w:t>
       </w:r>
@@ -577,7 +575,6 @@
       <w:r>
         <w:t xml:space="preserve">for </w:t>
       </w:r>
-      <w:proofErr w:type="spellStart"/>
       <w:r>
         <w:rPr>
           <w:b/>
@@ -592,7 +589,6 @@
         </w:rPr>
         <w:t>Perf</w:t>
       </w:r>
-      <w:proofErr w:type="spellEnd"/>
       <w:r>
         <w:t xml:space="preserve"> to analyze and </w:t>
       </w:r>
@@ -654,7 +650,6 @@
       <w:r>
         <w:t xml:space="preserve">to decouple </w:t>
       </w:r>
-      <w:proofErr w:type="spellStart"/>
       <w:r>
         <w:rPr>
           <w:b/>
@@ -662,7 +657,6 @@
         </w:rPr>
         <w:t>BeebPerf</w:t>
       </w:r>
-      <w:proofErr w:type="spellEnd"/>
       <w:r>
         <w:t xml:space="preserve"> from </w:t>
       </w:r>
@@ -697,7 +691,6 @@
       <w:r>
         <w:t xml:space="preserve">performance data which </w:t>
       </w:r>
-      <w:proofErr w:type="spellStart"/>
       <w:r>
         <w:rPr>
           <w:b/>
@@ -705,7 +698,6 @@
         </w:rPr>
         <w:t>BeebPerf</w:t>
       </w:r>
-      <w:proofErr w:type="spellEnd"/>
       <w:r>
         <w:t xml:space="preserve"> </w:t>
       </w:r>
@@ -841,7 +833,6 @@
       <w:r>
         <w:t xml:space="preserve"> is modified to generate a .perf file, which </w:t>
       </w:r>
-      <w:proofErr w:type="spellStart"/>
       <w:r>
         <w:rPr>
           <w:b/>
@@ -849,7 +840,6 @@
         </w:rPr>
         <w:t>BeebPerf</w:t>
       </w:r>
-      <w:proofErr w:type="spellEnd"/>
       <w:r>
         <w:t xml:space="preserve"> </w:t>
       </w:r>
@@ -936,7 +926,6 @@
         </w:rPr>
         <w:t>&lt;</w:t>
       </w:r>
-      <w:proofErr w:type="spellStart"/>
       <w:r>
         <w:rPr>
           <w:b/>
@@ -951,7 +940,6 @@
         </w:rPr>
         <w:t>chunk</w:t>
       </w:r>
-      <w:proofErr w:type="spellEnd"/>
       <w:r>
         <w:rPr>
           <w:b/>
@@ -969,7 +957,6 @@
         </w:rPr>
         <w:t>&lt;</w:t>
       </w:r>
-      <w:proofErr w:type="spellStart"/>
       <w:r>
         <w:rPr>
           <w:b/>
@@ -991,7 +978,6 @@
         </w:rPr>
         <w:t>_chunk</w:t>
       </w:r>
-      <w:proofErr w:type="spellEnd"/>
       <w:r>
         <w:rPr>
           <w:b/>
@@ -1020,44 +1006,33 @@
         </w:rPr>
         <w:t>&lt;</w:t>
       </w:r>
-      <w:proofErr w:type="spellStart"/>
       <w:r>
         <w:rPr>
           <w:b/>
           <w:bCs/>
         </w:rPr>
-        <w:t>snapshot_chunk</w:t>
-      </w:r>
-      <w:proofErr w:type="spellEnd"/>
+        <w:t>snapshot_chunk&gt;</w:t>
+      </w:r>
+      <w:r>
+        <w:t xml:space="preserve"> +</w:t>
+      </w:r>
+      <w:r>
+        <w:t xml:space="preserve"> </w:t>
+      </w:r>
       <w:r>
         <w:rPr>
           <w:b/>
           <w:bCs/>
         </w:rPr>
-        <w:t>&gt;</w:t>
-      </w:r>
-      <w:r>
-        <w:t xml:space="preserve"> +</w:t>
-      </w:r>
-      <w:r>
-        <w:t xml:space="preserve"> </w:t>
+        <w:t>&lt;</w:t>
       </w:r>
       <w:r>
         <w:rPr>
           <w:b/>
           <w:bCs/>
         </w:rPr>
-        <w:t>&lt;</w:t>
-      </w:r>
-      <w:proofErr w:type="spellStart"/>
-      <w:r>
-        <w:rPr>
-          <w:b/>
-          <w:bCs/>
-        </w:rPr>
         <w:t>execution_chunk</w:t>
       </w:r>
-      <w:proofErr w:type="spellEnd"/>
       <w:r>
         <w:rPr>
           <w:b/>
@@ -1087,13 +1062,8 @@
       <w:r>
         <w:t xml:space="preserve"> a common header which </w:t>
       </w:r>
-      <w:proofErr w:type="gramStart"/>
-      <w:r>
-        <w:t>proceeds</w:t>
-      </w:r>
-      <w:proofErr w:type="gramEnd"/>
-      <w:r>
-        <w:t xml:space="preserve"> </w:t>
+      <w:r>
+        <w:t xml:space="preserve">proceeds </w:t>
       </w:r>
       <w:r>
         <w:t>its</w:t>
@@ -1257,7 +1227,6 @@
         </w:rPr>
         <w:t>&lt;</w:t>
       </w:r>
-      <w:proofErr w:type="spellStart"/>
       <w:r>
         <w:rPr>
           <w:b/>
@@ -1270,15 +1239,7 @@
           <w:b/>
           <w:bCs/>
         </w:rPr>
-        <w:t>header</w:t>
-      </w:r>
-      <w:proofErr w:type="spellEnd"/>
-      <w:r>
-        <w:rPr>
-          <w:b/>
-          <w:bCs/>
-        </w:rPr>
-        <w:t>&gt;</w:t>
+        <w:t>header&gt;</w:t>
       </w:r>
       <w:r>
         <w:t xml:space="preserve"> = </w:t>
@@ -1289,24 +1250,11 @@
       <w:r>
         <w:t>&lt;tag&gt; + &lt;compression&gt; + &lt;</w:t>
       </w:r>
-      <w:proofErr w:type="spellStart"/>
       <w:r>
         <w:t>original_</w:t>
       </w:r>
       <w:r>
-        <w:t>size</w:t>
-      </w:r>
-      <w:proofErr w:type="spellEnd"/>
-      <w:r>
-        <w:t>&gt; + &lt;</w:t>
-      </w:r>
-      <w:proofErr w:type="spellStart"/>
-      <w:r>
-        <w:t>compressed_size</w:t>
-      </w:r>
-      <w:proofErr w:type="spellEnd"/>
-      <w:r>
-        <w:t>&gt;</w:t>
+        <w:t>size&gt; + &lt;compressed_size&gt;</w:t>
       </w:r>
     </w:p>
     <w:p>
@@ -1433,23 +1381,7 @@
                 <w:rFonts w:ascii="Aptos" w:hAnsi="Aptos"/>
                 <w:color w:val="000000"/>
               </w:rPr>
-              <w:t>‘</w:t>
-            </w:r>
-            <w:proofErr w:type="spellStart"/>
-            <w:r>
-              <w:rPr>
-                <w:rFonts w:ascii="Aptos" w:hAnsi="Aptos"/>
-                <w:color w:val="000000"/>
-              </w:rPr>
-              <w:t>PFhd</w:t>
-            </w:r>
-            <w:proofErr w:type="spellEnd"/>
-            <w:r>
-              <w:rPr>
-                <w:rFonts w:ascii="Aptos" w:hAnsi="Aptos"/>
-                <w:color w:val="000000"/>
-              </w:rPr>
-              <w:t>’</w:t>
+              <w:t>‘PFhd’</w:t>
             </w:r>
           </w:p>
         </w:tc>
@@ -1469,23 +1401,7 @@
                 <w:rFonts w:ascii="Aptos" w:hAnsi="Aptos"/>
                 <w:color w:val="000000"/>
               </w:rPr>
-              <w:t>&lt;</w:t>
-            </w:r>
-            <w:proofErr w:type="spellStart"/>
-            <w:r>
-              <w:rPr>
-                <w:rFonts w:ascii="Aptos" w:hAnsi="Aptos"/>
-                <w:color w:val="000000"/>
-              </w:rPr>
-              <w:t>header_chunk</w:t>
-            </w:r>
-            <w:proofErr w:type="spellEnd"/>
-            <w:r>
-              <w:rPr>
-                <w:rFonts w:ascii="Aptos" w:hAnsi="Aptos"/>
-                <w:color w:val="000000"/>
-              </w:rPr>
-              <w:t>&gt;</w:t>
+              <w:t>&lt;header_chunk&gt;</w:t>
             </w:r>
           </w:p>
         </w:tc>
@@ -1507,23 +1423,7 @@
                 <w:rFonts w:ascii="Aptos" w:hAnsi="Aptos"/>
                 <w:color w:val="000000"/>
               </w:rPr>
-              <w:t>‘</w:t>
-            </w:r>
-            <w:proofErr w:type="spellStart"/>
-            <w:r>
-              <w:rPr>
-                <w:rFonts w:ascii="Aptos" w:hAnsi="Aptos"/>
-                <w:color w:val="000000"/>
-              </w:rPr>
-              <w:t>PFlb</w:t>
-            </w:r>
-            <w:proofErr w:type="spellEnd"/>
-            <w:r>
-              <w:rPr>
-                <w:rFonts w:ascii="Aptos" w:hAnsi="Aptos"/>
-                <w:color w:val="000000"/>
-              </w:rPr>
-              <w:t>’</w:t>
+              <w:t>‘PFlb’</w:t>
             </w:r>
           </w:p>
         </w:tc>
@@ -1539,15 +1439,7 @@
               </w:rPr>
             </w:pPr>
             <w:r>
-              <w:t>&lt;</w:t>
-            </w:r>
-            <w:proofErr w:type="spellStart"/>
-            <w:r>
-              <w:t>labels_chunk</w:t>
-            </w:r>
-            <w:proofErr w:type="spellEnd"/>
-            <w:r>
-              <w:t>&gt;</w:t>
+              <w:t>&lt;labels_chunk&gt;</w:t>
             </w:r>
           </w:p>
         </w:tc>
@@ -1569,23 +1461,7 @@
                 <w:rFonts w:ascii="Aptos" w:hAnsi="Aptos"/>
                 <w:color w:val="000000"/>
               </w:rPr>
-              <w:t>‘</w:t>
-            </w:r>
-            <w:proofErr w:type="spellStart"/>
-            <w:r>
-              <w:rPr>
-                <w:rFonts w:ascii="Aptos" w:hAnsi="Aptos"/>
-                <w:color w:val="000000"/>
-              </w:rPr>
-              <w:t>PFss</w:t>
-            </w:r>
-            <w:proofErr w:type="spellEnd"/>
-            <w:r>
-              <w:rPr>
-                <w:rFonts w:ascii="Aptos" w:hAnsi="Aptos"/>
-                <w:color w:val="000000"/>
-              </w:rPr>
-              <w:t>’</w:t>
+              <w:t>‘PFss’</w:t>
             </w:r>
           </w:p>
         </w:tc>
@@ -1601,15 +1477,7 @@
               </w:rPr>
             </w:pPr>
             <w:r>
-              <w:t>&lt;</w:t>
-            </w:r>
-            <w:proofErr w:type="spellStart"/>
-            <w:r>
-              <w:t>snapshot_chunk</w:t>
-            </w:r>
-            <w:proofErr w:type="spellEnd"/>
-            <w:r>
-              <w:t>&gt;</w:t>
+              <w:t>&lt;snapshot_chunk&gt;</w:t>
             </w:r>
           </w:p>
         </w:tc>
@@ -1631,23 +1499,7 @@
                 <w:rFonts w:ascii="Aptos" w:hAnsi="Aptos"/>
                 <w:color w:val="000000"/>
               </w:rPr>
-              <w:t>‘</w:t>
-            </w:r>
-            <w:proofErr w:type="spellStart"/>
-            <w:r>
-              <w:rPr>
-                <w:rFonts w:ascii="Aptos" w:hAnsi="Aptos"/>
-                <w:color w:val="000000"/>
-              </w:rPr>
-              <w:t>PFex</w:t>
-            </w:r>
-            <w:proofErr w:type="spellEnd"/>
-            <w:r>
-              <w:rPr>
-                <w:rFonts w:ascii="Aptos" w:hAnsi="Aptos"/>
-                <w:color w:val="000000"/>
-              </w:rPr>
-              <w:t>’</w:t>
+              <w:t>‘PFex’</w:t>
             </w:r>
           </w:p>
         </w:tc>
@@ -1663,15 +1515,7 @@
               </w:rPr>
             </w:pPr>
             <w:r>
-              <w:t>&lt;</w:t>
-            </w:r>
-            <w:proofErr w:type="spellStart"/>
-            <w:r>
-              <w:t>execution_chunk</w:t>
-            </w:r>
-            <w:proofErr w:type="spellEnd"/>
-            <w:r>
-              <w:t>&gt;</w:t>
+              <w:t>&lt;execution_chunk&gt;</w:t>
             </w:r>
           </w:p>
         </w:tc>
@@ -1844,13 +1688,8 @@
             <w:tcW w:w="3240" w:type="dxa"/>
           </w:tcPr>
           <w:p>
-            <w:proofErr w:type="spellStart"/>
             <w:r>
-              <w:t>zlib</w:t>
-            </w:r>
-            <w:proofErr w:type="spellEnd"/>
-            <w:r>
-              <w:t xml:space="preserve"> 1.3.1 (default algorithm)</w:t>
+              <w:t>zlib 1.3.1 (default algorithm)</w:t>
             </w:r>
           </w:p>
         </w:tc>
@@ -1866,7 +1705,6 @@
       <w:r>
         <w:t>&lt;</w:t>
       </w:r>
-      <w:proofErr w:type="spellStart"/>
       <w:r>
         <w:t>original</w:t>
       </w:r>
@@ -1876,7 +1714,6 @@
       <w:r>
         <w:t>size</w:t>
       </w:r>
-      <w:proofErr w:type="spellEnd"/>
       <w:r>
         <w:t>&gt;</w:t>
       </w:r>
@@ -1910,16 +1747,11 @@
         <w:ind w:left="360"/>
       </w:pPr>
       <w:r>
-        <w:t>&lt;</w:t>
-      </w:r>
-      <w:proofErr w:type="spellStart"/>
-      <w:r>
-        <w:t>compressed_</w:t>
+        <w:t>&lt;compressed_</w:t>
       </w:r>
       <w:r>
         <w:t>size</w:t>
       </w:r>
-      <w:proofErr w:type="spellEnd"/>
       <w:r>
         <w:t>&gt;</w:t>
       </w:r>
@@ -1947,16 +1779,11 @@
       <w:r>
         <w:t>matches &lt;</w:t>
       </w:r>
-      <w:proofErr w:type="spellStart"/>
       <w:r>
         <w:t>original</w:t>
       </w:r>
       <w:r>
-        <w:t>_size</w:t>
-      </w:r>
-      <w:proofErr w:type="spellEnd"/>
-      <w:r>
-        <w:t>&gt;</w:t>
+        <w:t>_size&gt;</w:t>
       </w:r>
       <w:r>
         <w:t>.</w:t>
@@ -1978,15 +1805,7 @@
         <w:t xml:space="preserve">The header chunk </w:t>
       </w:r>
       <w:r>
-        <w:t xml:space="preserve">is the first chunk in the </w:t>
-      </w:r>
-      <w:proofErr w:type="gramStart"/>
-      <w:r>
-        <w:t>file</w:t>
-      </w:r>
-      <w:proofErr w:type="gramEnd"/>
-      <w:r>
-        <w:t xml:space="preserve"> and </w:t>
+        <w:t xml:space="preserve">is the first chunk in the file and </w:t>
       </w:r>
       <w:r>
         <w:t xml:space="preserve">it </w:t>
@@ -2045,7 +1864,6 @@
         </w:rPr>
         <w:t>&lt;</w:t>
       </w:r>
-      <w:proofErr w:type="spellStart"/>
       <w:r>
         <w:rPr>
           <w:b/>
@@ -2058,27 +1876,14 @@
           <w:b/>
           <w:bCs/>
         </w:rPr>
-        <w:t>_chunk</w:t>
-      </w:r>
-      <w:proofErr w:type="spellEnd"/>
-      <w:r>
-        <w:rPr>
-          <w:b/>
-          <w:bCs/>
-        </w:rPr>
-        <w:t>&gt;</w:t>
+        <w:t>_chunk&gt;</w:t>
       </w:r>
       <w:r>
         <w:t xml:space="preserve"> = </w:t>
       </w:r>
       <w:r>
-        <w:t>&lt;</w:t>
-      </w:r>
-      <w:proofErr w:type="spellStart"/>
-      <w:r>
-        <w:t>common_header</w:t>
-      </w:r>
-      <w:proofErr w:type="spellEnd"/>
+        <w:t>&lt;common_header</w:t>
+      </w:r>
       <w:r>
         <w:t>(</w:t>
       </w:r>
@@ -2089,7 +1894,6 @@
         </w:rPr>
         <w:t>‘</w:t>
       </w:r>
-      <w:proofErr w:type="spellStart"/>
       <w:r>
         <w:rPr>
           <w:rFonts w:ascii="Aptos" w:hAnsi="Aptos"/>
@@ -2097,17 +1901,7 @@
           <w:bCs/>
           <w:color w:val="000000"/>
         </w:rPr>
-        <w:t>PFhd</w:t>
-      </w:r>
-      <w:proofErr w:type="spellEnd"/>
-      <w:r>
-        <w:rPr>
-          <w:rFonts w:ascii="Aptos" w:hAnsi="Aptos"/>
-          <w:b/>
-          <w:bCs/>
-          <w:color w:val="000000"/>
-        </w:rPr>
-        <w:t>’</w:t>
+        <w:t>PFhd’</w:t>
       </w:r>
       <w:r>
         <w:rPr>
@@ -2123,78 +1917,76 @@
         <w:t xml:space="preserve"> + </w:t>
       </w:r>
       <w:r>
+        <w:t>&lt;header_data&gt;</w:t>
+      </w:r>
+      <w:r>
+        <w:t xml:space="preserve"> wher</w:t>
+      </w:r>
+      <w:r>
+        <w:t>e</w:t>
+      </w:r>
+    </w:p>
+    <w:p>
+      <w:pPr>
+        <w:ind w:left="720" w:hanging="360"/>
+      </w:pPr>
+      <w:r>
+        <w:t xml:space="preserve">&lt;header_data&gt; = </w:t>
+      </w:r>
+      <w:r>
+        <w:br/>
+      </w:r>
+      <w:r>
+        <w:t>&lt;major_version&gt; + &lt;minor_version&gt; + &lt;bbc_model&gt; + &lt;</w:t>
+      </w:r>
+      <w:r>
+        <w:t>total_</w:t>
+      </w:r>
+      <w:r>
+        <w:t>execution_count&gt;</w:t>
+      </w:r>
+    </w:p>
+    <w:p>
+      <w:pPr>
+        <w:ind w:left="360"/>
+      </w:pPr>
+      <w:r>
         <w:t>&lt;</w:t>
       </w:r>
-      <w:proofErr w:type="spellStart"/>
-      <w:r>
-        <w:t>header_data</w:t>
-      </w:r>
-      <w:proofErr w:type="spellEnd"/>
-      <w:r>
-        <w:t>&gt;</w:t>
-      </w:r>
-      <w:r>
-        <w:t xml:space="preserve"> wher</w:t>
-      </w:r>
-      <w:r>
-        <w:t>e</w:t>
-      </w:r>
-    </w:p>
-    <w:p>
-      <w:pPr>
-        <w:ind w:left="720" w:hanging="360"/>
+      <w:r>
+        <w:t>major_</w:t>
+      </w:r>
+      <w:r>
+        <w:t>version&gt;</w:t>
+      </w:r>
+      <w:r>
+        <w:t xml:space="preserve"> </w:t>
+      </w:r>
+      <w:r>
+        <w:t>(1 byte) Major version number</w:t>
+      </w:r>
+      <w:r>
+        <w:t>.  Value is 1.</w:t>
+      </w:r>
+    </w:p>
+    <w:p>
+      <w:pPr>
+        <w:ind w:left="360"/>
       </w:pPr>
       <w:r>
         <w:t>&lt;</w:t>
       </w:r>
-      <w:proofErr w:type="spellStart"/>
-      <w:r>
-        <w:t>header_data</w:t>
-      </w:r>
-      <w:proofErr w:type="spellEnd"/>
-      <w:r>
-        <w:t xml:space="preserve">&gt; = </w:t>
-      </w:r>
-      <w:r>
-        <w:br/>
-      </w:r>
-      <w:r>
-        <w:t>&lt;</w:t>
-      </w:r>
-      <w:proofErr w:type="spellStart"/>
-      <w:r>
-        <w:t>major_version</w:t>
-      </w:r>
-      <w:proofErr w:type="spellEnd"/>
-      <w:r>
-        <w:t>&gt; + &lt;</w:t>
-      </w:r>
-      <w:proofErr w:type="spellStart"/>
-      <w:r>
-        <w:t>minor_version</w:t>
-      </w:r>
-      <w:proofErr w:type="spellEnd"/>
-      <w:r>
-        <w:t>&gt; + &lt;</w:t>
-      </w:r>
-      <w:proofErr w:type="spellStart"/>
-      <w:r>
-        <w:t>bbc_model</w:t>
-      </w:r>
-      <w:proofErr w:type="spellEnd"/>
-      <w:r>
-        <w:t>&gt; + &lt;</w:t>
-      </w:r>
-      <w:proofErr w:type="spellStart"/>
-      <w:r>
-        <w:t>total_</w:t>
-      </w:r>
-      <w:r>
-        <w:t>execution_count</w:t>
-      </w:r>
-      <w:proofErr w:type="spellEnd"/>
-      <w:r>
-        <w:t>&gt;</w:t>
+      <w:r>
+        <w:t>minor</w:t>
+      </w:r>
+      <w:r>
+        <w:t>_version&gt; (1 byte) Minor version number</w:t>
+      </w:r>
+      <w:r>
+        <w:t>.  Value is 0</w:t>
+      </w:r>
+      <w:r>
+        <w:t>.</w:t>
       </w:r>
     </w:p>
     <w:p>
@@ -2202,68 +1994,7 @@
         <w:ind w:left="360"/>
       </w:pPr>
       <w:r>
-        <w:t>&lt;</w:t>
-      </w:r>
-      <w:proofErr w:type="spellStart"/>
-      <w:r>
-        <w:t>major_</w:t>
-      </w:r>
-      <w:r>
-        <w:t>version</w:t>
-      </w:r>
-      <w:proofErr w:type="spellEnd"/>
-      <w:r>
-        <w:t>&gt;</w:t>
-      </w:r>
-      <w:r>
-        <w:t xml:space="preserve"> </w:t>
-      </w:r>
-      <w:r>
-        <w:t>(1 byte) Major version number</w:t>
-      </w:r>
-      <w:r>
-        <w:t>.  Value is 1.</w:t>
-      </w:r>
-    </w:p>
-    <w:p>
-      <w:pPr>
-        <w:ind w:left="360"/>
-      </w:pPr>
-      <w:r>
-        <w:t>&lt;</w:t>
-      </w:r>
-      <w:proofErr w:type="spellStart"/>
-      <w:r>
-        <w:t>minor</w:t>
-      </w:r>
-      <w:r>
-        <w:t>_version</w:t>
-      </w:r>
-      <w:proofErr w:type="spellEnd"/>
-      <w:r>
-        <w:t>&gt; (1 byte) Minor version number</w:t>
-      </w:r>
-      <w:r>
-        <w:t>.  Value is 0</w:t>
-      </w:r>
-      <w:r>
-        <w:t>.</w:t>
-      </w:r>
-    </w:p>
-    <w:p>
-      <w:pPr>
-        <w:ind w:left="360"/>
-      </w:pPr>
-      <w:r>
-        <w:t>&lt;</w:t>
-      </w:r>
-      <w:proofErr w:type="spellStart"/>
-      <w:r>
-        <w:t>bbc_model</w:t>
-      </w:r>
-      <w:proofErr w:type="spellEnd"/>
-      <w:r>
-        <w:t>&gt; (1 byte) The BBC model</w:t>
+        <w:t>&lt;bbc_model&gt; (1 byte) The BBC model</w:t>
       </w:r>
     </w:p>
     <w:tbl>
@@ -2691,7 +2422,6 @@
       <w:r>
         <w:t>&lt;</w:t>
       </w:r>
-      <w:proofErr w:type="spellStart"/>
       <w:r>
         <w:t>total_</w:t>
       </w:r>
@@ -2702,11 +2432,7 @@
         <w:t>_</w:t>
       </w:r>
       <w:r>
-        <w:t>count</w:t>
-      </w:r>
-      <w:proofErr w:type="spellEnd"/>
-      <w:r>
-        <w:t xml:space="preserve">&gt; (4 bytes) The total number of </w:t>
+        <w:t xml:space="preserve">count&gt; (4 bytes) The total number of </w:t>
       </w:r>
       <w:r>
         <w:t xml:space="preserve">executed </w:t>
@@ -2761,35 +2487,14 @@
           <w:b/>
           <w:bCs/>
         </w:rPr>
-        <w:t>&lt;</w:t>
-      </w:r>
-      <w:proofErr w:type="spellStart"/>
-      <w:r>
-        <w:rPr>
-          <w:b/>
-          <w:bCs/>
-        </w:rPr>
-        <w:t>labels_chunk</w:t>
-      </w:r>
-      <w:proofErr w:type="spellEnd"/>
-      <w:r>
-        <w:rPr>
-          <w:b/>
-          <w:bCs/>
-        </w:rPr>
-        <w:t>&gt;</w:t>
+        <w:t>&lt;labels_chunk&gt;</w:t>
       </w:r>
       <w:r>
         <w:t xml:space="preserve"> = </w:t>
       </w:r>
       <w:r>
-        <w:t>&lt;</w:t>
-      </w:r>
-      <w:proofErr w:type="spellStart"/>
-      <w:r>
-        <w:t>common_heade</w:t>
-      </w:r>
-      <w:proofErr w:type="spellEnd"/>
+        <w:t>&lt;common_heade</w:t>
+      </w:r>
       <w:r>
         <w:t>(</w:t>
       </w:r>
@@ -2800,7 +2505,6 @@
         </w:rPr>
         <w:t>‘</w:t>
       </w:r>
-      <w:proofErr w:type="spellStart"/>
       <w:r>
         <w:rPr>
           <w:rFonts w:ascii="Aptos" w:hAnsi="Aptos"/>
@@ -2810,7 +2514,6 @@
         </w:rPr>
         <w:t>PFlb</w:t>
       </w:r>
-      <w:proofErr w:type="spellEnd"/>
       <w:r>
         <w:t>’</w:t>
       </w:r>
@@ -2821,16 +2524,11 @@
         <w:t xml:space="preserve">&gt; </w:t>
       </w:r>
       <w:r>
-        <w:t>+ &lt;</w:t>
-      </w:r>
-      <w:proofErr w:type="spellStart"/>
-      <w:r>
-        <w:t>label</w:t>
+        <w:t>+ &lt;label</w:t>
       </w:r>
       <w:r>
         <w:t>_data</w:t>
       </w:r>
-      <w:proofErr w:type="spellEnd"/>
       <w:r>
         <w:t>&gt;</w:t>
       </w:r>
@@ -2843,15 +2541,7 @@
         <w:ind w:left="360"/>
       </w:pPr>
       <w:r>
-        <w:t>&lt;</w:t>
-      </w:r>
-      <w:proofErr w:type="spellStart"/>
-      <w:r>
-        <w:t>label_data</w:t>
-      </w:r>
-      <w:proofErr w:type="spellEnd"/>
-      <w:r>
-        <w:t xml:space="preserve">&gt; = </w:t>
+        <w:t xml:space="preserve">&lt;label_data&gt; = </w:t>
       </w:r>
       <w:r>
         <w:t xml:space="preserve">list of </w:t>
@@ -2872,23 +2562,7 @@
       </w:r>
       <w:bookmarkEnd w:id="0"/>
       <w:r>
-        <w:t>&lt;</w:t>
-      </w:r>
-      <w:proofErr w:type="spellStart"/>
-      <w:r>
-        <w:t>label_address</w:t>
-      </w:r>
-      <w:proofErr w:type="spellEnd"/>
-      <w:r>
-        <w:t>&gt; + &lt;</w:t>
-      </w:r>
-      <w:proofErr w:type="spellStart"/>
-      <w:r>
-        <w:t>label_name</w:t>
-      </w:r>
-      <w:proofErr w:type="spellEnd"/>
-      <w:r>
-        <w:t>&gt;</w:t>
+        <w:t>&lt;label_address&gt; + &lt;label_name&gt;</w:t>
       </w:r>
       <w:r>
         <w:t xml:space="preserve"> </w:t>
@@ -2899,15 +2573,7 @@
         <w:ind w:left="810"/>
       </w:pPr>
       <w:r>
-        <w:t>&lt;</w:t>
-      </w:r>
-      <w:proofErr w:type="spellStart"/>
-      <w:r>
-        <w:t>label_address</w:t>
-      </w:r>
-      <w:proofErr w:type="spellEnd"/>
-      <w:r>
-        <w:t xml:space="preserve">&gt; (2 bytes) </w:t>
+        <w:t xml:space="preserve">&lt;label_address&gt; (2 bytes) </w:t>
       </w:r>
       <w:r>
         <w:t xml:space="preserve">A </w:t>
@@ -3003,7 +2669,6 @@
         </w:rPr>
         <w:t>&lt;</w:t>
       </w:r>
-      <w:proofErr w:type="spellStart"/>
       <w:r>
         <w:rPr>
           <w:b/>
@@ -3016,34 +2681,21 @@
           <w:b/>
           <w:bCs/>
         </w:rPr>
-        <w:t>_chunk</w:t>
-      </w:r>
-      <w:proofErr w:type="spellEnd"/>
+        <w:t>_chunk&gt;</w:t>
+      </w:r>
       <w:r>
         <w:rPr>
           <w:b/>
           <w:bCs/>
         </w:rPr>
-        <w:t>&gt;</w:t>
-      </w:r>
-      <w:r>
-        <w:rPr>
-          <w:b/>
-          <w:bCs/>
-        </w:rPr>
         <w:t xml:space="preserve"> </w:t>
       </w:r>
       <w:r>
-        <w:t>= &lt;</w:t>
-      </w:r>
-      <w:proofErr w:type="spellStart"/>
-      <w:r>
-        <w:t>common_</w:t>
+        <w:t>= &lt;common_</w:t>
       </w:r>
       <w:r>
         <w:t>header</w:t>
       </w:r>
-      <w:proofErr w:type="spellEnd"/>
       <w:r>
         <w:t>(</w:t>
       </w:r>
@@ -3054,7 +2706,6 @@
         </w:rPr>
         <w:t>‘</w:t>
       </w:r>
-      <w:proofErr w:type="spellStart"/>
       <w:r>
         <w:rPr>
           <w:rFonts w:ascii="Aptos" w:hAnsi="Aptos"/>
@@ -3062,45 +2713,27 @@
           <w:bCs/>
           <w:color w:val="000000"/>
         </w:rPr>
-        <w:t>PFss</w:t>
-      </w:r>
-      <w:proofErr w:type="spellEnd"/>
+        <w:t>PFss’</w:t>
+      </w:r>
       <w:r>
         <w:rPr>
           <w:rFonts w:ascii="Aptos" w:hAnsi="Aptos"/>
+          <w:color w:val="000000"/>
+        </w:rPr>
+        <w:t>)</w:t>
+      </w:r>
+      <w:r>
+        <w:t>&gt; +</w:t>
+      </w:r>
+      <w:r>
+        <w:rPr>
           <w:b/>
           <w:bCs/>
-          <w:color w:val="000000"/>
-        </w:rPr>
-        <w:t>’</w:t>
-      </w:r>
-      <w:r>
-        <w:rPr>
-          <w:rFonts w:ascii="Aptos" w:hAnsi="Aptos"/>
-          <w:color w:val="000000"/>
-        </w:rPr>
-        <w:t>)</w:t>
-      </w:r>
-      <w:r>
-        <w:t>&gt; +</w:t>
-      </w:r>
-      <w:r>
-        <w:rPr>
-          <w:b/>
-          <w:bCs/>
         </w:rPr>
         <w:t xml:space="preserve"> </w:t>
       </w:r>
       <w:r>
-        <w:t>&lt;</w:t>
-      </w:r>
-      <w:proofErr w:type="spellStart"/>
-      <w:r>
-        <w:t>snapshot_data</w:t>
-      </w:r>
-      <w:proofErr w:type="spellEnd"/>
-      <w:r>
-        <w:t>&gt;</w:t>
+        <w:t>&lt;snapshot_data&gt;</w:t>
       </w:r>
       <w:r>
         <w:t xml:space="preserve"> where</w:t>
@@ -3111,63 +2744,26 @@
         <w:ind w:left="720" w:hanging="360"/>
       </w:pPr>
       <w:r>
-        <w:t>&lt;</w:t>
-      </w:r>
-      <w:proofErr w:type="spellStart"/>
-      <w:r>
-        <w:t>snapshot_data</w:t>
-      </w:r>
-      <w:proofErr w:type="spellEnd"/>
-      <w:r>
-        <w:t>&gt; =</w:t>
+        <w:t>&lt;snapshot_data&gt; =</w:t>
       </w:r>
       <w:r>
         <w:br/>
-        <w:t>&lt;</w:t>
-      </w:r>
-      <w:proofErr w:type="spellStart"/>
-      <w:r>
-        <w:t>stack_</w:t>
+        <w:t>&lt;stack_</w:t>
       </w:r>
       <w:r>
         <w:t>pointer</w:t>
       </w:r>
-      <w:proofErr w:type="spellEnd"/>
       <w:r>
         <w:t xml:space="preserve">&gt; + </w:t>
       </w:r>
       <w:r>
-        <w:t>&lt;</w:t>
-      </w:r>
-      <w:proofErr w:type="spellStart"/>
-      <w:r>
-        <w:t>rom_paging_register</w:t>
-      </w:r>
-      <w:proofErr w:type="spellEnd"/>
-      <w:r>
-        <w:t>&gt; + &lt;</w:t>
-      </w:r>
-      <w:proofErr w:type="spellStart"/>
-      <w:r>
-        <w:t>acccon</w:t>
-      </w:r>
-      <w:proofErr w:type="spellEnd"/>
-      <w:r>
-        <w:t xml:space="preserve">&gt; + </w:t>
-      </w:r>
-      <w:r>
-        <w:t>&lt;</w:t>
-      </w:r>
-      <w:proofErr w:type="spellStart"/>
-      <w:r>
-        <w:t>hidden_ram_</w:t>
-      </w:r>
-      <w:r>
-        <w:t>address</w:t>
-      </w:r>
-      <w:proofErr w:type="spellEnd"/>
-      <w:r>
-        <w:t>&gt;</w:t>
+        <w:t xml:space="preserve">&lt;rom_paging_register&gt; + &lt;acccon&gt; + </w:t>
+      </w:r>
+      <w:r>
+        <w:t>&lt;hidden_ram_</w:t>
+      </w:r>
+      <w:r>
+        <w:t>address&gt;</w:t>
       </w:r>
       <w:r>
         <w:rPr>
@@ -3181,23 +2777,7 @@
         <w:t xml:space="preserve"> + </w:t>
       </w:r>
       <w:r>
-        <w:t>&lt;6845-registers&gt; + &lt;</w:t>
-      </w:r>
-      <w:proofErr w:type="spellStart"/>
-      <w:r>
-        <w:t>ULA_video_control_register</w:t>
-      </w:r>
-      <w:proofErr w:type="spellEnd"/>
-      <w:r>
-        <w:t>&gt; + &lt;</w:t>
-      </w:r>
-      <w:proofErr w:type="spellStart"/>
-      <w:r>
-        <w:t>ULA_palette</w:t>
-      </w:r>
-      <w:proofErr w:type="spellEnd"/>
-      <w:r>
-        <w:t xml:space="preserve">&gt; + </w:t>
+        <w:t xml:space="preserve">&lt;6845-registers&gt; + &lt;ULA_video_control_register&gt; + &lt;ULA_palette&gt; + </w:t>
       </w:r>
       <w:r>
         <w:t>&lt;memory&gt;</w:t>
@@ -3208,24 +2788,66 @@
         <w:ind w:left="360"/>
       </w:pPr>
       <w:r>
+        <w:t>&lt;stack_</w:t>
+      </w:r>
+      <w:r>
+        <w:t>pointer</w:t>
+      </w:r>
+      <w:r>
+        <w:t xml:space="preserve">&gt; (1 byte).  The value of the stack </w:t>
+      </w:r>
+      <w:r>
+        <w:t>pointer</w:t>
+      </w:r>
+      <w:r>
+        <w:t>, used to interpret the stack.</w:t>
+      </w:r>
+    </w:p>
+    <w:p>
+      <w:pPr>
+        <w:ind w:left="360"/>
+      </w:pPr>
+      <w:r>
         <w:t>&lt;</w:t>
       </w:r>
-      <w:proofErr w:type="spellStart"/>
-      <w:r>
-        <w:t>stack_</w:t>
-      </w:r>
-      <w:r>
-        <w:t>pointer</w:t>
-      </w:r>
-      <w:proofErr w:type="spellEnd"/>
-      <w:r>
-        <w:t xml:space="preserve">&gt; (1 byte).  The value of the stack </w:t>
-      </w:r>
-      <w:r>
-        <w:t>pointer</w:t>
-      </w:r>
-      <w:r>
-        <w:t>, used to interpret the stack.</w:t>
+      <w:r>
+        <w:t>rom_</w:t>
+      </w:r>
+      <w:r>
+        <w:t>pag</w:t>
+      </w:r>
+      <w:r>
+        <w:t>ing</w:t>
+      </w:r>
+      <w:r>
+        <w:t>_register</w:t>
+      </w:r>
+      <w:r>
+        <w:t>&gt; (1 byte).</w:t>
+      </w:r>
+      <w:r>
+        <w:t xml:space="preserve">  The value </w:t>
+      </w:r>
+      <w:r>
+        <w:t>of the ROM paging register</w:t>
+      </w:r>
+      <w:r>
+        <w:t xml:space="preserve"> (</w:t>
+      </w:r>
+      <w:r>
+        <w:t xml:space="preserve">set </w:t>
+      </w:r>
+      <w:r>
+        <w:t xml:space="preserve">via </w:t>
+      </w:r>
+      <w:r>
+        <w:t>SHEILA address &amp;FE30</w:t>
+      </w:r>
+      <w:r>
+        <w:t>)</w:t>
+      </w:r>
+      <w:r>
+        <w:t>.</w:t>
       </w:r>
     </w:p>
     <w:p>
@@ -3235,40 +2857,91 @@
       <w:r>
         <w:t>&lt;</w:t>
       </w:r>
-      <w:proofErr w:type="spellStart"/>
-      <w:r>
-        <w:t>rom_</w:t>
-      </w:r>
-      <w:r>
-        <w:t>pag</w:t>
-      </w:r>
-      <w:r>
-        <w:t>ing</w:t>
-      </w:r>
-      <w:r>
-        <w:t>_register</w:t>
-      </w:r>
-      <w:proofErr w:type="spellEnd"/>
-      <w:r>
-        <w:t>&gt; (1 byte).</w:t>
-      </w:r>
-      <w:r>
-        <w:t xml:space="preserve">  The value </w:t>
-      </w:r>
-      <w:r>
-        <w:t>of the ROM paging register</w:t>
-      </w:r>
-      <w:r>
-        <w:t xml:space="preserve"> (</w:t>
+      <w:r>
+        <w:t>acccon</w:t>
+      </w:r>
+      <w:r>
+        <w:t>&gt;</w:t>
+      </w:r>
+      <w:r>
+        <w:t xml:space="preserve"> (1 byte).</w:t>
+      </w:r>
+      <w:r>
+        <w:t xml:space="preserve">  The value of the access control register</w:t>
+      </w:r>
+      <w:r>
+        <w:t xml:space="preserve"> (set via </w:t>
+      </w:r>
+      <w:r>
+        <w:t xml:space="preserve">SHEILA address </w:t>
+      </w:r>
+      <w:r>
+        <w:t>&amp;FE34</w:t>
+      </w:r>
+      <w:r>
+        <w:t>)</w:t>
+      </w:r>
+      <w:r>
+        <w:t>.</w:t>
+      </w:r>
+    </w:p>
+    <w:p>
+      <w:pPr>
+        <w:ind w:left="360"/>
+      </w:pPr>
+      <w:r>
+        <w:t>&lt;hidden_ram_address&gt; (1 byte)</w:t>
+      </w:r>
+      <w:r>
+        <w:t xml:space="preserve">.  Populated </w:t>
+      </w:r>
+      <w:r>
+        <w:t>for the</w:t>
+      </w:r>
+      <w:r>
+        <w:t xml:space="preserve"> </w:t>
+      </w:r>
+      <w:r>
+        <w:t xml:space="preserve">BBC Model </w:t>
+      </w:r>
+      <w:r>
+        <w:t>B</w:t>
+      </w:r>
+      <w:r>
+        <w:t xml:space="preserve"> </w:t>
+      </w:r>
+      <w:r>
+        <w:t>Integra</w:t>
+      </w:r>
+      <w:r>
+        <w:t xml:space="preserve">.  </w:t>
+      </w:r>
+      <w:r>
+        <w:t xml:space="preserve">The value contains the </w:t>
+      </w:r>
+      <w:r>
+        <w:t xml:space="preserve">hidden memory address </w:t>
+      </w:r>
+      <w:r>
+        <w:t>(</w:t>
       </w:r>
       <w:r>
         <w:t xml:space="preserve">set </w:t>
       </w:r>
       <w:r>
-        <w:t xml:space="preserve">via </w:t>
-      </w:r>
-      <w:r>
-        <w:t>SHEILA address &amp;FE30</w:t>
+        <w:t>vi</w:t>
+      </w:r>
+      <w:r>
+        <w:t>a</w:t>
+      </w:r>
+      <w:r>
+        <w:t xml:space="preserve"> </w:t>
+      </w:r>
+      <w:r>
+        <w:t xml:space="preserve">SHEILA address </w:t>
+      </w:r>
+      <w:r>
+        <w:t>&amp;FE38</w:t>
       </w:r>
       <w:r>
         <w:t>)</w:t>
@@ -3276,42 +2949,43 @@
       <w:r>
         <w:t>.</w:t>
       </w:r>
+      <w:r>
+        <w:t xml:space="preserve">  Read</w:t>
+      </w:r>
+      <w:r>
+        <w:t>s</w:t>
+      </w:r>
+      <w:r>
+        <w:t xml:space="preserve"> and writes to SHEILA address </w:t>
+      </w:r>
+      <w:r>
+        <w:t>&amp;</w:t>
+      </w:r>
+      <w:r>
+        <w:t xml:space="preserve">FE3C </w:t>
+      </w:r>
+      <w:r>
+        <w:t xml:space="preserve">access </w:t>
+      </w:r>
+      <w:r>
+        <w:t xml:space="preserve">this </w:t>
+      </w:r>
+      <w:r>
+        <w:t xml:space="preserve">hidden </w:t>
+      </w:r>
+      <w:r>
+        <w:t>address</w:t>
+      </w:r>
+      <w:r>
+        <w:t>.</w:t>
+      </w:r>
     </w:p>
     <w:p>
       <w:pPr>
         <w:ind w:left="360"/>
       </w:pPr>
       <w:r>
-        <w:t>&lt;</w:t>
-      </w:r>
-      <w:proofErr w:type="spellStart"/>
-      <w:r>
-        <w:t>acccon</w:t>
-      </w:r>
-      <w:proofErr w:type="spellEnd"/>
-      <w:r>
-        <w:t>&gt;</w:t>
-      </w:r>
-      <w:r>
-        <w:t xml:space="preserve"> (1 byte).</w:t>
-      </w:r>
-      <w:r>
-        <w:t xml:space="preserve">  The value of the access control register</w:t>
-      </w:r>
-      <w:r>
-        <w:t xml:space="preserve"> (set via </w:t>
-      </w:r>
-      <w:r>
-        <w:t xml:space="preserve">SHEILA address </w:t>
-      </w:r>
-      <w:r>
-        <w:t>&amp;FE34</w:t>
-      </w:r>
-      <w:r>
-        <w:t>)</w:t>
-      </w:r>
-      <w:r>
-        <w:t>.</w:t>
+        <w:t>&lt;ULA_video_control_register&gt; (1 byte).  The value of the ULA video control register.</w:t>
       </w:r>
     </w:p>
     <w:p>
@@ -3319,134 +2993,7 @@
         <w:ind w:left="360"/>
       </w:pPr>
       <w:r>
-        <w:t>&lt;</w:t>
-      </w:r>
-      <w:proofErr w:type="spellStart"/>
-      <w:r>
-        <w:t>hidden_ram_address</w:t>
-      </w:r>
-      <w:proofErr w:type="spellEnd"/>
-      <w:r>
-        <w:t>&gt; (1 byte)</w:t>
-      </w:r>
-      <w:r>
-        <w:t xml:space="preserve">.  Populated </w:t>
-      </w:r>
-      <w:r>
-        <w:t>for the</w:t>
-      </w:r>
-      <w:r>
-        <w:t xml:space="preserve"> </w:t>
-      </w:r>
-      <w:r>
-        <w:t xml:space="preserve">BBC Model </w:t>
-      </w:r>
-      <w:r>
-        <w:t>B</w:t>
-      </w:r>
-      <w:r>
-        <w:t xml:space="preserve"> </w:t>
-      </w:r>
-      <w:r>
-        <w:t>Integra</w:t>
-      </w:r>
-      <w:r>
-        <w:t xml:space="preserve">.  </w:t>
-      </w:r>
-      <w:r>
-        <w:t xml:space="preserve">The value contains the </w:t>
-      </w:r>
-      <w:r>
-        <w:t xml:space="preserve">hidden memory address </w:t>
-      </w:r>
-      <w:r>
-        <w:t>(</w:t>
-      </w:r>
-      <w:r>
-        <w:t xml:space="preserve">set </w:t>
-      </w:r>
-      <w:r>
-        <w:t>vi</w:t>
-      </w:r>
-      <w:r>
-        <w:t>a</w:t>
-      </w:r>
-      <w:r>
-        <w:t xml:space="preserve"> </w:t>
-      </w:r>
-      <w:r>
-        <w:t xml:space="preserve">SHEILA address </w:t>
-      </w:r>
-      <w:r>
-        <w:t>&amp;FE38</w:t>
-      </w:r>
-      <w:r>
-        <w:t>)</w:t>
-      </w:r>
-      <w:r>
-        <w:t>.</w:t>
-      </w:r>
-      <w:r>
-        <w:t xml:space="preserve">  Read</w:t>
-      </w:r>
-      <w:r>
-        <w:t>s</w:t>
-      </w:r>
-      <w:r>
-        <w:t xml:space="preserve"> and writes to SHEILA address </w:t>
-      </w:r>
-      <w:r>
-        <w:t>&amp;</w:t>
-      </w:r>
-      <w:r>
-        <w:t xml:space="preserve">FE3C </w:t>
-      </w:r>
-      <w:r>
-        <w:t xml:space="preserve">access </w:t>
-      </w:r>
-      <w:r>
-        <w:t xml:space="preserve">this </w:t>
-      </w:r>
-      <w:r>
-        <w:t xml:space="preserve">hidden </w:t>
-      </w:r>
-      <w:r>
-        <w:t>address</w:t>
-      </w:r>
-      <w:r>
-        <w:t>.</w:t>
-      </w:r>
-    </w:p>
-    <w:p>
-      <w:pPr>
-        <w:ind w:left="360"/>
-      </w:pPr>
-      <w:r>
-        <w:t>&lt;</w:t>
-      </w:r>
-      <w:proofErr w:type="spellStart"/>
-      <w:r>
-        <w:t>ULA_video_control_register</w:t>
-      </w:r>
-      <w:proofErr w:type="spellEnd"/>
-      <w:r>
-        <w:t>&gt; (1 byte).  The value of the ULA video control register.</w:t>
-      </w:r>
-    </w:p>
-    <w:p>
-      <w:pPr>
-        <w:ind w:left="360"/>
-      </w:pPr>
-      <w:r>
-        <w:t>&lt;</w:t>
-      </w:r>
-      <w:proofErr w:type="spellStart"/>
-      <w:r>
-        <w:t>ULA_palette</w:t>
-      </w:r>
-      <w:proofErr w:type="spellEnd"/>
-      <w:r>
-        <w:t xml:space="preserve">&gt; (16 bytes).  The </w:t>
+        <w:t xml:space="preserve">&lt;ULA_palette&gt; (16 bytes).  The </w:t>
       </w:r>
       <w:r>
         <w:t xml:space="preserve">ULA’s </w:t>
@@ -3504,38 +3051,20 @@
       <w:r>
         <w:t>&lt;</w:t>
       </w:r>
-      <w:proofErr w:type="spellStart"/>
       <w:r>
         <w:t>base_</w:t>
       </w:r>
       <w:r>
+        <w:t>memory&gt; + &lt;paged_</w:t>
+      </w:r>
+      <w:r>
         <w:t>memory</w:t>
       </w:r>
-      <w:proofErr w:type="spellEnd"/>
-      <w:r>
-        <w:t>&gt; + &lt;</w:t>
-      </w:r>
-      <w:proofErr w:type="spellStart"/>
-      <w:r>
-        <w:t>paged_</w:t>
-      </w:r>
-      <w:r>
-        <w:t>memory</w:t>
-      </w:r>
-      <w:proofErr w:type="spellEnd"/>
       <w:r>
         <w:t xml:space="preserve">&gt; </w:t>
       </w:r>
       <w:r>
-        <w:t>+ &lt;</w:t>
-      </w:r>
-      <w:proofErr w:type="spellStart"/>
-      <w:r>
-        <w:t>shadow_ram</w:t>
-      </w:r>
-      <w:proofErr w:type="spellEnd"/>
-      <w:r>
-        <w:t>&gt;</w:t>
+        <w:t>+ &lt;shadow_ram&gt;</w:t>
       </w:r>
       <w:r>
         <w:rPr>
@@ -3549,15 +3078,7 @@
         <w:t xml:space="preserve"> + </w:t>
       </w:r>
       <w:r>
-        <w:t>&lt;</w:t>
-      </w:r>
-      <w:proofErr w:type="spellStart"/>
-      <w:r>
-        <w:t>mos_ram</w:t>
-      </w:r>
-      <w:proofErr w:type="spellEnd"/>
-      <w:r>
-        <w:t>&gt;</w:t>
+        <w:t>&lt;mos_ram&gt;</w:t>
       </w:r>
       <w:r>
         <w:rPr>
@@ -3579,15 +3100,7 @@
         <w:t xml:space="preserve"> + </w:t>
       </w:r>
       <w:r>
-        <w:t>&lt;</w:t>
-      </w:r>
-      <w:proofErr w:type="spellStart"/>
-      <w:r>
-        <w:t>filing_system_ram</w:t>
-      </w:r>
-      <w:proofErr w:type="spellEnd"/>
-      <w:r>
-        <w:t>&gt;</w:t>
+        <w:t>&lt;filing_system_ram&gt;</w:t>
       </w:r>
       <w:r>
         <w:rPr>
@@ -3601,15 +3114,7 @@
         <w:t xml:space="preserve"> +</w:t>
       </w:r>
       <w:r>
-        <w:t xml:space="preserve"> &lt;</w:t>
-      </w:r>
-      <w:proofErr w:type="spellStart"/>
-      <w:r>
-        <w:t>private_ram</w:t>
-      </w:r>
-      <w:proofErr w:type="spellEnd"/>
-      <w:r>
-        <w:t>&gt;</w:t>
+        <w:t xml:space="preserve"> &lt;private_ram&gt;</w:t>
       </w:r>
       <w:r>
         <w:rPr>
@@ -3620,15 +3125,7 @@
         <w:t>opt</w:t>
       </w:r>
       <w:r>
-        <w:t xml:space="preserve"> + &lt;</w:t>
-      </w:r>
-      <w:proofErr w:type="spellStart"/>
-      <w:r>
-        <w:t>hidden_ram</w:t>
-      </w:r>
-      <w:proofErr w:type="spellEnd"/>
-      <w:r>
-        <w:t>&gt;</w:t>
+        <w:t xml:space="preserve"> + &lt;hidden_ram&gt;</w:t>
       </w:r>
       <w:r>
         <w:rPr>
@@ -3810,15 +3307,7 @@
               <w:ind w:left="1440" w:hanging="1440"/>
             </w:pPr>
             <w:r>
-              <w:t>&lt;</w:t>
-            </w:r>
-            <w:proofErr w:type="spellStart"/>
-            <w:r>
-              <w:t>base_memory</w:t>
-            </w:r>
-            <w:proofErr w:type="spellEnd"/>
-            <w:r>
-              <w:t>&gt;</w:t>
+              <w:t>&lt;base_memory&gt;</w:t>
             </w:r>
           </w:p>
         </w:tc>
@@ -3891,13 +3380,8 @@
             <w:r>
               <w:t>&lt;</w:t>
             </w:r>
-            <w:proofErr w:type="spellStart"/>
             <w:r>
-              <w:t>paged_memory</w:t>
-            </w:r>
-            <w:proofErr w:type="spellEnd"/>
-            <w:r>
-              <w:t>&gt;</w:t>
+              <w:t>paged_memory&gt;</w:t>
             </w:r>
           </w:p>
         </w:tc>
@@ -3968,15 +3452,7 @@
           </w:tcPr>
           <w:p>
             <w:r>
-              <w:t>&lt;</w:t>
-            </w:r>
-            <w:proofErr w:type="spellStart"/>
-            <w:r>
-              <w:t>shadow_ram</w:t>
-            </w:r>
-            <w:proofErr w:type="spellEnd"/>
-            <w:r>
-              <w:t>&gt;</w:t>
+              <w:t>&lt;shadow_ram&gt;</w:t>
             </w:r>
           </w:p>
         </w:tc>
@@ -4040,15 +3516,7 @@
           </w:tcPr>
           <w:p>
             <w:r>
-              <w:t>&lt;</w:t>
-            </w:r>
-            <w:proofErr w:type="spellStart"/>
-            <w:r>
-              <w:t>mos_ram</w:t>
-            </w:r>
-            <w:proofErr w:type="spellEnd"/>
-            <w:r>
-              <w:t>&gt;</w:t>
+              <w:t>&lt;mos_ram&gt;</w:t>
             </w:r>
           </w:p>
         </w:tc>
@@ -4103,15 +3571,7 @@
           </w:tcPr>
           <w:p>
             <w:r>
-              <w:t>&lt;</w:t>
-            </w:r>
-            <w:proofErr w:type="spellStart"/>
-            <w:r>
-              <w:t>filing_system_ram</w:t>
-            </w:r>
-            <w:proofErr w:type="spellEnd"/>
-            <w:r>
-              <w:t>&gt;</w:t>
+              <w:t>&lt;filing_system_ram&gt;</w:t>
             </w:r>
           </w:p>
         </w:tc>
@@ -4167,15 +3627,7 @@
           <w:p>
             <w:r>
               <w:lastRenderedPageBreak/>
-              <w:t>&lt;</w:t>
-            </w:r>
-            <w:proofErr w:type="spellStart"/>
-            <w:r>
-              <w:t>private_ram</w:t>
-            </w:r>
-            <w:proofErr w:type="spellEnd"/>
-            <w:r>
-              <w:t>&gt;</w:t>
+              <w:t>&lt;private_ram&gt;</w:t>
             </w:r>
           </w:p>
         </w:tc>
@@ -4233,15 +3685,7 @@
           </w:tcPr>
           <w:p>
             <w:r>
-              <w:t>&lt;</w:t>
-            </w:r>
-            <w:proofErr w:type="spellStart"/>
-            <w:r>
-              <w:t>hidden_ram</w:t>
-            </w:r>
-            <w:proofErr w:type="spellEnd"/>
-            <w:r>
-              <w:t>&gt;</w:t>
+              <w:t>&lt;hidden_ram&gt;</w:t>
             </w:r>
           </w:p>
         </w:tc>
@@ -4300,66 +3744,46 @@
       <w:r>
         <w:t>&lt;</w:t>
       </w:r>
-      <w:proofErr w:type="spellStart"/>
       <w:r>
         <w:t>base_</w:t>
       </w:r>
       <w:r>
+        <w:t>memory&gt; (64K) The default 64K of memory.</w:t>
+      </w:r>
+      <w:r>
+        <w:t xml:space="preserve">  Addresses 0</w:t>
+      </w:r>
+      <w:r>
+        <w:t xml:space="preserve"> to </w:t>
+      </w:r>
+      <w:r>
+        <w:t>&amp;FFFF.</w:t>
+      </w:r>
+    </w:p>
+    <w:p>
+      <w:pPr>
+        <w:ind w:left="720" w:hanging="360"/>
+      </w:pPr>
+      <w:r>
+        <w:t>&lt;</w:t>
+      </w:r>
+      <w:r>
+        <w:t>paged_</w:t>
+      </w:r>
+      <w:r>
         <w:t>memory</w:t>
       </w:r>
-      <w:proofErr w:type="spellEnd"/>
-      <w:r>
-        <w:t>&gt; (64K) The default 64K of memory.</w:t>
-      </w:r>
-      <w:r>
-        <w:t xml:space="preserve">  Addresses 0</w:t>
-      </w:r>
-      <w:r>
-        <w:t xml:space="preserve"> to </w:t>
-      </w:r>
-      <w:r>
-        <w:t>&amp;FFFF.</w:t>
-      </w:r>
-    </w:p>
-    <w:p>
-      <w:pPr>
-        <w:ind w:left="720" w:hanging="360"/>
-      </w:pPr>
-      <w:r>
-        <w:t>&lt;</w:t>
-      </w:r>
-      <w:proofErr w:type="spellStart"/>
-      <w:r>
-        <w:t>paged_</w:t>
-      </w:r>
-      <w:r>
-        <w:t>memory</w:t>
-      </w:r>
-      <w:proofErr w:type="spellEnd"/>
       <w:r>
         <w:t>&gt;</w:t>
       </w:r>
       <w:r>
-        <w:t xml:space="preserve"> = &lt;</w:t>
-      </w:r>
-      <w:proofErr w:type="spellStart"/>
-      <w:r>
-        <w:t>page_count</w:t>
-      </w:r>
-      <w:proofErr w:type="spellEnd"/>
-      <w:r>
-        <w:t>&gt; + &lt;</w:t>
-      </w:r>
-      <w:proofErr w:type="spellStart"/>
+        <w:t xml:space="preserve"> = &lt;page_count&gt; + &lt;</w:t>
+      </w:r>
       <w:r>
         <w:t>page_</w:t>
       </w:r>
       <w:r>
-        <w:t>data</w:t>
-      </w:r>
-      <w:proofErr w:type="spellEnd"/>
-      <w:r>
-        <w:t>&gt;</w:t>
+        <w:t>data&gt;</w:t>
       </w:r>
       <w:r>
         <w:rPr>
@@ -4386,160 +3810,254 @@
         <w:ind w:left="720"/>
       </w:pPr>
       <w:r>
+        <w:t>&lt;page_count&gt; (1 byte) The number of pages.</w:t>
+      </w:r>
+    </w:p>
+    <w:p>
+      <w:pPr>
+        <w:ind w:left="720"/>
+      </w:pPr>
+      <w:r>
+        <w:t>&lt;page_data&gt; = &lt;page_ba</w:t>
+      </w:r>
+      <w:r>
+        <w:t>n</w:t>
+      </w:r>
+      <w:r>
+        <w:t>k&gt; + &lt;page_readonly&gt; + &lt;page_memor</w:t>
+      </w:r>
+      <w:r>
+        <w:t>y</w:t>
+      </w:r>
+      <w:r>
+        <w:t>&gt;</w:t>
+      </w:r>
+    </w:p>
+    <w:p>
+      <w:pPr>
+        <w:ind w:left="1080"/>
+      </w:pPr>
+      <w:r>
+        <w:t>&lt;page_</w:t>
+      </w:r>
+      <w:r>
+        <w:t>bank</w:t>
+      </w:r>
+      <w:r>
+        <w:t xml:space="preserve">&gt; (1 byte) A page </w:t>
+      </w:r>
+      <w:r>
+        <w:t xml:space="preserve">bank </w:t>
+      </w:r>
+      <w:r>
+        <w:t>id</w:t>
+      </w:r>
+      <w:r>
+        <w:t xml:space="preserve"> (0 to 16).</w:t>
+      </w:r>
+    </w:p>
+    <w:p>
+      <w:pPr>
+        <w:ind w:left="1080"/>
+      </w:pPr>
+      <w:r>
+        <w:t>&lt;page_</w:t>
+      </w:r>
+      <w:r>
+        <w:t>readonly</w:t>
+      </w:r>
+      <w:r>
+        <w:t xml:space="preserve">&gt; (1 byte) A page </w:t>
+      </w:r>
+      <w:r>
+        <w:t>read</w:t>
+      </w:r>
+      <w:r>
+        <w:t>-</w:t>
+      </w:r>
+      <w:r>
+        <w:t>only</w:t>
+      </w:r>
+      <w:r>
+        <w:t xml:space="preserve"> flag.</w:t>
+      </w:r>
+      <w:r>
+        <w:t xml:space="preserve"> </w:t>
+      </w:r>
+      <w:r>
+        <w:t xml:space="preserve"> 0 = </w:t>
+      </w:r>
+      <w:r>
+        <w:t>writable, 1 = read</w:t>
+      </w:r>
+      <w:r>
+        <w:t>-</w:t>
+      </w:r>
+      <w:r>
+        <w:t>only</w:t>
+      </w:r>
+    </w:p>
+    <w:p>
+      <w:pPr>
+        <w:ind w:left="1080"/>
+      </w:pPr>
+      <w:r>
         <w:t>&lt;</w:t>
       </w:r>
-      <w:proofErr w:type="spellStart"/>
-      <w:r>
-        <w:t>page_count</w:t>
-      </w:r>
-      <w:proofErr w:type="spellEnd"/>
-      <w:r>
-        <w:t>&gt; (1 byte) The number of pages.</w:t>
-      </w:r>
-    </w:p>
-    <w:p>
-      <w:pPr>
-        <w:ind w:left="720"/>
-      </w:pPr>
-      <w:r>
-        <w:t>&lt;</w:t>
-      </w:r>
-      <w:proofErr w:type="spellStart"/>
-      <w:r>
-        <w:t>page_data</w:t>
-      </w:r>
-      <w:proofErr w:type="spellEnd"/>
-      <w:r>
-        <w:t>&gt; = &lt;</w:t>
-      </w:r>
-      <w:proofErr w:type="spellStart"/>
-      <w:r>
-        <w:t>page_ba</w:t>
-      </w:r>
-      <w:r>
-        <w:t>n</w:t>
-      </w:r>
-      <w:r>
-        <w:t>k</w:t>
-      </w:r>
-      <w:proofErr w:type="spellEnd"/>
-      <w:r>
-        <w:t>&gt; + &lt;</w:t>
-      </w:r>
-      <w:proofErr w:type="spellStart"/>
-      <w:r>
-        <w:t>page_readonly</w:t>
-      </w:r>
-      <w:proofErr w:type="spellEnd"/>
-      <w:r>
-        <w:t>&gt; + &lt;</w:t>
-      </w:r>
-      <w:proofErr w:type="spellStart"/>
-      <w:r>
-        <w:t>page_memor</w:t>
-      </w:r>
-      <w:r>
-        <w:t>y</w:t>
-      </w:r>
-      <w:proofErr w:type="spellEnd"/>
-      <w:r>
-        <w:t>&gt;</w:t>
-      </w:r>
-    </w:p>
-    <w:p>
-      <w:pPr>
-        <w:ind w:left="1080"/>
-      </w:pPr>
-      <w:r>
-        <w:t>&lt;</w:t>
-      </w:r>
-      <w:proofErr w:type="spellStart"/>
-      <w:r>
-        <w:t>page_</w:t>
-      </w:r>
-      <w:r>
-        <w:t>bank</w:t>
-      </w:r>
-      <w:proofErr w:type="spellEnd"/>
-      <w:r>
-        <w:t xml:space="preserve">&gt; (1 byte) A page </w:t>
-      </w:r>
-      <w:r>
-        <w:t xml:space="preserve">bank </w:t>
-      </w:r>
-      <w:r>
-        <w:t>id</w:t>
-      </w:r>
-      <w:r>
-        <w:t xml:space="preserve"> (0 to 16).</w:t>
-      </w:r>
-    </w:p>
-    <w:p>
-      <w:pPr>
-        <w:ind w:left="1080"/>
-      </w:pPr>
-      <w:r>
-        <w:t>&lt;</w:t>
-      </w:r>
-      <w:proofErr w:type="spellStart"/>
-      <w:r>
-        <w:t>page_</w:t>
-      </w:r>
-      <w:r>
-        <w:t>readonly</w:t>
-      </w:r>
-      <w:proofErr w:type="spellEnd"/>
-      <w:r>
-        <w:t xml:space="preserve">&gt; (1 byte) A page </w:t>
-      </w:r>
-      <w:r>
-        <w:t>read</w:t>
-      </w:r>
-      <w:r>
-        <w:t>-</w:t>
-      </w:r>
-      <w:r>
-        <w:t>only</w:t>
-      </w:r>
-      <w:r>
-        <w:t xml:space="preserve"> flag.</w:t>
+      <w:r>
+        <w:t>page_memory</w:t>
+      </w:r>
+      <w:r>
+        <w:t xml:space="preserve">&gt; (16K) </w:t>
+      </w:r>
+      <w:r>
+        <w:t>The memory contents of a page</w:t>
+      </w:r>
+      <w:r>
+        <w:t>.  Addresses &amp;8000 to &amp;BFFF.</w:t>
+      </w:r>
+    </w:p>
+    <w:p>
+      <w:pPr>
+        <w:ind w:left="360"/>
+      </w:pPr>
+      <w:r>
+        <w:t xml:space="preserve">&lt;shadow_ram&gt; (20K) </w:t>
+      </w:r>
+      <w:r>
+        <w:t xml:space="preserve">Populated on Model B Plus, BBC Model </w:t>
+      </w:r>
+      <w:r>
+        <w:t xml:space="preserve">B </w:t>
+      </w:r>
+      <w:r>
+        <w:t>Integra, and BBC Mas</w:t>
+      </w:r>
+      <w:r>
+        <w:t>ter</w:t>
+      </w:r>
+      <w:r>
+        <w:t>.  Addresses &amp;</w:t>
+      </w:r>
+      <w:r>
+        <w:t>3</w:t>
+      </w:r>
+      <w:r>
+        <w:t>000 to &amp;</w:t>
+      </w:r>
+      <w:r>
+        <w:t>7</w:t>
+      </w:r>
+      <w:r>
+        <w:t>FFF.</w:t>
+      </w:r>
+    </w:p>
+    <w:p>
+      <w:pPr>
+        <w:ind w:left="360"/>
+      </w:pPr>
+      <w:r>
+        <w:t xml:space="preserve">&lt;mos_ram&gt; (4K) </w:t>
+      </w:r>
+      <w:r>
+        <w:t>Populated on BBC Master</w:t>
+      </w:r>
+      <w:r>
+        <w:t>.  Addresses &amp;8000 to &amp;</w:t>
+      </w:r>
+      <w:r>
+        <w:t>8FFF</w:t>
+      </w:r>
+      <w:r>
+        <w:t>.</w:t>
+      </w:r>
+    </w:p>
+    <w:p>
+      <w:pPr>
+        <w:ind w:left="360"/>
+      </w:pPr>
+      <w:r>
+        <w:t xml:space="preserve">&lt;filing_system_ram&gt; (8K) </w:t>
+      </w:r>
+      <w:r>
+        <w:t>Populated on BBC Master</w:t>
+      </w:r>
+      <w:r>
+        <w:t xml:space="preserve">.  </w:t>
+      </w:r>
+      <w:r>
+        <w:t>Addresses &amp;</w:t>
+      </w:r>
+      <w:r>
+        <w:t>C</w:t>
+      </w:r>
+      <w:r>
+        <w:t>000 to &amp;</w:t>
+      </w:r>
+      <w:r>
+        <w:t>D</w:t>
+      </w:r>
+      <w:r>
+        <w:t>FFF.</w:t>
+      </w:r>
+    </w:p>
+    <w:p>
+      <w:pPr>
+        <w:ind w:left="360"/>
+      </w:pPr>
+      <w:r>
+        <w:t>&lt;private_ram&gt; (</w:t>
+      </w:r>
+      <w:r>
+        <w:t>12</w:t>
+      </w:r>
+      <w:r>
+        <w:t xml:space="preserve">K) </w:t>
+      </w:r>
+      <w:r>
+        <w:t xml:space="preserve">Populated on </w:t>
+      </w:r>
+      <w:r>
+        <w:t xml:space="preserve">BBC </w:t>
+      </w:r>
+      <w:r>
+        <w:t>Model B Plus</w:t>
+      </w:r>
+      <w:r>
+        <w:t xml:space="preserve"> and </w:t>
+      </w:r>
+      <w:r>
+        <w:t>BBC Model B</w:t>
       </w:r>
       <w:r>
         <w:t xml:space="preserve"> </w:t>
       </w:r>
       <w:r>
-        <w:t xml:space="preserve"> 0 = </w:t>
-      </w:r>
-      <w:r>
-        <w:t>writable, 1 = read</w:t>
-      </w:r>
-      <w:r>
-        <w:t>-</w:t>
-      </w:r>
-      <w:r>
-        <w:t>only</w:t>
-      </w:r>
-    </w:p>
-    <w:p>
-      <w:pPr>
-        <w:ind w:left="1080"/>
-      </w:pPr>
-      <w:r>
-        <w:t>&lt;</w:t>
-      </w:r>
-      <w:proofErr w:type="spellStart"/>
-      <w:r>
-        <w:t>page_memory</w:t>
-      </w:r>
-      <w:proofErr w:type="spellEnd"/>
-      <w:r>
-        <w:t xml:space="preserve">&gt; (16K) </w:t>
-      </w:r>
-      <w:r>
-        <w:t>The memory contents of a page</w:t>
-      </w:r>
-      <w:r>
-        <w:t>.  Addresses &amp;8000 to &amp;BFFF.</w:t>
+        <w:t>Integra</w:t>
+      </w:r>
+      <w:r>
+        <w:t>.</w:t>
+      </w:r>
+      <w:r>
+        <w:t xml:space="preserve"> </w:t>
+      </w:r>
+      <w:r>
+        <w:t>Addresses &amp;</w:t>
+      </w:r>
+      <w:r>
+        <w:t>8</w:t>
+      </w:r>
+      <w:r>
+        <w:t>000 to &amp;</w:t>
+      </w:r>
+      <w:r>
+        <w:t>A</w:t>
+      </w:r>
+      <w:r>
+        <w:t>FFF.</w:t>
+      </w:r>
+      <w:r>
+        <w:t xml:space="preserve"> </w:t>
       </w:r>
     </w:p>
     <w:p>
@@ -4547,192 +4065,7 @@
         <w:ind w:left="360"/>
       </w:pPr>
       <w:r>
-        <w:t>&lt;</w:t>
-      </w:r>
-      <w:proofErr w:type="spellStart"/>
-      <w:r>
-        <w:t>shadow_ram</w:t>
-      </w:r>
-      <w:proofErr w:type="spellEnd"/>
-      <w:r>
-        <w:t xml:space="preserve">&gt; (20K) </w:t>
-      </w:r>
-      <w:r>
-        <w:t xml:space="preserve">Populated on Model B Plus, BBC Model </w:t>
-      </w:r>
-      <w:r>
-        <w:t xml:space="preserve">B </w:t>
-      </w:r>
-      <w:r>
-        <w:t>Integra, and BBC Mas</w:t>
-      </w:r>
-      <w:r>
-        <w:t>ter</w:t>
-      </w:r>
-      <w:r>
-        <w:t>.  Addresses &amp;</w:t>
-      </w:r>
-      <w:r>
-        <w:t>3</w:t>
-      </w:r>
-      <w:r>
-        <w:t>000 to &amp;</w:t>
-      </w:r>
-      <w:r>
-        <w:t>7</w:t>
-      </w:r>
-      <w:r>
-        <w:t>FFF.</w:t>
-      </w:r>
-    </w:p>
-    <w:p>
-      <w:pPr>
-        <w:ind w:left="360"/>
-      </w:pPr>
-      <w:r>
-        <w:t>&lt;</w:t>
-      </w:r>
-      <w:proofErr w:type="spellStart"/>
-      <w:r>
-        <w:t>mos_ram</w:t>
-      </w:r>
-      <w:proofErr w:type="spellEnd"/>
-      <w:r>
-        <w:t xml:space="preserve">&gt; (4K) </w:t>
-      </w:r>
-      <w:r>
-        <w:t>Populated on BBC Master</w:t>
-      </w:r>
-      <w:r>
-        <w:t>.  Addresses &amp;8000 to &amp;</w:t>
-      </w:r>
-      <w:r>
-        <w:t>8FFF</w:t>
-      </w:r>
-      <w:r>
-        <w:t>.</w:t>
-      </w:r>
-    </w:p>
-    <w:p>
-      <w:pPr>
-        <w:ind w:left="360"/>
-      </w:pPr>
-      <w:r>
-        <w:t>&lt;</w:t>
-      </w:r>
-      <w:proofErr w:type="spellStart"/>
-      <w:r>
-        <w:t>filing_system_ram</w:t>
-      </w:r>
-      <w:proofErr w:type="spellEnd"/>
-      <w:r>
-        <w:t xml:space="preserve">&gt; (8K) </w:t>
-      </w:r>
-      <w:r>
-        <w:t>Populated on BBC Master</w:t>
-      </w:r>
-      <w:r>
-        <w:t xml:space="preserve">.  </w:t>
-      </w:r>
-      <w:r>
-        <w:t>Addresses &amp;</w:t>
-      </w:r>
-      <w:r>
-        <w:t>C</w:t>
-      </w:r>
-      <w:r>
-        <w:t>000 to &amp;</w:t>
-      </w:r>
-      <w:r>
-        <w:t>D</w:t>
-      </w:r>
-      <w:r>
-        <w:t>FFF.</w:t>
-      </w:r>
-    </w:p>
-    <w:p>
-      <w:pPr>
-        <w:ind w:left="360"/>
-      </w:pPr>
-      <w:r>
-        <w:t>&lt;</w:t>
-      </w:r>
-      <w:proofErr w:type="spellStart"/>
-      <w:r>
-        <w:t>private_ram</w:t>
-      </w:r>
-      <w:proofErr w:type="spellEnd"/>
-      <w:r>
-        <w:t>&gt; (</w:t>
-      </w:r>
-      <w:r>
-        <w:t>12</w:t>
-      </w:r>
-      <w:r>
-        <w:t xml:space="preserve">K) </w:t>
-      </w:r>
-      <w:r>
-        <w:t xml:space="preserve">Populated on </w:t>
-      </w:r>
-      <w:r>
-        <w:t xml:space="preserve">BBC </w:t>
-      </w:r>
-      <w:r>
-        <w:t>Model B Plus</w:t>
-      </w:r>
-      <w:r>
-        <w:t xml:space="preserve"> and </w:t>
-      </w:r>
-      <w:r>
-        <w:t>BBC Model B</w:t>
-      </w:r>
-      <w:r>
-        <w:t xml:space="preserve"> </w:t>
-      </w:r>
-      <w:r>
-        <w:t>Integra</w:t>
-      </w:r>
-      <w:proofErr w:type="gramStart"/>
-      <w:r>
-        <w:t>.</w:t>
-      </w:r>
-      <w:r>
-        <w:t xml:space="preserve"> </w:t>
-      </w:r>
-      <w:proofErr w:type="gramEnd"/>
-      <w:r>
-        <w:t>Addresses &amp;</w:t>
-      </w:r>
-      <w:r>
-        <w:t>8</w:t>
-      </w:r>
-      <w:r>
-        <w:t>000 to &amp;</w:t>
-      </w:r>
-      <w:r>
-        <w:t>A</w:t>
-      </w:r>
-      <w:r>
-        <w:t>FFF.</w:t>
-      </w:r>
-      <w:r>
-        <w:t xml:space="preserve"> </w:t>
-      </w:r>
-    </w:p>
-    <w:p>
-      <w:pPr>
-        <w:ind w:left="360"/>
-      </w:pPr>
-      <w:r>
-        <w:t>&lt;</w:t>
-      </w:r>
-      <w:proofErr w:type="spellStart"/>
-      <w:r>
-        <w:t>hidden_ram</w:t>
-      </w:r>
-      <w:proofErr w:type="spellEnd"/>
-      <w:r>
-        <w:t xml:space="preserve">&gt; (256 bytes) </w:t>
+        <w:t xml:space="preserve">&lt;hidden_ram&gt; (256 bytes) </w:t>
       </w:r>
       <w:r>
         <w:t>Populated on BBC Model Integra B.</w:t>
@@ -4817,32 +4150,11 @@
           <w:b/>
           <w:bCs/>
         </w:rPr>
-        <w:t>&lt;</w:t>
-      </w:r>
-      <w:proofErr w:type="spellStart"/>
-      <w:r>
-        <w:rPr>
-          <w:b/>
-          <w:bCs/>
-        </w:rPr>
-        <w:t>execution_chunk</w:t>
-      </w:r>
-      <w:proofErr w:type="spellEnd"/>
-      <w:r>
-        <w:rPr>
-          <w:b/>
-          <w:bCs/>
-        </w:rPr>
-        <w:t>&gt;</w:t>
-      </w:r>
-      <w:r>
-        <w:t xml:space="preserve"> = &lt;</w:t>
-      </w:r>
-      <w:proofErr w:type="spellStart"/>
-      <w:r>
-        <w:t>common_header</w:t>
-      </w:r>
-      <w:proofErr w:type="spellEnd"/>
+        <w:t>&lt;execution_chunk&gt;</w:t>
+      </w:r>
+      <w:r>
+        <w:t xml:space="preserve"> = &lt;common_header</w:t>
+      </w:r>
       <w:r>
         <w:t>(</w:t>
       </w:r>
@@ -4853,7 +4165,6 @@
         </w:rPr>
         <w:t>‘</w:t>
       </w:r>
-      <w:proofErr w:type="spellStart"/>
       <w:r>
         <w:rPr>
           <w:rFonts w:ascii="Aptos" w:hAnsi="Aptos"/>
@@ -4861,94 +4172,68 @@
           <w:bCs/>
           <w:color w:val="000000"/>
         </w:rPr>
-        <w:t>PFex</w:t>
-      </w:r>
-      <w:proofErr w:type="spellEnd"/>
+        <w:t>PFex’</w:t>
+      </w:r>
       <w:r>
         <w:rPr>
           <w:rFonts w:ascii="Aptos" w:hAnsi="Aptos"/>
+          <w:color w:val="000000"/>
+        </w:rPr>
+        <w:t>)</w:t>
+      </w:r>
+      <w:r>
+        <w:t>&gt; + &lt;execution_data&gt;</w:t>
+      </w:r>
+    </w:p>
+    <w:p>
+      <w:pPr>
+        <w:ind w:left="360"/>
+      </w:pPr>
+      <w:r>
+        <w:t xml:space="preserve">&lt;execution_data&gt; = </w:t>
+      </w:r>
+      <w:r>
+        <w:t xml:space="preserve">list of </w:t>
+      </w:r>
+      <w:r>
+        <w:rPr>
           <w:b/>
           <w:bCs/>
-          <w:color w:val="000000"/>
-        </w:rPr>
-        <w:t>’</w:t>
-      </w:r>
-      <w:r>
-        <w:rPr>
-          <w:rFonts w:ascii="Aptos" w:hAnsi="Aptos"/>
-          <w:color w:val="000000"/>
-        </w:rPr>
-        <w:t>)</w:t>
-      </w:r>
-      <w:r>
-        <w:t>&gt; + &lt;</w:t>
-      </w:r>
-      <w:proofErr w:type="spellStart"/>
-      <w:r>
-        <w:t>execution_data</w:t>
-      </w:r>
-      <w:proofErr w:type="spellEnd"/>
-      <w:r>
-        <w:t>&gt;</w:t>
-      </w:r>
-    </w:p>
-    <w:p>
-      <w:pPr>
-        <w:ind w:left="360"/>
-      </w:pPr>
-      <w:r>
-        <w:t>&lt;</w:t>
-      </w:r>
-      <w:proofErr w:type="spellStart"/>
-      <w:r>
-        <w:t>execution_data</w:t>
-      </w:r>
-      <w:proofErr w:type="spellEnd"/>
-      <w:r>
-        <w:t xml:space="preserve">&gt; = </w:t>
-      </w:r>
-      <w:r>
-        <w:t xml:space="preserve">list of </w:t>
+        </w:rPr>
+        <w:t>&lt;interrupt&gt;</w:t>
+      </w:r>
+      <w:r>
+        <w:t xml:space="preserve"> </w:t>
+      </w:r>
+      <w:r>
+        <w:t>and/or</w:t>
+      </w:r>
+      <w:r>
+        <w:t xml:space="preserve"> </w:t>
       </w:r>
       <w:r>
         <w:rPr>
           <w:b/>
           <w:bCs/>
         </w:rPr>
-        <w:t>&lt;interrupt&gt;</w:t>
-      </w:r>
-      <w:r>
-        <w:t xml:space="preserve"> </w:t>
-      </w:r>
-      <w:r>
-        <w:t>and/or</w:t>
-      </w:r>
-      <w:r>
-        <w:t xml:space="preserve"> </w:t>
-      </w:r>
+        <w:t>&lt;instruction&gt;</w:t>
+      </w:r>
+      <w:r>
+        <w:t>, where</w:t>
+      </w:r>
+      <w:r>
+        <w:t>:</w:t>
+      </w:r>
+    </w:p>
+    <w:p>
+      <w:pPr>
+        <w:ind w:left="720" w:hanging="360"/>
+      </w:pPr>
       <w:r>
         <w:rPr>
           <w:b/>
           <w:bCs/>
         </w:rPr>
-        <w:t>&lt;instruction&gt;</w:t>
-      </w:r>
-      <w:r>
-        <w:t>, where</w:t>
-      </w:r>
-      <w:r>
-        <w:t>:</w:t>
-      </w:r>
-    </w:p>
-    <w:p>
-      <w:pPr>
-        <w:ind w:left="720" w:hanging="360"/>
-      </w:pPr>
-      <w:r>
-        <w:rPr>
-          <w:b/>
-          <w:bCs/>
-        </w:rPr>
         <w:t>&lt;interrupt&gt;</w:t>
       </w:r>
       <w:r>
@@ -4958,20 +4243,11 @@
         <w:br/>
       </w:r>
       <w:r>
+        <w:t xml:space="preserve">&lt;interrupt_marker&gt; + </w:t>
+      </w:r>
+      <w:r>
         <w:t>&lt;</w:t>
       </w:r>
-      <w:proofErr w:type="spellStart"/>
-      <w:r>
-        <w:t>interrupt_marker</w:t>
-      </w:r>
-      <w:proofErr w:type="spellEnd"/>
-      <w:r>
-        <w:t xml:space="preserve">&gt; + </w:t>
-      </w:r>
-      <w:r>
-        <w:t>&lt;</w:t>
-      </w:r>
-      <w:proofErr w:type="spellStart"/>
       <w:r>
         <w:t>address</w:t>
       </w:r>
@@ -4981,13 +4257,8 @@
       <w:r>
         <w:t>service_routine</w:t>
       </w:r>
-      <w:proofErr w:type="spellEnd"/>
-      <w:r>
-        <w:t>&gt; + &lt;</w:t>
-      </w:r>
-      <w:proofErr w:type="spellStart"/>
-      <w:r>
-        <w:t>address</w:t>
+      <w:r>
+        <w:t>&gt; + &lt;address</w:t>
       </w:r>
       <w:r>
         <w:t>_</w:t>
@@ -4995,20 +4266,11 @@
       <w:r>
         <w:t>interrupted</w:t>
       </w:r>
-      <w:proofErr w:type="spellEnd"/>
       <w:r>
         <w:t>&gt; +</w:t>
       </w:r>
       <w:r>
-        <w:t xml:space="preserve"> &lt;</w:t>
-      </w:r>
-      <w:proofErr w:type="spellStart"/>
-      <w:r>
-        <w:t>stack_pointer</w:t>
-      </w:r>
-      <w:proofErr w:type="spellEnd"/>
-      <w:r>
-        <w:t>&gt;</w:t>
+        <w:t xml:space="preserve"> &lt;stack_pointer&gt;</w:t>
       </w:r>
       <w:r>
         <w:t xml:space="preserve"> </w:t>
@@ -5019,15 +4281,7 @@
         <w:ind w:left="720"/>
       </w:pPr>
       <w:r>
-        <w:t>&lt;</w:t>
-      </w:r>
-      <w:proofErr w:type="spellStart"/>
-      <w:r>
-        <w:t>interrupt_marker</w:t>
-      </w:r>
-      <w:proofErr w:type="spellEnd"/>
-      <w:r>
-        <w:t>&gt; (2 bytes).  A two-byte value that distinguishes a &lt;interrupt&gt; from a &lt;instruction&gt;.</w:t>
+        <w:t>&lt;interrupt_marker&gt; (2 bytes).  A two-byte value that distinguishes a &lt;interrupt&gt; from a &lt;instruction&gt;.</w:t>
       </w:r>
       <w:r>
         <w:t xml:space="preserve"> </w:t>
@@ -5207,15 +4461,7 @@
         <w:ind w:left="720"/>
       </w:pPr>
       <w:r>
-        <w:t>&lt;</w:t>
-      </w:r>
-      <w:proofErr w:type="spellStart"/>
-      <w:r>
-        <w:t>address_service_routine</w:t>
-      </w:r>
-      <w:proofErr w:type="spellEnd"/>
-      <w:r>
-        <w:t>&gt; (2 bytes).  The address of the interrupt service routine.</w:t>
+        <w:t>&lt;address_service_routine&gt; (2 bytes).  The address of the interrupt service routine.</w:t>
       </w:r>
     </w:p>
     <w:p>
@@ -5223,16 +4469,11 @@
         <w:ind w:left="720"/>
       </w:pPr>
       <w:r>
-        <w:t>&lt;</w:t>
-      </w:r>
-      <w:proofErr w:type="spellStart"/>
-      <w:r>
-        <w:t>address_</w:t>
+        <w:t>&lt;address_</w:t>
       </w:r>
       <w:r>
         <w:t>interrupted</w:t>
       </w:r>
-      <w:proofErr w:type="spellEnd"/>
       <w:r>
         <w:t xml:space="preserve"> &gt; (2 bytes).  The address of </w:t>
       </w:r>
@@ -5248,15 +4489,7 @@
         <w:ind w:left="720"/>
       </w:pPr>
       <w:r>
-        <w:t>&lt;</w:t>
-      </w:r>
-      <w:proofErr w:type="spellStart"/>
-      <w:r>
-        <w:t>cycle_count</w:t>
-      </w:r>
-      <w:proofErr w:type="spellEnd"/>
-      <w:r>
-        <w:t xml:space="preserve">&gt; </w:t>
+        <w:t xml:space="preserve">&lt;cycle_count&gt; </w:t>
       </w:r>
       <w:r>
         <w:t>(1 byte) S</w:t>
@@ -5270,15 +4503,7 @@
         <w:ind w:left="720"/>
       </w:pPr>
       <w:r>
-        <w:t>&lt;</w:t>
-      </w:r>
-      <w:proofErr w:type="spellStart"/>
-      <w:r>
-        <w:t>stack_pointer</w:t>
-      </w:r>
-      <w:proofErr w:type="spellEnd"/>
-      <w:r>
-        <w:t xml:space="preserve">&gt; </w:t>
+        <w:t xml:space="preserve">&lt;stack_pointer&gt; </w:t>
       </w:r>
       <w:r>
         <w:t>(1 bytes) S</w:t>
@@ -5312,16 +4537,11 @@
       <w:r>
         <w:t>&lt;</w:t>
       </w:r>
-      <w:proofErr w:type="spellStart"/>
       <w:r>
         <w:t>opcode_</w:t>
       </w:r>
       <w:r>
-        <w:t>address</w:t>
-      </w:r>
-      <w:proofErr w:type="spellEnd"/>
-      <w:r>
-        <w:t>&gt; + &lt;opcode&gt; + &lt;operand&gt;</w:t>
+        <w:t>address&gt; + &lt;opcode&gt; + &lt;operand&gt;</w:t>
       </w:r>
       <w:r>
         <w:rPr>
@@ -5348,13 +4568,8 @@
       <w:r>
         <w:t>&lt;</w:t>
       </w:r>
-      <w:proofErr w:type="spellStart"/>
-      <w:r>
-        <w:t>stack_pointer</w:t>
-      </w:r>
-      <w:proofErr w:type="spellEnd"/>
-      <w:r>
-        <w:t>&gt;</w:t>
+      <w:r>
+        <w:t>stack_pointer&gt;</w:t>
       </w:r>
       <w:r>
         <w:rPr>
@@ -5368,15 +4583,7 @@
         <w:t xml:space="preserve"> + </w:t>
       </w:r>
       <w:r>
-        <w:t>&lt;</w:t>
-      </w:r>
-      <w:proofErr w:type="spellStart"/>
-      <w:r>
-        <w:t>return_address</w:t>
-      </w:r>
-      <w:proofErr w:type="spellEnd"/>
-      <w:r>
-        <w:t>&gt;</w:t>
+        <w:t>&lt;return_address&gt;</w:t>
       </w:r>
       <w:r>
         <w:rPr>
@@ -5401,15 +4608,7 @@
         <w:t xml:space="preserve">+ </w:t>
       </w:r>
       <w:r>
-        <w:t>&lt;</w:t>
-      </w:r>
-      <w:proofErr w:type="spellStart"/>
-      <w:r>
-        <w:t>memory_address</w:t>
-      </w:r>
-      <w:proofErr w:type="spellEnd"/>
-      <w:r>
-        <w:t>&gt;</w:t>
+        <w:t>&lt;memory_address&gt;</w:t>
       </w:r>
       <w:r>
         <w:rPr>
@@ -5430,7 +4629,6 @@
       <w:r>
         <w:t xml:space="preserve"> &lt;</w:t>
       </w:r>
-      <w:proofErr w:type="spellStart"/>
       <w:r>
         <w:t>memory</w:t>
       </w:r>
@@ -5440,7 +4638,6 @@
       <w:r>
         <w:t>_value</w:t>
       </w:r>
-      <w:proofErr w:type="spellEnd"/>
       <w:r>
         <w:t>&gt;</w:t>
       </w:r>
@@ -5463,11 +4660,9 @@
       <w:r>
         <w:t>+ &lt;</w:t>
       </w:r>
-      <w:proofErr w:type="spellStart"/>
       <w:r>
         <w:t>memory_write_value</w:t>
       </w:r>
-      <w:proofErr w:type="spellEnd"/>
       <w:r>
         <w:t>&gt;</w:t>
       </w:r>
@@ -5487,16 +4682,11 @@
       <w:r>
         <w:t>&lt;</w:t>
       </w:r>
-      <w:proofErr w:type="spellStart"/>
       <w:r>
         <w:t>opcode_</w:t>
       </w:r>
       <w:r>
-        <w:t>address</w:t>
-      </w:r>
-      <w:proofErr w:type="spellEnd"/>
-      <w:r>
-        <w:t>&gt;</w:t>
+        <w:t>address&gt;</w:t>
       </w:r>
       <w:r>
         <w:t xml:space="preserve"> </w:t>
@@ -5744,7 +4934,6 @@
             <w:r>
               <w:t>&amp;</w:t>
             </w:r>
-            <w:proofErr w:type="gramStart"/>
             <w:r>
               <w:t>8</w:t>
             </w:r>
@@ -5754,7 +4943,6 @@
             <w:r>
               <w:t>..</w:t>
             </w:r>
-            <w:proofErr w:type="gramEnd"/>
             <w:r>
               <w:t>&amp;</w:t>
             </w:r>
@@ -5835,15 +5023,7 @@
               <w:t xml:space="preserve"> </w:t>
             </w:r>
             <w:r>
-              <w:t>&amp;</w:t>
-            </w:r>
-            <w:proofErr w:type="gramStart"/>
-            <w:r>
-              <w:t>0000..</w:t>
-            </w:r>
-            <w:proofErr w:type="gramEnd"/>
-            <w:r>
-              <w:t>&amp;7F</w:t>
+              <w:t>&amp;0000..&amp;7F</w:t>
             </w:r>
             <w:r>
               <w:t>FF</w:t>
@@ -5858,14 +5038,12 @@
             <w:pPr>
               <w:jc w:val="center"/>
             </w:pPr>
-            <w:proofErr w:type="gramStart"/>
             <w:r>
               <w:t>0..</w:t>
             </w:r>
             <w:r>
               <w:t>&amp;</w:t>
             </w:r>
-            <w:proofErr w:type="gramEnd"/>
             <w:r>
               <w:t>7F</w:t>
             </w:r>
@@ -5879,14 +5057,12 @@
             <w:pPr>
               <w:jc w:val="center"/>
             </w:pPr>
-            <w:proofErr w:type="gramStart"/>
             <w:r>
               <w:t>0..</w:t>
             </w:r>
             <w:r>
               <w:t>&amp;</w:t>
             </w:r>
-            <w:proofErr w:type="gramEnd"/>
             <w:r>
               <w:t>FF</w:t>
             </w:r>
@@ -5930,15 +5106,7 @@
               <w:t>:</w:t>
             </w:r>
             <w:r>
-              <w:t xml:space="preserve"> &amp;</w:t>
-            </w:r>
-            <w:proofErr w:type="gramStart"/>
-            <w:r>
-              <w:t>8000..</w:t>
-            </w:r>
-            <w:proofErr w:type="gramEnd"/>
-            <w:r>
-              <w:t>&amp;FFFF</w:t>
+              <w:t xml:space="preserve"> &amp;8000..&amp;FFFF</w:t>
             </w:r>
           </w:p>
         </w:tc>
@@ -5969,11 +5137,9 @@
             <w:r>
               <w:t>&amp;</w:t>
             </w:r>
-            <w:proofErr w:type="gramStart"/>
             <w:r>
               <w:t>80..</w:t>
             </w:r>
-            <w:proofErr w:type="gramEnd"/>
             <w:r>
               <w:t>&amp;</w:t>
             </w:r>
@@ -5990,14 +5156,12 @@
             <w:pPr>
               <w:jc w:val="center"/>
             </w:pPr>
-            <w:proofErr w:type="gramStart"/>
             <w:r>
               <w:t>0..</w:t>
             </w:r>
             <w:r>
               <w:t>&amp;</w:t>
             </w:r>
-            <w:proofErr w:type="gramEnd"/>
             <w:r>
               <w:t>FF</w:t>
             </w:r>
@@ -6748,15 +5912,7 @@
         </w:rPr>
       </w:pPr>
       <w:r>
-        <w:t>&lt;</w:t>
-      </w:r>
-      <w:proofErr w:type="spellStart"/>
-      <w:r>
-        <w:t>stack_pointer</w:t>
-      </w:r>
-      <w:proofErr w:type="spellEnd"/>
-      <w:r>
-        <w:t xml:space="preserve">&gt; (1 byte) Populated for </w:t>
+        <w:t xml:space="preserve">&lt;stack_pointer&gt; (1 byte) Populated for </w:t>
       </w:r>
       <w:r>
         <w:t xml:space="preserve">opcodes </w:t>
@@ -6818,15 +5974,7 @@
         <w:ind w:left="720"/>
       </w:pPr>
       <w:r>
-        <w:t>&lt;</w:t>
-      </w:r>
-      <w:proofErr w:type="spellStart"/>
-      <w:r>
-        <w:t>return_address</w:t>
-      </w:r>
-      <w:proofErr w:type="spellEnd"/>
-      <w:r>
-        <w:t xml:space="preserve">&gt; (2 bytes) Populated for the </w:t>
+        <w:t xml:space="preserve">&lt;return_address&gt; (2 bytes) Populated for the </w:t>
       </w:r>
       <w:r>
         <w:rPr>
@@ -6866,15 +6014,7 @@
         <w:ind w:left="720"/>
       </w:pPr>
       <w:r>
-        <w:t>&lt;</w:t>
-      </w:r>
-      <w:proofErr w:type="spellStart"/>
-      <w:r>
-        <w:t>memory_address</w:t>
-      </w:r>
-      <w:proofErr w:type="spellEnd"/>
-      <w:r>
-        <w:t>&gt; (2 bytes) Populated for all opcodes that use the following addressing modes:</w:t>
+        <w:t>&lt;memory_address&gt; (2 bytes) Populated for all opcodes that use the following addressing modes:</w:t>
       </w:r>
     </w:p>
     <w:p>
@@ -7085,16 +6225,11 @@
         <w:ind w:left="720"/>
       </w:pPr>
       <w:r>
-        <w:t>&lt;</w:t>
-      </w:r>
-      <w:proofErr w:type="spellStart"/>
-      <w:r>
-        <w:t>memory</w:t>
+        <w:t>&lt;memory</w:t>
       </w:r>
       <w:r>
         <w:t>_read_value</w:t>
       </w:r>
-      <w:proofErr w:type="spellEnd"/>
       <w:r>
         <w:t xml:space="preserve">&gt; (1 byte) Populated for </w:t>
       </w:r>
@@ -7159,26 +6294,10 @@
         <w:ind w:left="720"/>
       </w:pPr>
       <w:r>
-        <w:t>&lt;</w:t>
-      </w:r>
-      <w:proofErr w:type="spellStart"/>
-      <w:r>
-        <w:t>memory_write_value</w:t>
-      </w:r>
-      <w:proofErr w:type="spellEnd"/>
-      <w:r>
-        <w:t xml:space="preserve">&gt; (1 byte) Populated for </w:t>
-      </w:r>
-      <w:proofErr w:type="gramStart"/>
-      <w:r>
-        <w:t xml:space="preserve">opcodes that </w:t>
-      </w:r>
-      <w:r>
-        <w:t>write</w:t>
-      </w:r>
-      <w:proofErr w:type="gramEnd"/>
-      <w:r>
-        <w:t xml:space="preserve"> to </w:t>
+        <w:t xml:space="preserve">&lt;memory_write_value&gt; (1 byte) Populated for opcodes that </w:t>
+      </w:r>
+      <w:r>
+        <w:t xml:space="preserve">write to </w:t>
       </w:r>
       <w:r>
         <w:t>an address</w:t>
@@ -7201,16 +6320,11 @@
       <w:r>
         <w:t>attempted to be written</w:t>
       </w:r>
-      <w:proofErr w:type="gramStart"/>
       <w:r>
         <w:t>.</w:t>
       </w:r>
       <w:r>
-        <w:t xml:space="preserve"> </w:t>
-      </w:r>
-      <w:proofErr w:type="gramEnd"/>
-      <w:r>
-        <w:t xml:space="preserve">This includes </w:t>
+        <w:t xml:space="preserve"> This includes </w:t>
       </w:r>
       <w:r>
         <w:lastRenderedPageBreak/>
@@ -7251,7 +6365,6 @@
       </w:r>
     </w:p>
     <w:p>
-      <w:proofErr w:type="gramStart"/>
       <w:r>
         <w:t xml:space="preserve">A </w:t>
       </w:r>
@@ -7262,7 +6375,6 @@
         </w:rPr>
         <w:t>.perf</w:t>
       </w:r>
-      <w:proofErr w:type="gramEnd"/>
       <w:r>
         <w:t xml:space="preserve"> </w:t>
       </w:r>
@@ -7399,7 +6511,6 @@
       <w:r>
         <w:t xml:space="preserve">a </w:t>
       </w:r>
-      <w:proofErr w:type="spellStart"/>
       <w:r>
         <w:rPr>
           <w:b/>
@@ -7407,7 +6518,6 @@
         </w:rPr>
         <w:t>PerfWriter</w:t>
       </w:r>
-      <w:proofErr w:type="spellEnd"/>
       <w:r>
         <w:t xml:space="preserve"> class</w:t>
       </w:r>
@@ -7758,7 +6868,6 @@
       <w:pPr>
         <w:pStyle w:val="Heading1"/>
       </w:pPr>
-      <w:proofErr w:type="spellStart"/>
       <w:r>
         <w:t>Bee</w:t>
       </w:r>
@@ -7768,19 +6877,10 @@
       <w:r>
         <w:t>Perf</w:t>
       </w:r>
-      <w:proofErr w:type="spellEnd"/>
-    </w:p>
-    <w:p>
-      <w:r>
-        <w:t xml:space="preserve">As outlined above, </w:t>
-      </w:r>
-      <w:proofErr w:type="spellStart"/>
-      <w:r>
-        <w:t>BeebPerf</w:t>
-      </w:r>
-      <w:proofErr w:type="spellEnd"/>
-      <w:r>
-        <w:t xml:space="preserve"> is a standalone </w:t>
+    </w:p>
+    <w:p>
+      <w:r>
+        <w:t xml:space="preserve">As outlined above, BeebPerf is a standalone </w:t>
       </w:r>
       <w:r>
         <w:t xml:space="preserve">Windows </w:t>
@@ -8576,16 +7676,21 @@
         <w:t xml:space="preserve"> –</w:t>
       </w:r>
       <w:r>
-        <w:t xml:space="preserve"> Show the following program attributes </w:t>
-      </w:r>
-      <w:r>
-        <w:t xml:space="preserve">over </w:t>
-      </w:r>
-      <w:r>
-        <w:t xml:space="preserve">across </w:t>
-      </w:r>
-      <w:r>
-        <w:t>the performance recoding:</w:t>
+        <w:t xml:space="preserve"> Show </w:t>
+      </w:r>
+      <w:r>
+        <w:t>a time</w:t>
+      </w:r>
+      <w:r>
+        <w:t>-</w:t>
+      </w:r>
+      <w:r>
+        <w:t>line allowing the user to select a specific time range to analyze.</w:t>
+      </w:r>
+    </w:p>
+    <w:p>
+      <w:r>
+        <w:t>The view can be expanded to show:</w:t>
       </w:r>
     </w:p>
     <w:p>
@@ -8662,17 +7767,6 @@
     </w:p>
     <w:p>
       <w:r>
-        <w:t xml:space="preserve">The view also allows the </w:t>
-      </w:r>
-      <w:r>
-        <w:t xml:space="preserve">analysis </w:t>
-      </w:r>
-      <w:r>
-        <w:t>window to be set, zoomed in, and reset.</w:t>
-      </w:r>
-    </w:p>
-    <w:p>
-      <w:r>
         <w:rPr>
           <w:b/>
           <w:bCs/>
@@ -8725,6 +7819,15 @@
       <w:r>
         <w:t>, sorted by ‘self’ cycle counts.</w:t>
       </w:r>
+      <w:r>
+        <w:t xml:space="preserve">  The routines with the highest self</w:t>
+      </w:r>
+      <w:r>
+        <w:t>-</w:t>
+      </w:r>
+      <w:r>
+        <w:t>CPU usage are marked as ‘hot’.</w:t>
+      </w:r>
     </w:p>
     <w:p>
       <w:r>
@@ -8773,23 +7876,29 @@
         <w:t xml:space="preserve">– </w:t>
       </w:r>
       <w:r>
-        <w:t xml:space="preserve">Show where the program </w:t>
+        <w:t>Show</w:t>
+      </w:r>
+      <w:r>
+        <w:t>s</w:t>
+      </w:r>
+      <w:r>
+        <w:t xml:space="preserve"> where the program </w:t>
       </w:r>
       <w:r>
         <w:t>is spending its time.  Each node in the tree represents a routine, with the top-level nodes showing the program entry point</w:t>
       </w:r>
       <w:r>
-        <w:t xml:space="preserve"> and interrupt </w:t>
+        <w:t xml:space="preserve"> and </w:t>
+      </w:r>
+      <w:r>
+        <w:lastRenderedPageBreak/>
+        <w:t xml:space="preserve">interrupt </w:t>
       </w:r>
       <w:r>
         <w:t>routines</w:t>
       </w:r>
       <w:r>
-        <w:t xml:space="preserve">.  Each node in the tree shows the self (exclusive), overall (inclusive), and </w:t>
-      </w:r>
-      <w:r>
-        <w:lastRenderedPageBreak/>
-        <w:t>elapsed times.  The child nodes are ordered by their inclusive CPU times.  In cases where a routine is called from multiple callers, the metrics shown are in the context of the caller.</w:t>
+        <w:t>.  Each node in the tree shows the self (exclusive), overall (inclusive), and elapsed times.  The child nodes are ordered by their inclusive CPU times.  In cases where a routine is called from multiple callers, the metrics shown are in the context of the caller.</w:t>
       </w:r>
     </w:p>
     <w:p>
@@ -8934,185 +8043,27 @@
         <w:t>Code panel</w:t>
       </w:r>
       <w:r>
-        <w:t xml:space="preserve"> – used to view the performance of an individual routine.  </w:t>
-      </w:r>
-    </w:p>
-    <w:p>
-      <w:r>
-        <w:t xml:space="preserve">The left </w:t>
-      </w:r>
-      <w:r>
-        <w:t xml:space="preserve">side </w:t>
-      </w:r>
-      <w:r>
-        <w:t>shows the code blocks executed</w:t>
-      </w:r>
-      <w:r>
-        <w:t xml:space="preserve">, along with their corresponding </w:t>
-      </w:r>
-      <w:r>
-        <w:t>metrics</w:t>
-      </w:r>
-      <w:r>
-        <w:t>.  The metrics can be show</w:t>
-      </w:r>
-      <w:r>
-        <w:t>n</w:t>
-      </w:r>
-      <w:r>
-        <w:t xml:space="preserve"> in absolute or relative terms.</w:t>
-      </w:r>
-      <w:r>
-        <w:t xml:space="preserve">  </w:t>
-      </w:r>
-      <w:r>
-        <w:t xml:space="preserve">A call is treated </w:t>
-      </w:r>
-      <w:r>
-        <w:t>like another code block</w:t>
-      </w:r>
-      <w:r>
-        <w:t>, where the overhead of the call is also shown.</w:t>
-      </w:r>
-    </w:p>
-    <w:p>
-      <w:r>
-        <w:t>Alternative call blocks (where code changes) are</w:t>
-      </w:r>
-      <w:r>
-        <w:t xml:space="preserve"> shown with their numbers </w:t>
-      </w:r>
-      <w:r>
-        <w:t>averaged.</w:t>
-      </w:r>
-    </w:p>
-    <w:p>
-      <w:r>
-        <w:t xml:space="preserve">The context of the results can be filtered </w:t>
-      </w:r>
-      <w:r>
-        <w:t xml:space="preserve">(using a drop-down) to a </w:t>
-      </w:r>
-      <w:r>
-        <w:t>specific call-stack or reflect all caller</w:t>
-      </w:r>
-      <w:r>
-        <w:t xml:space="preserve"> stacks</w:t>
-      </w:r>
-      <w:r>
-        <w:t>.</w:t>
-      </w:r>
-    </w:p>
-    <w:p>
-      <w:pPr>
-        <w:rPr>
-          <w:b/>
-          <w:bCs/>
-        </w:rPr>
-      </w:pPr>
-      <w:r>
-        <w:rPr>
-          <w:b/>
-          <w:bCs/>
-        </w:rPr>
-        <w:t xml:space="preserve">Code </w:t>
-      </w:r>
-      <w:r>
-        <w:rPr>
-          <w:b/>
-          <w:bCs/>
-        </w:rPr>
-        <w:t>Disassembly</w:t>
-      </w:r>
-    </w:p>
-    <w:p>
-      <w:r>
-        <w:t xml:space="preserve">Shows a disassembly of the </w:t>
+        <w:t xml:space="preserve"> – used to view the performance of an individual routine.</w:t>
+      </w:r>
+      <w:r>
+        <w:t xml:space="preserve"> </w:t>
+      </w:r>
+    </w:p>
+    <w:p>
+      <w:r>
+        <w:t xml:space="preserve">The panel shows </w:t>
+      </w:r>
+      <w:r>
+        <w:t xml:space="preserve">a disassembly of the </w:t>
       </w:r>
       <w:r>
         <w:t xml:space="preserve">current </w:t>
       </w:r>
       <w:r>
-        <w:t>routine’s instructions.  If alternative opcode sequences exist, these can be toggled over.  Specific metrics are shown for each (somehow).</w:t>
-      </w:r>
-      <w:r>
-        <w:t xml:space="preserve">  The </w:t>
-      </w:r>
-      <w:r>
-        <w:t>dissemble extends to the routine above and below.</w:t>
-      </w:r>
-    </w:p>
-    <w:p>
-      <w:r>
-        <w:t>If labels are present in the .perf file, these are included in the disassembly as labels, and destination locations.  They also are used to annotate indexed and absolute addressing modes, where the resolved address falls within a data structure.  A data structure is denoted by a label which does not fall within a code region, where the data structure reaches up to the next defined label.</w:t>
-      </w:r>
-    </w:p>
-    <w:p>
-      <w:pPr>
-        <w:rPr>
-          <w:b/>
-          <w:bCs/>
-        </w:rPr>
-      </w:pPr>
-      <w:r>
-        <w:rPr>
-          <w:b/>
-          <w:bCs/>
-        </w:rPr>
-        <w:t>Layout panel arrangements</w:t>
-      </w:r>
-    </w:p>
-    <w:p>
-      <w:r>
-        <w:t>The panels can be arranged in different ways to optimize analysis.</w:t>
-      </w:r>
-      <w:r>
-        <w:t xml:space="preserve">  The timeline view can be </w:t>
-      </w:r>
-      <w:r>
-        <w:t xml:space="preserve">optionally </w:t>
-      </w:r>
-      <w:r>
-        <w:t>collapsed,</w:t>
-      </w:r>
-      <w:r>
-        <w:t xml:space="preserve"> and the tabbed and </w:t>
-      </w:r>
-      <w:r>
-        <w:t>code-view panels can be arranged horizontally or vertically.</w:t>
-      </w:r>
-    </w:p>
-    <w:p>
-      <w:pPr>
-        <w:rPr>
-          <w:b/>
-          <w:bCs/>
-        </w:rPr>
-      </w:pPr>
-      <w:r>
-        <w:rPr>
-          <w:b/>
-          <w:bCs/>
-        </w:rPr>
-        <w:lastRenderedPageBreak/>
-        <w:t>Tooltips</w:t>
-      </w:r>
-    </w:p>
-    <w:p>
-      <w:r>
-        <w:t xml:space="preserve">Hovering over a numeric value will show </w:t>
-      </w:r>
-      <w:r>
-        <w:t xml:space="preserve">a </w:t>
-      </w:r>
-      <w:r>
-        <w:t>percentage</w:t>
-      </w:r>
-      <w:r>
-        <w:t xml:space="preserve"> </w:t>
-      </w:r>
-      <w:r>
-        <w:t>and other numeric formats.</w:t>
+        <w:t xml:space="preserve">routine’s instructions.  If alternative opcode sequences exist, </w:t>
+      </w:r>
+      <w:r>
+        <w:t>a vertical bar denotes that the code is modified.</w:t>
       </w:r>
     </w:p>
     <w:p>
@@ -9172,19 +8123,15 @@
       <w:r>
         <w:t xml:space="preserve">Hexadecimal </w:t>
       </w:r>
-      <w:proofErr w:type="gramStart"/>
       <w:r>
         <w:t>symbol: ‘</w:t>
       </w:r>
-      <w:proofErr w:type="gramEnd"/>
       <w:r>
         <w:t>$</w:t>
       </w:r>
-      <w:proofErr w:type="gramStart"/>
       <w:r>
         <w:t>’, ‘</w:t>
       </w:r>
-      <w:proofErr w:type="gramEnd"/>
       <w:r>
         <w:t>&amp;</w:t>
       </w:r>
@@ -9330,21 +8277,13 @@
         <w:t xml:space="preserve"> </w:t>
       </w:r>
       <w:r>
-        <w:t xml:space="preserve">or label.  For example, </w:t>
-      </w:r>
-      <w:proofErr w:type="spellStart"/>
-      <w:r>
-        <w:t>wait</w:t>
+        <w:t>or label.  For example, wait</w:t>
       </w:r>
       <w:r>
         <w:t>On</w:t>
       </w:r>
       <w:r>
-        <w:t>VSync</w:t>
-      </w:r>
-      <w:proofErr w:type="spellEnd"/>
-      <w:r>
-        <w:t xml:space="preserve"> could be configured to show a marker on completion.  Markers can be shown either as a milestone (diamond), or as a vertical line.</w:t>
+        <w:t>VSync could be configured to show a marker on completion.  Markers can be shown either as a milestone (diamond), or as a vertical line.</w:t>
       </w:r>
     </w:p>
     <w:p>
@@ -9436,6 +8375,7 @@
         </w:numPr>
       </w:pPr>
       <w:r>
+        <w:lastRenderedPageBreak/>
         <w:t>Each View responds to selection changes, highlighting the most appropriate element</w:t>
       </w:r>
       <w:r>
@@ -9590,7 +8530,6 @@
         </w:numPr>
       </w:pPr>
       <w:r>
-        <w:lastRenderedPageBreak/>
         <w:t>Scroll position changes</w:t>
       </w:r>
     </w:p>
@@ -9853,6 +8792,7 @@
         </w:numPr>
       </w:pPr>
       <w:r>
+        <w:lastRenderedPageBreak/>
         <w:t>Instructions</w:t>
       </w:r>
       <w:r>
@@ -10098,7 +9038,6 @@
         </w:numPr>
       </w:pPr>
       <w:r>
-        <w:lastRenderedPageBreak/>
         <w:t>Memory read</w:t>
       </w:r>
       <w:r>
@@ -10219,11 +9158,9 @@
       <w:r>
         <w:t xml:space="preserve">Aggregated CPU Metrics, by </w:t>
       </w:r>
-      <w:proofErr w:type="spellStart"/>
       <w:r>
         <w:t>RoutineStack</w:t>
       </w:r>
-      <w:proofErr w:type="spellEnd"/>
       <w:r>
         <w:t xml:space="preserve"> – </w:t>
       </w:r>
@@ -10288,7 +9225,6 @@
           <w:numId w:val="9"/>
         </w:numPr>
       </w:pPr>
-      <w:proofErr w:type="spellStart"/>
       <w:r>
         <w:rPr>
           <w:b/>
@@ -10296,20 +9232,11 @@
         </w:rPr>
         <w:t>CallStack</w:t>
       </w:r>
-      <w:proofErr w:type="spellEnd"/>
       <w:r>
         <w:t xml:space="preserve"> – represents a</w:t>
       </w:r>
       <w:r>
-        <w:t xml:space="preserve"> call stack within the recorded program</w:t>
-      </w:r>
-      <w:proofErr w:type="gramStart"/>
-      <w:r>
-        <w:t xml:space="preserve">. </w:t>
-      </w:r>
-      <w:proofErr w:type="gramEnd"/>
-      <w:r>
-        <w:t>Contains the following fields:</w:t>
+        <w:t xml:space="preserve"> call stack within the recorded program. Contains the following fields:</w:t>
       </w:r>
     </w:p>
     <w:p>
@@ -10354,15 +9281,7 @@
         </w:numPr>
       </w:pPr>
       <w:r>
-        <w:t xml:space="preserve">Parent </w:t>
-      </w:r>
-      <w:proofErr w:type="spellStart"/>
-      <w:r>
-        <w:t>CallStack</w:t>
-      </w:r>
-      <w:proofErr w:type="spellEnd"/>
-      <w:r>
-        <w:t xml:space="preserve"> reference</w:t>
+        <w:t>Parent CallStack reference</w:t>
       </w:r>
     </w:p>
     <w:p>
@@ -10397,15 +9316,7 @@
         <w:ind w:left="1080"/>
       </w:pPr>
       <w:r>
-        <w:t xml:space="preserve">The identify of a </w:t>
-      </w:r>
-      <w:proofErr w:type="spellStart"/>
-      <w:r>
-        <w:t>CallStack</w:t>
-      </w:r>
-      <w:proofErr w:type="spellEnd"/>
-      <w:r>
-        <w:t xml:space="preserve"> is defined </w:t>
+        <w:t xml:space="preserve">The identify of a CallStack is defined </w:t>
       </w:r>
       <w:r>
         <w:t xml:space="preserve">by the sequence of </w:t>
@@ -10446,7 +9357,6 @@
           <w:numId w:val="9"/>
         </w:numPr>
       </w:pPr>
-      <w:proofErr w:type="spellStart"/>
       <w:r>
         <w:rPr>
           <w:b/>
@@ -10454,7 +9364,6 @@
         </w:rPr>
         <w:t>StackFrame</w:t>
       </w:r>
-      <w:proofErr w:type="spellEnd"/>
       <w:r>
         <w:t xml:space="preserve"> – represents a unique stack-frame within the recorded program.</w:t>
       </w:r>
@@ -10513,6 +9422,7 @@
         </w:numPr>
       </w:pPr>
       <w:r>
+        <w:lastRenderedPageBreak/>
         <w:t xml:space="preserve">Start </w:t>
       </w:r>
       <w:r>
@@ -10700,7 +9610,6 @@
           <w:rFonts w:ascii="Aptos" w:hAnsi="Aptos"/>
           <w:color w:val="000000"/>
         </w:rPr>
-        <w:lastRenderedPageBreak/>
         <w:t>The Program’s Labels come from the Label Chunk, Instructions from the Execution Chunk</w:t>
       </w:r>
       <w:r>
@@ -11098,6 +10007,7 @@
         </w:numPr>
       </w:pPr>
       <w:r>
+        <w:lastRenderedPageBreak/>
         <w:t>Every JSR destination address</w:t>
       </w:r>
       <w:r>
@@ -11371,7 +10281,6 @@
           <w:rFonts w:ascii="Aptos" w:hAnsi="Aptos"/>
           <w:color w:val="000000"/>
         </w:rPr>
-        <w:lastRenderedPageBreak/>
         <w:t xml:space="preserve">The program's cycle count, which begins at zero, is incremented as instructions are processed. </w:t>
       </w:r>
       <w:r>
@@ -11906,6 +10815,7 @@
         <w:pStyle w:val="Heading3"/>
       </w:pPr>
       <w:r>
+        <w:lastRenderedPageBreak/>
         <w:t>Game loop analysis</w:t>
       </w:r>
     </w:p>
@@ -12123,7 +11033,6 @@
         <w:pStyle w:val="Heading2"/>
       </w:pPr>
       <w:r>
-        <w:lastRenderedPageBreak/>
         <w:t xml:space="preserve">Dynamic </w:t>
       </w:r>
       <w:r>
@@ -12465,6 +11374,7 @@
         </w:numPr>
       </w:pPr>
       <w:r>
+        <w:lastRenderedPageBreak/>
         <w:t>Calculate CPU metrics</w:t>
       </w:r>
     </w:p>
@@ -12501,11 +11411,7 @@
         </w:numPr>
       </w:pPr>
       <w:r>
-        <w:t xml:space="preserve">Populate </w:t>
-      </w:r>
-      <w:proofErr w:type="spellStart"/>
-      <w:r>
-        <w:t>No</w:t>
+        <w:t>Populate No</w:t>
       </w:r>
       <w:r>
         <w:t>Tr</w:t>
@@ -12516,7 +11422,6 @@
       <w:r>
         <w:t>verse</w:t>
       </w:r>
-      <w:proofErr w:type="spellEnd"/>
       <w:r>
         <w:t xml:space="preserve"> </w:t>
       </w:r>
@@ -12568,16 +11473,11 @@
           <w:numId w:val="19"/>
         </w:numPr>
       </w:pPr>
-      <w:proofErr w:type="spellStart"/>
       <w:r>
         <w:t>Routine</w:t>
       </w:r>
       <w:r>
-        <w:t>aggregated</w:t>
-      </w:r>
-      <w:proofErr w:type="spellEnd"/>
-      <w:r>
-        <w:t xml:space="preserve"> and total aggregated</w:t>
+        <w:t>aggregated and total aggregated</w:t>
       </w:r>
       <w:r>
         <w:t xml:space="preserve"> CPU metrics</w:t>
@@ -12725,7 +11625,6 @@
         </w:numPr>
       </w:pPr>
       <w:r>
-        <w:lastRenderedPageBreak/>
         <w:t xml:space="preserve">We also determine if </w:t>
       </w:r>
       <w:r>
@@ -12951,18 +11850,10 @@
         <w:t xml:space="preserve"> (this can be calculated) </w:t>
       </w:r>
       <w:r>
-        <w:t xml:space="preserve">on </w:t>
-      </w:r>
-      <w:proofErr w:type="gramStart"/>
-      <w:r>
-        <w:t xml:space="preserve">the </w:t>
-      </w:r>
-      <w:r>
-        <w:t>Video</w:t>
-      </w:r>
-      <w:proofErr w:type="gramEnd"/>
-      <w:r>
-        <w:t xml:space="preserve"> </w:t>
+        <w:t xml:space="preserve">on the </w:t>
+      </w:r>
+      <w:r>
+        <w:t xml:space="preserve">Video </w:t>
       </w:r>
       <w:r>
         <w:t>6845</w:t>
@@ -12997,15 +11888,7 @@
         </w:numPr>
       </w:pPr>
       <w:r>
-        <w:t xml:space="preserve">Detecting </w:t>
-      </w:r>
-      <w:proofErr w:type="spellStart"/>
-      <w:r>
-        <w:t>roms</w:t>
-      </w:r>
-      <w:proofErr w:type="spellEnd"/>
-      <w:r>
-        <w:t xml:space="preserve"> being paged in.  The easiest way to handle this is to record the value written to &amp;</w:t>
+        <w:t>Detecting roms being paged in.  The easiest way to handle this is to record the value written to &amp;</w:t>
       </w:r>
       <w:r>
         <w:t>FE30</w:t>
@@ -13032,15 +11915,8 @@
         </w:numPr>
       </w:pPr>
       <w:r>
-        <w:t>A spin loop is a tight look that doesn’t write anything, it just reads something</w:t>
-      </w:r>
-      <w:proofErr w:type="gramStart"/>
-      <w:r>
-        <w:t xml:space="preserve">. </w:t>
-      </w:r>
-      <w:proofErr w:type="gramEnd"/>
-      <w:r>
-        <w:t>They are shown in light grey (background is white).</w:t>
+        <w:lastRenderedPageBreak/>
+        <w:t>A spin loop is a tight look that doesn’t write anything, it just reads something. They are shown in light grey (background is white).</w:t>
       </w:r>
       <w:r>
         <w:t xml:space="preserve">  We are looking for a repeated set of non-instructions in the recording.</w:t>
@@ -13067,15 +11943,7 @@
         </w:numPr>
       </w:pPr>
       <w:r>
-        <w:t xml:space="preserve">Look for </w:t>
-      </w:r>
-      <w:proofErr w:type="gramStart"/>
-      <w:r>
-        <w:t>repeating</w:t>
-      </w:r>
-      <w:proofErr w:type="gramEnd"/>
-      <w:r>
-        <w:t xml:space="preserve"> instructions.</w:t>
+        <w:t>Look for repeating instructions.</w:t>
       </w:r>
     </w:p>
     <w:p>
@@ -13087,15 +11955,7 @@
         </w:numPr>
       </w:pPr>
       <w:r>
-        <w:t>Detecting when screen memory is being read</w:t>
-      </w:r>
-      <w:proofErr w:type="gramStart"/>
-      <w:r>
-        <w:t xml:space="preserve">. </w:t>
-      </w:r>
-      <w:proofErr w:type="gramEnd"/>
-      <w:r>
-        <w:t>We need to know.</w:t>
+        <w:t>Detecting when screen memory is being read. We need to know.</w:t>
       </w:r>
     </w:p>
     <w:p>
@@ -13107,15 +11967,7 @@
         </w:numPr>
       </w:pPr>
       <w:r>
-        <w:t xml:space="preserve">The screen </w:t>
-      </w:r>
-      <w:proofErr w:type="gramStart"/>
-      <w:r>
-        <w:t>start</w:t>
-      </w:r>
-      <w:proofErr w:type="gramEnd"/>
-      <w:r>
-        <w:t xml:space="preserve"> address.  Write value stored to </w:t>
+        <w:t xml:space="preserve">The screen start address.  Write value stored to </w:t>
       </w:r>
       <w:r>
         <w:t>&amp;FE00</w:t>
@@ -13139,15 +11991,7 @@
         </w:numPr>
       </w:pPr>
       <w:r>
-        <w:t>The screen wrap-size (how many K)</w:t>
-      </w:r>
-      <w:proofErr w:type="gramStart"/>
-      <w:r>
-        <w:t xml:space="preserve">. </w:t>
-      </w:r>
-      <w:proofErr w:type="gramEnd"/>
-      <w:r>
-        <w:t xml:space="preserve">Write value stored to </w:t>
+        <w:t xml:space="preserve">The screen wrap-size (how many K). Write value stored to </w:t>
       </w:r>
       <w:r>
         <w:t>&amp;FE40</w:t>
@@ -13162,23 +12006,7 @@
         </w:numPr>
       </w:pPr>
       <w:r>
-        <w:t xml:space="preserve">The screen format (mode-7 verses </w:t>
-      </w:r>
-      <w:proofErr w:type="gramStart"/>
-      <w:r>
-        <w:t>non mode</w:t>
-      </w:r>
-      <w:proofErr w:type="gramEnd"/>
-      <w:r>
-        <w:t>-7)</w:t>
-      </w:r>
-      <w:proofErr w:type="gramStart"/>
-      <w:r>
-        <w:t xml:space="preserve">. </w:t>
-      </w:r>
-      <w:proofErr w:type="gramEnd"/>
-      <w:r>
-        <w:t xml:space="preserve">Write values stored at </w:t>
+        <w:t xml:space="preserve">The screen format (mode-7 verses non mode-7). Write values stored at </w:t>
       </w:r>
       <w:r>
         <w:t>&amp;FE20</w:t>
@@ -13217,45 +12045,13 @@
         </w:numPr>
       </w:pPr>
       <w:r>
-        <w:t xml:space="preserve">Detecting when the screen read starts.  We need to know when the v-sync </w:t>
-      </w:r>
-      <w:proofErr w:type="gramStart"/>
-      <w:r>
-        <w:t>interrupt</w:t>
-      </w:r>
-      <w:proofErr w:type="gramEnd"/>
-      <w:r>
-        <w:t xml:space="preserve"> occurs.  We can time it from here.  We can determine this by </w:t>
-      </w:r>
-      <w:proofErr w:type="gramStart"/>
-      <w:r>
-        <w:t>looking</w:t>
-      </w:r>
-      <w:proofErr w:type="gramEnd"/>
-      <w:r>
-        <w:t xml:space="preserve"> if the values read from &amp;</w:t>
+        <w:t>Detecting when the screen read starts.  We need to know when the v-sync interrupt occurs.  We can time it from here.  We can determine this by looking if the values read from &amp;</w:t>
       </w:r>
       <w:r>
         <w:t>FE4D</w:t>
       </w:r>
       <w:r>
-        <w:t xml:space="preserve"> </w:t>
-      </w:r>
-      <w:proofErr w:type="gramStart"/>
-      <w:r>
-        <w:t>has</w:t>
-      </w:r>
-      <w:proofErr w:type="gramEnd"/>
-      <w:r>
-        <w:t xml:space="preserve"> bit two </w:t>
-      </w:r>
-      <w:proofErr w:type="gramStart"/>
-      <w:r>
-        <w:t>set</w:t>
-      </w:r>
-      <w:proofErr w:type="gramEnd"/>
-      <w:r>
-        <w:t>.  The rest is math.</w:t>
+        <w:t xml:space="preserve"> has bit two set.  The rest is math.</w:t>
       </w:r>
     </w:p>
     <w:p>
@@ -13333,7 +12129,6 @@
         </w:numPr>
       </w:pPr>
       <w:r>
-        <w:lastRenderedPageBreak/>
         <w:t>Timing synchronization</w:t>
       </w:r>
     </w:p>
@@ -13412,15 +12207,7 @@
         <w:t xml:space="preserve">Any code that </w:t>
       </w:r>
       <w:r>
-        <w:t xml:space="preserve">results in a function being </w:t>
-      </w:r>
-      <w:proofErr w:type="gramStart"/>
-      <w:r>
-        <w:t>called,</w:t>
-      </w:r>
-      <w:proofErr w:type="gramEnd"/>
-      <w:r>
-        <w:t xml:space="preserve"> is an implicit function all.</w:t>
+        <w:t>results in a function being called, is an implicit function all.</w:t>
       </w:r>
       <w:r>
         <w:t xml:space="preserve">  A return that lands on a function is </w:t>
@@ -13576,15 +12363,7 @@
         <w:t xml:space="preserve">Values on the stack can be a combination of return addresses, </w:t>
       </w:r>
       <w:r>
-        <w:t xml:space="preserve">and other data.  We want to understand what </w:t>
-      </w:r>
-      <w:proofErr w:type="gramStart"/>
-      <w:r>
-        <w:t>is a return address verses other data</w:t>
-      </w:r>
-      <w:proofErr w:type="gramEnd"/>
-      <w:r>
-        <w:t>.</w:t>
+        <w:t>and other data.  We want to understand what is a return address verses other data.</w:t>
       </w:r>
     </w:p>
     <w:p>
@@ -13596,6 +12375,7 @@
         </w:numPr>
       </w:pPr>
       <w:r>
+        <w:lastRenderedPageBreak/>
         <w:t xml:space="preserve">Look as address pairs on the stack, if these correlate to </w:t>
       </w:r>
       <w:r>

</xml_diff>

<commit_message>
Added vertical and horizontal layouts
</commit_message>
<xml_diff>
--- a/docs/Development.docx
+++ b/docs/Development.docx
@@ -203,7 +203,21 @@
     </w:p>
     <w:p>
       <w:r>
-        <w:t>Secondly, I’d like to know what percentage of screen memory read/writes are performed ah</w:t>
+        <w:t>Secondly, I’d like to understand what impact interrupt code is having on performance.  For example, in ‘</w:t>
+      </w:r>
+      <w:r>
+        <w:t>An Adventure in Time</w:t>
+      </w:r>
+      <w:r>
+        <w:t>’, samples are played using an 8Khz timer.  I’d love to better understand their impact in turns of missed frames and screen tearing.</w:t>
+      </w:r>
+    </w:p>
+    <w:p>
+      <w:r>
+        <w:t>Thirdly</w:t>
+      </w:r>
+      <w:r>
+        <w:t>, I’d like to know what percentage of screen memory read/writes are performed ah</w:t>
       </w:r>
       <w:r>
         <w:t xml:space="preserve">ead of the memory display read.  </w:t>
@@ -216,44 +230,6 @@
       </w:r>
       <w:r>
         <w:t xml:space="preserve"> the memory display read.</w:t>
-      </w:r>
-    </w:p>
-    <w:p>
-      <w:r>
-        <w:t xml:space="preserve">Thirdly, I’d like to understand </w:t>
-      </w:r>
-      <w:r>
-        <w:t>what impact interrupt code is having on performance.  For example, in ‘</w:t>
-      </w:r>
-      <w:r>
-        <w:t>An Adventure in Time</w:t>
-      </w:r>
-      <w:r>
-        <w:t xml:space="preserve">’, </w:t>
-      </w:r>
-      <w:r>
-        <w:t xml:space="preserve">samples are played using an </w:t>
-      </w:r>
-      <w:r>
-        <w:t xml:space="preserve">8Khz timer.  I’d </w:t>
-      </w:r>
-      <w:r>
-        <w:t xml:space="preserve">love </w:t>
-      </w:r>
-      <w:r>
-        <w:t>to better understand the</w:t>
-      </w:r>
-      <w:r>
-        <w:t>ir</w:t>
-      </w:r>
-      <w:r>
-        <w:t xml:space="preserve"> impact</w:t>
-      </w:r>
-      <w:r>
-        <w:t xml:space="preserve"> in turns of missed frames</w:t>
-      </w:r>
-      <w:r>
-        <w:t xml:space="preserve"> and screen tearing.</w:t>
       </w:r>
     </w:p>
     <w:p>
@@ -8534,83 +8510,6 @@
     </w:p>
     <w:p>
       <w:r>
-        <w:t>The view can be expanded to show:</w:t>
-      </w:r>
-    </w:p>
-    <w:p>
-      <w:pPr>
-        <w:pStyle w:val="ListParagraph"/>
-        <w:numPr>
-          <w:ilvl w:val="0"/>
-          <w:numId w:val="8"/>
-        </w:numPr>
-      </w:pPr>
-      <w:r>
-        <w:t>Percentage of non-waiting time</w:t>
-      </w:r>
-    </w:p>
-    <w:p>
-      <w:pPr>
-        <w:pStyle w:val="ListParagraph"/>
-        <w:numPr>
-          <w:ilvl w:val="0"/>
-          <w:numId w:val="8"/>
-        </w:numPr>
-      </w:pPr>
-      <w:r>
-        <w:t xml:space="preserve">Frame </w:t>
-      </w:r>
-      <w:r>
-        <w:t>rendering completeness</w:t>
-      </w:r>
-    </w:p>
-    <w:p>
-      <w:pPr>
-        <w:pStyle w:val="ListParagraph"/>
-        <w:numPr>
-          <w:ilvl w:val="0"/>
-          <w:numId w:val="8"/>
-        </w:numPr>
-      </w:pPr>
-      <w:r>
-        <w:t>E</w:t>
-      </w:r>
-      <w:r>
-        <w:t>vents</w:t>
-      </w:r>
-      <w:r>
-        <w:t xml:space="preserve"> (</w:t>
-      </w:r>
-      <w:r>
-        <w:t xml:space="preserve">memory display reads, </w:t>
-      </w:r>
-      <w:r>
-        <w:t>non-waiting durations, custom event</w:t>
-      </w:r>
-      <w:r>
-        <w:t>)</w:t>
-      </w:r>
-    </w:p>
-    <w:p>
-      <w:pPr>
-        <w:pStyle w:val="ListParagraph"/>
-        <w:numPr>
-          <w:ilvl w:val="0"/>
-          <w:numId w:val="8"/>
-        </w:numPr>
-      </w:pPr>
-      <w:r>
-        <w:t>The s</w:t>
-      </w:r>
-      <w:r>
-        <w:t>elected routine’s s</w:t>
-      </w:r>
-      <w:r>
-        <w:t>tack frames</w:t>
-      </w:r>
-    </w:p>
-    <w:p>
-      <w:r>
         <w:rPr>
           <w:b/>
           <w:bCs/>
@@ -8732,11 +8631,7 @@
         <w:t>is spending its time.  Each node in the tree represents a routine, with the top-level nodes showing the program entry point</w:t>
       </w:r>
       <w:r>
-        <w:t xml:space="preserve"> and </w:t>
-      </w:r>
-      <w:r>
-        <w:lastRenderedPageBreak/>
-        <w:t xml:space="preserve">interrupt </w:t>
+        <w:t xml:space="preserve"> and interrupt </w:t>
       </w:r>
       <w:r>
         <w:t>routines</w:t>
@@ -8798,6 +8693,7 @@
           <w:b/>
           <w:bCs/>
         </w:rPr>
+        <w:lastRenderedPageBreak/>
         <w:t xml:space="preserve">Memory </w:t>
       </w:r>
       <w:r>
@@ -8814,68 +8710,72 @@
         <w:t xml:space="preserve">tab </w:t>
       </w:r>
       <w:r>
-        <w:t>lists the highest and lowest used memory in the application</w:t>
+        <w:t xml:space="preserve">lists the highest </w:t>
+      </w:r>
+      <w:r>
+        <w:t xml:space="preserve">to </w:t>
+      </w:r>
+      <w:r>
+        <w:t>lowest used memory in the application</w:t>
       </w:r>
       <w:r>
         <w:t>.</w:t>
       </w:r>
       <w:r>
-        <w:t xml:space="preserve">  The memory can be shown </w:t>
-      </w:r>
-      <w:r>
-        <w:t>in a</w:t>
-      </w:r>
-      <w:r>
-        <w:t xml:space="preserve"> split-view </w:t>
+        <w:t xml:space="preserve">  The memory ca</w:t>
+      </w:r>
+      <w:r>
+        <w:t>n optionally be filtered to just the zero-page</w:t>
+      </w:r>
+      <w:r>
+        <w:t>.</w:t>
+      </w:r>
+    </w:p>
+    <w:p>
+      <w:r>
+        <w:t xml:space="preserve">Selecting an address </w:t>
+      </w:r>
+      <w:r>
+        <w:t xml:space="preserve">displays a panel on the right </w:t>
+      </w:r>
+      <w:r>
+        <w:t>which list</w:t>
+      </w:r>
+      <w:r>
+        <w:t>s</w:t>
+      </w:r>
+      <w:r>
+        <w:t xml:space="preserve"> all the routines which read or write to th</w:t>
+      </w:r>
+      <w:r>
+        <w:t>at</w:t>
+      </w:r>
+      <w:r>
+        <w:t xml:space="preserve"> address, </w:t>
       </w:r>
       <w:r>
         <w:t xml:space="preserve">with </w:t>
       </w:r>
       <w:r>
-        <w:t>zero-page addresses separate</w:t>
-      </w:r>
-      <w:r>
-        <w:t>d</w:t>
-      </w:r>
-      <w:r>
-        <w:t xml:space="preserve"> from non-zero-page addresses, a zero-page only view, and a non-zero-page only view.</w:t>
-      </w:r>
-    </w:p>
-    <w:p>
-      <w:r>
-        <w:t xml:space="preserve">Selecting an address </w:t>
-      </w:r>
-      <w:r>
-        <w:t xml:space="preserve">displays a panel on the right </w:t>
-      </w:r>
-      <w:r>
-        <w:t>which list</w:t>
-      </w:r>
-      <w:r>
-        <w:t>s</w:t>
-      </w:r>
-      <w:r>
-        <w:t xml:space="preserve"> all the routines which read or write to th</w:t>
-      </w:r>
-      <w:r>
-        <w:t>at</w:t>
-      </w:r>
-      <w:r>
-        <w:t xml:space="preserve"> address, </w:t>
-      </w:r>
-      <w:r>
-        <w:t>with access, read, and write counts.</w:t>
+        <w:t xml:space="preserve">respective </w:t>
+      </w:r>
+      <w:r>
+        <w:t>read</w:t>
+      </w:r>
+      <w:r>
+        <w:t xml:space="preserve"> </w:t>
+      </w:r>
+      <w:r>
+        <w:t>and write counts.</w:t>
       </w:r>
       <w:r>
         <w:t xml:space="preserve">  Selecting a routine </w:t>
       </w:r>
       <w:r>
-        <w:t>selects the routine in the code window, with the instructions that access the address highlighted.</w:t>
-      </w:r>
-    </w:p>
-    <w:p>
-      <w:r>
-        <w:t>Labels are shown next to addresses, where a close correlation has been established.</w:t>
+        <w:t>selects the routine in the code window,</w:t>
+      </w:r>
+      <w:r>
+        <w:t xml:space="preserve"> in which the read and write counts are shown.</w:t>
       </w:r>
     </w:p>
     <w:p>
@@ -9013,6 +8913,9 @@
         <w:t xml:space="preserve">hexadecimal, </w:t>
       </w:r>
       <w:r>
+        <w:t xml:space="preserve">octal, </w:t>
+      </w:r>
+      <w:r>
         <w:t xml:space="preserve">or </w:t>
       </w:r>
       <w:r>
@@ -9020,6 +8923,18 @@
       </w:r>
       <w:r>
         <w:t>.</w:t>
+      </w:r>
+    </w:p>
+    <w:p>
+      <w:pPr>
+        <w:pStyle w:val="ListParagraph"/>
+        <w:numPr>
+          <w:ilvl w:val="0"/>
+          <w:numId w:val="9"/>
+        </w:numPr>
+      </w:pPr>
+      <w:r>
+        <w:t>Display</w:t>
       </w:r>
     </w:p>
     <w:p>
@@ -9031,7 +8946,433 @@
         </w:numPr>
       </w:pPr>
       <w:r>
-        <w:t>Show labels</w:t>
+        <w:t>Font</w:t>
+      </w:r>
+      <w:r>
+        <w:t xml:space="preserve"> and scaling</w:t>
+      </w:r>
+    </w:p>
+    <w:p>
+      <w:pPr>
+        <w:pStyle w:val="Heading3"/>
+      </w:pPr>
+      <w:r>
+        <w:t xml:space="preserve">Managing the </w:t>
+      </w:r>
+      <w:r>
+        <w:t>‘</w:t>
+      </w:r>
+      <w:r>
+        <w:t>context</w:t>
+      </w:r>
+      <w:r>
+        <w:t>’</w:t>
+      </w:r>
+    </w:p>
+    <w:p>
+      <w:pPr>
+        <w:pStyle w:val="ListParagraph"/>
+        <w:numPr>
+          <w:ilvl w:val="0"/>
+          <w:numId w:val="9"/>
+        </w:numPr>
+      </w:pPr>
+      <w:r>
+        <w:t>The form owns the currently selected routine</w:t>
+      </w:r>
+      <w:r>
+        <w:t xml:space="preserve">, </w:t>
+      </w:r>
+      <w:r>
+        <w:t>call-stack</w:t>
+      </w:r>
+      <w:r>
+        <w:t>, and selected address.</w:t>
+      </w:r>
+    </w:p>
+    <w:p>
+      <w:pPr>
+        <w:pStyle w:val="ListParagraph"/>
+        <w:numPr>
+          <w:ilvl w:val="0"/>
+          <w:numId w:val="9"/>
+        </w:numPr>
+      </w:pPr>
+      <w:r>
+        <w:t xml:space="preserve">The selection can be </w:t>
+      </w:r>
+      <w:r>
+        <w:t xml:space="preserve">changed </w:t>
+      </w:r>
+      <w:r>
+        <w:t xml:space="preserve">and/or cleared </w:t>
+      </w:r>
+      <w:r>
+        <w:t xml:space="preserve">from </w:t>
+      </w:r>
+      <w:r>
+        <w:t xml:space="preserve">withing </w:t>
+      </w:r>
+      <w:r>
+        <w:t xml:space="preserve">any </w:t>
+      </w:r>
+      <w:r>
+        <w:t>V</w:t>
+      </w:r>
+      <w:r>
+        <w:t>iew</w:t>
+      </w:r>
+      <w:r>
+        <w:t>.</w:t>
+      </w:r>
+    </w:p>
+    <w:p>
+      <w:pPr>
+        <w:pStyle w:val="ListParagraph"/>
+        <w:numPr>
+          <w:ilvl w:val="0"/>
+          <w:numId w:val="9"/>
+        </w:numPr>
+      </w:pPr>
+      <w:r>
+        <w:t>Each View responds to selection changes, highlighting the most appropriate element</w:t>
+      </w:r>
+      <w:r>
+        <w:t xml:space="preserve"> within.</w:t>
+      </w:r>
+      <w:r>
+        <w:t xml:space="preserve">  For example, the Call Tree will select the most appropriate </w:t>
+      </w:r>
+      <w:r>
+        <w:t>tree node, expanding the tree as needed.</w:t>
+      </w:r>
+    </w:p>
+    <w:p>
+      <w:pPr>
+        <w:pStyle w:val="ListParagraph"/>
+        <w:numPr>
+          <w:ilvl w:val="0"/>
+          <w:numId w:val="9"/>
+        </w:numPr>
+        <w:rPr>
+          <w:rFonts w:ascii="Cascadia Mono" w:hAnsi="Cascadia Mono" w:cs="Cascadia Mono"/>
+          <w:color w:val="008000"/>
+          <w:kern w:val="0"/>
+          <w:sz w:val="19"/>
+          <w:szCs w:val="19"/>
+        </w:rPr>
+      </w:pPr>
+      <w:r>
+        <w:t xml:space="preserve">Selecting a view does not change the selection, but it may make the </w:t>
+      </w:r>
+      <w:r>
+        <w:t xml:space="preserve">current selected </w:t>
+      </w:r>
+      <w:r>
+        <w:t>call-stack not applicable</w:t>
+      </w:r>
+      <w:r>
+        <w:t xml:space="preserve">, resulting in the </w:t>
+      </w:r>
+      <w:r>
+        <w:t>Code View panel</w:t>
+      </w:r>
+      <w:r>
+        <w:t xml:space="preserve"> updating.</w:t>
+      </w:r>
+    </w:p>
+    <w:p>
+      <w:pPr>
+        <w:pStyle w:val="Heading3"/>
+      </w:pPr>
+      <w:r>
+        <w:t>Undo-Redo</w:t>
+      </w:r>
+      <w:r>
+        <w:t xml:space="preserve"> History</w:t>
+      </w:r>
+    </w:p>
+    <w:p>
+      <w:r>
+        <w:t xml:space="preserve">The following </w:t>
+      </w:r>
+      <w:r>
+        <w:t>actions</w:t>
+      </w:r>
+      <w:r>
+        <w:t xml:space="preserve"> are stored in the undo/redo </w:t>
+      </w:r>
+      <w:r>
+        <w:t>history:</w:t>
+      </w:r>
+    </w:p>
+    <w:p>
+      <w:pPr>
+        <w:pStyle w:val="ListParagraph"/>
+        <w:numPr>
+          <w:ilvl w:val="0"/>
+          <w:numId w:val="9"/>
+        </w:numPr>
+      </w:pPr>
+      <w:r>
+        <w:t xml:space="preserve">Select </w:t>
+      </w:r>
+      <w:r>
+        <w:t>time-line range</w:t>
+      </w:r>
+    </w:p>
+    <w:p>
+      <w:pPr>
+        <w:pStyle w:val="ListParagraph"/>
+        <w:numPr>
+          <w:ilvl w:val="0"/>
+          <w:numId w:val="9"/>
+        </w:numPr>
+      </w:pPr>
+      <w:r>
+        <w:t xml:space="preserve">Select/deselect </w:t>
+      </w:r>
+      <w:r>
+        <w:t>routine</w:t>
+      </w:r>
+      <w:r>
+        <w:t>/</w:t>
+      </w:r>
+      <w:r>
+        <w:t>call-stack</w:t>
+      </w:r>
+    </w:p>
+    <w:p>
+      <w:pPr>
+        <w:pStyle w:val="ListParagraph"/>
+        <w:numPr>
+          <w:ilvl w:val="0"/>
+          <w:numId w:val="9"/>
+        </w:numPr>
+      </w:pPr>
+      <w:r>
+        <w:t xml:space="preserve">Select </w:t>
+      </w:r>
+      <w:r>
+        <w:t>tab</w:t>
+      </w:r>
+    </w:p>
+    <w:p>
+      <w:pPr>
+        <w:pStyle w:val="ListParagraph"/>
+        <w:numPr>
+          <w:ilvl w:val="0"/>
+          <w:numId w:val="9"/>
+        </w:numPr>
+      </w:pPr>
+      <w:r>
+        <w:t xml:space="preserve">Select/deselect </w:t>
+      </w:r>
+      <w:r>
+        <w:t>memory address</w:t>
+      </w:r>
+    </w:p>
+    <w:p>
+      <w:pPr>
+        <w:pStyle w:val="ListParagraph"/>
+        <w:numPr>
+          <w:ilvl w:val="0"/>
+          <w:numId w:val="9"/>
+        </w:numPr>
+      </w:pPr>
+      <w:r>
+        <w:t>Show zero-page addresses</w:t>
+      </w:r>
+    </w:p>
+    <w:p>
+      <w:pPr>
+        <w:pStyle w:val="ListParagraph"/>
+        <w:numPr>
+          <w:ilvl w:val="0"/>
+          <w:numId w:val="9"/>
+        </w:numPr>
+      </w:pPr>
+      <w:r>
+        <w:t>Show hot routines</w:t>
+      </w:r>
+    </w:p>
+    <w:p>
+      <w:pPr>
+        <w:pStyle w:val="ListParagraph"/>
+        <w:numPr>
+          <w:ilvl w:val="0"/>
+          <w:numId w:val="9"/>
+        </w:numPr>
+      </w:pPr>
+      <w:r>
+        <w:t>Show hot paths</w:t>
+      </w:r>
+    </w:p>
+    <w:p>
+      <w:pPr>
+        <w:pStyle w:val="ListParagraph"/>
+        <w:numPr>
+          <w:ilvl w:val="0"/>
+          <w:numId w:val="9"/>
+        </w:numPr>
+      </w:pPr>
+      <w:r>
+        <w:lastRenderedPageBreak/>
+        <w:t xml:space="preserve">Flip </w:t>
+      </w:r>
+      <w:r>
+        <w:t>flame graph</w:t>
+      </w:r>
+    </w:p>
+    <w:p>
+      <w:r>
+        <w:t xml:space="preserve">The following actions are </w:t>
+      </w:r>
+      <w:r>
+        <w:rPr>
+          <w:u w:val="single"/>
+        </w:rPr>
+        <w:t>not</w:t>
+      </w:r>
+      <w:r>
+        <w:t xml:space="preserve"> stored in the undo/redo history: </w:t>
+      </w:r>
+    </w:p>
+    <w:p>
+      <w:pPr>
+        <w:pStyle w:val="ListParagraph"/>
+        <w:numPr>
+          <w:ilvl w:val="0"/>
+          <w:numId w:val="9"/>
+        </w:numPr>
+      </w:pPr>
+      <w:r>
+        <w:t>Open file</w:t>
+      </w:r>
+    </w:p>
+    <w:p>
+      <w:pPr>
+        <w:pStyle w:val="ListParagraph"/>
+        <w:numPr>
+          <w:ilvl w:val="0"/>
+          <w:numId w:val="9"/>
+        </w:numPr>
+      </w:pPr>
+      <w:r>
+        <w:t>Scroll position changes</w:t>
+      </w:r>
+    </w:p>
+    <w:p>
+      <w:pPr>
+        <w:pStyle w:val="ListParagraph"/>
+        <w:numPr>
+          <w:ilvl w:val="0"/>
+          <w:numId w:val="9"/>
+        </w:numPr>
+      </w:pPr>
+      <w:r>
+        <w:t>Divider position changes</w:t>
+      </w:r>
+    </w:p>
+    <w:p>
+      <w:pPr>
+        <w:pStyle w:val="ListParagraph"/>
+        <w:numPr>
+          <w:ilvl w:val="0"/>
+          <w:numId w:val="9"/>
+        </w:numPr>
+      </w:pPr>
+      <w:r>
+        <w:t>Window resize</w:t>
+      </w:r>
+      <w:r>
+        <w:t>s</w:t>
+      </w:r>
+    </w:p>
+    <w:p>
+      <w:pPr>
+        <w:pStyle w:val="ListParagraph"/>
+        <w:numPr>
+          <w:ilvl w:val="0"/>
+          <w:numId w:val="9"/>
+        </w:numPr>
+      </w:pPr>
+      <w:r>
+        <w:t>Zoom in / zoom out</w:t>
+      </w:r>
+    </w:p>
+    <w:p>
+      <w:pPr>
+        <w:pStyle w:val="ListParagraph"/>
+        <w:numPr>
+          <w:ilvl w:val="0"/>
+          <w:numId w:val="9"/>
+        </w:numPr>
+      </w:pPr>
+      <w:r>
+        <w:t>Settings</w:t>
+      </w:r>
+    </w:p>
+    <w:p>
+      <w:pPr>
+        <w:pStyle w:val="Heading1"/>
+      </w:pPr>
+      <w:r>
+        <w:t>Analysis</w:t>
+      </w:r>
+    </w:p>
+    <w:p>
+      <w:r>
+        <w:t>The following p</w:t>
+      </w:r>
+      <w:r>
+        <w:t>rimary data structures</w:t>
+      </w:r>
+      <w:r>
+        <w:t xml:space="preserve"> are used to </w:t>
+      </w:r>
+      <w:r>
+        <w:t xml:space="preserve">model </w:t>
+      </w:r>
+      <w:r>
+        <w:t xml:space="preserve">and analyze </w:t>
+      </w:r>
+      <w:r>
+        <w:t xml:space="preserve">recorded </w:t>
+      </w:r>
+      <w:r>
+        <w:t xml:space="preserve">performance </w:t>
+      </w:r>
+      <w:r>
+        <w:t>data</w:t>
+      </w:r>
+      <w:r>
+        <w:t>:</w:t>
+      </w:r>
+    </w:p>
+    <w:p>
+      <w:pPr>
+        <w:pStyle w:val="ListParagraph"/>
+        <w:numPr>
+          <w:ilvl w:val="0"/>
+          <w:numId w:val="9"/>
+        </w:numPr>
+      </w:pPr>
+      <w:r>
+        <w:rPr>
+          <w:b/>
+          <w:bCs/>
+        </w:rPr>
+        <w:t>Model</w:t>
+      </w:r>
+      <w:r>
+        <w:t xml:space="preserve"> – represent the </w:t>
+      </w:r>
+      <w:r>
+        <w:t xml:space="preserve">loaded </w:t>
+      </w:r>
+      <w:r>
+        <w:t>program.  Contains the following fields:</w:t>
       </w:r>
     </w:p>
     <w:p>
@@ -9043,7 +9384,133 @@
         </w:numPr>
       </w:pPr>
       <w:r>
-        <w:t>Show indexed labels (for data)</w:t>
+        <w:t>BBC model and CPU</w:t>
+      </w:r>
+    </w:p>
+    <w:p>
+      <w:pPr>
+        <w:pStyle w:val="ListParagraph"/>
+        <w:numPr>
+          <w:ilvl w:val="1"/>
+          <w:numId w:val="9"/>
+        </w:numPr>
+      </w:pPr>
+      <w:r>
+        <w:t>Program s</w:t>
+      </w:r>
+      <w:r>
+        <w:t xml:space="preserve">napshot </w:t>
+      </w:r>
+      <w:r>
+        <w:t>taken at the beginning of the recording, containing:</w:t>
+      </w:r>
+    </w:p>
+    <w:p>
+      <w:pPr>
+        <w:pStyle w:val="ListParagraph"/>
+        <w:numPr>
+          <w:ilvl w:val="2"/>
+          <w:numId w:val="9"/>
+        </w:numPr>
+      </w:pPr>
+      <w:r>
+        <w:t>The m</w:t>
+      </w:r>
+      <w:r>
+        <w:t>emory</w:t>
+      </w:r>
+    </w:p>
+    <w:p>
+      <w:pPr>
+        <w:pStyle w:val="ListParagraph"/>
+        <w:numPr>
+          <w:ilvl w:val="2"/>
+          <w:numId w:val="9"/>
+        </w:numPr>
+      </w:pPr>
+      <w:r>
+        <w:t xml:space="preserve"> </w:t>
+      </w:r>
+      <w:r>
+        <w:t>Stack pointer</w:t>
+      </w:r>
+    </w:p>
+    <w:p>
+      <w:pPr>
+        <w:pStyle w:val="ListParagraph"/>
+        <w:numPr>
+          <w:ilvl w:val="2"/>
+          <w:numId w:val="9"/>
+        </w:numPr>
+      </w:pPr>
+      <w:r>
+        <w:t>Rom Paging register and Access Control register</w:t>
+      </w:r>
+    </w:p>
+    <w:p>
+      <w:pPr>
+        <w:pStyle w:val="ListParagraph"/>
+        <w:numPr>
+          <w:ilvl w:val="2"/>
+          <w:numId w:val="9"/>
+        </w:numPr>
+      </w:pPr>
+      <w:r>
+        <w:t>Hidden RAM address (Integral)</w:t>
+      </w:r>
+    </w:p>
+    <w:p>
+      <w:pPr>
+        <w:pStyle w:val="ListParagraph"/>
+        <w:numPr>
+          <w:ilvl w:val="2"/>
+          <w:numId w:val="9"/>
+        </w:numPr>
+      </w:pPr>
+      <w:r>
+        <w:t>Video ULA register</w:t>
+      </w:r>
+      <w:r>
+        <w:t xml:space="preserve"> and palette</w:t>
+      </w:r>
+    </w:p>
+    <w:p>
+      <w:pPr>
+        <w:pStyle w:val="ListParagraph"/>
+        <w:numPr>
+          <w:ilvl w:val="2"/>
+          <w:numId w:val="9"/>
+        </w:numPr>
+      </w:pPr>
+      <w:r>
+        <w:t>Video control registers</w:t>
+      </w:r>
+    </w:p>
+    <w:p>
+      <w:pPr>
+        <w:pStyle w:val="ListParagraph"/>
+        <w:numPr>
+          <w:ilvl w:val="1"/>
+          <w:numId w:val="9"/>
+        </w:numPr>
+      </w:pPr>
+      <w:r>
+        <w:t>Labels (indexed by memory address)</w:t>
+      </w:r>
+    </w:p>
+    <w:p>
+      <w:pPr>
+        <w:pStyle w:val="ListParagraph"/>
+        <w:numPr>
+          <w:ilvl w:val="1"/>
+          <w:numId w:val="9"/>
+        </w:numPr>
+      </w:pPr>
+      <w:r>
+        <w:t>Instructions</w:t>
+      </w:r>
+      <w:r>
+        <w:t xml:space="preserve"> (array of Instruction)</w:t>
       </w:r>
     </w:p>
     <w:p>
@@ -9055,7 +9522,23 @@
         </w:numPr>
       </w:pPr>
       <w:r>
-        <w:t>Display</w:t>
+        <w:rPr>
+          <w:b/>
+          <w:bCs/>
+        </w:rPr>
+        <w:t>Canonical Address</w:t>
+      </w:r>
+      <w:r>
+        <w:t xml:space="preserve"> – represents </w:t>
+      </w:r>
+      <w:r>
+        <w:t>a unique memory address.</w:t>
+      </w:r>
+      <w:r>
+        <w:t xml:space="preserve"> </w:t>
+      </w:r>
+      <w:r>
+        <w:t xml:space="preserve"> Contains the following immutable fields:</w:t>
       </w:r>
     </w:p>
     <w:p>
@@ -9067,10 +9550,16 @@
         </w:numPr>
       </w:pPr>
       <w:r>
-        <w:t>Font</w:t>
-      </w:r>
-      <w:r>
-        <w:t xml:space="preserve"> and scaling</w:t>
+        <w:t>Page</w:t>
+      </w:r>
+      <w:r>
+        <w:t xml:space="preserve"> –</w:t>
+      </w:r>
+      <w:r>
+        <w:t xml:space="preserve"> </w:t>
+      </w:r>
+      <w:r>
+        <w:t>memory page</w:t>
       </w:r>
     </w:p>
     <w:p>
@@ -9082,7 +9571,10 @@
         </w:numPr>
       </w:pPr>
       <w:r>
-        <w:t>View layout</w:t>
+        <w:t>Address</w:t>
+      </w:r>
+      <w:r>
+        <w:t xml:space="preserve"> – relative address within the memory page</w:t>
       </w:r>
     </w:p>
     <w:p>
@@ -9094,13 +9586,35 @@
         </w:numPr>
       </w:pPr>
       <w:r>
-        <w:t>Custom m</w:t>
-      </w:r>
-      <w:r>
-        <w:t>arkers</w:t>
-      </w:r>
-      <w:r>
-        <w:t xml:space="preserve"> (associated with a .perf file name)</w:t>
+        <w:rPr>
+          <w:b/>
+          <w:bCs/>
+        </w:rPr>
+        <w:t>Instruction</w:t>
+      </w:r>
+      <w:r>
+        <w:t xml:space="preserve"> – represents a</w:t>
+      </w:r>
+      <w:r>
+        <w:t>n</w:t>
+      </w:r>
+      <w:r>
+        <w:t xml:space="preserve"> individual recorded instruction</w:t>
+      </w:r>
+      <w:r>
+        <w:t xml:space="preserve"> or interrupt</w:t>
+      </w:r>
+      <w:r>
+        <w:t>.</w:t>
+      </w:r>
+      <w:r>
+        <w:t xml:space="preserve">  Contains the following </w:t>
+      </w:r>
+      <w:r>
+        <w:t xml:space="preserve">immutable </w:t>
+      </w:r>
+      <w:r>
+        <w:t>fields:</w:t>
       </w:r>
     </w:p>
     <w:p>
@@ -9112,47 +9626,155 @@
         </w:numPr>
       </w:pPr>
       <w:r>
-        <w:t>A</w:t>
-      </w:r>
-      <w:r>
-        <w:t>bility to define markers based on an address</w:t>
+        <w:t>Type</w:t>
+      </w:r>
+      <w:r>
+        <w:t xml:space="preserve"> (i</w:t>
+      </w:r>
+      <w:r>
+        <w:t>nstruction, maskable interrupt, or non-maskable interrupt</w:t>
+      </w:r>
+      <w:r>
+        <w:t>)</w:t>
+      </w:r>
+    </w:p>
+    <w:p>
+      <w:pPr>
+        <w:pStyle w:val="ListParagraph"/>
+        <w:numPr>
+          <w:ilvl w:val="1"/>
+          <w:numId w:val="9"/>
+        </w:numPr>
+      </w:pPr>
+      <w:r>
+        <w:t>Cycle count</w:t>
+      </w:r>
+    </w:p>
+    <w:p>
+      <w:pPr>
+        <w:pStyle w:val="ListParagraph"/>
+        <w:numPr>
+          <w:ilvl w:val="1"/>
+          <w:numId w:val="9"/>
+        </w:numPr>
+      </w:pPr>
+      <w:r>
+        <w:t>Stack pointer</w:t>
+      </w:r>
+    </w:p>
+    <w:p>
+      <w:pPr>
+        <w:pStyle w:val="ListParagraph"/>
+        <w:numPr>
+          <w:ilvl w:val="1"/>
+          <w:numId w:val="9"/>
+        </w:numPr>
+      </w:pPr>
+      <w:r>
+        <w:t>ISR address (interrupt)</w:t>
+      </w:r>
+    </w:p>
+    <w:p>
+      <w:pPr>
+        <w:pStyle w:val="ListParagraph"/>
+        <w:numPr>
+          <w:ilvl w:val="1"/>
+          <w:numId w:val="9"/>
+        </w:numPr>
+      </w:pPr>
+      <w:r>
+        <w:t>Interrupted address (interrupt)</w:t>
+      </w:r>
+    </w:p>
+    <w:p>
+      <w:pPr>
+        <w:pStyle w:val="ListParagraph"/>
+        <w:numPr>
+          <w:ilvl w:val="1"/>
+          <w:numId w:val="9"/>
+        </w:numPr>
+      </w:pPr>
+      <w:r>
+        <w:t>Opcode address (instruction)</w:t>
+      </w:r>
+    </w:p>
+    <w:p>
+      <w:pPr>
+        <w:pStyle w:val="ListParagraph"/>
+        <w:numPr>
+          <w:ilvl w:val="1"/>
+          <w:numId w:val="9"/>
+        </w:numPr>
+      </w:pPr>
+      <w:r>
+        <w:lastRenderedPageBreak/>
+        <w:t>Opcode &amp; operand</w:t>
+      </w:r>
+      <w:r>
+        <w:t xml:space="preserve"> (instruction)</w:t>
+      </w:r>
+    </w:p>
+    <w:p>
+      <w:pPr>
+        <w:pStyle w:val="ListParagraph"/>
+        <w:numPr>
+          <w:ilvl w:val="1"/>
+          <w:numId w:val="9"/>
+        </w:numPr>
+      </w:pPr>
+      <w:r>
+        <w:t xml:space="preserve">Memory </w:t>
+      </w:r>
+      <w:r>
+        <w:t>a</w:t>
+      </w:r>
+      <w:r>
+        <w:t>ddress</w:t>
       </w:r>
       <w:r>
         <w:t xml:space="preserve"> </w:t>
       </w:r>
       <w:r>
-        <w:t xml:space="preserve">or label.  For example, </w:t>
-      </w:r>
-      <w:proofErr w:type="spellStart"/>
-      <w:r>
-        <w:t>wait</w:t>
-      </w:r>
-      <w:r>
-        <w:t>On</w:t>
-      </w:r>
-      <w:r>
-        <w:t>VSync</w:t>
-      </w:r>
-      <w:proofErr w:type="spellEnd"/>
-      <w:r>
-        <w:t xml:space="preserve"> could be configured to show a marker on completion.  Markers can be shown either as a milestone (diamond), or as a vertical line.</w:t>
-      </w:r>
-    </w:p>
-    <w:p>
-      <w:pPr>
-        <w:pStyle w:val="Heading3"/>
-      </w:pPr>
-      <w:r>
-        <w:t xml:space="preserve">Managing the </w:t>
-      </w:r>
-      <w:r>
-        <w:t>‘</w:t>
-      </w:r>
-      <w:r>
-        <w:t>context</w:t>
-      </w:r>
-      <w:r>
-        <w:t>’</w:t>
+        <w:t>/ d</w:t>
+      </w:r>
+      <w:r>
+        <w:t>estination address</w:t>
+      </w:r>
+      <w:r>
+        <w:t xml:space="preserve"> (instruction)</w:t>
+      </w:r>
+    </w:p>
+    <w:p>
+      <w:pPr>
+        <w:pStyle w:val="ListParagraph"/>
+        <w:numPr>
+          <w:ilvl w:val="1"/>
+          <w:numId w:val="9"/>
+        </w:numPr>
+      </w:pPr>
+      <w:r>
+        <w:t>Memory read</w:t>
+      </w:r>
+      <w:r>
+        <w:t>/</w:t>
+      </w:r>
+      <w:r>
+        <w:t>w</w:t>
+      </w:r>
+      <w:r>
+        <w:t xml:space="preserve">rite </w:t>
+      </w:r>
+      <w:r>
+        <w:t>v</w:t>
+      </w:r>
+      <w:r>
+        <w:t>alue</w:t>
+      </w:r>
+      <w:r>
+        <w:t>s</w:t>
+      </w:r>
+      <w:r>
+        <w:t xml:space="preserve"> (instruction)</w:t>
       </w:r>
     </w:p>
     <w:p>
@@ -9164,16 +9786,152 @@
         </w:numPr>
       </w:pPr>
       <w:r>
-        <w:t>The form owns the currently selected routine</w:t>
-      </w:r>
-      <w:r>
-        <w:t xml:space="preserve"> and </w:t>
-      </w:r>
-      <w:r>
-        <w:t>call-stack</w:t>
-      </w:r>
-      <w:r>
-        <w:t>.</w:t>
+        <w:rPr>
+          <w:b/>
+          <w:bCs/>
+        </w:rPr>
+        <w:t>Routine</w:t>
+      </w:r>
+      <w:r>
+        <w:t xml:space="preserve"> – represents a unique code routine.</w:t>
+      </w:r>
+      <w:r>
+        <w:t xml:space="preserve">  Contains the following fields.</w:t>
+      </w:r>
+    </w:p>
+    <w:p>
+      <w:pPr>
+        <w:pStyle w:val="ListParagraph"/>
+        <w:numPr>
+          <w:ilvl w:val="1"/>
+          <w:numId w:val="9"/>
+        </w:numPr>
+      </w:pPr>
+      <w:r>
+        <w:t>Start address</w:t>
+      </w:r>
+    </w:p>
+    <w:p>
+      <w:pPr>
+        <w:pStyle w:val="ListParagraph"/>
+        <w:numPr>
+          <w:ilvl w:val="1"/>
+          <w:numId w:val="9"/>
+        </w:numPr>
+      </w:pPr>
+      <w:r>
+        <w:t xml:space="preserve">End </w:t>
+      </w:r>
+      <w:r>
+        <w:t>address</w:t>
+      </w:r>
+    </w:p>
+    <w:p>
+      <w:pPr>
+        <w:pStyle w:val="ListParagraph"/>
+        <w:numPr>
+          <w:ilvl w:val="1"/>
+          <w:numId w:val="9"/>
+        </w:numPr>
+      </w:pPr>
+      <w:r>
+        <w:t>Label (optional)</w:t>
+      </w:r>
+    </w:p>
+    <w:p>
+      <w:pPr>
+        <w:pStyle w:val="ListParagraph"/>
+        <w:numPr>
+          <w:ilvl w:val="1"/>
+          <w:numId w:val="9"/>
+        </w:numPr>
+      </w:pPr>
+      <w:r>
+        <w:t>Code (including variants)</w:t>
+      </w:r>
+    </w:p>
+    <w:p>
+      <w:pPr>
+        <w:pStyle w:val="ListParagraph"/>
+        <w:numPr>
+          <w:ilvl w:val="1"/>
+          <w:numId w:val="9"/>
+        </w:numPr>
+      </w:pPr>
+      <w:r>
+        <w:t>Type (maskable ISR, non-maskable ISR, JSR, pseudo, unknown)</w:t>
+      </w:r>
+    </w:p>
+    <w:p>
+      <w:pPr>
+        <w:pStyle w:val="ListParagraph"/>
+        <w:numPr>
+          <w:ilvl w:val="1"/>
+          <w:numId w:val="9"/>
+        </w:numPr>
+      </w:pPr>
+      <w:r>
+        <w:t xml:space="preserve">Aggregated CPU Metrics, by </w:t>
+      </w:r>
+      <w:proofErr w:type="spellStart"/>
+      <w:r>
+        <w:t>RoutineStack</w:t>
+      </w:r>
+      <w:proofErr w:type="spellEnd"/>
+      <w:r>
+        <w:t xml:space="preserve"> – </w:t>
+      </w:r>
+      <w:r>
+        <w:rPr>
+          <w:i/>
+          <w:iCs/>
+        </w:rPr>
+        <w:t>populated</w:t>
+      </w:r>
+      <w:r>
+        <w:t xml:space="preserve"> </w:t>
+      </w:r>
+      <w:r>
+        <w:rPr>
+          <w:i/>
+          <w:iCs/>
+        </w:rPr>
+        <w:t>for a time-range</w:t>
+      </w:r>
+    </w:p>
+    <w:p>
+      <w:pPr>
+        <w:pStyle w:val="ListParagraph"/>
+        <w:numPr>
+          <w:ilvl w:val="1"/>
+          <w:numId w:val="9"/>
+        </w:numPr>
+      </w:pPr>
+      <w:r>
+        <w:t xml:space="preserve">Total </w:t>
+      </w:r>
+      <w:r>
+        <w:t>a</w:t>
+      </w:r>
+      <w:r>
+        <w:t xml:space="preserve">ggregated CPU Metrics – </w:t>
+      </w:r>
+      <w:r>
+        <w:rPr>
+          <w:i/>
+          <w:iCs/>
+        </w:rPr>
+        <w:t>populated</w:t>
+      </w:r>
+      <w:r>
+        <w:t xml:space="preserve"> </w:t>
+      </w:r>
+      <w:r>
+        <w:rPr>
+          <w:i/>
+          <w:iCs/>
+        </w:rPr>
+        <w:t>for a time-range</w:t>
       </w:r>
     </w:p>
     <w:p>
@@ -9184,32 +9942,146 @@
           <w:numId w:val="9"/>
         </w:numPr>
       </w:pPr>
-      <w:r>
-        <w:t xml:space="preserve">The selection can be </w:t>
-      </w:r>
-      <w:r>
-        <w:t xml:space="preserve">changed </w:t>
-      </w:r>
-      <w:r>
-        <w:t xml:space="preserve">and/or cleared </w:t>
-      </w:r>
-      <w:r>
-        <w:t xml:space="preserve">from </w:t>
-      </w:r>
-      <w:r>
-        <w:t xml:space="preserve">withing </w:t>
-      </w:r>
-      <w:r>
-        <w:t xml:space="preserve">any </w:t>
-      </w:r>
-      <w:r>
-        <w:t>V</w:t>
-      </w:r>
-      <w:r>
-        <w:t>iew</w:t>
-      </w:r>
-      <w:r>
-        <w:t>.</w:t>
+      <w:proofErr w:type="spellStart"/>
+      <w:r>
+        <w:rPr>
+          <w:b/>
+          <w:bCs/>
+        </w:rPr>
+        <w:t>CallStack</w:t>
+      </w:r>
+      <w:proofErr w:type="spellEnd"/>
+      <w:r>
+        <w:t xml:space="preserve"> – represents a</w:t>
+      </w:r>
+      <w:r>
+        <w:t xml:space="preserve"> call stack within the recorded program. Contains the following fields:</w:t>
+      </w:r>
+    </w:p>
+    <w:p>
+      <w:pPr>
+        <w:pStyle w:val="ListParagraph"/>
+        <w:numPr>
+          <w:ilvl w:val="1"/>
+          <w:numId w:val="9"/>
+        </w:numPr>
+      </w:pPr>
+      <w:r>
+        <w:t>Routine reference</w:t>
+      </w:r>
+    </w:p>
+    <w:p>
+      <w:pPr>
+        <w:pStyle w:val="ListParagraph"/>
+        <w:numPr>
+          <w:ilvl w:val="1"/>
+          <w:numId w:val="9"/>
+        </w:numPr>
+      </w:pPr>
+      <w:r>
+        <w:t>Canonical address</w:t>
+      </w:r>
+      <w:r>
+        <w:t xml:space="preserve"> (copy of </w:t>
+      </w:r>
+      <w:r>
+        <w:t>routine’s start address</w:t>
+      </w:r>
+      <w:r>
+        <w:t>)</w:t>
+      </w:r>
+    </w:p>
+    <w:p>
+      <w:pPr>
+        <w:pStyle w:val="ListParagraph"/>
+        <w:numPr>
+          <w:ilvl w:val="1"/>
+          <w:numId w:val="9"/>
+        </w:numPr>
+      </w:pPr>
+      <w:r>
+        <w:t xml:space="preserve">Parent </w:t>
+      </w:r>
+      <w:proofErr w:type="spellStart"/>
+      <w:r>
+        <w:t>CallStack</w:t>
+      </w:r>
+      <w:proofErr w:type="spellEnd"/>
+      <w:r>
+        <w:t xml:space="preserve"> reference</w:t>
+      </w:r>
+    </w:p>
+    <w:p>
+      <w:pPr>
+        <w:pStyle w:val="ListParagraph"/>
+        <w:numPr>
+          <w:ilvl w:val="1"/>
+          <w:numId w:val="9"/>
+        </w:numPr>
+      </w:pPr>
+      <w:r>
+        <w:t>Call t</w:t>
+      </w:r>
+      <w:r>
+        <w:t xml:space="preserve">ype </w:t>
+      </w:r>
+      <w:r>
+        <w:t xml:space="preserve">– e.g. </w:t>
+      </w:r>
+      <w:r>
+        <w:t xml:space="preserve">ISR, JSR, tail-call, </w:t>
+      </w:r>
+      <w:r>
+        <w:t xml:space="preserve">or </w:t>
+      </w:r>
+      <w:r>
+        <w:t>unknown</w:t>
+      </w:r>
+    </w:p>
+    <w:p>
+      <w:pPr>
+        <w:ind w:left="1080"/>
+      </w:pPr>
+      <w:r>
+        <w:t xml:space="preserve">The identify of a </w:t>
+      </w:r>
+      <w:proofErr w:type="spellStart"/>
+      <w:r>
+        <w:t>CallStack</w:t>
+      </w:r>
+      <w:proofErr w:type="spellEnd"/>
+      <w:r>
+        <w:t xml:space="preserve"> is defined </w:t>
+      </w:r>
+      <w:r>
+        <w:t xml:space="preserve">by the sequence of </w:t>
+      </w:r>
+      <w:r>
+        <w:t>addresses</w:t>
+      </w:r>
+      <w:r>
+        <w:t xml:space="preserve"> </w:t>
+      </w:r>
+      <w:r>
+        <w:t xml:space="preserve">up through the parent </w:t>
+      </w:r>
+      <w:r>
+        <w:t>chain</w:t>
+      </w:r>
+      <w:r>
+        <w:t xml:space="preserve">, </w:t>
+      </w:r>
+      <w:r>
+        <w:t xml:space="preserve">ending at the </w:t>
+      </w:r>
+      <w:r>
+        <w:t xml:space="preserve">root or </w:t>
+      </w:r>
+      <w:r>
+        <w:t xml:space="preserve">a call stack that has an </w:t>
+      </w:r>
+      <w:r>
+        <w:t>ISR call type.</w:t>
       </w:r>
     </w:p>
     <w:p>
@@ -9220,290 +10092,23 @@
           <w:numId w:val="9"/>
         </w:numPr>
       </w:pPr>
-      <w:r>
-        <w:lastRenderedPageBreak/>
-        <w:t>Each View responds to selection changes, highlighting the most appropriate element</w:t>
-      </w:r>
-      <w:r>
-        <w:t xml:space="preserve"> within.</w:t>
-      </w:r>
-      <w:r>
-        <w:t xml:space="preserve">  For example, the Call Tree will select the most appropriate </w:t>
-      </w:r>
-      <w:r>
-        <w:t>tree node, expanding the tree as needed.</w:t>
-      </w:r>
-    </w:p>
-    <w:p>
-      <w:pPr>
-        <w:pStyle w:val="ListParagraph"/>
-        <w:numPr>
-          <w:ilvl w:val="0"/>
-          <w:numId w:val="9"/>
-        </w:numPr>
-        <w:rPr>
-          <w:rFonts w:ascii="Cascadia Mono" w:hAnsi="Cascadia Mono" w:cs="Cascadia Mono"/>
-          <w:color w:val="008000"/>
-          <w:kern w:val="0"/>
-          <w:sz w:val="19"/>
-          <w:szCs w:val="19"/>
-        </w:rPr>
-      </w:pPr>
-      <w:r>
-        <w:t xml:space="preserve">Selecting a view does not change the selection, but it may make the </w:t>
-      </w:r>
-      <w:r>
-        <w:t xml:space="preserve">current selected </w:t>
-      </w:r>
-      <w:r>
-        <w:t>call-stack not applicable</w:t>
-      </w:r>
-      <w:r>
-        <w:t xml:space="preserve">, resulting in the </w:t>
-      </w:r>
-      <w:r>
-        <w:t>Code View panel</w:t>
-      </w:r>
-      <w:r>
-        <w:t xml:space="preserve"> updating.</w:t>
-      </w:r>
-    </w:p>
-    <w:p>
-      <w:pPr>
-        <w:pStyle w:val="Heading3"/>
-      </w:pPr>
-      <w:r>
-        <w:t>Undo-Redo</w:t>
-      </w:r>
-      <w:r>
-        <w:t xml:space="preserve"> History</w:t>
-      </w:r>
-    </w:p>
-    <w:p>
-      <w:r>
-        <w:t xml:space="preserve">The following </w:t>
-      </w:r>
-      <w:r>
-        <w:t>actions</w:t>
-      </w:r>
-      <w:r>
-        <w:t xml:space="preserve"> are stored in the undo/redo </w:t>
-      </w:r>
-      <w:r>
-        <w:t>history:</w:t>
-      </w:r>
-    </w:p>
-    <w:p>
-      <w:pPr>
-        <w:pStyle w:val="ListParagraph"/>
-        <w:numPr>
-          <w:ilvl w:val="0"/>
-          <w:numId w:val="9"/>
-        </w:numPr>
-      </w:pPr>
-      <w:r>
-        <w:t>Open file</w:t>
-      </w:r>
-    </w:p>
-    <w:p>
-      <w:pPr>
-        <w:pStyle w:val="ListParagraph"/>
-        <w:numPr>
-          <w:ilvl w:val="0"/>
-          <w:numId w:val="9"/>
-        </w:numPr>
-      </w:pPr>
-      <w:r>
-        <w:t>Change time-line range</w:t>
-      </w:r>
-    </w:p>
-    <w:p>
-      <w:pPr>
-        <w:pStyle w:val="ListParagraph"/>
-        <w:numPr>
-          <w:ilvl w:val="0"/>
-          <w:numId w:val="9"/>
-        </w:numPr>
-      </w:pPr>
-      <w:r>
-        <w:t>Change current routine and call-stack</w:t>
-      </w:r>
-    </w:p>
-    <w:p>
-      <w:pPr>
-        <w:pStyle w:val="ListParagraph"/>
-        <w:numPr>
-          <w:ilvl w:val="0"/>
-          <w:numId w:val="9"/>
-        </w:numPr>
-      </w:pPr>
-      <w:r>
-        <w:t>Change view</w:t>
-      </w:r>
-    </w:p>
-    <w:p>
-      <w:pPr>
-        <w:pStyle w:val="ListParagraph"/>
-        <w:numPr>
-          <w:ilvl w:val="0"/>
-          <w:numId w:val="9"/>
-        </w:numPr>
-      </w:pPr>
-      <w:r>
-        <w:t>Flip view</w:t>
-      </w:r>
-    </w:p>
-    <w:p>
-      <w:r>
-        <w:t xml:space="preserve">The following actions are </w:t>
-      </w:r>
-      <w:r>
-        <w:rPr>
-          <w:u w:val="single"/>
-        </w:rPr>
-        <w:t>not</w:t>
-      </w:r>
-      <w:r>
-        <w:t xml:space="preserve"> stored in the undo/redo history: </w:t>
-      </w:r>
-    </w:p>
-    <w:p>
-      <w:pPr>
-        <w:pStyle w:val="ListParagraph"/>
-        <w:numPr>
-          <w:ilvl w:val="0"/>
-          <w:numId w:val="9"/>
-        </w:numPr>
-      </w:pPr>
-      <w:r>
-        <w:t>Scroll position changes</w:t>
-      </w:r>
-    </w:p>
-    <w:p>
-      <w:pPr>
-        <w:pStyle w:val="ListParagraph"/>
-        <w:numPr>
-          <w:ilvl w:val="0"/>
-          <w:numId w:val="9"/>
-        </w:numPr>
-      </w:pPr>
-      <w:r>
-        <w:t>Divider position changes</w:t>
-      </w:r>
-    </w:p>
-    <w:p>
-      <w:pPr>
-        <w:pStyle w:val="ListParagraph"/>
-        <w:numPr>
-          <w:ilvl w:val="0"/>
-          <w:numId w:val="9"/>
-        </w:numPr>
-      </w:pPr>
-      <w:r>
-        <w:t>Window resize</w:t>
-      </w:r>
-      <w:r>
-        <w:t>s</w:t>
-      </w:r>
-    </w:p>
-    <w:p>
-      <w:pPr>
-        <w:pStyle w:val="ListParagraph"/>
-        <w:numPr>
-          <w:ilvl w:val="0"/>
-          <w:numId w:val="9"/>
-        </w:numPr>
-      </w:pPr>
-      <w:r>
-        <w:t>Zoom in / zoom out</w:t>
-      </w:r>
-    </w:p>
-    <w:p>
-      <w:pPr>
-        <w:pStyle w:val="ListParagraph"/>
-        <w:numPr>
-          <w:ilvl w:val="0"/>
-          <w:numId w:val="9"/>
-        </w:numPr>
-      </w:pPr>
-      <w:r>
-        <w:t>Settings changes</w:t>
-      </w:r>
-    </w:p>
-    <w:p>
-      <w:r>
-        <w:t>All views are notified after a</w:t>
-      </w:r>
-      <w:r>
-        <w:t>n</w:t>
-      </w:r>
-      <w:r>
-        <w:t xml:space="preserve"> undo or redo operation has been executed.  The views refresh themselves </w:t>
-      </w:r>
-      <w:r>
-        <w:t>appropriately, showing the selected routine etc.</w:t>
-      </w:r>
-    </w:p>
-    <w:p>
-      <w:pPr>
-        <w:pStyle w:val="Heading1"/>
-      </w:pPr>
-      <w:r>
-        <w:t>Analysis</w:t>
-      </w:r>
-    </w:p>
-    <w:p>
-      <w:r>
-        <w:t>The following p</w:t>
-      </w:r>
-      <w:r>
-        <w:t>rimary data structures</w:t>
-      </w:r>
-      <w:r>
-        <w:t xml:space="preserve"> are used to </w:t>
-      </w:r>
-      <w:r>
-        <w:t xml:space="preserve">model </w:t>
-      </w:r>
-      <w:r>
-        <w:t xml:space="preserve">and analyze </w:t>
-      </w:r>
-      <w:r>
-        <w:t xml:space="preserve">recorded </w:t>
-      </w:r>
-      <w:r>
-        <w:t xml:space="preserve">performance </w:t>
-      </w:r>
-      <w:r>
-        <w:t>data</w:t>
-      </w:r>
-      <w:r>
-        <w:t>:</w:t>
-      </w:r>
-    </w:p>
-    <w:p>
-      <w:pPr>
-        <w:pStyle w:val="ListParagraph"/>
-        <w:numPr>
-          <w:ilvl w:val="0"/>
-          <w:numId w:val="9"/>
-        </w:numPr>
-      </w:pPr>
+      <w:proofErr w:type="spellStart"/>
       <w:r>
         <w:rPr>
           <w:b/>
           <w:bCs/>
         </w:rPr>
-        <w:t>Model</w:t>
-      </w:r>
-      <w:r>
-        <w:t xml:space="preserve"> – represent the </w:t>
-      </w:r>
-      <w:r>
-        <w:t xml:space="preserve">loaded </w:t>
-      </w:r>
-      <w:r>
-        <w:t>program.  Contains the following fields:</w:t>
+        <w:t>StackFrame</w:t>
+      </w:r>
+      <w:proofErr w:type="spellEnd"/>
+      <w:r>
+        <w:t xml:space="preserve"> – represents a unique stack-frame within the recorded program.</w:t>
+      </w:r>
+      <w:r>
+        <w:t xml:space="preserve">  </w:t>
+      </w:r>
+      <w:r>
+        <w:t>Contains the following fields:</w:t>
       </w:r>
     </w:p>
     <w:p>
@@ -9515,7 +10120,7 @@
         </w:numPr>
       </w:pPr>
       <w:r>
-        <w:t>BBC model and CPU</w:t>
+        <w:t>List of child (nested) stack frames</w:t>
       </w:r>
     </w:p>
     <w:p>
@@ -9527,94 +10132,7 @@
         </w:numPr>
       </w:pPr>
       <w:r>
-        <w:t>Program s</w:t>
-      </w:r>
-      <w:r>
-        <w:t xml:space="preserve">napshot </w:t>
-      </w:r>
-      <w:r>
-        <w:t>taken at the beginning of the recording, containing:</w:t>
-      </w:r>
-    </w:p>
-    <w:p>
-      <w:pPr>
-        <w:pStyle w:val="ListParagraph"/>
-        <w:numPr>
-          <w:ilvl w:val="2"/>
-          <w:numId w:val="9"/>
-        </w:numPr>
-      </w:pPr>
-      <w:r>
-        <w:t>The m</w:t>
-      </w:r>
-      <w:r>
-        <w:t>emory</w:t>
-      </w:r>
-    </w:p>
-    <w:p>
-      <w:pPr>
-        <w:pStyle w:val="ListParagraph"/>
-        <w:numPr>
-          <w:ilvl w:val="2"/>
-          <w:numId w:val="9"/>
-        </w:numPr>
-      </w:pPr>
-      <w:r>
-        <w:t xml:space="preserve"> </w:t>
-      </w:r>
-      <w:r>
-        <w:t>Stack pointer</w:t>
-      </w:r>
-    </w:p>
-    <w:p>
-      <w:pPr>
-        <w:pStyle w:val="ListParagraph"/>
-        <w:numPr>
-          <w:ilvl w:val="2"/>
-          <w:numId w:val="9"/>
-        </w:numPr>
-      </w:pPr>
-      <w:r>
-        <w:t>Rom Paging register and Access Control register</w:t>
-      </w:r>
-    </w:p>
-    <w:p>
-      <w:pPr>
-        <w:pStyle w:val="ListParagraph"/>
-        <w:numPr>
-          <w:ilvl w:val="2"/>
-          <w:numId w:val="9"/>
-        </w:numPr>
-      </w:pPr>
-      <w:r>
-        <w:t>Hidden RAM address (Integral)</w:t>
-      </w:r>
-    </w:p>
-    <w:p>
-      <w:pPr>
-        <w:pStyle w:val="ListParagraph"/>
-        <w:numPr>
-          <w:ilvl w:val="2"/>
-          <w:numId w:val="9"/>
-        </w:numPr>
-      </w:pPr>
-      <w:r>
-        <w:t>Video ULA register</w:t>
-      </w:r>
-      <w:r>
-        <w:t xml:space="preserve"> and palette</w:t>
-      </w:r>
-    </w:p>
-    <w:p>
-      <w:pPr>
-        <w:pStyle w:val="ListParagraph"/>
-        <w:numPr>
-          <w:ilvl w:val="2"/>
-          <w:numId w:val="9"/>
-        </w:numPr>
-      </w:pPr>
-      <w:r>
-        <w:t>Video control registers</w:t>
+        <w:t>Call Stack (inherited for implementation efficiency)</w:t>
       </w:r>
     </w:p>
     <w:p>
@@ -9626,7 +10144,10 @@
         </w:numPr>
       </w:pPr>
       <w:r>
-        <w:t>Labels (indexed by memory address)</w:t>
+        <w:t xml:space="preserve">First and last instruction </w:t>
+      </w:r>
+      <w:r>
+        <w:t>indices</w:t>
       </w:r>
     </w:p>
     <w:p>
@@ -9638,659 +10159,6 @@
         </w:numPr>
       </w:pPr>
       <w:r>
-        <w:lastRenderedPageBreak/>
-        <w:t>Instructions</w:t>
-      </w:r>
-      <w:r>
-        <w:t xml:space="preserve"> (array of Instruction)</w:t>
-      </w:r>
-    </w:p>
-    <w:p>
-      <w:pPr>
-        <w:pStyle w:val="ListParagraph"/>
-        <w:numPr>
-          <w:ilvl w:val="0"/>
-          <w:numId w:val="9"/>
-        </w:numPr>
-      </w:pPr>
-      <w:r>
-        <w:rPr>
-          <w:b/>
-          <w:bCs/>
-        </w:rPr>
-        <w:t>Canonical Address</w:t>
-      </w:r>
-      <w:r>
-        <w:t xml:space="preserve"> – represents </w:t>
-      </w:r>
-      <w:r>
-        <w:t>a unique memory address.</w:t>
-      </w:r>
-      <w:r>
-        <w:t xml:space="preserve"> </w:t>
-      </w:r>
-      <w:r>
-        <w:t xml:space="preserve"> Contains the following immutable fields:</w:t>
-      </w:r>
-    </w:p>
-    <w:p>
-      <w:pPr>
-        <w:pStyle w:val="ListParagraph"/>
-        <w:numPr>
-          <w:ilvl w:val="1"/>
-          <w:numId w:val="9"/>
-        </w:numPr>
-      </w:pPr>
-      <w:r>
-        <w:t>Page</w:t>
-      </w:r>
-      <w:r>
-        <w:t xml:space="preserve"> –</w:t>
-      </w:r>
-      <w:r>
-        <w:t xml:space="preserve"> </w:t>
-      </w:r>
-      <w:r>
-        <w:t>memory page</w:t>
-      </w:r>
-    </w:p>
-    <w:p>
-      <w:pPr>
-        <w:pStyle w:val="ListParagraph"/>
-        <w:numPr>
-          <w:ilvl w:val="1"/>
-          <w:numId w:val="9"/>
-        </w:numPr>
-      </w:pPr>
-      <w:r>
-        <w:t>Address</w:t>
-      </w:r>
-      <w:r>
-        <w:t xml:space="preserve"> – relative address within the memory page</w:t>
-      </w:r>
-    </w:p>
-    <w:p>
-      <w:pPr>
-        <w:pStyle w:val="ListParagraph"/>
-        <w:numPr>
-          <w:ilvl w:val="0"/>
-          <w:numId w:val="9"/>
-        </w:numPr>
-      </w:pPr>
-      <w:r>
-        <w:rPr>
-          <w:b/>
-          <w:bCs/>
-        </w:rPr>
-        <w:t>Instruction</w:t>
-      </w:r>
-      <w:r>
-        <w:t xml:space="preserve"> – represents a</w:t>
-      </w:r>
-      <w:r>
-        <w:t>n</w:t>
-      </w:r>
-      <w:r>
-        <w:t xml:space="preserve"> individual recorded instruction</w:t>
-      </w:r>
-      <w:r>
-        <w:t xml:space="preserve"> or interrupt</w:t>
-      </w:r>
-      <w:r>
-        <w:t>.</w:t>
-      </w:r>
-      <w:r>
-        <w:t xml:space="preserve">  Contains the following </w:t>
-      </w:r>
-      <w:r>
-        <w:t xml:space="preserve">immutable </w:t>
-      </w:r>
-      <w:r>
-        <w:t>fields:</w:t>
-      </w:r>
-    </w:p>
-    <w:p>
-      <w:pPr>
-        <w:pStyle w:val="ListParagraph"/>
-        <w:numPr>
-          <w:ilvl w:val="1"/>
-          <w:numId w:val="9"/>
-        </w:numPr>
-      </w:pPr>
-      <w:r>
-        <w:t>Type</w:t>
-      </w:r>
-      <w:r>
-        <w:t xml:space="preserve"> (i</w:t>
-      </w:r>
-      <w:r>
-        <w:t>nstruction, maskable interrupt, or non-maskable interrupt</w:t>
-      </w:r>
-      <w:r>
-        <w:t>)</w:t>
-      </w:r>
-    </w:p>
-    <w:p>
-      <w:pPr>
-        <w:pStyle w:val="ListParagraph"/>
-        <w:numPr>
-          <w:ilvl w:val="1"/>
-          <w:numId w:val="9"/>
-        </w:numPr>
-      </w:pPr>
-      <w:r>
-        <w:t>Cycle count</w:t>
-      </w:r>
-    </w:p>
-    <w:p>
-      <w:pPr>
-        <w:pStyle w:val="ListParagraph"/>
-        <w:numPr>
-          <w:ilvl w:val="1"/>
-          <w:numId w:val="9"/>
-        </w:numPr>
-      </w:pPr>
-      <w:r>
-        <w:t>Stack pointer</w:t>
-      </w:r>
-    </w:p>
-    <w:p>
-      <w:pPr>
-        <w:pStyle w:val="ListParagraph"/>
-        <w:numPr>
-          <w:ilvl w:val="1"/>
-          <w:numId w:val="9"/>
-        </w:numPr>
-      </w:pPr>
-      <w:r>
-        <w:t>ISR address (interrupt)</w:t>
-      </w:r>
-    </w:p>
-    <w:p>
-      <w:pPr>
-        <w:pStyle w:val="ListParagraph"/>
-        <w:numPr>
-          <w:ilvl w:val="1"/>
-          <w:numId w:val="9"/>
-        </w:numPr>
-      </w:pPr>
-      <w:r>
-        <w:t>Interrupted address (interrupt)</w:t>
-      </w:r>
-    </w:p>
-    <w:p>
-      <w:pPr>
-        <w:pStyle w:val="ListParagraph"/>
-        <w:numPr>
-          <w:ilvl w:val="1"/>
-          <w:numId w:val="9"/>
-        </w:numPr>
-      </w:pPr>
-      <w:r>
-        <w:t>Opcode address (instruction)</w:t>
-      </w:r>
-    </w:p>
-    <w:p>
-      <w:pPr>
-        <w:pStyle w:val="ListParagraph"/>
-        <w:numPr>
-          <w:ilvl w:val="1"/>
-          <w:numId w:val="9"/>
-        </w:numPr>
-      </w:pPr>
-      <w:r>
-        <w:t>Opcode &amp; operand</w:t>
-      </w:r>
-      <w:r>
-        <w:t xml:space="preserve"> (instruction)</w:t>
-      </w:r>
-    </w:p>
-    <w:p>
-      <w:pPr>
-        <w:pStyle w:val="ListParagraph"/>
-        <w:numPr>
-          <w:ilvl w:val="1"/>
-          <w:numId w:val="9"/>
-        </w:numPr>
-      </w:pPr>
-      <w:r>
-        <w:t xml:space="preserve">Memory </w:t>
-      </w:r>
-      <w:r>
-        <w:t>a</w:t>
-      </w:r>
-      <w:r>
-        <w:t>ddress</w:t>
-      </w:r>
-      <w:r>
-        <w:t xml:space="preserve"> </w:t>
-      </w:r>
-      <w:r>
-        <w:t>/ d</w:t>
-      </w:r>
-      <w:r>
-        <w:t>estination address</w:t>
-      </w:r>
-      <w:r>
-        <w:t xml:space="preserve"> (instruction)</w:t>
-      </w:r>
-    </w:p>
-    <w:p>
-      <w:pPr>
-        <w:pStyle w:val="ListParagraph"/>
-        <w:numPr>
-          <w:ilvl w:val="1"/>
-          <w:numId w:val="9"/>
-        </w:numPr>
-      </w:pPr>
-      <w:r>
-        <w:t>Memory read</w:t>
-      </w:r>
-      <w:r>
-        <w:t>/</w:t>
-      </w:r>
-      <w:r>
-        <w:t>w</w:t>
-      </w:r>
-      <w:r>
-        <w:t xml:space="preserve">rite </w:t>
-      </w:r>
-      <w:r>
-        <w:t>v</w:t>
-      </w:r>
-      <w:r>
-        <w:t>alue</w:t>
-      </w:r>
-      <w:r>
-        <w:t>s</w:t>
-      </w:r>
-      <w:r>
-        <w:t xml:space="preserve"> (instruction)</w:t>
-      </w:r>
-    </w:p>
-    <w:p>
-      <w:pPr>
-        <w:pStyle w:val="ListParagraph"/>
-        <w:numPr>
-          <w:ilvl w:val="0"/>
-          <w:numId w:val="9"/>
-        </w:numPr>
-      </w:pPr>
-      <w:r>
-        <w:rPr>
-          <w:b/>
-          <w:bCs/>
-        </w:rPr>
-        <w:t>Routine</w:t>
-      </w:r>
-      <w:r>
-        <w:t xml:space="preserve"> – represents a unique code routine.</w:t>
-      </w:r>
-      <w:r>
-        <w:t xml:space="preserve">  Contains the following fields.</w:t>
-      </w:r>
-    </w:p>
-    <w:p>
-      <w:pPr>
-        <w:pStyle w:val="ListParagraph"/>
-        <w:numPr>
-          <w:ilvl w:val="1"/>
-          <w:numId w:val="9"/>
-        </w:numPr>
-      </w:pPr>
-      <w:r>
-        <w:t>Start address</w:t>
-      </w:r>
-    </w:p>
-    <w:p>
-      <w:pPr>
-        <w:pStyle w:val="ListParagraph"/>
-        <w:numPr>
-          <w:ilvl w:val="1"/>
-          <w:numId w:val="9"/>
-        </w:numPr>
-      </w:pPr>
-      <w:r>
-        <w:t xml:space="preserve">End </w:t>
-      </w:r>
-      <w:r>
-        <w:t>address</w:t>
-      </w:r>
-    </w:p>
-    <w:p>
-      <w:pPr>
-        <w:pStyle w:val="ListParagraph"/>
-        <w:numPr>
-          <w:ilvl w:val="1"/>
-          <w:numId w:val="9"/>
-        </w:numPr>
-      </w:pPr>
-      <w:r>
-        <w:t>Label (optional)</w:t>
-      </w:r>
-    </w:p>
-    <w:p>
-      <w:pPr>
-        <w:pStyle w:val="ListParagraph"/>
-        <w:numPr>
-          <w:ilvl w:val="1"/>
-          <w:numId w:val="9"/>
-        </w:numPr>
-      </w:pPr>
-      <w:r>
-        <w:t>Code (including variants)</w:t>
-      </w:r>
-    </w:p>
-    <w:p>
-      <w:pPr>
-        <w:pStyle w:val="ListParagraph"/>
-        <w:numPr>
-          <w:ilvl w:val="1"/>
-          <w:numId w:val="9"/>
-        </w:numPr>
-      </w:pPr>
-      <w:r>
-        <w:t>Type (maskable ISR, non-maskable ISR, JSR, pseudo, unknown)</w:t>
-      </w:r>
-    </w:p>
-    <w:p>
-      <w:pPr>
-        <w:pStyle w:val="ListParagraph"/>
-        <w:numPr>
-          <w:ilvl w:val="1"/>
-          <w:numId w:val="9"/>
-        </w:numPr>
-      </w:pPr>
-      <w:r>
-        <w:t xml:space="preserve">Aggregated CPU Metrics, by </w:t>
-      </w:r>
-      <w:proofErr w:type="spellStart"/>
-      <w:r>
-        <w:t>RoutineStack</w:t>
-      </w:r>
-      <w:proofErr w:type="spellEnd"/>
-      <w:r>
-        <w:t xml:space="preserve"> – </w:t>
-      </w:r>
-      <w:r>
-        <w:rPr>
-          <w:i/>
-          <w:iCs/>
-        </w:rPr>
-        <w:t>populated</w:t>
-      </w:r>
-      <w:r>
-        <w:t xml:space="preserve"> </w:t>
-      </w:r>
-      <w:r>
-        <w:rPr>
-          <w:i/>
-          <w:iCs/>
-        </w:rPr>
-        <w:t>for a time-range</w:t>
-      </w:r>
-    </w:p>
-    <w:p>
-      <w:pPr>
-        <w:pStyle w:val="ListParagraph"/>
-        <w:numPr>
-          <w:ilvl w:val="1"/>
-          <w:numId w:val="9"/>
-        </w:numPr>
-      </w:pPr>
-      <w:r>
-        <w:t xml:space="preserve">Total </w:t>
-      </w:r>
-      <w:r>
-        <w:t>a</w:t>
-      </w:r>
-      <w:r>
-        <w:t xml:space="preserve">ggregated CPU Metrics – </w:t>
-      </w:r>
-      <w:r>
-        <w:rPr>
-          <w:i/>
-          <w:iCs/>
-        </w:rPr>
-        <w:t>populated</w:t>
-      </w:r>
-      <w:r>
-        <w:t xml:space="preserve"> </w:t>
-      </w:r>
-      <w:r>
-        <w:rPr>
-          <w:i/>
-          <w:iCs/>
-        </w:rPr>
-        <w:t>for a time-range</w:t>
-      </w:r>
-    </w:p>
-    <w:p>
-      <w:pPr>
-        <w:pStyle w:val="ListParagraph"/>
-        <w:numPr>
-          <w:ilvl w:val="0"/>
-          <w:numId w:val="9"/>
-        </w:numPr>
-      </w:pPr>
-      <w:proofErr w:type="spellStart"/>
-      <w:r>
-        <w:rPr>
-          <w:b/>
-          <w:bCs/>
-        </w:rPr>
-        <w:t>CallStack</w:t>
-      </w:r>
-      <w:proofErr w:type="spellEnd"/>
-      <w:r>
-        <w:t xml:space="preserve"> – represents a</w:t>
-      </w:r>
-      <w:r>
-        <w:t xml:space="preserve"> call stack within the recorded program. Contains the following fields:</w:t>
-      </w:r>
-    </w:p>
-    <w:p>
-      <w:pPr>
-        <w:pStyle w:val="ListParagraph"/>
-        <w:numPr>
-          <w:ilvl w:val="1"/>
-          <w:numId w:val="9"/>
-        </w:numPr>
-      </w:pPr>
-      <w:r>
-        <w:t>Routine reference</w:t>
-      </w:r>
-    </w:p>
-    <w:p>
-      <w:pPr>
-        <w:pStyle w:val="ListParagraph"/>
-        <w:numPr>
-          <w:ilvl w:val="1"/>
-          <w:numId w:val="9"/>
-        </w:numPr>
-      </w:pPr>
-      <w:r>
-        <w:t>Canonical address</w:t>
-      </w:r>
-      <w:r>
-        <w:t xml:space="preserve"> (copy of </w:t>
-      </w:r>
-      <w:r>
-        <w:t>routine’s start address</w:t>
-      </w:r>
-      <w:r>
-        <w:t>)</w:t>
-      </w:r>
-    </w:p>
-    <w:p>
-      <w:pPr>
-        <w:pStyle w:val="ListParagraph"/>
-        <w:numPr>
-          <w:ilvl w:val="1"/>
-          <w:numId w:val="9"/>
-        </w:numPr>
-      </w:pPr>
-      <w:r>
-        <w:t xml:space="preserve">Parent </w:t>
-      </w:r>
-      <w:proofErr w:type="spellStart"/>
-      <w:r>
-        <w:t>CallStack</w:t>
-      </w:r>
-      <w:proofErr w:type="spellEnd"/>
-      <w:r>
-        <w:t xml:space="preserve"> reference</w:t>
-      </w:r>
-    </w:p>
-    <w:p>
-      <w:pPr>
-        <w:pStyle w:val="ListParagraph"/>
-        <w:numPr>
-          <w:ilvl w:val="1"/>
-          <w:numId w:val="9"/>
-        </w:numPr>
-      </w:pPr>
-      <w:r>
-        <w:t>Call t</w:t>
-      </w:r>
-      <w:r>
-        <w:t xml:space="preserve">ype </w:t>
-      </w:r>
-      <w:r>
-        <w:t xml:space="preserve">– e.g. </w:t>
-      </w:r>
-      <w:r>
-        <w:t xml:space="preserve">ISR, JSR, tail-call, </w:t>
-      </w:r>
-      <w:r>
-        <w:t xml:space="preserve">or </w:t>
-      </w:r>
-      <w:r>
-        <w:t>unknown</w:t>
-      </w:r>
-    </w:p>
-    <w:p>
-      <w:pPr>
-        <w:ind w:left="1080"/>
-      </w:pPr>
-      <w:r>
-        <w:t xml:space="preserve">The identify of a </w:t>
-      </w:r>
-      <w:proofErr w:type="spellStart"/>
-      <w:r>
-        <w:t>CallStack</w:t>
-      </w:r>
-      <w:proofErr w:type="spellEnd"/>
-      <w:r>
-        <w:t xml:space="preserve"> is defined </w:t>
-      </w:r>
-      <w:r>
-        <w:t xml:space="preserve">by the sequence of </w:t>
-      </w:r>
-      <w:r>
-        <w:t>addresses</w:t>
-      </w:r>
-      <w:r>
-        <w:t xml:space="preserve"> </w:t>
-      </w:r>
-      <w:r>
-        <w:t xml:space="preserve">up through the parent </w:t>
-      </w:r>
-      <w:r>
-        <w:t>chain</w:t>
-      </w:r>
-      <w:r>
-        <w:t xml:space="preserve">, </w:t>
-      </w:r>
-      <w:r>
-        <w:t xml:space="preserve">ending at the </w:t>
-      </w:r>
-      <w:r>
-        <w:t xml:space="preserve">root or </w:t>
-      </w:r>
-      <w:r>
-        <w:t xml:space="preserve">a call stack that has an </w:t>
-      </w:r>
-      <w:r>
-        <w:t>ISR call type.</w:t>
-      </w:r>
-    </w:p>
-    <w:p>
-      <w:pPr>
-        <w:pStyle w:val="ListParagraph"/>
-        <w:numPr>
-          <w:ilvl w:val="0"/>
-          <w:numId w:val="9"/>
-        </w:numPr>
-      </w:pPr>
-      <w:proofErr w:type="spellStart"/>
-      <w:r>
-        <w:rPr>
-          <w:b/>
-          <w:bCs/>
-        </w:rPr>
-        <w:t>StackFrame</w:t>
-      </w:r>
-      <w:proofErr w:type="spellEnd"/>
-      <w:r>
-        <w:t xml:space="preserve"> – represents a unique stack-frame within the recorded program.</w:t>
-      </w:r>
-      <w:r>
-        <w:t xml:space="preserve">  </w:t>
-      </w:r>
-      <w:r>
-        <w:t>Contains the following fields:</w:t>
-      </w:r>
-    </w:p>
-    <w:p>
-      <w:pPr>
-        <w:pStyle w:val="ListParagraph"/>
-        <w:numPr>
-          <w:ilvl w:val="1"/>
-          <w:numId w:val="9"/>
-        </w:numPr>
-      </w:pPr>
-      <w:r>
-        <w:t>List of child (nested) stack frames</w:t>
-      </w:r>
-    </w:p>
-    <w:p>
-      <w:pPr>
-        <w:pStyle w:val="ListParagraph"/>
-        <w:numPr>
-          <w:ilvl w:val="1"/>
-          <w:numId w:val="9"/>
-        </w:numPr>
-      </w:pPr>
-      <w:r>
-        <w:t>Call Stack (inherited for implementation efficiency)</w:t>
-      </w:r>
-    </w:p>
-    <w:p>
-      <w:pPr>
-        <w:pStyle w:val="ListParagraph"/>
-        <w:numPr>
-          <w:ilvl w:val="1"/>
-          <w:numId w:val="9"/>
-        </w:numPr>
-      </w:pPr>
-      <w:r>
-        <w:t xml:space="preserve">First and last instruction </w:t>
-      </w:r>
-      <w:r>
-        <w:t>indices</w:t>
-      </w:r>
-    </w:p>
-    <w:p>
-      <w:pPr>
-        <w:pStyle w:val="ListParagraph"/>
-        <w:numPr>
-          <w:ilvl w:val="1"/>
-          <w:numId w:val="9"/>
-        </w:numPr>
-      </w:pPr>
-      <w:r>
-        <w:lastRenderedPageBreak/>
         <w:t xml:space="preserve">Start </w:t>
       </w:r>
       <w:r>
@@ -10421,6 +10289,7 @@
         <w:pStyle w:val="Heading2"/>
       </w:pPr>
       <w:r>
+        <w:lastRenderedPageBreak/>
         <w:t xml:space="preserve">Load </w:t>
       </w:r>
       <w:r>
@@ -10875,7 +10744,6 @@
         </w:numPr>
       </w:pPr>
       <w:r>
-        <w:lastRenderedPageBreak/>
         <w:t>Every JSR destination address</w:t>
       </w:r>
       <w:r>
@@ -11149,6 +11017,7 @@
           <w:rFonts w:ascii="Aptos" w:hAnsi="Aptos"/>
           <w:color w:val="000000"/>
         </w:rPr>
+        <w:lastRenderedPageBreak/>
         <w:t xml:space="preserve">The program's cycle count, which begins at zero, is incremented as instructions are processed. </w:t>
       </w:r>
       <w:r>
@@ -11683,7 +11552,6 @@
         <w:pStyle w:val="Heading3"/>
       </w:pPr>
       <w:r>
-        <w:lastRenderedPageBreak/>
         <w:t>Game loop analysis</w:t>
       </w:r>
     </w:p>
@@ -11901,6 +11769,7 @@
         <w:pStyle w:val="Heading2"/>
       </w:pPr>
       <w:r>
+        <w:lastRenderedPageBreak/>
         <w:t xml:space="preserve">Dynamic </w:t>
       </w:r>
       <w:r>
@@ -12278,7 +12147,6 @@
         </w:numPr>
       </w:pPr>
       <w:r>
-        <w:lastRenderedPageBreak/>
         <w:t xml:space="preserve">Populate </w:t>
       </w:r>
       <w:proofErr w:type="spellStart"/>
@@ -12503,6 +12371,7 @@
         </w:numPr>
       </w:pPr>
       <w:r>
+        <w:lastRenderedPageBreak/>
         <w:t xml:space="preserve">We also determine if </w:t>
       </w:r>
       <w:r>
@@ -12840,7 +12709,6 @@
         </w:numPr>
       </w:pPr>
       <w:r>
-        <w:lastRenderedPageBreak/>
         <w:t>Detecting when screen memory is being read. We need to know.</w:t>
       </w:r>
     </w:p>
@@ -13015,6 +12883,7 @@
         </w:numPr>
       </w:pPr>
       <w:r>
+        <w:lastRenderedPageBreak/>
         <w:t>Timing synchronization</w:t>
       </w:r>
     </w:p>
@@ -13291,7 +13160,6 @@
         <w:pStyle w:val="Heading2"/>
       </w:pPr>
       <w:r>
-        <w:lastRenderedPageBreak/>
         <w:t>TODO list</w:t>
       </w:r>
     </w:p>
@@ -13304,17 +13172,19 @@
         </w:numPr>
       </w:pPr>
       <w:r>
-        <w:t>Put calculations on another thread</w:t>
-      </w:r>
-      <w:r>
-        <w:t xml:space="preserve"> – </w:t>
-      </w:r>
-      <w:r>
-        <w:rPr>
-          <w:b/>
-          <w:bCs/>
-        </w:rPr>
-        <w:t>in progress</w:t>
+        <w:t xml:space="preserve">Make percentages either </w:t>
+      </w:r>
+      <w:r>
+        <w:t xml:space="preserve">1) </w:t>
+      </w:r>
+      <w:r>
+        <w:t xml:space="preserve">relative to total or </w:t>
+      </w:r>
+      <w:r>
+        <w:t xml:space="preserve">2) relative to </w:t>
+      </w:r>
+      <w:r>
+        <w:t>selected routine</w:t>
       </w:r>
     </w:p>
     <w:p>
@@ -13326,19 +13196,19 @@
         </w:numPr>
       </w:pPr>
       <w:r>
-        <w:t xml:space="preserve">Make percentages either </w:t>
-      </w:r>
-      <w:r>
-        <w:t xml:space="preserve">1) </w:t>
-      </w:r>
-      <w:r>
-        <w:t xml:space="preserve">relative to total or </w:t>
-      </w:r>
-      <w:r>
-        <w:t xml:space="preserve">2) relative to </w:t>
-      </w:r>
-      <w:r>
-        <w:t>selected routine</w:t>
+        <w:t>Bug fixes</w:t>
+      </w:r>
+    </w:p>
+    <w:p>
+      <w:pPr>
+        <w:pStyle w:val="ListParagraph"/>
+        <w:numPr>
+          <w:ilvl w:val="1"/>
+          <w:numId w:val="12"/>
+        </w:numPr>
+      </w:pPr>
+      <w:r>
+        <w:t>Don’t allow timeline selection when static or dynamic processing is in flight</w:t>
       </w:r>
     </w:p>
     <w:p>
@@ -13350,43 +13220,7 @@
         </w:numPr>
       </w:pPr>
       <w:r>
-        <w:t>Bug fixes</w:t>
-      </w:r>
-    </w:p>
-    <w:p>
-      <w:pPr>
-        <w:pStyle w:val="ListParagraph"/>
-        <w:numPr>
-          <w:ilvl w:val="1"/>
-          <w:numId w:val="12"/>
-        </w:numPr>
-      </w:pPr>
-      <w:r>
-        <w:t>Don’t allow timeline selection when static or dynamic processing is in flight</w:t>
-      </w:r>
-    </w:p>
-    <w:p>
-      <w:pPr>
-        <w:pStyle w:val="ListParagraph"/>
-        <w:numPr>
-          <w:ilvl w:val="0"/>
-          <w:numId w:val="12"/>
-        </w:numPr>
-      </w:pPr>
-      <w:r>
         <w:t>Undo/Redo</w:t>
-      </w:r>
-    </w:p>
-    <w:p>
-      <w:pPr>
-        <w:pStyle w:val="ListParagraph"/>
-        <w:numPr>
-          <w:ilvl w:val="0"/>
-          <w:numId w:val="12"/>
-        </w:numPr>
-      </w:pPr>
-      <w:r>
-        <w:t>Fix selection ambiguity when switching tabs</w:t>
       </w:r>
     </w:p>
     <w:p>

</xml_diff>

<commit_message>
Added dark mode support
</commit_message>
<xml_diff>
--- a/docs/Development.docx
+++ b/docs/Development.docx
@@ -1063,8 +1063,13 @@
       <w:r>
         <w:t xml:space="preserve"> a common header which </w:t>
       </w:r>
-      <w:r>
-        <w:t xml:space="preserve">proceeds </w:t>
+      <w:proofErr w:type="gramStart"/>
+      <w:r>
+        <w:t>proceeds</w:t>
+      </w:r>
+      <w:proofErr w:type="gramEnd"/>
+      <w:r>
+        <w:t xml:space="preserve"> </w:t>
       </w:r>
       <w:r>
         <w:t>its</w:t>
@@ -1949,7 +1954,15 @@
         <w:t xml:space="preserve">The header chunk </w:t>
       </w:r>
       <w:r>
-        <w:t xml:space="preserve">is the first chunk in the file and </w:t>
+        <w:t xml:space="preserve">is the first chunk in the </w:t>
+      </w:r>
+      <w:proofErr w:type="gramStart"/>
+      <w:r>
+        <w:t>file</w:t>
+      </w:r>
+      <w:proofErr w:type="gramEnd"/>
+      <w:r>
+        <w:t xml:space="preserve"> and </w:t>
       </w:r>
       <w:r>
         <w:t xml:space="preserve">it </w:t>
@@ -4655,12 +4668,14 @@
       <w:r>
         <w:t>Integra</w:t>
       </w:r>
+      <w:proofErr w:type="gramStart"/>
       <w:r>
         <w:t>.</w:t>
       </w:r>
       <w:r>
         <w:t xml:space="preserve"> </w:t>
       </w:r>
+      <w:proofErr w:type="gramEnd"/>
       <w:r>
         <w:t>Addresses &amp;</w:t>
       </w:r>
@@ -5705,6 +5720,7 @@
             <w:r>
               <w:t>&amp;</w:t>
             </w:r>
+            <w:proofErr w:type="gramStart"/>
             <w:r>
               <w:t>8</w:t>
             </w:r>
@@ -5714,6 +5730,7 @@
             <w:r>
               <w:t>..</w:t>
             </w:r>
+            <w:proofErr w:type="gramEnd"/>
             <w:r>
               <w:t>&amp;</w:t>
             </w:r>
@@ -5794,7 +5811,15 @@
               <w:t xml:space="preserve"> </w:t>
             </w:r>
             <w:r>
-              <w:t>&amp;0000..&amp;7F</w:t>
+              <w:t>&amp;</w:t>
+            </w:r>
+            <w:proofErr w:type="gramStart"/>
+            <w:r>
+              <w:t>0000..</w:t>
+            </w:r>
+            <w:proofErr w:type="gramEnd"/>
+            <w:r>
+              <w:t>&amp;7F</w:t>
             </w:r>
             <w:r>
               <w:t>FF</w:t>
@@ -5809,12 +5834,14 @@
             <w:pPr>
               <w:jc w:val="center"/>
             </w:pPr>
+            <w:proofErr w:type="gramStart"/>
             <w:r>
               <w:t>0..</w:t>
             </w:r>
             <w:r>
               <w:t>&amp;</w:t>
             </w:r>
+            <w:proofErr w:type="gramEnd"/>
             <w:r>
               <w:t>7F</w:t>
             </w:r>
@@ -5828,12 +5855,14 @@
             <w:pPr>
               <w:jc w:val="center"/>
             </w:pPr>
+            <w:proofErr w:type="gramStart"/>
             <w:r>
               <w:t>0..</w:t>
             </w:r>
             <w:r>
               <w:t>&amp;</w:t>
             </w:r>
+            <w:proofErr w:type="gramEnd"/>
             <w:r>
               <w:t>FF</w:t>
             </w:r>
@@ -5877,7 +5906,15 @@
               <w:t>:</w:t>
             </w:r>
             <w:r>
-              <w:t xml:space="preserve"> &amp;8000..&amp;FFFF</w:t>
+              <w:t xml:space="preserve"> &amp;</w:t>
+            </w:r>
+            <w:proofErr w:type="gramStart"/>
+            <w:r>
+              <w:t>8000..</w:t>
+            </w:r>
+            <w:proofErr w:type="gramEnd"/>
+            <w:r>
+              <w:t>&amp;FFFF</w:t>
             </w:r>
           </w:p>
         </w:tc>
@@ -5908,9 +5945,11 @@
             <w:r>
               <w:t>&amp;</w:t>
             </w:r>
+            <w:proofErr w:type="gramStart"/>
             <w:r>
               <w:t>80..</w:t>
             </w:r>
+            <w:proofErr w:type="gramEnd"/>
             <w:r>
               <w:t>&amp;</w:t>
             </w:r>
@@ -5927,12 +5966,14 @@
             <w:pPr>
               <w:jc w:val="center"/>
             </w:pPr>
+            <w:proofErr w:type="gramStart"/>
             <w:r>
               <w:t>0..</w:t>
             </w:r>
             <w:r>
               <w:t>&amp;</w:t>
             </w:r>
+            <w:proofErr w:type="gramEnd"/>
             <w:r>
               <w:t>FF</w:t>
             </w:r>
@@ -7102,10 +7143,18 @@
       </w:r>
       <w:proofErr w:type="spellEnd"/>
       <w:r>
-        <w:t xml:space="preserve">&gt; (1 byte) Populated for opcodes that </w:t>
-      </w:r>
-      <w:r>
-        <w:t xml:space="preserve">write to </w:t>
+        <w:t xml:space="preserve">&gt; (1 byte) Populated for </w:t>
+      </w:r>
+      <w:proofErr w:type="gramStart"/>
+      <w:r>
+        <w:t xml:space="preserve">opcodes that </w:t>
+      </w:r>
+      <w:r>
+        <w:t>write</w:t>
+      </w:r>
+      <w:proofErr w:type="gramEnd"/>
+      <w:r>
+        <w:t xml:space="preserve"> to </w:t>
       </w:r>
       <w:r>
         <w:t>an address</w:t>
@@ -7128,11 +7177,16 @@
       <w:r>
         <w:t>attempted to be written</w:t>
       </w:r>
+      <w:proofErr w:type="gramStart"/>
       <w:r>
         <w:t>.</w:t>
       </w:r>
       <w:r>
-        <w:t xml:space="preserve"> This includes </w:t>
+        <w:t xml:space="preserve"> </w:t>
+      </w:r>
+      <w:proofErr w:type="gramEnd"/>
+      <w:r>
+        <w:t xml:space="preserve">This includes </w:t>
       </w:r>
       <w:r>
         <w:lastRenderedPageBreak/>
@@ -7173,6 +7227,7 @@
       </w:r>
     </w:p>
     <w:p>
+      <w:proofErr w:type="gramStart"/>
       <w:r>
         <w:t xml:space="preserve">A </w:t>
       </w:r>
@@ -7183,6 +7238,7 @@
         </w:rPr>
         <w:t>.perf</w:t>
       </w:r>
+      <w:proofErr w:type="gramEnd"/>
       <w:r>
         <w:t xml:space="preserve"> </w:t>
       </w:r>
@@ -8499,13 +8555,21 @@
         <w:t xml:space="preserve"> Show </w:t>
       </w:r>
       <w:r>
-        <w:t>a time</w:t>
+        <w:t xml:space="preserve">a </w:t>
+      </w:r>
+      <w:proofErr w:type="gramStart"/>
+      <w:r>
+        <w:t>time</w:t>
       </w:r>
       <w:r>
         <w:t>-</w:t>
       </w:r>
       <w:r>
-        <w:t>line allowing the user to select a specific time range to analyze.</w:t>
+        <w:t>line</w:t>
+      </w:r>
+      <w:proofErr w:type="gramEnd"/>
+      <w:r>
+        <w:t xml:space="preserve"> allowing the user to select a specific time range to analyze.</w:t>
       </w:r>
     </w:p>
     <w:p>
@@ -8841,7 +8905,7 @@
         </w:numPr>
       </w:pPr>
       <w:r>
-        <w:t>Disassembly:</w:t>
+        <w:t>General:</w:t>
       </w:r>
     </w:p>
     <w:p>
@@ -8853,7 +8917,7 @@
         </w:numPr>
       </w:pPr>
       <w:r>
-        <w:t>Uppercase or lowercase mnemonics.</w:t>
+        <w:t>Theme: Light / Dark / System</w:t>
       </w:r>
     </w:p>
     <w:p>
@@ -8865,22 +8929,28 @@
         </w:numPr>
       </w:pPr>
       <w:r>
-        <w:t xml:space="preserve">Hexadecimal </w:t>
-      </w:r>
-      <w:r>
-        <w:t>symbol: ‘</w:t>
-      </w:r>
-      <w:r>
-        <w:t>$</w:t>
-      </w:r>
-      <w:r>
-        <w:t>’, ‘</w:t>
-      </w:r>
-      <w:r>
-        <w:t>&amp;</w:t>
-      </w:r>
-      <w:r>
-        <w:t>’, or ‘0x’</w:t>
+        <w:t>Font s</w:t>
+      </w:r>
+      <w:r>
+        <w:t>caling</w:t>
+      </w:r>
+      <w:r>
+        <w:t xml:space="preserve"> (as a percentage)</w:t>
+      </w:r>
+      <w:r>
+        <w:t>, default is 100%</w:t>
+      </w:r>
+    </w:p>
+    <w:p>
+      <w:pPr>
+        <w:pStyle w:val="ListParagraph"/>
+        <w:numPr>
+          <w:ilvl w:val="0"/>
+          <w:numId w:val="9"/>
+        </w:numPr>
+      </w:pPr>
+      <w:r>
+        <w:t>Code:</w:t>
       </w:r>
     </w:p>
     <w:p>
@@ -8892,7 +8962,7 @@
         </w:numPr>
       </w:pPr>
       <w:r>
-        <w:t>Uppercase or lowercase hexadecimal.</w:t>
+        <w:t>Code font: System of custom</w:t>
       </w:r>
     </w:p>
     <w:p>
@@ -8904,25 +8974,346 @@
         </w:numPr>
       </w:pPr>
       <w:r>
-        <w:t xml:space="preserve">Default numeric literal </w:t>
-      </w:r>
-      <w:r>
-        <w:t xml:space="preserve">formatting: decimal, </w:t>
-      </w:r>
-      <w:r>
-        <w:t xml:space="preserve">hexadecimal, </w:t>
-      </w:r>
-      <w:r>
-        <w:t xml:space="preserve">octal, </w:t>
+        <w:t>Address</w:t>
+      </w:r>
+      <w:r>
+        <w:t>es</w:t>
+      </w:r>
+      <w:r>
+        <w:t>:</w:t>
+      </w:r>
+    </w:p>
+    <w:p>
+      <w:pPr>
+        <w:pStyle w:val="ListParagraph"/>
+        <w:numPr>
+          <w:ilvl w:val="2"/>
+          <w:numId w:val="9"/>
+        </w:numPr>
+      </w:pPr>
+      <w:r>
+        <w:t xml:space="preserve">Case: </w:t>
+      </w:r>
+      <w:r>
+        <w:t xml:space="preserve">Uppercase </w:t>
       </w:r>
       <w:r>
         <w:t xml:space="preserve">or </w:t>
       </w:r>
       <w:r>
-        <w:t>binary</w:t>
-      </w:r>
-      <w:r>
-        <w:t>.</w:t>
+        <w:t>lowercase</w:t>
+      </w:r>
+    </w:p>
+    <w:p>
+      <w:pPr>
+        <w:pStyle w:val="ListParagraph"/>
+        <w:numPr>
+          <w:ilvl w:val="2"/>
+          <w:numId w:val="9"/>
+        </w:numPr>
+      </w:pPr>
+      <w:r>
+        <w:t>Hex</w:t>
+      </w:r>
+      <w:r>
+        <w:t>a</w:t>
+      </w:r>
+      <w:r>
+        <w:t xml:space="preserve">decimal </w:t>
+      </w:r>
+      <w:r>
+        <w:t xml:space="preserve">prefix: </w:t>
+      </w:r>
+      <w:r>
+        <w:t>$, &amp;, or 0x</w:t>
+      </w:r>
+    </w:p>
+    <w:p>
+      <w:pPr>
+        <w:pStyle w:val="ListParagraph"/>
+        <w:numPr>
+          <w:ilvl w:val="2"/>
+          <w:numId w:val="9"/>
+        </w:numPr>
+      </w:pPr>
+      <w:r>
+        <w:t>Color: Theme or custom color</w:t>
+      </w:r>
+    </w:p>
+    <w:p>
+      <w:pPr>
+        <w:pStyle w:val="ListParagraph"/>
+        <w:numPr>
+          <w:ilvl w:val="2"/>
+          <w:numId w:val="9"/>
+        </w:numPr>
+      </w:pPr>
+      <w:r>
+        <w:t>Font: Normal, bold, and/or italic</w:t>
+      </w:r>
+    </w:p>
+    <w:p>
+      <w:pPr>
+        <w:pStyle w:val="ListParagraph"/>
+        <w:numPr>
+          <w:ilvl w:val="1"/>
+          <w:numId w:val="9"/>
+        </w:numPr>
+      </w:pPr>
+      <w:r>
+        <w:t>Mnemonics:</w:t>
+      </w:r>
+    </w:p>
+    <w:p>
+      <w:pPr>
+        <w:pStyle w:val="ListParagraph"/>
+        <w:numPr>
+          <w:ilvl w:val="2"/>
+          <w:numId w:val="9"/>
+        </w:numPr>
+      </w:pPr>
+      <w:r>
+        <w:t>Case: Uppercase or lowercase</w:t>
+      </w:r>
+    </w:p>
+    <w:p>
+      <w:pPr>
+        <w:pStyle w:val="ListParagraph"/>
+        <w:numPr>
+          <w:ilvl w:val="2"/>
+          <w:numId w:val="9"/>
+        </w:numPr>
+      </w:pPr>
+      <w:r>
+        <w:t>Color: Theme or custom color</w:t>
+      </w:r>
+    </w:p>
+    <w:p>
+      <w:pPr>
+        <w:pStyle w:val="ListParagraph"/>
+        <w:numPr>
+          <w:ilvl w:val="2"/>
+          <w:numId w:val="9"/>
+        </w:numPr>
+      </w:pPr>
+      <w:r>
+        <w:t>Font: Normal, bold, and/or italic</w:t>
+      </w:r>
+    </w:p>
+    <w:p>
+      <w:pPr>
+        <w:pStyle w:val="ListParagraph"/>
+        <w:numPr>
+          <w:ilvl w:val="1"/>
+          <w:numId w:val="9"/>
+        </w:numPr>
+      </w:pPr>
+      <w:r>
+        <w:t>Labels:</w:t>
+      </w:r>
+    </w:p>
+    <w:p>
+      <w:pPr>
+        <w:pStyle w:val="ListParagraph"/>
+        <w:numPr>
+          <w:ilvl w:val="2"/>
+          <w:numId w:val="9"/>
+        </w:numPr>
+      </w:pPr>
+      <w:r>
+        <w:t>Color: Theme or custom color</w:t>
+      </w:r>
+    </w:p>
+    <w:p>
+      <w:pPr>
+        <w:pStyle w:val="ListParagraph"/>
+        <w:numPr>
+          <w:ilvl w:val="2"/>
+          <w:numId w:val="9"/>
+        </w:numPr>
+      </w:pPr>
+      <w:r>
+        <w:t>Font: Normal, bold, and/or italic</w:t>
+      </w:r>
+    </w:p>
+    <w:p>
+      <w:pPr>
+        <w:pStyle w:val="ListParagraph"/>
+        <w:numPr>
+          <w:ilvl w:val="1"/>
+          <w:numId w:val="9"/>
+        </w:numPr>
+      </w:pPr>
+      <w:r>
+        <w:t>Literals</w:t>
+      </w:r>
+      <w:r>
+        <w:t>:</w:t>
+      </w:r>
+    </w:p>
+    <w:p>
+      <w:pPr>
+        <w:pStyle w:val="ListParagraph"/>
+        <w:numPr>
+          <w:ilvl w:val="2"/>
+          <w:numId w:val="9"/>
+        </w:numPr>
+      </w:pPr>
+      <w:r>
+        <w:t>Format: Decimal, hexadecimal, or binary (tool tip shows all formats)</w:t>
+      </w:r>
+    </w:p>
+    <w:p>
+      <w:pPr>
+        <w:pStyle w:val="ListParagraph"/>
+        <w:numPr>
+          <w:ilvl w:val="2"/>
+          <w:numId w:val="9"/>
+        </w:numPr>
+      </w:pPr>
+      <w:r>
+        <w:t>Color: Theme or custom color</w:t>
+      </w:r>
+    </w:p>
+    <w:p>
+      <w:pPr>
+        <w:pStyle w:val="ListParagraph"/>
+        <w:numPr>
+          <w:ilvl w:val="2"/>
+          <w:numId w:val="9"/>
+        </w:numPr>
+      </w:pPr>
+      <w:r>
+        <w:t>Font: Normal, bold, and/or italic</w:t>
+      </w:r>
+    </w:p>
+    <w:p>
+      <w:pPr>
+        <w:pStyle w:val="ListParagraph"/>
+        <w:numPr>
+          <w:ilvl w:val="1"/>
+          <w:numId w:val="9"/>
+        </w:numPr>
+      </w:pPr>
+      <w:r>
+        <w:t>Punctuation</w:t>
+      </w:r>
+      <w:r>
+        <w:t>:</w:t>
+      </w:r>
+    </w:p>
+    <w:p>
+      <w:pPr>
+        <w:pStyle w:val="ListParagraph"/>
+        <w:numPr>
+          <w:ilvl w:val="2"/>
+          <w:numId w:val="9"/>
+        </w:numPr>
+      </w:pPr>
+      <w:r>
+        <w:t>Color: Theme or custom color</w:t>
+      </w:r>
+    </w:p>
+    <w:p>
+      <w:pPr>
+        <w:pStyle w:val="ListParagraph"/>
+        <w:numPr>
+          <w:ilvl w:val="2"/>
+          <w:numId w:val="9"/>
+        </w:numPr>
+      </w:pPr>
+      <w:r>
+        <w:t>Font: Normal</w:t>
+      </w:r>
+      <w:r>
+        <w:t xml:space="preserve">, </w:t>
+      </w:r>
+      <w:r>
+        <w:t>bold</w:t>
+      </w:r>
+      <w:r>
+        <w:t>, and/or italic</w:t>
+      </w:r>
+    </w:p>
+    <w:p>
+      <w:pPr>
+        <w:pStyle w:val="ListParagraph"/>
+        <w:numPr>
+          <w:ilvl w:val="1"/>
+          <w:numId w:val="9"/>
+        </w:numPr>
+      </w:pPr>
+      <w:r>
+        <w:t>S</w:t>
+      </w:r>
+      <w:r>
+        <w:t>ample:</w:t>
+      </w:r>
+      <w:r>
+        <w:t xml:space="preserve"> </w:t>
+      </w:r>
+      <w:r>
+        <w:t xml:space="preserve">E.g. </w:t>
+      </w:r>
+      <w:r>
+        <w:tab/>
+      </w:r>
+      <w:r>
+        <w:t>&amp;2</w:t>
+      </w:r>
+      <w:r>
+        <w:t>E2F</w:t>
+      </w:r>
+      <w:r>
+        <w:tab/>
+      </w:r>
+      <w:r>
+        <w:t xml:space="preserve">LDA </w:t>
+      </w:r>
+      <w:r>
+        <w:rPr>
+          <w:i/>
+          <w:iCs/>
+        </w:rPr>
+        <w:t>label</w:t>
+      </w:r>
+      <w:r>
+        <w:t xml:space="preserve"> (&amp;80)</w:t>
+      </w:r>
+      <w:r>
+        <w:rPr>
+          <w:b/>
+          <w:bCs/>
+        </w:rPr>
+        <w:t>,</w:t>
+      </w:r>
+      <w:r>
+        <w:t xml:space="preserve"> </w:t>
+      </w:r>
+      <w:r>
+        <w:rPr>
+          <w:b/>
+          <w:bCs/>
+        </w:rPr>
+        <w:t>Y</w:t>
+      </w:r>
+    </w:p>
+    <w:p>
+      <w:pPr>
+        <w:pStyle w:val="Heading3"/>
+      </w:pPr>
+      <w:r>
+        <w:lastRenderedPageBreak/>
+        <w:t xml:space="preserve">Managing the </w:t>
+      </w:r>
+      <w:r>
+        <w:t>‘</w:t>
+      </w:r>
+      <w:r>
+        <w:t>context</w:t>
+      </w:r>
+      <w:r>
+        <w:t>’</w:t>
       </w:r>
     </w:p>
     <w:p>
@@ -8934,7 +9325,400 @@
         </w:numPr>
       </w:pPr>
       <w:r>
-        <w:t>Display</w:t>
+        <w:t>The form owns the currently selected routine</w:t>
+      </w:r>
+      <w:r>
+        <w:t xml:space="preserve">, </w:t>
+      </w:r>
+      <w:r>
+        <w:t>call-stack</w:t>
+      </w:r>
+      <w:r>
+        <w:t>, and selected address.</w:t>
+      </w:r>
+    </w:p>
+    <w:p>
+      <w:pPr>
+        <w:pStyle w:val="ListParagraph"/>
+        <w:numPr>
+          <w:ilvl w:val="0"/>
+          <w:numId w:val="9"/>
+        </w:numPr>
+      </w:pPr>
+      <w:r>
+        <w:t xml:space="preserve">The selection can be </w:t>
+      </w:r>
+      <w:r>
+        <w:t xml:space="preserve">changed </w:t>
+      </w:r>
+      <w:r>
+        <w:t xml:space="preserve">and/or cleared </w:t>
+      </w:r>
+      <w:r>
+        <w:t xml:space="preserve">from </w:t>
+      </w:r>
+      <w:r>
+        <w:t xml:space="preserve">withing </w:t>
+      </w:r>
+      <w:r>
+        <w:t xml:space="preserve">any </w:t>
+      </w:r>
+      <w:r>
+        <w:t>V</w:t>
+      </w:r>
+      <w:r>
+        <w:t>iew</w:t>
+      </w:r>
+      <w:r>
+        <w:t>.</w:t>
+      </w:r>
+    </w:p>
+    <w:p>
+      <w:pPr>
+        <w:pStyle w:val="ListParagraph"/>
+        <w:numPr>
+          <w:ilvl w:val="0"/>
+          <w:numId w:val="9"/>
+        </w:numPr>
+      </w:pPr>
+      <w:r>
+        <w:t>Each View responds to selection changes, highlighting the most appropriate element</w:t>
+      </w:r>
+      <w:r>
+        <w:t xml:space="preserve"> within.</w:t>
+      </w:r>
+      <w:r>
+        <w:t xml:space="preserve">  For example, the Call Tree will select the most appropriate </w:t>
+      </w:r>
+      <w:r>
+        <w:t>tree node, expanding the tree as needed.</w:t>
+      </w:r>
+    </w:p>
+    <w:p>
+      <w:pPr>
+        <w:pStyle w:val="ListParagraph"/>
+        <w:numPr>
+          <w:ilvl w:val="0"/>
+          <w:numId w:val="9"/>
+        </w:numPr>
+        <w:rPr>
+          <w:rFonts w:ascii="Cascadia Mono" w:hAnsi="Cascadia Mono" w:cs="Cascadia Mono"/>
+          <w:color w:val="008000"/>
+          <w:kern w:val="0"/>
+          <w:sz w:val="19"/>
+          <w:szCs w:val="19"/>
+        </w:rPr>
+      </w:pPr>
+      <w:r>
+        <w:t xml:space="preserve">Selecting a view does not change the selection, but it may make the </w:t>
+      </w:r>
+      <w:r>
+        <w:t xml:space="preserve">current selected </w:t>
+      </w:r>
+      <w:r>
+        <w:t>call-stack not applicable</w:t>
+      </w:r>
+      <w:r>
+        <w:t xml:space="preserve">, resulting in the </w:t>
+      </w:r>
+      <w:r>
+        <w:t>Code View panel</w:t>
+      </w:r>
+      <w:r>
+        <w:t xml:space="preserve"> updating.</w:t>
+      </w:r>
+    </w:p>
+    <w:p>
+      <w:pPr>
+        <w:pStyle w:val="Heading3"/>
+      </w:pPr>
+      <w:r>
+        <w:t>Undo-Redo</w:t>
+      </w:r>
+      <w:r>
+        <w:t xml:space="preserve"> History</w:t>
+      </w:r>
+    </w:p>
+    <w:p>
+      <w:r>
+        <w:t xml:space="preserve">The following </w:t>
+      </w:r>
+      <w:r>
+        <w:t>actions</w:t>
+      </w:r>
+      <w:r>
+        <w:t xml:space="preserve"> are stored in the undo/redo </w:t>
+      </w:r>
+      <w:r>
+        <w:t>history:</w:t>
+      </w:r>
+    </w:p>
+    <w:p>
+      <w:pPr>
+        <w:pStyle w:val="ListParagraph"/>
+        <w:numPr>
+          <w:ilvl w:val="0"/>
+          <w:numId w:val="9"/>
+        </w:numPr>
+      </w:pPr>
+      <w:r>
+        <w:t xml:space="preserve">Select </w:t>
+      </w:r>
+      <w:r>
+        <w:t>time-line range</w:t>
+      </w:r>
+    </w:p>
+    <w:p>
+      <w:pPr>
+        <w:pStyle w:val="ListParagraph"/>
+        <w:numPr>
+          <w:ilvl w:val="0"/>
+          <w:numId w:val="9"/>
+        </w:numPr>
+      </w:pPr>
+      <w:r>
+        <w:t xml:space="preserve">Select/deselect </w:t>
+      </w:r>
+      <w:r>
+        <w:t>routine</w:t>
+      </w:r>
+      <w:r>
+        <w:t>/</w:t>
+      </w:r>
+      <w:r>
+        <w:t>call-stack</w:t>
+      </w:r>
+    </w:p>
+    <w:p>
+      <w:pPr>
+        <w:pStyle w:val="ListParagraph"/>
+        <w:numPr>
+          <w:ilvl w:val="0"/>
+          <w:numId w:val="9"/>
+        </w:numPr>
+      </w:pPr>
+      <w:r>
+        <w:t xml:space="preserve">Select </w:t>
+      </w:r>
+      <w:r>
+        <w:t>tab</w:t>
+      </w:r>
+    </w:p>
+    <w:p>
+      <w:pPr>
+        <w:pStyle w:val="ListParagraph"/>
+        <w:numPr>
+          <w:ilvl w:val="0"/>
+          <w:numId w:val="9"/>
+        </w:numPr>
+      </w:pPr>
+      <w:r>
+        <w:t xml:space="preserve">Select/deselect </w:t>
+      </w:r>
+      <w:r>
+        <w:t>memory address</w:t>
+      </w:r>
+    </w:p>
+    <w:p>
+      <w:pPr>
+        <w:pStyle w:val="ListParagraph"/>
+        <w:numPr>
+          <w:ilvl w:val="0"/>
+          <w:numId w:val="9"/>
+        </w:numPr>
+      </w:pPr>
+      <w:r>
+        <w:t>Show zero-page addresses</w:t>
+      </w:r>
+    </w:p>
+    <w:p>
+      <w:pPr>
+        <w:pStyle w:val="ListParagraph"/>
+        <w:numPr>
+          <w:ilvl w:val="0"/>
+          <w:numId w:val="9"/>
+        </w:numPr>
+      </w:pPr>
+      <w:r>
+        <w:t>Show hot routines</w:t>
+      </w:r>
+    </w:p>
+    <w:p>
+      <w:pPr>
+        <w:pStyle w:val="ListParagraph"/>
+        <w:numPr>
+          <w:ilvl w:val="0"/>
+          <w:numId w:val="9"/>
+        </w:numPr>
+      </w:pPr>
+      <w:r>
+        <w:t>Show hot paths</w:t>
+      </w:r>
+    </w:p>
+    <w:p>
+      <w:pPr>
+        <w:pStyle w:val="ListParagraph"/>
+        <w:numPr>
+          <w:ilvl w:val="0"/>
+          <w:numId w:val="9"/>
+        </w:numPr>
+      </w:pPr>
+      <w:r>
+        <w:t xml:space="preserve">Flip </w:t>
+      </w:r>
+      <w:r>
+        <w:t>flame graph</w:t>
+      </w:r>
+    </w:p>
+    <w:p>
+      <w:r>
+        <w:t xml:space="preserve">The following actions are </w:t>
+      </w:r>
+      <w:r>
+        <w:rPr>
+          <w:u w:val="single"/>
+        </w:rPr>
+        <w:t>not</w:t>
+      </w:r>
+      <w:r>
+        <w:t xml:space="preserve"> stored in the undo/redo history: </w:t>
+      </w:r>
+    </w:p>
+    <w:p>
+      <w:pPr>
+        <w:pStyle w:val="ListParagraph"/>
+        <w:numPr>
+          <w:ilvl w:val="0"/>
+          <w:numId w:val="9"/>
+        </w:numPr>
+      </w:pPr>
+      <w:r>
+        <w:t>Open file</w:t>
+      </w:r>
+    </w:p>
+    <w:p>
+      <w:pPr>
+        <w:pStyle w:val="ListParagraph"/>
+        <w:numPr>
+          <w:ilvl w:val="0"/>
+          <w:numId w:val="9"/>
+        </w:numPr>
+      </w:pPr>
+      <w:r>
+        <w:t>Scroll position changes</w:t>
+      </w:r>
+    </w:p>
+    <w:p>
+      <w:pPr>
+        <w:pStyle w:val="ListParagraph"/>
+        <w:numPr>
+          <w:ilvl w:val="0"/>
+          <w:numId w:val="9"/>
+        </w:numPr>
+      </w:pPr>
+      <w:r>
+        <w:t>Divider position changes</w:t>
+      </w:r>
+    </w:p>
+    <w:p>
+      <w:pPr>
+        <w:pStyle w:val="ListParagraph"/>
+        <w:numPr>
+          <w:ilvl w:val="0"/>
+          <w:numId w:val="9"/>
+        </w:numPr>
+      </w:pPr>
+      <w:r>
+        <w:t>Window resize</w:t>
+      </w:r>
+      <w:r>
+        <w:t>s</w:t>
+      </w:r>
+    </w:p>
+    <w:p>
+      <w:pPr>
+        <w:pStyle w:val="ListParagraph"/>
+        <w:numPr>
+          <w:ilvl w:val="0"/>
+          <w:numId w:val="9"/>
+        </w:numPr>
+      </w:pPr>
+      <w:r>
+        <w:t>Zoom in / zoom out</w:t>
+      </w:r>
+    </w:p>
+    <w:p>
+      <w:pPr>
+        <w:pStyle w:val="ListParagraph"/>
+        <w:numPr>
+          <w:ilvl w:val="0"/>
+          <w:numId w:val="9"/>
+        </w:numPr>
+      </w:pPr>
+      <w:r>
+        <w:t>Settings</w:t>
+      </w:r>
+    </w:p>
+    <w:p>
+      <w:pPr>
+        <w:pStyle w:val="Heading1"/>
+      </w:pPr>
+      <w:r>
+        <w:t>Analysis</w:t>
+      </w:r>
+    </w:p>
+    <w:p>
+      <w:r>
+        <w:t>The following p</w:t>
+      </w:r>
+      <w:r>
+        <w:t>rimary data structures</w:t>
+      </w:r>
+      <w:r>
+        <w:t xml:space="preserve"> are used to </w:t>
+      </w:r>
+      <w:r>
+        <w:t xml:space="preserve">model </w:t>
+      </w:r>
+      <w:r>
+        <w:t xml:space="preserve">and analyze </w:t>
+      </w:r>
+      <w:r>
+        <w:t xml:space="preserve">recorded </w:t>
+      </w:r>
+      <w:r>
+        <w:t xml:space="preserve">performance </w:t>
+      </w:r>
+      <w:r>
+        <w:t>data</w:t>
+      </w:r>
+      <w:r>
+        <w:t>:</w:t>
+      </w:r>
+    </w:p>
+    <w:p>
+      <w:pPr>
+        <w:pStyle w:val="ListParagraph"/>
+        <w:numPr>
+          <w:ilvl w:val="0"/>
+          <w:numId w:val="9"/>
+        </w:numPr>
+      </w:pPr>
+      <w:r>
+        <w:rPr>
+          <w:b/>
+          <w:bCs/>
+        </w:rPr>
+        <w:t>Model</w:t>
+      </w:r>
+      <w:r>
+        <w:t xml:space="preserve"> – represent the </w:t>
+      </w:r>
+      <w:r>
+        <w:t xml:space="preserve">loaded </w:t>
+      </w:r>
+      <w:r>
+        <w:t>program.  Contains the following fields:</w:t>
       </w:r>
     </w:p>
     <w:p>
@@ -8946,27 +9730,134 @@
         </w:numPr>
       </w:pPr>
       <w:r>
-        <w:t>Font</w:t>
-      </w:r>
-      <w:r>
-        <w:t xml:space="preserve"> and scaling</w:t>
-      </w:r>
-    </w:p>
-    <w:p>
-      <w:pPr>
-        <w:pStyle w:val="Heading3"/>
-      </w:pPr>
-      <w:r>
-        <w:t xml:space="preserve">Managing the </w:t>
-      </w:r>
-      <w:r>
-        <w:t>‘</w:t>
-      </w:r>
-      <w:r>
-        <w:t>context</w:t>
-      </w:r>
-      <w:r>
-        <w:t>’</w:t>
+        <w:t>BBC model and CPU</w:t>
+      </w:r>
+    </w:p>
+    <w:p>
+      <w:pPr>
+        <w:pStyle w:val="ListParagraph"/>
+        <w:numPr>
+          <w:ilvl w:val="1"/>
+          <w:numId w:val="9"/>
+        </w:numPr>
+      </w:pPr>
+      <w:r>
+        <w:t>Program s</w:t>
+      </w:r>
+      <w:r>
+        <w:t xml:space="preserve">napshot </w:t>
+      </w:r>
+      <w:r>
+        <w:t>taken at the beginning of the recording, containing:</w:t>
+      </w:r>
+    </w:p>
+    <w:p>
+      <w:pPr>
+        <w:pStyle w:val="ListParagraph"/>
+        <w:numPr>
+          <w:ilvl w:val="2"/>
+          <w:numId w:val="9"/>
+        </w:numPr>
+      </w:pPr>
+      <w:r>
+        <w:t>The m</w:t>
+      </w:r>
+      <w:r>
+        <w:t>emory</w:t>
+      </w:r>
+    </w:p>
+    <w:p>
+      <w:pPr>
+        <w:pStyle w:val="ListParagraph"/>
+        <w:numPr>
+          <w:ilvl w:val="2"/>
+          <w:numId w:val="9"/>
+        </w:numPr>
+      </w:pPr>
+      <w:r>
+        <w:t xml:space="preserve"> </w:t>
+      </w:r>
+      <w:r>
+        <w:t>Stack pointer</w:t>
+      </w:r>
+    </w:p>
+    <w:p>
+      <w:pPr>
+        <w:pStyle w:val="ListParagraph"/>
+        <w:numPr>
+          <w:ilvl w:val="2"/>
+          <w:numId w:val="9"/>
+        </w:numPr>
+      </w:pPr>
+      <w:r>
+        <w:lastRenderedPageBreak/>
+        <w:t>Rom Paging register and Access Control register</w:t>
+      </w:r>
+    </w:p>
+    <w:p>
+      <w:pPr>
+        <w:pStyle w:val="ListParagraph"/>
+        <w:numPr>
+          <w:ilvl w:val="2"/>
+          <w:numId w:val="9"/>
+        </w:numPr>
+      </w:pPr>
+      <w:r>
+        <w:t>Hidden RAM address (Integral)</w:t>
+      </w:r>
+    </w:p>
+    <w:p>
+      <w:pPr>
+        <w:pStyle w:val="ListParagraph"/>
+        <w:numPr>
+          <w:ilvl w:val="2"/>
+          <w:numId w:val="9"/>
+        </w:numPr>
+      </w:pPr>
+      <w:r>
+        <w:t>Video ULA register</w:t>
+      </w:r>
+      <w:r>
+        <w:t xml:space="preserve"> and palette</w:t>
+      </w:r>
+    </w:p>
+    <w:p>
+      <w:pPr>
+        <w:pStyle w:val="ListParagraph"/>
+        <w:numPr>
+          <w:ilvl w:val="2"/>
+          <w:numId w:val="9"/>
+        </w:numPr>
+      </w:pPr>
+      <w:r>
+        <w:t>Video control registers</w:t>
+      </w:r>
+    </w:p>
+    <w:p>
+      <w:pPr>
+        <w:pStyle w:val="ListParagraph"/>
+        <w:numPr>
+          <w:ilvl w:val="1"/>
+          <w:numId w:val="9"/>
+        </w:numPr>
+      </w:pPr>
+      <w:r>
+        <w:t>Labels (indexed by memory address)</w:t>
+      </w:r>
+    </w:p>
+    <w:p>
+      <w:pPr>
+        <w:pStyle w:val="ListParagraph"/>
+        <w:numPr>
+          <w:ilvl w:val="1"/>
+          <w:numId w:val="9"/>
+        </w:numPr>
+      </w:pPr>
+      <w:r>
+        <w:t>Instructions</w:t>
+      </w:r>
+      <w:r>
+        <w:t xml:space="preserve"> (array of Instruction)</w:t>
       </w:r>
     </w:p>
     <w:p>
@@ -8978,16 +9869,59 @@
         </w:numPr>
       </w:pPr>
       <w:r>
-        <w:t>The form owns the currently selected routine</w:t>
-      </w:r>
-      <w:r>
-        <w:t xml:space="preserve">, </w:t>
-      </w:r>
-      <w:r>
-        <w:t>call-stack</w:t>
-      </w:r>
-      <w:r>
-        <w:t>, and selected address.</w:t>
+        <w:rPr>
+          <w:b/>
+          <w:bCs/>
+        </w:rPr>
+        <w:t>Canonical Address</w:t>
+      </w:r>
+      <w:r>
+        <w:t xml:space="preserve"> – represents </w:t>
+      </w:r>
+      <w:r>
+        <w:t>a unique memory address.</w:t>
+      </w:r>
+      <w:r>
+        <w:t xml:space="preserve"> </w:t>
+      </w:r>
+      <w:r>
+        <w:t xml:space="preserve"> Contains the following immutable fields:</w:t>
+      </w:r>
+    </w:p>
+    <w:p>
+      <w:pPr>
+        <w:pStyle w:val="ListParagraph"/>
+        <w:numPr>
+          <w:ilvl w:val="1"/>
+          <w:numId w:val="9"/>
+        </w:numPr>
+      </w:pPr>
+      <w:r>
+        <w:t>Page</w:t>
+      </w:r>
+      <w:r>
+        <w:t xml:space="preserve"> –</w:t>
+      </w:r>
+      <w:r>
+        <w:t xml:space="preserve"> </w:t>
+      </w:r>
+      <w:r>
+        <w:t>memory page</w:t>
+      </w:r>
+    </w:p>
+    <w:p>
+      <w:pPr>
+        <w:pStyle w:val="ListParagraph"/>
+        <w:numPr>
+          <w:ilvl w:val="1"/>
+          <w:numId w:val="9"/>
+        </w:numPr>
+      </w:pPr>
+      <w:r>
+        <w:t>Address</w:t>
+      </w:r>
+      <w:r>
+        <w:t xml:space="preserve"> – relative address within the memory page</w:t>
       </w:r>
     </w:p>
     <w:p>
@@ -8999,31 +9933,194 @@
         </w:numPr>
       </w:pPr>
       <w:r>
-        <w:t xml:space="preserve">The selection can be </w:t>
-      </w:r>
-      <w:r>
-        <w:t xml:space="preserve">changed </w:t>
-      </w:r>
-      <w:r>
-        <w:t xml:space="preserve">and/or cleared </w:t>
-      </w:r>
-      <w:r>
-        <w:t xml:space="preserve">from </w:t>
-      </w:r>
-      <w:r>
-        <w:t xml:space="preserve">withing </w:t>
-      </w:r>
-      <w:r>
-        <w:t xml:space="preserve">any </w:t>
-      </w:r>
-      <w:r>
-        <w:t>V</w:t>
-      </w:r>
-      <w:r>
-        <w:t>iew</w:t>
+        <w:rPr>
+          <w:b/>
+          <w:bCs/>
+        </w:rPr>
+        <w:t>Instruction</w:t>
+      </w:r>
+      <w:r>
+        <w:t xml:space="preserve"> – represents a</w:t>
+      </w:r>
+      <w:r>
+        <w:t>n</w:t>
+      </w:r>
+      <w:r>
+        <w:t xml:space="preserve"> individual recorded instruction</w:t>
+      </w:r>
+      <w:r>
+        <w:t xml:space="preserve"> or interrupt</w:t>
       </w:r>
       <w:r>
         <w:t>.</w:t>
+      </w:r>
+      <w:r>
+        <w:t xml:space="preserve">  Contains the following </w:t>
+      </w:r>
+      <w:r>
+        <w:t xml:space="preserve">immutable </w:t>
+      </w:r>
+      <w:r>
+        <w:t>fields:</w:t>
+      </w:r>
+    </w:p>
+    <w:p>
+      <w:pPr>
+        <w:pStyle w:val="ListParagraph"/>
+        <w:numPr>
+          <w:ilvl w:val="1"/>
+          <w:numId w:val="9"/>
+        </w:numPr>
+      </w:pPr>
+      <w:r>
+        <w:t>Type</w:t>
+      </w:r>
+      <w:r>
+        <w:t xml:space="preserve"> (i</w:t>
+      </w:r>
+      <w:r>
+        <w:t>nstruction, maskable interrupt, or non-maskable interrupt</w:t>
+      </w:r>
+      <w:r>
+        <w:t>)</w:t>
+      </w:r>
+    </w:p>
+    <w:p>
+      <w:pPr>
+        <w:pStyle w:val="ListParagraph"/>
+        <w:numPr>
+          <w:ilvl w:val="1"/>
+          <w:numId w:val="9"/>
+        </w:numPr>
+      </w:pPr>
+      <w:r>
+        <w:t>Cycle count</w:t>
+      </w:r>
+    </w:p>
+    <w:p>
+      <w:pPr>
+        <w:pStyle w:val="ListParagraph"/>
+        <w:numPr>
+          <w:ilvl w:val="1"/>
+          <w:numId w:val="9"/>
+        </w:numPr>
+      </w:pPr>
+      <w:r>
+        <w:t>Stack pointer</w:t>
+      </w:r>
+    </w:p>
+    <w:p>
+      <w:pPr>
+        <w:pStyle w:val="ListParagraph"/>
+        <w:numPr>
+          <w:ilvl w:val="1"/>
+          <w:numId w:val="9"/>
+        </w:numPr>
+      </w:pPr>
+      <w:r>
+        <w:t>ISR address (interrupt)</w:t>
+      </w:r>
+    </w:p>
+    <w:p>
+      <w:pPr>
+        <w:pStyle w:val="ListParagraph"/>
+        <w:numPr>
+          <w:ilvl w:val="1"/>
+          <w:numId w:val="9"/>
+        </w:numPr>
+      </w:pPr>
+      <w:r>
+        <w:t>Interrupted address (interrupt)</w:t>
+      </w:r>
+    </w:p>
+    <w:p>
+      <w:pPr>
+        <w:pStyle w:val="ListParagraph"/>
+        <w:numPr>
+          <w:ilvl w:val="1"/>
+          <w:numId w:val="9"/>
+        </w:numPr>
+      </w:pPr>
+      <w:r>
+        <w:t>Opcode address (instruction)</w:t>
+      </w:r>
+    </w:p>
+    <w:p>
+      <w:pPr>
+        <w:pStyle w:val="ListParagraph"/>
+        <w:numPr>
+          <w:ilvl w:val="1"/>
+          <w:numId w:val="9"/>
+        </w:numPr>
+      </w:pPr>
+      <w:r>
+        <w:t>Opcode &amp; operand</w:t>
+      </w:r>
+      <w:r>
+        <w:t xml:space="preserve"> (instruction)</w:t>
+      </w:r>
+    </w:p>
+    <w:p>
+      <w:pPr>
+        <w:pStyle w:val="ListParagraph"/>
+        <w:numPr>
+          <w:ilvl w:val="1"/>
+          <w:numId w:val="9"/>
+        </w:numPr>
+      </w:pPr>
+      <w:r>
+        <w:t xml:space="preserve">Memory </w:t>
+      </w:r>
+      <w:r>
+        <w:t>a</w:t>
+      </w:r>
+      <w:r>
+        <w:t>ddress</w:t>
+      </w:r>
+      <w:r>
+        <w:t xml:space="preserve"> </w:t>
+      </w:r>
+      <w:r>
+        <w:t>/ d</w:t>
+      </w:r>
+      <w:r>
+        <w:t>estination address</w:t>
+      </w:r>
+      <w:r>
+        <w:t xml:space="preserve"> (instruction)</w:t>
+      </w:r>
+    </w:p>
+    <w:p>
+      <w:pPr>
+        <w:pStyle w:val="ListParagraph"/>
+        <w:numPr>
+          <w:ilvl w:val="1"/>
+          <w:numId w:val="9"/>
+        </w:numPr>
+      </w:pPr>
+      <w:r>
+        <w:t>Memory read</w:t>
+      </w:r>
+      <w:r>
+        <w:t>/</w:t>
+      </w:r>
+      <w:r>
+        <w:t>w</w:t>
+      </w:r>
+      <w:r>
+        <w:t xml:space="preserve">rite </w:t>
+      </w:r>
+      <w:r>
+        <w:t>v</w:t>
+      </w:r>
+      <w:r>
+        <w:t>alue</w:t>
+      </w:r>
+      <w:r>
+        <w:t>s</w:t>
+      </w:r>
+      <w:r>
+        <w:t xml:space="preserve"> (instruction)</w:t>
       </w:r>
     </w:p>
     <w:p>
@@ -9035,16 +10132,152 @@
         </w:numPr>
       </w:pPr>
       <w:r>
-        <w:t>Each View responds to selection changes, highlighting the most appropriate element</w:t>
-      </w:r>
-      <w:r>
-        <w:t xml:space="preserve"> within.</w:t>
-      </w:r>
-      <w:r>
-        <w:t xml:space="preserve">  For example, the Call Tree will select the most appropriate </w:t>
-      </w:r>
-      <w:r>
-        <w:t>tree node, expanding the tree as needed.</w:t>
+        <w:rPr>
+          <w:b/>
+          <w:bCs/>
+        </w:rPr>
+        <w:t>Routine</w:t>
+      </w:r>
+      <w:r>
+        <w:t xml:space="preserve"> – represents a unique code routine.</w:t>
+      </w:r>
+      <w:r>
+        <w:t xml:space="preserve">  Contains the following fields.</w:t>
+      </w:r>
+    </w:p>
+    <w:p>
+      <w:pPr>
+        <w:pStyle w:val="ListParagraph"/>
+        <w:numPr>
+          <w:ilvl w:val="1"/>
+          <w:numId w:val="9"/>
+        </w:numPr>
+      </w:pPr>
+      <w:r>
+        <w:t>Start address</w:t>
+      </w:r>
+    </w:p>
+    <w:p>
+      <w:pPr>
+        <w:pStyle w:val="ListParagraph"/>
+        <w:numPr>
+          <w:ilvl w:val="1"/>
+          <w:numId w:val="9"/>
+        </w:numPr>
+      </w:pPr>
+      <w:r>
+        <w:t xml:space="preserve">End </w:t>
+      </w:r>
+      <w:r>
+        <w:t>address</w:t>
+      </w:r>
+    </w:p>
+    <w:p>
+      <w:pPr>
+        <w:pStyle w:val="ListParagraph"/>
+        <w:numPr>
+          <w:ilvl w:val="1"/>
+          <w:numId w:val="9"/>
+        </w:numPr>
+      </w:pPr>
+      <w:r>
+        <w:t>Label (optional)</w:t>
+      </w:r>
+    </w:p>
+    <w:p>
+      <w:pPr>
+        <w:pStyle w:val="ListParagraph"/>
+        <w:numPr>
+          <w:ilvl w:val="1"/>
+          <w:numId w:val="9"/>
+        </w:numPr>
+      </w:pPr>
+      <w:r>
+        <w:t>Code (including variants)</w:t>
+      </w:r>
+    </w:p>
+    <w:p>
+      <w:pPr>
+        <w:pStyle w:val="ListParagraph"/>
+        <w:numPr>
+          <w:ilvl w:val="1"/>
+          <w:numId w:val="9"/>
+        </w:numPr>
+      </w:pPr>
+      <w:r>
+        <w:t>Type (maskable ISR, non-maskable ISR, JSR, pseudo, unknown)</w:t>
+      </w:r>
+    </w:p>
+    <w:p>
+      <w:pPr>
+        <w:pStyle w:val="ListParagraph"/>
+        <w:numPr>
+          <w:ilvl w:val="1"/>
+          <w:numId w:val="9"/>
+        </w:numPr>
+      </w:pPr>
+      <w:r>
+        <w:t xml:space="preserve">Aggregated CPU Metrics, by </w:t>
+      </w:r>
+      <w:proofErr w:type="spellStart"/>
+      <w:r>
+        <w:t>RoutineStack</w:t>
+      </w:r>
+      <w:proofErr w:type="spellEnd"/>
+      <w:r>
+        <w:t xml:space="preserve"> – </w:t>
+      </w:r>
+      <w:r>
+        <w:rPr>
+          <w:i/>
+          <w:iCs/>
+        </w:rPr>
+        <w:t>populated</w:t>
+      </w:r>
+      <w:r>
+        <w:t xml:space="preserve"> </w:t>
+      </w:r>
+      <w:r>
+        <w:rPr>
+          <w:i/>
+          <w:iCs/>
+        </w:rPr>
+        <w:t>for a time-range</w:t>
+      </w:r>
+    </w:p>
+    <w:p>
+      <w:pPr>
+        <w:pStyle w:val="ListParagraph"/>
+        <w:numPr>
+          <w:ilvl w:val="1"/>
+          <w:numId w:val="9"/>
+        </w:numPr>
+      </w:pPr>
+      <w:r>
+        <w:t xml:space="preserve">Total </w:t>
+      </w:r>
+      <w:r>
+        <w:t>a</w:t>
+      </w:r>
+      <w:r>
+        <w:t xml:space="preserve">ggregated CPU Metrics – </w:t>
+      </w:r>
+      <w:r>
+        <w:rPr>
+          <w:i/>
+          <w:iCs/>
+        </w:rPr>
+        <w:t>populated</w:t>
+      </w:r>
+      <w:r>
+        <w:t xml:space="preserve"> </w:t>
+      </w:r>
+      <w:r>
+        <w:rPr>
+          <w:i/>
+          <w:iCs/>
+        </w:rPr>
+        <w:t>for a time-range</w:t>
       </w:r>
     </w:p>
     <w:p>
@@ -9054,56 +10287,155 @@
           <w:ilvl w:val="0"/>
           <w:numId w:val="9"/>
         </w:numPr>
-        <w:rPr>
-          <w:rFonts w:ascii="Cascadia Mono" w:hAnsi="Cascadia Mono" w:cs="Cascadia Mono"/>
-          <w:color w:val="008000"/>
-          <w:kern w:val="0"/>
-          <w:sz w:val="19"/>
-          <w:szCs w:val="19"/>
-        </w:rPr>
-      </w:pPr>
-      <w:r>
-        <w:t xml:space="preserve">Selecting a view does not change the selection, but it may make the </w:t>
-      </w:r>
-      <w:r>
-        <w:t xml:space="preserve">current selected </w:t>
-      </w:r>
-      <w:r>
-        <w:t>call-stack not applicable</w:t>
-      </w:r>
-      <w:r>
-        <w:t xml:space="preserve">, resulting in the </w:t>
-      </w:r>
-      <w:r>
-        <w:t>Code View panel</w:t>
-      </w:r>
-      <w:r>
-        <w:t xml:space="preserve"> updating.</w:t>
-      </w:r>
-    </w:p>
-    <w:p>
-      <w:pPr>
-        <w:pStyle w:val="Heading3"/>
-      </w:pPr>
-      <w:r>
-        <w:t>Undo-Redo</w:t>
-      </w:r>
-      <w:r>
-        <w:t xml:space="preserve"> History</w:t>
-      </w:r>
-    </w:p>
-    <w:p>
-      <w:r>
-        <w:t xml:space="preserve">The following </w:t>
-      </w:r>
-      <w:r>
-        <w:t>actions</w:t>
-      </w:r>
-      <w:r>
-        <w:t xml:space="preserve"> are stored in the undo/redo </w:t>
-      </w:r>
-      <w:r>
-        <w:t>history:</w:t>
+      </w:pPr>
+      <w:proofErr w:type="spellStart"/>
+      <w:r>
+        <w:rPr>
+          <w:b/>
+          <w:bCs/>
+        </w:rPr>
+        <w:t>CallStack</w:t>
+      </w:r>
+      <w:proofErr w:type="spellEnd"/>
+      <w:r>
+        <w:t xml:space="preserve"> – represents a</w:t>
+      </w:r>
+      <w:r>
+        <w:t xml:space="preserve"> call stack within the recorded program</w:t>
+      </w:r>
+      <w:proofErr w:type="gramStart"/>
+      <w:r>
+        <w:t xml:space="preserve">. </w:t>
+      </w:r>
+      <w:proofErr w:type="gramEnd"/>
+      <w:r>
+        <w:t>Contains the following fields:</w:t>
+      </w:r>
+    </w:p>
+    <w:p>
+      <w:pPr>
+        <w:pStyle w:val="ListParagraph"/>
+        <w:numPr>
+          <w:ilvl w:val="1"/>
+          <w:numId w:val="9"/>
+        </w:numPr>
+      </w:pPr>
+      <w:r>
+        <w:t>Routine reference</w:t>
+      </w:r>
+    </w:p>
+    <w:p>
+      <w:pPr>
+        <w:pStyle w:val="ListParagraph"/>
+        <w:numPr>
+          <w:ilvl w:val="1"/>
+          <w:numId w:val="9"/>
+        </w:numPr>
+      </w:pPr>
+      <w:r>
+        <w:t>Canonical address</w:t>
+      </w:r>
+      <w:r>
+        <w:t xml:space="preserve"> (copy of </w:t>
+      </w:r>
+      <w:r>
+        <w:t>routine’s start address</w:t>
+      </w:r>
+      <w:r>
+        <w:t>)</w:t>
+      </w:r>
+    </w:p>
+    <w:p>
+      <w:pPr>
+        <w:pStyle w:val="ListParagraph"/>
+        <w:numPr>
+          <w:ilvl w:val="1"/>
+          <w:numId w:val="9"/>
+        </w:numPr>
+      </w:pPr>
+      <w:r>
+        <w:t xml:space="preserve">Parent </w:t>
+      </w:r>
+      <w:proofErr w:type="spellStart"/>
+      <w:r>
+        <w:t>CallStack</w:t>
+      </w:r>
+      <w:proofErr w:type="spellEnd"/>
+      <w:r>
+        <w:t xml:space="preserve"> reference</w:t>
+      </w:r>
+    </w:p>
+    <w:p>
+      <w:pPr>
+        <w:pStyle w:val="ListParagraph"/>
+        <w:numPr>
+          <w:ilvl w:val="1"/>
+          <w:numId w:val="9"/>
+        </w:numPr>
+      </w:pPr>
+      <w:r>
+        <w:t>Call t</w:t>
+      </w:r>
+      <w:r>
+        <w:t xml:space="preserve">ype </w:t>
+      </w:r>
+      <w:r>
+        <w:t xml:space="preserve">– e.g. </w:t>
+      </w:r>
+      <w:r>
+        <w:t xml:space="preserve">ISR, JSR, tail-call, </w:t>
+      </w:r>
+      <w:r>
+        <w:t xml:space="preserve">or </w:t>
+      </w:r>
+      <w:r>
+        <w:t>unknown</w:t>
+      </w:r>
+    </w:p>
+    <w:p>
+      <w:pPr>
+        <w:ind w:left="1080"/>
+      </w:pPr>
+      <w:r>
+        <w:t xml:space="preserve">The identify of a </w:t>
+      </w:r>
+      <w:proofErr w:type="spellStart"/>
+      <w:r>
+        <w:t>CallStack</w:t>
+      </w:r>
+      <w:proofErr w:type="spellEnd"/>
+      <w:r>
+        <w:t xml:space="preserve"> is defined </w:t>
+      </w:r>
+      <w:r>
+        <w:t xml:space="preserve">by the sequence of </w:t>
+      </w:r>
+      <w:r>
+        <w:t>addresses</w:t>
+      </w:r>
+      <w:r>
+        <w:t xml:space="preserve"> </w:t>
+      </w:r>
+      <w:r>
+        <w:t xml:space="preserve">up through the parent </w:t>
+      </w:r>
+      <w:r>
+        <w:t>chain</w:t>
+      </w:r>
+      <w:r>
+        <w:t xml:space="preserve">, </w:t>
+      </w:r>
+      <w:r>
+        <w:t xml:space="preserve">ending at the </w:t>
+      </w:r>
+      <w:r>
+        <w:t xml:space="preserve">root or </w:t>
+      </w:r>
+      <w:r>
+        <w:t xml:space="preserve">a call stack that has an </w:t>
+      </w:r>
+      <w:r>
+        <w:t>ISR call type.</w:t>
       </w:r>
     </w:p>
     <w:p>
@@ -9114,265 +10446,24 @@
           <w:numId w:val="9"/>
         </w:numPr>
       </w:pPr>
-      <w:r>
-        <w:t xml:space="preserve">Select </w:t>
-      </w:r>
-      <w:r>
-        <w:t>time-line range</w:t>
-      </w:r>
-    </w:p>
-    <w:p>
-      <w:pPr>
-        <w:pStyle w:val="ListParagraph"/>
-        <w:numPr>
-          <w:ilvl w:val="0"/>
-          <w:numId w:val="9"/>
-        </w:numPr>
-      </w:pPr>
-      <w:r>
-        <w:t xml:space="preserve">Select/deselect </w:t>
-      </w:r>
-      <w:r>
-        <w:t>routine</w:t>
-      </w:r>
-      <w:r>
-        <w:t>/</w:t>
-      </w:r>
-      <w:r>
-        <w:t>call-stack</w:t>
-      </w:r>
-    </w:p>
-    <w:p>
-      <w:pPr>
-        <w:pStyle w:val="ListParagraph"/>
-        <w:numPr>
-          <w:ilvl w:val="0"/>
-          <w:numId w:val="9"/>
-        </w:numPr>
-      </w:pPr>
-      <w:r>
-        <w:t xml:space="preserve">Select </w:t>
-      </w:r>
-      <w:r>
-        <w:t>tab</w:t>
-      </w:r>
-    </w:p>
-    <w:p>
-      <w:pPr>
-        <w:pStyle w:val="ListParagraph"/>
-        <w:numPr>
-          <w:ilvl w:val="0"/>
-          <w:numId w:val="9"/>
-        </w:numPr>
-      </w:pPr>
-      <w:r>
-        <w:t xml:space="preserve">Select/deselect </w:t>
-      </w:r>
-      <w:r>
-        <w:t>memory address</w:t>
-      </w:r>
-    </w:p>
-    <w:p>
-      <w:pPr>
-        <w:pStyle w:val="ListParagraph"/>
-        <w:numPr>
-          <w:ilvl w:val="0"/>
-          <w:numId w:val="9"/>
-        </w:numPr>
-      </w:pPr>
-      <w:r>
-        <w:t>Show zero-page addresses</w:t>
-      </w:r>
-    </w:p>
-    <w:p>
-      <w:pPr>
-        <w:pStyle w:val="ListParagraph"/>
-        <w:numPr>
-          <w:ilvl w:val="0"/>
-          <w:numId w:val="9"/>
-        </w:numPr>
-      </w:pPr>
-      <w:r>
-        <w:t>Show hot routines</w:t>
-      </w:r>
-    </w:p>
-    <w:p>
-      <w:pPr>
-        <w:pStyle w:val="ListParagraph"/>
-        <w:numPr>
-          <w:ilvl w:val="0"/>
-          <w:numId w:val="9"/>
-        </w:numPr>
-      </w:pPr>
-      <w:r>
-        <w:t>Show hot paths</w:t>
-      </w:r>
-    </w:p>
-    <w:p>
-      <w:pPr>
-        <w:pStyle w:val="ListParagraph"/>
-        <w:numPr>
-          <w:ilvl w:val="0"/>
-          <w:numId w:val="9"/>
-        </w:numPr>
-      </w:pPr>
-      <w:r>
-        <w:lastRenderedPageBreak/>
-        <w:t xml:space="preserve">Flip </w:t>
-      </w:r>
-      <w:r>
-        <w:t>flame graph</w:t>
-      </w:r>
-    </w:p>
-    <w:p>
-      <w:r>
-        <w:t xml:space="preserve">The following actions are </w:t>
-      </w:r>
-      <w:r>
-        <w:rPr>
-          <w:u w:val="single"/>
-        </w:rPr>
-        <w:t>not</w:t>
-      </w:r>
-      <w:r>
-        <w:t xml:space="preserve"> stored in the undo/redo history: </w:t>
-      </w:r>
-    </w:p>
-    <w:p>
-      <w:pPr>
-        <w:pStyle w:val="ListParagraph"/>
-        <w:numPr>
-          <w:ilvl w:val="0"/>
-          <w:numId w:val="9"/>
-        </w:numPr>
-      </w:pPr>
-      <w:r>
-        <w:t>Open file</w:t>
-      </w:r>
-    </w:p>
-    <w:p>
-      <w:pPr>
-        <w:pStyle w:val="ListParagraph"/>
-        <w:numPr>
-          <w:ilvl w:val="0"/>
-          <w:numId w:val="9"/>
-        </w:numPr>
-      </w:pPr>
-      <w:r>
-        <w:t>Scroll position changes</w:t>
-      </w:r>
-    </w:p>
-    <w:p>
-      <w:pPr>
-        <w:pStyle w:val="ListParagraph"/>
-        <w:numPr>
-          <w:ilvl w:val="0"/>
-          <w:numId w:val="9"/>
-        </w:numPr>
-      </w:pPr>
-      <w:r>
-        <w:t>Divider position changes</w:t>
-      </w:r>
-    </w:p>
-    <w:p>
-      <w:pPr>
-        <w:pStyle w:val="ListParagraph"/>
-        <w:numPr>
-          <w:ilvl w:val="0"/>
-          <w:numId w:val="9"/>
-        </w:numPr>
-      </w:pPr>
-      <w:r>
-        <w:t>Window resize</w:t>
-      </w:r>
-      <w:r>
-        <w:t>s</w:t>
-      </w:r>
-    </w:p>
-    <w:p>
-      <w:pPr>
-        <w:pStyle w:val="ListParagraph"/>
-        <w:numPr>
-          <w:ilvl w:val="0"/>
-          <w:numId w:val="9"/>
-        </w:numPr>
-      </w:pPr>
-      <w:r>
-        <w:t>Zoom in / zoom out</w:t>
-      </w:r>
-    </w:p>
-    <w:p>
-      <w:pPr>
-        <w:pStyle w:val="ListParagraph"/>
-        <w:numPr>
-          <w:ilvl w:val="0"/>
-          <w:numId w:val="9"/>
-        </w:numPr>
-      </w:pPr>
-      <w:r>
-        <w:t>Settings</w:t>
-      </w:r>
-    </w:p>
-    <w:p>
-      <w:pPr>
-        <w:pStyle w:val="Heading1"/>
-      </w:pPr>
-      <w:r>
-        <w:t>Analysis</w:t>
-      </w:r>
-    </w:p>
-    <w:p>
-      <w:r>
-        <w:t>The following p</w:t>
-      </w:r>
-      <w:r>
-        <w:t>rimary data structures</w:t>
-      </w:r>
-      <w:r>
-        <w:t xml:space="preserve"> are used to </w:t>
-      </w:r>
-      <w:r>
-        <w:t xml:space="preserve">model </w:t>
-      </w:r>
-      <w:r>
-        <w:t xml:space="preserve">and analyze </w:t>
-      </w:r>
-      <w:r>
-        <w:t xml:space="preserve">recorded </w:t>
-      </w:r>
-      <w:r>
-        <w:t xml:space="preserve">performance </w:t>
-      </w:r>
-      <w:r>
-        <w:t>data</w:t>
-      </w:r>
-      <w:r>
-        <w:t>:</w:t>
-      </w:r>
-    </w:p>
-    <w:p>
-      <w:pPr>
-        <w:pStyle w:val="ListParagraph"/>
-        <w:numPr>
-          <w:ilvl w:val="0"/>
-          <w:numId w:val="9"/>
-        </w:numPr>
-      </w:pPr>
+      <w:proofErr w:type="spellStart"/>
       <w:r>
         <w:rPr>
           <w:b/>
           <w:bCs/>
         </w:rPr>
-        <w:t>Model</w:t>
-      </w:r>
-      <w:r>
-        <w:t xml:space="preserve"> – represent the </w:t>
-      </w:r>
-      <w:r>
-        <w:t xml:space="preserve">loaded </w:t>
-      </w:r>
-      <w:r>
-        <w:t>program.  Contains the following fields:</w:t>
+        <w:lastRenderedPageBreak/>
+        <w:t>StackFrame</w:t>
+      </w:r>
+      <w:proofErr w:type="spellEnd"/>
+      <w:r>
+        <w:t xml:space="preserve"> – represents a unique stack-frame within the recorded program.</w:t>
+      </w:r>
+      <w:r>
+        <w:t xml:space="preserve">  </w:t>
+      </w:r>
+      <w:r>
+        <w:t>Contains the following fields:</w:t>
       </w:r>
     </w:p>
     <w:p>
@@ -9384,7 +10475,7 @@
         </w:numPr>
       </w:pPr>
       <w:r>
-        <w:t>BBC model and CPU</w:t>
+        <w:t>List of child (nested) stack frames</w:t>
       </w:r>
     </w:p>
     <w:p>
@@ -9396,94 +10487,7 @@
         </w:numPr>
       </w:pPr>
       <w:r>
-        <w:t>Program s</w:t>
-      </w:r>
-      <w:r>
-        <w:t xml:space="preserve">napshot </w:t>
-      </w:r>
-      <w:r>
-        <w:t>taken at the beginning of the recording, containing:</w:t>
-      </w:r>
-    </w:p>
-    <w:p>
-      <w:pPr>
-        <w:pStyle w:val="ListParagraph"/>
-        <w:numPr>
-          <w:ilvl w:val="2"/>
-          <w:numId w:val="9"/>
-        </w:numPr>
-      </w:pPr>
-      <w:r>
-        <w:t>The m</w:t>
-      </w:r>
-      <w:r>
-        <w:t>emory</w:t>
-      </w:r>
-    </w:p>
-    <w:p>
-      <w:pPr>
-        <w:pStyle w:val="ListParagraph"/>
-        <w:numPr>
-          <w:ilvl w:val="2"/>
-          <w:numId w:val="9"/>
-        </w:numPr>
-      </w:pPr>
-      <w:r>
-        <w:t xml:space="preserve"> </w:t>
-      </w:r>
-      <w:r>
-        <w:t>Stack pointer</w:t>
-      </w:r>
-    </w:p>
-    <w:p>
-      <w:pPr>
-        <w:pStyle w:val="ListParagraph"/>
-        <w:numPr>
-          <w:ilvl w:val="2"/>
-          <w:numId w:val="9"/>
-        </w:numPr>
-      </w:pPr>
-      <w:r>
-        <w:t>Rom Paging register and Access Control register</w:t>
-      </w:r>
-    </w:p>
-    <w:p>
-      <w:pPr>
-        <w:pStyle w:val="ListParagraph"/>
-        <w:numPr>
-          <w:ilvl w:val="2"/>
-          <w:numId w:val="9"/>
-        </w:numPr>
-      </w:pPr>
-      <w:r>
-        <w:t>Hidden RAM address (Integral)</w:t>
-      </w:r>
-    </w:p>
-    <w:p>
-      <w:pPr>
-        <w:pStyle w:val="ListParagraph"/>
-        <w:numPr>
-          <w:ilvl w:val="2"/>
-          <w:numId w:val="9"/>
-        </w:numPr>
-      </w:pPr>
-      <w:r>
-        <w:t>Video ULA register</w:t>
-      </w:r>
-      <w:r>
-        <w:t xml:space="preserve"> and palette</w:t>
-      </w:r>
-    </w:p>
-    <w:p>
-      <w:pPr>
-        <w:pStyle w:val="ListParagraph"/>
-        <w:numPr>
-          <w:ilvl w:val="2"/>
-          <w:numId w:val="9"/>
-        </w:numPr>
-      </w:pPr>
-      <w:r>
-        <w:t>Video control registers</w:t>
+        <w:t>Call Stack (inherited for implementation efficiency)</w:t>
       </w:r>
     </w:p>
     <w:p>
@@ -9495,7 +10499,10 @@
         </w:numPr>
       </w:pPr>
       <w:r>
-        <w:t>Labels (indexed by memory address)</w:t>
+        <w:t xml:space="preserve">First and last instruction </w:t>
+      </w:r>
+      <w:r>
+        <w:t>indices</w:t>
       </w:r>
     </w:p>
     <w:p>
@@ -9507,658 +10514,6 @@
         </w:numPr>
       </w:pPr>
       <w:r>
-        <w:t>Instructions</w:t>
-      </w:r>
-      <w:r>
-        <w:t xml:space="preserve"> (array of Instruction)</w:t>
-      </w:r>
-    </w:p>
-    <w:p>
-      <w:pPr>
-        <w:pStyle w:val="ListParagraph"/>
-        <w:numPr>
-          <w:ilvl w:val="0"/>
-          <w:numId w:val="9"/>
-        </w:numPr>
-      </w:pPr>
-      <w:r>
-        <w:rPr>
-          <w:b/>
-          <w:bCs/>
-        </w:rPr>
-        <w:t>Canonical Address</w:t>
-      </w:r>
-      <w:r>
-        <w:t xml:space="preserve"> – represents </w:t>
-      </w:r>
-      <w:r>
-        <w:t>a unique memory address.</w:t>
-      </w:r>
-      <w:r>
-        <w:t xml:space="preserve"> </w:t>
-      </w:r>
-      <w:r>
-        <w:t xml:space="preserve"> Contains the following immutable fields:</w:t>
-      </w:r>
-    </w:p>
-    <w:p>
-      <w:pPr>
-        <w:pStyle w:val="ListParagraph"/>
-        <w:numPr>
-          <w:ilvl w:val="1"/>
-          <w:numId w:val="9"/>
-        </w:numPr>
-      </w:pPr>
-      <w:r>
-        <w:t>Page</w:t>
-      </w:r>
-      <w:r>
-        <w:t xml:space="preserve"> –</w:t>
-      </w:r>
-      <w:r>
-        <w:t xml:space="preserve"> </w:t>
-      </w:r>
-      <w:r>
-        <w:t>memory page</w:t>
-      </w:r>
-    </w:p>
-    <w:p>
-      <w:pPr>
-        <w:pStyle w:val="ListParagraph"/>
-        <w:numPr>
-          <w:ilvl w:val="1"/>
-          <w:numId w:val="9"/>
-        </w:numPr>
-      </w:pPr>
-      <w:r>
-        <w:t>Address</w:t>
-      </w:r>
-      <w:r>
-        <w:t xml:space="preserve"> – relative address within the memory page</w:t>
-      </w:r>
-    </w:p>
-    <w:p>
-      <w:pPr>
-        <w:pStyle w:val="ListParagraph"/>
-        <w:numPr>
-          <w:ilvl w:val="0"/>
-          <w:numId w:val="9"/>
-        </w:numPr>
-      </w:pPr>
-      <w:r>
-        <w:rPr>
-          <w:b/>
-          <w:bCs/>
-        </w:rPr>
-        <w:t>Instruction</w:t>
-      </w:r>
-      <w:r>
-        <w:t xml:space="preserve"> – represents a</w:t>
-      </w:r>
-      <w:r>
-        <w:t>n</w:t>
-      </w:r>
-      <w:r>
-        <w:t xml:space="preserve"> individual recorded instruction</w:t>
-      </w:r>
-      <w:r>
-        <w:t xml:space="preserve"> or interrupt</w:t>
-      </w:r>
-      <w:r>
-        <w:t>.</w:t>
-      </w:r>
-      <w:r>
-        <w:t xml:space="preserve">  Contains the following </w:t>
-      </w:r>
-      <w:r>
-        <w:t xml:space="preserve">immutable </w:t>
-      </w:r>
-      <w:r>
-        <w:t>fields:</w:t>
-      </w:r>
-    </w:p>
-    <w:p>
-      <w:pPr>
-        <w:pStyle w:val="ListParagraph"/>
-        <w:numPr>
-          <w:ilvl w:val="1"/>
-          <w:numId w:val="9"/>
-        </w:numPr>
-      </w:pPr>
-      <w:r>
-        <w:t>Type</w:t>
-      </w:r>
-      <w:r>
-        <w:t xml:space="preserve"> (i</w:t>
-      </w:r>
-      <w:r>
-        <w:t>nstruction, maskable interrupt, or non-maskable interrupt</w:t>
-      </w:r>
-      <w:r>
-        <w:t>)</w:t>
-      </w:r>
-    </w:p>
-    <w:p>
-      <w:pPr>
-        <w:pStyle w:val="ListParagraph"/>
-        <w:numPr>
-          <w:ilvl w:val="1"/>
-          <w:numId w:val="9"/>
-        </w:numPr>
-      </w:pPr>
-      <w:r>
-        <w:t>Cycle count</w:t>
-      </w:r>
-    </w:p>
-    <w:p>
-      <w:pPr>
-        <w:pStyle w:val="ListParagraph"/>
-        <w:numPr>
-          <w:ilvl w:val="1"/>
-          <w:numId w:val="9"/>
-        </w:numPr>
-      </w:pPr>
-      <w:r>
-        <w:t>Stack pointer</w:t>
-      </w:r>
-    </w:p>
-    <w:p>
-      <w:pPr>
-        <w:pStyle w:val="ListParagraph"/>
-        <w:numPr>
-          <w:ilvl w:val="1"/>
-          <w:numId w:val="9"/>
-        </w:numPr>
-      </w:pPr>
-      <w:r>
-        <w:t>ISR address (interrupt)</w:t>
-      </w:r>
-    </w:p>
-    <w:p>
-      <w:pPr>
-        <w:pStyle w:val="ListParagraph"/>
-        <w:numPr>
-          <w:ilvl w:val="1"/>
-          <w:numId w:val="9"/>
-        </w:numPr>
-      </w:pPr>
-      <w:r>
-        <w:t>Interrupted address (interrupt)</w:t>
-      </w:r>
-    </w:p>
-    <w:p>
-      <w:pPr>
-        <w:pStyle w:val="ListParagraph"/>
-        <w:numPr>
-          <w:ilvl w:val="1"/>
-          <w:numId w:val="9"/>
-        </w:numPr>
-      </w:pPr>
-      <w:r>
-        <w:t>Opcode address (instruction)</w:t>
-      </w:r>
-    </w:p>
-    <w:p>
-      <w:pPr>
-        <w:pStyle w:val="ListParagraph"/>
-        <w:numPr>
-          <w:ilvl w:val="1"/>
-          <w:numId w:val="9"/>
-        </w:numPr>
-      </w:pPr>
-      <w:r>
-        <w:lastRenderedPageBreak/>
-        <w:t>Opcode &amp; operand</w:t>
-      </w:r>
-      <w:r>
-        <w:t xml:space="preserve"> (instruction)</w:t>
-      </w:r>
-    </w:p>
-    <w:p>
-      <w:pPr>
-        <w:pStyle w:val="ListParagraph"/>
-        <w:numPr>
-          <w:ilvl w:val="1"/>
-          <w:numId w:val="9"/>
-        </w:numPr>
-      </w:pPr>
-      <w:r>
-        <w:t xml:space="preserve">Memory </w:t>
-      </w:r>
-      <w:r>
-        <w:t>a</w:t>
-      </w:r>
-      <w:r>
-        <w:t>ddress</w:t>
-      </w:r>
-      <w:r>
-        <w:t xml:space="preserve"> </w:t>
-      </w:r>
-      <w:r>
-        <w:t>/ d</w:t>
-      </w:r>
-      <w:r>
-        <w:t>estination address</w:t>
-      </w:r>
-      <w:r>
-        <w:t xml:space="preserve"> (instruction)</w:t>
-      </w:r>
-    </w:p>
-    <w:p>
-      <w:pPr>
-        <w:pStyle w:val="ListParagraph"/>
-        <w:numPr>
-          <w:ilvl w:val="1"/>
-          <w:numId w:val="9"/>
-        </w:numPr>
-      </w:pPr>
-      <w:r>
-        <w:t>Memory read</w:t>
-      </w:r>
-      <w:r>
-        <w:t>/</w:t>
-      </w:r>
-      <w:r>
-        <w:t>w</w:t>
-      </w:r>
-      <w:r>
-        <w:t xml:space="preserve">rite </w:t>
-      </w:r>
-      <w:r>
-        <w:t>v</w:t>
-      </w:r>
-      <w:r>
-        <w:t>alue</w:t>
-      </w:r>
-      <w:r>
-        <w:t>s</w:t>
-      </w:r>
-      <w:r>
-        <w:t xml:space="preserve"> (instruction)</w:t>
-      </w:r>
-    </w:p>
-    <w:p>
-      <w:pPr>
-        <w:pStyle w:val="ListParagraph"/>
-        <w:numPr>
-          <w:ilvl w:val="0"/>
-          <w:numId w:val="9"/>
-        </w:numPr>
-      </w:pPr>
-      <w:r>
-        <w:rPr>
-          <w:b/>
-          <w:bCs/>
-        </w:rPr>
-        <w:t>Routine</w:t>
-      </w:r>
-      <w:r>
-        <w:t xml:space="preserve"> – represents a unique code routine.</w:t>
-      </w:r>
-      <w:r>
-        <w:t xml:space="preserve">  Contains the following fields.</w:t>
-      </w:r>
-    </w:p>
-    <w:p>
-      <w:pPr>
-        <w:pStyle w:val="ListParagraph"/>
-        <w:numPr>
-          <w:ilvl w:val="1"/>
-          <w:numId w:val="9"/>
-        </w:numPr>
-      </w:pPr>
-      <w:r>
-        <w:t>Start address</w:t>
-      </w:r>
-    </w:p>
-    <w:p>
-      <w:pPr>
-        <w:pStyle w:val="ListParagraph"/>
-        <w:numPr>
-          <w:ilvl w:val="1"/>
-          <w:numId w:val="9"/>
-        </w:numPr>
-      </w:pPr>
-      <w:r>
-        <w:t xml:space="preserve">End </w:t>
-      </w:r>
-      <w:r>
-        <w:t>address</w:t>
-      </w:r>
-    </w:p>
-    <w:p>
-      <w:pPr>
-        <w:pStyle w:val="ListParagraph"/>
-        <w:numPr>
-          <w:ilvl w:val="1"/>
-          <w:numId w:val="9"/>
-        </w:numPr>
-      </w:pPr>
-      <w:r>
-        <w:t>Label (optional)</w:t>
-      </w:r>
-    </w:p>
-    <w:p>
-      <w:pPr>
-        <w:pStyle w:val="ListParagraph"/>
-        <w:numPr>
-          <w:ilvl w:val="1"/>
-          <w:numId w:val="9"/>
-        </w:numPr>
-      </w:pPr>
-      <w:r>
-        <w:t>Code (including variants)</w:t>
-      </w:r>
-    </w:p>
-    <w:p>
-      <w:pPr>
-        <w:pStyle w:val="ListParagraph"/>
-        <w:numPr>
-          <w:ilvl w:val="1"/>
-          <w:numId w:val="9"/>
-        </w:numPr>
-      </w:pPr>
-      <w:r>
-        <w:t>Type (maskable ISR, non-maskable ISR, JSR, pseudo, unknown)</w:t>
-      </w:r>
-    </w:p>
-    <w:p>
-      <w:pPr>
-        <w:pStyle w:val="ListParagraph"/>
-        <w:numPr>
-          <w:ilvl w:val="1"/>
-          <w:numId w:val="9"/>
-        </w:numPr>
-      </w:pPr>
-      <w:r>
-        <w:t xml:space="preserve">Aggregated CPU Metrics, by </w:t>
-      </w:r>
-      <w:proofErr w:type="spellStart"/>
-      <w:r>
-        <w:t>RoutineStack</w:t>
-      </w:r>
-      <w:proofErr w:type="spellEnd"/>
-      <w:r>
-        <w:t xml:space="preserve"> – </w:t>
-      </w:r>
-      <w:r>
-        <w:rPr>
-          <w:i/>
-          <w:iCs/>
-        </w:rPr>
-        <w:t>populated</w:t>
-      </w:r>
-      <w:r>
-        <w:t xml:space="preserve"> </w:t>
-      </w:r>
-      <w:r>
-        <w:rPr>
-          <w:i/>
-          <w:iCs/>
-        </w:rPr>
-        <w:t>for a time-range</w:t>
-      </w:r>
-    </w:p>
-    <w:p>
-      <w:pPr>
-        <w:pStyle w:val="ListParagraph"/>
-        <w:numPr>
-          <w:ilvl w:val="1"/>
-          <w:numId w:val="9"/>
-        </w:numPr>
-      </w:pPr>
-      <w:r>
-        <w:t xml:space="preserve">Total </w:t>
-      </w:r>
-      <w:r>
-        <w:t>a</w:t>
-      </w:r>
-      <w:r>
-        <w:t xml:space="preserve">ggregated CPU Metrics – </w:t>
-      </w:r>
-      <w:r>
-        <w:rPr>
-          <w:i/>
-          <w:iCs/>
-        </w:rPr>
-        <w:t>populated</w:t>
-      </w:r>
-      <w:r>
-        <w:t xml:space="preserve"> </w:t>
-      </w:r>
-      <w:r>
-        <w:rPr>
-          <w:i/>
-          <w:iCs/>
-        </w:rPr>
-        <w:t>for a time-range</w:t>
-      </w:r>
-    </w:p>
-    <w:p>
-      <w:pPr>
-        <w:pStyle w:val="ListParagraph"/>
-        <w:numPr>
-          <w:ilvl w:val="0"/>
-          <w:numId w:val="9"/>
-        </w:numPr>
-      </w:pPr>
-      <w:proofErr w:type="spellStart"/>
-      <w:r>
-        <w:rPr>
-          <w:b/>
-          <w:bCs/>
-        </w:rPr>
-        <w:t>CallStack</w:t>
-      </w:r>
-      <w:proofErr w:type="spellEnd"/>
-      <w:r>
-        <w:t xml:space="preserve"> – represents a</w:t>
-      </w:r>
-      <w:r>
-        <w:t xml:space="preserve"> call stack within the recorded program. Contains the following fields:</w:t>
-      </w:r>
-    </w:p>
-    <w:p>
-      <w:pPr>
-        <w:pStyle w:val="ListParagraph"/>
-        <w:numPr>
-          <w:ilvl w:val="1"/>
-          <w:numId w:val="9"/>
-        </w:numPr>
-      </w:pPr>
-      <w:r>
-        <w:t>Routine reference</w:t>
-      </w:r>
-    </w:p>
-    <w:p>
-      <w:pPr>
-        <w:pStyle w:val="ListParagraph"/>
-        <w:numPr>
-          <w:ilvl w:val="1"/>
-          <w:numId w:val="9"/>
-        </w:numPr>
-      </w:pPr>
-      <w:r>
-        <w:t>Canonical address</w:t>
-      </w:r>
-      <w:r>
-        <w:t xml:space="preserve"> (copy of </w:t>
-      </w:r>
-      <w:r>
-        <w:t>routine’s start address</w:t>
-      </w:r>
-      <w:r>
-        <w:t>)</w:t>
-      </w:r>
-    </w:p>
-    <w:p>
-      <w:pPr>
-        <w:pStyle w:val="ListParagraph"/>
-        <w:numPr>
-          <w:ilvl w:val="1"/>
-          <w:numId w:val="9"/>
-        </w:numPr>
-      </w:pPr>
-      <w:r>
-        <w:t xml:space="preserve">Parent </w:t>
-      </w:r>
-      <w:proofErr w:type="spellStart"/>
-      <w:r>
-        <w:t>CallStack</w:t>
-      </w:r>
-      <w:proofErr w:type="spellEnd"/>
-      <w:r>
-        <w:t xml:space="preserve"> reference</w:t>
-      </w:r>
-    </w:p>
-    <w:p>
-      <w:pPr>
-        <w:pStyle w:val="ListParagraph"/>
-        <w:numPr>
-          <w:ilvl w:val="1"/>
-          <w:numId w:val="9"/>
-        </w:numPr>
-      </w:pPr>
-      <w:r>
-        <w:t>Call t</w:t>
-      </w:r>
-      <w:r>
-        <w:t xml:space="preserve">ype </w:t>
-      </w:r>
-      <w:r>
-        <w:t xml:space="preserve">– e.g. </w:t>
-      </w:r>
-      <w:r>
-        <w:t xml:space="preserve">ISR, JSR, tail-call, </w:t>
-      </w:r>
-      <w:r>
-        <w:t xml:space="preserve">or </w:t>
-      </w:r>
-      <w:r>
-        <w:t>unknown</w:t>
-      </w:r>
-    </w:p>
-    <w:p>
-      <w:pPr>
-        <w:ind w:left="1080"/>
-      </w:pPr>
-      <w:r>
-        <w:t xml:space="preserve">The identify of a </w:t>
-      </w:r>
-      <w:proofErr w:type="spellStart"/>
-      <w:r>
-        <w:t>CallStack</w:t>
-      </w:r>
-      <w:proofErr w:type="spellEnd"/>
-      <w:r>
-        <w:t xml:space="preserve"> is defined </w:t>
-      </w:r>
-      <w:r>
-        <w:t xml:space="preserve">by the sequence of </w:t>
-      </w:r>
-      <w:r>
-        <w:t>addresses</w:t>
-      </w:r>
-      <w:r>
-        <w:t xml:space="preserve"> </w:t>
-      </w:r>
-      <w:r>
-        <w:t xml:space="preserve">up through the parent </w:t>
-      </w:r>
-      <w:r>
-        <w:t>chain</w:t>
-      </w:r>
-      <w:r>
-        <w:t xml:space="preserve">, </w:t>
-      </w:r>
-      <w:r>
-        <w:t xml:space="preserve">ending at the </w:t>
-      </w:r>
-      <w:r>
-        <w:t xml:space="preserve">root or </w:t>
-      </w:r>
-      <w:r>
-        <w:t xml:space="preserve">a call stack that has an </w:t>
-      </w:r>
-      <w:r>
-        <w:t>ISR call type.</w:t>
-      </w:r>
-    </w:p>
-    <w:p>
-      <w:pPr>
-        <w:pStyle w:val="ListParagraph"/>
-        <w:numPr>
-          <w:ilvl w:val="0"/>
-          <w:numId w:val="9"/>
-        </w:numPr>
-      </w:pPr>
-      <w:proofErr w:type="spellStart"/>
-      <w:r>
-        <w:rPr>
-          <w:b/>
-          <w:bCs/>
-        </w:rPr>
-        <w:t>StackFrame</w:t>
-      </w:r>
-      <w:proofErr w:type="spellEnd"/>
-      <w:r>
-        <w:t xml:space="preserve"> – represents a unique stack-frame within the recorded program.</w:t>
-      </w:r>
-      <w:r>
-        <w:t xml:space="preserve">  </w:t>
-      </w:r>
-      <w:r>
-        <w:t>Contains the following fields:</w:t>
-      </w:r>
-    </w:p>
-    <w:p>
-      <w:pPr>
-        <w:pStyle w:val="ListParagraph"/>
-        <w:numPr>
-          <w:ilvl w:val="1"/>
-          <w:numId w:val="9"/>
-        </w:numPr>
-      </w:pPr>
-      <w:r>
-        <w:t>List of child (nested) stack frames</w:t>
-      </w:r>
-    </w:p>
-    <w:p>
-      <w:pPr>
-        <w:pStyle w:val="ListParagraph"/>
-        <w:numPr>
-          <w:ilvl w:val="1"/>
-          <w:numId w:val="9"/>
-        </w:numPr>
-      </w:pPr>
-      <w:r>
-        <w:t>Call Stack (inherited for implementation efficiency)</w:t>
-      </w:r>
-    </w:p>
-    <w:p>
-      <w:pPr>
-        <w:pStyle w:val="ListParagraph"/>
-        <w:numPr>
-          <w:ilvl w:val="1"/>
-          <w:numId w:val="9"/>
-        </w:numPr>
-      </w:pPr>
-      <w:r>
-        <w:t xml:space="preserve">First and last instruction </w:t>
-      </w:r>
-      <w:r>
-        <w:t>indices</w:t>
-      </w:r>
-    </w:p>
-    <w:p>
-      <w:pPr>
-        <w:pStyle w:val="ListParagraph"/>
-        <w:numPr>
-          <w:ilvl w:val="1"/>
-          <w:numId w:val="9"/>
-        </w:numPr>
-      </w:pPr>
-      <w:r>
         <w:t xml:space="preserve">Start </w:t>
       </w:r>
       <w:r>
@@ -10289,7 +10644,6 @@
         <w:pStyle w:val="Heading2"/>
       </w:pPr>
       <w:r>
-        <w:lastRenderedPageBreak/>
         <w:t xml:space="preserve">Load </w:t>
       </w:r>
       <w:r>
@@ -10649,6 +11003,7 @@
         </w:numPr>
       </w:pPr>
       <w:r>
+        <w:lastRenderedPageBreak/>
         <w:t xml:space="preserve">Identify </w:t>
       </w:r>
       <w:r>
@@ -11017,7 +11372,6 @@
           <w:rFonts w:ascii="Aptos" w:hAnsi="Aptos"/>
           <w:color w:val="000000"/>
         </w:rPr>
-        <w:lastRenderedPageBreak/>
         <w:t xml:space="preserve">The program's cycle count, which begins at zero, is incremented as instructions are processed. </w:t>
       </w:r>
       <w:r>
@@ -11505,6 +11859,7 @@
           <w:i/>
           <w:iCs/>
         </w:rPr>
+        <w:lastRenderedPageBreak/>
         <w:t xml:space="preserve">Display frame timing </w:t>
       </w:r>
       <w:r>
@@ -11769,7 +12124,6 @@
         <w:pStyle w:val="Heading2"/>
       </w:pPr>
       <w:r>
-        <w:lastRenderedPageBreak/>
         <w:t xml:space="preserve">Dynamic </w:t>
       </w:r>
       <w:r>
@@ -12111,6 +12465,7 @@
         </w:numPr>
       </w:pPr>
       <w:r>
+        <w:lastRenderedPageBreak/>
         <w:t>Calculate CPU metrics</w:t>
       </w:r>
     </w:p>
@@ -12371,7 +12726,6 @@
         </w:numPr>
       </w:pPr>
       <w:r>
-        <w:lastRenderedPageBreak/>
         <w:t xml:space="preserve">We also determine if </w:t>
       </w:r>
       <w:r>
@@ -12597,10 +12951,18 @@
         <w:t xml:space="preserve"> (this can be calculated) </w:t>
       </w:r>
       <w:r>
-        <w:t xml:space="preserve">on the </w:t>
-      </w:r>
-      <w:r>
-        <w:t xml:space="preserve">Video </w:t>
+        <w:t xml:space="preserve">on </w:t>
+      </w:r>
+      <w:proofErr w:type="gramStart"/>
+      <w:r>
+        <w:t xml:space="preserve">the </w:t>
+      </w:r>
+      <w:r>
+        <w:t>Video</w:t>
+      </w:r>
+      <w:proofErr w:type="gramEnd"/>
+      <w:r>
+        <w:t xml:space="preserve"> </w:t>
       </w:r>
       <w:r>
         <w:t>6845</w:t>
@@ -12670,7 +13032,16 @@
         </w:numPr>
       </w:pPr>
       <w:r>
-        <w:t>A spin loop is a tight look that doesn’t write anything, it just reads something. They are shown in light grey (background is white).</w:t>
+        <w:lastRenderedPageBreak/>
+        <w:t>A spin loop is a tight look that doesn’t write anything, it just reads something</w:t>
+      </w:r>
+      <w:proofErr w:type="gramStart"/>
+      <w:r>
+        <w:t xml:space="preserve">. </w:t>
+      </w:r>
+      <w:proofErr w:type="gramEnd"/>
+      <w:r>
+        <w:t>They are shown in light grey (background is white).</w:t>
       </w:r>
       <w:r>
         <w:t xml:space="preserve">  We are looking for a repeated set of non-instructions in the recording.</w:t>
@@ -12697,7 +13068,15 @@
         </w:numPr>
       </w:pPr>
       <w:r>
-        <w:t>Look for repeating instructions.</w:t>
+        <w:t xml:space="preserve">Look for </w:t>
+      </w:r>
+      <w:proofErr w:type="gramStart"/>
+      <w:r>
+        <w:t>repeating</w:t>
+      </w:r>
+      <w:proofErr w:type="gramEnd"/>
+      <w:r>
+        <w:t xml:space="preserve"> instructions.</w:t>
       </w:r>
     </w:p>
     <w:p>
@@ -12709,7 +13088,15 @@
         </w:numPr>
       </w:pPr>
       <w:r>
-        <w:t>Detecting when screen memory is being read. We need to know.</w:t>
+        <w:t>Detecting when screen memory is being read</w:t>
+      </w:r>
+      <w:proofErr w:type="gramStart"/>
+      <w:r>
+        <w:t xml:space="preserve">. </w:t>
+      </w:r>
+      <w:proofErr w:type="gramEnd"/>
+      <w:r>
+        <w:t>We need to know.</w:t>
       </w:r>
     </w:p>
     <w:p>
@@ -12721,7 +13108,15 @@
         </w:numPr>
       </w:pPr>
       <w:r>
-        <w:t xml:space="preserve">The screen start address.  Write value stored to </w:t>
+        <w:t xml:space="preserve">The screen </w:t>
+      </w:r>
+      <w:proofErr w:type="gramStart"/>
+      <w:r>
+        <w:t>start</w:t>
+      </w:r>
+      <w:proofErr w:type="gramEnd"/>
+      <w:r>
+        <w:t xml:space="preserve"> address.  Write value stored to </w:t>
       </w:r>
       <w:r>
         <w:t>&amp;FE00</w:t>
@@ -12745,7 +13140,15 @@
         </w:numPr>
       </w:pPr>
       <w:r>
-        <w:t xml:space="preserve">The screen wrap-size (how many K). Write value stored to </w:t>
+        <w:t>The screen wrap-size (how many K)</w:t>
+      </w:r>
+      <w:proofErr w:type="gramStart"/>
+      <w:r>
+        <w:t xml:space="preserve">. </w:t>
+      </w:r>
+      <w:proofErr w:type="gramEnd"/>
+      <w:r>
+        <w:t xml:space="preserve">Write value stored to </w:t>
       </w:r>
       <w:r>
         <w:t>&amp;FE40</w:t>
@@ -12760,7 +13163,23 @@
         </w:numPr>
       </w:pPr>
       <w:r>
-        <w:t xml:space="preserve">The screen format (mode-7 verses non mode-7). Write values stored at </w:t>
+        <w:t xml:space="preserve">The screen format (mode-7 verses </w:t>
+      </w:r>
+      <w:proofErr w:type="gramStart"/>
+      <w:r>
+        <w:t>non mode</w:t>
+      </w:r>
+      <w:proofErr w:type="gramEnd"/>
+      <w:r>
+        <w:t>-7)</w:t>
+      </w:r>
+      <w:proofErr w:type="gramStart"/>
+      <w:r>
+        <w:t xml:space="preserve">. </w:t>
+      </w:r>
+      <w:proofErr w:type="gramEnd"/>
+      <w:r>
+        <w:t xml:space="preserve">Write values stored at </w:t>
       </w:r>
       <w:r>
         <w:t>&amp;FE20</w:t>
@@ -12799,13 +13218,45 @@
         </w:numPr>
       </w:pPr>
       <w:r>
-        <w:t>Detecting when the screen read starts.  We need to know when the v-sync interrupt occurs.  We can time it from here.  We can determine this by looking if the values read from &amp;</w:t>
+        <w:t xml:space="preserve">Detecting when the screen read starts.  We need to know when the v-sync </w:t>
+      </w:r>
+      <w:proofErr w:type="gramStart"/>
+      <w:r>
+        <w:t>interrupt</w:t>
+      </w:r>
+      <w:proofErr w:type="gramEnd"/>
+      <w:r>
+        <w:t xml:space="preserve"> occurs.  We can time it from here.  We can determine this by </w:t>
+      </w:r>
+      <w:proofErr w:type="gramStart"/>
+      <w:r>
+        <w:t>looking</w:t>
+      </w:r>
+      <w:proofErr w:type="gramEnd"/>
+      <w:r>
+        <w:t xml:space="preserve"> if the values read from &amp;</w:t>
       </w:r>
       <w:r>
         <w:t>FE4D</w:t>
       </w:r>
       <w:r>
-        <w:t xml:space="preserve"> has bit two set.  The rest is math.</w:t>
+        <w:t xml:space="preserve"> </w:t>
+      </w:r>
+      <w:proofErr w:type="gramStart"/>
+      <w:r>
+        <w:t>has</w:t>
+      </w:r>
+      <w:proofErr w:type="gramEnd"/>
+      <w:r>
+        <w:t xml:space="preserve"> bit two </w:t>
+      </w:r>
+      <w:proofErr w:type="gramStart"/>
+      <w:r>
+        <w:t>set</w:t>
+      </w:r>
+      <w:proofErr w:type="gramEnd"/>
+      <w:r>
+        <w:t>.  The rest is math.</w:t>
       </w:r>
     </w:p>
     <w:p>
@@ -12883,7 +13334,6 @@
         </w:numPr>
       </w:pPr>
       <w:r>
-        <w:lastRenderedPageBreak/>
         <w:t>Timing synchronization</w:t>
       </w:r>
     </w:p>
@@ -12962,7 +13412,15 @@
         <w:t xml:space="preserve">Any code that </w:t>
       </w:r>
       <w:r>
-        <w:t>results in a function being called, is an implicit function all.</w:t>
+        <w:t xml:space="preserve">results in a function being </w:t>
+      </w:r>
+      <w:proofErr w:type="gramStart"/>
+      <w:r>
+        <w:t>called,</w:t>
+      </w:r>
+      <w:proofErr w:type="gramEnd"/>
+      <w:r>
+        <w:t xml:space="preserve"> is an implicit function all.</w:t>
       </w:r>
       <w:r>
         <w:t xml:space="preserve">  A return that lands on a function is </w:t>
@@ -13118,7 +13576,15 @@
         <w:t xml:space="preserve">Values on the stack can be a combination of return addresses, </w:t>
       </w:r>
       <w:r>
-        <w:t>and other data.  We want to understand what is a return address verses other data.</w:t>
+        <w:t xml:space="preserve">and other data.  We want to understand what </w:t>
+      </w:r>
+      <w:proofErr w:type="gramStart"/>
+      <w:r>
+        <w:t>is a return address verses other data</w:t>
+      </w:r>
+      <w:proofErr w:type="gramEnd"/>
+      <w:r>
+        <w:t>.</w:t>
       </w:r>
     </w:p>
     <w:p>
@@ -13130,6 +13596,7 @@
         </w:numPr>
       </w:pPr>
       <w:r>
+        <w:lastRenderedPageBreak/>
         <w:t xml:space="preserve">Look as address pairs on the stack, if these correlate to </w:t>
       </w:r>
       <w:r>
@@ -18348,7 +18815,6 @@
   <w:style w:type="character" w:default="1" w:styleId="DefaultParagraphFont">
     <w:name w:val="Default Paragraph Font"/>
     <w:uiPriority w:val="1"/>
-    <w:semiHidden/>
     <w:unhideWhenUsed/>
   </w:style>
   <w:style w:type="table" w:default="1" w:styleId="TableNormal">

</xml_diff>

<commit_message>
Fixed spinner location on app launch
</commit_message>
<xml_diff>
--- a/docs/Development.docx
+++ b/docs/Development.docx
@@ -309,7 +309,21 @@
           <w:rFonts w:ascii="Aptos" w:hAnsi="Aptos"/>
           <w:color w:val="000000"/>
         </w:rPr>
-        <w:t xml:space="preserve">The easiest way to measure 6502 code is by logging executed instructions in an emulator like </w:t>
+        <w:t xml:space="preserve">The easiest way to measure 6502 code is by logging executed instructions </w:t>
+      </w:r>
+      <w:r>
+        <w:rPr>
+          <w:rFonts w:ascii="Aptos" w:hAnsi="Aptos"/>
+          <w:color w:val="000000"/>
+        </w:rPr>
+        <w:t>within</w:t>
+      </w:r>
+      <w:r>
+        <w:rPr>
+          <w:rFonts w:ascii="Aptos" w:hAnsi="Aptos"/>
+          <w:color w:val="000000"/>
+        </w:rPr>
+        <w:t xml:space="preserve"> an emulator like </w:t>
       </w:r>
       <w:r>
         <w:rPr>
@@ -334,7 +348,13 @@
         <w:t xml:space="preserve">To this end, </w:t>
       </w:r>
       <w:r>
-        <w:t>I added n</w:t>
+        <w:t xml:space="preserve">I </w:t>
+      </w:r>
+      <w:r>
+        <w:t xml:space="preserve">modified BeebEm, </w:t>
+      </w:r>
+      <w:r>
+        <w:t>added n</w:t>
       </w:r>
       <w:r>
         <w:t>ew</w:t>
@@ -381,44 +401,49 @@
           <w:rFonts w:ascii="Aptos" w:hAnsi="Aptos"/>
           <w:color w:val="000000"/>
         </w:rPr>
-        <w:t xml:space="preserve">menu items </w:t>
+        <w:t>menu items</w:t>
       </w:r>
       <w:r>
         <w:rPr>
           <w:rFonts w:ascii="Aptos" w:hAnsi="Aptos"/>
           <w:color w:val="000000"/>
         </w:rPr>
-        <w:t xml:space="preserve">to BeebEm that allow </w:t>
-      </w:r>
-      <w:r>
-        <w:rPr>
-          <w:rFonts w:ascii="Aptos" w:hAnsi="Aptos"/>
-          <w:b/>
-          <w:bCs/>
-          <w:color w:val="000000"/>
-        </w:rPr>
-        <w:t>BeebEm</w:t>
+        <w:t xml:space="preserve">, </w:t>
       </w:r>
       <w:r>
         <w:rPr>
           <w:rFonts w:ascii="Aptos" w:hAnsi="Aptos"/>
           <w:color w:val="000000"/>
         </w:rPr>
-        <w:t xml:space="preserve"> </w:t>
+        <w:t xml:space="preserve">to </w:t>
       </w:r>
       <w:r>
         <w:rPr>
           <w:rFonts w:ascii="Aptos" w:hAnsi="Aptos"/>
           <w:color w:val="000000"/>
         </w:rPr>
-        <w:t xml:space="preserve">to </w:t>
+        <w:t>log</w:t>
       </w:r>
       <w:r>
         <w:rPr>
           <w:rFonts w:ascii="Aptos" w:hAnsi="Aptos"/>
           <w:color w:val="000000"/>
         </w:rPr>
-        <w:t xml:space="preserve">record execution </w:t>
+        <w:t xml:space="preserve"> </w:t>
+      </w:r>
+      <w:r>
+        <w:rPr>
+          <w:rFonts w:ascii="Aptos" w:hAnsi="Aptos"/>
+          <w:color w:val="000000"/>
+        </w:rPr>
+        <w:t>executed instruction</w:t>
+      </w:r>
+      <w:r>
+        <w:rPr>
+          <w:rFonts w:ascii="Aptos" w:hAnsi="Aptos"/>
+          <w:color w:val="000000"/>
+        </w:rPr>
+        <w:t xml:space="preserve"> </w:t>
       </w:r>
       <w:r>
         <w:rPr>
@@ -458,40 +483,10 @@
         </w:rPr>
       </w:pPr>
       <w:r>
-        <w:t xml:space="preserve">As for the </w:t>
-      </w:r>
-      <w:r>
-        <w:t>analy</w:t>
-      </w:r>
-      <w:r>
-        <w:t>sis</w:t>
-      </w:r>
-      <w:r>
-        <w:t xml:space="preserve"> and </w:t>
-      </w:r>
-      <w:r>
-        <w:t xml:space="preserve">result </w:t>
-      </w:r>
-      <w:r>
-        <w:t>presentation</w:t>
-      </w:r>
-      <w:r>
-        <w:t xml:space="preserve">… </w:t>
-      </w:r>
-      <w:r>
-        <w:t xml:space="preserve">this </w:t>
-      </w:r>
-      <w:r>
-        <w:t xml:space="preserve">is </w:t>
-      </w:r>
-      <w:r>
-        <w:t>performed</w:t>
-      </w:r>
-      <w:r>
-        <w:t xml:space="preserve"> in a </w:t>
-      </w:r>
-      <w:r>
-        <w:t xml:space="preserve">separate </w:t>
+        <w:t xml:space="preserve">I then developed a </w:t>
+      </w:r>
+      <w:r>
+        <w:t xml:space="preserve">Windows </w:t>
       </w:r>
       <w:r>
         <w:t>application</w:t>
@@ -509,245 +504,112 @@
       </w:r>
       <w:proofErr w:type="spellEnd"/>
       <w:r>
-        <w:t>,</w:t>
+        <w:t xml:space="preserve">, </w:t>
+      </w:r>
+      <w:r>
+        <w:t>that read</w:t>
+      </w:r>
+      <w:r>
+        <w:t>s</w:t>
       </w:r>
       <w:r>
         <w:t xml:space="preserve"> </w:t>
       </w:r>
       <w:r>
-        <w:t xml:space="preserve">that resides </w:t>
-      </w:r>
-      <w:r>
-        <w:t>in its own git repository</w:t>
-      </w:r>
-      <w:r>
-        <w:t>.</w:t>
-      </w:r>
-    </w:p>
-    <w:p>
-      <w:r>
-        <w:t>The g</w:t>
-      </w:r>
-      <w:r>
-        <w:t xml:space="preserve">enerated </w:t>
+        <w:t>a</w:t>
+      </w:r>
+      <w:r>
+        <w:t xml:space="preserve"> </w:t>
       </w:r>
       <w:r>
         <w:rPr>
           <w:b/>
           <w:bCs/>
         </w:rPr>
-        <w:t>.perf</w:t>
-      </w:r>
-      <w:r>
-        <w:t xml:space="preserve"> file contain</w:t>
+        <w:t xml:space="preserve">.perf </w:t>
+      </w:r>
+      <w:r>
+        <w:t xml:space="preserve">file, </w:t>
+      </w:r>
+      <w:r>
+        <w:t>analyzes</w:t>
+      </w:r>
+      <w:r>
+        <w:t xml:space="preserve"> </w:t>
+      </w:r>
+      <w:r>
+        <w:t>the contained logged instructions</w:t>
+      </w:r>
+      <w:r>
+        <w:t xml:space="preserve">, and </w:t>
+      </w:r>
+      <w:r>
+        <w:t>presents</w:t>
+      </w:r>
+      <w:r>
+        <w:t xml:space="preserve"> </w:t>
+      </w:r>
+      <w:r>
+        <w:t xml:space="preserve">the </w:t>
+      </w:r>
+      <w:r>
+        <w:t>results</w:t>
+      </w:r>
+      <w:r>
+        <w:t>.</w:t>
+      </w:r>
+    </w:p>
+    <w:p>
+      <w:r>
+        <w:t xml:space="preserve">The </w:t>
+      </w:r>
+      <w:r>
+        <w:t>profile</w:t>
+      </w:r>
+      <w:r>
+        <w:t>r target</w:t>
       </w:r>
       <w:r>
         <w:t>s</w:t>
       </w:r>
       <w:r>
-        <w:t xml:space="preserve"> all the information </w:t>
-      </w:r>
-      <w:r>
-        <w:t xml:space="preserve">needed </w:t>
-      </w:r>
-      <w:r>
-        <w:t xml:space="preserve">for </w:t>
-      </w:r>
-      <w:proofErr w:type="spellStart"/>
-      <w:r>
-        <w:rPr>
-          <w:b/>
-          <w:bCs/>
-        </w:rPr>
-        <w:t>Beeb</w:t>
-      </w:r>
-      <w:r>
-        <w:rPr>
-          <w:b/>
-          <w:bCs/>
-        </w:rPr>
-        <w:t>Perf</w:t>
-      </w:r>
-      <w:proofErr w:type="spellEnd"/>
-      <w:r>
-        <w:t xml:space="preserve"> to analyze and </w:t>
-      </w:r>
-      <w:r>
-        <w:t xml:space="preserve">present the </w:t>
-      </w:r>
-      <w:r>
-        <w:t>performance results.</w:t>
-      </w:r>
-      <w:r>
-        <w:t xml:space="preserve">  In </w:t>
-      </w:r>
-      <w:r>
-        <w:t>addition</w:t>
-      </w:r>
-      <w:r>
-        <w:t xml:space="preserve"> to the recorded instruction, a </w:t>
-      </w:r>
-      <w:r>
-        <w:rPr>
-          <w:b/>
-          <w:bCs/>
-        </w:rPr>
-        <w:t>.perf</w:t>
-      </w:r>
-      <w:r>
-        <w:t xml:space="preserve"> file contains contextual information </w:t>
-      </w:r>
-      <w:r>
-        <w:t xml:space="preserve">such as the initial </w:t>
-      </w:r>
-      <w:r>
-        <w:t>memory contents, video configuration,</w:t>
-      </w:r>
-      <w:r>
-        <w:t xml:space="preserve"> </w:t>
-      </w:r>
-      <w:r>
-        <w:t xml:space="preserve">page registers, </w:t>
-      </w:r>
-      <w:r>
-        <w:t xml:space="preserve">and </w:t>
-      </w:r>
-      <w:r>
-        <w:t>symbol information</w:t>
+        <w:t xml:space="preserve"> machines which don’t leverage the tube</w:t>
       </w:r>
       <w:r>
         <w:t>.</w:t>
       </w:r>
     </w:p>
     <w:p>
+      <w:pPr>
+        <w:pStyle w:val="Heading1"/>
+      </w:pPr>
+      <w:r>
+        <w:t>.</w:t>
+      </w:r>
+      <w:r>
+        <w:t>Perf file format</w:t>
+      </w:r>
+    </w:p>
+    <w:p>
+      <w:r>
+        <w:t xml:space="preserve">This section describes the </w:t>
+      </w:r>
+      <w:r>
+        <w:t xml:space="preserve">.perf file </w:t>
+      </w:r>
+      <w:r>
+        <w:t>format</w:t>
+      </w:r>
+      <w:r>
+        <w:t xml:space="preserve"> (version 1.0)</w:t>
+      </w:r>
+      <w:r>
+        <w:t>.</w:t>
+      </w:r>
+    </w:p>
+    <w:p>
       <w:r>
         <w:lastRenderedPageBreak/>
-        <w:t xml:space="preserve">Using a file </w:t>
-      </w:r>
-      <w:r>
-        <w:t xml:space="preserve">format </w:t>
-      </w:r>
-      <w:r>
-        <w:t xml:space="preserve">to decouple </w:t>
-      </w:r>
-      <w:proofErr w:type="spellStart"/>
-      <w:r>
-        <w:rPr>
-          <w:b/>
-          <w:bCs/>
-        </w:rPr>
-        <w:t>BeebPerf</w:t>
-      </w:r>
-      <w:proofErr w:type="spellEnd"/>
-      <w:r>
-        <w:t xml:space="preserve"> from </w:t>
-      </w:r>
-      <w:r>
-        <w:rPr>
-          <w:b/>
-          <w:bCs/>
-        </w:rPr>
-        <w:t>BeebEm</w:t>
-      </w:r>
-      <w:r>
-        <w:t xml:space="preserve"> </w:t>
-      </w:r>
-      <w:r>
-        <w:t>provide</w:t>
-      </w:r>
-      <w:r>
-        <w:t>s</w:t>
-      </w:r>
-      <w:r>
-        <w:t xml:space="preserve"> opportunities for other emulators and </w:t>
-      </w:r>
-      <w:r>
-        <w:t xml:space="preserve">performance monitoring </w:t>
-      </w:r>
-      <w:r>
-        <w:t>tools</w:t>
-      </w:r>
-      <w:r>
-        <w:t xml:space="preserve"> to capture </w:t>
-      </w:r>
-      <w:r>
-        <w:t xml:space="preserve">performance data which </w:t>
-      </w:r>
-      <w:proofErr w:type="spellStart"/>
-      <w:r>
-        <w:rPr>
-          <w:b/>
-          <w:bCs/>
-        </w:rPr>
-        <w:t>BeebPerf</w:t>
-      </w:r>
-      <w:proofErr w:type="spellEnd"/>
-      <w:r>
-        <w:t xml:space="preserve"> </w:t>
-      </w:r>
-      <w:r>
-        <w:t>can</w:t>
-      </w:r>
-      <w:r>
-        <w:t xml:space="preserve"> analyze and present</w:t>
-      </w:r>
-      <w:r>
-        <w:t xml:space="preserve"> results</w:t>
-      </w:r>
-      <w:r>
-        <w:t xml:space="preserve"> on.</w:t>
-      </w:r>
-    </w:p>
-    <w:p>
-      <w:r>
-        <w:t xml:space="preserve">The </w:t>
-      </w:r>
-      <w:r>
-        <w:t>profile</w:t>
-      </w:r>
-      <w:r>
-        <w:t>r target</w:t>
-      </w:r>
-      <w:r>
-        <w:t>s</w:t>
-      </w:r>
-      <w:r>
-        <w:t xml:space="preserve"> machines which don’t leverage the tube</w:t>
-      </w:r>
-      <w:r>
-        <w:t>.</w:t>
-      </w:r>
-    </w:p>
-    <w:p>
-      <w:pPr>
-        <w:pStyle w:val="Heading1"/>
-      </w:pPr>
-      <w:r>
-        <w:t>.</w:t>
-      </w:r>
-      <w:r>
-        <w:t>Perf file format</w:t>
-      </w:r>
-    </w:p>
-    <w:p>
-      <w:r>
-        <w:t xml:space="preserve">This section describes the </w:t>
-      </w:r>
-      <w:r>
-        <w:t xml:space="preserve">.perf file </w:t>
-      </w:r>
-      <w:r>
-        <w:t>format</w:t>
-      </w:r>
-      <w:r>
-        <w:t xml:space="preserve"> (version 1.0)</w:t>
-      </w:r>
-      <w:r>
-        <w:t>.</w:t>
-      </w:r>
-    </w:p>
-    <w:p>
-      <w:r>
         <w:t xml:space="preserve">As outlined above, </w:t>
       </w:r>
       <w:r>
@@ -1719,7 +1581,6 @@
                 <w:b/>
                 <w:bCs/>
               </w:rPr>
-              <w:lastRenderedPageBreak/>
               <w:t>Value</w:t>
             </w:r>
           </w:p>
@@ -1943,6 +1804,7 @@
         <w:pStyle w:val="Heading2"/>
       </w:pPr>
       <w:r>
+        <w:lastRenderedPageBreak/>
         <w:t>Header Chunk</w:t>
       </w:r>
       <w:r>
@@ -2903,7 +2765,6 @@
         <w:ind w:left="810"/>
       </w:pPr>
       <w:r>
-        <w:lastRenderedPageBreak/>
         <w:t>&lt;label-name&gt;</w:t>
       </w:r>
       <w:r>
@@ -3087,6 +2948,7 @@
         <w:ind w:left="720" w:hanging="360"/>
       </w:pPr>
       <w:r>
+        <w:lastRenderedPageBreak/>
         <w:t>&lt;</w:t>
       </w:r>
       <w:proofErr w:type="spellStart"/>
@@ -4142,7 +4004,6 @@
           </w:tcPr>
           <w:p>
             <w:r>
-              <w:lastRenderedPageBreak/>
               <w:t>&lt;</w:t>
             </w:r>
             <w:proofErr w:type="spellStart"/>
@@ -4427,6 +4288,7 @@
         <w:ind w:left="1080"/>
       </w:pPr>
       <w:r>
+        <w:lastRenderedPageBreak/>
         <w:t>&lt;</w:t>
       </w:r>
       <w:proofErr w:type="spellStart"/>
@@ -5065,7 +4927,6 @@
                 <w:b/>
                 <w:bCs/>
               </w:rPr>
-              <w:lastRenderedPageBreak/>
               <w:t>Two</w:t>
             </w:r>
             <w:r>
@@ -5246,6 +5107,7 @@
         <w:ind w:left="720"/>
       </w:pPr>
       <w:r>
+        <w:lastRenderedPageBreak/>
         <w:t>&lt;</w:t>
       </w:r>
       <w:proofErr w:type="spellStart"/>
@@ -6484,7 +6346,6 @@
         <w:rPr>
           <w:noProof/>
         </w:rPr>
-        <w:lastRenderedPageBreak/>
         <w:tab/>
       </w:r>
       <w:r>
@@ -6700,6 +6561,7 @@
         <w:ind w:left="720"/>
       </w:pPr>
       <w:r>
+        <w:lastRenderedPageBreak/>
         <w:t xml:space="preserve">&lt;cycle-count&gt; (1 byte) </w:t>
       </w:r>
       <w:r>
@@ -7186,11 +7048,7 @@
       </w:r>
       <w:proofErr w:type="gramEnd"/>
       <w:r>
-        <w:t xml:space="preserve">This includes </w:t>
-      </w:r>
-      <w:r>
-        <w:lastRenderedPageBreak/>
-        <w:t xml:space="preserve">instructions like </w:t>
+        <w:t xml:space="preserve">This includes instructions like </w:t>
       </w:r>
       <w:r>
         <w:t>AS</w:t>
@@ -7320,6 +7178,7 @@
         <w:pStyle w:val="Heading1"/>
       </w:pPr>
       <w:r>
+        <w:lastRenderedPageBreak/>
         <w:t>BeebEm</w:t>
       </w:r>
       <w:r>
@@ -7481,6 +7340,9 @@
         <w:t xml:space="preserve">using </w:t>
       </w:r>
       <w:r>
+        <w:t xml:space="preserve">a </w:t>
+      </w:r>
+      <w:r>
         <w:rPr>
           <w:b/>
           <w:bCs/>
@@ -7502,9 +7364,6 @@
       </w:r>
       <w:r>
         <w:t>uffer</w:t>
-      </w:r>
-      <w:r>
-        <w:t>s</w:t>
       </w:r>
       <w:r>
         <w:t>.</w:t>
@@ -7598,6 +7457,9 @@
         <w:t xml:space="preserve">, </w:t>
       </w:r>
       <w:r>
+        <w:t xml:space="preserve">in chunks, </w:t>
+      </w:r>
+      <w:r>
         <w:t xml:space="preserve">in </w:t>
       </w:r>
       <w:r>
@@ -7799,6 +7661,19 @@
       </w:r>
       <w:r>
         <w:t>.</w:t>
+      </w:r>
+    </w:p>
+    <w:p>
+      <w:pPr>
+        <w:rPr>
+          <w:rFonts w:asciiTheme="majorHAnsi" w:eastAsiaTheme="majorEastAsia" w:hAnsiTheme="majorHAnsi" w:cstheme="majorBidi"/>
+          <w:color w:val="0F4761" w:themeColor="accent1" w:themeShade="BF"/>
+          <w:sz w:val="32"/>
+          <w:szCs w:val="32"/>
+        </w:rPr>
+      </w:pPr>
+      <w:r>
+        <w:br w:type="page"/>
       </w:r>
     </w:p>
     <w:p>
@@ -8945,6 +8820,18 @@
       <w:pPr>
         <w:pStyle w:val="ListParagraph"/>
         <w:numPr>
+          <w:ilvl w:val="1"/>
+          <w:numId w:val="9"/>
+        </w:numPr>
+      </w:pPr>
+      <w:r>
+        <w:t>Line spacing (as a percentage), default is 120%</w:t>
+      </w:r>
+    </w:p>
+    <w:p>
+      <w:pPr>
+        <w:pStyle w:val="ListParagraph"/>
+        <w:numPr>
           <w:ilvl w:val="0"/>
           <w:numId w:val="9"/>
         </w:numPr>
@@ -13580,11 +13467,11 @@
       </w:r>
       <w:proofErr w:type="gramStart"/>
       <w:r>
-        <w:t>is a return address verses other data</w:t>
+        <w:t>is a return</w:t>
       </w:r>
       <w:proofErr w:type="gramEnd"/>
       <w:r>
-        <w:t>.</w:t>
+        <w:t xml:space="preserve"> address verses other data.</w:t>
       </w:r>
     </w:p>
     <w:p>
@@ -13688,18 +13575,6 @@
       </w:pPr>
       <w:r>
         <w:t>Undo/Redo</w:t>
-      </w:r>
-    </w:p>
-    <w:p>
-      <w:pPr>
-        <w:pStyle w:val="ListParagraph"/>
-        <w:numPr>
-          <w:ilvl w:val="0"/>
-          <w:numId w:val="12"/>
-        </w:numPr>
-      </w:pPr>
-      <w:r>
-        <w:t>Settings dialog</w:t>
       </w:r>
     </w:p>
     <w:p>
@@ -18815,6 +18690,7 @@
   <w:style w:type="character" w:default="1" w:styleId="DefaultParagraphFont">
     <w:name w:val="Default Paragraph Font"/>
     <w:uiPriority w:val="1"/>
+    <w:semiHidden/>
     <w:unhideWhenUsed/>
   </w:style>
   <w:style w:type="table" w:default="1" w:styleId="TableNormal">

</xml_diff>

<commit_message>
Introduced .perf file begin display event
</commit_message>
<xml_diff>
--- a/docs/Development.docx
+++ b/docs/Development.docx
@@ -494,6 +494,7 @@
       <w:r>
         <w:t xml:space="preserve">, </w:t>
       </w:r>
+      <w:proofErr w:type="spellStart"/>
       <w:r>
         <w:rPr>
           <w:b/>
@@ -501,6 +502,7 @@
         </w:rPr>
         <w:t>BeebPerf</w:t>
       </w:r>
+      <w:proofErr w:type="spellEnd"/>
       <w:r>
         <w:t xml:space="preserve">, </w:t>
       </w:r>
@@ -677,6 +679,7 @@
       <w:r>
         <w:t xml:space="preserve"> is modified to generate a .perf file, which </w:t>
       </w:r>
+      <w:proofErr w:type="spellStart"/>
       <w:r>
         <w:rPr>
           <w:b/>
@@ -684,6 +687,7 @@
         </w:rPr>
         <w:t>BeebPerf</w:t>
       </w:r>
+      <w:proofErr w:type="spellEnd"/>
       <w:r>
         <w:t xml:space="preserve"> </w:t>
       </w:r>
@@ -770,6 +774,7 @@
         </w:rPr>
         <w:t>&lt;</w:t>
       </w:r>
+      <w:proofErr w:type="spellStart"/>
       <w:r>
         <w:rPr>
           <w:b/>
@@ -784,6 +789,7 @@
         </w:rPr>
         <w:t>chunk</w:t>
       </w:r>
+      <w:proofErr w:type="spellEnd"/>
       <w:r>
         <w:rPr>
           <w:b/>
@@ -801,6 +807,7 @@
         </w:rPr>
         <w:t>&lt;</w:t>
       </w:r>
+      <w:proofErr w:type="spellStart"/>
       <w:r>
         <w:rPr>
           <w:b/>
@@ -822,6 +829,7 @@
         </w:rPr>
         <w:t>_chunk</w:t>
       </w:r>
+      <w:proofErr w:type="spellEnd"/>
       <w:r>
         <w:rPr>
           <w:b/>
@@ -850,33 +858,44 @@
         </w:rPr>
         <w:t>&lt;</w:t>
       </w:r>
+      <w:proofErr w:type="spellStart"/>
       <w:r>
         <w:rPr>
           <w:b/>
           <w:bCs/>
         </w:rPr>
-        <w:t>snapshot_chunk&gt;</w:t>
-      </w:r>
-      <w:r>
-        <w:t xml:space="preserve"> +</w:t>
-      </w:r>
-      <w:r>
-        <w:t xml:space="preserve"> </w:t>
-      </w:r>
+        <w:t>snapshot_chunk</w:t>
+      </w:r>
+      <w:proofErr w:type="spellEnd"/>
       <w:r>
         <w:rPr>
           <w:b/>
           <w:bCs/>
         </w:rPr>
-        <w:t>&lt;</w:t>
+        <w:t>&gt;</w:t>
+      </w:r>
+      <w:r>
+        <w:t xml:space="preserve"> +</w:t>
+      </w:r>
+      <w:r>
+        <w:t xml:space="preserve"> </w:t>
       </w:r>
       <w:r>
         <w:rPr>
           <w:b/>
           <w:bCs/>
         </w:rPr>
+        <w:t>&lt;</w:t>
+      </w:r>
+      <w:proofErr w:type="spellStart"/>
+      <w:r>
+        <w:rPr>
+          <w:b/>
+          <w:bCs/>
+        </w:rPr>
         <w:t>execution_chunk</w:t>
       </w:r>
+      <w:proofErr w:type="spellEnd"/>
       <w:r>
         <w:rPr>
           <w:b/>
@@ -1076,6 +1095,7 @@
         </w:rPr>
         <w:t>&lt;</w:t>
       </w:r>
+      <w:proofErr w:type="spellStart"/>
       <w:r>
         <w:rPr>
           <w:b/>
@@ -1088,7 +1108,15 @@
           <w:b/>
           <w:bCs/>
         </w:rPr>
-        <w:t>header&gt;</w:t>
+        <w:t>header</w:t>
+      </w:r>
+      <w:proofErr w:type="spellEnd"/>
+      <w:r>
+        <w:rPr>
+          <w:b/>
+          <w:bCs/>
+        </w:rPr>
+        <w:t>&gt;</w:t>
       </w:r>
       <w:r>
         <w:t xml:space="preserve"> = </w:t>
@@ -1099,11 +1127,24 @@
       <w:r>
         <w:t>&lt;tag&gt; + &lt;compression&gt; + &lt;</w:t>
       </w:r>
+      <w:proofErr w:type="spellStart"/>
       <w:r>
         <w:t>original_</w:t>
       </w:r>
       <w:r>
-        <w:t>size&gt; + &lt;compressed_size&gt;</w:t>
+        <w:t>size</w:t>
+      </w:r>
+      <w:proofErr w:type="spellEnd"/>
+      <w:r>
+        <w:t>&gt; + &lt;</w:t>
+      </w:r>
+      <w:proofErr w:type="spellStart"/>
+      <w:r>
+        <w:t>compressed_size</w:t>
+      </w:r>
+      <w:proofErr w:type="spellEnd"/>
+      <w:r>
+        <w:t>&gt;</w:t>
       </w:r>
     </w:p>
     <w:p>
@@ -1230,7 +1271,23 @@
                 <w:rFonts w:ascii="Aptos" w:hAnsi="Aptos"/>
                 <w:color w:val="000000"/>
               </w:rPr>
-              <w:t>‘PFhd’</w:t>
+              <w:t>‘</w:t>
+            </w:r>
+            <w:proofErr w:type="spellStart"/>
+            <w:r>
+              <w:rPr>
+                <w:rFonts w:ascii="Aptos" w:hAnsi="Aptos"/>
+                <w:color w:val="000000"/>
+              </w:rPr>
+              <w:t>PFhd</w:t>
+            </w:r>
+            <w:proofErr w:type="spellEnd"/>
+            <w:r>
+              <w:rPr>
+                <w:rFonts w:ascii="Aptos" w:hAnsi="Aptos"/>
+                <w:color w:val="000000"/>
+              </w:rPr>
+              <w:t>’</w:t>
             </w:r>
           </w:p>
         </w:tc>
@@ -1250,7 +1307,23 @@
                 <w:rFonts w:ascii="Aptos" w:hAnsi="Aptos"/>
                 <w:color w:val="000000"/>
               </w:rPr>
-              <w:t>&lt;header_chunk&gt;</w:t>
+              <w:t>&lt;</w:t>
+            </w:r>
+            <w:proofErr w:type="spellStart"/>
+            <w:r>
+              <w:rPr>
+                <w:rFonts w:ascii="Aptos" w:hAnsi="Aptos"/>
+                <w:color w:val="000000"/>
+              </w:rPr>
+              <w:t>header_chunk</w:t>
+            </w:r>
+            <w:proofErr w:type="spellEnd"/>
+            <w:r>
+              <w:rPr>
+                <w:rFonts w:ascii="Aptos" w:hAnsi="Aptos"/>
+                <w:color w:val="000000"/>
+              </w:rPr>
+              <w:t>&gt;</w:t>
             </w:r>
           </w:p>
         </w:tc>
@@ -1272,7 +1345,23 @@
                 <w:rFonts w:ascii="Aptos" w:hAnsi="Aptos"/>
                 <w:color w:val="000000"/>
               </w:rPr>
-              <w:t>‘PFlb’</w:t>
+              <w:t>‘</w:t>
+            </w:r>
+            <w:proofErr w:type="spellStart"/>
+            <w:r>
+              <w:rPr>
+                <w:rFonts w:ascii="Aptos" w:hAnsi="Aptos"/>
+                <w:color w:val="000000"/>
+              </w:rPr>
+              <w:t>PFlb</w:t>
+            </w:r>
+            <w:proofErr w:type="spellEnd"/>
+            <w:r>
+              <w:rPr>
+                <w:rFonts w:ascii="Aptos" w:hAnsi="Aptos"/>
+                <w:color w:val="000000"/>
+              </w:rPr>
+              <w:t>’</w:t>
             </w:r>
           </w:p>
         </w:tc>
@@ -1288,7 +1377,15 @@
               </w:rPr>
             </w:pPr>
             <w:r>
-              <w:t>&lt;labels_chunk&gt;</w:t>
+              <w:t>&lt;</w:t>
+            </w:r>
+            <w:proofErr w:type="spellStart"/>
+            <w:r>
+              <w:t>labels_chunk</w:t>
+            </w:r>
+            <w:proofErr w:type="spellEnd"/>
+            <w:r>
+              <w:t>&gt;</w:t>
             </w:r>
           </w:p>
         </w:tc>
@@ -1310,7 +1407,23 @@
                 <w:rFonts w:ascii="Aptos" w:hAnsi="Aptos"/>
                 <w:color w:val="000000"/>
               </w:rPr>
-              <w:t>‘PFss’</w:t>
+              <w:t>‘</w:t>
+            </w:r>
+            <w:proofErr w:type="spellStart"/>
+            <w:r>
+              <w:rPr>
+                <w:rFonts w:ascii="Aptos" w:hAnsi="Aptos"/>
+                <w:color w:val="000000"/>
+              </w:rPr>
+              <w:t>PFss</w:t>
+            </w:r>
+            <w:proofErr w:type="spellEnd"/>
+            <w:r>
+              <w:rPr>
+                <w:rFonts w:ascii="Aptos" w:hAnsi="Aptos"/>
+                <w:color w:val="000000"/>
+              </w:rPr>
+              <w:t>’</w:t>
             </w:r>
           </w:p>
         </w:tc>
@@ -1326,7 +1439,15 @@
               </w:rPr>
             </w:pPr>
             <w:r>
-              <w:t>&lt;snapshot_chunk&gt;</w:t>
+              <w:t>&lt;</w:t>
+            </w:r>
+            <w:proofErr w:type="spellStart"/>
+            <w:r>
+              <w:t>snapshot_chunk</w:t>
+            </w:r>
+            <w:proofErr w:type="spellEnd"/>
+            <w:r>
+              <w:t>&gt;</w:t>
             </w:r>
           </w:p>
         </w:tc>
@@ -1348,7 +1469,23 @@
                 <w:rFonts w:ascii="Aptos" w:hAnsi="Aptos"/>
                 <w:color w:val="000000"/>
               </w:rPr>
-              <w:t>‘PFex’</w:t>
+              <w:t>‘</w:t>
+            </w:r>
+            <w:proofErr w:type="spellStart"/>
+            <w:r>
+              <w:rPr>
+                <w:rFonts w:ascii="Aptos" w:hAnsi="Aptos"/>
+                <w:color w:val="000000"/>
+              </w:rPr>
+              <w:t>PFex</w:t>
+            </w:r>
+            <w:proofErr w:type="spellEnd"/>
+            <w:r>
+              <w:rPr>
+                <w:rFonts w:ascii="Aptos" w:hAnsi="Aptos"/>
+                <w:color w:val="000000"/>
+              </w:rPr>
+              <w:t>’</w:t>
             </w:r>
           </w:p>
         </w:tc>
@@ -1364,7 +1501,15 @@
               </w:rPr>
             </w:pPr>
             <w:r>
-              <w:t>&lt;execution_chunk&gt;</w:t>
+              <w:t>&lt;</w:t>
+            </w:r>
+            <w:proofErr w:type="spellStart"/>
+            <w:r>
+              <w:t>execution_chunk</w:t>
+            </w:r>
+            <w:proofErr w:type="spellEnd"/>
+            <w:r>
+              <w:t>&gt;</w:t>
             </w:r>
           </w:p>
         </w:tc>
@@ -1536,8 +1681,13 @@
             <w:tcW w:w="3240" w:type="dxa"/>
           </w:tcPr>
           <w:p>
+            <w:proofErr w:type="spellStart"/>
             <w:r>
-              <w:t>zlib 1.3.1 (default algorithm)</w:t>
+              <w:t>zlib</w:t>
+            </w:r>
+            <w:proofErr w:type="spellEnd"/>
+            <w:r>
+              <w:t xml:space="preserve"> 1.3.1 (default algorithm)</w:t>
             </w:r>
           </w:p>
         </w:tc>
@@ -1553,6 +1703,7 @@
       <w:r>
         <w:t>&lt;</w:t>
       </w:r>
+      <w:proofErr w:type="spellStart"/>
       <w:r>
         <w:t>original</w:t>
       </w:r>
@@ -1562,6 +1713,7 @@
       <w:r>
         <w:t>size</w:t>
       </w:r>
+      <w:proofErr w:type="spellEnd"/>
       <w:r>
         <w:t>&gt;</w:t>
       </w:r>
@@ -1595,11 +1747,16 @@
         <w:ind w:left="360"/>
       </w:pPr>
       <w:r>
-        <w:t>&lt;compressed_</w:t>
+        <w:t>&lt;</w:t>
+      </w:r>
+      <w:proofErr w:type="spellStart"/>
+      <w:r>
+        <w:t>compressed_</w:t>
       </w:r>
       <w:r>
         <w:t>size</w:t>
       </w:r>
+      <w:proofErr w:type="spellEnd"/>
       <w:r>
         <w:t>&gt;</w:t>
       </w:r>
@@ -1627,11 +1784,16 @@
       <w:r>
         <w:t>matches &lt;</w:t>
       </w:r>
+      <w:proofErr w:type="spellStart"/>
       <w:r>
         <w:t>original</w:t>
       </w:r>
       <w:r>
-        <w:t>_size&gt;</w:t>
+        <w:t>_size</w:t>
+      </w:r>
+      <w:proofErr w:type="spellEnd"/>
+      <w:r>
+        <w:t>&gt;</w:t>
       </w:r>
       <w:r>
         <w:t>.</w:t>
@@ -1721,6 +1883,7 @@
         </w:rPr>
         <w:t>&lt;</w:t>
       </w:r>
+      <w:proofErr w:type="spellStart"/>
       <w:r>
         <w:rPr>
           <w:b/>
@@ -1733,14 +1896,27 @@
           <w:b/>
           <w:bCs/>
         </w:rPr>
-        <w:t>_chunk&gt;</w:t>
+        <w:t>_chunk</w:t>
+      </w:r>
+      <w:proofErr w:type="spellEnd"/>
+      <w:r>
+        <w:rPr>
+          <w:b/>
+          <w:bCs/>
+        </w:rPr>
+        <w:t>&gt;</w:t>
       </w:r>
       <w:r>
         <w:t xml:space="preserve"> = </w:t>
       </w:r>
       <w:r>
-        <w:t>&lt;common_header</w:t>
-      </w:r>
+        <w:t>&lt;</w:t>
+      </w:r>
+      <w:proofErr w:type="spellStart"/>
+      <w:r>
+        <w:t>common_header</w:t>
+      </w:r>
+      <w:proofErr w:type="spellEnd"/>
       <w:r>
         <w:t>(</w:t>
       </w:r>
@@ -1751,6 +1927,7 @@
         </w:rPr>
         <w:t>‘</w:t>
       </w:r>
+      <w:proofErr w:type="spellStart"/>
       <w:r>
         <w:rPr>
           <w:rFonts w:ascii="Aptos" w:hAnsi="Aptos"/>
@@ -1758,7 +1935,17 @@
           <w:bCs/>
           <w:color w:val="000000"/>
         </w:rPr>
-        <w:t>PFhd’</w:t>
+        <w:t>PFhd</w:t>
+      </w:r>
+      <w:proofErr w:type="spellEnd"/>
+      <w:r>
+        <w:rPr>
+          <w:rFonts w:ascii="Aptos" w:hAnsi="Aptos"/>
+          <w:b/>
+          <w:bCs/>
+          <w:color w:val="000000"/>
+        </w:rPr>
+        <w:t>’</w:t>
       </w:r>
       <w:r>
         <w:rPr>
@@ -1774,7 +1961,15 @@
         <w:t xml:space="preserve"> + </w:t>
       </w:r>
       <w:r>
-        <w:t>&lt;header_data&gt;</w:t>
+        <w:t>&lt;</w:t>
+      </w:r>
+      <w:proofErr w:type="spellStart"/>
+      <w:r>
+        <w:t>header_data</w:t>
+      </w:r>
+      <w:proofErr w:type="spellEnd"/>
+      <w:r>
+        <w:t>&gt;</w:t>
       </w:r>
       <w:r>
         <w:t xml:space="preserve"> wher</w:t>
@@ -1788,19 +1983,56 @@
         <w:ind w:left="720" w:hanging="360"/>
       </w:pPr>
       <w:r>
-        <w:t xml:space="preserve">&lt;header_data&gt; = </w:t>
+        <w:t>&lt;</w:t>
+      </w:r>
+      <w:proofErr w:type="spellStart"/>
+      <w:r>
+        <w:t>header_data</w:t>
+      </w:r>
+      <w:proofErr w:type="spellEnd"/>
+      <w:r>
+        <w:t xml:space="preserve">&gt; = </w:t>
       </w:r>
       <w:r>
         <w:br/>
       </w:r>
       <w:r>
-        <w:t>&lt;major_version&gt; + &lt;minor_version&gt; + &lt;bbc_model&gt; + &lt;</w:t>
-      </w:r>
+        <w:t>&lt;</w:t>
+      </w:r>
+      <w:proofErr w:type="spellStart"/>
+      <w:r>
+        <w:t>major_version</w:t>
+      </w:r>
+      <w:proofErr w:type="spellEnd"/>
+      <w:r>
+        <w:t>&gt; + &lt;</w:t>
+      </w:r>
+      <w:proofErr w:type="spellStart"/>
+      <w:r>
+        <w:t>minor_version</w:t>
+      </w:r>
+      <w:proofErr w:type="spellEnd"/>
+      <w:r>
+        <w:t>&gt; + &lt;</w:t>
+      </w:r>
+      <w:proofErr w:type="spellStart"/>
+      <w:r>
+        <w:t>bbc_model</w:t>
+      </w:r>
+      <w:proofErr w:type="spellEnd"/>
+      <w:r>
+        <w:t>&gt; + &lt;</w:t>
+      </w:r>
+      <w:proofErr w:type="spellStart"/>
       <w:r>
         <w:t>total_</w:t>
       </w:r>
       <w:r>
-        <w:t>execution_count&gt;</w:t>
+        <w:t>execution_count</w:t>
+      </w:r>
+      <w:proofErr w:type="spellEnd"/>
+      <w:r>
+        <w:t>&gt;</w:t>
       </w:r>
     </w:p>
     <w:p>
@@ -1810,11 +2042,16 @@
       <w:r>
         <w:t>&lt;</w:t>
       </w:r>
+      <w:proofErr w:type="spellStart"/>
       <w:r>
         <w:t>major_</w:t>
       </w:r>
       <w:r>
-        <w:t>version&gt;</w:t>
+        <w:t>version</w:t>
+      </w:r>
+      <w:proofErr w:type="spellEnd"/>
+      <w:r>
+        <w:t>&gt;</w:t>
       </w:r>
       <w:r>
         <w:t xml:space="preserve"> </w:t>
@@ -1833,11 +2070,16 @@
       <w:r>
         <w:t>&lt;</w:t>
       </w:r>
+      <w:proofErr w:type="spellStart"/>
       <w:r>
         <w:t>minor</w:t>
       </w:r>
       <w:r>
-        <w:t>_version&gt; (1 byte) Minor version number</w:t>
+        <w:t>_version</w:t>
+      </w:r>
+      <w:proofErr w:type="spellEnd"/>
+      <w:r>
+        <w:t>&gt; (1 byte) Minor version number</w:t>
       </w:r>
       <w:r>
         <w:t>.  Value is 0</w:t>
@@ -1851,7 +2093,15 @@
         <w:ind w:left="360"/>
       </w:pPr>
       <w:r>
-        <w:t>&lt;bbc_model&gt; (1 byte) The BBC model</w:t>
+        <w:t>&lt;</w:t>
+      </w:r>
+      <w:proofErr w:type="spellStart"/>
+      <w:r>
+        <w:t>bbc_model</w:t>
+      </w:r>
+      <w:proofErr w:type="spellEnd"/>
+      <w:r>
+        <w:t>&gt; (1 byte) The BBC model</w:t>
       </w:r>
     </w:p>
     <w:tbl>
@@ -2279,6 +2529,7 @@
       <w:r>
         <w:t>&lt;</w:t>
       </w:r>
+      <w:proofErr w:type="spellStart"/>
       <w:r>
         <w:t>total_</w:t>
       </w:r>
@@ -2289,7 +2540,11 @@
         <w:t>_</w:t>
       </w:r>
       <w:r>
-        <w:t xml:space="preserve">count&gt; (4 bytes) The total number of </w:t>
+        <w:t>count</w:t>
+      </w:r>
+      <w:proofErr w:type="spellEnd"/>
+      <w:r>
+        <w:t xml:space="preserve">&gt; (4 bytes) The total number of </w:t>
       </w:r>
       <w:r>
         <w:t xml:space="preserve">executed </w:t>
@@ -2344,14 +2599,35 @@
           <w:b/>
           <w:bCs/>
         </w:rPr>
-        <w:t>&lt;labels_chunk&gt;</w:t>
+        <w:t>&lt;</w:t>
+      </w:r>
+      <w:proofErr w:type="spellStart"/>
+      <w:r>
+        <w:rPr>
+          <w:b/>
+          <w:bCs/>
+        </w:rPr>
+        <w:t>labels_chunk</w:t>
+      </w:r>
+      <w:proofErr w:type="spellEnd"/>
+      <w:r>
+        <w:rPr>
+          <w:b/>
+          <w:bCs/>
+        </w:rPr>
+        <w:t>&gt;</w:t>
       </w:r>
       <w:r>
         <w:t xml:space="preserve"> = </w:t>
       </w:r>
       <w:r>
-        <w:t>&lt;common_heade</w:t>
-      </w:r>
+        <w:t>&lt;</w:t>
+      </w:r>
+      <w:proofErr w:type="spellStart"/>
+      <w:r>
+        <w:t>common_heade</w:t>
+      </w:r>
+      <w:proofErr w:type="spellEnd"/>
       <w:r>
         <w:t>(</w:t>
       </w:r>
@@ -2362,6 +2638,7 @@
         </w:rPr>
         <w:t>‘</w:t>
       </w:r>
+      <w:proofErr w:type="spellStart"/>
       <w:r>
         <w:rPr>
           <w:rFonts w:ascii="Aptos" w:hAnsi="Aptos"/>
@@ -2371,6 +2648,7 @@
         </w:rPr>
         <w:t>PFlb</w:t>
       </w:r>
+      <w:proofErr w:type="spellEnd"/>
       <w:r>
         <w:t>’</w:t>
       </w:r>
@@ -2381,11 +2659,16 @@
         <w:t xml:space="preserve">&gt; </w:t>
       </w:r>
       <w:r>
-        <w:t>+ &lt;label</w:t>
+        <w:t>+ &lt;</w:t>
+      </w:r>
+      <w:proofErr w:type="spellStart"/>
+      <w:r>
+        <w:t>label</w:t>
       </w:r>
       <w:r>
         <w:t>_data</w:t>
       </w:r>
+      <w:proofErr w:type="spellEnd"/>
       <w:r>
         <w:t>&gt;</w:t>
       </w:r>
@@ -2398,7 +2681,15 @@
         <w:ind w:left="360"/>
       </w:pPr>
       <w:r>
-        <w:t xml:space="preserve">&lt;label_data&gt; = </w:t>
+        <w:t>&lt;</w:t>
+      </w:r>
+      <w:proofErr w:type="spellStart"/>
+      <w:r>
+        <w:t>label_data</w:t>
+      </w:r>
+      <w:proofErr w:type="spellEnd"/>
+      <w:r>
+        <w:t xml:space="preserve">&gt; = </w:t>
       </w:r>
       <w:r>
         <w:t xml:space="preserve">list of </w:t>
@@ -2419,7 +2710,23 @@
       </w:r>
       <w:bookmarkEnd w:id="0"/>
       <w:r>
-        <w:t>&lt;label_address&gt; + &lt;label_name&gt;</w:t>
+        <w:t>&lt;</w:t>
+      </w:r>
+      <w:proofErr w:type="spellStart"/>
+      <w:r>
+        <w:t>label_address</w:t>
+      </w:r>
+      <w:proofErr w:type="spellEnd"/>
+      <w:r>
+        <w:t>&gt; + &lt;</w:t>
+      </w:r>
+      <w:proofErr w:type="spellStart"/>
+      <w:r>
+        <w:t>label_name</w:t>
+      </w:r>
+      <w:proofErr w:type="spellEnd"/>
+      <w:r>
+        <w:t>&gt;</w:t>
       </w:r>
       <w:r>
         <w:t xml:space="preserve"> </w:t>
@@ -2430,7 +2737,15 @@
         <w:ind w:left="810"/>
       </w:pPr>
       <w:r>
-        <w:t xml:space="preserve">&lt;label_address&gt; (2 bytes) </w:t>
+        <w:t>&lt;</w:t>
+      </w:r>
+      <w:proofErr w:type="spellStart"/>
+      <w:r>
+        <w:t>label_address</w:t>
+      </w:r>
+      <w:proofErr w:type="spellEnd"/>
+      <w:r>
+        <w:t xml:space="preserve">&gt; (2 bytes) </w:t>
       </w:r>
       <w:r>
         <w:t xml:space="preserve">A </w:t>
@@ -2525,6 +2840,7 @@
         </w:rPr>
         <w:t>&lt;</w:t>
       </w:r>
+      <w:proofErr w:type="spellStart"/>
       <w:r>
         <w:rPr>
           <w:b/>
@@ -2537,21 +2853,34 @@
           <w:b/>
           <w:bCs/>
         </w:rPr>
-        <w:t>_chunk&gt;</w:t>
-      </w:r>
+        <w:t>_chunk</w:t>
+      </w:r>
+      <w:proofErr w:type="spellEnd"/>
       <w:r>
         <w:rPr>
           <w:b/>
           <w:bCs/>
         </w:rPr>
+        <w:t>&gt;</w:t>
+      </w:r>
+      <w:r>
+        <w:rPr>
+          <w:b/>
+          <w:bCs/>
+        </w:rPr>
         <w:t xml:space="preserve"> </w:t>
       </w:r>
       <w:r>
-        <w:t>= &lt;common_</w:t>
+        <w:t>= &lt;</w:t>
+      </w:r>
+      <w:proofErr w:type="spellStart"/>
+      <w:r>
+        <w:t>common_</w:t>
       </w:r>
       <w:r>
         <w:t>header</w:t>
       </w:r>
+      <w:proofErr w:type="spellEnd"/>
       <w:r>
         <w:t>(</w:t>
       </w:r>
@@ -2562,6 +2891,7 @@
         </w:rPr>
         <w:t>‘</w:t>
       </w:r>
+      <w:proofErr w:type="spellStart"/>
       <w:r>
         <w:rPr>
           <w:rFonts w:ascii="Aptos" w:hAnsi="Aptos"/>
@@ -2569,7 +2899,17 @@
           <w:bCs/>
           <w:color w:val="000000"/>
         </w:rPr>
-        <w:t>PFss’</w:t>
+        <w:t>PFss</w:t>
+      </w:r>
+      <w:proofErr w:type="spellEnd"/>
+      <w:r>
+        <w:rPr>
+          <w:rFonts w:ascii="Aptos" w:hAnsi="Aptos"/>
+          <w:b/>
+          <w:bCs/>
+          <w:color w:val="000000"/>
+        </w:rPr>
+        <w:t>’</w:t>
       </w:r>
       <w:r>
         <w:rPr>
@@ -2589,7 +2929,15 @@
         <w:t xml:space="preserve"> </w:t>
       </w:r>
       <w:r>
-        <w:t>&lt;snapshot_data&gt;</w:t>
+        <w:t>&lt;</w:t>
+      </w:r>
+      <w:proofErr w:type="spellStart"/>
+      <w:r>
+        <w:t>snapshot_data</w:t>
+      </w:r>
+      <w:proofErr w:type="spellEnd"/>
+      <w:r>
+        <w:t>&gt;</w:t>
       </w:r>
       <w:r>
         <w:t xml:space="preserve"> where</w:t>
@@ -2601,26 +2949,63 @@
       </w:pPr>
       <w:r>
         <w:lastRenderedPageBreak/>
-        <w:t>&lt;snapshot_data&gt; =</w:t>
+        <w:t>&lt;</w:t>
+      </w:r>
+      <w:proofErr w:type="spellStart"/>
+      <w:r>
+        <w:t>snapshot_data</w:t>
+      </w:r>
+      <w:proofErr w:type="spellEnd"/>
+      <w:r>
+        <w:t>&gt; =</w:t>
       </w:r>
       <w:r>
         <w:br/>
-        <w:t>&lt;stack_</w:t>
+        <w:t>&lt;</w:t>
+      </w:r>
+      <w:proofErr w:type="spellStart"/>
+      <w:r>
+        <w:t>stack_</w:t>
       </w:r>
       <w:r>
         <w:t>pointer</w:t>
       </w:r>
+      <w:proofErr w:type="spellEnd"/>
       <w:r>
         <w:t xml:space="preserve">&gt; + </w:t>
       </w:r>
       <w:r>
-        <w:t xml:space="preserve">&lt;rom_paging_register&gt; + &lt;acccon&gt; + </w:t>
-      </w:r>
-      <w:r>
-        <w:t>&lt;hidden_ram_</w:t>
-      </w:r>
-      <w:r>
-        <w:t>address&gt;</w:t>
+        <w:t>&lt;</w:t>
+      </w:r>
+      <w:proofErr w:type="spellStart"/>
+      <w:r>
+        <w:t>rom_paging_register</w:t>
+      </w:r>
+      <w:proofErr w:type="spellEnd"/>
+      <w:r>
+        <w:t>&gt; + &lt;</w:t>
+      </w:r>
+      <w:proofErr w:type="spellStart"/>
+      <w:r>
+        <w:t>acccon</w:t>
+      </w:r>
+      <w:proofErr w:type="spellEnd"/>
+      <w:r>
+        <w:t xml:space="preserve">&gt; + </w:t>
+      </w:r>
+      <w:r>
+        <w:t>&lt;</w:t>
+      </w:r>
+      <w:proofErr w:type="spellStart"/>
+      <w:r>
+        <w:t>hidden_ram_</w:t>
+      </w:r>
+      <w:r>
+        <w:t>address</w:t>
+      </w:r>
+      <w:proofErr w:type="spellEnd"/>
+      <w:r>
+        <w:t>&gt;</w:t>
       </w:r>
       <w:r>
         <w:rPr>
@@ -2634,7 +3019,23 @@
         <w:t xml:space="preserve"> + </w:t>
       </w:r>
       <w:r>
-        <w:t xml:space="preserve">&lt;6845-registers&gt; + &lt;ULA_video_control_register&gt; + &lt;ULA_palette&gt; + </w:t>
+        <w:t>&lt;6845-registers&gt; + &lt;</w:t>
+      </w:r>
+      <w:proofErr w:type="spellStart"/>
+      <w:r>
+        <w:t>ULA_video_control_register</w:t>
+      </w:r>
+      <w:proofErr w:type="spellEnd"/>
+      <w:r>
+        <w:t>&gt; + &lt;</w:t>
+      </w:r>
+      <w:proofErr w:type="spellStart"/>
+      <w:r>
+        <w:t>ULA_palette</w:t>
+      </w:r>
+      <w:proofErr w:type="spellEnd"/>
+      <w:r>
+        <w:t xml:space="preserve">&gt; + </w:t>
       </w:r>
       <w:r>
         <w:t>&lt;memory&gt;</w:t>
@@ -2645,11 +3046,16 @@
         <w:ind w:left="360"/>
       </w:pPr>
       <w:r>
-        <w:t>&lt;stack_</w:t>
+        <w:t>&lt;</w:t>
+      </w:r>
+      <w:proofErr w:type="spellStart"/>
+      <w:r>
+        <w:t>stack_</w:t>
       </w:r>
       <w:r>
         <w:t>pointer</w:t>
       </w:r>
+      <w:proofErr w:type="spellEnd"/>
       <w:r>
         <w:t xml:space="preserve">&gt; (1 byte).  The value of the stack </w:t>
       </w:r>
@@ -2667,6 +3073,7 @@
       <w:r>
         <w:t>&lt;</w:t>
       </w:r>
+      <w:proofErr w:type="spellStart"/>
       <w:r>
         <w:t>rom_</w:t>
       </w:r>
@@ -2679,6 +3086,7 @@
       <w:r>
         <w:t>_register</w:t>
       </w:r>
+      <w:proofErr w:type="spellEnd"/>
       <w:r>
         <w:t>&gt; (1 byte).</w:t>
       </w:r>
@@ -2714,9 +3122,11 @@
       <w:r>
         <w:t>&lt;</w:t>
       </w:r>
+      <w:proofErr w:type="spellStart"/>
       <w:r>
         <w:t>acccon</w:t>
       </w:r>
+      <w:proofErr w:type="spellEnd"/>
       <w:r>
         <w:t>&gt;</w:t>
       </w:r>
@@ -2747,7 +3157,15 @@
         <w:ind w:left="360"/>
       </w:pPr>
       <w:r>
-        <w:t>&lt;hidden_ram_address&gt; (1 byte)</w:t>
+        <w:t>&lt;</w:t>
+      </w:r>
+      <w:proofErr w:type="spellStart"/>
+      <w:r>
+        <w:t>hidden_ram_address</w:t>
+      </w:r>
+      <w:proofErr w:type="spellEnd"/>
+      <w:r>
+        <w:t>&gt; (1 byte)</w:t>
       </w:r>
       <w:r>
         <w:t xml:space="preserve">.  Populated </w:t>
@@ -2842,7 +3260,15 @@
         <w:ind w:left="360"/>
       </w:pPr>
       <w:r>
-        <w:t>&lt;ULA_video_control_register&gt; (1 byte).  The value of the ULA video control register.</w:t>
+        <w:t>&lt;</w:t>
+      </w:r>
+      <w:proofErr w:type="spellStart"/>
+      <w:r>
+        <w:t>ULA_video_control_register</w:t>
+      </w:r>
+      <w:proofErr w:type="spellEnd"/>
+      <w:r>
+        <w:t>&gt; (1 byte).  The value of the ULA video control register.</w:t>
       </w:r>
     </w:p>
     <w:p>
@@ -2850,7 +3276,15 @@
         <w:ind w:left="360"/>
       </w:pPr>
       <w:r>
-        <w:t xml:space="preserve">&lt;ULA_palette&gt; (16 bytes).  The </w:t>
+        <w:t>&lt;</w:t>
+      </w:r>
+      <w:proofErr w:type="spellStart"/>
+      <w:r>
+        <w:t>ULA_palette</w:t>
+      </w:r>
+      <w:proofErr w:type="spellEnd"/>
+      <w:r>
+        <w:t xml:space="preserve">&gt; (16 bytes).  The </w:t>
       </w:r>
       <w:r>
         <w:t xml:space="preserve">ULA’s </w:t>
@@ -2908,20 +3342,38 @@
       <w:r>
         <w:t>&lt;</w:t>
       </w:r>
+      <w:proofErr w:type="spellStart"/>
       <w:r>
         <w:t>base_</w:t>
       </w:r>
       <w:r>
-        <w:t>memory&gt; + &lt;paged_</w:t>
-      </w:r>
-      <w:r>
         <w:t>memory</w:t>
       </w:r>
+      <w:proofErr w:type="spellEnd"/>
+      <w:r>
+        <w:t>&gt; + &lt;</w:t>
+      </w:r>
+      <w:proofErr w:type="spellStart"/>
+      <w:r>
+        <w:t>paged_</w:t>
+      </w:r>
+      <w:r>
+        <w:t>memory</w:t>
+      </w:r>
+      <w:proofErr w:type="spellEnd"/>
       <w:r>
         <w:t xml:space="preserve">&gt; </w:t>
       </w:r>
       <w:r>
-        <w:t>+ &lt;shadow_ram&gt;</w:t>
+        <w:t>+ &lt;</w:t>
+      </w:r>
+      <w:proofErr w:type="spellStart"/>
+      <w:r>
+        <w:t>shadow_ram</w:t>
+      </w:r>
+      <w:proofErr w:type="spellEnd"/>
+      <w:r>
+        <w:t>&gt;</w:t>
       </w:r>
       <w:r>
         <w:rPr>
@@ -2935,7 +3387,15 @@
         <w:t xml:space="preserve"> + </w:t>
       </w:r>
       <w:r>
-        <w:t>&lt;mos_ram&gt;</w:t>
+        <w:t>&lt;</w:t>
+      </w:r>
+      <w:proofErr w:type="spellStart"/>
+      <w:r>
+        <w:t>mos_ram</w:t>
+      </w:r>
+      <w:proofErr w:type="spellEnd"/>
+      <w:r>
+        <w:t>&gt;</w:t>
       </w:r>
       <w:r>
         <w:rPr>
@@ -2957,7 +3417,15 @@
         <w:t xml:space="preserve"> + </w:t>
       </w:r>
       <w:r>
-        <w:t>&lt;filing_system_ram&gt;</w:t>
+        <w:t>&lt;</w:t>
+      </w:r>
+      <w:proofErr w:type="spellStart"/>
+      <w:r>
+        <w:t>filing_system_ram</w:t>
+      </w:r>
+      <w:proofErr w:type="spellEnd"/>
+      <w:r>
+        <w:t>&gt;</w:t>
       </w:r>
       <w:r>
         <w:rPr>
@@ -2971,7 +3439,15 @@
         <w:t xml:space="preserve"> +</w:t>
       </w:r>
       <w:r>
-        <w:t xml:space="preserve"> &lt;private_ram&gt;</w:t>
+        <w:t xml:space="preserve"> &lt;</w:t>
+      </w:r>
+      <w:proofErr w:type="spellStart"/>
+      <w:r>
+        <w:t>private_ram</w:t>
+      </w:r>
+      <w:proofErr w:type="spellEnd"/>
+      <w:r>
+        <w:t>&gt;</w:t>
       </w:r>
       <w:r>
         <w:rPr>
@@ -2982,7 +3458,15 @@
         <w:t>opt</w:t>
       </w:r>
       <w:r>
-        <w:t xml:space="preserve"> + &lt;hidden_ram&gt;</w:t>
+        <w:t xml:space="preserve"> + &lt;</w:t>
+      </w:r>
+      <w:proofErr w:type="spellStart"/>
+      <w:r>
+        <w:t>hidden_ram</w:t>
+      </w:r>
+      <w:proofErr w:type="spellEnd"/>
+      <w:r>
+        <w:t>&gt;</w:t>
       </w:r>
       <w:r>
         <w:rPr>
@@ -3164,7 +3648,15 @@
               <w:ind w:left="1440" w:hanging="1440"/>
             </w:pPr>
             <w:r>
-              <w:t>&lt;base_memory&gt;</w:t>
+              <w:t>&lt;</w:t>
+            </w:r>
+            <w:proofErr w:type="spellStart"/>
+            <w:r>
+              <w:t>base_memory</w:t>
+            </w:r>
+            <w:proofErr w:type="spellEnd"/>
+            <w:r>
+              <w:t>&gt;</w:t>
             </w:r>
           </w:p>
         </w:tc>
@@ -3237,8 +3729,13 @@
             <w:r>
               <w:t>&lt;</w:t>
             </w:r>
+            <w:proofErr w:type="spellStart"/>
             <w:r>
-              <w:t>paged_memory&gt;</w:t>
+              <w:t>paged_memory</w:t>
+            </w:r>
+            <w:proofErr w:type="spellEnd"/>
+            <w:r>
+              <w:t>&gt;</w:t>
             </w:r>
           </w:p>
         </w:tc>
@@ -3309,7 +3806,15 @@
           </w:tcPr>
           <w:p>
             <w:r>
-              <w:t>&lt;shadow_ram&gt;</w:t>
+              <w:t>&lt;</w:t>
+            </w:r>
+            <w:proofErr w:type="spellStart"/>
+            <w:r>
+              <w:t>shadow_ram</w:t>
+            </w:r>
+            <w:proofErr w:type="spellEnd"/>
+            <w:r>
+              <w:t>&gt;</w:t>
             </w:r>
           </w:p>
         </w:tc>
@@ -3373,7 +3878,15 @@
           </w:tcPr>
           <w:p>
             <w:r>
-              <w:t>&lt;mos_ram&gt;</w:t>
+              <w:t>&lt;</w:t>
+            </w:r>
+            <w:proofErr w:type="spellStart"/>
+            <w:r>
+              <w:t>mos_ram</w:t>
+            </w:r>
+            <w:proofErr w:type="spellEnd"/>
+            <w:r>
+              <w:t>&gt;</w:t>
             </w:r>
           </w:p>
         </w:tc>
@@ -3428,7 +3941,15 @@
           </w:tcPr>
           <w:p>
             <w:r>
-              <w:t>&lt;filing_system_ram&gt;</w:t>
+              <w:t>&lt;</w:t>
+            </w:r>
+            <w:proofErr w:type="spellStart"/>
+            <w:r>
+              <w:t>filing_system_ram</w:t>
+            </w:r>
+            <w:proofErr w:type="spellEnd"/>
+            <w:r>
+              <w:t>&gt;</w:t>
             </w:r>
           </w:p>
         </w:tc>
@@ -3483,7 +4004,15 @@
           </w:tcPr>
           <w:p>
             <w:r>
-              <w:t>&lt;private_ram&gt;</w:t>
+              <w:t>&lt;</w:t>
+            </w:r>
+            <w:proofErr w:type="spellStart"/>
+            <w:r>
+              <w:t>private_ram</w:t>
+            </w:r>
+            <w:proofErr w:type="spellEnd"/>
+            <w:r>
+              <w:t>&gt;</w:t>
             </w:r>
           </w:p>
         </w:tc>
@@ -3541,7 +4070,15 @@
           </w:tcPr>
           <w:p>
             <w:r>
-              <w:t>&lt;hidden_ram&gt;</w:t>
+              <w:t>&lt;</w:t>
+            </w:r>
+            <w:proofErr w:type="spellStart"/>
+            <w:r>
+              <w:t>hidden_ram</w:t>
+            </w:r>
+            <w:proofErr w:type="spellEnd"/>
+            <w:r>
+              <w:t>&gt;</w:t>
             </w:r>
           </w:p>
         </w:tc>
@@ -3600,11 +4137,16 @@
       <w:r>
         <w:t>&lt;</w:t>
       </w:r>
+      <w:proofErr w:type="spellStart"/>
       <w:r>
         <w:t>base_</w:t>
       </w:r>
       <w:r>
-        <w:t>memory&gt; (64K) The default 64K of memory.</w:t>
+        <w:t>memory</w:t>
+      </w:r>
+      <w:proofErr w:type="spellEnd"/>
+      <w:r>
+        <w:t>&gt; (64K) The default 64K of memory.</w:t>
       </w:r>
       <w:r>
         <w:t xml:space="preserve">  Addresses 0</w:t>
@@ -3623,23 +4165,38 @@
       <w:r>
         <w:t>&lt;</w:t>
       </w:r>
+      <w:proofErr w:type="spellStart"/>
       <w:r>
         <w:t>paged_</w:t>
       </w:r>
       <w:r>
         <w:t>memory</w:t>
       </w:r>
+      <w:proofErr w:type="spellEnd"/>
       <w:r>
         <w:t>&gt;</w:t>
       </w:r>
       <w:r>
-        <w:t xml:space="preserve"> = &lt;page_count&gt; + &lt;</w:t>
-      </w:r>
+        <w:t xml:space="preserve"> = &lt;</w:t>
+      </w:r>
+      <w:proofErr w:type="spellStart"/>
+      <w:r>
+        <w:t>page_count</w:t>
+      </w:r>
+      <w:proofErr w:type="spellEnd"/>
+      <w:r>
+        <w:t>&gt; + &lt;</w:t>
+      </w:r>
+      <w:proofErr w:type="spellStart"/>
       <w:r>
         <w:t>page_</w:t>
       </w:r>
       <w:r>
-        <w:t>data&gt;</w:t>
+        <w:t>data</w:t>
+      </w:r>
+      <w:proofErr w:type="spellEnd"/>
+      <w:r>
+        <w:t>&gt;</w:t>
       </w:r>
       <w:r>
         <w:rPr>
@@ -3666,7 +4223,15 @@
         <w:ind w:left="720"/>
       </w:pPr>
       <w:r>
-        <w:t>&lt;page_count&gt; (1 byte) The number of pages.</w:t>
+        <w:t>&lt;</w:t>
+      </w:r>
+      <w:proofErr w:type="spellStart"/>
+      <w:r>
+        <w:t>page_count</w:t>
+      </w:r>
+      <w:proofErr w:type="spellEnd"/>
+      <w:r>
+        <w:t>&gt; (1 byte) The number of pages.</w:t>
       </w:r>
     </w:p>
     <w:p>
@@ -3674,17 +4239,46 @@
         <w:ind w:left="720"/>
       </w:pPr>
       <w:r>
-        <w:t>&lt;page_data&gt; = &lt;page_ba</w:t>
+        <w:t>&lt;</w:t>
+      </w:r>
+      <w:proofErr w:type="spellStart"/>
+      <w:r>
+        <w:t>page_data</w:t>
+      </w:r>
+      <w:proofErr w:type="spellEnd"/>
+      <w:r>
+        <w:t>&gt; = &lt;</w:t>
+      </w:r>
+      <w:proofErr w:type="spellStart"/>
+      <w:r>
+        <w:t>page_ba</w:t>
       </w:r>
       <w:r>
         <w:t>n</w:t>
       </w:r>
       <w:r>
-        <w:t>k&gt; + &lt;page_readonly&gt; + &lt;page_memor</w:t>
+        <w:t>k</w:t>
+      </w:r>
+      <w:proofErr w:type="spellEnd"/>
+      <w:r>
+        <w:t>&gt; + &lt;</w:t>
+      </w:r>
+      <w:proofErr w:type="spellStart"/>
+      <w:r>
+        <w:t>page_readonly</w:t>
+      </w:r>
+      <w:proofErr w:type="spellEnd"/>
+      <w:r>
+        <w:t>&gt; + &lt;</w:t>
+      </w:r>
+      <w:proofErr w:type="spellStart"/>
+      <w:r>
+        <w:t>page_memor</w:t>
       </w:r>
       <w:r>
         <w:t>y</w:t>
       </w:r>
+      <w:proofErr w:type="spellEnd"/>
       <w:r>
         <w:t>&gt;</w:t>
       </w:r>
@@ -3695,11 +4289,16 @@
       </w:pPr>
       <w:r>
         <w:lastRenderedPageBreak/>
-        <w:t>&lt;page_</w:t>
+        <w:t>&lt;</w:t>
+      </w:r>
+      <w:proofErr w:type="spellStart"/>
+      <w:r>
+        <w:t>page_</w:t>
       </w:r>
       <w:r>
         <w:t>bank</w:t>
       </w:r>
+      <w:proofErr w:type="spellEnd"/>
       <w:r>
         <w:t xml:space="preserve">&gt; (1 byte) A page </w:t>
       </w:r>
@@ -3718,11 +4317,16 @@
         <w:ind w:left="1080"/>
       </w:pPr>
       <w:r>
-        <w:t>&lt;page_</w:t>
+        <w:t>&lt;</w:t>
+      </w:r>
+      <w:proofErr w:type="spellStart"/>
+      <w:r>
+        <w:t>page_</w:t>
       </w:r>
       <w:r>
         <w:t>readonly</w:t>
       </w:r>
+      <w:proofErr w:type="spellEnd"/>
       <w:r>
         <w:t xml:space="preserve">&gt; (1 byte) A page </w:t>
       </w:r>
@@ -3761,9 +4365,11 @@
       <w:r>
         <w:t>&lt;</w:t>
       </w:r>
+      <w:proofErr w:type="spellStart"/>
       <w:r>
         <w:t>page_memory</w:t>
       </w:r>
+      <w:proofErr w:type="spellEnd"/>
       <w:r>
         <w:t xml:space="preserve">&gt; (16K) </w:t>
       </w:r>
@@ -3779,7 +4385,15 @@
         <w:ind w:left="360"/>
       </w:pPr>
       <w:r>
-        <w:t xml:space="preserve">&lt;shadow_ram&gt; (20K) </w:t>
+        <w:t>&lt;</w:t>
+      </w:r>
+      <w:proofErr w:type="spellStart"/>
+      <w:r>
+        <w:t>shadow_ram</w:t>
+      </w:r>
+      <w:proofErr w:type="spellEnd"/>
+      <w:r>
+        <w:t xml:space="preserve">&gt; (20K) </w:t>
       </w:r>
       <w:r>
         <w:t xml:space="preserve">Populated on Model B Plus, BBC Model </w:t>
@@ -3814,7 +4428,15 @@
         <w:ind w:left="360"/>
       </w:pPr>
       <w:r>
-        <w:t xml:space="preserve">&lt;mos_ram&gt; (4K) </w:t>
+        <w:t>&lt;</w:t>
+      </w:r>
+      <w:proofErr w:type="spellStart"/>
+      <w:r>
+        <w:t>mos_ram</w:t>
+      </w:r>
+      <w:proofErr w:type="spellEnd"/>
+      <w:r>
+        <w:t xml:space="preserve">&gt; (4K) </w:t>
       </w:r>
       <w:r>
         <w:t>Populated on BBC Master</w:t>
@@ -3834,7 +4456,15 @@
         <w:ind w:left="360"/>
       </w:pPr>
       <w:r>
-        <w:t xml:space="preserve">&lt;filing_system_ram&gt; (8K) </w:t>
+        <w:t>&lt;</w:t>
+      </w:r>
+      <w:proofErr w:type="spellStart"/>
+      <w:r>
+        <w:t>filing_system_ram</w:t>
+      </w:r>
+      <w:proofErr w:type="spellEnd"/>
+      <w:r>
+        <w:t xml:space="preserve">&gt; (8K) </w:t>
       </w:r>
       <w:r>
         <w:t>Populated on BBC Master</w:t>
@@ -3863,7 +4493,15 @@
         <w:ind w:left="360"/>
       </w:pPr>
       <w:r>
-        <w:t>&lt;private_ram&gt; (</w:t>
+        <w:t>&lt;</w:t>
+      </w:r>
+      <w:proofErr w:type="spellStart"/>
+      <w:r>
+        <w:t>private_ram</w:t>
+      </w:r>
+      <w:proofErr w:type="spellEnd"/>
+      <w:r>
+        <w:t>&gt; (</w:t>
       </w:r>
       <w:r>
         <w:t>12</w:t>
@@ -3922,7 +4560,15 @@
         <w:ind w:left="360"/>
       </w:pPr>
       <w:r>
-        <w:t xml:space="preserve">&lt;hidden_ram&gt; (256 bytes) </w:t>
+        <w:t>&lt;</w:t>
+      </w:r>
+      <w:proofErr w:type="spellStart"/>
+      <w:r>
+        <w:t>hidden_ram</w:t>
+      </w:r>
+      <w:proofErr w:type="spellEnd"/>
+      <w:r>
+        <w:t xml:space="preserve">&gt; (256 bytes) </w:t>
       </w:r>
       <w:r>
         <w:t>Populated on BBC Model Integra B.</w:t>
@@ -4013,11 +4659,32 @@
           <w:b/>
           <w:bCs/>
         </w:rPr>
-        <w:t>&lt;execution_chunk&gt;</w:t>
-      </w:r>
-      <w:r>
-        <w:t xml:space="preserve"> = &lt;common_header</w:t>
-      </w:r>
+        <w:t>&lt;</w:t>
+      </w:r>
+      <w:proofErr w:type="spellStart"/>
+      <w:r>
+        <w:rPr>
+          <w:b/>
+          <w:bCs/>
+        </w:rPr>
+        <w:t>execution_chunk</w:t>
+      </w:r>
+      <w:proofErr w:type="spellEnd"/>
+      <w:r>
+        <w:rPr>
+          <w:b/>
+          <w:bCs/>
+        </w:rPr>
+        <w:t>&gt;</w:t>
+      </w:r>
+      <w:r>
+        <w:t xml:space="preserve"> = &lt;</w:t>
+      </w:r>
+      <w:proofErr w:type="spellStart"/>
+      <w:r>
+        <w:t>common_header</w:t>
+      </w:r>
+      <w:proofErr w:type="spellEnd"/>
       <w:r>
         <w:t>(</w:t>
       </w:r>
@@ -4028,6 +4695,7 @@
         </w:rPr>
         <w:t>‘</w:t>
       </w:r>
+      <w:proofErr w:type="spellStart"/>
       <w:r>
         <w:rPr>
           <w:rFonts w:ascii="Aptos" w:hAnsi="Aptos"/>
@@ -4035,7 +4703,17 @@
           <w:bCs/>
           <w:color w:val="000000"/>
         </w:rPr>
-        <w:t>PFex’</w:t>
+        <w:t>PFex</w:t>
+      </w:r>
+      <w:proofErr w:type="spellEnd"/>
+      <w:r>
+        <w:rPr>
+          <w:rFonts w:ascii="Aptos" w:hAnsi="Aptos"/>
+          <w:b/>
+          <w:bCs/>
+          <w:color w:val="000000"/>
+        </w:rPr>
+        <w:t>’</w:t>
       </w:r>
       <w:r>
         <w:rPr>
@@ -4045,7 +4723,15 @@
         <w:t>)</w:t>
       </w:r>
       <w:r>
-        <w:t>&gt; + &lt;execution_data&gt;</w:t>
+        <w:t>&gt; + &lt;</w:t>
+      </w:r>
+      <w:proofErr w:type="spellStart"/>
+      <w:r>
+        <w:t>execution_data</w:t>
+      </w:r>
+      <w:proofErr w:type="spellEnd"/>
+      <w:r>
+        <w:t>&gt;</w:t>
       </w:r>
     </w:p>
     <w:p>
@@ -4053,7 +4739,15 @@
         <w:ind w:left="360"/>
       </w:pPr>
       <w:r>
-        <w:t xml:space="preserve">&lt;execution_data&gt; = </w:t>
+        <w:t>&lt;</w:t>
+      </w:r>
+      <w:proofErr w:type="spellStart"/>
+      <w:r>
+        <w:t>execution_data</w:t>
+      </w:r>
+      <w:proofErr w:type="spellEnd"/>
+      <w:r>
+        <w:t xml:space="preserve">&gt; = </w:t>
       </w:r>
       <w:r>
         <w:t xml:space="preserve">list of </w:t>
@@ -4108,7 +4802,23 @@
         <w:t>&gt;</w:t>
       </w:r>
       <w:r>
-        <w:t xml:space="preserve"> = &lt;event_marker&gt; + &lt;event_params&gt; </w:t>
+        <w:t xml:space="preserve"> = &lt;</w:t>
+      </w:r>
+      <w:proofErr w:type="spellStart"/>
+      <w:r>
+        <w:t>event_marker</w:t>
+      </w:r>
+      <w:proofErr w:type="spellEnd"/>
+      <w:r>
+        <w:t>&gt; + &lt;</w:t>
+      </w:r>
+      <w:proofErr w:type="spellStart"/>
+      <w:r>
+        <w:t>event_params</w:t>
+      </w:r>
+      <w:proofErr w:type="spellEnd"/>
+      <w:r>
+        <w:t xml:space="preserve">&gt; </w:t>
       </w:r>
     </w:p>
     <w:p>
@@ -4116,7 +4826,15 @@
         <w:ind w:left="720"/>
       </w:pPr>
       <w:r>
-        <w:t>&lt;event_marker&gt; (2 bytes).  A two-byte value that distinguishes a</w:t>
+        <w:t>&lt;</w:t>
+      </w:r>
+      <w:proofErr w:type="spellStart"/>
+      <w:r>
+        <w:t>event_marker</w:t>
+      </w:r>
+      <w:proofErr w:type="spellEnd"/>
+      <w:r>
+        <w:t>&gt; (2 bytes).  A two-byte value that distinguishes a</w:t>
       </w:r>
       <w:r>
         <w:t>n</w:t>
@@ -4262,7 +4980,15 @@
           </w:tcPr>
           <w:p>
             <w:r>
-              <w:t>&lt;interrupt_event_params&gt;</w:t>
+              <w:t>&lt;</w:t>
+            </w:r>
+            <w:proofErr w:type="spellStart"/>
+            <w:r>
+              <w:t>interrupt_event_params</w:t>
+            </w:r>
+            <w:proofErr w:type="spellEnd"/>
+            <w:r>
+              <w:t>&gt;</w:t>
             </w:r>
           </w:p>
         </w:tc>
@@ -4297,7 +5023,15 @@
           </w:tcPr>
           <w:p>
             <w:r>
-              <w:t>&lt;interrupt_event_params&gt;</w:t>
+              <w:t>&lt;</w:t>
+            </w:r>
+            <w:proofErr w:type="spellStart"/>
+            <w:r>
+              <w:t>interrupt_event_params</w:t>
+            </w:r>
+            <w:proofErr w:type="spellEnd"/>
+            <w:r>
+              <w:t>&gt;</w:t>
             </w:r>
           </w:p>
         </w:tc>
@@ -4322,13 +5056,7 @@
           </w:tcPr>
           <w:p>
             <w:r>
-              <w:t>Screen memory</w:t>
-            </w:r>
-            <w:r>
-              <w:t xml:space="preserve"> </w:t>
-            </w:r>
-            <w:r>
-              <w:t>display read</w:t>
+              <w:t>Begin display</w:t>
             </w:r>
           </w:p>
         </w:tc>
@@ -4384,15 +5112,13 @@
       </w:r>
       <w:proofErr w:type="gramEnd"/>
       <w:r>
-        <w:t xml:space="preserve"> signify that an </w:t>
-      </w:r>
-      <w:proofErr w:type="gramStart"/>
-      <w:r>
-        <w:t>interrupt</w:t>
-      </w:r>
-      <w:proofErr w:type="gramEnd"/>
-      <w:r>
-        <w:t xml:space="preserve"> has occurred.  A screen memory display read event signifies that the screen memory read, </w:t>
+        <w:t xml:space="preserve"> signify that an interrupt has occurred.  A </w:t>
+      </w:r>
+      <w:r>
+        <w:t xml:space="preserve">begin display event </w:t>
+      </w:r>
+      <w:r>
+        <w:t xml:space="preserve">signifies that the screen memory read, </w:t>
       </w:r>
       <w:r>
         <w:t>which</w:t>
@@ -4419,7 +5145,6 @@
         </w:rPr>
       </w:pPr>
       <w:r>
-        <w:lastRenderedPageBreak/>
         <w:tab/>
       </w:r>
       <w:r>
@@ -4427,7 +5152,23 @@
           <w:b/>
           <w:bCs/>
         </w:rPr>
-        <w:t>&lt;interrupt_event_params&gt;</w:t>
+        <w:t>&lt;</w:t>
+      </w:r>
+      <w:proofErr w:type="spellStart"/>
+      <w:r>
+        <w:rPr>
+          <w:b/>
+          <w:bCs/>
+        </w:rPr>
+        <w:t>interrupt_event_params</w:t>
+      </w:r>
+      <w:proofErr w:type="spellEnd"/>
+      <w:r>
+        <w:rPr>
+          <w:b/>
+          <w:bCs/>
+        </w:rPr>
+        <w:t>&gt;</w:t>
       </w:r>
       <w:r>
         <w:t xml:space="preserve"> = </w:t>
@@ -4435,6 +5176,7 @@
       <w:r>
         <w:t>&lt;</w:t>
       </w:r>
+      <w:proofErr w:type="spellStart"/>
       <w:r>
         <w:t>address</w:t>
       </w:r>
@@ -4444,8 +5186,13 @@
       <w:r>
         <w:t>service_routine</w:t>
       </w:r>
-      <w:r>
-        <w:t>&gt; + &lt;address</w:t>
+      <w:proofErr w:type="spellEnd"/>
+      <w:r>
+        <w:t>&gt; + &lt;</w:t>
+      </w:r>
+      <w:proofErr w:type="spellStart"/>
+      <w:r>
+        <w:t>address</w:t>
       </w:r>
       <w:r>
         <w:t>_</w:t>
@@ -4453,11 +5200,20 @@
       <w:r>
         <w:t>interrupted</w:t>
       </w:r>
+      <w:proofErr w:type="spellEnd"/>
       <w:r>
         <w:t>&gt; +</w:t>
       </w:r>
       <w:r>
-        <w:t xml:space="preserve"> &lt;stack_pointer&gt;</w:t>
+        <w:t xml:space="preserve"> &lt;</w:t>
+      </w:r>
+      <w:proofErr w:type="spellStart"/>
+      <w:r>
+        <w:t>stack_pointer</w:t>
+      </w:r>
+      <w:proofErr w:type="spellEnd"/>
+      <w:r>
+        <w:t>&gt;</w:t>
       </w:r>
       <w:r>
         <w:t xml:space="preserve"> </w:t>
@@ -4468,7 +5224,16 @@
         <w:ind w:left="1080"/>
       </w:pPr>
       <w:r>
-        <w:t>&lt;address_service_routine&gt; (2 bytes).  The address of the interrupt service routine.</w:t>
+        <w:lastRenderedPageBreak/>
+        <w:t>&lt;</w:t>
+      </w:r>
+      <w:proofErr w:type="spellStart"/>
+      <w:r>
+        <w:t>address_service_routine</w:t>
+      </w:r>
+      <w:proofErr w:type="spellEnd"/>
+      <w:r>
+        <w:t>&gt; (2 bytes).  The address of the interrupt service routine.</w:t>
       </w:r>
     </w:p>
     <w:p>
@@ -4476,11 +5241,16 @@
         <w:ind w:left="1080"/>
       </w:pPr>
       <w:r>
-        <w:t>&lt;address_</w:t>
+        <w:t>&lt;</w:t>
+      </w:r>
+      <w:proofErr w:type="spellStart"/>
+      <w:r>
+        <w:t>address_</w:t>
       </w:r>
       <w:r>
         <w:t>interrupted</w:t>
       </w:r>
+      <w:proofErr w:type="spellEnd"/>
       <w:r>
         <w:t xml:space="preserve"> &gt; (2 bytes).  The address of </w:t>
       </w:r>
@@ -4496,7 +5266,15 @@
         <w:ind w:left="1080"/>
       </w:pPr>
       <w:r>
-        <w:t xml:space="preserve">&lt;cycle_count&gt; </w:t>
+        <w:t>&lt;</w:t>
+      </w:r>
+      <w:proofErr w:type="spellStart"/>
+      <w:r>
+        <w:t>cycle_count</w:t>
+      </w:r>
+      <w:proofErr w:type="spellEnd"/>
+      <w:r>
+        <w:t xml:space="preserve">&gt; </w:t>
       </w:r>
       <w:r>
         <w:t>(1 byte) S</w:t>
@@ -4510,7 +5288,15 @@
         <w:ind w:left="1080"/>
       </w:pPr>
       <w:r>
-        <w:t xml:space="preserve">&lt;stack_pointer&gt; </w:t>
+        <w:t>&lt;</w:t>
+      </w:r>
+      <w:proofErr w:type="spellStart"/>
+      <w:r>
+        <w:t>stack_pointer</w:t>
+      </w:r>
+      <w:proofErr w:type="spellEnd"/>
+      <w:r>
+        <w:t xml:space="preserve">&gt; </w:t>
       </w:r>
       <w:r>
         <w:t>(1 bytes) S</w:t>
@@ -4544,11 +5330,16 @@
       <w:r>
         <w:t>&lt;</w:t>
       </w:r>
+      <w:proofErr w:type="spellStart"/>
       <w:r>
         <w:t>opcode_</w:t>
       </w:r>
       <w:r>
-        <w:t>address&gt; + &lt;opcode&gt; + &lt;operand&gt;</w:t>
+        <w:t>address</w:t>
+      </w:r>
+      <w:proofErr w:type="spellEnd"/>
+      <w:r>
+        <w:t>&gt; + &lt;opcode&gt; + &lt;operand&gt;</w:t>
       </w:r>
       <w:r>
         <w:rPr>
@@ -4575,8 +5366,13 @@
       <w:r>
         <w:t>&lt;</w:t>
       </w:r>
-      <w:r>
-        <w:t>stack_pointer&gt;</w:t>
+      <w:proofErr w:type="spellStart"/>
+      <w:r>
+        <w:t>stack_pointer</w:t>
+      </w:r>
+      <w:proofErr w:type="spellEnd"/>
+      <w:r>
+        <w:t>&gt;</w:t>
       </w:r>
       <w:r>
         <w:rPr>
@@ -4590,7 +5386,15 @@
         <w:t xml:space="preserve"> + </w:t>
       </w:r>
       <w:r>
-        <w:t>&lt;return_address&gt;</w:t>
+        <w:t>&lt;</w:t>
+      </w:r>
+      <w:proofErr w:type="spellStart"/>
+      <w:r>
+        <w:t>return_address</w:t>
+      </w:r>
+      <w:proofErr w:type="spellEnd"/>
+      <w:r>
+        <w:t>&gt;</w:t>
       </w:r>
       <w:r>
         <w:rPr>
@@ -4615,7 +5419,15 @@
         <w:t xml:space="preserve">+ </w:t>
       </w:r>
       <w:r>
-        <w:t>&lt;memory_address&gt;</w:t>
+        <w:t>&lt;</w:t>
+      </w:r>
+      <w:proofErr w:type="spellStart"/>
+      <w:r>
+        <w:t>memory_address</w:t>
+      </w:r>
+      <w:proofErr w:type="spellEnd"/>
+      <w:r>
+        <w:t>&gt;</w:t>
       </w:r>
       <w:r>
         <w:rPr>
@@ -4636,6 +5448,7 @@
       <w:r>
         <w:t xml:space="preserve"> &lt;</w:t>
       </w:r>
+      <w:proofErr w:type="spellStart"/>
       <w:r>
         <w:t>memory</w:t>
       </w:r>
@@ -4645,6 +5458,7 @@
       <w:r>
         <w:t>_value</w:t>
       </w:r>
+      <w:proofErr w:type="spellEnd"/>
       <w:r>
         <w:t>&gt;</w:t>
       </w:r>
@@ -4667,9 +5481,11 @@
       <w:r>
         <w:t>+ &lt;</w:t>
       </w:r>
+      <w:proofErr w:type="spellStart"/>
       <w:r>
         <w:t>memory_write_value</w:t>
       </w:r>
+      <w:proofErr w:type="spellEnd"/>
       <w:r>
         <w:t>&gt;</w:t>
       </w:r>
@@ -4689,11 +5505,16 @@
       <w:r>
         <w:t>&lt;</w:t>
       </w:r>
+      <w:proofErr w:type="spellStart"/>
       <w:r>
         <w:t>opcode_</w:t>
       </w:r>
       <w:r>
-        <w:t>address&gt;</w:t>
+        <w:t>address</w:t>
+      </w:r>
+      <w:proofErr w:type="spellEnd"/>
+      <w:r>
+        <w:t>&gt;</w:t>
       </w:r>
       <w:r>
         <w:t xml:space="preserve"> </w:t>
@@ -5615,7 +6436,6 @@
         <w:rPr>
           <w:noProof/>
         </w:rPr>
-        <w:lastRenderedPageBreak/>
         <w:tab/>
       </w:r>
       <w:r>
@@ -5668,6 +6488,7 @@
         <w:rPr>
           <w:noProof/>
         </w:rPr>
+        <w:lastRenderedPageBreak/>
         <w:t>writeByte(</w:t>
       </w:r>
       <w:r>
@@ -5827,7 +6648,15 @@
         </w:rPr>
       </w:pPr>
       <w:r>
-        <w:t xml:space="preserve">&lt;stack_pointer&gt; (1 byte) Populated for </w:t>
+        <w:t>&lt;</w:t>
+      </w:r>
+      <w:proofErr w:type="spellStart"/>
+      <w:r>
+        <w:t>stack_pointer</w:t>
+      </w:r>
+      <w:proofErr w:type="spellEnd"/>
+      <w:r>
+        <w:t xml:space="preserve">&gt; (1 byte) Populated for </w:t>
       </w:r>
       <w:r>
         <w:t xml:space="preserve">opcodes </w:t>
@@ -5889,7 +6718,15 @@
         <w:ind w:left="720"/>
       </w:pPr>
       <w:r>
-        <w:t xml:space="preserve">&lt;return_address&gt; (2 bytes) Populated for the </w:t>
+        <w:t>&lt;</w:t>
+      </w:r>
+      <w:proofErr w:type="spellStart"/>
+      <w:r>
+        <w:t>return_address</w:t>
+      </w:r>
+      <w:proofErr w:type="spellEnd"/>
+      <w:r>
+        <w:t xml:space="preserve">&gt; (2 bytes) Populated for the </w:t>
       </w:r>
       <w:r>
         <w:rPr>
@@ -5929,7 +6766,15 @@
         <w:ind w:left="720"/>
       </w:pPr>
       <w:r>
-        <w:t>&lt;memory_address&gt; (2 bytes) Populated for all opcodes that use the following addressing modes:</w:t>
+        <w:t>&lt;</w:t>
+      </w:r>
+      <w:proofErr w:type="spellStart"/>
+      <w:r>
+        <w:t>memory_address</w:t>
+      </w:r>
+      <w:proofErr w:type="spellEnd"/>
+      <w:r>
+        <w:t>&gt; (2 bytes) Populated for all opcodes that use the following addressing modes:</w:t>
       </w:r>
     </w:p>
     <w:p>
@@ -6152,11 +6997,16 @@
         <w:ind w:left="720"/>
       </w:pPr>
       <w:r>
-        <w:t>&lt;memory</w:t>
+        <w:t>&lt;</w:t>
+      </w:r>
+      <w:proofErr w:type="spellStart"/>
+      <w:r>
+        <w:t>memory</w:t>
       </w:r>
       <w:r>
         <w:t>_read_value</w:t>
       </w:r>
+      <w:proofErr w:type="spellEnd"/>
       <w:r>
         <w:t xml:space="preserve">&gt; (1 byte) Populated for </w:t>
       </w:r>
@@ -6221,7 +7071,15 @@
         <w:ind w:left="720"/>
       </w:pPr>
       <w:r>
-        <w:t xml:space="preserve">&lt;memory_write_value&gt; (1 byte) Populated for </w:t>
+        <w:t>&lt;</w:t>
+      </w:r>
+      <w:proofErr w:type="spellStart"/>
+      <w:r>
+        <w:t>memory_write_value</w:t>
+      </w:r>
+      <w:proofErr w:type="spellEnd"/>
+      <w:r>
+        <w:t xml:space="preserve">&gt; (1 byte) Populated for </w:t>
       </w:r>
       <w:proofErr w:type="gramStart"/>
       <w:r>
@@ -6259,11 +7117,7 @@
         <w:t>.</w:t>
       </w:r>
       <w:r>
-        <w:t xml:space="preserve"> This includes </w:t>
-      </w:r>
-      <w:r>
-        <w:lastRenderedPageBreak/>
-        <w:t xml:space="preserve">instructions like </w:t>
+        <w:t xml:space="preserve"> This includes instructions like </w:t>
       </w:r>
       <w:r>
         <w:t>AS</w:t>
@@ -6296,6 +7150,7 @@
         <w:pStyle w:val="Heading2"/>
       </w:pPr>
       <w:r>
+        <w:lastRenderedPageBreak/>
         <w:t>File size</w:t>
       </w:r>
     </w:p>
@@ -6448,6 +7303,7 @@
       <w:r>
         <w:t xml:space="preserve">a </w:t>
       </w:r>
+      <w:proofErr w:type="spellStart"/>
       <w:r>
         <w:rPr>
           <w:b/>
@@ -6455,6 +7311,7 @@
         </w:rPr>
         <w:t>PerfWriter</w:t>
       </w:r>
+      <w:proofErr w:type="spellEnd"/>
       <w:r>
         <w:t xml:space="preserve"> class</w:t>
       </w:r>
@@ -6817,6 +7674,7 @@
       <w:pPr>
         <w:pStyle w:val="Heading1"/>
       </w:pPr>
+      <w:proofErr w:type="spellStart"/>
       <w:r>
         <w:t>Bee</w:t>
       </w:r>
@@ -6826,10 +7684,19 @@
       <w:r>
         <w:t>Perf</w:t>
       </w:r>
-    </w:p>
-    <w:p>
-      <w:r>
-        <w:t xml:space="preserve">As outlined above, BeebPerf is a standalone </w:t>
+      <w:proofErr w:type="spellEnd"/>
+    </w:p>
+    <w:p>
+      <w:r>
+        <w:t xml:space="preserve">As outlined above, </w:t>
+      </w:r>
+      <w:proofErr w:type="spellStart"/>
+      <w:r>
+        <w:t>BeebPerf</w:t>
+      </w:r>
+      <w:proofErr w:type="spellEnd"/>
+      <w:r>
+        <w:t xml:space="preserve"> is a standalone </w:t>
       </w:r>
       <w:r>
         <w:t xml:space="preserve">Windows </w:t>
@@ -8016,15 +8883,7 @@
         <w:t xml:space="preserve">The </w:t>
       </w:r>
       <w:r>
-        <w:t xml:space="preserve">settings dialog allows </w:t>
-      </w:r>
-      <w:proofErr w:type="gramStart"/>
-      <w:r>
-        <w:t>a number of</w:t>
-      </w:r>
-      <w:proofErr w:type="gramEnd"/>
-      <w:r>
-        <w:t xml:space="preserve"> display options to be set, including the default font scaling, theme (light or dark mode), and code formatting and color options.</w:t>
+        <w:t>settings dialog allows a number of display options to be set, including the default font scaling, theme (light or dark mode), and code formatting and color options.</w:t>
       </w:r>
     </w:p>
     <w:p>
@@ -8869,9 +9728,11 @@
       <w:r>
         <w:t xml:space="preserve">Aggregated CPU Metrics, by </w:t>
       </w:r>
+      <w:proofErr w:type="spellStart"/>
       <w:r>
         <w:t>RoutineStack</w:t>
       </w:r>
+      <w:proofErr w:type="spellEnd"/>
       <w:r>
         <w:t xml:space="preserve"> – </w:t>
       </w:r>
@@ -8937,6 +9798,7 @@
           <w:numId w:val="9"/>
         </w:numPr>
       </w:pPr>
+      <w:proofErr w:type="spellStart"/>
       <w:r>
         <w:rPr>
           <w:b/>
@@ -8944,6 +9806,7 @@
         </w:rPr>
         <w:t>CallStack</w:t>
       </w:r>
+      <w:proofErr w:type="spellEnd"/>
       <w:r>
         <w:t xml:space="preserve"> – represents a</w:t>
       </w:r>
@@ -8993,7 +9856,15 @@
         </w:numPr>
       </w:pPr>
       <w:r>
-        <w:t>Parent CallStack reference</w:t>
+        <w:t xml:space="preserve">Parent </w:t>
+      </w:r>
+      <w:proofErr w:type="spellStart"/>
+      <w:r>
+        <w:t>CallStack</w:t>
+      </w:r>
+      <w:proofErr w:type="spellEnd"/>
+      <w:r>
+        <w:t xml:space="preserve"> reference</w:t>
       </w:r>
     </w:p>
     <w:p>
@@ -9028,7 +9899,15 @@
         <w:ind w:left="1080"/>
       </w:pPr>
       <w:r>
-        <w:t xml:space="preserve">The identify of a CallStack is defined </w:t>
+        <w:t xml:space="preserve">The identify of a </w:t>
+      </w:r>
+      <w:proofErr w:type="spellStart"/>
+      <w:r>
+        <w:t>CallStack</w:t>
+      </w:r>
+      <w:proofErr w:type="spellEnd"/>
+      <w:r>
+        <w:t xml:space="preserve"> is defined </w:t>
       </w:r>
       <w:r>
         <w:t xml:space="preserve">by the sequence of </w:t>
@@ -9069,6 +9948,7 @@
           <w:numId w:val="9"/>
         </w:numPr>
       </w:pPr>
+      <w:proofErr w:type="spellStart"/>
       <w:r>
         <w:rPr>
           <w:b/>
@@ -9076,6 +9956,7 @@
         </w:rPr>
         <w:t>StackFrame</w:t>
       </w:r>
+      <w:proofErr w:type="spellEnd"/>
       <w:r>
         <w:t xml:space="preserve"> – represents a unique stack-frame within the recorded program.</w:t>
       </w:r>
@@ -10987,7 +11868,11 @@
         </w:numPr>
       </w:pPr>
       <w:r>
-        <w:t>Populate No</w:t>
+        <w:t xml:space="preserve">Populate </w:t>
+      </w:r>
+      <w:proofErr w:type="spellStart"/>
+      <w:r>
+        <w:t>No</w:t>
       </w:r>
       <w:r>
         <w:t>Tr</w:t>
@@ -10998,6 +11883,7 @@
       <w:r>
         <w:t>verse</w:t>
       </w:r>
+      <w:proofErr w:type="spellEnd"/>
       <w:r>
         <w:t xml:space="preserve"> </w:t>
       </w:r>
@@ -11049,11 +11935,16 @@
           <w:numId w:val="19"/>
         </w:numPr>
       </w:pPr>
+      <w:proofErr w:type="spellStart"/>
       <w:r>
         <w:t>Routine</w:t>
       </w:r>
       <w:r>
-        <w:t>aggregated and total aggregated</w:t>
+        <w:t>aggregated</w:t>
+      </w:r>
+      <w:proofErr w:type="spellEnd"/>
+      <w:r>
+        <w:t xml:space="preserve"> and total aggregated</w:t>
       </w:r>
       <w:r>
         <w:t xml:space="preserve"> CPU metrics</w:t>
@@ -11473,7 +12364,15 @@
         </w:numPr>
       </w:pPr>
       <w:r>
-        <w:t>Detecting roms being paged in.  The easiest way to handle this is to record the value written to &amp;</w:t>
+        <w:t xml:space="preserve">Detecting </w:t>
+      </w:r>
+      <w:proofErr w:type="spellStart"/>
+      <w:r>
+        <w:t>roms</w:t>
+      </w:r>
+      <w:proofErr w:type="spellEnd"/>
+      <w:r>
+        <w:t xml:space="preserve"> being paged in.  The easiest way to handle this is to record the value written to &amp;</w:t>
       </w:r>
       <w:r>
         <w:t>FE30</w:t>
@@ -11614,7 +12513,15 @@
       </w:r>
       <w:proofErr w:type="gramEnd"/>
       <w:r>
-        <w:t xml:space="preserve">-7). Write values stored at </w:t>
+        <w:t>-7)</w:t>
+      </w:r>
+      <w:proofErr w:type="gramStart"/>
+      <w:r>
+        <w:t xml:space="preserve">. </w:t>
+      </w:r>
+      <w:proofErr w:type="gramEnd"/>
+      <w:r>
+        <w:t xml:space="preserve">Write values stored at </w:t>
       </w:r>
       <w:r>
         <w:t>&amp;FE20</w:t>

</xml_diff>

<commit_message>
Stack frame analysis changes
</commit_message>
<xml_diff>
--- a/docs/Development.docx
+++ b/docs/Development.docx
@@ -2817,9 +2817,6 @@
         <w:t xml:space="preserve"> and </w:t>
       </w:r>
       <w:r>
-        <w:t xml:space="preserve">the </w:t>
-      </w:r>
-      <w:r>
         <w:t xml:space="preserve">stack </w:t>
       </w:r>
       <w:r>
@@ -3404,7 +3401,13 @@
         <w:t xml:space="preserve">.  Populated </w:t>
       </w:r>
       <w:r>
-        <w:t>for the</w:t>
+        <w:t xml:space="preserve">only </w:t>
+      </w:r>
+      <w:r>
+        <w:t xml:space="preserve">on </w:t>
+      </w:r>
+      <w:r>
+        <w:t>the</w:t>
       </w:r>
       <w:r>
         <w:t xml:space="preserve"> </w:t>
@@ -4763,14 +4766,12 @@
       <w:r>
         <w:t>Integra</w:t>
       </w:r>
-      <w:proofErr w:type="gramStart"/>
       <w:r>
         <w:t>.</w:t>
       </w:r>
       <w:r>
         <w:t xml:space="preserve"> </w:t>
       </w:r>
-      <w:proofErr w:type="gramEnd"/>
       <w:r>
         <w:t>Addresses &amp;</w:t>
       </w:r>
@@ -5082,10 +5083,7 @@
         <w:t>the event type</w:t>
       </w:r>
       <w:r>
-        <w:t xml:space="preserve">.  The event marker is followed by one or more </w:t>
-      </w:r>
-      <w:r>
-        <w:t>event parameters</w:t>
+        <w:t xml:space="preserve"> and parameters as</w:t>
       </w:r>
       <w:r>
         <w:t xml:space="preserve"> </w:t>
@@ -5100,23 +5098,22 @@
     <w:tbl>
       <w:tblPr>
         <w:tblStyle w:val="TableGrid"/>
-        <w:tblW w:w="0" w:type="auto"/>
+        <w:tblW w:w="8370" w:type="dxa"/>
         <w:tblInd w:w="1165" w:type="dxa"/>
         <w:tblLook w:val="04A0" w:firstRow="1" w:lastRow="0" w:firstColumn="1" w:lastColumn="0" w:noHBand="0" w:noVBand="1"/>
       </w:tblPr>
       <w:tblGrid>
-        <w:gridCol w:w="2065"/>
-        <w:gridCol w:w="2700"/>
-        <w:gridCol w:w="2944"/>
+        <w:gridCol w:w="1800"/>
+        <w:gridCol w:w="3510"/>
+        <w:gridCol w:w="3060"/>
       </w:tblGrid>
       <w:tr>
         <w:tc>
           <w:tcPr>
-            <w:tcW w:w="2065" w:type="dxa"/>
+            <w:tcW w:w="1800" w:type="dxa"/>
           </w:tcPr>
           <w:p>
             <w:pPr>
-              <w:jc w:val="center"/>
               <w:rPr>
                 <w:b/>
                 <w:bCs/>
@@ -5140,7 +5137,7 @@
         </w:tc>
         <w:tc>
           <w:tcPr>
-            <w:tcW w:w="2700" w:type="dxa"/>
+            <w:tcW w:w="3510" w:type="dxa"/>
           </w:tcPr>
           <w:p>
             <w:pPr>
@@ -5167,7 +5164,7 @@
         </w:tc>
         <w:tc>
           <w:tcPr>
-            <w:tcW w:w="2700" w:type="dxa"/>
+            <w:tcW w:w="3060" w:type="dxa"/>
           </w:tcPr>
           <w:p>
             <w:pPr>
@@ -5189,12 +5186,9 @@
       <w:tr>
         <w:tc>
           <w:tcPr>
-            <w:tcW w:w="2065" w:type="dxa"/>
+            <w:tcW w:w="1800" w:type="dxa"/>
           </w:tcPr>
           <w:p>
-            <w:pPr>
-              <w:jc w:val="center"/>
-            </w:pPr>
             <w:r>
               <w:t>&amp;80, &amp;00</w:t>
             </w:r>
@@ -5202,17 +5196,20 @@
         </w:tc>
         <w:tc>
           <w:tcPr>
-            <w:tcW w:w="2700" w:type="dxa"/>
+            <w:tcW w:w="3510" w:type="dxa"/>
           </w:tcPr>
           <w:p>
             <w:r>
               <w:t>Maskable interrupt</w:t>
             </w:r>
+            <w:r>
+              <w:t xml:space="preserve"> (IRQ)</w:t>
+            </w:r>
           </w:p>
         </w:tc>
         <w:tc>
           <w:tcPr>
-            <w:tcW w:w="2700" w:type="dxa"/>
+            <w:tcW w:w="3060" w:type="dxa"/>
           </w:tcPr>
           <w:p>
             <w:r>
@@ -5232,12 +5229,9 @@
       <w:tr>
         <w:tc>
           <w:tcPr>
-            <w:tcW w:w="2065" w:type="dxa"/>
+            <w:tcW w:w="1800" w:type="dxa"/>
           </w:tcPr>
           <w:p>
-            <w:pPr>
-              <w:jc w:val="center"/>
-            </w:pPr>
             <w:r>
               <w:t>&amp;80, &amp;01</w:t>
             </w:r>
@@ -5245,17 +5239,20 @@
         </w:tc>
         <w:tc>
           <w:tcPr>
-            <w:tcW w:w="2700" w:type="dxa"/>
+            <w:tcW w:w="3510" w:type="dxa"/>
           </w:tcPr>
           <w:p>
             <w:r>
               <w:t>Non-maskable interrupt</w:t>
             </w:r>
+            <w:r>
+              <w:t xml:space="preserve"> (NMI)</w:t>
+            </w:r>
           </w:p>
         </w:tc>
         <w:tc>
           <w:tcPr>
-            <w:tcW w:w="2700" w:type="dxa"/>
+            <w:tcW w:w="3060" w:type="dxa"/>
           </w:tcPr>
           <w:p>
             <w:r>
@@ -5275,12 +5272,9 @@
       <w:tr>
         <w:tc>
           <w:tcPr>
-            <w:tcW w:w="2065" w:type="dxa"/>
+            <w:tcW w:w="1800" w:type="dxa"/>
           </w:tcPr>
           <w:p>
-            <w:pPr>
-              <w:jc w:val="center"/>
-            </w:pPr>
             <w:r>
               <w:t>&amp;80, &amp;02</w:t>
             </w:r>
@@ -5288,7 +5282,7 @@
         </w:tc>
         <w:tc>
           <w:tcPr>
-            <w:tcW w:w="2700" w:type="dxa"/>
+            <w:tcW w:w="3510" w:type="dxa"/>
           </w:tcPr>
           <w:p>
             <w:r>
@@ -5298,7 +5292,37 @@
         </w:tc>
         <w:tc>
           <w:tcPr>
-            <w:tcW w:w="2700" w:type="dxa"/>
+            <w:tcW w:w="3060" w:type="dxa"/>
+          </w:tcPr>
+          <w:p>
+            <w:r>
+              <w:rPr>
+                <w:i/>
+                <w:iCs/>
+              </w:rPr>
+              <w:t>&lt;</w:t>
+            </w:r>
+            <w:proofErr w:type="spellStart"/>
+            <w:r>
+              <w:t>display_fi</w:t>
+            </w:r>
+            <w:r>
+              <w:t>e</w:t>
+            </w:r>
+            <w:r>
+              <w:t>ld</w:t>
+            </w:r>
+            <w:proofErr w:type="spellEnd"/>
+            <w:r>
+              <w:t>&gt;</w:t>
+            </w:r>
+          </w:p>
+        </w:tc>
+      </w:tr>
+      <w:tr>
+        <w:tc>
+          <w:tcPr>
+            <w:tcW w:w="1800" w:type="dxa"/>
           </w:tcPr>
           <w:p>
             <w:pPr>
@@ -5312,7 +5336,70 @@
                 <w:i/>
                 <w:iCs/>
               </w:rPr>
-              <w:t>none</w:t>
+              <w:t>&amp;80, &amp;</w:t>
+            </w:r>
+            <w:proofErr w:type="gramStart"/>
+            <w:r>
+              <w:rPr>
+                <w:i/>
+                <w:iCs/>
+              </w:rPr>
+              <w:t>03..</w:t>
+            </w:r>
+            <w:proofErr w:type="gramEnd"/>
+            <w:r>
+              <w:rPr>
+                <w:i/>
+                <w:iCs/>
+              </w:rPr>
+              <w:t>&amp;7F</w:t>
+            </w:r>
+          </w:p>
+        </w:tc>
+        <w:tc>
+          <w:tcPr>
+            <w:tcW w:w="3510" w:type="dxa"/>
+          </w:tcPr>
+          <w:p>
+            <w:pPr>
+              <w:rPr>
+                <w:i/>
+                <w:iCs/>
+              </w:rPr>
+            </w:pPr>
+            <w:r>
+              <w:rPr>
+                <w:i/>
+                <w:iCs/>
+              </w:rPr>
+              <w:t>f</w:t>
+            </w:r>
+            <w:r>
+              <w:rPr>
+                <w:i/>
+                <w:iCs/>
+              </w:rPr>
+              <w:t>uture events</w:t>
+            </w:r>
+          </w:p>
+        </w:tc>
+        <w:tc>
+          <w:tcPr>
+            <w:tcW w:w="3060" w:type="dxa"/>
+          </w:tcPr>
+          <w:p>
+            <w:pPr>
+              <w:rPr>
+                <w:i/>
+                <w:iCs/>
+              </w:rPr>
+            </w:pPr>
+            <w:r>
+              <w:rPr>
+                <w:i/>
+                <w:iCs/>
+              </w:rPr>
+              <w:t>TBD</w:t>
             </w:r>
           </w:p>
         </w:tc>
@@ -5340,15 +5427,27 @@
         <w:t xml:space="preserve">The </w:t>
       </w:r>
       <w:r>
-        <w:t xml:space="preserve">maskable and non-maskable </w:t>
+        <w:t xml:space="preserve">maskable </w:t>
+      </w:r>
+      <w:r>
+        <w:t xml:space="preserve">(IRQ) </w:t>
+      </w:r>
+      <w:r>
+        <w:t xml:space="preserve">and non-maskable </w:t>
+      </w:r>
+      <w:r>
+        <w:t xml:space="preserve">(NMI) </w:t>
+      </w:r>
+      <w:r>
+        <w:t xml:space="preserve">interrupt events signify that an </w:t>
       </w:r>
       <w:proofErr w:type="gramStart"/>
       <w:r>
-        <w:t>interrupt events</w:t>
+        <w:t>interrupt</w:t>
       </w:r>
       <w:proofErr w:type="gramEnd"/>
       <w:r>
-        <w:t xml:space="preserve"> signify that an interrupt has occurred.  A </w:t>
+        <w:t xml:space="preserve"> has occurred.  A </w:t>
       </w:r>
       <w:r>
         <w:t xml:space="preserve">begin display event </w:t>
@@ -5374,15 +5473,8 @@
     </w:p>
     <w:p>
       <w:pPr>
-        <w:ind w:left="720" w:hanging="360"/>
-        <w:rPr>
-          <w:sz w:val="2"/>
-          <w:szCs w:val="2"/>
-        </w:rPr>
-      </w:pPr>
-      <w:r>
-        <w:tab/>
-      </w:r>
+        <w:ind w:left="1080" w:hanging="360"/>
+      </w:pPr>
       <w:r>
         <w:rPr>
           <w:b/>
@@ -5410,171 +5502,195 @@
         <w:t xml:space="preserve"> = </w:t>
       </w:r>
       <w:r>
+        <w:br/>
+      </w:r>
+      <w:r>
         <w:t>&lt;</w:t>
       </w:r>
       <w:proofErr w:type="spellStart"/>
       <w:r>
+        <w:t>cycle_count</w:t>
+      </w:r>
+      <w:proofErr w:type="spellEnd"/>
+      <w:r>
+        <w:t xml:space="preserve">&gt; </w:t>
+      </w:r>
+      <w:r>
+        <w:t xml:space="preserve">+ </w:t>
+      </w:r>
+      <w:r>
+        <w:t>&lt;</w:t>
+      </w:r>
+      <w:proofErr w:type="spellStart"/>
+      <w:r>
+        <w:t>destination_address</w:t>
+      </w:r>
+      <w:proofErr w:type="spellEnd"/>
+      <w:r>
+        <w:t xml:space="preserve">&gt; + </w:t>
+      </w:r>
+      <w:r>
+        <w:t>&lt;</w:t>
+      </w:r>
+      <w:proofErr w:type="spellStart"/>
+      <w:r>
+        <w:t>return_address</w:t>
+      </w:r>
+      <w:proofErr w:type="spellEnd"/>
+      <w:r>
+        <w:t>&gt;</w:t>
+      </w:r>
+    </w:p>
+    <w:p>
+      <w:pPr>
+        <w:ind w:left="1080"/>
+      </w:pPr>
+      <w:r>
+        <w:t>&lt;</w:t>
+      </w:r>
+      <w:proofErr w:type="spellStart"/>
+      <w:r>
+        <w:t>cycle_count</w:t>
+      </w:r>
+      <w:proofErr w:type="spellEnd"/>
+      <w:r>
+        <w:t>&gt; (1 byte) Specifies how many cycles it took to jump to the service routine (typically seven).</w:t>
+      </w:r>
+    </w:p>
+    <w:p>
+      <w:pPr>
+        <w:ind w:left="1080"/>
+      </w:pPr>
+      <w:r>
+        <w:t>&lt;</w:t>
+      </w:r>
+      <w:proofErr w:type="spellStart"/>
+      <w:r>
+        <w:t>destination_address</w:t>
+      </w:r>
+      <w:proofErr w:type="spellEnd"/>
+      <w:r>
+        <w:t>&gt; (2 bytes).  The address of the interrupt service routine.</w:t>
+      </w:r>
+    </w:p>
+    <w:p>
+      <w:pPr>
+        <w:ind w:left="1080"/>
+      </w:pPr>
+      <w:r>
+        <w:t>&lt;</w:t>
+      </w:r>
+      <w:proofErr w:type="spellStart"/>
+      <w:r>
+        <w:t>return_address</w:t>
+      </w:r>
+      <w:proofErr w:type="spellEnd"/>
+      <w:r>
+        <w:t>&gt; (2 bytes). The return address</w:t>
+      </w:r>
+      <w:r>
+        <w:t xml:space="preserve"> that was pushed on the stack.</w:t>
+      </w:r>
+    </w:p>
+    <w:p>
+      <w:pPr>
+        <w:ind w:left="720" w:hanging="720"/>
+      </w:pPr>
+      <w:r>
+        <w:tab/>
+      </w:r>
+      <w:r>
+        <w:t>&lt;</w:t>
+      </w:r>
+      <w:proofErr w:type="spellStart"/>
+      <w:r>
+        <w:rPr>
+          <w:b/>
+          <w:bCs/>
+        </w:rPr>
+        <w:t>display_field</w:t>
+      </w:r>
+      <w:proofErr w:type="spellEnd"/>
+      <w:proofErr w:type="gramStart"/>
+      <w:r>
+        <w:t>&gt;</w:t>
+      </w:r>
+      <w:r>
+        <w:t xml:space="preserve">  (</w:t>
+      </w:r>
+      <w:proofErr w:type="gramEnd"/>
+      <w:r>
+        <w:t>1 byte).  0 for even field, 1 for odd field</w:t>
+      </w:r>
+      <w:r>
+        <w:t xml:space="preserve"> (</w:t>
+      </w:r>
+      <w:r>
+        <w:t xml:space="preserve">when </w:t>
+      </w:r>
+      <w:r>
+        <w:t>interlace</w:t>
+      </w:r>
+      <w:r>
+        <w:t xml:space="preserve">d </w:t>
+      </w:r>
+      <w:r>
+        <w:t>sync</w:t>
+      </w:r>
+      <w:r>
+        <w:t xml:space="preserve"> </w:t>
+      </w:r>
+      <w:r>
+        <w:t xml:space="preserve">is </w:t>
+      </w:r>
+      <w:r>
+        <w:t>enabled</w:t>
+      </w:r>
+      <w:r>
+        <w:t>)</w:t>
+      </w:r>
+      <w:r>
+        <w:t>.</w:t>
+      </w:r>
+    </w:p>
+    <w:p>
+      <w:pPr>
+        <w:ind w:left="720" w:hanging="360"/>
+      </w:pPr>
+      <w:r>
+        <w:rPr>
+          <w:b/>
+          <w:bCs/>
+        </w:rPr>
+        <w:t>&lt;instruction&gt;</w:t>
+      </w:r>
+      <w:r>
+        <w:t xml:space="preserve"> = </w:t>
+      </w:r>
+      <w:r>
+        <w:br/>
+      </w:r>
+      <w:r>
+        <w:t>&lt;</w:t>
+      </w:r>
+      <w:proofErr w:type="spellStart"/>
+      <w:r>
+        <w:t>opcode_</w:t>
+      </w:r>
+      <w:r>
         <w:t>address</w:t>
       </w:r>
-      <w:r>
-        <w:t>_</w:t>
-      </w:r>
-      <w:r>
-        <w:t>service_routine</w:t>
-      </w:r>
       <w:proofErr w:type="spellEnd"/>
       <w:r>
-        <w:t>&gt; + &lt;</w:t>
-      </w:r>
-      <w:proofErr w:type="spellStart"/>
-      <w:r>
-        <w:t>address</w:t>
-      </w:r>
-      <w:r>
-        <w:t>_</w:t>
-      </w:r>
-      <w:r>
-        <w:t>interrupted</w:t>
-      </w:r>
-      <w:proofErr w:type="spellEnd"/>
-      <w:r>
-        <w:t>&gt; +</w:t>
-      </w:r>
-      <w:r>
-        <w:t xml:space="preserve"> &lt;</w:t>
-      </w:r>
-      <w:proofErr w:type="spellStart"/>
-      <w:r>
-        <w:t>stack_pointer</w:t>
-      </w:r>
-      <w:proofErr w:type="spellEnd"/>
-      <w:r>
-        <w:t>&gt;</w:t>
-      </w:r>
-      <w:r>
-        <w:t xml:space="preserve"> </w:t>
-      </w:r>
-    </w:p>
-    <w:p>
-      <w:pPr>
-        <w:ind w:left="1080"/>
-      </w:pPr>
-      <w:r>
-        <w:t>&lt;</w:t>
-      </w:r>
-      <w:proofErr w:type="spellStart"/>
-      <w:r>
-        <w:t>address_service_routine</w:t>
-      </w:r>
-      <w:proofErr w:type="spellEnd"/>
-      <w:r>
-        <w:t>&gt; (2 bytes).  The address of the interrupt service routine.</w:t>
-      </w:r>
-    </w:p>
-    <w:p>
-      <w:pPr>
-        <w:ind w:left="1080"/>
-      </w:pPr>
-      <w:r>
-        <w:t>&lt;</w:t>
-      </w:r>
-      <w:proofErr w:type="spellStart"/>
-      <w:r>
-        <w:t>address_</w:t>
-      </w:r>
-      <w:r>
-        <w:t>interrupted</w:t>
-      </w:r>
-      <w:proofErr w:type="spellEnd"/>
-      <w:r>
-        <w:t xml:space="preserve"> &gt; (2 bytes).  The address of </w:t>
-      </w:r>
-      <w:r>
-        <w:t>the instruction (opcode) that was interrupted</w:t>
-      </w:r>
-      <w:r>
-        <w:t>.</w:t>
-      </w:r>
-    </w:p>
-    <w:p>
-      <w:pPr>
-        <w:ind w:left="1080"/>
-      </w:pPr>
-      <w:r>
-        <w:t>&lt;</w:t>
-      </w:r>
-      <w:proofErr w:type="spellStart"/>
-      <w:r>
-        <w:t>cycle_count</w:t>
-      </w:r>
-      <w:proofErr w:type="spellEnd"/>
-      <w:r>
-        <w:t xml:space="preserve">&gt; </w:t>
-      </w:r>
-      <w:r>
-        <w:t>(1 byte) S</w:t>
-      </w:r>
-      <w:r>
-        <w:t>pecifies how many cycles it took to jump to the service routine (typically seven)</w:t>
-      </w:r>
-    </w:p>
-    <w:p>
-      <w:pPr>
-        <w:ind w:left="1080"/>
-      </w:pPr>
-      <w:r>
-        <w:t>&lt;</w:t>
-      </w:r>
-      <w:proofErr w:type="spellStart"/>
-      <w:r>
-        <w:t>stack_pointer</w:t>
-      </w:r>
-      <w:proofErr w:type="spellEnd"/>
-      <w:r>
-        <w:t xml:space="preserve">&gt; </w:t>
-      </w:r>
-      <w:r>
-        <w:t>(1 bytes) S</w:t>
-      </w:r>
-      <w:r>
-        <w:t>pecifies the new value of the stack pointer.</w:t>
-      </w:r>
-    </w:p>
-    <w:p>
-      <w:pPr>
-        <w:ind w:left="720" w:hanging="360"/>
+        <w:t>&gt; + &lt;opcode&gt; + &lt;operand&gt;</w:t>
+      </w:r>
+      <w:r>
         <w:rPr>
           <w:b/>
           <w:bCs/>
           <w:vertAlign w:val="superscript"/>
         </w:rPr>
-      </w:pPr>
-      <w:r>
-        <w:rPr>
-          <w:b/>
-          <w:bCs/>
-        </w:rPr>
-        <w:t>&lt;instruction&gt;</w:t>
-      </w:r>
-      <w:r>
-        <w:t xml:space="preserve"> = </w:t>
-      </w:r>
-      <w:r>
-        <w:br/>
-      </w:r>
-      <w:r>
-        <w:t>&lt;</w:t>
-      </w:r>
-      <w:proofErr w:type="spellStart"/>
-      <w:r>
-        <w:t>opcode_</w:t>
-      </w:r>
-      <w:r>
-        <w:t>address</w:t>
-      </w:r>
-      <w:proofErr w:type="spellEnd"/>
-      <w:r>
-        <w:t>&gt; + &lt;opcode&gt; + &lt;operand&gt;</w:t>
+        <w:t xml:space="preserve"> </w:t>
       </w:r>
       <w:r>
         <w:rPr>
@@ -5582,7 +5698,27 @@
           <w:bCs/>
           <w:vertAlign w:val="superscript"/>
         </w:rPr>
+        <w:t>opt</w:t>
+      </w:r>
+      <w:r>
+        <w:t xml:space="preserve"> + &lt;cycle-count&gt;</w:t>
+      </w:r>
+      <w:r>
+        <w:t xml:space="preserve"> +</w:t>
+      </w:r>
+      <w:r>
         <w:t xml:space="preserve"> </w:t>
+      </w:r>
+      <w:r>
+        <w:t>&lt;</w:t>
+      </w:r>
+      <w:proofErr w:type="spellStart"/>
+      <w:r>
+        <w:t>stack_pointer</w:t>
+      </w:r>
+      <w:proofErr w:type="spellEnd"/>
+      <w:r>
+        <w:t>&gt;</w:t>
       </w:r>
       <w:r>
         <w:rPr>
@@ -5593,17 +5729,20 @@
         <w:t>opt</w:t>
       </w:r>
       <w:r>
-        <w:t xml:space="preserve"> + &lt;cycle-count&gt;</w:t>
-      </w:r>
-      <w:r>
-        <w:t xml:space="preserve"> + </w:t>
+        <w:t xml:space="preserve"> </w:t>
+      </w:r>
+      <w:r>
+        <w:t xml:space="preserve">+ </w:t>
       </w:r>
       <w:r>
         <w:t>&lt;</w:t>
       </w:r>
       <w:proofErr w:type="spellStart"/>
       <w:r>
-        <w:t>stack_pointer</w:t>
+        <w:t>stack_</w:t>
+      </w:r>
+      <w:r>
+        <w:t>value</w:t>
       </w:r>
       <w:proofErr w:type="spellEnd"/>
       <w:r>
@@ -5618,14 +5757,17 @@
         <w:t>opt</w:t>
       </w:r>
       <w:r>
-        <w:t xml:space="preserve"> + </w:t>
+        <w:t xml:space="preserve"> </w:t>
+      </w:r>
+      <w:r>
+        <w:t xml:space="preserve">+ </w:t>
       </w:r>
       <w:r>
         <w:t>&lt;</w:t>
       </w:r>
       <w:proofErr w:type="spellStart"/>
       <w:r>
-        <w:t>return_address</w:t>
+        <w:t>destination_address</w:t>
       </w:r>
       <w:proofErr w:type="spellEnd"/>
       <w:r>
@@ -5637,7 +5779,21 @@
           <w:bCs/>
           <w:vertAlign w:val="superscript"/>
         </w:rPr>
-        <w:t xml:space="preserve"> </w:t>
+        <w:t>opt</w:t>
+      </w:r>
+      <w:r>
+        <w:t xml:space="preserve"> + </w:t>
+      </w:r>
+      <w:r>
+        <w:t>&lt;</w:t>
+      </w:r>
+      <w:proofErr w:type="spellStart"/>
+      <w:r>
+        <w:t>memory_address</w:t>
+      </w:r>
+      <w:proofErr w:type="spellEnd"/>
+      <w:r>
+        <w:t>&gt;</w:t>
       </w:r>
       <w:r>
         <w:rPr>
@@ -5645,24 +5801,7 @@
           <w:bCs/>
           <w:vertAlign w:val="superscript"/>
         </w:rPr>
-        <w:t>opt</w:t>
-      </w:r>
-      <w:r>
         <w:t xml:space="preserve"> </w:t>
-      </w:r>
-      <w:r>
-        <w:t xml:space="preserve">+ </w:t>
-      </w:r>
-      <w:r>
-        <w:t>&lt;</w:t>
-      </w:r>
-      <w:proofErr w:type="spellStart"/>
-      <w:r>
-        <w:t>memory_address</w:t>
-      </w:r>
-      <w:proofErr w:type="spellEnd"/>
-      <w:r>
-        <w:t>&gt;</w:t>
       </w:r>
       <w:r>
         <w:rPr>
@@ -5670,7 +5809,24 @@
           <w:bCs/>
           <w:vertAlign w:val="superscript"/>
         </w:rPr>
-        <w:t xml:space="preserve"> </w:t>
+        <w:t>opt</w:t>
+      </w:r>
+      <w:r>
+        <w:t xml:space="preserve"> &lt;</w:t>
+      </w:r>
+      <w:proofErr w:type="spellStart"/>
+      <w:r>
+        <w:t>memory</w:t>
+      </w:r>
+      <w:r>
+        <w:t>_read</w:t>
+      </w:r>
+      <w:r>
+        <w:t>_value</w:t>
+      </w:r>
+      <w:proofErr w:type="spellEnd"/>
+      <w:r>
+        <w:t>&gt;</w:t>
       </w:r>
       <w:r>
         <w:rPr>
@@ -5681,29 +5837,23 @@
         <w:t>opt</w:t>
       </w:r>
       <w:r>
-        <w:t xml:space="preserve"> &lt;</w:t>
-      </w:r>
-      <w:proofErr w:type="spellStart"/>
-      <w:r>
-        <w:t>memory</w:t>
-      </w:r>
-      <w:r>
-        <w:t>_read</w:t>
-      </w:r>
-      <w:r>
-        <w:t>_value</w:t>
-      </w:r>
-      <w:proofErr w:type="spellEnd"/>
-      <w:r>
-        <w:t>&gt;</w:t>
-      </w:r>
-      <w:r>
         <w:rPr>
           <w:b/>
           <w:bCs/>
           <w:vertAlign w:val="superscript"/>
         </w:rPr>
-        <w:t>opt</w:t>
+        <w:t xml:space="preserve"> </w:t>
+      </w:r>
+      <w:r>
+        <w:t>+ &lt;</w:t>
+      </w:r>
+      <w:proofErr w:type="spellStart"/>
+      <w:r>
+        <w:t>memory_write_value</w:t>
+      </w:r>
+      <w:proofErr w:type="spellEnd"/>
+      <w:r>
+        <w:t>&gt;</w:t>
       </w:r>
       <w:r>
         <w:rPr>
@@ -5711,26 +5861,16 @@
           <w:bCs/>
           <w:vertAlign w:val="superscript"/>
         </w:rPr>
+        <w:t>opt</w:t>
+      </w:r>
+      <w:r>
         <w:t xml:space="preserve"> </w:t>
       </w:r>
       <w:r>
-        <w:t>+ &lt;</w:t>
-      </w:r>
-      <w:proofErr w:type="spellStart"/>
-      <w:r>
-        <w:t>memory_write_value</w:t>
-      </w:r>
-      <w:proofErr w:type="spellEnd"/>
-      <w:r>
-        <w:t>&gt;</w:t>
-      </w:r>
-      <w:r>
-        <w:rPr>
-          <w:b/>
-          <w:bCs/>
-          <w:vertAlign w:val="superscript"/>
-        </w:rPr>
-        <w:t>opt</w:t>
+        <w:t>+</w:t>
+      </w:r>
+      <w:r>
+        <w:t xml:space="preserve"> </w:t>
       </w:r>
     </w:p>
     <w:p>
@@ -6272,6 +6412,7 @@
         <w:ind w:left="720"/>
       </w:pPr>
       <w:r>
+        <w:lastRenderedPageBreak/>
         <w:t xml:space="preserve">The following </w:t>
       </w:r>
       <w:r>
@@ -6316,7 +6457,6 @@
           <w:noProof/>
           <w:color w:val="BF4E14" w:themeColor="accent2" w:themeShade="BF"/>
         </w:rPr>
-        <w:lastRenderedPageBreak/>
         <w:t xml:space="preserve"># </w:t>
       </w:r>
       <w:r>
@@ -6845,7 +6985,15 @@
         <w:t>’s</w:t>
       </w:r>
       <w:r>
-        <w:t xml:space="preserve"> opcode, per </w:t>
+        <w:t xml:space="preserve"> </w:t>
+      </w:r>
+      <w:proofErr w:type="gramStart"/>
+      <w:r>
+        <w:t>opcode</w:t>
+      </w:r>
+      <w:proofErr w:type="gramEnd"/>
+      <w:r>
+        <w:t xml:space="preserve">, per </w:t>
       </w:r>
       <w:r>
         <w:t xml:space="preserve">the </w:t>
@@ -6877,10 +7025,6 @@
     <w:p>
       <w:pPr>
         <w:ind w:left="720"/>
-        <w:rPr>
-          <w:rFonts w:ascii="Aptos" w:hAnsi="Aptos"/>
-          <w:color w:val="000000"/>
-        </w:rPr>
       </w:pPr>
       <w:r>
         <w:t>&lt;</w:t>
@@ -6891,109 +7035,305 @@
       </w:r>
       <w:proofErr w:type="spellEnd"/>
       <w:r>
-        <w:t xml:space="preserve">&gt; (1 byte) Populated for </w:t>
-      </w:r>
-      <w:r>
-        <w:t xml:space="preserve">opcodes </w:t>
-      </w:r>
-      <w:r>
-        <w:t>that modify the stack pointer</w:t>
-      </w:r>
-      <w:r>
-        <w:t xml:space="preserve"> (e.g. JSR, RT</w:t>
-      </w:r>
-      <w:r>
-        <w:t xml:space="preserve">S, </w:t>
-      </w:r>
-      <w:r>
-        <w:t xml:space="preserve">RTI, </w:t>
-      </w:r>
-      <w:r>
-        <w:t>PHA, etc</w:t>
-      </w:r>
-      <w:r>
-        <w:t>.</w:t>
-      </w:r>
-      <w:r>
-        <w:t>)</w:t>
-      </w:r>
-      <w:r>
-        <w:t>.</w:t>
-      </w:r>
-      <w:r>
-        <w:t xml:space="preserve"> </w:t>
-      </w:r>
-      <w:r>
-        <w:t xml:space="preserve"> </w:t>
-      </w:r>
-      <w:r>
-        <w:t xml:space="preserve">Contains the value of the stack pointer </w:t>
-      </w:r>
-      <w:r>
-        <w:t xml:space="preserve">after the </w:t>
-      </w:r>
-      <w:r>
-        <w:t xml:space="preserve">instruction </w:t>
-      </w:r>
-      <w:r>
-        <w:t xml:space="preserve">was </w:t>
-      </w:r>
-      <w:r>
-        <w:t>execut</w:t>
-      </w:r>
-      <w:r>
-        <w:t>ed</w:t>
-      </w:r>
-      <w:r>
-        <w:t>.</w:t>
-      </w:r>
-    </w:p>
-    <w:p>
-      <w:pPr>
-        <w:ind w:left="720"/>
-      </w:pPr>
-      <w:r>
-        <w:t>&lt;</w:t>
-      </w:r>
-      <w:proofErr w:type="spellStart"/>
-      <w:r>
-        <w:t>return_address</w:t>
-      </w:r>
-      <w:proofErr w:type="spellEnd"/>
-      <w:r>
-        <w:t xml:space="preserve">&gt; (2 bytes) Populated for the </w:t>
+        <w:t xml:space="preserve">&gt; (1byte) Populated for </w:t>
+      </w:r>
+      <w:r>
+        <w:t xml:space="preserve">the </w:t>
       </w:r>
       <w:r>
         <w:rPr>
           <w:b/>
           <w:bCs/>
         </w:rPr>
-        <w:t>RTS</w:t>
-      </w:r>
-      <w:r>
-        <w:t xml:space="preserve"> and </w:t>
+        <w:t>TXS</w:t>
+      </w:r>
+      <w:r>
+        <w:t xml:space="preserve">, </w:t>
       </w:r>
       <w:r>
         <w:rPr>
           <w:b/>
           <w:bCs/>
         </w:rPr>
-        <w:t>RTI</w:t>
+        <w:t>TSX</w:t>
+      </w:r>
+      <w:r>
+        <w:t xml:space="preserve">, and </w:t>
+      </w:r>
+      <w:r>
+        <w:rPr>
+          <w:b/>
+          <w:bCs/>
+        </w:rPr>
+        <w:t>TA</w:t>
+      </w:r>
+      <w:r>
+        <w:rPr>
+          <w:b/>
+          <w:bCs/>
+        </w:rPr>
+        <w:t>S</w:t>
+      </w:r>
+      <w:r>
+        <w:rPr>
+          <w:vertAlign w:val="superscript"/>
+        </w:rPr>
+        <w:t>6502</w:t>
       </w:r>
       <w:r>
         <w:t xml:space="preserve"> </w:t>
       </w:r>
       <w:r>
-        <w:t>instruction</w:t>
-      </w:r>
-      <w:r>
-        <w:t xml:space="preserve"> with the value</w:t>
+        <w:t xml:space="preserve">instructions </w:t>
+      </w:r>
+      <w:r>
+        <w:t xml:space="preserve">which </w:t>
+      </w:r>
+      <w:r>
+        <w:t xml:space="preserve">explicitly </w:t>
+      </w:r>
+      <w:r>
+        <w:t xml:space="preserve">get or </w:t>
+      </w:r>
+      <w:r>
+        <w:t xml:space="preserve">set </w:t>
+      </w:r>
+      <w:r>
+        <w:t xml:space="preserve">the </w:t>
+      </w:r>
+      <w:r>
+        <w:t>stack</w:t>
+      </w:r>
+      <w:r>
+        <w:t xml:space="preserve"> pointer</w:t>
+      </w:r>
+      <w:r>
+        <w:t>.</w:t>
+      </w:r>
+    </w:p>
+    <w:p>
+      <w:pPr>
+        <w:ind w:left="720"/>
+      </w:pPr>
+      <w:r>
+        <w:t>&lt;</w:t>
+      </w:r>
+      <w:proofErr w:type="spellStart"/>
+      <w:r>
+        <w:t>stack_value</w:t>
+      </w:r>
+      <w:proofErr w:type="spellEnd"/>
+      <w:r>
+        <w:t>&gt; (1</w:t>
+      </w:r>
+      <w:r>
+        <w:t xml:space="preserve"> byte</w:t>
+      </w:r>
+      <w:r>
+        <w:t>)</w:t>
+      </w:r>
+      <w:r>
+        <w:t xml:space="preserve"> Populated for </w:t>
+      </w:r>
+      <w:r>
+        <w:t xml:space="preserve">the following instructions: </w:t>
+      </w:r>
+      <w:r>
+        <w:rPr>
+          <w:b/>
+          <w:bCs/>
+        </w:rPr>
+        <w:t>PHA</w:t>
+      </w:r>
+      <w:r>
+        <w:t xml:space="preserve">, </w:t>
+      </w:r>
+      <w:r>
+        <w:rPr>
+          <w:b/>
+          <w:bCs/>
+        </w:rPr>
+        <w:t>PLA</w:t>
+      </w:r>
+      <w:r>
+        <w:t xml:space="preserve">, </w:t>
+      </w:r>
+      <w:r>
+        <w:rPr>
+          <w:b/>
+          <w:bCs/>
+        </w:rPr>
+        <w:t>PHX</w:t>
+      </w:r>
+      <w:r>
+        <w:rPr>
+          <w:b/>
+          <w:bCs/>
+          <w:vertAlign w:val="superscript"/>
+        </w:rPr>
+        <w:t>65C02</w:t>
+      </w:r>
+      <w:r>
+        <w:t xml:space="preserve">, </w:t>
+      </w:r>
+      <w:r>
+        <w:rPr>
+          <w:b/>
+          <w:bCs/>
+        </w:rPr>
+        <w:t>PLX</w:t>
+      </w:r>
+      <w:r>
+        <w:rPr>
+          <w:b/>
+          <w:bCs/>
+          <w:vertAlign w:val="superscript"/>
+        </w:rPr>
+        <w:t>65C02</w:t>
+      </w:r>
+      <w:r>
+        <w:t xml:space="preserve">, </w:t>
+      </w:r>
+      <w:r>
+        <w:rPr>
+          <w:b/>
+          <w:bCs/>
+        </w:rPr>
+        <w:t>PHY</w:t>
+      </w:r>
+      <w:r>
+        <w:rPr>
+          <w:b/>
+          <w:bCs/>
+          <w:vertAlign w:val="superscript"/>
+        </w:rPr>
+        <w:t>65C02</w:t>
+      </w:r>
+      <w:r>
+        <w:t xml:space="preserve">, </w:t>
+      </w:r>
+      <w:r>
+        <w:rPr>
+          <w:b/>
+          <w:bCs/>
+        </w:rPr>
+        <w:t>PLY</w:t>
+      </w:r>
+      <w:r>
+        <w:rPr>
+          <w:b/>
+          <w:bCs/>
+          <w:vertAlign w:val="superscript"/>
+        </w:rPr>
+        <w:t>65C02</w:t>
+      </w:r>
+      <w:r>
+        <w:t>.</w:t>
+      </w:r>
+    </w:p>
+    <w:p>
+      <w:pPr>
+        <w:ind w:left="720"/>
+      </w:pPr>
+      <w:r>
+        <w:t>&lt;</w:t>
+      </w:r>
+      <w:proofErr w:type="spellStart"/>
+      <w:r>
+        <w:t>destination_address</w:t>
+      </w:r>
+      <w:proofErr w:type="spellEnd"/>
+      <w:r>
+        <w:t xml:space="preserve">&gt; (2 bytes) Populated for the </w:t>
+      </w:r>
+      <w:r>
+        <w:rPr>
+          <w:b/>
+          <w:bCs/>
+        </w:rPr>
+        <w:t>RTI, RTS,</w:t>
       </w:r>
       <w:r>
         <w:t xml:space="preserve"> </w:t>
       </w:r>
       <w:r>
-        <w:t>of the return address.</w:t>
+        <w:rPr>
+          <w:b/>
+          <w:bCs/>
+        </w:rPr>
+        <w:t>BRK</w:t>
+      </w:r>
+      <w:r>
+        <w:t xml:space="preserve">, </w:t>
+      </w:r>
+      <w:r>
+        <w:rPr>
+          <w:b/>
+          <w:bCs/>
+        </w:rPr>
+        <w:t>JMP</w:t>
+      </w:r>
+      <w:r>
+        <w:t xml:space="preserve"> </w:t>
+      </w:r>
+      <w:r>
+        <w:rPr>
+          <w:b/>
+          <w:bCs/>
+        </w:rPr>
+        <w:t>(</w:t>
+      </w:r>
+      <w:r>
+        <w:rPr>
+          <w:b/>
+          <w:bCs/>
+          <w:i/>
+          <w:iCs/>
+        </w:rPr>
+        <w:t>abs</w:t>
+      </w:r>
+      <w:r>
+        <w:rPr>
+          <w:b/>
+          <w:bCs/>
+        </w:rPr>
+        <w:t>)</w:t>
+      </w:r>
+      <w:r>
+        <w:rPr>
+          <w:b/>
+          <w:bCs/>
+        </w:rPr>
+        <w:t>,</w:t>
+      </w:r>
+      <w:r>
+        <w:t xml:space="preserve"> and </w:t>
+      </w:r>
+      <w:r>
+        <w:rPr>
+          <w:b/>
+          <w:bCs/>
+        </w:rPr>
+        <w:t>JMP (</w:t>
+      </w:r>
+      <w:r>
+        <w:rPr>
+          <w:b/>
+          <w:bCs/>
+          <w:i/>
+          <w:iCs/>
+        </w:rPr>
+        <w:t>abs</w:t>
+      </w:r>
+      <w:r>
+        <w:rPr>
+          <w:b/>
+          <w:bCs/>
+        </w:rPr>
+        <w:t xml:space="preserve">, X) </w:t>
+      </w:r>
+      <w:r>
+        <w:t>instructions, with the address of the resolved destination address.</w:t>
       </w:r>
     </w:p>
     <w:p>
@@ -7009,7 +7349,31 @@
       </w:r>
       <w:proofErr w:type="spellEnd"/>
       <w:r>
-        <w:t>&gt; (2 bytes) Populated for all opcodes that use the following addressing modes:</w:t>
+        <w:t>&gt; (2 bytes) Populated for all opcodes</w:t>
+      </w:r>
+      <w:r>
+        <w:t xml:space="preserve"> </w:t>
+      </w:r>
+      <w:r>
+        <w:t xml:space="preserve">that </w:t>
+      </w:r>
+      <w:r>
+        <w:t>read or write to</w:t>
+      </w:r>
+      <w:r>
+        <w:t xml:space="preserve"> memory </w:t>
+      </w:r>
+      <w:r>
+        <w:t>us</w:t>
+      </w:r>
+      <w:r>
+        <w:t>ing</w:t>
+      </w:r>
+      <w:r>
+        <w:t xml:space="preserve"> the following addressing modes</w:t>
+      </w:r>
+      <w:r>
+        <w:t>:</w:t>
       </w:r>
     </w:p>
     <w:p>
@@ -7061,6 +7425,7 @@
         <w:ind w:left="1440"/>
       </w:pPr>
       <w:r>
+        <w:lastRenderedPageBreak/>
         <w:t>Absolute, Y</w:t>
       </w:r>
     </w:p>
@@ -7115,7 +7480,6 @@
         <w:ind w:left="1440"/>
       </w:pPr>
       <w:r>
-        <w:lastRenderedPageBreak/>
         <w:t>(A</w:t>
       </w:r>
       <w:r>
@@ -7349,16 +7713,11 @@
       <w:r>
         <w:t>attempted to be written</w:t>
       </w:r>
-      <w:proofErr w:type="gramStart"/>
       <w:r>
         <w:t>.</w:t>
       </w:r>
       <w:r>
-        <w:t xml:space="preserve"> </w:t>
-      </w:r>
-      <w:proofErr w:type="gramEnd"/>
-      <w:r>
-        <w:t xml:space="preserve">This includes instructions like </w:t>
+        <w:t xml:space="preserve"> This includes instructions like </w:t>
       </w:r>
       <w:r>
         <w:t>AS</w:t>
@@ -7839,6 +8198,7 @@
     </w:p>
     <w:p>
       <w:r>
+        <w:lastRenderedPageBreak/>
         <w:t>Any errors that occur</w:t>
       </w:r>
       <w:r>
@@ -7890,7 +8250,6 @@
         <w:t xml:space="preserve">.  </w:t>
       </w:r>
       <w:r>
-        <w:lastRenderedPageBreak/>
         <w:t>In practice, the latter should not happen</w:t>
       </w:r>
       <w:r>
@@ -9124,7 +9483,15 @@
         <w:t xml:space="preserve">The </w:t>
       </w:r>
       <w:r>
-        <w:t>settings dialog allows a number of display options to be set, including the default font scaling, theme (light or dark mode), and code formatting and color options.</w:t>
+        <w:t xml:space="preserve">settings dialog allows </w:t>
+      </w:r>
+      <w:proofErr w:type="gramStart"/>
+      <w:r>
+        <w:t>a number of</w:t>
+      </w:r>
+      <w:proofErr w:type="gramEnd"/>
+      <w:r>
+        <w:t xml:space="preserve"> display options to be set, including the default font scaling, theme (light or dark mode), and code formatting and color options.</w:t>
       </w:r>
     </w:p>
     <w:p>
@@ -10052,15 +10419,7 @@
         <w:t xml:space="preserve"> – represents a</w:t>
       </w:r>
       <w:r>
-        <w:t xml:space="preserve"> call stack within the recorded program</w:t>
-      </w:r>
-      <w:proofErr w:type="gramStart"/>
-      <w:r>
-        <w:t xml:space="preserve">. </w:t>
-      </w:r>
-      <w:proofErr w:type="gramEnd"/>
-      <w:r>
-        <w:t>Contains the following fields:</w:t>
+        <w:t xml:space="preserve"> call stack within the recorded program. Contains the following fields:</w:t>
       </w:r>
     </w:p>
     <w:p>
@@ -10854,8 +11213,13 @@
       <w:r>
         <w:t xml:space="preserve"> is </w:t>
       </w:r>
-      <w:r>
-        <w:t xml:space="preserve">by definition a </w:t>
+      <w:proofErr w:type="gramStart"/>
+      <w:r>
+        <w:t>by definition a</w:t>
+      </w:r>
+      <w:proofErr w:type="gramEnd"/>
+      <w:r>
+        <w:t xml:space="preserve"> </w:t>
       </w:r>
       <w:r>
         <w:t>routine.</w:t>
@@ -10884,11 +11248,16 @@
       <w:r>
         <w:t xml:space="preserve">is </w:t>
       </w:r>
+      <w:proofErr w:type="gramStart"/>
       <w:r>
         <w:t xml:space="preserve">by definition </w:t>
       </w:r>
       <w:r>
-        <w:t>a routine.</w:t>
+        <w:t>a</w:t>
+      </w:r>
+      <w:proofErr w:type="gramEnd"/>
+      <w:r>
+        <w:t xml:space="preserve"> routine.</w:t>
       </w:r>
       <w:r>
         <w:t xml:space="preserve"> </w:t>
@@ -12437,7 +12806,15 @@
         <w:t xml:space="preserve">before or after the </w:t>
       </w:r>
       <w:r>
-        <w:t>screen display memory read, we need to</w:t>
+        <w:t xml:space="preserve">screen display memory </w:t>
+      </w:r>
+      <w:proofErr w:type="gramStart"/>
+      <w:r>
+        <w:t>read</w:t>
+      </w:r>
+      <w:proofErr w:type="gramEnd"/>
+      <w:r>
+        <w:t>, we need to</w:t>
       </w:r>
       <w:r>
         <w:t xml:space="preserve"> know</w:t>
@@ -12648,15 +13025,7 @@
         </w:numPr>
       </w:pPr>
       <w:r>
-        <w:t>A spin loop is a tight look that doesn’t write anything, it just reads something</w:t>
-      </w:r>
-      <w:proofErr w:type="gramStart"/>
-      <w:r>
-        <w:t xml:space="preserve">. </w:t>
-      </w:r>
-      <w:proofErr w:type="gramEnd"/>
-      <w:r>
-        <w:t>They are shown in light grey (background is white).</w:t>
+        <w:t>A spin loop is a tight look that doesn’t write anything, it just reads something. They are shown in light grey (background is white).</w:t>
       </w:r>
       <w:r>
         <w:t xml:space="preserve">  We are looking for a repeated set of non-instructions in the recording.</w:t>
@@ -12671,7 +13040,15 @@
         </w:numPr>
       </w:pPr>
       <w:r>
-        <w:t>Create list of instructions with all interrupts removed.</w:t>
+        <w:t xml:space="preserve">Create list of instructions with all </w:t>
+      </w:r>
+      <w:proofErr w:type="gramStart"/>
+      <w:r>
+        <w:t>interrupts</w:t>
+      </w:r>
+      <w:proofErr w:type="gramEnd"/>
+      <w:r>
+        <w:t xml:space="preserve"> removed.</w:t>
       </w:r>
     </w:p>
     <w:p>
@@ -12703,15 +13080,7 @@
         </w:numPr>
       </w:pPr>
       <w:r>
-        <w:t>Detecting when screen memory is being read</w:t>
-      </w:r>
-      <w:proofErr w:type="gramStart"/>
-      <w:r>
-        <w:t xml:space="preserve">. </w:t>
-      </w:r>
-      <w:proofErr w:type="gramEnd"/>
-      <w:r>
-        <w:t>We need to know.</w:t>
+        <w:t>Detecting when screen memory is being read. We need to know.</w:t>
       </w:r>
     </w:p>
     <w:p>
@@ -12755,15 +13124,7 @@
         </w:numPr>
       </w:pPr>
       <w:r>
-        <w:t>The screen wrap-size (how many K)</w:t>
-      </w:r>
-      <w:proofErr w:type="gramStart"/>
-      <w:r>
-        <w:t xml:space="preserve">. </w:t>
-      </w:r>
-      <w:proofErr w:type="gramEnd"/>
-      <w:r>
-        <w:t xml:space="preserve">Write value stored to </w:t>
+        <w:t xml:space="preserve">The screen wrap-size (how many K). Write value stored to </w:t>
       </w:r>
       <w:r>
         <w:t>&amp;FE40</w:t>
@@ -12786,15 +13147,7 @@
       </w:r>
       <w:proofErr w:type="gramEnd"/>
       <w:r>
-        <w:t>-7)</w:t>
-      </w:r>
-      <w:proofErr w:type="gramStart"/>
-      <w:r>
-        <w:t xml:space="preserve">. </w:t>
-      </w:r>
-      <w:proofErr w:type="gramEnd"/>
-      <w:r>
-        <w:t xml:space="preserve">Write values stored at </w:t>
+        <w:t xml:space="preserve">-7). Write values stored at </w:t>
       </w:r>
       <w:r>
         <w:t>&amp;FE20</w:t>
@@ -13411,7 +13764,15 @@
         <w:t xml:space="preserve"> T</w:t>
       </w:r>
       <w:r>
-        <w:t>his is pretty respectable.</w:t>
+        <w:t xml:space="preserve">his is </w:t>
+      </w:r>
+      <w:proofErr w:type="gramStart"/>
+      <w:r>
+        <w:t>pretty respectable</w:t>
+      </w:r>
+      <w:proofErr w:type="gramEnd"/>
+      <w:r>
+        <w:t>.</w:t>
       </w:r>
     </w:p>
     <w:p>
@@ -13505,7 +13866,15 @@
       </w:r>
       <w:proofErr w:type="spellEnd"/>
       <w:r>
-        <w:t xml:space="preserve"> zero-page variables.  In the majority of cases the callback update functions skip work so don’t read these.</w:t>
+        <w:t xml:space="preserve"> zero-page variables.  In </w:t>
+      </w:r>
+      <w:proofErr w:type="gramStart"/>
+      <w:r>
+        <w:t>the majority of</w:t>
+      </w:r>
+      <w:proofErr w:type="gramEnd"/>
+      <w:r>
+        <w:t xml:space="preserve"> cases the callback update functions skip work so don’t read these.</w:t>
       </w:r>
     </w:p>
     <w:p>
@@ -13529,7 +13898,15 @@
         <w:t>more time than expected.</w:t>
       </w:r>
       <w:r>
-        <w:t xml:space="preserve">  Looking deeper, the majority of the time (4.6% of overall time) is spent reading key states.</w:t>
+        <w:t xml:space="preserve">  Looking deeper, </w:t>
+      </w:r>
+      <w:proofErr w:type="gramStart"/>
+      <w:r>
+        <w:t>the majority of</w:t>
+      </w:r>
+      <w:proofErr w:type="gramEnd"/>
+      <w:r>
+        <w:t xml:space="preserve"> the time (4.6% of overall time) is spent reading key states.</w:t>
       </w:r>
     </w:p>
     <w:p>

</xml_diff>

<commit_message>
Fixed bug where ULA palette was not saved with physical color bits inverted.
</commit_message>
<xml_diff>
--- a/docs/Development.docx
+++ b/docs/Development.docx
@@ -3532,7 +3532,18 @@
         <w:t>ent</w:t>
       </w:r>
       <w:r>
-        <w:t>ries.</w:t>
+        <w:t>ries</w:t>
+      </w:r>
+      <w:r>
+        <w:t xml:space="preserve"> where physical colors are </w:t>
+      </w:r>
+      <w:proofErr w:type="spellStart"/>
+      <w:r>
+        <w:t>xor’d</w:t>
+      </w:r>
+      <w:proofErr w:type="spellEnd"/>
+      <w:r>
+        <w:t xml:space="preserve"> with 0x7.</w:t>
       </w:r>
     </w:p>
     <w:p>
@@ -3884,6 +3895,7 @@
               <w:ind w:left="1440" w:hanging="1440"/>
             </w:pPr>
             <w:r>
+              <w:lastRenderedPageBreak/>
               <w:t>&lt;</w:t>
             </w:r>
             <w:proofErr w:type="spellStart"/>
@@ -3963,7 +3975,6 @@
               <w:ind w:left="1440" w:hanging="1440"/>
             </w:pPr>
             <w:r>
-              <w:lastRenderedPageBreak/>
               <w:t>&lt;</w:t>
             </w:r>
             <w:proofErr w:type="spellStart"/>
@@ -5439,15 +5450,7 @@
         <w:t xml:space="preserve">(NMI) </w:t>
       </w:r>
       <w:r>
-        <w:t xml:space="preserve">interrupt events signify that an </w:t>
-      </w:r>
-      <w:proofErr w:type="gramStart"/>
-      <w:r>
-        <w:t>interrupt</w:t>
-      </w:r>
-      <w:proofErr w:type="gramEnd"/>
-      <w:r>
-        <w:t xml:space="preserve"> has occurred.  A </w:t>
+        <w:t xml:space="preserve">interrupt events signify that an interrupt has occurred.  A </w:t>
       </w:r>
       <w:r>
         <w:t xml:space="preserve">begin display event </w:t>
@@ -6985,15 +6988,7 @@
         <w:t>’s</w:t>
       </w:r>
       <w:r>
-        <w:t xml:space="preserve"> </w:t>
-      </w:r>
-      <w:proofErr w:type="gramStart"/>
-      <w:r>
-        <w:t>opcode</w:t>
-      </w:r>
-      <w:proofErr w:type="gramEnd"/>
-      <w:r>
-        <w:t xml:space="preserve">, per </w:t>
+        <w:t xml:space="preserve"> opcode, per </w:t>
       </w:r>
       <w:r>
         <w:t xml:space="preserve">the </w:t>
@@ -8269,6 +8264,185 @@
       <w:r>
         <w:t>Changes to BeebEm were kept to a minimum.</w:t>
       </w:r>
+    </w:p>
+    <w:p>
+      <w:r>
+        <w:t xml:space="preserve">The BeebEm changes are saved as a </w:t>
+      </w:r>
+      <w:r>
+        <w:rPr>
+          <w:b/>
+          <w:bCs/>
+        </w:rPr>
+        <w:t>git</w:t>
+      </w:r>
+      <w:r>
+        <w:t xml:space="preserve"> patch file, </w:t>
+      </w:r>
+      <w:r>
+        <w:t xml:space="preserve">which was </w:t>
+      </w:r>
+      <w:r>
+        <w:t>created using the following git commands:</w:t>
+      </w:r>
+    </w:p>
+    <w:p>
+      <w:pPr>
+        <w:pStyle w:val="NoSpacing"/>
+        <w:shd w:val="clear" w:color="auto" w:fill="0A2F41" w:themeFill="accent1" w:themeFillShade="80"/>
+        <w:ind w:left="90"/>
+        <w:rPr>
+          <w:color w:val="FFFFFF" w:themeColor="background1"/>
+        </w:rPr>
+      </w:pPr>
+      <w:r>
+        <w:rPr>
+          <w:color w:val="FFFFFF" w:themeColor="background1"/>
+        </w:rPr>
+        <w:t xml:space="preserve">    </w:t>
+      </w:r>
+      <w:r>
+        <w:rPr>
+          <w:color w:val="FFFFFF" w:themeColor="background1"/>
+        </w:rPr>
+        <w:t>git add -</w:t>
+      </w:r>
+      <w:proofErr w:type="gramStart"/>
+      <w:r>
+        <w:rPr>
+          <w:color w:val="FFFFFF" w:themeColor="background1"/>
+        </w:rPr>
+        <w:t>N .</w:t>
+      </w:r>
+      <w:proofErr w:type="gramEnd"/>
+      <w:r>
+        <w:rPr>
+          <w:color w:val="FFFFFF" w:themeColor="background1"/>
+        </w:rPr>
+        <w:br/>
+      </w:r>
+      <w:r>
+        <w:rPr>
+          <w:color w:val="FFFFFF" w:themeColor="background1"/>
+        </w:rPr>
+        <w:t xml:space="preserve">    </w:t>
+      </w:r>
+      <w:r>
+        <w:rPr>
+          <w:color w:val="FFFFFF" w:themeColor="background1"/>
+        </w:rPr>
+        <w:t>git diff</w:t>
+      </w:r>
+      <w:r>
+        <w:rPr>
+          <w:color w:val="FFFFFF" w:themeColor="background1"/>
+        </w:rPr>
+        <w:t xml:space="preserve"> &gt; ..\</w:t>
+      </w:r>
+      <w:proofErr w:type="spellStart"/>
+      <w:r>
+        <w:rPr>
+          <w:color w:val="FFFFFF" w:themeColor="background1"/>
+        </w:rPr>
+        <w:t>beebperf</w:t>
+      </w:r>
+      <w:proofErr w:type="spellEnd"/>
+      <w:r>
+        <w:rPr>
+          <w:color w:val="FFFFFF" w:themeColor="background1"/>
+        </w:rPr>
+        <w:t>\</w:t>
+      </w:r>
+      <w:proofErr w:type="spellStart"/>
+      <w:r>
+        <w:rPr>
+          <w:color w:val="FFFFFF" w:themeColor="background1"/>
+        </w:rPr>
+        <w:t>beebem_changelist.diff</w:t>
+      </w:r>
+      <w:proofErr w:type="spellEnd"/>
+    </w:p>
+    <w:p/>
+    <w:p>
+      <w:r>
+        <w:t xml:space="preserve">The </w:t>
+      </w:r>
+      <w:r>
+        <w:t xml:space="preserve">patch can be applied to the </w:t>
+      </w:r>
+      <w:r>
+        <w:t xml:space="preserve">BeebEm </w:t>
+      </w:r>
+      <w:r>
+        <w:t xml:space="preserve">sources using the </w:t>
+      </w:r>
+      <w:r>
+        <w:t>following git command:</w:t>
+      </w:r>
+    </w:p>
+    <w:p>
+      <w:pPr>
+        <w:pStyle w:val="NoSpacing"/>
+        <w:shd w:val="clear" w:color="auto" w:fill="0A2F41" w:themeFill="accent1" w:themeFillShade="80"/>
+        <w:ind w:left="90"/>
+        <w:rPr>
+          <w:color w:val="FFFFFF" w:themeColor="background1"/>
+        </w:rPr>
+      </w:pPr>
+      <w:r>
+        <w:rPr>
+          <w:color w:val="FFFFFF" w:themeColor="background1"/>
+        </w:rPr>
+        <w:t xml:space="preserve">    </w:t>
+      </w:r>
+      <w:proofErr w:type="gramStart"/>
+      <w:r>
+        <w:rPr>
+          <w:color w:val="FFFFFF" w:themeColor="background1"/>
+        </w:rPr>
+        <w:t>git</w:t>
+      </w:r>
+      <w:proofErr w:type="gramEnd"/>
+      <w:r>
+        <w:rPr>
+          <w:color w:val="FFFFFF" w:themeColor="background1"/>
+        </w:rPr>
+        <w:t xml:space="preserve"> </w:t>
+      </w:r>
+      <w:r>
+        <w:rPr>
+          <w:color w:val="FFFFFF" w:themeColor="background1"/>
+        </w:rPr>
+        <w:t xml:space="preserve">apply </w:t>
+      </w:r>
+      <w:r>
+        <w:rPr>
+          <w:color w:val="FFFFFF" w:themeColor="background1"/>
+        </w:rPr>
+        <w:t>..\</w:t>
+      </w:r>
+      <w:proofErr w:type="spellStart"/>
+      <w:r>
+        <w:rPr>
+          <w:color w:val="FFFFFF" w:themeColor="background1"/>
+        </w:rPr>
+        <w:t>beebperf</w:t>
+      </w:r>
+      <w:proofErr w:type="spellEnd"/>
+      <w:r>
+        <w:rPr>
+          <w:color w:val="FFFFFF" w:themeColor="background1"/>
+        </w:rPr>
+        <w:t>\</w:t>
+      </w:r>
+      <w:proofErr w:type="spellStart"/>
+      <w:r>
+        <w:rPr>
+          <w:color w:val="FFFFFF" w:themeColor="background1"/>
+        </w:rPr>
+        <w:t>beebem_changelist.diff</w:t>
+      </w:r>
+      <w:proofErr w:type="spellEnd"/>
     </w:p>
     <w:p>
       <w:pPr>
@@ -9483,15 +9657,7 @@
         <w:t xml:space="preserve">The </w:t>
       </w:r>
       <w:r>
-        <w:t xml:space="preserve">settings dialog allows </w:t>
-      </w:r>
-      <w:proofErr w:type="gramStart"/>
-      <w:r>
-        <w:t>a number of</w:t>
-      </w:r>
-      <w:proofErr w:type="gramEnd"/>
-      <w:r>
-        <w:t xml:space="preserve"> display options to be set, including the default font scaling, theme (light or dark mode), and code formatting and color options.</w:t>
+        <w:t>settings dialog allows a number of display options to be set, including the default font scaling, theme (light or dark mode), and code formatting and color options.</w:t>
       </w:r>
     </w:p>
     <w:p>
@@ -11213,13 +11379,8 @@
       <w:r>
         <w:t xml:space="preserve"> is </w:t>
       </w:r>
-      <w:proofErr w:type="gramStart"/>
-      <w:r>
-        <w:t>by definition a</w:t>
-      </w:r>
-      <w:proofErr w:type="gramEnd"/>
-      <w:r>
-        <w:t xml:space="preserve"> </w:t>
+      <w:r>
+        <w:t xml:space="preserve">by definition a </w:t>
       </w:r>
       <w:r>
         <w:t>routine.</w:t>
@@ -11248,16 +11409,11 @@
       <w:r>
         <w:t xml:space="preserve">is </w:t>
       </w:r>
-      <w:proofErr w:type="gramStart"/>
       <w:r>
         <w:t xml:space="preserve">by definition </w:t>
       </w:r>
       <w:r>
-        <w:t>a</w:t>
-      </w:r>
-      <w:proofErr w:type="gramEnd"/>
-      <w:r>
-        <w:t xml:space="preserve"> routine.</w:t>
+        <w:t>a routine.</w:t>
       </w:r>
       <w:r>
         <w:t xml:space="preserve"> </w:t>
@@ -12806,15 +12962,7 @@
         <w:t xml:space="preserve">before or after the </w:t>
       </w:r>
       <w:r>
-        <w:t xml:space="preserve">screen display memory </w:t>
-      </w:r>
-      <w:proofErr w:type="gramStart"/>
-      <w:r>
-        <w:t>read</w:t>
-      </w:r>
-      <w:proofErr w:type="gramEnd"/>
-      <w:r>
-        <w:t>, we need to</w:t>
+        <w:t>screen display memory read, we need to</w:t>
       </w:r>
       <w:r>
         <w:t xml:space="preserve"> know</w:t>
@@ -13040,15 +13188,7 @@
         </w:numPr>
       </w:pPr>
       <w:r>
-        <w:t xml:space="preserve">Create list of instructions with all </w:t>
-      </w:r>
-      <w:proofErr w:type="gramStart"/>
-      <w:r>
-        <w:t>interrupts</w:t>
-      </w:r>
-      <w:proofErr w:type="gramEnd"/>
-      <w:r>
-        <w:t xml:space="preserve"> removed.</w:t>
+        <w:t>Create list of instructions with all interrupts removed.</w:t>
       </w:r>
     </w:p>
     <w:p>
@@ -13147,7 +13287,15 @@
       </w:r>
       <w:proofErr w:type="gramEnd"/>
       <w:r>
-        <w:t xml:space="preserve">-7). Write values stored at </w:t>
+        <w:t>-7)</w:t>
+      </w:r>
+      <w:proofErr w:type="gramStart"/>
+      <w:r>
+        <w:t xml:space="preserve">. </w:t>
+      </w:r>
+      <w:proofErr w:type="gramEnd"/>
+      <w:r>
+        <w:t xml:space="preserve">Write values stored at </w:t>
       </w:r>
       <w:r>
         <w:t>&amp;FE20</w:t>
@@ -13764,15 +13912,7 @@
         <w:t xml:space="preserve"> T</w:t>
       </w:r>
       <w:r>
-        <w:t xml:space="preserve">his is </w:t>
-      </w:r>
-      <w:proofErr w:type="gramStart"/>
-      <w:r>
-        <w:t>pretty respectable</w:t>
-      </w:r>
-      <w:proofErr w:type="gramEnd"/>
-      <w:r>
-        <w:t>.</w:t>
+        <w:t>his is pretty respectable.</w:t>
       </w:r>
     </w:p>
     <w:p>
@@ -13866,15 +14006,7 @@
       </w:r>
       <w:proofErr w:type="spellEnd"/>
       <w:r>
-        <w:t xml:space="preserve"> zero-page variables.  In </w:t>
-      </w:r>
-      <w:proofErr w:type="gramStart"/>
-      <w:r>
-        <w:t>the majority of</w:t>
-      </w:r>
-      <w:proofErr w:type="gramEnd"/>
-      <w:r>
-        <w:t xml:space="preserve"> cases the callback update functions skip work so don’t read these.</w:t>
+        <w:t xml:space="preserve"> zero-page variables.  In the majority of cases the callback update functions skip work so don’t read these.</w:t>
       </w:r>
     </w:p>
     <w:p>
@@ -13898,15 +14030,7 @@
         <w:t>more time than expected.</w:t>
       </w:r>
       <w:r>
-        <w:t xml:space="preserve">  Looking deeper, </w:t>
-      </w:r>
-      <w:proofErr w:type="gramStart"/>
-      <w:r>
-        <w:t>the majority of</w:t>
-      </w:r>
-      <w:proofErr w:type="gramEnd"/>
-      <w:r>
-        <w:t xml:space="preserve"> the time (4.6% of overall time) is spent reading key states.</w:t>
+        <w:t xml:space="preserve">  Looking deeper, the majority of the time (4.6% of overall time) is spent reading key states.</w:t>
       </w:r>
     </w:p>
     <w:p>
@@ -19390,6 +19514,7 @@
   <w:style w:type="character" w:default="1" w:styleId="DefaultParagraphFont">
     <w:name w:val="Default Paragraph Font"/>
     <w:uiPriority w:val="1"/>
+    <w:semiHidden/>
     <w:unhideWhenUsed/>
   </w:style>
   <w:style w:type="table" w:default="1" w:styleId="TableNormal">

</xml_diff>

<commit_message>
Refactored IdentifyRoutines(), renames, and bug fixes
</commit_message>
<xml_diff>
--- a/docs/Development.docx
+++ b/docs/Development.docx
@@ -142,7 +142,10 @@
         <w:t xml:space="preserve">also </w:t>
       </w:r>
       <w:r>
-        <w:t>like a profiler to do</w:t>
+        <w:t>like</w:t>
+      </w:r>
+      <w:r>
+        <w:t xml:space="preserve"> to do</w:t>
       </w:r>
       <w:r>
         <w:t>.</w:t>
@@ -150,7 +153,13 @@
     </w:p>
     <w:p>
       <w:r>
-        <w:t xml:space="preserve">Firstly, I’d love to understand </w:t>
+        <w:t xml:space="preserve">Firstly, </w:t>
+      </w:r>
+      <w:r>
+        <w:t>I would</w:t>
+      </w:r>
+      <w:r>
+        <w:t xml:space="preserve"> love to understand </w:t>
       </w:r>
       <w:r>
         <w:t>memory usage better</w:t>
@@ -174,7 +183,13 @@
         <w:t xml:space="preserve"> variables,</w:t>
       </w:r>
       <w:r>
-        <w:t xml:space="preserve"> I’d also like to identify </w:t>
+        <w:t xml:space="preserve"> I</w:t>
+      </w:r>
+      <w:r>
+        <w:t xml:space="preserve"> wouuld</w:t>
+      </w:r>
+      <w:r>
+        <w:t xml:space="preserve"> also like to identify </w:t>
       </w:r>
       <w:r>
         <w:t xml:space="preserve">zero-page variables </w:t>
@@ -580,7 +595,13 @@
         <w:t>s</w:t>
       </w:r>
       <w:r>
-        <w:t xml:space="preserve"> machines which don’t leverage the tube</w:t>
+        <w:t xml:space="preserve"> machines which </w:t>
+      </w:r>
+      <w:r>
+        <w:t>do not</w:t>
+      </w:r>
+      <w:r>
+        <w:t xml:space="preserve"> leverage the tube</w:t>
       </w:r>
       <w:r>
         <w:t>.</w:t>
@@ -805,7 +826,10 @@
         </w:numPr>
       </w:pPr>
       <w:r>
-        <w:t>Maximizing the genericness of the captured information, allowing the format to be used for other purposes.</w:t>
+        <w:t>Maximizing the genericness of the captured information, allowing the format to be used for purposes</w:t>
+      </w:r>
+      <w:r>
+        <w:t xml:space="preserve"> other than profiling.</w:t>
       </w:r>
     </w:p>
     <w:p>
@@ -909,387 +933,387 @@
         <w:t xml:space="preserve">key events </w:t>
       </w:r>
       <w:r>
-        <w:t>(</w:t>
-      </w:r>
-      <w:r>
-        <w:t xml:space="preserve">e.g. </w:t>
+        <w:t xml:space="preserve">like </w:t>
       </w:r>
       <w:r>
         <w:t xml:space="preserve">interrupts and </w:t>
       </w:r>
       <w:r>
-        <w:t xml:space="preserve">screen memory </w:t>
-      </w:r>
-      <w:r>
-        <w:t>read</w:t>
+        <w:t xml:space="preserve">begin </w:t>
+      </w:r>
+      <w:r>
+        <w:t xml:space="preserve">screen </w:t>
+      </w:r>
+      <w:r>
+        <w:t>display</w:t>
+      </w:r>
+      <w:r>
+        <w:t>.</w:t>
+      </w:r>
+      <w:r>
+        <w:t xml:space="preserve">  </w:t>
+      </w:r>
+      <w:r>
+        <w:t xml:space="preserve">It also </w:t>
+      </w:r>
+      <w:r>
+        <w:t>optionally contain</w:t>
       </w:r>
       <w:r>
         <w:t>s</w:t>
       </w:r>
       <w:r>
-        <w:t>)</w:t>
-      </w:r>
-      <w:r>
-        <w:t>.</w:t>
-      </w:r>
-      <w:r>
-        <w:t xml:space="preserve">  </w:t>
-      </w:r>
-      <w:r>
-        <w:t xml:space="preserve">It also </w:t>
-      </w:r>
-      <w:r>
-        <w:t>optionally contain</w:t>
-      </w:r>
-      <w:r>
-        <w:t>s</w:t>
-      </w:r>
-      <w:r>
         <w:t xml:space="preserve"> label/symbol information.</w:t>
       </w:r>
     </w:p>
     <w:p>
       <w:r>
-        <w:t xml:space="preserve">The </w:t>
-      </w:r>
-      <w:r>
-        <w:t xml:space="preserve">file </w:t>
-      </w:r>
-      <w:r>
-        <w:t xml:space="preserve">format </w:t>
-      </w:r>
-      <w:r>
-        <w:t xml:space="preserve">has a </w:t>
-      </w:r>
-      <w:r>
-        <w:t>chunk-based</w:t>
-      </w:r>
-      <w:r>
-        <w:t xml:space="preserve"> binary format</w:t>
-      </w:r>
-      <w:r>
-        <w:t>, with the file containing the following chunks</w:t>
-      </w:r>
-      <w:r>
-        <w:t>:</w:t>
-      </w:r>
-    </w:p>
-    <w:p>
-      <w:pPr>
-        <w:ind w:left="720" w:hanging="360"/>
-      </w:pPr>
-      <w:r>
-        <w:rPr>
-          <w:b/>
-          <w:bCs/>
-        </w:rPr>
-        <w:t>&lt;</w:t>
-      </w:r>
-      <w:r>
-        <w:rPr>
-          <w:b/>
-          <w:bCs/>
-        </w:rPr>
-        <w:t>header_</w:t>
-      </w:r>
-      <w:r>
-        <w:rPr>
-          <w:b/>
-          <w:bCs/>
-        </w:rPr>
-        <w:t>chunk</w:t>
-      </w:r>
-      <w:r>
-        <w:rPr>
-          <w:b/>
-          <w:bCs/>
-        </w:rPr>
-        <w:t>&gt;</w:t>
-      </w:r>
-      <w:r>
-        <w:t xml:space="preserve"> + </w:t>
-      </w:r>
-      <w:r>
-        <w:rPr>
-          <w:b/>
-          <w:bCs/>
-        </w:rPr>
-        <w:t>&lt;</w:t>
-      </w:r>
-      <w:r>
-        <w:rPr>
-          <w:b/>
-          <w:bCs/>
-        </w:rPr>
-        <w:t>label</w:t>
-      </w:r>
-      <w:r>
-        <w:rPr>
-          <w:b/>
-          <w:bCs/>
-        </w:rPr>
-        <w:t>s</w:t>
-      </w:r>
-      <w:r>
-        <w:rPr>
-          <w:b/>
-          <w:bCs/>
-        </w:rPr>
-        <w:t>_chunk</w:t>
-      </w:r>
-      <w:r>
-        <w:rPr>
-          <w:b/>
-          <w:bCs/>
-        </w:rPr>
-        <w:t>&gt;</w:t>
-      </w:r>
-      <w:r>
-        <w:rPr>
-          <w:b/>
-          <w:bCs/>
-          <w:vertAlign w:val="superscript"/>
-        </w:rPr>
-        <w:t xml:space="preserve">opt </w:t>
-      </w:r>
-      <w:r>
-        <w:t>+</w:t>
-      </w:r>
-      <w:r>
-        <w:t xml:space="preserve"> </w:t>
-      </w:r>
-      <w:r>
-        <w:rPr>
-          <w:b/>
-          <w:bCs/>
-        </w:rPr>
-        <w:t>&lt;</w:t>
-      </w:r>
-      <w:r>
-        <w:rPr>
-          <w:b/>
-          <w:bCs/>
-        </w:rPr>
-        <w:t>snapshot_chunk&gt;</w:t>
-      </w:r>
-      <w:r>
-        <w:t xml:space="preserve"> +</w:t>
-      </w:r>
-      <w:r>
-        <w:t xml:space="preserve"> </w:t>
-      </w:r>
-      <w:r>
-        <w:rPr>
-          <w:b/>
-          <w:bCs/>
-        </w:rPr>
-        <w:t>&lt;</w:t>
-      </w:r>
-      <w:r>
-        <w:rPr>
-          <w:b/>
-          <w:bCs/>
-        </w:rPr>
-        <w:t>execution_chunk</w:t>
-      </w:r>
-      <w:r>
-        <w:rPr>
-          <w:b/>
-          <w:bCs/>
-        </w:rPr>
-        <w:t>&gt;</w:t>
-      </w:r>
-      <w:r>
-        <w:rPr>
-          <w:b/>
-          <w:bCs/>
-          <w:vertAlign w:val="superscript"/>
-        </w:rPr>
-        <w:t>1+</w:t>
-      </w:r>
-    </w:p>
-    <w:p>
-      <w:r>
-        <w:t xml:space="preserve">Every </w:t>
-      </w:r>
-      <w:r>
-        <w:t xml:space="preserve">chunk </w:t>
-      </w:r>
-      <w:r>
-        <w:t>has</w:t>
-      </w:r>
-      <w:r>
-        <w:t xml:space="preserve"> a common header which</w:t>
-      </w:r>
-      <w:r>
-        <w:t xml:space="preserve"> is proceeded with</w:t>
-      </w:r>
-      <w:r>
-        <w:t xml:space="preserve"> </w:t>
-      </w:r>
-      <w:r>
-        <w:t>its</w:t>
-      </w:r>
-      <w:r>
-        <w:t xml:space="preserve"> </w:t>
-      </w:r>
-      <w:r>
-        <w:t xml:space="preserve">respective </w:t>
-      </w:r>
-      <w:r>
-        <w:t>data</w:t>
-      </w:r>
-      <w:r>
-        <w:t>.</w:t>
-      </w:r>
-      <w:r>
-        <w:t xml:space="preserve">  Different chunk types </w:t>
-      </w:r>
-      <w:r>
-        <w:t>have different data formats</w:t>
-      </w:r>
-      <w:r>
-        <w:t>.</w:t>
-      </w:r>
-    </w:p>
-    <w:p>
-      <w:pPr>
-        <w:shd w:val="clear" w:color="auto" w:fill="FAFAD6"/>
-      </w:pPr>
-      <w:r>
-        <w:t>All scalar values are stored in little-endian format</w:t>
-      </w:r>
-      <w:r>
-        <w:t xml:space="preserve">, </w:t>
-      </w:r>
-      <w:r>
-        <w:t>unless otherwise stated</w:t>
-      </w:r>
-    </w:p>
-    <w:p>
-      <w:pPr>
-        <w:pStyle w:val="Heading2"/>
-      </w:pPr>
-      <w:r>
-        <w:t xml:space="preserve">Common </w:t>
-      </w:r>
-      <w:r>
-        <w:t xml:space="preserve">Header </w:t>
-      </w:r>
-    </w:p>
-    <w:p>
-      <w:pPr>
         <w:rPr>
           <w:rFonts w:ascii="Aptos" w:hAnsi="Aptos"/>
           <w:color w:val="000000"/>
         </w:rPr>
-      </w:pPr>
+        <w:t xml:space="preserve">The file uses a binary chunk-based format with </w:t>
+      </w:r>
       <w:r>
         <w:rPr>
           <w:rFonts w:ascii="Aptos" w:hAnsi="Aptos"/>
           <w:color w:val="000000"/>
         </w:rPr>
-        <w:t xml:space="preserve">Every </w:t>
+        <w:t xml:space="preserve">the following </w:t>
       </w:r>
       <w:r>
         <w:rPr>
           <w:rFonts w:ascii="Aptos" w:hAnsi="Aptos"/>
           <w:color w:val="000000"/>
         </w:rPr>
+        <w:t>chunks:</w:t>
+      </w:r>
+    </w:p>
+    <w:p>
+      <w:pPr>
+        <w:ind w:left="720" w:hanging="360"/>
+      </w:pPr>
+      <w:r>
+        <w:rPr>
+          <w:b/>
+          <w:bCs/>
+        </w:rPr>
+        <w:t>&lt;</w:t>
+      </w:r>
+      <w:r>
+        <w:rPr>
+          <w:b/>
+          <w:bCs/>
+        </w:rPr>
+        <w:t>header_</w:t>
+      </w:r>
+      <w:r>
+        <w:rPr>
+          <w:b/>
+          <w:bCs/>
+        </w:rPr>
         <w:t>chunk</w:t>
       </w:r>
       <w:r>
+        <w:rPr>
+          <w:b/>
+          <w:bCs/>
+        </w:rPr>
+        <w:t>&gt;</w:t>
+      </w:r>
+      <w:r>
+        <w:t xml:space="preserve"> + </w:t>
+      </w:r>
+      <w:r>
+        <w:rPr>
+          <w:b/>
+          <w:bCs/>
+        </w:rPr>
+        <w:t>&lt;</w:t>
+      </w:r>
+      <w:r>
+        <w:rPr>
+          <w:b/>
+          <w:bCs/>
+        </w:rPr>
+        <w:t>label</w:t>
+      </w:r>
+      <w:r>
+        <w:rPr>
+          <w:b/>
+          <w:bCs/>
+        </w:rPr>
+        <w:t>s</w:t>
+      </w:r>
+      <w:r>
+        <w:rPr>
+          <w:b/>
+          <w:bCs/>
+        </w:rPr>
+        <w:t>_chunk</w:t>
+      </w:r>
+      <w:r>
+        <w:rPr>
+          <w:b/>
+          <w:bCs/>
+        </w:rPr>
+        <w:t>&gt;</w:t>
+      </w:r>
+      <w:r>
+        <w:rPr>
+          <w:b/>
+          <w:bCs/>
+          <w:vertAlign w:val="superscript"/>
+        </w:rPr>
+        <w:t xml:space="preserve">opt </w:t>
+      </w:r>
+      <w:r>
+        <w:t>+</w:t>
+      </w:r>
+      <w:r>
+        <w:t xml:space="preserve"> </w:t>
+      </w:r>
+      <w:r>
+        <w:rPr>
+          <w:b/>
+          <w:bCs/>
+        </w:rPr>
+        <w:t>&lt;</w:t>
+      </w:r>
+      <w:r>
+        <w:rPr>
+          <w:b/>
+          <w:bCs/>
+        </w:rPr>
+        <w:t>snapshot_chunk&gt;</w:t>
+      </w:r>
+      <w:r>
+        <w:t xml:space="preserve"> +</w:t>
+      </w:r>
+      <w:r>
+        <w:t xml:space="preserve"> </w:t>
+      </w:r>
+      <w:r>
+        <w:rPr>
+          <w:b/>
+          <w:bCs/>
+        </w:rPr>
+        <w:t>&lt;</w:t>
+      </w:r>
+      <w:r>
+        <w:rPr>
+          <w:b/>
+          <w:bCs/>
+        </w:rPr>
+        <w:t>execution_chunk</w:t>
+      </w:r>
+      <w:r>
+        <w:rPr>
+          <w:b/>
+          <w:bCs/>
+        </w:rPr>
+        <w:t>&gt;</w:t>
+      </w:r>
+      <w:r>
+        <w:rPr>
+          <w:b/>
+          <w:bCs/>
+          <w:vertAlign w:val="superscript"/>
+        </w:rPr>
+        <w:t>1+</w:t>
+      </w:r>
+    </w:p>
+    <w:p>
+      <w:r>
+        <w:t xml:space="preserve">Every </w:t>
+      </w:r>
+      <w:r>
+        <w:t xml:space="preserve">chunk </w:t>
+      </w:r>
+      <w:r>
+        <w:t>has</w:t>
+      </w:r>
+      <w:r>
+        <w:t xml:space="preserve"> a common header which</w:t>
+      </w:r>
+      <w:r>
+        <w:t xml:space="preserve"> is proceeded with</w:t>
+      </w:r>
+      <w:r>
+        <w:t xml:space="preserve"> </w:t>
+      </w:r>
+      <w:r>
+        <w:t>its</w:t>
+      </w:r>
+      <w:r>
+        <w:t xml:space="preserve"> </w:t>
+      </w:r>
+      <w:r>
+        <w:t xml:space="preserve">respective </w:t>
+      </w:r>
+      <w:r>
+        <w:t>data</w:t>
+      </w:r>
+      <w:r>
+        <w:t>.</w:t>
+      </w:r>
+      <w:r>
+        <w:t xml:space="preserve">  Different chunk types </w:t>
+      </w:r>
+      <w:r>
+        <w:t>have different data formats</w:t>
+      </w:r>
+      <w:r>
+        <w:t>.</w:t>
+      </w:r>
+    </w:p>
+    <w:p>
+      <w:pPr>
+        <w:shd w:val="clear" w:color="auto" w:fill="FAFAD6"/>
+      </w:pPr>
+      <w:r>
+        <w:t>All scalar values are stored in little-endian format</w:t>
+      </w:r>
+      <w:r>
+        <w:t xml:space="preserve">, </w:t>
+      </w:r>
+      <w:r>
+        <w:t xml:space="preserve">unless </w:t>
+      </w:r>
+      <w:r>
+        <w:t xml:space="preserve">stated </w:t>
+      </w:r>
+      <w:r>
+        <w:t>otherwise</w:t>
+      </w:r>
+      <w:r>
+        <w:t>.</w:t>
+      </w:r>
+    </w:p>
+    <w:p>
+      <w:pPr>
+        <w:pStyle w:val="Heading2"/>
+      </w:pPr>
+      <w:r>
+        <w:t xml:space="preserve">Common </w:t>
+      </w:r>
+      <w:r>
+        <w:t xml:space="preserve">Header </w:t>
+      </w:r>
+    </w:p>
+    <w:p>
+      <w:pPr>
         <w:rPr>
           <w:rFonts w:ascii="Aptos" w:hAnsi="Aptos"/>
           <w:color w:val="000000"/>
         </w:rPr>
-        <w:t xml:space="preserve"> </w:t>
-      </w:r>
+      </w:pPr>
       <w:r>
         <w:rPr>
           <w:rFonts w:ascii="Aptos" w:hAnsi="Aptos"/>
           <w:color w:val="000000"/>
         </w:rPr>
-        <w:t xml:space="preserve">has </w:t>
+        <w:t xml:space="preserve">Every </w:t>
       </w:r>
       <w:r>
         <w:rPr>
           <w:rFonts w:ascii="Aptos" w:hAnsi="Aptos"/>
           <w:color w:val="000000"/>
         </w:rPr>
-        <w:t xml:space="preserve">a </w:t>
+        <w:t>chunk</w:t>
       </w:r>
       <w:r>
         <w:rPr>
           <w:rFonts w:ascii="Aptos" w:hAnsi="Aptos"/>
           <w:color w:val="000000"/>
         </w:rPr>
-        <w:t xml:space="preserve">common </w:t>
+        <w:t xml:space="preserve"> </w:t>
       </w:r>
       <w:r>
         <w:rPr>
           <w:rFonts w:ascii="Aptos" w:hAnsi="Aptos"/>
           <w:color w:val="000000"/>
         </w:rPr>
-        <w:t xml:space="preserve">header </w:t>
+        <w:t xml:space="preserve">has </w:t>
       </w:r>
       <w:r>
         <w:rPr>
           <w:rFonts w:ascii="Aptos" w:hAnsi="Aptos"/>
           <w:color w:val="000000"/>
         </w:rPr>
-        <w:t xml:space="preserve">which </w:t>
+        <w:t xml:space="preserve">a </w:t>
       </w:r>
       <w:r>
         <w:rPr>
           <w:rFonts w:ascii="Aptos" w:hAnsi="Aptos"/>
           <w:color w:val="000000"/>
         </w:rPr>
-        <w:t>contains</w:t>
+        <w:t xml:space="preserve">common </w:t>
       </w:r>
       <w:r>
         <w:rPr>
           <w:rFonts w:ascii="Aptos" w:hAnsi="Aptos"/>
           <w:color w:val="000000"/>
         </w:rPr>
-        <w:t xml:space="preserve"> the </w:t>
+        <w:t xml:space="preserve">header </w:t>
       </w:r>
       <w:r>
         <w:rPr>
           <w:rFonts w:ascii="Aptos" w:hAnsi="Aptos"/>
           <w:color w:val="000000"/>
         </w:rPr>
-        <w:t>chunk</w:t>
+        <w:t xml:space="preserve">which </w:t>
       </w:r>
       <w:r>
         <w:rPr>
           <w:rFonts w:ascii="Aptos" w:hAnsi="Aptos"/>
           <w:color w:val="000000"/>
         </w:rPr>
-        <w:t>’s</w:t>
+        <w:t>contains</w:t>
       </w:r>
       <w:r>
         <w:rPr>
           <w:rFonts w:ascii="Aptos" w:hAnsi="Aptos"/>
           <w:color w:val="000000"/>
         </w:rPr>
-        <w:t xml:space="preserve"> type</w:t>
+        <w:t xml:space="preserve"> the </w:t>
       </w:r>
       <w:r>
         <w:rPr>
           <w:rFonts w:ascii="Aptos" w:hAnsi="Aptos"/>
           <w:color w:val="000000"/>
         </w:rPr>
-        <w:t xml:space="preserve"> and data descriptor.</w:t>
-      </w:r>
-    </w:p>
-    <w:p>
-      <w:pPr>
-        <w:ind w:left="360" w:hanging="360"/>
+        <w:t>chunk</w:t>
+      </w:r>
+      <w:r>
         <w:rPr>
           <w:rFonts w:ascii="Aptos" w:hAnsi="Aptos"/>
           <w:color w:val="000000"/>
         </w:rPr>
+        <w:t>’s</w:t>
+      </w:r>
+      <w:r>
+        <w:rPr>
+          <w:rFonts w:ascii="Aptos" w:hAnsi="Aptos"/>
+          <w:color w:val="000000"/>
+        </w:rPr>
+        <w:t xml:space="preserve"> type</w:t>
+      </w:r>
+      <w:r>
+        <w:rPr>
+          <w:rFonts w:ascii="Aptos" w:hAnsi="Aptos"/>
+          <w:color w:val="000000"/>
+        </w:rPr>
+        <w:t xml:space="preserve"> and data descriptor.</w:t>
+      </w:r>
+    </w:p>
+    <w:p>
+      <w:pPr>
+        <w:ind w:left="360" w:hanging="360"/>
+        <w:rPr>
+          <w:rFonts w:ascii="Aptos" w:hAnsi="Aptos"/>
+          <w:color w:val="000000"/>
+        </w:rPr>
       </w:pPr>
       <w:r>
         <w:rPr>
@@ -1333,7 +1357,6 @@
         <w:ind w:left="360"/>
       </w:pPr>
       <w:r>
-        <w:lastRenderedPageBreak/>
         <w:t>&lt;tag&gt;</w:t>
       </w:r>
       <w:r>
@@ -1358,16 +1381,22 @@
         <w:t>chunk</w:t>
       </w:r>
       <w:r>
-        <w:t xml:space="preserve"> type.</w:t>
+        <w:t xml:space="preserve"> type</w:t>
+      </w:r>
+      <w:r>
+        <w:t xml:space="preserve">. </w:t>
       </w:r>
       <w:r>
         <w:t xml:space="preserve"> </w:t>
       </w:r>
       <w:r>
-        <w:t xml:space="preserve"> </w:t>
-      </w:r>
-      <w:r>
-        <w:t>The following table lists the tags used to identify the different chunks.</w:t>
+        <w:t xml:space="preserve">The following table lists </w:t>
+      </w:r>
+      <w:r>
+        <w:t>these</w:t>
+      </w:r>
+      <w:r>
+        <w:t xml:space="preserve"> the permissible tag values.</w:t>
       </w:r>
     </w:p>
     <w:tbl>
@@ -1404,6 +1433,7 @@
                 <w:b/>
                 <w:bCs/>
               </w:rPr>
+              <w:lastRenderedPageBreak/>
               <w:t>Tag</w:t>
             </w:r>
           </w:p>
@@ -2515,7 +2545,10 @@
         <w:t>instructions</w:t>
       </w:r>
       <w:r>
-        <w:t xml:space="preserve"> and </w:t>
+        <w:t xml:space="preserve"> </w:t>
+      </w:r>
+      <w:r>
+        <w:t xml:space="preserve">plus </w:t>
       </w:r>
       <w:r>
         <w:t>event</w:t>
@@ -2634,7 +2667,17 @@
         <w:ind w:left="360"/>
       </w:pPr>
       <w:r>
-        <w:t xml:space="preserve">&lt;label_data&gt; = </w:t>
+        <w:t>&lt;</w:t>
+      </w:r>
+      <w:r>
+        <w:rPr>
+          <w:b/>
+          <w:bCs/>
+        </w:rPr>
+        <w:t>label_data</w:t>
+      </w:r>
+      <w:r>
+        <w:t xml:space="preserve">&gt; = </w:t>
       </w:r>
       <w:r>
         <w:t xml:space="preserve">list of </w:t>
@@ -2848,7 +2891,17 @@
         <w:ind w:left="720" w:hanging="360"/>
       </w:pPr>
       <w:r>
-        <w:t>&lt;snapshot_data&gt; =</w:t>
+        <w:t>&lt;</w:t>
+      </w:r>
+      <w:r>
+        <w:rPr>
+          <w:b/>
+          <w:bCs/>
+        </w:rPr>
+        <w:t>snapshot_data</w:t>
+      </w:r>
+      <w:r>
+        <w:t>&gt; =</w:t>
       </w:r>
       <w:r>
         <w:br/>
@@ -3019,6 +3072,9 @@
       </w:r>
       <w:r>
         <w:t>pointer</w:t>
+      </w:r>
+      <w:r>
+        <w:t xml:space="preserve"> / register</w:t>
       </w:r>
       <w:r>
         <w:t>.</w:t>
@@ -3207,12 +3263,6 @@
         <w:t>.</w:t>
       </w:r>
       <w:r>
-        <w:t xml:space="preserve">  </w:t>
-      </w:r>
-      <w:r>
-        <w:t>It has a type of: ‘None’.</w:t>
-      </w:r>
-      <w:r>
         <w:t xml:space="preserve"> </w:t>
       </w:r>
     </w:p>
@@ -3221,12 +3271,77 @@
         <w:ind w:left="720"/>
       </w:pPr>
       <w:r>
-        <w:t>The contained start and return addresses are expressed in absolute address, page location pairs.  Page locations will typically be in whole RAM or a ROM page.</w:t>
+        <w:t xml:space="preserve">The contained start and return addresses are expressed in </w:t>
+      </w:r>
+      <w:r>
+        <w:t xml:space="preserve">page / </w:t>
+      </w:r>
+      <w:r>
+        <w:t xml:space="preserve">absolute </w:t>
+      </w:r>
+      <w:r>
+        <w:t>address pairs.  Page locations will typically be in whole RAM or a ROM page.</w:t>
       </w:r>
     </w:p>
     <w:p>
       <w:pPr>
         <w:ind w:left="720"/>
+        <w:rPr>
+          <w:rFonts w:ascii="Aptos" w:hAnsi="Aptos"/>
+          <w:color w:val="000000"/>
+        </w:rPr>
+      </w:pPr>
+      <w:r>
+        <w:rPr>
+          <w:rFonts w:ascii="Aptos" w:hAnsi="Aptos"/>
+          <w:color w:val="000000"/>
+        </w:rPr>
+        <w:t xml:space="preserve">The root stack frame represents the program. </w:t>
+      </w:r>
+      <w:r>
+        <w:rPr>
+          <w:rFonts w:ascii="Aptos" w:hAnsi="Aptos"/>
+          <w:color w:val="000000"/>
+        </w:rPr>
+        <w:t xml:space="preserve"> </w:t>
+      </w:r>
+      <w:r>
+        <w:rPr>
+          <w:rFonts w:ascii="Aptos" w:hAnsi="Aptos"/>
+          <w:color w:val="000000"/>
+        </w:rPr>
+        <w:t>Its start address is either the first sub &amp;8000 instruction jumped to from above &amp;8000, or the first instruction executed if no such jump occurs.</w:t>
+      </w:r>
+    </w:p>
+    <w:p>
+      <w:pPr>
+        <w:ind w:left="720"/>
+      </w:pPr>
+      <w:r>
+        <w:rPr>
+          <w:rFonts w:ascii="Aptos" w:hAnsi="Aptos"/>
+          <w:color w:val="000000"/>
+        </w:rPr>
+        <w:t>Each stack frame also capture</w:t>
+      </w:r>
+      <w:r>
+        <w:rPr>
+          <w:rFonts w:ascii="Aptos" w:hAnsi="Aptos"/>
+          <w:color w:val="000000"/>
+        </w:rPr>
+        <w:t>s</w:t>
+      </w:r>
+      <w:r>
+        <w:rPr>
+          <w:rFonts w:ascii="Aptos" w:hAnsi="Aptos"/>
+          <w:color w:val="000000"/>
+        </w:rPr>
+        <w:t xml:space="preserve"> the return address and stack pointer.</w:t>
+      </w:r>
+    </w:p>
+    <w:p>
+      <w:pPr>
+        <w:ind w:left="720"/>
       </w:pPr>
       <w:r>
         <w:t>&lt;stack_frame_count&gt; (1 byte) The number of stack frames.</w:t>
@@ -3264,7 +3379,13 @@
         <w:t xml:space="preserve">&lt;return_address&gt; + </w:t>
       </w:r>
       <w:r>
-        <w:t>&lt;stack_register&gt;</w:t>
+        <w:t>&lt;</w:t>
+      </w:r>
+      <w:r>
+        <w:t>return_stack_pointer</w:t>
+      </w:r>
+      <w:r>
+        <w:t>&gt;</w:t>
       </w:r>
     </w:p>
     <w:p>
@@ -3349,7 +3470,10 @@
           </w:tcPr>
           <w:p>
             <w:r>
-              <w:t>None</w:t>
+              <w:t xml:space="preserve">Program </w:t>
+            </w:r>
+            <w:r>
+              <w:t>stack frame</w:t>
             </w:r>
           </w:p>
         </w:tc>
@@ -3374,13 +3498,10 @@
           </w:tcPr>
           <w:p>
             <w:r>
-              <w:t xml:space="preserve">Invoked </w:t>
+              <w:t xml:space="preserve">Created with </w:t>
             </w:r>
             <w:r>
-              <w:t>by</w:t>
-            </w:r>
-            <w:r>
-              <w:t xml:space="preserve"> JSR</w:t>
+              <w:t>JSR</w:t>
             </w:r>
           </w:p>
         </w:tc>
@@ -3405,13 +3526,10 @@
           </w:tcPr>
           <w:p>
             <w:r>
-              <w:t xml:space="preserve">Invoked </w:t>
+              <w:t xml:space="preserve">Created with </w:t>
             </w:r>
             <w:r>
-              <w:t>by</w:t>
-            </w:r>
-            <w:r>
-              <w:t xml:space="preserve"> IRQ</w:t>
+              <w:t>IRQ</w:t>
             </w:r>
           </w:p>
         </w:tc>
@@ -3436,7 +3554,10 @@
           </w:tcPr>
           <w:p>
             <w:r>
-              <w:t>Invoked by NMI</w:t>
+              <w:t xml:space="preserve">Created with </w:t>
+            </w:r>
+            <w:r>
+              <w:t>NMI</w:t>
             </w:r>
           </w:p>
         </w:tc>
@@ -3461,7 +3582,10 @@
           </w:tcPr>
           <w:p>
             <w:r>
-              <w:t>Invoked by BRK</w:t>
+              <w:t xml:space="preserve">Created with </w:t>
+            </w:r>
+            <w:r>
+              <w:t>BRK</w:t>
             </w:r>
           </w:p>
         </w:tc>
@@ -3471,18 +3595,6 @@
       <w:pPr>
         <w:ind w:left="1080"/>
       </w:pPr>
-      <w:r>
-        <w:t xml:space="preserve">The root frame </w:t>
-      </w:r>
-      <w:r>
-        <w:t xml:space="preserve">always has </w:t>
-      </w:r>
-      <w:r>
-        <w:t xml:space="preserve">type </w:t>
-      </w:r>
-      <w:r>
-        <w:t>= None</w:t>
-      </w:r>
     </w:p>
     <w:p>
       <w:pPr>
@@ -3805,6 +3917,30 @@
     <w:p>
       <w:pPr>
         <w:ind w:left="1080"/>
+        <w:rPr>
+          <w:rFonts w:ascii="Aptos" w:hAnsi="Aptos"/>
+          <w:color w:val="000000"/>
+        </w:rPr>
+      </w:pPr>
+      <w:r>
+        <w:rPr>
+          <w:rFonts w:ascii="Aptos" w:hAnsi="Aptos"/>
+          <w:color w:val="000000"/>
+        </w:rPr>
+        <w:lastRenderedPageBreak/>
+        <w:t xml:space="preserve">The program </w:t>
+      </w:r>
+      <w:r>
+        <w:rPr>
+          <w:rFonts w:ascii="Aptos" w:hAnsi="Aptos"/>
+          <w:color w:val="000000"/>
+        </w:rPr>
+        <w:t>start address is either the first sub &amp;8000 instruction jumped to from above &amp;8000, or the first instruction executed if no such jump occurs.</w:t>
+      </w:r>
+    </w:p>
+    <w:p>
+      <w:pPr>
+        <w:ind w:left="1080"/>
       </w:pPr>
       <w:r>
         <w:t xml:space="preserve">&lt;return_address_page (1 byte) The memory page where the </w:t>
@@ -3824,28 +3960,41 @@
         <w:ind w:left="1080"/>
       </w:pPr>
       <w:r>
-        <w:t xml:space="preserve">&lt;return_address&gt; (2 bytes) Return address of the invoked routine, or </w:t>
-      </w:r>
-      <w:r>
-        <w:rPr>
-          <w:b/>
-          <w:bCs/>
-        </w:rPr>
-        <w:t>&amp;FFFF</w:t>
+        <w:t>&lt;return_address&gt; (2 bytes) Return address of the invoked routine</w:t>
+      </w:r>
+      <w:r>
+        <w:t xml:space="preserve">.  The root stack frame contains the address of the JMP instruction that invoked the program, or </w:t>
+      </w:r>
+      <w:r>
+        <w:t>zero</w:t>
+      </w:r>
+      <w:r>
+        <w:t xml:space="preserve"> if </w:t>
+      </w:r>
+      <w:r>
+        <w:rPr>
+          <w:rFonts w:ascii="Aptos" w:hAnsi="Aptos"/>
+          <w:color w:val="000000"/>
+        </w:rPr>
+        <w:t>no such jump occur</w:t>
+      </w:r>
+      <w:r>
+        <w:rPr>
+          <w:rFonts w:ascii="Aptos" w:hAnsi="Aptos"/>
+          <w:color w:val="000000"/>
+        </w:rPr>
+        <w:t>red</w:t>
+      </w:r>
+      <w:r>
+        <w:t>.</w:t>
       </w:r>
       <w:r>
         <w:t xml:space="preserve"> </w:t>
       </w:r>
       <w:r>
-        <w:t>(first stack frame).</w:t>
-      </w:r>
-      <w:r>
         <w:t xml:space="preserve"> </w:t>
       </w:r>
       <w:r>
-        <w:t xml:space="preserve"> </w:t>
-      </w:r>
-      <w:r>
         <w:t>This is an absolute address.</w:t>
       </w:r>
     </w:p>
@@ -3854,27 +4003,28 @@
         <w:ind w:left="1080"/>
       </w:pPr>
       <w:r>
-        <w:lastRenderedPageBreak/>
         <w:t>&lt;</w:t>
       </w:r>
       <w:r>
-        <w:t>stack_register</w:t>
+        <w:t>return_</w:t>
+      </w:r>
+      <w:r>
+        <w:t>stack_</w:t>
+      </w:r>
+      <w:r>
+        <w:t>pointer</w:t>
       </w:r>
       <w:r>
         <w:t xml:space="preserve">&gt; </w:t>
       </w:r>
       <w:r>
-        <w:t xml:space="preserve">(1) Value of the stack register prior to the invoked routine, or </w:t>
-      </w:r>
-      <w:r>
-        <w:rPr>
-          <w:b/>
-          <w:bCs/>
-        </w:rPr>
-        <w:t>0xFF</w:t>
-      </w:r>
-      <w:r>
-        <w:t xml:space="preserve"> (first stack frame).</w:t>
+        <w:t xml:space="preserve">(1) Value of the stack </w:t>
+      </w:r>
+      <w:r>
+        <w:t xml:space="preserve">pointer </w:t>
+      </w:r>
+      <w:r>
+        <w:t>prior to the invoked routine.</w:t>
       </w:r>
     </w:p>
     <w:p>
@@ -4596,6 +4746,7 @@
               <w:ind w:left="1440" w:hanging="1440"/>
             </w:pPr>
             <w:r>
+              <w:lastRenderedPageBreak/>
               <w:t>&lt;</w:t>
             </w:r>
             <w:r>
@@ -4982,7 +5133,6 @@
         <w:ind w:left="720" w:hanging="360"/>
       </w:pPr>
       <w:r>
-        <w:lastRenderedPageBreak/>
         <w:t>&lt;</w:t>
       </w:r>
       <w:r>
@@ -5409,7 +5559,7 @@
         <w:t>&gt; + &lt;execution_data&gt;</w:t>
       </w:r>
       <w:r>
-        <w:t>4ep</w:t>
+        <w:t xml:space="preserve"> where</w:t>
       </w:r>
     </w:p>
     <w:p>
@@ -5417,7 +5567,14 @@
         <w:ind w:left="360"/>
       </w:pPr>
       <w:r>
-        <w:t xml:space="preserve">&lt;execution_data&gt; = </w:t>
+        <w:rPr>
+          <w:b/>
+          <w:bCs/>
+        </w:rPr>
+        <w:t>&lt;execution_data&gt;</w:t>
+      </w:r>
+      <w:r>
+        <w:t xml:space="preserve"> = </w:t>
       </w:r>
       <w:r>
         <w:t xml:space="preserve">list of </w:t>
@@ -5480,6 +5637,7 @@
         <w:ind w:left="720"/>
       </w:pPr>
       <w:r>
+        <w:lastRenderedPageBreak/>
         <w:t>&lt;event_marker&gt; (2 bytes).  A two-byte value that distinguishes a</w:t>
       </w:r>
       <w:r>
@@ -5809,7 +5967,6 @@
         <w:ind w:left="720"/>
       </w:pPr>
       <w:r>
-        <w:lastRenderedPageBreak/>
         <w:t xml:space="preserve">The </w:t>
       </w:r>
       <w:r>
@@ -6356,6 +6513,7 @@
           </w:tcPr>
           <w:p>
             <w:r>
+              <w:lastRenderedPageBreak/>
               <w:t>Absolute address: &amp;0000..&amp;7FFF</w:t>
             </w:r>
           </w:p>
@@ -6716,7 +6874,6 @@
           <w:noProof/>
           <w:color w:val="0070C0"/>
         </w:rPr>
-        <w:lastRenderedPageBreak/>
         <w:t xml:space="preserve">if </w:t>
       </w:r>
       <w:r>
@@ -7241,6 +7398,7 @@
               <w:jc w:val="center"/>
             </w:pPr>
             <w:r>
+              <w:lastRenderedPageBreak/>
               <w:t>3</w:t>
             </w:r>
           </w:p>
@@ -7448,7 +7606,6 @@
         <w:ind w:left="1080"/>
       </w:pPr>
       <w:r>
-        <w:lastRenderedPageBreak/>
         <w:t>&lt;x</w:t>
       </w:r>
       <w:r>
@@ -7880,6 +8037,7 @@
         <w:ind w:left="720"/>
       </w:pPr>
       <w:r>
+        <w:lastRenderedPageBreak/>
         <w:t xml:space="preserve">&lt;memory_read_value&gt; (1 byte) Populated for opcodes </w:t>
       </w:r>
       <w:r>
@@ -8050,11 +8208,7 @@
         <w:t xml:space="preserve"> (e.g. PHA)</w:t>
       </w:r>
       <w:r>
-        <w:t xml:space="preserve">.  Contains the value </w:t>
-      </w:r>
-      <w:r>
-        <w:lastRenderedPageBreak/>
-        <w:t xml:space="preserve">attempted to be written. </w:t>
+        <w:t xml:space="preserve">.  Contains the value attempted to be written. </w:t>
       </w:r>
       <w:r>
         <w:t xml:space="preserve"> </w:t>
@@ -13039,7 +13193,10 @@
         <w:t xml:space="preserve">, </w:t>
       </w:r>
       <w:r>
-        <w:t>UpdateProgramStartAddress</w:t>
+        <w:t xml:space="preserve">SetStackFrame, </w:t>
+      </w:r>
+      <w:r>
+        <w:t>UpdateRootStackFrame</w:t>
       </w:r>
       <w:r>
         <w:t xml:space="preserve">) to </w:t>
@@ -13216,16 +13373,13 @@
         <w:t xml:space="preserve">) that returns the page associated with an address.  This is invoked by </w:t>
       </w:r>
       <w:r>
-        <w:t xml:space="preserve">PushStackFrame </w:t>
-      </w:r>
-      <w:r>
-        <w:t xml:space="preserve">and </w:t>
-      </w:r>
-      <w:r>
-        <w:t>UpdateProgramStartAddress</w:t>
-      </w:r>
-      <w:r>
-        <w:t xml:space="preserve"> (see 6502.cpp).</w:t>
+        <w:t>Set</w:t>
+      </w:r>
+      <w:r>
+        <w:t xml:space="preserve">StackFrame </w:t>
+      </w:r>
+      <w:r>
+        <w:t>(see 6502.cpp).</w:t>
       </w:r>
     </w:p>
     <w:p>
@@ -21329,7 +21483,6 @@
   <w:style w:type="character" w:default="1" w:styleId="DefaultParagraphFont">
     <w:name w:val="Default Paragraph Font"/>
     <w:uiPriority w:val="1"/>
-    <w:semiHidden/>
     <w:unhideWhenUsed/>
   </w:style>
   <w:style w:type="table" w:default="1" w:styleId="TableNormal">

</xml_diff>

<commit_message>
Fixed CallerCaller view regression from two changes ago. Also added IRQ, NMI, and BRK labels and reformatted how labels are formatted across all the views
</commit_message>
<xml_diff>
--- a/docs/Development.docx
+++ b/docs/Development.docx
@@ -186,8 +186,13 @@
         <w:t xml:space="preserve"> I</w:t>
       </w:r>
       <w:r>
-        <w:t xml:space="preserve"> wouuld</w:t>
-      </w:r>
+        <w:t xml:space="preserve"> </w:t>
+      </w:r>
+      <w:proofErr w:type="spellStart"/>
+      <w:r>
+        <w:t>wouuld</w:t>
+      </w:r>
+      <w:proofErr w:type="spellEnd"/>
       <w:r>
         <w:t xml:space="preserve"> also like to identify </w:t>
       </w:r>
@@ -518,6 +523,7 @@
       <w:r>
         <w:t xml:space="preserve">, </w:t>
       </w:r>
+      <w:proofErr w:type="spellStart"/>
       <w:r>
         <w:rPr>
           <w:b/>
@@ -525,6 +531,7 @@
         </w:rPr>
         <w:t>BeebPerf</w:t>
       </w:r>
+      <w:proofErr w:type="spellEnd"/>
       <w:r>
         <w:t xml:space="preserve">, </w:t>
       </w:r>
@@ -720,6 +727,7 @@
       <w:r>
         <w:t xml:space="preserve"> is modified to generate a .perf file, which </w:t>
       </w:r>
+      <w:proofErr w:type="spellStart"/>
       <w:r>
         <w:rPr>
           <w:b/>
@@ -727,6 +735,7 @@
         </w:rPr>
         <w:t>BeebPerf</w:t>
       </w:r>
+      <w:proofErr w:type="spellEnd"/>
       <w:r>
         <w:t xml:space="preserve"> </w:t>
       </w:r>
@@ -745,14 +754,21 @@
         <w:t xml:space="preserve">role decoupling </w:t>
       </w:r>
       <w:r>
-        <w:t>BeebEm from BeebPerf</w:t>
-      </w:r>
+        <w:t xml:space="preserve">BeebEm from </w:t>
+      </w:r>
+      <w:proofErr w:type="spellStart"/>
+      <w:r>
+        <w:t>BeebPerf</w:t>
+      </w:r>
+      <w:proofErr w:type="spellEnd"/>
+      <w:proofErr w:type="gramStart"/>
       <w:r>
         <w:t>.</w:t>
       </w:r>
       <w:r>
         <w:t xml:space="preserve"> </w:t>
       </w:r>
+      <w:proofErr w:type="gramEnd"/>
       <w:r>
         <w:t>The format strives to balance the needs of:</w:t>
       </w:r>
@@ -861,8 +877,17 @@
           <w:b/>
           <w:bCs/>
         </w:rPr>
-        <w:t>.pref</w:t>
-      </w:r>
+        <w:t>.</w:t>
+      </w:r>
+      <w:proofErr w:type="spellStart"/>
+      <w:r>
+        <w:rPr>
+          <w:b/>
+          <w:bCs/>
+        </w:rPr>
+        <w:t>pref</w:t>
+      </w:r>
+      <w:proofErr w:type="spellEnd"/>
       <w:r>
         <w:t xml:space="preserve"> file contains sufficient information </w:t>
       </w:r>
@@ -1000,6 +1025,7 @@
         </w:rPr>
         <w:t>&lt;</w:t>
       </w:r>
+      <w:proofErr w:type="spellStart"/>
       <w:r>
         <w:rPr>
           <w:b/>
@@ -1014,6 +1040,7 @@
         </w:rPr>
         <w:t>chunk</w:t>
       </w:r>
+      <w:proofErr w:type="spellEnd"/>
       <w:r>
         <w:rPr>
           <w:b/>
@@ -1031,6 +1058,7 @@
         </w:rPr>
         <w:t>&lt;</w:t>
       </w:r>
+      <w:proofErr w:type="spellStart"/>
       <w:r>
         <w:rPr>
           <w:b/>
@@ -1052,6 +1080,7 @@
         </w:rPr>
         <w:t>_chunk</w:t>
       </w:r>
+      <w:proofErr w:type="spellEnd"/>
       <w:r>
         <w:rPr>
           <w:b/>
@@ -1080,12 +1109,21 @@
         </w:rPr>
         <w:t>&lt;</w:t>
       </w:r>
-      <w:r>
-        <w:rPr>
-          <w:b/>
-          <w:bCs/>
-        </w:rPr>
-        <w:t>snapshot_chunk&gt;</w:t>
+      <w:proofErr w:type="spellStart"/>
+      <w:r>
+        <w:rPr>
+          <w:b/>
+          <w:bCs/>
+        </w:rPr>
+        <w:t>snapshot_chunk</w:t>
+      </w:r>
+      <w:proofErr w:type="spellEnd"/>
+      <w:r>
+        <w:rPr>
+          <w:b/>
+          <w:bCs/>
+        </w:rPr>
+        <w:t>&gt;</w:t>
       </w:r>
       <w:r>
         <w:t xml:space="preserve"> +</w:t>
@@ -1100,6 +1138,7 @@
         </w:rPr>
         <w:t>&lt;</w:t>
       </w:r>
+      <w:proofErr w:type="spellStart"/>
       <w:r>
         <w:rPr>
           <w:b/>
@@ -1107,6 +1146,7 @@
         </w:rPr>
         <w:t>execution_chunk</w:t>
       </w:r>
+      <w:proofErr w:type="spellEnd"/>
       <w:r>
         <w:rPr>
           <w:b/>
@@ -1322,6 +1362,7 @@
         </w:rPr>
         <w:t>&lt;</w:t>
       </w:r>
+      <w:proofErr w:type="spellStart"/>
       <w:r>
         <w:rPr>
           <w:b/>
@@ -1334,7 +1375,15 @@
           <w:b/>
           <w:bCs/>
         </w:rPr>
-        <w:t>header&gt;</w:t>
+        <w:t>header</w:t>
+      </w:r>
+      <w:proofErr w:type="spellEnd"/>
+      <w:r>
+        <w:rPr>
+          <w:b/>
+          <w:bCs/>
+        </w:rPr>
+        <w:t>&gt;</w:t>
       </w:r>
       <w:r>
         <w:t xml:space="preserve"> = </w:t>
@@ -1345,11 +1394,24 @@
       <w:r>
         <w:t>&lt;tag&gt; + &lt;compression&gt; + &lt;</w:t>
       </w:r>
+      <w:proofErr w:type="spellStart"/>
       <w:r>
         <w:t>original_</w:t>
       </w:r>
       <w:r>
-        <w:t>size&gt; + &lt;compressed_size&gt;</w:t>
+        <w:t>size</w:t>
+      </w:r>
+      <w:proofErr w:type="spellEnd"/>
+      <w:r>
+        <w:t>&gt; + &lt;</w:t>
+      </w:r>
+      <w:proofErr w:type="spellStart"/>
+      <w:r>
+        <w:t>compressed_size</w:t>
+      </w:r>
+      <w:proofErr w:type="spellEnd"/>
+      <w:r>
+        <w:t>&gt;</w:t>
       </w:r>
     </w:p>
     <w:p>
@@ -1392,11 +1454,16 @@
       <w:r>
         <w:t xml:space="preserve">The following table lists </w:t>
       </w:r>
+      <w:proofErr w:type="gramStart"/>
       <w:r>
         <w:t>these</w:t>
       </w:r>
       <w:r>
-        <w:t xml:space="preserve"> the permissible tag values.</w:t>
+        <w:t xml:space="preserve"> the</w:t>
+      </w:r>
+      <w:proofErr w:type="gramEnd"/>
+      <w:r>
+        <w:t xml:space="preserve"> permissible tag values.</w:t>
       </w:r>
     </w:p>
     <w:tbl>
@@ -1483,7 +1550,23 @@
                 <w:rFonts w:ascii="Aptos" w:hAnsi="Aptos"/>
                 <w:color w:val="000000"/>
               </w:rPr>
-              <w:t>‘PFhd’</w:t>
+              <w:t>‘</w:t>
+            </w:r>
+            <w:proofErr w:type="spellStart"/>
+            <w:r>
+              <w:rPr>
+                <w:rFonts w:ascii="Aptos" w:hAnsi="Aptos"/>
+                <w:color w:val="000000"/>
+              </w:rPr>
+              <w:t>PFhd</w:t>
+            </w:r>
+            <w:proofErr w:type="spellEnd"/>
+            <w:r>
+              <w:rPr>
+                <w:rFonts w:ascii="Aptos" w:hAnsi="Aptos"/>
+                <w:color w:val="000000"/>
+              </w:rPr>
+              <w:t>’</w:t>
             </w:r>
           </w:p>
         </w:tc>
@@ -1503,7 +1586,23 @@
                 <w:rFonts w:ascii="Aptos" w:hAnsi="Aptos"/>
                 <w:color w:val="000000"/>
               </w:rPr>
-              <w:t>&lt;header_chunk&gt;</w:t>
+              <w:t>&lt;</w:t>
+            </w:r>
+            <w:proofErr w:type="spellStart"/>
+            <w:r>
+              <w:rPr>
+                <w:rFonts w:ascii="Aptos" w:hAnsi="Aptos"/>
+                <w:color w:val="000000"/>
+              </w:rPr>
+              <w:t>header_chunk</w:t>
+            </w:r>
+            <w:proofErr w:type="spellEnd"/>
+            <w:r>
+              <w:rPr>
+                <w:rFonts w:ascii="Aptos" w:hAnsi="Aptos"/>
+                <w:color w:val="000000"/>
+              </w:rPr>
+              <w:t>&gt;</w:t>
             </w:r>
           </w:p>
         </w:tc>
@@ -1525,7 +1624,23 @@
                 <w:rFonts w:ascii="Aptos" w:hAnsi="Aptos"/>
                 <w:color w:val="000000"/>
               </w:rPr>
-              <w:t>‘PFlb’</w:t>
+              <w:t>‘</w:t>
+            </w:r>
+            <w:proofErr w:type="spellStart"/>
+            <w:r>
+              <w:rPr>
+                <w:rFonts w:ascii="Aptos" w:hAnsi="Aptos"/>
+                <w:color w:val="000000"/>
+              </w:rPr>
+              <w:t>PFlb</w:t>
+            </w:r>
+            <w:proofErr w:type="spellEnd"/>
+            <w:r>
+              <w:rPr>
+                <w:rFonts w:ascii="Aptos" w:hAnsi="Aptos"/>
+                <w:color w:val="000000"/>
+              </w:rPr>
+              <w:t>’</w:t>
             </w:r>
           </w:p>
         </w:tc>
@@ -1541,7 +1656,15 @@
               </w:rPr>
             </w:pPr>
             <w:r>
-              <w:t>&lt;labels_chunk&gt;</w:t>
+              <w:t>&lt;</w:t>
+            </w:r>
+            <w:proofErr w:type="spellStart"/>
+            <w:r>
+              <w:t>labels_chunk</w:t>
+            </w:r>
+            <w:proofErr w:type="spellEnd"/>
+            <w:r>
+              <w:t>&gt;</w:t>
             </w:r>
           </w:p>
         </w:tc>
@@ -1563,7 +1686,23 @@
                 <w:rFonts w:ascii="Aptos" w:hAnsi="Aptos"/>
                 <w:color w:val="000000"/>
               </w:rPr>
-              <w:t>‘PFss’</w:t>
+              <w:t>‘</w:t>
+            </w:r>
+            <w:proofErr w:type="spellStart"/>
+            <w:r>
+              <w:rPr>
+                <w:rFonts w:ascii="Aptos" w:hAnsi="Aptos"/>
+                <w:color w:val="000000"/>
+              </w:rPr>
+              <w:t>PFss</w:t>
+            </w:r>
+            <w:proofErr w:type="spellEnd"/>
+            <w:r>
+              <w:rPr>
+                <w:rFonts w:ascii="Aptos" w:hAnsi="Aptos"/>
+                <w:color w:val="000000"/>
+              </w:rPr>
+              <w:t>’</w:t>
             </w:r>
           </w:p>
         </w:tc>
@@ -1579,7 +1718,15 @@
               </w:rPr>
             </w:pPr>
             <w:r>
-              <w:t>&lt;snapshot_chunk&gt;</w:t>
+              <w:t>&lt;</w:t>
+            </w:r>
+            <w:proofErr w:type="spellStart"/>
+            <w:r>
+              <w:t>snapshot_chunk</w:t>
+            </w:r>
+            <w:proofErr w:type="spellEnd"/>
+            <w:r>
+              <w:t>&gt;</w:t>
             </w:r>
           </w:p>
         </w:tc>
@@ -1601,7 +1748,23 @@
                 <w:rFonts w:ascii="Aptos" w:hAnsi="Aptos"/>
                 <w:color w:val="000000"/>
               </w:rPr>
-              <w:t>‘PFex’</w:t>
+              <w:t>‘</w:t>
+            </w:r>
+            <w:proofErr w:type="spellStart"/>
+            <w:r>
+              <w:rPr>
+                <w:rFonts w:ascii="Aptos" w:hAnsi="Aptos"/>
+                <w:color w:val="000000"/>
+              </w:rPr>
+              <w:t>PFex</w:t>
+            </w:r>
+            <w:proofErr w:type="spellEnd"/>
+            <w:r>
+              <w:rPr>
+                <w:rFonts w:ascii="Aptos" w:hAnsi="Aptos"/>
+                <w:color w:val="000000"/>
+              </w:rPr>
+              <w:t>’</w:t>
             </w:r>
           </w:p>
         </w:tc>
@@ -1617,7 +1780,15 @@
               </w:rPr>
             </w:pPr>
             <w:r>
-              <w:t>&lt;execution_chunk&gt;</w:t>
+              <w:t>&lt;</w:t>
+            </w:r>
+            <w:proofErr w:type="spellStart"/>
+            <w:r>
+              <w:t>execution_chunk</w:t>
+            </w:r>
+            <w:proofErr w:type="spellEnd"/>
+            <w:r>
+              <w:t>&gt;</w:t>
             </w:r>
           </w:p>
         </w:tc>
@@ -1789,8 +1960,13 @@
             <w:tcW w:w="3240" w:type="dxa"/>
           </w:tcPr>
           <w:p>
+            <w:proofErr w:type="spellStart"/>
             <w:r>
-              <w:t>zlib 1.3.1 (default algorithm)</w:t>
+              <w:t>zlib</w:t>
+            </w:r>
+            <w:proofErr w:type="spellEnd"/>
+            <w:r>
+              <w:t xml:space="preserve"> 1.3.1 (default algorithm)</w:t>
             </w:r>
           </w:p>
         </w:tc>
@@ -1806,6 +1982,7 @@
       <w:r>
         <w:t>&lt;</w:t>
       </w:r>
+      <w:proofErr w:type="spellStart"/>
       <w:r>
         <w:t>original</w:t>
       </w:r>
@@ -1815,6 +1992,7 @@
       <w:r>
         <w:t>size</w:t>
       </w:r>
+      <w:proofErr w:type="spellEnd"/>
       <w:r>
         <w:t>&gt;</w:t>
       </w:r>
@@ -1851,11 +2029,16 @@
         <w:ind w:left="360"/>
       </w:pPr>
       <w:r>
-        <w:t>&lt;compressed_</w:t>
+        <w:t>&lt;</w:t>
+      </w:r>
+      <w:proofErr w:type="spellStart"/>
+      <w:r>
+        <w:t>compressed_</w:t>
       </w:r>
       <w:r>
         <w:t>size</w:t>
       </w:r>
+      <w:proofErr w:type="spellEnd"/>
       <w:r>
         <w:t>&gt;</w:t>
       </w:r>
@@ -1883,11 +2066,16 @@
       <w:r>
         <w:t>matches &lt;</w:t>
       </w:r>
+      <w:proofErr w:type="spellStart"/>
       <w:r>
         <w:t>original</w:t>
       </w:r>
       <w:r>
-        <w:t>_size&gt;</w:t>
+        <w:t>_size</w:t>
+      </w:r>
+      <w:proofErr w:type="spellEnd"/>
+      <w:r>
+        <w:t>&gt;</w:t>
       </w:r>
       <w:r>
         <w:t>.</w:t>
@@ -1909,7 +2097,15 @@
         <w:t xml:space="preserve">The header chunk </w:t>
       </w:r>
       <w:r>
-        <w:t xml:space="preserve">is the first chunk in the file and </w:t>
+        <w:t xml:space="preserve">is the first chunk in the </w:t>
+      </w:r>
+      <w:proofErr w:type="gramStart"/>
+      <w:r>
+        <w:t>file</w:t>
+      </w:r>
+      <w:proofErr w:type="gramEnd"/>
+      <w:r>
+        <w:t xml:space="preserve"> and </w:t>
       </w:r>
       <w:r>
         <w:t xml:space="preserve">it </w:t>
@@ -1968,6 +2164,7 @@
         </w:rPr>
         <w:t>&lt;</w:t>
       </w:r>
+      <w:proofErr w:type="spellStart"/>
       <w:r>
         <w:rPr>
           <w:b/>
@@ -1980,14 +2177,27 @@
           <w:b/>
           <w:bCs/>
         </w:rPr>
-        <w:t>_chunk&gt;</w:t>
+        <w:t>_chunk</w:t>
+      </w:r>
+      <w:proofErr w:type="spellEnd"/>
+      <w:r>
+        <w:rPr>
+          <w:b/>
+          <w:bCs/>
+        </w:rPr>
+        <w:t>&gt;</w:t>
       </w:r>
       <w:r>
         <w:t xml:space="preserve"> = </w:t>
       </w:r>
       <w:r>
-        <w:t>&lt;common_header</w:t>
-      </w:r>
+        <w:t>&lt;</w:t>
+      </w:r>
+      <w:proofErr w:type="spellStart"/>
+      <w:r>
+        <w:t>common_header</w:t>
+      </w:r>
+      <w:proofErr w:type="spellEnd"/>
       <w:r>
         <w:t>(</w:t>
       </w:r>
@@ -1998,6 +2208,7 @@
         </w:rPr>
         <w:t>‘</w:t>
       </w:r>
+      <w:proofErr w:type="spellStart"/>
       <w:r>
         <w:rPr>
           <w:rFonts w:ascii="Aptos" w:hAnsi="Aptos"/>
@@ -2005,7 +2216,17 @@
           <w:bCs/>
           <w:color w:val="000000"/>
         </w:rPr>
-        <w:t>PFhd’</w:t>
+        <w:t>PFhd</w:t>
+      </w:r>
+      <w:proofErr w:type="spellEnd"/>
+      <w:r>
+        <w:rPr>
+          <w:rFonts w:ascii="Aptos" w:hAnsi="Aptos"/>
+          <w:b/>
+          <w:bCs/>
+          <w:color w:val="000000"/>
+        </w:rPr>
+        <w:t>’</w:t>
       </w:r>
       <w:r>
         <w:rPr>
@@ -2021,7 +2242,15 @@
         <w:t xml:space="preserve"> + </w:t>
       </w:r>
       <w:r>
-        <w:t>&lt;header_data&gt;</w:t>
+        <w:t>&lt;</w:t>
+      </w:r>
+      <w:proofErr w:type="spellStart"/>
+      <w:r>
+        <w:t>header_data</w:t>
+      </w:r>
+      <w:proofErr w:type="spellEnd"/>
+      <w:r>
+        <w:t>&gt;</w:t>
       </w:r>
       <w:r>
         <w:t xml:space="preserve"> wher</w:t>
@@ -2035,19 +2264,56 @@
         <w:ind w:left="720" w:hanging="360"/>
       </w:pPr>
       <w:r>
-        <w:t xml:space="preserve">&lt;header_data&gt; = </w:t>
+        <w:t>&lt;</w:t>
+      </w:r>
+      <w:proofErr w:type="spellStart"/>
+      <w:r>
+        <w:t>header_data</w:t>
+      </w:r>
+      <w:proofErr w:type="spellEnd"/>
+      <w:r>
+        <w:t xml:space="preserve">&gt; = </w:t>
       </w:r>
       <w:r>
         <w:br/>
       </w:r>
       <w:r>
-        <w:t>&lt;major_version&gt; + &lt;minor_version&gt; + &lt;bbc_model&gt; + &lt;</w:t>
-      </w:r>
+        <w:t>&lt;</w:t>
+      </w:r>
+      <w:proofErr w:type="spellStart"/>
+      <w:r>
+        <w:t>major_version</w:t>
+      </w:r>
+      <w:proofErr w:type="spellEnd"/>
+      <w:r>
+        <w:t>&gt; + &lt;</w:t>
+      </w:r>
+      <w:proofErr w:type="spellStart"/>
+      <w:r>
+        <w:t>minor_version</w:t>
+      </w:r>
+      <w:proofErr w:type="spellEnd"/>
+      <w:r>
+        <w:t>&gt; + &lt;</w:t>
+      </w:r>
+      <w:proofErr w:type="spellStart"/>
+      <w:r>
+        <w:t>bbc_model</w:t>
+      </w:r>
+      <w:proofErr w:type="spellEnd"/>
+      <w:r>
+        <w:t>&gt; + &lt;</w:t>
+      </w:r>
+      <w:proofErr w:type="spellStart"/>
       <w:r>
         <w:t>total_</w:t>
       </w:r>
       <w:r>
-        <w:t>execution_count&gt;</w:t>
+        <w:t>execution_count</w:t>
+      </w:r>
+      <w:proofErr w:type="spellEnd"/>
+      <w:r>
+        <w:t>&gt;</w:t>
       </w:r>
     </w:p>
     <w:p>
@@ -2057,11 +2323,16 @@
       <w:r>
         <w:t>&lt;</w:t>
       </w:r>
+      <w:proofErr w:type="spellStart"/>
       <w:r>
         <w:t>major_</w:t>
       </w:r>
       <w:r>
-        <w:t>version&gt;</w:t>
+        <w:t>version</w:t>
+      </w:r>
+      <w:proofErr w:type="spellEnd"/>
+      <w:r>
+        <w:t>&gt;</w:t>
       </w:r>
       <w:r>
         <w:t xml:space="preserve"> </w:t>
@@ -2080,11 +2351,16 @@
       <w:r>
         <w:t>&lt;</w:t>
       </w:r>
+      <w:proofErr w:type="spellStart"/>
       <w:r>
         <w:t>minor</w:t>
       </w:r>
       <w:r>
-        <w:t>_version&gt; (1 byte) Minor version number</w:t>
+        <w:t>_version</w:t>
+      </w:r>
+      <w:proofErr w:type="spellEnd"/>
+      <w:r>
+        <w:t>&gt; (1 byte) Minor version number</w:t>
       </w:r>
       <w:r>
         <w:t>.  Value is 0</w:t>
@@ -2098,7 +2374,15 @@
         <w:ind w:left="360"/>
       </w:pPr>
       <w:r>
-        <w:t>&lt;bbc_model&gt; (1 byte) The BBC model</w:t>
+        <w:t>&lt;</w:t>
+      </w:r>
+      <w:proofErr w:type="spellStart"/>
+      <w:r>
+        <w:t>bbc_model</w:t>
+      </w:r>
+      <w:proofErr w:type="spellEnd"/>
+      <w:r>
+        <w:t>&gt; (1 byte) The BBC model</w:t>
       </w:r>
     </w:p>
     <w:tbl>
@@ -2526,6 +2810,7 @@
       <w:r>
         <w:t>&lt;</w:t>
       </w:r>
+      <w:proofErr w:type="spellStart"/>
       <w:r>
         <w:t>total_</w:t>
       </w:r>
@@ -2536,7 +2821,11 @@
         <w:t>_</w:t>
       </w:r>
       <w:r>
-        <w:t xml:space="preserve">count&gt; (4 bytes) The total number of </w:t>
+        <w:t>count</w:t>
+      </w:r>
+      <w:proofErr w:type="spellEnd"/>
+      <w:r>
+        <w:t xml:space="preserve">&gt; (4 bytes) The total number of </w:t>
       </w:r>
       <w:r>
         <w:t xml:space="preserve">executed </w:t>
@@ -2613,14 +2902,35 @@
           <w:b/>
           <w:bCs/>
         </w:rPr>
-        <w:t>&lt;labels_chunk&gt;</w:t>
+        <w:t>&lt;</w:t>
+      </w:r>
+      <w:proofErr w:type="spellStart"/>
+      <w:r>
+        <w:rPr>
+          <w:b/>
+          <w:bCs/>
+        </w:rPr>
+        <w:t>labels_chunk</w:t>
+      </w:r>
+      <w:proofErr w:type="spellEnd"/>
+      <w:r>
+        <w:rPr>
+          <w:b/>
+          <w:bCs/>
+        </w:rPr>
+        <w:t>&gt;</w:t>
       </w:r>
       <w:r>
         <w:t xml:space="preserve"> = </w:t>
       </w:r>
       <w:r>
-        <w:t>&lt;common_heade</w:t>
-      </w:r>
+        <w:t>&lt;</w:t>
+      </w:r>
+      <w:proofErr w:type="spellStart"/>
+      <w:r>
+        <w:t>common_heade</w:t>
+      </w:r>
+      <w:proofErr w:type="spellEnd"/>
       <w:r>
         <w:t>(</w:t>
       </w:r>
@@ -2631,6 +2941,7 @@
         </w:rPr>
         <w:t>‘</w:t>
       </w:r>
+      <w:proofErr w:type="spellStart"/>
       <w:r>
         <w:rPr>
           <w:rFonts w:ascii="Aptos" w:hAnsi="Aptos"/>
@@ -2640,6 +2951,7 @@
         </w:rPr>
         <w:t>PFlb</w:t>
       </w:r>
+      <w:proofErr w:type="spellEnd"/>
       <w:r>
         <w:t>’</w:t>
       </w:r>
@@ -2650,11 +2962,16 @@
         <w:t xml:space="preserve">&gt; </w:t>
       </w:r>
       <w:r>
-        <w:t>+ &lt;label</w:t>
+        <w:t>+ &lt;</w:t>
+      </w:r>
+      <w:proofErr w:type="spellStart"/>
+      <w:r>
+        <w:t>label</w:t>
       </w:r>
       <w:r>
         <w:t>_data</w:t>
       </w:r>
+      <w:proofErr w:type="spellEnd"/>
       <w:r>
         <w:t>&gt;</w:t>
       </w:r>
@@ -2669,6 +2986,7 @@
       <w:r>
         <w:t>&lt;</w:t>
       </w:r>
+      <w:proofErr w:type="spellStart"/>
       <w:r>
         <w:rPr>
           <w:b/>
@@ -2676,6 +2994,7 @@
         </w:rPr>
         <w:t>label_data</w:t>
       </w:r>
+      <w:proofErr w:type="spellEnd"/>
       <w:r>
         <w:t xml:space="preserve">&gt; = </w:t>
       </w:r>
@@ -2698,7 +3017,23 @@
       </w:r>
       <w:bookmarkEnd w:id="0"/>
       <w:r>
-        <w:t>&lt;label_address&gt; + &lt;label_name&gt;</w:t>
+        <w:t>&lt;</w:t>
+      </w:r>
+      <w:proofErr w:type="spellStart"/>
+      <w:r>
+        <w:t>label_address</w:t>
+      </w:r>
+      <w:proofErr w:type="spellEnd"/>
+      <w:r>
+        <w:t>&gt; + &lt;</w:t>
+      </w:r>
+      <w:proofErr w:type="spellStart"/>
+      <w:r>
+        <w:t>label_name</w:t>
+      </w:r>
+      <w:proofErr w:type="spellEnd"/>
+      <w:r>
+        <w:t>&gt;</w:t>
       </w:r>
       <w:r>
         <w:t xml:space="preserve"> </w:t>
@@ -2709,7 +3044,15 @@
         <w:ind w:left="810"/>
       </w:pPr>
       <w:r>
-        <w:t xml:space="preserve">&lt;label_address&gt; (2 bytes) </w:t>
+        <w:t>&lt;</w:t>
+      </w:r>
+      <w:proofErr w:type="spellStart"/>
+      <w:r>
+        <w:t>label_address</w:t>
+      </w:r>
+      <w:proofErr w:type="spellEnd"/>
+      <w:r>
+        <w:t xml:space="preserve">&gt; (2 bytes) </w:t>
       </w:r>
       <w:r>
         <w:t xml:space="preserve">A </w:t>
@@ -2816,6 +3159,7 @@
         </w:rPr>
         <w:t>&lt;</w:t>
       </w:r>
+      <w:proofErr w:type="spellStart"/>
       <w:r>
         <w:rPr>
           <w:b/>
@@ -2828,7 +3172,15 @@
           <w:b/>
           <w:bCs/>
         </w:rPr>
-        <w:t>_chunk&gt;</w:t>
+        <w:t>_chunk</w:t>
+      </w:r>
+      <w:proofErr w:type="spellEnd"/>
+      <w:r>
+        <w:rPr>
+          <w:b/>
+          <w:bCs/>
+        </w:rPr>
+        <w:t>&gt;</w:t>
       </w:r>
       <w:r>
         <w:rPr>
@@ -2838,11 +3190,16 @@
         <w:t xml:space="preserve"> </w:t>
       </w:r>
       <w:r>
-        <w:t>= &lt;common_</w:t>
+        <w:t>= &lt;</w:t>
+      </w:r>
+      <w:proofErr w:type="spellStart"/>
+      <w:r>
+        <w:t>common_</w:t>
       </w:r>
       <w:r>
         <w:t>header</w:t>
       </w:r>
+      <w:proofErr w:type="spellEnd"/>
       <w:r>
         <w:t>(</w:t>
       </w:r>
@@ -2853,6 +3210,7 @@
         </w:rPr>
         <w:t>‘</w:t>
       </w:r>
+      <w:proofErr w:type="spellStart"/>
       <w:r>
         <w:rPr>
           <w:rFonts w:ascii="Aptos" w:hAnsi="Aptos"/>
@@ -2860,7 +3218,17 @@
           <w:bCs/>
           <w:color w:val="000000"/>
         </w:rPr>
-        <w:t>PFss’</w:t>
+        <w:t>PFss</w:t>
+      </w:r>
+      <w:proofErr w:type="spellEnd"/>
+      <w:r>
+        <w:rPr>
+          <w:rFonts w:ascii="Aptos" w:hAnsi="Aptos"/>
+          <w:b/>
+          <w:bCs/>
+          <w:color w:val="000000"/>
+        </w:rPr>
+        <w:t>’</w:t>
       </w:r>
       <w:r>
         <w:rPr>
@@ -2880,7 +3248,15 @@
         <w:t xml:space="preserve"> </w:t>
       </w:r>
       <w:r>
-        <w:t>&lt;snapshot_data&gt;</w:t>
+        <w:t>&lt;</w:t>
+      </w:r>
+      <w:proofErr w:type="spellStart"/>
+      <w:r>
+        <w:t>snapshot_data</w:t>
+      </w:r>
+      <w:proofErr w:type="spellEnd"/>
+      <w:r>
+        <w:t>&gt;</w:t>
       </w:r>
       <w:r>
         <w:t xml:space="preserve"> where</w:t>
@@ -2893,6 +3269,7 @@
       <w:r>
         <w:t>&lt;</w:t>
       </w:r>
+      <w:proofErr w:type="spellStart"/>
       <w:r>
         <w:rPr>
           <w:b/>
@@ -2900,6 +3277,7 @@
         </w:rPr>
         <w:t>snapshot_data</w:t>
       </w:r>
+      <w:proofErr w:type="spellEnd"/>
       <w:r>
         <w:t>&gt; =</w:t>
       </w:r>
@@ -2907,44 +3285,81 @@
         <w:br/>
       </w:r>
       <w:r>
-        <w:t>&lt;program</w:t>
+        <w:t>&lt;</w:t>
+      </w:r>
+      <w:proofErr w:type="spellStart"/>
+      <w:r>
+        <w:t>program</w:t>
       </w:r>
       <w:r>
         <w:t>_</w:t>
       </w:r>
       <w:r>
-        <w:t xml:space="preserve">counter&gt; + </w:t>
-      </w:r>
-      <w:r>
-        <w:t>&lt;accumulator&gt; + &lt;x</w:t>
+        <w:t>counter</w:t>
+      </w:r>
+      <w:proofErr w:type="spellEnd"/>
+      <w:r>
+        <w:t xml:space="preserve">&gt; + </w:t>
+      </w:r>
+      <w:r>
+        <w:t>&lt;accumulator&gt; + &lt;</w:t>
+      </w:r>
+      <w:proofErr w:type="spellStart"/>
+      <w:r>
+        <w:t>x</w:t>
       </w:r>
       <w:r>
         <w:t>_</w:t>
       </w:r>
       <w:r>
-        <w:t>register&gt; + &lt;y</w:t>
+        <w:t>register</w:t>
+      </w:r>
+      <w:proofErr w:type="spellEnd"/>
+      <w:r>
+        <w:t>&gt; + &lt;</w:t>
+      </w:r>
+      <w:proofErr w:type="spellStart"/>
+      <w:r>
+        <w:t>y</w:t>
       </w:r>
       <w:r>
         <w:t>_</w:t>
       </w:r>
       <w:r>
-        <w:t>register&gt; + &lt;status</w:t>
+        <w:t>register</w:t>
+      </w:r>
+      <w:proofErr w:type="spellEnd"/>
+      <w:r>
+        <w:t>&gt; + &lt;</w:t>
+      </w:r>
+      <w:proofErr w:type="spellStart"/>
+      <w:r>
+        <w:t>status</w:t>
       </w:r>
       <w:r>
         <w:t>_</w:t>
       </w:r>
       <w:r>
-        <w:t>register&gt; +</w:t>
+        <w:t>register</w:t>
+      </w:r>
+      <w:proofErr w:type="spellEnd"/>
+      <w:r>
+        <w:t>&gt; +</w:t>
       </w:r>
       <w:r>
         <w:t xml:space="preserve"> </w:t>
       </w:r>
       <w:r>
-        <w:t>&lt;stack_</w:t>
+        <w:t>&lt;</w:t>
+      </w:r>
+      <w:proofErr w:type="spellStart"/>
+      <w:r>
+        <w:t>stack_</w:t>
       </w:r>
       <w:r>
         <w:t>pointer</w:t>
       </w:r>
+      <w:proofErr w:type="spellEnd"/>
       <w:r>
         <w:t xml:space="preserve">&gt; </w:t>
       </w:r>
@@ -2952,22 +3367,62 @@
         <w:t xml:space="preserve">+ </w:t>
       </w:r>
       <w:r>
-        <w:t xml:space="preserve">&lt;rom_paging_register&gt; + &lt;acccon&gt; </w:t>
-      </w:r>
-      <w:r>
-        <w:t xml:space="preserve">+ &lt;call_stack&gt; </w:t>
+        <w:t>&lt;</w:t>
+      </w:r>
+      <w:proofErr w:type="spellStart"/>
+      <w:r>
+        <w:t>rom_paging_register</w:t>
+      </w:r>
+      <w:proofErr w:type="spellEnd"/>
+      <w:r>
+        <w:t>&gt; + &lt;</w:t>
+      </w:r>
+      <w:proofErr w:type="spellStart"/>
+      <w:r>
+        <w:t>acccon</w:t>
+      </w:r>
+      <w:proofErr w:type="spellEnd"/>
+      <w:r>
+        <w:t xml:space="preserve">&gt; </w:t>
+      </w:r>
+      <w:r>
+        <w:t>+ &lt;</w:t>
+      </w:r>
+      <w:proofErr w:type="spellStart"/>
+      <w:r>
+        <w:t>call_stack</w:t>
+      </w:r>
+      <w:proofErr w:type="spellEnd"/>
+      <w:r>
+        <w:t xml:space="preserve">&gt; </w:t>
       </w:r>
       <w:r>
         <w:t xml:space="preserve">+ </w:t>
       </w:r>
       <w:r>
-        <w:t xml:space="preserve">&lt;screen_address&gt; + </w:t>
-      </w:r>
-      <w:r>
-        <w:t>&lt;hidden_ram_</w:t>
-      </w:r>
-      <w:r>
-        <w:t>address&gt;</w:t>
+        <w:t>&lt;</w:t>
+      </w:r>
+      <w:proofErr w:type="spellStart"/>
+      <w:r>
+        <w:t>screen_address</w:t>
+      </w:r>
+      <w:proofErr w:type="spellEnd"/>
+      <w:r>
+        <w:t xml:space="preserve">&gt; + </w:t>
+      </w:r>
+      <w:r>
+        <w:t>&lt;</w:t>
+      </w:r>
+      <w:proofErr w:type="spellStart"/>
+      <w:r>
+        <w:t>hidden_ram_</w:t>
+      </w:r>
+      <w:r>
+        <w:t>address</w:t>
+      </w:r>
+      <w:proofErr w:type="spellEnd"/>
+      <w:r>
+        <w:t>&gt;</w:t>
       </w:r>
       <w:r>
         <w:rPr>
@@ -2987,7 +3442,23 @@
         <w:t>_</w:t>
       </w:r>
       <w:r>
-        <w:t xml:space="preserve">registers&gt; + &lt;ULA_video_control_register&gt; + &lt;ULA_palette&gt; + </w:t>
+        <w:t>registers&gt; + &lt;</w:t>
+      </w:r>
+      <w:proofErr w:type="spellStart"/>
+      <w:r>
+        <w:t>ULA_video_control_register</w:t>
+      </w:r>
+      <w:proofErr w:type="spellEnd"/>
+      <w:r>
+        <w:t>&gt; + &lt;</w:t>
+      </w:r>
+      <w:proofErr w:type="spellStart"/>
+      <w:r>
+        <w:t>ULA_palette</w:t>
+      </w:r>
+      <w:proofErr w:type="spellEnd"/>
+      <w:r>
+        <w:t xml:space="preserve">&gt; + </w:t>
       </w:r>
       <w:r>
         <w:t>&lt;memory&gt;</w:t>
@@ -3020,13 +3491,21 @@
         <w:ind w:left="360"/>
       </w:pPr>
       <w:r>
-        <w:t>&lt;x</w:t>
+        <w:t>&lt;</w:t>
+      </w:r>
+      <w:proofErr w:type="spellStart"/>
+      <w:r>
+        <w:t>x</w:t>
       </w:r>
       <w:r>
         <w:t>_</w:t>
       </w:r>
       <w:r>
-        <w:t>register&gt; (1 byte).  The value of the X register.</w:t>
+        <w:t>register</w:t>
+      </w:r>
+      <w:proofErr w:type="spellEnd"/>
+      <w:r>
+        <w:t>&gt; (1 byte).  The value of the X register.</w:t>
       </w:r>
     </w:p>
     <w:p>
@@ -3034,13 +3513,21 @@
         <w:ind w:left="360"/>
       </w:pPr>
       <w:r>
-        <w:t>&lt;y</w:t>
+        <w:t>&lt;</w:t>
+      </w:r>
+      <w:proofErr w:type="spellStart"/>
+      <w:r>
+        <w:t>y</w:t>
       </w:r>
       <w:r>
         <w:t>_</w:t>
       </w:r>
       <w:r>
-        <w:t>register&gt; (1 byte).  The value of the Y register.</w:t>
+        <w:t>register</w:t>
+      </w:r>
+      <w:proofErr w:type="spellEnd"/>
+      <w:r>
+        <w:t>&gt; (1 byte).  The value of the Y register.</w:t>
       </w:r>
     </w:p>
     <w:p>
@@ -3048,13 +3535,21 @@
         <w:ind w:left="360"/>
       </w:pPr>
       <w:r>
-        <w:t>&lt;status</w:t>
+        <w:t>&lt;</w:t>
+      </w:r>
+      <w:proofErr w:type="spellStart"/>
+      <w:r>
+        <w:t>status</w:t>
       </w:r>
       <w:r>
         <w:t>_</w:t>
       </w:r>
       <w:r>
-        <w:t>register&gt; (1 byte).  The value of the status register.</w:t>
+        <w:t>register</w:t>
+      </w:r>
+      <w:proofErr w:type="spellEnd"/>
+      <w:r>
+        <w:t>&gt; (1 byte).  The value of the status register.</w:t>
       </w:r>
     </w:p>
     <w:p>
@@ -3062,11 +3557,16 @@
         <w:ind w:left="360"/>
       </w:pPr>
       <w:r>
-        <w:t>&lt;stack_</w:t>
+        <w:t>&lt;</w:t>
+      </w:r>
+      <w:proofErr w:type="spellStart"/>
+      <w:r>
+        <w:t>stack_</w:t>
       </w:r>
       <w:r>
         <w:t>pointer</w:t>
       </w:r>
+      <w:proofErr w:type="spellEnd"/>
       <w:r>
         <w:t xml:space="preserve">&gt; (1 byte).  The value of the stack </w:t>
       </w:r>
@@ -3087,6 +3587,7 @@
       <w:r>
         <w:t>&lt;</w:t>
       </w:r>
+      <w:proofErr w:type="spellStart"/>
       <w:r>
         <w:t>rom_</w:t>
       </w:r>
@@ -3099,6 +3600,7 @@
       <w:r>
         <w:t>_register</w:t>
       </w:r>
+      <w:proofErr w:type="spellEnd"/>
       <w:r>
         <w:t>&gt; (1 byte).</w:t>
       </w:r>
@@ -3134,9 +3636,11 @@
       <w:r>
         <w:t>&lt;</w:t>
       </w:r>
+      <w:proofErr w:type="spellStart"/>
       <w:r>
         <w:t>acccon</w:t>
       </w:r>
+      <w:proofErr w:type="spellEnd"/>
       <w:r>
         <w:t>&gt;</w:t>
       </w:r>
@@ -3172,7 +3676,31 @@
         </w:rPr>
       </w:pPr>
       <w:r>
-        <w:t>&lt;call_stack&gt; = &lt;stack_frame_count&gt; + &lt;stack_frame&gt;</w:t>
+        <w:t>&lt;</w:t>
+      </w:r>
+      <w:proofErr w:type="spellStart"/>
+      <w:r>
+        <w:t>call_stack</w:t>
+      </w:r>
+      <w:proofErr w:type="spellEnd"/>
+      <w:r>
+        <w:t>&gt; = &lt;</w:t>
+      </w:r>
+      <w:proofErr w:type="spellStart"/>
+      <w:r>
+        <w:t>stack_frame_count</w:t>
+      </w:r>
+      <w:proofErr w:type="spellEnd"/>
+      <w:r>
+        <w:t>&gt; + &lt;</w:t>
+      </w:r>
+      <w:proofErr w:type="spellStart"/>
+      <w:r>
+        <w:t>stack_frame</w:t>
+      </w:r>
+      <w:proofErr w:type="spellEnd"/>
+      <w:r>
+        <w:t>&gt;</w:t>
       </w:r>
       <w:r>
         <w:rPr>
@@ -3274,10 +3802,7 @@
         <w:t xml:space="preserve">The contained start and return addresses are expressed in </w:t>
       </w:r>
       <w:r>
-        <w:t xml:space="preserve">page / </w:t>
-      </w:r>
-      <w:r>
-        <w:t xml:space="preserve">absolute </w:t>
+        <w:t xml:space="preserve">page / absolute </w:t>
       </w:r>
       <w:r>
         <w:t>address pairs.  Page locations will typically be in whole RAM or a ROM page.</w:t>
@@ -3344,7 +3869,15 @@
         <w:ind w:left="720"/>
       </w:pPr>
       <w:r>
-        <w:t>&lt;stack_frame_count&gt; (1 byte) The number of stack frames.</w:t>
+        <w:t>&lt;</w:t>
+      </w:r>
+      <w:proofErr w:type="spellStart"/>
+      <w:r>
+        <w:t>stack_frame_count</w:t>
+      </w:r>
+      <w:proofErr w:type="spellEnd"/>
+      <w:r>
+        <w:t>&gt; (1 byte) The number of stack frames.</w:t>
       </w:r>
     </w:p>
     <w:p>
@@ -3352,38 +3885,82 @@
         <w:ind w:left="720"/>
       </w:pPr>
       <w:r>
-        <w:t xml:space="preserve">&lt;stack_frame&gt; = </w:t>
-      </w:r>
-      <w:r>
-        <w:t xml:space="preserve">&lt;stack_frame_type&gt; + </w:t>
-      </w:r>
-      <w:r>
-        <w:t xml:space="preserve">&lt;start_address_page&gt; + </w:t>
-      </w:r>
-      <w:r>
         <w:t>&lt;</w:t>
       </w:r>
+      <w:proofErr w:type="spellStart"/>
+      <w:r>
+        <w:t>stack_frame</w:t>
+      </w:r>
+      <w:proofErr w:type="spellEnd"/>
+      <w:r>
+        <w:t xml:space="preserve">&gt; = </w:t>
+      </w:r>
+      <w:r>
+        <w:t>&lt;</w:t>
+      </w:r>
+      <w:proofErr w:type="spellStart"/>
+      <w:r>
+        <w:t>stack_frame_type</w:t>
+      </w:r>
+      <w:proofErr w:type="spellEnd"/>
+      <w:r>
+        <w:t xml:space="preserve">&gt; + </w:t>
+      </w:r>
+      <w:r>
+        <w:t>&lt;</w:t>
+      </w:r>
+      <w:proofErr w:type="spellStart"/>
+      <w:r>
+        <w:t>start_address_page</w:t>
+      </w:r>
+      <w:proofErr w:type="spellEnd"/>
+      <w:r>
+        <w:t xml:space="preserve">&gt; + </w:t>
+      </w:r>
+      <w:r>
+        <w:t>&lt;</w:t>
+      </w:r>
+      <w:proofErr w:type="spellStart"/>
       <w:r>
         <w:t>start</w:t>
       </w:r>
       <w:r>
-        <w:t>_address&gt; + &lt;return_address</w:t>
+        <w:t>_address</w:t>
+      </w:r>
+      <w:proofErr w:type="spellEnd"/>
+      <w:r>
+        <w:t>&gt; + &lt;</w:t>
+      </w:r>
+      <w:proofErr w:type="spellStart"/>
+      <w:r>
+        <w:t>return_address</w:t>
       </w:r>
       <w:r>
         <w:t>_page</w:t>
       </w:r>
+      <w:proofErr w:type="spellEnd"/>
       <w:r>
         <w:t xml:space="preserve">&gt; + </w:t>
       </w:r>
       <w:r>
-        <w:t xml:space="preserve">&lt;return_address&gt; + </w:t>
-      </w:r>
-      <w:r>
         <w:t>&lt;</w:t>
       </w:r>
+      <w:proofErr w:type="spellStart"/>
+      <w:r>
+        <w:t>return_address</w:t>
+      </w:r>
+      <w:proofErr w:type="spellEnd"/>
+      <w:r>
+        <w:t xml:space="preserve">&gt; + </w:t>
+      </w:r>
+      <w:r>
+        <w:t>&lt;</w:t>
+      </w:r>
+      <w:proofErr w:type="spellStart"/>
       <w:r>
         <w:t>return_stack_pointer</w:t>
       </w:r>
+      <w:proofErr w:type="spellEnd"/>
       <w:r>
         <w:t>&gt;</w:t>
       </w:r>
@@ -3393,7 +3970,15 @@
         <w:ind w:left="1080"/>
       </w:pPr>
       <w:r>
-        <w:t>&lt;stack_frame_type&gt; (1 byte) The stack frame’s type.  The value can be one of the following:</w:t>
+        <w:t>&lt;</w:t>
+      </w:r>
+      <w:proofErr w:type="spellStart"/>
+      <w:r>
+        <w:t>stack_frame_type</w:t>
+      </w:r>
+      <w:proofErr w:type="spellEnd"/>
+      <w:r>
+        <w:t>&gt; (1 byte) The stack frame’s type.  The value can be one of the following:</w:t>
       </w:r>
     </w:p>
     <w:tbl>
@@ -3601,10 +4186,18 @@
         <w:ind w:left="1080"/>
       </w:pPr>
       <w:r>
-        <w:t>&lt;sta</w:t>
-      </w:r>
-      <w:r>
-        <w:t xml:space="preserve">rt_address_page (1 byte) </w:t>
+        <w:t>&lt;</w:t>
+      </w:r>
+      <w:proofErr w:type="spellStart"/>
+      <w:r>
+        <w:t>sta</w:t>
+      </w:r>
+      <w:r>
+        <w:t>rt_address_page</w:t>
+      </w:r>
+      <w:proofErr w:type="spellEnd"/>
+      <w:r>
+        <w:t xml:space="preserve"> (1 byte) </w:t>
       </w:r>
       <w:r>
         <w:t>The memory p</w:t>
@@ -3877,12 +4470,14 @@
       <w:r>
         <w:t>&lt;</w:t>
       </w:r>
+      <w:proofErr w:type="spellStart"/>
       <w:r>
         <w:t>start</w:t>
       </w:r>
       <w:r>
         <w:t>_address</w:t>
       </w:r>
+      <w:proofErr w:type="spellEnd"/>
       <w:r>
         <w:t>&gt; (</w:t>
       </w:r>
@@ -3943,7 +4538,15 @@
         <w:ind w:left="1080"/>
       </w:pPr>
       <w:r>
-        <w:t xml:space="preserve">&lt;return_address_page (1 byte) The memory page where the </w:t>
+        <w:t>&lt;</w:t>
+      </w:r>
+      <w:proofErr w:type="spellStart"/>
+      <w:r>
+        <w:t>return_address_page</w:t>
+      </w:r>
+      <w:proofErr w:type="spellEnd"/>
+      <w:r>
+        <w:t xml:space="preserve"> (1 byte) The memory page where the </w:t>
       </w:r>
       <w:r>
         <w:t xml:space="preserve">return </w:t>
@@ -3960,7 +4563,15 @@
         <w:ind w:left="1080"/>
       </w:pPr>
       <w:r>
-        <w:t>&lt;return_address&gt; (2 bytes) Return address of the invoked routine</w:t>
+        <w:t>&lt;</w:t>
+      </w:r>
+      <w:proofErr w:type="spellStart"/>
+      <w:r>
+        <w:t>return_address</w:t>
+      </w:r>
+      <w:proofErr w:type="spellEnd"/>
+      <w:r>
+        <w:t>&gt; (2 bytes) Return address of the invoked routine</w:t>
       </w:r>
       <w:r>
         <w:t xml:space="preserve">.  The root stack frame contains the address of the JMP instruction that invoked the program, or </w:t>
@@ -4005,6 +4616,7 @@
       <w:r>
         <w:t>&lt;</w:t>
       </w:r>
+      <w:proofErr w:type="spellStart"/>
       <w:r>
         <w:t>return_</w:t>
       </w:r>
@@ -4014,6 +4626,7 @@
       <w:r>
         <w:t>pointer</w:t>
       </w:r>
+      <w:proofErr w:type="spellEnd"/>
       <w:r>
         <w:t xml:space="preserve">&gt; </w:t>
       </w:r>
@@ -4034,11 +4647,16 @@
       <w:r>
         <w:t>&lt;</w:t>
       </w:r>
+      <w:proofErr w:type="spellStart"/>
       <w:r>
         <w:t>screen</w:t>
       </w:r>
       <w:r>
-        <w:t xml:space="preserve">_address&gt; (1 byte).  </w:t>
+        <w:t>_address</w:t>
+      </w:r>
+      <w:proofErr w:type="spellEnd"/>
+      <w:r>
+        <w:t xml:space="preserve">&gt; (1 byte).  </w:t>
       </w:r>
       <w:r>
         <w:t xml:space="preserve">The value specifies </w:t>
@@ -4249,7 +4867,15 @@
         <w:ind w:left="360"/>
       </w:pPr>
       <w:r>
-        <w:t>&lt;hidden_ram_address&gt; (1 byte)</w:t>
+        <w:t>&lt;</w:t>
+      </w:r>
+      <w:proofErr w:type="spellStart"/>
+      <w:r>
+        <w:t>hidden_ram_address</w:t>
+      </w:r>
+      <w:proofErr w:type="spellEnd"/>
+      <w:r>
+        <w:t>&gt; (1 byte)</w:t>
       </w:r>
       <w:r>
         <w:t xml:space="preserve">.  Populated </w:t>
@@ -4350,7 +4976,15 @@
         <w:ind w:left="360"/>
       </w:pPr>
       <w:r>
-        <w:t>&lt;ULA_video_control_register&gt; (1 byte).  The value of the ULA video control register.</w:t>
+        <w:t>&lt;</w:t>
+      </w:r>
+      <w:proofErr w:type="spellStart"/>
+      <w:r>
+        <w:t>ULA_video_control_register</w:t>
+      </w:r>
+      <w:proofErr w:type="spellEnd"/>
+      <w:r>
+        <w:t>&gt; (1 byte).  The value of the ULA video control register.</w:t>
       </w:r>
     </w:p>
     <w:p>
@@ -4358,7 +4992,15 @@
         <w:ind w:left="360"/>
       </w:pPr>
       <w:r>
-        <w:t xml:space="preserve">&lt;ULA_palette&gt; (16 bytes).  The </w:t>
+        <w:t>&lt;</w:t>
+      </w:r>
+      <w:proofErr w:type="spellStart"/>
+      <w:r>
+        <w:t>ULA_palette</w:t>
+      </w:r>
+      <w:proofErr w:type="spellEnd"/>
+      <w:r>
+        <w:t xml:space="preserve">&gt; (16 bytes).  The </w:t>
       </w:r>
       <w:r>
         <w:t xml:space="preserve">ULA’s </w:t>
@@ -4373,7 +5015,15 @@
         <w:t>ries</w:t>
       </w:r>
       <w:r>
-        <w:t xml:space="preserve"> where physical colors are xor’d with 0x7.</w:t>
+        <w:t xml:space="preserve"> where physical colors are </w:t>
+      </w:r>
+      <w:proofErr w:type="spellStart"/>
+      <w:r>
+        <w:t>xor’d</w:t>
+      </w:r>
+      <w:proofErr w:type="spellEnd"/>
+      <w:r>
+        <w:t xml:space="preserve"> with 0x7.</w:t>
       </w:r>
     </w:p>
     <w:p>
@@ -4419,20 +5069,38 @@
       <w:r>
         <w:t>&lt;</w:t>
       </w:r>
+      <w:proofErr w:type="spellStart"/>
       <w:r>
         <w:t>base_</w:t>
       </w:r>
       <w:r>
-        <w:t>memory&gt; + &lt;paged_</w:t>
-      </w:r>
-      <w:r>
         <w:t>memory</w:t>
       </w:r>
+      <w:proofErr w:type="spellEnd"/>
+      <w:r>
+        <w:t>&gt; + &lt;</w:t>
+      </w:r>
+      <w:proofErr w:type="spellStart"/>
+      <w:r>
+        <w:t>paged_</w:t>
+      </w:r>
+      <w:r>
+        <w:t>memory</w:t>
+      </w:r>
+      <w:proofErr w:type="spellEnd"/>
       <w:r>
         <w:t xml:space="preserve">&gt; </w:t>
       </w:r>
       <w:r>
-        <w:t>+ &lt;shadow_ram&gt;</w:t>
+        <w:t>+ &lt;</w:t>
+      </w:r>
+      <w:proofErr w:type="spellStart"/>
+      <w:r>
+        <w:t>shadow_ram</w:t>
+      </w:r>
+      <w:proofErr w:type="spellEnd"/>
+      <w:r>
+        <w:t>&gt;</w:t>
       </w:r>
       <w:r>
         <w:rPr>
@@ -4446,7 +5114,15 @@
         <w:t xml:space="preserve"> + </w:t>
       </w:r>
       <w:r>
-        <w:t>&lt;mos_ram&gt;</w:t>
+        <w:t>&lt;</w:t>
+      </w:r>
+      <w:proofErr w:type="spellStart"/>
+      <w:r>
+        <w:t>mos_ram</w:t>
+      </w:r>
+      <w:proofErr w:type="spellEnd"/>
+      <w:r>
+        <w:t>&gt;</w:t>
       </w:r>
       <w:r>
         <w:rPr>
@@ -4468,7 +5144,15 @@
         <w:t xml:space="preserve"> + </w:t>
       </w:r>
       <w:r>
-        <w:t>&lt;filing_system_ram&gt;</w:t>
+        <w:t>&lt;</w:t>
+      </w:r>
+      <w:proofErr w:type="spellStart"/>
+      <w:r>
+        <w:t>filing_system_ram</w:t>
+      </w:r>
+      <w:proofErr w:type="spellEnd"/>
+      <w:r>
+        <w:t>&gt;</w:t>
       </w:r>
       <w:r>
         <w:rPr>
@@ -4482,7 +5166,15 @@
         <w:t xml:space="preserve"> +</w:t>
       </w:r>
       <w:r>
-        <w:t xml:space="preserve"> &lt;private_ram&gt;</w:t>
+        <w:t xml:space="preserve"> &lt;</w:t>
+      </w:r>
+      <w:proofErr w:type="spellStart"/>
+      <w:r>
+        <w:t>private_ram</w:t>
+      </w:r>
+      <w:proofErr w:type="spellEnd"/>
+      <w:r>
+        <w:t>&gt;</w:t>
       </w:r>
       <w:r>
         <w:rPr>
@@ -4493,7 +5185,15 @@
         <w:t>opt</w:t>
       </w:r>
       <w:r>
-        <w:t xml:space="preserve"> + &lt;hidden_ram&gt;</w:t>
+        <w:t xml:space="preserve"> + &lt;</w:t>
+      </w:r>
+      <w:proofErr w:type="spellStart"/>
+      <w:r>
+        <w:t>hidden_ram</w:t>
+      </w:r>
+      <w:proofErr w:type="spellEnd"/>
+      <w:r>
+        <w:t>&gt;</w:t>
       </w:r>
       <w:r>
         <w:rPr>
@@ -4675,7 +5375,15 @@
               <w:ind w:left="1440" w:hanging="1440"/>
             </w:pPr>
             <w:r>
-              <w:t>&lt;base_memory&gt;</w:t>
+              <w:t>&lt;</w:t>
+            </w:r>
+            <w:proofErr w:type="spellStart"/>
+            <w:r>
+              <w:t>base_memory</w:t>
+            </w:r>
+            <w:proofErr w:type="spellEnd"/>
+            <w:r>
+              <w:t>&gt;</w:t>
             </w:r>
           </w:p>
         </w:tc>
@@ -4749,8 +5457,13 @@
               <w:lastRenderedPageBreak/>
               <w:t>&lt;</w:t>
             </w:r>
+            <w:proofErr w:type="spellStart"/>
             <w:r>
-              <w:t>paged_memory&gt;</w:t>
+              <w:t>paged_memory</w:t>
+            </w:r>
+            <w:proofErr w:type="spellEnd"/>
+            <w:r>
+              <w:t>&gt;</w:t>
             </w:r>
           </w:p>
         </w:tc>
@@ -4821,7 +5534,15 @@
           </w:tcPr>
           <w:p>
             <w:r>
-              <w:t>&lt;shadow_ram&gt;</w:t>
+              <w:t>&lt;</w:t>
+            </w:r>
+            <w:proofErr w:type="spellStart"/>
+            <w:r>
+              <w:t>shadow_ram</w:t>
+            </w:r>
+            <w:proofErr w:type="spellEnd"/>
+            <w:r>
+              <w:t>&gt;</w:t>
             </w:r>
           </w:p>
         </w:tc>
@@ -4885,7 +5606,15 @@
           </w:tcPr>
           <w:p>
             <w:r>
-              <w:t>&lt;mos_ram&gt;</w:t>
+              <w:t>&lt;</w:t>
+            </w:r>
+            <w:proofErr w:type="spellStart"/>
+            <w:r>
+              <w:t>mos_ram</w:t>
+            </w:r>
+            <w:proofErr w:type="spellEnd"/>
+            <w:r>
+              <w:t>&gt;</w:t>
             </w:r>
           </w:p>
         </w:tc>
@@ -4940,7 +5669,15 @@
           </w:tcPr>
           <w:p>
             <w:r>
-              <w:t>&lt;filing_system_ram&gt;</w:t>
+              <w:t>&lt;</w:t>
+            </w:r>
+            <w:proofErr w:type="spellStart"/>
+            <w:r>
+              <w:t>filing_system_ram</w:t>
+            </w:r>
+            <w:proofErr w:type="spellEnd"/>
+            <w:r>
+              <w:t>&gt;</w:t>
             </w:r>
           </w:p>
         </w:tc>
@@ -4995,7 +5732,15 @@
           </w:tcPr>
           <w:p>
             <w:r>
-              <w:t>&lt;private_ram&gt;</w:t>
+              <w:t>&lt;</w:t>
+            </w:r>
+            <w:proofErr w:type="spellStart"/>
+            <w:r>
+              <w:t>private_ram</w:t>
+            </w:r>
+            <w:proofErr w:type="spellEnd"/>
+            <w:r>
+              <w:t>&gt;</w:t>
             </w:r>
           </w:p>
         </w:tc>
@@ -5053,7 +5798,15 @@
           </w:tcPr>
           <w:p>
             <w:r>
-              <w:t>&lt;hidden_ram&gt;</w:t>
+              <w:t>&lt;</w:t>
+            </w:r>
+            <w:proofErr w:type="spellStart"/>
+            <w:r>
+              <w:t>hidden_ram</w:t>
+            </w:r>
+            <w:proofErr w:type="spellEnd"/>
+            <w:r>
+              <w:t>&gt;</w:t>
             </w:r>
           </w:p>
         </w:tc>
@@ -5112,11 +5865,16 @@
       <w:r>
         <w:t>&lt;</w:t>
       </w:r>
+      <w:proofErr w:type="spellStart"/>
       <w:r>
         <w:t>base_</w:t>
       </w:r>
       <w:r>
-        <w:t>memory&gt; (64K) The default 64K of memory.</w:t>
+        <w:t>memory</w:t>
+      </w:r>
+      <w:proofErr w:type="spellEnd"/>
+      <w:r>
+        <w:t>&gt; (64K) The default 64K of memory.</w:t>
       </w:r>
       <w:r>
         <w:t xml:space="preserve">  Addresses 0</w:t>
@@ -5135,23 +5893,38 @@
       <w:r>
         <w:t>&lt;</w:t>
       </w:r>
+      <w:proofErr w:type="spellStart"/>
       <w:r>
         <w:t>paged_</w:t>
       </w:r>
       <w:r>
         <w:t>memory</w:t>
       </w:r>
+      <w:proofErr w:type="spellEnd"/>
       <w:r>
         <w:t>&gt;</w:t>
       </w:r>
       <w:r>
-        <w:t xml:space="preserve"> = &lt;page_count&gt; + &lt;</w:t>
-      </w:r>
+        <w:t xml:space="preserve"> = &lt;</w:t>
+      </w:r>
+      <w:proofErr w:type="spellStart"/>
+      <w:r>
+        <w:t>page_count</w:t>
+      </w:r>
+      <w:proofErr w:type="spellEnd"/>
+      <w:r>
+        <w:t>&gt; + &lt;</w:t>
+      </w:r>
+      <w:proofErr w:type="spellStart"/>
       <w:r>
         <w:t>page_</w:t>
       </w:r>
       <w:r>
-        <w:t>data&gt;</w:t>
+        <w:t>data</w:t>
+      </w:r>
+      <w:proofErr w:type="spellEnd"/>
+      <w:r>
+        <w:t>&gt;</w:t>
       </w:r>
       <w:r>
         <w:rPr>
@@ -5178,7 +5951,15 @@
         <w:ind w:left="720"/>
       </w:pPr>
       <w:r>
-        <w:t>&lt;page_count&gt; (1 byte) The number of pages.</w:t>
+        <w:t>&lt;</w:t>
+      </w:r>
+      <w:proofErr w:type="spellStart"/>
+      <w:r>
+        <w:t>page_count</w:t>
+      </w:r>
+      <w:proofErr w:type="spellEnd"/>
+      <w:r>
+        <w:t>&gt; (1 byte) The number of pages.</w:t>
       </w:r>
     </w:p>
     <w:p>
@@ -5186,17 +5967,46 @@
         <w:ind w:left="720"/>
       </w:pPr>
       <w:r>
-        <w:t>&lt;page_data&gt; = &lt;page_ba</w:t>
+        <w:t>&lt;</w:t>
+      </w:r>
+      <w:proofErr w:type="spellStart"/>
+      <w:r>
+        <w:t>page_data</w:t>
+      </w:r>
+      <w:proofErr w:type="spellEnd"/>
+      <w:r>
+        <w:t>&gt; = &lt;</w:t>
+      </w:r>
+      <w:proofErr w:type="spellStart"/>
+      <w:r>
+        <w:t>page_ba</w:t>
       </w:r>
       <w:r>
         <w:t>n</w:t>
       </w:r>
       <w:r>
-        <w:t>k&gt; + &lt;page_readonly&gt; + &lt;page_memor</w:t>
+        <w:t>k</w:t>
+      </w:r>
+      <w:proofErr w:type="spellEnd"/>
+      <w:r>
+        <w:t>&gt; + &lt;</w:t>
+      </w:r>
+      <w:proofErr w:type="spellStart"/>
+      <w:r>
+        <w:t>page_readonly</w:t>
+      </w:r>
+      <w:proofErr w:type="spellEnd"/>
+      <w:r>
+        <w:t>&gt; + &lt;</w:t>
+      </w:r>
+      <w:proofErr w:type="spellStart"/>
+      <w:r>
+        <w:t>page_memor</w:t>
       </w:r>
       <w:r>
         <w:t>y</w:t>
       </w:r>
+      <w:proofErr w:type="spellEnd"/>
       <w:r>
         <w:t>&gt;</w:t>
       </w:r>
@@ -5206,11 +6016,16 @@
         <w:ind w:left="1080"/>
       </w:pPr>
       <w:r>
-        <w:t>&lt;page_</w:t>
+        <w:t>&lt;</w:t>
+      </w:r>
+      <w:proofErr w:type="spellStart"/>
+      <w:r>
+        <w:t>page_</w:t>
       </w:r>
       <w:r>
         <w:t>bank</w:t>
       </w:r>
+      <w:proofErr w:type="spellEnd"/>
       <w:r>
         <w:t xml:space="preserve">&gt; (1 byte) A page </w:t>
       </w:r>
@@ -5229,11 +6044,16 @@
         <w:ind w:left="1080"/>
       </w:pPr>
       <w:r>
-        <w:t>&lt;page_</w:t>
+        <w:t>&lt;</w:t>
+      </w:r>
+      <w:proofErr w:type="spellStart"/>
+      <w:r>
+        <w:t>page_</w:t>
       </w:r>
       <w:r>
         <w:t>readonly</w:t>
       </w:r>
+      <w:proofErr w:type="spellEnd"/>
       <w:r>
         <w:t xml:space="preserve">&gt; (1 byte) A page </w:t>
       </w:r>
@@ -5272,9 +6092,11 @@
       <w:r>
         <w:t>&lt;</w:t>
       </w:r>
+      <w:proofErr w:type="spellStart"/>
       <w:r>
         <w:t>page_memory</w:t>
       </w:r>
+      <w:proofErr w:type="spellEnd"/>
       <w:r>
         <w:t xml:space="preserve">&gt; (16K) </w:t>
       </w:r>
@@ -5290,7 +6112,15 @@
         <w:ind w:left="360"/>
       </w:pPr>
       <w:r>
-        <w:t xml:space="preserve">&lt;shadow_ram&gt; (20K) </w:t>
+        <w:t>&lt;</w:t>
+      </w:r>
+      <w:proofErr w:type="spellStart"/>
+      <w:r>
+        <w:t>shadow_ram</w:t>
+      </w:r>
+      <w:proofErr w:type="spellEnd"/>
+      <w:r>
+        <w:t xml:space="preserve">&gt; (20K) </w:t>
       </w:r>
       <w:r>
         <w:t xml:space="preserve">Populated on Model B Plus, BBC Model </w:t>
@@ -5325,7 +6155,15 @@
         <w:ind w:left="360"/>
       </w:pPr>
       <w:r>
-        <w:t xml:space="preserve">&lt;mos_ram&gt; (4K) </w:t>
+        <w:t>&lt;</w:t>
+      </w:r>
+      <w:proofErr w:type="spellStart"/>
+      <w:r>
+        <w:t>mos_ram</w:t>
+      </w:r>
+      <w:proofErr w:type="spellEnd"/>
+      <w:r>
+        <w:t xml:space="preserve">&gt; (4K) </w:t>
       </w:r>
       <w:r>
         <w:t>Populated on BBC Master</w:t>
@@ -5345,7 +6183,15 @@
         <w:ind w:left="360"/>
       </w:pPr>
       <w:r>
-        <w:t xml:space="preserve">&lt;filing_system_ram&gt; (8K) </w:t>
+        <w:t>&lt;</w:t>
+      </w:r>
+      <w:proofErr w:type="spellStart"/>
+      <w:r>
+        <w:t>filing_system_ram</w:t>
+      </w:r>
+      <w:proofErr w:type="spellEnd"/>
+      <w:r>
+        <w:t xml:space="preserve">&gt; (8K) </w:t>
       </w:r>
       <w:r>
         <w:t>Populated on BBC Master</w:t>
@@ -5374,7 +6220,15 @@
         <w:ind w:left="360"/>
       </w:pPr>
       <w:r>
-        <w:t>&lt;private_ram&gt; (</w:t>
+        <w:t>&lt;</w:t>
+      </w:r>
+      <w:proofErr w:type="spellStart"/>
+      <w:r>
+        <w:t>private_ram</w:t>
+      </w:r>
+      <w:proofErr w:type="spellEnd"/>
+      <w:r>
+        <w:t>&gt; (</w:t>
       </w:r>
       <w:r>
         <w:t>12</w:t>
@@ -5403,12 +6257,14 @@
       <w:r>
         <w:t>Integra</w:t>
       </w:r>
+      <w:proofErr w:type="gramStart"/>
       <w:r>
         <w:t>.</w:t>
       </w:r>
       <w:r>
         <w:t xml:space="preserve"> </w:t>
       </w:r>
+      <w:proofErr w:type="gramEnd"/>
       <w:r>
         <w:t>Addresses &amp;</w:t>
       </w:r>
@@ -5433,7 +6289,15 @@
         <w:ind w:left="360"/>
       </w:pPr>
       <w:r>
-        <w:t xml:space="preserve">&lt;hidden_ram&gt; (256 bytes) </w:t>
+        <w:t>&lt;</w:t>
+      </w:r>
+      <w:proofErr w:type="spellStart"/>
+      <w:r>
+        <w:t>hidden_ram</w:t>
+      </w:r>
+      <w:proofErr w:type="spellEnd"/>
+      <w:r>
+        <w:t xml:space="preserve">&gt; (256 bytes) </w:t>
       </w:r>
       <w:r>
         <w:t>Populated on BBC Model Integra B.</w:t>
@@ -5524,11 +6388,32 @@
           <w:b/>
           <w:bCs/>
         </w:rPr>
-        <w:t>&lt;execution_chunk&gt;</w:t>
-      </w:r>
-      <w:r>
-        <w:t xml:space="preserve"> = &lt;common_header</w:t>
-      </w:r>
+        <w:t>&lt;</w:t>
+      </w:r>
+      <w:proofErr w:type="spellStart"/>
+      <w:r>
+        <w:rPr>
+          <w:b/>
+          <w:bCs/>
+        </w:rPr>
+        <w:t>execution_chunk</w:t>
+      </w:r>
+      <w:proofErr w:type="spellEnd"/>
+      <w:r>
+        <w:rPr>
+          <w:b/>
+          <w:bCs/>
+        </w:rPr>
+        <w:t>&gt;</w:t>
+      </w:r>
+      <w:r>
+        <w:t xml:space="preserve"> = &lt;</w:t>
+      </w:r>
+      <w:proofErr w:type="spellStart"/>
+      <w:r>
+        <w:t>common_header</w:t>
+      </w:r>
+      <w:proofErr w:type="spellEnd"/>
       <w:r>
         <w:t>(</w:t>
       </w:r>
@@ -5539,6 +6424,7 @@
         </w:rPr>
         <w:t>‘</w:t>
       </w:r>
+      <w:proofErr w:type="spellStart"/>
       <w:r>
         <w:rPr>
           <w:rFonts w:ascii="Aptos" w:hAnsi="Aptos"/>
@@ -5546,7 +6432,17 @@
           <w:bCs/>
           <w:color w:val="000000"/>
         </w:rPr>
-        <w:t>PFex’</w:t>
+        <w:t>PFex</w:t>
+      </w:r>
+      <w:proofErr w:type="spellEnd"/>
+      <w:r>
+        <w:rPr>
+          <w:rFonts w:ascii="Aptos" w:hAnsi="Aptos"/>
+          <w:b/>
+          <w:bCs/>
+          <w:color w:val="000000"/>
+        </w:rPr>
+        <w:t>’</w:t>
       </w:r>
       <w:r>
         <w:rPr>
@@ -5556,7 +6452,15 @@
         <w:t>)</w:t>
       </w:r>
       <w:r>
-        <w:t>&gt; + &lt;execution_data&gt;</w:t>
+        <w:t>&gt; + &lt;</w:t>
+      </w:r>
+      <w:proofErr w:type="spellStart"/>
+      <w:r>
+        <w:t>execution_data</w:t>
+      </w:r>
+      <w:proofErr w:type="spellEnd"/>
+      <w:r>
+        <w:t>&gt;</w:t>
       </w:r>
       <w:r>
         <w:t xml:space="preserve"> where</w:t>
@@ -5571,7 +6475,23 @@
           <w:b/>
           <w:bCs/>
         </w:rPr>
-        <w:t>&lt;execution_data&gt;</w:t>
+        <w:t>&lt;</w:t>
+      </w:r>
+      <w:proofErr w:type="spellStart"/>
+      <w:r>
+        <w:rPr>
+          <w:b/>
+          <w:bCs/>
+        </w:rPr>
+        <w:t>execution_data</w:t>
+      </w:r>
+      <w:proofErr w:type="spellEnd"/>
+      <w:r>
+        <w:rPr>
+          <w:b/>
+          <w:bCs/>
+        </w:rPr>
+        <w:t>&gt;</w:t>
       </w:r>
       <w:r>
         <w:t xml:space="preserve"> = </w:t>
@@ -5629,7 +6549,23 @@
         <w:t>&gt;</w:t>
       </w:r>
       <w:r>
-        <w:t xml:space="preserve"> = &lt;event_marker&gt; + &lt;event_params&gt; </w:t>
+        <w:t xml:space="preserve"> = &lt;</w:t>
+      </w:r>
+      <w:proofErr w:type="spellStart"/>
+      <w:r>
+        <w:t>event_marker</w:t>
+      </w:r>
+      <w:proofErr w:type="spellEnd"/>
+      <w:r>
+        <w:t>&gt; + &lt;</w:t>
+      </w:r>
+      <w:proofErr w:type="spellStart"/>
+      <w:r>
+        <w:t>event_params</w:t>
+      </w:r>
+      <w:proofErr w:type="spellEnd"/>
+      <w:r>
+        <w:t xml:space="preserve">&gt; </w:t>
       </w:r>
     </w:p>
     <w:p>
@@ -5638,7 +6574,15 @@
       </w:pPr>
       <w:r>
         <w:lastRenderedPageBreak/>
-        <w:t>&lt;event_marker&gt; (2 bytes).  A two-byte value that distinguishes a</w:t>
+        <w:t>&lt;</w:t>
+      </w:r>
+      <w:proofErr w:type="spellStart"/>
+      <w:r>
+        <w:t>event_marker</w:t>
+      </w:r>
+      <w:proofErr w:type="spellEnd"/>
+      <w:r>
+        <w:t>&gt; (2 bytes).  A two-byte value that distinguishes a</w:t>
       </w:r>
       <w:r>
         <w:t>n</w:t>
@@ -5795,7 +6739,15 @@
           </w:tcPr>
           <w:p>
             <w:r>
-              <w:t>&lt;interrupt_event_params&gt;</w:t>
+              <w:t>&lt;</w:t>
+            </w:r>
+            <w:proofErr w:type="spellStart"/>
+            <w:r>
+              <w:t>interrupt_event_params</w:t>
+            </w:r>
+            <w:proofErr w:type="spellEnd"/>
+            <w:r>
+              <w:t>&gt;</w:t>
             </w:r>
           </w:p>
         </w:tc>
@@ -5830,7 +6782,15 @@
           </w:tcPr>
           <w:p>
             <w:r>
-              <w:t>&lt;interrupt_event_params&gt;</w:t>
+              <w:t>&lt;</w:t>
+            </w:r>
+            <w:proofErr w:type="spellStart"/>
+            <w:r>
+              <w:t>interrupt_event_params</w:t>
+            </w:r>
+            <w:proofErr w:type="spellEnd"/>
+            <w:r>
+              <w:t>&gt;</w:t>
             </w:r>
           </w:p>
         </w:tc>
@@ -5868,6 +6828,7 @@
               </w:rPr>
               <w:t>&lt;</w:t>
             </w:r>
+            <w:proofErr w:type="spellStart"/>
             <w:r>
               <w:t>display_fi</w:t>
             </w:r>
@@ -5875,7 +6836,11 @@
               <w:t>e</w:t>
             </w:r>
             <w:r>
-              <w:t>ld&gt;</w:t>
+              <w:t>ld</w:t>
+            </w:r>
+            <w:proofErr w:type="spellEnd"/>
+            <w:r>
+              <w:t>&gt;</w:t>
             </w:r>
           </w:p>
         </w:tc>
@@ -5897,7 +6862,23 @@
                 <w:i/>
                 <w:iCs/>
               </w:rPr>
-              <w:t>&amp;80, &amp;03..&amp;7F</w:t>
+              <w:t>&amp;80, &amp;</w:t>
+            </w:r>
+            <w:proofErr w:type="gramStart"/>
+            <w:r>
+              <w:rPr>
+                <w:i/>
+                <w:iCs/>
+              </w:rPr>
+              <w:t>03..</w:t>
+            </w:r>
+            <w:proofErr w:type="gramEnd"/>
+            <w:r>
+              <w:rPr>
+                <w:i/>
+                <w:iCs/>
+              </w:rPr>
+              <w:t>&amp;7F</w:t>
             </w:r>
           </w:p>
         </w:tc>
@@ -6015,7 +6996,23 @@
           <w:b/>
           <w:bCs/>
         </w:rPr>
-        <w:t>&lt;interrupt_event_params&gt;</w:t>
+        <w:t>&lt;</w:t>
+      </w:r>
+      <w:proofErr w:type="spellStart"/>
+      <w:r>
+        <w:rPr>
+          <w:b/>
+          <w:bCs/>
+        </w:rPr>
+        <w:t>interrupt_event_params</w:t>
+      </w:r>
+      <w:proofErr w:type="spellEnd"/>
+      <w:r>
+        <w:rPr>
+          <w:b/>
+          <w:bCs/>
+        </w:rPr>
+        <w:t>&gt;</w:t>
       </w:r>
       <w:r>
         <w:t xml:space="preserve"> </w:t>
@@ -6030,20 +7027,38 @@
         <w:br/>
       </w:r>
       <w:r>
-        <w:t xml:space="preserve">&lt;cycle_count&gt; </w:t>
+        <w:t>&lt;</w:t>
+      </w:r>
+      <w:proofErr w:type="spellStart"/>
+      <w:r>
+        <w:t>cycle_count</w:t>
+      </w:r>
+      <w:proofErr w:type="spellEnd"/>
+      <w:r>
+        <w:t xml:space="preserve">&gt; </w:t>
       </w:r>
       <w:r>
         <w:t xml:space="preserve">+ </w:t>
       </w:r>
       <w:r>
-        <w:t xml:space="preserve">&lt;destination_address&gt; + </w:t>
-      </w:r>
-      <w:r>
         <w:t>&lt;</w:t>
       </w:r>
+      <w:proofErr w:type="spellStart"/>
+      <w:r>
+        <w:t>destination_address</w:t>
+      </w:r>
+      <w:proofErr w:type="spellEnd"/>
+      <w:r>
+        <w:t xml:space="preserve">&gt; + </w:t>
+      </w:r>
+      <w:r>
+        <w:t>&lt;</w:t>
+      </w:r>
+      <w:proofErr w:type="spellStart"/>
       <w:r>
         <w:t>return_address</w:t>
       </w:r>
+      <w:proofErr w:type="spellEnd"/>
       <w:r>
         <w:t>&gt;</w:t>
       </w:r>
@@ -6053,7 +7068,15 @@
         <w:ind w:left="1080"/>
       </w:pPr>
       <w:r>
-        <w:t>&lt;cycle_count&gt; (1 byte) Specifies how many cycles it took to jump to the service routine (typically seven).</w:t>
+        <w:t>&lt;</w:t>
+      </w:r>
+      <w:proofErr w:type="spellStart"/>
+      <w:r>
+        <w:t>cycle_count</w:t>
+      </w:r>
+      <w:proofErr w:type="spellEnd"/>
+      <w:r>
+        <w:t>&gt; (1 byte) Specifies how many cycles it took to jump to the service routine (typically seven).</w:t>
       </w:r>
     </w:p>
     <w:p>
@@ -6067,9 +7090,11 @@
       <w:r>
         <w:t>&lt;</w:t>
       </w:r>
+      <w:proofErr w:type="spellStart"/>
       <w:r>
         <w:t>destination_address</w:t>
       </w:r>
+      <w:proofErr w:type="spellEnd"/>
       <w:r>
         <w:t>&gt; (2 bytes).  The address of the interrupt service routine</w:t>
       </w:r>
@@ -6085,7 +7110,15 @@
         <w:ind w:left="1080"/>
       </w:pPr>
       <w:r>
-        <w:t xml:space="preserve">&lt;return_address&gt; (2 bytes). </w:t>
+        <w:t>&lt;</w:t>
+      </w:r>
+      <w:proofErr w:type="spellStart"/>
+      <w:r>
+        <w:t>return_address</w:t>
+      </w:r>
+      <w:proofErr w:type="spellEnd"/>
+      <w:r>
+        <w:t xml:space="preserve">&gt; (2 bytes). </w:t>
       </w:r>
       <w:r>
         <w:t xml:space="preserve"> </w:t>
@@ -6107,6 +7140,7 @@
       <w:r>
         <w:t>&lt;</w:t>
       </w:r>
+      <w:proofErr w:type="spellStart"/>
       <w:r>
         <w:rPr>
           <w:b/>
@@ -6114,11 +7148,17 @@
         </w:rPr>
         <w:t>display_field</w:t>
       </w:r>
+      <w:proofErr w:type="spellEnd"/>
+      <w:proofErr w:type="gramStart"/>
       <w:r>
         <w:t>&gt;</w:t>
       </w:r>
       <w:r>
-        <w:t xml:space="preserve">  (1 byte).  0 for even field, 1 for odd field</w:t>
+        <w:t xml:space="preserve">  (</w:t>
+      </w:r>
+      <w:proofErr w:type="gramEnd"/>
+      <w:r>
+        <w:t>1 byte).  0 for even field, 1 for odd field</w:t>
       </w:r>
       <w:r>
         <w:t xml:space="preserve"> (</w:t>
@@ -6174,7 +7214,15 @@
       </w:r>
       <w:r>
         <w:br/>
-        <w:t>&lt;opcode_address&gt; + &lt;opcode&gt; + &lt;operand&gt;</w:t>
+        <w:t>&lt;</w:t>
+      </w:r>
+      <w:proofErr w:type="spellStart"/>
+      <w:r>
+        <w:t>opcode_address</w:t>
+      </w:r>
+      <w:proofErr w:type="spellEnd"/>
+      <w:r>
+        <w:t>&gt; + &lt;opcode&gt; + &lt;operand&gt;</w:t>
       </w:r>
       <w:r>
         <w:rPr>
@@ -6191,14 +7239,23 @@
         <w:br/>
       </w:r>
       <w:r>
-        <w:t>&lt;cycle</w:t>
+        <w:t>&lt;</w:t>
+      </w:r>
+      <w:proofErr w:type="spellStart"/>
+      <w:r>
+        <w:t>cycle</w:t>
       </w:r>
       <w:r>
         <w:t>_</w:t>
       </w:r>
       <w:r>
-        <w:t>count&gt; + &lt;</w:t>
-      </w:r>
+        <w:t>count</w:t>
+      </w:r>
+      <w:proofErr w:type="spellEnd"/>
+      <w:r>
+        <w:t>&gt; + &lt;</w:t>
+      </w:r>
+      <w:proofErr w:type="spellStart"/>
       <w:r>
         <w:t>modified_</w:t>
       </w:r>
@@ -6208,6 +7265,7 @@
       <w:r>
         <w:t>s</w:t>
       </w:r>
+      <w:proofErr w:type="spellEnd"/>
       <w:r>
         <w:t xml:space="preserve">&gt; </w:t>
       </w:r>
@@ -6215,7 +7273,15 @@
         <w:t xml:space="preserve">+ </w:t>
       </w:r>
       <w:r>
-        <w:t>&lt;destination_address&gt;</w:t>
+        <w:t>&lt;</w:t>
+      </w:r>
+      <w:proofErr w:type="spellStart"/>
+      <w:r>
+        <w:t>destination_address</w:t>
+      </w:r>
+      <w:proofErr w:type="spellEnd"/>
+      <w:r>
+        <w:t>&gt;</w:t>
       </w:r>
       <w:r>
         <w:rPr>
@@ -6226,7 +7292,15 @@
         <w:t>opt</w:t>
       </w:r>
       <w:r>
-        <w:t xml:space="preserve"> + &lt;memory_address&gt;</w:t>
+        <w:t xml:space="preserve"> + &lt;</w:t>
+      </w:r>
+      <w:proofErr w:type="spellStart"/>
+      <w:r>
+        <w:t>memory_address</w:t>
+      </w:r>
+      <w:proofErr w:type="spellEnd"/>
+      <w:r>
+        <w:t>&gt;</w:t>
       </w:r>
       <w:r>
         <w:rPr>
@@ -6237,7 +7311,15 @@
         <w:t>opt</w:t>
       </w:r>
       <w:r>
-        <w:t xml:space="preserve"> &lt;memory_read_value&gt;</w:t>
+        <w:t xml:space="preserve"> &lt;</w:t>
+      </w:r>
+      <w:proofErr w:type="spellStart"/>
+      <w:r>
+        <w:t>memory_read_value</w:t>
+      </w:r>
+      <w:proofErr w:type="spellEnd"/>
+      <w:r>
+        <w:t>&gt;</w:t>
       </w:r>
       <w:r>
         <w:rPr>
@@ -6256,7 +7338,15 @@
         <w:t xml:space="preserve"> </w:t>
       </w:r>
       <w:r>
-        <w:t>+ &lt;memory_write_value&gt;</w:t>
+        <w:t>+ &lt;</w:t>
+      </w:r>
+      <w:proofErr w:type="spellStart"/>
+      <w:r>
+        <w:t>memory_write_value</w:t>
+      </w:r>
+      <w:proofErr w:type="spellEnd"/>
+      <w:r>
+        <w:t>&gt;</w:t>
       </w:r>
       <w:r>
         <w:rPr>
@@ -6275,7 +7365,15 @@
         <w:ind w:left="720"/>
       </w:pPr>
       <w:r>
-        <w:t>&lt;opcode_address&gt; (1, 2, or 3 bytes) The instruction’s opcode address is encoded in 1, 2 or 3 bytes as depicted in the following table, where addresses are stored in relative format if possible.</w:t>
+        <w:t>&lt;</w:t>
+      </w:r>
+      <w:proofErr w:type="spellStart"/>
+      <w:r>
+        <w:t>opcode_address</w:t>
+      </w:r>
+      <w:proofErr w:type="spellEnd"/>
+      <w:r>
+        <w:t>&gt; (1, 2, or 3 bytes) The instruction’s opcode address is encoded in 1, 2 or 3 bytes as depicted in the following table, where addresses are stored in relative format if possible.</w:t>
       </w:r>
       <w:r>
         <w:t xml:space="preserve"> </w:t>
@@ -6467,7 +7565,15 @@
               <w:jc w:val="center"/>
             </w:pPr>
             <w:r>
-              <w:t>&amp;81..&amp;F</w:t>
+              <w:t>&amp;</w:t>
+            </w:r>
+            <w:proofErr w:type="gramStart"/>
+            <w:r>
+              <w:t>81..</w:t>
+            </w:r>
+            <w:proofErr w:type="gramEnd"/>
+            <w:r>
+              <w:t>&amp;F</w:t>
             </w:r>
             <w:r>
               <w:t>F</w:t>
@@ -6514,7 +7620,15 @@
           <w:p>
             <w:r>
               <w:lastRenderedPageBreak/>
-              <w:t>Absolute address: &amp;0000..&amp;7FFF</w:t>
+              <w:t>Absolute address: &amp;</w:t>
+            </w:r>
+            <w:proofErr w:type="gramStart"/>
+            <w:r>
+              <w:t>0000..</w:t>
+            </w:r>
+            <w:proofErr w:type="gramEnd"/>
+            <w:r>
+              <w:t>&amp;7FFF</w:t>
             </w:r>
           </w:p>
         </w:tc>
@@ -6526,8 +7640,13 @@
             <w:pPr>
               <w:jc w:val="center"/>
             </w:pPr>
+            <w:proofErr w:type="gramStart"/>
             <w:r>
-              <w:t>0..&amp;7F</w:t>
+              <w:t>0..&amp;</w:t>
+            </w:r>
+            <w:proofErr w:type="gramEnd"/>
+            <w:r>
+              <w:t>7F</w:t>
             </w:r>
           </w:p>
         </w:tc>
@@ -6539,8 +7658,13 @@
             <w:pPr>
               <w:jc w:val="center"/>
             </w:pPr>
+            <w:proofErr w:type="gramStart"/>
             <w:r>
-              <w:t>0..&amp;FF</w:t>
+              <w:t>0..&amp;</w:t>
+            </w:r>
+            <w:proofErr w:type="gramEnd"/>
+            <w:r>
+              <w:t>FF</w:t>
             </w:r>
           </w:p>
         </w:tc>
@@ -6569,7 +7693,15 @@
           </w:tcPr>
           <w:p>
             <w:r>
-              <w:t>Absolute address: &amp;8000..&amp;FFFF</w:t>
+              <w:t>Absolute address: &amp;</w:t>
+            </w:r>
+            <w:proofErr w:type="gramStart"/>
+            <w:r>
+              <w:t>8000..</w:t>
+            </w:r>
+            <w:proofErr w:type="gramEnd"/>
+            <w:r>
+              <w:t>&amp;FFFF</w:t>
             </w:r>
           </w:p>
         </w:tc>
@@ -6595,7 +7727,15 @@
               <w:jc w:val="center"/>
             </w:pPr>
             <w:r>
-              <w:t>&amp;80..&amp;FF</w:t>
+              <w:t>&amp;</w:t>
+            </w:r>
+            <w:proofErr w:type="gramStart"/>
+            <w:r>
+              <w:t>80..</w:t>
+            </w:r>
+            <w:proofErr w:type="gramEnd"/>
+            <w:r>
+              <w:t>&amp;FF</w:t>
             </w:r>
           </w:p>
         </w:tc>
@@ -6607,8 +7747,13 @@
             <w:pPr>
               <w:jc w:val="center"/>
             </w:pPr>
+            <w:proofErr w:type="gramStart"/>
             <w:r>
-              <w:t>0..&amp;FF</w:t>
+              <w:t>0..&amp;</w:t>
+            </w:r>
+            <w:proofErr w:type="gramEnd"/>
+            <w:r>
+              <w:t>FF</w:t>
             </w:r>
           </w:p>
         </w:tc>
@@ -6677,12 +7822,21 @@
                 <w:iCs/>
               </w:rPr>
             </w:pPr>
+            <w:proofErr w:type="gramStart"/>
             <w:r>
               <w:rPr>
                 <w:i/>
                 <w:iCs/>
               </w:rPr>
-              <w:t>0..&amp;7F</w:t>
+              <w:t>0..&amp;</w:t>
+            </w:r>
+            <w:proofErr w:type="gramEnd"/>
+            <w:r>
+              <w:rPr>
+                <w:i/>
+                <w:iCs/>
+              </w:rPr>
+              <w:t>7F</w:t>
             </w:r>
           </w:p>
         </w:tc>
@@ -7094,20 +8248,44 @@
         <w:ind w:left="720"/>
       </w:pPr>
       <w:r>
-        <w:t>&lt;cycle</w:t>
+        <w:t>&lt;</w:t>
+      </w:r>
+      <w:proofErr w:type="spellStart"/>
+      <w:r>
+        <w:t>cycle</w:t>
       </w:r>
       <w:r>
         <w:t>_</w:t>
       </w:r>
       <w:r>
-        <w:t>count&gt; (</w:t>
-      </w:r>
-      <w:r>
-        <w:rPr>
-          <w:b/>
-          <w:bCs/>
-        </w:rPr>
-        <w:t>bits 0..2</w:t>
+        <w:t>count</w:t>
+      </w:r>
+      <w:proofErr w:type="spellEnd"/>
+      <w:r>
+        <w:t>&gt; (</w:t>
+      </w:r>
+      <w:r>
+        <w:rPr>
+          <w:b/>
+          <w:bCs/>
+        </w:rPr>
+        <w:t xml:space="preserve">bits </w:t>
+      </w:r>
+      <w:proofErr w:type="gramStart"/>
+      <w:r>
+        <w:rPr>
+          <w:b/>
+          <w:bCs/>
+        </w:rPr>
+        <w:t>0..</w:t>
+      </w:r>
+      <w:proofErr w:type="gramEnd"/>
+      <w:r>
+        <w:rPr>
+          <w:b/>
+          <w:bCs/>
+        </w:rPr>
+        <w:t>2</w:t>
       </w:r>
       <w:r>
         <w:t xml:space="preserve"> of next </w:t>
@@ -7124,8 +8302,13 @@
       <w:r>
         <w:t xml:space="preserve"> </w:t>
       </w:r>
-      <w:r>
-        <w:t>2..7</w:t>
+      <w:proofErr w:type="gramStart"/>
+      <w:r>
+        <w:t>2..</w:t>
+      </w:r>
+      <w:proofErr w:type="gramEnd"/>
+      <w:r>
+        <w:t>7</w:t>
       </w:r>
       <w:r>
         <w:t>.</w:t>
@@ -7138,9 +8321,11 @@
       <w:r>
         <w:t>&lt;</w:t>
       </w:r>
+      <w:proofErr w:type="spellStart"/>
       <w:r>
         <w:t>modified_registers</w:t>
       </w:r>
+      <w:proofErr w:type="spellEnd"/>
       <w:r>
         <w:t xml:space="preserve">&gt; = </w:t>
       </w:r>
@@ -7148,7 +8333,11 @@
         <w:br/>
       </w:r>
       <w:r>
-        <w:t>&lt;modified</w:t>
+        <w:t>&lt;</w:t>
+      </w:r>
+      <w:proofErr w:type="spellStart"/>
+      <w:r>
+        <w:t>modified</w:t>
       </w:r>
       <w:r>
         <w:t>_</w:t>
@@ -7160,7 +8349,11 @@
         <w:t>_</w:t>
       </w:r>
       <w:r>
-        <w:t>flags&gt;</w:t>
+        <w:t>flags</w:t>
+      </w:r>
+      <w:proofErr w:type="spellEnd"/>
+      <w:r>
+        <w:t>&gt;</w:t>
       </w:r>
       <w:r>
         <w:t xml:space="preserve"> + &lt;accumulator&gt;</w:t>
@@ -7174,13 +8367,21 @@
         <w:t>opt</w:t>
       </w:r>
       <w:r>
-        <w:t xml:space="preserve"> + &lt;x</w:t>
+        <w:t xml:space="preserve"> + &lt;</w:t>
+      </w:r>
+      <w:proofErr w:type="spellStart"/>
+      <w:r>
+        <w:t>x</w:t>
       </w:r>
       <w:r>
         <w:t>_</w:t>
       </w:r>
       <w:r>
-        <w:t>register&gt;</w:t>
+        <w:t>register</w:t>
+      </w:r>
+      <w:proofErr w:type="spellEnd"/>
+      <w:r>
+        <w:t>&gt;</w:t>
       </w:r>
       <w:r>
         <w:rPr>
@@ -7191,13 +8392,21 @@
         <w:t>opt</w:t>
       </w:r>
       <w:r>
-        <w:t xml:space="preserve"> + &lt;y</w:t>
+        <w:t xml:space="preserve"> + &lt;</w:t>
+      </w:r>
+      <w:proofErr w:type="spellStart"/>
+      <w:r>
+        <w:t>y</w:t>
       </w:r>
       <w:r>
         <w:t>_</w:t>
       </w:r>
       <w:r>
-        <w:t>register&gt;</w:t>
+        <w:t>register</w:t>
+      </w:r>
+      <w:proofErr w:type="spellEnd"/>
+      <w:r>
+        <w:t>&gt;</w:t>
       </w:r>
       <w:r>
         <w:rPr>
@@ -7216,13 +8425,21 @@
         <w:t xml:space="preserve"> </w:t>
       </w:r>
       <w:r>
-        <w:t>+ &lt;status</w:t>
+        <w:t>+ &lt;</w:t>
+      </w:r>
+      <w:proofErr w:type="spellStart"/>
+      <w:r>
+        <w:t>status</w:t>
       </w:r>
       <w:r>
         <w:t>_</w:t>
       </w:r>
       <w:r>
-        <w:t>register&gt;</w:t>
+        <w:t>register</w:t>
+      </w:r>
+      <w:proofErr w:type="spellEnd"/>
+      <w:r>
+        <w:t>&gt;</w:t>
       </w:r>
       <w:r>
         <w:rPr>
@@ -7233,13 +8450,21 @@
         <w:t>opt</w:t>
       </w:r>
       <w:r>
-        <w:t xml:space="preserve"> + &lt;state</w:t>
+        <w:t xml:space="preserve"> + &lt;</w:t>
+      </w:r>
+      <w:proofErr w:type="spellStart"/>
+      <w:r>
+        <w:t>state</w:t>
       </w:r>
       <w:r>
         <w:t>_</w:t>
       </w:r>
       <w:r>
-        <w:t>pointer&gt;</w:t>
+        <w:t>pointer</w:t>
+      </w:r>
+      <w:proofErr w:type="spellEnd"/>
+      <w:r>
+        <w:t>&gt;</w:t>
       </w:r>
       <w:r>
         <w:rPr>
@@ -7258,7 +8483,11 @@
         <w:tab/>
       </w:r>
       <w:r>
-        <w:t>&lt;modified</w:t>
+        <w:t>&lt;</w:t>
+      </w:r>
+      <w:proofErr w:type="spellStart"/>
+      <w:r>
+        <w:t>modified</w:t>
       </w:r>
       <w:r>
         <w:t>_</w:t>
@@ -7270,7 +8499,11 @@
         <w:t>_</w:t>
       </w:r>
       <w:r>
-        <w:t>flags&gt;</w:t>
+        <w:t>flags</w:t>
+      </w:r>
+      <w:proofErr w:type="spellEnd"/>
+      <w:r>
+        <w:t>&gt;</w:t>
       </w:r>
       <w:r>
         <w:t xml:space="preserve"> (</w:t>
@@ -7280,7 +8513,23 @@
           <w:b/>
           <w:bCs/>
         </w:rPr>
-        <w:t>bits 3..7</w:t>
+        <w:t xml:space="preserve">bits </w:t>
+      </w:r>
+      <w:proofErr w:type="gramStart"/>
+      <w:r>
+        <w:rPr>
+          <w:b/>
+          <w:bCs/>
+        </w:rPr>
+        <w:t>3..</w:t>
+      </w:r>
+      <w:proofErr w:type="gramEnd"/>
+      <w:r>
+        <w:rPr>
+          <w:b/>
+          <w:bCs/>
+        </w:rPr>
+        <w:t>7</w:t>
       </w:r>
       <w:r>
         <w:t xml:space="preserve"> of next byte)</w:t>
@@ -7583,7 +8832,11 @@
         <w:t xml:space="preserve"> if the corresponding bit is set in </w:t>
       </w:r>
       <w:r>
-        <w:t>&lt;modified</w:t>
+        <w:t>&lt;</w:t>
+      </w:r>
+      <w:proofErr w:type="spellStart"/>
+      <w:r>
+        <w:t>modified</w:t>
       </w:r>
       <w:r>
         <w:t>_</w:t>
@@ -7595,7 +8848,11 @@
         <w:t>_</w:t>
       </w:r>
       <w:r>
-        <w:t>flags&gt;</w:t>
+        <w:t>flags</w:t>
+      </w:r>
+      <w:proofErr w:type="spellEnd"/>
+      <w:r>
+        <w:t>&gt;</w:t>
       </w:r>
       <w:r>
         <w:t>.</w:t>
@@ -7606,13 +8863,21 @@
         <w:ind w:left="1080"/>
       </w:pPr>
       <w:r>
-        <w:t>&lt;x</w:t>
+        <w:t>&lt;</w:t>
+      </w:r>
+      <w:proofErr w:type="spellStart"/>
+      <w:r>
+        <w:t>x</w:t>
       </w:r>
       <w:r>
         <w:t>_</w:t>
       </w:r>
       <w:r>
-        <w:t>register&gt;</w:t>
+        <w:t>register</w:t>
+      </w:r>
+      <w:proofErr w:type="spellEnd"/>
+      <w:r>
+        <w:t>&gt;</w:t>
       </w:r>
       <w:r>
         <w:t xml:space="preserve"> (0 or 1 byte)</w:t>
@@ -7633,7 +8898,11 @@
         <w:t xml:space="preserve">The value is written if the corresponding bit is set in </w:t>
       </w:r>
       <w:r>
-        <w:t>&lt;modified</w:t>
+        <w:t>&lt;</w:t>
+      </w:r>
+      <w:proofErr w:type="spellStart"/>
+      <w:r>
+        <w:t>modified</w:t>
       </w:r>
       <w:r>
         <w:t>_</w:t>
@@ -7645,7 +8914,11 @@
         <w:t>_</w:t>
       </w:r>
       <w:r>
-        <w:t>flags&gt;</w:t>
+        <w:t>flags</w:t>
+      </w:r>
+      <w:proofErr w:type="spellEnd"/>
+      <w:r>
+        <w:t>&gt;</w:t>
       </w:r>
       <w:r>
         <w:t>.</w:t>
@@ -7656,13 +8929,21 @@
         <w:ind w:left="1080"/>
       </w:pPr>
       <w:r>
-        <w:t>&lt;y</w:t>
+        <w:t>&lt;</w:t>
+      </w:r>
+      <w:proofErr w:type="spellStart"/>
+      <w:r>
+        <w:t>y</w:t>
       </w:r>
       <w:r>
         <w:t>_</w:t>
       </w:r>
       <w:r>
-        <w:t>register&gt;</w:t>
+        <w:t>register</w:t>
+      </w:r>
+      <w:proofErr w:type="spellEnd"/>
+      <w:r>
+        <w:t>&gt;</w:t>
       </w:r>
       <w:r>
         <w:t xml:space="preserve"> (0 or 1 byte)</w:t>
@@ -7677,7 +8958,11 @@
         <w:t xml:space="preserve">.  The value is written if the corresponding bit is set in </w:t>
       </w:r>
       <w:r>
-        <w:t>&lt;modified</w:t>
+        <w:t>&lt;</w:t>
+      </w:r>
+      <w:proofErr w:type="spellStart"/>
+      <w:r>
+        <w:t>modified</w:t>
       </w:r>
       <w:r>
         <w:t>_</w:t>
@@ -7689,7 +8974,11 @@
         <w:t>_</w:t>
       </w:r>
       <w:r>
-        <w:t>flags&gt;</w:t>
+        <w:t>flags</w:t>
+      </w:r>
+      <w:proofErr w:type="spellEnd"/>
+      <w:r>
+        <w:t>&gt;</w:t>
       </w:r>
       <w:r>
         <w:t>.</w:t>
@@ -7700,13 +8989,21 @@
         <w:ind w:left="1080"/>
       </w:pPr>
       <w:r>
-        <w:t>&lt;status</w:t>
+        <w:t>&lt;</w:t>
+      </w:r>
+      <w:proofErr w:type="spellStart"/>
+      <w:r>
+        <w:t>status</w:t>
       </w:r>
       <w:r>
         <w:t>_</w:t>
       </w:r>
       <w:r>
-        <w:t>register&gt;</w:t>
+        <w:t>register</w:t>
+      </w:r>
+      <w:proofErr w:type="spellEnd"/>
+      <w:r>
+        <w:t>&gt;</w:t>
       </w:r>
       <w:r>
         <w:t xml:space="preserve"> (0 or 1 byte)</w:t>
@@ -7718,7 +9015,11 @@
         <w:t xml:space="preserve">.  The value is written if the corresponding bit is set in </w:t>
       </w:r>
       <w:r>
-        <w:t>&lt;modified</w:t>
+        <w:t>&lt;</w:t>
+      </w:r>
+      <w:proofErr w:type="spellStart"/>
+      <w:r>
+        <w:t>modified</w:t>
       </w:r>
       <w:r>
         <w:t>_</w:t>
@@ -7730,7 +9031,11 @@
         <w:t>_</w:t>
       </w:r>
       <w:r>
-        <w:t>flags&gt;</w:t>
+        <w:t>flags</w:t>
+      </w:r>
+      <w:proofErr w:type="spellEnd"/>
+      <w:r>
+        <w:t>&gt;</w:t>
       </w:r>
       <w:r>
         <w:t>.</w:t>
@@ -7741,13 +9046,21 @@
         <w:ind w:left="1080"/>
       </w:pPr>
       <w:r>
-        <w:t>&lt;state</w:t>
+        <w:t>&lt;</w:t>
+      </w:r>
+      <w:proofErr w:type="spellStart"/>
+      <w:r>
+        <w:t>state</w:t>
       </w:r>
       <w:r>
         <w:t>_</w:t>
       </w:r>
       <w:r>
-        <w:t>pointer&gt;</w:t>
+        <w:t>pointer</w:t>
+      </w:r>
+      <w:proofErr w:type="spellEnd"/>
+      <w:r>
+        <w:t>&gt;</w:t>
       </w:r>
       <w:r>
         <w:t xml:space="preserve"> (0 or 1 byte)</w:t>
@@ -7759,7 +9072,11 @@
         <w:t xml:space="preserve">.   The value is written if the corresponding bit is set in </w:t>
       </w:r>
       <w:r>
-        <w:t>&lt;modified</w:t>
+        <w:t>&lt;</w:t>
+      </w:r>
+      <w:proofErr w:type="spellStart"/>
+      <w:r>
+        <w:t>modified</w:t>
       </w:r>
       <w:r>
         <w:t>_</w:t>
@@ -7771,7 +9088,11 @@
         <w:t>_</w:t>
       </w:r>
       <w:r>
-        <w:t>flags&gt;</w:t>
+        <w:t>flags</w:t>
+      </w:r>
+      <w:proofErr w:type="spellEnd"/>
+      <w:r>
+        <w:t>&gt;</w:t>
       </w:r>
       <w:r>
         <w:t>.</w:t>
@@ -7782,7 +9103,15 @@
         <w:ind w:left="720"/>
       </w:pPr>
       <w:r>
-        <w:t xml:space="preserve">&lt;destination_address&gt; (2 bytes) Populated for the </w:t>
+        <w:t>&lt;</w:t>
+      </w:r>
+      <w:proofErr w:type="spellStart"/>
+      <w:r>
+        <w:t>destination_address</w:t>
+      </w:r>
+      <w:proofErr w:type="spellEnd"/>
+      <w:r>
+        <w:t xml:space="preserve">&gt; (2 bytes) Populated for the </w:t>
       </w:r>
       <w:r>
         <w:rPr>
@@ -7889,7 +9218,15 @@
         <w:ind w:left="720"/>
       </w:pPr>
       <w:r>
-        <w:t>&lt;memory_address&gt; (2 bytes) Populated for all opcodes that read or write to memory</w:t>
+        <w:t>&lt;</w:t>
+      </w:r>
+      <w:proofErr w:type="spellStart"/>
+      <w:r>
+        <w:t>memory_address</w:t>
+      </w:r>
+      <w:proofErr w:type="spellEnd"/>
+      <w:r>
+        <w:t>&gt; (2 bytes) Populated for all opcodes that read or write to memory</w:t>
       </w:r>
       <w:r>
         <w:t xml:space="preserve"> </w:t>
@@ -8038,7 +9375,15 @@
       </w:pPr>
       <w:r>
         <w:lastRenderedPageBreak/>
-        <w:t xml:space="preserve">&lt;memory_read_value&gt; (1 byte) Populated for opcodes </w:t>
+        <w:t>&lt;</w:t>
+      </w:r>
+      <w:proofErr w:type="spellStart"/>
+      <w:r>
+        <w:t>memory_read_value</w:t>
+      </w:r>
+      <w:proofErr w:type="spellEnd"/>
+      <w:r>
+        <w:t xml:space="preserve">&gt; (1 byte) Populated for opcodes </w:t>
       </w:r>
       <w:r>
         <w:t>(ex</w:t>
@@ -8160,7 +9505,15 @@
         <w:ind w:left="720"/>
       </w:pPr>
       <w:r>
-        <w:t xml:space="preserve">&lt;memory_write_value&gt; (1 byte) Populated for opcodes </w:t>
+        <w:t>&lt;</w:t>
+      </w:r>
+      <w:proofErr w:type="spellStart"/>
+      <w:r>
+        <w:t>memory_write_value</w:t>
+      </w:r>
+      <w:proofErr w:type="spellEnd"/>
+      <w:r>
+        <w:t xml:space="preserve">&gt; (1 byte) Populated for opcodes </w:t>
       </w:r>
       <w:r>
         <w:t xml:space="preserve">(except </w:t>
@@ -8286,6 +9639,7 @@
       </w:r>
     </w:p>
     <w:p>
+      <w:proofErr w:type="gramStart"/>
       <w:r>
         <w:t xml:space="preserve">A </w:t>
       </w:r>
@@ -8296,6 +9650,7 @@
         </w:rPr>
         <w:t>.perf</w:t>
       </w:r>
+      <w:proofErr w:type="gramEnd"/>
       <w:r>
         <w:t xml:space="preserve"> </w:t>
       </w:r>
@@ -8383,6 +9738,7 @@
       <w:pPr>
         <w:pStyle w:val="Heading1"/>
       </w:pPr>
+      <w:proofErr w:type="spellStart"/>
       <w:r>
         <w:lastRenderedPageBreak/>
         <w:t>Bee</w:t>
@@ -8393,10 +9749,19 @@
       <w:r>
         <w:t>Perf</w:t>
       </w:r>
-    </w:p>
-    <w:p>
-      <w:r>
-        <w:t xml:space="preserve">As outlined above, BeebPerf is a standalone </w:t>
+      <w:proofErr w:type="spellEnd"/>
+    </w:p>
+    <w:p>
+      <w:r>
+        <w:t xml:space="preserve">As outlined above, </w:t>
+      </w:r>
+      <w:proofErr w:type="spellStart"/>
+      <w:r>
+        <w:t>BeebPerf</w:t>
+      </w:r>
+      <w:proofErr w:type="spellEnd"/>
+      <w:r>
+        <w:t xml:space="preserve"> is a standalone </w:t>
       </w:r>
       <w:r>
         <w:t xml:space="preserve">Windows </w:t>
@@ -8452,7 +9817,15 @@
         <w:t>.</w:t>
       </w:r>
       <w:r>
-        <w:t xml:space="preserve">  Many of the views presented on modelled from Visual Studio’s profiler views.</w:t>
+        <w:t xml:space="preserve">  Many of the views </w:t>
+      </w:r>
+      <w:proofErr w:type="gramStart"/>
+      <w:r>
+        <w:t>presented on</w:t>
+      </w:r>
+      <w:proofErr w:type="gramEnd"/>
+      <w:r>
+        <w:t xml:space="preserve"> modelled from Visual Studio’s profiler views.</w:t>
       </w:r>
     </w:p>
     <w:p>
@@ -9214,13 +10587,21 @@
         <w:t xml:space="preserve"> </w:t>
       </w:r>
       <w:r>
-        <w:t>a time</w:t>
+        <w:t xml:space="preserve">a </w:t>
+      </w:r>
+      <w:proofErr w:type="gramStart"/>
+      <w:r>
+        <w:t>time</w:t>
       </w:r>
       <w:r>
         <w:t>-</w:t>
       </w:r>
       <w:r>
-        <w:t>line allowing the user to select a specific time range to analyze.</w:t>
+        <w:t>line</w:t>
+      </w:r>
+      <w:proofErr w:type="gramEnd"/>
+      <w:r>
+        <w:t xml:space="preserve"> allowing the user to select a specific time range to analyze.</w:t>
       </w:r>
       <w:r>
         <w:t xml:space="preserve">  Frame snapshots are shown below.</w:t>
@@ -9356,7 +10737,15 @@
         <w:t>routines</w:t>
       </w:r>
       <w:r>
-        <w:t>.  Each node in the tree shows the self (exclusive), overall (inclusive), and elapsed times.  The child nodes are ordered by their inclusive CPU times.  In cases where a routine is called from multiple callers, the metrics shown are in the context of the call</w:t>
+        <w:t xml:space="preserve">.  Each node in the tree shows the self (exclusive), overall (inclusive), and elapsed times.  The child nodes are ordered by their inclusive CPU times.  In cases where a routine is called </w:t>
+      </w:r>
+      <w:proofErr w:type="gramStart"/>
+      <w:r>
+        <w:t>from</w:t>
+      </w:r>
+      <w:proofErr w:type="gramEnd"/>
+      <w:r>
+        <w:t xml:space="preserve"> multiple callers, the metrics shown are in the context of the call</w:t>
       </w:r>
       <w:r>
         <w:t xml:space="preserve"> stack</w:t>
@@ -9877,8 +11266,13 @@
       <w:r>
         <w:t xml:space="preserve">model </w:t>
       </w:r>
-      <w:r>
-        <w:t xml:space="preserve">an analyze </w:t>
+      <w:proofErr w:type="gramStart"/>
+      <w:r>
+        <w:t>an</w:t>
+      </w:r>
+      <w:proofErr w:type="gramEnd"/>
+      <w:r>
+        <w:t xml:space="preserve"> analyze </w:t>
       </w:r>
       <w:r>
         <w:t xml:space="preserve">recorded </w:t>
@@ -10424,9 +11818,11 @@
       <w:r>
         <w:t xml:space="preserve">Aggregated CPU Metrics, by </w:t>
       </w:r>
+      <w:proofErr w:type="spellStart"/>
       <w:r>
         <w:t>RoutineStack</w:t>
       </w:r>
+      <w:proofErr w:type="spellEnd"/>
       <w:r>
         <w:t xml:space="preserve"> – </w:t>
       </w:r>
@@ -10492,6 +11888,7 @@
           <w:numId w:val="9"/>
         </w:numPr>
       </w:pPr>
+      <w:proofErr w:type="spellStart"/>
       <w:r>
         <w:rPr>
           <w:b/>
@@ -10499,11 +11896,20 @@
         </w:rPr>
         <w:t>CallStack</w:t>
       </w:r>
+      <w:proofErr w:type="spellEnd"/>
       <w:r>
         <w:t xml:space="preserve"> – represents a</w:t>
       </w:r>
       <w:r>
-        <w:t xml:space="preserve"> call stack within the recorded program. Contains the following fields:</w:t>
+        <w:t xml:space="preserve"> call stack within the recorded program</w:t>
+      </w:r>
+      <w:proofErr w:type="gramStart"/>
+      <w:r>
+        <w:t xml:space="preserve">. </w:t>
+      </w:r>
+      <w:proofErr w:type="gramEnd"/>
+      <w:r>
+        <w:t>Contains the following fields:</w:t>
       </w:r>
     </w:p>
     <w:p>
@@ -10548,7 +11954,15 @@
         </w:numPr>
       </w:pPr>
       <w:r>
-        <w:t>Parent CallStack reference</w:t>
+        <w:t xml:space="preserve">Parent </w:t>
+      </w:r>
+      <w:proofErr w:type="spellStart"/>
+      <w:r>
+        <w:t>CallStack</w:t>
+      </w:r>
+      <w:proofErr w:type="spellEnd"/>
+      <w:r>
+        <w:t xml:space="preserve"> reference</w:t>
       </w:r>
     </w:p>
     <w:p>
@@ -10583,7 +11997,15 @@
         <w:ind w:left="1080"/>
       </w:pPr>
       <w:r>
-        <w:t xml:space="preserve">The identify of a CallStack is defined </w:t>
+        <w:t xml:space="preserve">The identify of a </w:t>
+      </w:r>
+      <w:proofErr w:type="spellStart"/>
+      <w:r>
+        <w:t>CallStack</w:t>
+      </w:r>
+      <w:proofErr w:type="spellEnd"/>
+      <w:r>
+        <w:t xml:space="preserve"> is defined </w:t>
       </w:r>
       <w:r>
         <w:t xml:space="preserve">by the sequence of </w:t>
@@ -10624,6 +12046,7 @@
           <w:numId w:val="9"/>
         </w:numPr>
       </w:pPr>
+      <w:proofErr w:type="spellStart"/>
       <w:r>
         <w:rPr>
           <w:b/>
@@ -10631,6 +12054,7 @@
         </w:rPr>
         <w:t>StackFrame</w:t>
       </w:r>
+      <w:proofErr w:type="spellEnd"/>
       <w:r>
         <w:t xml:space="preserve"> – represents a unique stack-frame within the recorded program.</w:t>
       </w:r>
@@ -11885,7 +13309,15 @@
         <w:contextualSpacing w:val="0"/>
       </w:pPr>
       <w:r>
-        <w:t xml:space="preserve">An execution trace includes screen memory display read events, which signify when the 6845 CRT control chip starts reading screen memory to display </w:t>
+        <w:t xml:space="preserve">An execution trace includes screen memory display read events, which </w:t>
+      </w:r>
+      <w:proofErr w:type="gramStart"/>
+      <w:r>
+        <w:t>signify</w:t>
+      </w:r>
+      <w:proofErr w:type="gramEnd"/>
+      <w:r>
+        <w:t xml:space="preserve"> when the 6845 CRT control chip starts reading screen memory to display </w:t>
       </w:r>
       <w:r>
         <w:t>each frame</w:t>
@@ -12383,7 +13815,11 @@
         </w:numPr>
       </w:pPr>
       <w:r>
-        <w:t>Populate No</w:t>
+        <w:t xml:space="preserve">Populate </w:t>
+      </w:r>
+      <w:proofErr w:type="spellStart"/>
+      <w:r>
+        <w:t>No</w:t>
       </w:r>
       <w:r>
         <w:t>Tr</w:t>
@@ -12394,6 +13830,7 @@
       <w:r>
         <w:t>verse</w:t>
       </w:r>
+      <w:proofErr w:type="spellEnd"/>
       <w:r>
         <w:t xml:space="preserve"> </w:t>
       </w:r>
@@ -12445,11 +13882,16 @@
           <w:numId w:val="19"/>
         </w:numPr>
       </w:pPr>
+      <w:proofErr w:type="spellStart"/>
       <w:r>
         <w:t>Routine</w:t>
       </w:r>
       <w:r>
-        <w:t>aggregated and total aggregated</w:t>
+        <w:t>aggregated</w:t>
+      </w:r>
+      <w:proofErr w:type="spellEnd"/>
+      <w:r>
+        <w:t xml:space="preserve"> and total aggregated</w:t>
       </w:r>
       <w:r>
         <w:t xml:space="preserve"> CPU metrics</w:t>
@@ -12822,10 +14264,18 @@
         <w:t xml:space="preserve"> (this can be calculated) </w:t>
       </w:r>
       <w:r>
-        <w:t xml:space="preserve">on the </w:t>
-      </w:r>
-      <w:r>
-        <w:t xml:space="preserve">Video </w:t>
+        <w:t xml:space="preserve">on </w:t>
+      </w:r>
+      <w:proofErr w:type="gramStart"/>
+      <w:r>
+        <w:t xml:space="preserve">the </w:t>
+      </w:r>
+      <w:r>
+        <w:t>Video</w:t>
+      </w:r>
+      <w:proofErr w:type="gramEnd"/>
+      <w:r>
+        <w:t xml:space="preserve"> </w:t>
       </w:r>
       <w:r>
         <w:t>6845</w:t>
@@ -12884,6 +14334,7 @@
       <w:r>
         <w:t xml:space="preserve">The performance functionality is encapsulated within a </w:t>
       </w:r>
+      <w:proofErr w:type="spellStart"/>
       <w:r>
         <w:rPr>
           <w:b/>
@@ -12891,8 +14342,25 @@
         </w:rPr>
         <w:t>PerfWriter</w:t>
       </w:r>
-      <w:r>
-        <w:t xml:space="preserve"> class (PerfWriter.h/cpp) </w:t>
+      <w:proofErr w:type="spellEnd"/>
+      <w:r>
+        <w:t xml:space="preserve"> class (</w:t>
+      </w:r>
+      <w:proofErr w:type="spellStart"/>
+      <w:r>
+        <w:t>PerfWriter.h</w:t>
+      </w:r>
+      <w:proofErr w:type="spellEnd"/>
+      <w:r>
+        <w:t>/</w:t>
+      </w:r>
+      <w:proofErr w:type="spellStart"/>
+      <w:r>
+        <w:t>cpp</w:t>
+      </w:r>
+      <w:proofErr w:type="spellEnd"/>
+      <w:r>
+        <w:t xml:space="preserve">) </w:t>
       </w:r>
     </w:p>
     <w:p>
@@ -12949,6 +14417,7 @@
       <w:r>
         <w:t xml:space="preserve">Logged events and instructions are recorded in a </w:t>
       </w:r>
+      <w:proofErr w:type="gramStart"/>
       <w:r>
         <w:rPr>
           <w:b/>
@@ -12958,6 +14427,7 @@
         </w:rPr>
         <w:t>write</w:t>
       </w:r>
+      <w:proofErr w:type="gramEnd"/>
       <w:r>
         <w:t xml:space="preserve"> buffer, whilst previously recorded instructions in the </w:t>
       </w:r>
@@ -13043,8 +14513,17 @@
           <w:b/>
           <w:bCs/>
         </w:rPr>
-        <w:t>/cpp</w:t>
-      </w:r>
+        <w:t>/</w:t>
+      </w:r>
+      <w:proofErr w:type="spellStart"/>
+      <w:r>
+        <w:rPr>
+          <w:b/>
+          <w:bCs/>
+        </w:rPr>
+        <w:t>cpp</w:t>
+      </w:r>
+      <w:proofErr w:type="spellEnd"/>
     </w:p>
     <w:p>
       <w:pPr>
@@ -13057,23 +14536,48 @@
       <w:r>
         <w:t xml:space="preserve">Added calls to </w:t>
       </w:r>
-      <w:r>
-        <w:t>PerfWriter_WriteInstruction(</w:t>
-      </w:r>
+      <w:proofErr w:type="spellStart"/>
+      <w:r>
+        <w:t>PerfWriter_</w:t>
+      </w:r>
+      <w:proofErr w:type="gramStart"/>
+      <w:r>
+        <w:t>WriteInstruction</w:t>
+      </w:r>
+      <w:proofErr w:type="spellEnd"/>
+      <w:r>
+        <w:t>(</w:t>
+      </w:r>
+      <w:proofErr w:type="gramEnd"/>
       <w:r>
         <w:t xml:space="preserve">…) and </w:t>
       </w:r>
-      <w:r>
-        <w:t>PerfWriter_WriteI</w:t>
+      <w:proofErr w:type="spellStart"/>
+      <w:r>
+        <w:t>PerfWriter_</w:t>
+      </w:r>
+      <w:proofErr w:type="gramStart"/>
+      <w:r>
+        <w:t>WriteI</w:t>
       </w:r>
       <w:r>
         <w:t>nterrupt</w:t>
       </w:r>
+      <w:proofErr w:type="spellEnd"/>
       <w:r>
         <w:t>(</w:t>
       </w:r>
-      <w:r>
-        <w:t>…) to log instructions and interrupts.  These wrapper functions only invoke the PerfWriter instance during a performance capture.</w:t>
+      <w:proofErr w:type="gramEnd"/>
+      <w:r>
+        <w:t xml:space="preserve">…) to log instructions and interrupts.  These wrapper functions only invoke the </w:t>
+      </w:r>
+      <w:proofErr w:type="spellStart"/>
+      <w:r>
+        <w:t>PerfWriter</w:t>
+      </w:r>
+      <w:proofErr w:type="spellEnd"/>
+      <w:r>
+        <w:t xml:space="preserve"> instance during a performance capture.</w:t>
       </w:r>
     </w:p>
     <w:p>
@@ -13087,51 +14591,75 @@
       <w:r>
         <w:t>Added static variables (</w:t>
       </w:r>
+      <w:proofErr w:type="spellStart"/>
       <w:r>
         <w:t>LastReadWriteAddress</w:t>
       </w:r>
+      <w:proofErr w:type="spellEnd"/>
       <w:r>
         <w:t xml:space="preserve">, </w:t>
       </w:r>
+      <w:proofErr w:type="spellStart"/>
       <w:r>
         <w:t>LastReadValue</w:t>
       </w:r>
+      <w:proofErr w:type="spellEnd"/>
       <w:r>
         <w:t xml:space="preserve">, and </w:t>
       </w:r>
+      <w:proofErr w:type="spellStart"/>
       <w:r>
         <w:t>LastWriteValue</w:t>
       </w:r>
+      <w:proofErr w:type="spellEnd"/>
       <w:r>
         <w:t xml:space="preserve">) to store the last accessed memory address, read value, and write value.  These values are passed to </w:t>
       </w:r>
-      <w:r>
-        <w:t>PerfWriter_WriteInstruction(</w:t>
-      </w:r>
+      <w:proofErr w:type="spellStart"/>
+      <w:r>
+        <w:t>PerfWriter_</w:t>
+      </w:r>
+      <w:proofErr w:type="gramStart"/>
+      <w:r>
+        <w:t>WriteInstruction</w:t>
+      </w:r>
+      <w:proofErr w:type="spellEnd"/>
+      <w:r>
+        <w:t>(</w:t>
+      </w:r>
+      <w:proofErr w:type="gramEnd"/>
       <w:r>
         <w:t>…).  Added helpers (</w:t>
       </w:r>
+      <w:proofErr w:type="spellStart"/>
       <w:r>
         <w:t>ReadZeroPage</w:t>
       </w:r>
+      <w:proofErr w:type="spellEnd"/>
       <w:r>
         <w:t xml:space="preserve">, </w:t>
       </w:r>
+      <w:proofErr w:type="spellStart"/>
       <w:r>
         <w:t>WriteZeroPage</w:t>
       </w:r>
+      <w:proofErr w:type="spellEnd"/>
       <w:r>
         <w:t xml:space="preserve">, </w:t>
       </w:r>
+      <w:proofErr w:type="spellStart"/>
       <w:r>
         <w:t>ReadPaged</w:t>
       </w:r>
+      <w:proofErr w:type="spellEnd"/>
       <w:r>
         <w:t xml:space="preserve">, </w:t>
       </w:r>
+      <w:proofErr w:type="spellStart"/>
       <w:r>
         <w:t>WritePaged</w:t>
       </w:r>
+      <w:proofErr w:type="spellEnd"/>
       <w:r>
         <w:t>) which wrap the respective functionality whilst updating the</w:t>
       </w:r>
@@ -13157,14 +14685,48 @@
         <w:t xml:space="preserve"> </w:t>
       </w:r>
       <w:r>
-        <w:t xml:space="preserve">new struct (StackFrame) and </w:t>
+        <w:t xml:space="preserve">new </w:t>
+      </w:r>
+      <w:proofErr w:type="gramStart"/>
+      <w:r>
+        <w:t>struct</w:t>
+      </w:r>
+      <w:proofErr w:type="gramEnd"/>
+      <w:r>
+        <w:t xml:space="preserve"> (</w:t>
+      </w:r>
+      <w:proofErr w:type="spellStart"/>
+      <w:r>
+        <w:t>StackFrame</w:t>
+      </w:r>
+      <w:proofErr w:type="spellEnd"/>
+      <w:r>
+        <w:t xml:space="preserve">) and </w:t>
       </w:r>
       <w:r>
         <w:t>static variables (</w:t>
       </w:r>
-      <w:r>
-        <w:t>StackFrames, StackFrameCount, fSyncStackFrames</w:t>
-      </w:r>
+      <w:proofErr w:type="spellStart"/>
+      <w:r>
+        <w:t>StackFrames</w:t>
+      </w:r>
+      <w:proofErr w:type="spellEnd"/>
+      <w:r>
+        <w:t xml:space="preserve">, </w:t>
+      </w:r>
+      <w:proofErr w:type="spellStart"/>
+      <w:r>
+        <w:t>StackFrameCount</w:t>
+      </w:r>
+      <w:proofErr w:type="spellEnd"/>
+      <w:r>
+        <w:t xml:space="preserve">, </w:t>
+      </w:r>
+      <w:proofErr w:type="spellStart"/>
+      <w:r>
+        <w:t>fSyncStackFrames</w:t>
+      </w:r>
+      <w:proofErr w:type="spellEnd"/>
       <w:r>
         <w:t xml:space="preserve">) to </w:t>
       </w:r>
@@ -13180,24 +14742,35 @@
       <w:r>
         <w:t xml:space="preserve"> and added helpers (</w:t>
       </w:r>
+      <w:proofErr w:type="spellStart"/>
       <w:r>
         <w:t>PushStackFrame</w:t>
       </w:r>
+      <w:proofErr w:type="spellEnd"/>
       <w:r>
         <w:t xml:space="preserve">, </w:t>
       </w:r>
+      <w:proofErr w:type="spellStart"/>
       <w:r>
         <w:t>SyncStackFrames</w:t>
       </w:r>
+      <w:proofErr w:type="spellEnd"/>
       <w:r>
         <w:t xml:space="preserve">, </w:t>
       </w:r>
-      <w:r>
-        <w:t xml:space="preserve">SetStackFrame, </w:t>
-      </w:r>
+      <w:proofErr w:type="spellStart"/>
+      <w:r>
+        <w:t>SetStackFrame</w:t>
+      </w:r>
+      <w:proofErr w:type="spellEnd"/>
+      <w:r>
+        <w:t xml:space="preserve">, </w:t>
+      </w:r>
+      <w:proofErr w:type="spellStart"/>
       <w:r>
         <w:t>UpdateRootStackFrame</w:t>
       </w:r>
+      <w:proofErr w:type="spellEnd"/>
       <w:r>
         <w:t xml:space="preserve">) to </w:t>
       </w:r>
@@ -13222,9 +14795,11 @@
       <w:r>
         <w:t xml:space="preserve">set </w:t>
       </w:r>
+      <w:proofErr w:type="spellStart"/>
       <w:r>
         <w:t>fSyncStackFrames</w:t>
       </w:r>
+      <w:proofErr w:type="spellEnd"/>
       <w:r>
         <w:t xml:space="preserve"> and invoke </w:t>
       </w:r>
@@ -13277,8 +14852,13 @@
       <w:r>
         <w:t xml:space="preserve">dded helper to get the emulator’s call stack: </w:t>
       </w:r>
-      <w:r>
-        <w:t xml:space="preserve">GetStackFrames </w:t>
+      <w:proofErr w:type="spellStart"/>
+      <w:r>
+        <w:t>GetStackFrames</w:t>
+      </w:r>
+      <w:proofErr w:type="spellEnd"/>
+      <w:r>
+        <w:t xml:space="preserve"> </w:t>
       </w:r>
       <w:r>
         <w:t>(…).  This is called during snapshot chunk serialization.</w:t>
@@ -13296,7 +14876,20 @@
         </w:numPr>
       </w:pPr>
       <w:r>
-        <w:t>Added helper to get the emulator’s registers: GetRegisters(…).  This is called during snapshot chunk serialization.</w:t>
+        <w:t xml:space="preserve">Added helper to get the emulator’s registers: </w:t>
+      </w:r>
+      <w:proofErr w:type="spellStart"/>
+      <w:proofErr w:type="gramStart"/>
+      <w:r>
+        <w:t>GetRegisters</w:t>
+      </w:r>
+      <w:proofErr w:type="spellEnd"/>
+      <w:r>
+        <w:t>(</w:t>
+      </w:r>
+      <w:proofErr w:type="gramEnd"/>
+      <w:r>
+        <w:t>…).  This is called during snapshot chunk serialization.</w:t>
       </w:r>
     </w:p>
     <w:p>
@@ -13310,6 +14903,7 @@
       <w:r>
         <w:t xml:space="preserve">Removed </w:t>
       </w:r>
+      <w:proofErr w:type="spellStart"/>
       <w:r>
         <w:rPr>
           <w:b/>
@@ -13317,9 +14911,11 @@
         </w:rPr>
         <w:t>ReadPaged</w:t>
       </w:r>
+      <w:proofErr w:type="spellEnd"/>
       <w:r>
         <w:t xml:space="preserve"> and </w:t>
       </w:r>
+      <w:proofErr w:type="spellStart"/>
       <w:r>
         <w:rPr>
           <w:b/>
@@ -13327,6 +14923,7 @@
         </w:rPr>
         <w:t>WritePaged</w:t>
       </w:r>
+      <w:proofErr w:type="spellEnd"/>
       <w:r>
         <w:t xml:space="preserve"> </w:t>
       </w:r>
@@ -13341,13 +14938,31 @@
           <w:bCs/>
         </w:rPr>
       </w:pPr>
-      <w:r>
-        <w:rPr>
-          <w:b/>
-          <w:bCs/>
-        </w:rPr>
-        <w:t>BeepMem.h/cpp</w:t>
-      </w:r>
+      <w:proofErr w:type="spellStart"/>
+      <w:r>
+        <w:rPr>
+          <w:b/>
+          <w:bCs/>
+        </w:rPr>
+        <w:t>BeepMem.h</w:t>
+      </w:r>
+      <w:proofErr w:type="spellEnd"/>
+      <w:r>
+        <w:rPr>
+          <w:b/>
+          <w:bCs/>
+        </w:rPr>
+        <w:t>/</w:t>
+      </w:r>
+      <w:proofErr w:type="spellStart"/>
+      <w:r>
+        <w:rPr>
+          <w:b/>
+          <w:bCs/>
+        </w:rPr>
+        <w:t>cpp</w:t>
+      </w:r>
+      <w:proofErr w:type="spellEnd"/>
     </w:p>
     <w:p>
       <w:pPr>
@@ -13358,25 +14973,42 @@
         </w:numPr>
       </w:pPr>
       <w:r>
-        <w:t>Defined new struct (</w:t>
-      </w:r>
+        <w:t xml:space="preserve">Defined new </w:t>
+      </w:r>
+      <w:proofErr w:type="gramStart"/>
+      <w:r>
+        <w:t>struct</w:t>
+      </w:r>
+      <w:proofErr w:type="gramEnd"/>
+      <w:r>
+        <w:t xml:space="preserve"> (</w:t>
+      </w:r>
+      <w:proofErr w:type="spellStart"/>
       <w:r>
         <w:t>MemPageType</w:t>
       </w:r>
+      <w:proofErr w:type="spellEnd"/>
       <w:r>
         <w:t>) and function (</w:t>
       </w:r>
+      <w:proofErr w:type="spellStart"/>
       <w:r>
         <w:t>BeebMemPage</w:t>
       </w:r>
+      <w:proofErr w:type="spellEnd"/>
       <w:r>
         <w:t xml:space="preserve">) that returns the page associated with an address.  This is invoked by </w:t>
       </w:r>
+      <w:proofErr w:type="spellStart"/>
       <w:r>
         <w:t>Set</w:t>
       </w:r>
       <w:r>
-        <w:t xml:space="preserve">StackFrame </w:t>
+        <w:t>StackFrame</w:t>
+      </w:r>
+      <w:proofErr w:type="spellEnd"/>
+      <w:r>
+        <w:t xml:space="preserve"> </w:t>
       </w:r>
       <w:r>
         <w:t>(see 6502.cpp).</w:t>
@@ -13431,6 +15063,7 @@
         </w:rPr>
         <w:t xml:space="preserve"> </w:t>
       </w:r>
+      <w:proofErr w:type="spellStart"/>
       <w:r>
         <w:rPr>
           <w:b/>
@@ -13438,6 +15071,7 @@
         </w:rPr>
         <w:t>HidAdd</w:t>
       </w:r>
+      <w:proofErr w:type="spellEnd"/>
       <w:r>
         <w:rPr>
           <w:b/>
@@ -13519,13 +15153,37 @@
         </w:numPr>
       </w:pPr>
       <w:r>
-        <w:t xml:space="preserve">Added call to PerfWriter_WriteBeginDisplayEvent(…) to log the start of screen display. </w:t>
+        <w:t xml:space="preserve">Added call to </w:t>
+      </w:r>
+      <w:proofErr w:type="spellStart"/>
+      <w:r>
+        <w:t>PerfWriter_</w:t>
+      </w:r>
+      <w:proofErr w:type="gramStart"/>
+      <w:r>
+        <w:t>WriteBeginDisplayEvent</w:t>
+      </w:r>
+      <w:proofErr w:type="spellEnd"/>
+      <w:r>
+        <w:t>(</w:t>
+      </w:r>
+      <w:proofErr w:type="gramEnd"/>
+      <w:r>
+        <w:t xml:space="preserve">…) to log the start of screen display. </w:t>
       </w:r>
       <w:r>
         <w:t xml:space="preserve"> </w:t>
       </w:r>
       <w:r>
-        <w:t xml:space="preserve">This wrapper function only invokes the PerfWriter class during </w:t>
+        <w:t xml:space="preserve">This wrapper function only invokes the </w:t>
+      </w:r>
+      <w:proofErr w:type="spellStart"/>
+      <w:r>
+        <w:t>PerfWriter</w:t>
+      </w:r>
+      <w:proofErr w:type="spellEnd"/>
+      <w:r>
+        <w:t xml:space="preserve"> class during </w:t>
       </w:r>
       <w:r>
         <w:t xml:space="preserve">a </w:t>
@@ -13541,13 +15199,31 @@
           <w:bCs/>
         </w:rPr>
       </w:pPr>
-      <w:r>
-        <w:rPr>
-          <w:b/>
-          <w:bCs/>
-        </w:rPr>
-        <w:t>Debug.h/cpp</w:t>
-      </w:r>
+      <w:proofErr w:type="spellStart"/>
+      <w:r>
+        <w:rPr>
+          <w:b/>
+          <w:bCs/>
+        </w:rPr>
+        <w:t>Debug.h</w:t>
+      </w:r>
+      <w:proofErr w:type="spellEnd"/>
+      <w:r>
+        <w:rPr>
+          <w:b/>
+          <w:bCs/>
+        </w:rPr>
+        <w:t>/</w:t>
+      </w:r>
+      <w:proofErr w:type="spellStart"/>
+      <w:r>
+        <w:rPr>
+          <w:b/>
+          <w:bCs/>
+        </w:rPr>
+        <w:t>cpp</w:t>
+      </w:r>
+      <w:proofErr w:type="spellEnd"/>
     </w:p>
     <w:p>
       <w:pPr>
@@ -13582,12 +15258,37 @@
           <w:bCs/>
         </w:rPr>
       </w:pPr>
-      <w:r>
-        <w:rPr>
-          <w:b/>
-          <w:bCs/>
-        </w:rPr>
-        <w:t>BeebWin.h/cpp, BeebWinIo.cpp</w:t>
+      <w:proofErr w:type="spellStart"/>
+      <w:r>
+        <w:rPr>
+          <w:b/>
+          <w:bCs/>
+        </w:rPr>
+        <w:t>BeebWin.h</w:t>
+      </w:r>
+      <w:proofErr w:type="spellEnd"/>
+      <w:r>
+        <w:rPr>
+          <w:b/>
+          <w:bCs/>
+        </w:rPr>
+        <w:t>/</w:t>
+      </w:r>
+      <w:proofErr w:type="spellStart"/>
+      <w:r>
+        <w:rPr>
+          <w:b/>
+          <w:bCs/>
+        </w:rPr>
+        <w:t>cpp</w:t>
+      </w:r>
+      <w:proofErr w:type="spellEnd"/>
+      <w:r>
+        <w:rPr>
+          <w:b/>
+          <w:bCs/>
+        </w:rPr>
+        <w:t>, BeebWinIo.cpp</w:t>
       </w:r>
     </w:p>
     <w:p>
@@ -13615,29 +15316,66 @@
         </w:rPr>
         <w:t xml:space="preserve"> </w:t>
       </w:r>
+      <w:proofErr w:type="spellStart"/>
+      <w:proofErr w:type="gramStart"/>
       <w:r>
         <w:t>UpdatePerfCaptureMenu</w:t>
       </w:r>
-      <w:r>
-        <w:t>()</w:t>
-      </w:r>
-      <w:r>
-        <w:t>, CapturePerf</w:t>
-      </w:r>
-      <w:r>
-        <w:t>()</w:t>
-      </w:r>
-      <w:r>
-        <w:t>, EndPerfCapture</w:t>
-      </w:r>
-      <w:r>
-        <w:t>()</w:t>
-      </w:r>
-      <w:r>
-        <w:t>, and IsCapturingPerf</w:t>
-      </w:r>
-      <w:r>
-        <w:t>()</w:t>
+      <w:proofErr w:type="spellEnd"/>
+      <w:r>
+        <w:t>(</w:t>
+      </w:r>
+      <w:proofErr w:type="gramEnd"/>
+      <w:r>
+        <w:t>)</w:t>
+      </w:r>
+      <w:r>
+        <w:t xml:space="preserve">, </w:t>
+      </w:r>
+      <w:proofErr w:type="spellStart"/>
+      <w:proofErr w:type="gramStart"/>
+      <w:r>
+        <w:t>CapturePerf</w:t>
+      </w:r>
+      <w:proofErr w:type="spellEnd"/>
+      <w:r>
+        <w:t>(</w:t>
+      </w:r>
+      <w:proofErr w:type="gramEnd"/>
+      <w:r>
+        <w:t>)</w:t>
+      </w:r>
+      <w:r>
+        <w:t xml:space="preserve">, </w:t>
+      </w:r>
+      <w:proofErr w:type="spellStart"/>
+      <w:proofErr w:type="gramStart"/>
+      <w:r>
+        <w:t>EndPerfCapture</w:t>
+      </w:r>
+      <w:proofErr w:type="spellEnd"/>
+      <w:r>
+        <w:t>(</w:t>
+      </w:r>
+      <w:proofErr w:type="gramEnd"/>
+      <w:r>
+        <w:t>)</w:t>
+      </w:r>
+      <w:r>
+        <w:t xml:space="preserve">, and </w:t>
+      </w:r>
+      <w:proofErr w:type="spellStart"/>
+      <w:proofErr w:type="gramStart"/>
+      <w:r>
+        <w:t>IsCapturingPerf</w:t>
+      </w:r>
+      <w:proofErr w:type="spellEnd"/>
+      <w:r>
+        <w:t>(</w:t>
+      </w:r>
+      <w:proofErr w:type="gramEnd"/>
+      <w:r>
+        <w:t>)</w:t>
       </w:r>
       <w:r>
         <w:t xml:space="preserve"> functions</w:t>
@@ -13651,9 +15389,11 @@
       <w:r>
         <w:t xml:space="preserve">.  The only notable differences are that </w:t>
       </w:r>
+      <w:proofErr w:type="spellStart"/>
       <w:r>
         <w:t>CapturePerf</w:t>
       </w:r>
+      <w:proofErr w:type="spellEnd"/>
       <w:r>
         <w:rPr>
           <w:b/>
@@ -13662,11 +15402,21 @@
         <w:t xml:space="preserve"> </w:t>
       </w:r>
       <w:r>
-        <w:t xml:space="preserve">creates an instance of the PerfWriter class, initializes it, and </w:t>
-      </w:r>
+        <w:t xml:space="preserve">creates an instance of the </w:t>
+      </w:r>
+      <w:proofErr w:type="spellStart"/>
+      <w:r>
+        <w:t>PerfWriter</w:t>
+      </w:r>
+      <w:proofErr w:type="spellEnd"/>
+      <w:r>
+        <w:t xml:space="preserve"> class, initializes it, and </w:t>
+      </w:r>
+      <w:proofErr w:type="spellStart"/>
       <w:r>
         <w:t>EndPerfCapture</w:t>
       </w:r>
+      <w:proofErr w:type="spellEnd"/>
       <w:r>
         <w:rPr>
           <w:b/>
@@ -13675,23 +15425,49 @@
         <w:t xml:space="preserve"> </w:t>
       </w:r>
       <w:r>
-        <w:t>closes the capture, and deletes the PerfWriter instance.</w:t>
-      </w:r>
-    </w:p>
-    <w:p>
-      <w:pPr>
-        <w:rPr>
-          <w:b/>
-          <w:bCs/>
-        </w:rPr>
-      </w:pPr>
-      <w:r>
-        <w:rPr>
-          <w:b/>
-          <w:bCs/>
-        </w:rPr>
-        <w:t>BeebWinPrefs.h/cpp</w:t>
-      </w:r>
+        <w:t xml:space="preserve">closes the capture, and deletes the </w:t>
+      </w:r>
+      <w:proofErr w:type="spellStart"/>
+      <w:r>
+        <w:t>PerfWriter</w:t>
+      </w:r>
+      <w:proofErr w:type="spellEnd"/>
+      <w:r>
+        <w:t xml:space="preserve"> instance.</w:t>
+      </w:r>
+    </w:p>
+    <w:p>
+      <w:pPr>
+        <w:rPr>
+          <w:b/>
+          <w:bCs/>
+        </w:rPr>
+      </w:pPr>
+      <w:proofErr w:type="spellStart"/>
+      <w:r>
+        <w:rPr>
+          <w:b/>
+          <w:bCs/>
+        </w:rPr>
+        <w:t>BeebWinPrefs.h</w:t>
+      </w:r>
+      <w:proofErr w:type="spellEnd"/>
+      <w:r>
+        <w:rPr>
+          <w:b/>
+          <w:bCs/>
+        </w:rPr>
+        <w:t>/</w:t>
+      </w:r>
+      <w:proofErr w:type="spellStart"/>
+      <w:r>
+        <w:rPr>
+          <w:b/>
+          <w:bCs/>
+        </w:rPr>
+        <w:t>cpp</w:t>
+      </w:r>
+      <w:proofErr w:type="spellEnd"/>
     </w:p>
     <w:p>
       <w:pPr>
@@ -13776,14 +15552,32 @@
           <w:bCs/>
         </w:rPr>
       </w:pPr>
+      <w:proofErr w:type="spellStart"/>
       <w:r>
         <w:rPr>
           <w:b/>
           <w:bCs/>
         </w:rPr>
         <w:lastRenderedPageBreak/>
-        <w:t>BeebEm.rc, Resource.h</w:t>
-      </w:r>
+        <w:t>BeebEm.rc</w:t>
+      </w:r>
+      <w:proofErr w:type="spellEnd"/>
+      <w:r>
+        <w:rPr>
+          <w:b/>
+          <w:bCs/>
+        </w:rPr>
+        <w:t xml:space="preserve">, </w:t>
+      </w:r>
+      <w:proofErr w:type="spellStart"/>
+      <w:r>
+        <w:rPr>
+          <w:b/>
+          <w:bCs/>
+        </w:rPr>
+        <w:t>Resource.h</w:t>
+      </w:r>
+      <w:proofErr w:type="spellEnd"/>
     </w:p>
     <w:p>
       <w:pPr>
@@ -13831,6 +15625,8 @@
         </w:rPr>
         <w:t>*</w:t>
       </w:r>
+      <w:proofErr w:type="spellStart"/>
+      <w:proofErr w:type="gramStart"/>
       <w:r>
         <w:rPr>
           <w:b/>
@@ -13866,6 +15662,8 @@
         </w:rPr>
         <w:t>.filters</w:t>
       </w:r>
+      <w:proofErr w:type="spellEnd"/>
+      <w:proofErr w:type="gramEnd"/>
     </w:p>
     <w:p>
       <w:pPr>
@@ -13891,8 +15689,17 @@
           <w:b/>
           <w:bCs/>
         </w:rPr>
-        <w:t>*.vcxproj</w:t>
-      </w:r>
+        <w:t>*.</w:t>
+      </w:r>
+      <w:proofErr w:type="spellStart"/>
+      <w:r>
+        <w:rPr>
+          <w:b/>
+          <w:bCs/>
+        </w:rPr>
+        <w:t>vcxproj</w:t>
+      </w:r>
+      <w:proofErr w:type="spellEnd"/>
     </w:p>
     <w:p>
       <w:pPr>
@@ -13903,7 +15710,15 @@
         </w:numPr>
       </w:pPr>
       <w:r>
-        <w:t>Updated WindowsTargetPlatformVersion to 10.0</w:t>
+        <w:t xml:space="preserve">Updated </w:t>
+      </w:r>
+      <w:proofErr w:type="spellStart"/>
+      <w:r>
+        <w:t>WindowsTargetPlatformVersion</w:t>
+      </w:r>
+      <w:proofErr w:type="spellEnd"/>
+      <w:r>
+        <w:t xml:space="preserve"> to 10.0</w:t>
       </w:r>
     </w:p>
     <w:p>
@@ -13915,7 +15730,15 @@
         </w:numPr>
       </w:pPr>
       <w:r>
-        <w:t>Updated PlatformToolset to v142</w:t>
+        <w:t xml:space="preserve">Updated </w:t>
+      </w:r>
+      <w:proofErr w:type="spellStart"/>
+      <w:r>
+        <w:t>PlatformToolset</w:t>
+      </w:r>
+      <w:proofErr w:type="spellEnd"/>
+      <w:r>
+        <w:t xml:space="preserve"> to v142</w:t>
       </w:r>
     </w:p>
     <w:p>
@@ -13954,16 +15777,52 @@
         </w:rPr>
         <w:t xml:space="preserve">git add -N </w:t>
       </w:r>
+      <w:proofErr w:type="spellStart"/>
       <w:r>
         <w:rPr>
           <w:color w:val="FFFFFF" w:themeColor="background1"/>
         </w:rPr>
-        <w:t>src\PerfWriter.h src\PerfWriter.cpp</w:t>
-      </w:r>
+        <w:t>src</w:t>
+      </w:r>
+      <w:proofErr w:type="spellEnd"/>
       <w:r>
         <w:rPr>
           <w:color w:val="FFFFFF" w:themeColor="background1"/>
         </w:rPr>
+        <w:t>\</w:t>
+      </w:r>
+      <w:proofErr w:type="spellStart"/>
+      <w:r>
+        <w:rPr>
+          <w:color w:val="FFFFFF" w:themeColor="background1"/>
+        </w:rPr>
+        <w:t>PerfWriter.h</w:t>
+      </w:r>
+      <w:proofErr w:type="spellEnd"/>
+      <w:r>
+        <w:rPr>
+          <w:color w:val="FFFFFF" w:themeColor="background1"/>
+        </w:rPr>
+        <w:t xml:space="preserve"> </w:t>
+      </w:r>
+      <w:proofErr w:type="spellStart"/>
+      <w:r>
+        <w:rPr>
+          <w:color w:val="FFFFFF" w:themeColor="background1"/>
+        </w:rPr>
+        <w:t>src</w:t>
+      </w:r>
+      <w:proofErr w:type="spellEnd"/>
+      <w:r>
+        <w:rPr>
+          <w:color w:val="FFFFFF" w:themeColor="background1"/>
+        </w:rPr>
+        <w:t>\PerfWriter.cpp</w:t>
+      </w:r>
+      <w:r>
+        <w:rPr>
+          <w:color w:val="FFFFFF" w:themeColor="background1"/>
+        </w:rPr>
         <w:br/>
       </w:r>
       <w:r>
@@ -13984,12 +15843,28 @@
         </w:rPr>
         <w:t xml:space="preserve"> &gt; ..\</w:t>
       </w:r>
+      <w:proofErr w:type="spellStart"/>
       <w:r>
         <w:rPr>
           <w:color w:val="FFFFFF" w:themeColor="background1"/>
         </w:rPr>
-        <w:t>beebperf\beebem_changelist.diff</w:t>
-      </w:r>
+        <w:t>beebperf</w:t>
+      </w:r>
+      <w:proofErr w:type="spellEnd"/>
+      <w:r>
+        <w:rPr>
+          <w:color w:val="FFFFFF" w:themeColor="background1"/>
+        </w:rPr>
+        <w:t>\</w:t>
+      </w:r>
+      <w:proofErr w:type="spellStart"/>
+      <w:r>
+        <w:rPr>
+          <w:color w:val="FFFFFF" w:themeColor="background1"/>
+        </w:rPr>
+        <w:t>beebem_changelist.diff</w:t>
+      </w:r>
+      <w:proofErr w:type="spellEnd"/>
     </w:p>
     <w:p/>
     <w:p>
@@ -14012,24 +15887,48 @@
         </w:rPr>
         <w:t xml:space="preserve">    </w:t>
       </w:r>
+      <w:proofErr w:type="gramStart"/>
       <w:r>
         <w:rPr>
           <w:color w:val="FFFFFF" w:themeColor="background1"/>
         </w:rPr>
-        <w:t xml:space="preserve">git </w:t>
-      </w:r>
+        <w:t>git</w:t>
+      </w:r>
+      <w:proofErr w:type="gramEnd"/>
       <w:r>
         <w:rPr>
           <w:color w:val="FFFFFF" w:themeColor="background1"/>
         </w:rPr>
+        <w:t xml:space="preserve"> </w:t>
+      </w:r>
+      <w:r>
+        <w:rPr>
+          <w:color w:val="FFFFFF" w:themeColor="background1"/>
+        </w:rPr>
         <w:t>apply ..\</w:t>
       </w:r>
+      <w:proofErr w:type="spellStart"/>
       <w:r>
         <w:rPr>
           <w:color w:val="FFFFFF" w:themeColor="background1"/>
         </w:rPr>
-        <w:t>beebperf\beebem_changelist.diff</w:t>
-      </w:r>
+        <w:t>beebperf</w:t>
+      </w:r>
+      <w:proofErr w:type="spellEnd"/>
+      <w:r>
+        <w:rPr>
+          <w:color w:val="FFFFFF" w:themeColor="background1"/>
+        </w:rPr>
+        <w:t>\</w:t>
+      </w:r>
+      <w:proofErr w:type="spellStart"/>
+      <w:r>
+        <w:rPr>
+          <w:color w:val="FFFFFF" w:themeColor="background1"/>
+        </w:rPr>
+        <w:t>beebem_changelist.diff</w:t>
+      </w:r>
+      <w:proofErr w:type="spellEnd"/>
     </w:p>
     <w:p>
       <w:pPr>
@@ -14086,8 +15985,13 @@
         </w:numPr>
       </w:pPr>
       <w:r>
-        <w:t>Alternative label formatting in dissassembly</w:t>
-      </w:r>
+        <w:t xml:space="preserve">Alternative label formatting in </w:t>
+      </w:r>
+      <w:proofErr w:type="spellStart"/>
+      <w:r>
+        <w:t>dissassembly</w:t>
+      </w:r>
+      <w:proofErr w:type="spellEnd"/>
     </w:p>
     <w:p>
       <w:pPr>
@@ -14207,11 +16111,16 @@
       <w:r>
         <w:t>call stacks</w:t>
       </w:r>
+      <w:proofErr w:type="gramStart"/>
       <w:r>
         <w:t>.</w:t>
       </w:r>
       <w:r>
-        <w:t xml:space="preserve"> A few things make this challenging. </w:t>
+        <w:t xml:space="preserve"> </w:t>
+      </w:r>
+      <w:proofErr w:type="gramEnd"/>
+      <w:r>
+        <w:t xml:space="preserve">A few things make this challenging. </w:t>
       </w:r>
     </w:p>
     <w:p>
@@ -14684,8 +16593,13 @@
         </w:rPr>
         <w:t>The game loop</w:t>
       </w:r>
-      <w:r>
-        <w:t>. Detecting the game loop</w:t>
+      <w:proofErr w:type="gramStart"/>
+      <w:r>
+        <w:t xml:space="preserve">. </w:t>
+      </w:r>
+      <w:proofErr w:type="gramEnd"/>
+      <w:r>
+        <w:t>Detecting the game loop</w:t>
       </w:r>
     </w:p>
     <w:p>
@@ -14831,8 +16745,13 @@
         </w:rPr>
         <w:t>screen memory is being read</w:t>
       </w:r>
-      <w:r>
-        <w:t>. We need to know.</w:t>
+      <w:proofErr w:type="gramStart"/>
+      <w:r>
+        <w:t xml:space="preserve">. </w:t>
+      </w:r>
+      <w:proofErr w:type="gramEnd"/>
+      <w:r>
+        <w:t>We need to know.</w:t>
       </w:r>
     </w:p>
     <w:p>
@@ -14844,7 +16763,15 @@
         </w:numPr>
       </w:pPr>
       <w:r>
-        <w:t xml:space="preserve">The screen start address.  Write value stored to </w:t>
+        <w:t xml:space="preserve">The screen </w:t>
+      </w:r>
+      <w:proofErr w:type="gramStart"/>
+      <w:r>
+        <w:t>start</w:t>
+      </w:r>
+      <w:proofErr w:type="gramEnd"/>
+      <w:r>
+        <w:t xml:space="preserve"> address.  Write value stored to </w:t>
       </w:r>
       <w:r>
         <w:t>&amp;FE00</w:t>
@@ -14868,7 +16795,15 @@
         </w:numPr>
       </w:pPr>
       <w:r>
-        <w:t xml:space="preserve">The screen wrap-size (how many K). Write value stored to </w:t>
+        <w:t>The screen wrap-size (how many K)</w:t>
+      </w:r>
+      <w:proofErr w:type="gramStart"/>
+      <w:r>
+        <w:t xml:space="preserve">. </w:t>
+      </w:r>
+      <w:proofErr w:type="gramEnd"/>
+      <w:r>
+        <w:t xml:space="preserve">Write value stored to </w:t>
       </w:r>
       <w:r>
         <w:t>&amp;FE40</w:t>
@@ -14883,7 +16818,23 @@
         </w:numPr>
       </w:pPr>
       <w:r>
-        <w:t xml:space="preserve">The screen format (mode-7 verses non mode-7). Write values stored at </w:t>
+        <w:t xml:space="preserve">The screen format (mode-7 verses </w:t>
+      </w:r>
+      <w:proofErr w:type="gramStart"/>
+      <w:r>
+        <w:t>non mode</w:t>
+      </w:r>
+      <w:proofErr w:type="gramEnd"/>
+      <w:r>
+        <w:t>-7)</w:t>
+      </w:r>
+      <w:proofErr w:type="gramStart"/>
+      <w:r>
+        <w:t xml:space="preserve">. </w:t>
+      </w:r>
+      <w:proofErr w:type="gramEnd"/>
+      <w:r>
+        <w:t xml:space="preserve">Write values stored at </w:t>
       </w:r>
       <w:r>
         <w:t>&amp;FE20</w:t>
@@ -14923,13 +16874,45 @@
       </w:pPr>
       <w:r>
         <w:lastRenderedPageBreak/>
-        <w:t>Detecting when the screen read starts.  We need to know when the v-sync interrupt occurs.  We can time it from here.  We can determine this by looking if the values read from &amp;</w:t>
+        <w:t xml:space="preserve">Detecting when the screen read starts.  We need to know when the v-sync </w:t>
+      </w:r>
+      <w:proofErr w:type="gramStart"/>
+      <w:r>
+        <w:t>interrupt</w:t>
+      </w:r>
+      <w:proofErr w:type="gramEnd"/>
+      <w:r>
+        <w:t xml:space="preserve"> occurs.  We can time it from here.  We can determine this by </w:t>
+      </w:r>
+      <w:proofErr w:type="gramStart"/>
+      <w:r>
+        <w:t>looking</w:t>
+      </w:r>
+      <w:proofErr w:type="gramEnd"/>
+      <w:r>
+        <w:t xml:space="preserve"> if the values read from &amp;</w:t>
       </w:r>
       <w:r>
         <w:t>FE4D</w:t>
       </w:r>
       <w:r>
-        <w:t xml:space="preserve"> has bit two set.  The rest is math.</w:t>
+        <w:t xml:space="preserve"> </w:t>
+      </w:r>
+      <w:proofErr w:type="gramStart"/>
+      <w:r>
+        <w:t>has</w:t>
+      </w:r>
+      <w:proofErr w:type="gramEnd"/>
+      <w:r>
+        <w:t xml:space="preserve"> bit two </w:t>
+      </w:r>
+      <w:proofErr w:type="gramStart"/>
+      <w:r>
+        <w:t>set</w:t>
+      </w:r>
+      <w:proofErr w:type="gramEnd"/>
+      <w:r>
+        <w:t>.  The rest is math.</w:t>
       </w:r>
     </w:p>
     <w:p>
@@ -14941,13 +16924,37 @@
         </w:numPr>
       </w:pPr>
       <w:r>
-        <w:t>Detecting roms being paged in  The easiest way to handle this is to record the value written to &amp;</w:t>
+        <w:t xml:space="preserve">Detecting </w:t>
+      </w:r>
+      <w:proofErr w:type="spellStart"/>
+      <w:r>
+        <w:t>roms</w:t>
+      </w:r>
+      <w:proofErr w:type="spellEnd"/>
+      <w:r>
+        <w:t xml:space="preserve"> being paged </w:t>
+      </w:r>
+      <w:proofErr w:type="gramStart"/>
+      <w:r>
+        <w:t>in  The</w:t>
+      </w:r>
+      <w:proofErr w:type="gramEnd"/>
+      <w:r>
+        <w:t xml:space="preserve"> easiest way to handle this is to record the value written to &amp;</w:t>
       </w:r>
       <w:r>
         <w:t>FE30</w:t>
       </w:r>
       <w:r>
-        <w:t>.  This led to the need to capture memory accesses. read and write value.</w:t>
+        <w:t xml:space="preserve">.  This led to the need to capture memory </w:t>
+      </w:r>
+      <w:proofErr w:type="gramStart"/>
+      <w:r>
+        <w:t xml:space="preserve">accesses. </w:t>
+      </w:r>
+      <w:proofErr w:type="gramEnd"/>
+      <w:r>
+        <w:t>read and write value.</w:t>
       </w:r>
     </w:p>
     <w:p>
@@ -14971,7 +16978,15 @@
         </w:numPr>
       </w:pPr>
       <w:r>
-        <w:t>A spin loop is a tight look that doesn’t write anything, it just reads something. They are shown in light grey (background is white).  We are looking for a repeated set of non-instructions in the recording.</w:t>
+        <w:t>A spin loop is a tight look that doesn’t write anything, it just reads something</w:t>
+      </w:r>
+      <w:proofErr w:type="gramStart"/>
+      <w:r>
+        <w:t xml:space="preserve">. </w:t>
+      </w:r>
+      <w:proofErr w:type="gramEnd"/>
+      <w:r>
+        <w:t>They are shown in light grey (background is white).  We are looking for a repeated set of non-instructions in the recording.</w:t>
       </w:r>
     </w:p>
     <w:p>
@@ -14995,7 +17010,15 @@
         </w:numPr>
       </w:pPr>
       <w:r>
-        <w:t>Look for repeating instructions.</w:t>
+        <w:t xml:space="preserve">Look for </w:t>
+      </w:r>
+      <w:proofErr w:type="gramStart"/>
+      <w:r>
+        <w:t>repeating</w:t>
+      </w:r>
+      <w:proofErr w:type="gramEnd"/>
+      <w:r>
+        <w:t xml:space="preserve"> instructions.</w:t>
       </w:r>
     </w:p>
     <w:p>
@@ -15144,7 +17167,15 @@
         <w:t>O</w:t>
       </w:r>
       <w:r>
-        <w:t xml:space="preserve">n closer inspection, a surprising amount of the time is spent in cacheObjectExtents, which sets the </w:t>
+        <w:t xml:space="preserve">n closer inspection, a surprising amount of the time is spent in </w:t>
+      </w:r>
+      <w:proofErr w:type="spellStart"/>
+      <w:r>
+        <w:t>cacheObjectExtents</w:t>
+      </w:r>
+      <w:proofErr w:type="spellEnd"/>
+      <w:r>
+        <w:t xml:space="preserve">, which sets the </w:t>
       </w:r>
       <w:r>
         <w:rPr>
@@ -15166,6 +17197,7 @@
       <w:r>
         <w:t xml:space="preserve">, </w:t>
       </w:r>
+      <w:proofErr w:type="spellStart"/>
       <w:r>
         <w:rPr>
           <w:i/>
@@ -15173,9 +17205,11 @@
         </w:rPr>
         <w:t>widthMinusOne</w:t>
       </w:r>
+      <w:proofErr w:type="spellEnd"/>
       <w:r>
         <w:t xml:space="preserve">, and </w:t>
       </w:r>
+      <w:proofErr w:type="spellStart"/>
       <w:r>
         <w:rPr>
           <w:i/>
@@ -15183,6 +17217,7 @@
         </w:rPr>
         <w:t>heightMinusOne</w:t>
       </w:r>
+      <w:proofErr w:type="spellEnd"/>
       <w:r>
         <w:t xml:space="preserve"> zero-page variables.  In the majority of cases the callback update functions skip work so don’t read these.</w:t>
       </w:r>
@@ -21483,6 +23518,7 @@
   <w:style w:type="character" w:default="1" w:styleId="DefaultParagraphFont">
     <w:name w:val="Default Paragraph Font"/>
     <w:uiPriority w:val="1"/>
+    <w:semiHidden/>
     <w:unhideWhenUsed/>
   </w:style>
   <w:style w:type="table" w:default="1" w:styleId="TableNormal">

</xml_diff>

<commit_message>
Bug fixes and doc updates
</commit_message>
<xml_diff>
--- a/docs/Development.docx
+++ b/docs/Development.docx
@@ -9752,9 +9752,6 @@
       <w:proofErr w:type="spellEnd"/>
     </w:p>
     <w:p>
-      <w:r>
-        <w:t xml:space="preserve">As outlined above, </w:t>
-      </w:r>
       <w:proofErr w:type="spellStart"/>
       <w:r>
         <w:t>BeebPerf</w:t>
@@ -9786,7 +9783,13 @@
         <w:t xml:space="preserve"> fil</w:t>
       </w:r>
       <w:r>
-        <w:t>e, analyses the data, and presents the performance results in a graphical way</w:t>
+        <w:t xml:space="preserve">e, analyses </w:t>
+      </w:r>
+      <w:r>
+        <w:t>its</w:t>
+      </w:r>
+      <w:r>
+        <w:t xml:space="preserve"> data, and presents the performance results in a graphical way</w:t>
       </w:r>
       <w:r>
         <w:t xml:space="preserve"> to the user.</w:t>
@@ -9819,13 +9822,11 @@
       <w:r>
         <w:t xml:space="preserve">  Many of the views </w:t>
       </w:r>
-      <w:proofErr w:type="gramStart"/>
-      <w:r>
-        <w:t>presented on</w:t>
-      </w:r>
-      <w:proofErr w:type="gramEnd"/>
-      <w:r>
-        <w:t xml:space="preserve"> modelled from Visual Studio’s profiler views.</w:t>
+      <w:r>
+        <w:t xml:space="preserve">are </w:t>
+      </w:r>
+      <w:r>
+        <w:t>modelled from Visual Studio’s profiler views.</w:t>
       </w:r>
     </w:p>
     <w:p>
@@ -9856,7 +9857,7 @@
         <w:t>r</w:t>
       </w:r>
       <w:r>
-        <w:t>am:</w:t>
+        <w:t>am</w:t>
       </w:r>
     </w:p>
     <w:p>
@@ -10609,6 +10610,11 @@
     </w:p>
     <w:p>
       <w:r>
+        <w:t>&lt;snapshot&gt;</w:t>
+      </w:r>
+    </w:p>
+    <w:p>
+      <w:r>
         <w:rPr>
           <w:b/>
           <w:bCs/>
@@ -10673,10 +10679,16 @@
     </w:p>
     <w:p>
       <w:r>
-        <w:rPr>
-          <w:b/>
-          <w:bCs/>
-        </w:rPr>
+        <w:t>&lt;snapshot&gt;</w:t>
+      </w:r>
+    </w:p>
+    <w:p>
+      <w:r>
+        <w:rPr>
+          <w:b/>
+          <w:bCs/>
+        </w:rPr>
+        <w:lastRenderedPageBreak/>
         <w:t xml:space="preserve">Caller \ Callee </w:t>
       </w:r>
       <w:r>
@@ -10698,330 +10710,378 @@
     </w:p>
     <w:p>
       <w:r>
-        <w:rPr>
-          <w:b/>
-          <w:bCs/>
-        </w:rPr>
+        <w:t>&lt;snapshot&gt;</w:t>
+      </w:r>
+    </w:p>
+    <w:p>
+      <w:r>
+        <w:rPr>
+          <w:b/>
+          <w:bCs/>
+        </w:rPr>
+        <w:t xml:space="preserve">Call tree </w:t>
+      </w:r>
+      <w:r>
+        <w:rPr>
+          <w:b/>
+          <w:bCs/>
+        </w:rPr>
+        <w:t>tab</w:t>
+      </w:r>
+      <w:r>
+        <w:t xml:space="preserve"> </w:t>
+      </w:r>
+      <w:r>
+        <w:t xml:space="preserve">– </w:t>
+      </w:r>
+      <w:r>
+        <w:t>Show</w:t>
+      </w:r>
+      <w:r>
+        <w:t>s</w:t>
+      </w:r>
+      <w:r>
+        <w:t xml:space="preserve"> where the program </w:t>
+      </w:r>
+      <w:r>
+        <w:t>is spending its time.  Each node in the tree represents a routine, with the top-level nodes showing the program entry point</w:t>
+      </w:r>
+      <w:r>
+        <w:t xml:space="preserve"> and interrupt </w:t>
+      </w:r>
+      <w:r>
+        <w:t>routines</w:t>
+      </w:r>
+      <w:r>
+        <w:t xml:space="preserve">.  Each node in the tree shows the self (exclusive), overall (inclusive), and elapsed times.  The child nodes are ordered by their inclusive CPU times.  In cases where a routine is called </w:t>
+      </w:r>
+      <w:proofErr w:type="gramStart"/>
+      <w:r>
+        <w:t>from</w:t>
+      </w:r>
+      <w:proofErr w:type="gramEnd"/>
+      <w:r>
+        <w:t xml:space="preserve"> multiple callers, the metrics shown are in the context of the call</w:t>
+      </w:r>
+      <w:r>
+        <w:t xml:space="preserve"> stack</w:t>
+      </w:r>
+      <w:r>
+        <w:t>.</w:t>
+      </w:r>
+    </w:p>
+    <w:p>
+      <w:r>
+        <w:t>&lt;snapshot&gt;</w:t>
+      </w:r>
+    </w:p>
+    <w:p>
+      <w:r>
+        <w:rPr>
+          <w:b/>
+          <w:bCs/>
+        </w:rPr>
+        <w:t xml:space="preserve">Flame </w:t>
+      </w:r>
+      <w:r>
+        <w:rPr>
+          <w:b/>
+          <w:bCs/>
+        </w:rPr>
+        <w:t xml:space="preserve">graph </w:t>
+      </w:r>
+      <w:r>
+        <w:rPr>
+          <w:b/>
+          <w:bCs/>
+        </w:rPr>
+        <w:t>tab</w:t>
+      </w:r>
+      <w:r>
+        <w:t xml:space="preserve"> </w:t>
+      </w:r>
+      <w:r>
+        <w:t xml:space="preserve">– </w:t>
+      </w:r>
+      <w:r>
+        <w:t xml:space="preserve">Provides a percentage breakdown of the </w:t>
+      </w:r>
+      <w:r>
+        <w:t>selected function</w:t>
+      </w:r>
+      <w:r>
+        <w:t>’s call graph.</w:t>
+      </w:r>
+      <w:r>
+        <w:t xml:space="preserve">  The </w:t>
+      </w:r>
+      <w:r>
+        <w:t>view can be flipped</w:t>
+      </w:r>
+      <w:r>
+        <w:t xml:space="preserve"> vertically.</w:t>
+      </w:r>
+    </w:p>
+    <w:p>
+      <w:r>
+        <w:t>&lt;snapshot&gt;</w:t>
+      </w:r>
+    </w:p>
+    <w:p>
+      <w:r>
+        <w:rPr>
+          <w:b/>
+          <w:bCs/>
+        </w:rPr>
+        <w:t xml:space="preserve">Memory </w:t>
+      </w:r>
+      <w:r>
+        <w:rPr>
+          <w:b/>
+          <w:bCs/>
+        </w:rPr>
+        <w:t>tab</w:t>
+      </w:r>
+      <w:r>
+        <w:t xml:space="preserve"> – The memory </w:t>
+      </w:r>
+      <w:r>
+        <w:t xml:space="preserve">tab </w:t>
+      </w:r>
+      <w:r>
+        <w:t xml:space="preserve">lists the highest </w:t>
+      </w:r>
+      <w:r>
+        <w:t xml:space="preserve">to </w:t>
+      </w:r>
+      <w:r>
+        <w:t xml:space="preserve">lowest </w:t>
+      </w:r>
+      <w:r>
+        <w:t>accessed</w:t>
+      </w:r>
+      <w:r>
+        <w:t xml:space="preserve"> memory in the application</w:t>
+      </w:r>
+      <w:r>
+        <w:t>.</w:t>
+      </w:r>
+      <w:r>
+        <w:t xml:space="preserve">  The memory ca</w:t>
+      </w:r>
+      <w:r>
+        <w:t>n optionally be filtered to just zero-page</w:t>
+      </w:r>
+      <w:r>
+        <w:t xml:space="preserve"> addresses</w:t>
+      </w:r>
+      <w:r>
+        <w:t>.</w:t>
+      </w:r>
+    </w:p>
+    <w:p>
+      <w:r>
+        <w:t xml:space="preserve">Selecting an address </w:t>
+      </w:r>
+      <w:r>
+        <w:t xml:space="preserve">displays a panel on the right </w:t>
+      </w:r>
+      <w:r>
+        <w:t>which list</w:t>
+      </w:r>
+      <w:r>
+        <w:t>s</w:t>
+      </w:r>
+      <w:r>
+        <w:t xml:space="preserve"> all the routines which read or write to th</w:t>
+      </w:r>
+      <w:r>
+        <w:t>at</w:t>
+      </w:r>
+      <w:r>
+        <w:t xml:space="preserve"> address, </w:t>
+      </w:r>
+      <w:r>
+        <w:t xml:space="preserve">with </w:t>
+      </w:r>
+      <w:r>
+        <w:t xml:space="preserve">respective </w:t>
+      </w:r>
+      <w:r>
+        <w:t>read</w:t>
+      </w:r>
+      <w:r>
+        <w:t xml:space="preserve"> </w:t>
+      </w:r>
+      <w:r>
+        <w:t>and write counts.</w:t>
+      </w:r>
+      <w:r>
+        <w:t xml:space="preserve">  Selecting a routine </w:t>
+      </w:r>
+      <w:r>
+        <w:t>selects the routine in the code window,</w:t>
+      </w:r>
+      <w:r>
+        <w:t xml:space="preserve"> in which the read and write counts are shown.</w:t>
+      </w:r>
+    </w:p>
+    <w:p>
+      <w:r>
+        <w:t>&lt;snapshot&gt;</w:t>
+      </w:r>
+    </w:p>
+    <w:p>
+      <w:r>
+        <w:rPr>
+          <w:b/>
+          <w:bCs/>
+        </w:rPr>
+        <w:t>Code panel</w:t>
+      </w:r>
+      <w:r>
+        <w:t xml:space="preserve"> – used to view the performance of an individual routine.</w:t>
+      </w:r>
+      <w:r>
+        <w:t xml:space="preserve"> </w:t>
+      </w:r>
+    </w:p>
+    <w:p>
+      <w:r>
+        <w:t xml:space="preserve">The panel shows </w:t>
+      </w:r>
+      <w:r>
+        <w:t xml:space="preserve">a disassembly of the </w:t>
+      </w:r>
+      <w:r>
+        <w:t xml:space="preserve">current </w:t>
+      </w:r>
+      <w:r>
+        <w:t xml:space="preserve">routine’s instructions.  If alternative opcode sequences exist, </w:t>
+      </w:r>
+      <w:r>
+        <w:t>a vertical bar denotes that the code is modified.</w:t>
+      </w:r>
+    </w:p>
+    <w:p>
+      <w:r>
+        <w:t>&lt;snapshot&gt;</w:t>
+      </w:r>
+    </w:p>
+    <w:p>
+      <w:pPr>
+        <w:rPr>
+          <w:b/>
+          <w:bCs/>
+        </w:rPr>
+      </w:pPr>
+      <w:r>
+        <w:rPr>
+          <w:b/>
+          <w:bCs/>
+        </w:rPr>
+        <w:t>Settings</w:t>
+      </w:r>
+      <w:r>
+        <w:rPr>
+          <w:b/>
+          <w:bCs/>
+        </w:rPr>
+        <w:t>:</w:t>
+      </w:r>
+    </w:p>
+    <w:p>
+      <w:r>
+        <w:t xml:space="preserve">The </w:t>
+      </w:r>
+      <w:r>
+        <w:t>settings dialog allows a number of display options to be set, including the default font scaling, theme (light or dark mode), and code formatting and color options.</w:t>
+      </w:r>
+    </w:p>
+    <w:p>
+      <w:r>
+        <w:t>&lt;snapshot&gt;</w:t>
+      </w:r>
+    </w:p>
+    <w:p>
+      <w:pPr>
+        <w:pStyle w:val="Heading3"/>
+      </w:pPr>
+      <w:r>
+        <w:t xml:space="preserve">Managing the </w:t>
+      </w:r>
+      <w:r>
+        <w:t>‘</w:t>
+      </w:r>
+      <w:r>
+        <w:t>context</w:t>
+      </w:r>
+      <w:r>
+        <w:t>’</w:t>
+      </w:r>
+    </w:p>
+    <w:p>
+      <w:r>
+        <w:t xml:space="preserve">The application has the notion of the current selected </w:t>
+      </w:r>
+      <w:r>
+        <w:t>routine</w:t>
+      </w:r>
+      <w:r>
+        <w:t xml:space="preserve">, </w:t>
+      </w:r>
+      <w:r>
+        <w:t>call-stack</w:t>
+      </w:r>
+      <w:r>
+        <w:t>, and address.</w:t>
+      </w:r>
+      <w:r>
+        <w:t xml:space="preserve">  Each view shows analysis based on these.  Some view</w:t>
+      </w:r>
+      <w:r>
+        <w:t>s</w:t>
+      </w:r>
+      <w:r>
+        <w:t xml:space="preserve"> allow the context to be changed.</w:t>
+      </w:r>
+    </w:p>
+    <w:p>
+      <w:pPr>
+        <w:pStyle w:val="Heading3"/>
+      </w:pPr>
+      <w:r>
         <w:lastRenderedPageBreak/>
-        <w:t xml:space="preserve">Call tree </w:t>
-      </w:r>
-      <w:r>
-        <w:rPr>
-          <w:b/>
-          <w:bCs/>
-        </w:rPr>
-        <w:t>tab</w:t>
+        <w:t>Undo-Redo</w:t>
+      </w:r>
+      <w:r>
+        <w:t xml:space="preserve"> History</w:t>
+      </w:r>
+    </w:p>
+    <w:p>
+      <w:r>
+        <w:t>The application supports undo/redo</w:t>
+      </w:r>
+      <w:r>
+        <w:t>.</w:t>
+      </w:r>
+      <w:r>
+        <w:t xml:space="preserve">  </w:t>
+      </w:r>
+      <w:r>
+        <w:t xml:space="preserve">The following </w:t>
+      </w:r>
+      <w:r>
+        <w:t>actions</w:t>
       </w:r>
       <w:r>
         <w:t xml:space="preserve"> </w:t>
       </w:r>
       <w:r>
-        <w:t xml:space="preserve">– </w:t>
-      </w:r>
-      <w:r>
-        <w:t>Show</w:t>
-      </w:r>
-      <w:r>
-        <w:t>s</w:t>
-      </w:r>
-      <w:r>
-        <w:t xml:space="preserve"> where the program </w:t>
-      </w:r>
-      <w:r>
-        <w:t>is spending its time.  Each node in the tree represents a routine, with the top-level nodes showing the program entry point</w:t>
-      </w:r>
-      <w:r>
-        <w:t xml:space="preserve"> and interrupt </w:t>
-      </w:r>
-      <w:r>
-        <w:t>routines</w:t>
-      </w:r>
-      <w:r>
-        <w:t xml:space="preserve">.  Each node in the tree shows the self (exclusive), overall (inclusive), and elapsed times.  The child nodes are ordered by their inclusive CPU times.  In cases where a routine is called </w:t>
-      </w:r>
-      <w:proofErr w:type="gramStart"/>
-      <w:r>
-        <w:t>from</w:t>
-      </w:r>
-      <w:proofErr w:type="gramEnd"/>
-      <w:r>
-        <w:t xml:space="preserve"> multiple callers, the metrics shown are in the context of the call</w:t>
-      </w:r>
-      <w:r>
-        <w:t xml:space="preserve"> stack</w:t>
-      </w:r>
-      <w:r>
-        <w:t>.</w:t>
-      </w:r>
-    </w:p>
-    <w:p>
-      <w:r>
-        <w:rPr>
-          <w:b/>
-          <w:bCs/>
-        </w:rPr>
-        <w:t xml:space="preserve">Flame </w:t>
-      </w:r>
-      <w:r>
-        <w:rPr>
-          <w:b/>
-          <w:bCs/>
-        </w:rPr>
-        <w:t xml:space="preserve">graph </w:t>
-      </w:r>
-      <w:r>
-        <w:rPr>
-          <w:b/>
-          <w:bCs/>
-        </w:rPr>
-        <w:t>tab</w:t>
-      </w:r>
-      <w:r>
-        <w:t xml:space="preserve"> </w:t>
-      </w:r>
-      <w:r>
-        <w:t xml:space="preserve">– </w:t>
-      </w:r>
-      <w:r>
-        <w:t xml:space="preserve">Provides a percentage breakdown of the </w:t>
-      </w:r>
-      <w:r>
-        <w:t>selected function</w:t>
-      </w:r>
-      <w:r>
-        <w:t>’s call graph.</w:t>
-      </w:r>
-      <w:r>
-        <w:t xml:space="preserve">  The </w:t>
-      </w:r>
-      <w:r>
-        <w:t>view can be flipped</w:t>
-      </w:r>
-      <w:r>
-        <w:t xml:space="preserve"> vertically.</w:t>
-      </w:r>
-    </w:p>
-    <w:p>
-      <w:r>
-        <w:rPr>
-          <w:b/>
-          <w:bCs/>
-        </w:rPr>
-        <w:t xml:space="preserve">Memory </w:t>
-      </w:r>
-      <w:r>
-        <w:rPr>
-          <w:b/>
-          <w:bCs/>
-        </w:rPr>
-        <w:t>tab</w:t>
-      </w:r>
-      <w:r>
-        <w:t xml:space="preserve"> – The memory </w:t>
-      </w:r>
-      <w:r>
-        <w:t xml:space="preserve">tab </w:t>
-      </w:r>
-      <w:r>
-        <w:t xml:space="preserve">lists the highest </w:t>
-      </w:r>
-      <w:r>
-        <w:t xml:space="preserve">to </w:t>
-      </w:r>
-      <w:r>
-        <w:t xml:space="preserve">lowest </w:t>
-      </w:r>
-      <w:r>
-        <w:t>accessed</w:t>
-      </w:r>
-      <w:r>
-        <w:t xml:space="preserve"> memory in the application</w:t>
-      </w:r>
-      <w:r>
-        <w:t>.</w:t>
-      </w:r>
-      <w:r>
-        <w:t xml:space="preserve">  The memory ca</w:t>
-      </w:r>
-      <w:r>
-        <w:t>n optionally be filtered to just zero-page</w:t>
-      </w:r>
-      <w:r>
-        <w:t xml:space="preserve"> addresses</w:t>
-      </w:r>
-      <w:r>
-        <w:t>.</w:t>
-      </w:r>
-    </w:p>
-    <w:p>
-      <w:r>
-        <w:t xml:space="preserve">Selecting an address </w:t>
-      </w:r>
-      <w:r>
-        <w:t xml:space="preserve">displays a panel on the right </w:t>
-      </w:r>
-      <w:r>
-        <w:t>which list</w:t>
-      </w:r>
-      <w:r>
-        <w:t>s</w:t>
-      </w:r>
-      <w:r>
-        <w:t xml:space="preserve"> all the routines which read or write to th</w:t>
-      </w:r>
-      <w:r>
-        <w:t>at</w:t>
-      </w:r>
-      <w:r>
-        <w:t xml:space="preserve"> address, </w:t>
-      </w:r>
-      <w:r>
-        <w:t xml:space="preserve">with </w:t>
-      </w:r>
-      <w:r>
-        <w:t xml:space="preserve">respective </w:t>
-      </w:r>
-      <w:r>
-        <w:t>read</w:t>
-      </w:r>
-      <w:r>
-        <w:t xml:space="preserve"> </w:t>
-      </w:r>
-      <w:r>
-        <w:t>and write counts.</w:t>
-      </w:r>
-      <w:r>
-        <w:t xml:space="preserve">  Selecting a routine </w:t>
-      </w:r>
-      <w:r>
-        <w:t>selects the routine in the code window,</w:t>
-      </w:r>
-      <w:r>
-        <w:t xml:space="preserve"> in which the read and write counts are shown.</w:t>
-      </w:r>
-    </w:p>
-    <w:p>
-      <w:r>
-        <w:rPr>
-          <w:b/>
-          <w:bCs/>
-        </w:rPr>
-        <w:t>Code panel</w:t>
-      </w:r>
-      <w:r>
-        <w:t xml:space="preserve"> – used to view the performance of an individual routine.</w:t>
-      </w:r>
-      <w:r>
-        <w:t xml:space="preserve"> </w:t>
-      </w:r>
-    </w:p>
-    <w:p>
-      <w:r>
-        <w:t xml:space="preserve">The panel shows </w:t>
-      </w:r>
-      <w:r>
-        <w:t xml:space="preserve">a disassembly of the </w:t>
-      </w:r>
-      <w:r>
-        <w:t xml:space="preserve">current </w:t>
-      </w:r>
-      <w:r>
-        <w:t xml:space="preserve">routine’s instructions.  If alternative opcode sequences exist, </w:t>
-      </w:r>
-      <w:r>
-        <w:t>a vertical bar denotes that the code is modified.</w:t>
-      </w:r>
-    </w:p>
-    <w:p>
-      <w:pPr>
-        <w:rPr>
-          <w:b/>
-          <w:bCs/>
-        </w:rPr>
-      </w:pPr>
-      <w:r>
-        <w:rPr>
-          <w:b/>
-          <w:bCs/>
-        </w:rPr>
-        <w:t>Settings</w:t>
-      </w:r>
-      <w:r>
-        <w:rPr>
-          <w:b/>
-          <w:bCs/>
-        </w:rPr>
+        <w:t>can be undone and redone</w:t>
+      </w:r>
+      <w:r>
         <w:t>:</w:t>
-      </w:r>
-    </w:p>
-    <w:p>
-      <w:r>
-        <w:t xml:space="preserve">The </w:t>
-      </w:r>
-      <w:r>
-        <w:t>settings dialog allows a number of display options to be set, including the default font scaling, theme (light or dark mode), and code formatting and color options.</w:t>
-      </w:r>
-    </w:p>
-    <w:p>
-      <w:pPr>
-        <w:pStyle w:val="Heading3"/>
-      </w:pPr>
-      <w:r>
-        <w:t xml:space="preserve">Managing the </w:t>
-      </w:r>
-      <w:r>
-        <w:t>‘</w:t>
-      </w:r>
-      <w:r>
-        <w:t>context</w:t>
-      </w:r>
-      <w:r>
-        <w:t>’</w:t>
-      </w:r>
-    </w:p>
-    <w:p>
-      <w:r>
-        <w:t xml:space="preserve">The application has the notion of the current selected </w:t>
-      </w:r>
-      <w:r>
-        <w:t>routine</w:t>
-      </w:r>
-      <w:r>
-        <w:t xml:space="preserve">, </w:t>
-      </w:r>
-      <w:r>
-        <w:t>call-stack</w:t>
-      </w:r>
-      <w:r>
-        <w:t>, and address.</w:t>
-      </w:r>
-      <w:r>
-        <w:t xml:space="preserve"> </w:t>
-      </w:r>
-    </w:p>
-    <w:p>
-      <w:pPr>
-        <w:pStyle w:val="Heading3"/>
-      </w:pPr>
-      <w:r>
-        <w:t>Undo-Redo</w:t>
-      </w:r>
-      <w:r>
-        <w:t xml:space="preserve"> History</w:t>
-      </w:r>
-    </w:p>
-    <w:p>
-      <w:r>
-        <w:t xml:space="preserve">The following </w:t>
-      </w:r>
-      <w:r>
-        <w:t>actions</w:t>
-      </w:r>
-      <w:r>
-        <w:t xml:space="preserve"> are stored in the undo/redo </w:t>
-      </w:r>
-      <w:r>
-        <w:t>history:</w:t>
       </w:r>
     </w:p>
     <w:p>
@@ -11154,18 +11214,16 @@
       </w:r>
     </w:p>
     <w:p>
-      <w:r>
-        <w:lastRenderedPageBreak/>
-        <w:t xml:space="preserve">The following actions are </w:t>
-      </w:r>
-      <w:r>
-        <w:rPr>
-          <w:u w:val="single"/>
-        </w:rPr>
-        <w:t>not</w:t>
-      </w:r>
-      <w:r>
-        <w:t xml:space="preserve"> stored in the undo/redo history: </w:t>
+      <w:pPr>
+        <w:pStyle w:val="Heading1"/>
+      </w:pPr>
+      <w:r>
+        <w:t>Current Limitations</w:t>
+      </w:r>
+    </w:p>
+    <w:p>
+      <w:r>
+        <w:t>The profiler currently has several limitations:</w:t>
       </w:r>
     </w:p>
     <w:p>
@@ -11173,11 +11231,25 @@
         <w:pStyle w:val="ListParagraph"/>
         <w:numPr>
           <w:ilvl w:val="0"/>
-          <w:numId w:val="9"/>
+          <w:numId w:val="51"/>
         </w:numPr>
-      </w:pPr>
-      <w:r>
-        <w:t>Open file</w:t>
+        <w:rPr>
+          <w:b/>
+          <w:bCs/>
+        </w:rPr>
+      </w:pPr>
+      <w:r>
+        <w:rPr>
+          <w:b/>
+          <w:bCs/>
+        </w:rPr>
+        <w:t>Label duplication</w:t>
+      </w:r>
+      <w:r>
+        <w:t>.</w:t>
+      </w:r>
+      <w:r>
+        <w:t xml:space="preserve">  If multiple labels map to the same address, the incorrect label may be used and displayed.</w:t>
       </w:r>
     </w:p>
     <w:p>
@@ -11185,11 +11257,27 @@
         <w:pStyle w:val="ListParagraph"/>
         <w:numPr>
           <w:ilvl w:val="0"/>
-          <w:numId w:val="9"/>
+          <w:numId w:val="51"/>
         </w:numPr>
-      </w:pPr>
-      <w:r>
-        <w:t>Scroll position changes</w:t>
+        <w:rPr>
+          <w:b/>
+          <w:bCs/>
+        </w:rPr>
+      </w:pPr>
+      <w:r>
+        <w:rPr>
+          <w:rFonts w:ascii="Aptos" w:hAnsi="Aptos"/>
+          <w:b/>
+          <w:color w:val="000000"/>
+        </w:rPr>
+        <w:t>Replaced code.</w:t>
+      </w:r>
+      <w:r>
+        <w:rPr>
+          <w:rFonts w:ascii="Aptos" w:hAnsi="Aptos"/>
+          <w:color w:val="000000"/>
+        </w:rPr>
+        <w:t xml:space="preserve">  If code is loaded and executed over previously run code, the profiler may not function correctly.  Current algorithms for identifying routines and stack frames do not support reloaded code.</w:t>
       </w:r>
     </w:p>
     <w:p>
@@ -11197,11 +11285,55 @@
         <w:pStyle w:val="ListParagraph"/>
         <w:numPr>
           <w:ilvl w:val="0"/>
-          <w:numId w:val="9"/>
+          <w:numId w:val="51"/>
         </w:numPr>
-      </w:pPr>
-      <w:r>
-        <w:t>Divider position changes</w:t>
+        <w:rPr>
+          <w:b/>
+          <w:bCs/>
+        </w:rPr>
+      </w:pPr>
+      <w:r>
+        <w:rPr>
+          <w:b/>
+          <w:bCs/>
+        </w:rPr>
+        <w:t xml:space="preserve">Code-patterns.  </w:t>
+      </w:r>
+      <w:r>
+        <w:t>S</w:t>
+      </w:r>
+      <w:r>
+        <w:t>ome</w:t>
+      </w:r>
+      <w:r>
+        <w:rPr>
+          <w:b/>
+          <w:bCs/>
+        </w:rPr>
+        <w:t xml:space="preserve"> </w:t>
+      </w:r>
+      <w:r>
+        <w:t xml:space="preserve">6502 </w:t>
+      </w:r>
+      <w:r>
+        <w:t>cod</w:t>
+      </w:r>
+      <w:r>
+        <w:t>ing</w:t>
+      </w:r>
+      <w:r>
+        <w:t xml:space="preserve"> patterns</w:t>
+      </w:r>
+      <w:r>
+        <w:t xml:space="preserve"> can result in deep call-paths being generated, which can impede analysis and performance.  For example, calling into the middle of a loop within another routine can result in deep call-paths.</w:t>
+      </w:r>
+    </w:p>
+    <w:p>
+      <w:pPr>
+        <w:pStyle w:val="Heading1"/>
+      </w:pPr>
+      <w:r>
+        <w:t>Recommendations</w:t>
       </w:r>
     </w:p>
     <w:p>
@@ -11209,14 +11341,29 @@
         <w:pStyle w:val="ListParagraph"/>
         <w:numPr>
           <w:ilvl w:val="0"/>
-          <w:numId w:val="9"/>
+          <w:numId w:val="53"/>
         </w:numPr>
       </w:pPr>
       <w:r>
-        <w:t>Window resize</w:t>
+        <w:t>Limit recordings to under a minute.</w:t>
+      </w:r>
+      <w:r>
+        <w:t xml:space="preserve">  Longer recording</w:t>
       </w:r>
       <w:r>
         <w:t>s</w:t>
+      </w:r>
+      <w:r>
+        <w:t xml:space="preserve"> will take longer to </w:t>
+      </w:r>
+      <w:r>
+        <w:t>analyze and</w:t>
+      </w:r>
+      <w:r>
+        <w:t xml:space="preserve"> are unlikely to provide more insight</w:t>
+      </w:r>
+      <w:r>
+        <w:t>.</w:t>
       </w:r>
     </w:p>
     <w:p>
@@ -11224,11 +11371,17 @@
         <w:pStyle w:val="ListParagraph"/>
         <w:numPr>
           <w:ilvl w:val="0"/>
-          <w:numId w:val="9"/>
+          <w:numId w:val="53"/>
         </w:numPr>
       </w:pPr>
       <w:r>
-        <w:t>Zoom in / zoom out</w:t>
+        <w:t xml:space="preserve">Avoid recording across disc activity, unless you are certain code is not being loaded.  The profiler does not handle executed code being replaced with different </w:t>
+      </w:r>
+      <w:r>
+        <w:t>executed</w:t>
+      </w:r>
+      <w:r>
+        <w:t>.</w:t>
       </w:r>
     </w:p>
     <w:p>
@@ -15738,8 +15891,157 @@
       </w:r>
       <w:proofErr w:type="spellEnd"/>
       <w:r>
-        <w:t xml:space="preserve"> to v142</w:t>
-      </w:r>
+        <w:t xml:space="preserve"> to v14</w:t>
+      </w:r>
+      <w:r>
+        <w:t>3.</w:t>
+      </w:r>
+      <w:r>
+        <w:t xml:space="preserve">  </w:t>
+      </w:r>
+    </w:p>
+    <w:p>
+      <w:pPr>
+        <w:rPr>
+          <w:b/>
+          <w:bCs/>
+        </w:rPr>
+      </w:pPr>
+      <w:r>
+        <w:rPr>
+          <w:b/>
+          <w:bCs/>
+        </w:rPr>
+        <w:t xml:space="preserve">The following components need </w:t>
+      </w:r>
+      <w:r>
+        <w:rPr>
+          <w:b/>
+          <w:bCs/>
+        </w:rPr>
+        <w:t xml:space="preserve">to be </w:t>
+      </w:r>
+      <w:r>
+        <w:rPr>
+          <w:b/>
+          <w:bCs/>
+        </w:rPr>
+        <w:t>install</w:t>
+      </w:r>
+      <w:r>
+        <w:rPr>
+          <w:b/>
+          <w:bCs/>
+        </w:rPr>
+        <w:t>ed</w:t>
+      </w:r>
+      <w:r>
+        <w:rPr>
+          <w:b/>
+          <w:bCs/>
+        </w:rPr>
+        <w:t xml:space="preserve"> in Visual Studio to build:</w:t>
+      </w:r>
+    </w:p>
+    <w:p>
+      <w:pPr>
+        <w:pStyle w:val="ListParagraph"/>
+        <w:numPr>
+          <w:ilvl w:val="0"/>
+          <w:numId w:val="8"/>
+        </w:numPr>
+        <w:rPr>
+          <w:b/>
+          <w:bCs/>
+        </w:rPr>
+      </w:pPr>
+      <w:r>
+        <w:rPr>
+          <w:b/>
+          <w:bCs/>
+        </w:rPr>
+        <w:t>MSVS v143 – VS 2022 C++ x64/x86 build tools (latest version)</w:t>
+      </w:r>
+    </w:p>
+    <w:p>
+      <w:pPr>
+        <w:pStyle w:val="ListParagraph"/>
+        <w:numPr>
+          <w:ilvl w:val="0"/>
+          <w:numId w:val="8"/>
+        </w:numPr>
+        <w:rPr>
+          <w:b/>
+          <w:bCs/>
+        </w:rPr>
+      </w:pPr>
+      <w:r>
+        <w:rPr>
+          <w:b/>
+          <w:bCs/>
+        </w:rPr>
+        <w:t xml:space="preserve">C++ MFC for </w:t>
+      </w:r>
+      <w:r>
+        <w:rPr>
+          <w:b/>
+          <w:bCs/>
+        </w:rPr>
+        <w:t>x64/x86</w:t>
+      </w:r>
+      <w:r>
+        <w:rPr>
+          <w:b/>
+          <w:bCs/>
+        </w:rPr>
+        <w:t xml:space="preserve"> (Latest MSVC)</w:t>
+      </w:r>
+      <w:r>
+        <w:rPr>
+          <w:b/>
+          <w:bCs/>
+        </w:rPr>
+        <w:t xml:space="preserve"> – only needed for </w:t>
+      </w:r>
+      <w:proofErr w:type="spellStart"/>
+      <w:r>
+        <w:rPr>
+          <w:b/>
+          <w:bCs/>
+        </w:rPr>
+        <w:t>afxre</w:t>
+      </w:r>
+      <w:r>
+        <w:rPr>
+          <w:b/>
+          <w:bCs/>
+        </w:rPr>
+        <w:t>s</w:t>
+      </w:r>
+      <w:r>
+        <w:rPr>
+          <w:b/>
+          <w:bCs/>
+        </w:rPr>
+        <w:t>.h</w:t>
+      </w:r>
+      <w:proofErr w:type="spellEnd"/>
+      <w:r>
+        <w:rPr>
+          <w:b/>
+          <w:bCs/>
+        </w:rPr>
+        <w:t>/</w:t>
+      </w:r>
+      <w:proofErr w:type="spellStart"/>
+      <w:r>
+        <w:rPr>
+          <w:b/>
+          <w:bCs/>
+        </w:rPr>
+        <w:t>rc</w:t>
+      </w:r>
+      <w:proofErr w:type="spellEnd"/>
     </w:p>
     <w:p>
       <w:r>
@@ -15930,25 +16232,12 @@
       </w:r>
       <w:proofErr w:type="spellEnd"/>
     </w:p>
-    <w:p>
-      <w:pPr>
-        <w:rPr>
-          <w:rFonts w:asciiTheme="majorHAnsi" w:eastAsiaTheme="majorEastAsia" w:hAnsiTheme="majorHAnsi" w:cstheme="majorBidi"/>
-          <w:color w:val="0F4761" w:themeColor="accent1" w:themeShade="BF"/>
-          <w:sz w:val="40"/>
-          <w:szCs w:val="40"/>
-        </w:rPr>
-      </w:pPr>
-      <w:r>
-        <w:br w:type="page"/>
-      </w:r>
-    </w:p>
+    <w:p/>
     <w:p>
       <w:pPr>
         <w:pStyle w:val="Heading1"/>
       </w:pPr>
       <w:r>
-        <w:lastRenderedPageBreak/>
         <w:t>Future work</w:t>
       </w:r>
     </w:p>
@@ -15961,7 +16250,46 @@
         </w:numPr>
       </w:pPr>
       <w:r>
-        <w:t>Bug fixes</w:t>
+        <w:t xml:space="preserve">Bug: </w:t>
+      </w:r>
+      <w:r>
+        <w:t>CodeView: B</w:t>
+      </w:r>
+      <w:r>
+        <w:t xml:space="preserve">ars </w:t>
+      </w:r>
+      <w:r>
+        <w:t xml:space="preserve">are </w:t>
+      </w:r>
+      <w:r>
+        <w:t>not show</w:t>
+      </w:r>
+      <w:r>
+        <w:t>n</w:t>
+      </w:r>
+      <w:r>
+        <w:t xml:space="preserve"> in </w:t>
+      </w:r>
+      <w:r>
+        <w:t xml:space="preserve">NMI </w:t>
+      </w:r>
+      <w:r>
+        <w:t>routine</w:t>
+      </w:r>
+      <w:r>
+        <w:t xml:space="preserve"> for some reason</w:t>
+      </w:r>
+    </w:p>
+    <w:p>
+      <w:pPr>
+        <w:pStyle w:val="ListParagraph"/>
+        <w:numPr>
+          <w:ilvl w:val="0"/>
+          <w:numId w:val="12"/>
+        </w:numPr>
+      </w:pPr>
+      <w:r>
+        <w:t xml:space="preserve">Bug: Flame graph.  </w:t>
       </w:r>
     </w:p>
     <w:p>
@@ -15973,7 +16301,19 @@
         </w:numPr>
       </w:pPr>
       <w:r>
-        <w:t>Don’t allow timeline selection when app is first loaded - crash</w:t>
+        <w:t>Fix mouse wheel regression</w:t>
+      </w:r>
+    </w:p>
+    <w:p>
+      <w:pPr>
+        <w:pStyle w:val="ListParagraph"/>
+        <w:numPr>
+          <w:ilvl w:val="1"/>
+          <w:numId w:val="12"/>
+        </w:numPr>
+      </w:pPr>
+      <w:r>
+        <w:t>Jump-to selection regression</w:t>
       </w:r>
     </w:p>
     <w:p>
@@ -15985,13 +16325,47 @@
         </w:numPr>
       </w:pPr>
       <w:r>
-        <w:t xml:space="preserve">Alternative label formatting in </w:t>
-      </w:r>
-      <w:proofErr w:type="spellStart"/>
-      <w:r>
-        <w:t>dissassembly</w:t>
-      </w:r>
-      <w:proofErr w:type="spellEnd"/>
+        <w:t>Memory access:</w:t>
+      </w:r>
+    </w:p>
+    <w:p>
+      <w:pPr>
+        <w:pStyle w:val="ListParagraph"/>
+        <w:numPr>
+          <w:ilvl w:val="1"/>
+          <w:numId w:val="12"/>
+        </w:numPr>
+      </w:pPr>
+      <w:r>
+        <w:t>Rollup memory access counts in routines</w:t>
+      </w:r>
+    </w:p>
+    <w:p>
+      <w:pPr>
+        <w:pStyle w:val="ListParagraph"/>
+        <w:numPr>
+          <w:ilvl w:val="1"/>
+          <w:numId w:val="12"/>
+        </w:numPr>
+      </w:pPr>
+      <w:r>
+        <w:t>S</w:t>
+      </w:r>
+      <w:r>
+        <w:t xml:space="preserve">how in </w:t>
+      </w:r>
+      <w:r>
+        <w:t xml:space="preserve">memory access counts in </w:t>
+      </w:r>
+      <w:r>
+        <w:t>code-view</w:t>
+      </w:r>
+      <w:r>
+        <w:t xml:space="preserve"> </w:t>
+      </w:r>
+      <w:r>
+        <w:t>fall-throughs</w:t>
+      </w:r>
     </w:p>
     <w:p>
       <w:pPr>
@@ -16002,7 +16376,34 @@
         </w:numPr>
       </w:pPr>
       <w:r>
-        <w:t>Make percentages either 1) relative to total or 2) relative to selected routine</w:t>
+        <w:t>Labels</w:t>
+      </w:r>
+      <w:r>
+        <w:t>:</w:t>
+      </w:r>
+    </w:p>
+    <w:p>
+      <w:pPr>
+        <w:pStyle w:val="ListParagraph"/>
+        <w:numPr>
+          <w:ilvl w:val="1"/>
+          <w:numId w:val="12"/>
+        </w:numPr>
+      </w:pPr>
+      <w:r>
+        <w:t>Allow these to be imported, for MOS versions etc.</w:t>
+      </w:r>
+    </w:p>
+    <w:p>
+      <w:pPr>
+        <w:pStyle w:val="ListParagraph"/>
+        <w:numPr>
+          <w:ilvl w:val="1"/>
+          <w:numId w:val="12"/>
+        </w:numPr>
+      </w:pPr>
+      <w:r>
+        <w:t>Improve label selection, when more label maps to an address.</w:t>
       </w:r>
     </w:p>
     <w:p>
@@ -16014,7 +16415,47 @@
         </w:numPr>
       </w:pPr>
       <w:r>
-        <w:t>Labels.  Allow these to be imported, for MOS versions etc.</w:t>
+        <w:t>Frame by frame view of performance.</w:t>
+      </w:r>
+    </w:p>
+    <w:p>
+      <w:pPr>
+        <w:pStyle w:val="ListParagraph"/>
+        <w:numPr>
+          <w:ilvl w:val="1"/>
+          <w:numId w:val="12"/>
+        </w:numPr>
+      </w:pPr>
+      <w:r>
+        <w:lastRenderedPageBreak/>
+        <w:t>Allow frame</w:t>
+      </w:r>
+      <w:r>
+        <w:t>(</w:t>
+      </w:r>
+      <w:r>
+        <w:t>s</w:t>
+      </w:r>
+      <w:r>
+        <w:t xml:space="preserve">) </w:t>
+      </w:r>
+      <w:r>
+        <w:t>select</w:t>
+      </w:r>
+      <w:r>
+        <w:t xml:space="preserve">ion where the </w:t>
+      </w:r>
+      <w:r>
+        <w:t xml:space="preserve">start and end analysis times </w:t>
+      </w:r>
+      <w:r>
+        <w:t xml:space="preserve">are </w:t>
+      </w:r>
+      <w:r>
+        <w:t>automatically set</w:t>
+      </w:r>
+      <w:r>
+        <w:t>.</w:t>
       </w:r>
     </w:p>
     <w:p>
@@ -16026,526 +16467,7 @@
         </w:numPr>
       </w:pPr>
       <w:r>
-        <w:t>Frame by frame view of performance.</w:t>
-      </w:r>
-    </w:p>
-    <w:p>
-      <w:pPr>
-        <w:rPr>
-          <w:rFonts w:asciiTheme="majorHAnsi" w:eastAsiaTheme="majorEastAsia" w:hAnsiTheme="majorHAnsi" w:cstheme="majorBidi"/>
-          <w:color w:val="0F4761" w:themeColor="accent1" w:themeShade="BF"/>
-          <w:sz w:val="40"/>
-          <w:szCs w:val="40"/>
-        </w:rPr>
-      </w:pPr>
-      <w:r>
-        <w:br w:type="page"/>
-      </w:r>
-    </w:p>
-    <w:p>
-      <w:pPr>
-        <w:pStyle w:val="Heading1"/>
-      </w:pPr>
-      <w:r>
-        <w:lastRenderedPageBreak/>
-        <w:t>Challenges</w:t>
-      </w:r>
-    </w:p>
-    <w:p>
-      <w:r>
-        <w:t xml:space="preserve">Many challenges were encountered during the development of the profiler. </w:t>
-      </w:r>
-    </w:p>
-    <w:p>
-      <w:pPr>
-        <w:rPr>
-          <w:b/>
-          <w:bCs/>
-        </w:rPr>
-      </w:pPr>
-      <w:r>
-        <w:rPr>
-          <w:b/>
-          <w:bCs/>
-        </w:rPr>
-        <w:t xml:space="preserve">Reconstructing </w:t>
-      </w:r>
-      <w:r>
-        <w:rPr>
-          <w:b/>
-          <w:bCs/>
-        </w:rPr>
-        <w:t xml:space="preserve">the </w:t>
-      </w:r>
-      <w:r>
-        <w:rPr>
-          <w:b/>
-          <w:bCs/>
-        </w:rPr>
-        <w:t>call-stack</w:t>
-      </w:r>
-      <w:r>
-        <w:rPr>
-          <w:b/>
-          <w:bCs/>
-        </w:rPr>
-        <w:t xml:space="preserve"> and stack frames</w:t>
-      </w:r>
-    </w:p>
-    <w:p>
-      <w:r>
-        <w:t xml:space="preserve">The most significant challenge encountered was how to reliably </w:t>
-      </w:r>
-      <w:r>
-        <w:t>identify all the program’s routines</w:t>
-      </w:r>
-      <w:r>
-        <w:t xml:space="preserve"> and </w:t>
-      </w:r>
-      <w:r>
-        <w:t>stack frames</w:t>
-      </w:r>
-      <w:r>
-        <w:t xml:space="preserve">, and their corresponding </w:t>
-      </w:r>
-      <w:r>
-        <w:t>call stacks</w:t>
-      </w:r>
-      <w:proofErr w:type="gramStart"/>
-      <w:r>
-        <w:t>.</w:t>
-      </w:r>
-      <w:r>
-        <w:t xml:space="preserve"> </w:t>
-      </w:r>
-      <w:proofErr w:type="gramEnd"/>
-      <w:r>
-        <w:t xml:space="preserve">A few things make this challenging. </w:t>
-      </w:r>
-    </w:p>
-    <w:p>
-      <w:r>
-        <w:t xml:space="preserve">Firstly, </w:t>
-      </w:r>
-      <w:r>
-        <w:t xml:space="preserve">it’s incredibly difficult to </w:t>
-      </w:r>
-      <w:r>
-        <w:t>reconstruct</w:t>
-      </w:r>
-      <w:r>
-        <w:t xml:space="preserve"> </w:t>
-      </w:r>
-      <w:r>
-        <w:t>the initial call stack</w:t>
-      </w:r>
-      <w:r>
-        <w:t>.</w:t>
-      </w:r>
-    </w:p>
-    <w:p/>
-    <w:p>
-      <w:r>
-        <w:t>Secondly, identifying all the routines in the program is non-trivial.</w:t>
-      </w:r>
-      <w:r>
-        <w:t xml:space="preserve"> </w:t>
-      </w:r>
-      <w:r>
-        <w:t xml:space="preserve"> While every JSR and interrupt destination is clearly a routine, </w:t>
-      </w:r>
-      <w:r>
-        <w:t>the initial call stack has associated routines</w:t>
-      </w:r>
-      <w:r>
-        <w:t>,</w:t>
-      </w:r>
-      <w:r>
-        <w:t xml:space="preserve"> which are unknown, unless invoked again within the recording.</w:t>
-      </w:r>
-    </w:p>
-    <w:p>
-      <w:r>
-        <w:t xml:space="preserve">In addition to this, instructions that </w:t>
-      </w:r>
-      <w:r>
-        <w:t xml:space="preserve">transfer control flow </w:t>
-      </w:r>
-      <w:r>
-        <w:t xml:space="preserve">into other routines, or routines up the call stack have to be considered.  If the destination is in the middle of another routine </w:t>
-      </w:r>
-      <w:r>
-        <w:t>the destination could also be a routine</w:t>
-      </w:r>
-      <w:r>
-        <w:t>.</w:t>
-      </w:r>
-    </w:p>
-    <w:p>
-      <w:r>
-        <w:t>The transfer could be a return, tail-call, co-routine call, dynamic dispatch call, state-machine jump, computed jump, optimized jump, or jump into the middle of another instruction.</w:t>
-      </w:r>
-    </w:p>
-    <w:p>
-      <w:r>
-        <w:t xml:space="preserve">Secondly, many programs </w:t>
-      </w:r>
-      <w:r>
-        <w:t xml:space="preserve">use the </w:t>
-      </w:r>
-      <w:r>
-        <w:rPr>
-          <w:b/>
-          <w:bCs/>
-        </w:rPr>
-        <w:t>RTS</w:t>
-      </w:r>
-      <w:r>
-        <w:t xml:space="preserve"> (return from sub-routine) </w:t>
-      </w:r>
-      <w:r>
-        <w:t xml:space="preserve">and </w:t>
-      </w:r>
-      <w:r>
-        <w:rPr>
-          <w:b/>
-          <w:bCs/>
-        </w:rPr>
-        <w:t>RTI</w:t>
-      </w:r>
-      <w:r>
-        <w:t xml:space="preserve"> (return from interrupt) </w:t>
-      </w:r>
-      <w:r>
-        <w:t xml:space="preserve">instructions </w:t>
-      </w:r>
-      <w:r>
-        <w:t xml:space="preserve">for purposes other than returning </w:t>
-      </w:r>
-      <w:r>
-        <w:t>from a sub-routine call or interrupt</w:t>
-      </w:r>
-      <w:r>
-        <w:t>.</w:t>
-      </w:r>
-      <w:r>
-        <w:t xml:space="preserve">  For example, the instruction</w:t>
-      </w:r>
-      <w:r>
-        <w:t>s</w:t>
-      </w:r>
-      <w:r>
-        <w:t xml:space="preserve"> can </w:t>
-      </w:r>
-      <w:r>
-        <w:t xml:space="preserve">also </w:t>
-      </w:r>
-      <w:r>
-        <w:t xml:space="preserve">be used to perform absolute jumps, computed jumps (dynamic dispatch), tail-call jumps, </w:t>
-      </w:r>
-      <w:r>
-        <w:t xml:space="preserve">and </w:t>
-      </w:r>
-      <w:r>
-        <w:t xml:space="preserve">escape from </w:t>
-      </w:r>
-      <w:r>
-        <w:t xml:space="preserve">a </w:t>
-      </w:r>
-      <w:r>
-        <w:t>deep stack.</w:t>
-      </w:r>
-    </w:p>
-    <w:p>
-      <w:r>
-        <w:t>The</w:t>
-      </w:r>
-      <w:r>
-        <w:t xml:space="preserve"> instructions </w:t>
-      </w:r>
-      <w:r>
-        <w:t xml:space="preserve">can also be </w:t>
-      </w:r>
-      <w:r>
-        <w:t xml:space="preserve">used </w:t>
-      </w:r>
-      <w:r>
-        <w:t xml:space="preserve">to </w:t>
-      </w:r>
-      <w:r>
-        <w:t xml:space="preserve">implement state machines, co-routines, </w:t>
-      </w:r>
-      <w:r>
-        <w:t xml:space="preserve">and </w:t>
-      </w:r>
-      <w:r>
-        <w:t xml:space="preserve">even </w:t>
-      </w:r>
-      <w:r>
-        <w:t xml:space="preserve">be used to jump </w:t>
-      </w:r>
-      <w:r>
-        <w:t xml:space="preserve">into </w:t>
-      </w:r>
-      <w:r>
-        <w:t xml:space="preserve">the middle of an </w:t>
-      </w:r>
-      <w:r>
-        <w:t>instruction</w:t>
-      </w:r>
-      <w:r>
-        <w:t xml:space="preserve">, though </w:t>
-      </w:r>
-      <w:r>
-        <w:t xml:space="preserve">the latter </w:t>
-      </w:r>
-      <w:r>
-        <w:t>is rare.</w:t>
-      </w:r>
-    </w:p>
-    <w:p>
-      <w:r>
-        <w:t>The bottom line is that o</w:t>
-      </w:r>
-      <w:r>
-        <w:t xml:space="preserve">ne cannot assume that </w:t>
-      </w:r>
-      <w:r>
-        <w:rPr>
-          <w:b/>
-          <w:bCs/>
-        </w:rPr>
-        <w:t>RTS</w:t>
-      </w:r>
-      <w:r>
-        <w:t xml:space="preserve"> and </w:t>
-      </w:r>
-      <w:r>
-        <w:rPr>
-          <w:b/>
-          <w:bCs/>
-        </w:rPr>
-        <w:t>RTI</w:t>
-      </w:r>
-      <w:r>
-        <w:t xml:space="preserve"> instructions </w:t>
-      </w:r>
-      <w:r>
-        <w:t xml:space="preserve">are </w:t>
-      </w:r>
-      <w:r>
-        <w:t>return</w:t>
-      </w:r>
-      <w:r>
-        <w:t xml:space="preserve">s. </w:t>
-      </w:r>
-    </w:p>
-    <w:p>
-      <w:r>
-        <w:t>Of course, before reconstruct</w:t>
-      </w:r>
-      <w:r>
-        <w:t>ing</w:t>
-      </w:r>
-      <w:r>
-        <w:t xml:space="preserve"> </w:t>
-      </w:r>
-      <w:r>
-        <w:t xml:space="preserve">call stacks and </w:t>
-      </w:r>
-      <w:r>
-        <w:t>stack frames</w:t>
-      </w:r>
-      <w:r>
-        <w:t>…</w:t>
-      </w:r>
-      <w:r>
-        <w:t xml:space="preserve"> </w:t>
-      </w:r>
-      <w:r>
-        <w:t xml:space="preserve">the program’s </w:t>
-      </w:r>
-      <w:r>
-        <w:t xml:space="preserve">routines </w:t>
-      </w:r>
-      <w:r>
-        <w:t xml:space="preserve">must </w:t>
-      </w:r>
-      <w:r>
-        <w:t xml:space="preserve">first </w:t>
-      </w:r>
-      <w:r>
-        <w:t>be identified.</w:t>
-      </w:r>
-    </w:p>
-    <w:p>
-      <w:r>
-        <w:t xml:space="preserve">By definition, every JSR destination </w:t>
-      </w:r>
-      <w:r>
-        <w:t xml:space="preserve">and interrupt destination </w:t>
-      </w:r>
-      <w:r>
-        <w:t xml:space="preserve">is a routine.  It is also true that any jump or </w:t>
-      </w:r>
-      <w:r>
-        <w:t>branch</w:t>
-      </w:r>
-      <w:r>
-        <w:t xml:space="preserve"> that lands </w:t>
-      </w:r>
-      <w:r>
-        <w:t xml:space="preserve">within </w:t>
-      </w:r>
-      <w:r>
-        <w:t>another routine</w:t>
-      </w:r>
-      <w:r>
-        <w:t xml:space="preserve"> is </w:t>
-      </w:r>
-      <w:r>
-        <w:t xml:space="preserve">also </w:t>
-      </w:r>
-      <w:r>
-        <w:t>transferring control flow</w:t>
-      </w:r>
-      <w:r>
-        <w:t xml:space="preserve">, so the destination </w:t>
-      </w:r>
-      <w:r>
-        <w:t xml:space="preserve">must </w:t>
-      </w:r>
-      <w:r>
-        <w:t xml:space="preserve">by definition </w:t>
-      </w:r>
-      <w:r>
-        <w:t xml:space="preserve">also be </w:t>
-      </w:r>
-      <w:r>
-        <w:t xml:space="preserve">a </w:t>
-      </w:r>
-      <w:r>
-        <w:t>routine.</w:t>
-      </w:r>
-      <w:r>
-        <w:t xml:space="preserve">  </w:t>
-      </w:r>
-    </w:p>
-    <w:p>
-      <w:r>
-        <w:lastRenderedPageBreak/>
-        <w:t>The program’s initial call-stack also notionally contains routine addresses, though determining what these are is non-trivial</w:t>
-      </w:r>
-      <w:r>
-        <w:t>, per above</w:t>
-      </w:r>
-      <w:r>
-        <w:t xml:space="preserve">.  </w:t>
-      </w:r>
-      <w:r>
-        <w:t>However</w:t>
-      </w:r>
-      <w:r>
-        <w:t xml:space="preserve">, I was able to reconstruct portions of </w:t>
-      </w:r>
-      <w:r>
-        <w:t>the initial stack</w:t>
-      </w:r>
-      <w:r>
-        <w:t>, if these reoccurred in the recording</w:t>
-      </w:r>
-      <w:r>
-        <w:t>.</w:t>
-      </w:r>
-      <w:r>
-        <w:t xml:space="preserve">  </w:t>
-      </w:r>
-    </w:p>
-    <w:p>
-      <w:r>
-        <w:t xml:space="preserve">Ultimately, I </w:t>
-      </w:r>
-      <w:r>
-        <w:t xml:space="preserve">concluded </w:t>
-      </w:r>
-      <w:r>
-        <w:t xml:space="preserve">that it would be </w:t>
-      </w:r>
-      <w:r>
-        <w:t>preferable to just include the initial call-stack in the snapshot by modifying BeebEm to</w:t>
-      </w:r>
-      <w:r>
-        <w:t xml:space="preserve"> </w:t>
-      </w:r>
-      <w:r>
-        <w:t xml:space="preserve">maintain a call-stack </w:t>
-      </w:r>
-      <w:r>
-        <w:t xml:space="preserve">during execution.  This </w:t>
-      </w:r>
-      <w:r>
-        <w:t>worked well</w:t>
-      </w:r>
-      <w:r>
-        <w:t>.</w:t>
-      </w:r>
-    </w:p>
-    <w:p>
-      <w:r>
-        <w:t>I just wished I’d come to this realization earlier</w:t>
-      </w:r>
-      <w:r>
-        <w:t xml:space="preserve"> as I </w:t>
-      </w:r>
-      <w:r>
-        <w:t xml:space="preserve">had </w:t>
-      </w:r>
-      <w:r>
-        <w:t>spent weeks exploring different approaches to no avail.</w:t>
-      </w:r>
-      <w:r>
-        <w:t xml:space="preserve">  We live and learn…</w:t>
-      </w:r>
-    </w:p>
-    <w:p/>
-    <w:p/>
-    <w:p>
-      <w:r>
-        <w:t xml:space="preserve">One of the knurliest </w:t>
-      </w:r>
-    </w:p>
-    <w:p>
-      <w:pPr>
-        <w:pStyle w:val="ListParagraph"/>
-        <w:numPr>
-          <w:ilvl w:val="0"/>
-          <w:numId w:val="12"/>
-        </w:numPr>
-        <w:rPr>
-          <w:b/>
-          <w:bCs/>
-        </w:rPr>
-      </w:pPr>
-      <w:r>
-        <w:rPr>
-          <w:b/>
-          <w:bCs/>
-        </w:rPr>
-        <w:t xml:space="preserve">Call-stack &amp; </w:t>
-      </w:r>
-      <w:r>
-        <w:rPr>
-          <w:b/>
-          <w:bCs/>
-        </w:rPr>
-        <w:t>S</w:t>
-      </w:r>
-      <w:r>
-        <w:rPr>
-          <w:b/>
-          <w:bCs/>
-        </w:rPr>
-        <w:t>tack frames</w:t>
+        <w:t>Issues:</w:t>
       </w:r>
     </w:p>
     <w:p>
@@ -16557,13 +16479,63 @@
         </w:numPr>
       </w:pPr>
       <w:r>
-        <w:t>R</w:t>
-      </w:r>
-      <w:r>
-        <w:t>econstructing the stack</w:t>
-      </w:r>
-      <w:r>
-        <w:t xml:space="preserve"> prior to recording</w:t>
+        <w:t xml:space="preserve">Some coding patterns </w:t>
+      </w:r>
+      <w:r>
+        <w:t xml:space="preserve">don’t </w:t>
+      </w:r>
+      <w:r>
+        <w:t>lend themselves to a strict routine with tail calls</w:t>
+      </w:r>
+      <w:r>
+        <w:t xml:space="preserve"> view</w:t>
+      </w:r>
+      <w:r>
+        <w:t xml:space="preserve">.  For example, a call </w:t>
+      </w:r>
+      <w:r>
+        <w:t>into the middle of a loop.</w:t>
+      </w:r>
+      <w:r>
+        <w:t xml:space="preserve">  </w:t>
+      </w:r>
+      <w:r>
+        <w:t>B</w:t>
+      </w:r>
+      <w:r>
+        <w:t xml:space="preserve">etter </w:t>
+      </w:r>
+      <w:r>
+        <w:t xml:space="preserve">to allow some routines to have </w:t>
+      </w:r>
+      <w:r>
+        <w:t>multiple/</w:t>
+      </w:r>
+      <w:r>
+        <w:t>arbitrary</w:t>
+      </w:r>
+      <w:r>
+        <w:t xml:space="preserve"> </w:t>
+      </w:r>
+      <w:r>
+        <w:t>entry points</w:t>
+      </w:r>
+      <w:r>
+        <w:t xml:space="preserve"> in some cases.</w:t>
+      </w:r>
+      <w:r>
+        <w:t xml:space="preserve">  A </w:t>
+      </w:r>
+      <w:proofErr w:type="gramStart"/>
+      <w:r>
+        <w:t>co-routines</w:t>
+      </w:r>
+      <w:proofErr w:type="gramEnd"/>
+      <w:r>
+        <w:t xml:space="preserve"> is another example.</w:t>
+      </w:r>
+      <w:r>
+        <w:t xml:space="preserve"> </w:t>
       </w:r>
     </w:p>
     <w:p>
@@ -16575,23 +16547,7 @@
         </w:numPr>
       </w:pPr>
       <w:r>
-        <w:t>RTI and RTS, and stack manipulation</w:t>
-      </w:r>
-    </w:p>
-    <w:p>
-      <w:pPr>
-        <w:pStyle w:val="ListParagraph"/>
-        <w:numPr>
-          <w:ilvl w:val="0"/>
-          <w:numId w:val="12"/>
-        </w:numPr>
-      </w:pPr>
-      <w:r>
-        <w:rPr>
-          <w:b/>
-          <w:bCs/>
-        </w:rPr>
-        <w:t>The game loop</w:t>
+        <w:t>Routines and code can overlap when code is reloaded and executed</w:t>
       </w:r>
       <w:proofErr w:type="gramStart"/>
       <w:r>
@@ -16599,454 +16555,38 @@
       </w:r>
       <w:proofErr w:type="gramEnd"/>
       <w:r>
-        <w:t>Detecting the game loop</w:t>
-      </w:r>
-    </w:p>
-    <w:p>
-      <w:pPr>
-        <w:pStyle w:val="ListParagraph"/>
-        <w:numPr>
-          <w:ilvl w:val="1"/>
-          <w:numId w:val="12"/>
-        </w:numPr>
-      </w:pPr>
-      <w:r>
-        <w:t>We can look for code that spins every 50</w:t>
-      </w:r>
-      <w:r>
-        <w:rPr>
-          <w:vertAlign w:val="superscript"/>
-        </w:rPr>
-        <w:t>th</w:t>
-      </w:r>
-      <w:r>
-        <w:t xml:space="preserve"> of a second.</w:t>
-      </w:r>
-    </w:p>
-    <w:p>
-      <w:pPr>
-        <w:pStyle w:val="ListParagraph"/>
-        <w:numPr>
-          <w:ilvl w:val="1"/>
-          <w:numId w:val="12"/>
-        </w:numPr>
-      </w:pPr>
-      <w:r>
-        <w:t>We can look for a spin loop somehow</w:t>
-      </w:r>
-    </w:p>
-    <w:p>
-      <w:pPr>
-        <w:pStyle w:val="ListParagraph"/>
-        <w:numPr>
-          <w:ilvl w:val="1"/>
-          <w:numId w:val="12"/>
-        </w:numPr>
-      </w:pPr>
-      <w:r>
-        <w:t>We can look for code that executes every 50</w:t>
-      </w:r>
-      <w:r>
-        <w:rPr>
-          <w:vertAlign w:val="superscript"/>
-        </w:rPr>
-        <w:t>th</w:t>
-      </w:r>
-      <w:r>
-        <w:t xml:space="preserve"> second.</w:t>
-      </w:r>
-    </w:p>
-    <w:p>
-      <w:pPr>
-        <w:pStyle w:val="ListParagraph"/>
-        <w:numPr>
-          <w:ilvl w:val="0"/>
-          <w:numId w:val="12"/>
-        </w:numPr>
-      </w:pPr>
-      <w:r>
-        <w:rPr>
-          <w:b/>
-          <w:bCs/>
-        </w:rPr>
-        <w:t>The .perf file format</w:t>
-      </w:r>
-      <w:r>
-        <w:t>.  Got isosteric over time.</w:t>
-      </w:r>
-    </w:p>
-    <w:p>
-      <w:pPr>
-        <w:pStyle w:val="ListParagraph"/>
-        <w:numPr>
-          <w:ilvl w:val="0"/>
-          <w:numId w:val="12"/>
-        </w:numPr>
-      </w:pPr>
-      <w:r>
-        <w:rPr>
-          <w:b/>
-          <w:bCs/>
-        </w:rPr>
-        <w:t>Label applicability.</w:t>
-      </w:r>
-      <w:r>
-        <w:t xml:space="preserve">  Labels are associated with 16-bit addresses, and as such, any label in the &amp;8000-&amp;BFFF range cannot be attributed to a specific paged ROM.  Furthermore, code and data may be dynamically loaded into memory locations or overwritten.  As such, a determination needs to be made as to the validity of labels given a context.  This is accomplished by looking at all the labels associated with a body of code.  If these all align to instructions locations, within the code block, the labels are assumed to be valid, otherwise not.</w:t>
-      </w:r>
-    </w:p>
-    <w:p>
-      <w:pPr>
-        <w:pStyle w:val="ListParagraph"/>
-        <w:numPr>
-          <w:ilvl w:val="0"/>
-          <w:numId w:val="12"/>
-        </w:numPr>
-      </w:pPr>
-      <w:r>
-        <w:t xml:space="preserve">Detecting the start </w:t>
-      </w:r>
-      <w:r>
-        <w:t xml:space="preserve">and end of </w:t>
-      </w:r>
-      <w:r>
-        <w:t>the game loop</w:t>
-      </w:r>
-      <w:r>
-        <w:t>.</w:t>
-      </w:r>
-    </w:p>
-    <w:p>
-      <w:pPr>
-        <w:pStyle w:val="ListParagraph"/>
-        <w:numPr>
-          <w:ilvl w:val="0"/>
-          <w:numId w:val="12"/>
-        </w:numPr>
-      </w:pPr>
-      <w:r>
-        <w:t>Determining program start address</w:t>
-      </w:r>
-    </w:p>
-    <w:p>
-      <w:pPr>
-        <w:pStyle w:val="ListParagraph"/>
-        <w:numPr>
-          <w:ilvl w:val="0"/>
-          <w:numId w:val="12"/>
-        </w:numPr>
-      </w:pPr>
-      <w:r>
-        <w:t xml:space="preserve">Detecting when </w:t>
-      </w:r>
-      <w:r>
-        <w:rPr>
-          <w:b/>
-          <w:bCs/>
-        </w:rPr>
-        <w:t>screen memory is being read</w:t>
-      </w:r>
-      <w:proofErr w:type="gramStart"/>
-      <w:r>
-        <w:t xml:space="preserve">. </w:t>
-      </w:r>
-      <w:proofErr w:type="gramEnd"/>
-      <w:r>
-        <w:t>We need to know.</w:t>
-      </w:r>
-    </w:p>
-    <w:p>
-      <w:pPr>
-        <w:pStyle w:val="ListParagraph"/>
-        <w:numPr>
-          <w:ilvl w:val="1"/>
-          <w:numId w:val="12"/>
-        </w:numPr>
-      </w:pPr>
-      <w:r>
-        <w:t xml:space="preserve">The screen </w:t>
-      </w:r>
-      <w:proofErr w:type="gramStart"/>
-      <w:r>
-        <w:t>start</w:t>
-      </w:r>
-      <w:proofErr w:type="gramEnd"/>
-      <w:r>
-        <w:t xml:space="preserve"> address.  Write value stored to </w:t>
-      </w:r>
-      <w:r>
-        <w:t>&amp;FE00</w:t>
-      </w:r>
-      <w:r>
-        <w:t xml:space="preserve"> and </w:t>
-      </w:r>
-      <w:r>
-        <w:t>&amp;FE0</w:t>
-      </w:r>
-      <w:r>
-        <w:t>1</w:t>
-      </w:r>
-    </w:p>
-    <w:p>
-      <w:pPr>
-        <w:pStyle w:val="ListParagraph"/>
-        <w:numPr>
-          <w:ilvl w:val="1"/>
-          <w:numId w:val="12"/>
-        </w:numPr>
-      </w:pPr>
-      <w:r>
-        <w:t>The screen wrap-size (how many K)</w:t>
-      </w:r>
-      <w:proofErr w:type="gramStart"/>
-      <w:r>
-        <w:t xml:space="preserve">. </w:t>
-      </w:r>
-      <w:proofErr w:type="gramEnd"/>
-      <w:r>
-        <w:t xml:space="preserve">Write value stored to </w:t>
-      </w:r>
-      <w:r>
-        <w:t>&amp;FE40</w:t>
-      </w:r>
-    </w:p>
-    <w:p>
-      <w:pPr>
-        <w:pStyle w:val="ListParagraph"/>
-        <w:numPr>
-          <w:ilvl w:val="1"/>
-          <w:numId w:val="12"/>
-        </w:numPr>
-      </w:pPr>
-      <w:r>
-        <w:t xml:space="preserve">The screen format (mode-7 verses </w:t>
-      </w:r>
-      <w:proofErr w:type="gramStart"/>
-      <w:r>
-        <w:t>non mode</w:t>
-      </w:r>
-      <w:proofErr w:type="gramEnd"/>
-      <w:r>
-        <w:t>-7)</w:t>
-      </w:r>
-      <w:proofErr w:type="gramStart"/>
-      <w:r>
-        <w:t xml:space="preserve">. </w:t>
-      </w:r>
-      <w:proofErr w:type="gramEnd"/>
-      <w:r>
-        <w:t xml:space="preserve">Write values stored at </w:t>
-      </w:r>
-      <w:r>
-        <w:t>&amp;FE20</w:t>
-      </w:r>
-      <w:r>
-        <w:t xml:space="preserve"> (video ULA) and </w:t>
-      </w:r>
-      <w:r>
-        <w:t>&amp;FE00</w:t>
-      </w:r>
-      <w:r>
-        <w:t xml:space="preserve"> and </w:t>
-      </w:r>
-      <w:r>
-        <w:t>&amp;</w:t>
-      </w:r>
-      <w:r>
-        <w:t>FE01</w:t>
-      </w:r>
-      <w:r>
-        <w:t xml:space="preserve"> (</w:t>
-      </w:r>
-      <w:r>
-        <w:t>6845 CRTC</w:t>
-      </w:r>
-      <w:r>
-        <w:t>).</w:t>
-      </w:r>
-    </w:p>
-    <w:p>
-      <w:pPr>
-        <w:pStyle w:val="ListParagraph"/>
-        <w:numPr>
-          <w:ilvl w:val="1"/>
-          <w:numId w:val="12"/>
-        </w:numPr>
+        <w:t>How best to handle this in the profile and analysis?</w:t>
+      </w:r>
+    </w:p>
+    <w:p>
+      <w:pPr>
+        <w:rPr>
+          <w:rFonts w:asciiTheme="majorHAnsi" w:eastAsiaTheme="majorEastAsia" w:hAnsiTheme="majorHAnsi" w:cstheme="majorBidi"/>
+          <w:color w:val="0F4761" w:themeColor="accent1" w:themeShade="BF"/>
+          <w:sz w:val="40"/>
+          <w:szCs w:val="40"/>
+        </w:rPr>
+      </w:pPr>
+      <w:r>
+        <w:br w:type="page"/>
+      </w:r>
+    </w:p>
+    <w:p>
+      <w:pPr>
+        <w:pStyle w:val="Heading1"/>
       </w:pPr>
       <w:r>
         <w:lastRenderedPageBreak/>
-        <w:t xml:space="preserve">Detecting when the screen read starts.  We need to know when the v-sync </w:t>
-      </w:r>
-      <w:proofErr w:type="gramStart"/>
-      <w:r>
-        <w:t>interrupt</w:t>
-      </w:r>
-      <w:proofErr w:type="gramEnd"/>
-      <w:r>
-        <w:t xml:space="preserve"> occurs.  We can time it from here.  We can determine this by </w:t>
-      </w:r>
-      <w:proofErr w:type="gramStart"/>
-      <w:r>
-        <w:t>looking</w:t>
-      </w:r>
-      <w:proofErr w:type="gramEnd"/>
-      <w:r>
-        <w:t xml:space="preserve"> if the values read from &amp;</w:t>
-      </w:r>
-      <w:r>
-        <w:t>FE4D</w:t>
-      </w:r>
-      <w:r>
-        <w:t xml:space="preserve"> </w:t>
-      </w:r>
-      <w:proofErr w:type="gramStart"/>
-      <w:r>
-        <w:t>has</w:t>
-      </w:r>
-      <w:proofErr w:type="gramEnd"/>
-      <w:r>
-        <w:t xml:space="preserve"> bit two </w:t>
-      </w:r>
-      <w:proofErr w:type="gramStart"/>
-      <w:r>
-        <w:t>set</w:t>
-      </w:r>
-      <w:proofErr w:type="gramEnd"/>
-      <w:r>
-        <w:t>.  The rest is math.</w:t>
-      </w:r>
-    </w:p>
-    <w:p>
-      <w:pPr>
-        <w:pStyle w:val="ListParagraph"/>
-        <w:numPr>
-          <w:ilvl w:val="0"/>
-          <w:numId w:val="12"/>
-        </w:numPr>
-      </w:pPr>
-      <w:r>
-        <w:t xml:space="preserve">Detecting </w:t>
-      </w:r>
-      <w:proofErr w:type="spellStart"/>
-      <w:r>
-        <w:t>roms</w:t>
-      </w:r>
-      <w:proofErr w:type="spellEnd"/>
-      <w:r>
-        <w:t xml:space="preserve"> being paged </w:t>
-      </w:r>
-      <w:proofErr w:type="gramStart"/>
-      <w:r>
-        <w:t>in  The</w:t>
-      </w:r>
-      <w:proofErr w:type="gramEnd"/>
-      <w:r>
-        <w:t xml:space="preserve"> easiest way to handle this is to record the value written to &amp;</w:t>
-      </w:r>
-      <w:r>
-        <w:t>FE30</w:t>
-      </w:r>
-      <w:r>
-        <w:t xml:space="preserve">.  This led to the need to capture memory </w:t>
-      </w:r>
-      <w:proofErr w:type="gramStart"/>
-      <w:r>
-        <w:t xml:space="preserve">accesses. </w:t>
-      </w:r>
-      <w:proofErr w:type="gramEnd"/>
-      <w:r>
-        <w:t>read and write value.</w:t>
-      </w:r>
-    </w:p>
-    <w:p>
-      <w:pPr>
-        <w:pStyle w:val="ListParagraph"/>
-        <w:numPr>
-          <w:ilvl w:val="0"/>
-          <w:numId w:val="12"/>
-        </w:numPr>
-      </w:pPr>
-      <w:r>
-        <w:t xml:space="preserve">How do we identify spin loops? </w:t>
-      </w:r>
-    </w:p>
-    <w:p>
-      <w:pPr>
-        <w:pStyle w:val="ListParagraph"/>
-        <w:numPr>
-          <w:ilvl w:val="1"/>
-          <w:numId w:val="12"/>
-        </w:numPr>
-      </w:pPr>
-      <w:r>
-        <w:t>A spin loop is a tight look that doesn’t write anything, it just reads something</w:t>
-      </w:r>
-      <w:proofErr w:type="gramStart"/>
-      <w:r>
-        <w:t xml:space="preserve">. </w:t>
-      </w:r>
-      <w:proofErr w:type="gramEnd"/>
-      <w:r>
-        <w:t>They are shown in light grey (background is white).  We are looking for a repeated set of non-instructions in the recording.</w:t>
-      </w:r>
-    </w:p>
-    <w:p>
-      <w:pPr>
-        <w:pStyle w:val="ListParagraph"/>
-        <w:numPr>
-          <w:ilvl w:val="2"/>
-          <w:numId w:val="12"/>
-        </w:numPr>
-      </w:pPr>
-      <w:r>
-        <w:t>Create list of instructions with all interrupts removed.</w:t>
-      </w:r>
-    </w:p>
-    <w:p>
-      <w:pPr>
-        <w:pStyle w:val="ListParagraph"/>
-        <w:numPr>
-          <w:ilvl w:val="2"/>
-          <w:numId w:val="12"/>
-        </w:numPr>
-      </w:pPr>
-      <w:r>
-        <w:t xml:space="preserve">Look for </w:t>
-      </w:r>
-      <w:proofErr w:type="gramStart"/>
-      <w:r>
-        <w:t>repeating</w:t>
-      </w:r>
-      <w:proofErr w:type="gramEnd"/>
-      <w:r>
-        <w:t xml:space="preserve"> instructions.</w:t>
-      </w:r>
-    </w:p>
-    <w:p>
-      <w:pPr>
-        <w:pStyle w:val="ListParagraph"/>
-        <w:numPr>
-          <w:ilvl w:val="0"/>
-          <w:numId w:val="12"/>
-        </w:numPr>
-      </w:pPr>
-      <w:r>
-        <w:t>Interrupts…  Code that ends in an RTI, or an instruction whose address is at an unexpected location during execution.</w:t>
-      </w:r>
-    </w:p>
-    <w:p>
-      <w:pPr>
-        <w:pStyle w:val="Heading1"/>
-      </w:pPr>
-      <w:r>
-        <w:t>D</w:t>
-      </w:r>
-      <w:r>
-        <w:t>iscoveries</w:t>
-      </w:r>
-      <w:r>
-        <w:t>…</w:t>
-      </w:r>
-    </w:p>
+        <w:t>Case study</w:t>
+      </w:r>
+      <w:r>
+        <w:t xml:space="preserve"> - </w:t>
+      </w:r>
+      <w:r>
+        <w:t xml:space="preserve">Profiling ‘An Adventure in Time’ </w:t>
+      </w:r>
+    </w:p>
+    <w:p/>
     <w:p>
       <w:r>
         <w:t>So how useful is the profiler?</w:t>
@@ -17075,6 +16615,11 @@
       </w:r>
       <w:r>
         <w:t>:</w:t>
+      </w:r>
+    </w:p>
+    <w:p>
+      <w:r>
+        <w:t>&lt;include snapshot&gt;</w:t>
       </w:r>
     </w:p>
     <w:p>
@@ -17219,7 +16764,13 @@
       </w:r>
       <w:proofErr w:type="spellEnd"/>
       <w:r>
-        <w:t xml:space="preserve"> zero-page variables.  In the majority of cases the callback update functions skip work so don’t read these.</w:t>
+        <w:t xml:space="preserve"> zero-page variables.  In the majority of cases the callback update functions skip work so don’t </w:t>
+      </w:r>
+      <w:r>
+        <w:t>use the values</w:t>
+      </w:r>
+      <w:r>
+        <w:t>.</w:t>
       </w:r>
     </w:p>
     <w:p>
@@ -17234,7 +16785,13 @@
         <w:t>5.5</w:t>
       </w:r>
       <w:r>
-        <w:t xml:space="preserve">% of the time processing input, which is </w:t>
+        <w:t xml:space="preserve">% of the time </w:t>
+      </w:r>
+      <w:r>
+        <w:t xml:space="preserve">is spent </w:t>
+      </w:r>
+      <w:r>
+        <w:t xml:space="preserve">processing input, which is </w:t>
       </w:r>
       <w:r>
         <w:t xml:space="preserve">also </w:t>
@@ -17243,7 +16800,10 @@
         <w:t>more time than expected.</w:t>
       </w:r>
       <w:r>
-        <w:t xml:space="preserve">  Looking deeper, the majority of the time (4.6% of overall time) is spent reading key states.</w:t>
+        <w:t xml:space="preserve">  Looking deeper, the majority of the time (4.6% of overall time) is spent reading key states</w:t>
+      </w:r>
+      <w:r>
+        <w:t>!</w:t>
       </w:r>
     </w:p>
     <w:p>
@@ -17259,79 +16819,46 @@
         </w:rPr>
       </w:pPr>
       <w:r>
-        <w:t xml:space="preserve">Thirdly, video analysis showed… </w:t>
-      </w:r>
-      <w:r>
-        <w:rPr>
-          <w:b/>
-          <w:bCs/>
-        </w:rPr>
-        <w:t>TBD</w:t>
-      </w:r>
-    </w:p>
-    <w:p>
-      <w:pPr>
-        <w:rPr>
-          <w:i/>
-          <w:iCs/>
-        </w:rPr>
-      </w:pPr>
-      <w:r>
-        <w:rPr>
-          <w:i/>
-          <w:iCs/>
-        </w:rPr>
+        <w:t>Thirdly, video analysis show</w:t>
+      </w:r>
+      <w:r>
+        <w:t>s the game is mostly rendering okay</w:t>
+      </w:r>
+    </w:p>
+    <w:p>
+      <w:r>
         <w:t xml:space="preserve">Interestingly, the video generated frame snapshots did reveal a couple of minor glitches.  The first one occurs when transitioning from the title </w:t>
       </w:r>
       <w:r>
-        <w:rPr>
-          <w:i/>
-          <w:iCs/>
-        </w:rPr>
         <w:t xml:space="preserve">screen </w:t>
       </w:r>
       <w:r>
-        <w:rPr>
-          <w:i/>
-          <w:iCs/>
-        </w:rPr>
         <w:t xml:space="preserve">to </w:t>
       </w:r>
       <w:r>
-        <w:rPr>
-          <w:i/>
-          <w:iCs/>
-        </w:rPr>
         <w:t xml:space="preserve">the </w:t>
       </w:r>
       <w:r>
-        <w:rPr>
-          <w:i/>
-          <w:iCs/>
-        </w:rPr>
-        <w:t xml:space="preserve">instructions screen </w:t>
-      </w:r>
-      <w:r>
-        <w:rPr>
-          <w:i/>
-          <w:iCs/>
-        </w:rPr>
-        <w:lastRenderedPageBreak/>
-        <w:t xml:space="preserve">where the Mode 7 screen copy falls behind the screen memory read </w:t>
-      </w:r>
-      <w:r>
-        <w:rPr>
-          <w:i/>
-          <w:iCs/>
-        </w:rPr>
+        <w:t xml:space="preserve">instructions screen where the Mode 7 screen copy falls behind the screen memory read </w:t>
+      </w:r>
+      <w:r>
         <w:t>resulting in the double height text not being rendered correctly on one interlaced frame.</w:t>
       </w:r>
       <w:r>
-        <w:rPr>
-          <w:i/>
-          <w:iCs/>
-        </w:rPr>
         <w:t xml:space="preserve"> </w:t>
+      </w:r>
+    </w:p>
+    <w:p>
+      <w:r>
+        <w:t xml:space="preserve">As for tearing, this does occur, and it </w:t>
+      </w:r>
+      <w:r>
+        <w:t>happens when K9’s laser is fired.</w:t>
+      </w:r>
+    </w:p>
+    <w:p>
+      <w:r>
+        <w:t>&lt;include snapshot&gt;</w:t>
       </w:r>
     </w:p>
     <w:sectPr>
@@ -18472,6 +17999,95 @@
     </w:lvl>
   </w:abstractNum>
   <w:abstractNum w:abstractNumId="9" w15:restartNumberingAfterBreak="0">
+    <w:nsid w:val="19823ED4"/>
+    <w:multiLevelType w:val="hybridMultilevel"/>
+    <w:tmpl w:val="8DA0DB0A"/>
+    <w:lvl w:ilvl="0" w:tplc="0409000F">
+      <w:start w:val="1"/>
+      <w:numFmt w:val="decimal"/>
+      <w:lvlText w:val="%1."/>
+      <w:lvlJc w:val="left"/>
+      <w:pPr>
+        <w:ind w:left="720" w:hanging="360"/>
+      </w:pPr>
+      <w:rPr>
+        <w:rFonts w:hint="default"/>
+      </w:rPr>
+    </w:lvl>
+    <w:lvl w:ilvl="1" w:tplc="04090019" w:tentative="1">
+      <w:start w:val="1"/>
+      <w:numFmt w:val="lowerLetter"/>
+      <w:lvlText w:val="%2."/>
+      <w:lvlJc w:val="left"/>
+      <w:pPr>
+        <w:ind w:left="1440" w:hanging="360"/>
+      </w:pPr>
+    </w:lvl>
+    <w:lvl w:ilvl="2" w:tplc="0409001B" w:tentative="1">
+      <w:start w:val="1"/>
+      <w:numFmt w:val="lowerRoman"/>
+      <w:lvlText w:val="%3."/>
+      <w:lvlJc w:val="right"/>
+      <w:pPr>
+        <w:ind w:left="2160" w:hanging="180"/>
+      </w:pPr>
+    </w:lvl>
+    <w:lvl w:ilvl="3" w:tplc="0409000F" w:tentative="1">
+      <w:start w:val="1"/>
+      <w:numFmt w:val="decimal"/>
+      <w:lvlText w:val="%4."/>
+      <w:lvlJc w:val="left"/>
+      <w:pPr>
+        <w:ind w:left="2880" w:hanging="360"/>
+      </w:pPr>
+    </w:lvl>
+    <w:lvl w:ilvl="4" w:tplc="04090019" w:tentative="1">
+      <w:start w:val="1"/>
+      <w:numFmt w:val="lowerLetter"/>
+      <w:lvlText w:val="%5."/>
+      <w:lvlJc w:val="left"/>
+      <w:pPr>
+        <w:ind w:left="3600" w:hanging="360"/>
+      </w:pPr>
+    </w:lvl>
+    <w:lvl w:ilvl="5" w:tplc="0409001B" w:tentative="1">
+      <w:start w:val="1"/>
+      <w:numFmt w:val="lowerRoman"/>
+      <w:lvlText w:val="%6."/>
+      <w:lvlJc w:val="right"/>
+      <w:pPr>
+        <w:ind w:left="4320" w:hanging="180"/>
+      </w:pPr>
+    </w:lvl>
+    <w:lvl w:ilvl="6" w:tplc="0409000F" w:tentative="1">
+      <w:start w:val="1"/>
+      <w:numFmt w:val="decimal"/>
+      <w:lvlText w:val="%7."/>
+      <w:lvlJc w:val="left"/>
+      <w:pPr>
+        <w:ind w:left="5040" w:hanging="360"/>
+      </w:pPr>
+    </w:lvl>
+    <w:lvl w:ilvl="7" w:tplc="04090019" w:tentative="1">
+      <w:start w:val="1"/>
+      <w:numFmt w:val="lowerLetter"/>
+      <w:lvlText w:val="%8."/>
+      <w:lvlJc w:val="left"/>
+      <w:pPr>
+        <w:ind w:left="5760" w:hanging="360"/>
+      </w:pPr>
+    </w:lvl>
+    <w:lvl w:ilvl="8" w:tplc="0409001B" w:tentative="1">
+      <w:start w:val="1"/>
+      <w:numFmt w:val="lowerRoman"/>
+      <w:lvlText w:val="%9."/>
+      <w:lvlJc w:val="right"/>
+      <w:pPr>
+        <w:ind w:left="6480" w:hanging="180"/>
+      </w:pPr>
+    </w:lvl>
+  </w:abstractNum>
+  <w:abstractNum w:abstractNumId="10" w15:restartNumberingAfterBreak="0">
     <w:nsid w:val="1D2E33C9"/>
     <w:multiLevelType w:val="hybridMultilevel"/>
     <w:tmpl w:val="C8CA8FBC"/>
@@ -18584,7 +18200,7 @@
       </w:rPr>
     </w:lvl>
   </w:abstractNum>
-  <w:abstractNum w:abstractNumId="10" w15:restartNumberingAfterBreak="0">
+  <w:abstractNum w:abstractNumId="11" w15:restartNumberingAfterBreak="0">
     <w:nsid w:val="2087169C"/>
     <w:multiLevelType w:val="hybridMultilevel"/>
     <w:tmpl w:val="D4905642"/>
@@ -18673,7 +18289,7 @@
       </w:pPr>
     </w:lvl>
   </w:abstractNum>
-  <w:abstractNum w:abstractNumId="11" w15:restartNumberingAfterBreak="0">
+  <w:abstractNum w:abstractNumId="12" w15:restartNumberingAfterBreak="0">
     <w:nsid w:val="223175D7"/>
     <w:multiLevelType w:val="hybridMultilevel"/>
     <w:tmpl w:val="E47E4CF0"/>
@@ -18786,7 +18402,119 @@
       </w:rPr>
     </w:lvl>
   </w:abstractNum>
-  <w:abstractNum w:abstractNumId="12" w15:restartNumberingAfterBreak="0">
+  <w:abstractNum w:abstractNumId="13" w15:restartNumberingAfterBreak="0">
+    <w:nsid w:val="22A67E09"/>
+    <w:multiLevelType w:val="multilevel"/>
+    <w:tmpl w:val="C1847A6E"/>
+    <w:lvl w:ilvl="0">
+      <w:numFmt w:val="decimal"/>
+      <w:lvlText w:val="%1."/>
+      <w:lvlJc w:val="left"/>
+      <w:pPr>
+        <w:ind w:left="1800" w:hanging="360"/>
+      </w:pPr>
+      <w:rPr>
+        <w:rFonts w:hint="default"/>
+      </w:rPr>
+    </w:lvl>
+    <w:lvl w:ilvl="1" w:tentative="1">
+      <w:start w:val="1"/>
+      <w:numFmt w:val="bullet"/>
+      <w:lvlText w:val="o"/>
+      <w:lvlJc w:val="left"/>
+      <w:pPr>
+        <w:ind w:left="2160" w:hanging="360"/>
+      </w:pPr>
+      <w:rPr>
+        <w:rFonts w:ascii="Courier New" w:hAnsi="Courier New" w:cs="Courier New" w:hint="default"/>
+      </w:rPr>
+    </w:lvl>
+    <w:lvl w:ilvl="2" w:tentative="1">
+      <w:start w:val="1"/>
+      <w:numFmt w:val="bullet"/>
+      <w:lvlText w:val=""/>
+      <w:lvlJc w:val="left"/>
+      <w:pPr>
+        <w:ind w:left="2880" w:hanging="360"/>
+      </w:pPr>
+      <w:rPr>
+        <w:rFonts w:ascii="Wingdings" w:hAnsi="Wingdings" w:hint="default"/>
+      </w:rPr>
+    </w:lvl>
+    <w:lvl w:ilvl="3" w:tentative="1">
+      <w:start w:val="1"/>
+      <w:numFmt w:val="bullet"/>
+      <w:lvlText w:val=""/>
+      <w:lvlJc w:val="left"/>
+      <w:pPr>
+        <w:ind w:left="3600" w:hanging="360"/>
+      </w:pPr>
+      <w:rPr>
+        <w:rFonts w:ascii="Symbol" w:hAnsi="Symbol" w:hint="default"/>
+      </w:rPr>
+    </w:lvl>
+    <w:lvl w:ilvl="4" w:tentative="1">
+      <w:start w:val="1"/>
+      <w:numFmt w:val="bullet"/>
+      <w:lvlText w:val="o"/>
+      <w:lvlJc w:val="left"/>
+      <w:pPr>
+        <w:ind w:left="4320" w:hanging="360"/>
+      </w:pPr>
+      <w:rPr>
+        <w:rFonts w:ascii="Courier New" w:hAnsi="Courier New" w:cs="Courier New" w:hint="default"/>
+      </w:rPr>
+    </w:lvl>
+    <w:lvl w:ilvl="5" w:tentative="1">
+      <w:start w:val="1"/>
+      <w:numFmt w:val="bullet"/>
+      <w:lvlText w:val=""/>
+      <w:lvlJc w:val="left"/>
+      <w:pPr>
+        <w:ind w:left="5040" w:hanging="360"/>
+      </w:pPr>
+      <w:rPr>
+        <w:rFonts w:ascii="Wingdings" w:hAnsi="Wingdings" w:hint="default"/>
+      </w:rPr>
+    </w:lvl>
+    <w:lvl w:ilvl="6" w:tentative="1">
+      <w:start w:val="1"/>
+      <w:numFmt w:val="bullet"/>
+      <w:lvlText w:val=""/>
+      <w:lvlJc w:val="left"/>
+      <w:pPr>
+        <w:ind w:left="5760" w:hanging="360"/>
+      </w:pPr>
+      <w:rPr>
+        <w:rFonts w:ascii="Symbol" w:hAnsi="Symbol" w:hint="default"/>
+      </w:rPr>
+    </w:lvl>
+    <w:lvl w:ilvl="7" w:tentative="1">
+      <w:start w:val="1"/>
+      <w:numFmt w:val="bullet"/>
+      <w:lvlText w:val="o"/>
+      <w:lvlJc w:val="left"/>
+      <w:pPr>
+        <w:ind w:left="6480" w:hanging="360"/>
+      </w:pPr>
+      <w:rPr>
+        <w:rFonts w:ascii="Courier New" w:hAnsi="Courier New" w:cs="Courier New" w:hint="default"/>
+      </w:rPr>
+    </w:lvl>
+    <w:lvl w:ilvl="8" w:tentative="1">
+      <w:start w:val="1"/>
+      <w:numFmt w:val="bullet"/>
+      <w:lvlText w:val=""/>
+      <w:lvlJc w:val="left"/>
+      <w:pPr>
+        <w:ind w:left="7200" w:hanging="360"/>
+      </w:pPr>
+      <w:rPr>
+        <w:rFonts w:ascii="Wingdings" w:hAnsi="Wingdings" w:hint="default"/>
+      </w:rPr>
+    </w:lvl>
+  </w:abstractNum>
+  <w:abstractNum w:abstractNumId="14" w15:restartNumberingAfterBreak="0">
     <w:nsid w:val="2436696C"/>
     <w:multiLevelType w:val="hybridMultilevel"/>
     <w:tmpl w:val="FB50D53A"/>
@@ -18898,7 +18626,7 @@
       </w:rPr>
     </w:lvl>
   </w:abstractNum>
-  <w:abstractNum w:abstractNumId="13" w15:restartNumberingAfterBreak="0">
+  <w:abstractNum w:abstractNumId="15" w15:restartNumberingAfterBreak="0">
     <w:nsid w:val="29AA1028"/>
     <w:multiLevelType w:val="hybridMultilevel"/>
     <w:tmpl w:val="4672DC98"/>
@@ -19011,7 +18739,7 @@
       </w:rPr>
     </w:lvl>
   </w:abstractNum>
-  <w:abstractNum w:abstractNumId="14" w15:restartNumberingAfterBreak="0">
+  <w:abstractNum w:abstractNumId="16" w15:restartNumberingAfterBreak="0">
     <w:nsid w:val="2B312A88"/>
     <w:multiLevelType w:val="hybridMultilevel"/>
     <w:tmpl w:val="A956FCEC"/>
@@ -19123,7 +18851,7 @@
       </w:rPr>
     </w:lvl>
   </w:abstractNum>
-  <w:abstractNum w:abstractNumId="15" w15:restartNumberingAfterBreak="0">
+  <w:abstractNum w:abstractNumId="17" w15:restartNumberingAfterBreak="0">
     <w:nsid w:val="2E33237D"/>
     <w:multiLevelType w:val="hybridMultilevel"/>
     <w:tmpl w:val="FC749FA4"/>
@@ -19212,7 +18940,7 @@
       </w:pPr>
     </w:lvl>
   </w:abstractNum>
-  <w:abstractNum w:abstractNumId="16" w15:restartNumberingAfterBreak="0">
+  <w:abstractNum w:abstractNumId="18" w15:restartNumberingAfterBreak="0">
     <w:nsid w:val="30EE4BE2"/>
     <w:multiLevelType w:val="hybridMultilevel"/>
     <w:tmpl w:val="B3CADE1E"/>
@@ -19324,7 +19052,7 @@
       </w:rPr>
     </w:lvl>
   </w:abstractNum>
-  <w:abstractNum w:abstractNumId="17" w15:restartNumberingAfterBreak="0">
+  <w:abstractNum w:abstractNumId="19" w15:restartNumberingAfterBreak="0">
     <w:nsid w:val="315D741E"/>
     <w:multiLevelType w:val="hybridMultilevel"/>
     <w:tmpl w:val="88709516"/>
@@ -19412,7 +19140,7 @@
       </w:pPr>
     </w:lvl>
   </w:abstractNum>
-  <w:abstractNum w:abstractNumId="18" w15:restartNumberingAfterBreak="0">
+  <w:abstractNum w:abstractNumId="20" w15:restartNumberingAfterBreak="0">
     <w:nsid w:val="321B6EB1"/>
     <w:multiLevelType w:val="hybridMultilevel"/>
     <w:tmpl w:val="D24409A4"/>
@@ -19524,7 +19252,7 @@
       </w:rPr>
     </w:lvl>
   </w:abstractNum>
-  <w:abstractNum w:abstractNumId="19" w15:restartNumberingAfterBreak="0">
+  <w:abstractNum w:abstractNumId="21" w15:restartNumberingAfterBreak="0">
     <w:nsid w:val="32A47373"/>
     <w:multiLevelType w:val="hybridMultilevel"/>
     <w:tmpl w:val="49CED4BE"/>
@@ -19613,7 +19341,7 @@
       </w:pPr>
     </w:lvl>
   </w:abstractNum>
-  <w:abstractNum w:abstractNumId="20" w15:restartNumberingAfterBreak="0">
+  <w:abstractNum w:abstractNumId="22" w15:restartNumberingAfterBreak="0">
     <w:nsid w:val="340E436D"/>
     <w:multiLevelType w:val="hybridMultilevel"/>
     <w:tmpl w:val="C840E69E"/>
@@ -19726,7 +19454,7 @@
       </w:rPr>
     </w:lvl>
   </w:abstractNum>
-  <w:abstractNum w:abstractNumId="21" w15:restartNumberingAfterBreak="0">
+  <w:abstractNum w:abstractNumId="23" w15:restartNumberingAfterBreak="0">
     <w:nsid w:val="344157C3"/>
     <w:multiLevelType w:val="hybridMultilevel"/>
     <w:tmpl w:val="D50845F4"/>
@@ -19815,7 +19543,7 @@
       </w:pPr>
     </w:lvl>
   </w:abstractNum>
-  <w:abstractNum w:abstractNumId="22" w15:restartNumberingAfterBreak="0">
+  <w:abstractNum w:abstractNumId="24" w15:restartNumberingAfterBreak="0">
     <w:nsid w:val="37B30A55"/>
     <w:multiLevelType w:val="hybridMultilevel"/>
     <w:tmpl w:val="F92A4914"/>
@@ -19928,7 +19656,7 @@
       </w:rPr>
     </w:lvl>
   </w:abstractNum>
-  <w:abstractNum w:abstractNumId="23" w15:restartNumberingAfterBreak="0">
+  <w:abstractNum w:abstractNumId="25" w15:restartNumberingAfterBreak="0">
     <w:nsid w:val="3AF504D6"/>
     <w:multiLevelType w:val="hybridMultilevel"/>
     <w:tmpl w:val="492459FE"/>
@@ -20017,7 +19745,7 @@
       </w:pPr>
     </w:lvl>
   </w:abstractNum>
-  <w:abstractNum w:abstractNumId="24" w15:restartNumberingAfterBreak="0">
+  <w:abstractNum w:abstractNumId="26" w15:restartNumberingAfterBreak="0">
     <w:nsid w:val="3B195DDE"/>
     <w:multiLevelType w:val="hybridMultilevel"/>
     <w:tmpl w:val="49967242"/>
@@ -20106,7 +19834,7 @@
       </w:pPr>
     </w:lvl>
   </w:abstractNum>
-  <w:abstractNum w:abstractNumId="25" w15:restartNumberingAfterBreak="0">
+  <w:abstractNum w:abstractNumId="27" w15:restartNumberingAfterBreak="0">
     <w:nsid w:val="3D5066A4"/>
     <w:multiLevelType w:val="hybridMultilevel"/>
     <w:tmpl w:val="F6A00D3C"/>
@@ -20219,7 +19947,7 @@
       </w:rPr>
     </w:lvl>
   </w:abstractNum>
-  <w:abstractNum w:abstractNumId="26" w15:restartNumberingAfterBreak="0">
+  <w:abstractNum w:abstractNumId="28" w15:restartNumberingAfterBreak="0">
     <w:nsid w:val="3EE10AFE"/>
     <w:multiLevelType w:val="hybridMultilevel"/>
     <w:tmpl w:val="48041BD4"/>
@@ -20332,7 +20060,7 @@
       </w:rPr>
     </w:lvl>
   </w:abstractNum>
-  <w:abstractNum w:abstractNumId="27" w15:restartNumberingAfterBreak="0">
+  <w:abstractNum w:abstractNumId="29" w15:restartNumberingAfterBreak="0">
     <w:nsid w:val="45161BD6"/>
     <w:multiLevelType w:val="hybridMultilevel"/>
     <w:tmpl w:val="D806D5D6"/>
@@ -20421,7 +20149,7 @@
       </w:pPr>
     </w:lvl>
   </w:abstractNum>
-  <w:abstractNum w:abstractNumId="28" w15:restartNumberingAfterBreak="0">
+  <w:abstractNum w:abstractNumId="30" w15:restartNumberingAfterBreak="0">
     <w:nsid w:val="458A0515"/>
     <w:multiLevelType w:val="hybridMultilevel"/>
     <w:tmpl w:val="2B301470"/>
@@ -20534,7 +20262,96 @@
       </w:rPr>
     </w:lvl>
   </w:abstractNum>
-  <w:abstractNum w:abstractNumId="29" w15:restartNumberingAfterBreak="0">
+  <w:abstractNum w:abstractNumId="31" w15:restartNumberingAfterBreak="0">
+    <w:nsid w:val="4C923F77"/>
+    <w:multiLevelType w:val="hybridMultilevel"/>
+    <w:tmpl w:val="B498CF6C"/>
+    <w:lvl w:ilvl="0" w:tplc="0409000F">
+      <w:start w:val="1"/>
+      <w:numFmt w:val="decimal"/>
+      <w:lvlText w:val="%1."/>
+      <w:lvlJc w:val="left"/>
+      <w:pPr>
+        <w:ind w:left="720" w:hanging="360"/>
+      </w:pPr>
+      <w:rPr>
+        <w:rFonts w:hint="default"/>
+      </w:rPr>
+    </w:lvl>
+    <w:lvl w:ilvl="1" w:tplc="04090019">
+      <w:start w:val="1"/>
+      <w:numFmt w:val="lowerLetter"/>
+      <w:lvlText w:val="%2."/>
+      <w:lvlJc w:val="left"/>
+      <w:pPr>
+        <w:ind w:left="1440" w:hanging="360"/>
+      </w:pPr>
+    </w:lvl>
+    <w:lvl w:ilvl="2" w:tplc="0409001B" w:tentative="1">
+      <w:start w:val="1"/>
+      <w:numFmt w:val="lowerRoman"/>
+      <w:lvlText w:val="%3."/>
+      <w:lvlJc w:val="right"/>
+      <w:pPr>
+        <w:ind w:left="2160" w:hanging="180"/>
+      </w:pPr>
+    </w:lvl>
+    <w:lvl w:ilvl="3" w:tplc="0409000F" w:tentative="1">
+      <w:start w:val="1"/>
+      <w:numFmt w:val="decimal"/>
+      <w:lvlText w:val="%4."/>
+      <w:lvlJc w:val="left"/>
+      <w:pPr>
+        <w:ind w:left="2880" w:hanging="360"/>
+      </w:pPr>
+    </w:lvl>
+    <w:lvl w:ilvl="4" w:tplc="04090019" w:tentative="1">
+      <w:start w:val="1"/>
+      <w:numFmt w:val="lowerLetter"/>
+      <w:lvlText w:val="%5."/>
+      <w:lvlJc w:val="left"/>
+      <w:pPr>
+        <w:ind w:left="3600" w:hanging="360"/>
+      </w:pPr>
+    </w:lvl>
+    <w:lvl w:ilvl="5" w:tplc="0409001B" w:tentative="1">
+      <w:start w:val="1"/>
+      <w:numFmt w:val="lowerRoman"/>
+      <w:lvlText w:val="%6."/>
+      <w:lvlJc w:val="right"/>
+      <w:pPr>
+        <w:ind w:left="4320" w:hanging="180"/>
+      </w:pPr>
+    </w:lvl>
+    <w:lvl w:ilvl="6" w:tplc="0409000F" w:tentative="1">
+      <w:start w:val="1"/>
+      <w:numFmt w:val="decimal"/>
+      <w:lvlText w:val="%7."/>
+      <w:lvlJc w:val="left"/>
+      <w:pPr>
+        <w:ind w:left="5040" w:hanging="360"/>
+      </w:pPr>
+    </w:lvl>
+    <w:lvl w:ilvl="7" w:tplc="04090019" w:tentative="1">
+      <w:start w:val="1"/>
+      <w:numFmt w:val="lowerLetter"/>
+      <w:lvlText w:val="%8."/>
+      <w:lvlJc w:val="left"/>
+      <w:pPr>
+        <w:ind w:left="5760" w:hanging="360"/>
+      </w:pPr>
+    </w:lvl>
+    <w:lvl w:ilvl="8" w:tplc="0409001B" w:tentative="1">
+      <w:start w:val="1"/>
+      <w:numFmt w:val="lowerRoman"/>
+      <w:lvlText w:val="%9."/>
+      <w:lvlJc w:val="right"/>
+      <w:pPr>
+        <w:ind w:left="6480" w:hanging="180"/>
+      </w:pPr>
+    </w:lvl>
+  </w:abstractNum>
+  <w:abstractNum w:abstractNumId="32" w15:restartNumberingAfterBreak="0">
     <w:nsid w:val="4FED7D40"/>
     <w:multiLevelType w:val="hybridMultilevel"/>
     <w:tmpl w:val="7F58DA28"/>
@@ -20647,7 +20464,7 @@
       </w:rPr>
     </w:lvl>
   </w:abstractNum>
-  <w:abstractNum w:abstractNumId="30" w15:restartNumberingAfterBreak="0">
+  <w:abstractNum w:abstractNumId="33" w15:restartNumberingAfterBreak="0">
     <w:nsid w:val="50575224"/>
     <w:multiLevelType w:val="hybridMultilevel"/>
     <w:tmpl w:val="CF5A5852"/>
@@ -20736,7 +20553,7 @@
       </w:pPr>
     </w:lvl>
   </w:abstractNum>
-  <w:abstractNum w:abstractNumId="31" w15:restartNumberingAfterBreak="0">
+  <w:abstractNum w:abstractNumId="34" w15:restartNumberingAfterBreak="0">
     <w:nsid w:val="52943761"/>
     <w:multiLevelType w:val="hybridMultilevel"/>
     <w:tmpl w:val="827648F6"/>
@@ -20849,7 +20666,7 @@
       </w:rPr>
     </w:lvl>
   </w:abstractNum>
-  <w:abstractNum w:abstractNumId="32" w15:restartNumberingAfterBreak="0">
+  <w:abstractNum w:abstractNumId="35" w15:restartNumberingAfterBreak="0">
     <w:nsid w:val="53022C6C"/>
     <w:multiLevelType w:val="hybridMultilevel"/>
     <w:tmpl w:val="B1A2FFB2"/>
@@ -20962,7 +20779,7 @@
       </w:rPr>
     </w:lvl>
   </w:abstractNum>
-  <w:abstractNum w:abstractNumId="33" w15:restartNumberingAfterBreak="0">
+  <w:abstractNum w:abstractNumId="36" w15:restartNumberingAfterBreak="0">
     <w:nsid w:val="54CD0D6A"/>
     <w:multiLevelType w:val="hybridMultilevel"/>
     <w:tmpl w:val="32EE2FE6"/>
@@ -21075,7 +20892,7 @@
       </w:rPr>
     </w:lvl>
   </w:abstractNum>
-  <w:abstractNum w:abstractNumId="34" w15:restartNumberingAfterBreak="0">
+  <w:abstractNum w:abstractNumId="37" w15:restartNumberingAfterBreak="0">
     <w:nsid w:val="55D87ABE"/>
     <w:multiLevelType w:val="hybridMultilevel"/>
     <w:tmpl w:val="320A163C"/>
@@ -21188,7 +21005,7 @@
       </w:rPr>
     </w:lvl>
   </w:abstractNum>
-  <w:abstractNum w:abstractNumId="35" w15:restartNumberingAfterBreak="0">
+  <w:abstractNum w:abstractNumId="38" w15:restartNumberingAfterBreak="0">
     <w:nsid w:val="58503F77"/>
     <w:multiLevelType w:val="hybridMultilevel"/>
     <w:tmpl w:val="C99A9E4C"/>
@@ -21300,7 +21117,7 @@
       </w:rPr>
     </w:lvl>
   </w:abstractNum>
-  <w:abstractNum w:abstractNumId="36" w15:restartNumberingAfterBreak="0">
+  <w:abstractNum w:abstractNumId="39" w15:restartNumberingAfterBreak="0">
     <w:nsid w:val="58626F21"/>
     <w:multiLevelType w:val="hybridMultilevel"/>
     <w:tmpl w:val="B61264F2"/>
@@ -21412,7 +21229,7 @@
       </w:rPr>
     </w:lvl>
   </w:abstractNum>
-  <w:abstractNum w:abstractNumId="37" w15:restartNumberingAfterBreak="0">
+  <w:abstractNum w:abstractNumId="40" w15:restartNumberingAfterBreak="0">
     <w:nsid w:val="59CC3DC4"/>
     <w:multiLevelType w:val="hybridMultilevel"/>
     <w:tmpl w:val="80D854DA"/>
@@ -21525,7 +21342,7 @@
       </w:rPr>
     </w:lvl>
   </w:abstractNum>
-  <w:abstractNum w:abstractNumId="38" w15:restartNumberingAfterBreak="0">
+  <w:abstractNum w:abstractNumId="41" w15:restartNumberingAfterBreak="0">
     <w:nsid w:val="5B6F7CFD"/>
     <w:multiLevelType w:val="hybridMultilevel"/>
     <w:tmpl w:val="93EAF40E"/>
@@ -21611,7 +21428,7 @@
       </w:pPr>
     </w:lvl>
   </w:abstractNum>
-  <w:abstractNum w:abstractNumId="39" w15:restartNumberingAfterBreak="0">
+  <w:abstractNum w:abstractNumId="42" w15:restartNumberingAfterBreak="0">
     <w:nsid w:val="5D1A04B1"/>
     <w:multiLevelType w:val="hybridMultilevel"/>
     <w:tmpl w:val="122A4170"/>
@@ -21723,7 +21540,7 @@
       </w:rPr>
     </w:lvl>
   </w:abstractNum>
-  <w:abstractNum w:abstractNumId="40" w15:restartNumberingAfterBreak="0">
+  <w:abstractNum w:abstractNumId="43" w15:restartNumberingAfterBreak="0">
     <w:nsid w:val="61F00524"/>
     <w:multiLevelType w:val="hybridMultilevel"/>
     <w:tmpl w:val="DA22D490"/>
@@ -21836,7 +21653,7 @@
       </w:rPr>
     </w:lvl>
   </w:abstractNum>
-  <w:abstractNum w:abstractNumId="41" w15:restartNumberingAfterBreak="0">
+  <w:abstractNum w:abstractNumId="44" w15:restartNumberingAfterBreak="0">
     <w:nsid w:val="620C3812"/>
     <w:multiLevelType w:val="hybridMultilevel"/>
     <w:tmpl w:val="E2EABAAA"/>
@@ -21928,7 +21745,7 @@
       </w:pPr>
     </w:lvl>
   </w:abstractNum>
-  <w:abstractNum w:abstractNumId="42" w15:restartNumberingAfterBreak="0">
+  <w:abstractNum w:abstractNumId="45" w15:restartNumberingAfterBreak="0">
     <w:nsid w:val="673E1561"/>
     <w:multiLevelType w:val="hybridMultilevel"/>
     <w:tmpl w:val="7D42D1F0"/>
@@ -22023,7 +21840,7 @@
       </w:pPr>
     </w:lvl>
   </w:abstractNum>
-  <w:abstractNum w:abstractNumId="43" w15:restartNumberingAfterBreak="0">
+  <w:abstractNum w:abstractNumId="46" w15:restartNumberingAfterBreak="0">
     <w:nsid w:val="6B8C35B0"/>
     <w:multiLevelType w:val="hybridMultilevel"/>
     <w:tmpl w:val="C3C2A424"/>
@@ -22136,7 +21953,7 @@
       </w:rPr>
     </w:lvl>
   </w:abstractNum>
-  <w:abstractNum w:abstractNumId="44" w15:restartNumberingAfterBreak="0">
+  <w:abstractNum w:abstractNumId="47" w15:restartNumberingAfterBreak="0">
     <w:nsid w:val="6BCA6CF4"/>
     <w:multiLevelType w:val="hybridMultilevel"/>
     <w:tmpl w:val="72D6E6B6"/>
@@ -22249,7 +22066,7 @@
       </w:rPr>
     </w:lvl>
   </w:abstractNum>
-  <w:abstractNum w:abstractNumId="45" w15:restartNumberingAfterBreak="0">
+  <w:abstractNum w:abstractNumId="48" w15:restartNumberingAfterBreak="0">
     <w:nsid w:val="6FF97690"/>
     <w:multiLevelType w:val="hybridMultilevel"/>
     <w:tmpl w:val="64881558"/>
@@ -22361,7 +22178,7 @@
       </w:rPr>
     </w:lvl>
   </w:abstractNum>
-  <w:abstractNum w:abstractNumId="46" w15:restartNumberingAfterBreak="0">
+  <w:abstractNum w:abstractNumId="49" w15:restartNumberingAfterBreak="0">
     <w:nsid w:val="77037CBE"/>
     <w:multiLevelType w:val="hybridMultilevel"/>
     <w:tmpl w:val="C2803B70"/>
@@ -22450,7 +22267,7 @@
       </w:pPr>
     </w:lvl>
   </w:abstractNum>
-  <w:abstractNum w:abstractNumId="47" w15:restartNumberingAfterBreak="0">
+  <w:abstractNum w:abstractNumId="50" w15:restartNumberingAfterBreak="0">
     <w:nsid w:val="79E81D64"/>
     <w:multiLevelType w:val="hybridMultilevel"/>
     <w:tmpl w:val="88D0154E"/>
@@ -22539,7 +22356,7 @@
       </w:pPr>
     </w:lvl>
   </w:abstractNum>
-  <w:abstractNum w:abstractNumId="48" w15:restartNumberingAfterBreak="0">
+  <w:abstractNum w:abstractNumId="51" w15:restartNumberingAfterBreak="0">
     <w:nsid w:val="7A1B3C59"/>
     <w:multiLevelType w:val="hybridMultilevel"/>
     <w:tmpl w:val="DDAA74EC"/>
@@ -22652,7 +22469,7 @@
       </w:rPr>
     </w:lvl>
   </w:abstractNum>
-  <w:abstractNum w:abstractNumId="49" w15:restartNumberingAfterBreak="0">
+  <w:abstractNum w:abstractNumId="52" w15:restartNumberingAfterBreak="0">
     <w:nsid w:val="7D1F6788"/>
     <w:multiLevelType w:val="hybridMultilevel"/>
     <w:tmpl w:val="4F9ECB6A"/>
@@ -22766,94 +22583,94 @@
     </w:lvl>
   </w:abstractNum>
   <w:num w:numId="1" w16cid:durableId="1020274605">
-    <w:abstractNumId w:val="31"/>
+    <w:abstractNumId w:val="34"/>
   </w:num>
   <w:num w:numId="2" w16cid:durableId="1038355566">
-    <w:abstractNumId w:val="11"/>
+    <w:abstractNumId w:val="12"/>
   </w:num>
   <w:num w:numId="3" w16cid:durableId="1051072854">
-    <w:abstractNumId w:val="20"/>
+    <w:abstractNumId w:val="22"/>
   </w:num>
   <w:num w:numId="4" w16cid:durableId="1066687358">
-    <w:abstractNumId w:val="28"/>
+    <w:abstractNumId w:val="30"/>
   </w:num>
   <w:num w:numId="5" w16cid:durableId="107554550">
-    <w:abstractNumId w:val="43"/>
+    <w:abstractNumId w:val="46"/>
   </w:num>
   <w:num w:numId="6" w16cid:durableId="1128620781">
-    <w:abstractNumId w:val="21"/>
+    <w:abstractNumId w:val="23"/>
   </w:num>
   <w:num w:numId="7" w16cid:durableId="1131165215">
-    <w:abstractNumId w:val="41"/>
+    <w:abstractNumId w:val="44"/>
   </w:num>
   <w:num w:numId="8" w16cid:durableId="113254413">
-    <w:abstractNumId w:val="39"/>
+    <w:abstractNumId w:val="42"/>
   </w:num>
   <w:num w:numId="9" w16cid:durableId="1191190934">
-    <w:abstractNumId w:val="44"/>
+    <w:abstractNumId w:val="47"/>
   </w:num>
   <w:num w:numId="10" w16cid:durableId="1216623829">
-    <w:abstractNumId w:val="9"/>
+    <w:abstractNumId w:val="10"/>
   </w:num>
   <w:num w:numId="11" w16cid:durableId="123742512">
-    <w:abstractNumId w:val="37"/>
+    <w:abstractNumId w:val="40"/>
   </w:num>
   <w:num w:numId="12" w16cid:durableId="124004162">
     <w:abstractNumId w:val="7"/>
   </w:num>
   <w:num w:numId="13" w16cid:durableId="1260406227">
-    <w:abstractNumId w:val="30"/>
+    <w:abstractNumId w:val="33"/>
   </w:num>
   <w:num w:numId="14" w16cid:durableId="1408069065">
-    <w:abstractNumId w:val="23"/>
+    <w:abstractNumId w:val="25"/>
   </w:num>
   <w:num w:numId="15" w16cid:durableId="1425305013">
-    <w:abstractNumId w:val="17"/>
+    <w:abstractNumId w:val="19"/>
   </w:num>
   <w:num w:numId="16" w16cid:durableId="1457144852">
+    <w:abstractNumId w:val="28"/>
+  </w:num>
+  <w:num w:numId="17" w16cid:durableId="1468203927">
+    <w:abstractNumId w:val="24"/>
+  </w:num>
+  <w:num w:numId="18" w16cid:durableId="1508247737">
+    <w:abstractNumId w:val="49"/>
+  </w:num>
+  <w:num w:numId="19" w16cid:durableId="1537354892">
     <w:abstractNumId w:val="26"/>
   </w:num>
-  <w:num w:numId="17" w16cid:durableId="1468203927">
-    <w:abstractNumId w:val="22"/>
-  </w:num>
-  <w:num w:numId="18" w16cid:durableId="1508247737">
-    <w:abstractNumId w:val="46"/>
-  </w:num>
-  <w:num w:numId="19" w16cid:durableId="1537354892">
-    <w:abstractNumId w:val="24"/>
-  </w:num>
   <w:num w:numId="20" w16cid:durableId="1597638782">
-    <w:abstractNumId w:val="42"/>
+    <w:abstractNumId w:val="45"/>
   </w:num>
   <w:num w:numId="21" w16cid:durableId="1620986286">
-    <w:abstractNumId w:val="47"/>
+    <w:abstractNumId w:val="50"/>
   </w:num>
   <w:num w:numId="22" w16cid:durableId="1682275811">
     <w:abstractNumId w:val="5"/>
   </w:num>
   <w:num w:numId="23" w16cid:durableId="1762607677">
+    <w:abstractNumId w:val="38"/>
+  </w:num>
+  <w:num w:numId="24" w16cid:durableId="1777485336">
     <w:abstractNumId w:val="35"/>
   </w:num>
-  <w:num w:numId="24" w16cid:durableId="1777485336">
-    <w:abstractNumId w:val="32"/>
-  </w:num>
   <w:num w:numId="25" w16cid:durableId="1823159972">
-    <w:abstractNumId w:val="27"/>
+    <w:abstractNumId w:val="29"/>
   </w:num>
   <w:num w:numId="26" w16cid:durableId="1966617499">
     <w:abstractNumId w:val="8"/>
   </w:num>
   <w:num w:numId="27" w16cid:durableId="1976182835">
-    <w:abstractNumId w:val="34"/>
+    <w:abstractNumId w:val="37"/>
   </w:num>
   <w:num w:numId="28" w16cid:durableId="2093358611">
-    <w:abstractNumId w:val="49"/>
+    <w:abstractNumId w:val="52"/>
   </w:num>
   <w:num w:numId="29" w16cid:durableId="2105567649">
     <w:abstractNumId w:val="1"/>
   </w:num>
   <w:num w:numId="30" w16cid:durableId="2111120628">
-    <w:abstractNumId w:val="19"/>
+    <w:abstractNumId w:val="21"/>
   </w:num>
   <w:num w:numId="31" w16cid:durableId="273907365">
     <w:abstractNumId w:val="4"/>
@@ -22862,58 +22679,67 @@
     <w:abstractNumId w:val="0"/>
   </w:num>
   <w:num w:numId="33" w16cid:durableId="487475517">
-    <w:abstractNumId w:val="12"/>
+    <w:abstractNumId w:val="14"/>
   </w:num>
   <w:num w:numId="34" w16cid:durableId="548733428">
-    <w:abstractNumId w:val="33"/>
+    <w:abstractNumId w:val="36"/>
   </w:num>
   <w:num w:numId="35" w16cid:durableId="689574971">
-    <w:abstractNumId w:val="38"/>
+    <w:abstractNumId w:val="41"/>
   </w:num>
   <w:num w:numId="36" w16cid:durableId="788159740">
     <w:abstractNumId w:val="6"/>
   </w:num>
   <w:num w:numId="37" w16cid:durableId="840703382">
-    <w:abstractNumId w:val="25"/>
+    <w:abstractNumId w:val="27"/>
   </w:num>
   <w:num w:numId="38" w16cid:durableId="927008340">
-    <w:abstractNumId w:val="48"/>
+    <w:abstractNumId w:val="51"/>
   </w:num>
   <w:num w:numId="39" w16cid:durableId="89743824">
-    <w:abstractNumId w:val="13"/>
+    <w:abstractNumId w:val="15"/>
   </w:num>
   <w:num w:numId="40" w16cid:durableId="132137380">
-    <w:abstractNumId w:val="15"/>
+    <w:abstractNumId w:val="17"/>
   </w:num>
   <w:num w:numId="41" w16cid:durableId="940071931">
-    <w:abstractNumId w:val="10"/>
+    <w:abstractNumId w:val="11"/>
   </w:num>
   <w:num w:numId="42" w16cid:durableId="862206418">
     <w:abstractNumId w:val="3"/>
   </w:num>
   <w:num w:numId="43" w16cid:durableId="300889070">
-    <w:abstractNumId w:val="40"/>
+    <w:abstractNumId w:val="43"/>
   </w:num>
   <w:num w:numId="44" w16cid:durableId="666324038">
-    <w:abstractNumId w:val="36"/>
+    <w:abstractNumId w:val="39"/>
   </w:num>
   <w:num w:numId="45" w16cid:durableId="1752969189">
-    <w:abstractNumId w:val="14"/>
+    <w:abstractNumId w:val="16"/>
   </w:num>
   <w:num w:numId="46" w16cid:durableId="1234512538">
+    <w:abstractNumId w:val="20"/>
+  </w:num>
+  <w:num w:numId="47" w16cid:durableId="2118599643">
+    <w:abstractNumId w:val="48"/>
+  </w:num>
+  <w:num w:numId="48" w16cid:durableId="1625696879">
     <w:abstractNumId w:val="18"/>
   </w:num>
-  <w:num w:numId="47" w16cid:durableId="2118599643">
-    <w:abstractNumId w:val="45"/>
-  </w:num>
-  <w:num w:numId="48" w16cid:durableId="1625696879">
-    <w:abstractNumId w:val="16"/>
-  </w:num>
   <w:num w:numId="49" w16cid:durableId="1259368659">
-    <w:abstractNumId w:val="29"/>
+    <w:abstractNumId w:val="32"/>
   </w:num>
   <w:num w:numId="50" w16cid:durableId="2052876337">
     <w:abstractNumId w:val="2"/>
+  </w:num>
+  <w:num w:numId="51" w16cid:durableId="160396701">
+    <w:abstractNumId w:val="31"/>
+  </w:num>
+  <w:num w:numId="52" w16cid:durableId="2145923782">
+    <w:abstractNumId w:val="13"/>
+  </w:num>
+  <w:num w:numId="53" w16cid:durableId="1952855945">
+    <w:abstractNumId w:val="9"/>
   </w:num>
 </w:numbering>
 </file>
@@ -23518,7 +23344,6 @@
   <w:style w:type="character" w:default="1" w:styleId="DefaultParagraphFont">
     <w:name w:val="Default Paragraph Font"/>
     <w:uiPriority w:val="1"/>
-    <w:semiHidden/>
     <w:unhideWhenUsed/>
   </w:style>
   <w:style w:type="table" w:default="1" w:styleId="TableNormal">

</xml_diff>

<commit_message>
Added ExtractLabels console app
</commit_message>
<xml_diff>
--- a/docs/Development.docx
+++ b/docs/Development.docx
@@ -186,8 +186,13 @@
         <w:t xml:space="preserve"> I</w:t>
       </w:r>
       <w:r>
-        <w:t xml:space="preserve"> wouuld</w:t>
-      </w:r>
+        <w:t xml:space="preserve"> </w:t>
+      </w:r>
+      <w:proofErr w:type="spellStart"/>
+      <w:r>
+        <w:t>wouuld</w:t>
+      </w:r>
+      <w:proofErr w:type="spellEnd"/>
       <w:r>
         <w:t xml:space="preserve"> also like to identify </w:t>
       </w:r>
@@ -518,6 +523,7 @@
       <w:r>
         <w:t xml:space="preserve">, </w:t>
       </w:r>
+      <w:proofErr w:type="spellStart"/>
       <w:r>
         <w:rPr>
           <w:b/>
@@ -525,6 +531,7 @@
         </w:rPr>
         <w:t>BeebPerf</w:t>
       </w:r>
+      <w:proofErr w:type="spellEnd"/>
       <w:r>
         <w:t xml:space="preserve">, </w:t>
       </w:r>
@@ -720,6 +727,7 @@
       <w:r>
         <w:t xml:space="preserve"> is modified to generate a .perf file, which </w:t>
       </w:r>
+      <w:proofErr w:type="spellStart"/>
       <w:r>
         <w:rPr>
           <w:b/>
@@ -727,6 +735,7 @@
         </w:rPr>
         <w:t>BeebPerf</w:t>
       </w:r>
+      <w:proofErr w:type="spellEnd"/>
       <w:r>
         <w:t xml:space="preserve"> </w:t>
       </w:r>
@@ -745,8 +754,13 @@
         <w:t xml:space="preserve">role decoupling </w:t>
       </w:r>
       <w:r>
-        <w:t>BeebEm from BeebPerf</w:t>
-      </w:r>
+        <w:t xml:space="preserve">BeebEm from </w:t>
+      </w:r>
+      <w:proofErr w:type="spellStart"/>
+      <w:r>
+        <w:t>BeebPerf</w:t>
+      </w:r>
+      <w:proofErr w:type="spellEnd"/>
       <w:r>
         <w:t>.</w:t>
       </w:r>
@@ -861,8 +875,17 @@
           <w:b/>
           <w:bCs/>
         </w:rPr>
-        <w:t>.pref</w:t>
-      </w:r>
+        <w:t>.</w:t>
+      </w:r>
+      <w:proofErr w:type="spellStart"/>
+      <w:r>
+        <w:rPr>
+          <w:b/>
+          <w:bCs/>
+        </w:rPr>
+        <w:t>pref</w:t>
+      </w:r>
+      <w:proofErr w:type="spellEnd"/>
       <w:r>
         <w:t xml:space="preserve"> file contains sufficient information </w:t>
       </w:r>
@@ -1000,6 +1023,7 @@
         </w:rPr>
         <w:t>&lt;</w:t>
       </w:r>
+      <w:proofErr w:type="spellStart"/>
       <w:r>
         <w:rPr>
           <w:b/>
@@ -1014,6 +1038,7 @@
         </w:rPr>
         <w:t>chunk</w:t>
       </w:r>
+      <w:proofErr w:type="spellEnd"/>
       <w:r>
         <w:rPr>
           <w:b/>
@@ -1031,6 +1056,7 @@
         </w:rPr>
         <w:t>&lt;</w:t>
       </w:r>
+      <w:proofErr w:type="spellStart"/>
       <w:r>
         <w:rPr>
           <w:b/>
@@ -1052,6 +1078,7 @@
         </w:rPr>
         <w:t>_chunk</w:t>
       </w:r>
+      <w:proofErr w:type="spellEnd"/>
       <w:r>
         <w:rPr>
           <w:b/>
@@ -1080,12 +1107,21 @@
         </w:rPr>
         <w:t>&lt;</w:t>
       </w:r>
-      <w:r>
-        <w:rPr>
-          <w:b/>
-          <w:bCs/>
-        </w:rPr>
-        <w:t>snapshot_chunk&gt;</w:t>
+      <w:proofErr w:type="spellStart"/>
+      <w:r>
+        <w:rPr>
+          <w:b/>
+          <w:bCs/>
+        </w:rPr>
+        <w:t>snapshot_chunk</w:t>
+      </w:r>
+      <w:proofErr w:type="spellEnd"/>
+      <w:r>
+        <w:rPr>
+          <w:b/>
+          <w:bCs/>
+        </w:rPr>
+        <w:t>&gt;</w:t>
       </w:r>
       <w:r>
         <w:t xml:space="preserve"> +</w:t>
@@ -1100,6 +1136,7 @@
         </w:rPr>
         <w:t>&lt;</w:t>
       </w:r>
+      <w:proofErr w:type="spellStart"/>
       <w:r>
         <w:rPr>
           <w:b/>
@@ -1107,6 +1144,7 @@
         </w:rPr>
         <w:t>execution_chunk</w:t>
       </w:r>
+      <w:proofErr w:type="spellEnd"/>
       <w:r>
         <w:rPr>
           <w:b/>
@@ -1322,6 +1360,7 @@
         </w:rPr>
         <w:t>&lt;</w:t>
       </w:r>
+      <w:proofErr w:type="spellStart"/>
       <w:r>
         <w:rPr>
           <w:b/>
@@ -1334,7 +1373,15 @@
           <w:b/>
           <w:bCs/>
         </w:rPr>
-        <w:t>header&gt;</w:t>
+        <w:t>header</w:t>
+      </w:r>
+      <w:proofErr w:type="spellEnd"/>
+      <w:r>
+        <w:rPr>
+          <w:b/>
+          <w:bCs/>
+        </w:rPr>
+        <w:t>&gt;</w:t>
       </w:r>
       <w:r>
         <w:t xml:space="preserve"> = </w:t>
@@ -1345,11 +1392,24 @@
       <w:r>
         <w:t>&lt;tag&gt; + &lt;compression&gt; + &lt;</w:t>
       </w:r>
+      <w:proofErr w:type="spellStart"/>
       <w:r>
         <w:t>original_</w:t>
       </w:r>
       <w:r>
-        <w:t>size&gt; + &lt;compressed_size&gt;</w:t>
+        <w:t>size</w:t>
+      </w:r>
+      <w:proofErr w:type="spellEnd"/>
+      <w:r>
+        <w:t>&gt; + &lt;</w:t>
+      </w:r>
+      <w:proofErr w:type="spellStart"/>
+      <w:r>
+        <w:t>compressed_size</w:t>
+      </w:r>
+      <w:proofErr w:type="spellEnd"/>
+      <w:r>
+        <w:t>&gt;</w:t>
       </w:r>
     </w:p>
     <w:p>
@@ -1483,7 +1543,23 @@
                 <w:rFonts w:ascii="Aptos" w:hAnsi="Aptos"/>
                 <w:color w:val="000000"/>
               </w:rPr>
-              <w:t>‘PFhd’</w:t>
+              <w:t>‘</w:t>
+            </w:r>
+            <w:proofErr w:type="spellStart"/>
+            <w:r>
+              <w:rPr>
+                <w:rFonts w:ascii="Aptos" w:hAnsi="Aptos"/>
+                <w:color w:val="000000"/>
+              </w:rPr>
+              <w:t>PFhd</w:t>
+            </w:r>
+            <w:proofErr w:type="spellEnd"/>
+            <w:r>
+              <w:rPr>
+                <w:rFonts w:ascii="Aptos" w:hAnsi="Aptos"/>
+                <w:color w:val="000000"/>
+              </w:rPr>
+              <w:t>’</w:t>
             </w:r>
           </w:p>
         </w:tc>
@@ -1503,7 +1579,23 @@
                 <w:rFonts w:ascii="Aptos" w:hAnsi="Aptos"/>
                 <w:color w:val="000000"/>
               </w:rPr>
-              <w:t>&lt;header_chunk&gt;</w:t>
+              <w:t>&lt;</w:t>
+            </w:r>
+            <w:proofErr w:type="spellStart"/>
+            <w:r>
+              <w:rPr>
+                <w:rFonts w:ascii="Aptos" w:hAnsi="Aptos"/>
+                <w:color w:val="000000"/>
+              </w:rPr>
+              <w:t>header_chunk</w:t>
+            </w:r>
+            <w:proofErr w:type="spellEnd"/>
+            <w:r>
+              <w:rPr>
+                <w:rFonts w:ascii="Aptos" w:hAnsi="Aptos"/>
+                <w:color w:val="000000"/>
+              </w:rPr>
+              <w:t>&gt;</w:t>
             </w:r>
           </w:p>
         </w:tc>
@@ -1525,7 +1617,23 @@
                 <w:rFonts w:ascii="Aptos" w:hAnsi="Aptos"/>
                 <w:color w:val="000000"/>
               </w:rPr>
-              <w:t>‘PFlb’</w:t>
+              <w:t>‘</w:t>
+            </w:r>
+            <w:proofErr w:type="spellStart"/>
+            <w:r>
+              <w:rPr>
+                <w:rFonts w:ascii="Aptos" w:hAnsi="Aptos"/>
+                <w:color w:val="000000"/>
+              </w:rPr>
+              <w:t>PFlb</w:t>
+            </w:r>
+            <w:proofErr w:type="spellEnd"/>
+            <w:r>
+              <w:rPr>
+                <w:rFonts w:ascii="Aptos" w:hAnsi="Aptos"/>
+                <w:color w:val="000000"/>
+              </w:rPr>
+              <w:t>’</w:t>
             </w:r>
           </w:p>
         </w:tc>
@@ -1541,7 +1649,15 @@
               </w:rPr>
             </w:pPr>
             <w:r>
-              <w:t>&lt;labels_chunk&gt;</w:t>
+              <w:t>&lt;</w:t>
+            </w:r>
+            <w:proofErr w:type="spellStart"/>
+            <w:r>
+              <w:t>labels_chunk</w:t>
+            </w:r>
+            <w:proofErr w:type="spellEnd"/>
+            <w:r>
+              <w:t>&gt;</w:t>
             </w:r>
           </w:p>
         </w:tc>
@@ -1563,7 +1679,23 @@
                 <w:rFonts w:ascii="Aptos" w:hAnsi="Aptos"/>
                 <w:color w:val="000000"/>
               </w:rPr>
-              <w:t>‘PFss’</w:t>
+              <w:t>‘</w:t>
+            </w:r>
+            <w:proofErr w:type="spellStart"/>
+            <w:r>
+              <w:rPr>
+                <w:rFonts w:ascii="Aptos" w:hAnsi="Aptos"/>
+                <w:color w:val="000000"/>
+              </w:rPr>
+              <w:t>PFss</w:t>
+            </w:r>
+            <w:proofErr w:type="spellEnd"/>
+            <w:r>
+              <w:rPr>
+                <w:rFonts w:ascii="Aptos" w:hAnsi="Aptos"/>
+                <w:color w:val="000000"/>
+              </w:rPr>
+              <w:t>’</w:t>
             </w:r>
           </w:p>
         </w:tc>
@@ -1579,7 +1711,15 @@
               </w:rPr>
             </w:pPr>
             <w:r>
-              <w:t>&lt;snapshot_chunk&gt;</w:t>
+              <w:t>&lt;</w:t>
+            </w:r>
+            <w:proofErr w:type="spellStart"/>
+            <w:r>
+              <w:t>snapshot_chunk</w:t>
+            </w:r>
+            <w:proofErr w:type="spellEnd"/>
+            <w:r>
+              <w:t>&gt;</w:t>
             </w:r>
           </w:p>
         </w:tc>
@@ -1601,7 +1741,23 @@
                 <w:rFonts w:ascii="Aptos" w:hAnsi="Aptos"/>
                 <w:color w:val="000000"/>
               </w:rPr>
-              <w:t>‘PFex’</w:t>
+              <w:t>‘</w:t>
+            </w:r>
+            <w:proofErr w:type="spellStart"/>
+            <w:r>
+              <w:rPr>
+                <w:rFonts w:ascii="Aptos" w:hAnsi="Aptos"/>
+                <w:color w:val="000000"/>
+              </w:rPr>
+              <w:t>PFex</w:t>
+            </w:r>
+            <w:proofErr w:type="spellEnd"/>
+            <w:r>
+              <w:rPr>
+                <w:rFonts w:ascii="Aptos" w:hAnsi="Aptos"/>
+                <w:color w:val="000000"/>
+              </w:rPr>
+              <w:t>’</w:t>
             </w:r>
           </w:p>
         </w:tc>
@@ -1617,7 +1773,15 @@
               </w:rPr>
             </w:pPr>
             <w:r>
-              <w:t>&lt;execution_chunk&gt;</w:t>
+              <w:t>&lt;</w:t>
+            </w:r>
+            <w:proofErr w:type="spellStart"/>
+            <w:r>
+              <w:t>execution_chunk</w:t>
+            </w:r>
+            <w:proofErr w:type="spellEnd"/>
+            <w:r>
+              <w:t>&gt;</w:t>
             </w:r>
           </w:p>
         </w:tc>
@@ -1789,8 +1953,13 @@
             <w:tcW w:w="3240" w:type="dxa"/>
           </w:tcPr>
           <w:p>
+            <w:proofErr w:type="spellStart"/>
             <w:r>
-              <w:t>zlib 1.3.1 (default algorithm)</w:t>
+              <w:t>zlib</w:t>
+            </w:r>
+            <w:proofErr w:type="spellEnd"/>
+            <w:r>
+              <w:t xml:space="preserve"> 1.3.1 (default algorithm)</w:t>
             </w:r>
           </w:p>
         </w:tc>
@@ -1806,6 +1975,7 @@
       <w:r>
         <w:t>&lt;</w:t>
       </w:r>
+      <w:proofErr w:type="spellStart"/>
       <w:r>
         <w:t>original</w:t>
       </w:r>
@@ -1815,6 +1985,7 @@
       <w:r>
         <w:t>size</w:t>
       </w:r>
+      <w:proofErr w:type="spellEnd"/>
       <w:r>
         <w:t>&gt;</w:t>
       </w:r>
@@ -1851,11 +2022,16 @@
         <w:ind w:left="360"/>
       </w:pPr>
       <w:r>
-        <w:t>&lt;compressed_</w:t>
+        <w:t>&lt;</w:t>
+      </w:r>
+      <w:proofErr w:type="spellStart"/>
+      <w:r>
+        <w:t>compressed_</w:t>
       </w:r>
       <w:r>
         <w:t>size</w:t>
       </w:r>
+      <w:proofErr w:type="spellEnd"/>
       <w:r>
         <w:t>&gt;</w:t>
       </w:r>
@@ -1883,11 +2059,16 @@
       <w:r>
         <w:t>matches &lt;</w:t>
       </w:r>
+      <w:proofErr w:type="spellStart"/>
       <w:r>
         <w:t>original</w:t>
       </w:r>
       <w:r>
-        <w:t>_size&gt;</w:t>
+        <w:t>_size</w:t>
+      </w:r>
+      <w:proofErr w:type="spellEnd"/>
+      <w:r>
+        <w:t>&gt;</w:t>
       </w:r>
       <w:r>
         <w:t>.</w:t>
@@ -1968,6 +2149,7 @@
         </w:rPr>
         <w:t>&lt;</w:t>
       </w:r>
+      <w:proofErr w:type="spellStart"/>
       <w:r>
         <w:rPr>
           <w:b/>
@@ -1980,14 +2162,27 @@
           <w:b/>
           <w:bCs/>
         </w:rPr>
-        <w:t>_chunk&gt;</w:t>
+        <w:t>_chunk</w:t>
+      </w:r>
+      <w:proofErr w:type="spellEnd"/>
+      <w:r>
+        <w:rPr>
+          <w:b/>
+          <w:bCs/>
+        </w:rPr>
+        <w:t>&gt;</w:t>
       </w:r>
       <w:r>
         <w:t xml:space="preserve"> = </w:t>
       </w:r>
       <w:r>
-        <w:t>&lt;common_header</w:t>
-      </w:r>
+        <w:t>&lt;</w:t>
+      </w:r>
+      <w:proofErr w:type="spellStart"/>
+      <w:r>
+        <w:t>common_header</w:t>
+      </w:r>
+      <w:proofErr w:type="spellEnd"/>
       <w:r>
         <w:t>(</w:t>
       </w:r>
@@ -1998,6 +2193,7 @@
         </w:rPr>
         <w:t>‘</w:t>
       </w:r>
+      <w:proofErr w:type="spellStart"/>
       <w:r>
         <w:rPr>
           <w:rFonts w:ascii="Aptos" w:hAnsi="Aptos"/>
@@ -2005,7 +2201,17 @@
           <w:bCs/>
           <w:color w:val="000000"/>
         </w:rPr>
-        <w:t>PFhd’</w:t>
+        <w:t>PFhd</w:t>
+      </w:r>
+      <w:proofErr w:type="spellEnd"/>
+      <w:r>
+        <w:rPr>
+          <w:rFonts w:ascii="Aptos" w:hAnsi="Aptos"/>
+          <w:b/>
+          <w:bCs/>
+          <w:color w:val="000000"/>
+        </w:rPr>
+        <w:t>’</w:t>
       </w:r>
       <w:r>
         <w:rPr>
@@ -2021,7 +2227,15 @@
         <w:t xml:space="preserve"> + </w:t>
       </w:r>
       <w:r>
-        <w:t>&lt;header_data&gt;</w:t>
+        <w:t>&lt;</w:t>
+      </w:r>
+      <w:proofErr w:type="spellStart"/>
+      <w:r>
+        <w:t>header_data</w:t>
+      </w:r>
+      <w:proofErr w:type="spellEnd"/>
+      <w:r>
+        <w:t>&gt;</w:t>
       </w:r>
       <w:r>
         <w:t xml:space="preserve"> wher</w:t>
@@ -2035,19 +2249,56 @@
         <w:ind w:left="720" w:hanging="360"/>
       </w:pPr>
       <w:r>
-        <w:t xml:space="preserve">&lt;header_data&gt; = </w:t>
+        <w:t>&lt;</w:t>
+      </w:r>
+      <w:proofErr w:type="spellStart"/>
+      <w:r>
+        <w:t>header_data</w:t>
+      </w:r>
+      <w:proofErr w:type="spellEnd"/>
+      <w:r>
+        <w:t xml:space="preserve">&gt; = </w:t>
       </w:r>
       <w:r>
         <w:br/>
       </w:r>
       <w:r>
-        <w:t>&lt;major_version&gt; + &lt;minor_version&gt; + &lt;bbc_model&gt; + &lt;</w:t>
-      </w:r>
+        <w:t>&lt;</w:t>
+      </w:r>
+      <w:proofErr w:type="spellStart"/>
+      <w:r>
+        <w:t>major_version</w:t>
+      </w:r>
+      <w:proofErr w:type="spellEnd"/>
+      <w:r>
+        <w:t>&gt; + &lt;</w:t>
+      </w:r>
+      <w:proofErr w:type="spellStart"/>
+      <w:r>
+        <w:t>minor_version</w:t>
+      </w:r>
+      <w:proofErr w:type="spellEnd"/>
+      <w:r>
+        <w:t>&gt; + &lt;</w:t>
+      </w:r>
+      <w:proofErr w:type="spellStart"/>
+      <w:r>
+        <w:t>bbc_model</w:t>
+      </w:r>
+      <w:proofErr w:type="spellEnd"/>
+      <w:r>
+        <w:t>&gt; + &lt;</w:t>
+      </w:r>
+      <w:proofErr w:type="spellStart"/>
       <w:r>
         <w:t>total_</w:t>
       </w:r>
       <w:r>
-        <w:t>execution_count&gt;</w:t>
+        <w:t>execution_count</w:t>
+      </w:r>
+      <w:proofErr w:type="spellEnd"/>
+      <w:r>
+        <w:t>&gt;</w:t>
       </w:r>
     </w:p>
     <w:p>
@@ -2057,11 +2308,16 @@
       <w:r>
         <w:t>&lt;</w:t>
       </w:r>
+      <w:proofErr w:type="spellStart"/>
       <w:r>
         <w:t>major_</w:t>
       </w:r>
       <w:r>
-        <w:t>version&gt;</w:t>
+        <w:t>version</w:t>
+      </w:r>
+      <w:proofErr w:type="spellEnd"/>
+      <w:r>
+        <w:t>&gt;</w:t>
       </w:r>
       <w:r>
         <w:t xml:space="preserve"> </w:t>
@@ -2080,11 +2336,16 @@
       <w:r>
         <w:t>&lt;</w:t>
       </w:r>
+      <w:proofErr w:type="spellStart"/>
       <w:r>
         <w:t>minor</w:t>
       </w:r>
       <w:r>
-        <w:t>_version&gt; (1 byte) Minor version number</w:t>
+        <w:t>_version</w:t>
+      </w:r>
+      <w:proofErr w:type="spellEnd"/>
+      <w:r>
+        <w:t>&gt; (1 byte) Minor version number</w:t>
       </w:r>
       <w:r>
         <w:t>.  Value is 0</w:t>
@@ -2098,7 +2359,15 @@
         <w:ind w:left="360"/>
       </w:pPr>
       <w:r>
-        <w:t>&lt;bbc_model&gt; (1 byte) The BBC model</w:t>
+        <w:t>&lt;</w:t>
+      </w:r>
+      <w:proofErr w:type="spellStart"/>
+      <w:r>
+        <w:t>bbc_model</w:t>
+      </w:r>
+      <w:proofErr w:type="spellEnd"/>
+      <w:r>
+        <w:t>&gt; (1 byte) The BBC model</w:t>
       </w:r>
     </w:p>
     <w:tbl>
@@ -2526,6 +2795,7 @@
       <w:r>
         <w:t>&lt;</w:t>
       </w:r>
+      <w:proofErr w:type="spellStart"/>
       <w:r>
         <w:t>total_</w:t>
       </w:r>
@@ -2536,7 +2806,11 @@
         <w:t>_</w:t>
       </w:r>
       <w:r>
-        <w:t xml:space="preserve">count&gt; (4 bytes) The total number of </w:t>
+        <w:t>count</w:t>
+      </w:r>
+      <w:proofErr w:type="spellEnd"/>
+      <w:r>
+        <w:t xml:space="preserve">&gt; (4 bytes) The total number of </w:t>
       </w:r>
       <w:r>
         <w:t xml:space="preserve">executed </w:t>
@@ -2613,14 +2887,35 @@
           <w:b/>
           <w:bCs/>
         </w:rPr>
-        <w:t>&lt;labels_chunk&gt;</w:t>
+        <w:t>&lt;</w:t>
+      </w:r>
+      <w:proofErr w:type="spellStart"/>
+      <w:r>
+        <w:rPr>
+          <w:b/>
+          <w:bCs/>
+        </w:rPr>
+        <w:t>labels_chunk</w:t>
+      </w:r>
+      <w:proofErr w:type="spellEnd"/>
+      <w:r>
+        <w:rPr>
+          <w:b/>
+          <w:bCs/>
+        </w:rPr>
+        <w:t>&gt;</w:t>
       </w:r>
       <w:r>
         <w:t xml:space="preserve"> = </w:t>
       </w:r>
       <w:r>
-        <w:t>&lt;common_heade</w:t>
-      </w:r>
+        <w:t>&lt;</w:t>
+      </w:r>
+      <w:proofErr w:type="spellStart"/>
+      <w:r>
+        <w:t>common_heade</w:t>
+      </w:r>
+      <w:proofErr w:type="spellEnd"/>
       <w:r>
         <w:t>(</w:t>
       </w:r>
@@ -2631,6 +2926,7 @@
         </w:rPr>
         <w:t>‘</w:t>
       </w:r>
+      <w:proofErr w:type="spellStart"/>
       <w:r>
         <w:rPr>
           <w:rFonts w:ascii="Aptos" w:hAnsi="Aptos"/>
@@ -2640,6 +2936,7 @@
         </w:rPr>
         <w:t>PFlb</w:t>
       </w:r>
+      <w:proofErr w:type="spellEnd"/>
       <w:r>
         <w:t>’</w:t>
       </w:r>
@@ -2650,11 +2947,16 @@
         <w:t xml:space="preserve">&gt; </w:t>
       </w:r>
       <w:r>
-        <w:t>+ &lt;label</w:t>
+        <w:t>+ &lt;</w:t>
+      </w:r>
+      <w:proofErr w:type="spellStart"/>
+      <w:r>
+        <w:t>label</w:t>
       </w:r>
       <w:r>
         <w:t>_data</w:t>
       </w:r>
+      <w:proofErr w:type="spellEnd"/>
       <w:r>
         <w:t>&gt;</w:t>
       </w:r>
@@ -2669,6 +2971,7 @@
       <w:r>
         <w:t>&lt;</w:t>
       </w:r>
+      <w:proofErr w:type="spellStart"/>
       <w:r>
         <w:rPr>
           <w:b/>
@@ -2676,6 +2979,7 @@
         </w:rPr>
         <w:t>label_data</w:t>
       </w:r>
+      <w:proofErr w:type="spellEnd"/>
       <w:r>
         <w:t xml:space="preserve">&gt; = </w:t>
       </w:r>
@@ -2698,7 +3002,23 @@
       </w:r>
       <w:bookmarkEnd w:id="0"/>
       <w:r>
-        <w:t>&lt;label_address&gt; + &lt;label_name&gt;</w:t>
+        <w:t>&lt;</w:t>
+      </w:r>
+      <w:proofErr w:type="spellStart"/>
+      <w:r>
+        <w:t>label_address</w:t>
+      </w:r>
+      <w:proofErr w:type="spellEnd"/>
+      <w:r>
+        <w:t>&gt; + &lt;</w:t>
+      </w:r>
+      <w:proofErr w:type="spellStart"/>
+      <w:r>
+        <w:t>label_name</w:t>
+      </w:r>
+      <w:proofErr w:type="spellEnd"/>
+      <w:r>
+        <w:t>&gt;</w:t>
       </w:r>
       <w:r>
         <w:t xml:space="preserve"> </w:t>
@@ -2709,7 +3029,15 @@
         <w:ind w:left="810"/>
       </w:pPr>
       <w:r>
-        <w:t xml:space="preserve">&lt;label_address&gt; (2 bytes) </w:t>
+        <w:t>&lt;</w:t>
+      </w:r>
+      <w:proofErr w:type="spellStart"/>
+      <w:r>
+        <w:t>label_address</w:t>
+      </w:r>
+      <w:proofErr w:type="spellEnd"/>
+      <w:r>
+        <w:t xml:space="preserve">&gt; (2 bytes) </w:t>
       </w:r>
       <w:r>
         <w:t xml:space="preserve">A </w:t>
@@ -2816,6 +3144,7 @@
         </w:rPr>
         <w:t>&lt;</w:t>
       </w:r>
+      <w:proofErr w:type="spellStart"/>
       <w:r>
         <w:rPr>
           <w:b/>
@@ -2828,7 +3157,15 @@
           <w:b/>
           <w:bCs/>
         </w:rPr>
-        <w:t>_chunk&gt;</w:t>
+        <w:t>_chunk</w:t>
+      </w:r>
+      <w:proofErr w:type="spellEnd"/>
+      <w:r>
+        <w:rPr>
+          <w:b/>
+          <w:bCs/>
+        </w:rPr>
+        <w:t>&gt;</w:t>
       </w:r>
       <w:r>
         <w:rPr>
@@ -2838,11 +3175,16 @@
         <w:t xml:space="preserve"> </w:t>
       </w:r>
       <w:r>
-        <w:t>= &lt;common_</w:t>
+        <w:t>= &lt;</w:t>
+      </w:r>
+      <w:proofErr w:type="spellStart"/>
+      <w:r>
+        <w:t>common_</w:t>
       </w:r>
       <w:r>
         <w:t>header</w:t>
       </w:r>
+      <w:proofErr w:type="spellEnd"/>
       <w:r>
         <w:t>(</w:t>
       </w:r>
@@ -2853,6 +3195,7 @@
         </w:rPr>
         <w:t>‘</w:t>
       </w:r>
+      <w:proofErr w:type="spellStart"/>
       <w:r>
         <w:rPr>
           <w:rFonts w:ascii="Aptos" w:hAnsi="Aptos"/>
@@ -2860,7 +3203,17 @@
           <w:bCs/>
           <w:color w:val="000000"/>
         </w:rPr>
-        <w:t>PFss’</w:t>
+        <w:t>PFss</w:t>
+      </w:r>
+      <w:proofErr w:type="spellEnd"/>
+      <w:r>
+        <w:rPr>
+          <w:rFonts w:ascii="Aptos" w:hAnsi="Aptos"/>
+          <w:b/>
+          <w:bCs/>
+          <w:color w:val="000000"/>
+        </w:rPr>
+        <w:t>’</w:t>
       </w:r>
       <w:r>
         <w:rPr>
@@ -2880,7 +3233,15 @@
         <w:t xml:space="preserve"> </w:t>
       </w:r>
       <w:r>
-        <w:t>&lt;snapshot_data&gt;</w:t>
+        <w:t>&lt;</w:t>
+      </w:r>
+      <w:proofErr w:type="spellStart"/>
+      <w:r>
+        <w:t>snapshot_data</w:t>
+      </w:r>
+      <w:proofErr w:type="spellEnd"/>
+      <w:r>
+        <w:t>&gt;</w:t>
       </w:r>
       <w:r>
         <w:t xml:space="preserve"> where</w:t>
@@ -2893,6 +3254,7 @@
       <w:r>
         <w:t>&lt;</w:t>
       </w:r>
+      <w:proofErr w:type="spellStart"/>
       <w:r>
         <w:rPr>
           <w:b/>
@@ -2900,6 +3262,7 @@
         </w:rPr>
         <w:t>snapshot_data</w:t>
       </w:r>
+      <w:proofErr w:type="spellEnd"/>
       <w:r>
         <w:t>&gt; =</w:t>
       </w:r>
@@ -2907,44 +3270,81 @@
         <w:br/>
       </w:r>
       <w:r>
-        <w:t>&lt;program</w:t>
+        <w:t>&lt;</w:t>
+      </w:r>
+      <w:proofErr w:type="spellStart"/>
+      <w:r>
+        <w:t>program</w:t>
       </w:r>
       <w:r>
         <w:t>_</w:t>
       </w:r>
       <w:r>
-        <w:t xml:space="preserve">counter&gt; + </w:t>
-      </w:r>
-      <w:r>
-        <w:t>&lt;accumulator&gt; + &lt;x</w:t>
+        <w:t>counter</w:t>
+      </w:r>
+      <w:proofErr w:type="spellEnd"/>
+      <w:r>
+        <w:t xml:space="preserve">&gt; + </w:t>
+      </w:r>
+      <w:r>
+        <w:t>&lt;accumulator&gt; + &lt;</w:t>
+      </w:r>
+      <w:proofErr w:type="spellStart"/>
+      <w:r>
+        <w:t>x</w:t>
       </w:r>
       <w:r>
         <w:t>_</w:t>
       </w:r>
       <w:r>
-        <w:t>register&gt; + &lt;y</w:t>
+        <w:t>register</w:t>
+      </w:r>
+      <w:proofErr w:type="spellEnd"/>
+      <w:r>
+        <w:t>&gt; + &lt;</w:t>
+      </w:r>
+      <w:proofErr w:type="spellStart"/>
+      <w:r>
+        <w:t>y</w:t>
       </w:r>
       <w:r>
         <w:t>_</w:t>
       </w:r>
       <w:r>
-        <w:t>register&gt; + &lt;status</w:t>
+        <w:t>register</w:t>
+      </w:r>
+      <w:proofErr w:type="spellEnd"/>
+      <w:r>
+        <w:t>&gt; + &lt;</w:t>
+      </w:r>
+      <w:proofErr w:type="spellStart"/>
+      <w:r>
+        <w:t>status</w:t>
       </w:r>
       <w:r>
         <w:t>_</w:t>
       </w:r>
       <w:r>
-        <w:t>register&gt; +</w:t>
+        <w:t>register</w:t>
+      </w:r>
+      <w:proofErr w:type="spellEnd"/>
+      <w:r>
+        <w:t>&gt; +</w:t>
       </w:r>
       <w:r>
         <w:t xml:space="preserve"> </w:t>
       </w:r>
       <w:r>
-        <w:t>&lt;stack_</w:t>
+        <w:t>&lt;</w:t>
+      </w:r>
+      <w:proofErr w:type="spellStart"/>
+      <w:r>
+        <w:t>stack_</w:t>
       </w:r>
       <w:r>
         <w:t>pointer</w:t>
       </w:r>
+      <w:proofErr w:type="spellEnd"/>
       <w:r>
         <w:t xml:space="preserve">&gt; </w:t>
       </w:r>
@@ -2952,22 +3352,62 @@
         <w:t xml:space="preserve">+ </w:t>
       </w:r>
       <w:r>
-        <w:t xml:space="preserve">&lt;rom_paging_register&gt; + &lt;acccon&gt; </w:t>
-      </w:r>
-      <w:r>
-        <w:t xml:space="preserve">+ &lt;call_stack&gt; </w:t>
+        <w:t>&lt;</w:t>
+      </w:r>
+      <w:proofErr w:type="spellStart"/>
+      <w:r>
+        <w:t>rom_paging_register</w:t>
+      </w:r>
+      <w:proofErr w:type="spellEnd"/>
+      <w:r>
+        <w:t>&gt; + &lt;</w:t>
+      </w:r>
+      <w:proofErr w:type="spellStart"/>
+      <w:r>
+        <w:t>acccon</w:t>
+      </w:r>
+      <w:proofErr w:type="spellEnd"/>
+      <w:r>
+        <w:t xml:space="preserve">&gt; </w:t>
+      </w:r>
+      <w:r>
+        <w:t>+ &lt;</w:t>
+      </w:r>
+      <w:proofErr w:type="spellStart"/>
+      <w:r>
+        <w:t>call_stack</w:t>
+      </w:r>
+      <w:proofErr w:type="spellEnd"/>
+      <w:r>
+        <w:t xml:space="preserve">&gt; </w:t>
       </w:r>
       <w:r>
         <w:t xml:space="preserve">+ </w:t>
       </w:r>
       <w:r>
-        <w:t xml:space="preserve">&lt;screen_address&gt; + </w:t>
-      </w:r>
-      <w:r>
-        <w:t>&lt;hidden_ram_</w:t>
-      </w:r>
-      <w:r>
-        <w:t>address&gt;</w:t>
+        <w:t>&lt;</w:t>
+      </w:r>
+      <w:proofErr w:type="spellStart"/>
+      <w:r>
+        <w:t>screen_address</w:t>
+      </w:r>
+      <w:proofErr w:type="spellEnd"/>
+      <w:r>
+        <w:t xml:space="preserve">&gt; + </w:t>
+      </w:r>
+      <w:r>
+        <w:t>&lt;</w:t>
+      </w:r>
+      <w:proofErr w:type="spellStart"/>
+      <w:r>
+        <w:t>hidden_ram_</w:t>
+      </w:r>
+      <w:r>
+        <w:t>address</w:t>
+      </w:r>
+      <w:proofErr w:type="spellEnd"/>
+      <w:r>
+        <w:t>&gt;</w:t>
       </w:r>
       <w:r>
         <w:rPr>
@@ -2987,7 +3427,23 @@
         <w:t>_</w:t>
       </w:r>
       <w:r>
-        <w:t xml:space="preserve">registers&gt; + &lt;ULA_video_control_register&gt; + &lt;ULA_palette&gt; + </w:t>
+        <w:t>registers&gt; + &lt;</w:t>
+      </w:r>
+      <w:proofErr w:type="spellStart"/>
+      <w:r>
+        <w:t>ULA_video_control_register</w:t>
+      </w:r>
+      <w:proofErr w:type="spellEnd"/>
+      <w:r>
+        <w:t>&gt; + &lt;</w:t>
+      </w:r>
+      <w:proofErr w:type="spellStart"/>
+      <w:r>
+        <w:t>ULA_palette</w:t>
+      </w:r>
+      <w:proofErr w:type="spellEnd"/>
+      <w:r>
+        <w:t xml:space="preserve">&gt; + </w:t>
       </w:r>
       <w:r>
         <w:t>&lt;memory&gt;</w:t>
@@ -3020,13 +3476,21 @@
         <w:ind w:left="360"/>
       </w:pPr>
       <w:r>
-        <w:t>&lt;x</w:t>
+        <w:t>&lt;</w:t>
+      </w:r>
+      <w:proofErr w:type="spellStart"/>
+      <w:r>
+        <w:t>x</w:t>
       </w:r>
       <w:r>
         <w:t>_</w:t>
       </w:r>
       <w:r>
-        <w:t>register&gt; (1 byte).  The value of the X register.</w:t>
+        <w:t>register</w:t>
+      </w:r>
+      <w:proofErr w:type="spellEnd"/>
+      <w:r>
+        <w:t>&gt; (1 byte).  The value of the X register.</w:t>
       </w:r>
     </w:p>
     <w:p>
@@ -3034,13 +3498,21 @@
         <w:ind w:left="360"/>
       </w:pPr>
       <w:r>
-        <w:t>&lt;y</w:t>
+        <w:t>&lt;</w:t>
+      </w:r>
+      <w:proofErr w:type="spellStart"/>
+      <w:r>
+        <w:t>y</w:t>
       </w:r>
       <w:r>
         <w:t>_</w:t>
       </w:r>
       <w:r>
-        <w:t>register&gt; (1 byte).  The value of the Y register.</w:t>
+        <w:t>register</w:t>
+      </w:r>
+      <w:proofErr w:type="spellEnd"/>
+      <w:r>
+        <w:t>&gt; (1 byte).  The value of the Y register.</w:t>
       </w:r>
     </w:p>
     <w:p>
@@ -3048,13 +3520,21 @@
         <w:ind w:left="360"/>
       </w:pPr>
       <w:r>
-        <w:t>&lt;status</w:t>
+        <w:t>&lt;</w:t>
+      </w:r>
+      <w:proofErr w:type="spellStart"/>
+      <w:r>
+        <w:t>status</w:t>
       </w:r>
       <w:r>
         <w:t>_</w:t>
       </w:r>
       <w:r>
-        <w:t>register&gt; (1 byte).  The value of the status register.</w:t>
+        <w:t>register</w:t>
+      </w:r>
+      <w:proofErr w:type="spellEnd"/>
+      <w:r>
+        <w:t>&gt; (1 byte).  The value of the status register.</w:t>
       </w:r>
     </w:p>
     <w:p>
@@ -3062,11 +3542,16 @@
         <w:ind w:left="360"/>
       </w:pPr>
       <w:r>
-        <w:t>&lt;stack_</w:t>
+        <w:t>&lt;</w:t>
+      </w:r>
+      <w:proofErr w:type="spellStart"/>
+      <w:r>
+        <w:t>stack_</w:t>
       </w:r>
       <w:r>
         <w:t>pointer</w:t>
       </w:r>
+      <w:proofErr w:type="spellEnd"/>
       <w:r>
         <w:t xml:space="preserve">&gt; (1 byte).  The value of the stack </w:t>
       </w:r>
@@ -3087,6 +3572,7 @@
       <w:r>
         <w:t>&lt;</w:t>
       </w:r>
+      <w:proofErr w:type="spellStart"/>
       <w:r>
         <w:t>rom_</w:t>
       </w:r>
@@ -3099,6 +3585,7 @@
       <w:r>
         <w:t>_register</w:t>
       </w:r>
+      <w:proofErr w:type="spellEnd"/>
       <w:r>
         <w:t>&gt; (1 byte).</w:t>
       </w:r>
@@ -3134,9 +3621,11 @@
       <w:r>
         <w:t>&lt;</w:t>
       </w:r>
+      <w:proofErr w:type="spellStart"/>
       <w:r>
         <w:t>acccon</w:t>
       </w:r>
+      <w:proofErr w:type="spellEnd"/>
       <w:r>
         <w:t>&gt;</w:t>
       </w:r>
@@ -3172,7 +3661,31 @@
         </w:rPr>
       </w:pPr>
       <w:r>
-        <w:t>&lt;call_stack&gt; = &lt;stack_frame_count&gt; + &lt;stack_frame&gt;</w:t>
+        <w:t>&lt;</w:t>
+      </w:r>
+      <w:proofErr w:type="spellStart"/>
+      <w:r>
+        <w:t>call_stack</w:t>
+      </w:r>
+      <w:proofErr w:type="spellEnd"/>
+      <w:r>
+        <w:t>&gt; = &lt;</w:t>
+      </w:r>
+      <w:proofErr w:type="spellStart"/>
+      <w:r>
+        <w:t>stack_frame_count</w:t>
+      </w:r>
+      <w:proofErr w:type="spellEnd"/>
+      <w:r>
+        <w:t>&gt; + &lt;</w:t>
+      </w:r>
+      <w:proofErr w:type="spellStart"/>
+      <w:r>
+        <w:t>stack_frame</w:t>
+      </w:r>
+      <w:proofErr w:type="spellEnd"/>
+      <w:r>
+        <w:t>&gt;</w:t>
       </w:r>
       <w:r>
         <w:rPr>
@@ -3502,7 +4015,15 @@
         <w:ind w:left="720"/>
       </w:pPr>
       <w:r>
-        <w:t>&lt;stack_frame_count&gt; (1 byte) The number of stack frames.</w:t>
+        <w:t>&lt;</w:t>
+      </w:r>
+      <w:proofErr w:type="spellStart"/>
+      <w:r>
+        <w:t>stack_frame_count</w:t>
+      </w:r>
+      <w:proofErr w:type="spellEnd"/>
+      <w:r>
+        <w:t>&gt; (1 byte) The number of stack frames.</w:t>
       </w:r>
     </w:p>
     <w:p>
@@ -3510,41 +4031,85 @@
         <w:ind w:left="720"/>
       </w:pPr>
       <w:r>
-        <w:t xml:space="preserve">&lt;stack_frame&gt; = </w:t>
-      </w:r>
-      <w:r>
-        <w:t xml:space="preserve">&lt;stack_frame_type&gt; + </w:t>
-      </w:r>
-      <w:r>
-        <w:t xml:space="preserve">&lt;start_address_page&gt; + </w:t>
-      </w:r>
-      <w:r>
         <w:t>&lt;</w:t>
       </w:r>
+      <w:proofErr w:type="spellStart"/>
+      <w:r>
+        <w:t>stack_frame</w:t>
+      </w:r>
+      <w:proofErr w:type="spellEnd"/>
+      <w:r>
+        <w:t xml:space="preserve">&gt; = </w:t>
+      </w:r>
+      <w:r>
+        <w:t>&lt;</w:t>
+      </w:r>
+      <w:proofErr w:type="spellStart"/>
+      <w:r>
+        <w:t>stack_frame_type</w:t>
+      </w:r>
+      <w:proofErr w:type="spellEnd"/>
+      <w:r>
+        <w:t xml:space="preserve">&gt; + </w:t>
+      </w:r>
+      <w:r>
+        <w:t>&lt;</w:t>
+      </w:r>
+      <w:proofErr w:type="spellStart"/>
+      <w:r>
+        <w:t>start_address_page</w:t>
+      </w:r>
+      <w:proofErr w:type="spellEnd"/>
+      <w:r>
+        <w:t xml:space="preserve">&gt; + </w:t>
+      </w:r>
+      <w:r>
+        <w:t>&lt;</w:t>
+      </w:r>
+      <w:proofErr w:type="spellStart"/>
       <w:r>
         <w:t>start</w:t>
       </w:r>
       <w:r>
-        <w:t>_address&gt; + &lt;return_address</w:t>
+        <w:t>_address</w:t>
+      </w:r>
+      <w:proofErr w:type="spellEnd"/>
+      <w:r>
+        <w:t>&gt; + &lt;</w:t>
+      </w:r>
+      <w:proofErr w:type="spellStart"/>
+      <w:r>
+        <w:t>return_address</w:t>
       </w:r>
       <w:r>
         <w:t>_page</w:t>
       </w:r>
+      <w:proofErr w:type="spellEnd"/>
       <w:r>
         <w:t xml:space="preserve">&gt; + </w:t>
       </w:r>
       <w:r>
-        <w:t xml:space="preserve">&lt;return_address&gt; + </w:t>
-      </w:r>
-      <w:r>
         <w:t>&lt;</w:t>
       </w:r>
+      <w:proofErr w:type="spellStart"/>
+      <w:r>
+        <w:t>return_address</w:t>
+      </w:r>
+      <w:proofErr w:type="spellEnd"/>
+      <w:r>
+        <w:t xml:space="preserve">&gt; + </w:t>
+      </w:r>
+      <w:r>
+        <w:t>&lt;</w:t>
+      </w:r>
+      <w:proofErr w:type="spellStart"/>
       <w:r>
         <w:t>return_</w:t>
       </w:r>
       <w:r>
         <w:t>stack_pointer</w:t>
       </w:r>
+      <w:proofErr w:type="spellEnd"/>
       <w:r>
         <w:t>&gt;</w:t>
       </w:r>
@@ -3554,7 +4119,15 @@
         <w:ind w:left="1080"/>
       </w:pPr>
       <w:r>
-        <w:t>&lt;stack_frame_type&gt; (1 byte) The stack frame’s type.  The value can be one of the following:</w:t>
+        <w:t>&lt;</w:t>
+      </w:r>
+      <w:proofErr w:type="spellStart"/>
+      <w:r>
+        <w:t>stack_frame_type</w:t>
+      </w:r>
+      <w:proofErr w:type="spellEnd"/>
+      <w:r>
+        <w:t>&gt; (1 byte) The stack frame’s type.  The value can be one of the following:</w:t>
       </w:r>
     </w:p>
     <w:tbl>
@@ -3762,10 +4335,18 @@
         <w:ind w:left="1080"/>
       </w:pPr>
       <w:r>
-        <w:t>&lt;sta</w:t>
-      </w:r>
-      <w:r>
-        <w:t xml:space="preserve">rt_address_page (1 byte) </w:t>
+        <w:t>&lt;</w:t>
+      </w:r>
+      <w:proofErr w:type="spellStart"/>
+      <w:r>
+        <w:t>sta</w:t>
+      </w:r>
+      <w:r>
+        <w:t>rt_address_page</w:t>
+      </w:r>
+      <w:proofErr w:type="spellEnd"/>
+      <w:r>
+        <w:t xml:space="preserve"> (1 byte) </w:t>
       </w:r>
       <w:r>
         <w:t>The memory p</w:t>
@@ -4039,12 +4620,14 @@
         <w:lastRenderedPageBreak/>
         <w:t>&lt;</w:t>
       </w:r>
+      <w:proofErr w:type="spellStart"/>
       <w:r>
         <w:t>start</w:t>
       </w:r>
       <w:r>
         <w:t>_address</w:t>
       </w:r>
+      <w:proofErr w:type="spellEnd"/>
       <w:r>
         <w:t>&gt; (</w:t>
       </w:r>
@@ -4113,7 +4696,15 @@
         <w:ind w:left="1080"/>
       </w:pPr>
       <w:r>
-        <w:t xml:space="preserve">&lt;return_address_page (1 byte) The memory page where the </w:t>
+        <w:t>&lt;</w:t>
+      </w:r>
+      <w:proofErr w:type="spellStart"/>
+      <w:r>
+        <w:t>return_address_page</w:t>
+      </w:r>
+      <w:proofErr w:type="spellEnd"/>
+      <w:r>
+        <w:t xml:space="preserve"> (1 byte) The memory page where the </w:t>
       </w:r>
       <w:r>
         <w:t xml:space="preserve">return </w:t>
@@ -4139,7 +4730,15 @@
         <w:ind w:left="1080"/>
       </w:pPr>
       <w:r>
-        <w:t xml:space="preserve">&lt;return_address&gt; (2 bytes) </w:t>
+        <w:t>&lt;</w:t>
+      </w:r>
+      <w:proofErr w:type="spellStart"/>
+      <w:r>
+        <w:t>return_address</w:t>
+      </w:r>
+      <w:proofErr w:type="spellEnd"/>
+      <w:r>
+        <w:t xml:space="preserve">&gt; (2 bytes) </w:t>
       </w:r>
       <w:r>
         <w:t xml:space="preserve">Return address. </w:t>
@@ -4196,6 +4795,7 @@
       <w:r>
         <w:t>&lt;</w:t>
       </w:r>
+      <w:proofErr w:type="spellStart"/>
       <w:r>
         <w:t>return_</w:t>
       </w:r>
@@ -4208,6 +4808,7 @@
       <w:r>
         <w:t>pointer</w:t>
       </w:r>
+      <w:proofErr w:type="spellEnd"/>
       <w:r>
         <w:t xml:space="preserve">&gt; </w:t>
       </w:r>
@@ -4278,11 +4879,16 @@
       <w:r>
         <w:t>&lt;</w:t>
       </w:r>
+      <w:proofErr w:type="spellStart"/>
       <w:r>
         <w:t>screen</w:t>
       </w:r>
       <w:r>
-        <w:t xml:space="preserve">_address&gt; (1 byte).  </w:t>
+        <w:t>_address</w:t>
+      </w:r>
+      <w:proofErr w:type="spellEnd"/>
+      <w:r>
+        <w:t xml:space="preserve">&gt; (1 byte).  </w:t>
       </w:r>
       <w:r>
         <w:t xml:space="preserve">The value specifies </w:t>
@@ -4493,7 +5099,15 @@
         <w:ind w:left="360"/>
       </w:pPr>
       <w:r>
-        <w:t>&lt;hidden_ram_address&gt; (1 byte)</w:t>
+        <w:t>&lt;</w:t>
+      </w:r>
+      <w:proofErr w:type="spellStart"/>
+      <w:r>
+        <w:t>hidden_ram_address</w:t>
+      </w:r>
+      <w:proofErr w:type="spellEnd"/>
+      <w:r>
+        <w:t>&gt; (1 byte)</w:t>
       </w:r>
       <w:r>
         <w:t xml:space="preserve">.  Populated </w:t>
@@ -4594,7 +5208,15 @@
         <w:ind w:left="360"/>
       </w:pPr>
       <w:r>
-        <w:t>&lt;ULA_video_control_register&gt; (1 byte).  The value of the ULA video control register.</w:t>
+        <w:t>&lt;</w:t>
+      </w:r>
+      <w:proofErr w:type="spellStart"/>
+      <w:r>
+        <w:t>ULA_video_control_register</w:t>
+      </w:r>
+      <w:proofErr w:type="spellEnd"/>
+      <w:r>
+        <w:t>&gt; (1 byte).  The value of the ULA video control register.</w:t>
       </w:r>
     </w:p>
     <w:p>
@@ -4602,7 +5224,15 @@
         <w:ind w:left="360"/>
       </w:pPr>
       <w:r>
-        <w:t xml:space="preserve">&lt;ULA_palette&gt; (16 bytes).  The </w:t>
+        <w:t>&lt;</w:t>
+      </w:r>
+      <w:proofErr w:type="spellStart"/>
+      <w:r>
+        <w:t>ULA_palette</w:t>
+      </w:r>
+      <w:proofErr w:type="spellEnd"/>
+      <w:r>
+        <w:t xml:space="preserve">&gt; (16 bytes).  The </w:t>
       </w:r>
       <w:r>
         <w:t xml:space="preserve">ULA’s </w:t>
@@ -4617,7 +5247,15 @@
         <w:t>ries</w:t>
       </w:r>
       <w:r>
-        <w:t xml:space="preserve"> where physical colors are xor’d with 0x7.</w:t>
+        <w:t xml:space="preserve"> where physical colors are </w:t>
+      </w:r>
+      <w:proofErr w:type="spellStart"/>
+      <w:r>
+        <w:t>xor’d</w:t>
+      </w:r>
+      <w:proofErr w:type="spellEnd"/>
+      <w:r>
+        <w:t xml:space="preserve"> with 0x7.</w:t>
       </w:r>
     </w:p>
     <w:p>
@@ -4663,20 +5301,38 @@
       <w:r>
         <w:t>&lt;</w:t>
       </w:r>
+      <w:proofErr w:type="spellStart"/>
       <w:r>
         <w:t>base_</w:t>
       </w:r>
       <w:r>
-        <w:t>memory&gt; + &lt;paged_</w:t>
-      </w:r>
-      <w:r>
         <w:t>memory</w:t>
       </w:r>
+      <w:proofErr w:type="spellEnd"/>
+      <w:r>
+        <w:t>&gt; + &lt;</w:t>
+      </w:r>
+      <w:proofErr w:type="spellStart"/>
+      <w:r>
+        <w:t>paged_</w:t>
+      </w:r>
+      <w:r>
+        <w:t>memory</w:t>
+      </w:r>
+      <w:proofErr w:type="spellEnd"/>
       <w:r>
         <w:t xml:space="preserve">&gt; </w:t>
       </w:r>
       <w:r>
-        <w:t>+ &lt;shadow_ram&gt;</w:t>
+        <w:t>+ &lt;</w:t>
+      </w:r>
+      <w:proofErr w:type="spellStart"/>
+      <w:r>
+        <w:t>shadow_ram</w:t>
+      </w:r>
+      <w:proofErr w:type="spellEnd"/>
+      <w:r>
+        <w:t>&gt;</w:t>
       </w:r>
       <w:r>
         <w:rPr>
@@ -4690,7 +5346,15 @@
         <w:t xml:space="preserve"> + </w:t>
       </w:r>
       <w:r>
-        <w:t>&lt;mos_ram&gt;</w:t>
+        <w:t>&lt;</w:t>
+      </w:r>
+      <w:proofErr w:type="spellStart"/>
+      <w:r>
+        <w:t>mos_ram</w:t>
+      </w:r>
+      <w:proofErr w:type="spellEnd"/>
+      <w:r>
+        <w:t>&gt;</w:t>
       </w:r>
       <w:r>
         <w:rPr>
@@ -4712,7 +5376,15 @@
         <w:t xml:space="preserve"> + </w:t>
       </w:r>
       <w:r>
-        <w:t>&lt;filing_system_ram&gt;</w:t>
+        <w:t>&lt;</w:t>
+      </w:r>
+      <w:proofErr w:type="spellStart"/>
+      <w:r>
+        <w:t>filing_system_ram</w:t>
+      </w:r>
+      <w:proofErr w:type="spellEnd"/>
+      <w:r>
+        <w:t>&gt;</w:t>
       </w:r>
       <w:r>
         <w:rPr>
@@ -4726,7 +5398,15 @@
         <w:t xml:space="preserve"> +</w:t>
       </w:r>
       <w:r>
-        <w:t xml:space="preserve"> &lt;private_ram&gt;</w:t>
+        <w:t xml:space="preserve"> &lt;</w:t>
+      </w:r>
+      <w:proofErr w:type="spellStart"/>
+      <w:r>
+        <w:t>private_ram</w:t>
+      </w:r>
+      <w:proofErr w:type="spellEnd"/>
+      <w:r>
+        <w:t>&gt;</w:t>
       </w:r>
       <w:r>
         <w:rPr>
@@ -4737,7 +5417,15 @@
         <w:t>opt</w:t>
       </w:r>
       <w:r>
-        <w:t xml:space="preserve"> + &lt;hidden_ram&gt;</w:t>
+        <w:t xml:space="preserve"> + &lt;</w:t>
+      </w:r>
+      <w:proofErr w:type="spellStart"/>
+      <w:r>
+        <w:t>hidden_ram</w:t>
+      </w:r>
+      <w:proofErr w:type="spellEnd"/>
+      <w:r>
+        <w:t>&gt;</w:t>
       </w:r>
       <w:r>
         <w:rPr>
@@ -4920,7 +5608,15 @@
               <w:ind w:left="1440" w:hanging="1440"/>
             </w:pPr>
             <w:r>
-              <w:t>&lt;base_memory&gt;</w:t>
+              <w:t>&lt;</w:t>
+            </w:r>
+            <w:proofErr w:type="spellStart"/>
+            <w:r>
+              <w:t>base_memory</w:t>
+            </w:r>
+            <w:proofErr w:type="spellEnd"/>
+            <w:r>
+              <w:t>&gt;</w:t>
             </w:r>
           </w:p>
         </w:tc>
@@ -4993,8 +5689,13 @@
             <w:r>
               <w:t>&lt;</w:t>
             </w:r>
+            <w:proofErr w:type="spellStart"/>
             <w:r>
-              <w:t>paged_memory&gt;</w:t>
+              <w:t>paged_memory</w:t>
+            </w:r>
+            <w:proofErr w:type="spellEnd"/>
+            <w:r>
+              <w:t>&gt;</w:t>
             </w:r>
           </w:p>
         </w:tc>
@@ -5065,7 +5766,15 @@
           </w:tcPr>
           <w:p>
             <w:r>
-              <w:t>&lt;shadow_ram&gt;</w:t>
+              <w:t>&lt;</w:t>
+            </w:r>
+            <w:proofErr w:type="spellStart"/>
+            <w:r>
+              <w:t>shadow_ram</w:t>
+            </w:r>
+            <w:proofErr w:type="spellEnd"/>
+            <w:r>
+              <w:t>&gt;</w:t>
             </w:r>
           </w:p>
         </w:tc>
@@ -5129,7 +5838,15 @@
           </w:tcPr>
           <w:p>
             <w:r>
-              <w:t>&lt;mos_ram&gt;</w:t>
+              <w:t>&lt;</w:t>
+            </w:r>
+            <w:proofErr w:type="spellStart"/>
+            <w:r>
+              <w:t>mos_ram</w:t>
+            </w:r>
+            <w:proofErr w:type="spellEnd"/>
+            <w:r>
+              <w:t>&gt;</w:t>
             </w:r>
           </w:p>
         </w:tc>
@@ -5184,7 +5901,15 @@
           </w:tcPr>
           <w:p>
             <w:r>
-              <w:t>&lt;filing_system_ram&gt;</w:t>
+              <w:t>&lt;</w:t>
+            </w:r>
+            <w:proofErr w:type="spellStart"/>
+            <w:r>
+              <w:t>filing_system_ram</w:t>
+            </w:r>
+            <w:proofErr w:type="spellEnd"/>
+            <w:r>
+              <w:t>&gt;</w:t>
             </w:r>
           </w:p>
         </w:tc>
@@ -5239,7 +5964,15 @@
           </w:tcPr>
           <w:p>
             <w:r>
-              <w:t>&lt;private_ram&gt;</w:t>
+              <w:t>&lt;</w:t>
+            </w:r>
+            <w:proofErr w:type="spellStart"/>
+            <w:r>
+              <w:t>private_ram</w:t>
+            </w:r>
+            <w:proofErr w:type="spellEnd"/>
+            <w:r>
+              <w:t>&gt;</w:t>
             </w:r>
           </w:p>
         </w:tc>
@@ -5297,7 +6030,15 @@
           </w:tcPr>
           <w:p>
             <w:r>
-              <w:t>&lt;hidden_ram&gt;</w:t>
+              <w:t>&lt;</w:t>
+            </w:r>
+            <w:proofErr w:type="spellStart"/>
+            <w:r>
+              <w:t>hidden_ram</w:t>
+            </w:r>
+            <w:proofErr w:type="spellEnd"/>
+            <w:r>
+              <w:t>&gt;</w:t>
             </w:r>
           </w:p>
         </w:tc>
@@ -5356,11 +6097,16 @@
       <w:r>
         <w:t>&lt;</w:t>
       </w:r>
+      <w:proofErr w:type="spellStart"/>
       <w:r>
         <w:t>base_</w:t>
       </w:r>
       <w:r>
-        <w:t>memory&gt; (64K) The default 64K of memory.</w:t>
+        <w:t>memory</w:t>
+      </w:r>
+      <w:proofErr w:type="spellEnd"/>
+      <w:r>
+        <w:t>&gt; (64K) The default 64K of memory.</w:t>
       </w:r>
       <w:r>
         <w:t xml:space="preserve">  Addresses 0</w:t>
@@ -5379,23 +6125,38 @@
       <w:r>
         <w:t>&lt;</w:t>
       </w:r>
+      <w:proofErr w:type="spellStart"/>
       <w:r>
         <w:t>paged_</w:t>
       </w:r>
       <w:r>
         <w:t>memory</w:t>
       </w:r>
+      <w:proofErr w:type="spellEnd"/>
       <w:r>
         <w:t>&gt;</w:t>
       </w:r>
       <w:r>
-        <w:t xml:space="preserve"> = &lt;page_count&gt; + &lt;</w:t>
-      </w:r>
+        <w:t xml:space="preserve"> = &lt;</w:t>
+      </w:r>
+      <w:proofErr w:type="spellStart"/>
+      <w:r>
+        <w:t>page_count</w:t>
+      </w:r>
+      <w:proofErr w:type="spellEnd"/>
+      <w:r>
+        <w:t>&gt; + &lt;</w:t>
+      </w:r>
+      <w:proofErr w:type="spellStart"/>
       <w:r>
         <w:t>page_</w:t>
       </w:r>
       <w:r>
-        <w:t>data&gt;</w:t>
+        <w:t>data</w:t>
+      </w:r>
+      <w:proofErr w:type="spellEnd"/>
+      <w:r>
+        <w:t>&gt;</w:t>
       </w:r>
       <w:r>
         <w:rPr>
@@ -5422,7 +6183,15 @@
         <w:ind w:left="720"/>
       </w:pPr>
       <w:r>
-        <w:t>&lt;page_count&gt; (1 byte) The number of pages.</w:t>
+        <w:t>&lt;</w:t>
+      </w:r>
+      <w:proofErr w:type="spellStart"/>
+      <w:r>
+        <w:t>page_count</w:t>
+      </w:r>
+      <w:proofErr w:type="spellEnd"/>
+      <w:r>
+        <w:t>&gt; (1 byte) The number of pages.</w:t>
       </w:r>
     </w:p>
     <w:p>
@@ -5430,17 +6199,46 @@
         <w:ind w:left="720"/>
       </w:pPr>
       <w:r>
-        <w:t>&lt;page_data&gt; = &lt;page_ba</w:t>
+        <w:t>&lt;</w:t>
+      </w:r>
+      <w:proofErr w:type="spellStart"/>
+      <w:r>
+        <w:t>page_data</w:t>
+      </w:r>
+      <w:proofErr w:type="spellEnd"/>
+      <w:r>
+        <w:t>&gt; = &lt;</w:t>
+      </w:r>
+      <w:proofErr w:type="spellStart"/>
+      <w:r>
+        <w:t>page_ba</w:t>
       </w:r>
       <w:r>
         <w:t>n</w:t>
       </w:r>
       <w:r>
-        <w:t>k&gt; + &lt;page_readonly&gt; + &lt;page_memor</w:t>
+        <w:t>k</w:t>
+      </w:r>
+      <w:proofErr w:type="spellEnd"/>
+      <w:r>
+        <w:t>&gt; + &lt;</w:t>
+      </w:r>
+      <w:proofErr w:type="spellStart"/>
+      <w:r>
+        <w:t>page_readonly</w:t>
+      </w:r>
+      <w:proofErr w:type="spellEnd"/>
+      <w:r>
+        <w:t>&gt; + &lt;</w:t>
+      </w:r>
+      <w:proofErr w:type="spellStart"/>
+      <w:r>
+        <w:t>page_memor</w:t>
       </w:r>
       <w:r>
         <w:t>y</w:t>
       </w:r>
+      <w:proofErr w:type="spellEnd"/>
       <w:r>
         <w:t>&gt;</w:t>
       </w:r>
@@ -5450,11 +6248,16 @@
         <w:ind w:left="1080"/>
       </w:pPr>
       <w:r>
-        <w:t>&lt;page_</w:t>
+        <w:t>&lt;</w:t>
+      </w:r>
+      <w:proofErr w:type="spellStart"/>
+      <w:r>
+        <w:t>page_</w:t>
       </w:r>
       <w:r>
         <w:t>bank</w:t>
       </w:r>
+      <w:proofErr w:type="spellEnd"/>
       <w:r>
         <w:t xml:space="preserve">&gt; (1 byte) A page </w:t>
       </w:r>
@@ -5473,11 +6276,16 @@
         <w:ind w:left="1080"/>
       </w:pPr>
       <w:r>
-        <w:t>&lt;page_</w:t>
+        <w:t>&lt;</w:t>
+      </w:r>
+      <w:proofErr w:type="spellStart"/>
+      <w:r>
+        <w:t>page_</w:t>
       </w:r>
       <w:r>
         <w:t>readonly</w:t>
       </w:r>
+      <w:proofErr w:type="spellEnd"/>
       <w:r>
         <w:t xml:space="preserve">&gt; (1 byte) A page </w:t>
       </w:r>
@@ -5516,9 +6324,11 @@
       <w:r>
         <w:t>&lt;</w:t>
       </w:r>
+      <w:proofErr w:type="spellStart"/>
       <w:r>
         <w:t>page_memory</w:t>
       </w:r>
+      <w:proofErr w:type="spellEnd"/>
       <w:r>
         <w:t xml:space="preserve">&gt; (16K) </w:t>
       </w:r>
@@ -5534,7 +6344,15 @@
         <w:ind w:left="360"/>
       </w:pPr>
       <w:r>
-        <w:t xml:space="preserve">&lt;shadow_ram&gt; (20K) </w:t>
+        <w:t>&lt;</w:t>
+      </w:r>
+      <w:proofErr w:type="spellStart"/>
+      <w:r>
+        <w:t>shadow_ram</w:t>
+      </w:r>
+      <w:proofErr w:type="spellEnd"/>
+      <w:r>
+        <w:t xml:space="preserve">&gt; (20K) </w:t>
       </w:r>
       <w:r>
         <w:t xml:space="preserve">Populated on Model B Plus, BBC Model </w:t>
@@ -5569,7 +6387,15 @@
         <w:ind w:left="360"/>
       </w:pPr>
       <w:r>
-        <w:t xml:space="preserve">&lt;mos_ram&gt; (4K) </w:t>
+        <w:t>&lt;</w:t>
+      </w:r>
+      <w:proofErr w:type="spellStart"/>
+      <w:r>
+        <w:t>mos_ram</w:t>
+      </w:r>
+      <w:proofErr w:type="spellEnd"/>
+      <w:r>
+        <w:t xml:space="preserve">&gt; (4K) </w:t>
       </w:r>
       <w:r>
         <w:t>Populated on BBC Master</w:t>
@@ -5589,7 +6415,15 @@
         <w:ind w:left="360"/>
       </w:pPr>
       <w:r>
-        <w:t xml:space="preserve">&lt;filing_system_ram&gt; (8K) </w:t>
+        <w:t>&lt;</w:t>
+      </w:r>
+      <w:proofErr w:type="spellStart"/>
+      <w:r>
+        <w:t>filing_system_ram</w:t>
+      </w:r>
+      <w:proofErr w:type="spellEnd"/>
+      <w:r>
+        <w:t xml:space="preserve">&gt; (8K) </w:t>
       </w:r>
       <w:r>
         <w:t>Populated on BBC Master</w:t>
@@ -5618,7 +6452,15 @@
         <w:ind w:left="360"/>
       </w:pPr>
       <w:r>
-        <w:t>&lt;private_ram&gt; (</w:t>
+        <w:t>&lt;</w:t>
+      </w:r>
+      <w:proofErr w:type="spellStart"/>
+      <w:r>
+        <w:t>private_ram</w:t>
+      </w:r>
+      <w:proofErr w:type="spellEnd"/>
+      <w:r>
+        <w:t>&gt; (</w:t>
       </w:r>
       <w:r>
         <w:t>12</w:t>
@@ -5677,7 +6519,15 @@
         <w:ind w:left="360"/>
       </w:pPr>
       <w:r>
-        <w:t xml:space="preserve">&lt;hidden_ram&gt; (256 bytes) </w:t>
+        <w:t>&lt;</w:t>
+      </w:r>
+      <w:proofErr w:type="spellStart"/>
+      <w:r>
+        <w:t>hidden_ram</w:t>
+      </w:r>
+      <w:proofErr w:type="spellEnd"/>
+      <w:r>
+        <w:t xml:space="preserve">&gt; (256 bytes) </w:t>
       </w:r>
       <w:r>
         <w:t>Populated on BBC Model Integra B.</w:t>
@@ -5768,11 +6618,32 @@
           <w:b/>
           <w:bCs/>
         </w:rPr>
-        <w:t>&lt;execution_chunk&gt;</w:t>
-      </w:r>
-      <w:r>
-        <w:t xml:space="preserve"> = &lt;common_header</w:t>
-      </w:r>
+        <w:t>&lt;</w:t>
+      </w:r>
+      <w:proofErr w:type="spellStart"/>
+      <w:r>
+        <w:rPr>
+          <w:b/>
+          <w:bCs/>
+        </w:rPr>
+        <w:t>execution_chunk</w:t>
+      </w:r>
+      <w:proofErr w:type="spellEnd"/>
+      <w:r>
+        <w:rPr>
+          <w:b/>
+          <w:bCs/>
+        </w:rPr>
+        <w:t>&gt;</w:t>
+      </w:r>
+      <w:r>
+        <w:t xml:space="preserve"> = &lt;</w:t>
+      </w:r>
+      <w:proofErr w:type="spellStart"/>
+      <w:r>
+        <w:t>common_header</w:t>
+      </w:r>
+      <w:proofErr w:type="spellEnd"/>
       <w:r>
         <w:t>(</w:t>
       </w:r>
@@ -5783,6 +6654,7 @@
         </w:rPr>
         <w:t>‘</w:t>
       </w:r>
+      <w:proofErr w:type="spellStart"/>
       <w:r>
         <w:rPr>
           <w:rFonts w:ascii="Aptos" w:hAnsi="Aptos"/>
@@ -5790,7 +6662,17 @@
           <w:bCs/>
           <w:color w:val="000000"/>
         </w:rPr>
-        <w:t>PFex’</w:t>
+        <w:t>PFex</w:t>
+      </w:r>
+      <w:proofErr w:type="spellEnd"/>
+      <w:r>
+        <w:rPr>
+          <w:rFonts w:ascii="Aptos" w:hAnsi="Aptos"/>
+          <w:b/>
+          <w:bCs/>
+          <w:color w:val="000000"/>
+        </w:rPr>
+        <w:t>’</w:t>
       </w:r>
       <w:r>
         <w:rPr>
@@ -5800,7 +6682,15 @@
         <w:t>)</w:t>
       </w:r>
       <w:r>
-        <w:t>&gt; + &lt;execution_data&gt;</w:t>
+        <w:t>&gt; + &lt;</w:t>
+      </w:r>
+      <w:proofErr w:type="spellStart"/>
+      <w:r>
+        <w:t>execution_data</w:t>
+      </w:r>
+      <w:proofErr w:type="spellEnd"/>
+      <w:r>
+        <w:t>&gt;</w:t>
       </w:r>
       <w:r>
         <w:t xml:space="preserve"> where</w:t>
@@ -5815,7 +6705,23 @@
           <w:b/>
           <w:bCs/>
         </w:rPr>
-        <w:t>&lt;execution_data&gt;</w:t>
+        <w:t>&lt;</w:t>
+      </w:r>
+      <w:proofErr w:type="spellStart"/>
+      <w:r>
+        <w:rPr>
+          <w:b/>
+          <w:bCs/>
+        </w:rPr>
+        <w:t>execution_data</w:t>
+      </w:r>
+      <w:proofErr w:type="spellEnd"/>
+      <w:r>
+        <w:rPr>
+          <w:b/>
+          <w:bCs/>
+        </w:rPr>
+        <w:t>&gt;</w:t>
       </w:r>
       <w:r>
         <w:t xml:space="preserve"> = </w:t>
@@ -5874,7 +6780,23 @@
         <w:t>&gt;</w:t>
       </w:r>
       <w:r>
-        <w:t xml:space="preserve"> = &lt;event_marker&gt; + &lt;event_params&gt; </w:t>
+        <w:t xml:space="preserve"> = &lt;</w:t>
+      </w:r>
+      <w:proofErr w:type="spellStart"/>
+      <w:r>
+        <w:t>event_marker</w:t>
+      </w:r>
+      <w:proofErr w:type="spellEnd"/>
+      <w:r>
+        <w:t>&gt; + &lt;</w:t>
+      </w:r>
+      <w:proofErr w:type="spellStart"/>
+      <w:r>
+        <w:t>event_params</w:t>
+      </w:r>
+      <w:proofErr w:type="spellEnd"/>
+      <w:r>
+        <w:t xml:space="preserve">&gt; </w:t>
       </w:r>
     </w:p>
     <w:p>
@@ -5882,7 +6804,15 @@
         <w:ind w:left="720"/>
       </w:pPr>
       <w:r>
-        <w:t>&lt;event_marker&gt; (2 bytes).  A two-byte value that distinguishes a</w:t>
+        <w:t>&lt;</w:t>
+      </w:r>
+      <w:proofErr w:type="spellStart"/>
+      <w:r>
+        <w:t>event_marker</w:t>
+      </w:r>
+      <w:proofErr w:type="spellEnd"/>
+      <w:r>
+        <w:t>&gt; (2 bytes).  A two-byte value that distinguishes a</w:t>
       </w:r>
       <w:r>
         <w:t>n</w:t>
@@ -6039,7 +6969,15 @@
           </w:tcPr>
           <w:p>
             <w:r>
-              <w:t>&lt;interrupt_event_params&gt;</w:t>
+              <w:t>&lt;</w:t>
+            </w:r>
+            <w:proofErr w:type="spellStart"/>
+            <w:r>
+              <w:t>interrupt_event_params</w:t>
+            </w:r>
+            <w:proofErr w:type="spellEnd"/>
+            <w:r>
+              <w:t>&gt;</w:t>
             </w:r>
           </w:p>
         </w:tc>
@@ -6074,7 +7012,15 @@
           </w:tcPr>
           <w:p>
             <w:r>
-              <w:t>&lt;interrupt_event_params&gt;</w:t>
+              <w:t>&lt;</w:t>
+            </w:r>
+            <w:proofErr w:type="spellStart"/>
+            <w:r>
+              <w:t>interrupt_event_params</w:t>
+            </w:r>
+            <w:proofErr w:type="spellEnd"/>
+            <w:r>
+              <w:t>&gt;</w:t>
             </w:r>
           </w:p>
         </w:tc>
@@ -6112,6 +7058,7 @@
               </w:rPr>
               <w:t>&lt;</w:t>
             </w:r>
+            <w:proofErr w:type="spellStart"/>
             <w:r>
               <w:t>display_fi</w:t>
             </w:r>
@@ -6119,7 +7066,11 @@
               <w:t>e</w:t>
             </w:r>
             <w:r>
-              <w:t>ld&gt;</w:t>
+              <w:t>ld</w:t>
+            </w:r>
+            <w:proofErr w:type="spellEnd"/>
+            <w:r>
+              <w:t>&gt;</w:t>
             </w:r>
           </w:p>
         </w:tc>
@@ -6259,7 +7210,23 @@
           <w:b/>
           <w:bCs/>
         </w:rPr>
-        <w:t>&lt;interrupt_event_params&gt;</w:t>
+        <w:t>&lt;</w:t>
+      </w:r>
+      <w:proofErr w:type="spellStart"/>
+      <w:r>
+        <w:rPr>
+          <w:b/>
+          <w:bCs/>
+        </w:rPr>
+        <w:t>interrupt_event_params</w:t>
+      </w:r>
+      <w:proofErr w:type="spellEnd"/>
+      <w:r>
+        <w:rPr>
+          <w:b/>
+          <w:bCs/>
+        </w:rPr>
+        <w:t>&gt;</w:t>
       </w:r>
       <w:r>
         <w:t xml:space="preserve"> </w:t>
@@ -6274,20 +7241,38 @@
         <w:br/>
       </w:r>
       <w:r>
-        <w:t xml:space="preserve">&lt;cycle_count&gt; </w:t>
+        <w:t>&lt;</w:t>
+      </w:r>
+      <w:proofErr w:type="spellStart"/>
+      <w:r>
+        <w:t>cycle_count</w:t>
+      </w:r>
+      <w:proofErr w:type="spellEnd"/>
+      <w:r>
+        <w:t xml:space="preserve">&gt; </w:t>
       </w:r>
       <w:r>
         <w:t xml:space="preserve">+ </w:t>
       </w:r>
       <w:r>
-        <w:t xml:space="preserve">&lt;destination_address&gt; + </w:t>
-      </w:r>
-      <w:r>
         <w:t>&lt;</w:t>
       </w:r>
+      <w:proofErr w:type="spellStart"/>
+      <w:r>
+        <w:t>destination_address</w:t>
+      </w:r>
+      <w:proofErr w:type="spellEnd"/>
+      <w:r>
+        <w:t xml:space="preserve">&gt; + </w:t>
+      </w:r>
+      <w:r>
+        <w:t>&lt;</w:t>
+      </w:r>
+      <w:proofErr w:type="spellStart"/>
       <w:r>
         <w:t>return_address</w:t>
       </w:r>
+      <w:proofErr w:type="spellEnd"/>
       <w:r>
         <w:t>&gt;</w:t>
       </w:r>
@@ -6297,7 +7282,15 @@
         <w:ind w:left="1080"/>
       </w:pPr>
       <w:r>
-        <w:t>&lt;cycle_count&gt; (1 byte) Specifies how many cycles it took to jump to the service routine (typically seven).</w:t>
+        <w:t>&lt;</w:t>
+      </w:r>
+      <w:proofErr w:type="spellStart"/>
+      <w:r>
+        <w:t>cycle_count</w:t>
+      </w:r>
+      <w:proofErr w:type="spellEnd"/>
+      <w:r>
+        <w:t>&gt; (1 byte) Specifies how many cycles it took to jump to the service routine (typically seven).</w:t>
       </w:r>
     </w:p>
     <w:p>
@@ -6311,9 +7304,11 @@
       <w:r>
         <w:t>&lt;</w:t>
       </w:r>
+      <w:proofErr w:type="spellStart"/>
       <w:r>
         <w:t>destination_address</w:t>
       </w:r>
+      <w:proofErr w:type="spellEnd"/>
       <w:r>
         <w:t>&gt; (2 bytes).  The address of the interrupt service routine</w:t>
       </w:r>
@@ -6329,7 +7324,15 @@
         <w:ind w:left="1080"/>
       </w:pPr>
       <w:r>
-        <w:t xml:space="preserve">&lt;return_address&gt; (2 bytes). </w:t>
+        <w:t>&lt;</w:t>
+      </w:r>
+      <w:proofErr w:type="spellStart"/>
+      <w:r>
+        <w:t>return_address</w:t>
+      </w:r>
+      <w:proofErr w:type="spellEnd"/>
+      <w:r>
+        <w:t xml:space="preserve">&gt; (2 bytes). </w:t>
       </w:r>
       <w:r>
         <w:t xml:space="preserve"> </w:t>
@@ -6351,6 +7354,7 @@
       <w:r>
         <w:t>&lt;</w:t>
       </w:r>
+      <w:proofErr w:type="spellStart"/>
       <w:r>
         <w:rPr>
           <w:b/>
@@ -6358,6 +7362,7 @@
         </w:rPr>
         <w:t>display_field</w:t>
       </w:r>
+      <w:proofErr w:type="spellEnd"/>
       <w:r>
         <w:t>&gt;</w:t>
       </w:r>
@@ -6418,7 +7423,15 @@
       </w:r>
       <w:r>
         <w:br/>
-        <w:t>&lt;opcode_address&gt; + &lt;opcode&gt; + &lt;operand&gt;</w:t>
+        <w:t>&lt;</w:t>
+      </w:r>
+      <w:proofErr w:type="spellStart"/>
+      <w:r>
+        <w:t>opcode_address</w:t>
+      </w:r>
+      <w:proofErr w:type="spellEnd"/>
+      <w:r>
+        <w:t>&gt; + &lt;opcode&gt; + &lt;operand&gt;</w:t>
       </w:r>
       <w:r>
         <w:rPr>
@@ -6435,14 +7448,23 @@
         <w:br/>
       </w:r>
       <w:r>
-        <w:t>&lt;cycle</w:t>
+        <w:t>&lt;</w:t>
+      </w:r>
+      <w:proofErr w:type="spellStart"/>
+      <w:r>
+        <w:t>cycle</w:t>
       </w:r>
       <w:r>
         <w:t>_</w:t>
       </w:r>
       <w:r>
-        <w:t>count&gt; + &lt;</w:t>
-      </w:r>
+        <w:t>count</w:t>
+      </w:r>
+      <w:proofErr w:type="spellEnd"/>
+      <w:r>
+        <w:t>&gt; + &lt;</w:t>
+      </w:r>
+      <w:proofErr w:type="spellStart"/>
       <w:r>
         <w:t>modified_</w:t>
       </w:r>
@@ -6452,6 +7474,7 @@
       <w:r>
         <w:t>s</w:t>
       </w:r>
+      <w:proofErr w:type="spellEnd"/>
       <w:r>
         <w:t xml:space="preserve">&gt; </w:t>
       </w:r>
@@ -6459,7 +7482,15 @@
         <w:t xml:space="preserve">+ </w:t>
       </w:r>
       <w:r>
-        <w:t>&lt;destination_address&gt;</w:t>
+        <w:t>&lt;</w:t>
+      </w:r>
+      <w:proofErr w:type="spellStart"/>
+      <w:r>
+        <w:t>destination_address</w:t>
+      </w:r>
+      <w:proofErr w:type="spellEnd"/>
+      <w:r>
+        <w:t>&gt;</w:t>
       </w:r>
       <w:r>
         <w:rPr>
@@ -6470,7 +7501,15 @@
         <w:t>opt</w:t>
       </w:r>
       <w:r>
-        <w:t xml:space="preserve"> + &lt;memory_address&gt;</w:t>
+        <w:t xml:space="preserve"> + &lt;</w:t>
+      </w:r>
+      <w:proofErr w:type="spellStart"/>
+      <w:r>
+        <w:t>memory_address</w:t>
+      </w:r>
+      <w:proofErr w:type="spellEnd"/>
+      <w:r>
+        <w:t>&gt;</w:t>
       </w:r>
       <w:r>
         <w:rPr>
@@ -6481,7 +7520,15 @@
         <w:t>opt</w:t>
       </w:r>
       <w:r>
-        <w:t xml:space="preserve"> &lt;memory_read_value&gt;</w:t>
+        <w:t xml:space="preserve"> &lt;</w:t>
+      </w:r>
+      <w:proofErr w:type="spellStart"/>
+      <w:r>
+        <w:t>memory_read_value</w:t>
+      </w:r>
+      <w:proofErr w:type="spellEnd"/>
+      <w:r>
+        <w:t>&gt;</w:t>
       </w:r>
       <w:r>
         <w:rPr>
@@ -6500,7 +7547,15 @@
         <w:t xml:space="preserve"> </w:t>
       </w:r>
       <w:r>
-        <w:t>+ &lt;memory_write_value&gt;</w:t>
+        <w:t>+ &lt;</w:t>
+      </w:r>
+      <w:proofErr w:type="spellStart"/>
+      <w:r>
+        <w:t>memory_write_value</w:t>
+      </w:r>
+      <w:proofErr w:type="spellEnd"/>
+      <w:r>
+        <w:t>&gt;</w:t>
       </w:r>
       <w:r>
         <w:rPr>
@@ -6519,7 +7574,15 @@
         <w:ind w:left="720"/>
       </w:pPr>
       <w:r>
-        <w:t>&lt;opcode_address&gt; (1, 2, or 3 bytes) The instruction’s opcode address is encoded in 1, 2 or 3 bytes as depicted in the following table, where addresses are stored in relative format if possible.</w:t>
+        <w:t>&lt;</w:t>
+      </w:r>
+      <w:proofErr w:type="spellStart"/>
+      <w:r>
+        <w:t>opcode_address</w:t>
+      </w:r>
+      <w:proofErr w:type="spellEnd"/>
+      <w:r>
+        <w:t>&gt; (1, 2, or 3 bytes) The instruction’s opcode address is encoded in 1, 2 or 3 bytes as depicted in the following table, where addresses are stored in relative format if possible.</w:t>
       </w:r>
       <w:r>
         <w:t xml:space="preserve"> </w:t>
@@ -7338,13 +8401,21 @@
         <w:ind w:left="720"/>
       </w:pPr>
       <w:r>
-        <w:t>&lt;cycle</w:t>
+        <w:t>&lt;</w:t>
+      </w:r>
+      <w:proofErr w:type="spellStart"/>
+      <w:r>
+        <w:t>cycle</w:t>
       </w:r>
       <w:r>
         <w:t>_</w:t>
       </w:r>
       <w:r>
-        <w:t>count&gt; (</w:t>
+        <w:t>count</w:t>
+      </w:r>
+      <w:proofErr w:type="spellEnd"/>
+      <w:r>
+        <w:t>&gt; (</w:t>
       </w:r>
       <w:r>
         <w:rPr>
@@ -7382,9 +8453,11 @@
       <w:r>
         <w:t>&lt;</w:t>
       </w:r>
+      <w:proofErr w:type="spellStart"/>
       <w:r>
         <w:t>modified_registers</w:t>
       </w:r>
+      <w:proofErr w:type="spellEnd"/>
       <w:r>
         <w:t xml:space="preserve">&gt; = </w:t>
       </w:r>
@@ -7392,7 +8465,11 @@
         <w:br/>
       </w:r>
       <w:r>
-        <w:t>&lt;modified</w:t>
+        <w:t>&lt;</w:t>
+      </w:r>
+      <w:proofErr w:type="spellStart"/>
+      <w:r>
+        <w:t>modified</w:t>
       </w:r>
       <w:r>
         <w:t>_</w:t>
@@ -7404,7 +8481,11 @@
         <w:t>_</w:t>
       </w:r>
       <w:r>
-        <w:t>flags&gt;</w:t>
+        <w:t>flags</w:t>
+      </w:r>
+      <w:proofErr w:type="spellEnd"/>
+      <w:r>
+        <w:t>&gt;</w:t>
       </w:r>
       <w:r>
         <w:t xml:space="preserve"> + &lt;accumulator&gt;</w:t>
@@ -7418,13 +8499,21 @@
         <w:t>opt</w:t>
       </w:r>
       <w:r>
-        <w:t xml:space="preserve"> + &lt;x</w:t>
+        <w:t xml:space="preserve"> + &lt;</w:t>
+      </w:r>
+      <w:proofErr w:type="spellStart"/>
+      <w:r>
+        <w:t>x</w:t>
       </w:r>
       <w:r>
         <w:t>_</w:t>
       </w:r>
       <w:r>
-        <w:t>register&gt;</w:t>
+        <w:t>register</w:t>
+      </w:r>
+      <w:proofErr w:type="spellEnd"/>
+      <w:r>
+        <w:t>&gt;</w:t>
       </w:r>
       <w:r>
         <w:rPr>
@@ -7435,13 +8524,21 @@
         <w:t>opt</w:t>
       </w:r>
       <w:r>
-        <w:t xml:space="preserve"> + &lt;y</w:t>
+        <w:t xml:space="preserve"> + &lt;</w:t>
+      </w:r>
+      <w:proofErr w:type="spellStart"/>
+      <w:r>
+        <w:t>y</w:t>
       </w:r>
       <w:r>
         <w:t>_</w:t>
       </w:r>
       <w:r>
-        <w:t>register&gt;</w:t>
+        <w:t>register</w:t>
+      </w:r>
+      <w:proofErr w:type="spellEnd"/>
+      <w:r>
+        <w:t>&gt;</w:t>
       </w:r>
       <w:r>
         <w:rPr>
@@ -7460,13 +8557,21 @@
         <w:t xml:space="preserve"> </w:t>
       </w:r>
       <w:r>
-        <w:t>+ &lt;status</w:t>
+        <w:t>+ &lt;</w:t>
+      </w:r>
+      <w:proofErr w:type="spellStart"/>
+      <w:r>
+        <w:t>status</w:t>
       </w:r>
       <w:r>
         <w:t>_</w:t>
       </w:r>
       <w:r>
-        <w:t>register&gt;</w:t>
+        <w:t>register</w:t>
+      </w:r>
+      <w:proofErr w:type="spellEnd"/>
+      <w:r>
+        <w:t>&gt;</w:t>
       </w:r>
       <w:r>
         <w:rPr>
@@ -7477,13 +8582,21 @@
         <w:t>opt</w:t>
       </w:r>
       <w:r>
-        <w:t xml:space="preserve"> + &lt;state</w:t>
+        <w:t xml:space="preserve"> + &lt;</w:t>
+      </w:r>
+      <w:proofErr w:type="spellStart"/>
+      <w:r>
+        <w:t>state</w:t>
       </w:r>
       <w:r>
         <w:t>_</w:t>
       </w:r>
       <w:r>
-        <w:t>pointer&gt;</w:t>
+        <w:t>pointer</w:t>
+      </w:r>
+      <w:proofErr w:type="spellEnd"/>
+      <w:r>
+        <w:t>&gt;</w:t>
       </w:r>
       <w:r>
         <w:rPr>
@@ -7502,7 +8615,11 @@
         <w:tab/>
       </w:r>
       <w:r>
-        <w:t>&lt;modified</w:t>
+        <w:t>&lt;</w:t>
+      </w:r>
+      <w:proofErr w:type="spellStart"/>
+      <w:r>
+        <w:t>modified</w:t>
       </w:r>
       <w:r>
         <w:t>_</w:t>
@@ -7514,7 +8631,11 @@
         <w:t>_</w:t>
       </w:r>
       <w:r>
-        <w:t>flags&gt;</w:t>
+        <w:t>flags</w:t>
+      </w:r>
+      <w:proofErr w:type="spellEnd"/>
+      <w:r>
+        <w:t>&gt;</w:t>
       </w:r>
       <w:r>
         <w:t xml:space="preserve"> (</w:t>
@@ -7827,7 +8948,11 @@
         <w:t xml:space="preserve"> if the corresponding bit is set in </w:t>
       </w:r>
       <w:r>
-        <w:t>&lt;modified</w:t>
+        <w:t>&lt;</w:t>
+      </w:r>
+      <w:proofErr w:type="spellStart"/>
+      <w:r>
+        <w:t>modified</w:t>
       </w:r>
       <w:r>
         <w:t>_</w:t>
@@ -7839,7 +8964,11 @@
         <w:t>_</w:t>
       </w:r>
       <w:r>
-        <w:t>flags&gt;</w:t>
+        <w:t>flags</w:t>
+      </w:r>
+      <w:proofErr w:type="spellEnd"/>
+      <w:r>
+        <w:t>&gt;</w:t>
       </w:r>
       <w:r>
         <w:t>.</w:t>
@@ -7850,13 +8979,21 @@
         <w:ind w:left="1080"/>
       </w:pPr>
       <w:r>
-        <w:t>&lt;x</w:t>
+        <w:t>&lt;</w:t>
+      </w:r>
+      <w:proofErr w:type="spellStart"/>
+      <w:r>
+        <w:t>x</w:t>
       </w:r>
       <w:r>
         <w:t>_</w:t>
       </w:r>
       <w:r>
-        <w:t>register&gt;</w:t>
+        <w:t>register</w:t>
+      </w:r>
+      <w:proofErr w:type="spellEnd"/>
+      <w:r>
+        <w:t>&gt;</w:t>
       </w:r>
       <w:r>
         <w:t xml:space="preserve"> (0 or 1 byte)</w:t>
@@ -7877,7 +9014,11 @@
         <w:t xml:space="preserve">The value is written if the corresponding bit is set in </w:t>
       </w:r>
       <w:r>
-        <w:t>&lt;modified</w:t>
+        <w:t>&lt;</w:t>
+      </w:r>
+      <w:proofErr w:type="spellStart"/>
+      <w:r>
+        <w:t>modified</w:t>
       </w:r>
       <w:r>
         <w:t>_</w:t>
@@ -7889,7 +9030,11 @@
         <w:t>_</w:t>
       </w:r>
       <w:r>
-        <w:t>flags&gt;</w:t>
+        <w:t>flags</w:t>
+      </w:r>
+      <w:proofErr w:type="spellEnd"/>
+      <w:r>
+        <w:t>&gt;</w:t>
       </w:r>
       <w:r>
         <w:t>.</w:t>
@@ -7900,13 +9045,21 @@
         <w:ind w:left="1080"/>
       </w:pPr>
       <w:r>
-        <w:t>&lt;y</w:t>
+        <w:t>&lt;</w:t>
+      </w:r>
+      <w:proofErr w:type="spellStart"/>
+      <w:r>
+        <w:t>y</w:t>
       </w:r>
       <w:r>
         <w:t>_</w:t>
       </w:r>
       <w:r>
-        <w:t>register&gt;</w:t>
+        <w:t>register</w:t>
+      </w:r>
+      <w:proofErr w:type="spellEnd"/>
+      <w:r>
+        <w:t>&gt;</w:t>
       </w:r>
       <w:r>
         <w:t xml:space="preserve"> (0 or 1 byte)</w:t>
@@ -7921,7 +9074,11 @@
         <w:t xml:space="preserve">.  The value is written if the corresponding bit is set in </w:t>
       </w:r>
       <w:r>
-        <w:t>&lt;modified</w:t>
+        <w:t>&lt;</w:t>
+      </w:r>
+      <w:proofErr w:type="spellStart"/>
+      <w:r>
+        <w:t>modified</w:t>
       </w:r>
       <w:r>
         <w:t>_</w:t>
@@ -7933,7 +9090,11 @@
         <w:t>_</w:t>
       </w:r>
       <w:r>
-        <w:t>flags&gt;</w:t>
+        <w:t>flags</w:t>
+      </w:r>
+      <w:proofErr w:type="spellEnd"/>
+      <w:r>
+        <w:t>&gt;</w:t>
       </w:r>
       <w:r>
         <w:t>.</w:t>
@@ -7944,13 +9105,21 @@
         <w:ind w:left="1080"/>
       </w:pPr>
       <w:r>
-        <w:t>&lt;status</w:t>
+        <w:t>&lt;</w:t>
+      </w:r>
+      <w:proofErr w:type="spellStart"/>
+      <w:r>
+        <w:t>status</w:t>
       </w:r>
       <w:r>
         <w:t>_</w:t>
       </w:r>
       <w:r>
-        <w:t>register&gt;</w:t>
+        <w:t>register</w:t>
+      </w:r>
+      <w:proofErr w:type="spellEnd"/>
+      <w:r>
+        <w:t>&gt;</w:t>
       </w:r>
       <w:r>
         <w:t xml:space="preserve"> (0 or 1 byte)</w:t>
@@ -7962,7 +9131,11 @@
         <w:t xml:space="preserve">.  The value is written if the corresponding bit is set in </w:t>
       </w:r>
       <w:r>
-        <w:t>&lt;modified</w:t>
+        <w:t>&lt;</w:t>
+      </w:r>
+      <w:proofErr w:type="spellStart"/>
+      <w:r>
+        <w:t>modified</w:t>
       </w:r>
       <w:r>
         <w:t>_</w:t>
@@ -7974,7 +9147,11 @@
         <w:t>_</w:t>
       </w:r>
       <w:r>
-        <w:t>flags&gt;</w:t>
+        <w:t>flags</w:t>
+      </w:r>
+      <w:proofErr w:type="spellEnd"/>
+      <w:r>
+        <w:t>&gt;</w:t>
       </w:r>
       <w:r>
         <w:t>.</w:t>
@@ -7985,13 +9162,21 @@
         <w:ind w:left="1080"/>
       </w:pPr>
       <w:r>
-        <w:t>&lt;state</w:t>
+        <w:t>&lt;</w:t>
+      </w:r>
+      <w:proofErr w:type="spellStart"/>
+      <w:r>
+        <w:t>state</w:t>
       </w:r>
       <w:r>
         <w:t>_</w:t>
       </w:r>
       <w:r>
-        <w:t>pointer&gt;</w:t>
+        <w:t>pointer</w:t>
+      </w:r>
+      <w:proofErr w:type="spellEnd"/>
+      <w:r>
+        <w:t>&gt;</w:t>
       </w:r>
       <w:r>
         <w:t xml:space="preserve"> (0 or 1 byte)</w:t>
@@ -8003,7 +9188,11 @@
         <w:t xml:space="preserve">.   The value is written if the corresponding bit is set in </w:t>
       </w:r>
       <w:r>
-        <w:t>&lt;modified</w:t>
+        <w:t>&lt;</w:t>
+      </w:r>
+      <w:proofErr w:type="spellStart"/>
+      <w:r>
+        <w:t>modified</w:t>
       </w:r>
       <w:r>
         <w:t>_</w:t>
@@ -8015,7 +9204,11 @@
         <w:t>_</w:t>
       </w:r>
       <w:r>
-        <w:t>flags&gt;</w:t>
+        <w:t>flags</w:t>
+      </w:r>
+      <w:proofErr w:type="spellEnd"/>
+      <w:r>
+        <w:t>&gt;</w:t>
       </w:r>
       <w:r>
         <w:t>.</w:t>
@@ -8026,7 +9219,15 @@
         <w:ind w:left="720"/>
       </w:pPr>
       <w:r>
-        <w:t xml:space="preserve">&lt;destination_address&gt; (2 bytes) Populated for the </w:t>
+        <w:t>&lt;</w:t>
+      </w:r>
+      <w:proofErr w:type="spellStart"/>
+      <w:r>
+        <w:t>destination_address</w:t>
+      </w:r>
+      <w:proofErr w:type="spellEnd"/>
+      <w:r>
+        <w:t xml:space="preserve">&gt; (2 bytes) Populated for the </w:t>
       </w:r>
       <w:r>
         <w:rPr>
@@ -8133,7 +9334,15 @@
         <w:ind w:left="720"/>
       </w:pPr>
       <w:r>
-        <w:t xml:space="preserve">&lt;memory_address&gt; (2 bytes) Populated for all opcodes </w:t>
+        <w:t>&lt;</w:t>
+      </w:r>
+      <w:proofErr w:type="spellStart"/>
+      <w:r>
+        <w:t>memory_address</w:t>
+      </w:r>
+      <w:proofErr w:type="spellEnd"/>
+      <w:r>
+        <w:t xml:space="preserve">&gt; (2 bytes) Populated for all opcodes </w:t>
       </w:r>
       <w:r>
         <w:t xml:space="preserve">(except </w:t>
@@ -8327,7 +9536,15 @@
         <w:ind w:left="720"/>
       </w:pPr>
       <w:r>
-        <w:t xml:space="preserve">&lt;memory_read_value&gt; (1 byte) Populated for opcodes </w:t>
+        <w:t>&lt;</w:t>
+      </w:r>
+      <w:proofErr w:type="spellStart"/>
+      <w:r>
+        <w:t>memory_read_value</w:t>
+      </w:r>
+      <w:proofErr w:type="spellEnd"/>
+      <w:r>
+        <w:t xml:space="preserve">&gt; (1 byte) Populated for opcodes </w:t>
       </w:r>
       <w:r>
         <w:t>(ex</w:t>
@@ -8449,7 +9666,15 @@
         <w:ind w:left="720"/>
       </w:pPr>
       <w:r>
-        <w:t xml:space="preserve">&lt;memory_write_value&gt; (1 byte) Populated for opcodes </w:t>
+        <w:t>&lt;</w:t>
+      </w:r>
+      <w:proofErr w:type="spellStart"/>
+      <w:r>
+        <w:t>memory_write_value</w:t>
+      </w:r>
+      <w:proofErr w:type="spellEnd"/>
+      <w:r>
+        <w:t xml:space="preserve">&gt; (1 byte) Populated for opcodes </w:t>
       </w:r>
       <w:r>
         <w:t xml:space="preserve">(except </w:t>
@@ -8672,6 +9897,7 @@
       <w:pPr>
         <w:pStyle w:val="Heading1"/>
       </w:pPr>
+      <w:proofErr w:type="spellStart"/>
       <w:r>
         <w:lastRenderedPageBreak/>
         <w:t>Bee</w:t>
@@ -8682,10 +9908,16 @@
       <w:r>
         <w:t>Perf</w:t>
       </w:r>
-    </w:p>
-    <w:p>
-      <w:r>
-        <w:t xml:space="preserve">BeebPerf is a standalone </w:t>
+      <w:proofErr w:type="spellEnd"/>
+    </w:p>
+    <w:p>
+      <w:proofErr w:type="spellStart"/>
+      <w:r>
+        <w:t>BeebPerf</w:t>
+      </w:r>
+      <w:proofErr w:type="spellEnd"/>
+      <w:r>
+        <w:t xml:space="preserve"> is a standalone </w:t>
       </w:r>
       <w:r>
         <w:t xml:space="preserve">Windows </w:t>
@@ -10877,9 +12109,11 @@
       <w:r>
         <w:t xml:space="preserve">Aggregated CPU Metrics, by </w:t>
       </w:r>
+      <w:proofErr w:type="spellStart"/>
       <w:r>
         <w:t>RoutineStack</w:t>
       </w:r>
+      <w:proofErr w:type="spellEnd"/>
       <w:r>
         <w:t xml:space="preserve"> – </w:t>
       </w:r>
@@ -10945,6 +12179,7 @@
           <w:numId w:val="9"/>
         </w:numPr>
       </w:pPr>
+      <w:proofErr w:type="spellStart"/>
       <w:r>
         <w:rPr>
           <w:b/>
@@ -10952,6 +12187,7 @@
         </w:rPr>
         <w:t>CallStack</w:t>
       </w:r>
+      <w:proofErr w:type="spellEnd"/>
       <w:r>
         <w:t xml:space="preserve"> – represents a</w:t>
       </w:r>
@@ -11001,7 +12237,15 @@
         </w:numPr>
       </w:pPr>
       <w:r>
-        <w:t>Parent CallStack reference</w:t>
+        <w:t xml:space="preserve">Parent </w:t>
+      </w:r>
+      <w:proofErr w:type="spellStart"/>
+      <w:r>
+        <w:t>CallStack</w:t>
+      </w:r>
+      <w:proofErr w:type="spellEnd"/>
+      <w:r>
+        <w:t xml:space="preserve"> reference</w:t>
       </w:r>
     </w:p>
     <w:p>
@@ -11036,7 +12280,15 @@
         <w:ind w:left="1080"/>
       </w:pPr>
       <w:r>
-        <w:t xml:space="preserve">The identify of a CallStack is defined </w:t>
+        <w:t xml:space="preserve">The identify of a </w:t>
+      </w:r>
+      <w:proofErr w:type="spellStart"/>
+      <w:r>
+        <w:t>CallStack</w:t>
+      </w:r>
+      <w:proofErr w:type="spellEnd"/>
+      <w:r>
+        <w:t xml:space="preserve"> is defined </w:t>
       </w:r>
       <w:r>
         <w:t xml:space="preserve">by the sequence of </w:t>
@@ -11077,6 +12329,7 @@
           <w:numId w:val="9"/>
         </w:numPr>
       </w:pPr>
+      <w:proofErr w:type="spellStart"/>
       <w:r>
         <w:rPr>
           <w:b/>
@@ -11084,6 +12337,7 @@
         </w:rPr>
         <w:t>StackFrame</w:t>
       </w:r>
+      <w:proofErr w:type="spellEnd"/>
       <w:r>
         <w:t xml:space="preserve"> – represents a unique stack-frame within the recorded program.</w:t>
       </w:r>
@@ -12836,7 +14090,11 @@
         </w:numPr>
       </w:pPr>
       <w:r>
-        <w:t>Populate No</w:t>
+        <w:t xml:space="preserve">Populate </w:t>
+      </w:r>
+      <w:proofErr w:type="spellStart"/>
+      <w:r>
+        <w:t>No</w:t>
       </w:r>
       <w:r>
         <w:t>Tr</w:t>
@@ -12847,6 +14105,7 @@
       <w:r>
         <w:t>verse</w:t>
       </w:r>
+      <w:proofErr w:type="spellEnd"/>
       <w:r>
         <w:t xml:space="preserve"> </w:t>
       </w:r>
@@ -12898,11 +14157,16 @@
           <w:numId w:val="19"/>
         </w:numPr>
       </w:pPr>
+      <w:proofErr w:type="spellStart"/>
       <w:r>
         <w:t>Routine</w:t>
       </w:r>
       <w:r>
-        <w:t>aggregated and total aggregated</w:t>
+        <w:t>aggregated</w:t>
+      </w:r>
+      <w:proofErr w:type="spellEnd"/>
+      <w:r>
+        <w:t xml:space="preserve"> and total aggregated</w:t>
       </w:r>
       <w:r>
         <w:t xml:space="preserve"> CPU metrics</w:t>
@@ -13337,6 +14601,7 @@
       <w:r>
         <w:t xml:space="preserve">The performance functionality is encapsulated within a </w:t>
       </w:r>
+      <w:proofErr w:type="spellStart"/>
       <w:r>
         <w:rPr>
           <w:b/>
@@ -13344,8 +14609,25 @@
         </w:rPr>
         <w:t>PerfWriter</w:t>
       </w:r>
-      <w:r>
-        <w:t xml:space="preserve"> class (PerfWriter.h/cpp) </w:t>
+      <w:proofErr w:type="spellEnd"/>
+      <w:r>
+        <w:t xml:space="preserve"> class (</w:t>
+      </w:r>
+      <w:proofErr w:type="spellStart"/>
+      <w:r>
+        <w:t>PerfWriter.h</w:t>
+      </w:r>
+      <w:proofErr w:type="spellEnd"/>
+      <w:r>
+        <w:t>/</w:t>
+      </w:r>
+      <w:proofErr w:type="spellStart"/>
+      <w:r>
+        <w:t>cpp</w:t>
+      </w:r>
+      <w:proofErr w:type="spellEnd"/>
+      <w:r>
+        <w:t xml:space="preserve">) </w:t>
       </w:r>
     </w:p>
     <w:p>
@@ -13496,8 +14778,17 @@
           <w:b/>
           <w:bCs/>
         </w:rPr>
-        <w:t>/cpp</w:t>
-      </w:r>
+        <w:t>/</w:t>
+      </w:r>
+      <w:proofErr w:type="spellStart"/>
+      <w:r>
+        <w:rPr>
+          <w:b/>
+          <w:bCs/>
+        </w:rPr>
+        <w:t>cpp</w:t>
+      </w:r>
+      <w:proofErr w:type="spellEnd"/>
     </w:p>
     <w:p>
       <w:pPr>
@@ -13510,23 +14801,38 @@
       <w:r>
         <w:t xml:space="preserve">Added calls to </w:t>
       </w:r>
-      <w:r>
-        <w:t>PerfWriter_WriteInstruction(</w:t>
+      <w:proofErr w:type="spellStart"/>
+      <w:r>
+        <w:t>PerfWriter_WriteInstruction</w:t>
+      </w:r>
+      <w:proofErr w:type="spellEnd"/>
+      <w:r>
+        <w:t>(</w:t>
       </w:r>
       <w:r>
         <w:t xml:space="preserve">…) and </w:t>
       </w:r>
+      <w:proofErr w:type="spellStart"/>
       <w:r>
         <w:t>PerfWriter_WriteI</w:t>
       </w:r>
       <w:r>
         <w:t>nterrupt</w:t>
       </w:r>
+      <w:proofErr w:type="spellEnd"/>
       <w:r>
         <w:t>(</w:t>
       </w:r>
       <w:r>
-        <w:t>…) to log instructions and interrupts.  These wrapper functions only invoke the PerfWriter instance during a performance capture.</w:t>
+        <w:t xml:space="preserve">…) to log instructions and interrupts.  These wrapper functions only invoke the </w:t>
+      </w:r>
+      <w:proofErr w:type="spellStart"/>
+      <w:r>
+        <w:t>PerfWriter</w:t>
+      </w:r>
+      <w:proofErr w:type="spellEnd"/>
+      <w:r>
+        <w:t xml:space="preserve"> instance during a performance capture.</w:t>
       </w:r>
     </w:p>
     <w:p>
@@ -13540,51 +14846,70 @@
       <w:r>
         <w:t>Added static variables (</w:t>
       </w:r>
+      <w:proofErr w:type="spellStart"/>
       <w:r>
         <w:t>LastReadWriteAddress</w:t>
       </w:r>
+      <w:proofErr w:type="spellEnd"/>
       <w:r>
         <w:t xml:space="preserve">, </w:t>
       </w:r>
+      <w:proofErr w:type="spellStart"/>
       <w:r>
         <w:t>LastReadValue</w:t>
       </w:r>
+      <w:proofErr w:type="spellEnd"/>
       <w:r>
         <w:t xml:space="preserve">, and </w:t>
       </w:r>
+      <w:proofErr w:type="spellStart"/>
       <w:r>
         <w:t>LastWriteValue</w:t>
       </w:r>
+      <w:proofErr w:type="spellEnd"/>
       <w:r>
         <w:t xml:space="preserve">) to store the last accessed memory address, read value, and write value.  These values are passed to </w:t>
       </w:r>
-      <w:r>
-        <w:t>PerfWriter_WriteInstruction(</w:t>
+      <w:proofErr w:type="spellStart"/>
+      <w:r>
+        <w:t>PerfWriter_WriteInstruction</w:t>
+      </w:r>
+      <w:proofErr w:type="spellEnd"/>
+      <w:r>
+        <w:t>(</w:t>
       </w:r>
       <w:r>
         <w:t>…).  Added helpers (</w:t>
       </w:r>
+      <w:proofErr w:type="spellStart"/>
       <w:r>
         <w:t>ReadZeroPage</w:t>
       </w:r>
+      <w:proofErr w:type="spellEnd"/>
       <w:r>
         <w:t xml:space="preserve">, </w:t>
       </w:r>
+      <w:proofErr w:type="spellStart"/>
       <w:r>
         <w:t>WriteZeroPage</w:t>
       </w:r>
+      <w:proofErr w:type="spellEnd"/>
       <w:r>
         <w:t xml:space="preserve">, </w:t>
       </w:r>
+      <w:proofErr w:type="spellStart"/>
       <w:r>
         <w:t>ReadPaged</w:t>
       </w:r>
+      <w:proofErr w:type="spellEnd"/>
       <w:r>
         <w:t xml:space="preserve">, </w:t>
       </w:r>
+      <w:proofErr w:type="spellStart"/>
       <w:r>
         <w:t>WritePaged</w:t>
       </w:r>
+      <w:proofErr w:type="spellEnd"/>
       <w:r>
         <w:t>) which wrap the respective functionality whilst updating the</w:t>
       </w:r>
@@ -13610,14 +14935,32 @@
         <w:t xml:space="preserve"> </w:t>
       </w:r>
       <w:r>
-        <w:t xml:space="preserve">new struct (StackFrame) and </w:t>
+        <w:t>new struct (</w:t>
+      </w:r>
+      <w:proofErr w:type="spellStart"/>
+      <w:r>
+        <w:t>StackFrame</w:t>
+      </w:r>
+      <w:proofErr w:type="spellEnd"/>
+      <w:r>
+        <w:t xml:space="preserve">) and </w:t>
       </w:r>
       <w:r>
         <w:t>static variables (</w:t>
       </w:r>
-      <w:r>
-        <w:t>StackFrames, StackFrameCount</w:t>
-      </w:r>
+      <w:proofErr w:type="spellStart"/>
+      <w:r>
+        <w:t>StackFrames</w:t>
+      </w:r>
+      <w:proofErr w:type="spellEnd"/>
+      <w:r>
+        <w:t xml:space="preserve">, </w:t>
+      </w:r>
+      <w:proofErr w:type="spellStart"/>
+      <w:r>
+        <w:t>StackFrameCount</w:t>
+      </w:r>
+      <w:proofErr w:type="spellEnd"/>
       <w:r>
         <w:t xml:space="preserve">) to </w:t>
       </w:r>
@@ -13633,24 +14976,35 @@
       <w:r>
         <w:t xml:space="preserve"> and added helpers (</w:t>
       </w:r>
+      <w:proofErr w:type="spellStart"/>
       <w:r>
         <w:t>PushStackFrame</w:t>
       </w:r>
+      <w:proofErr w:type="spellEnd"/>
       <w:r>
         <w:t xml:space="preserve">, </w:t>
       </w:r>
+      <w:proofErr w:type="spellStart"/>
       <w:r>
         <w:t>SyncStackFrames</w:t>
       </w:r>
+      <w:proofErr w:type="spellEnd"/>
       <w:r>
         <w:t xml:space="preserve">, </w:t>
       </w:r>
-      <w:r>
-        <w:t xml:space="preserve">SetStackFrame, </w:t>
-      </w:r>
+      <w:proofErr w:type="spellStart"/>
+      <w:r>
+        <w:t>SetStackFrame</w:t>
+      </w:r>
+      <w:proofErr w:type="spellEnd"/>
+      <w:r>
+        <w:t xml:space="preserve">, </w:t>
+      </w:r>
+      <w:proofErr w:type="spellStart"/>
       <w:r>
         <w:t>UpdateRootStackFrame</w:t>
       </w:r>
+      <w:proofErr w:type="spellEnd"/>
       <w:r>
         <w:t xml:space="preserve">) to </w:t>
       </w:r>
@@ -13724,8 +15078,13 @@
       <w:r>
         <w:t xml:space="preserve">dded helper to get the emulator’s call stack: </w:t>
       </w:r>
-      <w:r>
-        <w:t xml:space="preserve">GetStackFrames </w:t>
+      <w:proofErr w:type="spellStart"/>
+      <w:r>
+        <w:t>GetStackFrames</w:t>
+      </w:r>
+      <w:proofErr w:type="spellEnd"/>
+      <w:r>
+        <w:t xml:space="preserve"> </w:t>
       </w:r>
       <w:r>
         <w:t>(…).  This is called during snapshot chunk serialization.</w:t>
@@ -13743,7 +15102,15 @@
         </w:numPr>
       </w:pPr>
       <w:r>
-        <w:t>Added helper to get the emulator’s registers: GetRegisters(…).  This is called during snapshot chunk serialization.</w:t>
+        <w:t xml:space="preserve">Added helper to get the emulator’s registers: </w:t>
+      </w:r>
+      <w:proofErr w:type="spellStart"/>
+      <w:r>
+        <w:t>GetRegisters</w:t>
+      </w:r>
+      <w:proofErr w:type="spellEnd"/>
+      <w:r>
+        <w:t>(…).  This is called during snapshot chunk serialization.</w:t>
       </w:r>
     </w:p>
     <w:p>
@@ -13757,6 +15124,7 @@
       <w:r>
         <w:t xml:space="preserve">Removed </w:t>
       </w:r>
+      <w:proofErr w:type="spellStart"/>
       <w:r>
         <w:rPr>
           <w:b/>
@@ -13764,9 +15132,11 @@
         </w:rPr>
         <w:t>ReadPaged</w:t>
       </w:r>
+      <w:proofErr w:type="spellEnd"/>
       <w:r>
         <w:t xml:space="preserve"> and </w:t>
       </w:r>
+      <w:proofErr w:type="spellStart"/>
       <w:r>
         <w:rPr>
           <w:b/>
@@ -13774,6 +15144,7 @@
         </w:rPr>
         <w:t>WritePaged</w:t>
       </w:r>
+      <w:proofErr w:type="spellEnd"/>
       <w:r>
         <w:t xml:space="preserve"> </w:t>
       </w:r>
@@ -13788,13 +15159,31 @@
           <w:bCs/>
         </w:rPr>
       </w:pPr>
-      <w:r>
-        <w:rPr>
-          <w:b/>
-          <w:bCs/>
-        </w:rPr>
-        <w:t>BeepMem.h/cpp</w:t>
-      </w:r>
+      <w:proofErr w:type="spellStart"/>
+      <w:r>
+        <w:rPr>
+          <w:b/>
+          <w:bCs/>
+        </w:rPr>
+        <w:t>BeepMem.h</w:t>
+      </w:r>
+      <w:proofErr w:type="spellEnd"/>
+      <w:r>
+        <w:rPr>
+          <w:b/>
+          <w:bCs/>
+        </w:rPr>
+        <w:t>/</w:t>
+      </w:r>
+      <w:proofErr w:type="spellStart"/>
+      <w:r>
+        <w:rPr>
+          <w:b/>
+          <w:bCs/>
+        </w:rPr>
+        <w:t>cpp</w:t>
+      </w:r>
+      <w:proofErr w:type="spellEnd"/>
     </w:p>
     <w:p>
       <w:pPr>
@@ -13807,23 +15196,32 @@
       <w:r>
         <w:t>Defined new struct (</w:t>
       </w:r>
+      <w:proofErr w:type="spellStart"/>
       <w:r>
         <w:t>MemPageType</w:t>
       </w:r>
+      <w:proofErr w:type="spellEnd"/>
       <w:r>
         <w:t>) and function (</w:t>
       </w:r>
+      <w:proofErr w:type="spellStart"/>
       <w:r>
         <w:t>BeebMemPage</w:t>
       </w:r>
+      <w:proofErr w:type="spellEnd"/>
       <w:r>
         <w:t xml:space="preserve">) that returns the page associated with an address.  This is invoked by </w:t>
       </w:r>
+      <w:proofErr w:type="spellStart"/>
       <w:r>
         <w:t>Set</w:t>
       </w:r>
       <w:r>
-        <w:t xml:space="preserve">StackFrame </w:t>
+        <w:t>StackFrame</w:t>
+      </w:r>
+      <w:proofErr w:type="spellEnd"/>
+      <w:r>
+        <w:t xml:space="preserve"> </w:t>
       </w:r>
       <w:r>
         <w:t>(see 6502.cpp).</w:t>
@@ -13878,6 +15276,7 @@
         </w:rPr>
         <w:t xml:space="preserve"> </w:t>
       </w:r>
+      <w:proofErr w:type="spellStart"/>
       <w:r>
         <w:rPr>
           <w:b/>
@@ -13885,6 +15284,7 @@
         </w:rPr>
         <w:t>HidAdd</w:t>
       </w:r>
+      <w:proofErr w:type="spellEnd"/>
       <w:r>
         <w:rPr>
           <w:b/>
@@ -13966,13 +15366,29 @@
         </w:numPr>
       </w:pPr>
       <w:r>
-        <w:t xml:space="preserve">Added call to PerfWriter_WriteBeginDisplayEvent(…) to log the start of screen display. </w:t>
+        <w:t xml:space="preserve">Added call to </w:t>
+      </w:r>
+      <w:proofErr w:type="spellStart"/>
+      <w:r>
+        <w:t>PerfWriter_WriteBeginDisplayEvent</w:t>
+      </w:r>
+      <w:proofErr w:type="spellEnd"/>
+      <w:r>
+        <w:t xml:space="preserve">(…) to log the start of screen display. </w:t>
       </w:r>
       <w:r>
         <w:t xml:space="preserve"> </w:t>
       </w:r>
       <w:r>
-        <w:t xml:space="preserve">This wrapper function only invokes the PerfWriter class during </w:t>
+        <w:t xml:space="preserve">This wrapper function only invokes the </w:t>
+      </w:r>
+      <w:proofErr w:type="spellStart"/>
+      <w:r>
+        <w:t>PerfWriter</w:t>
+      </w:r>
+      <w:proofErr w:type="spellEnd"/>
+      <w:r>
+        <w:t xml:space="preserve"> class during </w:t>
       </w:r>
       <w:r>
         <w:t xml:space="preserve">a </w:t>
@@ -13988,13 +15404,31 @@
           <w:bCs/>
         </w:rPr>
       </w:pPr>
-      <w:r>
-        <w:rPr>
-          <w:b/>
-          <w:bCs/>
-        </w:rPr>
-        <w:t>Debug.h/cpp</w:t>
-      </w:r>
+      <w:proofErr w:type="spellStart"/>
+      <w:r>
+        <w:rPr>
+          <w:b/>
+          <w:bCs/>
+        </w:rPr>
+        <w:t>Debug.h</w:t>
+      </w:r>
+      <w:proofErr w:type="spellEnd"/>
+      <w:r>
+        <w:rPr>
+          <w:b/>
+          <w:bCs/>
+        </w:rPr>
+        <w:t>/</w:t>
+      </w:r>
+      <w:proofErr w:type="spellStart"/>
+      <w:r>
+        <w:rPr>
+          <w:b/>
+          <w:bCs/>
+        </w:rPr>
+        <w:t>cpp</w:t>
+      </w:r>
+      <w:proofErr w:type="spellEnd"/>
     </w:p>
     <w:p>
       <w:pPr>
@@ -14029,12 +15463,37 @@
           <w:bCs/>
         </w:rPr>
       </w:pPr>
-      <w:r>
-        <w:rPr>
-          <w:b/>
-          <w:bCs/>
-        </w:rPr>
-        <w:t>BeebWin.h/cpp, BeebWinIo.cpp</w:t>
+      <w:proofErr w:type="spellStart"/>
+      <w:r>
+        <w:rPr>
+          <w:b/>
+          <w:bCs/>
+        </w:rPr>
+        <w:t>BeebWin.h</w:t>
+      </w:r>
+      <w:proofErr w:type="spellEnd"/>
+      <w:r>
+        <w:rPr>
+          <w:b/>
+          <w:bCs/>
+        </w:rPr>
+        <w:t>/</w:t>
+      </w:r>
+      <w:proofErr w:type="spellStart"/>
+      <w:r>
+        <w:rPr>
+          <w:b/>
+          <w:bCs/>
+        </w:rPr>
+        <w:t>cpp</w:t>
+      </w:r>
+      <w:proofErr w:type="spellEnd"/>
+      <w:r>
+        <w:rPr>
+          <w:b/>
+          <w:bCs/>
+        </w:rPr>
+        <w:t>, BeebWinIo.cpp</w:t>
       </w:r>
     </w:p>
     <w:p>
@@ -14062,27 +15521,44 @@
         </w:rPr>
         <w:t xml:space="preserve"> </w:t>
       </w:r>
+      <w:proofErr w:type="spellStart"/>
       <w:r>
         <w:t>UpdatePerfCaptureMenu</w:t>
       </w:r>
+      <w:proofErr w:type="spellEnd"/>
       <w:r>
         <w:t>()</w:t>
       </w:r>
       <w:r>
-        <w:t>, CapturePerf</w:t>
-      </w:r>
+        <w:t xml:space="preserve">, </w:t>
+      </w:r>
+      <w:proofErr w:type="spellStart"/>
+      <w:r>
+        <w:t>CapturePerf</w:t>
+      </w:r>
+      <w:proofErr w:type="spellEnd"/>
       <w:r>
         <w:t>()</w:t>
       </w:r>
       <w:r>
-        <w:t>, EndPerfCapture</w:t>
-      </w:r>
+        <w:t xml:space="preserve">, </w:t>
+      </w:r>
+      <w:proofErr w:type="spellStart"/>
+      <w:r>
+        <w:t>EndPerfCapture</w:t>
+      </w:r>
+      <w:proofErr w:type="spellEnd"/>
       <w:r>
         <w:t>()</w:t>
       </w:r>
       <w:r>
-        <w:t>, and IsCapturingPerf</w:t>
-      </w:r>
+        <w:t xml:space="preserve">, and </w:t>
+      </w:r>
+      <w:proofErr w:type="spellStart"/>
+      <w:r>
+        <w:t>IsCapturingPerf</w:t>
+      </w:r>
+      <w:proofErr w:type="spellEnd"/>
       <w:r>
         <w:t>()</w:t>
       </w:r>
@@ -14098,9 +15574,11 @@
       <w:r>
         <w:t xml:space="preserve">.  The only notable differences are that </w:t>
       </w:r>
+      <w:proofErr w:type="spellStart"/>
       <w:r>
         <w:t>CapturePerf</w:t>
       </w:r>
+      <w:proofErr w:type="spellEnd"/>
       <w:r>
         <w:rPr>
           <w:b/>
@@ -14109,11 +15587,21 @@
         <w:t xml:space="preserve"> </w:t>
       </w:r>
       <w:r>
-        <w:t xml:space="preserve">creates an instance of the PerfWriter class, initializes it, and </w:t>
-      </w:r>
+        <w:t xml:space="preserve">creates an instance of the </w:t>
+      </w:r>
+      <w:proofErr w:type="spellStart"/>
+      <w:r>
+        <w:t>PerfWriter</w:t>
+      </w:r>
+      <w:proofErr w:type="spellEnd"/>
+      <w:r>
+        <w:t xml:space="preserve"> class, initializes it, and </w:t>
+      </w:r>
+      <w:proofErr w:type="spellStart"/>
       <w:r>
         <w:t>EndPerfCapture</w:t>
       </w:r>
+      <w:proofErr w:type="spellEnd"/>
       <w:r>
         <w:rPr>
           <w:b/>
@@ -14122,23 +15610,49 @@
         <w:t xml:space="preserve"> </w:t>
       </w:r>
       <w:r>
-        <w:t>closes the capture, and deletes the PerfWriter instance.</w:t>
-      </w:r>
-    </w:p>
-    <w:p>
-      <w:pPr>
-        <w:rPr>
-          <w:b/>
-          <w:bCs/>
-        </w:rPr>
-      </w:pPr>
-      <w:r>
-        <w:rPr>
-          <w:b/>
-          <w:bCs/>
-        </w:rPr>
-        <w:t>BeebWinPrefs.h/cpp</w:t>
-      </w:r>
+        <w:t xml:space="preserve">closes the capture, and deletes the </w:t>
+      </w:r>
+      <w:proofErr w:type="spellStart"/>
+      <w:r>
+        <w:t>PerfWriter</w:t>
+      </w:r>
+      <w:proofErr w:type="spellEnd"/>
+      <w:r>
+        <w:t xml:space="preserve"> instance.</w:t>
+      </w:r>
+    </w:p>
+    <w:p>
+      <w:pPr>
+        <w:rPr>
+          <w:b/>
+          <w:bCs/>
+        </w:rPr>
+      </w:pPr>
+      <w:proofErr w:type="spellStart"/>
+      <w:r>
+        <w:rPr>
+          <w:b/>
+          <w:bCs/>
+        </w:rPr>
+        <w:t>BeebWinPrefs.h</w:t>
+      </w:r>
+      <w:proofErr w:type="spellEnd"/>
+      <w:r>
+        <w:rPr>
+          <w:b/>
+          <w:bCs/>
+        </w:rPr>
+        <w:t>/</w:t>
+      </w:r>
+      <w:proofErr w:type="spellStart"/>
+      <w:r>
+        <w:rPr>
+          <w:b/>
+          <w:bCs/>
+        </w:rPr>
+        <w:t>cpp</w:t>
+      </w:r>
+      <w:proofErr w:type="spellEnd"/>
     </w:p>
     <w:p>
       <w:pPr>
@@ -14223,14 +15737,32 @@
           <w:bCs/>
         </w:rPr>
       </w:pPr>
+      <w:proofErr w:type="spellStart"/>
       <w:r>
         <w:rPr>
           <w:b/>
           <w:bCs/>
         </w:rPr>
         <w:lastRenderedPageBreak/>
-        <w:t>BeebEm.rc, Resource.h</w:t>
-      </w:r>
+        <w:t>BeebEm.rc</w:t>
+      </w:r>
+      <w:proofErr w:type="spellEnd"/>
+      <w:r>
+        <w:rPr>
+          <w:b/>
+          <w:bCs/>
+        </w:rPr>
+        <w:t xml:space="preserve">, </w:t>
+      </w:r>
+      <w:proofErr w:type="spellStart"/>
+      <w:r>
+        <w:rPr>
+          <w:b/>
+          <w:bCs/>
+        </w:rPr>
+        <w:t>Resource.h</w:t>
+      </w:r>
+      <w:proofErr w:type="spellEnd"/>
     </w:p>
     <w:p>
       <w:pPr>
@@ -14278,6 +15810,7 @@
         </w:rPr>
         <w:t>*</w:t>
       </w:r>
+      <w:proofErr w:type="spellStart"/>
       <w:r>
         <w:rPr>
           <w:b/>
@@ -14313,6 +15846,7 @@
         </w:rPr>
         <w:t>.filters</w:t>
       </w:r>
+      <w:proofErr w:type="spellEnd"/>
     </w:p>
     <w:p>
       <w:pPr>
@@ -14338,8 +15872,17 @@
           <w:b/>
           <w:bCs/>
         </w:rPr>
-        <w:t>*.vcxproj</w:t>
-      </w:r>
+        <w:t>*.</w:t>
+      </w:r>
+      <w:proofErr w:type="spellStart"/>
+      <w:r>
+        <w:rPr>
+          <w:b/>
+          <w:bCs/>
+        </w:rPr>
+        <w:t>vcxproj</w:t>
+      </w:r>
+      <w:proofErr w:type="spellEnd"/>
     </w:p>
     <w:p>
       <w:pPr>
@@ -14350,7 +15893,15 @@
         </w:numPr>
       </w:pPr>
       <w:r>
-        <w:t>Updated WindowsTargetPlatformVersion to 10.0</w:t>
+        <w:t xml:space="preserve">Updated </w:t>
+      </w:r>
+      <w:proofErr w:type="spellStart"/>
+      <w:r>
+        <w:t>WindowsTargetPlatformVersion</w:t>
+      </w:r>
+      <w:proofErr w:type="spellEnd"/>
+      <w:r>
+        <w:t xml:space="preserve"> to 10.0</w:t>
       </w:r>
     </w:p>
     <w:p>
@@ -14362,7 +15913,15 @@
         </w:numPr>
       </w:pPr>
       <w:r>
-        <w:t>Updated PlatformToolset to v14</w:t>
+        <w:t xml:space="preserve">Updated </w:t>
+      </w:r>
+      <w:proofErr w:type="spellStart"/>
+      <w:r>
+        <w:t>PlatformToolset</w:t>
+      </w:r>
+      <w:proofErr w:type="spellEnd"/>
+      <w:r>
+        <w:t xml:space="preserve"> to v14</w:t>
       </w:r>
       <w:r>
         <w:t>2</w:t>
@@ -14479,14 +16038,27 @@
         <w:t xml:space="preserve"> only </w:t>
       </w:r>
       <w:r>
-        <w:t>needed for afxre</w:t>
+        <w:t xml:space="preserve">needed for </w:t>
+      </w:r>
+      <w:proofErr w:type="spellStart"/>
+      <w:r>
+        <w:t>afxre</w:t>
       </w:r>
       <w:r>
         <w:t>s</w:t>
       </w:r>
       <w:r>
-        <w:t>.h/rc</w:t>
-      </w:r>
+        <w:t>.h</w:t>
+      </w:r>
+      <w:proofErr w:type="spellEnd"/>
+      <w:r>
+        <w:t>/</w:t>
+      </w:r>
+      <w:proofErr w:type="spellStart"/>
+      <w:r>
+        <w:t>rc</w:t>
+      </w:r>
+      <w:proofErr w:type="spellEnd"/>
     </w:p>
     <w:p>
       <w:r>
@@ -14524,16 +16096,52 @@
         </w:rPr>
         <w:t xml:space="preserve">git add -N </w:t>
       </w:r>
+      <w:proofErr w:type="spellStart"/>
       <w:r>
         <w:rPr>
           <w:color w:val="FFFFFF" w:themeColor="background1"/>
         </w:rPr>
-        <w:t>src\PerfWriter.h src\PerfWriter.cpp</w:t>
-      </w:r>
+        <w:t>src</w:t>
+      </w:r>
+      <w:proofErr w:type="spellEnd"/>
       <w:r>
         <w:rPr>
           <w:color w:val="FFFFFF" w:themeColor="background1"/>
         </w:rPr>
+        <w:t>\</w:t>
+      </w:r>
+      <w:proofErr w:type="spellStart"/>
+      <w:r>
+        <w:rPr>
+          <w:color w:val="FFFFFF" w:themeColor="background1"/>
+        </w:rPr>
+        <w:t>PerfWriter.h</w:t>
+      </w:r>
+      <w:proofErr w:type="spellEnd"/>
+      <w:r>
+        <w:rPr>
+          <w:color w:val="FFFFFF" w:themeColor="background1"/>
+        </w:rPr>
+        <w:t xml:space="preserve"> </w:t>
+      </w:r>
+      <w:proofErr w:type="spellStart"/>
+      <w:r>
+        <w:rPr>
+          <w:color w:val="FFFFFF" w:themeColor="background1"/>
+        </w:rPr>
+        <w:t>src</w:t>
+      </w:r>
+      <w:proofErr w:type="spellEnd"/>
+      <w:r>
+        <w:rPr>
+          <w:color w:val="FFFFFF" w:themeColor="background1"/>
+        </w:rPr>
+        <w:t>\PerfWriter.cpp</w:t>
+      </w:r>
+      <w:r>
+        <w:rPr>
+          <w:color w:val="FFFFFF" w:themeColor="background1"/>
+        </w:rPr>
         <w:br/>
       </w:r>
       <w:r>
@@ -14554,12 +16162,28 @@
         </w:rPr>
         <w:t xml:space="preserve"> &gt; ..\</w:t>
       </w:r>
+      <w:proofErr w:type="spellStart"/>
       <w:r>
         <w:rPr>
           <w:color w:val="FFFFFF" w:themeColor="background1"/>
         </w:rPr>
-        <w:t>beebperf\beebem_changelist.diff</w:t>
-      </w:r>
+        <w:t>beebperf</w:t>
+      </w:r>
+      <w:proofErr w:type="spellEnd"/>
+      <w:r>
+        <w:rPr>
+          <w:color w:val="FFFFFF" w:themeColor="background1"/>
+        </w:rPr>
+        <w:t>\</w:t>
+      </w:r>
+      <w:proofErr w:type="spellStart"/>
+      <w:r>
+        <w:rPr>
+          <w:color w:val="FFFFFF" w:themeColor="background1"/>
+        </w:rPr>
+        <w:t>beebem_changelist.diff</w:t>
+      </w:r>
+      <w:proofErr w:type="spellEnd"/>
     </w:p>
     <w:p/>
     <w:p>
@@ -14594,12 +16218,28 @@
         </w:rPr>
         <w:t>apply ..\</w:t>
       </w:r>
+      <w:proofErr w:type="spellStart"/>
       <w:r>
         <w:rPr>
           <w:color w:val="FFFFFF" w:themeColor="background1"/>
         </w:rPr>
-        <w:t>beebperf\beebem_changelist.diff</w:t>
-      </w:r>
+        <w:t>beebperf</w:t>
+      </w:r>
+      <w:proofErr w:type="spellEnd"/>
+      <w:r>
+        <w:rPr>
+          <w:color w:val="FFFFFF" w:themeColor="background1"/>
+        </w:rPr>
+        <w:t>\</w:t>
+      </w:r>
+      <w:proofErr w:type="spellStart"/>
+      <w:r>
+        <w:rPr>
+          <w:color w:val="FFFFFF" w:themeColor="background1"/>
+        </w:rPr>
+        <w:t>beebem_changelist.diff</w:t>
+      </w:r>
+      <w:proofErr w:type="spellEnd"/>
     </w:p>
     <w:p>
       <w:pPr>
@@ -14630,34 +16270,10 @@
         </w:numPr>
       </w:pPr>
       <w:r>
-        <w:t>Issue where insert</w:t>
-      </w:r>
-      <w:r>
-        <w:t>ed</w:t>
-      </w:r>
-      <w:r>
-        <w:t xml:space="preserve"> stack frames</w:t>
-      </w:r>
-      <w:r>
-        <w:t xml:space="preserve"> are associated with the wrong routine.</w:t>
-      </w:r>
-      <w:r>
-        <w:t xml:space="preserve">  We need to keep track of routine address ranges, and use these to determine whether to </w:t>
-      </w:r>
-      <w:r>
-        <w:t>split routines</w:t>
-      </w:r>
-    </w:p>
-    <w:p>
-      <w:pPr>
-        <w:pStyle w:val="ListParagraph"/>
-        <w:numPr>
-          <w:ilvl w:val="1"/>
-          <w:numId w:val="8"/>
-        </w:numPr>
-      </w:pPr>
-      <w:r>
         <w:t>Issue where we have very deep code paths</w:t>
+      </w:r>
+      <w:r>
+        <w:t xml:space="preserve"> – in progress</w:t>
       </w:r>
     </w:p>
     <w:p>
@@ -14713,7 +16329,6 @@
         </w:numPr>
       </w:pPr>
       <w:r>
-        <w:lastRenderedPageBreak/>
         <w:t>Allow frame</w:t>
       </w:r>
       <w:r>
@@ -14765,6 +16380,7 @@
         </w:numPr>
       </w:pPr>
       <w:r>
+        <w:lastRenderedPageBreak/>
         <w:t xml:space="preserve">Some coding patterns </w:t>
       </w:r>
       <w:r>
@@ -14992,7 +16608,15 @@
         <w:t>O</w:t>
       </w:r>
       <w:r>
-        <w:t xml:space="preserve">n closer inspection, a surprising amount of the time is spent in cacheObjectExtents, which sets the </w:t>
+        <w:t xml:space="preserve">n closer inspection, a surprising amount of the time is spent in </w:t>
+      </w:r>
+      <w:proofErr w:type="spellStart"/>
+      <w:r>
+        <w:t>cacheObjectExtents</w:t>
+      </w:r>
+      <w:proofErr w:type="spellEnd"/>
+      <w:r>
+        <w:t xml:space="preserve">, which sets the </w:t>
       </w:r>
       <w:r>
         <w:rPr>
@@ -15014,6 +16638,7 @@
       <w:r>
         <w:t xml:space="preserve">, </w:t>
       </w:r>
+      <w:proofErr w:type="spellStart"/>
       <w:r>
         <w:rPr>
           <w:i/>
@@ -15021,9 +16646,11 @@
         </w:rPr>
         <w:t>widthMinusOne</w:t>
       </w:r>
+      <w:proofErr w:type="spellEnd"/>
       <w:r>
         <w:t xml:space="preserve">, and </w:t>
       </w:r>
+      <w:proofErr w:type="spellStart"/>
       <w:r>
         <w:rPr>
           <w:i/>
@@ -15031,6 +16658,7 @@
         </w:rPr>
         <w:t>heightMinusOne</w:t>
       </w:r>
+      <w:proofErr w:type="spellEnd"/>
       <w:r>
         <w:t xml:space="preserve"> zero-page variables.  In the majority of cases the callback update functions skip work so don’t </w:t>
       </w:r>

</xml_diff>

<commit_message>
Implemented Help dialog box
</commit_message>
<xml_diff>
--- a/docs/Development.docx
+++ b/docs/Development.docx
@@ -8918,10 +8918,7 @@
         <w:t>line allowing the user to select a specific time range to analyze</w:t>
       </w:r>
       <w:r>
-        <w:t xml:space="preserve"> </w:t>
-      </w:r>
-      <w:r>
-        <w:t>(shown in blue)</w:t>
+        <w:t xml:space="preserve"> (shown in blue)</w:t>
       </w:r>
       <w:r>
         <w:t>.</w:t>
@@ -9767,7 +9764,16 @@
     </w:p>
     <w:p>
       <w:r>
-        <w:t>The help window …</w:t>
+        <w:t>The help window</w:t>
+      </w:r>
+      <w:r>
+        <w:t xml:space="preserve"> displays getting started instructions, and other </w:t>
+      </w:r>
+      <w:r>
+        <w:t xml:space="preserve">useful </w:t>
+      </w:r>
+      <w:r>
+        <w:t>information.</w:t>
       </w:r>
     </w:p>
     <w:p>
@@ -14514,7 +14520,7 @@
         </w:numPr>
       </w:pPr>
       <w:r>
-        <w:t>Help dialog…</w:t>
+        <w:t>Create ExtractLabels project</w:t>
       </w:r>
     </w:p>
     <w:p>
@@ -14526,7 +14532,42 @@
         </w:numPr>
       </w:pPr>
       <w:r>
-        <w:t>Show tail calls and fall-throughs</w:t>
+        <w:t xml:space="preserve">Create elite and revs </w:t>
+      </w:r>
+      <w:r>
+        <w:rPr>
+          <w:b/>
+          <w:bCs/>
+        </w:rPr>
+        <w:t>sample</w:t>
+      </w:r>
+      <w:r>
+        <w:rPr>
+          <w:b/>
+          <w:bCs/>
+        </w:rPr>
+        <w:t>s</w:t>
+      </w:r>
+      <w:r>
+        <w:t xml:space="preserve"> </w:t>
+      </w:r>
+      <w:r>
+        <w:t>recording with embedded labels</w:t>
+      </w:r>
+    </w:p>
+    <w:p>
+      <w:pPr>
+        <w:pStyle w:val="ListParagraph"/>
+        <w:numPr>
+          <w:ilvl w:val="0"/>
+          <w:numId w:val="54"/>
+        </w:numPr>
+      </w:pPr>
+      <w:r>
+        <w:t>Update copyright</w:t>
+      </w:r>
+      <w:r>
+        <w:t xml:space="preserve"> 2026</w:t>
       </w:r>
     </w:p>
     <w:p>
@@ -14609,6 +14650,7 @@
         </w:numPr>
       </w:pPr>
       <w:r>
+        <w:lastRenderedPageBreak/>
         <w:t xml:space="preserve">Some coding patterns </w:t>
       </w:r>
       <w:r>
@@ -14636,11 +14678,7 @@
         <w:t xml:space="preserve">etter </w:t>
       </w:r>
       <w:r>
-        <w:t xml:space="preserve">to allow some </w:t>
-      </w:r>
-      <w:r>
-        <w:lastRenderedPageBreak/>
-        <w:t xml:space="preserve">routines to have </w:t>
+        <w:t xml:space="preserve">to allow some routines to have </w:t>
       </w:r>
       <w:r>
         <w:t>multiple/</w:t>
@@ -21576,7 +21614,6 @@
   <w:style w:type="character" w:default="1" w:styleId="DefaultParagraphFont">
     <w:name w:val="Default Paragraph Font"/>
     <w:uiPriority w:val="1"/>
-    <w:semiHidden/>
     <w:unhideWhenUsed/>
   </w:style>
   <w:style w:type="table" w:default="1" w:styleId="TableNormal">

</xml_diff>

<commit_message>
Migrated to .Net 10 and target window 8.  Also added ExtractLabels console app that extracts labels from a BeebAsm output into a BeebAsm -labels option format
</commit_message>
<xml_diff>
--- a/docs/Development.docx
+++ b/docs/Development.docx
@@ -14557,21 +14557,6 @@
     </w:p>
     <w:p>
       <w:pPr>
-        <w:pStyle w:val="ListParagraph"/>
-        <w:numPr>
-          <w:ilvl w:val="0"/>
-          <w:numId w:val="54"/>
-        </w:numPr>
-      </w:pPr>
-      <w:r>
-        <w:t>Update copyright</w:t>
-      </w:r>
-      <w:r>
-        <w:t xml:space="preserve"> 2026</w:t>
-      </w:r>
-    </w:p>
-    <w:p>
-      <w:pPr>
         <w:pStyle w:val="Heading1"/>
       </w:pPr>
       <w:r>
@@ -14650,35 +14635,38 @@
         </w:numPr>
       </w:pPr>
       <w:r>
+        <w:t xml:space="preserve">Some coding patterns </w:t>
+      </w:r>
+      <w:r>
+        <w:t xml:space="preserve">don’t </w:t>
+      </w:r>
+      <w:r>
+        <w:t>lend themselves to a strict routine with tail calls</w:t>
+      </w:r>
+      <w:r>
+        <w:t xml:space="preserve"> view</w:t>
+      </w:r>
+      <w:r>
+        <w:t xml:space="preserve">.  For example, a call </w:t>
+      </w:r>
+      <w:r>
+        <w:t>into the middle of a loop.</w:t>
+      </w:r>
+      <w:r>
+        <w:t xml:space="preserve">  </w:t>
+      </w:r>
+      <w:r>
+        <w:t>B</w:t>
+      </w:r>
+      <w:r>
+        <w:t xml:space="preserve">etter </w:t>
+      </w:r>
+      <w:r>
+        <w:t xml:space="preserve">to allow some </w:t>
+      </w:r>
+      <w:r>
         <w:lastRenderedPageBreak/>
-        <w:t xml:space="preserve">Some coding patterns </w:t>
-      </w:r>
-      <w:r>
-        <w:t xml:space="preserve">don’t </w:t>
-      </w:r>
-      <w:r>
-        <w:t>lend themselves to a strict routine with tail calls</w:t>
-      </w:r>
-      <w:r>
-        <w:t xml:space="preserve"> view</w:t>
-      </w:r>
-      <w:r>
-        <w:t xml:space="preserve">.  For example, a call </w:t>
-      </w:r>
-      <w:r>
-        <w:t>into the middle of a loop.</w:t>
-      </w:r>
-      <w:r>
-        <w:t xml:space="preserve">  </w:t>
-      </w:r>
-      <w:r>
-        <w:t>B</w:t>
-      </w:r>
-      <w:r>
-        <w:t xml:space="preserve">etter </w:t>
-      </w:r>
-      <w:r>
-        <w:t xml:space="preserve">to allow some routines to have </w:t>
+        <w:t xml:space="preserve">routines to have </w:t>
       </w:r>
       <w:r>
         <w:t>multiple/</w:t>
@@ -21614,6 +21602,7 @@
   <w:style w:type="character" w:default="1" w:styleId="DefaultParagraphFont">
     <w:name w:val="Default Paragraph Font"/>
     <w:uiPriority w:val="1"/>
+    <w:semiHidden/>
     <w:unhideWhenUsed/>
   </w:style>
   <w:style w:type="table" w:default="1" w:styleId="TableNormal">

</xml_diff>

<commit_message>
Bug fixes: 1) TabControls state index and page state handling was not consistent. 2) The caller / callee view incorrectly showed a caller into an IRQ/BRK/NMI.
</commit_message>
<xml_diff>
--- a/docs/Development.docx
+++ b/docs/Development.docx
@@ -4,10 +4,1028 @@
   <w:body>
     <w:p>
       <w:pPr>
+        <w:pStyle w:val="Title"/>
+      </w:pPr>
+      <w:r>
+        <w:t>BBC Micro</w:t>
+      </w:r>
+      <w:r>
+        <w:t xml:space="preserve"> Profiler</w:t>
+      </w:r>
+      <w:r>
+        <w:t xml:space="preserve"> </w:t>
+      </w:r>
+    </w:p>
+    <w:p>
+      <w:r>
+        <w:t>After finishing ‘</w:t>
+      </w:r>
+      <w:r>
+        <w:t xml:space="preserve">An Adventure </w:t>
+      </w:r>
+      <w:r>
+        <w:t>i</w:t>
+      </w:r>
+      <w:r>
+        <w:t>n Time’</w:t>
+      </w:r>
+      <w:r>
+        <w:t xml:space="preserve">, I needed something to </w:t>
+      </w:r>
+      <w:r>
+        <w:t>do,</w:t>
+      </w:r>
+      <w:r>
+        <w:t xml:space="preserve"> and I thought I could use my stills to help others </w:t>
+      </w:r>
+      <w:r>
+        <w:t>develop</w:t>
+      </w:r>
+      <w:r>
+        <w:t xml:space="preserve"> games for the BBC Micro</w:t>
+      </w:r>
+      <w:r>
+        <w:t>.</w:t>
+      </w:r>
+    </w:p>
+    <w:p>
+      <w:r>
+        <w:t xml:space="preserve">One thing </w:t>
+      </w:r>
+      <w:r>
+        <w:t xml:space="preserve">that I </w:t>
+      </w:r>
+      <w:r>
+        <w:t xml:space="preserve">really </w:t>
+      </w:r>
+      <w:r>
+        <w:t>could have use</w:t>
+      </w:r>
+      <w:r>
+        <w:t>d</w:t>
+      </w:r>
+      <w:r>
+        <w:t xml:space="preserve"> when </w:t>
+      </w:r>
+      <w:r>
+        <w:t xml:space="preserve">writing the game was a </w:t>
+      </w:r>
+      <w:r>
+        <w:t>graphical</w:t>
+      </w:r>
+      <w:r>
+        <w:t>-</w:t>
+      </w:r>
+      <w:r>
+        <w:t xml:space="preserve">based </w:t>
+      </w:r>
+      <w:r>
+        <w:t>profiler</w:t>
+      </w:r>
+      <w:r>
+        <w:t xml:space="preserve">, </w:t>
+      </w:r>
+      <w:r>
+        <w:t>like</w:t>
+      </w:r>
+      <w:r>
+        <w:t xml:space="preserve"> </w:t>
+      </w:r>
+      <w:r>
+        <w:t xml:space="preserve">the one found in </w:t>
+      </w:r>
+      <w:r>
+        <w:t>Visual Studio</w:t>
+      </w:r>
+      <w:r>
+        <w:t>.</w:t>
+      </w:r>
+      <w:r>
+        <w:t xml:space="preserve">  I imagine other</w:t>
+      </w:r>
+      <w:r>
+        <w:t>s</w:t>
+      </w:r>
+      <w:r>
+        <w:t xml:space="preserve"> would also find this useful</w:t>
+      </w:r>
+      <w:r>
+        <w:t>.</w:t>
+      </w:r>
+    </w:p>
+    <w:p>
+      <w:pPr>
         <w:pStyle w:val="Heading1"/>
       </w:pPr>
       <w:r>
-        <w:t>Before going public</w:t>
+        <w:t>Approach</w:t>
+      </w:r>
+    </w:p>
+    <w:p>
+      <w:r>
+        <w:t xml:space="preserve">Profilers </w:t>
+      </w:r>
+      <w:r>
+        <w:t xml:space="preserve">typically </w:t>
+      </w:r>
+      <w:r>
+        <w:t>do three things</w:t>
+      </w:r>
+      <w:r>
+        <w:t xml:space="preserve">: </w:t>
+      </w:r>
+      <w:r>
+        <w:rPr>
+          <w:b/>
+          <w:bCs/>
+        </w:rPr>
+        <w:t>Measure</w:t>
+      </w:r>
+      <w:r>
+        <w:t xml:space="preserve"> </w:t>
+      </w:r>
+      <w:r>
+        <w:sym w:font="Wingdings" w:char="F0E0"/>
+      </w:r>
+      <w:r>
+        <w:t xml:space="preserve"> </w:t>
+      </w:r>
+      <w:r>
+        <w:rPr>
+          <w:b/>
+          <w:bCs/>
+        </w:rPr>
+        <w:t>Analy</w:t>
+      </w:r>
+      <w:r>
+        <w:rPr>
+          <w:b/>
+          <w:bCs/>
+        </w:rPr>
+        <w:t>sis</w:t>
+      </w:r>
+      <w:r>
+        <w:t xml:space="preserve"> </w:t>
+      </w:r>
+      <w:r>
+        <w:sym w:font="Wingdings" w:char="F0E0"/>
+      </w:r>
+      <w:r>
+        <w:t xml:space="preserve"> </w:t>
+      </w:r>
+      <w:r>
+        <w:rPr>
+          <w:b/>
+          <w:bCs/>
+        </w:rPr>
+        <w:t>Present</w:t>
+      </w:r>
+      <w:r>
+        <w:t xml:space="preserve"> </w:t>
+      </w:r>
+      <w:r>
+        <w:rPr>
+          <w:b/>
+          <w:bCs/>
+        </w:rPr>
+        <w:t>Results</w:t>
+      </w:r>
+    </w:p>
+    <w:p>
+      <w:r>
+        <w:rPr>
+          <w:rFonts w:ascii="Aptos" w:hAnsi="Aptos"/>
+          <w:color w:val="000000"/>
+        </w:rPr>
+        <w:t xml:space="preserve">The easiest way to measure 6502 code is by logging executed instructions </w:t>
+      </w:r>
+      <w:r>
+        <w:rPr>
+          <w:rFonts w:ascii="Aptos" w:hAnsi="Aptos"/>
+          <w:color w:val="000000"/>
+        </w:rPr>
+        <w:t>within</w:t>
+      </w:r>
+      <w:r>
+        <w:rPr>
+          <w:rFonts w:ascii="Aptos" w:hAnsi="Aptos"/>
+          <w:color w:val="000000"/>
+        </w:rPr>
+        <w:t xml:space="preserve"> an emulator like </w:t>
+      </w:r>
+      <w:r>
+        <w:rPr>
+          <w:rFonts w:ascii="Aptos" w:hAnsi="Aptos"/>
+          <w:b/>
+          <w:color w:val="000000"/>
+        </w:rPr>
+        <w:t>BeebEm</w:t>
+      </w:r>
+      <w:r>
+        <w:t>.</w:t>
+      </w:r>
+    </w:p>
+    <w:p>
+      <w:pPr>
+        <w:rPr>
+          <w:rFonts w:ascii="Aptos" w:hAnsi="Aptos"/>
+          <w:color w:val="000000"/>
+        </w:rPr>
+      </w:pPr>
+      <w:r>
+        <w:t xml:space="preserve">To this end, </w:t>
+      </w:r>
+      <w:r>
+        <w:t xml:space="preserve">I </w:t>
+      </w:r>
+      <w:r>
+        <w:t xml:space="preserve">modified BeebEm, </w:t>
+      </w:r>
+      <w:r>
+        <w:t>add</w:t>
+      </w:r>
+      <w:r>
+        <w:t>ing</w:t>
+      </w:r>
+      <w:r>
+        <w:t xml:space="preserve"> n</w:t>
+      </w:r>
+      <w:r>
+        <w:t>ew</w:t>
+      </w:r>
+      <w:r>
+        <w:rPr>
+          <w:rFonts w:ascii="Aptos" w:hAnsi="Aptos"/>
+          <w:b/>
+          <w:bCs/>
+          <w:color w:val="000000"/>
+        </w:rPr>
+        <w:t xml:space="preserve"> </w:t>
+      </w:r>
+      <w:r>
+        <w:rPr>
+          <w:rFonts w:ascii="Aptos" w:hAnsi="Aptos"/>
+          <w:color w:val="000000"/>
+        </w:rPr>
+        <w:t xml:space="preserve">File </w:t>
+      </w:r>
+      <w:r>
+        <w:rPr>
+          <w:rFonts w:ascii="Aptos" w:hAnsi="Aptos"/>
+          <w:color w:val="000000"/>
+        </w:rPr>
+        <w:sym w:font="Wingdings" w:char="F0E0"/>
+      </w:r>
+      <w:r>
+        <w:rPr>
+          <w:rFonts w:ascii="Aptos" w:hAnsi="Aptos"/>
+          <w:color w:val="000000"/>
+        </w:rPr>
+        <w:t xml:space="preserve"> </w:t>
+      </w:r>
+      <w:r>
+        <w:rPr>
+          <w:rFonts w:ascii="Aptos" w:hAnsi="Aptos"/>
+          <w:b/>
+          <w:bCs/>
+          <w:color w:val="000000"/>
+        </w:rPr>
+        <w:t>'Capture Perf…</w:t>
+      </w:r>
+      <w:r>
+        <w:rPr>
+          <w:rFonts w:ascii="Aptos" w:hAnsi="Aptos"/>
+          <w:color w:val="000000"/>
+        </w:rPr>
+        <w:t xml:space="preserve">' and </w:t>
+      </w:r>
+      <w:r>
+        <w:rPr>
+          <w:rFonts w:ascii="Aptos" w:hAnsi="Aptos"/>
+          <w:b/>
+          <w:bCs/>
+          <w:color w:val="000000"/>
+        </w:rPr>
+        <w:t>'End Perf</w:t>
+      </w:r>
+      <w:r>
+        <w:rPr>
+          <w:rFonts w:ascii="Aptos" w:hAnsi="Aptos"/>
+          <w:color w:val="000000"/>
+        </w:rPr>
+        <w:t xml:space="preserve">' </w:t>
+      </w:r>
+      <w:r>
+        <w:rPr>
+          <w:rFonts w:ascii="Aptos" w:hAnsi="Aptos"/>
+          <w:color w:val="000000"/>
+        </w:rPr>
+        <w:t>menu items</w:t>
+      </w:r>
+      <w:r>
+        <w:rPr>
+          <w:rFonts w:ascii="Aptos" w:hAnsi="Aptos"/>
+          <w:color w:val="000000"/>
+        </w:rPr>
+        <w:t xml:space="preserve">, </w:t>
+      </w:r>
+      <w:r>
+        <w:rPr>
+          <w:rFonts w:ascii="Aptos" w:hAnsi="Aptos"/>
+          <w:color w:val="000000"/>
+        </w:rPr>
+        <w:t xml:space="preserve">to </w:t>
+      </w:r>
+      <w:r>
+        <w:rPr>
+          <w:rFonts w:ascii="Aptos" w:hAnsi="Aptos"/>
+          <w:color w:val="000000"/>
+        </w:rPr>
+        <w:t>log</w:t>
+      </w:r>
+      <w:r>
+        <w:rPr>
+          <w:rFonts w:ascii="Aptos" w:hAnsi="Aptos"/>
+          <w:color w:val="000000"/>
+        </w:rPr>
+        <w:t xml:space="preserve"> </w:t>
+      </w:r>
+      <w:r>
+        <w:rPr>
+          <w:rFonts w:ascii="Aptos" w:hAnsi="Aptos"/>
+          <w:color w:val="000000"/>
+        </w:rPr>
+        <w:t>executed instruction</w:t>
+      </w:r>
+      <w:r>
+        <w:rPr>
+          <w:rFonts w:ascii="Aptos" w:hAnsi="Aptos"/>
+          <w:color w:val="000000"/>
+        </w:rPr>
+        <w:t xml:space="preserve"> </w:t>
+      </w:r>
+      <w:r>
+        <w:rPr>
+          <w:rFonts w:ascii="Aptos" w:hAnsi="Aptos"/>
+          <w:color w:val="000000"/>
+        </w:rPr>
+        <w:t xml:space="preserve">to </w:t>
+      </w:r>
+      <w:r>
+        <w:rPr>
+          <w:rFonts w:ascii="Aptos" w:hAnsi="Aptos"/>
+          <w:color w:val="000000"/>
+        </w:rPr>
+        <w:t xml:space="preserve">a </w:t>
+      </w:r>
+      <w:r>
+        <w:rPr>
+          <w:rFonts w:ascii="Aptos" w:hAnsi="Aptos"/>
+          <w:b/>
+          <w:color w:val="000000"/>
+        </w:rPr>
+        <w:t>.perf</w:t>
+      </w:r>
+      <w:r>
+        <w:rPr>
+          <w:rFonts w:ascii="Aptos" w:hAnsi="Aptos"/>
+          <w:color w:val="000000"/>
+        </w:rPr>
+        <w:t xml:space="preserve"> file.</w:t>
+      </w:r>
+      <w:r>
+        <w:rPr>
+          <w:rFonts w:ascii="Aptos" w:hAnsi="Aptos"/>
+          <w:color w:val="000000"/>
+        </w:rPr>
+        <w:t xml:space="preserve">  See </w:t>
+      </w:r>
+      <w:r>
+        <w:rPr>
+          <w:rFonts w:ascii="Aptos" w:hAnsi="Aptos"/>
+          <w:color w:val="000000"/>
+        </w:rPr>
+        <w:t>A</w:t>
+      </w:r>
+      <w:r>
+        <w:rPr>
+          <w:rFonts w:ascii="Aptos" w:hAnsi="Aptos"/>
+          <w:color w:val="000000"/>
+        </w:rPr>
+        <w:t>ppendix for file format.</w:t>
+      </w:r>
+    </w:p>
+    <w:p>
+      <w:r>
+        <w:t xml:space="preserve">I then developed a </w:t>
+      </w:r>
+      <w:r>
+        <w:t xml:space="preserve">Windows </w:t>
+      </w:r>
+      <w:r>
+        <w:t>application</w:t>
+      </w:r>
+      <w:r>
+        <w:t xml:space="preserve">, </w:t>
+      </w:r>
+      <w:proofErr w:type="spellStart"/>
+      <w:r>
+        <w:rPr>
+          <w:b/>
+          <w:bCs/>
+        </w:rPr>
+        <w:t>BeebPerf</w:t>
+      </w:r>
+      <w:proofErr w:type="spellEnd"/>
+      <w:r>
+        <w:t xml:space="preserve">, </w:t>
+      </w:r>
+      <w:r>
+        <w:t>that read</w:t>
+      </w:r>
+      <w:r>
+        <w:t>s</w:t>
+      </w:r>
+      <w:r>
+        <w:t xml:space="preserve"> </w:t>
+      </w:r>
+      <w:r>
+        <w:t>a</w:t>
+      </w:r>
+      <w:r>
+        <w:t xml:space="preserve"> </w:t>
+      </w:r>
+      <w:r>
+        <w:rPr>
+          <w:b/>
+          <w:bCs/>
+        </w:rPr>
+        <w:t xml:space="preserve">.perf </w:t>
+      </w:r>
+      <w:r>
+        <w:t xml:space="preserve">file, </w:t>
+      </w:r>
+      <w:r>
+        <w:t>analyzes</w:t>
+      </w:r>
+      <w:r>
+        <w:t xml:space="preserve"> </w:t>
+      </w:r>
+      <w:r>
+        <w:t>the contained logged instructions</w:t>
+      </w:r>
+      <w:r>
+        <w:t xml:space="preserve">, and </w:t>
+      </w:r>
+      <w:r>
+        <w:t>presents</w:t>
+      </w:r>
+      <w:r>
+        <w:t xml:space="preserve"> </w:t>
+      </w:r>
+      <w:r>
+        <w:t xml:space="preserve">the </w:t>
+      </w:r>
+      <w:r>
+        <w:t>results</w:t>
+      </w:r>
+      <w:r>
+        <w:t>.</w:t>
+      </w:r>
+    </w:p>
+    <w:p>
+      <w:pPr>
+        <w:pStyle w:val="Heading1"/>
+      </w:pPr>
+      <w:r>
+        <w:t>BeebEm changes</w:t>
+      </w:r>
+    </w:p>
+    <w:p>
+      <w:r>
+        <w:t xml:space="preserve">BeebEm is modified to generate a </w:t>
+      </w:r>
+      <w:r>
+        <w:rPr>
+          <w:b/>
+          <w:bCs/>
+        </w:rPr>
+        <w:t>.perf</w:t>
+      </w:r>
+      <w:r>
+        <w:t xml:space="preserve"> file</w:t>
+      </w:r>
+      <w:r>
+        <w:t xml:space="preserve"> (see </w:t>
+      </w:r>
+      <w:r>
+        <w:rPr>
+          <w:b/>
+          <w:bCs/>
+        </w:rPr>
+        <w:t>BeebEm Code Changes</w:t>
+      </w:r>
+      <w:r>
+        <w:t xml:space="preserve"> for details).</w:t>
+      </w:r>
+    </w:p>
+    <w:p>
+      <w:r>
+        <w:t xml:space="preserve">The changes add </w:t>
+      </w:r>
+      <w:r>
+        <w:rPr>
+          <w:b/>
+          <w:bCs/>
+        </w:rPr>
+        <w:t>Capture Perf…</w:t>
+      </w:r>
+      <w:r>
+        <w:t xml:space="preserve"> and </w:t>
+      </w:r>
+      <w:r>
+        <w:rPr>
+          <w:b/>
+          <w:bCs/>
+        </w:rPr>
+        <w:t>End Perf</w:t>
+      </w:r>
+      <w:r>
+        <w:rPr>
+          <w:b/>
+          <w:bCs/>
+        </w:rPr>
+        <w:t xml:space="preserve"> </w:t>
+      </w:r>
+      <w:r>
+        <w:t>File menu</w:t>
+      </w:r>
+      <w:r>
+        <w:t xml:space="preserve"> items allowing a performance trace to be recorded to a </w:t>
+      </w:r>
+      <w:r>
+        <w:rPr>
+          <w:b/>
+          <w:bCs/>
+        </w:rPr>
+        <w:t>.perf</w:t>
+      </w:r>
+      <w:r>
+        <w:t xml:space="preserve"> file.</w:t>
+      </w:r>
+    </w:p>
+    <w:p>
+      <w:r>
+        <w:t>A modified version of BeebEm can be built using Visual Studio (2022 or 2026) using the following instructions:</w:t>
+      </w:r>
+    </w:p>
+    <w:p>
+      <w:pPr>
+        <w:pStyle w:val="ListParagraph"/>
+        <w:numPr>
+          <w:ilvl w:val="0"/>
+          <w:numId w:val="56"/>
+        </w:numPr>
+      </w:pPr>
+      <w:r>
+        <w:t xml:space="preserve">Using the </w:t>
+      </w:r>
+      <w:r>
+        <w:rPr>
+          <w:b/>
+          <w:bCs/>
+        </w:rPr>
+        <w:t xml:space="preserve">Tools </w:t>
+      </w:r>
+      <w:r>
+        <w:rPr>
+          <w:b/>
+          <w:bCs/>
+        </w:rPr>
+        <w:sym w:font="Wingdings" w:char="F0E0"/>
+      </w:r>
+      <w:r>
+        <w:rPr>
+          <w:b/>
+          <w:bCs/>
+        </w:rPr>
+        <w:t xml:space="preserve"> Get Tools and Features</w:t>
+      </w:r>
+      <w:r>
+        <w:t>… menu option, ensure the following components are installed:</w:t>
+      </w:r>
+    </w:p>
+    <w:p>
+      <w:pPr>
+        <w:pStyle w:val="ListParagraph"/>
+        <w:numPr>
+          <w:ilvl w:val="0"/>
+          <w:numId w:val="57"/>
+        </w:numPr>
+      </w:pPr>
+      <w:r>
+        <w:t>MSVS v142 – VS 2019 C++ x64/x86 build tools (v14.29 – 16.11)</w:t>
+      </w:r>
+    </w:p>
+    <w:p>
+      <w:pPr>
+        <w:pStyle w:val="ListParagraph"/>
+        <w:numPr>
+          <w:ilvl w:val="0"/>
+          <w:numId w:val="57"/>
+        </w:numPr>
+      </w:pPr>
+      <w:r>
+        <w:t xml:space="preserve">C++ v14.29 (16.11) MFC for v142 build tool (x86 &amp; x64) – only needed for </w:t>
+      </w:r>
+      <w:proofErr w:type="spellStart"/>
+      <w:r>
+        <w:t>afxres.h</w:t>
+      </w:r>
+      <w:proofErr w:type="spellEnd"/>
+      <w:r>
+        <w:t>/</w:t>
+      </w:r>
+      <w:proofErr w:type="spellStart"/>
+      <w:r>
+        <w:t>rc</w:t>
+      </w:r>
+      <w:proofErr w:type="spellEnd"/>
+    </w:p>
+    <w:p>
+      <w:pPr>
+        <w:pStyle w:val="ListParagraph"/>
+        <w:numPr>
+          <w:ilvl w:val="0"/>
+          <w:numId w:val="56"/>
+        </w:numPr>
+      </w:pPr>
+      <w:r>
+        <w:t xml:space="preserve">Using the </w:t>
+      </w:r>
+      <w:r>
+        <w:rPr>
+          <w:b/>
+          <w:bCs/>
+        </w:rPr>
+        <w:t xml:space="preserve">Git </w:t>
+      </w:r>
+      <w:r>
+        <w:rPr>
+          <w:b/>
+          <w:bCs/>
+        </w:rPr>
+        <w:sym w:font="Wingdings" w:char="F0E0"/>
+      </w:r>
+      <w:r>
+        <w:rPr>
+          <w:b/>
+          <w:bCs/>
+        </w:rPr>
+        <w:t xml:space="preserve"> Clone Repository</w:t>
+      </w:r>
+      <w:r>
+        <w:rPr>
+          <w:b/>
+          <w:bCs/>
+        </w:rPr>
+        <w:t>…</w:t>
+      </w:r>
+      <w:r>
+        <w:t xml:space="preserve"> menu option, clone the BeebEm repository: </w:t>
+      </w:r>
+      <w:r>
+        <w:t>https://github.com/stardot/beebem-windows.git</w:t>
+      </w:r>
+      <w:r>
+        <w:t>.</w:t>
+      </w:r>
+    </w:p>
+    <w:p>
+      <w:pPr>
+        <w:pStyle w:val="ListParagraph"/>
+        <w:numPr>
+          <w:ilvl w:val="0"/>
+          <w:numId w:val="56"/>
+        </w:numPr>
+      </w:pPr>
+      <w:r>
+        <w:t xml:space="preserve">Using the </w:t>
+      </w:r>
+      <w:r>
+        <w:rPr>
+          <w:b/>
+          <w:bCs/>
+        </w:rPr>
+        <w:t xml:space="preserve">Git </w:t>
+      </w:r>
+      <w:r>
+        <w:rPr>
+          <w:b/>
+          <w:bCs/>
+        </w:rPr>
+        <w:sym w:font="Wingdings" w:char="F0E0"/>
+      </w:r>
+      <w:r>
+        <w:rPr>
+          <w:b/>
+          <w:bCs/>
+        </w:rPr>
+        <w:t xml:space="preserve"> Open </w:t>
+      </w:r>
+      <w:r>
+        <w:rPr>
+          <w:b/>
+          <w:bCs/>
+        </w:rPr>
+        <w:t xml:space="preserve">in </w:t>
+      </w:r>
+      <w:r>
+        <w:rPr>
+          <w:b/>
+          <w:bCs/>
+        </w:rPr>
+        <w:t>Command Prompt</w:t>
+      </w:r>
+      <w:r>
+        <w:t xml:space="preserve"> menu option, execute the following git command to apply the change</w:t>
+      </w:r>
+      <w:r>
+        <w:t>s.</w:t>
+      </w:r>
+      <w:r>
+        <w:br/>
+      </w:r>
+      <w:r>
+        <w:t>git apply ..\</w:t>
+      </w:r>
+      <w:proofErr w:type="spellStart"/>
+      <w:r>
+        <w:t>beebperf</w:t>
+      </w:r>
+      <w:proofErr w:type="spellEnd"/>
+      <w:r>
+        <w:t>\</w:t>
+      </w:r>
+      <w:proofErr w:type="spellStart"/>
+      <w:r>
+        <w:t>beebem_changelist.diff</w:t>
+      </w:r>
+      <w:proofErr w:type="spellEnd"/>
+    </w:p>
+    <w:p>
+      <w:pPr>
+        <w:pStyle w:val="ListParagraph"/>
+        <w:numPr>
+          <w:ilvl w:val="0"/>
+          <w:numId w:val="56"/>
+        </w:numPr>
+      </w:pPr>
+      <w:r>
+        <w:lastRenderedPageBreak/>
+        <w:t>Reopen and rebuild the solution.</w:t>
+      </w:r>
+    </w:p>
+    <w:p>
+      <w:pPr>
+        <w:pStyle w:val="Heading2"/>
+      </w:pPr>
+      <w:r>
+        <w:t xml:space="preserve">Recording </w:t>
+      </w:r>
+      <w:r>
+        <w:t>a .Perf file</w:t>
+      </w:r>
+    </w:p>
+    <w:p>
+      <w:r>
+        <w:t xml:space="preserve">To start a performance recording select the </w:t>
+      </w:r>
+      <w:r>
+        <w:rPr>
+          <w:b/>
+          <w:bCs/>
+        </w:rPr>
+        <w:t>Capture Perf…</w:t>
+      </w:r>
+      <w:r>
+        <w:t xml:space="preserve"> menu item, choosing the name of the file to create.  To end the recording, select the </w:t>
+      </w:r>
+      <w:r>
+        <w:rPr>
+          <w:b/>
+          <w:bCs/>
+        </w:rPr>
+        <w:t>End Perf</w:t>
+      </w:r>
+      <w:r>
+        <w:t xml:space="preserve"> menu item.</w:t>
+      </w:r>
+    </w:p>
+    <w:p>
+      <w:r>
+        <w:t xml:space="preserve">Keep recording times </w:t>
+      </w:r>
+      <w:r>
+        <w:t xml:space="preserve">to </w:t>
+      </w:r>
+      <w:r>
+        <w:t>under a minute.</w:t>
+      </w:r>
+      <w:r>
+        <w:t xml:space="preserve">  A one</w:t>
+      </w:r>
+      <w:r>
+        <w:t>-</w:t>
+      </w:r>
+      <w:r>
+        <w:t xml:space="preserve">minute recording will </w:t>
+      </w:r>
+      <w:r>
+        <w:t xml:space="preserve">use </w:t>
+      </w:r>
+      <w:r>
+        <w:t xml:space="preserve">approximately </w:t>
+      </w:r>
+      <w:r>
+        <w:t xml:space="preserve">40Mb to 80Mb of disk space and may take more than fifteen seconds to load in </w:t>
+      </w:r>
+      <w:proofErr w:type="spellStart"/>
+      <w:r>
+        <w:rPr>
+          <w:b/>
+          <w:bCs/>
+        </w:rPr>
+        <w:t>BeebPerf</w:t>
+      </w:r>
+      <w:proofErr w:type="spellEnd"/>
+      <w:r>
+        <w:t xml:space="preserve">. </w:t>
+      </w:r>
+    </w:p>
+    <w:p>
+      <w:r>
+        <w:t>And a</w:t>
+      </w:r>
+      <w:r>
+        <w:t xml:space="preserve">void </w:t>
+      </w:r>
+      <w:r>
+        <w:t>recording</w:t>
+      </w:r>
+      <w:r>
+        <w:t xml:space="preserve"> disc activity, if code is being loaded.  </w:t>
+      </w:r>
+      <w:proofErr w:type="spellStart"/>
+      <w:r>
+        <w:rPr>
+          <w:b/>
+          <w:bCs/>
+        </w:rPr>
+        <w:t>BeebPerf</w:t>
+      </w:r>
+      <w:proofErr w:type="spellEnd"/>
+      <w:r>
+        <w:rPr>
+          <w:b/>
+          <w:bCs/>
+        </w:rPr>
+        <w:t xml:space="preserve"> </w:t>
+      </w:r>
+      <w:r>
+        <w:t>get</w:t>
+      </w:r>
+      <w:r>
+        <w:t>s</w:t>
+      </w:r>
+      <w:r>
+        <w:t xml:space="preserve"> confused by overlapping code</w:t>
+      </w:r>
+      <w:r>
+        <w:t>.</w:t>
+      </w:r>
+    </w:p>
+    <w:p>
+      <w:pPr>
+        <w:pStyle w:val="Heading2"/>
+      </w:pPr>
+      <w:r>
+        <w:t>Including labels</w:t>
+      </w:r>
+    </w:p>
+    <w:p>
+      <w:r>
+        <w:t>T</w:t>
+      </w:r>
+      <w:r>
+        <w:t xml:space="preserve">he </w:t>
+      </w:r>
+      <w:r>
+        <w:rPr>
+          <w:b/>
+          <w:bCs/>
+        </w:rPr>
+        <w:t>BeebEm</w:t>
+      </w:r>
+      <w:r>
+        <w:rPr>
+          <w:b/>
+          <w:bCs/>
+        </w:rPr>
+        <w:t>.exe</w:t>
+      </w:r>
+      <w:r>
+        <w:t xml:space="preserve"> </w:t>
+      </w:r>
+      <w:r>
+        <w:rPr>
+          <w:b/>
+          <w:bCs/>
+        </w:rPr>
+        <w:t>-</w:t>
+      </w:r>
+      <w:proofErr w:type="spellStart"/>
+      <w:r>
+        <w:rPr>
+          <w:b/>
+          <w:bCs/>
+        </w:rPr>
+        <w:t>DebugLabels</w:t>
+      </w:r>
+      <w:proofErr w:type="spellEnd"/>
+      <w:r>
+        <w:rPr>
+          <w:b/>
+          <w:bCs/>
+        </w:rPr>
+        <w:t xml:space="preserve"> &lt;file&gt;</w:t>
+      </w:r>
+      <w:r>
+        <w:t xml:space="preserve"> command line option can be used to embed labels within generated .perf files</w:t>
+      </w:r>
+      <w:r>
+        <w:t>.</w:t>
+      </w:r>
+      <w:r>
+        <w:t xml:space="preserve"> </w:t>
+      </w:r>
+      <w:r>
+        <w:t xml:space="preserve"> This </w:t>
+      </w:r>
+      <w:r>
+        <w:t>can be jolly useful.</w:t>
+      </w:r>
+      <w:r>
+        <w:t xml:space="preserve"> </w:t>
+      </w:r>
+      <w:r>
+        <w:t xml:space="preserve"> Alternatively, label files can be side loaded into </w:t>
+      </w:r>
+      <w:proofErr w:type="spellStart"/>
+      <w:r>
+        <w:rPr>
+          <w:b/>
+          <w:bCs/>
+        </w:rPr>
+        <w:t>BeebPerf</w:t>
+      </w:r>
+      <w:proofErr w:type="spellEnd"/>
+      <w:r>
+        <w:rPr>
+          <w:b/>
+          <w:bCs/>
+        </w:rPr>
+        <w:t xml:space="preserve"> </w:t>
+      </w:r>
+      <w:r>
+        <w:t xml:space="preserve">using its </w:t>
+      </w:r>
+      <w:r>
+        <w:t>Labels dialog.</w:t>
+      </w:r>
+    </w:p>
+    <w:p>
+      <w:r>
+        <w:t xml:space="preserve">Files compatible with the </w:t>
+      </w:r>
+      <w:r>
+        <w:rPr>
+          <w:b/>
+          <w:bCs/>
+        </w:rPr>
+        <w:t>-</w:t>
+      </w:r>
+      <w:proofErr w:type="spellStart"/>
+      <w:r>
+        <w:rPr>
+          <w:b/>
+          <w:bCs/>
+        </w:rPr>
+        <w:t>DebugLabels</w:t>
+      </w:r>
+      <w:proofErr w:type="spellEnd"/>
+      <w:r>
+        <w:t xml:space="preserve"> option include:</w:t>
       </w:r>
     </w:p>
     <w:p>
@@ -19,7 +1037,44 @@
         </w:numPr>
       </w:pPr>
       <w:r>
-        <w:t>Caller/Callee bug where parents of IRQ are shown.</w:t>
+        <w:t xml:space="preserve">Labels files generated using </w:t>
+      </w:r>
+      <w:r>
+        <w:rPr>
+          <w:b/>
+          <w:bCs/>
+        </w:rPr>
+        <w:t>BeebAsm</w:t>
+      </w:r>
+      <w:r>
+        <w:rPr>
+          <w:b/>
+          <w:bCs/>
+        </w:rPr>
+        <w:t>.exe</w:t>
+      </w:r>
+      <w:r>
+        <w:t xml:space="preserve"> </w:t>
+      </w:r>
+      <w:r>
+        <w:rPr>
+          <w:b/>
+          <w:bCs/>
+        </w:rPr>
+        <w:t>-labels</w:t>
+      </w:r>
+      <w:r>
+        <w:t xml:space="preserve"> </w:t>
+      </w:r>
+      <w:r>
+        <w:rPr>
+          <w:b/>
+          <w:bCs/>
+        </w:rPr>
+        <w:t>&lt;file&gt;</w:t>
+      </w:r>
+      <w:r>
+        <w:t xml:space="preserve"> command line option.</w:t>
       </w:r>
     </w:p>
     <w:p>
@@ -31,1093 +1086,6 @@
         </w:numPr>
       </w:pPr>
       <w:r>
-        <w:t>Move flip view and layout to settings</w:t>
-      </w:r>
-    </w:p>
-    <w:p>
-      <w:pPr>
-        <w:pStyle w:val="Title"/>
-      </w:pPr>
-      <w:r>
-        <w:t>BBC Micro</w:t>
-      </w:r>
-      <w:r>
-        <w:t xml:space="preserve"> Profiler</w:t>
-      </w:r>
-      <w:r>
-        <w:t xml:space="preserve"> </w:t>
-      </w:r>
-    </w:p>
-    <w:p>
-      <w:r>
-        <w:t>After finishing ‘</w:t>
-      </w:r>
-      <w:r>
-        <w:t xml:space="preserve">An Adventure </w:t>
-      </w:r>
-      <w:r>
-        <w:t>i</w:t>
-      </w:r>
-      <w:r>
-        <w:t>n Time’</w:t>
-      </w:r>
-      <w:r>
-        <w:t xml:space="preserve">, I needed something to </w:t>
-      </w:r>
-      <w:r>
-        <w:t>do,</w:t>
-      </w:r>
-      <w:r>
-        <w:t xml:space="preserve"> and I thought I could use my stills to help others </w:t>
-      </w:r>
-      <w:r>
-        <w:t>develop</w:t>
-      </w:r>
-      <w:r>
-        <w:t xml:space="preserve"> games for the BBC Micro</w:t>
-      </w:r>
-      <w:r>
-        <w:t>.</w:t>
-      </w:r>
-    </w:p>
-    <w:p>
-      <w:r>
-        <w:t xml:space="preserve">One thing </w:t>
-      </w:r>
-      <w:r>
-        <w:t xml:space="preserve">that I </w:t>
-      </w:r>
-      <w:r>
-        <w:t xml:space="preserve">really </w:t>
-      </w:r>
-      <w:r>
-        <w:t>could have use</w:t>
-      </w:r>
-      <w:r>
-        <w:t>d</w:t>
-      </w:r>
-      <w:r>
-        <w:t xml:space="preserve"> when </w:t>
-      </w:r>
-      <w:r>
-        <w:t xml:space="preserve">writing the game was a </w:t>
-      </w:r>
-      <w:r>
-        <w:t>graphical</w:t>
-      </w:r>
-      <w:r>
-        <w:t>-</w:t>
-      </w:r>
-      <w:r>
-        <w:t xml:space="preserve">based </w:t>
-      </w:r>
-      <w:r>
-        <w:t>profiler</w:t>
-      </w:r>
-      <w:r>
-        <w:t xml:space="preserve">, </w:t>
-      </w:r>
-      <w:r>
-        <w:t>like</w:t>
-      </w:r>
-      <w:r>
-        <w:t xml:space="preserve"> </w:t>
-      </w:r>
-      <w:r>
-        <w:t xml:space="preserve">the one found in </w:t>
-      </w:r>
-      <w:r>
-        <w:t>Visual Studio</w:t>
-      </w:r>
-      <w:r>
-        <w:t>.</w:t>
-      </w:r>
-      <w:r>
-        <w:t xml:space="preserve">  I imagine other</w:t>
-      </w:r>
-      <w:r>
-        <w:t>s</w:t>
-      </w:r>
-      <w:r>
-        <w:t xml:space="preserve"> would also find this useful</w:t>
-      </w:r>
-      <w:r>
-        <w:t>.</w:t>
-      </w:r>
-    </w:p>
-    <w:p>
-      <w:pPr>
-        <w:pStyle w:val="Heading1"/>
-      </w:pPr>
-      <w:r>
-        <w:t>Approach</w:t>
-      </w:r>
-    </w:p>
-    <w:p>
-      <w:r>
-        <w:t xml:space="preserve">Profilers </w:t>
-      </w:r>
-      <w:r>
-        <w:t xml:space="preserve">typically </w:t>
-      </w:r>
-      <w:r>
-        <w:t>do three things</w:t>
-      </w:r>
-      <w:r>
-        <w:t xml:space="preserve">: </w:t>
-      </w:r>
-      <w:r>
-        <w:rPr>
-          <w:b/>
-          <w:bCs/>
-        </w:rPr>
-        <w:t>Measure</w:t>
-      </w:r>
-      <w:r>
-        <w:t xml:space="preserve"> </w:t>
-      </w:r>
-      <w:r>
-        <w:sym w:font="Wingdings" w:char="F0E0"/>
-      </w:r>
-      <w:r>
-        <w:t xml:space="preserve"> </w:t>
-      </w:r>
-      <w:r>
-        <w:rPr>
-          <w:b/>
-          <w:bCs/>
-        </w:rPr>
-        <w:t>Analy</w:t>
-      </w:r>
-      <w:r>
-        <w:rPr>
-          <w:b/>
-          <w:bCs/>
-        </w:rPr>
-        <w:t>sis</w:t>
-      </w:r>
-      <w:r>
-        <w:t xml:space="preserve"> </w:t>
-      </w:r>
-      <w:r>
-        <w:sym w:font="Wingdings" w:char="F0E0"/>
-      </w:r>
-      <w:r>
-        <w:t xml:space="preserve"> </w:t>
-      </w:r>
-      <w:r>
-        <w:rPr>
-          <w:b/>
-          <w:bCs/>
-        </w:rPr>
-        <w:t>Present</w:t>
-      </w:r>
-      <w:r>
-        <w:t xml:space="preserve"> </w:t>
-      </w:r>
-      <w:r>
-        <w:rPr>
-          <w:b/>
-          <w:bCs/>
-        </w:rPr>
-        <w:t>Results</w:t>
-      </w:r>
-    </w:p>
-    <w:p>
-      <w:r>
-        <w:rPr>
-          <w:rFonts w:ascii="Aptos" w:hAnsi="Aptos"/>
-          <w:color w:val="000000"/>
-        </w:rPr>
-        <w:t xml:space="preserve">The easiest way to measure 6502 code is by logging executed instructions </w:t>
-      </w:r>
-      <w:r>
-        <w:rPr>
-          <w:rFonts w:ascii="Aptos" w:hAnsi="Aptos"/>
-          <w:color w:val="000000"/>
-        </w:rPr>
-        <w:t>within</w:t>
-      </w:r>
-      <w:r>
-        <w:rPr>
-          <w:rFonts w:ascii="Aptos" w:hAnsi="Aptos"/>
-          <w:color w:val="000000"/>
-        </w:rPr>
-        <w:t xml:space="preserve"> an emulator like </w:t>
-      </w:r>
-      <w:r>
-        <w:rPr>
-          <w:rFonts w:ascii="Aptos" w:hAnsi="Aptos"/>
-          <w:b/>
-          <w:color w:val="000000"/>
-        </w:rPr>
-        <w:t>BeebEm</w:t>
-      </w:r>
-      <w:r>
-        <w:t>.</w:t>
-      </w:r>
-    </w:p>
-    <w:p>
-      <w:pPr>
-        <w:rPr>
-          <w:rFonts w:ascii="Aptos" w:hAnsi="Aptos"/>
-          <w:color w:val="000000"/>
-        </w:rPr>
-      </w:pPr>
-      <w:r>
-        <w:t xml:space="preserve">To this end, </w:t>
-      </w:r>
-      <w:r>
-        <w:t xml:space="preserve">I </w:t>
-      </w:r>
-      <w:r>
-        <w:t xml:space="preserve">modified BeebEm, </w:t>
-      </w:r>
-      <w:r>
-        <w:t>add</w:t>
-      </w:r>
-      <w:r>
-        <w:t>ing</w:t>
-      </w:r>
-      <w:r>
-        <w:t xml:space="preserve"> n</w:t>
-      </w:r>
-      <w:r>
-        <w:t>ew</w:t>
-      </w:r>
-      <w:r>
-        <w:rPr>
-          <w:rFonts w:ascii="Aptos" w:hAnsi="Aptos"/>
-          <w:b/>
-          <w:bCs/>
-          <w:color w:val="000000"/>
-        </w:rPr>
-        <w:t xml:space="preserve"> </w:t>
-      </w:r>
-      <w:r>
-        <w:rPr>
-          <w:rFonts w:ascii="Aptos" w:hAnsi="Aptos"/>
-          <w:color w:val="000000"/>
-        </w:rPr>
-        <w:t xml:space="preserve">File </w:t>
-      </w:r>
-      <w:r>
-        <w:rPr>
-          <w:rFonts w:ascii="Aptos" w:hAnsi="Aptos"/>
-          <w:color w:val="000000"/>
-        </w:rPr>
-        <w:sym w:font="Wingdings" w:char="F0E0"/>
-      </w:r>
-      <w:r>
-        <w:rPr>
-          <w:rFonts w:ascii="Aptos" w:hAnsi="Aptos"/>
-          <w:color w:val="000000"/>
-        </w:rPr>
-        <w:t xml:space="preserve"> </w:t>
-      </w:r>
-      <w:r>
-        <w:rPr>
-          <w:rFonts w:ascii="Aptos" w:hAnsi="Aptos"/>
-          <w:b/>
-          <w:bCs/>
-          <w:color w:val="000000"/>
-        </w:rPr>
-        <w:t>'Capture Perf…</w:t>
-      </w:r>
-      <w:r>
-        <w:rPr>
-          <w:rFonts w:ascii="Aptos" w:hAnsi="Aptos"/>
-          <w:color w:val="000000"/>
-        </w:rPr>
-        <w:t xml:space="preserve">' and </w:t>
-      </w:r>
-      <w:r>
-        <w:rPr>
-          <w:rFonts w:ascii="Aptos" w:hAnsi="Aptos"/>
-          <w:b/>
-          <w:bCs/>
-          <w:color w:val="000000"/>
-        </w:rPr>
-        <w:t>'End Perf</w:t>
-      </w:r>
-      <w:r>
-        <w:rPr>
-          <w:rFonts w:ascii="Aptos" w:hAnsi="Aptos"/>
-          <w:color w:val="000000"/>
-        </w:rPr>
-        <w:t xml:space="preserve">' </w:t>
-      </w:r>
-      <w:r>
-        <w:rPr>
-          <w:rFonts w:ascii="Aptos" w:hAnsi="Aptos"/>
-          <w:color w:val="000000"/>
-        </w:rPr>
-        <w:t>menu items</w:t>
-      </w:r>
-      <w:r>
-        <w:rPr>
-          <w:rFonts w:ascii="Aptos" w:hAnsi="Aptos"/>
-          <w:color w:val="000000"/>
-        </w:rPr>
-        <w:t xml:space="preserve">, </w:t>
-      </w:r>
-      <w:r>
-        <w:rPr>
-          <w:rFonts w:ascii="Aptos" w:hAnsi="Aptos"/>
-          <w:color w:val="000000"/>
-        </w:rPr>
-        <w:t xml:space="preserve">to </w:t>
-      </w:r>
-      <w:r>
-        <w:rPr>
-          <w:rFonts w:ascii="Aptos" w:hAnsi="Aptos"/>
-          <w:color w:val="000000"/>
-        </w:rPr>
-        <w:t>log</w:t>
-      </w:r>
-      <w:r>
-        <w:rPr>
-          <w:rFonts w:ascii="Aptos" w:hAnsi="Aptos"/>
-          <w:color w:val="000000"/>
-        </w:rPr>
-        <w:t xml:space="preserve"> </w:t>
-      </w:r>
-      <w:r>
-        <w:rPr>
-          <w:rFonts w:ascii="Aptos" w:hAnsi="Aptos"/>
-          <w:color w:val="000000"/>
-        </w:rPr>
-        <w:t>executed instruction</w:t>
-      </w:r>
-      <w:r>
-        <w:rPr>
-          <w:rFonts w:ascii="Aptos" w:hAnsi="Aptos"/>
-          <w:color w:val="000000"/>
-        </w:rPr>
-        <w:t xml:space="preserve"> </w:t>
-      </w:r>
-      <w:r>
-        <w:rPr>
-          <w:rFonts w:ascii="Aptos" w:hAnsi="Aptos"/>
-          <w:color w:val="000000"/>
-        </w:rPr>
-        <w:t xml:space="preserve">to </w:t>
-      </w:r>
-      <w:r>
-        <w:rPr>
-          <w:rFonts w:ascii="Aptos" w:hAnsi="Aptos"/>
-          <w:color w:val="000000"/>
-        </w:rPr>
-        <w:t xml:space="preserve">a </w:t>
-      </w:r>
-      <w:r>
-        <w:rPr>
-          <w:rFonts w:ascii="Aptos" w:hAnsi="Aptos"/>
-          <w:b/>
-          <w:color w:val="000000"/>
-        </w:rPr>
-        <w:t>.perf</w:t>
-      </w:r>
-      <w:r>
-        <w:rPr>
-          <w:rFonts w:ascii="Aptos" w:hAnsi="Aptos"/>
-          <w:color w:val="000000"/>
-        </w:rPr>
-        <w:t xml:space="preserve"> file.</w:t>
-      </w:r>
-      <w:r>
-        <w:rPr>
-          <w:rFonts w:ascii="Aptos" w:hAnsi="Aptos"/>
-          <w:color w:val="000000"/>
-        </w:rPr>
-        <w:t xml:space="preserve">  See </w:t>
-      </w:r>
-      <w:r>
-        <w:rPr>
-          <w:rFonts w:ascii="Aptos" w:hAnsi="Aptos"/>
-          <w:color w:val="000000"/>
-        </w:rPr>
-        <w:t>A</w:t>
-      </w:r>
-      <w:r>
-        <w:rPr>
-          <w:rFonts w:ascii="Aptos" w:hAnsi="Aptos"/>
-          <w:color w:val="000000"/>
-        </w:rPr>
-        <w:t>ppendix for file format.</w:t>
-      </w:r>
-    </w:p>
-    <w:p>
-      <w:r>
-        <w:t xml:space="preserve">I then developed a </w:t>
-      </w:r>
-      <w:r>
-        <w:t xml:space="preserve">Windows </w:t>
-      </w:r>
-      <w:r>
-        <w:t>application</w:t>
-      </w:r>
-      <w:r>
-        <w:t xml:space="preserve">, </w:t>
-      </w:r>
-      <w:proofErr w:type="spellStart"/>
-      <w:r>
-        <w:rPr>
-          <w:b/>
-          <w:bCs/>
-        </w:rPr>
-        <w:t>BeebPerf</w:t>
-      </w:r>
-      <w:proofErr w:type="spellEnd"/>
-      <w:r>
-        <w:t xml:space="preserve">, </w:t>
-      </w:r>
-      <w:r>
-        <w:t>that read</w:t>
-      </w:r>
-      <w:r>
-        <w:t>s</w:t>
-      </w:r>
-      <w:r>
-        <w:t xml:space="preserve"> </w:t>
-      </w:r>
-      <w:r>
-        <w:t>a</w:t>
-      </w:r>
-      <w:r>
-        <w:t xml:space="preserve"> </w:t>
-      </w:r>
-      <w:r>
-        <w:rPr>
-          <w:b/>
-          <w:bCs/>
-        </w:rPr>
-        <w:t xml:space="preserve">.perf </w:t>
-      </w:r>
-      <w:r>
-        <w:t xml:space="preserve">file, </w:t>
-      </w:r>
-      <w:r>
-        <w:t>analyzes</w:t>
-      </w:r>
-      <w:r>
-        <w:t xml:space="preserve"> </w:t>
-      </w:r>
-      <w:r>
-        <w:t>the contained logged instructions</w:t>
-      </w:r>
-      <w:r>
-        <w:t xml:space="preserve">, and </w:t>
-      </w:r>
-      <w:r>
-        <w:t>presents</w:t>
-      </w:r>
-      <w:r>
-        <w:t xml:space="preserve"> </w:t>
-      </w:r>
-      <w:r>
-        <w:t xml:space="preserve">the </w:t>
-      </w:r>
-      <w:r>
-        <w:t>results</w:t>
-      </w:r>
-      <w:r>
-        <w:t>.</w:t>
-      </w:r>
-    </w:p>
-    <w:p>
-      <w:pPr>
-        <w:pStyle w:val="Heading1"/>
-      </w:pPr>
-      <w:r>
-        <w:t>BeebEm changes</w:t>
-      </w:r>
-    </w:p>
-    <w:p>
-      <w:r>
-        <w:t xml:space="preserve">BeebEm is modified to generate a </w:t>
-      </w:r>
-      <w:r>
-        <w:rPr>
-          <w:b/>
-          <w:bCs/>
-        </w:rPr>
-        <w:t>.perf</w:t>
-      </w:r>
-      <w:r>
-        <w:t xml:space="preserve"> file</w:t>
-      </w:r>
-      <w:r>
-        <w:t xml:space="preserve"> (see </w:t>
-      </w:r>
-      <w:r>
-        <w:rPr>
-          <w:b/>
-          <w:bCs/>
-        </w:rPr>
-        <w:t>BeebEm Code Changes</w:t>
-      </w:r>
-      <w:r>
-        <w:t xml:space="preserve"> for details).</w:t>
-      </w:r>
-    </w:p>
-    <w:p>
-      <w:r>
-        <w:t xml:space="preserve">The changes add </w:t>
-      </w:r>
-      <w:r>
-        <w:rPr>
-          <w:b/>
-          <w:bCs/>
-        </w:rPr>
-        <w:t>Capture Perf…</w:t>
-      </w:r>
-      <w:r>
-        <w:t xml:space="preserve"> and </w:t>
-      </w:r>
-      <w:r>
-        <w:rPr>
-          <w:b/>
-          <w:bCs/>
-        </w:rPr>
-        <w:t>End Perf</w:t>
-      </w:r>
-      <w:r>
-        <w:rPr>
-          <w:b/>
-          <w:bCs/>
-        </w:rPr>
-        <w:t xml:space="preserve"> </w:t>
-      </w:r>
-      <w:r>
-        <w:t>File menu</w:t>
-      </w:r>
-      <w:r>
-        <w:t xml:space="preserve"> items allowing a performance trace to be recorded to a </w:t>
-      </w:r>
-      <w:r>
-        <w:rPr>
-          <w:b/>
-          <w:bCs/>
-        </w:rPr>
-        <w:t>.perf</w:t>
-      </w:r>
-      <w:r>
-        <w:t xml:space="preserve"> file.</w:t>
-      </w:r>
-    </w:p>
-    <w:p>
-      <w:r>
-        <w:t>A modified version of BeebEm can be built using Visual Studio (2022 or 2026) using the following instructions:</w:t>
-      </w:r>
-    </w:p>
-    <w:p>
-      <w:pPr>
-        <w:pStyle w:val="ListParagraph"/>
-        <w:numPr>
-          <w:ilvl w:val="0"/>
-          <w:numId w:val="56"/>
-        </w:numPr>
-      </w:pPr>
-      <w:r>
-        <w:t xml:space="preserve">Using the </w:t>
-      </w:r>
-      <w:r>
-        <w:rPr>
-          <w:b/>
-          <w:bCs/>
-        </w:rPr>
-        <w:t xml:space="preserve">Tools </w:t>
-      </w:r>
-      <w:r>
-        <w:rPr>
-          <w:b/>
-          <w:bCs/>
-        </w:rPr>
-        <w:sym w:font="Wingdings" w:char="F0E0"/>
-      </w:r>
-      <w:r>
-        <w:rPr>
-          <w:b/>
-          <w:bCs/>
-        </w:rPr>
-        <w:t xml:space="preserve"> Get Tools and Features</w:t>
-      </w:r>
-      <w:r>
-        <w:t>… menu option, ensure the following components are installed:</w:t>
-      </w:r>
-    </w:p>
-    <w:p>
-      <w:pPr>
-        <w:pStyle w:val="ListParagraph"/>
-        <w:numPr>
-          <w:ilvl w:val="0"/>
-          <w:numId w:val="57"/>
-        </w:numPr>
-      </w:pPr>
-      <w:r>
-        <w:t>MSVS v142 – VS 2019 C++ x64/x86 build tools (v14.29 – 16.11)</w:t>
-      </w:r>
-    </w:p>
-    <w:p>
-      <w:pPr>
-        <w:pStyle w:val="ListParagraph"/>
-        <w:numPr>
-          <w:ilvl w:val="0"/>
-          <w:numId w:val="57"/>
-        </w:numPr>
-      </w:pPr>
-      <w:r>
-        <w:t xml:space="preserve">C++ v14.29 (16.11) MFC for v142 build tool (x86 &amp; x64) – only needed for </w:t>
-      </w:r>
-      <w:proofErr w:type="spellStart"/>
-      <w:r>
-        <w:t>afxres.h</w:t>
-      </w:r>
-      <w:proofErr w:type="spellEnd"/>
-      <w:r>
-        <w:t>/</w:t>
-      </w:r>
-      <w:proofErr w:type="spellStart"/>
-      <w:r>
-        <w:t>rc</w:t>
-      </w:r>
-      <w:proofErr w:type="spellEnd"/>
-    </w:p>
-    <w:p>
-      <w:pPr>
-        <w:pStyle w:val="ListParagraph"/>
-        <w:numPr>
-          <w:ilvl w:val="0"/>
-          <w:numId w:val="56"/>
-        </w:numPr>
-      </w:pPr>
-      <w:r>
-        <w:lastRenderedPageBreak/>
-        <w:t xml:space="preserve">Using the </w:t>
-      </w:r>
-      <w:r>
-        <w:rPr>
-          <w:b/>
-          <w:bCs/>
-        </w:rPr>
-        <w:t xml:space="preserve">Git </w:t>
-      </w:r>
-      <w:r>
-        <w:rPr>
-          <w:b/>
-          <w:bCs/>
-        </w:rPr>
-        <w:sym w:font="Wingdings" w:char="F0E0"/>
-      </w:r>
-      <w:r>
-        <w:rPr>
-          <w:b/>
-          <w:bCs/>
-        </w:rPr>
-        <w:t xml:space="preserve"> Clone Repository</w:t>
-      </w:r>
-      <w:r>
-        <w:rPr>
-          <w:b/>
-          <w:bCs/>
-        </w:rPr>
-        <w:t>…</w:t>
-      </w:r>
-      <w:r>
-        <w:t xml:space="preserve"> menu option, clone the BeebEm repository: </w:t>
-      </w:r>
-      <w:r>
-        <w:t>https://github.com/stardot/beebem-windows.git</w:t>
-      </w:r>
-      <w:r>
-        <w:t>.</w:t>
-      </w:r>
-    </w:p>
-    <w:p>
-      <w:pPr>
-        <w:pStyle w:val="ListParagraph"/>
-        <w:numPr>
-          <w:ilvl w:val="0"/>
-          <w:numId w:val="56"/>
-        </w:numPr>
-      </w:pPr>
-      <w:r>
-        <w:t xml:space="preserve">Using the </w:t>
-      </w:r>
-      <w:r>
-        <w:rPr>
-          <w:b/>
-          <w:bCs/>
-        </w:rPr>
-        <w:t xml:space="preserve">Git </w:t>
-      </w:r>
-      <w:r>
-        <w:rPr>
-          <w:b/>
-          <w:bCs/>
-        </w:rPr>
-        <w:sym w:font="Wingdings" w:char="F0E0"/>
-      </w:r>
-      <w:r>
-        <w:rPr>
-          <w:b/>
-          <w:bCs/>
-        </w:rPr>
-        <w:t xml:space="preserve"> Open </w:t>
-      </w:r>
-      <w:r>
-        <w:rPr>
-          <w:b/>
-          <w:bCs/>
-        </w:rPr>
-        <w:t xml:space="preserve">in </w:t>
-      </w:r>
-      <w:r>
-        <w:rPr>
-          <w:b/>
-          <w:bCs/>
-        </w:rPr>
-        <w:t>Command Prompt</w:t>
-      </w:r>
-      <w:r>
-        <w:t xml:space="preserve"> menu option, execute the following git command to apply the change</w:t>
-      </w:r>
-      <w:r>
-        <w:t>s.</w:t>
-      </w:r>
-      <w:r>
-        <w:br/>
-      </w:r>
-      <w:r>
-        <w:t>git apply ..\</w:t>
-      </w:r>
-      <w:proofErr w:type="spellStart"/>
-      <w:r>
-        <w:t>beebperf</w:t>
-      </w:r>
-      <w:proofErr w:type="spellEnd"/>
-      <w:r>
-        <w:t>\</w:t>
-      </w:r>
-      <w:proofErr w:type="spellStart"/>
-      <w:r>
-        <w:t>beebem_changelist.diff</w:t>
-      </w:r>
-      <w:proofErr w:type="spellEnd"/>
-    </w:p>
-    <w:p>
-      <w:pPr>
-        <w:pStyle w:val="ListParagraph"/>
-        <w:numPr>
-          <w:ilvl w:val="0"/>
-          <w:numId w:val="56"/>
-        </w:numPr>
-      </w:pPr>
-      <w:r>
-        <w:t>Reopen and rebuild the solution.</w:t>
-      </w:r>
-    </w:p>
-    <w:p>
-      <w:pPr>
-        <w:pStyle w:val="Heading2"/>
-      </w:pPr>
-      <w:r>
-        <w:t xml:space="preserve">Recording </w:t>
-      </w:r>
-      <w:r>
-        <w:t>a .Perf file</w:t>
-      </w:r>
-    </w:p>
-    <w:p>
-      <w:r>
-        <w:t xml:space="preserve">To start a performance recording select the </w:t>
-      </w:r>
-      <w:r>
-        <w:rPr>
-          <w:b/>
-          <w:bCs/>
-        </w:rPr>
-        <w:t>Capture Perf…</w:t>
-      </w:r>
-      <w:r>
-        <w:t xml:space="preserve"> menu item, choosing the name of the file to create.  To end the recording, select the </w:t>
-      </w:r>
-      <w:r>
-        <w:rPr>
-          <w:b/>
-          <w:bCs/>
-        </w:rPr>
-        <w:t>End Perf</w:t>
-      </w:r>
-      <w:r>
-        <w:t xml:space="preserve"> menu item.</w:t>
-      </w:r>
-    </w:p>
-    <w:p>
-      <w:r>
-        <w:t xml:space="preserve">Keep recording times </w:t>
-      </w:r>
-      <w:r>
-        <w:t xml:space="preserve">to </w:t>
-      </w:r>
-      <w:r>
-        <w:t>under a minute.</w:t>
-      </w:r>
-      <w:r>
-        <w:t xml:space="preserve">  A one</w:t>
-      </w:r>
-      <w:r>
-        <w:t>-</w:t>
-      </w:r>
-      <w:r>
-        <w:t xml:space="preserve">minute recording will </w:t>
-      </w:r>
-      <w:r>
-        <w:t xml:space="preserve">use </w:t>
-      </w:r>
-      <w:r>
-        <w:t xml:space="preserve">approximately </w:t>
-      </w:r>
-      <w:r>
-        <w:t xml:space="preserve">40Mb to 80Mb of disk space and may take more than fifteen seconds to load in </w:t>
-      </w:r>
-      <w:proofErr w:type="spellStart"/>
-      <w:r>
-        <w:rPr>
-          <w:b/>
-          <w:bCs/>
-        </w:rPr>
-        <w:t>BeebPerf</w:t>
-      </w:r>
-      <w:proofErr w:type="spellEnd"/>
-      <w:r>
-        <w:t xml:space="preserve">. </w:t>
-      </w:r>
-    </w:p>
-    <w:p>
-      <w:r>
-        <w:t>And a</w:t>
-      </w:r>
-      <w:r>
-        <w:t xml:space="preserve">void </w:t>
-      </w:r>
-      <w:r>
-        <w:t>recording</w:t>
-      </w:r>
-      <w:r>
-        <w:t xml:space="preserve"> disc activity, if code is being loaded.  </w:t>
-      </w:r>
-      <w:proofErr w:type="spellStart"/>
-      <w:r>
-        <w:rPr>
-          <w:b/>
-          <w:bCs/>
-        </w:rPr>
-        <w:t>BeebPerf</w:t>
-      </w:r>
-      <w:proofErr w:type="spellEnd"/>
-      <w:r>
-        <w:rPr>
-          <w:b/>
-          <w:bCs/>
-        </w:rPr>
-        <w:t xml:space="preserve"> </w:t>
-      </w:r>
-      <w:r>
-        <w:t>get</w:t>
-      </w:r>
-      <w:r>
-        <w:t>s</w:t>
-      </w:r>
-      <w:r>
-        <w:t xml:space="preserve"> confused by overlapping code</w:t>
-      </w:r>
-      <w:r>
-        <w:t>.</w:t>
-      </w:r>
-    </w:p>
-    <w:p>
-      <w:pPr>
-        <w:pStyle w:val="Heading2"/>
-      </w:pPr>
-      <w:r>
-        <w:t>Including labels</w:t>
-      </w:r>
-    </w:p>
-    <w:p>
-      <w:r>
-        <w:t>T</w:t>
-      </w:r>
-      <w:r>
-        <w:t xml:space="preserve">he </w:t>
-      </w:r>
-      <w:r>
-        <w:rPr>
-          <w:b/>
-          <w:bCs/>
-        </w:rPr>
-        <w:t>BeebEm</w:t>
-      </w:r>
-      <w:r>
-        <w:rPr>
-          <w:b/>
-          <w:bCs/>
-        </w:rPr>
-        <w:t>.exe</w:t>
-      </w:r>
-      <w:r>
-        <w:t xml:space="preserve"> </w:t>
-      </w:r>
-      <w:r>
-        <w:rPr>
-          <w:b/>
-          <w:bCs/>
-        </w:rPr>
-        <w:t>-</w:t>
-      </w:r>
-      <w:proofErr w:type="spellStart"/>
-      <w:r>
-        <w:rPr>
-          <w:b/>
-          <w:bCs/>
-        </w:rPr>
-        <w:t>DebugLabels</w:t>
-      </w:r>
-      <w:proofErr w:type="spellEnd"/>
-      <w:r>
-        <w:rPr>
-          <w:b/>
-          <w:bCs/>
-        </w:rPr>
-        <w:t xml:space="preserve"> &lt;file&gt;</w:t>
-      </w:r>
-      <w:r>
-        <w:t xml:space="preserve"> command line option can be used to embed labels within generated .perf files</w:t>
-      </w:r>
-      <w:r>
-        <w:t>.</w:t>
-      </w:r>
-      <w:r>
-        <w:t xml:space="preserve"> </w:t>
-      </w:r>
-      <w:r>
-        <w:t xml:space="preserve"> This </w:t>
-      </w:r>
-      <w:r>
-        <w:t>can be jolly useful.</w:t>
-      </w:r>
-      <w:r>
-        <w:t xml:space="preserve"> </w:t>
-      </w:r>
-      <w:r>
-        <w:t xml:space="preserve"> Alternatively, label files can be side loaded into </w:t>
-      </w:r>
-      <w:proofErr w:type="spellStart"/>
-      <w:r>
-        <w:rPr>
-          <w:b/>
-          <w:bCs/>
-        </w:rPr>
-        <w:t>BeebPerf</w:t>
-      </w:r>
-      <w:proofErr w:type="spellEnd"/>
-      <w:r>
-        <w:rPr>
-          <w:b/>
-          <w:bCs/>
-        </w:rPr>
-        <w:t xml:space="preserve"> </w:t>
-      </w:r>
-      <w:r>
-        <w:t xml:space="preserve">using its </w:t>
-      </w:r>
-      <w:r>
-        <w:t>Labels dialog.</w:t>
-      </w:r>
-    </w:p>
-    <w:p>
-      <w:r>
-        <w:t xml:space="preserve">Files compatible with the </w:t>
-      </w:r>
-      <w:r>
-        <w:rPr>
-          <w:b/>
-          <w:bCs/>
-        </w:rPr>
-        <w:t>-</w:t>
-      </w:r>
-      <w:proofErr w:type="spellStart"/>
-      <w:r>
-        <w:rPr>
-          <w:b/>
-          <w:bCs/>
-        </w:rPr>
-        <w:t>DebugLabels</w:t>
-      </w:r>
-      <w:proofErr w:type="spellEnd"/>
-      <w:r>
-        <w:t xml:space="preserve"> option include:</w:t>
-      </w:r>
-    </w:p>
-    <w:p>
-      <w:pPr>
-        <w:pStyle w:val="ListParagraph"/>
-        <w:numPr>
-          <w:ilvl w:val="0"/>
-          <w:numId w:val="8"/>
-        </w:numPr>
-      </w:pPr>
-      <w:r>
-        <w:t xml:space="preserve">Labels files generated using </w:t>
-      </w:r>
-      <w:r>
-        <w:rPr>
-          <w:b/>
-          <w:bCs/>
-        </w:rPr>
-        <w:t>BeebAsm</w:t>
-      </w:r>
-      <w:r>
-        <w:rPr>
-          <w:b/>
-          <w:bCs/>
-        </w:rPr>
-        <w:t>.exe</w:t>
-      </w:r>
-      <w:r>
-        <w:t xml:space="preserve"> </w:t>
-      </w:r>
-      <w:r>
-        <w:rPr>
-          <w:b/>
-          <w:bCs/>
-        </w:rPr>
-        <w:t>-labels</w:t>
-      </w:r>
-      <w:r>
-        <w:t xml:space="preserve"> </w:t>
-      </w:r>
-      <w:r>
-        <w:rPr>
-          <w:b/>
-          <w:bCs/>
-        </w:rPr>
-        <w:t>&lt;file&gt;</w:t>
-      </w:r>
-      <w:r>
-        <w:t xml:space="preserve"> command line option.</w:t>
-      </w:r>
-    </w:p>
-    <w:p>
-      <w:pPr>
-        <w:pStyle w:val="ListParagraph"/>
-        <w:numPr>
-          <w:ilvl w:val="0"/>
-          <w:numId w:val="8"/>
-        </w:numPr>
-      </w:pPr>
-      <w:r>
         <w:t xml:space="preserve">Labels files generated using the </w:t>
       </w:r>
       <w:proofErr w:type="spellStart"/>
@@ -1315,38 +1283,38 @@
         <w:pStyle w:val="Heading2"/>
       </w:pPr>
       <w:r>
+        <w:t>UX Design</w:t>
+      </w:r>
+    </w:p>
+    <w:p>
+      <w:r>
+        <w:t xml:space="preserve">The </w:t>
+      </w:r>
+      <w:r>
+        <w:t xml:space="preserve">general </w:t>
+      </w:r>
+      <w:r>
+        <w:t>application</w:t>
+      </w:r>
+      <w:r>
+        <w:t xml:space="preserve"> layout</w:t>
+      </w:r>
+      <w:r>
+        <w:t xml:space="preserve"> is </w:t>
+      </w:r>
+      <w:r>
+        <w:t>shown below</w:t>
+      </w:r>
+      <w:r>
+        <w:t>.</w:t>
+      </w:r>
+    </w:p>
+    <w:p>
+      <w:r>
+        <w:rPr>
+          <w:noProof/>
+        </w:rPr>
         <w:lastRenderedPageBreak/>
-        <w:t>UX Design</w:t>
-      </w:r>
-    </w:p>
-    <w:p>
-      <w:r>
-        <w:t xml:space="preserve">The </w:t>
-      </w:r>
-      <w:r>
-        <w:t xml:space="preserve">general </w:t>
-      </w:r>
-      <w:r>
-        <w:t>application</w:t>
-      </w:r>
-      <w:r>
-        <w:t xml:space="preserve"> layout</w:t>
-      </w:r>
-      <w:r>
-        <w:t xml:space="preserve"> is </w:t>
-      </w:r>
-      <w:r>
-        <w:t>shown below</w:t>
-      </w:r>
-      <w:r>
-        <w:t>.</w:t>
-      </w:r>
-    </w:p>
-    <w:p>
-      <w:r>
-        <w:rPr>
-          <w:noProof/>
-        </w:rPr>
         <w:drawing>
           <wp:inline distT="0" distB="0" distL="0" distR="0" wp14:anchorId="23F654DB" wp14:editId="1CFBC96C">
             <wp:extent cx="5943600" cy="4453255"/>

</xml_diff>

<commit_message>
Fixed codeview performance issue
</commit_message>
<xml_diff>
--- a/docs/Development.docx
+++ b/docs/Development.docx
@@ -477,6 +477,7 @@
       <w:r>
         <w:t xml:space="preserve">, </w:t>
       </w:r>
+      <w:proofErr w:type="spellStart"/>
       <w:r>
         <w:rPr>
           <w:b/>
@@ -484,6 +485,7 @@
         </w:rPr>
         <w:t>BeebPerf</w:t>
       </w:r>
+      <w:proofErr w:type="spellEnd"/>
       <w:r>
         <w:t xml:space="preserve">, </w:t>
       </w:r>
@@ -727,8 +729,21 @@
         <w:t xml:space="preserve"> </w:t>
       </w:r>
       <w:r>
-        <w:t>needed for afxres.h/rc</w:t>
-      </w:r>
+        <w:t xml:space="preserve">needed for </w:t>
+      </w:r>
+      <w:proofErr w:type="spellStart"/>
+      <w:r>
+        <w:t>afxres.h</w:t>
+      </w:r>
+      <w:proofErr w:type="spellEnd"/>
+      <w:r>
+        <w:t>/</w:t>
+      </w:r>
+      <w:proofErr w:type="spellStart"/>
+      <w:r>
+        <w:t>rc</w:t>
+      </w:r>
+      <w:proofErr w:type="spellEnd"/>
     </w:p>
     <w:p>
       <w:pPr>
@@ -789,8 +804,21 @@
         <w:t>‘</w:t>
       </w:r>
       <w:r>
-        <w:t>https://github.com/stardot/beebem-windows.git</w:t>
-      </w:r>
+        <w:t>https://github.com/</w:t>
+      </w:r>
+      <w:proofErr w:type="spellStart"/>
+      <w:r>
+        <w:t>stardot</w:t>
+      </w:r>
+      <w:proofErr w:type="spellEnd"/>
+      <w:r>
+        <w:t>/</w:t>
+      </w:r>
+      <w:proofErr w:type="spellStart"/>
+      <w:r>
+        <w:t>beebem-windows.git</w:t>
+      </w:r>
+      <w:proofErr w:type="spellEnd"/>
       <w:r>
         <w:t>’</w:t>
       </w:r>
@@ -873,12 +901,28 @@
         </w:rPr>
         <w:t>apply ..\</w:t>
       </w:r>
+      <w:proofErr w:type="spellStart"/>
       <w:r>
         <w:rPr>
           <w:color w:val="FFFFFF" w:themeColor="background1"/>
         </w:rPr>
-        <w:t>beebperf\beebem_changelist.diff</w:t>
-      </w:r>
+        <w:t>beebperf</w:t>
+      </w:r>
+      <w:proofErr w:type="spellEnd"/>
+      <w:r>
+        <w:rPr>
+          <w:color w:val="FFFFFF" w:themeColor="background1"/>
+        </w:rPr>
+        <w:t>\</w:t>
+      </w:r>
+      <w:proofErr w:type="spellStart"/>
+      <w:r>
+        <w:rPr>
+          <w:color w:val="FFFFFF" w:themeColor="background1"/>
+        </w:rPr>
+        <w:t>beebem_changelist.diff</w:t>
+      </w:r>
+      <w:proofErr w:type="spellEnd"/>
     </w:p>
     <w:p>
       <w:pPr>
@@ -1031,6 +1075,7 @@
       <w:r>
         <w:t xml:space="preserve">seconds to load in </w:t>
       </w:r>
+      <w:proofErr w:type="spellStart"/>
       <w:r>
         <w:rPr>
           <w:b/>
@@ -1038,6 +1083,7 @@
         </w:rPr>
         <w:t>BeebPerf</w:t>
       </w:r>
+      <w:proofErr w:type="spellEnd"/>
       <w:r>
         <w:t>.</w:t>
       </w:r>
@@ -1061,12 +1107,21 @@
       <w:r>
         <w:t xml:space="preserve">disc activity, if code is being loaded.  </w:t>
       </w:r>
-      <w:r>
-        <w:rPr>
-          <w:b/>
-          <w:bCs/>
-        </w:rPr>
-        <w:t xml:space="preserve">BeebPerf </w:t>
+      <w:proofErr w:type="spellStart"/>
+      <w:r>
+        <w:rPr>
+          <w:b/>
+          <w:bCs/>
+        </w:rPr>
+        <w:t>BeebPerf</w:t>
+      </w:r>
+      <w:proofErr w:type="spellEnd"/>
+      <w:r>
+        <w:rPr>
+          <w:b/>
+          <w:bCs/>
+        </w:rPr>
+        <w:t xml:space="preserve"> </w:t>
       </w:r>
       <w:r>
         <w:t>get</w:t>
@@ -1115,8 +1170,17 @@
           <w:b/>
           <w:bCs/>
         </w:rPr>
-        <w:t>-DebugLabels</w:t>
-      </w:r>
+        <w:t>-</w:t>
+      </w:r>
+      <w:proofErr w:type="spellStart"/>
+      <w:r>
+        <w:rPr>
+          <w:b/>
+          <w:bCs/>
+        </w:rPr>
+        <w:t>DebugLabels</w:t>
+      </w:r>
+      <w:proofErr w:type="spellEnd"/>
       <w:r>
         <w:rPr>
           <w:b/>
@@ -1142,6 +1206,7 @@
       <w:r>
         <w:t xml:space="preserve">Alternatively, label files can be side loaded into </w:t>
       </w:r>
+      <w:proofErr w:type="spellStart"/>
       <w:r>
         <w:rPr>
           <w:b/>
@@ -1149,6 +1214,7 @@
         </w:rPr>
         <w:t>BeebPerf</w:t>
       </w:r>
+      <w:proofErr w:type="spellEnd"/>
       <w:r>
         <w:rPr>
           <w:b/>
@@ -1185,8 +1251,17 @@
           <w:b/>
           <w:bCs/>
         </w:rPr>
-        <w:t>-DebugLabels</w:t>
-      </w:r>
+        <w:t>-</w:t>
+      </w:r>
+      <w:proofErr w:type="spellStart"/>
+      <w:r>
+        <w:rPr>
+          <w:b/>
+          <w:bCs/>
+        </w:rPr>
+        <w:t>DebugLabels</w:t>
+      </w:r>
+      <w:proofErr w:type="spellEnd"/>
       <w:r>
         <w:t xml:space="preserve"> option include:</w:t>
       </w:r>
@@ -1260,6 +1335,7 @@
       <w:r>
         <w:t xml:space="preserve">Labels files generated using the </w:t>
       </w:r>
+      <w:proofErr w:type="spellStart"/>
       <w:r>
         <w:rPr>
           <w:b/>
@@ -1267,6 +1343,7 @@
         </w:rPr>
         <w:t>ExtractLabels</w:t>
       </w:r>
+      <w:proofErr w:type="spellEnd"/>
       <w:r>
         <w:t xml:space="preserve"> </w:t>
       </w:r>
@@ -1276,6 +1353,7 @@
       <w:r>
         <w:t xml:space="preserve">, which is built as part of the </w:t>
       </w:r>
+      <w:proofErr w:type="spellStart"/>
       <w:r>
         <w:rPr>
           <w:b/>
@@ -1283,6 +1361,7 @@
         </w:rPr>
         <w:t>BeebPerf</w:t>
       </w:r>
+      <w:proofErr w:type="spellEnd"/>
       <w:r>
         <w:t xml:space="preserve"> solution</w:t>
       </w:r>
@@ -1377,6 +1456,7 @@
       <w:pPr>
         <w:pStyle w:val="Heading1"/>
       </w:pPr>
+      <w:proofErr w:type="spellStart"/>
       <w:r>
         <w:lastRenderedPageBreak/>
         <w:t>Bee</w:t>
@@ -1387,10 +1467,16 @@
       <w:r>
         <w:t>Perf</w:t>
       </w:r>
-    </w:p>
-    <w:p>
-      <w:r>
-        <w:t xml:space="preserve">BeebPerf is a standalone </w:t>
+      <w:proofErr w:type="spellEnd"/>
+    </w:p>
+    <w:p>
+      <w:proofErr w:type="spellStart"/>
+      <w:r>
+        <w:t>BeebPerf</w:t>
+      </w:r>
+      <w:proofErr w:type="spellEnd"/>
+      <w:r>
+        <w:t xml:space="preserve"> is a standalone </w:t>
       </w:r>
       <w:r>
         <w:t xml:space="preserve">Windows </w:t>
@@ -1483,6 +1569,7 @@
       <w:r>
         <w:t xml:space="preserve">of </w:t>
       </w:r>
+      <w:proofErr w:type="spellStart"/>
       <w:r>
         <w:rPr>
           <w:b/>
@@ -1490,6 +1577,7 @@
         </w:rPr>
         <w:t>BeebPerf</w:t>
       </w:r>
+      <w:proofErr w:type="spellEnd"/>
       <w:r>
         <w:t xml:space="preserve"> </w:t>
       </w:r>
@@ -1997,9 +2085,11 @@
             <w:tcW w:w="1975" w:type="dxa"/>
           </w:tcPr>
           <w:p>
+            <w:proofErr w:type="spellStart"/>
             <w:r>
               <w:t>Self CPU</w:t>
             </w:r>
+            <w:proofErr w:type="spellEnd"/>
           </w:p>
         </w:tc>
         <w:tc>
@@ -2052,10 +2142,7 @@
           </w:p>
           <w:p>
             <w:r>
-              <w:t>Ex</w:t>
-            </w:r>
-            <w:r>
-              <w:t>cludes the cycles spent executing interrupt code during the execution of the rout</w:t>
+              <w:t>Excludes the cycles spent executing interrupt code during the execution of the rout</w:t>
             </w:r>
             <w:r>
               <w:t>ine.</w:t>
@@ -2251,13 +2338,7 @@
     </w:p>
     <w:p>
       <w:r>
-        <w:t xml:space="preserve">Useful for visualizing the callers and callee of </w:t>
-      </w:r>
-      <w:r>
-        <w:t>the selected</w:t>
-      </w:r>
-      <w:r>
-        <w:t xml:space="preserve"> routine.</w:t>
+        <w:t>Useful for visualizing the callers and callee of the selected routine.</w:t>
       </w:r>
     </w:p>
     <w:p>
@@ -2290,10 +2371,7 @@
         <w:t>percentages</w:t>
       </w:r>
       <w:r>
-        <w:t xml:space="preserve"> with </w:t>
-      </w:r>
-      <w:r>
-        <w:t>respect to the total number of cycles in the analysis time range</w:t>
+        <w:t xml:space="preserve"> with respect to the total number of cycles in the analysis time range</w:t>
       </w:r>
       <w:r>
         <w:t>.</w:t>
@@ -3112,7 +3190,13 @@
               <w:t>instruction</w:t>
             </w:r>
             <w:r>
-              <w:t>, including cycles stent in invoked routines</w:t>
+              <w:t>, including cycles s</w:t>
+            </w:r>
+            <w:r>
+              <w:t>p</w:t>
+            </w:r>
+            <w:r>
+              <w:t>ent in invoked routines</w:t>
             </w:r>
             <w:r>
               <w:t xml:space="preserve"> (directly or indirectly)</w:t>
@@ -3134,7 +3218,19 @@
           </w:p>
           <w:p>
             <w:r>
-              <w:t>The percentage shown is with respect to the total number of cycles in the analysis time range.</w:t>
+              <w:t xml:space="preserve">The percentage shown is with respect to the total number of cycles </w:t>
+            </w:r>
+            <w:r>
+              <w:t>executed by the routin</w:t>
+            </w:r>
+            <w:r>
+              <w:t xml:space="preserve">e, </w:t>
+            </w:r>
+            <w:r>
+              <w:t xml:space="preserve">including cycles </w:t>
+            </w:r>
+            <w:r>
+              <w:t>spent in invoked routines (directly or indirectly) from JSR’s and tail-calls.</w:t>
             </w:r>
           </w:p>
         </w:tc>
@@ -3184,10 +3280,7 @@
               </w:rPr>
             </w:pPr>
             <w:r>
-              <w:t>The n</w:t>
-            </w:r>
-            <w:r>
-              <w:t>umber of times the instruction was executed.</w:t>
+              <w:t>The number of times the instruction was executed.</w:t>
             </w:r>
           </w:p>
         </w:tc>
@@ -3846,19 +3939,26 @@
       <w:pPr>
         <w:pStyle w:val="Heading1"/>
       </w:pPr>
+      <w:proofErr w:type="spellStart"/>
       <w:r>
         <w:lastRenderedPageBreak/>
-        <w:t>BeebPerf Design</w:t>
-      </w:r>
-    </w:p>
-    <w:p>
-      <w:r>
-        <w:rPr>
-          <w:b/>
-          <w:bCs/>
-        </w:rPr>
         <w:t>BeebPerf</w:t>
       </w:r>
+      <w:proofErr w:type="spellEnd"/>
+      <w:r>
+        <w:t xml:space="preserve"> Design</w:t>
+      </w:r>
+    </w:p>
+    <w:p>
+      <w:proofErr w:type="spellStart"/>
+      <w:r>
+        <w:rPr>
+          <w:b/>
+          <w:bCs/>
+        </w:rPr>
+        <w:t>BeebPerf</w:t>
+      </w:r>
+      <w:proofErr w:type="spellEnd"/>
       <w:r>
         <w:t xml:space="preserve"> is a .NET Windows Forms app, written in C#. </w:t>
       </w:r>
@@ -3911,6 +4011,7 @@
       <w:r>
         <w:t xml:space="preserve">single </w:t>
       </w:r>
+      <w:proofErr w:type="spellStart"/>
       <w:r>
         <w:rPr>
           <w:b/>
@@ -3918,6 +4019,7 @@
         </w:rPr>
         <w:t>BeebPerf</w:t>
       </w:r>
+      <w:proofErr w:type="spellEnd"/>
       <w:r>
         <w:t xml:space="preserve"> </w:t>
       </w:r>
@@ -3957,6 +4059,7 @@
       <w:r>
         <w:t xml:space="preserve">  All the UX components, including the main form, are in the </w:t>
       </w:r>
+      <w:proofErr w:type="spellStart"/>
       <w:r>
         <w:rPr>
           <w:b/>
@@ -3964,6 +4067,7 @@
         </w:rPr>
         <w:t>ux</w:t>
       </w:r>
+      <w:proofErr w:type="spellEnd"/>
       <w:r>
         <w:t xml:space="preserve"> folder.</w:t>
       </w:r>
@@ -4186,6 +4290,7 @@
       <w:r>
         <w:t xml:space="preserve">Loading the labels files (uses the </w:t>
       </w:r>
+      <w:proofErr w:type="spellStart"/>
       <w:r>
         <w:rPr>
           <w:b/>
@@ -4193,6 +4298,7 @@
         </w:rPr>
         <w:t>LabelsFileReader</w:t>
       </w:r>
+      <w:proofErr w:type="spellEnd"/>
       <w:r>
         <w:t xml:space="preserve"> class defined in the project root folder).</w:t>
       </w:r>
@@ -4257,6 +4363,7 @@
       <w:r>
         <w:t xml:space="preserve">using the </w:t>
       </w:r>
+      <w:proofErr w:type="spellStart"/>
       <w:r>
         <w:rPr>
           <w:b/>
@@ -4264,6 +4371,7 @@
         </w:rPr>
         <w:t>PerfReader</w:t>
       </w:r>
+      <w:proofErr w:type="spellEnd"/>
       <w:r>
         <w:t xml:space="preserve"> class</w:t>
       </w:r>
@@ -4645,6 +4753,7 @@
       </w:r>
     </w:p>
     <w:p>
+      <w:proofErr w:type="spellStart"/>
       <w:r>
         <w:rPr>
           <w:b/>
@@ -4652,6 +4761,7 @@
         </w:rPr>
         <w:t>MiniStackFrame</w:t>
       </w:r>
+      <w:proofErr w:type="spellEnd"/>
       <w:r>
         <w:t xml:space="preserve"> – represents a mini stack frame.  Contains the following fields:</w:t>
       </w:r>
@@ -5069,7 +5179,15 @@
         </w:numPr>
       </w:pPr>
       <w:r>
-        <w:t xml:space="preserve">Aggregated CPU Metrics, by CallStack – </w:t>
+        <w:t xml:space="preserve">Aggregated CPU Metrics, by </w:t>
+      </w:r>
+      <w:proofErr w:type="spellStart"/>
+      <w:r>
+        <w:t>CallStack</w:t>
+      </w:r>
+      <w:proofErr w:type="spellEnd"/>
+      <w:r>
+        <w:t xml:space="preserve"> – </w:t>
       </w:r>
       <w:r>
         <w:rPr>
@@ -5181,6 +5299,7 @@
       </w:r>
     </w:p>
     <w:p>
+      <w:proofErr w:type="spellStart"/>
       <w:r>
         <w:rPr>
           <w:b/>
@@ -5188,6 +5307,7 @@
         </w:rPr>
         <w:t>StackFrame</w:t>
       </w:r>
+      <w:proofErr w:type="spellEnd"/>
       <w:r>
         <w:t xml:space="preserve"> – represents a unique stack-frame within the recorded program.  Contains the following fields:</w:t>
       </w:r>
@@ -5292,6 +5412,7 @@
       </w:r>
     </w:p>
     <w:p>
+      <w:proofErr w:type="spellStart"/>
       <w:r>
         <w:rPr>
           <w:b/>
@@ -5300,6 +5421,7 @@
         <w:lastRenderedPageBreak/>
         <w:t>CallStack</w:t>
       </w:r>
+      <w:proofErr w:type="spellEnd"/>
       <w:r>
         <w:t xml:space="preserve"> – represents a call stack within the recorded program. </w:t>
       </w:r>
@@ -5396,7 +5518,15 @@
     </w:p>
     <w:p>
       <w:r>
-        <w:t>The identify of a CallStack is defined by the sequence of addresses up through the parent chain, ending at the root or a call stack that has an ISR call type.</w:t>
+        <w:t xml:space="preserve">The identify of a </w:t>
+      </w:r>
+      <w:proofErr w:type="spellStart"/>
+      <w:r>
+        <w:t>CallStack</w:t>
+      </w:r>
+      <w:proofErr w:type="spellEnd"/>
+      <w:r>
+        <w:t xml:space="preserve"> is defined by the sequence of addresses up through the parent chain, ending at the root or a call stack that has an ISR call type.</w:t>
       </w:r>
     </w:p>
     <w:p>
@@ -6025,6 +6155,7 @@
       <w:r>
         <w:t>The application is built around a main Form (</w:t>
       </w:r>
+      <w:proofErr w:type="spellStart"/>
       <w:r>
         <w:rPr>
           <w:b/>
@@ -6032,6 +6163,7 @@
         </w:rPr>
         <w:t>BeebPerfForm</w:t>
       </w:r>
+      <w:proofErr w:type="spellEnd"/>
       <w:r>
         <w:t xml:space="preserve">) which </w:t>
       </w:r>
@@ -6242,9 +6374,11 @@
             <w:tcW w:w="2700" w:type="dxa"/>
           </w:tcPr>
           <w:p>
+            <w:proofErr w:type="spellStart"/>
             <w:r>
               <w:t>BeepPerfForm</w:t>
             </w:r>
+            <w:proofErr w:type="spellEnd"/>
           </w:p>
         </w:tc>
         <w:tc>
@@ -6274,6 +6408,7 @@
             <w:tcW w:w="2700" w:type="dxa"/>
           </w:tcPr>
           <w:p>
+            <w:proofErr w:type="spellStart"/>
             <w:r>
               <w:t>Time</w:t>
             </w:r>
@@ -6283,6 +6418,7 @@
             <w:r>
               <w:t>ineView</w:t>
             </w:r>
+            <w:proofErr w:type="spellEnd"/>
           </w:p>
         </w:tc>
         <w:tc>
@@ -6312,9 +6448,11 @@
             <w:tcW w:w="2700" w:type="dxa"/>
           </w:tcPr>
           <w:p>
+            <w:proofErr w:type="spellStart"/>
             <w:r>
               <w:t>TabControlEx</w:t>
             </w:r>
+            <w:proofErr w:type="spellEnd"/>
           </w:p>
         </w:tc>
         <w:tc>
@@ -6344,9 +6482,11 @@
             <w:tcW w:w="2700" w:type="dxa"/>
           </w:tcPr>
           <w:p>
+            <w:proofErr w:type="spellStart"/>
             <w:r>
               <w:t>GridView</w:t>
             </w:r>
+            <w:proofErr w:type="spellEnd"/>
           </w:p>
         </w:tc>
         <w:tc>
@@ -6354,9 +6494,11 @@
             <w:tcW w:w="1710" w:type="dxa"/>
           </w:tcPr>
           <w:p>
+            <w:proofErr w:type="spellStart"/>
             <w:r>
               <w:t>DataGridView</w:t>
             </w:r>
+            <w:proofErr w:type="spellEnd"/>
           </w:p>
         </w:tc>
         <w:tc>
@@ -6394,9 +6536,11 @@
             <w:pPr>
               <w:ind w:left="4320" w:hanging="4320"/>
             </w:pPr>
+            <w:proofErr w:type="spellStart"/>
             <w:r>
               <w:t>RoutinesView</w:t>
             </w:r>
+            <w:proofErr w:type="spellEnd"/>
           </w:p>
         </w:tc>
         <w:tc>
@@ -6407,9 +6551,11 @@
             <w:pPr>
               <w:ind w:left="4320" w:hanging="4320"/>
             </w:pPr>
+            <w:proofErr w:type="spellStart"/>
             <w:r>
               <w:t>GridView</w:t>
             </w:r>
+            <w:proofErr w:type="spellEnd"/>
           </w:p>
         </w:tc>
         <w:tc>
@@ -6435,9 +6581,11 @@
             <w:pPr>
               <w:ind w:left="4320" w:hanging="4320"/>
             </w:pPr>
+            <w:proofErr w:type="spellStart"/>
             <w:r>
               <w:t>CallerCalleeView</w:t>
             </w:r>
+            <w:proofErr w:type="spellEnd"/>
           </w:p>
         </w:tc>
         <w:tc>
@@ -6476,9 +6624,11 @@
             <w:pPr>
               <w:ind w:left="4320" w:hanging="4320"/>
             </w:pPr>
+            <w:proofErr w:type="spellStart"/>
             <w:r>
               <w:t>CallTreeView</w:t>
             </w:r>
+            <w:proofErr w:type="spellEnd"/>
           </w:p>
         </w:tc>
         <w:tc>
@@ -6489,9 +6639,11 @@
             <w:pPr>
               <w:ind w:left="4320" w:hanging="4320"/>
             </w:pPr>
+            <w:proofErr w:type="spellStart"/>
             <w:r>
               <w:t>GridView</w:t>
             </w:r>
+            <w:proofErr w:type="spellEnd"/>
           </w:p>
         </w:tc>
         <w:tc>
@@ -6517,9 +6669,11 @@
             <w:pPr>
               <w:ind w:left="4320" w:hanging="4320"/>
             </w:pPr>
+            <w:proofErr w:type="spellStart"/>
             <w:r>
               <w:t>FlameGraph</w:t>
             </w:r>
+            <w:proofErr w:type="spellEnd"/>
           </w:p>
         </w:tc>
         <w:tc>
@@ -6558,9 +6712,11 @@
             <w:pPr>
               <w:ind w:left="4320" w:hanging="4320"/>
             </w:pPr>
+            <w:proofErr w:type="spellStart"/>
             <w:r>
               <w:t>MemoryView</w:t>
             </w:r>
+            <w:proofErr w:type="spellEnd"/>
           </w:p>
         </w:tc>
         <w:tc>
@@ -6571,9 +6727,11 @@
             <w:pPr>
               <w:ind w:left="4320" w:hanging="4320"/>
             </w:pPr>
+            <w:proofErr w:type="spellStart"/>
             <w:r>
               <w:t>GridView</w:t>
             </w:r>
+            <w:proofErr w:type="spellEnd"/>
           </w:p>
         </w:tc>
         <w:tc>
@@ -6602,9 +6760,11 @@
             <w:pPr>
               <w:ind w:left="4320" w:hanging="4320"/>
             </w:pPr>
+            <w:proofErr w:type="spellStart"/>
             <w:r>
               <w:t>MemoryRoutinesView</w:t>
             </w:r>
+            <w:proofErr w:type="spellEnd"/>
           </w:p>
         </w:tc>
         <w:tc>
@@ -6615,9 +6775,11 @@
             <w:pPr>
               <w:ind w:left="4320" w:hanging="4320"/>
             </w:pPr>
+            <w:proofErr w:type="spellStart"/>
             <w:r>
               <w:t>GridView</w:t>
             </w:r>
+            <w:proofErr w:type="spellEnd"/>
           </w:p>
         </w:tc>
         <w:tc>
@@ -6657,9 +6819,11 @@
             <w:pPr>
               <w:ind w:left="4320" w:hanging="4320"/>
             </w:pPr>
+            <w:proofErr w:type="spellStart"/>
             <w:r>
               <w:t>GridView</w:t>
             </w:r>
+            <w:proofErr w:type="spellEnd"/>
           </w:p>
         </w:tc>
         <w:tc>
@@ -6726,9 +6890,11 @@
             <w:pPr>
               <w:ind w:left="4320" w:hanging="4320"/>
             </w:pPr>
+            <w:proofErr w:type="spellStart"/>
             <w:r>
               <w:t>LabelsDialog</w:t>
             </w:r>
+            <w:proofErr w:type="spellEnd"/>
           </w:p>
         </w:tc>
         <w:tc>
@@ -6767,9 +6933,11 @@
             <w:pPr>
               <w:ind w:left="4320" w:hanging="4320"/>
             </w:pPr>
+            <w:proofErr w:type="spellStart"/>
             <w:r>
               <w:t>SettingsDialog</w:t>
             </w:r>
+            <w:proofErr w:type="spellEnd"/>
           </w:p>
         </w:tc>
         <w:tc>
@@ -6808,9 +6976,11 @@
             <w:pPr>
               <w:ind w:left="4320" w:hanging="4320"/>
             </w:pPr>
+            <w:proofErr w:type="spellStart"/>
             <w:r>
               <w:t>SampleCodePanel</w:t>
             </w:r>
+            <w:proofErr w:type="spellEnd"/>
           </w:p>
         </w:tc>
         <w:tc>
@@ -6852,9 +7022,11 @@
             <w:tcW w:w="2700" w:type="dxa"/>
           </w:tcPr>
           <w:p>
+            <w:proofErr w:type="spellStart"/>
             <w:r>
               <w:t>HelpDialog</w:t>
             </w:r>
+            <w:proofErr w:type="spellEnd"/>
           </w:p>
         </w:tc>
         <w:tc>
@@ -6890,6 +7062,7 @@
       <w:r>
         <w:t xml:space="preserve">the </w:t>
       </w:r>
+      <w:proofErr w:type="spellStart"/>
       <w:r>
         <w:rPr>
           <w:b/>
@@ -6897,6 +7070,7 @@
         </w:rPr>
         <w:t>ReentrancyGuard</w:t>
       </w:r>
+      <w:proofErr w:type="spellEnd"/>
       <w:r>
         <w:rPr>
           <w:b/>
@@ -6907,6 +7081,7 @@
       <w:r>
         <w:t xml:space="preserve">(also in </w:t>
       </w:r>
+      <w:proofErr w:type="spellStart"/>
       <w:r>
         <w:rPr>
           <w:b/>
@@ -6914,18 +7089,28 @@
         </w:rPr>
         <w:t>ux</w:t>
       </w:r>
+      <w:proofErr w:type="spellEnd"/>
       <w:r>
         <w:t xml:space="preserve"> folder)</w:t>
       </w:r>
       <w:r>
         <w:t xml:space="preserve"> which is used to stop cyclic </w:t>
       </w:r>
-      <w:r>
-        <w:rPr>
-          <w:b/>
-          <w:bCs/>
-        </w:rPr>
-        <w:t xml:space="preserve">api </w:t>
+      <w:proofErr w:type="spellStart"/>
+      <w:r>
+        <w:rPr>
+          <w:b/>
+          <w:bCs/>
+        </w:rPr>
+        <w:t>api</w:t>
+      </w:r>
+      <w:proofErr w:type="spellEnd"/>
+      <w:r>
+        <w:rPr>
+          <w:b/>
+          <w:bCs/>
+        </w:rPr>
+        <w:t xml:space="preserve"> </w:t>
       </w:r>
       <w:r>
         <w:rPr>
@@ -6953,7 +7138,23 @@
           <w:b/>
           <w:bCs/>
         </w:rPr>
-        <w:t xml:space="preserve"> api </w:t>
+        <w:t xml:space="preserve"> </w:t>
+      </w:r>
+      <w:proofErr w:type="spellStart"/>
+      <w:r>
+        <w:rPr>
+          <w:b/>
+          <w:bCs/>
+        </w:rPr>
+        <w:t>api</w:t>
+      </w:r>
+      <w:proofErr w:type="spellEnd"/>
+      <w:r>
+        <w:rPr>
+          <w:b/>
+          <w:bCs/>
+        </w:rPr>
+        <w:t xml:space="preserve"> </w:t>
       </w:r>
       <w:r>
         <w:rPr>
@@ -7020,6 +7221,7 @@
       <w:r>
         <w:t>The undo / redo history class (</w:t>
       </w:r>
+      <w:proofErr w:type="spellStart"/>
       <w:r>
         <w:rPr>
           <w:b/>
@@ -7027,6 +7229,7 @@
         </w:rPr>
         <w:t>UndoRedoHistory</w:t>
       </w:r>
+      <w:proofErr w:type="spellEnd"/>
       <w:r>
         <w:t>)</w:t>
       </w:r>
@@ -7065,7 +7268,15 @@
         </w:numPr>
       </w:pPr>
       <w:r>
-        <w:t>bool CanUndo()</w:t>
+        <w:t xml:space="preserve">bool </w:t>
+      </w:r>
+      <w:proofErr w:type="spellStart"/>
+      <w:r>
+        <w:t>CanUndo</w:t>
+      </w:r>
+      <w:proofErr w:type="spellEnd"/>
+      <w:r>
+        <w:t>()</w:t>
       </w:r>
     </w:p>
     <w:p>
@@ -7077,7 +7288,15 @@
         </w:numPr>
       </w:pPr>
       <w:r>
-        <w:t>bool CanRedo()</w:t>
+        <w:t xml:space="preserve">bool </w:t>
+      </w:r>
+      <w:proofErr w:type="spellStart"/>
+      <w:r>
+        <w:t>CanRedo</w:t>
+      </w:r>
+      <w:proofErr w:type="spellEnd"/>
+      <w:r>
+        <w:t>()</w:t>
       </w:r>
     </w:p>
     <w:p>
@@ -7180,6 +7399,7 @@
       <w:r>
         <w:t xml:space="preserve">The </w:t>
       </w:r>
+      <w:proofErr w:type="spellStart"/>
       <w:r>
         <w:rPr>
           <w:b/>
@@ -7187,6 +7407,7 @@
         </w:rPr>
         <w:t>UndoRedoHistory</w:t>
       </w:r>
+      <w:proofErr w:type="spellEnd"/>
       <w:r>
         <w:t xml:space="preserve"> class internally </w:t>
       </w:r>
@@ -7435,13 +7656,19 @@
         <w:t>–</w:t>
       </w:r>
       <w:r>
-        <w:t xml:space="preserve"> zlib</w:t>
-      </w:r>
+        <w:t xml:space="preserve"> </w:t>
+      </w:r>
+      <w:proofErr w:type="spellStart"/>
+      <w:r>
+        <w:t>zlib</w:t>
+      </w:r>
+      <w:proofErr w:type="spellEnd"/>
     </w:p>
     <w:p>
       <w:r>
         <w:t xml:space="preserve">The </w:t>
       </w:r>
+      <w:proofErr w:type="spellStart"/>
       <w:r>
         <w:rPr>
           <w:b/>
@@ -7449,6 +7676,7 @@
         </w:rPr>
         <w:t>PerfReader</w:t>
       </w:r>
+      <w:proofErr w:type="spellEnd"/>
       <w:r>
         <w:t xml:space="preserve"> class uncompresses chuck</w:t>
       </w:r>
@@ -7461,6 +7689,7 @@
       <w:r>
         <w:t xml:space="preserve">open source </w:t>
       </w:r>
+      <w:proofErr w:type="spellStart"/>
       <w:r>
         <w:rPr>
           <w:b/>
@@ -7468,6 +7697,7 @@
         </w:rPr>
         <w:t>zlib</w:t>
       </w:r>
+      <w:proofErr w:type="spellEnd"/>
       <w:r>
         <w:t xml:space="preserve"> library</w:t>
       </w:r>
@@ -7475,7 +7705,15 @@
         <w:t xml:space="preserve">.  </w:t>
       </w:r>
       <w:r>
-        <w:t>Copyright (C) 1995-2024 Jean-loup Gailly and Mark Adler</w:t>
+        <w:t xml:space="preserve">Copyright (C) 1995-2024 Jean-loup </w:t>
+      </w:r>
+      <w:proofErr w:type="spellStart"/>
+      <w:r>
+        <w:t>Gailly</w:t>
+      </w:r>
+      <w:proofErr w:type="spellEnd"/>
+      <w:r>
+        <w:t xml:space="preserve"> and Mark Adler</w:t>
       </w:r>
       <w:r>
         <w:t>.</w:t>
@@ -7485,6 +7723,7 @@
       <w:r>
         <w:t xml:space="preserve">The sources can be found in the </w:t>
       </w:r>
+      <w:proofErr w:type="spellStart"/>
       <w:r>
         <w:rPr>
           <w:b/>
@@ -7492,6 +7731,7 @@
         </w:rPr>
         <w:t>zlib</w:t>
       </w:r>
+      <w:proofErr w:type="spellEnd"/>
       <w:r>
         <w:t xml:space="preserve"> project</w:t>
       </w:r>
@@ -7501,6 +7741,7 @@
       <w:r>
         <w:t xml:space="preserve">the </w:t>
       </w:r>
+      <w:proofErr w:type="spellStart"/>
       <w:r>
         <w:rPr>
           <w:b/>
@@ -7508,6 +7749,7 @@
         </w:rPr>
         <w:t>BeebPerf</w:t>
       </w:r>
+      <w:proofErr w:type="spellEnd"/>
       <w:r>
         <w:t xml:space="preserve"> solution.  </w:t>
       </w:r>
@@ -7538,6 +7780,7 @@
       <w:r>
         <w:t xml:space="preserve">The </w:t>
       </w:r>
+      <w:proofErr w:type="spellStart"/>
       <w:r>
         <w:rPr>
           <w:b/>
@@ -7545,8 +7788,25 @@
         </w:rPr>
         <w:t>PerfReader</w:t>
       </w:r>
-      <w:r>
-        <w:t xml:space="preserve"> class calls the zlib apis using </w:t>
+      <w:proofErr w:type="spellEnd"/>
+      <w:r>
+        <w:t xml:space="preserve"> class calls the </w:t>
+      </w:r>
+      <w:proofErr w:type="spellStart"/>
+      <w:r>
+        <w:t>zlib</w:t>
+      </w:r>
+      <w:proofErr w:type="spellEnd"/>
+      <w:r>
+        <w:t xml:space="preserve"> </w:t>
+      </w:r>
+      <w:proofErr w:type="spellStart"/>
+      <w:r>
+        <w:t>apis</w:t>
+      </w:r>
+      <w:proofErr w:type="spellEnd"/>
+      <w:r>
+        <w:t xml:space="preserve"> using </w:t>
       </w:r>
       <w:r>
         <w:t>P/Invoke</w:t>
@@ -7619,6 +7879,7 @@
       <w:r>
         <w:t xml:space="preserve"> is modified to generate a .perf file, which </w:t>
       </w:r>
+      <w:proofErr w:type="spellStart"/>
       <w:r>
         <w:rPr>
           <w:b/>
@@ -7626,6 +7887,7 @@
         </w:rPr>
         <w:t>BeebPerf</w:t>
       </w:r>
+      <w:proofErr w:type="spellEnd"/>
       <w:r>
         <w:t xml:space="preserve"> reads and analyses.</w:t>
       </w:r>
@@ -7718,8 +7980,17 @@
           <w:b/>
           <w:bCs/>
         </w:rPr>
-        <w:t>.pref</w:t>
-      </w:r>
+        <w:t>.</w:t>
+      </w:r>
+      <w:proofErr w:type="spellStart"/>
+      <w:r>
+        <w:rPr>
+          <w:b/>
+          <w:bCs/>
+        </w:rPr>
+        <w:t>pref</w:t>
+      </w:r>
+      <w:proofErr w:type="spellEnd"/>
       <w:r>
         <w:t xml:space="preserve"> file contains sufficient information to analyze CPU metrics, memory, and screen rendering.  It contains a snapshot of the BBC Micro at the start of recording and a log of all executed 6502 (or 65C02) instructions.  The log contains all 6502/65C02 register state changes, all memory accesses and values, plus key events like interrupts and begin screen display.  It also optionally contains label information.</w:t>
       </w:r>
@@ -7756,7 +8027,23 @@
           <w:b/>
           <w:bCs/>
         </w:rPr>
-        <w:t>&lt;header_chunk&gt;</w:t>
+        <w:t>&lt;</w:t>
+      </w:r>
+      <w:proofErr w:type="spellStart"/>
+      <w:r>
+        <w:rPr>
+          <w:b/>
+          <w:bCs/>
+        </w:rPr>
+        <w:t>header_chunk</w:t>
+      </w:r>
+      <w:proofErr w:type="spellEnd"/>
+      <w:r>
+        <w:rPr>
+          <w:b/>
+          <w:bCs/>
+        </w:rPr>
+        <w:t>&gt;</w:t>
       </w:r>
       <w:r>
         <w:t xml:space="preserve"> + </w:t>
@@ -7766,7 +8053,15 @@
           <w:b/>
           <w:bCs/>
         </w:rPr>
-        <w:t>&lt;label</w:t>
+        <w:t>&lt;</w:t>
+      </w:r>
+      <w:proofErr w:type="spellStart"/>
+      <w:r>
+        <w:rPr>
+          <w:b/>
+          <w:bCs/>
+        </w:rPr>
+        <w:t>label</w:t>
       </w:r>
       <w:r>
         <w:rPr>
@@ -7780,7 +8075,15 @@
           <w:b/>
           <w:bCs/>
         </w:rPr>
-        <w:t>_chunk&gt;</w:t>
+        <w:t>_chunk</w:t>
+      </w:r>
+      <w:proofErr w:type="spellEnd"/>
+      <w:r>
+        <w:rPr>
+          <w:b/>
+          <w:bCs/>
+        </w:rPr>
+        <w:t>&gt;</w:t>
       </w:r>
       <w:r>
         <w:rPr>
@@ -7801,7 +8104,23 @@
           <w:b/>
           <w:bCs/>
         </w:rPr>
-        <w:t>&lt;snapshot_chunk&gt;</w:t>
+        <w:t>&lt;</w:t>
+      </w:r>
+      <w:proofErr w:type="spellStart"/>
+      <w:r>
+        <w:rPr>
+          <w:b/>
+          <w:bCs/>
+        </w:rPr>
+        <w:t>snapshot_chunk</w:t>
+      </w:r>
+      <w:proofErr w:type="spellEnd"/>
+      <w:r>
+        <w:rPr>
+          <w:b/>
+          <w:bCs/>
+        </w:rPr>
+        <w:t>&gt;</w:t>
       </w:r>
       <w:r>
         <w:t xml:space="preserve"> + </w:t>
@@ -7811,7 +8130,23 @@
           <w:b/>
           <w:bCs/>
         </w:rPr>
-        <w:t>&lt;execution_chunk&gt;</w:t>
+        <w:t>&lt;</w:t>
+      </w:r>
+      <w:proofErr w:type="spellStart"/>
+      <w:r>
+        <w:rPr>
+          <w:b/>
+          <w:bCs/>
+        </w:rPr>
+        <w:t>execution_chunk</w:t>
+      </w:r>
+      <w:proofErr w:type="spellEnd"/>
+      <w:r>
+        <w:rPr>
+          <w:b/>
+          <w:bCs/>
+        </w:rPr>
+        <w:t>&gt;</w:t>
       </w:r>
       <w:r>
         <w:rPr>
@@ -7930,6 +8265,7 @@
         </w:rPr>
         <w:t>&lt;</w:t>
       </w:r>
+      <w:proofErr w:type="spellStart"/>
       <w:r>
         <w:rPr>
           <w:b/>
@@ -7942,7 +8278,15 @@
           <w:b/>
           <w:bCs/>
         </w:rPr>
-        <w:t>header&gt;</w:t>
+        <w:t>header</w:t>
+      </w:r>
+      <w:proofErr w:type="spellEnd"/>
+      <w:r>
+        <w:rPr>
+          <w:b/>
+          <w:bCs/>
+        </w:rPr>
+        <w:t>&gt;</w:t>
       </w:r>
       <w:r>
         <w:t xml:space="preserve"> = </w:t>
@@ -7953,11 +8297,24 @@
       <w:r>
         <w:t>&lt;tag&gt; + &lt;compression&gt; + &lt;</w:t>
       </w:r>
+      <w:proofErr w:type="spellStart"/>
       <w:r>
         <w:t>original_</w:t>
       </w:r>
       <w:r>
-        <w:t>size&gt; + &lt;compressed_size&gt;</w:t>
+        <w:t>size</w:t>
+      </w:r>
+      <w:proofErr w:type="spellEnd"/>
+      <w:r>
+        <w:t>&gt; + &lt;</w:t>
+      </w:r>
+      <w:proofErr w:type="spellStart"/>
+      <w:r>
+        <w:t>compressed_size</w:t>
+      </w:r>
+      <w:proofErr w:type="spellEnd"/>
+      <w:r>
+        <w:t>&gt;</w:t>
       </w:r>
     </w:p>
     <w:p>
@@ -8055,7 +8412,23 @@
                 <w:rFonts w:ascii="Aptos" w:hAnsi="Aptos"/>
                 <w:color w:val="000000"/>
               </w:rPr>
-              <w:t>‘PFhd’</w:t>
+              <w:t>‘</w:t>
+            </w:r>
+            <w:proofErr w:type="spellStart"/>
+            <w:r>
+              <w:rPr>
+                <w:rFonts w:ascii="Aptos" w:hAnsi="Aptos"/>
+                <w:color w:val="000000"/>
+              </w:rPr>
+              <w:t>PFhd</w:t>
+            </w:r>
+            <w:proofErr w:type="spellEnd"/>
+            <w:r>
+              <w:rPr>
+                <w:rFonts w:ascii="Aptos" w:hAnsi="Aptos"/>
+                <w:color w:val="000000"/>
+              </w:rPr>
+              <w:t>’</w:t>
             </w:r>
           </w:p>
         </w:tc>
@@ -8075,7 +8448,23 @@
                 <w:rFonts w:ascii="Aptos" w:hAnsi="Aptos"/>
                 <w:color w:val="000000"/>
               </w:rPr>
-              <w:t>&lt;header_chunk&gt;</w:t>
+              <w:t>&lt;</w:t>
+            </w:r>
+            <w:proofErr w:type="spellStart"/>
+            <w:r>
+              <w:rPr>
+                <w:rFonts w:ascii="Aptos" w:hAnsi="Aptos"/>
+                <w:color w:val="000000"/>
+              </w:rPr>
+              <w:t>header_chunk</w:t>
+            </w:r>
+            <w:proofErr w:type="spellEnd"/>
+            <w:r>
+              <w:rPr>
+                <w:rFonts w:ascii="Aptos" w:hAnsi="Aptos"/>
+                <w:color w:val="000000"/>
+              </w:rPr>
+              <w:t>&gt;</w:t>
             </w:r>
           </w:p>
         </w:tc>
@@ -8097,7 +8486,23 @@
                 <w:rFonts w:ascii="Aptos" w:hAnsi="Aptos"/>
                 <w:color w:val="000000"/>
               </w:rPr>
-              <w:t>‘PFlb’</w:t>
+              <w:t>‘</w:t>
+            </w:r>
+            <w:proofErr w:type="spellStart"/>
+            <w:r>
+              <w:rPr>
+                <w:rFonts w:ascii="Aptos" w:hAnsi="Aptos"/>
+                <w:color w:val="000000"/>
+              </w:rPr>
+              <w:t>PFlb</w:t>
+            </w:r>
+            <w:proofErr w:type="spellEnd"/>
+            <w:r>
+              <w:rPr>
+                <w:rFonts w:ascii="Aptos" w:hAnsi="Aptos"/>
+                <w:color w:val="000000"/>
+              </w:rPr>
+              <w:t>’</w:t>
             </w:r>
           </w:p>
         </w:tc>
@@ -8113,7 +8518,15 @@
               </w:rPr>
             </w:pPr>
             <w:r>
-              <w:t>&lt;labels_chunk&gt;</w:t>
+              <w:t>&lt;</w:t>
+            </w:r>
+            <w:proofErr w:type="spellStart"/>
+            <w:r>
+              <w:t>labels_chunk</w:t>
+            </w:r>
+            <w:proofErr w:type="spellEnd"/>
+            <w:r>
+              <w:t>&gt;</w:t>
             </w:r>
           </w:p>
         </w:tc>
@@ -8135,7 +8548,23 @@
                 <w:rFonts w:ascii="Aptos" w:hAnsi="Aptos"/>
                 <w:color w:val="000000"/>
               </w:rPr>
-              <w:t>‘PFss’</w:t>
+              <w:t>‘</w:t>
+            </w:r>
+            <w:proofErr w:type="spellStart"/>
+            <w:r>
+              <w:rPr>
+                <w:rFonts w:ascii="Aptos" w:hAnsi="Aptos"/>
+                <w:color w:val="000000"/>
+              </w:rPr>
+              <w:t>PFss</w:t>
+            </w:r>
+            <w:proofErr w:type="spellEnd"/>
+            <w:r>
+              <w:rPr>
+                <w:rFonts w:ascii="Aptos" w:hAnsi="Aptos"/>
+                <w:color w:val="000000"/>
+              </w:rPr>
+              <w:t>’</w:t>
             </w:r>
           </w:p>
         </w:tc>
@@ -8151,7 +8580,15 @@
               </w:rPr>
             </w:pPr>
             <w:r>
-              <w:t>&lt;snapshot_chunk&gt;</w:t>
+              <w:t>&lt;</w:t>
+            </w:r>
+            <w:proofErr w:type="spellStart"/>
+            <w:r>
+              <w:t>snapshot_chunk</w:t>
+            </w:r>
+            <w:proofErr w:type="spellEnd"/>
+            <w:r>
+              <w:t>&gt;</w:t>
             </w:r>
           </w:p>
         </w:tc>
@@ -8173,7 +8610,23 @@
                 <w:rFonts w:ascii="Aptos" w:hAnsi="Aptos"/>
                 <w:color w:val="000000"/>
               </w:rPr>
-              <w:t>‘PFex’</w:t>
+              <w:t>‘</w:t>
+            </w:r>
+            <w:proofErr w:type="spellStart"/>
+            <w:r>
+              <w:rPr>
+                <w:rFonts w:ascii="Aptos" w:hAnsi="Aptos"/>
+                <w:color w:val="000000"/>
+              </w:rPr>
+              <w:t>PFex</w:t>
+            </w:r>
+            <w:proofErr w:type="spellEnd"/>
+            <w:r>
+              <w:rPr>
+                <w:rFonts w:ascii="Aptos" w:hAnsi="Aptos"/>
+                <w:color w:val="000000"/>
+              </w:rPr>
+              <w:t>’</w:t>
             </w:r>
           </w:p>
         </w:tc>
@@ -8189,7 +8642,15 @@
               </w:rPr>
             </w:pPr>
             <w:r>
-              <w:t>&lt;execution_chunk&gt;</w:t>
+              <w:t>&lt;</w:t>
+            </w:r>
+            <w:proofErr w:type="spellStart"/>
+            <w:r>
+              <w:t>execution_chunk</w:t>
+            </w:r>
+            <w:proofErr w:type="spellEnd"/>
+            <w:r>
+              <w:t>&gt;</w:t>
             </w:r>
           </w:p>
         </w:tc>
@@ -8355,8 +8816,13 @@
             <w:tcW w:w="3240" w:type="dxa"/>
           </w:tcPr>
           <w:p>
-            <w:r>
-              <w:t>zlib 1.3.1 (default algorithm)</w:t>
+            <w:proofErr w:type="spellStart"/>
+            <w:r>
+              <w:t>zlib</w:t>
+            </w:r>
+            <w:proofErr w:type="spellEnd"/>
+            <w:r>
+              <w:t xml:space="preserve"> 1.3.1 (default algorithm)</w:t>
             </w:r>
           </w:p>
         </w:tc>
@@ -8372,11 +8838,16 @@
       <w:r>
         <w:t>&lt;</w:t>
       </w:r>
+      <w:proofErr w:type="spellStart"/>
       <w:r>
         <w:t>original</w:t>
       </w:r>
       <w:r>
-        <w:t>_size&gt;</w:t>
+        <w:t>_size</w:t>
+      </w:r>
+      <w:proofErr w:type="spellEnd"/>
+      <w:r>
+        <w:t>&gt;</w:t>
       </w:r>
       <w:r>
         <w:t xml:space="preserve"> (4 bytes) The size of the chuck data, before compression, in bytes.</w:t>
@@ -8387,10 +8858,26 @@
         <w:ind w:left="360"/>
       </w:pPr>
       <w:r>
-        <w:t>&lt;compressed_size&gt;</w:t>
-      </w:r>
-      <w:r>
-        <w:t xml:space="preserve"> (4 bytes) The size of the chuck data, after compression, in bytes.  If the data is not compressed, the value matches &lt;original_size&gt;.</w:t>
+        <w:t>&lt;</w:t>
+      </w:r>
+      <w:proofErr w:type="spellStart"/>
+      <w:r>
+        <w:t>compressed_size</w:t>
+      </w:r>
+      <w:proofErr w:type="spellEnd"/>
+      <w:r>
+        <w:t>&gt;</w:t>
+      </w:r>
+      <w:r>
+        <w:t xml:space="preserve"> (4 bytes) The size of the chuck data, after compression, in bytes.  If the data is not compressed, the value matches &lt;</w:t>
+      </w:r>
+      <w:proofErr w:type="spellStart"/>
+      <w:r>
+        <w:t>original_size</w:t>
+      </w:r>
+      <w:proofErr w:type="spellEnd"/>
+      <w:r>
+        <w:t>&gt;.</w:t>
       </w:r>
     </w:p>
     <w:p>
@@ -8418,14 +8905,35 @@
           <w:b/>
           <w:bCs/>
         </w:rPr>
-        <w:t>&lt;header_chunk&gt;</w:t>
+        <w:t>&lt;</w:t>
+      </w:r>
+      <w:proofErr w:type="spellStart"/>
+      <w:r>
+        <w:rPr>
+          <w:b/>
+          <w:bCs/>
+        </w:rPr>
+        <w:t>header_chunk</w:t>
+      </w:r>
+      <w:proofErr w:type="spellEnd"/>
+      <w:r>
+        <w:rPr>
+          <w:b/>
+          <w:bCs/>
+        </w:rPr>
+        <w:t>&gt;</w:t>
       </w:r>
       <w:r>
         <w:t xml:space="preserve"> = </w:t>
       </w:r>
       <w:r>
-        <w:t>&lt;common_header</w:t>
-      </w:r>
+        <w:t>&lt;</w:t>
+      </w:r>
+      <w:proofErr w:type="spellStart"/>
+      <w:r>
+        <w:t>common_header</w:t>
+      </w:r>
+      <w:proofErr w:type="spellEnd"/>
       <w:r>
         <w:t>(</w:t>
       </w:r>
@@ -8436,6 +8944,7 @@
         </w:rPr>
         <w:t>‘</w:t>
       </w:r>
+      <w:proofErr w:type="spellStart"/>
       <w:r>
         <w:rPr>
           <w:rFonts w:ascii="Aptos" w:hAnsi="Aptos"/>
@@ -8443,7 +8952,17 @@
           <w:bCs/>
           <w:color w:val="000000"/>
         </w:rPr>
-        <w:t>PFhd’</w:t>
+        <w:t>PFhd</w:t>
+      </w:r>
+      <w:proofErr w:type="spellEnd"/>
+      <w:r>
+        <w:rPr>
+          <w:rFonts w:ascii="Aptos" w:hAnsi="Aptos"/>
+          <w:b/>
+          <w:bCs/>
+          <w:color w:val="000000"/>
+        </w:rPr>
+        <w:t>’</w:t>
       </w:r>
       <w:r>
         <w:rPr>
@@ -8453,7 +8972,15 @@
         <w:t>)</w:t>
       </w:r>
       <w:r>
-        <w:t>&gt; + &lt;header_data&gt; where</w:t>
+        <w:t>&gt; + &lt;</w:t>
+      </w:r>
+      <w:proofErr w:type="spellStart"/>
+      <w:r>
+        <w:t>header_data</w:t>
+      </w:r>
+      <w:proofErr w:type="spellEnd"/>
+      <w:r>
+        <w:t>&gt; where</w:t>
       </w:r>
     </w:p>
     <w:p>
@@ -8461,11 +8988,51 @@
         <w:ind w:left="720" w:hanging="360"/>
       </w:pPr>
       <w:r>
-        <w:t xml:space="preserve">&lt;header_data&gt; = </w:t>
+        <w:t>&lt;</w:t>
+      </w:r>
+      <w:proofErr w:type="spellStart"/>
+      <w:r>
+        <w:t>header_data</w:t>
+      </w:r>
+      <w:proofErr w:type="spellEnd"/>
+      <w:r>
+        <w:t xml:space="preserve">&gt; = </w:t>
       </w:r>
       <w:r>
         <w:br/>
-        <w:t>&lt;major_version&gt; + &lt;minor_version&gt; + &lt;bbc_model&gt; + &lt;total_execution_count&gt;</w:t>
+        <w:t>&lt;</w:t>
+      </w:r>
+      <w:proofErr w:type="spellStart"/>
+      <w:r>
+        <w:t>major_version</w:t>
+      </w:r>
+      <w:proofErr w:type="spellEnd"/>
+      <w:r>
+        <w:t>&gt; + &lt;</w:t>
+      </w:r>
+      <w:proofErr w:type="spellStart"/>
+      <w:r>
+        <w:t>minor_version</w:t>
+      </w:r>
+      <w:proofErr w:type="spellEnd"/>
+      <w:r>
+        <w:t>&gt; + &lt;</w:t>
+      </w:r>
+      <w:proofErr w:type="spellStart"/>
+      <w:r>
+        <w:t>bbc_model</w:t>
+      </w:r>
+      <w:proofErr w:type="spellEnd"/>
+      <w:r>
+        <w:t>&gt; + &lt;</w:t>
+      </w:r>
+      <w:proofErr w:type="spellStart"/>
+      <w:r>
+        <w:t>total_execution_count</w:t>
+      </w:r>
+      <w:proofErr w:type="spellEnd"/>
+      <w:r>
+        <w:t>&gt;</w:t>
       </w:r>
     </w:p>
     <w:p>
@@ -8473,7 +9040,15 @@
         <w:ind w:left="360"/>
       </w:pPr>
       <w:r>
-        <w:t>&lt;major_version&gt; (1 byte) Major version number.  Value is 1.</w:t>
+        <w:t>&lt;</w:t>
+      </w:r>
+      <w:proofErr w:type="spellStart"/>
+      <w:r>
+        <w:t>major_version</w:t>
+      </w:r>
+      <w:proofErr w:type="spellEnd"/>
+      <w:r>
+        <w:t>&gt; (1 byte) Major version number.  Value is 1.</w:t>
       </w:r>
     </w:p>
     <w:p>
@@ -8481,7 +9056,15 @@
         <w:ind w:left="360"/>
       </w:pPr>
       <w:r>
-        <w:t>&lt;minor_version&gt; (1 byte) Minor version number.  Value is 0.</w:t>
+        <w:t>&lt;</w:t>
+      </w:r>
+      <w:proofErr w:type="spellStart"/>
+      <w:r>
+        <w:t>minor_version</w:t>
+      </w:r>
+      <w:proofErr w:type="spellEnd"/>
+      <w:r>
+        <w:t>&gt; (1 byte) Minor version number.  Value is 0.</w:t>
       </w:r>
     </w:p>
     <w:p>
@@ -8489,7 +9072,15 @@
         <w:ind w:left="360"/>
       </w:pPr>
       <w:r>
-        <w:t>&lt;bbc_model&gt; (1 byte) The BBC model</w:t>
+        <w:t>&lt;</w:t>
+      </w:r>
+      <w:proofErr w:type="spellStart"/>
+      <w:r>
+        <w:t>bbc_model</w:t>
+      </w:r>
+      <w:proofErr w:type="spellEnd"/>
+      <w:r>
+        <w:t>&gt; (1 byte) The BBC model</w:t>
       </w:r>
     </w:p>
     <w:tbl>
@@ -8915,7 +9506,15 @@
         <w:ind w:left="360"/>
       </w:pPr>
       <w:r>
-        <w:t>&lt;total_execution_count&gt; (4 bytes) The total number of executed instructions plus events in the file.</w:t>
+        <w:t>&lt;</w:t>
+      </w:r>
+      <w:proofErr w:type="spellStart"/>
+      <w:r>
+        <w:t>total_execution_count</w:t>
+      </w:r>
+      <w:proofErr w:type="spellEnd"/>
+      <w:r>
+        <w:t>&gt; (4 bytes) The total number of executed instructions plus events in the file.</w:t>
       </w:r>
     </w:p>
     <w:p>
@@ -8959,14 +9558,35 @@
           <w:b/>
           <w:bCs/>
         </w:rPr>
-        <w:t>&lt;labels_chunk&gt;</w:t>
+        <w:t>&lt;</w:t>
+      </w:r>
+      <w:proofErr w:type="spellStart"/>
+      <w:r>
+        <w:rPr>
+          <w:b/>
+          <w:bCs/>
+        </w:rPr>
+        <w:t>labels_chunk</w:t>
+      </w:r>
+      <w:proofErr w:type="spellEnd"/>
+      <w:r>
+        <w:rPr>
+          <w:b/>
+          <w:bCs/>
+        </w:rPr>
+        <w:t>&gt;</w:t>
       </w:r>
       <w:r>
         <w:t xml:space="preserve"> = </w:t>
       </w:r>
       <w:r>
-        <w:t>&lt;common_heade</w:t>
-      </w:r>
+        <w:t>&lt;</w:t>
+      </w:r>
+      <w:proofErr w:type="spellStart"/>
+      <w:r>
+        <w:t>common_heade</w:t>
+      </w:r>
+      <w:proofErr w:type="spellEnd"/>
       <w:r>
         <w:t>(</w:t>
       </w:r>
@@ -8977,6 +9597,7 @@
         </w:rPr>
         <w:t>‘</w:t>
       </w:r>
+      <w:proofErr w:type="spellStart"/>
       <w:r>
         <w:rPr>
           <w:rFonts w:ascii="Aptos" w:hAnsi="Aptos"/>
@@ -8986,6 +9607,7 @@
         </w:rPr>
         <w:t>PFlb</w:t>
       </w:r>
+      <w:proofErr w:type="spellEnd"/>
       <w:r>
         <w:t>’)</w:t>
       </w:r>
@@ -8993,7 +9615,15 @@
         <w:t xml:space="preserve">&gt; </w:t>
       </w:r>
       <w:r>
-        <w:t>+ &lt;label_data&gt; where</w:t>
+        <w:t>+ &lt;</w:t>
+      </w:r>
+      <w:proofErr w:type="spellStart"/>
+      <w:r>
+        <w:t>label_data</w:t>
+      </w:r>
+      <w:proofErr w:type="spellEnd"/>
+      <w:r>
+        <w:t>&gt; where</w:t>
       </w:r>
     </w:p>
     <w:p>
@@ -9003,6 +9633,7 @@
       <w:r>
         <w:t>&lt;</w:t>
       </w:r>
+      <w:proofErr w:type="spellStart"/>
       <w:r>
         <w:rPr>
           <w:b/>
@@ -9010,6 +9641,7 @@
         </w:rPr>
         <w:t>label_data</w:t>
       </w:r>
+      <w:proofErr w:type="spellEnd"/>
       <w:r>
         <w:t xml:space="preserve">&gt; = </w:t>
       </w:r>
@@ -9032,7 +9664,23 @@
       </w:r>
       <w:bookmarkEnd w:id="0"/>
       <w:r>
-        <w:t xml:space="preserve">&lt;label_address&gt; + &lt;label_name&gt; </w:t>
+        <w:t>&lt;</w:t>
+      </w:r>
+      <w:proofErr w:type="spellStart"/>
+      <w:r>
+        <w:t>label_address</w:t>
+      </w:r>
+      <w:proofErr w:type="spellEnd"/>
+      <w:r>
+        <w:t>&gt; + &lt;</w:t>
+      </w:r>
+      <w:proofErr w:type="spellStart"/>
+      <w:r>
+        <w:t>label_name</w:t>
+      </w:r>
+      <w:proofErr w:type="spellEnd"/>
+      <w:r>
+        <w:t xml:space="preserve">&gt; </w:t>
       </w:r>
     </w:p>
     <w:p>
@@ -9040,7 +9688,15 @@
         <w:ind w:left="810"/>
       </w:pPr>
       <w:r>
-        <w:t>&lt;label_address&gt; (2 bytes) A 16-bit address.</w:t>
+        <w:t>&lt;</w:t>
+      </w:r>
+      <w:proofErr w:type="spellStart"/>
+      <w:r>
+        <w:t>label_address</w:t>
+      </w:r>
+      <w:proofErr w:type="spellEnd"/>
+      <w:r>
+        <w:t>&gt; (2 bytes) A 16-bit address.</w:t>
       </w:r>
     </w:p>
     <w:p>
@@ -9084,6 +9740,7 @@
         </w:rPr>
         <w:t>&lt;</w:t>
       </w:r>
+      <w:proofErr w:type="spellStart"/>
       <w:r>
         <w:rPr>
           <w:b/>
@@ -9096,7 +9753,15 @@
           <w:b/>
           <w:bCs/>
         </w:rPr>
-        <w:t>_chunk&gt;</w:t>
+        <w:t>_chunk</w:t>
+      </w:r>
+      <w:proofErr w:type="spellEnd"/>
+      <w:r>
+        <w:rPr>
+          <w:b/>
+          <w:bCs/>
+        </w:rPr>
+        <w:t>&gt;</w:t>
       </w:r>
       <w:r>
         <w:rPr>
@@ -9106,11 +9771,16 @@
         <w:t xml:space="preserve"> </w:t>
       </w:r>
       <w:r>
-        <w:t>= &lt;common_</w:t>
+        <w:t>= &lt;</w:t>
+      </w:r>
+      <w:proofErr w:type="spellStart"/>
+      <w:r>
+        <w:t>common_</w:t>
       </w:r>
       <w:r>
         <w:t>header</w:t>
       </w:r>
+      <w:proofErr w:type="spellEnd"/>
       <w:r>
         <w:t>(</w:t>
       </w:r>
@@ -9121,6 +9791,7 @@
         </w:rPr>
         <w:t>‘</w:t>
       </w:r>
+      <w:proofErr w:type="spellStart"/>
       <w:r>
         <w:rPr>
           <w:rFonts w:ascii="Aptos" w:hAnsi="Aptos"/>
@@ -9128,7 +9799,17 @@
           <w:bCs/>
           <w:color w:val="000000"/>
         </w:rPr>
-        <w:t>PFss’</w:t>
+        <w:t>PFss</w:t>
+      </w:r>
+      <w:proofErr w:type="spellEnd"/>
+      <w:r>
+        <w:rPr>
+          <w:rFonts w:ascii="Aptos" w:hAnsi="Aptos"/>
+          <w:b/>
+          <w:bCs/>
+          <w:color w:val="000000"/>
+        </w:rPr>
+        <w:t>’</w:t>
       </w:r>
       <w:r>
         <w:rPr>
@@ -9148,7 +9829,15 @@
         <w:t xml:space="preserve"> </w:t>
       </w:r>
       <w:r>
-        <w:t>&lt;snapshot_data&gt; where</w:t>
+        <w:t>&lt;</w:t>
+      </w:r>
+      <w:proofErr w:type="spellStart"/>
+      <w:r>
+        <w:t>snapshot_data</w:t>
+      </w:r>
+      <w:proofErr w:type="spellEnd"/>
+      <w:r>
+        <w:t>&gt; where</w:t>
       </w:r>
     </w:p>
     <w:p>
@@ -9158,6 +9847,7 @@
       <w:r>
         <w:t>&lt;</w:t>
       </w:r>
+      <w:proofErr w:type="spellStart"/>
       <w:r>
         <w:rPr>
           <w:b/>
@@ -9165,6 +9855,7 @@
         </w:rPr>
         <w:t>snapshot_data</w:t>
       </w:r>
+      <w:proofErr w:type="spellEnd"/>
       <w:r>
         <w:t>&gt; =</w:t>
       </w:r>
@@ -9172,34 +9863,114 @@
         <w:br/>
       </w:r>
       <w:r>
-        <w:t>&lt;program</w:t>
+        <w:t>&lt;</w:t>
+      </w:r>
+      <w:proofErr w:type="spellStart"/>
+      <w:r>
+        <w:t>program</w:t>
       </w:r>
       <w:r>
         <w:t>_</w:t>
       </w:r>
       <w:r>
-        <w:t>counter&gt; + &lt;accumulator&gt; + &lt;x</w:t>
+        <w:t>counter</w:t>
+      </w:r>
+      <w:proofErr w:type="spellEnd"/>
+      <w:r>
+        <w:t>&gt; + &lt;accumulator&gt; + &lt;</w:t>
+      </w:r>
+      <w:proofErr w:type="spellStart"/>
+      <w:r>
+        <w:t>x</w:t>
       </w:r>
       <w:r>
         <w:t>_</w:t>
       </w:r>
       <w:r>
-        <w:t>register&gt; + &lt;y</w:t>
+        <w:t>register</w:t>
+      </w:r>
+      <w:proofErr w:type="spellEnd"/>
+      <w:r>
+        <w:t>&gt; + &lt;</w:t>
+      </w:r>
+      <w:proofErr w:type="spellStart"/>
+      <w:r>
+        <w:t>y</w:t>
       </w:r>
       <w:r>
         <w:t>_</w:t>
       </w:r>
       <w:r>
-        <w:t>register&gt; + &lt;status</w:t>
+        <w:t>register</w:t>
+      </w:r>
+      <w:proofErr w:type="spellEnd"/>
+      <w:r>
+        <w:t>&gt; + &lt;</w:t>
+      </w:r>
+      <w:proofErr w:type="spellStart"/>
+      <w:r>
+        <w:t>status</w:t>
       </w:r>
       <w:r>
         <w:t>_</w:t>
       </w:r>
       <w:r>
-        <w:t>register&gt; +</w:t>
-      </w:r>
-      <w:r>
-        <w:t xml:space="preserve"> &lt;stack_pointer&gt; + &lt;rom_paging_register&gt; + &lt;acccon&gt; + &lt;call_stack&gt; + &lt;screen_address&gt; + &lt;hidden_ram_address&gt;</w:t>
+        <w:t>register</w:t>
+      </w:r>
+      <w:proofErr w:type="spellEnd"/>
+      <w:r>
+        <w:t>&gt; +</w:t>
+      </w:r>
+      <w:r>
+        <w:t xml:space="preserve"> &lt;</w:t>
+      </w:r>
+      <w:proofErr w:type="spellStart"/>
+      <w:r>
+        <w:t>stack_pointer</w:t>
+      </w:r>
+      <w:proofErr w:type="spellEnd"/>
+      <w:r>
+        <w:t>&gt; + &lt;</w:t>
+      </w:r>
+      <w:proofErr w:type="spellStart"/>
+      <w:r>
+        <w:t>rom_paging_register</w:t>
+      </w:r>
+      <w:proofErr w:type="spellEnd"/>
+      <w:r>
+        <w:t>&gt; + &lt;</w:t>
+      </w:r>
+      <w:proofErr w:type="spellStart"/>
+      <w:r>
+        <w:t>acccon</w:t>
+      </w:r>
+      <w:proofErr w:type="spellEnd"/>
+      <w:r>
+        <w:t>&gt; + &lt;</w:t>
+      </w:r>
+      <w:proofErr w:type="spellStart"/>
+      <w:r>
+        <w:t>call_stack</w:t>
+      </w:r>
+      <w:proofErr w:type="spellEnd"/>
+      <w:r>
+        <w:t>&gt; + &lt;</w:t>
+      </w:r>
+      <w:proofErr w:type="spellStart"/>
+      <w:r>
+        <w:t>screen_address</w:t>
+      </w:r>
+      <w:proofErr w:type="spellEnd"/>
+      <w:r>
+        <w:t>&gt; + &lt;</w:t>
+      </w:r>
+      <w:proofErr w:type="spellStart"/>
+      <w:r>
+        <w:t>hidden_ram_address</w:t>
+      </w:r>
+      <w:proofErr w:type="spellEnd"/>
+      <w:r>
+        <w:t>&gt;</w:t>
       </w:r>
       <w:r>
         <w:rPr>
@@ -9210,7 +9981,31 @@
         <w:t>opt</w:t>
       </w:r>
       <w:r>
-        <w:t xml:space="preserve"> + &lt;6845_registers&gt; + &lt;ULA_video_control_register&gt; + &lt;ULA_palette&gt; + &lt;memory_snapshot&gt;</w:t>
+        <w:t xml:space="preserve"> + &lt;6845_registers&gt; + &lt;</w:t>
+      </w:r>
+      <w:proofErr w:type="spellStart"/>
+      <w:r>
+        <w:t>ULA_video_control_register</w:t>
+      </w:r>
+      <w:proofErr w:type="spellEnd"/>
+      <w:r>
+        <w:t>&gt; + &lt;</w:t>
+      </w:r>
+      <w:proofErr w:type="spellStart"/>
+      <w:r>
+        <w:t>ULA_palette</w:t>
+      </w:r>
+      <w:proofErr w:type="spellEnd"/>
+      <w:r>
+        <w:t>&gt; + &lt;</w:t>
+      </w:r>
+      <w:proofErr w:type="spellStart"/>
+      <w:r>
+        <w:t>memory_snapshot</w:t>
+      </w:r>
+      <w:proofErr w:type="spellEnd"/>
+      <w:r>
+        <w:t>&gt;</w:t>
       </w:r>
     </w:p>
     <w:p>
@@ -9240,13 +10035,21 @@
         <w:ind w:left="360"/>
       </w:pPr>
       <w:r>
-        <w:t>&lt;x</w:t>
+        <w:t>&lt;</w:t>
+      </w:r>
+      <w:proofErr w:type="spellStart"/>
+      <w:r>
+        <w:t>x</w:t>
       </w:r>
       <w:r>
         <w:t>_</w:t>
       </w:r>
       <w:r>
-        <w:t>register&gt; (1 byte).  The value of the X register.</w:t>
+        <w:t>register</w:t>
+      </w:r>
+      <w:proofErr w:type="spellEnd"/>
+      <w:r>
+        <w:t>&gt; (1 byte).  The value of the X register.</w:t>
       </w:r>
     </w:p>
     <w:p>
@@ -9254,13 +10057,21 @@
         <w:ind w:left="360"/>
       </w:pPr>
       <w:r>
-        <w:t>&lt;y</w:t>
+        <w:t>&lt;</w:t>
+      </w:r>
+      <w:proofErr w:type="spellStart"/>
+      <w:r>
+        <w:t>y</w:t>
       </w:r>
       <w:r>
         <w:t>_</w:t>
       </w:r>
       <w:r>
-        <w:t>register&gt; (1 byte).  The value of the Y register.</w:t>
+        <w:t>register</w:t>
+      </w:r>
+      <w:proofErr w:type="spellEnd"/>
+      <w:r>
+        <w:t>&gt; (1 byte).  The value of the Y register.</w:t>
       </w:r>
     </w:p>
     <w:p>
@@ -9268,13 +10079,21 @@
         <w:ind w:left="360"/>
       </w:pPr>
       <w:r>
-        <w:t>&lt;status</w:t>
+        <w:t>&lt;</w:t>
+      </w:r>
+      <w:proofErr w:type="spellStart"/>
+      <w:r>
+        <w:t>status</w:t>
       </w:r>
       <w:r>
         <w:t>_</w:t>
       </w:r>
       <w:r>
-        <w:t>register&gt; (1 byte).  The value of the status register.</w:t>
+        <w:t>register</w:t>
+      </w:r>
+      <w:proofErr w:type="spellEnd"/>
+      <w:r>
+        <w:t>&gt; (1 byte).  The value of the status register.</w:t>
       </w:r>
     </w:p>
     <w:p>
@@ -9282,7 +10101,15 @@
         <w:ind w:left="360"/>
       </w:pPr>
       <w:r>
-        <w:t>&lt;stack_pointer&gt; (1 byte).  The value of the stack register.</w:t>
+        <w:t>&lt;</w:t>
+      </w:r>
+      <w:proofErr w:type="spellStart"/>
+      <w:r>
+        <w:t>stack_pointer</w:t>
+      </w:r>
+      <w:proofErr w:type="spellEnd"/>
+      <w:r>
+        <w:t>&gt; (1 byte).  The value of the stack register.</w:t>
       </w:r>
     </w:p>
     <w:p>
@@ -9290,7 +10117,15 @@
         <w:ind w:left="360"/>
       </w:pPr>
       <w:r>
-        <w:t>&lt;rom_paging_register&gt; (1 byte).  The value of the ROM paging register (set via SHEILA address &amp;FE30).</w:t>
+        <w:t>&lt;</w:t>
+      </w:r>
+      <w:proofErr w:type="spellStart"/>
+      <w:r>
+        <w:t>rom_paging_register</w:t>
+      </w:r>
+      <w:proofErr w:type="spellEnd"/>
+      <w:r>
+        <w:t>&gt; (1 byte).  The value of the ROM paging register (set via SHEILA address &amp;FE30).</w:t>
       </w:r>
     </w:p>
     <w:p>
@@ -9298,7 +10133,15 @@
         <w:ind w:left="360"/>
       </w:pPr>
       <w:r>
-        <w:t>&lt;acccon&gt; (1 byte).  The value of the access control register (set via SHEILA address &amp;FE34).</w:t>
+        <w:t>&lt;</w:t>
+      </w:r>
+      <w:proofErr w:type="spellStart"/>
+      <w:r>
+        <w:t>acccon</w:t>
+      </w:r>
+      <w:proofErr w:type="spellEnd"/>
+      <w:r>
+        <w:t>&gt; (1 byte).  The value of the access control register (set via SHEILA address &amp;FE34).</w:t>
       </w:r>
     </w:p>
     <w:p>
@@ -9311,7 +10154,31 @@
         </w:rPr>
       </w:pPr>
       <w:r>
-        <w:t>&lt;call_stack&gt; = &lt;stack_frame_count&gt; + &lt;stack_frame&gt;</w:t>
+        <w:t>&lt;</w:t>
+      </w:r>
+      <w:proofErr w:type="spellStart"/>
+      <w:r>
+        <w:t>call_stack</w:t>
+      </w:r>
+      <w:proofErr w:type="spellEnd"/>
+      <w:r>
+        <w:t>&gt; = &lt;</w:t>
+      </w:r>
+      <w:proofErr w:type="spellStart"/>
+      <w:r>
+        <w:t>stack_frame_count</w:t>
+      </w:r>
+      <w:proofErr w:type="spellEnd"/>
+      <w:r>
+        <w:t>&gt; + &lt;</w:t>
+      </w:r>
+      <w:proofErr w:type="spellStart"/>
+      <w:r>
+        <w:t>stack_frame</w:t>
+      </w:r>
+      <w:proofErr w:type="spellEnd"/>
+      <w:r>
+        <w:t>&gt;</w:t>
       </w:r>
       <w:r>
         <w:rPr>
@@ -9485,7 +10352,15 @@
         <w:ind w:left="720"/>
       </w:pPr>
       <w:r>
-        <w:t>&lt;stack_frame_count&gt; (1 byte) The number of stack frames.</w:t>
+        <w:t>&lt;</w:t>
+      </w:r>
+      <w:proofErr w:type="spellStart"/>
+      <w:r>
+        <w:t>stack_frame_count</w:t>
+      </w:r>
+      <w:proofErr w:type="spellEnd"/>
+      <w:r>
+        <w:t>&gt; (1 byte) The number of stack frames.</w:t>
       </w:r>
     </w:p>
     <w:p>
@@ -9493,7 +10368,63 @@
         <w:ind w:left="720"/>
       </w:pPr>
       <w:r>
-        <w:t>&lt;stack_frame&gt; = &lt;stack_frame_type&gt; + &lt;start_address_page&gt; + &lt;start_address&gt; + &lt;return_address_page&gt; + &lt;return_address&gt; + &lt;return_stack_pointer&gt;</w:t>
+        <w:t>&lt;</w:t>
+      </w:r>
+      <w:proofErr w:type="spellStart"/>
+      <w:r>
+        <w:t>stack_frame</w:t>
+      </w:r>
+      <w:proofErr w:type="spellEnd"/>
+      <w:r>
+        <w:t>&gt; = &lt;</w:t>
+      </w:r>
+      <w:proofErr w:type="spellStart"/>
+      <w:r>
+        <w:t>stack_frame_type</w:t>
+      </w:r>
+      <w:proofErr w:type="spellEnd"/>
+      <w:r>
+        <w:t>&gt; + &lt;</w:t>
+      </w:r>
+      <w:proofErr w:type="spellStart"/>
+      <w:r>
+        <w:t>start_address_page</w:t>
+      </w:r>
+      <w:proofErr w:type="spellEnd"/>
+      <w:r>
+        <w:t>&gt; + &lt;</w:t>
+      </w:r>
+      <w:proofErr w:type="spellStart"/>
+      <w:r>
+        <w:t>start_address</w:t>
+      </w:r>
+      <w:proofErr w:type="spellEnd"/>
+      <w:r>
+        <w:t>&gt; + &lt;</w:t>
+      </w:r>
+      <w:proofErr w:type="spellStart"/>
+      <w:r>
+        <w:t>return_address_page</w:t>
+      </w:r>
+      <w:proofErr w:type="spellEnd"/>
+      <w:r>
+        <w:t>&gt; + &lt;</w:t>
+      </w:r>
+      <w:proofErr w:type="spellStart"/>
+      <w:r>
+        <w:t>return_address</w:t>
+      </w:r>
+      <w:proofErr w:type="spellEnd"/>
+      <w:r>
+        <w:t>&gt; + &lt;</w:t>
+      </w:r>
+      <w:proofErr w:type="spellStart"/>
+      <w:r>
+        <w:t>return_stack_pointer</w:t>
+      </w:r>
+      <w:proofErr w:type="spellEnd"/>
+      <w:r>
+        <w:t>&gt;</w:t>
       </w:r>
     </w:p>
     <w:p>
@@ -9501,7 +10432,15 @@
         <w:ind w:left="1080"/>
       </w:pPr>
       <w:r>
-        <w:t>&lt;stack_frame_type&gt; (1 byte) The stack frame’s type.  The value can be one of the following:</w:t>
+        <w:t>&lt;</w:t>
+      </w:r>
+      <w:proofErr w:type="spellStart"/>
+      <w:r>
+        <w:t>stack_frame_type</w:t>
+      </w:r>
+      <w:proofErr w:type="spellEnd"/>
+      <w:r>
+        <w:t>&gt; (1 byte) The stack frame’s type.  The value can be one of the following:</w:t>
       </w:r>
     </w:p>
     <w:tbl>
@@ -9694,7 +10633,15 @@
         <w:ind w:left="1080"/>
       </w:pPr>
       <w:r>
-        <w:t>&lt;start_address_page&gt; (1 byte) The memory page where the start address is located.  The value can be one of the following:</w:t>
+        <w:t>&lt;</w:t>
+      </w:r>
+      <w:proofErr w:type="spellStart"/>
+      <w:r>
+        <w:t>start_address_page</w:t>
+      </w:r>
+      <w:proofErr w:type="spellEnd"/>
+      <w:r>
+        <w:t>&gt; (1 byte) The memory page where the start address is located.  The value can be one of the following:</w:t>
       </w:r>
     </w:p>
     <w:tbl>
@@ -9947,9 +10894,11 @@
         <w:lastRenderedPageBreak/>
         <w:t>&lt;</w:t>
       </w:r>
+      <w:proofErr w:type="spellStart"/>
       <w:r>
         <w:t>start_address</w:t>
       </w:r>
+      <w:proofErr w:type="spellEnd"/>
       <w:r>
         <w:t>&gt; (</w:t>
       </w:r>
@@ -10006,7 +10955,15 @@
         <w:ind w:left="1080"/>
       </w:pPr>
       <w:r>
-        <w:t>&lt;return_address_page (1 byte) The memory page where the return address is located.  The value is defined in the above table.  The value in the root stack is always 16 (Whole RAM).</w:t>
+        <w:t>&lt;</w:t>
+      </w:r>
+      <w:proofErr w:type="spellStart"/>
+      <w:r>
+        <w:t>return_address_page</w:t>
+      </w:r>
+      <w:proofErr w:type="spellEnd"/>
+      <w:r>
+        <w:t xml:space="preserve"> (1 byte) The memory page where the return address is located.  The value is defined in the above table.  The value in the root stack is always 16 (Whole RAM).</w:t>
       </w:r>
     </w:p>
     <w:p>
@@ -10014,7 +10971,15 @@
         <w:ind w:left="1080"/>
       </w:pPr>
       <w:r>
-        <w:t xml:space="preserve">&lt;return_address&gt; (2 bytes) Return address.  The value that the program counter is set to by the returning </w:t>
+        <w:t>&lt;</w:t>
+      </w:r>
+      <w:proofErr w:type="spellStart"/>
+      <w:r>
+        <w:t>return_address</w:t>
+      </w:r>
+      <w:proofErr w:type="spellEnd"/>
+      <w:r>
+        <w:t xml:space="preserve">&gt; (2 bytes) Return address.  The value that the program counter is set to by the returning </w:t>
       </w:r>
       <w:r>
         <w:rPr>
@@ -10044,9 +11009,11 @@
       <w:r>
         <w:t>&lt;</w:t>
       </w:r>
+      <w:proofErr w:type="spellStart"/>
       <w:r>
         <w:t>return_stack_pointer</w:t>
       </w:r>
+      <w:proofErr w:type="spellEnd"/>
       <w:r>
         <w:t xml:space="preserve">&gt; </w:t>
       </w:r>
@@ -10079,7 +11046,15 @@
         <w:ind w:left="360"/>
       </w:pPr>
       <w:r>
-        <w:t>&lt;screen_address&gt; (1 byte).  The value specifies the screen address, as defined by the following table.  This is used in conjunction with hardware scrolling to wrap screen addresses.</w:t>
+        <w:t>&lt;</w:t>
+      </w:r>
+      <w:proofErr w:type="spellStart"/>
+      <w:r>
+        <w:t>screen_address</w:t>
+      </w:r>
+      <w:proofErr w:type="spellEnd"/>
+      <w:r>
+        <w:t>&gt; (1 byte).  The value specifies the screen address, as defined by the following table.  This is used in conjunction with hardware scrolling to wrap screen addresses.</w:t>
       </w:r>
     </w:p>
     <w:tbl>
@@ -10237,7 +11212,15 @@
         <w:ind w:left="360"/>
       </w:pPr>
       <w:r>
-        <w:t xml:space="preserve">&lt;hidden_ram_address&gt; (1 byte).  Populated only on the </w:t>
+        <w:t>&lt;</w:t>
+      </w:r>
+      <w:proofErr w:type="spellStart"/>
+      <w:r>
+        <w:t>hidden_ram_address</w:t>
+      </w:r>
+      <w:proofErr w:type="spellEnd"/>
+      <w:r>
+        <w:t xml:space="preserve">&gt; (1 byte).  Populated only on the </w:t>
       </w:r>
       <w:r>
         <w:t xml:space="preserve">BBC Model </w:t>
@@ -10257,7 +11240,15 @@
         <w:ind w:left="360"/>
       </w:pPr>
       <w:r>
-        <w:t>&lt;ULA_video_control_register&gt; (1 byte).  The value of the ULA video control register.</w:t>
+        <w:t>&lt;</w:t>
+      </w:r>
+      <w:proofErr w:type="spellStart"/>
+      <w:r>
+        <w:t>ULA_video_control_register</w:t>
+      </w:r>
+      <w:proofErr w:type="spellEnd"/>
+      <w:r>
+        <w:t>&gt; (1 byte).  The value of the ULA video control register.</w:t>
       </w:r>
     </w:p>
     <w:p>
@@ -10265,7 +11256,23 @@
         <w:ind w:left="360"/>
       </w:pPr>
       <w:r>
-        <w:t>&lt;ULA_palette&gt; (16 bytes).  The ULA’s 16 palette entries where physical colors are xor’d with 0x7.</w:t>
+        <w:t>&lt;</w:t>
+      </w:r>
+      <w:proofErr w:type="spellStart"/>
+      <w:r>
+        <w:t>ULA_palette</w:t>
+      </w:r>
+      <w:proofErr w:type="spellEnd"/>
+      <w:r>
+        <w:t xml:space="preserve">&gt; (16 bytes).  The ULA’s 16 palette entries where physical colors are </w:t>
+      </w:r>
+      <w:proofErr w:type="spellStart"/>
+      <w:r>
+        <w:t>xor’d</w:t>
+      </w:r>
+      <w:proofErr w:type="spellEnd"/>
+      <w:r>
+        <w:t xml:space="preserve"> with 0x7.</w:t>
       </w:r>
     </w:p>
     <w:p>
@@ -10281,7 +11288,15 @@
         <w:ind w:left="360"/>
       </w:pPr>
       <w:r>
-        <w:t xml:space="preserve">&lt;memory_snapshot&gt; = </w:t>
+        <w:t>&lt;</w:t>
+      </w:r>
+      <w:proofErr w:type="spellStart"/>
+      <w:r>
+        <w:t>memory_snapshot</w:t>
+      </w:r>
+      <w:proofErr w:type="spellEnd"/>
+      <w:r>
+        <w:t xml:space="preserve">&gt; = </w:t>
       </w:r>
     </w:p>
     <w:p>
@@ -10294,7 +11309,31 @@
         </w:rPr>
       </w:pPr>
       <w:r>
-        <w:t>&lt;base_memory&gt; + &lt;paged_memory&gt; + &lt;shadow_ram&gt;</w:t>
+        <w:t>&lt;</w:t>
+      </w:r>
+      <w:proofErr w:type="spellStart"/>
+      <w:r>
+        <w:t>base_memory</w:t>
+      </w:r>
+      <w:proofErr w:type="spellEnd"/>
+      <w:r>
+        <w:t>&gt; + &lt;</w:t>
+      </w:r>
+      <w:proofErr w:type="spellStart"/>
+      <w:r>
+        <w:t>paged_memory</w:t>
+      </w:r>
+      <w:proofErr w:type="spellEnd"/>
+      <w:r>
+        <w:t>&gt; + &lt;</w:t>
+      </w:r>
+      <w:proofErr w:type="spellStart"/>
+      <w:r>
+        <w:t>shadow_ram</w:t>
+      </w:r>
+      <w:proofErr w:type="spellEnd"/>
+      <w:r>
+        <w:t>&gt;</w:t>
       </w:r>
       <w:r>
         <w:rPr>
@@ -10305,7 +11344,15 @@
         <w:t>opt</w:t>
       </w:r>
       <w:r>
-        <w:t xml:space="preserve"> + &lt;mos_ram&gt;</w:t>
+        <w:t xml:space="preserve"> + &lt;</w:t>
+      </w:r>
+      <w:proofErr w:type="spellStart"/>
+      <w:r>
+        <w:t>mos_ram</w:t>
+      </w:r>
+      <w:proofErr w:type="spellEnd"/>
+      <w:r>
+        <w:t>&gt;</w:t>
       </w:r>
       <w:r>
         <w:rPr>
@@ -10324,7 +11371,15 @@
         <w:t>opt</w:t>
       </w:r>
       <w:r>
-        <w:t xml:space="preserve"> + &lt;filing_system_ram&gt;</w:t>
+        <w:t xml:space="preserve"> + &lt;</w:t>
+      </w:r>
+      <w:proofErr w:type="spellStart"/>
+      <w:r>
+        <w:t>filing_system_ram</w:t>
+      </w:r>
+      <w:proofErr w:type="spellEnd"/>
+      <w:r>
+        <w:t>&gt;</w:t>
       </w:r>
       <w:r>
         <w:rPr>
@@ -10338,7 +11393,15 @@
         <w:t xml:space="preserve"> +</w:t>
       </w:r>
       <w:r>
-        <w:t xml:space="preserve"> &lt;private_ram&gt;</w:t>
+        <w:t xml:space="preserve"> &lt;</w:t>
+      </w:r>
+      <w:proofErr w:type="spellStart"/>
+      <w:r>
+        <w:t>private_ram</w:t>
+      </w:r>
+      <w:proofErr w:type="spellEnd"/>
+      <w:r>
+        <w:t>&gt;</w:t>
       </w:r>
       <w:r>
         <w:rPr>
@@ -10349,7 +11412,15 @@
         <w:t>opt</w:t>
       </w:r>
       <w:r>
-        <w:t xml:space="preserve"> + &lt;hidden_ram&gt;</w:t>
+        <w:t xml:space="preserve"> + &lt;</w:t>
+      </w:r>
+      <w:proofErr w:type="spellStart"/>
+      <w:r>
+        <w:t>hidden_ram</w:t>
+      </w:r>
+      <w:proofErr w:type="spellEnd"/>
+      <w:r>
+        <w:t>&gt;</w:t>
       </w:r>
       <w:r>
         <w:rPr>
@@ -10500,7 +11571,15 @@
               <w:ind w:left="1440" w:hanging="1440"/>
             </w:pPr>
             <w:r>
-              <w:t>&lt;base_memory&gt;</w:t>
+              <w:t>&lt;</w:t>
+            </w:r>
+            <w:proofErr w:type="spellStart"/>
+            <w:r>
+              <w:t>base_memory</w:t>
+            </w:r>
+            <w:proofErr w:type="spellEnd"/>
+            <w:r>
+              <w:t>&gt;</w:t>
             </w:r>
           </w:p>
         </w:tc>
@@ -10571,7 +11650,15 @@
               <w:ind w:left="1440" w:hanging="1440"/>
             </w:pPr>
             <w:r>
-              <w:t>&lt;paged_memory&gt;</w:t>
+              <w:t>&lt;</w:t>
+            </w:r>
+            <w:proofErr w:type="spellStart"/>
+            <w:r>
+              <w:t>paged_memory</w:t>
+            </w:r>
+            <w:proofErr w:type="spellEnd"/>
+            <w:r>
+              <w:t>&gt;</w:t>
             </w:r>
           </w:p>
         </w:tc>
@@ -10639,7 +11726,15 @@
           </w:tcPr>
           <w:p>
             <w:r>
-              <w:t>&lt;shadow_ram&gt;</w:t>
+              <w:t>&lt;</w:t>
+            </w:r>
+            <w:proofErr w:type="spellStart"/>
+            <w:r>
+              <w:t>shadow_ram</w:t>
+            </w:r>
+            <w:proofErr w:type="spellEnd"/>
+            <w:r>
+              <w:t>&gt;</w:t>
             </w:r>
           </w:p>
         </w:tc>
@@ -10700,7 +11795,15 @@
           </w:tcPr>
           <w:p>
             <w:r>
-              <w:t>&lt;mos_ram&gt;</w:t>
+              <w:t>&lt;</w:t>
+            </w:r>
+            <w:proofErr w:type="spellStart"/>
+            <w:r>
+              <w:t>mos_ram</w:t>
+            </w:r>
+            <w:proofErr w:type="spellEnd"/>
+            <w:r>
+              <w:t>&gt;</w:t>
             </w:r>
           </w:p>
         </w:tc>
@@ -10755,7 +11858,15 @@
           </w:tcPr>
           <w:p>
             <w:r>
-              <w:t>&lt;filing_system_ram&gt;</w:t>
+              <w:t>&lt;</w:t>
+            </w:r>
+            <w:proofErr w:type="spellStart"/>
+            <w:r>
+              <w:t>filing_system_ram</w:t>
+            </w:r>
+            <w:proofErr w:type="spellEnd"/>
+            <w:r>
+              <w:t>&gt;</w:t>
             </w:r>
           </w:p>
         </w:tc>
@@ -10810,7 +11921,15 @@
           </w:tcPr>
           <w:p>
             <w:r>
-              <w:t>&lt;private_ram&gt;</w:t>
+              <w:t>&lt;</w:t>
+            </w:r>
+            <w:proofErr w:type="spellStart"/>
+            <w:r>
+              <w:t>private_ram</w:t>
+            </w:r>
+            <w:proofErr w:type="spellEnd"/>
+            <w:r>
+              <w:t>&gt;</w:t>
             </w:r>
           </w:p>
         </w:tc>
@@ -10868,7 +11987,15 @@
           </w:tcPr>
           <w:p>
             <w:r>
-              <w:t>&lt;hidden_ram&gt;</w:t>
+              <w:t>&lt;</w:t>
+            </w:r>
+            <w:proofErr w:type="spellStart"/>
+            <w:r>
+              <w:t>hidden_ram</w:t>
+            </w:r>
+            <w:proofErr w:type="spellEnd"/>
+            <w:r>
+              <w:t>&gt;</w:t>
             </w:r>
           </w:p>
         </w:tc>
@@ -10923,7 +12050,15 @@
       </w:pPr>
       <w:r>
         <w:br/>
-        <w:t>&lt;base_memory&gt; (64K) The default 64K of memory.  Addresses 0 to &amp;FFFF.</w:t>
+        <w:t>&lt;</w:t>
+      </w:r>
+      <w:proofErr w:type="spellStart"/>
+      <w:r>
+        <w:t>base_memory</w:t>
+      </w:r>
+      <w:proofErr w:type="spellEnd"/>
+      <w:r>
+        <w:t>&gt; (64K) The default 64K of memory.  Addresses 0 to &amp;FFFF.</w:t>
       </w:r>
     </w:p>
     <w:p>
@@ -10931,7 +12066,31 @@
         <w:ind w:left="720" w:hanging="360"/>
       </w:pPr>
       <w:r>
-        <w:t>&lt;paged_memory&gt; = &lt;page_count&gt; + &lt;page_data&gt;</w:t>
+        <w:t>&lt;</w:t>
+      </w:r>
+      <w:proofErr w:type="spellStart"/>
+      <w:r>
+        <w:t>paged_memory</w:t>
+      </w:r>
+      <w:proofErr w:type="spellEnd"/>
+      <w:r>
+        <w:t>&gt; = &lt;</w:t>
+      </w:r>
+      <w:proofErr w:type="spellStart"/>
+      <w:r>
+        <w:t>page_count</w:t>
+      </w:r>
+      <w:proofErr w:type="spellEnd"/>
+      <w:r>
+        <w:t>&gt; + &lt;</w:t>
+      </w:r>
+      <w:proofErr w:type="spellStart"/>
+      <w:r>
+        <w:t>page_data</w:t>
+      </w:r>
+      <w:proofErr w:type="spellEnd"/>
+      <w:r>
+        <w:t>&gt;</w:t>
       </w:r>
       <w:r>
         <w:rPr>
@@ -10950,7 +12109,15 @@
         <w:ind w:left="720"/>
       </w:pPr>
       <w:r>
-        <w:t>&lt;page_count&gt; (1 byte) The number of pages.</w:t>
+        <w:t>&lt;</w:t>
+      </w:r>
+      <w:proofErr w:type="spellStart"/>
+      <w:r>
+        <w:t>page_count</w:t>
+      </w:r>
+      <w:proofErr w:type="spellEnd"/>
+      <w:r>
+        <w:t>&gt; (1 byte) The number of pages.</w:t>
       </w:r>
     </w:p>
     <w:p>
@@ -10958,7 +12125,39 @@
         <w:ind w:left="720"/>
       </w:pPr>
       <w:r>
-        <w:t>&lt;page_data&gt; = &lt;page_bank&gt; + &lt;page_readonly&gt; + &lt;page_memory&gt;</w:t>
+        <w:t>&lt;</w:t>
+      </w:r>
+      <w:proofErr w:type="spellStart"/>
+      <w:r>
+        <w:t>page_data</w:t>
+      </w:r>
+      <w:proofErr w:type="spellEnd"/>
+      <w:r>
+        <w:t>&gt; = &lt;</w:t>
+      </w:r>
+      <w:proofErr w:type="spellStart"/>
+      <w:r>
+        <w:t>page_bank</w:t>
+      </w:r>
+      <w:proofErr w:type="spellEnd"/>
+      <w:r>
+        <w:t>&gt; + &lt;</w:t>
+      </w:r>
+      <w:proofErr w:type="spellStart"/>
+      <w:r>
+        <w:t>page_readonly</w:t>
+      </w:r>
+      <w:proofErr w:type="spellEnd"/>
+      <w:r>
+        <w:t>&gt; + &lt;</w:t>
+      </w:r>
+      <w:proofErr w:type="spellStart"/>
+      <w:r>
+        <w:t>page_memory</w:t>
+      </w:r>
+      <w:proofErr w:type="spellEnd"/>
+      <w:r>
+        <w:t>&gt;</w:t>
       </w:r>
     </w:p>
     <w:p>
@@ -10966,7 +12165,15 @@
         <w:ind w:left="1080"/>
       </w:pPr>
       <w:r>
-        <w:t>&lt;page_bank&gt; (1 byte) A page bank id</w:t>
+        <w:t>&lt;</w:t>
+      </w:r>
+      <w:proofErr w:type="spellStart"/>
+      <w:r>
+        <w:t>page_bank</w:t>
+      </w:r>
+      <w:proofErr w:type="spellEnd"/>
+      <w:r>
+        <w:t>&gt; (1 byte) A page bank id</w:t>
       </w:r>
       <w:r>
         <w:t xml:space="preserve"> (0 to 16).</w:t>
@@ -10977,7 +12184,15 @@
         <w:ind w:left="1080"/>
       </w:pPr>
       <w:r>
-        <w:t xml:space="preserve">&lt;page_readonly&gt; (1 byte) A page </w:t>
+        <w:t>&lt;</w:t>
+      </w:r>
+      <w:proofErr w:type="spellStart"/>
+      <w:r>
+        <w:t>page_readonly</w:t>
+      </w:r>
+      <w:proofErr w:type="spellEnd"/>
+      <w:r>
+        <w:t xml:space="preserve">&gt; (1 byte) A page </w:t>
       </w:r>
       <w:r>
         <w:t>read-only</w:t>
@@ -11003,7 +12218,15 @@
         <w:ind w:left="1080"/>
       </w:pPr>
       <w:r>
-        <w:t>&lt;page_memory&gt; (16K) The memory contents of a page.  Addresses &amp;8000 to &amp;BFFF.</w:t>
+        <w:t>&lt;</w:t>
+      </w:r>
+      <w:proofErr w:type="spellStart"/>
+      <w:r>
+        <w:t>page_memory</w:t>
+      </w:r>
+      <w:proofErr w:type="spellEnd"/>
+      <w:r>
+        <w:t>&gt; (16K) The memory contents of a page.  Addresses &amp;8000 to &amp;BFFF.</w:t>
       </w:r>
     </w:p>
     <w:p>
@@ -11011,7 +12234,15 @@
         <w:ind w:left="360"/>
       </w:pPr>
       <w:r>
-        <w:t>&lt;shadow_ram&gt; (20K) Populated on Model B Plus, BBC Model B Integra, and BBC Master.  Addresses &amp;3000 to &amp;7FFF.</w:t>
+        <w:t>&lt;</w:t>
+      </w:r>
+      <w:proofErr w:type="spellStart"/>
+      <w:r>
+        <w:t>shadow_ram</w:t>
+      </w:r>
+      <w:proofErr w:type="spellEnd"/>
+      <w:r>
+        <w:t>&gt; (20K) Populated on Model B Plus, BBC Model B Integra, and BBC Master.  Addresses &amp;3000 to &amp;7FFF.</w:t>
       </w:r>
     </w:p>
     <w:p>
@@ -11019,7 +12250,15 @@
         <w:ind w:left="360"/>
       </w:pPr>
       <w:r>
-        <w:t>&lt;mos_ram&gt; (4K) Populated on BBC Master.  Addresses &amp;8000 to &amp;8FFF.</w:t>
+        <w:t>&lt;</w:t>
+      </w:r>
+      <w:proofErr w:type="spellStart"/>
+      <w:r>
+        <w:t>mos_ram</w:t>
+      </w:r>
+      <w:proofErr w:type="spellEnd"/>
+      <w:r>
+        <w:t>&gt; (4K) Populated on BBC Master.  Addresses &amp;8000 to &amp;8FFF.</w:t>
       </w:r>
     </w:p>
     <w:p>
@@ -11027,7 +12266,15 @@
         <w:ind w:left="360"/>
       </w:pPr>
       <w:r>
-        <w:t>&lt;filing_system_ram&gt; (8K) Populated on BBC Master.  Addresses &amp;C000 to &amp;DFFF.</w:t>
+        <w:t>&lt;</w:t>
+      </w:r>
+      <w:proofErr w:type="spellStart"/>
+      <w:r>
+        <w:t>filing_system_ram</w:t>
+      </w:r>
+      <w:proofErr w:type="spellEnd"/>
+      <w:r>
+        <w:t>&gt; (8K) Populated on BBC Master.  Addresses &amp;C000 to &amp;DFFF.</w:t>
       </w:r>
     </w:p>
     <w:p>
@@ -11035,7 +12282,15 @@
         <w:ind w:left="360"/>
       </w:pPr>
       <w:r>
-        <w:t xml:space="preserve">&lt;private_ram&gt; (12K) Populated on </w:t>
+        <w:t>&lt;</w:t>
+      </w:r>
+      <w:proofErr w:type="spellStart"/>
+      <w:r>
+        <w:t>private_ram</w:t>
+      </w:r>
+      <w:proofErr w:type="spellEnd"/>
+      <w:r>
+        <w:t xml:space="preserve">&gt; (12K) Populated on </w:t>
       </w:r>
       <w:r>
         <w:t xml:space="preserve">BBC </w:t>
@@ -11082,7 +12337,15 @@
         <w:ind w:left="360"/>
       </w:pPr>
       <w:r>
-        <w:t>&lt;hidden_ram&gt; (256 bytes) Populated on BBC Model Integra B.</w:t>
+        <w:t>&lt;</w:t>
+      </w:r>
+      <w:proofErr w:type="spellStart"/>
+      <w:r>
+        <w:t>hidden_ram</w:t>
+      </w:r>
+      <w:proofErr w:type="spellEnd"/>
+      <w:r>
+        <w:t>&gt; (256 bytes) Populated on BBC Model Integra B.</w:t>
       </w:r>
     </w:p>
     <w:p>
@@ -11107,10 +12370,34 @@
           <w:b/>
           <w:bCs/>
         </w:rPr>
-        <w:t>&lt;execution_chunk&gt;</w:t>
-      </w:r>
-      <w:r>
-        <w:t xml:space="preserve"> = &lt;common_header(</w:t>
+        <w:t>&lt;</w:t>
+      </w:r>
+      <w:proofErr w:type="spellStart"/>
+      <w:r>
+        <w:rPr>
+          <w:b/>
+          <w:bCs/>
+        </w:rPr>
+        <w:t>execution_chunk</w:t>
+      </w:r>
+      <w:proofErr w:type="spellEnd"/>
+      <w:r>
+        <w:rPr>
+          <w:b/>
+          <w:bCs/>
+        </w:rPr>
+        <w:t>&gt;</w:t>
+      </w:r>
+      <w:r>
+        <w:t xml:space="preserve"> = &lt;</w:t>
+      </w:r>
+      <w:proofErr w:type="spellStart"/>
+      <w:r>
+        <w:t>common_header</w:t>
+      </w:r>
+      <w:proofErr w:type="spellEnd"/>
+      <w:r>
+        <w:t>(</w:t>
       </w:r>
       <w:r>
         <w:rPr>
@@ -11119,6 +12406,7 @@
         </w:rPr>
         <w:t>‘</w:t>
       </w:r>
+      <w:proofErr w:type="spellStart"/>
       <w:r>
         <w:rPr>
           <w:rFonts w:ascii="Aptos" w:hAnsi="Aptos"/>
@@ -11126,7 +12414,17 @@
           <w:bCs/>
           <w:color w:val="000000"/>
         </w:rPr>
-        <w:t>PFex’</w:t>
+        <w:t>PFex</w:t>
+      </w:r>
+      <w:proofErr w:type="spellEnd"/>
+      <w:r>
+        <w:rPr>
+          <w:rFonts w:ascii="Aptos" w:hAnsi="Aptos"/>
+          <w:b/>
+          <w:bCs/>
+          <w:color w:val="000000"/>
+        </w:rPr>
+        <w:t>’</w:t>
       </w:r>
       <w:r>
         <w:rPr>
@@ -11136,7 +12434,15 @@
         <w:t>)</w:t>
       </w:r>
       <w:r>
-        <w:t>&gt; + &lt;execution_data&gt; where</w:t>
+        <w:t>&gt; + &lt;</w:t>
+      </w:r>
+      <w:proofErr w:type="spellStart"/>
+      <w:r>
+        <w:t>execution_data</w:t>
+      </w:r>
+      <w:proofErr w:type="spellEnd"/>
+      <w:r>
+        <w:t>&gt; where</w:t>
       </w:r>
     </w:p>
     <w:p>
@@ -11148,7 +12454,23 @@
           <w:b/>
           <w:bCs/>
         </w:rPr>
-        <w:t>&lt;execution_data&gt;</w:t>
+        <w:t>&lt;</w:t>
+      </w:r>
+      <w:proofErr w:type="spellStart"/>
+      <w:r>
+        <w:rPr>
+          <w:b/>
+          <w:bCs/>
+        </w:rPr>
+        <w:t>execution_data</w:t>
+      </w:r>
+      <w:proofErr w:type="spellEnd"/>
+      <w:r>
+        <w:rPr>
+          <w:b/>
+          <w:bCs/>
+        </w:rPr>
+        <w:t>&gt;</w:t>
       </w:r>
       <w:r>
         <w:t xml:space="preserve"> = list of </w:t>
@@ -11201,7 +12523,23 @@
         <w:t>&gt;</w:t>
       </w:r>
       <w:r>
-        <w:t xml:space="preserve"> = &lt;event_marker&gt; + &lt;event_params&gt; </w:t>
+        <w:t xml:space="preserve"> = &lt;</w:t>
+      </w:r>
+      <w:proofErr w:type="spellStart"/>
+      <w:r>
+        <w:t>event_marker</w:t>
+      </w:r>
+      <w:proofErr w:type="spellEnd"/>
+      <w:r>
+        <w:t>&gt; + &lt;</w:t>
+      </w:r>
+      <w:proofErr w:type="spellStart"/>
+      <w:r>
+        <w:t>event_params</w:t>
+      </w:r>
+      <w:proofErr w:type="spellEnd"/>
+      <w:r>
+        <w:t xml:space="preserve">&gt; </w:t>
       </w:r>
     </w:p>
     <w:p>
@@ -11209,7 +12547,15 @@
         <w:ind w:left="720"/>
       </w:pPr>
       <w:r>
-        <w:t>&lt;event_marker&gt; (2 bytes).  A two-byte value that distinguishes an &lt;event&gt; from an &lt;instruction&gt;.  The marker also specifies the event type and subsequent parameters as depicted in the table below.</w:t>
+        <w:t>&lt;</w:t>
+      </w:r>
+      <w:proofErr w:type="spellStart"/>
+      <w:r>
+        <w:t>event_marker</w:t>
+      </w:r>
+      <w:proofErr w:type="spellEnd"/>
+      <w:r>
+        <w:t>&gt; (2 bytes).  A two-byte value that distinguishes an &lt;event&gt; from an &lt;instruction&gt;.  The marker also specifies the event type and subsequent parameters as depicted in the table below.</w:t>
       </w:r>
     </w:p>
     <w:tbl>
@@ -11327,7 +12673,15 @@
           </w:tcPr>
           <w:p>
             <w:r>
-              <w:t>&lt;interrupt_event_params&gt;</w:t>
+              <w:t>&lt;</w:t>
+            </w:r>
+            <w:proofErr w:type="spellStart"/>
+            <w:r>
+              <w:t>interrupt_event_params</w:t>
+            </w:r>
+            <w:proofErr w:type="spellEnd"/>
+            <w:r>
+              <w:t>&gt;</w:t>
             </w:r>
           </w:p>
         </w:tc>
@@ -11359,7 +12713,15 @@
           </w:tcPr>
           <w:p>
             <w:r>
-              <w:t>&lt;interrupt_event_params&gt;</w:t>
+              <w:t>&lt;</w:t>
+            </w:r>
+            <w:proofErr w:type="spellStart"/>
+            <w:r>
+              <w:t>interrupt_event_params</w:t>
+            </w:r>
+            <w:proofErr w:type="spellEnd"/>
+            <w:r>
+              <w:t>&gt;</w:t>
             </w:r>
           </w:p>
         </w:tc>
@@ -11397,8 +12759,13 @@
               </w:rPr>
               <w:t>&lt;</w:t>
             </w:r>
-            <w:r>
-              <w:t>display_field&gt;</w:t>
+            <w:proofErr w:type="spellStart"/>
+            <w:r>
+              <w:t>display_field</w:t>
+            </w:r>
+            <w:proofErr w:type="spellEnd"/>
+            <w:r>
+              <w:t>&gt;</w:t>
             </w:r>
           </w:p>
         </w:tc>
@@ -11500,7 +12867,23 @@
           <w:b/>
           <w:bCs/>
         </w:rPr>
-        <w:t>&lt;interrupt_event_params&gt;</w:t>
+        <w:t>&lt;</w:t>
+      </w:r>
+      <w:proofErr w:type="spellStart"/>
+      <w:r>
+        <w:rPr>
+          <w:b/>
+          <w:bCs/>
+        </w:rPr>
+        <w:t>interrupt_event_params</w:t>
+      </w:r>
+      <w:proofErr w:type="spellEnd"/>
+      <w:r>
+        <w:rPr>
+          <w:b/>
+          <w:bCs/>
+        </w:rPr>
+        <w:t>&gt;</w:t>
       </w:r>
       <w:r>
         <w:t xml:space="preserve"> </w:t>
@@ -11513,8 +12896,29 @@
       </w:r>
       <w:r>
         <w:br/>
-        <w:t>&lt;cycle_count&gt; + &lt;destination_address&gt; + &lt;return_address</w:t>
-      </w:r>
+        <w:t>&lt;</w:t>
+      </w:r>
+      <w:proofErr w:type="spellStart"/>
+      <w:r>
+        <w:t>cycle_count</w:t>
+      </w:r>
+      <w:proofErr w:type="spellEnd"/>
+      <w:r>
+        <w:t>&gt; + &lt;</w:t>
+      </w:r>
+      <w:proofErr w:type="spellStart"/>
+      <w:r>
+        <w:t>destination_address</w:t>
+      </w:r>
+      <w:proofErr w:type="spellEnd"/>
+      <w:r>
+        <w:t>&gt; + &lt;</w:t>
+      </w:r>
+      <w:proofErr w:type="spellStart"/>
+      <w:r>
+        <w:t>return_address</w:t>
+      </w:r>
+      <w:proofErr w:type="spellEnd"/>
       <w:r>
         <w:t>&gt;</w:t>
       </w:r>
@@ -11524,7 +12928,15 @@
         <w:ind w:left="1080"/>
       </w:pPr>
       <w:r>
-        <w:t>&lt;cycle_count&gt; (1 byte) Specifies how many cycles it took to jump to the service routine.  This is always seven.</w:t>
+        <w:t>&lt;</w:t>
+      </w:r>
+      <w:proofErr w:type="spellStart"/>
+      <w:r>
+        <w:t>cycle_count</w:t>
+      </w:r>
+      <w:proofErr w:type="spellEnd"/>
+      <w:r>
+        <w:t>&gt; (1 byte) Specifies how many cycles it took to jump to the service routine.  This is always seven.</w:t>
       </w:r>
     </w:p>
     <w:p>
@@ -11536,7 +12948,15 @@
         </w:rPr>
       </w:pPr>
       <w:r>
-        <w:t xml:space="preserve">&lt;destination_address&gt; (2 bytes).  The address of the interrupt service routine.  </w:t>
+        <w:t>&lt;</w:t>
+      </w:r>
+      <w:proofErr w:type="spellStart"/>
+      <w:r>
+        <w:t>destination_address</w:t>
+      </w:r>
+      <w:proofErr w:type="spellEnd"/>
+      <w:r>
+        <w:t xml:space="preserve">&gt; (2 bytes).  The address of the interrupt service routine.  </w:t>
       </w:r>
       <w:r>
         <w:t>For NMI interrupts, the value held in $FFFA–$FFFB.  For IRQ’s, the value held in $FFFE–$FFFF.</w:t>
@@ -11547,7 +12967,15 @@
         <w:ind w:left="1080"/>
       </w:pPr>
       <w:r>
-        <w:t>&lt;return_address&gt; (2 bytes).  The return address that was pushed on the stack.</w:t>
+        <w:t>&lt;</w:t>
+      </w:r>
+      <w:proofErr w:type="spellStart"/>
+      <w:r>
+        <w:t>return_address</w:t>
+      </w:r>
+      <w:proofErr w:type="spellEnd"/>
+      <w:r>
+        <w:t>&gt; (2 bytes).  The return address that was pushed on the stack.</w:t>
       </w:r>
     </w:p>
     <w:p>
@@ -11560,6 +12988,7 @@
       <w:r>
         <w:t>&lt;</w:t>
       </w:r>
+      <w:proofErr w:type="spellStart"/>
       <w:r>
         <w:rPr>
           <w:b/>
@@ -11567,6 +12996,7 @@
         </w:rPr>
         <w:t>display_field</w:t>
       </w:r>
+      <w:proofErr w:type="spellEnd"/>
       <w:r>
         <w:t>&gt;</w:t>
       </w:r>
@@ -11597,7 +13027,15 @@
       </w:r>
       <w:r>
         <w:br/>
-        <w:t>&lt;opcode_address&gt; + &lt;opcode&gt; + &lt;operand&gt;</w:t>
+        <w:t>&lt;</w:t>
+      </w:r>
+      <w:proofErr w:type="spellStart"/>
+      <w:r>
+        <w:t>opcode_address</w:t>
+      </w:r>
+      <w:proofErr w:type="spellEnd"/>
+      <w:r>
+        <w:t>&gt; + &lt;opcode&gt; + &lt;operand&gt;</w:t>
       </w:r>
       <w:r>
         <w:rPr>
@@ -11612,13 +13050,37 @@
       </w:r>
       <w:r>
         <w:br/>
-        <w:t xml:space="preserve">&lt;cycle_count&gt; + &lt;modified_registers&gt; </w:t>
+        <w:t>&lt;</w:t>
+      </w:r>
+      <w:proofErr w:type="spellStart"/>
+      <w:r>
+        <w:t>cycle_count</w:t>
+      </w:r>
+      <w:proofErr w:type="spellEnd"/>
+      <w:r>
+        <w:t>&gt; + &lt;</w:t>
+      </w:r>
+      <w:proofErr w:type="spellStart"/>
+      <w:r>
+        <w:t>modified_registers</w:t>
+      </w:r>
+      <w:proofErr w:type="spellEnd"/>
+      <w:r>
+        <w:t xml:space="preserve">&gt; </w:t>
       </w:r>
       <w:r>
         <w:t xml:space="preserve">+ </w:t>
       </w:r>
       <w:r>
-        <w:t>&lt;destination_address&gt;</w:t>
+        <w:t>&lt;</w:t>
+      </w:r>
+      <w:proofErr w:type="spellStart"/>
+      <w:r>
+        <w:t>destination_address</w:t>
+      </w:r>
+      <w:proofErr w:type="spellEnd"/>
+      <w:r>
+        <w:t>&gt;</w:t>
       </w:r>
       <w:r>
         <w:rPr>
@@ -11629,7 +13091,15 @@
         <w:t>opt</w:t>
       </w:r>
       <w:r>
-        <w:t xml:space="preserve"> + &lt;memory_address&gt;</w:t>
+        <w:t xml:space="preserve"> + &lt;</w:t>
+      </w:r>
+      <w:proofErr w:type="spellStart"/>
+      <w:r>
+        <w:t>memory_address</w:t>
+      </w:r>
+      <w:proofErr w:type="spellEnd"/>
+      <w:r>
+        <w:t>&gt;</w:t>
       </w:r>
       <w:r>
         <w:rPr>
@@ -11640,7 +13110,15 @@
         <w:t>opt</w:t>
       </w:r>
       <w:r>
-        <w:t xml:space="preserve"> &lt;memory_read_value&gt;</w:t>
+        <w:t xml:space="preserve"> &lt;</w:t>
+      </w:r>
+      <w:proofErr w:type="spellStart"/>
+      <w:r>
+        <w:t>memory_read_value</w:t>
+      </w:r>
+      <w:proofErr w:type="spellEnd"/>
+      <w:r>
+        <w:t>&gt;</w:t>
       </w:r>
       <w:r>
         <w:rPr>
@@ -11659,7 +13137,15 @@
         <w:t xml:space="preserve"> </w:t>
       </w:r>
       <w:r>
-        <w:t>+ &lt;memory_write_value&gt;</w:t>
+        <w:t>+ &lt;</w:t>
+      </w:r>
+      <w:proofErr w:type="spellStart"/>
+      <w:r>
+        <w:t>memory_write_value</w:t>
+      </w:r>
+      <w:proofErr w:type="spellEnd"/>
+      <w:r>
+        <w:t>&gt;</w:t>
       </w:r>
       <w:r>
         <w:rPr>
@@ -11678,7 +13164,15 @@
         <w:ind w:left="720"/>
       </w:pPr>
       <w:r>
-        <w:t>&lt;opcode_address&gt; (1, 2, or 3 bytes) The instruction’s opcode address is encoded in 1, 2 or 3 bytes as depicted in the following table, where addresses are stored in relative format if possible.</w:t>
+        <w:t>&lt;</w:t>
+      </w:r>
+      <w:proofErr w:type="spellStart"/>
+      <w:r>
+        <w:t>opcode_address</w:t>
+      </w:r>
+      <w:proofErr w:type="spellEnd"/>
+      <w:r>
+        <w:t>&gt; (1, 2, or 3 bytes) The instruction’s opcode address is encoded in 1, 2 or 3 bytes as depicted in the following table, where addresses are stored in relative format if possible.</w:t>
       </w:r>
       <w:r>
         <w:t xml:space="preserve"> </w:t>
@@ -12498,7 +13992,15 @@
         <w:ind w:left="720"/>
       </w:pPr>
       <w:r>
-        <w:t>&lt;cycle_count&gt; (</w:t>
+        <w:t>&lt;</w:t>
+      </w:r>
+      <w:proofErr w:type="spellStart"/>
+      <w:r>
+        <w:t>cycle_count</w:t>
+      </w:r>
+      <w:proofErr w:type="spellEnd"/>
+      <w:r>
+        <w:t>&gt; (</w:t>
       </w:r>
       <w:r>
         <w:rPr>
@@ -12516,11 +14018,27 @@
         <w:ind w:left="1080" w:hanging="360"/>
       </w:pPr>
       <w:r>
-        <w:t xml:space="preserve">&lt;modified_registers&gt; = </w:t>
+        <w:t>&lt;</w:t>
+      </w:r>
+      <w:proofErr w:type="spellStart"/>
+      <w:r>
+        <w:t>modified_registers</w:t>
+      </w:r>
+      <w:proofErr w:type="spellEnd"/>
+      <w:r>
+        <w:t xml:space="preserve">&gt; = </w:t>
       </w:r>
       <w:r>
         <w:br/>
-        <w:t>&lt;modified_register_flags&gt; + &lt;accumulator&gt;</w:t>
+        <w:t>&lt;</w:t>
+      </w:r>
+      <w:proofErr w:type="spellStart"/>
+      <w:r>
+        <w:t>modified_register_flags</w:t>
+      </w:r>
+      <w:proofErr w:type="spellEnd"/>
+      <w:r>
+        <w:t>&gt; + &lt;accumulator&gt;</w:t>
       </w:r>
       <w:r>
         <w:rPr>
@@ -12531,7 +14049,15 @@
         <w:t>opt</w:t>
       </w:r>
       <w:r>
-        <w:t xml:space="preserve"> + &lt;x_register&gt;</w:t>
+        <w:t xml:space="preserve"> + &lt;</w:t>
+      </w:r>
+      <w:proofErr w:type="spellStart"/>
+      <w:r>
+        <w:t>x_register</w:t>
+      </w:r>
+      <w:proofErr w:type="spellEnd"/>
+      <w:r>
+        <w:t>&gt;</w:t>
       </w:r>
       <w:r>
         <w:rPr>
@@ -12542,7 +14068,15 @@
         <w:t>opt</w:t>
       </w:r>
       <w:r>
-        <w:t xml:space="preserve"> + &lt;y_register&gt;</w:t>
+        <w:t xml:space="preserve"> + &lt;</w:t>
+      </w:r>
+      <w:proofErr w:type="spellStart"/>
+      <w:r>
+        <w:t>y_register</w:t>
+      </w:r>
+      <w:proofErr w:type="spellEnd"/>
+      <w:r>
+        <w:t>&gt;</w:t>
       </w:r>
       <w:r>
         <w:rPr>
@@ -12561,7 +14095,15 @@
         <w:t xml:space="preserve"> </w:t>
       </w:r>
       <w:r>
-        <w:t>+ &lt;status_register&gt;</w:t>
+        <w:t>+ &lt;</w:t>
+      </w:r>
+      <w:proofErr w:type="spellStart"/>
+      <w:r>
+        <w:t>status_register</w:t>
+      </w:r>
+      <w:proofErr w:type="spellEnd"/>
+      <w:r>
+        <w:t>&gt;</w:t>
       </w:r>
       <w:r>
         <w:rPr>
@@ -12572,7 +14114,15 @@
         <w:t>opt</w:t>
       </w:r>
       <w:r>
-        <w:t xml:space="preserve"> + &lt;state_pointer&gt;</w:t>
+        <w:t xml:space="preserve"> + &lt;</w:t>
+      </w:r>
+      <w:proofErr w:type="spellStart"/>
+      <w:r>
+        <w:t>state_pointer</w:t>
+      </w:r>
+      <w:proofErr w:type="spellEnd"/>
+      <w:r>
+        <w:t>&gt;</w:t>
       </w:r>
       <w:r>
         <w:rPr>
@@ -12589,7 +14139,15 @@
       </w:pPr>
       <w:r>
         <w:tab/>
-        <w:t>&lt;modified_register_flags&gt; (</w:t>
+        <w:t>&lt;</w:t>
+      </w:r>
+      <w:proofErr w:type="spellStart"/>
+      <w:r>
+        <w:t>modified_register_flags</w:t>
+      </w:r>
+      <w:proofErr w:type="spellEnd"/>
+      <w:r>
+        <w:t>&gt; (</w:t>
       </w:r>
       <w:r>
         <w:rPr>
@@ -12822,7 +14380,15 @@
         <w:ind w:left="1080"/>
       </w:pPr>
       <w:r>
-        <w:t>&lt;accumulator&gt; (0 or 1 byte) Contains the value of the accumulator.  The value is written if the corresponding bit is set in &lt;modified_register_flags&gt;.</w:t>
+        <w:t>&lt;accumulator&gt; (0 or 1 byte) Contains the value of the accumulator.  The value is written if the corresponding bit is set in &lt;</w:t>
+      </w:r>
+      <w:proofErr w:type="spellStart"/>
+      <w:r>
+        <w:t>modified_register_flags</w:t>
+      </w:r>
+      <w:proofErr w:type="spellEnd"/>
+      <w:r>
+        <w:t>&gt;.</w:t>
       </w:r>
     </w:p>
     <w:p>
@@ -12830,7 +14396,23 @@
         <w:ind w:left="1080"/>
       </w:pPr>
       <w:r>
-        <w:t>&lt;x_register&gt; (0 or 1 byte) Contains the new value of the X register.  The value is written if the corresponding bit is set in &lt;modified_register_flags&gt;.</w:t>
+        <w:t>&lt;</w:t>
+      </w:r>
+      <w:proofErr w:type="spellStart"/>
+      <w:r>
+        <w:t>x_register</w:t>
+      </w:r>
+      <w:proofErr w:type="spellEnd"/>
+      <w:r>
+        <w:t>&gt; (0 or 1 byte) Contains the new value of the X register.  The value is written if the corresponding bit is set in &lt;</w:t>
+      </w:r>
+      <w:proofErr w:type="spellStart"/>
+      <w:r>
+        <w:t>modified_register_flags</w:t>
+      </w:r>
+      <w:proofErr w:type="spellEnd"/>
+      <w:r>
+        <w:t>&gt;.</w:t>
       </w:r>
     </w:p>
     <w:p>
@@ -12838,7 +14420,23 @@
         <w:ind w:left="1080"/>
       </w:pPr>
       <w:r>
-        <w:t>&lt;y_register&gt; (0 or 1 byte) Contains the new value of the Y register.  The value is written if the corresponding bit is set in &lt;modified_register_flags&gt;.</w:t>
+        <w:t>&lt;</w:t>
+      </w:r>
+      <w:proofErr w:type="spellStart"/>
+      <w:r>
+        <w:t>y_register</w:t>
+      </w:r>
+      <w:proofErr w:type="spellEnd"/>
+      <w:r>
+        <w:t>&gt; (0 or 1 byte) Contains the new value of the Y register.  The value is written if the corresponding bit is set in &lt;</w:t>
+      </w:r>
+      <w:proofErr w:type="spellStart"/>
+      <w:r>
+        <w:t>modified_register_flags</w:t>
+      </w:r>
+      <w:proofErr w:type="spellEnd"/>
+      <w:r>
+        <w:t>&gt;.</w:t>
       </w:r>
     </w:p>
     <w:p>
@@ -12846,7 +14444,23 @@
         <w:ind w:left="1080"/>
       </w:pPr>
       <w:r>
-        <w:t>&lt;status_register&gt; (0 or 1 byte) Contains the new value of the status register.  The value is written if the corresponding bit is set in &lt;modified_register_flags&gt;.</w:t>
+        <w:t>&lt;</w:t>
+      </w:r>
+      <w:proofErr w:type="spellStart"/>
+      <w:r>
+        <w:t>status_register</w:t>
+      </w:r>
+      <w:proofErr w:type="spellEnd"/>
+      <w:r>
+        <w:t>&gt; (0 or 1 byte) Contains the new value of the status register.  The value is written if the corresponding bit is set in &lt;</w:t>
+      </w:r>
+      <w:proofErr w:type="spellStart"/>
+      <w:r>
+        <w:t>modified_register_flags</w:t>
+      </w:r>
+      <w:proofErr w:type="spellEnd"/>
+      <w:r>
+        <w:t>&gt;.</w:t>
       </w:r>
     </w:p>
     <w:p>
@@ -12854,7 +14468,23 @@
         <w:ind w:left="1080"/>
       </w:pPr>
       <w:r>
-        <w:t>&lt;state_pointer&gt; (0 or 1 byte) Contains the new value of the stack pointer.   The value is written if the corresponding bit is set in &lt;modified_register_flags&gt;.</w:t>
+        <w:t>&lt;</w:t>
+      </w:r>
+      <w:proofErr w:type="spellStart"/>
+      <w:r>
+        <w:t>state_pointer</w:t>
+      </w:r>
+      <w:proofErr w:type="spellEnd"/>
+      <w:r>
+        <w:t>&gt; (0 or 1 byte) Contains the new value of the stack pointer.   The value is written if the corresponding bit is set in &lt;</w:t>
+      </w:r>
+      <w:proofErr w:type="spellStart"/>
+      <w:r>
+        <w:t>modified_register_flags</w:t>
+      </w:r>
+      <w:proofErr w:type="spellEnd"/>
+      <w:r>
+        <w:t>&gt;.</w:t>
       </w:r>
     </w:p>
     <w:p>
@@ -12862,7 +14492,15 @@
         <w:ind w:left="720"/>
       </w:pPr>
       <w:r>
-        <w:t xml:space="preserve">&lt;destination_address&gt; (2 bytes) Populated for the </w:t>
+        <w:t>&lt;</w:t>
+      </w:r>
+      <w:proofErr w:type="spellStart"/>
+      <w:r>
+        <w:t>destination_address</w:t>
+      </w:r>
+      <w:proofErr w:type="spellEnd"/>
+      <w:r>
+        <w:t xml:space="preserve">&gt; (2 bytes) Populated for the </w:t>
       </w:r>
       <w:r>
         <w:rPr>
@@ -12969,7 +14607,15 @@
         <w:ind w:left="720"/>
       </w:pPr>
       <w:r>
-        <w:t xml:space="preserve">&lt;memory_address&gt; (2 bytes) Populated for all opcodes (except </w:t>
+        <w:t>&lt;</w:t>
+      </w:r>
+      <w:proofErr w:type="spellStart"/>
+      <w:r>
+        <w:t>memory_address</w:t>
+      </w:r>
+      <w:proofErr w:type="spellEnd"/>
+      <w:r>
+        <w:t xml:space="preserve">&gt; (2 bytes) Populated for all opcodes (except </w:t>
       </w:r>
       <w:r>
         <w:rPr>
@@ -13142,7 +14788,15 @@
         <w:ind w:left="720"/>
       </w:pPr>
       <w:r>
-        <w:t xml:space="preserve">&lt;memory_read_value&gt; (1 byte) Populated for opcodes (except </w:t>
+        <w:t>&lt;</w:t>
+      </w:r>
+      <w:proofErr w:type="spellStart"/>
+      <w:r>
+        <w:t>memory_read_value</w:t>
+      </w:r>
+      <w:proofErr w:type="spellEnd"/>
+      <w:r>
+        <w:t xml:space="preserve">&gt; (1 byte) Populated for opcodes (except </w:t>
       </w:r>
       <w:r>
         <w:rPr>
@@ -13228,7 +14882,15 @@
         <w:ind w:left="720"/>
       </w:pPr>
       <w:r>
-        <w:t xml:space="preserve">&lt;memory_write_value&gt; (1 byte) Populated for opcodes (except </w:t>
+        <w:t>&lt;</w:t>
+      </w:r>
+      <w:proofErr w:type="spellStart"/>
+      <w:r>
+        <w:t>memory_write_value</w:t>
+      </w:r>
+      <w:proofErr w:type="spellEnd"/>
+      <w:r>
+        <w:t xml:space="preserve">&gt; (1 byte) Populated for opcodes (except </w:t>
       </w:r>
       <w:r>
         <w:rPr>
@@ -13333,6 +14995,7 @@
       <w:r>
         <w:t xml:space="preserve">The performance functionality is encapsulated within a </w:t>
       </w:r>
+      <w:proofErr w:type="spellStart"/>
       <w:r>
         <w:rPr>
           <w:b/>
@@ -13340,8 +15003,25 @@
         </w:rPr>
         <w:t>PerfWriter</w:t>
       </w:r>
-      <w:r>
-        <w:t xml:space="preserve"> class (PerfWriter.h/cpp) </w:t>
+      <w:proofErr w:type="spellEnd"/>
+      <w:r>
+        <w:t xml:space="preserve"> class (</w:t>
+      </w:r>
+      <w:proofErr w:type="spellStart"/>
+      <w:r>
+        <w:t>PerfWriter.h</w:t>
+      </w:r>
+      <w:proofErr w:type="spellEnd"/>
+      <w:r>
+        <w:t>/</w:t>
+      </w:r>
+      <w:proofErr w:type="spellStart"/>
+      <w:r>
+        <w:t>cpp</w:t>
+      </w:r>
+      <w:proofErr w:type="spellEnd"/>
+      <w:r>
+        <w:t xml:space="preserve">) </w:t>
       </w:r>
     </w:p>
     <w:p>
@@ -13492,8 +15172,17 @@
           <w:b/>
           <w:bCs/>
         </w:rPr>
-        <w:t>/cpp</w:t>
-      </w:r>
+        <w:t>/</w:t>
+      </w:r>
+      <w:proofErr w:type="spellStart"/>
+      <w:r>
+        <w:rPr>
+          <w:b/>
+          <w:bCs/>
+        </w:rPr>
+        <w:t>cpp</w:t>
+      </w:r>
+      <w:proofErr w:type="spellEnd"/>
     </w:p>
     <w:p>
       <w:pPr>
@@ -13507,23 +15196,38 @@
         <w:lastRenderedPageBreak/>
         <w:t xml:space="preserve">Added calls to </w:t>
       </w:r>
-      <w:r>
-        <w:t>PerfWriter_WriteInstruction(</w:t>
+      <w:proofErr w:type="spellStart"/>
+      <w:r>
+        <w:t>PerfWriter_WriteInstruction</w:t>
+      </w:r>
+      <w:proofErr w:type="spellEnd"/>
+      <w:r>
+        <w:t>(</w:t>
       </w:r>
       <w:r>
         <w:t xml:space="preserve">…) and </w:t>
       </w:r>
+      <w:proofErr w:type="spellStart"/>
       <w:r>
         <w:t>PerfWriter_WriteI</w:t>
       </w:r>
       <w:r>
         <w:t>nterrupt</w:t>
       </w:r>
+      <w:proofErr w:type="spellEnd"/>
       <w:r>
         <w:t>(</w:t>
       </w:r>
       <w:r>
-        <w:t>…) to log instructions and interrupts.  These wrapper functions only invoke the PerfWriter instance during a performance capture.</w:t>
+        <w:t xml:space="preserve">…) to log instructions and interrupts.  These wrapper functions only invoke the </w:t>
+      </w:r>
+      <w:proofErr w:type="spellStart"/>
+      <w:r>
+        <w:t>PerfWriter</w:t>
+      </w:r>
+      <w:proofErr w:type="spellEnd"/>
+      <w:r>
+        <w:t xml:space="preserve"> instance during a performance capture.</w:t>
       </w:r>
     </w:p>
     <w:p>
@@ -13537,51 +15241,70 @@
       <w:r>
         <w:t>Added static variables (</w:t>
       </w:r>
+      <w:proofErr w:type="spellStart"/>
       <w:r>
         <w:t>LastReadWriteAddress</w:t>
       </w:r>
+      <w:proofErr w:type="spellEnd"/>
       <w:r>
         <w:t xml:space="preserve">, </w:t>
       </w:r>
+      <w:proofErr w:type="spellStart"/>
       <w:r>
         <w:t>LastReadValue</w:t>
       </w:r>
+      <w:proofErr w:type="spellEnd"/>
       <w:r>
         <w:t xml:space="preserve">, and </w:t>
       </w:r>
+      <w:proofErr w:type="spellStart"/>
       <w:r>
         <w:t>LastWriteValue</w:t>
       </w:r>
+      <w:proofErr w:type="spellEnd"/>
       <w:r>
         <w:t xml:space="preserve">) to store the last accessed memory address, read value, and write value.  These values are passed to </w:t>
       </w:r>
-      <w:r>
-        <w:t>PerfWriter_WriteInstruction(</w:t>
+      <w:proofErr w:type="spellStart"/>
+      <w:r>
+        <w:t>PerfWriter_WriteInstruction</w:t>
+      </w:r>
+      <w:proofErr w:type="spellEnd"/>
+      <w:r>
+        <w:t>(</w:t>
       </w:r>
       <w:r>
         <w:t>…).  Added helpers (</w:t>
       </w:r>
+      <w:proofErr w:type="spellStart"/>
       <w:r>
         <w:t>ReadZeroPage</w:t>
       </w:r>
+      <w:proofErr w:type="spellEnd"/>
       <w:r>
         <w:t xml:space="preserve">, </w:t>
       </w:r>
+      <w:proofErr w:type="spellStart"/>
       <w:r>
         <w:t>WriteZeroPage</w:t>
       </w:r>
+      <w:proofErr w:type="spellEnd"/>
       <w:r>
         <w:t xml:space="preserve">, </w:t>
       </w:r>
+      <w:proofErr w:type="spellStart"/>
       <w:r>
         <w:t>ReadPaged</w:t>
       </w:r>
+      <w:proofErr w:type="spellEnd"/>
       <w:r>
         <w:t xml:space="preserve">, </w:t>
       </w:r>
+      <w:proofErr w:type="spellStart"/>
       <w:r>
         <w:t>WritePaged</w:t>
       </w:r>
+      <w:proofErr w:type="spellEnd"/>
       <w:r>
         <w:t>) which wrap the respective functionality whilst updating these variables.  Updated the emulator interpretation code to use the new helpers.</w:t>
       </w:r>
@@ -13595,29 +15318,61 @@
         </w:numPr>
       </w:pPr>
       <w:r>
-        <w:t>Defined new struct (StackFrame) and static variables (</w:t>
-      </w:r>
-      <w:r>
-        <w:t>StackFrames, StackFrameCount</w:t>
-      </w:r>
+        <w:t>Defined new struct (</w:t>
+      </w:r>
+      <w:proofErr w:type="spellStart"/>
+      <w:r>
+        <w:t>StackFrame</w:t>
+      </w:r>
+      <w:proofErr w:type="spellEnd"/>
+      <w:r>
+        <w:t>) and static variables (</w:t>
+      </w:r>
+      <w:proofErr w:type="spellStart"/>
+      <w:r>
+        <w:t>StackFrames</w:t>
+      </w:r>
+      <w:proofErr w:type="spellEnd"/>
+      <w:r>
+        <w:t xml:space="preserve">, </w:t>
+      </w:r>
+      <w:proofErr w:type="spellStart"/>
+      <w:r>
+        <w:t>StackFrameCount</w:t>
+      </w:r>
+      <w:proofErr w:type="spellEnd"/>
       <w:r>
         <w:t>) to capture the current call stack, and added helpers (</w:t>
       </w:r>
+      <w:proofErr w:type="spellStart"/>
       <w:r>
         <w:t>PushStackFrame</w:t>
       </w:r>
+      <w:proofErr w:type="spellEnd"/>
       <w:r>
         <w:t xml:space="preserve">, </w:t>
       </w:r>
+      <w:proofErr w:type="spellStart"/>
       <w:r>
         <w:t>SyncStackFrames</w:t>
       </w:r>
-      <w:r>
-        <w:t xml:space="preserve">, SetStackFrame, </w:t>
-      </w:r>
+      <w:proofErr w:type="spellEnd"/>
+      <w:r>
+        <w:t xml:space="preserve">, </w:t>
+      </w:r>
+      <w:proofErr w:type="spellStart"/>
+      <w:r>
+        <w:t>SetStackFrame</w:t>
+      </w:r>
+      <w:proofErr w:type="spellEnd"/>
+      <w:r>
+        <w:t xml:space="preserve">, </w:t>
+      </w:r>
+      <w:proofErr w:type="spellStart"/>
       <w:r>
         <w:t>UpdateRootStackFrame</w:t>
       </w:r>
+      <w:proofErr w:type="spellEnd"/>
       <w:r>
         <w:t>) to maintain this.  Updated the emulator’s interpretation code to invoke the new helpers.</w:t>
       </w:r>
@@ -13657,8 +15412,13 @@
       <w:r>
         <w:t xml:space="preserve">Added helper to get the emulator’s call stack: </w:t>
       </w:r>
-      <w:r>
-        <w:t xml:space="preserve">GetStackFrames </w:t>
+      <w:proofErr w:type="spellStart"/>
+      <w:r>
+        <w:t>GetStackFrames</w:t>
+      </w:r>
+      <w:proofErr w:type="spellEnd"/>
+      <w:r>
+        <w:t xml:space="preserve"> </w:t>
       </w:r>
       <w:r>
         <w:t xml:space="preserve">(…).  This is called during snapshot chunk serialization.  </w:t>
@@ -13673,7 +15433,15 @@
         </w:numPr>
       </w:pPr>
       <w:r>
-        <w:t>Added helper to get the emulator’s registers: GetRegisters(…).  This is called during snapshot chunk serialization.</w:t>
+        <w:t xml:space="preserve">Added helper to get the emulator’s registers: </w:t>
+      </w:r>
+      <w:proofErr w:type="spellStart"/>
+      <w:r>
+        <w:t>GetRegisters</w:t>
+      </w:r>
+      <w:proofErr w:type="spellEnd"/>
+      <w:r>
+        <w:t>(…).  This is called during snapshot chunk serialization.</w:t>
       </w:r>
     </w:p>
     <w:p>
@@ -13687,6 +15455,7 @@
       <w:r>
         <w:t xml:space="preserve">Removed </w:t>
       </w:r>
+      <w:proofErr w:type="spellStart"/>
       <w:r>
         <w:rPr>
           <w:b/>
@@ -13694,9 +15463,11 @@
         </w:rPr>
         <w:t>ReadPaged</w:t>
       </w:r>
+      <w:proofErr w:type="spellEnd"/>
       <w:r>
         <w:t xml:space="preserve"> and </w:t>
       </w:r>
+      <w:proofErr w:type="spellStart"/>
       <w:r>
         <w:rPr>
           <w:b/>
@@ -13704,6 +15475,7 @@
         </w:rPr>
         <w:t>WritePaged</w:t>
       </w:r>
+      <w:proofErr w:type="spellEnd"/>
       <w:r>
         <w:t xml:space="preserve"> </w:t>
       </w:r>
@@ -13718,13 +15490,31 @@
           <w:bCs/>
         </w:rPr>
       </w:pPr>
-      <w:r>
-        <w:rPr>
-          <w:b/>
-          <w:bCs/>
-        </w:rPr>
-        <w:t>BeepMem.h/cpp</w:t>
-      </w:r>
+      <w:proofErr w:type="spellStart"/>
+      <w:r>
+        <w:rPr>
+          <w:b/>
+          <w:bCs/>
+        </w:rPr>
+        <w:t>BeepMem.h</w:t>
+      </w:r>
+      <w:proofErr w:type="spellEnd"/>
+      <w:r>
+        <w:rPr>
+          <w:b/>
+          <w:bCs/>
+        </w:rPr>
+        <w:t>/</w:t>
+      </w:r>
+      <w:proofErr w:type="spellStart"/>
+      <w:r>
+        <w:rPr>
+          <w:b/>
+          <w:bCs/>
+        </w:rPr>
+        <w:t>cpp</w:t>
+      </w:r>
+      <w:proofErr w:type="spellEnd"/>
     </w:p>
     <w:p>
       <w:pPr>
@@ -13737,20 +15527,32 @@
       <w:r>
         <w:t>Defined new struct (</w:t>
       </w:r>
+      <w:proofErr w:type="spellStart"/>
       <w:r>
         <w:t>MemPageType</w:t>
       </w:r>
+      <w:proofErr w:type="spellEnd"/>
       <w:r>
         <w:t>) and function (</w:t>
       </w:r>
+      <w:proofErr w:type="spellStart"/>
       <w:r>
         <w:t>BeebMemPage</w:t>
       </w:r>
-      <w:r>
-        <w:t>) that returns the page associated with an address.  This is invoked by Set</w:t>
-      </w:r>
-      <w:r>
-        <w:t xml:space="preserve">StackFrame </w:t>
+      <w:proofErr w:type="spellEnd"/>
+      <w:r>
+        <w:t xml:space="preserve">) that returns the page associated with an address.  This is invoked by </w:t>
+      </w:r>
+      <w:proofErr w:type="spellStart"/>
+      <w:r>
+        <w:t>Set</w:t>
+      </w:r>
+      <w:r>
+        <w:t>StackFrame</w:t>
+      </w:r>
+      <w:proofErr w:type="spellEnd"/>
+      <w:r>
+        <w:t xml:space="preserve"> </w:t>
       </w:r>
       <w:r>
         <w:t>(see 6502.cpp).</w:t>
@@ -13805,6 +15607,7 @@
         </w:rPr>
         <w:t xml:space="preserve"> </w:t>
       </w:r>
+      <w:proofErr w:type="spellStart"/>
       <w:r>
         <w:rPr>
           <w:b/>
@@ -13812,6 +15615,7 @@
         </w:rPr>
         <w:t>HidAdd</w:t>
       </w:r>
+      <w:proofErr w:type="spellEnd"/>
       <w:r>
         <w:rPr>
           <w:b/>
@@ -13893,13 +15697,29 @@
         </w:numPr>
       </w:pPr>
       <w:r>
-        <w:t xml:space="preserve">Added call to PerfWriter_WriteBeginDisplayEvent(…) to log the start of screen display. </w:t>
+        <w:t xml:space="preserve">Added call to </w:t>
+      </w:r>
+      <w:proofErr w:type="spellStart"/>
+      <w:r>
+        <w:t>PerfWriter_WriteBeginDisplayEvent</w:t>
+      </w:r>
+      <w:proofErr w:type="spellEnd"/>
+      <w:r>
+        <w:t xml:space="preserve">(…) to log the start of screen display. </w:t>
       </w:r>
       <w:r>
         <w:t xml:space="preserve"> </w:t>
       </w:r>
       <w:r>
-        <w:t xml:space="preserve">This wrapper function only invokes the PerfWriter class during </w:t>
+        <w:t xml:space="preserve">This wrapper function only invokes the </w:t>
+      </w:r>
+      <w:proofErr w:type="spellStart"/>
+      <w:r>
+        <w:t>PerfWriter</w:t>
+      </w:r>
+      <w:proofErr w:type="spellEnd"/>
+      <w:r>
+        <w:t xml:space="preserve"> class during </w:t>
       </w:r>
       <w:r>
         <w:t xml:space="preserve">a </w:t>
@@ -13915,13 +15735,31 @@
           <w:bCs/>
         </w:rPr>
       </w:pPr>
-      <w:r>
-        <w:rPr>
-          <w:b/>
-          <w:bCs/>
-        </w:rPr>
-        <w:t>Debug.h/cpp</w:t>
-      </w:r>
+      <w:proofErr w:type="spellStart"/>
+      <w:r>
+        <w:rPr>
+          <w:b/>
+          <w:bCs/>
+        </w:rPr>
+        <w:t>Debug.h</w:t>
+      </w:r>
+      <w:proofErr w:type="spellEnd"/>
+      <w:r>
+        <w:rPr>
+          <w:b/>
+          <w:bCs/>
+        </w:rPr>
+        <w:t>/</w:t>
+      </w:r>
+      <w:proofErr w:type="spellStart"/>
+      <w:r>
+        <w:rPr>
+          <w:b/>
+          <w:bCs/>
+        </w:rPr>
+        <w:t>cpp</w:t>
+      </w:r>
+      <w:proofErr w:type="spellEnd"/>
     </w:p>
     <w:p>
       <w:pPr>
@@ -13956,12 +15794,37 @@
           <w:bCs/>
         </w:rPr>
       </w:pPr>
-      <w:r>
-        <w:rPr>
-          <w:b/>
-          <w:bCs/>
-        </w:rPr>
-        <w:t>BeebWin.h/cpp, BeebWinIo.cpp</w:t>
+      <w:proofErr w:type="spellStart"/>
+      <w:r>
+        <w:rPr>
+          <w:b/>
+          <w:bCs/>
+        </w:rPr>
+        <w:t>BeebWin.h</w:t>
+      </w:r>
+      <w:proofErr w:type="spellEnd"/>
+      <w:r>
+        <w:rPr>
+          <w:b/>
+          <w:bCs/>
+        </w:rPr>
+        <w:t>/</w:t>
+      </w:r>
+      <w:proofErr w:type="spellStart"/>
+      <w:r>
+        <w:rPr>
+          <w:b/>
+          <w:bCs/>
+        </w:rPr>
+        <w:t>cpp</w:t>
+      </w:r>
+      <w:proofErr w:type="spellEnd"/>
+      <w:r>
+        <w:rPr>
+          <w:b/>
+          <w:bCs/>
+        </w:rPr>
+        <w:t>, BeebWinIo.cpp</w:t>
       </w:r>
     </w:p>
     <w:p>
@@ -13989,27 +15852,44 @@
         </w:rPr>
         <w:t xml:space="preserve"> </w:t>
       </w:r>
+      <w:proofErr w:type="spellStart"/>
       <w:r>
         <w:t>UpdatePerfCaptureMenu</w:t>
       </w:r>
+      <w:proofErr w:type="spellEnd"/>
       <w:r>
         <w:t>()</w:t>
       </w:r>
       <w:r>
-        <w:t>, CapturePerf</w:t>
-      </w:r>
+        <w:t xml:space="preserve">, </w:t>
+      </w:r>
+      <w:proofErr w:type="spellStart"/>
+      <w:r>
+        <w:t>CapturePerf</w:t>
+      </w:r>
+      <w:proofErr w:type="spellEnd"/>
       <w:r>
         <w:t>()</w:t>
       </w:r>
       <w:r>
-        <w:t>, EndPerfCapture</w:t>
-      </w:r>
+        <w:t xml:space="preserve">, </w:t>
+      </w:r>
+      <w:proofErr w:type="spellStart"/>
+      <w:r>
+        <w:t>EndPerfCapture</w:t>
+      </w:r>
+      <w:proofErr w:type="spellEnd"/>
       <w:r>
         <w:t>()</w:t>
       </w:r>
       <w:r>
-        <w:t>, and IsCapturingPerf</w:t>
-      </w:r>
+        <w:t xml:space="preserve">, and </w:t>
+      </w:r>
+      <w:proofErr w:type="spellStart"/>
+      <w:r>
+        <w:t>IsCapturingPerf</w:t>
+      </w:r>
+      <w:proofErr w:type="spellEnd"/>
       <w:r>
         <w:t>()</w:t>
       </w:r>
@@ -14023,9 +15903,11 @@
         <w:lastRenderedPageBreak/>
         <w:t xml:space="preserve">capture is implemented.  The only notable differences are that </w:t>
       </w:r>
+      <w:proofErr w:type="spellStart"/>
       <w:r>
         <w:t>CapturePerf</w:t>
       </w:r>
+      <w:proofErr w:type="spellEnd"/>
       <w:r>
         <w:rPr>
           <w:b/>
@@ -14034,11 +15916,21 @@
         <w:t xml:space="preserve"> </w:t>
       </w:r>
       <w:r>
-        <w:t xml:space="preserve">creates an instance of the PerfWriter class, initializes it, and </w:t>
-      </w:r>
+        <w:t xml:space="preserve">creates an instance of the </w:t>
+      </w:r>
+      <w:proofErr w:type="spellStart"/>
+      <w:r>
+        <w:t>PerfWriter</w:t>
+      </w:r>
+      <w:proofErr w:type="spellEnd"/>
+      <w:r>
+        <w:t xml:space="preserve"> class, initializes it, and </w:t>
+      </w:r>
+      <w:proofErr w:type="spellStart"/>
       <w:r>
         <w:t>EndPerfCapture</w:t>
       </w:r>
+      <w:proofErr w:type="spellEnd"/>
       <w:r>
         <w:rPr>
           <w:b/>
@@ -14047,23 +15939,49 @@
         <w:t xml:space="preserve"> </w:t>
       </w:r>
       <w:r>
-        <w:t>closes the capture, and deletes the PerfWriter instance.</w:t>
-      </w:r>
-    </w:p>
-    <w:p>
-      <w:pPr>
-        <w:rPr>
-          <w:b/>
-          <w:bCs/>
-        </w:rPr>
-      </w:pPr>
-      <w:r>
-        <w:rPr>
-          <w:b/>
-          <w:bCs/>
-        </w:rPr>
-        <w:t>BeebWinPrefs.h/cpp</w:t>
-      </w:r>
+        <w:t xml:space="preserve">closes the capture, and deletes the </w:t>
+      </w:r>
+      <w:proofErr w:type="spellStart"/>
+      <w:r>
+        <w:t>PerfWriter</w:t>
+      </w:r>
+      <w:proofErr w:type="spellEnd"/>
+      <w:r>
+        <w:t xml:space="preserve"> instance.</w:t>
+      </w:r>
+    </w:p>
+    <w:p>
+      <w:pPr>
+        <w:rPr>
+          <w:b/>
+          <w:bCs/>
+        </w:rPr>
+      </w:pPr>
+      <w:proofErr w:type="spellStart"/>
+      <w:r>
+        <w:rPr>
+          <w:b/>
+          <w:bCs/>
+        </w:rPr>
+        <w:t>BeebWinPrefs.h</w:t>
+      </w:r>
+      <w:proofErr w:type="spellEnd"/>
+      <w:r>
+        <w:rPr>
+          <w:b/>
+          <w:bCs/>
+        </w:rPr>
+        <w:t>/</w:t>
+      </w:r>
+      <w:proofErr w:type="spellStart"/>
+      <w:r>
+        <w:rPr>
+          <w:b/>
+          <w:bCs/>
+        </w:rPr>
+        <w:t>cpp</w:t>
+      </w:r>
+      <w:proofErr w:type="spellEnd"/>
     </w:p>
     <w:p>
       <w:pPr>
@@ -14145,13 +16063,31 @@
           <w:bCs/>
         </w:rPr>
       </w:pPr>
-      <w:r>
-        <w:rPr>
-          <w:b/>
-          <w:bCs/>
-        </w:rPr>
-        <w:t>BeebEm.rc, Resource.h</w:t>
-      </w:r>
+      <w:proofErr w:type="spellStart"/>
+      <w:r>
+        <w:rPr>
+          <w:b/>
+          <w:bCs/>
+        </w:rPr>
+        <w:t>BeebEm.rc</w:t>
+      </w:r>
+      <w:proofErr w:type="spellEnd"/>
+      <w:r>
+        <w:rPr>
+          <w:b/>
+          <w:bCs/>
+        </w:rPr>
+        <w:t xml:space="preserve">, </w:t>
+      </w:r>
+      <w:proofErr w:type="spellStart"/>
+      <w:r>
+        <w:rPr>
+          <w:b/>
+          <w:bCs/>
+        </w:rPr>
+        <w:t>Resource.h</w:t>
+      </w:r>
+      <w:proofErr w:type="spellEnd"/>
     </w:p>
     <w:p>
       <w:pPr>
@@ -14199,6 +16135,7 @@
         </w:rPr>
         <w:t>*</w:t>
       </w:r>
+      <w:proofErr w:type="spellStart"/>
       <w:r>
         <w:rPr>
           <w:b/>
@@ -14234,6 +16171,7 @@
         </w:rPr>
         <w:t>.filters</w:t>
       </w:r>
+      <w:proofErr w:type="spellEnd"/>
     </w:p>
     <w:p>
       <w:pPr>
@@ -14259,8 +16197,17 @@
           <w:b/>
           <w:bCs/>
         </w:rPr>
-        <w:t>*.vcxproj</w:t>
-      </w:r>
+        <w:t>*.</w:t>
+      </w:r>
+      <w:proofErr w:type="spellStart"/>
+      <w:r>
+        <w:rPr>
+          <w:b/>
+          <w:bCs/>
+        </w:rPr>
+        <w:t>vcxproj</w:t>
+      </w:r>
+      <w:proofErr w:type="spellEnd"/>
     </w:p>
     <w:p>
       <w:pPr>
@@ -14271,7 +16218,15 @@
         </w:numPr>
       </w:pPr>
       <w:r>
-        <w:t>Updated WindowsTargetPlatformVersion to 10.0</w:t>
+        <w:t xml:space="preserve">Updated </w:t>
+      </w:r>
+      <w:proofErr w:type="spellStart"/>
+      <w:r>
+        <w:t>WindowsTargetPlatformVersion</w:t>
+      </w:r>
+      <w:proofErr w:type="spellEnd"/>
+      <w:r>
+        <w:t xml:space="preserve"> to 10.0</w:t>
       </w:r>
     </w:p>
     <w:p>
@@ -14283,7 +16238,15 @@
         </w:numPr>
       </w:pPr>
       <w:r>
-        <w:t>Updated PlatformToolset to v14</w:t>
+        <w:t xml:space="preserve">Updated </w:t>
+      </w:r>
+      <w:proofErr w:type="spellStart"/>
+      <w:r>
+        <w:t>PlatformToolset</w:t>
+      </w:r>
+      <w:proofErr w:type="spellEnd"/>
+      <w:r>
+        <w:t xml:space="preserve"> to v14</w:t>
       </w:r>
       <w:r>
         <w:t xml:space="preserve">2.  </w:t>
@@ -14345,16 +16308,52 @@
         </w:rPr>
         <w:t xml:space="preserve">git add -N </w:t>
       </w:r>
+      <w:proofErr w:type="spellStart"/>
       <w:r>
         <w:rPr>
           <w:color w:val="FFFFFF" w:themeColor="background1"/>
         </w:rPr>
-        <w:t>src\PerfWriter.h src\PerfWriter.cpp</w:t>
-      </w:r>
+        <w:t>src</w:t>
+      </w:r>
+      <w:proofErr w:type="spellEnd"/>
       <w:r>
         <w:rPr>
           <w:color w:val="FFFFFF" w:themeColor="background1"/>
         </w:rPr>
+        <w:t>\</w:t>
+      </w:r>
+      <w:proofErr w:type="spellStart"/>
+      <w:r>
+        <w:rPr>
+          <w:color w:val="FFFFFF" w:themeColor="background1"/>
+        </w:rPr>
+        <w:t>PerfWriter.h</w:t>
+      </w:r>
+      <w:proofErr w:type="spellEnd"/>
+      <w:r>
+        <w:rPr>
+          <w:color w:val="FFFFFF" w:themeColor="background1"/>
+        </w:rPr>
+        <w:t xml:space="preserve"> </w:t>
+      </w:r>
+      <w:proofErr w:type="spellStart"/>
+      <w:r>
+        <w:rPr>
+          <w:color w:val="FFFFFF" w:themeColor="background1"/>
+        </w:rPr>
+        <w:t>src</w:t>
+      </w:r>
+      <w:proofErr w:type="spellEnd"/>
+      <w:r>
+        <w:rPr>
+          <w:color w:val="FFFFFF" w:themeColor="background1"/>
+        </w:rPr>
+        <w:t>\PerfWriter.cpp</w:t>
+      </w:r>
+      <w:r>
+        <w:rPr>
+          <w:color w:val="FFFFFF" w:themeColor="background1"/>
+        </w:rPr>
         <w:br/>
       </w:r>
       <w:r>
@@ -14375,12 +16374,28 @@
         </w:rPr>
         <w:t xml:space="preserve"> &gt; ..\</w:t>
       </w:r>
+      <w:proofErr w:type="spellStart"/>
       <w:r>
         <w:rPr>
           <w:color w:val="FFFFFF" w:themeColor="background1"/>
         </w:rPr>
-        <w:t>beebperf\beebem_changelist.diff</w:t>
-      </w:r>
+        <w:t>beebperf</w:t>
+      </w:r>
+      <w:proofErr w:type="spellEnd"/>
+      <w:r>
+        <w:rPr>
+          <w:color w:val="FFFFFF" w:themeColor="background1"/>
+        </w:rPr>
+        <w:t>\</w:t>
+      </w:r>
+      <w:proofErr w:type="spellStart"/>
+      <w:r>
+        <w:rPr>
+          <w:color w:val="FFFFFF" w:themeColor="background1"/>
+        </w:rPr>
+        <w:t>beebem_changelist.diff</w:t>
+      </w:r>
+      <w:proofErr w:type="spellEnd"/>
     </w:p>
     <w:p/>
     <w:p>
@@ -14415,12 +16430,28 @@
         </w:rPr>
         <w:t>apply ..\</w:t>
       </w:r>
+      <w:proofErr w:type="spellStart"/>
       <w:r>
         <w:rPr>
           <w:color w:val="FFFFFF" w:themeColor="background1"/>
         </w:rPr>
-        <w:t>beebperf\beebem_changelist.diff</w:t>
-      </w:r>
+        <w:t>beebperf</w:t>
+      </w:r>
+      <w:proofErr w:type="spellEnd"/>
+      <w:r>
+        <w:rPr>
+          <w:color w:val="FFFFFF" w:themeColor="background1"/>
+        </w:rPr>
+        <w:t>\</w:t>
+      </w:r>
+      <w:proofErr w:type="spellStart"/>
+      <w:r>
+        <w:rPr>
+          <w:color w:val="FFFFFF" w:themeColor="background1"/>
+        </w:rPr>
+        <w:t>beebem_changelist.diff</w:t>
+      </w:r>
+      <w:proofErr w:type="spellEnd"/>
     </w:p>
     <w:p/>
     <w:p/>
@@ -21968,6 +23999,7 @@
   <w:style w:type="character" w:default="1" w:styleId="DefaultParagraphFont">
     <w:name w:val="Default Paragraph Font"/>
     <w:uiPriority w:val="1"/>
+    <w:semiHidden/>
     <w:unhideWhenUsed/>
   </w:style>
   <w:style w:type="table" w:default="1" w:styleId="TableNormal">

</xml_diff>